<commit_message>
Agregado de imágnes e informe completado
</commit_message>
<xml_diff>
--- a/Proyecto 1C/Informe-IEEE.docx
+++ b/Proyecto 1C/Informe-IEEE.docx
@@ -5,6 +5,7 @@
     <w:p>
       <w:pPr>
         <w:pStyle w:val="IEEETitle"/>
+        <w:ind w:right="-811"/>
         <w:rPr>
           <w:lang w:val="pt-BR"/>
         </w:rPr>
@@ -19,6 +20,7 @@
     <w:p>
       <w:pPr>
         <w:pStyle w:val="IEEEAuthorName"/>
+        <w:ind w:right="-811"/>
         <w:rPr>
           <w:lang w:val="pt-BR"/>
         </w:rPr>
@@ -71,6 +73,7 @@
     <w:p>
       <w:pPr>
         <w:pStyle w:val="IEEEAuthorAffiliation"/>
+        <w:ind w:right="-811"/>
         <w:rPr>
           <w:lang w:val="es-AR"/>
         </w:rPr>
@@ -103,6 +106,7 @@
     <w:p>
       <w:pPr>
         <w:pStyle w:val="IEEEAuthorEmail"/>
+        <w:ind w:right="-811"/>
         <w:rPr>
           <w:lang w:val="es-AR"/>
         </w:rPr>
@@ -128,6 +132,7 @@
     <w:p>
       <w:pPr>
         <w:pStyle w:val="IEEEAuthorEmail"/>
+        <w:ind w:right="-811"/>
         <w:rPr>
           <w:lang w:val="es-AR"/>
         </w:rPr>
@@ -149,16 +154,11 @@
           <w:t>diegocale@frba.utn.edu.ar</w:t>
         </w:r>
       </w:hyperlink>
-      <w:r>
-        <w:rPr>
-          <w:lang w:val="es-AR"/>
-        </w:rPr>
-        <w:t xml:space="preserve"> </w:t>
-      </w:r>
     </w:p>
     <w:p>
       <w:pPr>
         <w:pStyle w:val="IEEEAuthorAffiliation"/>
+        <w:ind w:right="-811"/>
         <w:rPr>
           <w:lang w:val="es-AR"/>
         </w:rPr>

</xml_diff>

<commit_message>
link de jupyter corregido
</commit_message>
<xml_diff>
--- a/Proyecto 1C/Informe-IEEE.docx
+++ b/Proyecto 1C/Informe-IEEE.docx
@@ -680,7 +680,7 @@
             <v:path o:extrusionok="f" gradientshapeok="t" o:connecttype="rect"/>
             <o:lock v:ext="edit" aspectratio="t"/>
           </v:shapetype>
-          <v:shape id="Imagen 1" o:spid="_x0000_i1055" type="#_x0000_t75" style="width:195.8pt;height:73.1pt;visibility:visible;mso-wrap-style:square">
+          <v:shape id="Imagen 1" o:spid="_x0000_i1026" type="#_x0000_t75" style="width:195.9pt;height:73.4pt;visibility:visible;mso-wrap-style:square">
             <v:imagedata r:id="rId10" o:title="" cropbottom="11365f"/>
           </v:shape>
         </w:pict>
@@ -771,7 +771,7 @@
           <w:szCs w:val="20"/>
         </w:rPr>
         <w:pict w14:anchorId="56A9E98A">
-          <v:shape id="Imagen 2" o:spid="_x0000_i1076" type="#_x0000_t75" style="width:244.9pt;height:88.35pt;visibility:visible;mso-wrap-style:square">
+          <v:shape id="Imagen 2" o:spid="_x0000_i1027" type="#_x0000_t75" style="width:245.1pt;height:88.6pt;visibility:visible;mso-wrap-style:square">
             <v:imagedata r:id="rId11" o:title=""/>
           </v:shape>
         </w:pict>
@@ -828,7 +828,7 @@
           <w:noProof/>
         </w:rPr>
         <w:pict w14:anchorId="4E2CA24B">
-          <v:shape id="_x0000_i1075" type="#_x0000_t75" style="width:207.25pt;height:72.55pt;visibility:visible;mso-wrap-style:square">
+          <v:shape id="_x0000_i1028" type="#_x0000_t75" style="width:207.7pt;height:72.7pt;visibility:visible;mso-wrap-style:square">
             <v:imagedata r:id="rId12" o:title=""/>
           </v:shape>
         </w:pict>
@@ -876,7 +876,7 @@
           <w:szCs w:val="20"/>
         </w:rPr>
         <w:pict w14:anchorId="717F03DF">
-          <v:shape id="_x0000_i1062" type="#_x0000_t75" style="width:15.25pt;height:13.65pt" equationxml="&lt;?xml version=&quot;1.0&quot; encoding=&quot;UTF-8&quot; standalone=&quot;yes&quot;?&gt;&#10;&lt;?mso-application progid=&quot;Word.Document&quot;?&gt;&#10;&lt;w:wordDocument xmlns:aml=&quot;http://schemas.microsoft.com/aml/2001/core&quot; xmlns:wpc=&quot;http://schemas.microsoft.com/office/word/2010/wordprocessingCanvas&quot; xmlns:cx=&quot;http://schemas.microsoft.com/office/drawing/2014/chartex&quot; xmlns:cx1=&quot;http://schemas.microsoft.com/office/drawing/2015/9/8/chartex&quot; xmlns:cx2=&quot;http://schemas.microsoft.com/office/drawing/2015/10/21/chartex&quot; xmlns:cx3=&quot;http://schemas.microsoft.com/office/drawing/2016/5/9/chartex&quot; xmlns:cx4=&quot;http://schemas.microsoft.com/office/drawing/2016/5/10/chartex&quot; xmlns:cx5=&quot;http://schemas.microsoft.com/office/drawing/2016/5/11/chartex&quot; xmlns:cx6=&quot;http://schemas.microsoft.com/office/drawing/2016/5/12/chartex&quot; xmlns:cx7=&quot;http://schemas.microsoft.com/office/drawing/2016/5/13/chartex&quot; xmlns:cx8=&quot;http://schemas.microsoft.com/office/drawing/2016/5/14/chartex&quot; xmlns:cr=&quot;http://schemas.microsoft.com/office/comments/2020/reactions&quot; xmlns:dt=&quot;uuid:C2F41010-65B3-11d1-A29F-00AA00C14882&quot; xmlns:mc=&quot;http://schemas.openxmlformats.org/markup-compatibility/2006&quot; xmlns:aink=&quot;http://schemas.microsoft.com/office/drawing/2016/ink&quot; xmlns:am3d=&quot;http://schemas.microsoft.com/office/drawing/2017/model3d&quot; xmlns:o=&quot;urn:schemas-microsoft-com:office:office&quot; xmlns:oel=&quot;http://schemas.microsoft.com/office/2019/extlst&quot; xmlns:m=&quot;http://schemas.openxmlformats.org/officeDocument/2006/math&quot; xmlns:v=&quot;urn:schemas-microsoft-com:vml&quot; xmlns:w10=&quot;urn:schemas-microsoft-com:office:word&quot; xmlns:w=&quot;http://schemas.microsoft.com/office/word/2003/wordml&quot; xmlns:wx=&quot;http://schemas.microsoft.com/office/word/2003/auxHint&quot; xmlns:wne=&quot;http://schemas.microsoft.com/office/word/2006/wordml&quot; xmlns:wsp=&quot;http://schemas.microsoft.com/office/word/2003/wordml/sp2&quot; xmlns:sl=&quot;http://schemas.microsoft.com/schemaLibrary/2003/core&quot; w:macrosPresent=&quot;no&quot; w:embeddedObjPresent=&quot;no&quot; w:ocxPresent=&quot;no&quot; xml:space=&quot;preserve&quot;&gt;&lt;w:ignoreSubtree w:val=&quot;http://schemas.microsoft.com/office/word/2003/wordml/sp2&quot;/&gt;&lt;o:DocumentProperties&gt;&lt;o:Version&gt;16&lt;/o:Version&gt;&lt;/o:DocumentProperties&gt;&lt;w:docPr&gt;&lt;w:view w:val=&quot;print&quot;/&gt;&lt;w:zoom w:percent=&quot;100&quot;/&gt;&lt;w:doNotEmbedSystemFonts/&gt;&lt;w:activeWritingStyle w:lang=&quot;EN-AU&quot; w:vendorID=&quot;64&quot; w:dllVersion=&quot;6&quot; w:nlCheck=&quot;on&quot; w:optionSet=&quot;1&quot;/&gt;&lt;w:activeWritingStyle w:lang=&quot;EN-GB&quot; w:vendorID=&quot;64&quot; w:dllVersion=&quot;6&quot; w:nlCheck=&quot;on&quot; w:optionSet=&quot;1&quot;/&gt;&lt;w:activeWritingStyle w:lang=&quot;EN-US&quot; w:vendorID=&quot;64&quot; w:dllVersion=&quot;6&quot; w:nlCheck=&quot;on&quot; w:optionSet=&quot;1&quot;/&gt;&lt;w:activeWritingStyle w:lang=&quot;EN-AU&quot; w:vendorID=&quot;64&quot; w:dllVersion=&quot;0&quot; w:nlCheck=&quot;on&quot; w:optionSet=&quot;0&quot;/&gt;&lt;w:activeWritingStyle w:lang=&quot;EN-GB&quot; w:vendorID=&quot;64&quot; w:dllVersion=&quot;0&quot; w:nlCheck=&quot;on&quot; w:optionSet=&quot;0&quot;/&gt;&lt;w:activeWritingStyle w:lang=&quot;EN-US&quot; w:vendorID=&quot;64&quot; w:dllVersion=&quot;0&quot; w:nlCheck=&quot;on&quot; w:optionSet=&quot;0&quot;/&gt;&lt;w:activeWritingStyle w:lang=&quot;ES-AR&quot; w:vendorID=&quot;64&quot; w:dllVersion=&quot;0&quot; w:nlCheck=&quot;on&quot; w:optionSet=&quot;0&quot;/&gt;&lt;w:activeWritingStyle w:lang=&quot;580A&quot; w:vendorID=&quot;64&quot; w:dllVersion=&quot;0&quot; w:nlCheck=&quot;on&quot; w:optionSet=&quot;0&quot;/&gt;&lt;w:activeWritingStyle w:lang=&quot;PT-BR&quot; w:vendorID=&quot;64&quot; w:dllVersion=&quot;0&quot; w:nlCheck=&quot;on&quot; w:optionSet=&quot;0&quot;/&gt;&lt;w:stylePaneFormatFilter w:val=&quot;3F01&quot;/&gt;&lt;w:defaultTabStop w:val=&quot;720&quot;/&gt;&lt;w:hyphenationZone w:val=&quot;425&quot;/&gt;&lt;w:characterSpacingControl w:val=&quot;DontCompress&quot;/&gt;&lt;w:optimizeForBrowser/&gt;&lt;w:validateAgainstSchema/&gt;&lt;w:saveInvalidXML w:val=&quot;off&quot;/&gt;&lt;w:ignoreMixedContent w:val=&quot;off&quot;/&gt;&lt;w:alwaysShowPlaceholderText w:val=&quot;off&quot;/&gt;&lt;w:compat&gt;&lt;w:breakWrappedTables/&gt;&lt;w:snapToGridInCell/&gt;&lt;w:applyBreakingRules/&gt;&lt;w:wrapTextWithPunct/&gt;&lt;w:useAsianBreakRules/&gt;&lt;w:useWord2002TableStyleRules/&gt;&lt;w:useFELayout/&gt;&lt;/w:compat&gt;&lt;wsp:rsids&gt;&lt;wsp:rsidRoot wsp:val=&quot;00426FBB&quot;/&gt;&lt;wsp:rsid wsp:val=&quot;000002E1&quot;/&gt;&lt;wsp:rsid wsp:val=&quot;00003C97&quot;/&gt;&lt;wsp:rsid wsp:val=&quot;00005565&quot;/&gt;&lt;wsp:rsid wsp:val=&quot;0001754A&quot;/&gt;&lt;wsp:rsid wsp:val=&quot;00017719&quot;/&gt;&lt;wsp:rsid wsp:val=&quot;00027F1D&quot;/&gt;&lt;wsp:rsid wsp:val=&quot;0003296C&quot;/&gt;&lt;wsp:rsid wsp:val=&quot;0003351F&quot;/&gt;&lt;wsp:rsid wsp:val=&quot;00044599&quot;/&gt;&lt;wsp:rsid wsp:val=&quot;000540E6&quot;/&gt;&lt;wsp:rsid wsp:val=&quot;00054421&quot;/&gt;&lt;wsp:rsid wsp:val=&quot;00062E46&quot;/&gt;&lt;wsp:rsid wsp:val=&quot;00074AC8&quot;/&gt;&lt;wsp:rsid wsp:val=&quot;00081408&quot;/&gt;&lt;wsp:rsid wsp:val=&quot;00081EBE&quot;/&gt;&lt;wsp:rsid wsp:val=&quot;00086EDC&quot;/&gt;&lt;wsp:rsid wsp:val=&quot;000B36A3&quot;/&gt;&lt;wsp:rsid wsp:val=&quot;000C013C&quot;/&gt;&lt;wsp:rsid wsp:val=&quot;000E3F84&quot;/&gt;&lt;wsp:rsid wsp:val=&quot;001056DF&quot;/&gt;&lt;wsp:rsid wsp:val=&quot;0010789C&quot;/&gt;&lt;wsp:rsid wsp:val=&quot;00114025&quot;/&gt;&lt;wsp:rsid wsp:val=&quot;001160D2&quot;/&gt;&lt;wsp:rsid wsp:val=&quot;00120636&quot;/&gt;&lt;wsp:rsid wsp:val=&quot;001348A5&quot;/&gt;&lt;wsp:rsid wsp:val=&quot;00151B8E&quot;/&gt;&lt;wsp:rsid wsp:val=&quot;00182170&quot;/&gt;&lt;wsp:rsid wsp:val=&quot;001928FB&quot;/&gt;&lt;wsp:rsid wsp:val=&quot;00192BC7&quot;/&gt;&lt;wsp:rsid wsp:val=&quot;00195BE6&quot;/&gt;&lt;wsp:rsid wsp:val=&quot;001A50EA&quot;/&gt;&lt;wsp:rsid wsp:val=&quot;001F16CD&quot;/&gt;&lt;wsp:rsid wsp:val=&quot;001F47D2&quot;/&gt;&lt;wsp:rsid wsp:val=&quot;002029C8&quot;/&gt;&lt;wsp:rsid wsp:val=&quot;0022285A&quot;/&gt;&lt;wsp:rsid wsp:val=&quot;00224C61&quot;/&gt;&lt;wsp:rsid wsp:val=&quot;00256ABC&quot;/&gt;&lt;wsp:rsid wsp:val=&quot;0027227B&quot;/&gt;&lt;wsp:rsid wsp:val=&quot;00273AC7&quot;/&gt;&lt;wsp:rsid wsp:val=&quot;00273D2C&quot;/&gt;&lt;wsp:rsid wsp:val=&quot;00285ECD&quot;/&gt;&lt;wsp:rsid wsp:val=&quot;00290E1B&quot;/&gt;&lt;wsp:rsid wsp:val=&quot;00291B17&quot;/&gt;&lt;wsp:rsid wsp:val=&quot;00291BB3&quot;/&gt;&lt;wsp:rsid wsp:val=&quot;002A6742&quot;/&gt;&lt;wsp:rsid wsp:val=&quot;002C1A7F&quot;/&gt;&lt;wsp:rsid wsp:val=&quot;002C4239&quot;/&gt;&lt;wsp:rsid wsp:val=&quot;002C559D&quot;/&gt;&lt;wsp:rsid wsp:val=&quot;002D16AE&quot;/&gt;&lt;wsp:rsid wsp:val=&quot;002D2D42&quot;/&gt;&lt;wsp:rsid wsp:val=&quot;002F72D0&quot;/&gt;&lt;wsp:rsid wsp:val=&quot;002F7A4F&quot;/&gt;&lt;wsp:rsid wsp:val=&quot;003003AB&quot;/&gt;&lt;wsp:rsid wsp:val=&quot;00302C35&quot;/&gt;&lt;wsp:rsid wsp:val=&quot;00311C49&quot;/&gt;&lt;wsp:rsid wsp:val=&quot;0032119E&quot;/&gt;&lt;wsp:rsid wsp:val=&quot;00321304&quot;/&gt;&lt;wsp:rsid wsp:val=&quot;00324FC2&quot;/&gt;&lt;wsp:rsid wsp:val=&quot;003312CA&quot;/&gt;&lt;wsp:rsid wsp:val=&quot;00331F84&quot;/&gt;&lt;wsp:rsid wsp:val=&quot;0037721F&quot;/&gt;&lt;wsp:rsid wsp:val=&quot;003950A4&quot;/&gt;&lt;wsp:rsid wsp:val=&quot;003A1E7E&quot;/&gt;&lt;wsp:rsid wsp:val=&quot;003E2069&quot;/&gt;&lt;wsp:rsid wsp:val=&quot;003E2FDC&quot;/&gt;&lt;wsp:rsid wsp:val=&quot;003E3577&quot;/&gt;&lt;wsp:rsid wsp:val=&quot;003F3A61&quot;/&gt;&lt;wsp:rsid wsp:val=&quot;00410A5D&quot;/&gt;&lt;wsp:rsid wsp:val=&quot;00414909&quot;/&gt;&lt;wsp:rsid wsp:val=&quot;00416537&quot;/&gt;&lt;wsp:rsid wsp:val=&quot;00425A6A&quot;/&gt;&lt;wsp:rsid wsp:val=&quot;00426FBB&quot;/&gt;&lt;wsp:rsid wsp:val=&quot;00454542&quot;/&gt;&lt;wsp:rsid wsp:val=&quot;0047429A&quot;/&gt;&lt;wsp:rsid wsp:val=&quot;0048374C&quot;/&gt;&lt;wsp:rsid wsp:val=&quot;0048771D&quot;/&gt;&lt;wsp:rsid wsp:val=&quot;004A6605&quot;/&gt;&lt;wsp:rsid wsp:val=&quot;004C45FA&quot;/&gt;&lt;wsp:rsid wsp:val=&quot;004D35A3&quot;/&gt;&lt;wsp:rsid wsp:val=&quot;004E1BD8&quot;/&gt;&lt;wsp:rsid wsp:val=&quot;004E452A&quot;/&gt;&lt;wsp:rsid wsp:val=&quot;004E78E3&quot;/&gt;&lt;wsp:rsid wsp:val=&quot;004F2BFE&quot;/&gt;&lt;wsp:rsid wsp:val=&quot;004F63D3&quot;/&gt;&lt;wsp:rsid wsp:val=&quot;004F7DCF&quot;/&gt;&lt;wsp:rsid wsp:val=&quot;005004BF&quot;/&gt;&lt;wsp:rsid wsp:val=&quot;00502E89&quot;/&gt;&lt;wsp:rsid wsp:val=&quot;00506CFE&quot;/&gt;&lt;wsp:rsid wsp:val=&quot;00510E95&quot;/&gt;&lt;wsp:rsid wsp:val=&quot;005225C3&quot;/&gt;&lt;wsp:rsid wsp:val=&quot;00527D56&quot;/&gt;&lt;wsp:rsid wsp:val=&quot;0053221F&quot;/&gt;&lt;wsp:rsid wsp:val=&quot;00536FAE&quot;/&gt;&lt;wsp:rsid wsp:val=&quot;00542C85&quot;/&gt;&lt;wsp:rsid wsp:val=&quot;00553510&quot;/&gt;&lt;wsp:rsid wsp:val=&quot;00554186&quot;/&gt;&lt;wsp:rsid wsp:val=&quot;00585769&quot;/&gt;&lt;wsp:rsid wsp:val=&quot;00585C61&quot;/&gt;&lt;wsp:rsid wsp:val=&quot;00591130&quot;/&gt;&lt;wsp:rsid wsp:val=&quot;005A3F28&quot;/&gt;&lt;wsp:rsid wsp:val=&quot;005A40BE&quot;/&gt;&lt;wsp:rsid wsp:val=&quot;005B13E2&quot;/&gt;&lt;wsp:rsid wsp:val=&quot;005B47D7&quot;/&gt;&lt;wsp:rsid wsp:val=&quot;005C5526&quot;/&gt;&lt;wsp:rsid wsp:val=&quot;005C62C6&quot;/&gt;&lt;wsp:rsid wsp:val=&quot;005D7B9E&quot;/&gt;&lt;wsp:rsid wsp:val=&quot;005E112E&quot;/&gt;&lt;wsp:rsid wsp:val=&quot;005F0834&quot;/&gt;&lt;wsp:rsid wsp:val=&quot;005F68AB&quot;/&gt;&lt;wsp:rsid wsp:val=&quot;005F6DC3&quot;/&gt;&lt;wsp:rsid wsp:val=&quot;00601A8E&quot;/&gt;&lt;wsp:rsid wsp:val=&quot;0062033E&quot;/&gt;&lt;wsp:rsid wsp:val=&quot;00624482&quot;/&gt;&lt;wsp:rsid wsp:val=&quot;0064799C&quot;/&gt;&lt;wsp:rsid wsp:val=&quot;00654156&quot;/&gt;&lt;wsp:rsid wsp:val=&quot;006B47CA&quot;/&gt;&lt;wsp:rsid wsp:val=&quot;006C304C&quot;/&gt;&lt;wsp:rsid wsp:val=&quot;006C4511&quot;/&gt;&lt;wsp:rsid wsp:val=&quot;006C65F5&quot;/&gt;&lt;wsp:rsid wsp:val=&quot;006C7AAA&quot;/&gt;&lt;wsp:rsid wsp:val=&quot;006D1C2A&quot;/&gt;&lt;wsp:rsid wsp:val=&quot;006D264F&quot;/&gt;&lt;wsp:rsid wsp:val=&quot;006E2A8D&quot;/&gt;&lt;wsp:rsid wsp:val=&quot;006E7574&quot;/&gt;&lt;wsp:rsid wsp:val=&quot;00703430&quot;/&gt;&lt;wsp:rsid wsp:val=&quot;00703548&quot;/&gt;&lt;wsp:rsid wsp:val=&quot;00704E18&quot;/&gt;&lt;wsp:rsid wsp:val=&quot;007069BE&quot;/&gt;&lt;wsp:rsid wsp:val=&quot;00745C86&quot;/&gt;&lt;wsp:rsid wsp:val=&quot;00764603&quot;/&gt;&lt;wsp:rsid wsp:val=&quot;0076604D&quot;/&gt;&lt;wsp:rsid wsp:val=&quot;00790909&quot;/&gt;&lt;wsp:rsid wsp:val=&quot;007B1582&quot;/&gt;&lt;wsp:rsid wsp:val=&quot;007B5A07&quot;/&gt;&lt;wsp:rsid wsp:val=&quot;007C065D&quot;/&gt;&lt;wsp:rsid wsp:val=&quot;007D3E71&quot;/&gt;&lt;wsp:rsid wsp:val=&quot;007E5D6A&quot;/&gt;&lt;wsp:rsid wsp:val=&quot;007E645D&quot;/&gt;&lt;wsp:rsid wsp:val=&quot;007F75CA&quot;/&gt;&lt;wsp:rsid wsp:val=&quot;00821E08&quot;/&gt;&lt;wsp:rsid wsp:val=&quot;00834EFD&quot;/&gt;&lt;wsp:rsid wsp:val=&quot;00844B24&quot;/&gt;&lt;wsp:rsid wsp:val=&quot;0084515F&quot;/&gt;&lt;wsp:rsid wsp:val=&quot;0085092D&quot;/&gt;&lt;wsp:rsid wsp:val=&quot;00865414&quot;/&gt;&lt;wsp:rsid wsp:val=&quot;00877D4C&quot;/&gt;&lt;wsp:rsid wsp:val=&quot;00883903&quot;/&gt;&lt;wsp:rsid wsp:val=&quot;0089763B&quot;/&gt;&lt;wsp:rsid wsp:val=&quot;008B6AE3&quot;/&gt;&lt;wsp:rsid wsp:val=&quot;008C1332&quot;/&gt;&lt;wsp:rsid wsp:val=&quot;008D1045&quot;/&gt;&lt;wsp:rsid wsp:val=&quot;008E5996&quot;/&gt;&lt;wsp:rsid wsp:val=&quot;00901AE1&quot;/&gt;&lt;wsp:rsid wsp:val=&quot;00912F93&quot;/&gt;&lt;wsp:rsid wsp:val=&quot;009205B4&quot;/&gt;&lt;wsp:rsid wsp:val=&quot;00955B59&quot;/&gt;&lt;wsp:rsid wsp:val=&quot;00992262&quot;/&gt;&lt;wsp:rsid wsp:val=&quot;009926BC&quot;/&gt;&lt;wsp:rsid wsp:val=&quot;009A4319&quot;/&gt;&lt;wsp:rsid wsp:val=&quot;009A6C3F&quot;/&gt;&lt;wsp:rsid wsp:val=&quot;009B73F2&quot;/&gt;&lt;wsp:rsid wsp:val=&quot;009C12BD&quot;/&gt;&lt;wsp:rsid wsp:val=&quot;009C50FE&quot;/&gt;&lt;wsp:rsid wsp:val=&quot;009E49DD&quot;/&gt;&lt;wsp:rsid wsp:val=&quot;00A03E75&quot;/&gt;&lt;wsp:rsid wsp:val=&quot;00A20627&quot;/&gt;&lt;wsp:rsid wsp:val=&quot;00A22FE9&quot;/&gt;&lt;wsp:rsid wsp:val=&quot;00A31A44&quot;/&gt;&lt;wsp:rsid wsp:val=&quot;00A32BFA&quot;/&gt;&lt;wsp:rsid wsp:val=&quot;00A3325E&quot;/&gt;&lt;wsp:rsid wsp:val=&quot;00A45FCE&quot;/&gt;&lt;wsp:rsid wsp:val=&quot;00A75671&quot;/&gt;&lt;wsp:rsid wsp:val=&quot;00A773CC&quot;/&gt;&lt;wsp:rsid wsp:val=&quot;00A924D0&quot;/&gt;&lt;wsp:rsid wsp:val=&quot;00A9318B&quot;/&gt;&lt;wsp:rsid wsp:val=&quot;00A94AC1&quot;/&gt;&lt;wsp:rsid wsp:val=&quot;00AB18B7&quot;/&gt;&lt;wsp:rsid wsp:val=&quot;00AD335D&quot;/&gt;&lt;wsp:rsid wsp:val=&quot;00AF114C&quot;/&gt;&lt;wsp:rsid wsp:val=&quot;00AF792B&quot;/&gt;&lt;wsp:rsid wsp:val=&quot;00B33D2F&quot;/&gt;&lt;wsp:rsid wsp:val=&quot;00B40A5B&quot;/&gt;&lt;wsp:rsid wsp:val=&quot;00B45C6B&quot;/&gt;&lt;wsp:rsid wsp:val=&quot;00B55D5E&quot;/&gt;&lt;wsp:rsid wsp:val=&quot;00B57A80&quot;/&gt;&lt;wsp:rsid wsp:val=&quot;00B70E9C&quot;/&gt;&lt;wsp:rsid wsp:val=&quot;00B713D8&quot;/&gt;&lt;wsp:rsid wsp:val=&quot;00B72979&quot;/&gt;&lt;wsp:rsid wsp:val=&quot;00B94516&quot;/&gt;&lt;wsp:rsid wsp:val=&quot;00BA25E2&quot;/&gt;&lt;wsp:rsid wsp:val=&quot;00BB2855&quot;/&gt;&lt;wsp:rsid wsp:val=&quot;00BC5343&quot;/&gt;&lt;wsp:rsid wsp:val=&quot;00BD19C1&quot;/&gt;&lt;wsp:rsid wsp:val=&quot;00BD25B8&quot;/&gt;&lt;wsp:rsid wsp:val=&quot;00C012E1&quot;/&gt;&lt;wsp:rsid wsp:val=&quot;00C06BB4&quot;/&gt;&lt;wsp:rsid wsp:val=&quot;00C10D20&quot;/&gt;&lt;wsp:rsid wsp:val=&quot;00C12E0C&quot;/&gt;&lt;wsp:rsid wsp:val=&quot;00C21916&quot;/&gt;&lt;wsp:rsid wsp:val=&quot;00C34915&quot;/&gt;&lt;wsp:rsid wsp:val=&quot;00C457CA&quot;/&gt;&lt;wsp:rsid wsp:val=&quot;00C53FB6&quot;/&gt;&lt;wsp:rsid wsp:val=&quot;00C57FB7&quot;/&gt;&lt;wsp:rsid wsp:val=&quot;00C644D4&quot;/&gt;&lt;wsp:rsid wsp:val=&quot;00C65F3F&quot;/&gt;&lt;wsp:rsid wsp:val=&quot;00C72414&quot;/&gt;&lt;wsp:rsid wsp:val=&quot;00C72B1A&quot;/&gt;&lt;wsp:rsid wsp:val=&quot;00C8667B&quot;/&gt;&lt;wsp:rsid wsp:val=&quot;00C90993&quot;/&gt;&lt;wsp:rsid wsp:val=&quot;00CA4CE3&quot;/&gt;&lt;wsp:rsid wsp:val=&quot;00CC72FD&quot;/&gt;&lt;wsp:rsid wsp:val=&quot;00CD4F3F&quot;/&gt;&lt;wsp:rsid wsp:val=&quot;00D311F8&quot;/&gt;&lt;wsp:rsid wsp:val=&quot;00D31660&quot;/&gt;&lt;wsp:rsid wsp:val=&quot;00D36B52&quot;/&gt;&lt;wsp:rsid wsp:val=&quot;00D377C8&quot;/&gt;&lt;wsp:rsid wsp:val=&quot;00D41274&quot;/&gt;&lt;wsp:rsid wsp:val=&quot;00D4229C&quot;/&gt;&lt;wsp:rsid wsp:val=&quot;00D43BF3&quot;/&gt;&lt;wsp:rsid wsp:val=&quot;00D549FB&quot;/&gt;&lt;wsp:rsid wsp:val=&quot;00D767BB&quot;/&gt;&lt;wsp:rsid wsp:val=&quot;00D939B0&quot;/&gt;&lt;wsp:rsid wsp:val=&quot;00DA31A2&quot;/&gt;&lt;wsp:rsid wsp:val=&quot;00DB16E0&quot;/&gt;&lt;wsp:rsid wsp:val=&quot;00DB2DF9&quot;/&gt;&lt;wsp:rsid wsp:val=&quot;00DB465D&quot;/&gt;&lt;wsp:rsid wsp:val=&quot;00DB48A2&quot;/&gt;&lt;wsp:rsid wsp:val=&quot;00DB7E63&quot;/&gt;&lt;wsp:rsid wsp:val=&quot;00DC2055&quot;/&gt;&lt;wsp:rsid wsp:val=&quot;00DC3908&quot;/&gt;&lt;wsp:rsid wsp:val=&quot;00DD71E8&quot;/&gt;&lt;wsp:rsid wsp:val=&quot;00DD7F83&quot;/&gt;&lt;wsp:rsid wsp:val=&quot;00DE4EB8&quot;/&gt;&lt;wsp:rsid wsp:val=&quot;00E0641E&quot;/&gt;&lt;wsp:rsid wsp:val=&quot;00E06664&quot;/&gt;&lt;wsp:rsid wsp:val=&quot;00E304BC&quot;/&gt;&lt;wsp:rsid wsp:val=&quot;00E32853&quot;/&gt;&lt;wsp:rsid wsp:val=&quot;00E34EBD&quot;/&gt;&lt;wsp:rsid wsp:val=&quot;00E401F8&quot;/&gt;&lt;wsp:rsid wsp:val=&quot;00E46425&quot;/&gt;&lt;wsp:rsid wsp:val=&quot;00E469FC&quot;/&gt;&lt;wsp:rsid wsp:val=&quot;00E47D0E&quot;/&gt;&lt;wsp:rsid wsp:val=&quot;00E65018&quot;/&gt;&lt;wsp:rsid wsp:val=&quot;00E76CA1&quot;/&gt;&lt;wsp:rsid wsp:val=&quot;00E94339&quot;/&gt;&lt;wsp:rsid wsp:val=&quot;00E97563&quot;/&gt;&lt;wsp:rsid wsp:val=&quot;00EB0B63&quot;/&gt;&lt;wsp:rsid wsp:val=&quot;00EC265C&quot;/&gt;&lt;wsp:rsid wsp:val=&quot;00ED61CB&quot;/&gt;&lt;wsp:rsid wsp:val=&quot;00EE752A&quot;/&gt;&lt;wsp:rsid wsp:val=&quot;00F06A72&quot;/&gt;&lt;wsp:rsid wsp:val=&quot;00F136F0&quot;/&gt;&lt;wsp:rsid wsp:val=&quot;00F20BBB&quot;/&gt;&lt;wsp:rsid wsp:val=&quot;00F36048&quot;/&gt;&lt;wsp:rsid wsp:val=&quot;00F43BD8&quot;/&gt;&lt;wsp:rsid wsp:val=&quot;00F562F3&quot;/&gt;&lt;wsp:rsid wsp:val=&quot;00F74B89&quot;/&gt;&lt;wsp:rsid wsp:val=&quot;00F75133&quot;/&gt;&lt;wsp:rsid wsp:val=&quot;00F83272&quot;/&gt;&lt;wsp:rsid wsp:val=&quot;00F9358D&quot;/&gt;&lt;wsp:rsid wsp:val=&quot;00FA3899&quot;/&gt;&lt;wsp:rsid wsp:val=&quot;00FA4909&quot;/&gt;&lt;wsp:rsid wsp:val=&quot;00FA5164&quot;/&gt;&lt;wsp:rsid wsp:val=&quot;00FA6751&quot;/&gt;&lt;wsp:rsid wsp:val=&quot;00FA6BD7&quot;/&gt;&lt;wsp:rsid wsp:val=&quot;00FB1048&quot;/&gt;&lt;wsp:rsid wsp:val=&quot;00FB62C4&quot;/&gt;&lt;wsp:rsid wsp:val=&quot;00FB7701&quot;/&gt;&lt;wsp:rsid wsp:val=&quot;00FD1AC5&quot;/&gt;&lt;wsp:rsid wsp:val=&quot;00FD5CF0&quot;/&gt;&lt;/wsp:rsids&gt;&lt;/w:docPr&gt;&lt;w:body&gt;&lt;wx:sect&gt;&lt;w:p wsp:rsidR=&quot;003E2069&quot; wsp:rsidRDefault=&quot;003E2069&quot; wsp:rsidP=&quot;003E2069&quot;&gt;&lt;m:oMathPara&gt;&lt;m:oMath&gt;&lt;m:sSub&gt;&lt;m:sSubPr&gt;&lt;m:ctrlPr&gt;&lt;w:rPr&gt;&lt;w:rFonts w:ascii=&quot;Cambria Math&quot; w:h-ansi=&quot;Cambria Math&quot;/&gt;&lt;wx:font wx:val=&quot;Cambria Math&quot;/&gt;&lt;w:i/&gt;&lt;/w:rPr&gt;&lt;/m:ctrlPr&gt;&lt;/m:sSubPr&gt;&lt;m:e&gt;&lt;m:r&gt;&lt;w:rPr&gt;&lt;w:rFonts w:ascii=&quot;Cambria Math&quot; w:h-ansi=&quot;Cambria Math&quot;/&gt;&lt;wx:font wx:val=&quot;Cambria Math&quot;/&gt;&lt;w:i/&gt;&lt;/w:rPr&gt;&lt;m:t&gt;V&lt;/m:t&gt;&lt;/m:r&gt;&lt;/m:e&gt;&lt;m:sub&gt;&lt;m:r&gt;&lt;w:rPr&gt;&lt;w:rFonts w:ascii=&quot;Cambria Math&quot; w:h-ansi=&quot;Cambria Math&quot;/&gt;&lt;wx:font wx:val=&quot;Cambria Math&quot;/&gt;&lt;w:i/&gt;&lt;/w:rPr&gt;&lt;m:t&gt;in&lt;/m:t&gt;&lt;/m:r&gt;&lt;/m:sub&gt;&lt;/m:sSub&gt;&lt;/m:oMath&gt;&lt;/m:oMathPara&gt;&lt;/w:p&gt;&lt;w:sectPr wsp:rsidR=&quot;00000000&quot;&gt;&lt;w:pgSz w:w=&quot;12240&quot; w:h=&quot;15840&quot;/&gt;&lt;w:pgMar w:top=&quot;1440&quot; w:right=&quot;1440&quot; w:bottom=&quot;1440&quot; w:left=&quot;1440&quot; w:header=&quot;720&quot; w:footer=&quot;720&quot; w:gutter=&quot;0&quot;/&gt;&lt;w:cols w:space=&quot;720&quot;/&gt;&lt;/w:sectPr&gt;&lt;/wx:sect&gt;&lt;/w:body&gt;&lt;/w:wordDocument&gt;">
+          <v:shape id="_x0000_i1029" type="#_x0000_t75" style="width:15.25pt;height:13.85pt" equationxml="&lt;?xml version=&quot;1.0&quot; encoding=&quot;UTF-8&quot; standalone=&quot;yes&quot;?&gt;&#10;&lt;?mso-application progid=&quot;Word.Document&quot;?&gt;&#10;&lt;w:wordDocument xmlns:aml=&quot;http://schemas.microsoft.com/aml/2001/core&quot; xmlns:wpc=&quot;http://schemas.microsoft.com/office/word/2010/wordprocessingCanvas&quot; xmlns:cx=&quot;http://schemas.microsoft.com/office/drawing/2014/chartex&quot; xmlns:cx1=&quot;http://schemas.microsoft.com/office/drawing/2015/9/8/chartex&quot; xmlns:cx2=&quot;http://schemas.microsoft.com/office/drawing/2015/10/21/chartex&quot; xmlns:cx3=&quot;http://schemas.microsoft.com/office/drawing/2016/5/9/chartex&quot; xmlns:cx4=&quot;http://schemas.microsoft.com/office/drawing/2016/5/10/chartex&quot; xmlns:cx5=&quot;http://schemas.microsoft.com/office/drawing/2016/5/11/chartex&quot; xmlns:cx6=&quot;http://schemas.microsoft.com/office/drawing/2016/5/12/chartex&quot; xmlns:cx7=&quot;http://schemas.microsoft.com/office/drawing/2016/5/13/chartex&quot; xmlns:cx8=&quot;http://schemas.microsoft.com/office/drawing/2016/5/14/chartex&quot; xmlns:cr=&quot;http://schemas.microsoft.com/office/comments/2020/reactions&quot; xmlns:dt=&quot;uuid:C2F41010-65B3-11d1-A29F-00AA00C14882&quot; xmlns:mc=&quot;http://schemas.openxmlformats.org/markup-compatibility/2006&quot; xmlns:aink=&quot;http://schemas.microsoft.com/office/drawing/2016/ink&quot; xmlns:am3d=&quot;http://schemas.microsoft.com/office/drawing/2017/model3d&quot; xmlns:o=&quot;urn:schemas-microsoft-com:office:office&quot; xmlns:oel=&quot;http://schemas.microsoft.com/office/2019/extlst&quot; xmlns:m=&quot;http://schemas.openxmlformats.org/officeDocument/2006/math&quot; xmlns:v=&quot;urn:schemas-microsoft-com:vml&quot; xmlns:w10=&quot;urn:schemas-microsoft-com:office:word&quot; xmlns:w=&quot;http://schemas.microsoft.com/office/word/2003/wordml&quot; xmlns:wx=&quot;http://schemas.microsoft.com/office/word/2003/auxHint&quot; xmlns:wne=&quot;http://schemas.microsoft.com/office/word/2006/wordml&quot; xmlns:wsp=&quot;http://schemas.microsoft.com/office/word/2003/wordml/sp2&quot; xmlns:sl=&quot;http://schemas.microsoft.com/schemaLibrary/2003/core&quot; w:macrosPresent=&quot;no&quot; w:embeddedObjPresent=&quot;no&quot; w:ocxPresent=&quot;no&quot; xml:space=&quot;preserve&quot;&gt;&lt;w:ignoreSubtree w:val=&quot;http://schemas.microsoft.com/office/word/2003/wordml/sp2&quot;/&gt;&lt;o:DocumentProperties&gt;&lt;o:Version&gt;16&lt;/o:Version&gt;&lt;/o:DocumentProperties&gt;&lt;w:docPr&gt;&lt;w:view w:val=&quot;print&quot;/&gt;&lt;w:zoom w:percent=&quot;100&quot;/&gt;&lt;w:doNotEmbedSystemFonts/&gt;&lt;w:activeWritingStyle w:lang=&quot;EN-AU&quot; w:vendorID=&quot;64&quot; w:dllVersion=&quot;6&quot; w:nlCheck=&quot;on&quot; w:optionSet=&quot;1&quot;/&gt;&lt;w:activeWritingStyle w:lang=&quot;EN-GB&quot; w:vendorID=&quot;64&quot; w:dllVersion=&quot;6&quot; w:nlCheck=&quot;on&quot; w:optionSet=&quot;1&quot;/&gt;&lt;w:activeWritingStyle w:lang=&quot;EN-US&quot; w:vendorID=&quot;64&quot; w:dllVersion=&quot;6&quot; w:nlCheck=&quot;on&quot; w:optionSet=&quot;1&quot;/&gt;&lt;w:activeWritingStyle w:lang=&quot;EN-AU&quot; w:vendorID=&quot;64&quot; w:dllVersion=&quot;0&quot; w:nlCheck=&quot;on&quot; w:optionSet=&quot;0&quot;/&gt;&lt;w:activeWritingStyle w:lang=&quot;EN-GB&quot; w:vendorID=&quot;64&quot; w:dllVersion=&quot;0&quot; w:nlCheck=&quot;on&quot; w:optionSet=&quot;0&quot;/&gt;&lt;w:activeWritingStyle w:lang=&quot;EN-US&quot; w:vendorID=&quot;64&quot; w:dllVersion=&quot;0&quot; w:nlCheck=&quot;on&quot; w:optionSet=&quot;0&quot;/&gt;&lt;w:activeWritingStyle w:lang=&quot;ES-AR&quot; w:vendorID=&quot;64&quot; w:dllVersion=&quot;0&quot; w:nlCheck=&quot;on&quot; w:optionSet=&quot;0&quot;/&gt;&lt;w:activeWritingStyle w:lang=&quot;580A&quot; w:vendorID=&quot;64&quot; w:dllVersion=&quot;0&quot; w:nlCheck=&quot;on&quot; w:optionSet=&quot;0&quot;/&gt;&lt;w:activeWritingStyle w:lang=&quot;PT-BR&quot; w:vendorID=&quot;64&quot; w:dllVersion=&quot;0&quot; w:nlCheck=&quot;on&quot; w:optionSet=&quot;0&quot;/&gt;&lt;w:stylePaneFormatFilter w:val=&quot;3F01&quot;/&gt;&lt;w:defaultTabStop w:val=&quot;720&quot;/&gt;&lt;w:hyphenationZone w:val=&quot;425&quot;/&gt;&lt;w:characterSpacingControl w:val=&quot;DontCompress&quot;/&gt;&lt;w:optimizeForBrowser/&gt;&lt;w:validateAgainstSchema/&gt;&lt;w:saveInvalidXML w:val=&quot;off&quot;/&gt;&lt;w:ignoreMixedContent w:val=&quot;off&quot;/&gt;&lt;w:alwaysShowPlaceholderText w:val=&quot;off&quot;/&gt;&lt;w:compat&gt;&lt;w:breakWrappedTables/&gt;&lt;w:snapToGridInCell/&gt;&lt;w:applyBreakingRules/&gt;&lt;w:wrapTextWithPunct/&gt;&lt;w:useAsianBreakRules/&gt;&lt;w:useWord2002TableStyleRules/&gt;&lt;w:useFELayout/&gt;&lt;/w:compat&gt;&lt;wsp:rsids&gt;&lt;wsp:rsidRoot wsp:val=&quot;00426FBB&quot;/&gt;&lt;wsp:rsid wsp:val=&quot;000002E1&quot;/&gt;&lt;wsp:rsid wsp:val=&quot;00003C97&quot;/&gt;&lt;wsp:rsid wsp:val=&quot;00005565&quot;/&gt;&lt;wsp:rsid wsp:val=&quot;0001754A&quot;/&gt;&lt;wsp:rsid wsp:val=&quot;00017719&quot;/&gt;&lt;wsp:rsid wsp:val=&quot;00027F1D&quot;/&gt;&lt;wsp:rsid wsp:val=&quot;0003296C&quot;/&gt;&lt;wsp:rsid wsp:val=&quot;0003351F&quot;/&gt;&lt;wsp:rsid wsp:val=&quot;00044599&quot;/&gt;&lt;wsp:rsid wsp:val=&quot;000540E6&quot;/&gt;&lt;wsp:rsid wsp:val=&quot;00054421&quot;/&gt;&lt;wsp:rsid wsp:val=&quot;00062E46&quot;/&gt;&lt;wsp:rsid wsp:val=&quot;00074AC8&quot;/&gt;&lt;wsp:rsid wsp:val=&quot;00081408&quot;/&gt;&lt;wsp:rsid wsp:val=&quot;00081EBE&quot;/&gt;&lt;wsp:rsid wsp:val=&quot;00086EDC&quot;/&gt;&lt;wsp:rsid wsp:val=&quot;000B36A3&quot;/&gt;&lt;wsp:rsid wsp:val=&quot;000C013C&quot;/&gt;&lt;wsp:rsid wsp:val=&quot;000E3F84&quot;/&gt;&lt;wsp:rsid wsp:val=&quot;001056DF&quot;/&gt;&lt;wsp:rsid wsp:val=&quot;0010789C&quot;/&gt;&lt;wsp:rsid wsp:val=&quot;00114025&quot;/&gt;&lt;wsp:rsid wsp:val=&quot;001160D2&quot;/&gt;&lt;wsp:rsid wsp:val=&quot;00120636&quot;/&gt;&lt;wsp:rsid wsp:val=&quot;001348A5&quot;/&gt;&lt;wsp:rsid wsp:val=&quot;00151B8E&quot;/&gt;&lt;wsp:rsid wsp:val=&quot;00182170&quot;/&gt;&lt;wsp:rsid wsp:val=&quot;001928FB&quot;/&gt;&lt;wsp:rsid wsp:val=&quot;00192BC7&quot;/&gt;&lt;wsp:rsid wsp:val=&quot;00195BE6&quot;/&gt;&lt;wsp:rsid wsp:val=&quot;001A50EA&quot;/&gt;&lt;wsp:rsid wsp:val=&quot;001F16CD&quot;/&gt;&lt;wsp:rsid wsp:val=&quot;001F47D2&quot;/&gt;&lt;wsp:rsid wsp:val=&quot;002029C8&quot;/&gt;&lt;wsp:rsid wsp:val=&quot;0022285A&quot;/&gt;&lt;wsp:rsid wsp:val=&quot;00224C61&quot;/&gt;&lt;wsp:rsid wsp:val=&quot;00256ABC&quot;/&gt;&lt;wsp:rsid wsp:val=&quot;0027227B&quot;/&gt;&lt;wsp:rsid wsp:val=&quot;00273AC7&quot;/&gt;&lt;wsp:rsid wsp:val=&quot;00273D2C&quot;/&gt;&lt;wsp:rsid wsp:val=&quot;00285ECD&quot;/&gt;&lt;wsp:rsid wsp:val=&quot;00290E1B&quot;/&gt;&lt;wsp:rsid wsp:val=&quot;00291B17&quot;/&gt;&lt;wsp:rsid wsp:val=&quot;00291BB3&quot;/&gt;&lt;wsp:rsid wsp:val=&quot;002A6742&quot;/&gt;&lt;wsp:rsid wsp:val=&quot;002C1A7F&quot;/&gt;&lt;wsp:rsid wsp:val=&quot;002C4239&quot;/&gt;&lt;wsp:rsid wsp:val=&quot;002C559D&quot;/&gt;&lt;wsp:rsid wsp:val=&quot;002D16AE&quot;/&gt;&lt;wsp:rsid wsp:val=&quot;002D2D42&quot;/&gt;&lt;wsp:rsid wsp:val=&quot;002F72D0&quot;/&gt;&lt;wsp:rsid wsp:val=&quot;002F7A4F&quot;/&gt;&lt;wsp:rsid wsp:val=&quot;003003AB&quot;/&gt;&lt;wsp:rsid wsp:val=&quot;00302C35&quot;/&gt;&lt;wsp:rsid wsp:val=&quot;00311C49&quot;/&gt;&lt;wsp:rsid wsp:val=&quot;0032119E&quot;/&gt;&lt;wsp:rsid wsp:val=&quot;00321304&quot;/&gt;&lt;wsp:rsid wsp:val=&quot;00324FC2&quot;/&gt;&lt;wsp:rsid wsp:val=&quot;003312CA&quot;/&gt;&lt;wsp:rsid wsp:val=&quot;00331F84&quot;/&gt;&lt;wsp:rsid wsp:val=&quot;0037721F&quot;/&gt;&lt;wsp:rsid wsp:val=&quot;003950A4&quot;/&gt;&lt;wsp:rsid wsp:val=&quot;003A1E7E&quot;/&gt;&lt;wsp:rsid wsp:val=&quot;003E2069&quot;/&gt;&lt;wsp:rsid wsp:val=&quot;003E2FDC&quot;/&gt;&lt;wsp:rsid wsp:val=&quot;003E3577&quot;/&gt;&lt;wsp:rsid wsp:val=&quot;003F3A61&quot;/&gt;&lt;wsp:rsid wsp:val=&quot;00410A5D&quot;/&gt;&lt;wsp:rsid wsp:val=&quot;00414909&quot;/&gt;&lt;wsp:rsid wsp:val=&quot;00416537&quot;/&gt;&lt;wsp:rsid wsp:val=&quot;00425A6A&quot;/&gt;&lt;wsp:rsid wsp:val=&quot;00426FBB&quot;/&gt;&lt;wsp:rsid wsp:val=&quot;00454542&quot;/&gt;&lt;wsp:rsid wsp:val=&quot;0047429A&quot;/&gt;&lt;wsp:rsid wsp:val=&quot;0048374C&quot;/&gt;&lt;wsp:rsid wsp:val=&quot;0048771D&quot;/&gt;&lt;wsp:rsid wsp:val=&quot;004A6605&quot;/&gt;&lt;wsp:rsid wsp:val=&quot;004C45FA&quot;/&gt;&lt;wsp:rsid wsp:val=&quot;004D35A3&quot;/&gt;&lt;wsp:rsid wsp:val=&quot;004E1BD8&quot;/&gt;&lt;wsp:rsid wsp:val=&quot;004E452A&quot;/&gt;&lt;wsp:rsid wsp:val=&quot;004E78E3&quot;/&gt;&lt;wsp:rsid wsp:val=&quot;004F2BFE&quot;/&gt;&lt;wsp:rsid wsp:val=&quot;004F63D3&quot;/&gt;&lt;wsp:rsid wsp:val=&quot;004F7DCF&quot;/&gt;&lt;wsp:rsid wsp:val=&quot;005004BF&quot;/&gt;&lt;wsp:rsid wsp:val=&quot;00502E89&quot;/&gt;&lt;wsp:rsid wsp:val=&quot;00506CFE&quot;/&gt;&lt;wsp:rsid wsp:val=&quot;00510E95&quot;/&gt;&lt;wsp:rsid wsp:val=&quot;005225C3&quot;/&gt;&lt;wsp:rsid wsp:val=&quot;00527D56&quot;/&gt;&lt;wsp:rsid wsp:val=&quot;0053221F&quot;/&gt;&lt;wsp:rsid wsp:val=&quot;00536FAE&quot;/&gt;&lt;wsp:rsid wsp:val=&quot;00542C85&quot;/&gt;&lt;wsp:rsid wsp:val=&quot;00553510&quot;/&gt;&lt;wsp:rsid wsp:val=&quot;00554186&quot;/&gt;&lt;wsp:rsid wsp:val=&quot;00585769&quot;/&gt;&lt;wsp:rsid wsp:val=&quot;00585C61&quot;/&gt;&lt;wsp:rsid wsp:val=&quot;00591130&quot;/&gt;&lt;wsp:rsid wsp:val=&quot;005A3F28&quot;/&gt;&lt;wsp:rsid wsp:val=&quot;005A40BE&quot;/&gt;&lt;wsp:rsid wsp:val=&quot;005B13E2&quot;/&gt;&lt;wsp:rsid wsp:val=&quot;005B47D7&quot;/&gt;&lt;wsp:rsid wsp:val=&quot;005C5526&quot;/&gt;&lt;wsp:rsid wsp:val=&quot;005C62C6&quot;/&gt;&lt;wsp:rsid wsp:val=&quot;005D7B9E&quot;/&gt;&lt;wsp:rsid wsp:val=&quot;005E112E&quot;/&gt;&lt;wsp:rsid wsp:val=&quot;005F0834&quot;/&gt;&lt;wsp:rsid wsp:val=&quot;005F68AB&quot;/&gt;&lt;wsp:rsid wsp:val=&quot;005F6DC3&quot;/&gt;&lt;wsp:rsid wsp:val=&quot;00601A8E&quot;/&gt;&lt;wsp:rsid wsp:val=&quot;0062033E&quot;/&gt;&lt;wsp:rsid wsp:val=&quot;00624482&quot;/&gt;&lt;wsp:rsid wsp:val=&quot;0064799C&quot;/&gt;&lt;wsp:rsid wsp:val=&quot;00654156&quot;/&gt;&lt;wsp:rsid wsp:val=&quot;006B47CA&quot;/&gt;&lt;wsp:rsid wsp:val=&quot;006C304C&quot;/&gt;&lt;wsp:rsid wsp:val=&quot;006C4511&quot;/&gt;&lt;wsp:rsid wsp:val=&quot;006C65F5&quot;/&gt;&lt;wsp:rsid wsp:val=&quot;006C7AAA&quot;/&gt;&lt;wsp:rsid wsp:val=&quot;006D1C2A&quot;/&gt;&lt;wsp:rsid wsp:val=&quot;006D264F&quot;/&gt;&lt;wsp:rsid wsp:val=&quot;006E2A8D&quot;/&gt;&lt;wsp:rsid wsp:val=&quot;006E7574&quot;/&gt;&lt;wsp:rsid wsp:val=&quot;00703430&quot;/&gt;&lt;wsp:rsid wsp:val=&quot;00703548&quot;/&gt;&lt;wsp:rsid wsp:val=&quot;00704E18&quot;/&gt;&lt;wsp:rsid wsp:val=&quot;007069BE&quot;/&gt;&lt;wsp:rsid wsp:val=&quot;00745C86&quot;/&gt;&lt;wsp:rsid wsp:val=&quot;00764603&quot;/&gt;&lt;wsp:rsid wsp:val=&quot;0076604D&quot;/&gt;&lt;wsp:rsid wsp:val=&quot;00790909&quot;/&gt;&lt;wsp:rsid wsp:val=&quot;007B1582&quot;/&gt;&lt;wsp:rsid wsp:val=&quot;007B5A07&quot;/&gt;&lt;wsp:rsid wsp:val=&quot;007C065D&quot;/&gt;&lt;wsp:rsid wsp:val=&quot;007D3E71&quot;/&gt;&lt;wsp:rsid wsp:val=&quot;007E5D6A&quot;/&gt;&lt;wsp:rsid wsp:val=&quot;007E645D&quot;/&gt;&lt;wsp:rsid wsp:val=&quot;007F75CA&quot;/&gt;&lt;wsp:rsid wsp:val=&quot;00821E08&quot;/&gt;&lt;wsp:rsid wsp:val=&quot;00834EFD&quot;/&gt;&lt;wsp:rsid wsp:val=&quot;00844B24&quot;/&gt;&lt;wsp:rsid wsp:val=&quot;0084515F&quot;/&gt;&lt;wsp:rsid wsp:val=&quot;0085092D&quot;/&gt;&lt;wsp:rsid wsp:val=&quot;00865414&quot;/&gt;&lt;wsp:rsid wsp:val=&quot;00877D4C&quot;/&gt;&lt;wsp:rsid wsp:val=&quot;00883903&quot;/&gt;&lt;wsp:rsid wsp:val=&quot;0089763B&quot;/&gt;&lt;wsp:rsid wsp:val=&quot;008B6AE3&quot;/&gt;&lt;wsp:rsid wsp:val=&quot;008C1332&quot;/&gt;&lt;wsp:rsid wsp:val=&quot;008D1045&quot;/&gt;&lt;wsp:rsid wsp:val=&quot;008E5996&quot;/&gt;&lt;wsp:rsid wsp:val=&quot;00901AE1&quot;/&gt;&lt;wsp:rsid wsp:val=&quot;00912F93&quot;/&gt;&lt;wsp:rsid wsp:val=&quot;009205B4&quot;/&gt;&lt;wsp:rsid wsp:val=&quot;00955B59&quot;/&gt;&lt;wsp:rsid wsp:val=&quot;00992262&quot;/&gt;&lt;wsp:rsid wsp:val=&quot;009926BC&quot;/&gt;&lt;wsp:rsid wsp:val=&quot;009A4319&quot;/&gt;&lt;wsp:rsid wsp:val=&quot;009A6C3F&quot;/&gt;&lt;wsp:rsid wsp:val=&quot;009B73F2&quot;/&gt;&lt;wsp:rsid wsp:val=&quot;009C12BD&quot;/&gt;&lt;wsp:rsid wsp:val=&quot;009C50FE&quot;/&gt;&lt;wsp:rsid wsp:val=&quot;009E49DD&quot;/&gt;&lt;wsp:rsid wsp:val=&quot;00A03E75&quot;/&gt;&lt;wsp:rsid wsp:val=&quot;00A20627&quot;/&gt;&lt;wsp:rsid wsp:val=&quot;00A22FE9&quot;/&gt;&lt;wsp:rsid wsp:val=&quot;00A31A44&quot;/&gt;&lt;wsp:rsid wsp:val=&quot;00A32BFA&quot;/&gt;&lt;wsp:rsid wsp:val=&quot;00A3325E&quot;/&gt;&lt;wsp:rsid wsp:val=&quot;00A45FCE&quot;/&gt;&lt;wsp:rsid wsp:val=&quot;00A75671&quot;/&gt;&lt;wsp:rsid wsp:val=&quot;00A773CC&quot;/&gt;&lt;wsp:rsid wsp:val=&quot;00A924D0&quot;/&gt;&lt;wsp:rsid wsp:val=&quot;00A9318B&quot;/&gt;&lt;wsp:rsid wsp:val=&quot;00A94AC1&quot;/&gt;&lt;wsp:rsid wsp:val=&quot;00AB18B7&quot;/&gt;&lt;wsp:rsid wsp:val=&quot;00AD335D&quot;/&gt;&lt;wsp:rsid wsp:val=&quot;00AF114C&quot;/&gt;&lt;wsp:rsid wsp:val=&quot;00AF792B&quot;/&gt;&lt;wsp:rsid wsp:val=&quot;00B33D2F&quot;/&gt;&lt;wsp:rsid wsp:val=&quot;00B40A5B&quot;/&gt;&lt;wsp:rsid wsp:val=&quot;00B45C6B&quot;/&gt;&lt;wsp:rsid wsp:val=&quot;00B55D5E&quot;/&gt;&lt;wsp:rsid wsp:val=&quot;00B57A80&quot;/&gt;&lt;wsp:rsid wsp:val=&quot;00B70E9C&quot;/&gt;&lt;wsp:rsid wsp:val=&quot;00B713D8&quot;/&gt;&lt;wsp:rsid wsp:val=&quot;00B72979&quot;/&gt;&lt;wsp:rsid wsp:val=&quot;00B94516&quot;/&gt;&lt;wsp:rsid wsp:val=&quot;00BA25E2&quot;/&gt;&lt;wsp:rsid wsp:val=&quot;00BB2855&quot;/&gt;&lt;wsp:rsid wsp:val=&quot;00BC5343&quot;/&gt;&lt;wsp:rsid wsp:val=&quot;00BD19C1&quot;/&gt;&lt;wsp:rsid wsp:val=&quot;00BD25B8&quot;/&gt;&lt;wsp:rsid wsp:val=&quot;00C012E1&quot;/&gt;&lt;wsp:rsid wsp:val=&quot;00C06BB4&quot;/&gt;&lt;wsp:rsid wsp:val=&quot;00C10D20&quot;/&gt;&lt;wsp:rsid wsp:val=&quot;00C12E0C&quot;/&gt;&lt;wsp:rsid wsp:val=&quot;00C21916&quot;/&gt;&lt;wsp:rsid wsp:val=&quot;00C34915&quot;/&gt;&lt;wsp:rsid wsp:val=&quot;00C457CA&quot;/&gt;&lt;wsp:rsid wsp:val=&quot;00C53FB6&quot;/&gt;&lt;wsp:rsid wsp:val=&quot;00C57FB7&quot;/&gt;&lt;wsp:rsid wsp:val=&quot;00C644D4&quot;/&gt;&lt;wsp:rsid wsp:val=&quot;00C65F3F&quot;/&gt;&lt;wsp:rsid wsp:val=&quot;00C72414&quot;/&gt;&lt;wsp:rsid wsp:val=&quot;00C72B1A&quot;/&gt;&lt;wsp:rsid wsp:val=&quot;00C8667B&quot;/&gt;&lt;wsp:rsid wsp:val=&quot;00C90993&quot;/&gt;&lt;wsp:rsid wsp:val=&quot;00CA4CE3&quot;/&gt;&lt;wsp:rsid wsp:val=&quot;00CC72FD&quot;/&gt;&lt;wsp:rsid wsp:val=&quot;00CD4F3F&quot;/&gt;&lt;wsp:rsid wsp:val=&quot;00D311F8&quot;/&gt;&lt;wsp:rsid wsp:val=&quot;00D31660&quot;/&gt;&lt;wsp:rsid wsp:val=&quot;00D36B52&quot;/&gt;&lt;wsp:rsid wsp:val=&quot;00D377C8&quot;/&gt;&lt;wsp:rsid wsp:val=&quot;00D41274&quot;/&gt;&lt;wsp:rsid wsp:val=&quot;00D4229C&quot;/&gt;&lt;wsp:rsid wsp:val=&quot;00D43BF3&quot;/&gt;&lt;wsp:rsid wsp:val=&quot;00D549FB&quot;/&gt;&lt;wsp:rsid wsp:val=&quot;00D767BB&quot;/&gt;&lt;wsp:rsid wsp:val=&quot;00D939B0&quot;/&gt;&lt;wsp:rsid wsp:val=&quot;00DA31A2&quot;/&gt;&lt;wsp:rsid wsp:val=&quot;00DB16E0&quot;/&gt;&lt;wsp:rsid wsp:val=&quot;00DB2DF9&quot;/&gt;&lt;wsp:rsid wsp:val=&quot;00DB465D&quot;/&gt;&lt;wsp:rsid wsp:val=&quot;00DB48A2&quot;/&gt;&lt;wsp:rsid wsp:val=&quot;00DB7E63&quot;/&gt;&lt;wsp:rsid wsp:val=&quot;00DC2055&quot;/&gt;&lt;wsp:rsid wsp:val=&quot;00DC3908&quot;/&gt;&lt;wsp:rsid wsp:val=&quot;00DD71E8&quot;/&gt;&lt;wsp:rsid wsp:val=&quot;00DD7F83&quot;/&gt;&lt;wsp:rsid wsp:val=&quot;00DE4EB8&quot;/&gt;&lt;wsp:rsid wsp:val=&quot;00E0641E&quot;/&gt;&lt;wsp:rsid wsp:val=&quot;00E06664&quot;/&gt;&lt;wsp:rsid wsp:val=&quot;00E304BC&quot;/&gt;&lt;wsp:rsid wsp:val=&quot;00E32853&quot;/&gt;&lt;wsp:rsid wsp:val=&quot;00E34EBD&quot;/&gt;&lt;wsp:rsid wsp:val=&quot;00E401F8&quot;/&gt;&lt;wsp:rsid wsp:val=&quot;00E46425&quot;/&gt;&lt;wsp:rsid wsp:val=&quot;00E469FC&quot;/&gt;&lt;wsp:rsid wsp:val=&quot;00E47D0E&quot;/&gt;&lt;wsp:rsid wsp:val=&quot;00E65018&quot;/&gt;&lt;wsp:rsid wsp:val=&quot;00E76CA1&quot;/&gt;&lt;wsp:rsid wsp:val=&quot;00E94339&quot;/&gt;&lt;wsp:rsid wsp:val=&quot;00E97563&quot;/&gt;&lt;wsp:rsid wsp:val=&quot;00EB0B63&quot;/&gt;&lt;wsp:rsid wsp:val=&quot;00EC265C&quot;/&gt;&lt;wsp:rsid wsp:val=&quot;00ED61CB&quot;/&gt;&lt;wsp:rsid wsp:val=&quot;00EE752A&quot;/&gt;&lt;wsp:rsid wsp:val=&quot;00F06A72&quot;/&gt;&lt;wsp:rsid wsp:val=&quot;00F136F0&quot;/&gt;&lt;wsp:rsid wsp:val=&quot;00F20BBB&quot;/&gt;&lt;wsp:rsid wsp:val=&quot;00F36048&quot;/&gt;&lt;wsp:rsid wsp:val=&quot;00F43BD8&quot;/&gt;&lt;wsp:rsid wsp:val=&quot;00F562F3&quot;/&gt;&lt;wsp:rsid wsp:val=&quot;00F74B89&quot;/&gt;&lt;wsp:rsid wsp:val=&quot;00F75133&quot;/&gt;&lt;wsp:rsid wsp:val=&quot;00F83272&quot;/&gt;&lt;wsp:rsid wsp:val=&quot;00F9358D&quot;/&gt;&lt;wsp:rsid wsp:val=&quot;00FA3899&quot;/&gt;&lt;wsp:rsid wsp:val=&quot;00FA4909&quot;/&gt;&lt;wsp:rsid wsp:val=&quot;00FA5164&quot;/&gt;&lt;wsp:rsid wsp:val=&quot;00FA6751&quot;/&gt;&lt;wsp:rsid wsp:val=&quot;00FA6BD7&quot;/&gt;&lt;wsp:rsid wsp:val=&quot;00FB1048&quot;/&gt;&lt;wsp:rsid wsp:val=&quot;00FB62C4&quot;/&gt;&lt;wsp:rsid wsp:val=&quot;00FB7701&quot;/&gt;&lt;wsp:rsid wsp:val=&quot;00FD1AC5&quot;/&gt;&lt;wsp:rsid wsp:val=&quot;00FD5CF0&quot;/&gt;&lt;/wsp:rsids&gt;&lt;/w:docPr&gt;&lt;w:body&gt;&lt;wx:sect&gt;&lt;w:p wsp:rsidR=&quot;003E2069&quot; wsp:rsidRDefault=&quot;003E2069&quot; wsp:rsidP=&quot;003E2069&quot;&gt;&lt;m:oMathPara&gt;&lt;m:oMath&gt;&lt;m:sSub&gt;&lt;m:sSubPr&gt;&lt;m:ctrlPr&gt;&lt;w:rPr&gt;&lt;w:rFonts w:ascii=&quot;Cambria Math&quot; w:h-ansi=&quot;Cambria Math&quot;/&gt;&lt;wx:font wx:val=&quot;Cambria Math&quot;/&gt;&lt;w:i/&gt;&lt;/w:rPr&gt;&lt;/m:ctrlPr&gt;&lt;/m:sSubPr&gt;&lt;m:e&gt;&lt;m:r&gt;&lt;w:rPr&gt;&lt;w:rFonts w:ascii=&quot;Cambria Math&quot; w:h-ansi=&quot;Cambria Math&quot;/&gt;&lt;wx:font wx:val=&quot;Cambria Math&quot;/&gt;&lt;w:i/&gt;&lt;/w:rPr&gt;&lt;m:t&gt;V&lt;/m:t&gt;&lt;/m:r&gt;&lt;/m:e&gt;&lt;m:sub&gt;&lt;m:r&gt;&lt;w:rPr&gt;&lt;w:rFonts w:ascii=&quot;Cambria Math&quot; w:h-ansi=&quot;Cambria Math&quot;/&gt;&lt;wx:font wx:val=&quot;Cambria Math&quot;/&gt;&lt;w:i/&gt;&lt;/w:rPr&gt;&lt;m:t&gt;in&lt;/m:t&gt;&lt;/m:r&gt;&lt;/m:sub&gt;&lt;/m:sSub&gt;&lt;/m:oMath&gt;&lt;/m:oMathPara&gt;&lt;/w:p&gt;&lt;w:sectPr wsp:rsidR=&quot;00000000&quot;&gt;&lt;w:pgSz w:w=&quot;12240&quot; w:h=&quot;15840&quot;/&gt;&lt;w:pgMar w:top=&quot;1440&quot; w:right=&quot;1440&quot; w:bottom=&quot;1440&quot; w:left=&quot;1440&quot; w:header=&quot;720&quot; w:footer=&quot;720&quot; w:gutter=&quot;0&quot;/&gt;&lt;w:cols w:space=&quot;720&quot;/&gt;&lt;/w:sectPr&gt;&lt;/wx:sect&gt;&lt;/w:body&gt;&lt;/w:wordDocument&gt;">
             <v:imagedata r:id="rId13" o:title="" chromakey="white"/>
           </v:shape>
         </w:pict>
@@ -905,7 +905,7 @@
           <w:szCs w:val="20"/>
         </w:rPr>
         <w:pict w14:anchorId="2FBDFA70">
-          <v:shape id="_x0000_i1063" type="#_x0000_t75" style="width:15.25pt;height:13.65pt" equationxml="&lt;?xml version=&quot;1.0&quot; encoding=&quot;UTF-8&quot; standalone=&quot;yes&quot;?&gt;&#10;&lt;?mso-application progid=&quot;Word.Document&quot;?&gt;&#10;&lt;w:wordDocument xmlns:aml=&quot;http://schemas.microsoft.com/aml/2001/core&quot; xmlns:wpc=&quot;http://schemas.microsoft.com/office/word/2010/wordprocessingCanvas&quot; xmlns:cx=&quot;http://schemas.microsoft.com/office/drawing/2014/chartex&quot; xmlns:cx1=&quot;http://schemas.microsoft.com/office/drawing/2015/9/8/chartex&quot; xmlns:cx2=&quot;http://schemas.microsoft.com/office/drawing/2015/10/21/chartex&quot; xmlns:cx3=&quot;http://schemas.microsoft.com/office/drawing/2016/5/9/chartex&quot; xmlns:cx4=&quot;http://schemas.microsoft.com/office/drawing/2016/5/10/chartex&quot; xmlns:cx5=&quot;http://schemas.microsoft.com/office/drawing/2016/5/11/chartex&quot; xmlns:cx6=&quot;http://schemas.microsoft.com/office/drawing/2016/5/12/chartex&quot; xmlns:cx7=&quot;http://schemas.microsoft.com/office/drawing/2016/5/13/chartex&quot; xmlns:cx8=&quot;http://schemas.microsoft.com/office/drawing/2016/5/14/chartex&quot; xmlns:cr=&quot;http://schemas.microsoft.com/office/comments/2020/reactions&quot; xmlns:dt=&quot;uuid:C2F41010-65B3-11d1-A29F-00AA00C14882&quot; xmlns:mc=&quot;http://schemas.openxmlformats.org/markup-compatibility/2006&quot; xmlns:aink=&quot;http://schemas.microsoft.com/office/drawing/2016/ink&quot; xmlns:am3d=&quot;http://schemas.microsoft.com/office/drawing/2017/model3d&quot; xmlns:o=&quot;urn:schemas-microsoft-com:office:office&quot; xmlns:oel=&quot;http://schemas.microsoft.com/office/2019/extlst&quot; xmlns:m=&quot;http://schemas.openxmlformats.org/officeDocument/2006/math&quot; xmlns:v=&quot;urn:schemas-microsoft-com:vml&quot; xmlns:w10=&quot;urn:schemas-microsoft-com:office:word&quot; xmlns:w=&quot;http://schemas.microsoft.com/office/word/2003/wordml&quot; xmlns:wx=&quot;http://schemas.microsoft.com/office/word/2003/auxHint&quot; xmlns:wne=&quot;http://schemas.microsoft.com/office/word/2006/wordml&quot; xmlns:wsp=&quot;http://schemas.microsoft.com/office/word/2003/wordml/sp2&quot; xmlns:sl=&quot;http://schemas.microsoft.com/schemaLibrary/2003/core&quot; w:macrosPresent=&quot;no&quot; w:embeddedObjPresent=&quot;no&quot; w:ocxPresent=&quot;no&quot; xml:space=&quot;preserve&quot;&gt;&lt;w:ignoreSubtree w:val=&quot;http://schemas.microsoft.com/office/word/2003/wordml/sp2&quot;/&gt;&lt;o:DocumentProperties&gt;&lt;o:Version&gt;16&lt;/o:Version&gt;&lt;/o:DocumentProperties&gt;&lt;w:docPr&gt;&lt;w:view w:val=&quot;print&quot;/&gt;&lt;w:zoom w:percent=&quot;100&quot;/&gt;&lt;w:doNotEmbedSystemFonts/&gt;&lt;w:activeWritingStyle w:lang=&quot;EN-AU&quot; w:vendorID=&quot;64&quot; w:dllVersion=&quot;6&quot; w:nlCheck=&quot;on&quot; w:optionSet=&quot;1&quot;/&gt;&lt;w:activeWritingStyle w:lang=&quot;EN-GB&quot; w:vendorID=&quot;64&quot; w:dllVersion=&quot;6&quot; w:nlCheck=&quot;on&quot; w:optionSet=&quot;1&quot;/&gt;&lt;w:activeWritingStyle w:lang=&quot;EN-US&quot; w:vendorID=&quot;64&quot; w:dllVersion=&quot;6&quot; w:nlCheck=&quot;on&quot; w:optionSet=&quot;1&quot;/&gt;&lt;w:activeWritingStyle w:lang=&quot;EN-AU&quot; w:vendorID=&quot;64&quot; w:dllVersion=&quot;0&quot; w:nlCheck=&quot;on&quot; w:optionSet=&quot;0&quot;/&gt;&lt;w:activeWritingStyle w:lang=&quot;EN-GB&quot; w:vendorID=&quot;64&quot; w:dllVersion=&quot;0&quot; w:nlCheck=&quot;on&quot; w:optionSet=&quot;0&quot;/&gt;&lt;w:activeWritingStyle w:lang=&quot;EN-US&quot; w:vendorID=&quot;64&quot; w:dllVersion=&quot;0&quot; w:nlCheck=&quot;on&quot; w:optionSet=&quot;0&quot;/&gt;&lt;w:activeWritingStyle w:lang=&quot;ES-AR&quot; w:vendorID=&quot;64&quot; w:dllVersion=&quot;0&quot; w:nlCheck=&quot;on&quot; w:optionSet=&quot;0&quot;/&gt;&lt;w:activeWritingStyle w:lang=&quot;580A&quot; w:vendorID=&quot;64&quot; w:dllVersion=&quot;0&quot; w:nlCheck=&quot;on&quot; w:optionSet=&quot;0&quot;/&gt;&lt;w:activeWritingStyle w:lang=&quot;PT-BR&quot; w:vendorID=&quot;64&quot; w:dllVersion=&quot;0&quot; w:nlCheck=&quot;on&quot; w:optionSet=&quot;0&quot;/&gt;&lt;w:stylePaneFormatFilter w:val=&quot;3F01&quot;/&gt;&lt;w:defaultTabStop w:val=&quot;720&quot;/&gt;&lt;w:hyphenationZone w:val=&quot;425&quot;/&gt;&lt;w:characterSpacingControl w:val=&quot;DontCompress&quot;/&gt;&lt;w:optimizeForBrowser/&gt;&lt;w:validateAgainstSchema/&gt;&lt;w:saveInvalidXML w:val=&quot;off&quot;/&gt;&lt;w:ignoreMixedContent w:val=&quot;off&quot;/&gt;&lt;w:alwaysShowPlaceholderText w:val=&quot;off&quot;/&gt;&lt;w:compat&gt;&lt;w:breakWrappedTables/&gt;&lt;w:snapToGridInCell/&gt;&lt;w:applyBreakingRules/&gt;&lt;w:wrapTextWithPunct/&gt;&lt;w:useAsianBreakRules/&gt;&lt;w:useWord2002TableStyleRules/&gt;&lt;w:useFELayout/&gt;&lt;/w:compat&gt;&lt;wsp:rsids&gt;&lt;wsp:rsidRoot wsp:val=&quot;00426FBB&quot;/&gt;&lt;wsp:rsid wsp:val=&quot;000002E1&quot;/&gt;&lt;wsp:rsid wsp:val=&quot;00003C97&quot;/&gt;&lt;wsp:rsid wsp:val=&quot;00005565&quot;/&gt;&lt;wsp:rsid wsp:val=&quot;0001754A&quot;/&gt;&lt;wsp:rsid wsp:val=&quot;00017719&quot;/&gt;&lt;wsp:rsid wsp:val=&quot;00027F1D&quot;/&gt;&lt;wsp:rsid wsp:val=&quot;0003296C&quot;/&gt;&lt;wsp:rsid wsp:val=&quot;0003351F&quot;/&gt;&lt;wsp:rsid wsp:val=&quot;00044599&quot;/&gt;&lt;wsp:rsid wsp:val=&quot;000540E6&quot;/&gt;&lt;wsp:rsid wsp:val=&quot;00054421&quot;/&gt;&lt;wsp:rsid wsp:val=&quot;00062E46&quot;/&gt;&lt;wsp:rsid wsp:val=&quot;00074AC8&quot;/&gt;&lt;wsp:rsid wsp:val=&quot;00081408&quot;/&gt;&lt;wsp:rsid wsp:val=&quot;00081EBE&quot;/&gt;&lt;wsp:rsid wsp:val=&quot;00086EDC&quot;/&gt;&lt;wsp:rsid wsp:val=&quot;000B36A3&quot;/&gt;&lt;wsp:rsid wsp:val=&quot;000C013C&quot;/&gt;&lt;wsp:rsid wsp:val=&quot;000E3F84&quot;/&gt;&lt;wsp:rsid wsp:val=&quot;001056DF&quot;/&gt;&lt;wsp:rsid wsp:val=&quot;0010789C&quot;/&gt;&lt;wsp:rsid wsp:val=&quot;00114025&quot;/&gt;&lt;wsp:rsid wsp:val=&quot;001160D2&quot;/&gt;&lt;wsp:rsid wsp:val=&quot;00120636&quot;/&gt;&lt;wsp:rsid wsp:val=&quot;001348A5&quot;/&gt;&lt;wsp:rsid wsp:val=&quot;00151B8E&quot;/&gt;&lt;wsp:rsid wsp:val=&quot;00182170&quot;/&gt;&lt;wsp:rsid wsp:val=&quot;001928FB&quot;/&gt;&lt;wsp:rsid wsp:val=&quot;00192BC7&quot;/&gt;&lt;wsp:rsid wsp:val=&quot;00195BE6&quot;/&gt;&lt;wsp:rsid wsp:val=&quot;001A50EA&quot;/&gt;&lt;wsp:rsid wsp:val=&quot;001F16CD&quot;/&gt;&lt;wsp:rsid wsp:val=&quot;001F47D2&quot;/&gt;&lt;wsp:rsid wsp:val=&quot;002029C8&quot;/&gt;&lt;wsp:rsid wsp:val=&quot;0022285A&quot;/&gt;&lt;wsp:rsid wsp:val=&quot;00224C61&quot;/&gt;&lt;wsp:rsid wsp:val=&quot;00256ABC&quot;/&gt;&lt;wsp:rsid wsp:val=&quot;0027227B&quot;/&gt;&lt;wsp:rsid wsp:val=&quot;00273AC7&quot;/&gt;&lt;wsp:rsid wsp:val=&quot;00273D2C&quot;/&gt;&lt;wsp:rsid wsp:val=&quot;00285ECD&quot;/&gt;&lt;wsp:rsid wsp:val=&quot;00290E1B&quot;/&gt;&lt;wsp:rsid wsp:val=&quot;00291B17&quot;/&gt;&lt;wsp:rsid wsp:val=&quot;00291BB3&quot;/&gt;&lt;wsp:rsid wsp:val=&quot;002A6742&quot;/&gt;&lt;wsp:rsid wsp:val=&quot;002C1A7F&quot;/&gt;&lt;wsp:rsid wsp:val=&quot;002C4239&quot;/&gt;&lt;wsp:rsid wsp:val=&quot;002C559D&quot;/&gt;&lt;wsp:rsid wsp:val=&quot;002D16AE&quot;/&gt;&lt;wsp:rsid wsp:val=&quot;002D2D42&quot;/&gt;&lt;wsp:rsid wsp:val=&quot;002F72D0&quot;/&gt;&lt;wsp:rsid wsp:val=&quot;002F7A4F&quot;/&gt;&lt;wsp:rsid wsp:val=&quot;003003AB&quot;/&gt;&lt;wsp:rsid wsp:val=&quot;00302C35&quot;/&gt;&lt;wsp:rsid wsp:val=&quot;00311C49&quot;/&gt;&lt;wsp:rsid wsp:val=&quot;0032119E&quot;/&gt;&lt;wsp:rsid wsp:val=&quot;00321304&quot;/&gt;&lt;wsp:rsid wsp:val=&quot;00324FC2&quot;/&gt;&lt;wsp:rsid wsp:val=&quot;003312CA&quot;/&gt;&lt;wsp:rsid wsp:val=&quot;00331F84&quot;/&gt;&lt;wsp:rsid wsp:val=&quot;0037721F&quot;/&gt;&lt;wsp:rsid wsp:val=&quot;003950A4&quot;/&gt;&lt;wsp:rsid wsp:val=&quot;003A1E7E&quot;/&gt;&lt;wsp:rsid wsp:val=&quot;003E2069&quot;/&gt;&lt;wsp:rsid wsp:val=&quot;003E2FDC&quot;/&gt;&lt;wsp:rsid wsp:val=&quot;003E3577&quot;/&gt;&lt;wsp:rsid wsp:val=&quot;003F3A61&quot;/&gt;&lt;wsp:rsid wsp:val=&quot;00410A5D&quot;/&gt;&lt;wsp:rsid wsp:val=&quot;00414909&quot;/&gt;&lt;wsp:rsid wsp:val=&quot;00416537&quot;/&gt;&lt;wsp:rsid wsp:val=&quot;00425A6A&quot;/&gt;&lt;wsp:rsid wsp:val=&quot;00426FBB&quot;/&gt;&lt;wsp:rsid wsp:val=&quot;00454542&quot;/&gt;&lt;wsp:rsid wsp:val=&quot;0047429A&quot;/&gt;&lt;wsp:rsid wsp:val=&quot;0048374C&quot;/&gt;&lt;wsp:rsid wsp:val=&quot;0048771D&quot;/&gt;&lt;wsp:rsid wsp:val=&quot;004A6605&quot;/&gt;&lt;wsp:rsid wsp:val=&quot;004C45FA&quot;/&gt;&lt;wsp:rsid wsp:val=&quot;004D35A3&quot;/&gt;&lt;wsp:rsid wsp:val=&quot;004E1BD8&quot;/&gt;&lt;wsp:rsid wsp:val=&quot;004E452A&quot;/&gt;&lt;wsp:rsid wsp:val=&quot;004E78E3&quot;/&gt;&lt;wsp:rsid wsp:val=&quot;004F2BFE&quot;/&gt;&lt;wsp:rsid wsp:val=&quot;004F63D3&quot;/&gt;&lt;wsp:rsid wsp:val=&quot;004F7DCF&quot;/&gt;&lt;wsp:rsid wsp:val=&quot;005004BF&quot;/&gt;&lt;wsp:rsid wsp:val=&quot;00502E89&quot;/&gt;&lt;wsp:rsid wsp:val=&quot;00506CFE&quot;/&gt;&lt;wsp:rsid wsp:val=&quot;00510E95&quot;/&gt;&lt;wsp:rsid wsp:val=&quot;005225C3&quot;/&gt;&lt;wsp:rsid wsp:val=&quot;00527D56&quot;/&gt;&lt;wsp:rsid wsp:val=&quot;0053221F&quot;/&gt;&lt;wsp:rsid wsp:val=&quot;00536FAE&quot;/&gt;&lt;wsp:rsid wsp:val=&quot;00542C85&quot;/&gt;&lt;wsp:rsid wsp:val=&quot;00553510&quot;/&gt;&lt;wsp:rsid wsp:val=&quot;00554186&quot;/&gt;&lt;wsp:rsid wsp:val=&quot;00585769&quot;/&gt;&lt;wsp:rsid wsp:val=&quot;00585C61&quot;/&gt;&lt;wsp:rsid wsp:val=&quot;00591130&quot;/&gt;&lt;wsp:rsid wsp:val=&quot;005A3F28&quot;/&gt;&lt;wsp:rsid wsp:val=&quot;005A40BE&quot;/&gt;&lt;wsp:rsid wsp:val=&quot;005B13E2&quot;/&gt;&lt;wsp:rsid wsp:val=&quot;005B47D7&quot;/&gt;&lt;wsp:rsid wsp:val=&quot;005C5526&quot;/&gt;&lt;wsp:rsid wsp:val=&quot;005C62C6&quot;/&gt;&lt;wsp:rsid wsp:val=&quot;005D7B9E&quot;/&gt;&lt;wsp:rsid wsp:val=&quot;005E112E&quot;/&gt;&lt;wsp:rsid wsp:val=&quot;005F0834&quot;/&gt;&lt;wsp:rsid wsp:val=&quot;005F68AB&quot;/&gt;&lt;wsp:rsid wsp:val=&quot;005F6DC3&quot;/&gt;&lt;wsp:rsid wsp:val=&quot;00601A8E&quot;/&gt;&lt;wsp:rsid wsp:val=&quot;0062033E&quot;/&gt;&lt;wsp:rsid wsp:val=&quot;00624482&quot;/&gt;&lt;wsp:rsid wsp:val=&quot;0064799C&quot;/&gt;&lt;wsp:rsid wsp:val=&quot;00654156&quot;/&gt;&lt;wsp:rsid wsp:val=&quot;006B47CA&quot;/&gt;&lt;wsp:rsid wsp:val=&quot;006C304C&quot;/&gt;&lt;wsp:rsid wsp:val=&quot;006C4511&quot;/&gt;&lt;wsp:rsid wsp:val=&quot;006C65F5&quot;/&gt;&lt;wsp:rsid wsp:val=&quot;006C7AAA&quot;/&gt;&lt;wsp:rsid wsp:val=&quot;006D1C2A&quot;/&gt;&lt;wsp:rsid wsp:val=&quot;006D264F&quot;/&gt;&lt;wsp:rsid wsp:val=&quot;006E2A8D&quot;/&gt;&lt;wsp:rsid wsp:val=&quot;006E7574&quot;/&gt;&lt;wsp:rsid wsp:val=&quot;00703430&quot;/&gt;&lt;wsp:rsid wsp:val=&quot;00703548&quot;/&gt;&lt;wsp:rsid wsp:val=&quot;00704E18&quot;/&gt;&lt;wsp:rsid wsp:val=&quot;007069BE&quot;/&gt;&lt;wsp:rsid wsp:val=&quot;00745C86&quot;/&gt;&lt;wsp:rsid wsp:val=&quot;00764603&quot;/&gt;&lt;wsp:rsid wsp:val=&quot;0076604D&quot;/&gt;&lt;wsp:rsid wsp:val=&quot;00790909&quot;/&gt;&lt;wsp:rsid wsp:val=&quot;007B1582&quot;/&gt;&lt;wsp:rsid wsp:val=&quot;007B5A07&quot;/&gt;&lt;wsp:rsid wsp:val=&quot;007C065D&quot;/&gt;&lt;wsp:rsid wsp:val=&quot;007D3E71&quot;/&gt;&lt;wsp:rsid wsp:val=&quot;007E5D6A&quot;/&gt;&lt;wsp:rsid wsp:val=&quot;007E645D&quot;/&gt;&lt;wsp:rsid wsp:val=&quot;007F75CA&quot;/&gt;&lt;wsp:rsid wsp:val=&quot;00821E08&quot;/&gt;&lt;wsp:rsid wsp:val=&quot;00834EFD&quot;/&gt;&lt;wsp:rsid wsp:val=&quot;00844B24&quot;/&gt;&lt;wsp:rsid wsp:val=&quot;0084515F&quot;/&gt;&lt;wsp:rsid wsp:val=&quot;0085092D&quot;/&gt;&lt;wsp:rsid wsp:val=&quot;00865414&quot;/&gt;&lt;wsp:rsid wsp:val=&quot;00877D4C&quot;/&gt;&lt;wsp:rsid wsp:val=&quot;00883903&quot;/&gt;&lt;wsp:rsid wsp:val=&quot;0089763B&quot;/&gt;&lt;wsp:rsid wsp:val=&quot;008B6AE3&quot;/&gt;&lt;wsp:rsid wsp:val=&quot;008C1332&quot;/&gt;&lt;wsp:rsid wsp:val=&quot;008D1045&quot;/&gt;&lt;wsp:rsid wsp:val=&quot;008E5996&quot;/&gt;&lt;wsp:rsid wsp:val=&quot;00901AE1&quot;/&gt;&lt;wsp:rsid wsp:val=&quot;00912F93&quot;/&gt;&lt;wsp:rsid wsp:val=&quot;009205B4&quot;/&gt;&lt;wsp:rsid wsp:val=&quot;00955B59&quot;/&gt;&lt;wsp:rsid wsp:val=&quot;00992262&quot;/&gt;&lt;wsp:rsid wsp:val=&quot;009926BC&quot;/&gt;&lt;wsp:rsid wsp:val=&quot;009A4319&quot;/&gt;&lt;wsp:rsid wsp:val=&quot;009A6C3F&quot;/&gt;&lt;wsp:rsid wsp:val=&quot;009B73F2&quot;/&gt;&lt;wsp:rsid wsp:val=&quot;009C12BD&quot;/&gt;&lt;wsp:rsid wsp:val=&quot;009C50FE&quot;/&gt;&lt;wsp:rsid wsp:val=&quot;009E49DD&quot;/&gt;&lt;wsp:rsid wsp:val=&quot;00A03E75&quot;/&gt;&lt;wsp:rsid wsp:val=&quot;00A20627&quot;/&gt;&lt;wsp:rsid wsp:val=&quot;00A22FE9&quot;/&gt;&lt;wsp:rsid wsp:val=&quot;00A31A44&quot;/&gt;&lt;wsp:rsid wsp:val=&quot;00A32BFA&quot;/&gt;&lt;wsp:rsid wsp:val=&quot;00A3325E&quot;/&gt;&lt;wsp:rsid wsp:val=&quot;00A45FCE&quot;/&gt;&lt;wsp:rsid wsp:val=&quot;00A75671&quot;/&gt;&lt;wsp:rsid wsp:val=&quot;00A773CC&quot;/&gt;&lt;wsp:rsid wsp:val=&quot;00A924D0&quot;/&gt;&lt;wsp:rsid wsp:val=&quot;00A9318B&quot;/&gt;&lt;wsp:rsid wsp:val=&quot;00A94AC1&quot;/&gt;&lt;wsp:rsid wsp:val=&quot;00AB18B7&quot;/&gt;&lt;wsp:rsid wsp:val=&quot;00AD335D&quot;/&gt;&lt;wsp:rsid wsp:val=&quot;00AF114C&quot;/&gt;&lt;wsp:rsid wsp:val=&quot;00AF792B&quot;/&gt;&lt;wsp:rsid wsp:val=&quot;00B33D2F&quot;/&gt;&lt;wsp:rsid wsp:val=&quot;00B40A5B&quot;/&gt;&lt;wsp:rsid wsp:val=&quot;00B45C6B&quot;/&gt;&lt;wsp:rsid wsp:val=&quot;00B55D5E&quot;/&gt;&lt;wsp:rsid wsp:val=&quot;00B57A80&quot;/&gt;&lt;wsp:rsid wsp:val=&quot;00B70E9C&quot;/&gt;&lt;wsp:rsid wsp:val=&quot;00B713D8&quot;/&gt;&lt;wsp:rsid wsp:val=&quot;00B72979&quot;/&gt;&lt;wsp:rsid wsp:val=&quot;00B94516&quot;/&gt;&lt;wsp:rsid wsp:val=&quot;00BA25E2&quot;/&gt;&lt;wsp:rsid wsp:val=&quot;00BB2855&quot;/&gt;&lt;wsp:rsid wsp:val=&quot;00BC5343&quot;/&gt;&lt;wsp:rsid wsp:val=&quot;00BD19C1&quot;/&gt;&lt;wsp:rsid wsp:val=&quot;00BD25B8&quot;/&gt;&lt;wsp:rsid wsp:val=&quot;00C012E1&quot;/&gt;&lt;wsp:rsid wsp:val=&quot;00C06BB4&quot;/&gt;&lt;wsp:rsid wsp:val=&quot;00C10D20&quot;/&gt;&lt;wsp:rsid wsp:val=&quot;00C12E0C&quot;/&gt;&lt;wsp:rsid wsp:val=&quot;00C21916&quot;/&gt;&lt;wsp:rsid wsp:val=&quot;00C34915&quot;/&gt;&lt;wsp:rsid wsp:val=&quot;00C457CA&quot;/&gt;&lt;wsp:rsid wsp:val=&quot;00C53FB6&quot;/&gt;&lt;wsp:rsid wsp:val=&quot;00C57FB7&quot;/&gt;&lt;wsp:rsid wsp:val=&quot;00C644D4&quot;/&gt;&lt;wsp:rsid wsp:val=&quot;00C65F3F&quot;/&gt;&lt;wsp:rsid wsp:val=&quot;00C72414&quot;/&gt;&lt;wsp:rsid wsp:val=&quot;00C72B1A&quot;/&gt;&lt;wsp:rsid wsp:val=&quot;00C8667B&quot;/&gt;&lt;wsp:rsid wsp:val=&quot;00C90993&quot;/&gt;&lt;wsp:rsid wsp:val=&quot;00CA4CE3&quot;/&gt;&lt;wsp:rsid wsp:val=&quot;00CC72FD&quot;/&gt;&lt;wsp:rsid wsp:val=&quot;00CD4F3F&quot;/&gt;&lt;wsp:rsid wsp:val=&quot;00D311F8&quot;/&gt;&lt;wsp:rsid wsp:val=&quot;00D31660&quot;/&gt;&lt;wsp:rsid wsp:val=&quot;00D36B52&quot;/&gt;&lt;wsp:rsid wsp:val=&quot;00D377C8&quot;/&gt;&lt;wsp:rsid wsp:val=&quot;00D41274&quot;/&gt;&lt;wsp:rsid wsp:val=&quot;00D4229C&quot;/&gt;&lt;wsp:rsid wsp:val=&quot;00D43BF3&quot;/&gt;&lt;wsp:rsid wsp:val=&quot;00D549FB&quot;/&gt;&lt;wsp:rsid wsp:val=&quot;00D767BB&quot;/&gt;&lt;wsp:rsid wsp:val=&quot;00D939B0&quot;/&gt;&lt;wsp:rsid wsp:val=&quot;00DA31A2&quot;/&gt;&lt;wsp:rsid wsp:val=&quot;00DB16E0&quot;/&gt;&lt;wsp:rsid wsp:val=&quot;00DB2DF9&quot;/&gt;&lt;wsp:rsid wsp:val=&quot;00DB465D&quot;/&gt;&lt;wsp:rsid wsp:val=&quot;00DB48A2&quot;/&gt;&lt;wsp:rsid wsp:val=&quot;00DB7E63&quot;/&gt;&lt;wsp:rsid wsp:val=&quot;00DC2055&quot;/&gt;&lt;wsp:rsid wsp:val=&quot;00DC3908&quot;/&gt;&lt;wsp:rsid wsp:val=&quot;00DD71E8&quot;/&gt;&lt;wsp:rsid wsp:val=&quot;00DD7F83&quot;/&gt;&lt;wsp:rsid wsp:val=&quot;00DE4EB8&quot;/&gt;&lt;wsp:rsid wsp:val=&quot;00E0641E&quot;/&gt;&lt;wsp:rsid wsp:val=&quot;00E06664&quot;/&gt;&lt;wsp:rsid wsp:val=&quot;00E304BC&quot;/&gt;&lt;wsp:rsid wsp:val=&quot;00E32853&quot;/&gt;&lt;wsp:rsid wsp:val=&quot;00E34EBD&quot;/&gt;&lt;wsp:rsid wsp:val=&quot;00E401F8&quot;/&gt;&lt;wsp:rsid wsp:val=&quot;00E46425&quot;/&gt;&lt;wsp:rsid wsp:val=&quot;00E469FC&quot;/&gt;&lt;wsp:rsid wsp:val=&quot;00E47D0E&quot;/&gt;&lt;wsp:rsid wsp:val=&quot;00E65018&quot;/&gt;&lt;wsp:rsid wsp:val=&quot;00E76CA1&quot;/&gt;&lt;wsp:rsid wsp:val=&quot;00E94339&quot;/&gt;&lt;wsp:rsid wsp:val=&quot;00E97563&quot;/&gt;&lt;wsp:rsid wsp:val=&quot;00EB0B63&quot;/&gt;&lt;wsp:rsid wsp:val=&quot;00EC265C&quot;/&gt;&lt;wsp:rsid wsp:val=&quot;00ED61CB&quot;/&gt;&lt;wsp:rsid wsp:val=&quot;00EE752A&quot;/&gt;&lt;wsp:rsid wsp:val=&quot;00F06A72&quot;/&gt;&lt;wsp:rsid wsp:val=&quot;00F136F0&quot;/&gt;&lt;wsp:rsid wsp:val=&quot;00F20BBB&quot;/&gt;&lt;wsp:rsid wsp:val=&quot;00F36048&quot;/&gt;&lt;wsp:rsid wsp:val=&quot;00F43BD8&quot;/&gt;&lt;wsp:rsid wsp:val=&quot;00F562F3&quot;/&gt;&lt;wsp:rsid wsp:val=&quot;00F74B89&quot;/&gt;&lt;wsp:rsid wsp:val=&quot;00F75133&quot;/&gt;&lt;wsp:rsid wsp:val=&quot;00F83272&quot;/&gt;&lt;wsp:rsid wsp:val=&quot;00F9358D&quot;/&gt;&lt;wsp:rsid wsp:val=&quot;00FA3899&quot;/&gt;&lt;wsp:rsid wsp:val=&quot;00FA4909&quot;/&gt;&lt;wsp:rsid wsp:val=&quot;00FA5164&quot;/&gt;&lt;wsp:rsid wsp:val=&quot;00FA6751&quot;/&gt;&lt;wsp:rsid wsp:val=&quot;00FA6BD7&quot;/&gt;&lt;wsp:rsid wsp:val=&quot;00FB1048&quot;/&gt;&lt;wsp:rsid wsp:val=&quot;00FB62C4&quot;/&gt;&lt;wsp:rsid wsp:val=&quot;00FB7701&quot;/&gt;&lt;wsp:rsid wsp:val=&quot;00FD1AC5&quot;/&gt;&lt;wsp:rsid wsp:val=&quot;00FD5CF0&quot;/&gt;&lt;/wsp:rsids&gt;&lt;/w:docPr&gt;&lt;w:body&gt;&lt;wx:sect&gt;&lt;w:p wsp:rsidR=&quot;003E2069&quot; wsp:rsidRDefault=&quot;003E2069&quot; wsp:rsidP=&quot;003E2069&quot;&gt;&lt;m:oMathPara&gt;&lt;m:oMath&gt;&lt;m:sSub&gt;&lt;m:sSubPr&gt;&lt;m:ctrlPr&gt;&lt;w:rPr&gt;&lt;w:rFonts w:ascii=&quot;Cambria Math&quot; w:h-ansi=&quot;Cambria Math&quot;/&gt;&lt;wx:font wx:val=&quot;Cambria Math&quot;/&gt;&lt;w:i/&gt;&lt;/w:rPr&gt;&lt;/m:ctrlPr&gt;&lt;/m:sSubPr&gt;&lt;m:e&gt;&lt;m:r&gt;&lt;w:rPr&gt;&lt;w:rFonts w:ascii=&quot;Cambria Math&quot; w:h-ansi=&quot;Cambria Math&quot;/&gt;&lt;wx:font wx:val=&quot;Cambria Math&quot;/&gt;&lt;w:i/&gt;&lt;/w:rPr&gt;&lt;m:t&gt;V&lt;/m:t&gt;&lt;/m:r&gt;&lt;/m:e&gt;&lt;m:sub&gt;&lt;m:r&gt;&lt;w:rPr&gt;&lt;w:rFonts w:ascii=&quot;Cambria Math&quot; w:h-ansi=&quot;Cambria Math&quot;/&gt;&lt;wx:font wx:val=&quot;Cambria Math&quot;/&gt;&lt;w:i/&gt;&lt;/w:rPr&gt;&lt;m:t&gt;in&lt;/m:t&gt;&lt;/m:r&gt;&lt;/m:sub&gt;&lt;/m:sSub&gt;&lt;/m:oMath&gt;&lt;/m:oMathPara&gt;&lt;/w:p&gt;&lt;w:sectPr wsp:rsidR=&quot;00000000&quot;&gt;&lt;w:pgSz w:w=&quot;12240&quot; w:h=&quot;15840&quot;/&gt;&lt;w:pgMar w:top=&quot;1440&quot; w:right=&quot;1440&quot; w:bottom=&quot;1440&quot; w:left=&quot;1440&quot; w:header=&quot;720&quot; w:footer=&quot;720&quot; w:gutter=&quot;0&quot;/&gt;&lt;w:cols w:space=&quot;720&quot;/&gt;&lt;/w:sectPr&gt;&lt;/wx:sect&gt;&lt;/w:body&gt;&lt;/w:wordDocument&gt;">
+          <v:shape id="_x0000_i1030" type="#_x0000_t75" style="width:15.25pt;height:13.85pt" equationxml="&lt;?xml version=&quot;1.0&quot; encoding=&quot;UTF-8&quot; standalone=&quot;yes&quot;?&gt;&#10;&lt;?mso-application progid=&quot;Word.Document&quot;?&gt;&#10;&lt;w:wordDocument xmlns:aml=&quot;http://schemas.microsoft.com/aml/2001/core&quot; xmlns:wpc=&quot;http://schemas.microsoft.com/office/word/2010/wordprocessingCanvas&quot; xmlns:cx=&quot;http://schemas.microsoft.com/office/drawing/2014/chartex&quot; xmlns:cx1=&quot;http://schemas.microsoft.com/office/drawing/2015/9/8/chartex&quot; xmlns:cx2=&quot;http://schemas.microsoft.com/office/drawing/2015/10/21/chartex&quot; xmlns:cx3=&quot;http://schemas.microsoft.com/office/drawing/2016/5/9/chartex&quot; xmlns:cx4=&quot;http://schemas.microsoft.com/office/drawing/2016/5/10/chartex&quot; xmlns:cx5=&quot;http://schemas.microsoft.com/office/drawing/2016/5/11/chartex&quot; xmlns:cx6=&quot;http://schemas.microsoft.com/office/drawing/2016/5/12/chartex&quot; xmlns:cx7=&quot;http://schemas.microsoft.com/office/drawing/2016/5/13/chartex&quot; xmlns:cx8=&quot;http://schemas.microsoft.com/office/drawing/2016/5/14/chartex&quot; xmlns:cr=&quot;http://schemas.microsoft.com/office/comments/2020/reactions&quot; xmlns:dt=&quot;uuid:C2F41010-65B3-11d1-A29F-00AA00C14882&quot; xmlns:mc=&quot;http://schemas.openxmlformats.org/markup-compatibility/2006&quot; xmlns:aink=&quot;http://schemas.microsoft.com/office/drawing/2016/ink&quot; xmlns:am3d=&quot;http://schemas.microsoft.com/office/drawing/2017/model3d&quot; xmlns:o=&quot;urn:schemas-microsoft-com:office:office&quot; xmlns:oel=&quot;http://schemas.microsoft.com/office/2019/extlst&quot; xmlns:m=&quot;http://schemas.openxmlformats.org/officeDocument/2006/math&quot; xmlns:v=&quot;urn:schemas-microsoft-com:vml&quot; xmlns:w10=&quot;urn:schemas-microsoft-com:office:word&quot; xmlns:w=&quot;http://schemas.microsoft.com/office/word/2003/wordml&quot; xmlns:wx=&quot;http://schemas.microsoft.com/office/word/2003/auxHint&quot; xmlns:wne=&quot;http://schemas.microsoft.com/office/word/2006/wordml&quot; xmlns:wsp=&quot;http://schemas.microsoft.com/office/word/2003/wordml/sp2&quot; xmlns:sl=&quot;http://schemas.microsoft.com/schemaLibrary/2003/core&quot; w:macrosPresent=&quot;no&quot; w:embeddedObjPresent=&quot;no&quot; w:ocxPresent=&quot;no&quot; xml:space=&quot;preserve&quot;&gt;&lt;w:ignoreSubtree w:val=&quot;http://schemas.microsoft.com/office/word/2003/wordml/sp2&quot;/&gt;&lt;o:DocumentProperties&gt;&lt;o:Version&gt;16&lt;/o:Version&gt;&lt;/o:DocumentProperties&gt;&lt;w:docPr&gt;&lt;w:view w:val=&quot;print&quot;/&gt;&lt;w:zoom w:percent=&quot;100&quot;/&gt;&lt;w:doNotEmbedSystemFonts/&gt;&lt;w:activeWritingStyle w:lang=&quot;EN-AU&quot; w:vendorID=&quot;64&quot; w:dllVersion=&quot;6&quot; w:nlCheck=&quot;on&quot; w:optionSet=&quot;1&quot;/&gt;&lt;w:activeWritingStyle w:lang=&quot;EN-GB&quot; w:vendorID=&quot;64&quot; w:dllVersion=&quot;6&quot; w:nlCheck=&quot;on&quot; w:optionSet=&quot;1&quot;/&gt;&lt;w:activeWritingStyle w:lang=&quot;EN-US&quot; w:vendorID=&quot;64&quot; w:dllVersion=&quot;6&quot; w:nlCheck=&quot;on&quot; w:optionSet=&quot;1&quot;/&gt;&lt;w:activeWritingStyle w:lang=&quot;EN-AU&quot; w:vendorID=&quot;64&quot; w:dllVersion=&quot;0&quot; w:nlCheck=&quot;on&quot; w:optionSet=&quot;0&quot;/&gt;&lt;w:activeWritingStyle w:lang=&quot;EN-GB&quot; w:vendorID=&quot;64&quot; w:dllVersion=&quot;0&quot; w:nlCheck=&quot;on&quot; w:optionSet=&quot;0&quot;/&gt;&lt;w:activeWritingStyle w:lang=&quot;EN-US&quot; w:vendorID=&quot;64&quot; w:dllVersion=&quot;0&quot; w:nlCheck=&quot;on&quot; w:optionSet=&quot;0&quot;/&gt;&lt;w:activeWritingStyle w:lang=&quot;ES-AR&quot; w:vendorID=&quot;64&quot; w:dllVersion=&quot;0&quot; w:nlCheck=&quot;on&quot; w:optionSet=&quot;0&quot;/&gt;&lt;w:activeWritingStyle w:lang=&quot;580A&quot; w:vendorID=&quot;64&quot; w:dllVersion=&quot;0&quot; w:nlCheck=&quot;on&quot; w:optionSet=&quot;0&quot;/&gt;&lt;w:activeWritingStyle w:lang=&quot;PT-BR&quot; w:vendorID=&quot;64&quot; w:dllVersion=&quot;0&quot; w:nlCheck=&quot;on&quot; w:optionSet=&quot;0&quot;/&gt;&lt;w:stylePaneFormatFilter w:val=&quot;3F01&quot;/&gt;&lt;w:defaultTabStop w:val=&quot;720&quot;/&gt;&lt;w:hyphenationZone w:val=&quot;425&quot;/&gt;&lt;w:characterSpacingControl w:val=&quot;DontCompress&quot;/&gt;&lt;w:optimizeForBrowser/&gt;&lt;w:validateAgainstSchema/&gt;&lt;w:saveInvalidXML w:val=&quot;off&quot;/&gt;&lt;w:ignoreMixedContent w:val=&quot;off&quot;/&gt;&lt;w:alwaysShowPlaceholderText w:val=&quot;off&quot;/&gt;&lt;w:compat&gt;&lt;w:breakWrappedTables/&gt;&lt;w:snapToGridInCell/&gt;&lt;w:applyBreakingRules/&gt;&lt;w:wrapTextWithPunct/&gt;&lt;w:useAsianBreakRules/&gt;&lt;w:useWord2002TableStyleRules/&gt;&lt;w:useFELayout/&gt;&lt;/w:compat&gt;&lt;wsp:rsids&gt;&lt;wsp:rsidRoot wsp:val=&quot;00426FBB&quot;/&gt;&lt;wsp:rsid wsp:val=&quot;000002E1&quot;/&gt;&lt;wsp:rsid wsp:val=&quot;00003C97&quot;/&gt;&lt;wsp:rsid wsp:val=&quot;00005565&quot;/&gt;&lt;wsp:rsid wsp:val=&quot;0001754A&quot;/&gt;&lt;wsp:rsid wsp:val=&quot;00017719&quot;/&gt;&lt;wsp:rsid wsp:val=&quot;00027F1D&quot;/&gt;&lt;wsp:rsid wsp:val=&quot;0003296C&quot;/&gt;&lt;wsp:rsid wsp:val=&quot;0003351F&quot;/&gt;&lt;wsp:rsid wsp:val=&quot;00044599&quot;/&gt;&lt;wsp:rsid wsp:val=&quot;000540E6&quot;/&gt;&lt;wsp:rsid wsp:val=&quot;00054421&quot;/&gt;&lt;wsp:rsid wsp:val=&quot;00062E46&quot;/&gt;&lt;wsp:rsid wsp:val=&quot;00074AC8&quot;/&gt;&lt;wsp:rsid wsp:val=&quot;00081408&quot;/&gt;&lt;wsp:rsid wsp:val=&quot;00081EBE&quot;/&gt;&lt;wsp:rsid wsp:val=&quot;00086EDC&quot;/&gt;&lt;wsp:rsid wsp:val=&quot;000B36A3&quot;/&gt;&lt;wsp:rsid wsp:val=&quot;000C013C&quot;/&gt;&lt;wsp:rsid wsp:val=&quot;000E3F84&quot;/&gt;&lt;wsp:rsid wsp:val=&quot;001056DF&quot;/&gt;&lt;wsp:rsid wsp:val=&quot;0010789C&quot;/&gt;&lt;wsp:rsid wsp:val=&quot;00114025&quot;/&gt;&lt;wsp:rsid wsp:val=&quot;001160D2&quot;/&gt;&lt;wsp:rsid wsp:val=&quot;00120636&quot;/&gt;&lt;wsp:rsid wsp:val=&quot;001348A5&quot;/&gt;&lt;wsp:rsid wsp:val=&quot;00151B8E&quot;/&gt;&lt;wsp:rsid wsp:val=&quot;00182170&quot;/&gt;&lt;wsp:rsid wsp:val=&quot;001928FB&quot;/&gt;&lt;wsp:rsid wsp:val=&quot;00192BC7&quot;/&gt;&lt;wsp:rsid wsp:val=&quot;00195BE6&quot;/&gt;&lt;wsp:rsid wsp:val=&quot;001A50EA&quot;/&gt;&lt;wsp:rsid wsp:val=&quot;001F16CD&quot;/&gt;&lt;wsp:rsid wsp:val=&quot;001F47D2&quot;/&gt;&lt;wsp:rsid wsp:val=&quot;002029C8&quot;/&gt;&lt;wsp:rsid wsp:val=&quot;0022285A&quot;/&gt;&lt;wsp:rsid wsp:val=&quot;00224C61&quot;/&gt;&lt;wsp:rsid wsp:val=&quot;00256ABC&quot;/&gt;&lt;wsp:rsid wsp:val=&quot;0027227B&quot;/&gt;&lt;wsp:rsid wsp:val=&quot;00273AC7&quot;/&gt;&lt;wsp:rsid wsp:val=&quot;00273D2C&quot;/&gt;&lt;wsp:rsid wsp:val=&quot;00285ECD&quot;/&gt;&lt;wsp:rsid wsp:val=&quot;00290E1B&quot;/&gt;&lt;wsp:rsid wsp:val=&quot;00291B17&quot;/&gt;&lt;wsp:rsid wsp:val=&quot;00291BB3&quot;/&gt;&lt;wsp:rsid wsp:val=&quot;002A6742&quot;/&gt;&lt;wsp:rsid wsp:val=&quot;002C1A7F&quot;/&gt;&lt;wsp:rsid wsp:val=&quot;002C4239&quot;/&gt;&lt;wsp:rsid wsp:val=&quot;002C559D&quot;/&gt;&lt;wsp:rsid wsp:val=&quot;002D16AE&quot;/&gt;&lt;wsp:rsid wsp:val=&quot;002D2D42&quot;/&gt;&lt;wsp:rsid wsp:val=&quot;002F72D0&quot;/&gt;&lt;wsp:rsid wsp:val=&quot;002F7A4F&quot;/&gt;&lt;wsp:rsid wsp:val=&quot;003003AB&quot;/&gt;&lt;wsp:rsid wsp:val=&quot;00302C35&quot;/&gt;&lt;wsp:rsid wsp:val=&quot;00311C49&quot;/&gt;&lt;wsp:rsid wsp:val=&quot;0032119E&quot;/&gt;&lt;wsp:rsid wsp:val=&quot;00321304&quot;/&gt;&lt;wsp:rsid wsp:val=&quot;00324FC2&quot;/&gt;&lt;wsp:rsid wsp:val=&quot;003312CA&quot;/&gt;&lt;wsp:rsid wsp:val=&quot;00331F84&quot;/&gt;&lt;wsp:rsid wsp:val=&quot;0037721F&quot;/&gt;&lt;wsp:rsid wsp:val=&quot;003950A4&quot;/&gt;&lt;wsp:rsid wsp:val=&quot;003A1E7E&quot;/&gt;&lt;wsp:rsid wsp:val=&quot;003E2069&quot;/&gt;&lt;wsp:rsid wsp:val=&quot;003E2FDC&quot;/&gt;&lt;wsp:rsid wsp:val=&quot;003E3577&quot;/&gt;&lt;wsp:rsid wsp:val=&quot;003F3A61&quot;/&gt;&lt;wsp:rsid wsp:val=&quot;00410A5D&quot;/&gt;&lt;wsp:rsid wsp:val=&quot;00414909&quot;/&gt;&lt;wsp:rsid wsp:val=&quot;00416537&quot;/&gt;&lt;wsp:rsid wsp:val=&quot;00425A6A&quot;/&gt;&lt;wsp:rsid wsp:val=&quot;00426FBB&quot;/&gt;&lt;wsp:rsid wsp:val=&quot;00454542&quot;/&gt;&lt;wsp:rsid wsp:val=&quot;0047429A&quot;/&gt;&lt;wsp:rsid wsp:val=&quot;0048374C&quot;/&gt;&lt;wsp:rsid wsp:val=&quot;0048771D&quot;/&gt;&lt;wsp:rsid wsp:val=&quot;004A6605&quot;/&gt;&lt;wsp:rsid wsp:val=&quot;004C45FA&quot;/&gt;&lt;wsp:rsid wsp:val=&quot;004D35A3&quot;/&gt;&lt;wsp:rsid wsp:val=&quot;004E1BD8&quot;/&gt;&lt;wsp:rsid wsp:val=&quot;004E452A&quot;/&gt;&lt;wsp:rsid wsp:val=&quot;004E78E3&quot;/&gt;&lt;wsp:rsid wsp:val=&quot;004F2BFE&quot;/&gt;&lt;wsp:rsid wsp:val=&quot;004F63D3&quot;/&gt;&lt;wsp:rsid wsp:val=&quot;004F7DCF&quot;/&gt;&lt;wsp:rsid wsp:val=&quot;005004BF&quot;/&gt;&lt;wsp:rsid wsp:val=&quot;00502E89&quot;/&gt;&lt;wsp:rsid wsp:val=&quot;00506CFE&quot;/&gt;&lt;wsp:rsid wsp:val=&quot;00510E95&quot;/&gt;&lt;wsp:rsid wsp:val=&quot;005225C3&quot;/&gt;&lt;wsp:rsid wsp:val=&quot;00527D56&quot;/&gt;&lt;wsp:rsid wsp:val=&quot;0053221F&quot;/&gt;&lt;wsp:rsid wsp:val=&quot;00536FAE&quot;/&gt;&lt;wsp:rsid wsp:val=&quot;00542C85&quot;/&gt;&lt;wsp:rsid wsp:val=&quot;00553510&quot;/&gt;&lt;wsp:rsid wsp:val=&quot;00554186&quot;/&gt;&lt;wsp:rsid wsp:val=&quot;00585769&quot;/&gt;&lt;wsp:rsid wsp:val=&quot;00585C61&quot;/&gt;&lt;wsp:rsid wsp:val=&quot;00591130&quot;/&gt;&lt;wsp:rsid wsp:val=&quot;005A3F28&quot;/&gt;&lt;wsp:rsid wsp:val=&quot;005A40BE&quot;/&gt;&lt;wsp:rsid wsp:val=&quot;005B13E2&quot;/&gt;&lt;wsp:rsid wsp:val=&quot;005B47D7&quot;/&gt;&lt;wsp:rsid wsp:val=&quot;005C5526&quot;/&gt;&lt;wsp:rsid wsp:val=&quot;005C62C6&quot;/&gt;&lt;wsp:rsid wsp:val=&quot;005D7B9E&quot;/&gt;&lt;wsp:rsid wsp:val=&quot;005E112E&quot;/&gt;&lt;wsp:rsid wsp:val=&quot;005F0834&quot;/&gt;&lt;wsp:rsid wsp:val=&quot;005F68AB&quot;/&gt;&lt;wsp:rsid wsp:val=&quot;005F6DC3&quot;/&gt;&lt;wsp:rsid wsp:val=&quot;00601A8E&quot;/&gt;&lt;wsp:rsid wsp:val=&quot;0062033E&quot;/&gt;&lt;wsp:rsid wsp:val=&quot;00624482&quot;/&gt;&lt;wsp:rsid wsp:val=&quot;0064799C&quot;/&gt;&lt;wsp:rsid wsp:val=&quot;00654156&quot;/&gt;&lt;wsp:rsid wsp:val=&quot;006B47CA&quot;/&gt;&lt;wsp:rsid wsp:val=&quot;006C304C&quot;/&gt;&lt;wsp:rsid wsp:val=&quot;006C4511&quot;/&gt;&lt;wsp:rsid wsp:val=&quot;006C65F5&quot;/&gt;&lt;wsp:rsid wsp:val=&quot;006C7AAA&quot;/&gt;&lt;wsp:rsid wsp:val=&quot;006D1C2A&quot;/&gt;&lt;wsp:rsid wsp:val=&quot;006D264F&quot;/&gt;&lt;wsp:rsid wsp:val=&quot;006E2A8D&quot;/&gt;&lt;wsp:rsid wsp:val=&quot;006E7574&quot;/&gt;&lt;wsp:rsid wsp:val=&quot;00703430&quot;/&gt;&lt;wsp:rsid wsp:val=&quot;00703548&quot;/&gt;&lt;wsp:rsid wsp:val=&quot;00704E18&quot;/&gt;&lt;wsp:rsid wsp:val=&quot;007069BE&quot;/&gt;&lt;wsp:rsid wsp:val=&quot;00745C86&quot;/&gt;&lt;wsp:rsid wsp:val=&quot;00764603&quot;/&gt;&lt;wsp:rsid wsp:val=&quot;0076604D&quot;/&gt;&lt;wsp:rsid wsp:val=&quot;00790909&quot;/&gt;&lt;wsp:rsid wsp:val=&quot;007B1582&quot;/&gt;&lt;wsp:rsid wsp:val=&quot;007B5A07&quot;/&gt;&lt;wsp:rsid wsp:val=&quot;007C065D&quot;/&gt;&lt;wsp:rsid wsp:val=&quot;007D3E71&quot;/&gt;&lt;wsp:rsid wsp:val=&quot;007E5D6A&quot;/&gt;&lt;wsp:rsid wsp:val=&quot;007E645D&quot;/&gt;&lt;wsp:rsid wsp:val=&quot;007F75CA&quot;/&gt;&lt;wsp:rsid wsp:val=&quot;00821E08&quot;/&gt;&lt;wsp:rsid wsp:val=&quot;00834EFD&quot;/&gt;&lt;wsp:rsid wsp:val=&quot;00844B24&quot;/&gt;&lt;wsp:rsid wsp:val=&quot;0084515F&quot;/&gt;&lt;wsp:rsid wsp:val=&quot;0085092D&quot;/&gt;&lt;wsp:rsid wsp:val=&quot;00865414&quot;/&gt;&lt;wsp:rsid wsp:val=&quot;00877D4C&quot;/&gt;&lt;wsp:rsid wsp:val=&quot;00883903&quot;/&gt;&lt;wsp:rsid wsp:val=&quot;0089763B&quot;/&gt;&lt;wsp:rsid wsp:val=&quot;008B6AE3&quot;/&gt;&lt;wsp:rsid wsp:val=&quot;008C1332&quot;/&gt;&lt;wsp:rsid wsp:val=&quot;008D1045&quot;/&gt;&lt;wsp:rsid wsp:val=&quot;008E5996&quot;/&gt;&lt;wsp:rsid wsp:val=&quot;00901AE1&quot;/&gt;&lt;wsp:rsid wsp:val=&quot;00912F93&quot;/&gt;&lt;wsp:rsid wsp:val=&quot;009205B4&quot;/&gt;&lt;wsp:rsid wsp:val=&quot;00955B59&quot;/&gt;&lt;wsp:rsid wsp:val=&quot;00992262&quot;/&gt;&lt;wsp:rsid wsp:val=&quot;009926BC&quot;/&gt;&lt;wsp:rsid wsp:val=&quot;009A4319&quot;/&gt;&lt;wsp:rsid wsp:val=&quot;009A6C3F&quot;/&gt;&lt;wsp:rsid wsp:val=&quot;009B73F2&quot;/&gt;&lt;wsp:rsid wsp:val=&quot;009C12BD&quot;/&gt;&lt;wsp:rsid wsp:val=&quot;009C50FE&quot;/&gt;&lt;wsp:rsid wsp:val=&quot;009E49DD&quot;/&gt;&lt;wsp:rsid wsp:val=&quot;00A03E75&quot;/&gt;&lt;wsp:rsid wsp:val=&quot;00A20627&quot;/&gt;&lt;wsp:rsid wsp:val=&quot;00A22FE9&quot;/&gt;&lt;wsp:rsid wsp:val=&quot;00A31A44&quot;/&gt;&lt;wsp:rsid wsp:val=&quot;00A32BFA&quot;/&gt;&lt;wsp:rsid wsp:val=&quot;00A3325E&quot;/&gt;&lt;wsp:rsid wsp:val=&quot;00A45FCE&quot;/&gt;&lt;wsp:rsid wsp:val=&quot;00A75671&quot;/&gt;&lt;wsp:rsid wsp:val=&quot;00A773CC&quot;/&gt;&lt;wsp:rsid wsp:val=&quot;00A924D0&quot;/&gt;&lt;wsp:rsid wsp:val=&quot;00A9318B&quot;/&gt;&lt;wsp:rsid wsp:val=&quot;00A94AC1&quot;/&gt;&lt;wsp:rsid wsp:val=&quot;00AB18B7&quot;/&gt;&lt;wsp:rsid wsp:val=&quot;00AD335D&quot;/&gt;&lt;wsp:rsid wsp:val=&quot;00AF114C&quot;/&gt;&lt;wsp:rsid wsp:val=&quot;00AF792B&quot;/&gt;&lt;wsp:rsid wsp:val=&quot;00B33D2F&quot;/&gt;&lt;wsp:rsid wsp:val=&quot;00B40A5B&quot;/&gt;&lt;wsp:rsid wsp:val=&quot;00B45C6B&quot;/&gt;&lt;wsp:rsid wsp:val=&quot;00B55D5E&quot;/&gt;&lt;wsp:rsid wsp:val=&quot;00B57A80&quot;/&gt;&lt;wsp:rsid wsp:val=&quot;00B70E9C&quot;/&gt;&lt;wsp:rsid wsp:val=&quot;00B713D8&quot;/&gt;&lt;wsp:rsid wsp:val=&quot;00B72979&quot;/&gt;&lt;wsp:rsid wsp:val=&quot;00B94516&quot;/&gt;&lt;wsp:rsid wsp:val=&quot;00BA25E2&quot;/&gt;&lt;wsp:rsid wsp:val=&quot;00BB2855&quot;/&gt;&lt;wsp:rsid wsp:val=&quot;00BC5343&quot;/&gt;&lt;wsp:rsid wsp:val=&quot;00BD19C1&quot;/&gt;&lt;wsp:rsid wsp:val=&quot;00BD25B8&quot;/&gt;&lt;wsp:rsid wsp:val=&quot;00C012E1&quot;/&gt;&lt;wsp:rsid wsp:val=&quot;00C06BB4&quot;/&gt;&lt;wsp:rsid wsp:val=&quot;00C10D20&quot;/&gt;&lt;wsp:rsid wsp:val=&quot;00C12E0C&quot;/&gt;&lt;wsp:rsid wsp:val=&quot;00C21916&quot;/&gt;&lt;wsp:rsid wsp:val=&quot;00C34915&quot;/&gt;&lt;wsp:rsid wsp:val=&quot;00C457CA&quot;/&gt;&lt;wsp:rsid wsp:val=&quot;00C53FB6&quot;/&gt;&lt;wsp:rsid wsp:val=&quot;00C57FB7&quot;/&gt;&lt;wsp:rsid wsp:val=&quot;00C644D4&quot;/&gt;&lt;wsp:rsid wsp:val=&quot;00C65F3F&quot;/&gt;&lt;wsp:rsid wsp:val=&quot;00C72414&quot;/&gt;&lt;wsp:rsid wsp:val=&quot;00C72B1A&quot;/&gt;&lt;wsp:rsid wsp:val=&quot;00C8667B&quot;/&gt;&lt;wsp:rsid wsp:val=&quot;00C90993&quot;/&gt;&lt;wsp:rsid wsp:val=&quot;00CA4CE3&quot;/&gt;&lt;wsp:rsid wsp:val=&quot;00CC72FD&quot;/&gt;&lt;wsp:rsid wsp:val=&quot;00CD4F3F&quot;/&gt;&lt;wsp:rsid wsp:val=&quot;00D311F8&quot;/&gt;&lt;wsp:rsid wsp:val=&quot;00D31660&quot;/&gt;&lt;wsp:rsid wsp:val=&quot;00D36B52&quot;/&gt;&lt;wsp:rsid wsp:val=&quot;00D377C8&quot;/&gt;&lt;wsp:rsid wsp:val=&quot;00D41274&quot;/&gt;&lt;wsp:rsid wsp:val=&quot;00D4229C&quot;/&gt;&lt;wsp:rsid wsp:val=&quot;00D43BF3&quot;/&gt;&lt;wsp:rsid wsp:val=&quot;00D549FB&quot;/&gt;&lt;wsp:rsid wsp:val=&quot;00D767BB&quot;/&gt;&lt;wsp:rsid wsp:val=&quot;00D939B0&quot;/&gt;&lt;wsp:rsid wsp:val=&quot;00DA31A2&quot;/&gt;&lt;wsp:rsid wsp:val=&quot;00DB16E0&quot;/&gt;&lt;wsp:rsid wsp:val=&quot;00DB2DF9&quot;/&gt;&lt;wsp:rsid wsp:val=&quot;00DB465D&quot;/&gt;&lt;wsp:rsid wsp:val=&quot;00DB48A2&quot;/&gt;&lt;wsp:rsid wsp:val=&quot;00DB7E63&quot;/&gt;&lt;wsp:rsid wsp:val=&quot;00DC2055&quot;/&gt;&lt;wsp:rsid wsp:val=&quot;00DC3908&quot;/&gt;&lt;wsp:rsid wsp:val=&quot;00DD71E8&quot;/&gt;&lt;wsp:rsid wsp:val=&quot;00DD7F83&quot;/&gt;&lt;wsp:rsid wsp:val=&quot;00DE4EB8&quot;/&gt;&lt;wsp:rsid wsp:val=&quot;00E0641E&quot;/&gt;&lt;wsp:rsid wsp:val=&quot;00E06664&quot;/&gt;&lt;wsp:rsid wsp:val=&quot;00E304BC&quot;/&gt;&lt;wsp:rsid wsp:val=&quot;00E32853&quot;/&gt;&lt;wsp:rsid wsp:val=&quot;00E34EBD&quot;/&gt;&lt;wsp:rsid wsp:val=&quot;00E401F8&quot;/&gt;&lt;wsp:rsid wsp:val=&quot;00E46425&quot;/&gt;&lt;wsp:rsid wsp:val=&quot;00E469FC&quot;/&gt;&lt;wsp:rsid wsp:val=&quot;00E47D0E&quot;/&gt;&lt;wsp:rsid wsp:val=&quot;00E65018&quot;/&gt;&lt;wsp:rsid wsp:val=&quot;00E76CA1&quot;/&gt;&lt;wsp:rsid wsp:val=&quot;00E94339&quot;/&gt;&lt;wsp:rsid wsp:val=&quot;00E97563&quot;/&gt;&lt;wsp:rsid wsp:val=&quot;00EB0B63&quot;/&gt;&lt;wsp:rsid wsp:val=&quot;00EC265C&quot;/&gt;&lt;wsp:rsid wsp:val=&quot;00ED61CB&quot;/&gt;&lt;wsp:rsid wsp:val=&quot;00EE752A&quot;/&gt;&lt;wsp:rsid wsp:val=&quot;00F06A72&quot;/&gt;&lt;wsp:rsid wsp:val=&quot;00F136F0&quot;/&gt;&lt;wsp:rsid wsp:val=&quot;00F20BBB&quot;/&gt;&lt;wsp:rsid wsp:val=&quot;00F36048&quot;/&gt;&lt;wsp:rsid wsp:val=&quot;00F43BD8&quot;/&gt;&lt;wsp:rsid wsp:val=&quot;00F562F3&quot;/&gt;&lt;wsp:rsid wsp:val=&quot;00F74B89&quot;/&gt;&lt;wsp:rsid wsp:val=&quot;00F75133&quot;/&gt;&lt;wsp:rsid wsp:val=&quot;00F83272&quot;/&gt;&lt;wsp:rsid wsp:val=&quot;00F9358D&quot;/&gt;&lt;wsp:rsid wsp:val=&quot;00FA3899&quot;/&gt;&lt;wsp:rsid wsp:val=&quot;00FA4909&quot;/&gt;&lt;wsp:rsid wsp:val=&quot;00FA5164&quot;/&gt;&lt;wsp:rsid wsp:val=&quot;00FA6751&quot;/&gt;&lt;wsp:rsid wsp:val=&quot;00FA6BD7&quot;/&gt;&lt;wsp:rsid wsp:val=&quot;00FB1048&quot;/&gt;&lt;wsp:rsid wsp:val=&quot;00FB62C4&quot;/&gt;&lt;wsp:rsid wsp:val=&quot;00FB7701&quot;/&gt;&lt;wsp:rsid wsp:val=&quot;00FD1AC5&quot;/&gt;&lt;wsp:rsid wsp:val=&quot;00FD5CF0&quot;/&gt;&lt;/wsp:rsids&gt;&lt;/w:docPr&gt;&lt;w:body&gt;&lt;wx:sect&gt;&lt;w:p wsp:rsidR=&quot;003E2069&quot; wsp:rsidRDefault=&quot;003E2069&quot; wsp:rsidP=&quot;003E2069&quot;&gt;&lt;m:oMathPara&gt;&lt;m:oMath&gt;&lt;m:sSub&gt;&lt;m:sSubPr&gt;&lt;m:ctrlPr&gt;&lt;w:rPr&gt;&lt;w:rFonts w:ascii=&quot;Cambria Math&quot; w:h-ansi=&quot;Cambria Math&quot;/&gt;&lt;wx:font wx:val=&quot;Cambria Math&quot;/&gt;&lt;w:i/&gt;&lt;/w:rPr&gt;&lt;/m:ctrlPr&gt;&lt;/m:sSubPr&gt;&lt;m:e&gt;&lt;m:r&gt;&lt;w:rPr&gt;&lt;w:rFonts w:ascii=&quot;Cambria Math&quot; w:h-ansi=&quot;Cambria Math&quot;/&gt;&lt;wx:font wx:val=&quot;Cambria Math&quot;/&gt;&lt;w:i/&gt;&lt;/w:rPr&gt;&lt;m:t&gt;V&lt;/m:t&gt;&lt;/m:r&gt;&lt;/m:e&gt;&lt;m:sub&gt;&lt;m:r&gt;&lt;w:rPr&gt;&lt;w:rFonts w:ascii=&quot;Cambria Math&quot; w:h-ansi=&quot;Cambria Math&quot;/&gt;&lt;wx:font wx:val=&quot;Cambria Math&quot;/&gt;&lt;w:i/&gt;&lt;/w:rPr&gt;&lt;m:t&gt;in&lt;/m:t&gt;&lt;/m:r&gt;&lt;/m:sub&gt;&lt;/m:sSub&gt;&lt;/m:oMath&gt;&lt;/m:oMathPara&gt;&lt;/w:p&gt;&lt;w:sectPr wsp:rsidR=&quot;00000000&quot;&gt;&lt;w:pgSz w:w=&quot;12240&quot; w:h=&quot;15840&quot;/&gt;&lt;w:pgMar w:top=&quot;1440&quot; w:right=&quot;1440&quot; w:bottom=&quot;1440&quot; w:left=&quot;1440&quot; w:header=&quot;720&quot; w:footer=&quot;720&quot; w:gutter=&quot;0&quot;/&gt;&lt;w:cols w:space=&quot;720&quot;/&gt;&lt;/w:sectPr&gt;&lt;/wx:sect&gt;&lt;/w:body&gt;&lt;/w:wordDocument&gt;">
             <v:imagedata r:id="rId13" o:title="" chromakey="white"/>
           </v:shape>
         </w:pict>
@@ -951,7 +951,7 @@
           <w:szCs w:val="20"/>
         </w:rPr>
         <w:pict w14:anchorId="431D0327">
-          <v:shape id="_x0000_i1064" type="#_x0000_t75" style="width:21.25pt;height:13.65pt" equationxml="&lt;?xml version=&quot;1.0&quot; encoding=&quot;UTF-8&quot; standalone=&quot;yes&quot;?&gt;&#10;&lt;?mso-application progid=&quot;Word.Document&quot;?&gt;&#10;&lt;w:wordDocument xmlns:aml=&quot;http://schemas.microsoft.com/aml/2001/core&quot; xmlns:wpc=&quot;http://schemas.microsoft.com/office/word/2010/wordprocessingCanvas&quot; xmlns:cx=&quot;http://schemas.microsoft.com/office/drawing/2014/chartex&quot; xmlns:cx1=&quot;http://schemas.microsoft.com/office/drawing/2015/9/8/chartex&quot; xmlns:cx2=&quot;http://schemas.microsoft.com/office/drawing/2015/10/21/chartex&quot; xmlns:cx3=&quot;http://schemas.microsoft.com/office/drawing/2016/5/9/chartex&quot; xmlns:cx4=&quot;http://schemas.microsoft.com/office/drawing/2016/5/10/chartex&quot; xmlns:cx5=&quot;http://schemas.microsoft.com/office/drawing/2016/5/11/chartex&quot; xmlns:cx6=&quot;http://schemas.microsoft.com/office/drawing/2016/5/12/chartex&quot; xmlns:cx7=&quot;http://schemas.microsoft.com/office/drawing/2016/5/13/chartex&quot; xmlns:cx8=&quot;http://schemas.microsoft.com/office/drawing/2016/5/14/chartex&quot; xmlns:cr=&quot;http://schemas.microsoft.com/office/comments/2020/reactions&quot; xmlns:dt=&quot;uuid:C2F41010-65B3-11d1-A29F-00AA00C14882&quot; xmlns:mc=&quot;http://schemas.openxmlformats.org/markup-compatibility/2006&quot; xmlns:aink=&quot;http://schemas.microsoft.com/office/drawing/2016/ink&quot; xmlns:am3d=&quot;http://schemas.microsoft.com/office/drawing/2017/model3d&quot; xmlns:o=&quot;urn:schemas-microsoft-com:office:office&quot; xmlns:oel=&quot;http://schemas.microsoft.com/office/2019/extlst&quot; xmlns:m=&quot;http://schemas.openxmlformats.org/officeDocument/2006/math&quot; xmlns:v=&quot;urn:schemas-microsoft-com:vml&quot; xmlns:w10=&quot;urn:schemas-microsoft-com:office:word&quot; xmlns:w=&quot;http://schemas.microsoft.com/office/word/2003/wordml&quot; xmlns:wx=&quot;http://schemas.microsoft.com/office/word/2003/auxHint&quot; xmlns:wne=&quot;http://schemas.microsoft.com/office/word/2006/wordml&quot; xmlns:wsp=&quot;http://schemas.microsoft.com/office/word/2003/wordml/sp2&quot; xmlns:sl=&quot;http://schemas.microsoft.com/schemaLibrary/2003/core&quot; w:macrosPresent=&quot;no&quot; w:embeddedObjPresent=&quot;no&quot; w:ocxPresent=&quot;no&quot; xml:space=&quot;preserve&quot;&gt;&lt;w:ignoreSubtree w:val=&quot;http://schemas.microsoft.com/office/word/2003/wordml/sp2&quot;/&gt;&lt;o:DocumentProperties&gt;&lt;o:Version&gt;16&lt;/o:Version&gt;&lt;/o:DocumentProperties&gt;&lt;w:docPr&gt;&lt;w:view w:val=&quot;print&quot;/&gt;&lt;w:zoom w:percent=&quot;100&quot;/&gt;&lt;w:doNotEmbedSystemFonts/&gt;&lt;w:activeWritingStyle w:lang=&quot;EN-AU&quot; w:vendorID=&quot;64&quot; w:dllVersion=&quot;6&quot; w:nlCheck=&quot;on&quot; w:optionSet=&quot;1&quot;/&gt;&lt;w:activeWritingStyle w:lang=&quot;EN-GB&quot; w:vendorID=&quot;64&quot; w:dllVersion=&quot;6&quot; w:nlCheck=&quot;on&quot; w:optionSet=&quot;1&quot;/&gt;&lt;w:activeWritingStyle w:lang=&quot;EN-US&quot; w:vendorID=&quot;64&quot; w:dllVersion=&quot;6&quot; w:nlCheck=&quot;on&quot; w:optionSet=&quot;1&quot;/&gt;&lt;w:activeWritingStyle w:lang=&quot;EN-AU&quot; w:vendorID=&quot;64&quot; w:dllVersion=&quot;0&quot; w:nlCheck=&quot;on&quot; w:optionSet=&quot;0&quot;/&gt;&lt;w:activeWritingStyle w:lang=&quot;EN-GB&quot; w:vendorID=&quot;64&quot; w:dllVersion=&quot;0&quot; w:nlCheck=&quot;on&quot; w:optionSet=&quot;0&quot;/&gt;&lt;w:activeWritingStyle w:lang=&quot;EN-US&quot; w:vendorID=&quot;64&quot; w:dllVersion=&quot;0&quot; w:nlCheck=&quot;on&quot; w:optionSet=&quot;0&quot;/&gt;&lt;w:activeWritingStyle w:lang=&quot;ES-AR&quot; w:vendorID=&quot;64&quot; w:dllVersion=&quot;0&quot; w:nlCheck=&quot;on&quot; w:optionSet=&quot;0&quot;/&gt;&lt;w:activeWritingStyle w:lang=&quot;580A&quot; w:vendorID=&quot;64&quot; w:dllVersion=&quot;0&quot; w:nlCheck=&quot;on&quot; w:optionSet=&quot;0&quot;/&gt;&lt;w:activeWritingStyle w:lang=&quot;PT-BR&quot; w:vendorID=&quot;64&quot; w:dllVersion=&quot;0&quot; w:nlCheck=&quot;on&quot; w:optionSet=&quot;0&quot;/&gt;&lt;w:stylePaneFormatFilter w:val=&quot;3F01&quot;/&gt;&lt;w:defaultTabStop w:val=&quot;720&quot;/&gt;&lt;w:hyphenationZone w:val=&quot;425&quot;/&gt;&lt;w:characterSpacingControl w:val=&quot;DontCompress&quot;/&gt;&lt;w:optimizeForBrowser/&gt;&lt;w:validateAgainstSchema/&gt;&lt;w:saveInvalidXML w:val=&quot;off&quot;/&gt;&lt;w:ignoreMixedContent w:val=&quot;off&quot;/&gt;&lt;w:alwaysShowPlaceholderText w:val=&quot;off&quot;/&gt;&lt;w:compat&gt;&lt;w:breakWrappedTables/&gt;&lt;w:snapToGridInCell/&gt;&lt;w:applyBreakingRules/&gt;&lt;w:wrapTextWithPunct/&gt;&lt;w:useAsianBreakRules/&gt;&lt;w:useWord2002TableStyleRules/&gt;&lt;w:useFELayout/&gt;&lt;/w:compat&gt;&lt;wsp:rsids&gt;&lt;wsp:rsidRoot wsp:val=&quot;00426FBB&quot;/&gt;&lt;wsp:rsid wsp:val=&quot;000002E1&quot;/&gt;&lt;wsp:rsid wsp:val=&quot;00003C97&quot;/&gt;&lt;wsp:rsid wsp:val=&quot;00005565&quot;/&gt;&lt;wsp:rsid wsp:val=&quot;0001754A&quot;/&gt;&lt;wsp:rsid wsp:val=&quot;00017719&quot;/&gt;&lt;wsp:rsid wsp:val=&quot;00027F1D&quot;/&gt;&lt;wsp:rsid wsp:val=&quot;0003296C&quot;/&gt;&lt;wsp:rsid wsp:val=&quot;0003351F&quot;/&gt;&lt;wsp:rsid wsp:val=&quot;00044599&quot;/&gt;&lt;wsp:rsid wsp:val=&quot;000540E6&quot;/&gt;&lt;wsp:rsid wsp:val=&quot;00054421&quot;/&gt;&lt;wsp:rsid wsp:val=&quot;00062E46&quot;/&gt;&lt;wsp:rsid wsp:val=&quot;00074AC8&quot;/&gt;&lt;wsp:rsid wsp:val=&quot;00081408&quot;/&gt;&lt;wsp:rsid wsp:val=&quot;00081EBE&quot;/&gt;&lt;wsp:rsid wsp:val=&quot;00086EDC&quot;/&gt;&lt;wsp:rsid wsp:val=&quot;000B36A3&quot;/&gt;&lt;wsp:rsid wsp:val=&quot;000C013C&quot;/&gt;&lt;wsp:rsid wsp:val=&quot;000E3F84&quot;/&gt;&lt;wsp:rsid wsp:val=&quot;001056DF&quot;/&gt;&lt;wsp:rsid wsp:val=&quot;0010789C&quot;/&gt;&lt;wsp:rsid wsp:val=&quot;00114025&quot;/&gt;&lt;wsp:rsid wsp:val=&quot;001160D2&quot;/&gt;&lt;wsp:rsid wsp:val=&quot;00120636&quot;/&gt;&lt;wsp:rsid wsp:val=&quot;001348A5&quot;/&gt;&lt;wsp:rsid wsp:val=&quot;00151B8E&quot;/&gt;&lt;wsp:rsid wsp:val=&quot;00182170&quot;/&gt;&lt;wsp:rsid wsp:val=&quot;001928FB&quot;/&gt;&lt;wsp:rsid wsp:val=&quot;00192BC7&quot;/&gt;&lt;wsp:rsid wsp:val=&quot;00195BE6&quot;/&gt;&lt;wsp:rsid wsp:val=&quot;001A50EA&quot;/&gt;&lt;wsp:rsid wsp:val=&quot;001F16CD&quot;/&gt;&lt;wsp:rsid wsp:val=&quot;001F47D2&quot;/&gt;&lt;wsp:rsid wsp:val=&quot;002029C8&quot;/&gt;&lt;wsp:rsid wsp:val=&quot;0022285A&quot;/&gt;&lt;wsp:rsid wsp:val=&quot;00224C61&quot;/&gt;&lt;wsp:rsid wsp:val=&quot;00256ABC&quot;/&gt;&lt;wsp:rsid wsp:val=&quot;0027227B&quot;/&gt;&lt;wsp:rsid wsp:val=&quot;00273AC7&quot;/&gt;&lt;wsp:rsid wsp:val=&quot;00273D2C&quot;/&gt;&lt;wsp:rsid wsp:val=&quot;00285ECD&quot;/&gt;&lt;wsp:rsid wsp:val=&quot;00290E1B&quot;/&gt;&lt;wsp:rsid wsp:val=&quot;00291B17&quot;/&gt;&lt;wsp:rsid wsp:val=&quot;00291BB3&quot;/&gt;&lt;wsp:rsid wsp:val=&quot;002A6742&quot;/&gt;&lt;wsp:rsid wsp:val=&quot;002C1A7F&quot;/&gt;&lt;wsp:rsid wsp:val=&quot;002C4239&quot;/&gt;&lt;wsp:rsid wsp:val=&quot;002C559D&quot;/&gt;&lt;wsp:rsid wsp:val=&quot;002D16AE&quot;/&gt;&lt;wsp:rsid wsp:val=&quot;002D2D42&quot;/&gt;&lt;wsp:rsid wsp:val=&quot;002F72D0&quot;/&gt;&lt;wsp:rsid wsp:val=&quot;002F7A4F&quot;/&gt;&lt;wsp:rsid wsp:val=&quot;003003AB&quot;/&gt;&lt;wsp:rsid wsp:val=&quot;00302C35&quot;/&gt;&lt;wsp:rsid wsp:val=&quot;00311C49&quot;/&gt;&lt;wsp:rsid wsp:val=&quot;0032119E&quot;/&gt;&lt;wsp:rsid wsp:val=&quot;00321304&quot;/&gt;&lt;wsp:rsid wsp:val=&quot;00324FC2&quot;/&gt;&lt;wsp:rsid wsp:val=&quot;003312CA&quot;/&gt;&lt;wsp:rsid wsp:val=&quot;00331F84&quot;/&gt;&lt;wsp:rsid wsp:val=&quot;0037721F&quot;/&gt;&lt;wsp:rsid wsp:val=&quot;003950A4&quot;/&gt;&lt;wsp:rsid wsp:val=&quot;003A1E7E&quot;/&gt;&lt;wsp:rsid wsp:val=&quot;003E2FDC&quot;/&gt;&lt;wsp:rsid wsp:val=&quot;003E3577&quot;/&gt;&lt;wsp:rsid wsp:val=&quot;003F3A61&quot;/&gt;&lt;wsp:rsid wsp:val=&quot;00410A5D&quot;/&gt;&lt;wsp:rsid wsp:val=&quot;00414909&quot;/&gt;&lt;wsp:rsid wsp:val=&quot;00416537&quot;/&gt;&lt;wsp:rsid wsp:val=&quot;00425A6A&quot;/&gt;&lt;wsp:rsid wsp:val=&quot;00426FBB&quot;/&gt;&lt;wsp:rsid wsp:val=&quot;00454542&quot;/&gt;&lt;wsp:rsid wsp:val=&quot;0047429A&quot;/&gt;&lt;wsp:rsid wsp:val=&quot;0048374C&quot;/&gt;&lt;wsp:rsid wsp:val=&quot;0048771D&quot;/&gt;&lt;wsp:rsid wsp:val=&quot;004A6605&quot;/&gt;&lt;wsp:rsid wsp:val=&quot;004C45FA&quot;/&gt;&lt;wsp:rsid wsp:val=&quot;004D35A3&quot;/&gt;&lt;wsp:rsid wsp:val=&quot;004E1BD8&quot;/&gt;&lt;wsp:rsid wsp:val=&quot;004E452A&quot;/&gt;&lt;wsp:rsid wsp:val=&quot;004E78E3&quot;/&gt;&lt;wsp:rsid wsp:val=&quot;004F2BFE&quot;/&gt;&lt;wsp:rsid wsp:val=&quot;004F63D3&quot;/&gt;&lt;wsp:rsid wsp:val=&quot;004F7DCF&quot;/&gt;&lt;wsp:rsid wsp:val=&quot;005004BF&quot;/&gt;&lt;wsp:rsid wsp:val=&quot;00502E89&quot;/&gt;&lt;wsp:rsid wsp:val=&quot;00506CFE&quot;/&gt;&lt;wsp:rsid wsp:val=&quot;00510E95&quot;/&gt;&lt;wsp:rsid wsp:val=&quot;005225C3&quot;/&gt;&lt;wsp:rsid wsp:val=&quot;00527D56&quot;/&gt;&lt;wsp:rsid wsp:val=&quot;0053221F&quot;/&gt;&lt;wsp:rsid wsp:val=&quot;00536FAE&quot;/&gt;&lt;wsp:rsid wsp:val=&quot;00542C85&quot;/&gt;&lt;wsp:rsid wsp:val=&quot;00553510&quot;/&gt;&lt;wsp:rsid wsp:val=&quot;00554186&quot;/&gt;&lt;wsp:rsid wsp:val=&quot;00585769&quot;/&gt;&lt;wsp:rsid wsp:val=&quot;00585C61&quot;/&gt;&lt;wsp:rsid wsp:val=&quot;00591130&quot;/&gt;&lt;wsp:rsid wsp:val=&quot;005A3F28&quot;/&gt;&lt;wsp:rsid wsp:val=&quot;005A40BE&quot;/&gt;&lt;wsp:rsid wsp:val=&quot;005B13E2&quot;/&gt;&lt;wsp:rsid wsp:val=&quot;005B47D7&quot;/&gt;&lt;wsp:rsid wsp:val=&quot;005C5526&quot;/&gt;&lt;wsp:rsid wsp:val=&quot;005C62C6&quot;/&gt;&lt;wsp:rsid wsp:val=&quot;005D7B9E&quot;/&gt;&lt;wsp:rsid wsp:val=&quot;005E112E&quot;/&gt;&lt;wsp:rsid wsp:val=&quot;005F0834&quot;/&gt;&lt;wsp:rsid wsp:val=&quot;005F68AB&quot;/&gt;&lt;wsp:rsid wsp:val=&quot;005F6DC3&quot;/&gt;&lt;wsp:rsid wsp:val=&quot;00601A8E&quot;/&gt;&lt;wsp:rsid wsp:val=&quot;0062033E&quot;/&gt;&lt;wsp:rsid wsp:val=&quot;00624482&quot;/&gt;&lt;wsp:rsid wsp:val=&quot;0064799C&quot;/&gt;&lt;wsp:rsid wsp:val=&quot;00654156&quot;/&gt;&lt;wsp:rsid wsp:val=&quot;006B47CA&quot;/&gt;&lt;wsp:rsid wsp:val=&quot;006C304C&quot;/&gt;&lt;wsp:rsid wsp:val=&quot;006C4511&quot;/&gt;&lt;wsp:rsid wsp:val=&quot;006C65F5&quot;/&gt;&lt;wsp:rsid wsp:val=&quot;006C7AAA&quot;/&gt;&lt;wsp:rsid wsp:val=&quot;006D1C2A&quot;/&gt;&lt;wsp:rsid wsp:val=&quot;006D264F&quot;/&gt;&lt;wsp:rsid wsp:val=&quot;006E2A8D&quot;/&gt;&lt;wsp:rsid wsp:val=&quot;006E7574&quot;/&gt;&lt;wsp:rsid wsp:val=&quot;00703430&quot;/&gt;&lt;wsp:rsid wsp:val=&quot;00703548&quot;/&gt;&lt;wsp:rsid wsp:val=&quot;00704E18&quot;/&gt;&lt;wsp:rsid wsp:val=&quot;007069BE&quot;/&gt;&lt;wsp:rsid wsp:val=&quot;00745C86&quot;/&gt;&lt;wsp:rsid wsp:val=&quot;00764603&quot;/&gt;&lt;wsp:rsid wsp:val=&quot;0076604D&quot;/&gt;&lt;wsp:rsid wsp:val=&quot;00790909&quot;/&gt;&lt;wsp:rsid wsp:val=&quot;007B1582&quot;/&gt;&lt;wsp:rsid wsp:val=&quot;007B5A07&quot;/&gt;&lt;wsp:rsid wsp:val=&quot;007C065D&quot;/&gt;&lt;wsp:rsid wsp:val=&quot;007D3E71&quot;/&gt;&lt;wsp:rsid wsp:val=&quot;007E5D6A&quot;/&gt;&lt;wsp:rsid wsp:val=&quot;007E645D&quot;/&gt;&lt;wsp:rsid wsp:val=&quot;007F75CA&quot;/&gt;&lt;wsp:rsid wsp:val=&quot;00821E08&quot;/&gt;&lt;wsp:rsid wsp:val=&quot;00834EFD&quot;/&gt;&lt;wsp:rsid wsp:val=&quot;00844B24&quot;/&gt;&lt;wsp:rsid wsp:val=&quot;0084515F&quot;/&gt;&lt;wsp:rsid wsp:val=&quot;0085092D&quot;/&gt;&lt;wsp:rsid wsp:val=&quot;00865414&quot;/&gt;&lt;wsp:rsid wsp:val=&quot;00877D4C&quot;/&gt;&lt;wsp:rsid wsp:val=&quot;00883903&quot;/&gt;&lt;wsp:rsid wsp:val=&quot;0089763B&quot;/&gt;&lt;wsp:rsid wsp:val=&quot;008B6AE3&quot;/&gt;&lt;wsp:rsid wsp:val=&quot;008C1332&quot;/&gt;&lt;wsp:rsid wsp:val=&quot;008D1045&quot;/&gt;&lt;wsp:rsid wsp:val=&quot;008E5996&quot;/&gt;&lt;wsp:rsid wsp:val=&quot;00901AE1&quot;/&gt;&lt;wsp:rsid wsp:val=&quot;00912F93&quot;/&gt;&lt;wsp:rsid wsp:val=&quot;009205B4&quot;/&gt;&lt;wsp:rsid wsp:val=&quot;00955B59&quot;/&gt;&lt;wsp:rsid wsp:val=&quot;00992262&quot;/&gt;&lt;wsp:rsid wsp:val=&quot;009926BC&quot;/&gt;&lt;wsp:rsid wsp:val=&quot;009A4319&quot;/&gt;&lt;wsp:rsid wsp:val=&quot;009A6C3F&quot;/&gt;&lt;wsp:rsid wsp:val=&quot;009B73F2&quot;/&gt;&lt;wsp:rsid wsp:val=&quot;009C12BD&quot;/&gt;&lt;wsp:rsid wsp:val=&quot;009C50FE&quot;/&gt;&lt;wsp:rsid wsp:val=&quot;009E49DD&quot;/&gt;&lt;wsp:rsid wsp:val=&quot;00A03E75&quot;/&gt;&lt;wsp:rsid wsp:val=&quot;00A20627&quot;/&gt;&lt;wsp:rsid wsp:val=&quot;00A22FE9&quot;/&gt;&lt;wsp:rsid wsp:val=&quot;00A31A44&quot;/&gt;&lt;wsp:rsid wsp:val=&quot;00A32BFA&quot;/&gt;&lt;wsp:rsid wsp:val=&quot;00A3325E&quot;/&gt;&lt;wsp:rsid wsp:val=&quot;00A45FCE&quot;/&gt;&lt;wsp:rsid wsp:val=&quot;00A75671&quot;/&gt;&lt;wsp:rsid wsp:val=&quot;00A773CC&quot;/&gt;&lt;wsp:rsid wsp:val=&quot;00A924D0&quot;/&gt;&lt;wsp:rsid wsp:val=&quot;00A9318B&quot;/&gt;&lt;wsp:rsid wsp:val=&quot;00A94AC1&quot;/&gt;&lt;wsp:rsid wsp:val=&quot;00AB18B7&quot;/&gt;&lt;wsp:rsid wsp:val=&quot;00AC510A&quot;/&gt;&lt;wsp:rsid wsp:val=&quot;00AD335D&quot;/&gt;&lt;wsp:rsid wsp:val=&quot;00AF114C&quot;/&gt;&lt;wsp:rsid wsp:val=&quot;00AF792B&quot;/&gt;&lt;wsp:rsid wsp:val=&quot;00B33D2F&quot;/&gt;&lt;wsp:rsid wsp:val=&quot;00B40A5B&quot;/&gt;&lt;wsp:rsid wsp:val=&quot;00B45C6B&quot;/&gt;&lt;wsp:rsid wsp:val=&quot;00B55D5E&quot;/&gt;&lt;wsp:rsid wsp:val=&quot;00B57A80&quot;/&gt;&lt;wsp:rsid wsp:val=&quot;00B70E9C&quot;/&gt;&lt;wsp:rsid wsp:val=&quot;00B713D8&quot;/&gt;&lt;wsp:rsid wsp:val=&quot;00B72979&quot;/&gt;&lt;wsp:rsid wsp:val=&quot;00B94516&quot;/&gt;&lt;wsp:rsid wsp:val=&quot;00BA25E2&quot;/&gt;&lt;wsp:rsid wsp:val=&quot;00BB2855&quot;/&gt;&lt;wsp:rsid wsp:val=&quot;00BC5343&quot;/&gt;&lt;wsp:rsid wsp:val=&quot;00BD19C1&quot;/&gt;&lt;wsp:rsid wsp:val=&quot;00BD25B8&quot;/&gt;&lt;wsp:rsid wsp:val=&quot;00C012E1&quot;/&gt;&lt;wsp:rsid wsp:val=&quot;00C06BB4&quot;/&gt;&lt;wsp:rsid wsp:val=&quot;00C10D20&quot;/&gt;&lt;wsp:rsid wsp:val=&quot;00C12E0C&quot;/&gt;&lt;wsp:rsid wsp:val=&quot;00C21916&quot;/&gt;&lt;wsp:rsid wsp:val=&quot;00C34915&quot;/&gt;&lt;wsp:rsid wsp:val=&quot;00C457CA&quot;/&gt;&lt;wsp:rsid wsp:val=&quot;00C53FB6&quot;/&gt;&lt;wsp:rsid wsp:val=&quot;00C57FB7&quot;/&gt;&lt;wsp:rsid wsp:val=&quot;00C644D4&quot;/&gt;&lt;wsp:rsid wsp:val=&quot;00C65F3F&quot;/&gt;&lt;wsp:rsid wsp:val=&quot;00C72414&quot;/&gt;&lt;wsp:rsid wsp:val=&quot;00C72B1A&quot;/&gt;&lt;wsp:rsid wsp:val=&quot;00C8667B&quot;/&gt;&lt;wsp:rsid wsp:val=&quot;00C90993&quot;/&gt;&lt;wsp:rsid wsp:val=&quot;00CA4CE3&quot;/&gt;&lt;wsp:rsid wsp:val=&quot;00CC72FD&quot;/&gt;&lt;wsp:rsid wsp:val=&quot;00CD4F3F&quot;/&gt;&lt;wsp:rsid wsp:val=&quot;00D311F8&quot;/&gt;&lt;wsp:rsid wsp:val=&quot;00D31660&quot;/&gt;&lt;wsp:rsid wsp:val=&quot;00D36B52&quot;/&gt;&lt;wsp:rsid wsp:val=&quot;00D377C8&quot;/&gt;&lt;wsp:rsid wsp:val=&quot;00D41274&quot;/&gt;&lt;wsp:rsid wsp:val=&quot;00D4229C&quot;/&gt;&lt;wsp:rsid wsp:val=&quot;00D43BF3&quot;/&gt;&lt;wsp:rsid wsp:val=&quot;00D549FB&quot;/&gt;&lt;wsp:rsid wsp:val=&quot;00D767BB&quot;/&gt;&lt;wsp:rsid wsp:val=&quot;00D939B0&quot;/&gt;&lt;wsp:rsid wsp:val=&quot;00DA31A2&quot;/&gt;&lt;wsp:rsid wsp:val=&quot;00DB16E0&quot;/&gt;&lt;wsp:rsid wsp:val=&quot;00DB2DF9&quot;/&gt;&lt;wsp:rsid wsp:val=&quot;00DB465D&quot;/&gt;&lt;wsp:rsid wsp:val=&quot;00DB48A2&quot;/&gt;&lt;wsp:rsid wsp:val=&quot;00DB7E63&quot;/&gt;&lt;wsp:rsid wsp:val=&quot;00DC2055&quot;/&gt;&lt;wsp:rsid wsp:val=&quot;00DC3908&quot;/&gt;&lt;wsp:rsid wsp:val=&quot;00DD71E8&quot;/&gt;&lt;wsp:rsid wsp:val=&quot;00DD7F83&quot;/&gt;&lt;wsp:rsid wsp:val=&quot;00DE4EB8&quot;/&gt;&lt;wsp:rsid wsp:val=&quot;00E0641E&quot;/&gt;&lt;wsp:rsid wsp:val=&quot;00E06664&quot;/&gt;&lt;wsp:rsid wsp:val=&quot;00E304BC&quot;/&gt;&lt;wsp:rsid wsp:val=&quot;00E32853&quot;/&gt;&lt;wsp:rsid wsp:val=&quot;00E34EBD&quot;/&gt;&lt;wsp:rsid wsp:val=&quot;00E401F8&quot;/&gt;&lt;wsp:rsid wsp:val=&quot;00E46425&quot;/&gt;&lt;wsp:rsid wsp:val=&quot;00E469FC&quot;/&gt;&lt;wsp:rsid wsp:val=&quot;00E47D0E&quot;/&gt;&lt;wsp:rsid wsp:val=&quot;00E65018&quot;/&gt;&lt;wsp:rsid wsp:val=&quot;00E76CA1&quot;/&gt;&lt;wsp:rsid wsp:val=&quot;00E94339&quot;/&gt;&lt;wsp:rsid wsp:val=&quot;00E97563&quot;/&gt;&lt;wsp:rsid wsp:val=&quot;00EB0B63&quot;/&gt;&lt;wsp:rsid wsp:val=&quot;00EC265C&quot;/&gt;&lt;wsp:rsid wsp:val=&quot;00ED61CB&quot;/&gt;&lt;wsp:rsid wsp:val=&quot;00EE752A&quot;/&gt;&lt;wsp:rsid wsp:val=&quot;00F06A72&quot;/&gt;&lt;wsp:rsid wsp:val=&quot;00F136F0&quot;/&gt;&lt;wsp:rsid wsp:val=&quot;00F20BBB&quot;/&gt;&lt;wsp:rsid wsp:val=&quot;00F36048&quot;/&gt;&lt;wsp:rsid wsp:val=&quot;00F43BD8&quot;/&gt;&lt;wsp:rsid wsp:val=&quot;00F562F3&quot;/&gt;&lt;wsp:rsid wsp:val=&quot;00F74B89&quot;/&gt;&lt;wsp:rsid wsp:val=&quot;00F75133&quot;/&gt;&lt;wsp:rsid wsp:val=&quot;00F83272&quot;/&gt;&lt;wsp:rsid wsp:val=&quot;00F9358D&quot;/&gt;&lt;wsp:rsid wsp:val=&quot;00FA3899&quot;/&gt;&lt;wsp:rsid wsp:val=&quot;00FA4909&quot;/&gt;&lt;wsp:rsid wsp:val=&quot;00FA5164&quot;/&gt;&lt;wsp:rsid wsp:val=&quot;00FA6751&quot;/&gt;&lt;wsp:rsid wsp:val=&quot;00FA6BD7&quot;/&gt;&lt;wsp:rsid wsp:val=&quot;00FB1048&quot;/&gt;&lt;wsp:rsid wsp:val=&quot;00FB62C4&quot;/&gt;&lt;wsp:rsid wsp:val=&quot;00FB7701&quot;/&gt;&lt;wsp:rsid wsp:val=&quot;00FD1AC5&quot;/&gt;&lt;wsp:rsid wsp:val=&quot;00FD5CF0&quot;/&gt;&lt;/wsp:rsids&gt;&lt;/w:docPr&gt;&lt;w:body&gt;&lt;wx:sect&gt;&lt;w:p wsp:rsidR=&quot;00AC510A&quot; wsp:rsidRDefault=&quot;00AC510A&quot; wsp:rsidP=&quot;00AC510A&quot;&gt;&lt;m:oMathPara&gt;&lt;m:oMath&gt;&lt;m:sSub&gt;&lt;m:sSubPr&gt;&lt;m:ctrlPr&gt;&lt;w:rPr&gt;&lt;w:rFonts w:ascii=&quot;Cambria Math&quot; w:fareast=&quot;Times New Roman&quot; w:h-ansi=&quot;Cambria Math&quot;/&gt;&lt;wx:font wx:val=&quot;Cambria Math&quot;/&gt;&lt;w:i/&gt;&lt;/w:rPr&gt;&lt;/m:ctrlPr&gt;&lt;/m:sSubPr&gt;&lt;m:e&gt;&lt;m:r&gt;&lt;w:rPr&gt;&lt;w:rFonts w:ascii=&quot;Cambria Math&quot; w:fareast=&quot;Times New Roman&quot; w:h-ansi=&quot;Cambria Math&quot;/&gt;&lt;wx:font wx:val=&quot;Cambria Math&quot;/&gt;&lt;w:i/&gt;&lt;/w:rPr&gt;&lt;m:t&gt;V&lt;/m:t&gt;&lt;/m:r&gt;&lt;/m:e&gt;&lt;m:sub&gt;&lt;m:r&gt;&lt;w:rPr&gt;&lt;w:rFonts w:ascii=&quot;Cambria Math&quot; w:fareast=&quot;Times New Roman&quot; w:h-ansi=&quot;Cambria Math&quot;/&gt;&lt;wx:font wx:val=&quot;Cambria Math&quot;/&gt;&lt;w:i/&gt;&lt;/w:rPr&gt;&lt;m:t&gt;out&lt;/m:t&gt;&lt;/m:r&gt;&lt;/m:sub&gt;&lt;/m:sSub&gt;&lt;/m:oMath&gt;&lt;/m:oMathPara&gt;&lt;/w:p&gt;&lt;w:sectPr wsp:rsidR=&quot;00000000&quot;&gt;&lt;w:pgSz w:w=&quot;12240&quot; w:h=&quot;15840&quot;/&gt;&lt;w:pgMar w:top=&quot;1440&quot; w:right=&quot;1440&quot; w:bottom=&quot;1440&quot; w:left=&quot;1440&quot; w:header=&quot;720&quot; w:footer=&quot;720&quot; w:gutter=&quot;0&quot;/&gt;&lt;w:cols w:space=&quot;720&quot;/&gt;&lt;/w:sectPr&gt;&lt;/wx:sect&gt;&lt;/w:body&gt;&lt;/w:wordDocument&gt;">
+          <v:shape id="_x0000_i1031" type="#_x0000_t75" style="width:21.45pt;height:13.85pt" equationxml="&lt;?xml version=&quot;1.0&quot; encoding=&quot;UTF-8&quot; standalone=&quot;yes&quot;?&gt;&#10;&lt;?mso-application progid=&quot;Word.Document&quot;?&gt;&#10;&lt;w:wordDocument xmlns:aml=&quot;http://schemas.microsoft.com/aml/2001/core&quot; xmlns:wpc=&quot;http://schemas.microsoft.com/office/word/2010/wordprocessingCanvas&quot; xmlns:cx=&quot;http://schemas.microsoft.com/office/drawing/2014/chartex&quot; xmlns:cx1=&quot;http://schemas.microsoft.com/office/drawing/2015/9/8/chartex&quot; xmlns:cx2=&quot;http://schemas.microsoft.com/office/drawing/2015/10/21/chartex&quot; xmlns:cx3=&quot;http://schemas.microsoft.com/office/drawing/2016/5/9/chartex&quot; xmlns:cx4=&quot;http://schemas.microsoft.com/office/drawing/2016/5/10/chartex&quot; xmlns:cx5=&quot;http://schemas.microsoft.com/office/drawing/2016/5/11/chartex&quot; xmlns:cx6=&quot;http://schemas.microsoft.com/office/drawing/2016/5/12/chartex&quot; xmlns:cx7=&quot;http://schemas.microsoft.com/office/drawing/2016/5/13/chartex&quot; xmlns:cx8=&quot;http://schemas.microsoft.com/office/drawing/2016/5/14/chartex&quot; xmlns:cr=&quot;http://schemas.microsoft.com/office/comments/2020/reactions&quot; xmlns:dt=&quot;uuid:C2F41010-65B3-11d1-A29F-00AA00C14882&quot; xmlns:mc=&quot;http://schemas.openxmlformats.org/markup-compatibility/2006&quot; xmlns:aink=&quot;http://schemas.microsoft.com/office/drawing/2016/ink&quot; xmlns:am3d=&quot;http://schemas.microsoft.com/office/drawing/2017/model3d&quot; xmlns:o=&quot;urn:schemas-microsoft-com:office:office&quot; xmlns:oel=&quot;http://schemas.microsoft.com/office/2019/extlst&quot; xmlns:m=&quot;http://schemas.openxmlformats.org/officeDocument/2006/math&quot; xmlns:v=&quot;urn:schemas-microsoft-com:vml&quot; xmlns:w10=&quot;urn:schemas-microsoft-com:office:word&quot; xmlns:w=&quot;http://schemas.microsoft.com/office/word/2003/wordml&quot; xmlns:wx=&quot;http://schemas.microsoft.com/office/word/2003/auxHint&quot; xmlns:wne=&quot;http://schemas.microsoft.com/office/word/2006/wordml&quot; xmlns:wsp=&quot;http://schemas.microsoft.com/office/word/2003/wordml/sp2&quot; xmlns:sl=&quot;http://schemas.microsoft.com/schemaLibrary/2003/core&quot; w:macrosPresent=&quot;no&quot; w:embeddedObjPresent=&quot;no&quot; w:ocxPresent=&quot;no&quot; xml:space=&quot;preserve&quot;&gt;&lt;w:ignoreSubtree w:val=&quot;http://schemas.microsoft.com/office/word/2003/wordml/sp2&quot;/&gt;&lt;o:DocumentProperties&gt;&lt;o:Version&gt;16&lt;/o:Version&gt;&lt;/o:DocumentProperties&gt;&lt;w:docPr&gt;&lt;w:view w:val=&quot;print&quot;/&gt;&lt;w:zoom w:percent=&quot;100&quot;/&gt;&lt;w:doNotEmbedSystemFonts/&gt;&lt;w:activeWritingStyle w:lang=&quot;EN-AU&quot; w:vendorID=&quot;64&quot; w:dllVersion=&quot;6&quot; w:nlCheck=&quot;on&quot; w:optionSet=&quot;1&quot;/&gt;&lt;w:activeWritingStyle w:lang=&quot;EN-GB&quot; w:vendorID=&quot;64&quot; w:dllVersion=&quot;6&quot; w:nlCheck=&quot;on&quot; w:optionSet=&quot;1&quot;/&gt;&lt;w:activeWritingStyle w:lang=&quot;EN-US&quot; w:vendorID=&quot;64&quot; w:dllVersion=&quot;6&quot; w:nlCheck=&quot;on&quot; w:optionSet=&quot;1&quot;/&gt;&lt;w:activeWritingStyle w:lang=&quot;EN-AU&quot; w:vendorID=&quot;64&quot; w:dllVersion=&quot;0&quot; w:nlCheck=&quot;on&quot; w:optionSet=&quot;0&quot;/&gt;&lt;w:activeWritingStyle w:lang=&quot;EN-GB&quot; w:vendorID=&quot;64&quot; w:dllVersion=&quot;0&quot; w:nlCheck=&quot;on&quot; w:optionSet=&quot;0&quot;/&gt;&lt;w:activeWritingStyle w:lang=&quot;EN-US&quot; w:vendorID=&quot;64&quot; w:dllVersion=&quot;0&quot; w:nlCheck=&quot;on&quot; w:optionSet=&quot;0&quot;/&gt;&lt;w:activeWritingStyle w:lang=&quot;ES-AR&quot; w:vendorID=&quot;64&quot; w:dllVersion=&quot;0&quot; w:nlCheck=&quot;on&quot; w:optionSet=&quot;0&quot;/&gt;&lt;w:activeWritingStyle w:lang=&quot;580A&quot; w:vendorID=&quot;64&quot; w:dllVersion=&quot;0&quot; w:nlCheck=&quot;on&quot; w:optionSet=&quot;0&quot;/&gt;&lt;w:activeWritingStyle w:lang=&quot;PT-BR&quot; w:vendorID=&quot;64&quot; w:dllVersion=&quot;0&quot; w:nlCheck=&quot;on&quot; w:optionSet=&quot;0&quot;/&gt;&lt;w:stylePaneFormatFilter w:val=&quot;3F01&quot;/&gt;&lt;w:defaultTabStop w:val=&quot;720&quot;/&gt;&lt;w:hyphenationZone w:val=&quot;425&quot;/&gt;&lt;w:characterSpacingControl w:val=&quot;DontCompress&quot;/&gt;&lt;w:optimizeForBrowser/&gt;&lt;w:validateAgainstSchema/&gt;&lt;w:saveInvalidXML w:val=&quot;off&quot;/&gt;&lt;w:ignoreMixedContent w:val=&quot;off&quot;/&gt;&lt;w:alwaysShowPlaceholderText w:val=&quot;off&quot;/&gt;&lt;w:compat&gt;&lt;w:breakWrappedTables/&gt;&lt;w:snapToGridInCell/&gt;&lt;w:applyBreakingRules/&gt;&lt;w:wrapTextWithPunct/&gt;&lt;w:useAsianBreakRules/&gt;&lt;w:useWord2002TableStyleRules/&gt;&lt;w:useFELayout/&gt;&lt;/w:compat&gt;&lt;wsp:rsids&gt;&lt;wsp:rsidRoot wsp:val=&quot;00426FBB&quot;/&gt;&lt;wsp:rsid wsp:val=&quot;000002E1&quot;/&gt;&lt;wsp:rsid wsp:val=&quot;00003C97&quot;/&gt;&lt;wsp:rsid wsp:val=&quot;00005565&quot;/&gt;&lt;wsp:rsid wsp:val=&quot;0001754A&quot;/&gt;&lt;wsp:rsid wsp:val=&quot;00017719&quot;/&gt;&lt;wsp:rsid wsp:val=&quot;00027F1D&quot;/&gt;&lt;wsp:rsid wsp:val=&quot;0003296C&quot;/&gt;&lt;wsp:rsid wsp:val=&quot;0003351F&quot;/&gt;&lt;wsp:rsid wsp:val=&quot;00044599&quot;/&gt;&lt;wsp:rsid wsp:val=&quot;000540E6&quot;/&gt;&lt;wsp:rsid wsp:val=&quot;00054421&quot;/&gt;&lt;wsp:rsid wsp:val=&quot;00062E46&quot;/&gt;&lt;wsp:rsid wsp:val=&quot;00074AC8&quot;/&gt;&lt;wsp:rsid wsp:val=&quot;00081408&quot;/&gt;&lt;wsp:rsid wsp:val=&quot;00081EBE&quot;/&gt;&lt;wsp:rsid wsp:val=&quot;00086EDC&quot;/&gt;&lt;wsp:rsid wsp:val=&quot;000B36A3&quot;/&gt;&lt;wsp:rsid wsp:val=&quot;000C013C&quot;/&gt;&lt;wsp:rsid wsp:val=&quot;000E3F84&quot;/&gt;&lt;wsp:rsid wsp:val=&quot;001056DF&quot;/&gt;&lt;wsp:rsid wsp:val=&quot;0010789C&quot;/&gt;&lt;wsp:rsid wsp:val=&quot;00114025&quot;/&gt;&lt;wsp:rsid wsp:val=&quot;001160D2&quot;/&gt;&lt;wsp:rsid wsp:val=&quot;00120636&quot;/&gt;&lt;wsp:rsid wsp:val=&quot;001348A5&quot;/&gt;&lt;wsp:rsid wsp:val=&quot;00151B8E&quot;/&gt;&lt;wsp:rsid wsp:val=&quot;00182170&quot;/&gt;&lt;wsp:rsid wsp:val=&quot;001928FB&quot;/&gt;&lt;wsp:rsid wsp:val=&quot;00192BC7&quot;/&gt;&lt;wsp:rsid wsp:val=&quot;00195BE6&quot;/&gt;&lt;wsp:rsid wsp:val=&quot;001A50EA&quot;/&gt;&lt;wsp:rsid wsp:val=&quot;001F16CD&quot;/&gt;&lt;wsp:rsid wsp:val=&quot;001F47D2&quot;/&gt;&lt;wsp:rsid wsp:val=&quot;002029C8&quot;/&gt;&lt;wsp:rsid wsp:val=&quot;0022285A&quot;/&gt;&lt;wsp:rsid wsp:val=&quot;00224C61&quot;/&gt;&lt;wsp:rsid wsp:val=&quot;00256ABC&quot;/&gt;&lt;wsp:rsid wsp:val=&quot;0027227B&quot;/&gt;&lt;wsp:rsid wsp:val=&quot;00273AC7&quot;/&gt;&lt;wsp:rsid wsp:val=&quot;00273D2C&quot;/&gt;&lt;wsp:rsid wsp:val=&quot;00285ECD&quot;/&gt;&lt;wsp:rsid wsp:val=&quot;00290E1B&quot;/&gt;&lt;wsp:rsid wsp:val=&quot;00291B17&quot;/&gt;&lt;wsp:rsid wsp:val=&quot;00291BB3&quot;/&gt;&lt;wsp:rsid wsp:val=&quot;002A6742&quot;/&gt;&lt;wsp:rsid wsp:val=&quot;002C1A7F&quot;/&gt;&lt;wsp:rsid wsp:val=&quot;002C4239&quot;/&gt;&lt;wsp:rsid wsp:val=&quot;002C559D&quot;/&gt;&lt;wsp:rsid wsp:val=&quot;002D16AE&quot;/&gt;&lt;wsp:rsid wsp:val=&quot;002D2D42&quot;/&gt;&lt;wsp:rsid wsp:val=&quot;002F72D0&quot;/&gt;&lt;wsp:rsid wsp:val=&quot;002F7A4F&quot;/&gt;&lt;wsp:rsid wsp:val=&quot;003003AB&quot;/&gt;&lt;wsp:rsid wsp:val=&quot;00302C35&quot;/&gt;&lt;wsp:rsid wsp:val=&quot;00311C49&quot;/&gt;&lt;wsp:rsid wsp:val=&quot;0032119E&quot;/&gt;&lt;wsp:rsid wsp:val=&quot;00321304&quot;/&gt;&lt;wsp:rsid wsp:val=&quot;00324FC2&quot;/&gt;&lt;wsp:rsid wsp:val=&quot;003312CA&quot;/&gt;&lt;wsp:rsid wsp:val=&quot;00331F84&quot;/&gt;&lt;wsp:rsid wsp:val=&quot;0037721F&quot;/&gt;&lt;wsp:rsid wsp:val=&quot;003950A4&quot;/&gt;&lt;wsp:rsid wsp:val=&quot;003A1E7E&quot;/&gt;&lt;wsp:rsid wsp:val=&quot;003E2FDC&quot;/&gt;&lt;wsp:rsid wsp:val=&quot;003E3577&quot;/&gt;&lt;wsp:rsid wsp:val=&quot;003F3A61&quot;/&gt;&lt;wsp:rsid wsp:val=&quot;00410A5D&quot;/&gt;&lt;wsp:rsid wsp:val=&quot;00414909&quot;/&gt;&lt;wsp:rsid wsp:val=&quot;00416537&quot;/&gt;&lt;wsp:rsid wsp:val=&quot;00425A6A&quot;/&gt;&lt;wsp:rsid wsp:val=&quot;00426FBB&quot;/&gt;&lt;wsp:rsid wsp:val=&quot;00454542&quot;/&gt;&lt;wsp:rsid wsp:val=&quot;0047429A&quot;/&gt;&lt;wsp:rsid wsp:val=&quot;0048374C&quot;/&gt;&lt;wsp:rsid wsp:val=&quot;0048771D&quot;/&gt;&lt;wsp:rsid wsp:val=&quot;004A6605&quot;/&gt;&lt;wsp:rsid wsp:val=&quot;004C45FA&quot;/&gt;&lt;wsp:rsid wsp:val=&quot;004D35A3&quot;/&gt;&lt;wsp:rsid wsp:val=&quot;004E1BD8&quot;/&gt;&lt;wsp:rsid wsp:val=&quot;004E452A&quot;/&gt;&lt;wsp:rsid wsp:val=&quot;004E78E3&quot;/&gt;&lt;wsp:rsid wsp:val=&quot;004F2BFE&quot;/&gt;&lt;wsp:rsid wsp:val=&quot;004F63D3&quot;/&gt;&lt;wsp:rsid wsp:val=&quot;004F7DCF&quot;/&gt;&lt;wsp:rsid wsp:val=&quot;005004BF&quot;/&gt;&lt;wsp:rsid wsp:val=&quot;00502E89&quot;/&gt;&lt;wsp:rsid wsp:val=&quot;00506CFE&quot;/&gt;&lt;wsp:rsid wsp:val=&quot;00510E95&quot;/&gt;&lt;wsp:rsid wsp:val=&quot;005225C3&quot;/&gt;&lt;wsp:rsid wsp:val=&quot;00527D56&quot;/&gt;&lt;wsp:rsid wsp:val=&quot;0053221F&quot;/&gt;&lt;wsp:rsid wsp:val=&quot;00536FAE&quot;/&gt;&lt;wsp:rsid wsp:val=&quot;00542C85&quot;/&gt;&lt;wsp:rsid wsp:val=&quot;00553510&quot;/&gt;&lt;wsp:rsid wsp:val=&quot;00554186&quot;/&gt;&lt;wsp:rsid wsp:val=&quot;00585769&quot;/&gt;&lt;wsp:rsid wsp:val=&quot;00585C61&quot;/&gt;&lt;wsp:rsid wsp:val=&quot;00591130&quot;/&gt;&lt;wsp:rsid wsp:val=&quot;005A3F28&quot;/&gt;&lt;wsp:rsid wsp:val=&quot;005A40BE&quot;/&gt;&lt;wsp:rsid wsp:val=&quot;005B13E2&quot;/&gt;&lt;wsp:rsid wsp:val=&quot;005B47D7&quot;/&gt;&lt;wsp:rsid wsp:val=&quot;005C5526&quot;/&gt;&lt;wsp:rsid wsp:val=&quot;005C62C6&quot;/&gt;&lt;wsp:rsid wsp:val=&quot;005D7B9E&quot;/&gt;&lt;wsp:rsid wsp:val=&quot;005E112E&quot;/&gt;&lt;wsp:rsid wsp:val=&quot;005F0834&quot;/&gt;&lt;wsp:rsid wsp:val=&quot;005F68AB&quot;/&gt;&lt;wsp:rsid wsp:val=&quot;005F6DC3&quot;/&gt;&lt;wsp:rsid wsp:val=&quot;00601A8E&quot;/&gt;&lt;wsp:rsid wsp:val=&quot;0062033E&quot;/&gt;&lt;wsp:rsid wsp:val=&quot;00624482&quot;/&gt;&lt;wsp:rsid wsp:val=&quot;0064799C&quot;/&gt;&lt;wsp:rsid wsp:val=&quot;00654156&quot;/&gt;&lt;wsp:rsid wsp:val=&quot;006B47CA&quot;/&gt;&lt;wsp:rsid wsp:val=&quot;006C304C&quot;/&gt;&lt;wsp:rsid wsp:val=&quot;006C4511&quot;/&gt;&lt;wsp:rsid wsp:val=&quot;006C65F5&quot;/&gt;&lt;wsp:rsid wsp:val=&quot;006C7AAA&quot;/&gt;&lt;wsp:rsid wsp:val=&quot;006D1C2A&quot;/&gt;&lt;wsp:rsid wsp:val=&quot;006D264F&quot;/&gt;&lt;wsp:rsid wsp:val=&quot;006E2A8D&quot;/&gt;&lt;wsp:rsid wsp:val=&quot;006E7574&quot;/&gt;&lt;wsp:rsid wsp:val=&quot;00703430&quot;/&gt;&lt;wsp:rsid wsp:val=&quot;00703548&quot;/&gt;&lt;wsp:rsid wsp:val=&quot;00704E18&quot;/&gt;&lt;wsp:rsid wsp:val=&quot;007069BE&quot;/&gt;&lt;wsp:rsid wsp:val=&quot;00745C86&quot;/&gt;&lt;wsp:rsid wsp:val=&quot;00764603&quot;/&gt;&lt;wsp:rsid wsp:val=&quot;0076604D&quot;/&gt;&lt;wsp:rsid wsp:val=&quot;00790909&quot;/&gt;&lt;wsp:rsid wsp:val=&quot;007B1582&quot;/&gt;&lt;wsp:rsid wsp:val=&quot;007B5A07&quot;/&gt;&lt;wsp:rsid wsp:val=&quot;007C065D&quot;/&gt;&lt;wsp:rsid wsp:val=&quot;007D3E71&quot;/&gt;&lt;wsp:rsid wsp:val=&quot;007E5D6A&quot;/&gt;&lt;wsp:rsid wsp:val=&quot;007E645D&quot;/&gt;&lt;wsp:rsid wsp:val=&quot;007F75CA&quot;/&gt;&lt;wsp:rsid wsp:val=&quot;00821E08&quot;/&gt;&lt;wsp:rsid wsp:val=&quot;00834EFD&quot;/&gt;&lt;wsp:rsid wsp:val=&quot;00844B24&quot;/&gt;&lt;wsp:rsid wsp:val=&quot;0084515F&quot;/&gt;&lt;wsp:rsid wsp:val=&quot;0085092D&quot;/&gt;&lt;wsp:rsid wsp:val=&quot;00865414&quot;/&gt;&lt;wsp:rsid wsp:val=&quot;00877D4C&quot;/&gt;&lt;wsp:rsid wsp:val=&quot;00883903&quot;/&gt;&lt;wsp:rsid wsp:val=&quot;0089763B&quot;/&gt;&lt;wsp:rsid wsp:val=&quot;008B6AE3&quot;/&gt;&lt;wsp:rsid wsp:val=&quot;008C1332&quot;/&gt;&lt;wsp:rsid wsp:val=&quot;008D1045&quot;/&gt;&lt;wsp:rsid wsp:val=&quot;008E5996&quot;/&gt;&lt;wsp:rsid wsp:val=&quot;00901AE1&quot;/&gt;&lt;wsp:rsid wsp:val=&quot;00912F93&quot;/&gt;&lt;wsp:rsid wsp:val=&quot;009205B4&quot;/&gt;&lt;wsp:rsid wsp:val=&quot;00955B59&quot;/&gt;&lt;wsp:rsid wsp:val=&quot;00992262&quot;/&gt;&lt;wsp:rsid wsp:val=&quot;009926BC&quot;/&gt;&lt;wsp:rsid wsp:val=&quot;009A4319&quot;/&gt;&lt;wsp:rsid wsp:val=&quot;009A6C3F&quot;/&gt;&lt;wsp:rsid wsp:val=&quot;009B73F2&quot;/&gt;&lt;wsp:rsid wsp:val=&quot;009C12BD&quot;/&gt;&lt;wsp:rsid wsp:val=&quot;009C50FE&quot;/&gt;&lt;wsp:rsid wsp:val=&quot;009E49DD&quot;/&gt;&lt;wsp:rsid wsp:val=&quot;00A03E75&quot;/&gt;&lt;wsp:rsid wsp:val=&quot;00A20627&quot;/&gt;&lt;wsp:rsid wsp:val=&quot;00A22FE9&quot;/&gt;&lt;wsp:rsid wsp:val=&quot;00A31A44&quot;/&gt;&lt;wsp:rsid wsp:val=&quot;00A32BFA&quot;/&gt;&lt;wsp:rsid wsp:val=&quot;00A3325E&quot;/&gt;&lt;wsp:rsid wsp:val=&quot;00A45FCE&quot;/&gt;&lt;wsp:rsid wsp:val=&quot;00A75671&quot;/&gt;&lt;wsp:rsid wsp:val=&quot;00A773CC&quot;/&gt;&lt;wsp:rsid wsp:val=&quot;00A924D0&quot;/&gt;&lt;wsp:rsid wsp:val=&quot;00A9318B&quot;/&gt;&lt;wsp:rsid wsp:val=&quot;00A94AC1&quot;/&gt;&lt;wsp:rsid wsp:val=&quot;00AB18B7&quot;/&gt;&lt;wsp:rsid wsp:val=&quot;00AC510A&quot;/&gt;&lt;wsp:rsid wsp:val=&quot;00AD335D&quot;/&gt;&lt;wsp:rsid wsp:val=&quot;00AF114C&quot;/&gt;&lt;wsp:rsid wsp:val=&quot;00AF792B&quot;/&gt;&lt;wsp:rsid wsp:val=&quot;00B33D2F&quot;/&gt;&lt;wsp:rsid wsp:val=&quot;00B40A5B&quot;/&gt;&lt;wsp:rsid wsp:val=&quot;00B45C6B&quot;/&gt;&lt;wsp:rsid wsp:val=&quot;00B55D5E&quot;/&gt;&lt;wsp:rsid wsp:val=&quot;00B57A80&quot;/&gt;&lt;wsp:rsid wsp:val=&quot;00B70E9C&quot;/&gt;&lt;wsp:rsid wsp:val=&quot;00B713D8&quot;/&gt;&lt;wsp:rsid wsp:val=&quot;00B72979&quot;/&gt;&lt;wsp:rsid wsp:val=&quot;00B94516&quot;/&gt;&lt;wsp:rsid wsp:val=&quot;00BA25E2&quot;/&gt;&lt;wsp:rsid wsp:val=&quot;00BB2855&quot;/&gt;&lt;wsp:rsid wsp:val=&quot;00BC5343&quot;/&gt;&lt;wsp:rsid wsp:val=&quot;00BD19C1&quot;/&gt;&lt;wsp:rsid wsp:val=&quot;00BD25B8&quot;/&gt;&lt;wsp:rsid wsp:val=&quot;00C012E1&quot;/&gt;&lt;wsp:rsid wsp:val=&quot;00C06BB4&quot;/&gt;&lt;wsp:rsid wsp:val=&quot;00C10D20&quot;/&gt;&lt;wsp:rsid wsp:val=&quot;00C12E0C&quot;/&gt;&lt;wsp:rsid wsp:val=&quot;00C21916&quot;/&gt;&lt;wsp:rsid wsp:val=&quot;00C34915&quot;/&gt;&lt;wsp:rsid wsp:val=&quot;00C457CA&quot;/&gt;&lt;wsp:rsid wsp:val=&quot;00C53FB6&quot;/&gt;&lt;wsp:rsid wsp:val=&quot;00C57FB7&quot;/&gt;&lt;wsp:rsid wsp:val=&quot;00C644D4&quot;/&gt;&lt;wsp:rsid wsp:val=&quot;00C65F3F&quot;/&gt;&lt;wsp:rsid wsp:val=&quot;00C72414&quot;/&gt;&lt;wsp:rsid wsp:val=&quot;00C72B1A&quot;/&gt;&lt;wsp:rsid wsp:val=&quot;00C8667B&quot;/&gt;&lt;wsp:rsid wsp:val=&quot;00C90993&quot;/&gt;&lt;wsp:rsid wsp:val=&quot;00CA4CE3&quot;/&gt;&lt;wsp:rsid wsp:val=&quot;00CC72FD&quot;/&gt;&lt;wsp:rsid wsp:val=&quot;00CD4F3F&quot;/&gt;&lt;wsp:rsid wsp:val=&quot;00D311F8&quot;/&gt;&lt;wsp:rsid wsp:val=&quot;00D31660&quot;/&gt;&lt;wsp:rsid wsp:val=&quot;00D36B52&quot;/&gt;&lt;wsp:rsid wsp:val=&quot;00D377C8&quot;/&gt;&lt;wsp:rsid wsp:val=&quot;00D41274&quot;/&gt;&lt;wsp:rsid wsp:val=&quot;00D4229C&quot;/&gt;&lt;wsp:rsid wsp:val=&quot;00D43BF3&quot;/&gt;&lt;wsp:rsid wsp:val=&quot;00D549FB&quot;/&gt;&lt;wsp:rsid wsp:val=&quot;00D767BB&quot;/&gt;&lt;wsp:rsid wsp:val=&quot;00D939B0&quot;/&gt;&lt;wsp:rsid wsp:val=&quot;00DA31A2&quot;/&gt;&lt;wsp:rsid wsp:val=&quot;00DB16E0&quot;/&gt;&lt;wsp:rsid wsp:val=&quot;00DB2DF9&quot;/&gt;&lt;wsp:rsid wsp:val=&quot;00DB465D&quot;/&gt;&lt;wsp:rsid wsp:val=&quot;00DB48A2&quot;/&gt;&lt;wsp:rsid wsp:val=&quot;00DB7E63&quot;/&gt;&lt;wsp:rsid wsp:val=&quot;00DC2055&quot;/&gt;&lt;wsp:rsid wsp:val=&quot;00DC3908&quot;/&gt;&lt;wsp:rsid wsp:val=&quot;00DD71E8&quot;/&gt;&lt;wsp:rsid wsp:val=&quot;00DD7F83&quot;/&gt;&lt;wsp:rsid wsp:val=&quot;00DE4EB8&quot;/&gt;&lt;wsp:rsid wsp:val=&quot;00E0641E&quot;/&gt;&lt;wsp:rsid wsp:val=&quot;00E06664&quot;/&gt;&lt;wsp:rsid wsp:val=&quot;00E304BC&quot;/&gt;&lt;wsp:rsid wsp:val=&quot;00E32853&quot;/&gt;&lt;wsp:rsid wsp:val=&quot;00E34EBD&quot;/&gt;&lt;wsp:rsid wsp:val=&quot;00E401F8&quot;/&gt;&lt;wsp:rsid wsp:val=&quot;00E46425&quot;/&gt;&lt;wsp:rsid wsp:val=&quot;00E469FC&quot;/&gt;&lt;wsp:rsid wsp:val=&quot;00E47D0E&quot;/&gt;&lt;wsp:rsid wsp:val=&quot;00E65018&quot;/&gt;&lt;wsp:rsid wsp:val=&quot;00E76CA1&quot;/&gt;&lt;wsp:rsid wsp:val=&quot;00E94339&quot;/&gt;&lt;wsp:rsid wsp:val=&quot;00E97563&quot;/&gt;&lt;wsp:rsid wsp:val=&quot;00EB0B63&quot;/&gt;&lt;wsp:rsid wsp:val=&quot;00EC265C&quot;/&gt;&lt;wsp:rsid wsp:val=&quot;00ED61CB&quot;/&gt;&lt;wsp:rsid wsp:val=&quot;00EE752A&quot;/&gt;&lt;wsp:rsid wsp:val=&quot;00F06A72&quot;/&gt;&lt;wsp:rsid wsp:val=&quot;00F136F0&quot;/&gt;&lt;wsp:rsid wsp:val=&quot;00F20BBB&quot;/&gt;&lt;wsp:rsid wsp:val=&quot;00F36048&quot;/&gt;&lt;wsp:rsid wsp:val=&quot;00F43BD8&quot;/&gt;&lt;wsp:rsid wsp:val=&quot;00F562F3&quot;/&gt;&lt;wsp:rsid wsp:val=&quot;00F74B89&quot;/&gt;&lt;wsp:rsid wsp:val=&quot;00F75133&quot;/&gt;&lt;wsp:rsid wsp:val=&quot;00F83272&quot;/&gt;&lt;wsp:rsid wsp:val=&quot;00F9358D&quot;/&gt;&lt;wsp:rsid wsp:val=&quot;00FA3899&quot;/&gt;&lt;wsp:rsid wsp:val=&quot;00FA4909&quot;/&gt;&lt;wsp:rsid wsp:val=&quot;00FA5164&quot;/&gt;&lt;wsp:rsid wsp:val=&quot;00FA6751&quot;/&gt;&lt;wsp:rsid wsp:val=&quot;00FA6BD7&quot;/&gt;&lt;wsp:rsid wsp:val=&quot;00FB1048&quot;/&gt;&lt;wsp:rsid wsp:val=&quot;00FB62C4&quot;/&gt;&lt;wsp:rsid wsp:val=&quot;00FB7701&quot;/&gt;&lt;wsp:rsid wsp:val=&quot;00FD1AC5&quot;/&gt;&lt;wsp:rsid wsp:val=&quot;00FD5CF0&quot;/&gt;&lt;/wsp:rsids&gt;&lt;/w:docPr&gt;&lt;w:body&gt;&lt;wx:sect&gt;&lt;w:p wsp:rsidR=&quot;00AC510A&quot; wsp:rsidRDefault=&quot;00AC510A&quot; wsp:rsidP=&quot;00AC510A&quot;&gt;&lt;m:oMathPara&gt;&lt;m:oMath&gt;&lt;m:sSub&gt;&lt;m:sSubPr&gt;&lt;m:ctrlPr&gt;&lt;w:rPr&gt;&lt;w:rFonts w:ascii=&quot;Cambria Math&quot; w:fareast=&quot;Times New Roman&quot; w:h-ansi=&quot;Cambria Math&quot;/&gt;&lt;wx:font wx:val=&quot;Cambria Math&quot;/&gt;&lt;w:i/&gt;&lt;/w:rPr&gt;&lt;/m:ctrlPr&gt;&lt;/m:sSubPr&gt;&lt;m:e&gt;&lt;m:r&gt;&lt;w:rPr&gt;&lt;w:rFonts w:ascii=&quot;Cambria Math&quot; w:fareast=&quot;Times New Roman&quot; w:h-ansi=&quot;Cambria Math&quot;/&gt;&lt;wx:font wx:val=&quot;Cambria Math&quot;/&gt;&lt;w:i/&gt;&lt;/w:rPr&gt;&lt;m:t&gt;V&lt;/m:t&gt;&lt;/m:r&gt;&lt;/m:e&gt;&lt;m:sub&gt;&lt;m:r&gt;&lt;w:rPr&gt;&lt;w:rFonts w:ascii=&quot;Cambria Math&quot; w:fareast=&quot;Times New Roman&quot; w:h-ansi=&quot;Cambria Math&quot;/&gt;&lt;wx:font wx:val=&quot;Cambria Math&quot;/&gt;&lt;w:i/&gt;&lt;/w:rPr&gt;&lt;m:t&gt;out&lt;/m:t&gt;&lt;/m:r&gt;&lt;/m:sub&gt;&lt;/m:sSub&gt;&lt;/m:oMath&gt;&lt;/m:oMathPara&gt;&lt;/w:p&gt;&lt;w:sectPr wsp:rsidR=&quot;00000000&quot;&gt;&lt;w:pgSz w:w=&quot;12240&quot; w:h=&quot;15840&quot;/&gt;&lt;w:pgMar w:top=&quot;1440&quot; w:right=&quot;1440&quot; w:bottom=&quot;1440&quot; w:left=&quot;1440&quot; w:header=&quot;720&quot; w:footer=&quot;720&quot; w:gutter=&quot;0&quot;/&gt;&lt;w:cols w:space=&quot;720&quot;/&gt;&lt;/w:sectPr&gt;&lt;/wx:sect&gt;&lt;/w:body&gt;&lt;/w:wordDocument&gt;">
             <v:imagedata r:id="rId14" o:title="" chromakey="white"/>
           </v:shape>
         </w:pict>
@@ -980,7 +980,7 @@
           <w:szCs w:val="20"/>
         </w:rPr>
         <w:pict w14:anchorId="4B08ED6E">
-          <v:shape id="_x0000_i1065" type="#_x0000_t75" style="width:21.25pt;height:13.65pt" equationxml="&lt;?xml version=&quot;1.0&quot; encoding=&quot;UTF-8&quot; standalone=&quot;yes&quot;?&gt;&#10;&lt;?mso-application progid=&quot;Word.Document&quot;?&gt;&#10;&lt;w:wordDocument xmlns:aml=&quot;http://schemas.microsoft.com/aml/2001/core&quot; xmlns:wpc=&quot;http://schemas.microsoft.com/office/word/2010/wordprocessingCanvas&quot; xmlns:cx=&quot;http://schemas.microsoft.com/office/drawing/2014/chartex&quot; xmlns:cx1=&quot;http://schemas.microsoft.com/office/drawing/2015/9/8/chartex&quot; xmlns:cx2=&quot;http://schemas.microsoft.com/office/drawing/2015/10/21/chartex&quot; xmlns:cx3=&quot;http://schemas.microsoft.com/office/drawing/2016/5/9/chartex&quot; xmlns:cx4=&quot;http://schemas.microsoft.com/office/drawing/2016/5/10/chartex&quot; xmlns:cx5=&quot;http://schemas.microsoft.com/office/drawing/2016/5/11/chartex&quot; xmlns:cx6=&quot;http://schemas.microsoft.com/office/drawing/2016/5/12/chartex&quot; xmlns:cx7=&quot;http://schemas.microsoft.com/office/drawing/2016/5/13/chartex&quot; xmlns:cx8=&quot;http://schemas.microsoft.com/office/drawing/2016/5/14/chartex&quot; xmlns:cr=&quot;http://schemas.microsoft.com/office/comments/2020/reactions&quot; xmlns:dt=&quot;uuid:C2F41010-65B3-11d1-A29F-00AA00C14882&quot; xmlns:mc=&quot;http://schemas.openxmlformats.org/markup-compatibility/2006&quot; xmlns:aink=&quot;http://schemas.microsoft.com/office/drawing/2016/ink&quot; xmlns:am3d=&quot;http://schemas.microsoft.com/office/drawing/2017/model3d&quot; xmlns:o=&quot;urn:schemas-microsoft-com:office:office&quot; xmlns:oel=&quot;http://schemas.microsoft.com/office/2019/extlst&quot; xmlns:m=&quot;http://schemas.openxmlformats.org/officeDocument/2006/math&quot; xmlns:v=&quot;urn:schemas-microsoft-com:vml&quot; xmlns:w10=&quot;urn:schemas-microsoft-com:office:word&quot; xmlns:w=&quot;http://schemas.microsoft.com/office/word/2003/wordml&quot; xmlns:wx=&quot;http://schemas.microsoft.com/office/word/2003/auxHint&quot; xmlns:wne=&quot;http://schemas.microsoft.com/office/word/2006/wordml&quot; xmlns:wsp=&quot;http://schemas.microsoft.com/office/word/2003/wordml/sp2&quot; xmlns:sl=&quot;http://schemas.microsoft.com/schemaLibrary/2003/core&quot; w:macrosPresent=&quot;no&quot; w:embeddedObjPresent=&quot;no&quot; w:ocxPresent=&quot;no&quot; xml:space=&quot;preserve&quot;&gt;&lt;w:ignoreSubtree w:val=&quot;http://schemas.microsoft.com/office/word/2003/wordml/sp2&quot;/&gt;&lt;o:DocumentProperties&gt;&lt;o:Version&gt;16&lt;/o:Version&gt;&lt;/o:DocumentProperties&gt;&lt;w:docPr&gt;&lt;w:view w:val=&quot;print&quot;/&gt;&lt;w:zoom w:percent=&quot;100&quot;/&gt;&lt;w:doNotEmbedSystemFonts/&gt;&lt;w:activeWritingStyle w:lang=&quot;EN-AU&quot; w:vendorID=&quot;64&quot; w:dllVersion=&quot;6&quot; w:nlCheck=&quot;on&quot; w:optionSet=&quot;1&quot;/&gt;&lt;w:activeWritingStyle w:lang=&quot;EN-GB&quot; w:vendorID=&quot;64&quot; w:dllVersion=&quot;6&quot; w:nlCheck=&quot;on&quot; w:optionSet=&quot;1&quot;/&gt;&lt;w:activeWritingStyle w:lang=&quot;EN-US&quot; w:vendorID=&quot;64&quot; w:dllVersion=&quot;6&quot; w:nlCheck=&quot;on&quot; w:optionSet=&quot;1&quot;/&gt;&lt;w:activeWritingStyle w:lang=&quot;EN-AU&quot; w:vendorID=&quot;64&quot; w:dllVersion=&quot;0&quot; w:nlCheck=&quot;on&quot; w:optionSet=&quot;0&quot;/&gt;&lt;w:activeWritingStyle w:lang=&quot;EN-GB&quot; w:vendorID=&quot;64&quot; w:dllVersion=&quot;0&quot; w:nlCheck=&quot;on&quot; w:optionSet=&quot;0&quot;/&gt;&lt;w:activeWritingStyle w:lang=&quot;EN-US&quot; w:vendorID=&quot;64&quot; w:dllVersion=&quot;0&quot; w:nlCheck=&quot;on&quot; w:optionSet=&quot;0&quot;/&gt;&lt;w:activeWritingStyle w:lang=&quot;ES-AR&quot; w:vendorID=&quot;64&quot; w:dllVersion=&quot;0&quot; w:nlCheck=&quot;on&quot; w:optionSet=&quot;0&quot;/&gt;&lt;w:activeWritingStyle w:lang=&quot;580A&quot; w:vendorID=&quot;64&quot; w:dllVersion=&quot;0&quot; w:nlCheck=&quot;on&quot; w:optionSet=&quot;0&quot;/&gt;&lt;w:activeWritingStyle w:lang=&quot;PT-BR&quot; w:vendorID=&quot;64&quot; w:dllVersion=&quot;0&quot; w:nlCheck=&quot;on&quot; w:optionSet=&quot;0&quot;/&gt;&lt;w:stylePaneFormatFilter w:val=&quot;3F01&quot;/&gt;&lt;w:defaultTabStop w:val=&quot;720&quot;/&gt;&lt;w:hyphenationZone w:val=&quot;425&quot;/&gt;&lt;w:characterSpacingControl w:val=&quot;DontCompress&quot;/&gt;&lt;w:optimizeForBrowser/&gt;&lt;w:validateAgainstSchema/&gt;&lt;w:saveInvalidXML w:val=&quot;off&quot;/&gt;&lt;w:ignoreMixedContent w:val=&quot;off&quot;/&gt;&lt;w:alwaysShowPlaceholderText w:val=&quot;off&quot;/&gt;&lt;w:compat&gt;&lt;w:breakWrappedTables/&gt;&lt;w:snapToGridInCell/&gt;&lt;w:applyBreakingRules/&gt;&lt;w:wrapTextWithPunct/&gt;&lt;w:useAsianBreakRules/&gt;&lt;w:useWord2002TableStyleRules/&gt;&lt;w:useFELayout/&gt;&lt;/w:compat&gt;&lt;wsp:rsids&gt;&lt;wsp:rsidRoot wsp:val=&quot;00426FBB&quot;/&gt;&lt;wsp:rsid wsp:val=&quot;000002E1&quot;/&gt;&lt;wsp:rsid wsp:val=&quot;00003C97&quot;/&gt;&lt;wsp:rsid wsp:val=&quot;00005565&quot;/&gt;&lt;wsp:rsid wsp:val=&quot;0001754A&quot;/&gt;&lt;wsp:rsid wsp:val=&quot;00017719&quot;/&gt;&lt;wsp:rsid wsp:val=&quot;00027F1D&quot;/&gt;&lt;wsp:rsid wsp:val=&quot;0003296C&quot;/&gt;&lt;wsp:rsid wsp:val=&quot;0003351F&quot;/&gt;&lt;wsp:rsid wsp:val=&quot;00044599&quot;/&gt;&lt;wsp:rsid wsp:val=&quot;000540E6&quot;/&gt;&lt;wsp:rsid wsp:val=&quot;00054421&quot;/&gt;&lt;wsp:rsid wsp:val=&quot;00062E46&quot;/&gt;&lt;wsp:rsid wsp:val=&quot;00074AC8&quot;/&gt;&lt;wsp:rsid wsp:val=&quot;00081408&quot;/&gt;&lt;wsp:rsid wsp:val=&quot;00081EBE&quot;/&gt;&lt;wsp:rsid wsp:val=&quot;00086EDC&quot;/&gt;&lt;wsp:rsid wsp:val=&quot;000B36A3&quot;/&gt;&lt;wsp:rsid wsp:val=&quot;000C013C&quot;/&gt;&lt;wsp:rsid wsp:val=&quot;000E3F84&quot;/&gt;&lt;wsp:rsid wsp:val=&quot;001056DF&quot;/&gt;&lt;wsp:rsid wsp:val=&quot;0010789C&quot;/&gt;&lt;wsp:rsid wsp:val=&quot;00114025&quot;/&gt;&lt;wsp:rsid wsp:val=&quot;001160D2&quot;/&gt;&lt;wsp:rsid wsp:val=&quot;00120636&quot;/&gt;&lt;wsp:rsid wsp:val=&quot;001348A5&quot;/&gt;&lt;wsp:rsid wsp:val=&quot;00151B8E&quot;/&gt;&lt;wsp:rsid wsp:val=&quot;00182170&quot;/&gt;&lt;wsp:rsid wsp:val=&quot;001928FB&quot;/&gt;&lt;wsp:rsid wsp:val=&quot;00192BC7&quot;/&gt;&lt;wsp:rsid wsp:val=&quot;00195BE6&quot;/&gt;&lt;wsp:rsid wsp:val=&quot;001A50EA&quot;/&gt;&lt;wsp:rsid wsp:val=&quot;001F16CD&quot;/&gt;&lt;wsp:rsid wsp:val=&quot;001F47D2&quot;/&gt;&lt;wsp:rsid wsp:val=&quot;002029C8&quot;/&gt;&lt;wsp:rsid wsp:val=&quot;0022285A&quot;/&gt;&lt;wsp:rsid wsp:val=&quot;00224C61&quot;/&gt;&lt;wsp:rsid wsp:val=&quot;00256ABC&quot;/&gt;&lt;wsp:rsid wsp:val=&quot;0027227B&quot;/&gt;&lt;wsp:rsid wsp:val=&quot;00273AC7&quot;/&gt;&lt;wsp:rsid wsp:val=&quot;00273D2C&quot;/&gt;&lt;wsp:rsid wsp:val=&quot;00285ECD&quot;/&gt;&lt;wsp:rsid wsp:val=&quot;00290E1B&quot;/&gt;&lt;wsp:rsid wsp:val=&quot;00291B17&quot;/&gt;&lt;wsp:rsid wsp:val=&quot;00291BB3&quot;/&gt;&lt;wsp:rsid wsp:val=&quot;002A6742&quot;/&gt;&lt;wsp:rsid wsp:val=&quot;002C1A7F&quot;/&gt;&lt;wsp:rsid wsp:val=&quot;002C4239&quot;/&gt;&lt;wsp:rsid wsp:val=&quot;002C559D&quot;/&gt;&lt;wsp:rsid wsp:val=&quot;002D16AE&quot;/&gt;&lt;wsp:rsid wsp:val=&quot;002D2D42&quot;/&gt;&lt;wsp:rsid wsp:val=&quot;002F72D0&quot;/&gt;&lt;wsp:rsid wsp:val=&quot;002F7A4F&quot;/&gt;&lt;wsp:rsid wsp:val=&quot;003003AB&quot;/&gt;&lt;wsp:rsid wsp:val=&quot;00302C35&quot;/&gt;&lt;wsp:rsid wsp:val=&quot;00311C49&quot;/&gt;&lt;wsp:rsid wsp:val=&quot;0032119E&quot;/&gt;&lt;wsp:rsid wsp:val=&quot;00321304&quot;/&gt;&lt;wsp:rsid wsp:val=&quot;00324FC2&quot;/&gt;&lt;wsp:rsid wsp:val=&quot;003312CA&quot;/&gt;&lt;wsp:rsid wsp:val=&quot;00331F84&quot;/&gt;&lt;wsp:rsid wsp:val=&quot;0037721F&quot;/&gt;&lt;wsp:rsid wsp:val=&quot;003950A4&quot;/&gt;&lt;wsp:rsid wsp:val=&quot;003A1E7E&quot;/&gt;&lt;wsp:rsid wsp:val=&quot;003E2FDC&quot;/&gt;&lt;wsp:rsid wsp:val=&quot;003E3577&quot;/&gt;&lt;wsp:rsid wsp:val=&quot;003F3A61&quot;/&gt;&lt;wsp:rsid wsp:val=&quot;00410A5D&quot;/&gt;&lt;wsp:rsid wsp:val=&quot;00414909&quot;/&gt;&lt;wsp:rsid wsp:val=&quot;00416537&quot;/&gt;&lt;wsp:rsid wsp:val=&quot;00425A6A&quot;/&gt;&lt;wsp:rsid wsp:val=&quot;00426FBB&quot;/&gt;&lt;wsp:rsid wsp:val=&quot;00454542&quot;/&gt;&lt;wsp:rsid wsp:val=&quot;0047429A&quot;/&gt;&lt;wsp:rsid wsp:val=&quot;0048374C&quot;/&gt;&lt;wsp:rsid wsp:val=&quot;0048771D&quot;/&gt;&lt;wsp:rsid wsp:val=&quot;004A6605&quot;/&gt;&lt;wsp:rsid wsp:val=&quot;004C45FA&quot;/&gt;&lt;wsp:rsid wsp:val=&quot;004D35A3&quot;/&gt;&lt;wsp:rsid wsp:val=&quot;004E1BD8&quot;/&gt;&lt;wsp:rsid wsp:val=&quot;004E452A&quot;/&gt;&lt;wsp:rsid wsp:val=&quot;004E78E3&quot;/&gt;&lt;wsp:rsid wsp:val=&quot;004F2BFE&quot;/&gt;&lt;wsp:rsid wsp:val=&quot;004F63D3&quot;/&gt;&lt;wsp:rsid wsp:val=&quot;004F7DCF&quot;/&gt;&lt;wsp:rsid wsp:val=&quot;005004BF&quot;/&gt;&lt;wsp:rsid wsp:val=&quot;00502E89&quot;/&gt;&lt;wsp:rsid wsp:val=&quot;00506CFE&quot;/&gt;&lt;wsp:rsid wsp:val=&quot;00510E95&quot;/&gt;&lt;wsp:rsid wsp:val=&quot;005225C3&quot;/&gt;&lt;wsp:rsid wsp:val=&quot;00527D56&quot;/&gt;&lt;wsp:rsid wsp:val=&quot;0053221F&quot;/&gt;&lt;wsp:rsid wsp:val=&quot;00536FAE&quot;/&gt;&lt;wsp:rsid wsp:val=&quot;00542C85&quot;/&gt;&lt;wsp:rsid wsp:val=&quot;00553510&quot;/&gt;&lt;wsp:rsid wsp:val=&quot;00554186&quot;/&gt;&lt;wsp:rsid wsp:val=&quot;00585769&quot;/&gt;&lt;wsp:rsid wsp:val=&quot;00585C61&quot;/&gt;&lt;wsp:rsid wsp:val=&quot;00591130&quot;/&gt;&lt;wsp:rsid wsp:val=&quot;005A3F28&quot;/&gt;&lt;wsp:rsid wsp:val=&quot;005A40BE&quot;/&gt;&lt;wsp:rsid wsp:val=&quot;005B13E2&quot;/&gt;&lt;wsp:rsid wsp:val=&quot;005B47D7&quot;/&gt;&lt;wsp:rsid wsp:val=&quot;005C5526&quot;/&gt;&lt;wsp:rsid wsp:val=&quot;005C62C6&quot;/&gt;&lt;wsp:rsid wsp:val=&quot;005D7B9E&quot;/&gt;&lt;wsp:rsid wsp:val=&quot;005E112E&quot;/&gt;&lt;wsp:rsid wsp:val=&quot;005F0834&quot;/&gt;&lt;wsp:rsid wsp:val=&quot;005F68AB&quot;/&gt;&lt;wsp:rsid wsp:val=&quot;005F6DC3&quot;/&gt;&lt;wsp:rsid wsp:val=&quot;00601A8E&quot;/&gt;&lt;wsp:rsid wsp:val=&quot;0062033E&quot;/&gt;&lt;wsp:rsid wsp:val=&quot;00624482&quot;/&gt;&lt;wsp:rsid wsp:val=&quot;0064799C&quot;/&gt;&lt;wsp:rsid wsp:val=&quot;00654156&quot;/&gt;&lt;wsp:rsid wsp:val=&quot;006B47CA&quot;/&gt;&lt;wsp:rsid wsp:val=&quot;006C304C&quot;/&gt;&lt;wsp:rsid wsp:val=&quot;006C4511&quot;/&gt;&lt;wsp:rsid wsp:val=&quot;006C65F5&quot;/&gt;&lt;wsp:rsid wsp:val=&quot;006C7AAA&quot;/&gt;&lt;wsp:rsid wsp:val=&quot;006D1C2A&quot;/&gt;&lt;wsp:rsid wsp:val=&quot;006D264F&quot;/&gt;&lt;wsp:rsid wsp:val=&quot;006E2A8D&quot;/&gt;&lt;wsp:rsid wsp:val=&quot;006E7574&quot;/&gt;&lt;wsp:rsid wsp:val=&quot;00703430&quot;/&gt;&lt;wsp:rsid wsp:val=&quot;00703548&quot;/&gt;&lt;wsp:rsid wsp:val=&quot;00704E18&quot;/&gt;&lt;wsp:rsid wsp:val=&quot;007069BE&quot;/&gt;&lt;wsp:rsid wsp:val=&quot;00745C86&quot;/&gt;&lt;wsp:rsid wsp:val=&quot;00764603&quot;/&gt;&lt;wsp:rsid wsp:val=&quot;0076604D&quot;/&gt;&lt;wsp:rsid wsp:val=&quot;00790909&quot;/&gt;&lt;wsp:rsid wsp:val=&quot;007B1582&quot;/&gt;&lt;wsp:rsid wsp:val=&quot;007B5A07&quot;/&gt;&lt;wsp:rsid wsp:val=&quot;007C065D&quot;/&gt;&lt;wsp:rsid wsp:val=&quot;007D3E71&quot;/&gt;&lt;wsp:rsid wsp:val=&quot;007E5D6A&quot;/&gt;&lt;wsp:rsid wsp:val=&quot;007E645D&quot;/&gt;&lt;wsp:rsid wsp:val=&quot;007F75CA&quot;/&gt;&lt;wsp:rsid wsp:val=&quot;00821E08&quot;/&gt;&lt;wsp:rsid wsp:val=&quot;00834EFD&quot;/&gt;&lt;wsp:rsid wsp:val=&quot;00844B24&quot;/&gt;&lt;wsp:rsid wsp:val=&quot;0084515F&quot;/&gt;&lt;wsp:rsid wsp:val=&quot;0085092D&quot;/&gt;&lt;wsp:rsid wsp:val=&quot;00865414&quot;/&gt;&lt;wsp:rsid wsp:val=&quot;00877D4C&quot;/&gt;&lt;wsp:rsid wsp:val=&quot;00883903&quot;/&gt;&lt;wsp:rsid wsp:val=&quot;0089763B&quot;/&gt;&lt;wsp:rsid wsp:val=&quot;008B6AE3&quot;/&gt;&lt;wsp:rsid wsp:val=&quot;008C1332&quot;/&gt;&lt;wsp:rsid wsp:val=&quot;008D1045&quot;/&gt;&lt;wsp:rsid wsp:val=&quot;008E5996&quot;/&gt;&lt;wsp:rsid wsp:val=&quot;00901AE1&quot;/&gt;&lt;wsp:rsid wsp:val=&quot;00912F93&quot;/&gt;&lt;wsp:rsid wsp:val=&quot;009205B4&quot;/&gt;&lt;wsp:rsid wsp:val=&quot;00955B59&quot;/&gt;&lt;wsp:rsid wsp:val=&quot;00992262&quot;/&gt;&lt;wsp:rsid wsp:val=&quot;009926BC&quot;/&gt;&lt;wsp:rsid wsp:val=&quot;009A4319&quot;/&gt;&lt;wsp:rsid wsp:val=&quot;009A6C3F&quot;/&gt;&lt;wsp:rsid wsp:val=&quot;009B73F2&quot;/&gt;&lt;wsp:rsid wsp:val=&quot;009C12BD&quot;/&gt;&lt;wsp:rsid wsp:val=&quot;009C50FE&quot;/&gt;&lt;wsp:rsid wsp:val=&quot;009E49DD&quot;/&gt;&lt;wsp:rsid wsp:val=&quot;00A03E75&quot;/&gt;&lt;wsp:rsid wsp:val=&quot;00A20627&quot;/&gt;&lt;wsp:rsid wsp:val=&quot;00A22FE9&quot;/&gt;&lt;wsp:rsid wsp:val=&quot;00A31A44&quot;/&gt;&lt;wsp:rsid wsp:val=&quot;00A32BFA&quot;/&gt;&lt;wsp:rsid wsp:val=&quot;00A3325E&quot;/&gt;&lt;wsp:rsid wsp:val=&quot;00A45FCE&quot;/&gt;&lt;wsp:rsid wsp:val=&quot;00A75671&quot;/&gt;&lt;wsp:rsid wsp:val=&quot;00A773CC&quot;/&gt;&lt;wsp:rsid wsp:val=&quot;00A924D0&quot;/&gt;&lt;wsp:rsid wsp:val=&quot;00A9318B&quot;/&gt;&lt;wsp:rsid wsp:val=&quot;00A94AC1&quot;/&gt;&lt;wsp:rsid wsp:val=&quot;00AB18B7&quot;/&gt;&lt;wsp:rsid wsp:val=&quot;00AC510A&quot;/&gt;&lt;wsp:rsid wsp:val=&quot;00AD335D&quot;/&gt;&lt;wsp:rsid wsp:val=&quot;00AF114C&quot;/&gt;&lt;wsp:rsid wsp:val=&quot;00AF792B&quot;/&gt;&lt;wsp:rsid wsp:val=&quot;00B33D2F&quot;/&gt;&lt;wsp:rsid wsp:val=&quot;00B40A5B&quot;/&gt;&lt;wsp:rsid wsp:val=&quot;00B45C6B&quot;/&gt;&lt;wsp:rsid wsp:val=&quot;00B55D5E&quot;/&gt;&lt;wsp:rsid wsp:val=&quot;00B57A80&quot;/&gt;&lt;wsp:rsid wsp:val=&quot;00B70E9C&quot;/&gt;&lt;wsp:rsid wsp:val=&quot;00B713D8&quot;/&gt;&lt;wsp:rsid wsp:val=&quot;00B72979&quot;/&gt;&lt;wsp:rsid wsp:val=&quot;00B94516&quot;/&gt;&lt;wsp:rsid wsp:val=&quot;00BA25E2&quot;/&gt;&lt;wsp:rsid wsp:val=&quot;00BB2855&quot;/&gt;&lt;wsp:rsid wsp:val=&quot;00BC5343&quot;/&gt;&lt;wsp:rsid wsp:val=&quot;00BD19C1&quot;/&gt;&lt;wsp:rsid wsp:val=&quot;00BD25B8&quot;/&gt;&lt;wsp:rsid wsp:val=&quot;00C012E1&quot;/&gt;&lt;wsp:rsid wsp:val=&quot;00C06BB4&quot;/&gt;&lt;wsp:rsid wsp:val=&quot;00C10D20&quot;/&gt;&lt;wsp:rsid wsp:val=&quot;00C12E0C&quot;/&gt;&lt;wsp:rsid wsp:val=&quot;00C21916&quot;/&gt;&lt;wsp:rsid wsp:val=&quot;00C34915&quot;/&gt;&lt;wsp:rsid wsp:val=&quot;00C457CA&quot;/&gt;&lt;wsp:rsid wsp:val=&quot;00C53FB6&quot;/&gt;&lt;wsp:rsid wsp:val=&quot;00C57FB7&quot;/&gt;&lt;wsp:rsid wsp:val=&quot;00C644D4&quot;/&gt;&lt;wsp:rsid wsp:val=&quot;00C65F3F&quot;/&gt;&lt;wsp:rsid wsp:val=&quot;00C72414&quot;/&gt;&lt;wsp:rsid wsp:val=&quot;00C72B1A&quot;/&gt;&lt;wsp:rsid wsp:val=&quot;00C8667B&quot;/&gt;&lt;wsp:rsid wsp:val=&quot;00C90993&quot;/&gt;&lt;wsp:rsid wsp:val=&quot;00CA4CE3&quot;/&gt;&lt;wsp:rsid wsp:val=&quot;00CC72FD&quot;/&gt;&lt;wsp:rsid wsp:val=&quot;00CD4F3F&quot;/&gt;&lt;wsp:rsid wsp:val=&quot;00D311F8&quot;/&gt;&lt;wsp:rsid wsp:val=&quot;00D31660&quot;/&gt;&lt;wsp:rsid wsp:val=&quot;00D36B52&quot;/&gt;&lt;wsp:rsid wsp:val=&quot;00D377C8&quot;/&gt;&lt;wsp:rsid wsp:val=&quot;00D41274&quot;/&gt;&lt;wsp:rsid wsp:val=&quot;00D4229C&quot;/&gt;&lt;wsp:rsid wsp:val=&quot;00D43BF3&quot;/&gt;&lt;wsp:rsid wsp:val=&quot;00D549FB&quot;/&gt;&lt;wsp:rsid wsp:val=&quot;00D767BB&quot;/&gt;&lt;wsp:rsid wsp:val=&quot;00D939B0&quot;/&gt;&lt;wsp:rsid wsp:val=&quot;00DA31A2&quot;/&gt;&lt;wsp:rsid wsp:val=&quot;00DB16E0&quot;/&gt;&lt;wsp:rsid wsp:val=&quot;00DB2DF9&quot;/&gt;&lt;wsp:rsid wsp:val=&quot;00DB465D&quot;/&gt;&lt;wsp:rsid wsp:val=&quot;00DB48A2&quot;/&gt;&lt;wsp:rsid wsp:val=&quot;00DB7E63&quot;/&gt;&lt;wsp:rsid wsp:val=&quot;00DC2055&quot;/&gt;&lt;wsp:rsid wsp:val=&quot;00DC3908&quot;/&gt;&lt;wsp:rsid wsp:val=&quot;00DD71E8&quot;/&gt;&lt;wsp:rsid wsp:val=&quot;00DD7F83&quot;/&gt;&lt;wsp:rsid wsp:val=&quot;00DE4EB8&quot;/&gt;&lt;wsp:rsid wsp:val=&quot;00E0641E&quot;/&gt;&lt;wsp:rsid wsp:val=&quot;00E06664&quot;/&gt;&lt;wsp:rsid wsp:val=&quot;00E304BC&quot;/&gt;&lt;wsp:rsid wsp:val=&quot;00E32853&quot;/&gt;&lt;wsp:rsid wsp:val=&quot;00E34EBD&quot;/&gt;&lt;wsp:rsid wsp:val=&quot;00E401F8&quot;/&gt;&lt;wsp:rsid wsp:val=&quot;00E46425&quot;/&gt;&lt;wsp:rsid wsp:val=&quot;00E469FC&quot;/&gt;&lt;wsp:rsid wsp:val=&quot;00E47D0E&quot;/&gt;&lt;wsp:rsid wsp:val=&quot;00E65018&quot;/&gt;&lt;wsp:rsid wsp:val=&quot;00E76CA1&quot;/&gt;&lt;wsp:rsid wsp:val=&quot;00E94339&quot;/&gt;&lt;wsp:rsid wsp:val=&quot;00E97563&quot;/&gt;&lt;wsp:rsid wsp:val=&quot;00EB0B63&quot;/&gt;&lt;wsp:rsid wsp:val=&quot;00EC265C&quot;/&gt;&lt;wsp:rsid wsp:val=&quot;00ED61CB&quot;/&gt;&lt;wsp:rsid wsp:val=&quot;00EE752A&quot;/&gt;&lt;wsp:rsid wsp:val=&quot;00F06A72&quot;/&gt;&lt;wsp:rsid wsp:val=&quot;00F136F0&quot;/&gt;&lt;wsp:rsid wsp:val=&quot;00F20BBB&quot;/&gt;&lt;wsp:rsid wsp:val=&quot;00F36048&quot;/&gt;&lt;wsp:rsid wsp:val=&quot;00F43BD8&quot;/&gt;&lt;wsp:rsid wsp:val=&quot;00F562F3&quot;/&gt;&lt;wsp:rsid wsp:val=&quot;00F74B89&quot;/&gt;&lt;wsp:rsid wsp:val=&quot;00F75133&quot;/&gt;&lt;wsp:rsid wsp:val=&quot;00F83272&quot;/&gt;&lt;wsp:rsid wsp:val=&quot;00F9358D&quot;/&gt;&lt;wsp:rsid wsp:val=&quot;00FA3899&quot;/&gt;&lt;wsp:rsid wsp:val=&quot;00FA4909&quot;/&gt;&lt;wsp:rsid wsp:val=&quot;00FA5164&quot;/&gt;&lt;wsp:rsid wsp:val=&quot;00FA6751&quot;/&gt;&lt;wsp:rsid wsp:val=&quot;00FA6BD7&quot;/&gt;&lt;wsp:rsid wsp:val=&quot;00FB1048&quot;/&gt;&lt;wsp:rsid wsp:val=&quot;00FB62C4&quot;/&gt;&lt;wsp:rsid wsp:val=&quot;00FB7701&quot;/&gt;&lt;wsp:rsid wsp:val=&quot;00FD1AC5&quot;/&gt;&lt;wsp:rsid wsp:val=&quot;00FD5CF0&quot;/&gt;&lt;/wsp:rsids&gt;&lt;/w:docPr&gt;&lt;w:body&gt;&lt;wx:sect&gt;&lt;w:p wsp:rsidR=&quot;00AC510A&quot; wsp:rsidRDefault=&quot;00AC510A&quot; wsp:rsidP=&quot;00AC510A&quot;&gt;&lt;m:oMathPara&gt;&lt;m:oMath&gt;&lt;m:sSub&gt;&lt;m:sSubPr&gt;&lt;m:ctrlPr&gt;&lt;w:rPr&gt;&lt;w:rFonts w:ascii=&quot;Cambria Math&quot; w:fareast=&quot;Times New Roman&quot; w:h-ansi=&quot;Cambria Math&quot;/&gt;&lt;wx:font wx:val=&quot;Cambria Math&quot;/&gt;&lt;w:i/&gt;&lt;/w:rPr&gt;&lt;/m:ctrlPr&gt;&lt;/m:sSubPr&gt;&lt;m:e&gt;&lt;m:r&gt;&lt;w:rPr&gt;&lt;w:rFonts w:ascii=&quot;Cambria Math&quot; w:fareast=&quot;Times New Roman&quot; w:h-ansi=&quot;Cambria Math&quot;/&gt;&lt;wx:font wx:val=&quot;Cambria Math&quot;/&gt;&lt;w:i/&gt;&lt;/w:rPr&gt;&lt;m:t&gt;V&lt;/m:t&gt;&lt;/m:r&gt;&lt;/m:e&gt;&lt;m:sub&gt;&lt;m:r&gt;&lt;w:rPr&gt;&lt;w:rFonts w:ascii=&quot;Cambria Math&quot; w:fareast=&quot;Times New Roman&quot; w:h-ansi=&quot;Cambria Math&quot;/&gt;&lt;wx:font wx:val=&quot;Cambria Math&quot;/&gt;&lt;w:i/&gt;&lt;/w:rPr&gt;&lt;m:t&gt;out&lt;/m:t&gt;&lt;/m:r&gt;&lt;/m:sub&gt;&lt;/m:sSub&gt;&lt;/m:oMath&gt;&lt;/m:oMathPara&gt;&lt;/w:p&gt;&lt;w:sectPr wsp:rsidR=&quot;00000000&quot;&gt;&lt;w:pgSz w:w=&quot;12240&quot; w:h=&quot;15840&quot;/&gt;&lt;w:pgMar w:top=&quot;1440&quot; w:right=&quot;1440&quot; w:bottom=&quot;1440&quot; w:left=&quot;1440&quot; w:header=&quot;720&quot; w:footer=&quot;720&quot; w:gutter=&quot;0&quot;/&gt;&lt;w:cols w:space=&quot;720&quot;/&gt;&lt;/w:sectPr&gt;&lt;/wx:sect&gt;&lt;/w:body&gt;&lt;/w:wordDocument&gt;">
+          <v:shape id="_x0000_i1032" type="#_x0000_t75" style="width:21.45pt;height:13.85pt" equationxml="&lt;?xml version=&quot;1.0&quot; encoding=&quot;UTF-8&quot; standalone=&quot;yes&quot;?&gt;&#10;&lt;?mso-application progid=&quot;Word.Document&quot;?&gt;&#10;&lt;w:wordDocument xmlns:aml=&quot;http://schemas.microsoft.com/aml/2001/core&quot; xmlns:wpc=&quot;http://schemas.microsoft.com/office/word/2010/wordprocessingCanvas&quot; xmlns:cx=&quot;http://schemas.microsoft.com/office/drawing/2014/chartex&quot; xmlns:cx1=&quot;http://schemas.microsoft.com/office/drawing/2015/9/8/chartex&quot; xmlns:cx2=&quot;http://schemas.microsoft.com/office/drawing/2015/10/21/chartex&quot; xmlns:cx3=&quot;http://schemas.microsoft.com/office/drawing/2016/5/9/chartex&quot; xmlns:cx4=&quot;http://schemas.microsoft.com/office/drawing/2016/5/10/chartex&quot; xmlns:cx5=&quot;http://schemas.microsoft.com/office/drawing/2016/5/11/chartex&quot; xmlns:cx6=&quot;http://schemas.microsoft.com/office/drawing/2016/5/12/chartex&quot; xmlns:cx7=&quot;http://schemas.microsoft.com/office/drawing/2016/5/13/chartex&quot; xmlns:cx8=&quot;http://schemas.microsoft.com/office/drawing/2016/5/14/chartex&quot; xmlns:cr=&quot;http://schemas.microsoft.com/office/comments/2020/reactions&quot; xmlns:dt=&quot;uuid:C2F41010-65B3-11d1-A29F-00AA00C14882&quot; xmlns:mc=&quot;http://schemas.openxmlformats.org/markup-compatibility/2006&quot; xmlns:aink=&quot;http://schemas.microsoft.com/office/drawing/2016/ink&quot; xmlns:am3d=&quot;http://schemas.microsoft.com/office/drawing/2017/model3d&quot; xmlns:o=&quot;urn:schemas-microsoft-com:office:office&quot; xmlns:oel=&quot;http://schemas.microsoft.com/office/2019/extlst&quot; xmlns:m=&quot;http://schemas.openxmlformats.org/officeDocument/2006/math&quot; xmlns:v=&quot;urn:schemas-microsoft-com:vml&quot; xmlns:w10=&quot;urn:schemas-microsoft-com:office:word&quot; xmlns:w=&quot;http://schemas.microsoft.com/office/word/2003/wordml&quot; xmlns:wx=&quot;http://schemas.microsoft.com/office/word/2003/auxHint&quot; xmlns:wne=&quot;http://schemas.microsoft.com/office/word/2006/wordml&quot; xmlns:wsp=&quot;http://schemas.microsoft.com/office/word/2003/wordml/sp2&quot; xmlns:sl=&quot;http://schemas.microsoft.com/schemaLibrary/2003/core&quot; w:macrosPresent=&quot;no&quot; w:embeddedObjPresent=&quot;no&quot; w:ocxPresent=&quot;no&quot; xml:space=&quot;preserve&quot;&gt;&lt;w:ignoreSubtree w:val=&quot;http://schemas.microsoft.com/office/word/2003/wordml/sp2&quot;/&gt;&lt;o:DocumentProperties&gt;&lt;o:Version&gt;16&lt;/o:Version&gt;&lt;/o:DocumentProperties&gt;&lt;w:docPr&gt;&lt;w:view w:val=&quot;print&quot;/&gt;&lt;w:zoom w:percent=&quot;100&quot;/&gt;&lt;w:doNotEmbedSystemFonts/&gt;&lt;w:activeWritingStyle w:lang=&quot;EN-AU&quot; w:vendorID=&quot;64&quot; w:dllVersion=&quot;6&quot; w:nlCheck=&quot;on&quot; w:optionSet=&quot;1&quot;/&gt;&lt;w:activeWritingStyle w:lang=&quot;EN-GB&quot; w:vendorID=&quot;64&quot; w:dllVersion=&quot;6&quot; w:nlCheck=&quot;on&quot; w:optionSet=&quot;1&quot;/&gt;&lt;w:activeWritingStyle w:lang=&quot;EN-US&quot; w:vendorID=&quot;64&quot; w:dllVersion=&quot;6&quot; w:nlCheck=&quot;on&quot; w:optionSet=&quot;1&quot;/&gt;&lt;w:activeWritingStyle w:lang=&quot;EN-AU&quot; w:vendorID=&quot;64&quot; w:dllVersion=&quot;0&quot; w:nlCheck=&quot;on&quot; w:optionSet=&quot;0&quot;/&gt;&lt;w:activeWritingStyle w:lang=&quot;EN-GB&quot; w:vendorID=&quot;64&quot; w:dllVersion=&quot;0&quot; w:nlCheck=&quot;on&quot; w:optionSet=&quot;0&quot;/&gt;&lt;w:activeWritingStyle w:lang=&quot;EN-US&quot; w:vendorID=&quot;64&quot; w:dllVersion=&quot;0&quot; w:nlCheck=&quot;on&quot; w:optionSet=&quot;0&quot;/&gt;&lt;w:activeWritingStyle w:lang=&quot;ES-AR&quot; w:vendorID=&quot;64&quot; w:dllVersion=&quot;0&quot; w:nlCheck=&quot;on&quot; w:optionSet=&quot;0&quot;/&gt;&lt;w:activeWritingStyle w:lang=&quot;580A&quot; w:vendorID=&quot;64&quot; w:dllVersion=&quot;0&quot; w:nlCheck=&quot;on&quot; w:optionSet=&quot;0&quot;/&gt;&lt;w:activeWritingStyle w:lang=&quot;PT-BR&quot; w:vendorID=&quot;64&quot; w:dllVersion=&quot;0&quot; w:nlCheck=&quot;on&quot; w:optionSet=&quot;0&quot;/&gt;&lt;w:stylePaneFormatFilter w:val=&quot;3F01&quot;/&gt;&lt;w:defaultTabStop w:val=&quot;720&quot;/&gt;&lt;w:hyphenationZone w:val=&quot;425&quot;/&gt;&lt;w:characterSpacingControl w:val=&quot;DontCompress&quot;/&gt;&lt;w:optimizeForBrowser/&gt;&lt;w:validateAgainstSchema/&gt;&lt;w:saveInvalidXML w:val=&quot;off&quot;/&gt;&lt;w:ignoreMixedContent w:val=&quot;off&quot;/&gt;&lt;w:alwaysShowPlaceholderText w:val=&quot;off&quot;/&gt;&lt;w:compat&gt;&lt;w:breakWrappedTables/&gt;&lt;w:snapToGridInCell/&gt;&lt;w:applyBreakingRules/&gt;&lt;w:wrapTextWithPunct/&gt;&lt;w:useAsianBreakRules/&gt;&lt;w:useWord2002TableStyleRules/&gt;&lt;w:useFELayout/&gt;&lt;/w:compat&gt;&lt;wsp:rsids&gt;&lt;wsp:rsidRoot wsp:val=&quot;00426FBB&quot;/&gt;&lt;wsp:rsid wsp:val=&quot;000002E1&quot;/&gt;&lt;wsp:rsid wsp:val=&quot;00003C97&quot;/&gt;&lt;wsp:rsid wsp:val=&quot;00005565&quot;/&gt;&lt;wsp:rsid wsp:val=&quot;0001754A&quot;/&gt;&lt;wsp:rsid wsp:val=&quot;00017719&quot;/&gt;&lt;wsp:rsid wsp:val=&quot;00027F1D&quot;/&gt;&lt;wsp:rsid wsp:val=&quot;0003296C&quot;/&gt;&lt;wsp:rsid wsp:val=&quot;0003351F&quot;/&gt;&lt;wsp:rsid wsp:val=&quot;00044599&quot;/&gt;&lt;wsp:rsid wsp:val=&quot;000540E6&quot;/&gt;&lt;wsp:rsid wsp:val=&quot;00054421&quot;/&gt;&lt;wsp:rsid wsp:val=&quot;00062E46&quot;/&gt;&lt;wsp:rsid wsp:val=&quot;00074AC8&quot;/&gt;&lt;wsp:rsid wsp:val=&quot;00081408&quot;/&gt;&lt;wsp:rsid wsp:val=&quot;00081EBE&quot;/&gt;&lt;wsp:rsid wsp:val=&quot;00086EDC&quot;/&gt;&lt;wsp:rsid wsp:val=&quot;000B36A3&quot;/&gt;&lt;wsp:rsid wsp:val=&quot;000C013C&quot;/&gt;&lt;wsp:rsid wsp:val=&quot;000E3F84&quot;/&gt;&lt;wsp:rsid wsp:val=&quot;001056DF&quot;/&gt;&lt;wsp:rsid wsp:val=&quot;0010789C&quot;/&gt;&lt;wsp:rsid wsp:val=&quot;00114025&quot;/&gt;&lt;wsp:rsid wsp:val=&quot;001160D2&quot;/&gt;&lt;wsp:rsid wsp:val=&quot;00120636&quot;/&gt;&lt;wsp:rsid wsp:val=&quot;001348A5&quot;/&gt;&lt;wsp:rsid wsp:val=&quot;00151B8E&quot;/&gt;&lt;wsp:rsid wsp:val=&quot;00182170&quot;/&gt;&lt;wsp:rsid wsp:val=&quot;001928FB&quot;/&gt;&lt;wsp:rsid wsp:val=&quot;00192BC7&quot;/&gt;&lt;wsp:rsid wsp:val=&quot;00195BE6&quot;/&gt;&lt;wsp:rsid wsp:val=&quot;001A50EA&quot;/&gt;&lt;wsp:rsid wsp:val=&quot;001F16CD&quot;/&gt;&lt;wsp:rsid wsp:val=&quot;001F47D2&quot;/&gt;&lt;wsp:rsid wsp:val=&quot;002029C8&quot;/&gt;&lt;wsp:rsid wsp:val=&quot;0022285A&quot;/&gt;&lt;wsp:rsid wsp:val=&quot;00224C61&quot;/&gt;&lt;wsp:rsid wsp:val=&quot;00256ABC&quot;/&gt;&lt;wsp:rsid wsp:val=&quot;0027227B&quot;/&gt;&lt;wsp:rsid wsp:val=&quot;00273AC7&quot;/&gt;&lt;wsp:rsid wsp:val=&quot;00273D2C&quot;/&gt;&lt;wsp:rsid wsp:val=&quot;00285ECD&quot;/&gt;&lt;wsp:rsid wsp:val=&quot;00290E1B&quot;/&gt;&lt;wsp:rsid wsp:val=&quot;00291B17&quot;/&gt;&lt;wsp:rsid wsp:val=&quot;00291BB3&quot;/&gt;&lt;wsp:rsid wsp:val=&quot;002A6742&quot;/&gt;&lt;wsp:rsid wsp:val=&quot;002C1A7F&quot;/&gt;&lt;wsp:rsid wsp:val=&quot;002C4239&quot;/&gt;&lt;wsp:rsid wsp:val=&quot;002C559D&quot;/&gt;&lt;wsp:rsid wsp:val=&quot;002D16AE&quot;/&gt;&lt;wsp:rsid wsp:val=&quot;002D2D42&quot;/&gt;&lt;wsp:rsid wsp:val=&quot;002F72D0&quot;/&gt;&lt;wsp:rsid wsp:val=&quot;002F7A4F&quot;/&gt;&lt;wsp:rsid wsp:val=&quot;003003AB&quot;/&gt;&lt;wsp:rsid wsp:val=&quot;00302C35&quot;/&gt;&lt;wsp:rsid wsp:val=&quot;00311C49&quot;/&gt;&lt;wsp:rsid wsp:val=&quot;0032119E&quot;/&gt;&lt;wsp:rsid wsp:val=&quot;00321304&quot;/&gt;&lt;wsp:rsid wsp:val=&quot;00324FC2&quot;/&gt;&lt;wsp:rsid wsp:val=&quot;003312CA&quot;/&gt;&lt;wsp:rsid wsp:val=&quot;00331F84&quot;/&gt;&lt;wsp:rsid wsp:val=&quot;0037721F&quot;/&gt;&lt;wsp:rsid wsp:val=&quot;003950A4&quot;/&gt;&lt;wsp:rsid wsp:val=&quot;003A1E7E&quot;/&gt;&lt;wsp:rsid wsp:val=&quot;003E2FDC&quot;/&gt;&lt;wsp:rsid wsp:val=&quot;003E3577&quot;/&gt;&lt;wsp:rsid wsp:val=&quot;003F3A61&quot;/&gt;&lt;wsp:rsid wsp:val=&quot;00410A5D&quot;/&gt;&lt;wsp:rsid wsp:val=&quot;00414909&quot;/&gt;&lt;wsp:rsid wsp:val=&quot;00416537&quot;/&gt;&lt;wsp:rsid wsp:val=&quot;00425A6A&quot;/&gt;&lt;wsp:rsid wsp:val=&quot;00426FBB&quot;/&gt;&lt;wsp:rsid wsp:val=&quot;00454542&quot;/&gt;&lt;wsp:rsid wsp:val=&quot;0047429A&quot;/&gt;&lt;wsp:rsid wsp:val=&quot;0048374C&quot;/&gt;&lt;wsp:rsid wsp:val=&quot;0048771D&quot;/&gt;&lt;wsp:rsid wsp:val=&quot;004A6605&quot;/&gt;&lt;wsp:rsid wsp:val=&quot;004C45FA&quot;/&gt;&lt;wsp:rsid wsp:val=&quot;004D35A3&quot;/&gt;&lt;wsp:rsid wsp:val=&quot;004E1BD8&quot;/&gt;&lt;wsp:rsid wsp:val=&quot;004E452A&quot;/&gt;&lt;wsp:rsid wsp:val=&quot;004E78E3&quot;/&gt;&lt;wsp:rsid wsp:val=&quot;004F2BFE&quot;/&gt;&lt;wsp:rsid wsp:val=&quot;004F63D3&quot;/&gt;&lt;wsp:rsid wsp:val=&quot;004F7DCF&quot;/&gt;&lt;wsp:rsid wsp:val=&quot;005004BF&quot;/&gt;&lt;wsp:rsid wsp:val=&quot;00502E89&quot;/&gt;&lt;wsp:rsid wsp:val=&quot;00506CFE&quot;/&gt;&lt;wsp:rsid wsp:val=&quot;00510E95&quot;/&gt;&lt;wsp:rsid wsp:val=&quot;005225C3&quot;/&gt;&lt;wsp:rsid wsp:val=&quot;00527D56&quot;/&gt;&lt;wsp:rsid wsp:val=&quot;0053221F&quot;/&gt;&lt;wsp:rsid wsp:val=&quot;00536FAE&quot;/&gt;&lt;wsp:rsid wsp:val=&quot;00542C85&quot;/&gt;&lt;wsp:rsid wsp:val=&quot;00553510&quot;/&gt;&lt;wsp:rsid wsp:val=&quot;00554186&quot;/&gt;&lt;wsp:rsid wsp:val=&quot;00585769&quot;/&gt;&lt;wsp:rsid wsp:val=&quot;00585C61&quot;/&gt;&lt;wsp:rsid wsp:val=&quot;00591130&quot;/&gt;&lt;wsp:rsid wsp:val=&quot;005A3F28&quot;/&gt;&lt;wsp:rsid wsp:val=&quot;005A40BE&quot;/&gt;&lt;wsp:rsid wsp:val=&quot;005B13E2&quot;/&gt;&lt;wsp:rsid wsp:val=&quot;005B47D7&quot;/&gt;&lt;wsp:rsid wsp:val=&quot;005C5526&quot;/&gt;&lt;wsp:rsid wsp:val=&quot;005C62C6&quot;/&gt;&lt;wsp:rsid wsp:val=&quot;005D7B9E&quot;/&gt;&lt;wsp:rsid wsp:val=&quot;005E112E&quot;/&gt;&lt;wsp:rsid wsp:val=&quot;005F0834&quot;/&gt;&lt;wsp:rsid wsp:val=&quot;005F68AB&quot;/&gt;&lt;wsp:rsid wsp:val=&quot;005F6DC3&quot;/&gt;&lt;wsp:rsid wsp:val=&quot;00601A8E&quot;/&gt;&lt;wsp:rsid wsp:val=&quot;0062033E&quot;/&gt;&lt;wsp:rsid wsp:val=&quot;00624482&quot;/&gt;&lt;wsp:rsid wsp:val=&quot;0064799C&quot;/&gt;&lt;wsp:rsid wsp:val=&quot;00654156&quot;/&gt;&lt;wsp:rsid wsp:val=&quot;006B47CA&quot;/&gt;&lt;wsp:rsid wsp:val=&quot;006C304C&quot;/&gt;&lt;wsp:rsid wsp:val=&quot;006C4511&quot;/&gt;&lt;wsp:rsid wsp:val=&quot;006C65F5&quot;/&gt;&lt;wsp:rsid wsp:val=&quot;006C7AAA&quot;/&gt;&lt;wsp:rsid wsp:val=&quot;006D1C2A&quot;/&gt;&lt;wsp:rsid wsp:val=&quot;006D264F&quot;/&gt;&lt;wsp:rsid wsp:val=&quot;006E2A8D&quot;/&gt;&lt;wsp:rsid wsp:val=&quot;006E7574&quot;/&gt;&lt;wsp:rsid wsp:val=&quot;00703430&quot;/&gt;&lt;wsp:rsid wsp:val=&quot;00703548&quot;/&gt;&lt;wsp:rsid wsp:val=&quot;00704E18&quot;/&gt;&lt;wsp:rsid wsp:val=&quot;007069BE&quot;/&gt;&lt;wsp:rsid wsp:val=&quot;00745C86&quot;/&gt;&lt;wsp:rsid wsp:val=&quot;00764603&quot;/&gt;&lt;wsp:rsid wsp:val=&quot;0076604D&quot;/&gt;&lt;wsp:rsid wsp:val=&quot;00790909&quot;/&gt;&lt;wsp:rsid wsp:val=&quot;007B1582&quot;/&gt;&lt;wsp:rsid wsp:val=&quot;007B5A07&quot;/&gt;&lt;wsp:rsid wsp:val=&quot;007C065D&quot;/&gt;&lt;wsp:rsid wsp:val=&quot;007D3E71&quot;/&gt;&lt;wsp:rsid wsp:val=&quot;007E5D6A&quot;/&gt;&lt;wsp:rsid wsp:val=&quot;007E645D&quot;/&gt;&lt;wsp:rsid wsp:val=&quot;007F75CA&quot;/&gt;&lt;wsp:rsid wsp:val=&quot;00821E08&quot;/&gt;&lt;wsp:rsid wsp:val=&quot;00834EFD&quot;/&gt;&lt;wsp:rsid wsp:val=&quot;00844B24&quot;/&gt;&lt;wsp:rsid wsp:val=&quot;0084515F&quot;/&gt;&lt;wsp:rsid wsp:val=&quot;0085092D&quot;/&gt;&lt;wsp:rsid wsp:val=&quot;00865414&quot;/&gt;&lt;wsp:rsid wsp:val=&quot;00877D4C&quot;/&gt;&lt;wsp:rsid wsp:val=&quot;00883903&quot;/&gt;&lt;wsp:rsid wsp:val=&quot;0089763B&quot;/&gt;&lt;wsp:rsid wsp:val=&quot;008B6AE3&quot;/&gt;&lt;wsp:rsid wsp:val=&quot;008C1332&quot;/&gt;&lt;wsp:rsid wsp:val=&quot;008D1045&quot;/&gt;&lt;wsp:rsid wsp:val=&quot;008E5996&quot;/&gt;&lt;wsp:rsid wsp:val=&quot;00901AE1&quot;/&gt;&lt;wsp:rsid wsp:val=&quot;00912F93&quot;/&gt;&lt;wsp:rsid wsp:val=&quot;009205B4&quot;/&gt;&lt;wsp:rsid wsp:val=&quot;00955B59&quot;/&gt;&lt;wsp:rsid wsp:val=&quot;00992262&quot;/&gt;&lt;wsp:rsid wsp:val=&quot;009926BC&quot;/&gt;&lt;wsp:rsid wsp:val=&quot;009A4319&quot;/&gt;&lt;wsp:rsid wsp:val=&quot;009A6C3F&quot;/&gt;&lt;wsp:rsid wsp:val=&quot;009B73F2&quot;/&gt;&lt;wsp:rsid wsp:val=&quot;009C12BD&quot;/&gt;&lt;wsp:rsid wsp:val=&quot;009C50FE&quot;/&gt;&lt;wsp:rsid wsp:val=&quot;009E49DD&quot;/&gt;&lt;wsp:rsid wsp:val=&quot;00A03E75&quot;/&gt;&lt;wsp:rsid wsp:val=&quot;00A20627&quot;/&gt;&lt;wsp:rsid wsp:val=&quot;00A22FE9&quot;/&gt;&lt;wsp:rsid wsp:val=&quot;00A31A44&quot;/&gt;&lt;wsp:rsid wsp:val=&quot;00A32BFA&quot;/&gt;&lt;wsp:rsid wsp:val=&quot;00A3325E&quot;/&gt;&lt;wsp:rsid wsp:val=&quot;00A45FCE&quot;/&gt;&lt;wsp:rsid wsp:val=&quot;00A75671&quot;/&gt;&lt;wsp:rsid wsp:val=&quot;00A773CC&quot;/&gt;&lt;wsp:rsid wsp:val=&quot;00A924D0&quot;/&gt;&lt;wsp:rsid wsp:val=&quot;00A9318B&quot;/&gt;&lt;wsp:rsid wsp:val=&quot;00A94AC1&quot;/&gt;&lt;wsp:rsid wsp:val=&quot;00AB18B7&quot;/&gt;&lt;wsp:rsid wsp:val=&quot;00AC510A&quot;/&gt;&lt;wsp:rsid wsp:val=&quot;00AD335D&quot;/&gt;&lt;wsp:rsid wsp:val=&quot;00AF114C&quot;/&gt;&lt;wsp:rsid wsp:val=&quot;00AF792B&quot;/&gt;&lt;wsp:rsid wsp:val=&quot;00B33D2F&quot;/&gt;&lt;wsp:rsid wsp:val=&quot;00B40A5B&quot;/&gt;&lt;wsp:rsid wsp:val=&quot;00B45C6B&quot;/&gt;&lt;wsp:rsid wsp:val=&quot;00B55D5E&quot;/&gt;&lt;wsp:rsid wsp:val=&quot;00B57A80&quot;/&gt;&lt;wsp:rsid wsp:val=&quot;00B70E9C&quot;/&gt;&lt;wsp:rsid wsp:val=&quot;00B713D8&quot;/&gt;&lt;wsp:rsid wsp:val=&quot;00B72979&quot;/&gt;&lt;wsp:rsid wsp:val=&quot;00B94516&quot;/&gt;&lt;wsp:rsid wsp:val=&quot;00BA25E2&quot;/&gt;&lt;wsp:rsid wsp:val=&quot;00BB2855&quot;/&gt;&lt;wsp:rsid wsp:val=&quot;00BC5343&quot;/&gt;&lt;wsp:rsid wsp:val=&quot;00BD19C1&quot;/&gt;&lt;wsp:rsid wsp:val=&quot;00BD25B8&quot;/&gt;&lt;wsp:rsid wsp:val=&quot;00C012E1&quot;/&gt;&lt;wsp:rsid wsp:val=&quot;00C06BB4&quot;/&gt;&lt;wsp:rsid wsp:val=&quot;00C10D20&quot;/&gt;&lt;wsp:rsid wsp:val=&quot;00C12E0C&quot;/&gt;&lt;wsp:rsid wsp:val=&quot;00C21916&quot;/&gt;&lt;wsp:rsid wsp:val=&quot;00C34915&quot;/&gt;&lt;wsp:rsid wsp:val=&quot;00C457CA&quot;/&gt;&lt;wsp:rsid wsp:val=&quot;00C53FB6&quot;/&gt;&lt;wsp:rsid wsp:val=&quot;00C57FB7&quot;/&gt;&lt;wsp:rsid wsp:val=&quot;00C644D4&quot;/&gt;&lt;wsp:rsid wsp:val=&quot;00C65F3F&quot;/&gt;&lt;wsp:rsid wsp:val=&quot;00C72414&quot;/&gt;&lt;wsp:rsid wsp:val=&quot;00C72B1A&quot;/&gt;&lt;wsp:rsid wsp:val=&quot;00C8667B&quot;/&gt;&lt;wsp:rsid wsp:val=&quot;00C90993&quot;/&gt;&lt;wsp:rsid wsp:val=&quot;00CA4CE3&quot;/&gt;&lt;wsp:rsid wsp:val=&quot;00CC72FD&quot;/&gt;&lt;wsp:rsid wsp:val=&quot;00CD4F3F&quot;/&gt;&lt;wsp:rsid wsp:val=&quot;00D311F8&quot;/&gt;&lt;wsp:rsid wsp:val=&quot;00D31660&quot;/&gt;&lt;wsp:rsid wsp:val=&quot;00D36B52&quot;/&gt;&lt;wsp:rsid wsp:val=&quot;00D377C8&quot;/&gt;&lt;wsp:rsid wsp:val=&quot;00D41274&quot;/&gt;&lt;wsp:rsid wsp:val=&quot;00D4229C&quot;/&gt;&lt;wsp:rsid wsp:val=&quot;00D43BF3&quot;/&gt;&lt;wsp:rsid wsp:val=&quot;00D549FB&quot;/&gt;&lt;wsp:rsid wsp:val=&quot;00D767BB&quot;/&gt;&lt;wsp:rsid wsp:val=&quot;00D939B0&quot;/&gt;&lt;wsp:rsid wsp:val=&quot;00DA31A2&quot;/&gt;&lt;wsp:rsid wsp:val=&quot;00DB16E0&quot;/&gt;&lt;wsp:rsid wsp:val=&quot;00DB2DF9&quot;/&gt;&lt;wsp:rsid wsp:val=&quot;00DB465D&quot;/&gt;&lt;wsp:rsid wsp:val=&quot;00DB48A2&quot;/&gt;&lt;wsp:rsid wsp:val=&quot;00DB7E63&quot;/&gt;&lt;wsp:rsid wsp:val=&quot;00DC2055&quot;/&gt;&lt;wsp:rsid wsp:val=&quot;00DC3908&quot;/&gt;&lt;wsp:rsid wsp:val=&quot;00DD71E8&quot;/&gt;&lt;wsp:rsid wsp:val=&quot;00DD7F83&quot;/&gt;&lt;wsp:rsid wsp:val=&quot;00DE4EB8&quot;/&gt;&lt;wsp:rsid wsp:val=&quot;00E0641E&quot;/&gt;&lt;wsp:rsid wsp:val=&quot;00E06664&quot;/&gt;&lt;wsp:rsid wsp:val=&quot;00E304BC&quot;/&gt;&lt;wsp:rsid wsp:val=&quot;00E32853&quot;/&gt;&lt;wsp:rsid wsp:val=&quot;00E34EBD&quot;/&gt;&lt;wsp:rsid wsp:val=&quot;00E401F8&quot;/&gt;&lt;wsp:rsid wsp:val=&quot;00E46425&quot;/&gt;&lt;wsp:rsid wsp:val=&quot;00E469FC&quot;/&gt;&lt;wsp:rsid wsp:val=&quot;00E47D0E&quot;/&gt;&lt;wsp:rsid wsp:val=&quot;00E65018&quot;/&gt;&lt;wsp:rsid wsp:val=&quot;00E76CA1&quot;/&gt;&lt;wsp:rsid wsp:val=&quot;00E94339&quot;/&gt;&lt;wsp:rsid wsp:val=&quot;00E97563&quot;/&gt;&lt;wsp:rsid wsp:val=&quot;00EB0B63&quot;/&gt;&lt;wsp:rsid wsp:val=&quot;00EC265C&quot;/&gt;&lt;wsp:rsid wsp:val=&quot;00ED61CB&quot;/&gt;&lt;wsp:rsid wsp:val=&quot;00EE752A&quot;/&gt;&lt;wsp:rsid wsp:val=&quot;00F06A72&quot;/&gt;&lt;wsp:rsid wsp:val=&quot;00F136F0&quot;/&gt;&lt;wsp:rsid wsp:val=&quot;00F20BBB&quot;/&gt;&lt;wsp:rsid wsp:val=&quot;00F36048&quot;/&gt;&lt;wsp:rsid wsp:val=&quot;00F43BD8&quot;/&gt;&lt;wsp:rsid wsp:val=&quot;00F562F3&quot;/&gt;&lt;wsp:rsid wsp:val=&quot;00F74B89&quot;/&gt;&lt;wsp:rsid wsp:val=&quot;00F75133&quot;/&gt;&lt;wsp:rsid wsp:val=&quot;00F83272&quot;/&gt;&lt;wsp:rsid wsp:val=&quot;00F9358D&quot;/&gt;&lt;wsp:rsid wsp:val=&quot;00FA3899&quot;/&gt;&lt;wsp:rsid wsp:val=&quot;00FA4909&quot;/&gt;&lt;wsp:rsid wsp:val=&quot;00FA5164&quot;/&gt;&lt;wsp:rsid wsp:val=&quot;00FA6751&quot;/&gt;&lt;wsp:rsid wsp:val=&quot;00FA6BD7&quot;/&gt;&lt;wsp:rsid wsp:val=&quot;00FB1048&quot;/&gt;&lt;wsp:rsid wsp:val=&quot;00FB62C4&quot;/&gt;&lt;wsp:rsid wsp:val=&quot;00FB7701&quot;/&gt;&lt;wsp:rsid wsp:val=&quot;00FD1AC5&quot;/&gt;&lt;wsp:rsid wsp:val=&quot;00FD5CF0&quot;/&gt;&lt;/wsp:rsids&gt;&lt;/w:docPr&gt;&lt;w:body&gt;&lt;wx:sect&gt;&lt;w:p wsp:rsidR=&quot;00AC510A&quot; wsp:rsidRDefault=&quot;00AC510A&quot; wsp:rsidP=&quot;00AC510A&quot;&gt;&lt;m:oMathPara&gt;&lt;m:oMath&gt;&lt;m:sSub&gt;&lt;m:sSubPr&gt;&lt;m:ctrlPr&gt;&lt;w:rPr&gt;&lt;w:rFonts w:ascii=&quot;Cambria Math&quot; w:fareast=&quot;Times New Roman&quot; w:h-ansi=&quot;Cambria Math&quot;/&gt;&lt;wx:font wx:val=&quot;Cambria Math&quot;/&gt;&lt;w:i/&gt;&lt;/w:rPr&gt;&lt;/m:ctrlPr&gt;&lt;/m:sSubPr&gt;&lt;m:e&gt;&lt;m:r&gt;&lt;w:rPr&gt;&lt;w:rFonts w:ascii=&quot;Cambria Math&quot; w:fareast=&quot;Times New Roman&quot; w:h-ansi=&quot;Cambria Math&quot;/&gt;&lt;wx:font wx:val=&quot;Cambria Math&quot;/&gt;&lt;w:i/&gt;&lt;/w:rPr&gt;&lt;m:t&gt;V&lt;/m:t&gt;&lt;/m:r&gt;&lt;/m:e&gt;&lt;m:sub&gt;&lt;m:r&gt;&lt;w:rPr&gt;&lt;w:rFonts w:ascii=&quot;Cambria Math&quot; w:fareast=&quot;Times New Roman&quot; w:h-ansi=&quot;Cambria Math&quot;/&gt;&lt;wx:font wx:val=&quot;Cambria Math&quot;/&gt;&lt;w:i/&gt;&lt;/w:rPr&gt;&lt;m:t&gt;out&lt;/m:t&gt;&lt;/m:r&gt;&lt;/m:sub&gt;&lt;/m:sSub&gt;&lt;/m:oMath&gt;&lt;/m:oMathPara&gt;&lt;/w:p&gt;&lt;w:sectPr wsp:rsidR=&quot;00000000&quot;&gt;&lt;w:pgSz w:w=&quot;12240&quot; w:h=&quot;15840&quot;/&gt;&lt;w:pgMar w:top=&quot;1440&quot; w:right=&quot;1440&quot; w:bottom=&quot;1440&quot; w:left=&quot;1440&quot; w:header=&quot;720&quot; w:footer=&quot;720&quot; w:gutter=&quot;0&quot;/&gt;&lt;w:cols w:space=&quot;720&quot;/&gt;&lt;/w:sectPr&gt;&lt;/wx:sect&gt;&lt;/w:body&gt;&lt;/w:wordDocument&gt;">
             <v:imagedata r:id="rId14" o:title="" chromakey="white"/>
           </v:shape>
         </w:pict>
@@ -1026,7 +1026,7 @@
           <w:szCs w:val="20"/>
         </w:rPr>
         <w:pict w14:anchorId="110BFF7C">
-          <v:shape id="_x0000_i1066" type="#_x0000_t75" style="width:8.2pt;height:13.65pt" equationxml="&lt;?xml version=&quot;1.0&quot; encoding=&quot;UTF-8&quot; standalone=&quot;yes&quot;?&gt;&#10;&lt;?mso-application progid=&quot;Word.Document&quot;?&gt;&#10;&lt;w:wordDocument xmlns:aml=&quot;http://schemas.microsoft.com/aml/2001/core&quot; xmlns:wpc=&quot;http://schemas.microsoft.com/office/word/2010/wordprocessingCanvas&quot; xmlns:cx=&quot;http://schemas.microsoft.com/office/drawing/2014/chartex&quot; xmlns:cx1=&quot;http://schemas.microsoft.com/office/drawing/2015/9/8/chartex&quot; xmlns:cx2=&quot;http://schemas.microsoft.com/office/drawing/2015/10/21/chartex&quot; xmlns:cx3=&quot;http://schemas.microsoft.com/office/drawing/2016/5/9/chartex&quot; xmlns:cx4=&quot;http://schemas.microsoft.com/office/drawing/2016/5/10/chartex&quot; xmlns:cx5=&quot;http://schemas.microsoft.com/office/drawing/2016/5/11/chartex&quot; xmlns:cx6=&quot;http://schemas.microsoft.com/office/drawing/2016/5/12/chartex&quot; xmlns:cx7=&quot;http://schemas.microsoft.com/office/drawing/2016/5/13/chartex&quot; xmlns:cx8=&quot;http://schemas.microsoft.com/office/drawing/2016/5/14/chartex&quot; xmlns:cr=&quot;http://schemas.microsoft.com/office/comments/2020/reactions&quot; xmlns:dt=&quot;uuid:C2F41010-65B3-11d1-A29F-00AA00C14882&quot; xmlns:mc=&quot;http://schemas.openxmlformats.org/markup-compatibility/2006&quot; xmlns:aink=&quot;http://schemas.microsoft.com/office/drawing/2016/ink&quot; xmlns:am3d=&quot;http://schemas.microsoft.com/office/drawing/2017/model3d&quot; xmlns:o=&quot;urn:schemas-microsoft-com:office:office&quot; xmlns:oel=&quot;http://schemas.microsoft.com/office/2019/extlst&quot; xmlns:m=&quot;http://schemas.openxmlformats.org/officeDocument/2006/math&quot; xmlns:v=&quot;urn:schemas-microsoft-com:vml&quot; xmlns:w10=&quot;urn:schemas-microsoft-com:office:word&quot; xmlns:w=&quot;http://schemas.microsoft.com/office/word/2003/wordml&quot; xmlns:wx=&quot;http://schemas.microsoft.com/office/word/2003/auxHint&quot; xmlns:wne=&quot;http://schemas.microsoft.com/office/word/2006/wordml&quot; xmlns:wsp=&quot;http://schemas.microsoft.com/office/word/2003/wordml/sp2&quot; xmlns:sl=&quot;http://schemas.microsoft.com/schemaLibrary/2003/core&quot; w:macrosPresent=&quot;no&quot; w:embeddedObjPresent=&quot;no&quot; w:ocxPresent=&quot;no&quot; xml:space=&quot;preserve&quot;&gt;&lt;w:ignoreSubtree w:val=&quot;http://schemas.microsoft.com/office/word/2003/wordml/sp2&quot;/&gt;&lt;o:DocumentProperties&gt;&lt;o:Version&gt;16&lt;/o:Version&gt;&lt;/o:DocumentProperties&gt;&lt;w:docPr&gt;&lt;w:view w:val=&quot;print&quot;/&gt;&lt;w:zoom w:percent=&quot;100&quot;/&gt;&lt;w:doNotEmbedSystemFonts/&gt;&lt;w:activeWritingStyle w:lang=&quot;EN-AU&quot; w:vendorID=&quot;64&quot; w:dllVersion=&quot;6&quot; w:nlCheck=&quot;on&quot; w:optionSet=&quot;1&quot;/&gt;&lt;w:activeWritingStyle w:lang=&quot;EN-GB&quot; w:vendorID=&quot;64&quot; w:dllVersion=&quot;6&quot; w:nlCheck=&quot;on&quot; w:optionSet=&quot;1&quot;/&gt;&lt;w:activeWritingStyle w:lang=&quot;EN-US&quot; w:vendorID=&quot;64&quot; w:dllVersion=&quot;6&quot; w:nlCheck=&quot;on&quot; w:optionSet=&quot;1&quot;/&gt;&lt;w:activeWritingStyle w:lang=&quot;EN-AU&quot; w:vendorID=&quot;64&quot; w:dllVersion=&quot;0&quot; w:nlCheck=&quot;on&quot; w:optionSet=&quot;0&quot;/&gt;&lt;w:activeWritingStyle w:lang=&quot;EN-GB&quot; w:vendorID=&quot;64&quot; w:dllVersion=&quot;0&quot; w:nlCheck=&quot;on&quot; w:optionSet=&quot;0&quot;/&gt;&lt;w:activeWritingStyle w:lang=&quot;EN-US&quot; w:vendorID=&quot;64&quot; w:dllVersion=&quot;0&quot; w:nlCheck=&quot;on&quot; w:optionSet=&quot;0&quot;/&gt;&lt;w:activeWritingStyle w:lang=&quot;ES-AR&quot; w:vendorID=&quot;64&quot; w:dllVersion=&quot;0&quot; w:nlCheck=&quot;on&quot; w:optionSet=&quot;0&quot;/&gt;&lt;w:activeWritingStyle w:lang=&quot;580A&quot; w:vendorID=&quot;64&quot; w:dllVersion=&quot;0&quot; w:nlCheck=&quot;on&quot; w:optionSet=&quot;0&quot;/&gt;&lt;w:activeWritingStyle w:lang=&quot;PT-BR&quot; w:vendorID=&quot;64&quot; w:dllVersion=&quot;0&quot; w:nlCheck=&quot;on&quot; w:optionSet=&quot;0&quot;/&gt;&lt;w:stylePaneFormatFilter w:val=&quot;3F01&quot;/&gt;&lt;w:defaultTabStop w:val=&quot;720&quot;/&gt;&lt;w:hyphenationZone w:val=&quot;425&quot;/&gt;&lt;w:characterSpacingControl w:val=&quot;DontCompress&quot;/&gt;&lt;w:optimizeForBrowser/&gt;&lt;w:validateAgainstSchema/&gt;&lt;w:saveInvalidXML w:val=&quot;off&quot;/&gt;&lt;w:ignoreMixedContent w:val=&quot;off&quot;/&gt;&lt;w:alwaysShowPlaceholderText w:val=&quot;off&quot;/&gt;&lt;w:compat&gt;&lt;w:breakWrappedTables/&gt;&lt;w:snapToGridInCell/&gt;&lt;w:applyBreakingRules/&gt;&lt;w:wrapTextWithPunct/&gt;&lt;w:useAsianBreakRules/&gt;&lt;w:useWord2002TableStyleRules/&gt;&lt;w:useFELayout/&gt;&lt;/w:compat&gt;&lt;wsp:rsids&gt;&lt;wsp:rsidRoot wsp:val=&quot;00426FBB&quot;/&gt;&lt;wsp:rsid wsp:val=&quot;000002E1&quot;/&gt;&lt;wsp:rsid wsp:val=&quot;00003C97&quot;/&gt;&lt;wsp:rsid wsp:val=&quot;00005565&quot;/&gt;&lt;wsp:rsid wsp:val=&quot;0001754A&quot;/&gt;&lt;wsp:rsid wsp:val=&quot;00017719&quot;/&gt;&lt;wsp:rsid wsp:val=&quot;00027F1D&quot;/&gt;&lt;wsp:rsid wsp:val=&quot;0003296C&quot;/&gt;&lt;wsp:rsid wsp:val=&quot;0003351F&quot;/&gt;&lt;wsp:rsid wsp:val=&quot;00044599&quot;/&gt;&lt;wsp:rsid wsp:val=&quot;000540E6&quot;/&gt;&lt;wsp:rsid wsp:val=&quot;00054421&quot;/&gt;&lt;wsp:rsid wsp:val=&quot;00062E46&quot;/&gt;&lt;wsp:rsid wsp:val=&quot;00074AC8&quot;/&gt;&lt;wsp:rsid wsp:val=&quot;00081408&quot;/&gt;&lt;wsp:rsid wsp:val=&quot;00081EBE&quot;/&gt;&lt;wsp:rsid wsp:val=&quot;00086EDC&quot;/&gt;&lt;wsp:rsid wsp:val=&quot;000B36A3&quot;/&gt;&lt;wsp:rsid wsp:val=&quot;000C013C&quot;/&gt;&lt;wsp:rsid wsp:val=&quot;000E3F84&quot;/&gt;&lt;wsp:rsid wsp:val=&quot;001056DF&quot;/&gt;&lt;wsp:rsid wsp:val=&quot;0010789C&quot;/&gt;&lt;wsp:rsid wsp:val=&quot;00114025&quot;/&gt;&lt;wsp:rsid wsp:val=&quot;001160D2&quot;/&gt;&lt;wsp:rsid wsp:val=&quot;00120636&quot;/&gt;&lt;wsp:rsid wsp:val=&quot;001348A5&quot;/&gt;&lt;wsp:rsid wsp:val=&quot;00151B8E&quot;/&gt;&lt;wsp:rsid wsp:val=&quot;00182170&quot;/&gt;&lt;wsp:rsid wsp:val=&quot;001928FB&quot;/&gt;&lt;wsp:rsid wsp:val=&quot;00192BC7&quot;/&gt;&lt;wsp:rsid wsp:val=&quot;00195BE6&quot;/&gt;&lt;wsp:rsid wsp:val=&quot;001A50EA&quot;/&gt;&lt;wsp:rsid wsp:val=&quot;001F16CD&quot;/&gt;&lt;wsp:rsid wsp:val=&quot;001F47D2&quot;/&gt;&lt;wsp:rsid wsp:val=&quot;002029C8&quot;/&gt;&lt;wsp:rsid wsp:val=&quot;0022285A&quot;/&gt;&lt;wsp:rsid wsp:val=&quot;00224C61&quot;/&gt;&lt;wsp:rsid wsp:val=&quot;00256ABC&quot;/&gt;&lt;wsp:rsid wsp:val=&quot;0027227B&quot;/&gt;&lt;wsp:rsid wsp:val=&quot;00273AC7&quot;/&gt;&lt;wsp:rsid wsp:val=&quot;00273D2C&quot;/&gt;&lt;wsp:rsid wsp:val=&quot;00285ECD&quot;/&gt;&lt;wsp:rsid wsp:val=&quot;00290E1B&quot;/&gt;&lt;wsp:rsid wsp:val=&quot;00291B17&quot;/&gt;&lt;wsp:rsid wsp:val=&quot;00291BB3&quot;/&gt;&lt;wsp:rsid wsp:val=&quot;002A6742&quot;/&gt;&lt;wsp:rsid wsp:val=&quot;002C1A7F&quot;/&gt;&lt;wsp:rsid wsp:val=&quot;002C4239&quot;/&gt;&lt;wsp:rsid wsp:val=&quot;002C559D&quot;/&gt;&lt;wsp:rsid wsp:val=&quot;002D16AE&quot;/&gt;&lt;wsp:rsid wsp:val=&quot;002D2D42&quot;/&gt;&lt;wsp:rsid wsp:val=&quot;002F72D0&quot;/&gt;&lt;wsp:rsid wsp:val=&quot;002F7A4F&quot;/&gt;&lt;wsp:rsid wsp:val=&quot;003003AB&quot;/&gt;&lt;wsp:rsid wsp:val=&quot;00302C35&quot;/&gt;&lt;wsp:rsid wsp:val=&quot;00311C49&quot;/&gt;&lt;wsp:rsid wsp:val=&quot;0032119E&quot;/&gt;&lt;wsp:rsid wsp:val=&quot;00321304&quot;/&gt;&lt;wsp:rsid wsp:val=&quot;00324FC2&quot;/&gt;&lt;wsp:rsid wsp:val=&quot;003312CA&quot;/&gt;&lt;wsp:rsid wsp:val=&quot;00331F84&quot;/&gt;&lt;wsp:rsid wsp:val=&quot;0037721F&quot;/&gt;&lt;wsp:rsid wsp:val=&quot;003950A4&quot;/&gt;&lt;wsp:rsid wsp:val=&quot;003A1E7E&quot;/&gt;&lt;wsp:rsid wsp:val=&quot;003E2FDC&quot;/&gt;&lt;wsp:rsid wsp:val=&quot;003E3577&quot;/&gt;&lt;wsp:rsid wsp:val=&quot;003F3A61&quot;/&gt;&lt;wsp:rsid wsp:val=&quot;00410A5D&quot;/&gt;&lt;wsp:rsid wsp:val=&quot;00414909&quot;/&gt;&lt;wsp:rsid wsp:val=&quot;00416537&quot;/&gt;&lt;wsp:rsid wsp:val=&quot;00425A6A&quot;/&gt;&lt;wsp:rsid wsp:val=&quot;00426FBB&quot;/&gt;&lt;wsp:rsid wsp:val=&quot;00454542&quot;/&gt;&lt;wsp:rsid wsp:val=&quot;0047429A&quot;/&gt;&lt;wsp:rsid wsp:val=&quot;0048374C&quot;/&gt;&lt;wsp:rsid wsp:val=&quot;0048771D&quot;/&gt;&lt;wsp:rsid wsp:val=&quot;004A6605&quot;/&gt;&lt;wsp:rsid wsp:val=&quot;004C45FA&quot;/&gt;&lt;wsp:rsid wsp:val=&quot;004D35A3&quot;/&gt;&lt;wsp:rsid wsp:val=&quot;004E1BD8&quot;/&gt;&lt;wsp:rsid wsp:val=&quot;004E452A&quot;/&gt;&lt;wsp:rsid wsp:val=&quot;004E78E3&quot;/&gt;&lt;wsp:rsid wsp:val=&quot;004F2BFE&quot;/&gt;&lt;wsp:rsid wsp:val=&quot;004F63D3&quot;/&gt;&lt;wsp:rsid wsp:val=&quot;004F7DCF&quot;/&gt;&lt;wsp:rsid wsp:val=&quot;005004BF&quot;/&gt;&lt;wsp:rsid wsp:val=&quot;00502E89&quot;/&gt;&lt;wsp:rsid wsp:val=&quot;00506CFE&quot;/&gt;&lt;wsp:rsid wsp:val=&quot;00510E95&quot;/&gt;&lt;wsp:rsid wsp:val=&quot;005225C3&quot;/&gt;&lt;wsp:rsid wsp:val=&quot;00527D56&quot;/&gt;&lt;wsp:rsid wsp:val=&quot;0053221F&quot;/&gt;&lt;wsp:rsid wsp:val=&quot;00536FAE&quot;/&gt;&lt;wsp:rsid wsp:val=&quot;00542C85&quot;/&gt;&lt;wsp:rsid wsp:val=&quot;00553510&quot;/&gt;&lt;wsp:rsid wsp:val=&quot;00554186&quot;/&gt;&lt;wsp:rsid wsp:val=&quot;00585769&quot;/&gt;&lt;wsp:rsid wsp:val=&quot;00585C61&quot;/&gt;&lt;wsp:rsid wsp:val=&quot;00591130&quot;/&gt;&lt;wsp:rsid wsp:val=&quot;005A3F28&quot;/&gt;&lt;wsp:rsid wsp:val=&quot;005A40BE&quot;/&gt;&lt;wsp:rsid wsp:val=&quot;005B13E2&quot;/&gt;&lt;wsp:rsid wsp:val=&quot;005B47D7&quot;/&gt;&lt;wsp:rsid wsp:val=&quot;005C5526&quot;/&gt;&lt;wsp:rsid wsp:val=&quot;005C62C6&quot;/&gt;&lt;wsp:rsid wsp:val=&quot;005D7B9E&quot;/&gt;&lt;wsp:rsid wsp:val=&quot;005E112E&quot;/&gt;&lt;wsp:rsid wsp:val=&quot;005F0834&quot;/&gt;&lt;wsp:rsid wsp:val=&quot;005F68AB&quot;/&gt;&lt;wsp:rsid wsp:val=&quot;005F6DC3&quot;/&gt;&lt;wsp:rsid wsp:val=&quot;00601A8E&quot;/&gt;&lt;wsp:rsid wsp:val=&quot;0062033E&quot;/&gt;&lt;wsp:rsid wsp:val=&quot;00624482&quot;/&gt;&lt;wsp:rsid wsp:val=&quot;0064799C&quot;/&gt;&lt;wsp:rsid wsp:val=&quot;00654156&quot;/&gt;&lt;wsp:rsid wsp:val=&quot;006B47CA&quot;/&gt;&lt;wsp:rsid wsp:val=&quot;006C304C&quot;/&gt;&lt;wsp:rsid wsp:val=&quot;006C4511&quot;/&gt;&lt;wsp:rsid wsp:val=&quot;006C65F5&quot;/&gt;&lt;wsp:rsid wsp:val=&quot;006C7AAA&quot;/&gt;&lt;wsp:rsid wsp:val=&quot;006D1C2A&quot;/&gt;&lt;wsp:rsid wsp:val=&quot;006D264F&quot;/&gt;&lt;wsp:rsid wsp:val=&quot;006E2A8D&quot;/&gt;&lt;wsp:rsid wsp:val=&quot;006E7574&quot;/&gt;&lt;wsp:rsid wsp:val=&quot;00703430&quot;/&gt;&lt;wsp:rsid wsp:val=&quot;00703548&quot;/&gt;&lt;wsp:rsid wsp:val=&quot;00704E18&quot;/&gt;&lt;wsp:rsid wsp:val=&quot;007069BE&quot;/&gt;&lt;wsp:rsid wsp:val=&quot;00745C86&quot;/&gt;&lt;wsp:rsid wsp:val=&quot;00764603&quot;/&gt;&lt;wsp:rsid wsp:val=&quot;0076604D&quot;/&gt;&lt;wsp:rsid wsp:val=&quot;00790909&quot;/&gt;&lt;wsp:rsid wsp:val=&quot;007B1582&quot;/&gt;&lt;wsp:rsid wsp:val=&quot;007B5A07&quot;/&gt;&lt;wsp:rsid wsp:val=&quot;007C065D&quot;/&gt;&lt;wsp:rsid wsp:val=&quot;007D3E71&quot;/&gt;&lt;wsp:rsid wsp:val=&quot;007E5D6A&quot;/&gt;&lt;wsp:rsid wsp:val=&quot;007E645D&quot;/&gt;&lt;wsp:rsid wsp:val=&quot;007F75CA&quot;/&gt;&lt;wsp:rsid wsp:val=&quot;00821E08&quot;/&gt;&lt;wsp:rsid wsp:val=&quot;00834EFD&quot;/&gt;&lt;wsp:rsid wsp:val=&quot;00844B24&quot;/&gt;&lt;wsp:rsid wsp:val=&quot;0084515F&quot;/&gt;&lt;wsp:rsid wsp:val=&quot;0085092D&quot;/&gt;&lt;wsp:rsid wsp:val=&quot;00865414&quot;/&gt;&lt;wsp:rsid wsp:val=&quot;00877D4C&quot;/&gt;&lt;wsp:rsid wsp:val=&quot;00883903&quot;/&gt;&lt;wsp:rsid wsp:val=&quot;0089763B&quot;/&gt;&lt;wsp:rsid wsp:val=&quot;008B6AE3&quot;/&gt;&lt;wsp:rsid wsp:val=&quot;008C1332&quot;/&gt;&lt;wsp:rsid wsp:val=&quot;008D1045&quot;/&gt;&lt;wsp:rsid wsp:val=&quot;008E5996&quot;/&gt;&lt;wsp:rsid wsp:val=&quot;00901AE1&quot;/&gt;&lt;wsp:rsid wsp:val=&quot;00912F93&quot;/&gt;&lt;wsp:rsid wsp:val=&quot;009205B4&quot;/&gt;&lt;wsp:rsid wsp:val=&quot;00955B59&quot;/&gt;&lt;wsp:rsid wsp:val=&quot;00992262&quot;/&gt;&lt;wsp:rsid wsp:val=&quot;009926BC&quot;/&gt;&lt;wsp:rsid wsp:val=&quot;009A4319&quot;/&gt;&lt;wsp:rsid wsp:val=&quot;009A6C3F&quot;/&gt;&lt;wsp:rsid wsp:val=&quot;009B73F2&quot;/&gt;&lt;wsp:rsid wsp:val=&quot;009C12BD&quot;/&gt;&lt;wsp:rsid wsp:val=&quot;009C50FE&quot;/&gt;&lt;wsp:rsid wsp:val=&quot;009E49DD&quot;/&gt;&lt;wsp:rsid wsp:val=&quot;00A03E75&quot;/&gt;&lt;wsp:rsid wsp:val=&quot;00A20627&quot;/&gt;&lt;wsp:rsid wsp:val=&quot;00A22FE9&quot;/&gt;&lt;wsp:rsid wsp:val=&quot;00A31A44&quot;/&gt;&lt;wsp:rsid wsp:val=&quot;00A32BFA&quot;/&gt;&lt;wsp:rsid wsp:val=&quot;00A3325E&quot;/&gt;&lt;wsp:rsid wsp:val=&quot;00A45FCE&quot;/&gt;&lt;wsp:rsid wsp:val=&quot;00A75671&quot;/&gt;&lt;wsp:rsid wsp:val=&quot;00A773CC&quot;/&gt;&lt;wsp:rsid wsp:val=&quot;00A924D0&quot;/&gt;&lt;wsp:rsid wsp:val=&quot;00A9318B&quot;/&gt;&lt;wsp:rsid wsp:val=&quot;00A94AC1&quot;/&gt;&lt;wsp:rsid wsp:val=&quot;00AB18B7&quot;/&gt;&lt;wsp:rsid wsp:val=&quot;00AD335D&quot;/&gt;&lt;wsp:rsid wsp:val=&quot;00AF114C&quot;/&gt;&lt;wsp:rsid wsp:val=&quot;00AF792B&quot;/&gt;&lt;wsp:rsid wsp:val=&quot;00B33D2F&quot;/&gt;&lt;wsp:rsid wsp:val=&quot;00B40A5B&quot;/&gt;&lt;wsp:rsid wsp:val=&quot;00B45C6B&quot;/&gt;&lt;wsp:rsid wsp:val=&quot;00B55D5E&quot;/&gt;&lt;wsp:rsid wsp:val=&quot;00B57A80&quot;/&gt;&lt;wsp:rsid wsp:val=&quot;00B70E9C&quot;/&gt;&lt;wsp:rsid wsp:val=&quot;00B713D8&quot;/&gt;&lt;wsp:rsid wsp:val=&quot;00B72979&quot;/&gt;&lt;wsp:rsid wsp:val=&quot;00B94516&quot;/&gt;&lt;wsp:rsid wsp:val=&quot;00BA25E2&quot;/&gt;&lt;wsp:rsid wsp:val=&quot;00BB2855&quot;/&gt;&lt;wsp:rsid wsp:val=&quot;00BC5343&quot;/&gt;&lt;wsp:rsid wsp:val=&quot;00BD19C1&quot;/&gt;&lt;wsp:rsid wsp:val=&quot;00BD25B8&quot;/&gt;&lt;wsp:rsid wsp:val=&quot;00C012E1&quot;/&gt;&lt;wsp:rsid wsp:val=&quot;00C06BB4&quot;/&gt;&lt;wsp:rsid wsp:val=&quot;00C10D20&quot;/&gt;&lt;wsp:rsid wsp:val=&quot;00C12E0C&quot;/&gt;&lt;wsp:rsid wsp:val=&quot;00C21916&quot;/&gt;&lt;wsp:rsid wsp:val=&quot;00C34915&quot;/&gt;&lt;wsp:rsid wsp:val=&quot;00C457CA&quot;/&gt;&lt;wsp:rsid wsp:val=&quot;00C53FB6&quot;/&gt;&lt;wsp:rsid wsp:val=&quot;00C57FB7&quot;/&gt;&lt;wsp:rsid wsp:val=&quot;00C644D4&quot;/&gt;&lt;wsp:rsid wsp:val=&quot;00C65F3F&quot;/&gt;&lt;wsp:rsid wsp:val=&quot;00C72414&quot;/&gt;&lt;wsp:rsid wsp:val=&quot;00C72B1A&quot;/&gt;&lt;wsp:rsid wsp:val=&quot;00C8667B&quot;/&gt;&lt;wsp:rsid wsp:val=&quot;00C90993&quot;/&gt;&lt;wsp:rsid wsp:val=&quot;00C914DE&quot;/&gt;&lt;wsp:rsid wsp:val=&quot;00CA4CE3&quot;/&gt;&lt;wsp:rsid wsp:val=&quot;00CC72FD&quot;/&gt;&lt;wsp:rsid wsp:val=&quot;00CD4F3F&quot;/&gt;&lt;wsp:rsid wsp:val=&quot;00D311F8&quot;/&gt;&lt;wsp:rsid wsp:val=&quot;00D31660&quot;/&gt;&lt;wsp:rsid wsp:val=&quot;00D36B52&quot;/&gt;&lt;wsp:rsid wsp:val=&quot;00D377C8&quot;/&gt;&lt;wsp:rsid wsp:val=&quot;00D41274&quot;/&gt;&lt;wsp:rsid wsp:val=&quot;00D4229C&quot;/&gt;&lt;wsp:rsid wsp:val=&quot;00D43BF3&quot;/&gt;&lt;wsp:rsid wsp:val=&quot;00D549FB&quot;/&gt;&lt;wsp:rsid wsp:val=&quot;00D767BB&quot;/&gt;&lt;wsp:rsid wsp:val=&quot;00D939B0&quot;/&gt;&lt;wsp:rsid wsp:val=&quot;00DA31A2&quot;/&gt;&lt;wsp:rsid wsp:val=&quot;00DB16E0&quot;/&gt;&lt;wsp:rsid wsp:val=&quot;00DB2DF9&quot;/&gt;&lt;wsp:rsid wsp:val=&quot;00DB465D&quot;/&gt;&lt;wsp:rsid wsp:val=&quot;00DB48A2&quot;/&gt;&lt;wsp:rsid wsp:val=&quot;00DB7E63&quot;/&gt;&lt;wsp:rsid wsp:val=&quot;00DC2055&quot;/&gt;&lt;wsp:rsid wsp:val=&quot;00DC3908&quot;/&gt;&lt;wsp:rsid wsp:val=&quot;00DD71E8&quot;/&gt;&lt;wsp:rsid wsp:val=&quot;00DD7F83&quot;/&gt;&lt;wsp:rsid wsp:val=&quot;00DE4EB8&quot;/&gt;&lt;wsp:rsid wsp:val=&quot;00E0641E&quot;/&gt;&lt;wsp:rsid wsp:val=&quot;00E06664&quot;/&gt;&lt;wsp:rsid wsp:val=&quot;00E304BC&quot;/&gt;&lt;wsp:rsid wsp:val=&quot;00E32853&quot;/&gt;&lt;wsp:rsid wsp:val=&quot;00E34EBD&quot;/&gt;&lt;wsp:rsid wsp:val=&quot;00E401F8&quot;/&gt;&lt;wsp:rsid wsp:val=&quot;00E46425&quot;/&gt;&lt;wsp:rsid wsp:val=&quot;00E469FC&quot;/&gt;&lt;wsp:rsid wsp:val=&quot;00E47D0E&quot;/&gt;&lt;wsp:rsid wsp:val=&quot;00E65018&quot;/&gt;&lt;wsp:rsid wsp:val=&quot;00E76CA1&quot;/&gt;&lt;wsp:rsid wsp:val=&quot;00E94339&quot;/&gt;&lt;wsp:rsid wsp:val=&quot;00E97563&quot;/&gt;&lt;wsp:rsid wsp:val=&quot;00EB0B63&quot;/&gt;&lt;wsp:rsid wsp:val=&quot;00EC265C&quot;/&gt;&lt;wsp:rsid wsp:val=&quot;00ED61CB&quot;/&gt;&lt;wsp:rsid wsp:val=&quot;00EE752A&quot;/&gt;&lt;wsp:rsid wsp:val=&quot;00F06A72&quot;/&gt;&lt;wsp:rsid wsp:val=&quot;00F136F0&quot;/&gt;&lt;wsp:rsid wsp:val=&quot;00F20BBB&quot;/&gt;&lt;wsp:rsid wsp:val=&quot;00F36048&quot;/&gt;&lt;wsp:rsid wsp:val=&quot;00F43BD8&quot;/&gt;&lt;wsp:rsid wsp:val=&quot;00F562F3&quot;/&gt;&lt;wsp:rsid wsp:val=&quot;00F74B89&quot;/&gt;&lt;wsp:rsid wsp:val=&quot;00F75133&quot;/&gt;&lt;wsp:rsid wsp:val=&quot;00F83272&quot;/&gt;&lt;wsp:rsid wsp:val=&quot;00F9358D&quot;/&gt;&lt;wsp:rsid wsp:val=&quot;00FA3899&quot;/&gt;&lt;wsp:rsid wsp:val=&quot;00FA4909&quot;/&gt;&lt;wsp:rsid wsp:val=&quot;00FA5164&quot;/&gt;&lt;wsp:rsid wsp:val=&quot;00FA6751&quot;/&gt;&lt;wsp:rsid wsp:val=&quot;00FA6BD7&quot;/&gt;&lt;wsp:rsid wsp:val=&quot;00FB1048&quot;/&gt;&lt;wsp:rsid wsp:val=&quot;00FB62C4&quot;/&gt;&lt;wsp:rsid wsp:val=&quot;00FB7701&quot;/&gt;&lt;wsp:rsid wsp:val=&quot;00FD1AC5&quot;/&gt;&lt;wsp:rsid wsp:val=&quot;00FD5CF0&quot;/&gt;&lt;/wsp:rsids&gt;&lt;/w:docPr&gt;&lt;w:body&gt;&lt;wx:sect&gt;&lt;w:p wsp:rsidR=&quot;00C914DE&quot; wsp:rsidRDefault=&quot;00C914DE&quot; wsp:rsidP=&quot;00C914DE&quot;&gt;&lt;m:oMathPara&gt;&lt;m:oMath&gt;&lt;m:r&gt;&lt;w:rPr&gt;&lt;w:rFonts w:ascii=&quot;Cambria Math&quot; w:fareast=&quot;Times New Roman&quot; w:h-ansi=&quot;Cambria Math&quot;/&gt;&lt;wx:font wx:val=&quot;Cambria Math&quot;/&gt;&lt;w:i/&gt;&lt;/w:rPr&gt;&lt;m:t&gt;D&lt;/m:t&gt;&lt;/m:r&gt;&lt;/m:oMath&gt;&lt;/m:oMathPara&gt;&lt;/w:p&gt;&lt;w:sectPr wsp:rsidR=&quot;00000000&quot;&gt;&lt;w:pgSz w:w=&quot;12240&quot; w:h=&quot;15840&quot;/&gt;&lt;w:pgMar w:top=&quot;1440&quot; w:right=&quot;1440&quot; w:bottom=&quot;1440&quot; w:left=&quot;1440&quot; w:header=&quot;720&quot; w:footer=&quot;720&quot; w:gutter=&quot;0&quot;/&gt;&lt;w:cols w:space=&quot;720&quot;/&gt;&lt;/w:sectPr&gt;&lt;/wx:sect&gt;&lt;/w:body&gt;&lt;/w:wordDocument&gt;">
+          <v:shape id="_x0000_i1033" type="#_x0000_t75" style="width:8.3pt;height:13.85pt" equationxml="&lt;?xml version=&quot;1.0&quot; encoding=&quot;UTF-8&quot; standalone=&quot;yes&quot;?&gt;&#10;&lt;?mso-application progid=&quot;Word.Document&quot;?&gt;&#10;&lt;w:wordDocument xmlns:aml=&quot;http://schemas.microsoft.com/aml/2001/core&quot; xmlns:wpc=&quot;http://schemas.microsoft.com/office/word/2010/wordprocessingCanvas&quot; xmlns:cx=&quot;http://schemas.microsoft.com/office/drawing/2014/chartex&quot; xmlns:cx1=&quot;http://schemas.microsoft.com/office/drawing/2015/9/8/chartex&quot; xmlns:cx2=&quot;http://schemas.microsoft.com/office/drawing/2015/10/21/chartex&quot; xmlns:cx3=&quot;http://schemas.microsoft.com/office/drawing/2016/5/9/chartex&quot; xmlns:cx4=&quot;http://schemas.microsoft.com/office/drawing/2016/5/10/chartex&quot; xmlns:cx5=&quot;http://schemas.microsoft.com/office/drawing/2016/5/11/chartex&quot; xmlns:cx6=&quot;http://schemas.microsoft.com/office/drawing/2016/5/12/chartex&quot; xmlns:cx7=&quot;http://schemas.microsoft.com/office/drawing/2016/5/13/chartex&quot; xmlns:cx8=&quot;http://schemas.microsoft.com/office/drawing/2016/5/14/chartex&quot; xmlns:cr=&quot;http://schemas.microsoft.com/office/comments/2020/reactions&quot; xmlns:dt=&quot;uuid:C2F41010-65B3-11d1-A29F-00AA00C14882&quot; xmlns:mc=&quot;http://schemas.openxmlformats.org/markup-compatibility/2006&quot; xmlns:aink=&quot;http://schemas.microsoft.com/office/drawing/2016/ink&quot; xmlns:am3d=&quot;http://schemas.microsoft.com/office/drawing/2017/model3d&quot; xmlns:o=&quot;urn:schemas-microsoft-com:office:office&quot; xmlns:oel=&quot;http://schemas.microsoft.com/office/2019/extlst&quot; xmlns:m=&quot;http://schemas.openxmlformats.org/officeDocument/2006/math&quot; xmlns:v=&quot;urn:schemas-microsoft-com:vml&quot; xmlns:w10=&quot;urn:schemas-microsoft-com:office:word&quot; xmlns:w=&quot;http://schemas.microsoft.com/office/word/2003/wordml&quot; xmlns:wx=&quot;http://schemas.microsoft.com/office/word/2003/auxHint&quot; xmlns:wne=&quot;http://schemas.microsoft.com/office/word/2006/wordml&quot; xmlns:wsp=&quot;http://schemas.microsoft.com/office/word/2003/wordml/sp2&quot; xmlns:sl=&quot;http://schemas.microsoft.com/schemaLibrary/2003/core&quot; w:macrosPresent=&quot;no&quot; w:embeddedObjPresent=&quot;no&quot; w:ocxPresent=&quot;no&quot; xml:space=&quot;preserve&quot;&gt;&lt;w:ignoreSubtree w:val=&quot;http://schemas.microsoft.com/office/word/2003/wordml/sp2&quot;/&gt;&lt;o:DocumentProperties&gt;&lt;o:Version&gt;16&lt;/o:Version&gt;&lt;/o:DocumentProperties&gt;&lt;w:docPr&gt;&lt;w:view w:val=&quot;print&quot;/&gt;&lt;w:zoom w:percent=&quot;100&quot;/&gt;&lt;w:doNotEmbedSystemFonts/&gt;&lt;w:activeWritingStyle w:lang=&quot;EN-AU&quot; w:vendorID=&quot;64&quot; w:dllVersion=&quot;6&quot; w:nlCheck=&quot;on&quot; w:optionSet=&quot;1&quot;/&gt;&lt;w:activeWritingStyle w:lang=&quot;EN-GB&quot; w:vendorID=&quot;64&quot; w:dllVersion=&quot;6&quot; w:nlCheck=&quot;on&quot; w:optionSet=&quot;1&quot;/&gt;&lt;w:activeWritingStyle w:lang=&quot;EN-US&quot; w:vendorID=&quot;64&quot; w:dllVersion=&quot;6&quot; w:nlCheck=&quot;on&quot; w:optionSet=&quot;1&quot;/&gt;&lt;w:activeWritingStyle w:lang=&quot;EN-AU&quot; w:vendorID=&quot;64&quot; w:dllVersion=&quot;0&quot; w:nlCheck=&quot;on&quot; w:optionSet=&quot;0&quot;/&gt;&lt;w:activeWritingStyle w:lang=&quot;EN-GB&quot; w:vendorID=&quot;64&quot; w:dllVersion=&quot;0&quot; w:nlCheck=&quot;on&quot; w:optionSet=&quot;0&quot;/&gt;&lt;w:activeWritingStyle w:lang=&quot;EN-US&quot; w:vendorID=&quot;64&quot; w:dllVersion=&quot;0&quot; w:nlCheck=&quot;on&quot; w:optionSet=&quot;0&quot;/&gt;&lt;w:activeWritingStyle w:lang=&quot;ES-AR&quot; w:vendorID=&quot;64&quot; w:dllVersion=&quot;0&quot; w:nlCheck=&quot;on&quot; w:optionSet=&quot;0&quot;/&gt;&lt;w:activeWritingStyle w:lang=&quot;580A&quot; w:vendorID=&quot;64&quot; w:dllVersion=&quot;0&quot; w:nlCheck=&quot;on&quot; w:optionSet=&quot;0&quot;/&gt;&lt;w:activeWritingStyle w:lang=&quot;PT-BR&quot; w:vendorID=&quot;64&quot; w:dllVersion=&quot;0&quot; w:nlCheck=&quot;on&quot; w:optionSet=&quot;0&quot;/&gt;&lt;w:stylePaneFormatFilter w:val=&quot;3F01&quot;/&gt;&lt;w:defaultTabStop w:val=&quot;720&quot;/&gt;&lt;w:hyphenationZone w:val=&quot;425&quot;/&gt;&lt;w:characterSpacingControl w:val=&quot;DontCompress&quot;/&gt;&lt;w:optimizeForBrowser/&gt;&lt;w:validateAgainstSchema/&gt;&lt;w:saveInvalidXML w:val=&quot;off&quot;/&gt;&lt;w:ignoreMixedContent w:val=&quot;off&quot;/&gt;&lt;w:alwaysShowPlaceholderText w:val=&quot;off&quot;/&gt;&lt;w:compat&gt;&lt;w:breakWrappedTables/&gt;&lt;w:snapToGridInCell/&gt;&lt;w:applyBreakingRules/&gt;&lt;w:wrapTextWithPunct/&gt;&lt;w:useAsianBreakRules/&gt;&lt;w:useWord2002TableStyleRules/&gt;&lt;w:useFELayout/&gt;&lt;/w:compat&gt;&lt;wsp:rsids&gt;&lt;wsp:rsidRoot wsp:val=&quot;00426FBB&quot;/&gt;&lt;wsp:rsid wsp:val=&quot;000002E1&quot;/&gt;&lt;wsp:rsid wsp:val=&quot;00003C97&quot;/&gt;&lt;wsp:rsid wsp:val=&quot;00005565&quot;/&gt;&lt;wsp:rsid wsp:val=&quot;0001754A&quot;/&gt;&lt;wsp:rsid wsp:val=&quot;00017719&quot;/&gt;&lt;wsp:rsid wsp:val=&quot;00027F1D&quot;/&gt;&lt;wsp:rsid wsp:val=&quot;0003296C&quot;/&gt;&lt;wsp:rsid wsp:val=&quot;0003351F&quot;/&gt;&lt;wsp:rsid wsp:val=&quot;00044599&quot;/&gt;&lt;wsp:rsid wsp:val=&quot;000540E6&quot;/&gt;&lt;wsp:rsid wsp:val=&quot;00054421&quot;/&gt;&lt;wsp:rsid wsp:val=&quot;00062E46&quot;/&gt;&lt;wsp:rsid wsp:val=&quot;00074AC8&quot;/&gt;&lt;wsp:rsid wsp:val=&quot;00081408&quot;/&gt;&lt;wsp:rsid wsp:val=&quot;00081EBE&quot;/&gt;&lt;wsp:rsid wsp:val=&quot;00086EDC&quot;/&gt;&lt;wsp:rsid wsp:val=&quot;000B36A3&quot;/&gt;&lt;wsp:rsid wsp:val=&quot;000C013C&quot;/&gt;&lt;wsp:rsid wsp:val=&quot;000E3F84&quot;/&gt;&lt;wsp:rsid wsp:val=&quot;001056DF&quot;/&gt;&lt;wsp:rsid wsp:val=&quot;0010789C&quot;/&gt;&lt;wsp:rsid wsp:val=&quot;00114025&quot;/&gt;&lt;wsp:rsid wsp:val=&quot;001160D2&quot;/&gt;&lt;wsp:rsid wsp:val=&quot;00120636&quot;/&gt;&lt;wsp:rsid wsp:val=&quot;001348A5&quot;/&gt;&lt;wsp:rsid wsp:val=&quot;00151B8E&quot;/&gt;&lt;wsp:rsid wsp:val=&quot;00182170&quot;/&gt;&lt;wsp:rsid wsp:val=&quot;001928FB&quot;/&gt;&lt;wsp:rsid wsp:val=&quot;00192BC7&quot;/&gt;&lt;wsp:rsid wsp:val=&quot;00195BE6&quot;/&gt;&lt;wsp:rsid wsp:val=&quot;001A50EA&quot;/&gt;&lt;wsp:rsid wsp:val=&quot;001F16CD&quot;/&gt;&lt;wsp:rsid wsp:val=&quot;001F47D2&quot;/&gt;&lt;wsp:rsid wsp:val=&quot;002029C8&quot;/&gt;&lt;wsp:rsid wsp:val=&quot;0022285A&quot;/&gt;&lt;wsp:rsid wsp:val=&quot;00224C61&quot;/&gt;&lt;wsp:rsid wsp:val=&quot;00256ABC&quot;/&gt;&lt;wsp:rsid wsp:val=&quot;0027227B&quot;/&gt;&lt;wsp:rsid wsp:val=&quot;00273AC7&quot;/&gt;&lt;wsp:rsid wsp:val=&quot;00273D2C&quot;/&gt;&lt;wsp:rsid wsp:val=&quot;00285ECD&quot;/&gt;&lt;wsp:rsid wsp:val=&quot;00290E1B&quot;/&gt;&lt;wsp:rsid wsp:val=&quot;00291B17&quot;/&gt;&lt;wsp:rsid wsp:val=&quot;00291BB3&quot;/&gt;&lt;wsp:rsid wsp:val=&quot;002A6742&quot;/&gt;&lt;wsp:rsid wsp:val=&quot;002C1A7F&quot;/&gt;&lt;wsp:rsid wsp:val=&quot;002C4239&quot;/&gt;&lt;wsp:rsid wsp:val=&quot;002C559D&quot;/&gt;&lt;wsp:rsid wsp:val=&quot;002D16AE&quot;/&gt;&lt;wsp:rsid wsp:val=&quot;002D2D42&quot;/&gt;&lt;wsp:rsid wsp:val=&quot;002F72D0&quot;/&gt;&lt;wsp:rsid wsp:val=&quot;002F7A4F&quot;/&gt;&lt;wsp:rsid wsp:val=&quot;003003AB&quot;/&gt;&lt;wsp:rsid wsp:val=&quot;00302C35&quot;/&gt;&lt;wsp:rsid wsp:val=&quot;00311C49&quot;/&gt;&lt;wsp:rsid wsp:val=&quot;0032119E&quot;/&gt;&lt;wsp:rsid wsp:val=&quot;00321304&quot;/&gt;&lt;wsp:rsid wsp:val=&quot;00324FC2&quot;/&gt;&lt;wsp:rsid wsp:val=&quot;003312CA&quot;/&gt;&lt;wsp:rsid wsp:val=&quot;00331F84&quot;/&gt;&lt;wsp:rsid wsp:val=&quot;0037721F&quot;/&gt;&lt;wsp:rsid wsp:val=&quot;003950A4&quot;/&gt;&lt;wsp:rsid wsp:val=&quot;003A1E7E&quot;/&gt;&lt;wsp:rsid wsp:val=&quot;003E2FDC&quot;/&gt;&lt;wsp:rsid wsp:val=&quot;003E3577&quot;/&gt;&lt;wsp:rsid wsp:val=&quot;003F3A61&quot;/&gt;&lt;wsp:rsid wsp:val=&quot;00410A5D&quot;/&gt;&lt;wsp:rsid wsp:val=&quot;00414909&quot;/&gt;&lt;wsp:rsid wsp:val=&quot;00416537&quot;/&gt;&lt;wsp:rsid wsp:val=&quot;00425A6A&quot;/&gt;&lt;wsp:rsid wsp:val=&quot;00426FBB&quot;/&gt;&lt;wsp:rsid wsp:val=&quot;00454542&quot;/&gt;&lt;wsp:rsid wsp:val=&quot;0047429A&quot;/&gt;&lt;wsp:rsid wsp:val=&quot;0048374C&quot;/&gt;&lt;wsp:rsid wsp:val=&quot;0048771D&quot;/&gt;&lt;wsp:rsid wsp:val=&quot;004A6605&quot;/&gt;&lt;wsp:rsid wsp:val=&quot;004C45FA&quot;/&gt;&lt;wsp:rsid wsp:val=&quot;004D35A3&quot;/&gt;&lt;wsp:rsid wsp:val=&quot;004E1BD8&quot;/&gt;&lt;wsp:rsid wsp:val=&quot;004E452A&quot;/&gt;&lt;wsp:rsid wsp:val=&quot;004E78E3&quot;/&gt;&lt;wsp:rsid wsp:val=&quot;004F2BFE&quot;/&gt;&lt;wsp:rsid wsp:val=&quot;004F63D3&quot;/&gt;&lt;wsp:rsid wsp:val=&quot;004F7DCF&quot;/&gt;&lt;wsp:rsid wsp:val=&quot;005004BF&quot;/&gt;&lt;wsp:rsid wsp:val=&quot;00502E89&quot;/&gt;&lt;wsp:rsid wsp:val=&quot;00506CFE&quot;/&gt;&lt;wsp:rsid wsp:val=&quot;00510E95&quot;/&gt;&lt;wsp:rsid wsp:val=&quot;005225C3&quot;/&gt;&lt;wsp:rsid wsp:val=&quot;00527D56&quot;/&gt;&lt;wsp:rsid wsp:val=&quot;0053221F&quot;/&gt;&lt;wsp:rsid wsp:val=&quot;00536FAE&quot;/&gt;&lt;wsp:rsid wsp:val=&quot;00542C85&quot;/&gt;&lt;wsp:rsid wsp:val=&quot;00553510&quot;/&gt;&lt;wsp:rsid wsp:val=&quot;00554186&quot;/&gt;&lt;wsp:rsid wsp:val=&quot;00585769&quot;/&gt;&lt;wsp:rsid wsp:val=&quot;00585C61&quot;/&gt;&lt;wsp:rsid wsp:val=&quot;00591130&quot;/&gt;&lt;wsp:rsid wsp:val=&quot;005A3F28&quot;/&gt;&lt;wsp:rsid wsp:val=&quot;005A40BE&quot;/&gt;&lt;wsp:rsid wsp:val=&quot;005B13E2&quot;/&gt;&lt;wsp:rsid wsp:val=&quot;005B47D7&quot;/&gt;&lt;wsp:rsid wsp:val=&quot;005C5526&quot;/&gt;&lt;wsp:rsid wsp:val=&quot;005C62C6&quot;/&gt;&lt;wsp:rsid wsp:val=&quot;005D7B9E&quot;/&gt;&lt;wsp:rsid wsp:val=&quot;005E112E&quot;/&gt;&lt;wsp:rsid wsp:val=&quot;005F0834&quot;/&gt;&lt;wsp:rsid wsp:val=&quot;005F68AB&quot;/&gt;&lt;wsp:rsid wsp:val=&quot;005F6DC3&quot;/&gt;&lt;wsp:rsid wsp:val=&quot;00601A8E&quot;/&gt;&lt;wsp:rsid wsp:val=&quot;0062033E&quot;/&gt;&lt;wsp:rsid wsp:val=&quot;00624482&quot;/&gt;&lt;wsp:rsid wsp:val=&quot;0064799C&quot;/&gt;&lt;wsp:rsid wsp:val=&quot;00654156&quot;/&gt;&lt;wsp:rsid wsp:val=&quot;006B47CA&quot;/&gt;&lt;wsp:rsid wsp:val=&quot;006C304C&quot;/&gt;&lt;wsp:rsid wsp:val=&quot;006C4511&quot;/&gt;&lt;wsp:rsid wsp:val=&quot;006C65F5&quot;/&gt;&lt;wsp:rsid wsp:val=&quot;006C7AAA&quot;/&gt;&lt;wsp:rsid wsp:val=&quot;006D1C2A&quot;/&gt;&lt;wsp:rsid wsp:val=&quot;006D264F&quot;/&gt;&lt;wsp:rsid wsp:val=&quot;006E2A8D&quot;/&gt;&lt;wsp:rsid wsp:val=&quot;006E7574&quot;/&gt;&lt;wsp:rsid wsp:val=&quot;00703430&quot;/&gt;&lt;wsp:rsid wsp:val=&quot;00703548&quot;/&gt;&lt;wsp:rsid wsp:val=&quot;00704E18&quot;/&gt;&lt;wsp:rsid wsp:val=&quot;007069BE&quot;/&gt;&lt;wsp:rsid wsp:val=&quot;00745C86&quot;/&gt;&lt;wsp:rsid wsp:val=&quot;00764603&quot;/&gt;&lt;wsp:rsid wsp:val=&quot;0076604D&quot;/&gt;&lt;wsp:rsid wsp:val=&quot;00790909&quot;/&gt;&lt;wsp:rsid wsp:val=&quot;007B1582&quot;/&gt;&lt;wsp:rsid wsp:val=&quot;007B5A07&quot;/&gt;&lt;wsp:rsid wsp:val=&quot;007C065D&quot;/&gt;&lt;wsp:rsid wsp:val=&quot;007D3E71&quot;/&gt;&lt;wsp:rsid wsp:val=&quot;007E5D6A&quot;/&gt;&lt;wsp:rsid wsp:val=&quot;007E645D&quot;/&gt;&lt;wsp:rsid wsp:val=&quot;007F75CA&quot;/&gt;&lt;wsp:rsid wsp:val=&quot;00821E08&quot;/&gt;&lt;wsp:rsid wsp:val=&quot;00834EFD&quot;/&gt;&lt;wsp:rsid wsp:val=&quot;00844B24&quot;/&gt;&lt;wsp:rsid wsp:val=&quot;0084515F&quot;/&gt;&lt;wsp:rsid wsp:val=&quot;0085092D&quot;/&gt;&lt;wsp:rsid wsp:val=&quot;00865414&quot;/&gt;&lt;wsp:rsid wsp:val=&quot;00877D4C&quot;/&gt;&lt;wsp:rsid wsp:val=&quot;00883903&quot;/&gt;&lt;wsp:rsid wsp:val=&quot;0089763B&quot;/&gt;&lt;wsp:rsid wsp:val=&quot;008B6AE3&quot;/&gt;&lt;wsp:rsid wsp:val=&quot;008C1332&quot;/&gt;&lt;wsp:rsid wsp:val=&quot;008D1045&quot;/&gt;&lt;wsp:rsid wsp:val=&quot;008E5996&quot;/&gt;&lt;wsp:rsid wsp:val=&quot;00901AE1&quot;/&gt;&lt;wsp:rsid wsp:val=&quot;00912F93&quot;/&gt;&lt;wsp:rsid wsp:val=&quot;009205B4&quot;/&gt;&lt;wsp:rsid wsp:val=&quot;00955B59&quot;/&gt;&lt;wsp:rsid wsp:val=&quot;00992262&quot;/&gt;&lt;wsp:rsid wsp:val=&quot;009926BC&quot;/&gt;&lt;wsp:rsid wsp:val=&quot;009A4319&quot;/&gt;&lt;wsp:rsid wsp:val=&quot;009A6C3F&quot;/&gt;&lt;wsp:rsid wsp:val=&quot;009B73F2&quot;/&gt;&lt;wsp:rsid wsp:val=&quot;009C12BD&quot;/&gt;&lt;wsp:rsid wsp:val=&quot;009C50FE&quot;/&gt;&lt;wsp:rsid wsp:val=&quot;009E49DD&quot;/&gt;&lt;wsp:rsid wsp:val=&quot;00A03E75&quot;/&gt;&lt;wsp:rsid wsp:val=&quot;00A20627&quot;/&gt;&lt;wsp:rsid wsp:val=&quot;00A22FE9&quot;/&gt;&lt;wsp:rsid wsp:val=&quot;00A31A44&quot;/&gt;&lt;wsp:rsid wsp:val=&quot;00A32BFA&quot;/&gt;&lt;wsp:rsid wsp:val=&quot;00A3325E&quot;/&gt;&lt;wsp:rsid wsp:val=&quot;00A45FCE&quot;/&gt;&lt;wsp:rsid wsp:val=&quot;00A75671&quot;/&gt;&lt;wsp:rsid wsp:val=&quot;00A773CC&quot;/&gt;&lt;wsp:rsid wsp:val=&quot;00A924D0&quot;/&gt;&lt;wsp:rsid wsp:val=&quot;00A9318B&quot;/&gt;&lt;wsp:rsid wsp:val=&quot;00A94AC1&quot;/&gt;&lt;wsp:rsid wsp:val=&quot;00AB18B7&quot;/&gt;&lt;wsp:rsid wsp:val=&quot;00AD335D&quot;/&gt;&lt;wsp:rsid wsp:val=&quot;00AF114C&quot;/&gt;&lt;wsp:rsid wsp:val=&quot;00AF792B&quot;/&gt;&lt;wsp:rsid wsp:val=&quot;00B33D2F&quot;/&gt;&lt;wsp:rsid wsp:val=&quot;00B40A5B&quot;/&gt;&lt;wsp:rsid wsp:val=&quot;00B45C6B&quot;/&gt;&lt;wsp:rsid wsp:val=&quot;00B55D5E&quot;/&gt;&lt;wsp:rsid wsp:val=&quot;00B57A80&quot;/&gt;&lt;wsp:rsid wsp:val=&quot;00B70E9C&quot;/&gt;&lt;wsp:rsid wsp:val=&quot;00B713D8&quot;/&gt;&lt;wsp:rsid wsp:val=&quot;00B72979&quot;/&gt;&lt;wsp:rsid wsp:val=&quot;00B94516&quot;/&gt;&lt;wsp:rsid wsp:val=&quot;00BA25E2&quot;/&gt;&lt;wsp:rsid wsp:val=&quot;00BB2855&quot;/&gt;&lt;wsp:rsid wsp:val=&quot;00BC5343&quot;/&gt;&lt;wsp:rsid wsp:val=&quot;00BD19C1&quot;/&gt;&lt;wsp:rsid wsp:val=&quot;00BD25B8&quot;/&gt;&lt;wsp:rsid wsp:val=&quot;00C012E1&quot;/&gt;&lt;wsp:rsid wsp:val=&quot;00C06BB4&quot;/&gt;&lt;wsp:rsid wsp:val=&quot;00C10D20&quot;/&gt;&lt;wsp:rsid wsp:val=&quot;00C12E0C&quot;/&gt;&lt;wsp:rsid wsp:val=&quot;00C21916&quot;/&gt;&lt;wsp:rsid wsp:val=&quot;00C34915&quot;/&gt;&lt;wsp:rsid wsp:val=&quot;00C457CA&quot;/&gt;&lt;wsp:rsid wsp:val=&quot;00C53FB6&quot;/&gt;&lt;wsp:rsid wsp:val=&quot;00C57FB7&quot;/&gt;&lt;wsp:rsid wsp:val=&quot;00C644D4&quot;/&gt;&lt;wsp:rsid wsp:val=&quot;00C65F3F&quot;/&gt;&lt;wsp:rsid wsp:val=&quot;00C72414&quot;/&gt;&lt;wsp:rsid wsp:val=&quot;00C72B1A&quot;/&gt;&lt;wsp:rsid wsp:val=&quot;00C8667B&quot;/&gt;&lt;wsp:rsid wsp:val=&quot;00C90993&quot;/&gt;&lt;wsp:rsid wsp:val=&quot;00C914DE&quot;/&gt;&lt;wsp:rsid wsp:val=&quot;00CA4CE3&quot;/&gt;&lt;wsp:rsid wsp:val=&quot;00CC72FD&quot;/&gt;&lt;wsp:rsid wsp:val=&quot;00CD4F3F&quot;/&gt;&lt;wsp:rsid wsp:val=&quot;00D311F8&quot;/&gt;&lt;wsp:rsid wsp:val=&quot;00D31660&quot;/&gt;&lt;wsp:rsid wsp:val=&quot;00D36B52&quot;/&gt;&lt;wsp:rsid wsp:val=&quot;00D377C8&quot;/&gt;&lt;wsp:rsid wsp:val=&quot;00D41274&quot;/&gt;&lt;wsp:rsid wsp:val=&quot;00D4229C&quot;/&gt;&lt;wsp:rsid wsp:val=&quot;00D43BF3&quot;/&gt;&lt;wsp:rsid wsp:val=&quot;00D549FB&quot;/&gt;&lt;wsp:rsid wsp:val=&quot;00D767BB&quot;/&gt;&lt;wsp:rsid wsp:val=&quot;00D939B0&quot;/&gt;&lt;wsp:rsid wsp:val=&quot;00DA31A2&quot;/&gt;&lt;wsp:rsid wsp:val=&quot;00DB16E0&quot;/&gt;&lt;wsp:rsid wsp:val=&quot;00DB2DF9&quot;/&gt;&lt;wsp:rsid wsp:val=&quot;00DB465D&quot;/&gt;&lt;wsp:rsid wsp:val=&quot;00DB48A2&quot;/&gt;&lt;wsp:rsid wsp:val=&quot;00DB7E63&quot;/&gt;&lt;wsp:rsid wsp:val=&quot;00DC2055&quot;/&gt;&lt;wsp:rsid wsp:val=&quot;00DC3908&quot;/&gt;&lt;wsp:rsid wsp:val=&quot;00DD71E8&quot;/&gt;&lt;wsp:rsid wsp:val=&quot;00DD7F83&quot;/&gt;&lt;wsp:rsid wsp:val=&quot;00DE4EB8&quot;/&gt;&lt;wsp:rsid wsp:val=&quot;00E0641E&quot;/&gt;&lt;wsp:rsid wsp:val=&quot;00E06664&quot;/&gt;&lt;wsp:rsid wsp:val=&quot;00E304BC&quot;/&gt;&lt;wsp:rsid wsp:val=&quot;00E32853&quot;/&gt;&lt;wsp:rsid wsp:val=&quot;00E34EBD&quot;/&gt;&lt;wsp:rsid wsp:val=&quot;00E401F8&quot;/&gt;&lt;wsp:rsid wsp:val=&quot;00E46425&quot;/&gt;&lt;wsp:rsid wsp:val=&quot;00E469FC&quot;/&gt;&lt;wsp:rsid wsp:val=&quot;00E47D0E&quot;/&gt;&lt;wsp:rsid wsp:val=&quot;00E65018&quot;/&gt;&lt;wsp:rsid wsp:val=&quot;00E76CA1&quot;/&gt;&lt;wsp:rsid wsp:val=&quot;00E94339&quot;/&gt;&lt;wsp:rsid wsp:val=&quot;00E97563&quot;/&gt;&lt;wsp:rsid wsp:val=&quot;00EB0B63&quot;/&gt;&lt;wsp:rsid wsp:val=&quot;00EC265C&quot;/&gt;&lt;wsp:rsid wsp:val=&quot;00ED61CB&quot;/&gt;&lt;wsp:rsid wsp:val=&quot;00EE752A&quot;/&gt;&lt;wsp:rsid wsp:val=&quot;00F06A72&quot;/&gt;&lt;wsp:rsid wsp:val=&quot;00F136F0&quot;/&gt;&lt;wsp:rsid wsp:val=&quot;00F20BBB&quot;/&gt;&lt;wsp:rsid wsp:val=&quot;00F36048&quot;/&gt;&lt;wsp:rsid wsp:val=&quot;00F43BD8&quot;/&gt;&lt;wsp:rsid wsp:val=&quot;00F562F3&quot;/&gt;&lt;wsp:rsid wsp:val=&quot;00F74B89&quot;/&gt;&lt;wsp:rsid wsp:val=&quot;00F75133&quot;/&gt;&lt;wsp:rsid wsp:val=&quot;00F83272&quot;/&gt;&lt;wsp:rsid wsp:val=&quot;00F9358D&quot;/&gt;&lt;wsp:rsid wsp:val=&quot;00FA3899&quot;/&gt;&lt;wsp:rsid wsp:val=&quot;00FA4909&quot;/&gt;&lt;wsp:rsid wsp:val=&quot;00FA5164&quot;/&gt;&lt;wsp:rsid wsp:val=&quot;00FA6751&quot;/&gt;&lt;wsp:rsid wsp:val=&quot;00FA6BD7&quot;/&gt;&lt;wsp:rsid wsp:val=&quot;00FB1048&quot;/&gt;&lt;wsp:rsid wsp:val=&quot;00FB62C4&quot;/&gt;&lt;wsp:rsid wsp:val=&quot;00FB7701&quot;/&gt;&lt;wsp:rsid wsp:val=&quot;00FD1AC5&quot;/&gt;&lt;wsp:rsid wsp:val=&quot;00FD5CF0&quot;/&gt;&lt;/wsp:rsids&gt;&lt;/w:docPr&gt;&lt;w:body&gt;&lt;wx:sect&gt;&lt;w:p wsp:rsidR=&quot;00C914DE&quot; wsp:rsidRDefault=&quot;00C914DE&quot; wsp:rsidP=&quot;00C914DE&quot;&gt;&lt;m:oMathPara&gt;&lt;m:oMath&gt;&lt;m:r&gt;&lt;w:rPr&gt;&lt;w:rFonts w:ascii=&quot;Cambria Math&quot; w:fareast=&quot;Times New Roman&quot; w:h-ansi=&quot;Cambria Math&quot;/&gt;&lt;wx:font wx:val=&quot;Cambria Math&quot;/&gt;&lt;w:i/&gt;&lt;/w:rPr&gt;&lt;m:t&gt;D&lt;/m:t&gt;&lt;/m:r&gt;&lt;/m:oMath&gt;&lt;/m:oMathPara&gt;&lt;/w:p&gt;&lt;w:sectPr wsp:rsidR=&quot;00000000&quot;&gt;&lt;w:pgSz w:w=&quot;12240&quot; w:h=&quot;15840&quot;/&gt;&lt;w:pgMar w:top=&quot;1440&quot; w:right=&quot;1440&quot; w:bottom=&quot;1440&quot; w:left=&quot;1440&quot; w:header=&quot;720&quot; w:footer=&quot;720&quot; w:gutter=&quot;0&quot;/&gt;&lt;w:cols w:space=&quot;720&quot;/&gt;&lt;/w:sectPr&gt;&lt;/wx:sect&gt;&lt;/w:body&gt;&lt;/w:wordDocument&gt;">
             <v:imagedata r:id="rId15" o:title="" chromakey="white"/>
           </v:shape>
         </w:pict>
@@ -1055,7 +1055,7 @@
           <w:szCs w:val="20"/>
         </w:rPr>
         <w:pict w14:anchorId="00BFD547">
-          <v:shape id="_x0000_i1067" type="#_x0000_t75" style="width:8.2pt;height:13.65pt" equationxml="&lt;?xml version=&quot;1.0&quot; encoding=&quot;UTF-8&quot; standalone=&quot;yes&quot;?&gt;&#10;&lt;?mso-application progid=&quot;Word.Document&quot;?&gt;&#10;&lt;w:wordDocument xmlns:aml=&quot;http://schemas.microsoft.com/aml/2001/core&quot; xmlns:wpc=&quot;http://schemas.microsoft.com/office/word/2010/wordprocessingCanvas&quot; xmlns:cx=&quot;http://schemas.microsoft.com/office/drawing/2014/chartex&quot; xmlns:cx1=&quot;http://schemas.microsoft.com/office/drawing/2015/9/8/chartex&quot; xmlns:cx2=&quot;http://schemas.microsoft.com/office/drawing/2015/10/21/chartex&quot; xmlns:cx3=&quot;http://schemas.microsoft.com/office/drawing/2016/5/9/chartex&quot; xmlns:cx4=&quot;http://schemas.microsoft.com/office/drawing/2016/5/10/chartex&quot; xmlns:cx5=&quot;http://schemas.microsoft.com/office/drawing/2016/5/11/chartex&quot; xmlns:cx6=&quot;http://schemas.microsoft.com/office/drawing/2016/5/12/chartex&quot; xmlns:cx7=&quot;http://schemas.microsoft.com/office/drawing/2016/5/13/chartex&quot; xmlns:cx8=&quot;http://schemas.microsoft.com/office/drawing/2016/5/14/chartex&quot; xmlns:cr=&quot;http://schemas.microsoft.com/office/comments/2020/reactions&quot; xmlns:dt=&quot;uuid:C2F41010-65B3-11d1-A29F-00AA00C14882&quot; xmlns:mc=&quot;http://schemas.openxmlformats.org/markup-compatibility/2006&quot; xmlns:aink=&quot;http://schemas.microsoft.com/office/drawing/2016/ink&quot; xmlns:am3d=&quot;http://schemas.microsoft.com/office/drawing/2017/model3d&quot; xmlns:o=&quot;urn:schemas-microsoft-com:office:office&quot; xmlns:oel=&quot;http://schemas.microsoft.com/office/2019/extlst&quot; xmlns:m=&quot;http://schemas.openxmlformats.org/officeDocument/2006/math&quot; xmlns:v=&quot;urn:schemas-microsoft-com:vml&quot; xmlns:w10=&quot;urn:schemas-microsoft-com:office:word&quot; xmlns:w=&quot;http://schemas.microsoft.com/office/word/2003/wordml&quot; xmlns:wx=&quot;http://schemas.microsoft.com/office/word/2003/auxHint&quot; xmlns:wne=&quot;http://schemas.microsoft.com/office/word/2006/wordml&quot; xmlns:wsp=&quot;http://schemas.microsoft.com/office/word/2003/wordml/sp2&quot; xmlns:sl=&quot;http://schemas.microsoft.com/schemaLibrary/2003/core&quot; w:macrosPresent=&quot;no&quot; w:embeddedObjPresent=&quot;no&quot; w:ocxPresent=&quot;no&quot; xml:space=&quot;preserve&quot;&gt;&lt;w:ignoreSubtree w:val=&quot;http://schemas.microsoft.com/office/word/2003/wordml/sp2&quot;/&gt;&lt;o:DocumentProperties&gt;&lt;o:Version&gt;16&lt;/o:Version&gt;&lt;/o:DocumentProperties&gt;&lt;w:docPr&gt;&lt;w:view w:val=&quot;print&quot;/&gt;&lt;w:zoom w:percent=&quot;100&quot;/&gt;&lt;w:doNotEmbedSystemFonts/&gt;&lt;w:activeWritingStyle w:lang=&quot;EN-AU&quot; w:vendorID=&quot;64&quot; w:dllVersion=&quot;6&quot; w:nlCheck=&quot;on&quot; w:optionSet=&quot;1&quot;/&gt;&lt;w:activeWritingStyle w:lang=&quot;EN-GB&quot; w:vendorID=&quot;64&quot; w:dllVersion=&quot;6&quot; w:nlCheck=&quot;on&quot; w:optionSet=&quot;1&quot;/&gt;&lt;w:activeWritingStyle w:lang=&quot;EN-US&quot; w:vendorID=&quot;64&quot; w:dllVersion=&quot;6&quot; w:nlCheck=&quot;on&quot; w:optionSet=&quot;1&quot;/&gt;&lt;w:activeWritingStyle w:lang=&quot;EN-AU&quot; w:vendorID=&quot;64&quot; w:dllVersion=&quot;0&quot; w:nlCheck=&quot;on&quot; w:optionSet=&quot;0&quot;/&gt;&lt;w:activeWritingStyle w:lang=&quot;EN-GB&quot; w:vendorID=&quot;64&quot; w:dllVersion=&quot;0&quot; w:nlCheck=&quot;on&quot; w:optionSet=&quot;0&quot;/&gt;&lt;w:activeWritingStyle w:lang=&quot;EN-US&quot; w:vendorID=&quot;64&quot; w:dllVersion=&quot;0&quot; w:nlCheck=&quot;on&quot; w:optionSet=&quot;0&quot;/&gt;&lt;w:activeWritingStyle w:lang=&quot;ES-AR&quot; w:vendorID=&quot;64&quot; w:dllVersion=&quot;0&quot; w:nlCheck=&quot;on&quot; w:optionSet=&quot;0&quot;/&gt;&lt;w:activeWritingStyle w:lang=&quot;580A&quot; w:vendorID=&quot;64&quot; w:dllVersion=&quot;0&quot; w:nlCheck=&quot;on&quot; w:optionSet=&quot;0&quot;/&gt;&lt;w:activeWritingStyle w:lang=&quot;PT-BR&quot; w:vendorID=&quot;64&quot; w:dllVersion=&quot;0&quot; w:nlCheck=&quot;on&quot; w:optionSet=&quot;0&quot;/&gt;&lt;w:stylePaneFormatFilter w:val=&quot;3F01&quot;/&gt;&lt;w:defaultTabStop w:val=&quot;720&quot;/&gt;&lt;w:hyphenationZone w:val=&quot;425&quot;/&gt;&lt;w:characterSpacingControl w:val=&quot;DontCompress&quot;/&gt;&lt;w:optimizeForBrowser/&gt;&lt;w:validateAgainstSchema/&gt;&lt;w:saveInvalidXML w:val=&quot;off&quot;/&gt;&lt;w:ignoreMixedContent w:val=&quot;off&quot;/&gt;&lt;w:alwaysShowPlaceholderText w:val=&quot;off&quot;/&gt;&lt;w:compat&gt;&lt;w:breakWrappedTables/&gt;&lt;w:snapToGridInCell/&gt;&lt;w:applyBreakingRules/&gt;&lt;w:wrapTextWithPunct/&gt;&lt;w:useAsianBreakRules/&gt;&lt;w:useWord2002TableStyleRules/&gt;&lt;w:useFELayout/&gt;&lt;/w:compat&gt;&lt;wsp:rsids&gt;&lt;wsp:rsidRoot wsp:val=&quot;00426FBB&quot;/&gt;&lt;wsp:rsid wsp:val=&quot;000002E1&quot;/&gt;&lt;wsp:rsid wsp:val=&quot;00003C97&quot;/&gt;&lt;wsp:rsid wsp:val=&quot;00005565&quot;/&gt;&lt;wsp:rsid wsp:val=&quot;0001754A&quot;/&gt;&lt;wsp:rsid wsp:val=&quot;00017719&quot;/&gt;&lt;wsp:rsid wsp:val=&quot;00027F1D&quot;/&gt;&lt;wsp:rsid wsp:val=&quot;0003296C&quot;/&gt;&lt;wsp:rsid wsp:val=&quot;0003351F&quot;/&gt;&lt;wsp:rsid wsp:val=&quot;00044599&quot;/&gt;&lt;wsp:rsid wsp:val=&quot;000540E6&quot;/&gt;&lt;wsp:rsid wsp:val=&quot;00054421&quot;/&gt;&lt;wsp:rsid wsp:val=&quot;00062E46&quot;/&gt;&lt;wsp:rsid wsp:val=&quot;00074AC8&quot;/&gt;&lt;wsp:rsid wsp:val=&quot;00081408&quot;/&gt;&lt;wsp:rsid wsp:val=&quot;00081EBE&quot;/&gt;&lt;wsp:rsid wsp:val=&quot;00086EDC&quot;/&gt;&lt;wsp:rsid wsp:val=&quot;000B36A3&quot;/&gt;&lt;wsp:rsid wsp:val=&quot;000C013C&quot;/&gt;&lt;wsp:rsid wsp:val=&quot;000E3F84&quot;/&gt;&lt;wsp:rsid wsp:val=&quot;001056DF&quot;/&gt;&lt;wsp:rsid wsp:val=&quot;0010789C&quot;/&gt;&lt;wsp:rsid wsp:val=&quot;00114025&quot;/&gt;&lt;wsp:rsid wsp:val=&quot;001160D2&quot;/&gt;&lt;wsp:rsid wsp:val=&quot;00120636&quot;/&gt;&lt;wsp:rsid wsp:val=&quot;001348A5&quot;/&gt;&lt;wsp:rsid wsp:val=&quot;00151B8E&quot;/&gt;&lt;wsp:rsid wsp:val=&quot;00182170&quot;/&gt;&lt;wsp:rsid wsp:val=&quot;001928FB&quot;/&gt;&lt;wsp:rsid wsp:val=&quot;00192BC7&quot;/&gt;&lt;wsp:rsid wsp:val=&quot;00195BE6&quot;/&gt;&lt;wsp:rsid wsp:val=&quot;001A50EA&quot;/&gt;&lt;wsp:rsid wsp:val=&quot;001F16CD&quot;/&gt;&lt;wsp:rsid wsp:val=&quot;001F47D2&quot;/&gt;&lt;wsp:rsid wsp:val=&quot;002029C8&quot;/&gt;&lt;wsp:rsid wsp:val=&quot;0022285A&quot;/&gt;&lt;wsp:rsid wsp:val=&quot;00224C61&quot;/&gt;&lt;wsp:rsid wsp:val=&quot;00256ABC&quot;/&gt;&lt;wsp:rsid wsp:val=&quot;0027227B&quot;/&gt;&lt;wsp:rsid wsp:val=&quot;00273AC7&quot;/&gt;&lt;wsp:rsid wsp:val=&quot;00273D2C&quot;/&gt;&lt;wsp:rsid wsp:val=&quot;00285ECD&quot;/&gt;&lt;wsp:rsid wsp:val=&quot;00290E1B&quot;/&gt;&lt;wsp:rsid wsp:val=&quot;00291B17&quot;/&gt;&lt;wsp:rsid wsp:val=&quot;00291BB3&quot;/&gt;&lt;wsp:rsid wsp:val=&quot;002A6742&quot;/&gt;&lt;wsp:rsid wsp:val=&quot;002C1A7F&quot;/&gt;&lt;wsp:rsid wsp:val=&quot;002C4239&quot;/&gt;&lt;wsp:rsid wsp:val=&quot;002C559D&quot;/&gt;&lt;wsp:rsid wsp:val=&quot;002D16AE&quot;/&gt;&lt;wsp:rsid wsp:val=&quot;002D2D42&quot;/&gt;&lt;wsp:rsid wsp:val=&quot;002F72D0&quot;/&gt;&lt;wsp:rsid wsp:val=&quot;002F7A4F&quot;/&gt;&lt;wsp:rsid wsp:val=&quot;003003AB&quot;/&gt;&lt;wsp:rsid wsp:val=&quot;00302C35&quot;/&gt;&lt;wsp:rsid wsp:val=&quot;00311C49&quot;/&gt;&lt;wsp:rsid wsp:val=&quot;0032119E&quot;/&gt;&lt;wsp:rsid wsp:val=&quot;00321304&quot;/&gt;&lt;wsp:rsid wsp:val=&quot;00324FC2&quot;/&gt;&lt;wsp:rsid wsp:val=&quot;003312CA&quot;/&gt;&lt;wsp:rsid wsp:val=&quot;00331F84&quot;/&gt;&lt;wsp:rsid wsp:val=&quot;0037721F&quot;/&gt;&lt;wsp:rsid wsp:val=&quot;003950A4&quot;/&gt;&lt;wsp:rsid wsp:val=&quot;003A1E7E&quot;/&gt;&lt;wsp:rsid wsp:val=&quot;003E2FDC&quot;/&gt;&lt;wsp:rsid wsp:val=&quot;003E3577&quot;/&gt;&lt;wsp:rsid wsp:val=&quot;003F3A61&quot;/&gt;&lt;wsp:rsid wsp:val=&quot;00410A5D&quot;/&gt;&lt;wsp:rsid wsp:val=&quot;00414909&quot;/&gt;&lt;wsp:rsid wsp:val=&quot;00416537&quot;/&gt;&lt;wsp:rsid wsp:val=&quot;00425A6A&quot;/&gt;&lt;wsp:rsid wsp:val=&quot;00426FBB&quot;/&gt;&lt;wsp:rsid wsp:val=&quot;00454542&quot;/&gt;&lt;wsp:rsid wsp:val=&quot;0047429A&quot;/&gt;&lt;wsp:rsid wsp:val=&quot;0048374C&quot;/&gt;&lt;wsp:rsid wsp:val=&quot;0048771D&quot;/&gt;&lt;wsp:rsid wsp:val=&quot;004A6605&quot;/&gt;&lt;wsp:rsid wsp:val=&quot;004C45FA&quot;/&gt;&lt;wsp:rsid wsp:val=&quot;004D35A3&quot;/&gt;&lt;wsp:rsid wsp:val=&quot;004E1BD8&quot;/&gt;&lt;wsp:rsid wsp:val=&quot;004E452A&quot;/&gt;&lt;wsp:rsid wsp:val=&quot;004E78E3&quot;/&gt;&lt;wsp:rsid wsp:val=&quot;004F2BFE&quot;/&gt;&lt;wsp:rsid wsp:val=&quot;004F63D3&quot;/&gt;&lt;wsp:rsid wsp:val=&quot;004F7DCF&quot;/&gt;&lt;wsp:rsid wsp:val=&quot;005004BF&quot;/&gt;&lt;wsp:rsid wsp:val=&quot;00502E89&quot;/&gt;&lt;wsp:rsid wsp:val=&quot;00506CFE&quot;/&gt;&lt;wsp:rsid wsp:val=&quot;00510E95&quot;/&gt;&lt;wsp:rsid wsp:val=&quot;005225C3&quot;/&gt;&lt;wsp:rsid wsp:val=&quot;00527D56&quot;/&gt;&lt;wsp:rsid wsp:val=&quot;0053221F&quot;/&gt;&lt;wsp:rsid wsp:val=&quot;00536FAE&quot;/&gt;&lt;wsp:rsid wsp:val=&quot;00542C85&quot;/&gt;&lt;wsp:rsid wsp:val=&quot;00553510&quot;/&gt;&lt;wsp:rsid wsp:val=&quot;00554186&quot;/&gt;&lt;wsp:rsid wsp:val=&quot;00585769&quot;/&gt;&lt;wsp:rsid wsp:val=&quot;00585C61&quot;/&gt;&lt;wsp:rsid wsp:val=&quot;00591130&quot;/&gt;&lt;wsp:rsid wsp:val=&quot;005A3F28&quot;/&gt;&lt;wsp:rsid wsp:val=&quot;005A40BE&quot;/&gt;&lt;wsp:rsid wsp:val=&quot;005B13E2&quot;/&gt;&lt;wsp:rsid wsp:val=&quot;005B47D7&quot;/&gt;&lt;wsp:rsid wsp:val=&quot;005C5526&quot;/&gt;&lt;wsp:rsid wsp:val=&quot;005C62C6&quot;/&gt;&lt;wsp:rsid wsp:val=&quot;005D7B9E&quot;/&gt;&lt;wsp:rsid wsp:val=&quot;005E112E&quot;/&gt;&lt;wsp:rsid wsp:val=&quot;005F0834&quot;/&gt;&lt;wsp:rsid wsp:val=&quot;005F68AB&quot;/&gt;&lt;wsp:rsid wsp:val=&quot;005F6DC3&quot;/&gt;&lt;wsp:rsid wsp:val=&quot;00601A8E&quot;/&gt;&lt;wsp:rsid wsp:val=&quot;0062033E&quot;/&gt;&lt;wsp:rsid wsp:val=&quot;00624482&quot;/&gt;&lt;wsp:rsid wsp:val=&quot;0064799C&quot;/&gt;&lt;wsp:rsid wsp:val=&quot;00654156&quot;/&gt;&lt;wsp:rsid wsp:val=&quot;006B47CA&quot;/&gt;&lt;wsp:rsid wsp:val=&quot;006C304C&quot;/&gt;&lt;wsp:rsid wsp:val=&quot;006C4511&quot;/&gt;&lt;wsp:rsid wsp:val=&quot;006C65F5&quot;/&gt;&lt;wsp:rsid wsp:val=&quot;006C7AAA&quot;/&gt;&lt;wsp:rsid wsp:val=&quot;006D1C2A&quot;/&gt;&lt;wsp:rsid wsp:val=&quot;006D264F&quot;/&gt;&lt;wsp:rsid wsp:val=&quot;006E2A8D&quot;/&gt;&lt;wsp:rsid wsp:val=&quot;006E7574&quot;/&gt;&lt;wsp:rsid wsp:val=&quot;00703430&quot;/&gt;&lt;wsp:rsid wsp:val=&quot;00703548&quot;/&gt;&lt;wsp:rsid wsp:val=&quot;00704E18&quot;/&gt;&lt;wsp:rsid wsp:val=&quot;007069BE&quot;/&gt;&lt;wsp:rsid wsp:val=&quot;00745C86&quot;/&gt;&lt;wsp:rsid wsp:val=&quot;00764603&quot;/&gt;&lt;wsp:rsid wsp:val=&quot;0076604D&quot;/&gt;&lt;wsp:rsid wsp:val=&quot;00790909&quot;/&gt;&lt;wsp:rsid wsp:val=&quot;007B1582&quot;/&gt;&lt;wsp:rsid wsp:val=&quot;007B5A07&quot;/&gt;&lt;wsp:rsid wsp:val=&quot;007C065D&quot;/&gt;&lt;wsp:rsid wsp:val=&quot;007D3E71&quot;/&gt;&lt;wsp:rsid wsp:val=&quot;007E5D6A&quot;/&gt;&lt;wsp:rsid wsp:val=&quot;007E645D&quot;/&gt;&lt;wsp:rsid wsp:val=&quot;007F75CA&quot;/&gt;&lt;wsp:rsid wsp:val=&quot;00821E08&quot;/&gt;&lt;wsp:rsid wsp:val=&quot;00834EFD&quot;/&gt;&lt;wsp:rsid wsp:val=&quot;00844B24&quot;/&gt;&lt;wsp:rsid wsp:val=&quot;0084515F&quot;/&gt;&lt;wsp:rsid wsp:val=&quot;0085092D&quot;/&gt;&lt;wsp:rsid wsp:val=&quot;00865414&quot;/&gt;&lt;wsp:rsid wsp:val=&quot;00877D4C&quot;/&gt;&lt;wsp:rsid wsp:val=&quot;00883903&quot;/&gt;&lt;wsp:rsid wsp:val=&quot;0089763B&quot;/&gt;&lt;wsp:rsid wsp:val=&quot;008B6AE3&quot;/&gt;&lt;wsp:rsid wsp:val=&quot;008C1332&quot;/&gt;&lt;wsp:rsid wsp:val=&quot;008D1045&quot;/&gt;&lt;wsp:rsid wsp:val=&quot;008E5996&quot;/&gt;&lt;wsp:rsid wsp:val=&quot;00901AE1&quot;/&gt;&lt;wsp:rsid wsp:val=&quot;00912F93&quot;/&gt;&lt;wsp:rsid wsp:val=&quot;009205B4&quot;/&gt;&lt;wsp:rsid wsp:val=&quot;00955B59&quot;/&gt;&lt;wsp:rsid wsp:val=&quot;00992262&quot;/&gt;&lt;wsp:rsid wsp:val=&quot;009926BC&quot;/&gt;&lt;wsp:rsid wsp:val=&quot;009A4319&quot;/&gt;&lt;wsp:rsid wsp:val=&quot;009A6C3F&quot;/&gt;&lt;wsp:rsid wsp:val=&quot;009B73F2&quot;/&gt;&lt;wsp:rsid wsp:val=&quot;009C12BD&quot;/&gt;&lt;wsp:rsid wsp:val=&quot;009C50FE&quot;/&gt;&lt;wsp:rsid wsp:val=&quot;009E49DD&quot;/&gt;&lt;wsp:rsid wsp:val=&quot;00A03E75&quot;/&gt;&lt;wsp:rsid wsp:val=&quot;00A20627&quot;/&gt;&lt;wsp:rsid wsp:val=&quot;00A22FE9&quot;/&gt;&lt;wsp:rsid wsp:val=&quot;00A31A44&quot;/&gt;&lt;wsp:rsid wsp:val=&quot;00A32BFA&quot;/&gt;&lt;wsp:rsid wsp:val=&quot;00A3325E&quot;/&gt;&lt;wsp:rsid wsp:val=&quot;00A45FCE&quot;/&gt;&lt;wsp:rsid wsp:val=&quot;00A75671&quot;/&gt;&lt;wsp:rsid wsp:val=&quot;00A773CC&quot;/&gt;&lt;wsp:rsid wsp:val=&quot;00A924D0&quot;/&gt;&lt;wsp:rsid wsp:val=&quot;00A9318B&quot;/&gt;&lt;wsp:rsid wsp:val=&quot;00A94AC1&quot;/&gt;&lt;wsp:rsid wsp:val=&quot;00AB18B7&quot;/&gt;&lt;wsp:rsid wsp:val=&quot;00AD335D&quot;/&gt;&lt;wsp:rsid wsp:val=&quot;00AF114C&quot;/&gt;&lt;wsp:rsid wsp:val=&quot;00AF792B&quot;/&gt;&lt;wsp:rsid wsp:val=&quot;00B33D2F&quot;/&gt;&lt;wsp:rsid wsp:val=&quot;00B40A5B&quot;/&gt;&lt;wsp:rsid wsp:val=&quot;00B45C6B&quot;/&gt;&lt;wsp:rsid wsp:val=&quot;00B55D5E&quot;/&gt;&lt;wsp:rsid wsp:val=&quot;00B57A80&quot;/&gt;&lt;wsp:rsid wsp:val=&quot;00B70E9C&quot;/&gt;&lt;wsp:rsid wsp:val=&quot;00B713D8&quot;/&gt;&lt;wsp:rsid wsp:val=&quot;00B72979&quot;/&gt;&lt;wsp:rsid wsp:val=&quot;00B94516&quot;/&gt;&lt;wsp:rsid wsp:val=&quot;00BA25E2&quot;/&gt;&lt;wsp:rsid wsp:val=&quot;00BB2855&quot;/&gt;&lt;wsp:rsid wsp:val=&quot;00BC5343&quot;/&gt;&lt;wsp:rsid wsp:val=&quot;00BD19C1&quot;/&gt;&lt;wsp:rsid wsp:val=&quot;00BD25B8&quot;/&gt;&lt;wsp:rsid wsp:val=&quot;00C012E1&quot;/&gt;&lt;wsp:rsid wsp:val=&quot;00C06BB4&quot;/&gt;&lt;wsp:rsid wsp:val=&quot;00C10D20&quot;/&gt;&lt;wsp:rsid wsp:val=&quot;00C12E0C&quot;/&gt;&lt;wsp:rsid wsp:val=&quot;00C21916&quot;/&gt;&lt;wsp:rsid wsp:val=&quot;00C34915&quot;/&gt;&lt;wsp:rsid wsp:val=&quot;00C457CA&quot;/&gt;&lt;wsp:rsid wsp:val=&quot;00C53FB6&quot;/&gt;&lt;wsp:rsid wsp:val=&quot;00C57FB7&quot;/&gt;&lt;wsp:rsid wsp:val=&quot;00C644D4&quot;/&gt;&lt;wsp:rsid wsp:val=&quot;00C65F3F&quot;/&gt;&lt;wsp:rsid wsp:val=&quot;00C72414&quot;/&gt;&lt;wsp:rsid wsp:val=&quot;00C72B1A&quot;/&gt;&lt;wsp:rsid wsp:val=&quot;00C8667B&quot;/&gt;&lt;wsp:rsid wsp:val=&quot;00C90993&quot;/&gt;&lt;wsp:rsid wsp:val=&quot;00C914DE&quot;/&gt;&lt;wsp:rsid wsp:val=&quot;00CA4CE3&quot;/&gt;&lt;wsp:rsid wsp:val=&quot;00CC72FD&quot;/&gt;&lt;wsp:rsid wsp:val=&quot;00CD4F3F&quot;/&gt;&lt;wsp:rsid wsp:val=&quot;00D311F8&quot;/&gt;&lt;wsp:rsid wsp:val=&quot;00D31660&quot;/&gt;&lt;wsp:rsid wsp:val=&quot;00D36B52&quot;/&gt;&lt;wsp:rsid wsp:val=&quot;00D377C8&quot;/&gt;&lt;wsp:rsid wsp:val=&quot;00D41274&quot;/&gt;&lt;wsp:rsid wsp:val=&quot;00D4229C&quot;/&gt;&lt;wsp:rsid wsp:val=&quot;00D43BF3&quot;/&gt;&lt;wsp:rsid wsp:val=&quot;00D549FB&quot;/&gt;&lt;wsp:rsid wsp:val=&quot;00D767BB&quot;/&gt;&lt;wsp:rsid wsp:val=&quot;00D939B0&quot;/&gt;&lt;wsp:rsid wsp:val=&quot;00DA31A2&quot;/&gt;&lt;wsp:rsid wsp:val=&quot;00DB16E0&quot;/&gt;&lt;wsp:rsid wsp:val=&quot;00DB2DF9&quot;/&gt;&lt;wsp:rsid wsp:val=&quot;00DB465D&quot;/&gt;&lt;wsp:rsid wsp:val=&quot;00DB48A2&quot;/&gt;&lt;wsp:rsid wsp:val=&quot;00DB7E63&quot;/&gt;&lt;wsp:rsid wsp:val=&quot;00DC2055&quot;/&gt;&lt;wsp:rsid wsp:val=&quot;00DC3908&quot;/&gt;&lt;wsp:rsid wsp:val=&quot;00DD71E8&quot;/&gt;&lt;wsp:rsid wsp:val=&quot;00DD7F83&quot;/&gt;&lt;wsp:rsid wsp:val=&quot;00DE4EB8&quot;/&gt;&lt;wsp:rsid wsp:val=&quot;00E0641E&quot;/&gt;&lt;wsp:rsid wsp:val=&quot;00E06664&quot;/&gt;&lt;wsp:rsid wsp:val=&quot;00E304BC&quot;/&gt;&lt;wsp:rsid wsp:val=&quot;00E32853&quot;/&gt;&lt;wsp:rsid wsp:val=&quot;00E34EBD&quot;/&gt;&lt;wsp:rsid wsp:val=&quot;00E401F8&quot;/&gt;&lt;wsp:rsid wsp:val=&quot;00E46425&quot;/&gt;&lt;wsp:rsid wsp:val=&quot;00E469FC&quot;/&gt;&lt;wsp:rsid wsp:val=&quot;00E47D0E&quot;/&gt;&lt;wsp:rsid wsp:val=&quot;00E65018&quot;/&gt;&lt;wsp:rsid wsp:val=&quot;00E76CA1&quot;/&gt;&lt;wsp:rsid wsp:val=&quot;00E94339&quot;/&gt;&lt;wsp:rsid wsp:val=&quot;00E97563&quot;/&gt;&lt;wsp:rsid wsp:val=&quot;00EB0B63&quot;/&gt;&lt;wsp:rsid wsp:val=&quot;00EC265C&quot;/&gt;&lt;wsp:rsid wsp:val=&quot;00ED61CB&quot;/&gt;&lt;wsp:rsid wsp:val=&quot;00EE752A&quot;/&gt;&lt;wsp:rsid wsp:val=&quot;00F06A72&quot;/&gt;&lt;wsp:rsid wsp:val=&quot;00F136F0&quot;/&gt;&lt;wsp:rsid wsp:val=&quot;00F20BBB&quot;/&gt;&lt;wsp:rsid wsp:val=&quot;00F36048&quot;/&gt;&lt;wsp:rsid wsp:val=&quot;00F43BD8&quot;/&gt;&lt;wsp:rsid wsp:val=&quot;00F562F3&quot;/&gt;&lt;wsp:rsid wsp:val=&quot;00F74B89&quot;/&gt;&lt;wsp:rsid wsp:val=&quot;00F75133&quot;/&gt;&lt;wsp:rsid wsp:val=&quot;00F83272&quot;/&gt;&lt;wsp:rsid wsp:val=&quot;00F9358D&quot;/&gt;&lt;wsp:rsid wsp:val=&quot;00FA3899&quot;/&gt;&lt;wsp:rsid wsp:val=&quot;00FA4909&quot;/&gt;&lt;wsp:rsid wsp:val=&quot;00FA5164&quot;/&gt;&lt;wsp:rsid wsp:val=&quot;00FA6751&quot;/&gt;&lt;wsp:rsid wsp:val=&quot;00FA6BD7&quot;/&gt;&lt;wsp:rsid wsp:val=&quot;00FB1048&quot;/&gt;&lt;wsp:rsid wsp:val=&quot;00FB62C4&quot;/&gt;&lt;wsp:rsid wsp:val=&quot;00FB7701&quot;/&gt;&lt;wsp:rsid wsp:val=&quot;00FD1AC5&quot;/&gt;&lt;wsp:rsid wsp:val=&quot;00FD5CF0&quot;/&gt;&lt;/wsp:rsids&gt;&lt;/w:docPr&gt;&lt;w:body&gt;&lt;wx:sect&gt;&lt;w:p wsp:rsidR=&quot;00C914DE&quot; wsp:rsidRDefault=&quot;00C914DE&quot; wsp:rsidP=&quot;00C914DE&quot;&gt;&lt;m:oMathPara&gt;&lt;m:oMath&gt;&lt;m:r&gt;&lt;w:rPr&gt;&lt;w:rFonts w:ascii=&quot;Cambria Math&quot; w:fareast=&quot;Times New Roman&quot; w:h-ansi=&quot;Cambria Math&quot;/&gt;&lt;wx:font wx:val=&quot;Cambria Math&quot;/&gt;&lt;w:i/&gt;&lt;/w:rPr&gt;&lt;m:t&gt;D&lt;/m:t&gt;&lt;/m:r&gt;&lt;/m:oMath&gt;&lt;/m:oMathPara&gt;&lt;/w:p&gt;&lt;w:sectPr wsp:rsidR=&quot;00000000&quot;&gt;&lt;w:pgSz w:w=&quot;12240&quot; w:h=&quot;15840&quot;/&gt;&lt;w:pgMar w:top=&quot;1440&quot; w:right=&quot;1440&quot; w:bottom=&quot;1440&quot; w:left=&quot;1440&quot; w:header=&quot;720&quot; w:footer=&quot;720&quot; w:gutter=&quot;0&quot;/&gt;&lt;w:cols w:space=&quot;720&quot;/&gt;&lt;/w:sectPr&gt;&lt;/wx:sect&gt;&lt;/w:body&gt;&lt;/w:wordDocument&gt;">
+          <v:shape id="_x0000_i1034" type="#_x0000_t75" style="width:8.3pt;height:13.85pt" equationxml="&lt;?xml version=&quot;1.0&quot; encoding=&quot;UTF-8&quot; standalone=&quot;yes&quot;?&gt;&#10;&lt;?mso-application progid=&quot;Word.Document&quot;?&gt;&#10;&lt;w:wordDocument xmlns:aml=&quot;http://schemas.microsoft.com/aml/2001/core&quot; xmlns:wpc=&quot;http://schemas.microsoft.com/office/word/2010/wordprocessingCanvas&quot; xmlns:cx=&quot;http://schemas.microsoft.com/office/drawing/2014/chartex&quot; xmlns:cx1=&quot;http://schemas.microsoft.com/office/drawing/2015/9/8/chartex&quot; xmlns:cx2=&quot;http://schemas.microsoft.com/office/drawing/2015/10/21/chartex&quot; xmlns:cx3=&quot;http://schemas.microsoft.com/office/drawing/2016/5/9/chartex&quot; xmlns:cx4=&quot;http://schemas.microsoft.com/office/drawing/2016/5/10/chartex&quot; xmlns:cx5=&quot;http://schemas.microsoft.com/office/drawing/2016/5/11/chartex&quot; xmlns:cx6=&quot;http://schemas.microsoft.com/office/drawing/2016/5/12/chartex&quot; xmlns:cx7=&quot;http://schemas.microsoft.com/office/drawing/2016/5/13/chartex&quot; xmlns:cx8=&quot;http://schemas.microsoft.com/office/drawing/2016/5/14/chartex&quot; xmlns:cr=&quot;http://schemas.microsoft.com/office/comments/2020/reactions&quot; xmlns:dt=&quot;uuid:C2F41010-65B3-11d1-A29F-00AA00C14882&quot; xmlns:mc=&quot;http://schemas.openxmlformats.org/markup-compatibility/2006&quot; xmlns:aink=&quot;http://schemas.microsoft.com/office/drawing/2016/ink&quot; xmlns:am3d=&quot;http://schemas.microsoft.com/office/drawing/2017/model3d&quot; xmlns:o=&quot;urn:schemas-microsoft-com:office:office&quot; xmlns:oel=&quot;http://schemas.microsoft.com/office/2019/extlst&quot; xmlns:m=&quot;http://schemas.openxmlformats.org/officeDocument/2006/math&quot; xmlns:v=&quot;urn:schemas-microsoft-com:vml&quot; xmlns:w10=&quot;urn:schemas-microsoft-com:office:word&quot; xmlns:w=&quot;http://schemas.microsoft.com/office/word/2003/wordml&quot; xmlns:wx=&quot;http://schemas.microsoft.com/office/word/2003/auxHint&quot; xmlns:wne=&quot;http://schemas.microsoft.com/office/word/2006/wordml&quot; xmlns:wsp=&quot;http://schemas.microsoft.com/office/word/2003/wordml/sp2&quot; xmlns:sl=&quot;http://schemas.microsoft.com/schemaLibrary/2003/core&quot; w:macrosPresent=&quot;no&quot; w:embeddedObjPresent=&quot;no&quot; w:ocxPresent=&quot;no&quot; xml:space=&quot;preserve&quot;&gt;&lt;w:ignoreSubtree w:val=&quot;http://schemas.microsoft.com/office/word/2003/wordml/sp2&quot;/&gt;&lt;o:DocumentProperties&gt;&lt;o:Version&gt;16&lt;/o:Version&gt;&lt;/o:DocumentProperties&gt;&lt;w:docPr&gt;&lt;w:view w:val=&quot;print&quot;/&gt;&lt;w:zoom w:percent=&quot;100&quot;/&gt;&lt;w:doNotEmbedSystemFonts/&gt;&lt;w:activeWritingStyle w:lang=&quot;EN-AU&quot; w:vendorID=&quot;64&quot; w:dllVersion=&quot;6&quot; w:nlCheck=&quot;on&quot; w:optionSet=&quot;1&quot;/&gt;&lt;w:activeWritingStyle w:lang=&quot;EN-GB&quot; w:vendorID=&quot;64&quot; w:dllVersion=&quot;6&quot; w:nlCheck=&quot;on&quot; w:optionSet=&quot;1&quot;/&gt;&lt;w:activeWritingStyle w:lang=&quot;EN-US&quot; w:vendorID=&quot;64&quot; w:dllVersion=&quot;6&quot; w:nlCheck=&quot;on&quot; w:optionSet=&quot;1&quot;/&gt;&lt;w:activeWritingStyle w:lang=&quot;EN-AU&quot; w:vendorID=&quot;64&quot; w:dllVersion=&quot;0&quot; w:nlCheck=&quot;on&quot; w:optionSet=&quot;0&quot;/&gt;&lt;w:activeWritingStyle w:lang=&quot;EN-GB&quot; w:vendorID=&quot;64&quot; w:dllVersion=&quot;0&quot; w:nlCheck=&quot;on&quot; w:optionSet=&quot;0&quot;/&gt;&lt;w:activeWritingStyle w:lang=&quot;EN-US&quot; w:vendorID=&quot;64&quot; w:dllVersion=&quot;0&quot; w:nlCheck=&quot;on&quot; w:optionSet=&quot;0&quot;/&gt;&lt;w:activeWritingStyle w:lang=&quot;ES-AR&quot; w:vendorID=&quot;64&quot; w:dllVersion=&quot;0&quot; w:nlCheck=&quot;on&quot; w:optionSet=&quot;0&quot;/&gt;&lt;w:activeWritingStyle w:lang=&quot;580A&quot; w:vendorID=&quot;64&quot; w:dllVersion=&quot;0&quot; w:nlCheck=&quot;on&quot; w:optionSet=&quot;0&quot;/&gt;&lt;w:activeWritingStyle w:lang=&quot;PT-BR&quot; w:vendorID=&quot;64&quot; w:dllVersion=&quot;0&quot; w:nlCheck=&quot;on&quot; w:optionSet=&quot;0&quot;/&gt;&lt;w:stylePaneFormatFilter w:val=&quot;3F01&quot;/&gt;&lt;w:defaultTabStop w:val=&quot;720&quot;/&gt;&lt;w:hyphenationZone w:val=&quot;425&quot;/&gt;&lt;w:characterSpacingControl w:val=&quot;DontCompress&quot;/&gt;&lt;w:optimizeForBrowser/&gt;&lt;w:validateAgainstSchema/&gt;&lt;w:saveInvalidXML w:val=&quot;off&quot;/&gt;&lt;w:ignoreMixedContent w:val=&quot;off&quot;/&gt;&lt;w:alwaysShowPlaceholderText w:val=&quot;off&quot;/&gt;&lt;w:compat&gt;&lt;w:breakWrappedTables/&gt;&lt;w:snapToGridInCell/&gt;&lt;w:applyBreakingRules/&gt;&lt;w:wrapTextWithPunct/&gt;&lt;w:useAsianBreakRules/&gt;&lt;w:useWord2002TableStyleRules/&gt;&lt;w:useFELayout/&gt;&lt;/w:compat&gt;&lt;wsp:rsids&gt;&lt;wsp:rsidRoot wsp:val=&quot;00426FBB&quot;/&gt;&lt;wsp:rsid wsp:val=&quot;000002E1&quot;/&gt;&lt;wsp:rsid wsp:val=&quot;00003C97&quot;/&gt;&lt;wsp:rsid wsp:val=&quot;00005565&quot;/&gt;&lt;wsp:rsid wsp:val=&quot;0001754A&quot;/&gt;&lt;wsp:rsid wsp:val=&quot;00017719&quot;/&gt;&lt;wsp:rsid wsp:val=&quot;00027F1D&quot;/&gt;&lt;wsp:rsid wsp:val=&quot;0003296C&quot;/&gt;&lt;wsp:rsid wsp:val=&quot;0003351F&quot;/&gt;&lt;wsp:rsid wsp:val=&quot;00044599&quot;/&gt;&lt;wsp:rsid wsp:val=&quot;000540E6&quot;/&gt;&lt;wsp:rsid wsp:val=&quot;00054421&quot;/&gt;&lt;wsp:rsid wsp:val=&quot;00062E46&quot;/&gt;&lt;wsp:rsid wsp:val=&quot;00074AC8&quot;/&gt;&lt;wsp:rsid wsp:val=&quot;00081408&quot;/&gt;&lt;wsp:rsid wsp:val=&quot;00081EBE&quot;/&gt;&lt;wsp:rsid wsp:val=&quot;00086EDC&quot;/&gt;&lt;wsp:rsid wsp:val=&quot;000B36A3&quot;/&gt;&lt;wsp:rsid wsp:val=&quot;000C013C&quot;/&gt;&lt;wsp:rsid wsp:val=&quot;000E3F84&quot;/&gt;&lt;wsp:rsid wsp:val=&quot;001056DF&quot;/&gt;&lt;wsp:rsid wsp:val=&quot;0010789C&quot;/&gt;&lt;wsp:rsid wsp:val=&quot;00114025&quot;/&gt;&lt;wsp:rsid wsp:val=&quot;001160D2&quot;/&gt;&lt;wsp:rsid wsp:val=&quot;00120636&quot;/&gt;&lt;wsp:rsid wsp:val=&quot;001348A5&quot;/&gt;&lt;wsp:rsid wsp:val=&quot;00151B8E&quot;/&gt;&lt;wsp:rsid wsp:val=&quot;00182170&quot;/&gt;&lt;wsp:rsid wsp:val=&quot;001928FB&quot;/&gt;&lt;wsp:rsid wsp:val=&quot;00192BC7&quot;/&gt;&lt;wsp:rsid wsp:val=&quot;00195BE6&quot;/&gt;&lt;wsp:rsid wsp:val=&quot;001A50EA&quot;/&gt;&lt;wsp:rsid wsp:val=&quot;001F16CD&quot;/&gt;&lt;wsp:rsid wsp:val=&quot;001F47D2&quot;/&gt;&lt;wsp:rsid wsp:val=&quot;002029C8&quot;/&gt;&lt;wsp:rsid wsp:val=&quot;0022285A&quot;/&gt;&lt;wsp:rsid wsp:val=&quot;00224C61&quot;/&gt;&lt;wsp:rsid wsp:val=&quot;00256ABC&quot;/&gt;&lt;wsp:rsid wsp:val=&quot;0027227B&quot;/&gt;&lt;wsp:rsid wsp:val=&quot;00273AC7&quot;/&gt;&lt;wsp:rsid wsp:val=&quot;00273D2C&quot;/&gt;&lt;wsp:rsid wsp:val=&quot;00285ECD&quot;/&gt;&lt;wsp:rsid wsp:val=&quot;00290E1B&quot;/&gt;&lt;wsp:rsid wsp:val=&quot;00291B17&quot;/&gt;&lt;wsp:rsid wsp:val=&quot;00291BB3&quot;/&gt;&lt;wsp:rsid wsp:val=&quot;002A6742&quot;/&gt;&lt;wsp:rsid wsp:val=&quot;002C1A7F&quot;/&gt;&lt;wsp:rsid wsp:val=&quot;002C4239&quot;/&gt;&lt;wsp:rsid wsp:val=&quot;002C559D&quot;/&gt;&lt;wsp:rsid wsp:val=&quot;002D16AE&quot;/&gt;&lt;wsp:rsid wsp:val=&quot;002D2D42&quot;/&gt;&lt;wsp:rsid wsp:val=&quot;002F72D0&quot;/&gt;&lt;wsp:rsid wsp:val=&quot;002F7A4F&quot;/&gt;&lt;wsp:rsid wsp:val=&quot;003003AB&quot;/&gt;&lt;wsp:rsid wsp:val=&quot;00302C35&quot;/&gt;&lt;wsp:rsid wsp:val=&quot;00311C49&quot;/&gt;&lt;wsp:rsid wsp:val=&quot;0032119E&quot;/&gt;&lt;wsp:rsid wsp:val=&quot;00321304&quot;/&gt;&lt;wsp:rsid wsp:val=&quot;00324FC2&quot;/&gt;&lt;wsp:rsid wsp:val=&quot;003312CA&quot;/&gt;&lt;wsp:rsid wsp:val=&quot;00331F84&quot;/&gt;&lt;wsp:rsid wsp:val=&quot;0037721F&quot;/&gt;&lt;wsp:rsid wsp:val=&quot;003950A4&quot;/&gt;&lt;wsp:rsid wsp:val=&quot;003A1E7E&quot;/&gt;&lt;wsp:rsid wsp:val=&quot;003E2FDC&quot;/&gt;&lt;wsp:rsid wsp:val=&quot;003E3577&quot;/&gt;&lt;wsp:rsid wsp:val=&quot;003F3A61&quot;/&gt;&lt;wsp:rsid wsp:val=&quot;00410A5D&quot;/&gt;&lt;wsp:rsid wsp:val=&quot;00414909&quot;/&gt;&lt;wsp:rsid wsp:val=&quot;00416537&quot;/&gt;&lt;wsp:rsid wsp:val=&quot;00425A6A&quot;/&gt;&lt;wsp:rsid wsp:val=&quot;00426FBB&quot;/&gt;&lt;wsp:rsid wsp:val=&quot;00454542&quot;/&gt;&lt;wsp:rsid wsp:val=&quot;0047429A&quot;/&gt;&lt;wsp:rsid wsp:val=&quot;0048374C&quot;/&gt;&lt;wsp:rsid wsp:val=&quot;0048771D&quot;/&gt;&lt;wsp:rsid wsp:val=&quot;004A6605&quot;/&gt;&lt;wsp:rsid wsp:val=&quot;004C45FA&quot;/&gt;&lt;wsp:rsid wsp:val=&quot;004D35A3&quot;/&gt;&lt;wsp:rsid wsp:val=&quot;004E1BD8&quot;/&gt;&lt;wsp:rsid wsp:val=&quot;004E452A&quot;/&gt;&lt;wsp:rsid wsp:val=&quot;004E78E3&quot;/&gt;&lt;wsp:rsid wsp:val=&quot;004F2BFE&quot;/&gt;&lt;wsp:rsid wsp:val=&quot;004F63D3&quot;/&gt;&lt;wsp:rsid wsp:val=&quot;004F7DCF&quot;/&gt;&lt;wsp:rsid wsp:val=&quot;005004BF&quot;/&gt;&lt;wsp:rsid wsp:val=&quot;00502E89&quot;/&gt;&lt;wsp:rsid wsp:val=&quot;00506CFE&quot;/&gt;&lt;wsp:rsid wsp:val=&quot;00510E95&quot;/&gt;&lt;wsp:rsid wsp:val=&quot;005225C3&quot;/&gt;&lt;wsp:rsid wsp:val=&quot;00527D56&quot;/&gt;&lt;wsp:rsid wsp:val=&quot;0053221F&quot;/&gt;&lt;wsp:rsid wsp:val=&quot;00536FAE&quot;/&gt;&lt;wsp:rsid wsp:val=&quot;00542C85&quot;/&gt;&lt;wsp:rsid wsp:val=&quot;00553510&quot;/&gt;&lt;wsp:rsid wsp:val=&quot;00554186&quot;/&gt;&lt;wsp:rsid wsp:val=&quot;00585769&quot;/&gt;&lt;wsp:rsid wsp:val=&quot;00585C61&quot;/&gt;&lt;wsp:rsid wsp:val=&quot;00591130&quot;/&gt;&lt;wsp:rsid wsp:val=&quot;005A3F28&quot;/&gt;&lt;wsp:rsid wsp:val=&quot;005A40BE&quot;/&gt;&lt;wsp:rsid wsp:val=&quot;005B13E2&quot;/&gt;&lt;wsp:rsid wsp:val=&quot;005B47D7&quot;/&gt;&lt;wsp:rsid wsp:val=&quot;005C5526&quot;/&gt;&lt;wsp:rsid wsp:val=&quot;005C62C6&quot;/&gt;&lt;wsp:rsid wsp:val=&quot;005D7B9E&quot;/&gt;&lt;wsp:rsid wsp:val=&quot;005E112E&quot;/&gt;&lt;wsp:rsid wsp:val=&quot;005F0834&quot;/&gt;&lt;wsp:rsid wsp:val=&quot;005F68AB&quot;/&gt;&lt;wsp:rsid wsp:val=&quot;005F6DC3&quot;/&gt;&lt;wsp:rsid wsp:val=&quot;00601A8E&quot;/&gt;&lt;wsp:rsid wsp:val=&quot;0062033E&quot;/&gt;&lt;wsp:rsid wsp:val=&quot;00624482&quot;/&gt;&lt;wsp:rsid wsp:val=&quot;0064799C&quot;/&gt;&lt;wsp:rsid wsp:val=&quot;00654156&quot;/&gt;&lt;wsp:rsid wsp:val=&quot;006B47CA&quot;/&gt;&lt;wsp:rsid wsp:val=&quot;006C304C&quot;/&gt;&lt;wsp:rsid wsp:val=&quot;006C4511&quot;/&gt;&lt;wsp:rsid wsp:val=&quot;006C65F5&quot;/&gt;&lt;wsp:rsid wsp:val=&quot;006C7AAA&quot;/&gt;&lt;wsp:rsid wsp:val=&quot;006D1C2A&quot;/&gt;&lt;wsp:rsid wsp:val=&quot;006D264F&quot;/&gt;&lt;wsp:rsid wsp:val=&quot;006E2A8D&quot;/&gt;&lt;wsp:rsid wsp:val=&quot;006E7574&quot;/&gt;&lt;wsp:rsid wsp:val=&quot;00703430&quot;/&gt;&lt;wsp:rsid wsp:val=&quot;00703548&quot;/&gt;&lt;wsp:rsid wsp:val=&quot;00704E18&quot;/&gt;&lt;wsp:rsid wsp:val=&quot;007069BE&quot;/&gt;&lt;wsp:rsid wsp:val=&quot;00745C86&quot;/&gt;&lt;wsp:rsid wsp:val=&quot;00764603&quot;/&gt;&lt;wsp:rsid wsp:val=&quot;0076604D&quot;/&gt;&lt;wsp:rsid wsp:val=&quot;00790909&quot;/&gt;&lt;wsp:rsid wsp:val=&quot;007B1582&quot;/&gt;&lt;wsp:rsid wsp:val=&quot;007B5A07&quot;/&gt;&lt;wsp:rsid wsp:val=&quot;007C065D&quot;/&gt;&lt;wsp:rsid wsp:val=&quot;007D3E71&quot;/&gt;&lt;wsp:rsid wsp:val=&quot;007E5D6A&quot;/&gt;&lt;wsp:rsid wsp:val=&quot;007E645D&quot;/&gt;&lt;wsp:rsid wsp:val=&quot;007F75CA&quot;/&gt;&lt;wsp:rsid wsp:val=&quot;00821E08&quot;/&gt;&lt;wsp:rsid wsp:val=&quot;00834EFD&quot;/&gt;&lt;wsp:rsid wsp:val=&quot;00844B24&quot;/&gt;&lt;wsp:rsid wsp:val=&quot;0084515F&quot;/&gt;&lt;wsp:rsid wsp:val=&quot;0085092D&quot;/&gt;&lt;wsp:rsid wsp:val=&quot;00865414&quot;/&gt;&lt;wsp:rsid wsp:val=&quot;00877D4C&quot;/&gt;&lt;wsp:rsid wsp:val=&quot;00883903&quot;/&gt;&lt;wsp:rsid wsp:val=&quot;0089763B&quot;/&gt;&lt;wsp:rsid wsp:val=&quot;008B6AE3&quot;/&gt;&lt;wsp:rsid wsp:val=&quot;008C1332&quot;/&gt;&lt;wsp:rsid wsp:val=&quot;008D1045&quot;/&gt;&lt;wsp:rsid wsp:val=&quot;008E5996&quot;/&gt;&lt;wsp:rsid wsp:val=&quot;00901AE1&quot;/&gt;&lt;wsp:rsid wsp:val=&quot;00912F93&quot;/&gt;&lt;wsp:rsid wsp:val=&quot;009205B4&quot;/&gt;&lt;wsp:rsid wsp:val=&quot;00955B59&quot;/&gt;&lt;wsp:rsid wsp:val=&quot;00992262&quot;/&gt;&lt;wsp:rsid wsp:val=&quot;009926BC&quot;/&gt;&lt;wsp:rsid wsp:val=&quot;009A4319&quot;/&gt;&lt;wsp:rsid wsp:val=&quot;009A6C3F&quot;/&gt;&lt;wsp:rsid wsp:val=&quot;009B73F2&quot;/&gt;&lt;wsp:rsid wsp:val=&quot;009C12BD&quot;/&gt;&lt;wsp:rsid wsp:val=&quot;009C50FE&quot;/&gt;&lt;wsp:rsid wsp:val=&quot;009E49DD&quot;/&gt;&lt;wsp:rsid wsp:val=&quot;00A03E75&quot;/&gt;&lt;wsp:rsid wsp:val=&quot;00A20627&quot;/&gt;&lt;wsp:rsid wsp:val=&quot;00A22FE9&quot;/&gt;&lt;wsp:rsid wsp:val=&quot;00A31A44&quot;/&gt;&lt;wsp:rsid wsp:val=&quot;00A32BFA&quot;/&gt;&lt;wsp:rsid wsp:val=&quot;00A3325E&quot;/&gt;&lt;wsp:rsid wsp:val=&quot;00A45FCE&quot;/&gt;&lt;wsp:rsid wsp:val=&quot;00A75671&quot;/&gt;&lt;wsp:rsid wsp:val=&quot;00A773CC&quot;/&gt;&lt;wsp:rsid wsp:val=&quot;00A924D0&quot;/&gt;&lt;wsp:rsid wsp:val=&quot;00A9318B&quot;/&gt;&lt;wsp:rsid wsp:val=&quot;00A94AC1&quot;/&gt;&lt;wsp:rsid wsp:val=&quot;00AB18B7&quot;/&gt;&lt;wsp:rsid wsp:val=&quot;00AD335D&quot;/&gt;&lt;wsp:rsid wsp:val=&quot;00AF114C&quot;/&gt;&lt;wsp:rsid wsp:val=&quot;00AF792B&quot;/&gt;&lt;wsp:rsid wsp:val=&quot;00B33D2F&quot;/&gt;&lt;wsp:rsid wsp:val=&quot;00B40A5B&quot;/&gt;&lt;wsp:rsid wsp:val=&quot;00B45C6B&quot;/&gt;&lt;wsp:rsid wsp:val=&quot;00B55D5E&quot;/&gt;&lt;wsp:rsid wsp:val=&quot;00B57A80&quot;/&gt;&lt;wsp:rsid wsp:val=&quot;00B70E9C&quot;/&gt;&lt;wsp:rsid wsp:val=&quot;00B713D8&quot;/&gt;&lt;wsp:rsid wsp:val=&quot;00B72979&quot;/&gt;&lt;wsp:rsid wsp:val=&quot;00B94516&quot;/&gt;&lt;wsp:rsid wsp:val=&quot;00BA25E2&quot;/&gt;&lt;wsp:rsid wsp:val=&quot;00BB2855&quot;/&gt;&lt;wsp:rsid wsp:val=&quot;00BC5343&quot;/&gt;&lt;wsp:rsid wsp:val=&quot;00BD19C1&quot;/&gt;&lt;wsp:rsid wsp:val=&quot;00BD25B8&quot;/&gt;&lt;wsp:rsid wsp:val=&quot;00C012E1&quot;/&gt;&lt;wsp:rsid wsp:val=&quot;00C06BB4&quot;/&gt;&lt;wsp:rsid wsp:val=&quot;00C10D20&quot;/&gt;&lt;wsp:rsid wsp:val=&quot;00C12E0C&quot;/&gt;&lt;wsp:rsid wsp:val=&quot;00C21916&quot;/&gt;&lt;wsp:rsid wsp:val=&quot;00C34915&quot;/&gt;&lt;wsp:rsid wsp:val=&quot;00C457CA&quot;/&gt;&lt;wsp:rsid wsp:val=&quot;00C53FB6&quot;/&gt;&lt;wsp:rsid wsp:val=&quot;00C57FB7&quot;/&gt;&lt;wsp:rsid wsp:val=&quot;00C644D4&quot;/&gt;&lt;wsp:rsid wsp:val=&quot;00C65F3F&quot;/&gt;&lt;wsp:rsid wsp:val=&quot;00C72414&quot;/&gt;&lt;wsp:rsid wsp:val=&quot;00C72B1A&quot;/&gt;&lt;wsp:rsid wsp:val=&quot;00C8667B&quot;/&gt;&lt;wsp:rsid wsp:val=&quot;00C90993&quot;/&gt;&lt;wsp:rsid wsp:val=&quot;00C914DE&quot;/&gt;&lt;wsp:rsid wsp:val=&quot;00CA4CE3&quot;/&gt;&lt;wsp:rsid wsp:val=&quot;00CC72FD&quot;/&gt;&lt;wsp:rsid wsp:val=&quot;00CD4F3F&quot;/&gt;&lt;wsp:rsid wsp:val=&quot;00D311F8&quot;/&gt;&lt;wsp:rsid wsp:val=&quot;00D31660&quot;/&gt;&lt;wsp:rsid wsp:val=&quot;00D36B52&quot;/&gt;&lt;wsp:rsid wsp:val=&quot;00D377C8&quot;/&gt;&lt;wsp:rsid wsp:val=&quot;00D41274&quot;/&gt;&lt;wsp:rsid wsp:val=&quot;00D4229C&quot;/&gt;&lt;wsp:rsid wsp:val=&quot;00D43BF3&quot;/&gt;&lt;wsp:rsid wsp:val=&quot;00D549FB&quot;/&gt;&lt;wsp:rsid wsp:val=&quot;00D767BB&quot;/&gt;&lt;wsp:rsid wsp:val=&quot;00D939B0&quot;/&gt;&lt;wsp:rsid wsp:val=&quot;00DA31A2&quot;/&gt;&lt;wsp:rsid wsp:val=&quot;00DB16E0&quot;/&gt;&lt;wsp:rsid wsp:val=&quot;00DB2DF9&quot;/&gt;&lt;wsp:rsid wsp:val=&quot;00DB465D&quot;/&gt;&lt;wsp:rsid wsp:val=&quot;00DB48A2&quot;/&gt;&lt;wsp:rsid wsp:val=&quot;00DB7E63&quot;/&gt;&lt;wsp:rsid wsp:val=&quot;00DC2055&quot;/&gt;&lt;wsp:rsid wsp:val=&quot;00DC3908&quot;/&gt;&lt;wsp:rsid wsp:val=&quot;00DD71E8&quot;/&gt;&lt;wsp:rsid wsp:val=&quot;00DD7F83&quot;/&gt;&lt;wsp:rsid wsp:val=&quot;00DE4EB8&quot;/&gt;&lt;wsp:rsid wsp:val=&quot;00E0641E&quot;/&gt;&lt;wsp:rsid wsp:val=&quot;00E06664&quot;/&gt;&lt;wsp:rsid wsp:val=&quot;00E304BC&quot;/&gt;&lt;wsp:rsid wsp:val=&quot;00E32853&quot;/&gt;&lt;wsp:rsid wsp:val=&quot;00E34EBD&quot;/&gt;&lt;wsp:rsid wsp:val=&quot;00E401F8&quot;/&gt;&lt;wsp:rsid wsp:val=&quot;00E46425&quot;/&gt;&lt;wsp:rsid wsp:val=&quot;00E469FC&quot;/&gt;&lt;wsp:rsid wsp:val=&quot;00E47D0E&quot;/&gt;&lt;wsp:rsid wsp:val=&quot;00E65018&quot;/&gt;&lt;wsp:rsid wsp:val=&quot;00E76CA1&quot;/&gt;&lt;wsp:rsid wsp:val=&quot;00E94339&quot;/&gt;&lt;wsp:rsid wsp:val=&quot;00E97563&quot;/&gt;&lt;wsp:rsid wsp:val=&quot;00EB0B63&quot;/&gt;&lt;wsp:rsid wsp:val=&quot;00EC265C&quot;/&gt;&lt;wsp:rsid wsp:val=&quot;00ED61CB&quot;/&gt;&lt;wsp:rsid wsp:val=&quot;00EE752A&quot;/&gt;&lt;wsp:rsid wsp:val=&quot;00F06A72&quot;/&gt;&lt;wsp:rsid wsp:val=&quot;00F136F0&quot;/&gt;&lt;wsp:rsid wsp:val=&quot;00F20BBB&quot;/&gt;&lt;wsp:rsid wsp:val=&quot;00F36048&quot;/&gt;&lt;wsp:rsid wsp:val=&quot;00F43BD8&quot;/&gt;&lt;wsp:rsid wsp:val=&quot;00F562F3&quot;/&gt;&lt;wsp:rsid wsp:val=&quot;00F74B89&quot;/&gt;&lt;wsp:rsid wsp:val=&quot;00F75133&quot;/&gt;&lt;wsp:rsid wsp:val=&quot;00F83272&quot;/&gt;&lt;wsp:rsid wsp:val=&quot;00F9358D&quot;/&gt;&lt;wsp:rsid wsp:val=&quot;00FA3899&quot;/&gt;&lt;wsp:rsid wsp:val=&quot;00FA4909&quot;/&gt;&lt;wsp:rsid wsp:val=&quot;00FA5164&quot;/&gt;&lt;wsp:rsid wsp:val=&quot;00FA6751&quot;/&gt;&lt;wsp:rsid wsp:val=&quot;00FA6BD7&quot;/&gt;&lt;wsp:rsid wsp:val=&quot;00FB1048&quot;/&gt;&lt;wsp:rsid wsp:val=&quot;00FB62C4&quot;/&gt;&lt;wsp:rsid wsp:val=&quot;00FB7701&quot;/&gt;&lt;wsp:rsid wsp:val=&quot;00FD1AC5&quot;/&gt;&lt;wsp:rsid wsp:val=&quot;00FD5CF0&quot;/&gt;&lt;/wsp:rsids&gt;&lt;/w:docPr&gt;&lt;w:body&gt;&lt;wx:sect&gt;&lt;w:p wsp:rsidR=&quot;00C914DE&quot; wsp:rsidRDefault=&quot;00C914DE&quot; wsp:rsidP=&quot;00C914DE&quot;&gt;&lt;m:oMathPara&gt;&lt;m:oMath&gt;&lt;m:r&gt;&lt;w:rPr&gt;&lt;w:rFonts w:ascii=&quot;Cambria Math&quot; w:fareast=&quot;Times New Roman&quot; w:h-ansi=&quot;Cambria Math&quot;/&gt;&lt;wx:font wx:val=&quot;Cambria Math&quot;/&gt;&lt;w:i/&gt;&lt;/w:rPr&gt;&lt;m:t&gt;D&lt;/m:t&gt;&lt;/m:r&gt;&lt;/m:oMath&gt;&lt;/m:oMathPara&gt;&lt;/w:p&gt;&lt;w:sectPr wsp:rsidR=&quot;00000000&quot;&gt;&lt;w:pgSz w:w=&quot;12240&quot; w:h=&quot;15840&quot;/&gt;&lt;w:pgMar w:top=&quot;1440&quot; w:right=&quot;1440&quot; w:bottom=&quot;1440&quot; w:left=&quot;1440&quot; w:header=&quot;720&quot; w:footer=&quot;720&quot; w:gutter=&quot;0&quot;/&gt;&lt;w:cols w:space=&quot;720&quot;/&gt;&lt;/w:sectPr&gt;&lt;/wx:sect&gt;&lt;/w:body&gt;&lt;/w:wordDocument&gt;">
             <v:imagedata r:id="rId15" o:title="" chromakey="white"/>
           </v:shape>
         </w:pict>
@@ -1091,7 +1091,7 @@
           <w:szCs w:val="20"/>
         </w:rPr>
         <w:pict w14:anchorId="000DA706">
-          <v:shape id="_x0000_i1068" type="#_x0000_t75" style="width:91.65pt;height:18.55pt" equationxml="&lt;?xml version=&quot;1.0&quot; encoding=&quot;UTF-8&quot; standalone=&quot;yes&quot;?&gt;&#10;&lt;?mso-application progid=&quot;Word.Document&quot;?&gt;&#10;&lt;w:wordDocument xmlns:aml=&quot;http://schemas.microsoft.com/aml/2001/core&quot; xmlns:wpc=&quot;http://schemas.microsoft.com/office/word/2010/wordprocessingCanvas&quot; xmlns:cx=&quot;http://schemas.microsoft.com/office/drawing/2014/chartex&quot; xmlns:cx1=&quot;http://schemas.microsoft.com/office/drawing/2015/9/8/chartex&quot; xmlns:cx2=&quot;http://schemas.microsoft.com/office/drawing/2015/10/21/chartex&quot; xmlns:cx3=&quot;http://schemas.microsoft.com/office/drawing/2016/5/9/chartex&quot; xmlns:cx4=&quot;http://schemas.microsoft.com/office/drawing/2016/5/10/chartex&quot; xmlns:cx5=&quot;http://schemas.microsoft.com/office/drawing/2016/5/11/chartex&quot; xmlns:cx6=&quot;http://schemas.microsoft.com/office/drawing/2016/5/12/chartex&quot; xmlns:cx7=&quot;http://schemas.microsoft.com/office/drawing/2016/5/13/chartex&quot; xmlns:cx8=&quot;http://schemas.microsoft.com/office/drawing/2016/5/14/chartex&quot; xmlns:cr=&quot;http://schemas.microsoft.com/office/comments/2020/reactions&quot; xmlns:dt=&quot;uuid:C2F41010-65B3-11d1-A29F-00AA00C14882&quot; xmlns:mc=&quot;http://schemas.openxmlformats.org/markup-compatibility/2006&quot; xmlns:aink=&quot;http://schemas.microsoft.com/office/drawing/2016/ink&quot; xmlns:am3d=&quot;http://schemas.microsoft.com/office/drawing/2017/model3d&quot; xmlns:o=&quot;urn:schemas-microsoft-com:office:office&quot; xmlns:oel=&quot;http://schemas.microsoft.com/office/2019/extlst&quot; xmlns:m=&quot;http://schemas.openxmlformats.org/officeDocument/2006/math&quot; xmlns:v=&quot;urn:schemas-microsoft-com:vml&quot; xmlns:w10=&quot;urn:schemas-microsoft-com:office:word&quot; xmlns:w=&quot;http://schemas.microsoft.com/office/word/2003/wordml&quot; xmlns:wx=&quot;http://schemas.microsoft.com/office/word/2003/auxHint&quot; xmlns:wne=&quot;http://schemas.microsoft.com/office/word/2006/wordml&quot; xmlns:wsp=&quot;http://schemas.microsoft.com/office/word/2003/wordml/sp2&quot; xmlns:sl=&quot;http://schemas.microsoft.com/schemaLibrary/2003/core&quot; w:macrosPresent=&quot;no&quot; w:embeddedObjPresent=&quot;no&quot; w:ocxPresent=&quot;no&quot; xml:space=&quot;preserve&quot;&gt;&lt;w:ignoreSubtree w:val=&quot;http://schemas.microsoft.com/office/word/2003/wordml/sp2&quot;/&gt;&lt;o:DocumentProperties&gt;&lt;o:Version&gt;16&lt;/o:Version&gt;&lt;/o:DocumentProperties&gt;&lt;w:docPr&gt;&lt;w:view w:val=&quot;print&quot;/&gt;&lt;w:zoom w:percent=&quot;100&quot;/&gt;&lt;w:doNotEmbedSystemFonts/&gt;&lt;w:activeWritingStyle w:lang=&quot;EN-AU&quot; w:vendorID=&quot;64&quot; w:dllVersion=&quot;6&quot; w:nlCheck=&quot;on&quot; w:optionSet=&quot;1&quot;/&gt;&lt;w:activeWritingStyle w:lang=&quot;EN-GB&quot; w:vendorID=&quot;64&quot; w:dllVersion=&quot;6&quot; w:nlCheck=&quot;on&quot; w:optionSet=&quot;1&quot;/&gt;&lt;w:activeWritingStyle w:lang=&quot;EN-US&quot; w:vendorID=&quot;64&quot; w:dllVersion=&quot;6&quot; w:nlCheck=&quot;on&quot; w:optionSet=&quot;1&quot;/&gt;&lt;w:activeWritingStyle w:lang=&quot;EN-AU&quot; w:vendorID=&quot;64&quot; w:dllVersion=&quot;0&quot; w:nlCheck=&quot;on&quot; w:optionSet=&quot;0&quot;/&gt;&lt;w:activeWritingStyle w:lang=&quot;EN-GB&quot; w:vendorID=&quot;64&quot; w:dllVersion=&quot;0&quot; w:nlCheck=&quot;on&quot; w:optionSet=&quot;0&quot;/&gt;&lt;w:activeWritingStyle w:lang=&quot;EN-US&quot; w:vendorID=&quot;64&quot; w:dllVersion=&quot;0&quot; w:nlCheck=&quot;on&quot; w:optionSet=&quot;0&quot;/&gt;&lt;w:activeWritingStyle w:lang=&quot;ES-AR&quot; w:vendorID=&quot;64&quot; w:dllVersion=&quot;0&quot; w:nlCheck=&quot;on&quot; w:optionSet=&quot;0&quot;/&gt;&lt;w:activeWritingStyle w:lang=&quot;580A&quot; w:vendorID=&quot;64&quot; w:dllVersion=&quot;0&quot; w:nlCheck=&quot;on&quot; w:optionSet=&quot;0&quot;/&gt;&lt;w:activeWritingStyle w:lang=&quot;PT-BR&quot; w:vendorID=&quot;64&quot; w:dllVersion=&quot;0&quot; w:nlCheck=&quot;on&quot; w:optionSet=&quot;0&quot;/&gt;&lt;w:stylePaneFormatFilter w:val=&quot;3F01&quot;/&gt;&lt;w:defaultTabStop w:val=&quot;720&quot;/&gt;&lt;w:hyphenationZone w:val=&quot;425&quot;/&gt;&lt;w:characterSpacingControl w:val=&quot;DontCompress&quot;/&gt;&lt;w:optimizeForBrowser/&gt;&lt;w:validateAgainstSchema/&gt;&lt;w:saveInvalidXML w:val=&quot;off&quot;/&gt;&lt;w:ignoreMixedContent w:val=&quot;off&quot;/&gt;&lt;w:alwaysShowPlaceholderText w:val=&quot;off&quot;/&gt;&lt;w:compat&gt;&lt;w:breakWrappedTables/&gt;&lt;w:snapToGridInCell/&gt;&lt;w:applyBreakingRules/&gt;&lt;w:wrapTextWithPunct/&gt;&lt;w:useAsianBreakRules/&gt;&lt;w:useWord2002TableStyleRules/&gt;&lt;w:useFELayout/&gt;&lt;/w:compat&gt;&lt;wsp:rsids&gt;&lt;wsp:rsidRoot wsp:val=&quot;00426FBB&quot;/&gt;&lt;wsp:rsid wsp:val=&quot;000002E1&quot;/&gt;&lt;wsp:rsid wsp:val=&quot;00003C97&quot;/&gt;&lt;wsp:rsid wsp:val=&quot;00005565&quot;/&gt;&lt;wsp:rsid wsp:val=&quot;0001754A&quot;/&gt;&lt;wsp:rsid wsp:val=&quot;00017719&quot;/&gt;&lt;wsp:rsid wsp:val=&quot;00027F1D&quot;/&gt;&lt;wsp:rsid wsp:val=&quot;0003296C&quot;/&gt;&lt;wsp:rsid wsp:val=&quot;0003351F&quot;/&gt;&lt;wsp:rsid wsp:val=&quot;00044599&quot;/&gt;&lt;wsp:rsid wsp:val=&quot;000540E6&quot;/&gt;&lt;wsp:rsid wsp:val=&quot;00054421&quot;/&gt;&lt;wsp:rsid wsp:val=&quot;00062E46&quot;/&gt;&lt;wsp:rsid wsp:val=&quot;00074AC8&quot;/&gt;&lt;wsp:rsid wsp:val=&quot;00081408&quot;/&gt;&lt;wsp:rsid wsp:val=&quot;00081EBE&quot;/&gt;&lt;wsp:rsid wsp:val=&quot;00086EDC&quot;/&gt;&lt;wsp:rsid wsp:val=&quot;000B36A3&quot;/&gt;&lt;wsp:rsid wsp:val=&quot;000C013C&quot;/&gt;&lt;wsp:rsid wsp:val=&quot;000E3F84&quot;/&gt;&lt;wsp:rsid wsp:val=&quot;001056DF&quot;/&gt;&lt;wsp:rsid wsp:val=&quot;0010789C&quot;/&gt;&lt;wsp:rsid wsp:val=&quot;00114025&quot;/&gt;&lt;wsp:rsid wsp:val=&quot;001160D2&quot;/&gt;&lt;wsp:rsid wsp:val=&quot;00120636&quot;/&gt;&lt;wsp:rsid wsp:val=&quot;001348A5&quot;/&gt;&lt;wsp:rsid wsp:val=&quot;00151B8E&quot;/&gt;&lt;wsp:rsid wsp:val=&quot;00182170&quot;/&gt;&lt;wsp:rsid wsp:val=&quot;001928FB&quot;/&gt;&lt;wsp:rsid wsp:val=&quot;00192BC7&quot;/&gt;&lt;wsp:rsid wsp:val=&quot;00195BE6&quot;/&gt;&lt;wsp:rsid wsp:val=&quot;001A50EA&quot;/&gt;&lt;wsp:rsid wsp:val=&quot;001F16CD&quot;/&gt;&lt;wsp:rsid wsp:val=&quot;001F47D2&quot;/&gt;&lt;wsp:rsid wsp:val=&quot;002029C8&quot;/&gt;&lt;wsp:rsid wsp:val=&quot;0022285A&quot;/&gt;&lt;wsp:rsid wsp:val=&quot;00224C61&quot;/&gt;&lt;wsp:rsid wsp:val=&quot;00256ABC&quot;/&gt;&lt;wsp:rsid wsp:val=&quot;0027227B&quot;/&gt;&lt;wsp:rsid wsp:val=&quot;00273AC7&quot;/&gt;&lt;wsp:rsid wsp:val=&quot;00273D2C&quot;/&gt;&lt;wsp:rsid wsp:val=&quot;00285ECD&quot;/&gt;&lt;wsp:rsid wsp:val=&quot;00290E1B&quot;/&gt;&lt;wsp:rsid wsp:val=&quot;00291B17&quot;/&gt;&lt;wsp:rsid wsp:val=&quot;00291BB3&quot;/&gt;&lt;wsp:rsid wsp:val=&quot;002A6742&quot;/&gt;&lt;wsp:rsid wsp:val=&quot;002C1A7F&quot;/&gt;&lt;wsp:rsid wsp:val=&quot;002C4239&quot;/&gt;&lt;wsp:rsid wsp:val=&quot;002C559D&quot;/&gt;&lt;wsp:rsid wsp:val=&quot;002D16AE&quot;/&gt;&lt;wsp:rsid wsp:val=&quot;002D2D42&quot;/&gt;&lt;wsp:rsid wsp:val=&quot;002F72D0&quot;/&gt;&lt;wsp:rsid wsp:val=&quot;002F7A4F&quot;/&gt;&lt;wsp:rsid wsp:val=&quot;003003AB&quot;/&gt;&lt;wsp:rsid wsp:val=&quot;00302C35&quot;/&gt;&lt;wsp:rsid wsp:val=&quot;00311C49&quot;/&gt;&lt;wsp:rsid wsp:val=&quot;0032119E&quot;/&gt;&lt;wsp:rsid wsp:val=&quot;00321304&quot;/&gt;&lt;wsp:rsid wsp:val=&quot;00324FC2&quot;/&gt;&lt;wsp:rsid wsp:val=&quot;003312CA&quot;/&gt;&lt;wsp:rsid wsp:val=&quot;00331F84&quot;/&gt;&lt;wsp:rsid wsp:val=&quot;0037721F&quot;/&gt;&lt;wsp:rsid wsp:val=&quot;003950A4&quot;/&gt;&lt;wsp:rsid wsp:val=&quot;003A1E7E&quot;/&gt;&lt;wsp:rsid wsp:val=&quot;003E2FDC&quot;/&gt;&lt;wsp:rsid wsp:val=&quot;003E3577&quot;/&gt;&lt;wsp:rsid wsp:val=&quot;003F3A61&quot;/&gt;&lt;wsp:rsid wsp:val=&quot;00410A5D&quot;/&gt;&lt;wsp:rsid wsp:val=&quot;00414909&quot;/&gt;&lt;wsp:rsid wsp:val=&quot;00416537&quot;/&gt;&lt;wsp:rsid wsp:val=&quot;00425A6A&quot;/&gt;&lt;wsp:rsid wsp:val=&quot;00426FBB&quot;/&gt;&lt;wsp:rsid wsp:val=&quot;00454542&quot;/&gt;&lt;wsp:rsid wsp:val=&quot;0047429A&quot;/&gt;&lt;wsp:rsid wsp:val=&quot;0048374C&quot;/&gt;&lt;wsp:rsid wsp:val=&quot;0048771D&quot;/&gt;&lt;wsp:rsid wsp:val=&quot;004A6605&quot;/&gt;&lt;wsp:rsid wsp:val=&quot;004C45FA&quot;/&gt;&lt;wsp:rsid wsp:val=&quot;004D35A3&quot;/&gt;&lt;wsp:rsid wsp:val=&quot;004E1BD8&quot;/&gt;&lt;wsp:rsid wsp:val=&quot;004E452A&quot;/&gt;&lt;wsp:rsid wsp:val=&quot;004E78E3&quot;/&gt;&lt;wsp:rsid wsp:val=&quot;004F2BFE&quot;/&gt;&lt;wsp:rsid wsp:val=&quot;004F63D3&quot;/&gt;&lt;wsp:rsid wsp:val=&quot;004F7DCF&quot;/&gt;&lt;wsp:rsid wsp:val=&quot;005004BF&quot;/&gt;&lt;wsp:rsid wsp:val=&quot;00502E89&quot;/&gt;&lt;wsp:rsid wsp:val=&quot;00506CFE&quot;/&gt;&lt;wsp:rsid wsp:val=&quot;00510E95&quot;/&gt;&lt;wsp:rsid wsp:val=&quot;005225C3&quot;/&gt;&lt;wsp:rsid wsp:val=&quot;00527D56&quot;/&gt;&lt;wsp:rsid wsp:val=&quot;0053221F&quot;/&gt;&lt;wsp:rsid wsp:val=&quot;0053590D&quot;/&gt;&lt;wsp:rsid wsp:val=&quot;00536FAE&quot;/&gt;&lt;wsp:rsid wsp:val=&quot;00542C85&quot;/&gt;&lt;wsp:rsid wsp:val=&quot;00553510&quot;/&gt;&lt;wsp:rsid wsp:val=&quot;00554186&quot;/&gt;&lt;wsp:rsid wsp:val=&quot;00585769&quot;/&gt;&lt;wsp:rsid wsp:val=&quot;00585C61&quot;/&gt;&lt;wsp:rsid wsp:val=&quot;00591130&quot;/&gt;&lt;wsp:rsid wsp:val=&quot;005A3F28&quot;/&gt;&lt;wsp:rsid wsp:val=&quot;005A40BE&quot;/&gt;&lt;wsp:rsid wsp:val=&quot;005B13E2&quot;/&gt;&lt;wsp:rsid wsp:val=&quot;005B47D7&quot;/&gt;&lt;wsp:rsid wsp:val=&quot;005C5526&quot;/&gt;&lt;wsp:rsid wsp:val=&quot;005C62C6&quot;/&gt;&lt;wsp:rsid wsp:val=&quot;005D7B9E&quot;/&gt;&lt;wsp:rsid wsp:val=&quot;005E112E&quot;/&gt;&lt;wsp:rsid wsp:val=&quot;005F0834&quot;/&gt;&lt;wsp:rsid wsp:val=&quot;005F68AB&quot;/&gt;&lt;wsp:rsid wsp:val=&quot;005F6DC3&quot;/&gt;&lt;wsp:rsid wsp:val=&quot;00601A8E&quot;/&gt;&lt;wsp:rsid wsp:val=&quot;0062033E&quot;/&gt;&lt;wsp:rsid wsp:val=&quot;00624482&quot;/&gt;&lt;wsp:rsid wsp:val=&quot;0064799C&quot;/&gt;&lt;wsp:rsid wsp:val=&quot;00654156&quot;/&gt;&lt;wsp:rsid wsp:val=&quot;006B47CA&quot;/&gt;&lt;wsp:rsid wsp:val=&quot;006C304C&quot;/&gt;&lt;wsp:rsid wsp:val=&quot;006C4511&quot;/&gt;&lt;wsp:rsid wsp:val=&quot;006C65F5&quot;/&gt;&lt;wsp:rsid wsp:val=&quot;006C7AAA&quot;/&gt;&lt;wsp:rsid wsp:val=&quot;006D1C2A&quot;/&gt;&lt;wsp:rsid wsp:val=&quot;006D264F&quot;/&gt;&lt;wsp:rsid wsp:val=&quot;006E2A8D&quot;/&gt;&lt;wsp:rsid wsp:val=&quot;006E7574&quot;/&gt;&lt;wsp:rsid wsp:val=&quot;00703430&quot;/&gt;&lt;wsp:rsid wsp:val=&quot;00703548&quot;/&gt;&lt;wsp:rsid wsp:val=&quot;00704E18&quot;/&gt;&lt;wsp:rsid wsp:val=&quot;007069BE&quot;/&gt;&lt;wsp:rsid wsp:val=&quot;00745C86&quot;/&gt;&lt;wsp:rsid wsp:val=&quot;00764603&quot;/&gt;&lt;wsp:rsid wsp:val=&quot;0076604D&quot;/&gt;&lt;wsp:rsid wsp:val=&quot;00790909&quot;/&gt;&lt;wsp:rsid wsp:val=&quot;007B1582&quot;/&gt;&lt;wsp:rsid wsp:val=&quot;007B5A07&quot;/&gt;&lt;wsp:rsid wsp:val=&quot;007C065D&quot;/&gt;&lt;wsp:rsid wsp:val=&quot;007D3E71&quot;/&gt;&lt;wsp:rsid wsp:val=&quot;007E5D6A&quot;/&gt;&lt;wsp:rsid wsp:val=&quot;007E645D&quot;/&gt;&lt;wsp:rsid wsp:val=&quot;007F75CA&quot;/&gt;&lt;wsp:rsid wsp:val=&quot;00821E08&quot;/&gt;&lt;wsp:rsid wsp:val=&quot;00834EFD&quot;/&gt;&lt;wsp:rsid wsp:val=&quot;00844B24&quot;/&gt;&lt;wsp:rsid wsp:val=&quot;0084515F&quot;/&gt;&lt;wsp:rsid wsp:val=&quot;0085092D&quot;/&gt;&lt;wsp:rsid wsp:val=&quot;00865414&quot;/&gt;&lt;wsp:rsid wsp:val=&quot;00877D4C&quot;/&gt;&lt;wsp:rsid wsp:val=&quot;00883903&quot;/&gt;&lt;wsp:rsid wsp:val=&quot;0089763B&quot;/&gt;&lt;wsp:rsid wsp:val=&quot;008B6AE3&quot;/&gt;&lt;wsp:rsid wsp:val=&quot;008C1332&quot;/&gt;&lt;wsp:rsid wsp:val=&quot;008D1045&quot;/&gt;&lt;wsp:rsid wsp:val=&quot;008E5996&quot;/&gt;&lt;wsp:rsid wsp:val=&quot;00901AE1&quot;/&gt;&lt;wsp:rsid wsp:val=&quot;00912F93&quot;/&gt;&lt;wsp:rsid wsp:val=&quot;009205B4&quot;/&gt;&lt;wsp:rsid wsp:val=&quot;00955B59&quot;/&gt;&lt;wsp:rsid wsp:val=&quot;00992262&quot;/&gt;&lt;wsp:rsid wsp:val=&quot;009926BC&quot;/&gt;&lt;wsp:rsid wsp:val=&quot;009A4319&quot;/&gt;&lt;wsp:rsid wsp:val=&quot;009A6C3F&quot;/&gt;&lt;wsp:rsid wsp:val=&quot;009B73F2&quot;/&gt;&lt;wsp:rsid wsp:val=&quot;009C12BD&quot;/&gt;&lt;wsp:rsid wsp:val=&quot;009C50FE&quot;/&gt;&lt;wsp:rsid wsp:val=&quot;009E49DD&quot;/&gt;&lt;wsp:rsid wsp:val=&quot;00A03E75&quot;/&gt;&lt;wsp:rsid wsp:val=&quot;00A20627&quot;/&gt;&lt;wsp:rsid wsp:val=&quot;00A22FE9&quot;/&gt;&lt;wsp:rsid wsp:val=&quot;00A31A44&quot;/&gt;&lt;wsp:rsid wsp:val=&quot;00A32BFA&quot;/&gt;&lt;wsp:rsid wsp:val=&quot;00A3325E&quot;/&gt;&lt;wsp:rsid wsp:val=&quot;00A45FCE&quot;/&gt;&lt;wsp:rsid wsp:val=&quot;00A75671&quot;/&gt;&lt;wsp:rsid wsp:val=&quot;00A773CC&quot;/&gt;&lt;wsp:rsid wsp:val=&quot;00A924D0&quot;/&gt;&lt;wsp:rsid wsp:val=&quot;00A9318B&quot;/&gt;&lt;wsp:rsid wsp:val=&quot;00A94AC1&quot;/&gt;&lt;wsp:rsid wsp:val=&quot;00AB18B7&quot;/&gt;&lt;wsp:rsid wsp:val=&quot;00AD335D&quot;/&gt;&lt;wsp:rsid wsp:val=&quot;00AF114C&quot;/&gt;&lt;wsp:rsid wsp:val=&quot;00AF792B&quot;/&gt;&lt;wsp:rsid wsp:val=&quot;00B33D2F&quot;/&gt;&lt;wsp:rsid wsp:val=&quot;00B40A5B&quot;/&gt;&lt;wsp:rsid wsp:val=&quot;00B45C6B&quot;/&gt;&lt;wsp:rsid wsp:val=&quot;00B55D5E&quot;/&gt;&lt;wsp:rsid wsp:val=&quot;00B57A80&quot;/&gt;&lt;wsp:rsid wsp:val=&quot;00B70E9C&quot;/&gt;&lt;wsp:rsid wsp:val=&quot;00B713D8&quot;/&gt;&lt;wsp:rsid wsp:val=&quot;00B72979&quot;/&gt;&lt;wsp:rsid wsp:val=&quot;00B94516&quot;/&gt;&lt;wsp:rsid wsp:val=&quot;00BA25E2&quot;/&gt;&lt;wsp:rsid wsp:val=&quot;00BB2855&quot;/&gt;&lt;wsp:rsid wsp:val=&quot;00BC5343&quot;/&gt;&lt;wsp:rsid wsp:val=&quot;00BD19C1&quot;/&gt;&lt;wsp:rsid wsp:val=&quot;00BD25B8&quot;/&gt;&lt;wsp:rsid wsp:val=&quot;00C012E1&quot;/&gt;&lt;wsp:rsid wsp:val=&quot;00C06BB4&quot;/&gt;&lt;wsp:rsid wsp:val=&quot;00C10D20&quot;/&gt;&lt;wsp:rsid wsp:val=&quot;00C12E0C&quot;/&gt;&lt;wsp:rsid wsp:val=&quot;00C21916&quot;/&gt;&lt;wsp:rsid wsp:val=&quot;00C34915&quot;/&gt;&lt;wsp:rsid wsp:val=&quot;00C457CA&quot;/&gt;&lt;wsp:rsid wsp:val=&quot;00C53FB6&quot;/&gt;&lt;wsp:rsid wsp:val=&quot;00C57FB7&quot;/&gt;&lt;wsp:rsid wsp:val=&quot;00C644D4&quot;/&gt;&lt;wsp:rsid wsp:val=&quot;00C65F3F&quot;/&gt;&lt;wsp:rsid wsp:val=&quot;00C72414&quot;/&gt;&lt;wsp:rsid wsp:val=&quot;00C72B1A&quot;/&gt;&lt;wsp:rsid wsp:val=&quot;00C8667B&quot;/&gt;&lt;wsp:rsid wsp:val=&quot;00C90993&quot;/&gt;&lt;wsp:rsid wsp:val=&quot;00CA4CE3&quot;/&gt;&lt;wsp:rsid wsp:val=&quot;00CC72FD&quot;/&gt;&lt;wsp:rsid wsp:val=&quot;00CD4F3F&quot;/&gt;&lt;wsp:rsid wsp:val=&quot;00D311F8&quot;/&gt;&lt;wsp:rsid wsp:val=&quot;00D31660&quot;/&gt;&lt;wsp:rsid wsp:val=&quot;00D36B52&quot;/&gt;&lt;wsp:rsid wsp:val=&quot;00D377C8&quot;/&gt;&lt;wsp:rsid wsp:val=&quot;00D41274&quot;/&gt;&lt;wsp:rsid wsp:val=&quot;00D4229C&quot;/&gt;&lt;wsp:rsid wsp:val=&quot;00D43BF3&quot;/&gt;&lt;wsp:rsid wsp:val=&quot;00D549FB&quot;/&gt;&lt;wsp:rsid wsp:val=&quot;00D767BB&quot;/&gt;&lt;wsp:rsid wsp:val=&quot;00D939B0&quot;/&gt;&lt;wsp:rsid wsp:val=&quot;00DA31A2&quot;/&gt;&lt;wsp:rsid wsp:val=&quot;00DB16E0&quot;/&gt;&lt;wsp:rsid wsp:val=&quot;00DB2DF9&quot;/&gt;&lt;wsp:rsid wsp:val=&quot;00DB465D&quot;/&gt;&lt;wsp:rsid wsp:val=&quot;00DB48A2&quot;/&gt;&lt;wsp:rsid wsp:val=&quot;00DB7E63&quot;/&gt;&lt;wsp:rsid wsp:val=&quot;00DC2055&quot;/&gt;&lt;wsp:rsid wsp:val=&quot;00DC3908&quot;/&gt;&lt;wsp:rsid wsp:val=&quot;00DD71E8&quot;/&gt;&lt;wsp:rsid wsp:val=&quot;00DD7F83&quot;/&gt;&lt;wsp:rsid wsp:val=&quot;00DE4EB8&quot;/&gt;&lt;wsp:rsid wsp:val=&quot;00E0641E&quot;/&gt;&lt;wsp:rsid wsp:val=&quot;00E06664&quot;/&gt;&lt;wsp:rsid wsp:val=&quot;00E304BC&quot;/&gt;&lt;wsp:rsid wsp:val=&quot;00E32853&quot;/&gt;&lt;wsp:rsid wsp:val=&quot;00E34EBD&quot;/&gt;&lt;wsp:rsid wsp:val=&quot;00E401F8&quot;/&gt;&lt;wsp:rsid wsp:val=&quot;00E46425&quot;/&gt;&lt;wsp:rsid wsp:val=&quot;00E469FC&quot;/&gt;&lt;wsp:rsid wsp:val=&quot;00E47D0E&quot;/&gt;&lt;wsp:rsid wsp:val=&quot;00E65018&quot;/&gt;&lt;wsp:rsid wsp:val=&quot;00E76CA1&quot;/&gt;&lt;wsp:rsid wsp:val=&quot;00E94339&quot;/&gt;&lt;wsp:rsid wsp:val=&quot;00E97563&quot;/&gt;&lt;wsp:rsid wsp:val=&quot;00EB0B63&quot;/&gt;&lt;wsp:rsid wsp:val=&quot;00EC265C&quot;/&gt;&lt;wsp:rsid wsp:val=&quot;00ED61CB&quot;/&gt;&lt;wsp:rsid wsp:val=&quot;00EE752A&quot;/&gt;&lt;wsp:rsid wsp:val=&quot;00F06A72&quot;/&gt;&lt;wsp:rsid wsp:val=&quot;00F136F0&quot;/&gt;&lt;wsp:rsid wsp:val=&quot;00F20BBB&quot;/&gt;&lt;wsp:rsid wsp:val=&quot;00F36048&quot;/&gt;&lt;wsp:rsid wsp:val=&quot;00F43BD8&quot;/&gt;&lt;wsp:rsid wsp:val=&quot;00F562F3&quot;/&gt;&lt;wsp:rsid wsp:val=&quot;00F74B89&quot;/&gt;&lt;wsp:rsid wsp:val=&quot;00F75133&quot;/&gt;&lt;wsp:rsid wsp:val=&quot;00F83272&quot;/&gt;&lt;wsp:rsid wsp:val=&quot;00F9358D&quot;/&gt;&lt;wsp:rsid wsp:val=&quot;00FA3899&quot;/&gt;&lt;wsp:rsid wsp:val=&quot;00FA4909&quot;/&gt;&lt;wsp:rsid wsp:val=&quot;00FA5164&quot;/&gt;&lt;wsp:rsid wsp:val=&quot;00FA6751&quot;/&gt;&lt;wsp:rsid wsp:val=&quot;00FA6BD7&quot;/&gt;&lt;wsp:rsid wsp:val=&quot;00FB1048&quot;/&gt;&lt;wsp:rsid wsp:val=&quot;00FB62C4&quot;/&gt;&lt;wsp:rsid wsp:val=&quot;00FB7701&quot;/&gt;&lt;wsp:rsid wsp:val=&quot;00FD1AC5&quot;/&gt;&lt;wsp:rsid wsp:val=&quot;00FD5CF0&quot;/&gt;&lt;/wsp:rsids&gt;&lt;/w:docPr&gt;&lt;w:body&gt;&lt;wx:sect&gt;&lt;w:p wsp:rsidR=&quot;0053590D&quot; wsp:rsidRPr=&quot;0053590D&quot; wsp:rsidRDefault=&quot;0053590D&quot; wsp:rsidP=&quot;0053590D&quot;&gt;&lt;m:oMathPara&gt;&lt;m:oMath&gt;&lt;m:sSub&gt;&lt;m:sSubPr&gt;&lt;m:ctrlPr&gt;&lt;w:rPr&gt;&lt;w:rFonts w:ascii=&quot;Cambria Math&quot; w:h-ansi=&quot;Cambria Math&quot;/&gt;&lt;wx:font wx:val=&quot;Cambria Math&quot;/&gt;&lt;w:i/&gt;&lt;w:sz w:val=&quot;32&quot;/&gt;&lt;w:sz-cs w:val=&quot;32&quot;/&gt;&lt;/w:rPr&gt;&lt;/m:ctrlPr&gt;&lt;/m:sSubPr&gt;&lt;m:e&gt;&lt;m:r&gt;&lt;w:rPr&gt;&lt;w:rFonts w:ascii=&quot;Cambria Math&quot; w:h-ansi=&quot;Cambria Math&quot;/&gt;&lt;wx:font wx:val=&quot;Cambria Math&quot;/&gt;&lt;w:i/&gt;&lt;w:sz w:val=&quot;32&quot;/&gt;&lt;w:sz-cs w:val=&quot;32&quot;/&gt;&lt;/w:rPr&gt;&lt;m:t&gt;V&lt;/m:t&gt;&lt;/m:r&gt;&lt;/m:e&gt;&lt;m:sub&gt;&lt;m:r&gt;&lt;w:rPr&gt;&lt;w:rFonts w:ascii=&quot;Cambria Math&quot; w:h-ansi=&quot;Cambria Math&quot;/&gt;&lt;wx:font wx:val=&quot;Cambria Math&quot;/&gt;&lt;w:i/&gt;&lt;w:sz w:val=&quot;32&quot;/&gt;&lt;w:sz-cs w:val=&quot;32&quot;/&gt;&lt;/w:rPr&gt;&lt;m:t&gt;out&lt;/m:t&gt;&lt;/m:r&gt;&lt;/m:sub&gt;&lt;/m:sSub&gt;&lt;m:r&gt;&lt;w:rPr&gt;&lt;w:rFonts w:ascii=&quot;Cambria Math&quot; w:h-ansi=&quot;Cambria Math&quot;/&gt;&lt;wx:font wx:val=&quot;Cambria Math&quot;/&gt;&lt;w:i/&gt;&lt;w:sz w:val=&quot;32&quot;/&gt;&lt;w:sz-cs w:val=&quot;32&quot;/&gt;&lt;/w:rPr&gt;&lt;m:t&gt;=Dâˆ™&lt;/m:t&gt;&lt;/m:r&gt;&lt;m:sSub&gt;&lt;m:sSubPr&gt;&lt;m:ctrlPr&gt;&lt;w:rPr&gt;&lt;w:rFonts w:ascii=&quot;Cambria Math&quot; w:h-ansi=&quot;Cambria Math&quot;/&gt;&lt;wx:font wx:val=&quot;Cambria Math&quot;/&gt;&lt;w:i/&gt;&lt;w:sz w:val=&quot;32&quot;/&gt;&lt;w:sz-cs w:val=&quot;32&quot;/&gt;&lt;/w:rPr&gt;&lt;/m:ctrlPr&gt;&lt;/m:sSubPr&gt;&lt;m:e&gt;&lt;m:r&gt;&lt;w:rPr&gt;&lt;w:rFonts w:ascii=&quot;Cambria Math&quot; w:h-ansi=&quot;Cambria Math&quot;/&gt;&lt;wx:font wx:val=&quot;Cambria Math&quot;/&gt;&lt;w:i/&gt;&lt;w:sz w:val=&quot;32&quot;/&gt;&lt;w:sz-cs w:val=&quot;32&quot;/&gt;&lt;/w:rPr&gt;&lt;m:t&gt;V&lt;/m:t&gt;&lt;/m:r&gt;&lt;/m:e&gt;&lt;m:sub&gt;&lt;m:r&gt;&lt;w:rPr&gt;&lt;w:rFonts w:ascii=&quot;Cambria Math&quot; w:h-ansi=&quot;Cambria Math&quot;/&gt;&lt;wx:font wx:val=&quot;Cambria Math&quot;/&gt;&lt;w:i/&gt;&lt;w:sz w:val=&quot;32&quot;/&gt;&lt;w:sz-cs w:val=&quot;32&quot;/&gt;&lt;/w:rPr&gt;&lt;m:t&gt;in&lt;/m:t&gt;&lt;/m:r&gt;&lt;/m:sub&gt;&lt;/m:sSub&gt;&lt;/m:oMath&gt;&lt;/m:oMathPara&gt;&lt;/w:p&gt;&lt;w:sectPr wsp:rsidR=&quot;00000000&quot; wsp:rsidRPr=&quot;0053590D&quot;&gt;&lt;w:pgSz w:w=&quot;12240&quot; w:h=&quot;15840&quot;/&gt;&lt;w:pgMar w:top=&quot;1440&quot; w:right=&quot;1440&quot; w:bottom=&quot;1440&quot; w:left=&quot;1440&quot; w:header=&quot;720&quot; w:footer=&quot;720&quot; w:gutter=&quot;0&quot;/&gt;&lt;w:cols w:space=&quot;720&quot;/&gt;&lt;/w:sectPr&gt;&lt;/wx:sect&gt;&lt;/w:body&gt;&lt;/w:wordDocument&gt;">
+          <v:shape id="_x0000_i1035" type="#_x0000_t75" style="width:91.4pt;height:18.7pt" equationxml="&lt;?xml version=&quot;1.0&quot; encoding=&quot;UTF-8&quot; standalone=&quot;yes&quot;?&gt;&#10;&lt;?mso-application progid=&quot;Word.Document&quot;?&gt;&#10;&lt;w:wordDocument xmlns:aml=&quot;http://schemas.microsoft.com/aml/2001/core&quot; xmlns:wpc=&quot;http://schemas.microsoft.com/office/word/2010/wordprocessingCanvas&quot; xmlns:cx=&quot;http://schemas.microsoft.com/office/drawing/2014/chartex&quot; xmlns:cx1=&quot;http://schemas.microsoft.com/office/drawing/2015/9/8/chartex&quot; xmlns:cx2=&quot;http://schemas.microsoft.com/office/drawing/2015/10/21/chartex&quot; xmlns:cx3=&quot;http://schemas.microsoft.com/office/drawing/2016/5/9/chartex&quot; xmlns:cx4=&quot;http://schemas.microsoft.com/office/drawing/2016/5/10/chartex&quot; xmlns:cx5=&quot;http://schemas.microsoft.com/office/drawing/2016/5/11/chartex&quot; xmlns:cx6=&quot;http://schemas.microsoft.com/office/drawing/2016/5/12/chartex&quot; xmlns:cx7=&quot;http://schemas.microsoft.com/office/drawing/2016/5/13/chartex&quot; xmlns:cx8=&quot;http://schemas.microsoft.com/office/drawing/2016/5/14/chartex&quot; xmlns:cr=&quot;http://schemas.microsoft.com/office/comments/2020/reactions&quot; xmlns:dt=&quot;uuid:C2F41010-65B3-11d1-A29F-00AA00C14882&quot; xmlns:mc=&quot;http://schemas.openxmlformats.org/markup-compatibility/2006&quot; xmlns:aink=&quot;http://schemas.microsoft.com/office/drawing/2016/ink&quot; xmlns:am3d=&quot;http://schemas.microsoft.com/office/drawing/2017/model3d&quot; xmlns:o=&quot;urn:schemas-microsoft-com:office:office&quot; xmlns:oel=&quot;http://schemas.microsoft.com/office/2019/extlst&quot; xmlns:m=&quot;http://schemas.openxmlformats.org/officeDocument/2006/math&quot; xmlns:v=&quot;urn:schemas-microsoft-com:vml&quot; xmlns:w10=&quot;urn:schemas-microsoft-com:office:word&quot; xmlns:w=&quot;http://schemas.microsoft.com/office/word/2003/wordml&quot; xmlns:wx=&quot;http://schemas.microsoft.com/office/word/2003/auxHint&quot; xmlns:wne=&quot;http://schemas.microsoft.com/office/word/2006/wordml&quot; xmlns:wsp=&quot;http://schemas.microsoft.com/office/word/2003/wordml/sp2&quot; xmlns:sl=&quot;http://schemas.microsoft.com/schemaLibrary/2003/core&quot; w:macrosPresent=&quot;no&quot; w:embeddedObjPresent=&quot;no&quot; w:ocxPresent=&quot;no&quot; xml:space=&quot;preserve&quot;&gt;&lt;w:ignoreSubtree w:val=&quot;http://schemas.microsoft.com/office/word/2003/wordml/sp2&quot;/&gt;&lt;o:DocumentProperties&gt;&lt;o:Version&gt;16&lt;/o:Version&gt;&lt;/o:DocumentProperties&gt;&lt;w:docPr&gt;&lt;w:view w:val=&quot;print&quot;/&gt;&lt;w:zoom w:percent=&quot;100&quot;/&gt;&lt;w:doNotEmbedSystemFonts/&gt;&lt;w:activeWritingStyle w:lang=&quot;EN-AU&quot; w:vendorID=&quot;64&quot; w:dllVersion=&quot;6&quot; w:nlCheck=&quot;on&quot; w:optionSet=&quot;1&quot;/&gt;&lt;w:activeWritingStyle w:lang=&quot;EN-GB&quot; w:vendorID=&quot;64&quot; w:dllVersion=&quot;6&quot; w:nlCheck=&quot;on&quot; w:optionSet=&quot;1&quot;/&gt;&lt;w:activeWritingStyle w:lang=&quot;EN-US&quot; w:vendorID=&quot;64&quot; w:dllVersion=&quot;6&quot; w:nlCheck=&quot;on&quot; w:optionSet=&quot;1&quot;/&gt;&lt;w:activeWritingStyle w:lang=&quot;EN-AU&quot; w:vendorID=&quot;64&quot; w:dllVersion=&quot;0&quot; w:nlCheck=&quot;on&quot; w:optionSet=&quot;0&quot;/&gt;&lt;w:activeWritingStyle w:lang=&quot;EN-GB&quot; w:vendorID=&quot;64&quot; w:dllVersion=&quot;0&quot; w:nlCheck=&quot;on&quot; w:optionSet=&quot;0&quot;/&gt;&lt;w:activeWritingStyle w:lang=&quot;EN-US&quot; w:vendorID=&quot;64&quot; w:dllVersion=&quot;0&quot; w:nlCheck=&quot;on&quot; w:optionSet=&quot;0&quot;/&gt;&lt;w:activeWritingStyle w:lang=&quot;ES-AR&quot; w:vendorID=&quot;64&quot; w:dllVersion=&quot;0&quot; w:nlCheck=&quot;on&quot; w:optionSet=&quot;0&quot;/&gt;&lt;w:activeWritingStyle w:lang=&quot;580A&quot; w:vendorID=&quot;64&quot; w:dllVersion=&quot;0&quot; w:nlCheck=&quot;on&quot; w:optionSet=&quot;0&quot;/&gt;&lt;w:activeWritingStyle w:lang=&quot;PT-BR&quot; w:vendorID=&quot;64&quot; w:dllVersion=&quot;0&quot; w:nlCheck=&quot;on&quot; w:optionSet=&quot;0&quot;/&gt;&lt;w:stylePaneFormatFilter w:val=&quot;3F01&quot;/&gt;&lt;w:defaultTabStop w:val=&quot;720&quot;/&gt;&lt;w:hyphenationZone w:val=&quot;425&quot;/&gt;&lt;w:characterSpacingControl w:val=&quot;DontCompress&quot;/&gt;&lt;w:optimizeForBrowser/&gt;&lt;w:validateAgainstSchema/&gt;&lt;w:saveInvalidXML w:val=&quot;off&quot;/&gt;&lt;w:ignoreMixedContent w:val=&quot;off&quot;/&gt;&lt;w:alwaysShowPlaceholderText w:val=&quot;off&quot;/&gt;&lt;w:compat&gt;&lt;w:breakWrappedTables/&gt;&lt;w:snapToGridInCell/&gt;&lt;w:applyBreakingRules/&gt;&lt;w:wrapTextWithPunct/&gt;&lt;w:useAsianBreakRules/&gt;&lt;w:useWord2002TableStyleRules/&gt;&lt;w:useFELayout/&gt;&lt;/w:compat&gt;&lt;wsp:rsids&gt;&lt;wsp:rsidRoot wsp:val=&quot;00426FBB&quot;/&gt;&lt;wsp:rsid wsp:val=&quot;000002E1&quot;/&gt;&lt;wsp:rsid wsp:val=&quot;00003C97&quot;/&gt;&lt;wsp:rsid wsp:val=&quot;00005565&quot;/&gt;&lt;wsp:rsid wsp:val=&quot;0001754A&quot;/&gt;&lt;wsp:rsid wsp:val=&quot;00017719&quot;/&gt;&lt;wsp:rsid wsp:val=&quot;00027F1D&quot;/&gt;&lt;wsp:rsid wsp:val=&quot;0003296C&quot;/&gt;&lt;wsp:rsid wsp:val=&quot;0003351F&quot;/&gt;&lt;wsp:rsid wsp:val=&quot;00044599&quot;/&gt;&lt;wsp:rsid wsp:val=&quot;000540E6&quot;/&gt;&lt;wsp:rsid wsp:val=&quot;00054421&quot;/&gt;&lt;wsp:rsid wsp:val=&quot;00062E46&quot;/&gt;&lt;wsp:rsid wsp:val=&quot;00074AC8&quot;/&gt;&lt;wsp:rsid wsp:val=&quot;00081408&quot;/&gt;&lt;wsp:rsid wsp:val=&quot;00081EBE&quot;/&gt;&lt;wsp:rsid wsp:val=&quot;00086EDC&quot;/&gt;&lt;wsp:rsid wsp:val=&quot;000B36A3&quot;/&gt;&lt;wsp:rsid wsp:val=&quot;000C013C&quot;/&gt;&lt;wsp:rsid wsp:val=&quot;000E3F84&quot;/&gt;&lt;wsp:rsid wsp:val=&quot;001056DF&quot;/&gt;&lt;wsp:rsid wsp:val=&quot;0010789C&quot;/&gt;&lt;wsp:rsid wsp:val=&quot;00114025&quot;/&gt;&lt;wsp:rsid wsp:val=&quot;001160D2&quot;/&gt;&lt;wsp:rsid wsp:val=&quot;00120636&quot;/&gt;&lt;wsp:rsid wsp:val=&quot;001348A5&quot;/&gt;&lt;wsp:rsid wsp:val=&quot;00151B8E&quot;/&gt;&lt;wsp:rsid wsp:val=&quot;00182170&quot;/&gt;&lt;wsp:rsid wsp:val=&quot;001928FB&quot;/&gt;&lt;wsp:rsid wsp:val=&quot;00192BC7&quot;/&gt;&lt;wsp:rsid wsp:val=&quot;00195BE6&quot;/&gt;&lt;wsp:rsid wsp:val=&quot;001A50EA&quot;/&gt;&lt;wsp:rsid wsp:val=&quot;001F16CD&quot;/&gt;&lt;wsp:rsid wsp:val=&quot;001F47D2&quot;/&gt;&lt;wsp:rsid wsp:val=&quot;002029C8&quot;/&gt;&lt;wsp:rsid wsp:val=&quot;0022285A&quot;/&gt;&lt;wsp:rsid wsp:val=&quot;00224C61&quot;/&gt;&lt;wsp:rsid wsp:val=&quot;00256ABC&quot;/&gt;&lt;wsp:rsid wsp:val=&quot;0027227B&quot;/&gt;&lt;wsp:rsid wsp:val=&quot;00273AC7&quot;/&gt;&lt;wsp:rsid wsp:val=&quot;00273D2C&quot;/&gt;&lt;wsp:rsid wsp:val=&quot;00285ECD&quot;/&gt;&lt;wsp:rsid wsp:val=&quot;00290E1B&quot;/&gt;&lt;wsp:rsid wsp:val=&quot;00291B17&quot;/&gt;&lt;wsp:rsid wsp:val=&quot;00291BB3&quot;/&gt;&lt;wsp:rsid wsp:val=&quot;002A6742&quot;/&gt;&lt;wsp:rsid wsp:val=&quot;002C1A7F&quot;/&gt;&lt;wsp:rsid wsp:val=&quot;002C4239&quot;/&gt;&lt;wsp:rsid wsp:val=&quot;002C559D&quot;/&gt;&lt;wsp:rsid wsp:val=&quot;002D16AE&quot;/&gt;&lt;wsp:rsid wsp:val=&quot;002D2D42&quot;/&gt;&lt;wsp:rsid wsp:val=&quot;002F72D0&quot;/&gt;&lt;wsp:rsid wsp:val=&quot;002F7A4F&quot;/&gt;&lt;wsp:rsid wsp:val=&quot;003003AB&quot;/&gt;&lt;wsp:rsid wsp:val=&quot;00302C35&quot;/&gt;&lt;wsp:rsid wsp:val=&quot;00311C49&quot;/&gt;&lt;wsp:rsid wsp:val=&quot;0032119E&quot;/&gt;&lt;wsp:rsid wsp:val=&quot;00321304&quot;/&gt;&lt;wsp:rsid wsp:val=&quot;00324FC2&quot;/&gt;&lt;wsp:rsid wsp:val=&quot;003312CA&quot;/&gt;&lt;wsp:rsid wsp:val=&quot;00331F84&quot;/&gt;&lt;wsp:rsid wsp:val=&quot;0037721F&quot;/&gt;&lt;wsp:rsid wsp:val=&quot;003950A4&quot;/&gt;&lt;wsp:rsid wsp:val=&quot;003A1E7E&quot;/&gt;&lt;wsp:rsid wsp:val=&quot;003E2FDC&quot;/&gt;&lt;wsp:rsid wsp:val=&quot;003E3577&quot;/&gt;&lt;wsp:rsid wsp:val=&quot;003F3A61&quot;/&gt;&lt;wsp:rsid wsp:val=&quot;00410A5D&quot;/&gt;&lt;wsp:rsid wsp:val=&quot;00414909&quot;/&gt;&lt;wsp:rsid wsp:val=&quot;00416537&quot;/&gt;&lt;wsp:rsid wsp:val=&quot;00425A6A&quot;/&gt;&lt;wsp:rsid wsp:val=&quot;00426FBB&quot;/&gt;&lt;wsp:rsid wsp:val=&quot;00454542&quot;/&gt;&lt;wsp:rsid wsp:val=&quot;0047429A&quot;/&gt;&lt;wsp:rsid wsp:val=&quot;0048374C&quot;/&gt;&lt;wsp:rsid wsp:val=&quot;0048771D&quot;/&gt;&lt;wsp:rsid wsp:val=&quot;004A6605&quot;/&gt;&lt;wsp:rsid wsp:val=&quot;004C45FA&quot;/&gt;&lt;wsp:rsid wsp:val=&quot;004D35A3&quot;/&gt;&lt;wsp:rsid wsp:val=&quot;004E1BD8&quot;/&gt;&lt;wsp:rsid wsp:val=&quot;004E452A&quot;/&gt;&lt;wsp:rsid wsp:val=&quot;004E78E3&quot;/&gt;&lt;wsp:rsid wsp:val=&quot;004F2BFE&quot;/&gt;&lt;wsp:rsid wsp:val=&quot;004F63D3&quot;/&gt;&lt;wsp:rsid wsp:val=&quot;004F7DCF&quot;/&gt;&lt;wsp:rsid wsp:val=&quot;005004BF&quot;/&gt;&lt;wsp:rsid wsp:val=&quot;00502E89&quot;/&gt;&lt;wsp:rsid wsp:val=&quot;00506CFE&quot;/&gt;&lt;wsp:rsid wsp:val=&quot;00510E95&quot;/&gt;&lt;wsp:rsid wsp:val=&quot;005225C3&quot;/&gt;&lt;wsp:rsid wsp:val=&quot;00527D56&quot;/&gt;&lt;wsp:rsid wsp:val=&quot;0053221F&quot;/&gt;&lt;wsp:rsid wsp:val=&quot;0053590D&quot;/&gt;&lt;wsp:rsid wsp:val=&quot;00536FAE&quot;/&gt;&lt;wsp:rsid wsp:val=&quot;00542C85&quot;/&gt;&lt;wsp:rsid wsp:val=&quot;00553510&quot;/&gt;&lt;wsp:rsid wsp:val=&quot;00554186&quot;/&gt;&lt;wsp:rsid wsp:val=&quot;00585769&quot;/&gt;&lt;wsp:rsid wsp:val=&quot;00585C61&quot;/&gt;&lt;wsp:rsid wsp:val=&quot;00591130&quot;/&gt;&lt;wsp:rsid wsp:val=&quot;005A3F28&quot;/&gt;&lt;wsp:rsid wsp:val=&quot;005A40BE&quot;/&gt;&lt;wsp:rsid wsp:val=&quot;005B13E2&quot;/&gt;&lt;wsp:rsid wsp:val=&quot;005B47D7&quot;/&gt;&lt;wsp:rsid wsp:val=&quot;005C5526&quot;/&gt;&lt;wsp:rsid wsp:val=&quot;005C62C6&quot;/&gt;&lt;wsp:rsid wsp:val=&quot;005D7B9E&quot;/&gt;&lt;wsp:rsid wsp:val=&quot;005E112E&quot;/&gt;&lt;wsp:rsid wsp:val=&quot;005F0834&quot;/&gt;&lt;wsp:rsid wsp:val=&quot;005F68AB&quot;/&gt;&lt;wsp:rsid wsp:val=&quot;005F6DC3&quot;/&gt;&lt;wsp:rsid wsp:val=&quot;00601A8E&quot;/&gt;&lt;wsp:rsid wsp:val=&quot;0062033E&quot;/&gt;&lt;wsp:rsid wsp:val=&quot;00624482&quot;/&gt;&lt;wsp:rsid wsp:val=&quot;0064799C&quot;/&gt;&lt;wsp:rsid wsp:val=&quot;00654156&quot;/&gt;&lt;wsp:rsid wsp:val=&quot;006B47CA&quot;/&gt;&lt;wsp:rsid wsp:val=&quot;006C304C&quot;/&gt;&lt;wsp:rsid wsp:val=&quot;006C4511&quot;/&gt;&lt;wsp:rsid wsp:val=&quot;006C65F5&quot;/&gt;&lt;wsp:rsid wsp:val=&quot;006C7AAA&quot;/&gt;&lt;wsp:rsid wsp:val=&quot;006D1C2A&quot;/&gt;&lt;wsp:rsid wsp:val=&quot;006D264F&quot;/&gt;&lt;wsp:rsid wsp:val=&quot;006E2A8D&quot;/&gt;&lt;wsp:rsid wsp:val=&quot;006E7574&quot;/&gt;&lt;wsp:rsid wsp:val=&quot;00703430&quot;/&gt;&lt;wsp:rsid wsp:val=&quot;00703548&quot;/&gt;&lt;wsp:rsid wsp:val=&quot;00704E18&quot;/&gt;&lt;wsp:rsid wsp:val=&quot;007069BE&quot;/&gt;&lt;wsp:rsid wsp:val=&quot;00745C86&quot;/&gt;&lt;wsp:rsid wsp:val=&quot;00764603&quot;/&gt;&lt;wsp:rsid wsp:val=&quot;0076604D&quot;/&gt;&lt;wsp:rsid wsp:val=&quot;00790909&quot;/&gt;&lt;wsp:rsid wsp:val=&quot;007B1582&quot;/&gt;&lt;wsp:rsid wsp:val=&quot;007B5A07&quot;/&gt;&lt;wsp:rsid wsp:val=&quot;007C065D&quot;/&gt;&lt;wsp:rsid wsp:val=&quot;007D3E71&quot;/&gt;&lt;wsp:rsid wsp:val=&quot;007E5D6A&quot;/&gt;&lt;wsp:rsid wsp:val=&quot;007E645D&quot;/&gt;&lt;wsp:rsid wsp:val=&quot;007F75CA&quot;/&gt;&lt;wsp:rsid wsp:val=&quot;00821E08&quot;/&gt;&lt;wsp:rsid wsp:val=&quot;00834EFD&quot;/&gt;&lt;wsp:rsid wsp:val=&quot;00844B24&quot;/&gt;&lt;wsp:rsid wsp:val=&quot;0084515F&quot;/&gt;&lt;wsp:rsid wsp:val=&quot;0085092D&quot;/&gt;&lt;wsp:rsid wsp:val=&quot;00865414&quot;/&gt;&lt;wsp:rsid wsp:val=&quot;00877D4C&quot;/&gt;&lt;wsp:rsid wsp:val=&quot;00883903&quot;/&gt;&lt;wsp:rsid wsp:val=&quot;0089763B&quot;/&gt;&lt;wsp:rsid wsp:val=&quot;008B6AE3&quot;/&gt;&lt;wsp:rsid wsp:val=&quot;008C1332&quot;/&gt;&lt;wsp:rsid wsp:val=&quot;008D1045&quot;/&gt;&lt;wsp:rsid wsp:val=&quot;008E5996&quot;/&gt;&lt;wsp:rsid wsp:val=&quot;00901AE1&quot;/&gt;&lt;wsp:rsid wsp:val=&quot;00912F93&quot;/&gt;&lt;wsp:rsid wsp:val=&quot;009205B4&quot;/&gt;&lt;wsp:rsid wsp:val=&quot;00955B59&quot;/&gt;&lt;wsp:rsid wsp:val=&quot;00992262&quot;/&gt;&lt;wsp:rsid wsp:val=&quot;009926BC&quot;/&gt;&lt;wsp:rsid wsp:val=&quot;009A4319&quot;/&gt;&lt;wsp:rsid wsp:val=&quot;009A6C3F&quot;/&gt;&lt;wsp:rsid wsp:val=&quot;009B73F2&quot;/&gt;&lt;wsp:rsid wsp:val=&quot;009C12BD&quot;/&gt;&lt;wsp:rsid wsp:val=&quot;009C50FE&quot;/&gt;&lt;wsp:rsid wsp:val=&quot;009E49DD&quot;/&gt;&lt;wsp:rsid wsp:val=&quot;00A03E75&quot;/&gt;&lt;wsp:rsid wsp:val=&quot;00A20627&quot;/&gt;&lt;wsp:rsid wsp:val=&quot;00A22FE9&quot;/&gt;&lt;wsp:rsid wsp:val=&quot;00A31A44&quot;/&gt;&lt;wsp:rsid wsp:val=&quot;00A32BFA&quot;/&gt;&lt;wsp:rsid wsp:val=&quot;00A3325E&quot;/&gt;&lt;wsp:rsid wsp:val=&quot;00A45FCE&quot;/&gt;&lt;wsp:rsid wsp:val=&quot;00A75671&quot;/&gt;&lt;wsp:rsid wsp:val=&quot;00A773CC&quot;/&gt;&lt;wsp:rsid wsp:val=&quot;00A924D0&quot;/&gt;&lt;wsp:rsid wsp:val=&quot;00A9318B&quot;/&gt;&lt;wsp:rsid wsp:val=&quot;00A94AC1&quot;/&gt;&lt;wsp:rsid wsp:val=&quot;00AB18B7&quot;/&gt;&lt;wsp:rsid wsp:val=&quot;00AD335D&quot;/&gt;&lt;wsp:rsid wsp:val=&quot;00AF114C&quot;/&gt;&lt;wsp:rsid wsp:val=&quot;00AF792B&quot;/&gt;&lt;wsp:rsid wsp:val=&quot;00B33D2F&quot;/&gt;&lt;wsp:rsid wsp:val=&quot;00B40A5B&quot;/&gt;&lt;wsp:rsid wsp:val=&quot;00B45C6B&quot;/&gt;&lt;wsp:rsid wsp:val=&quot;00B55D5E&quot;/&gt;&lt;wsp:rsid wsp:val=&quot;00B57A80&quot;/&gt;&lt;wsp:rsid wsp:val=&quot;00B70E9C&quot;/&gt;&lt;wsp:rsid wsp:val=&quot;00B713D8&quot;/&gt;&lt;wsp:rsid wsp:val=&quot;00B72979&quot;/&gt;&lt;wsp:rsid wsp:val=&quot;00B94516&quot;/&gt;&lt;wsp:rsid wsp:val=&quot;00BA25E2&quot;/&gt;&lt;wsp:rsid wsp:val=&quot;00BB2855&quot;/&gt;&lt;wsp:rsid wsp:val=&quot;00BC5343&quot;/&gt;&lt;wsp:rsid wsp:val=&quot;00BD19C1&quot;/&gt;&lt;wsp:rsid wsp:val=&quot;00BD25B8&quot;/&gt;&lt;wsp:rsid wsp:val=&quot;00C012E1&quot;/&gt;&lt;wsp:rsid wsp:val=&quot;00C06BB4&quot;/&gt;&lt;wsp:rsid wsp:val=&quot;00C10D20&quot;/&gt;&lt;wsp:rsid wsp:val=&quot;00C12E0C&quot;/&gt;&lt;wsp:rsid wsp:val=&quot;00C21916&quot;/&gt;&lt;wsp:rsid wsp:val=&quot;00C34915&quot;/&gt;&lt;wsp:rsid wsp:val=&quot;00C457CA&quot;/&gt;&lt;wsp:rsid wsp:val=&quot;00C53FB6&quot;/&gt;&lt;wsp:rsid wsp:val=&quot;00C57FB7&quot;/&gt;&lt;wsp:rsid wsp:val=&quot;00C644D4&quot;/&gt;&lt;wsp:rsid wsp:val=&quot;00C65F3F&quot;/&gt;&lt;wsp:rsid wsp:val=&quot;00C72414&quot;/&gt;&lt;wsp:rsid wsp:val=&quot;00C72B1A&quot;/&gt;&lt;wsp:rsid wsp:val=&quot;00C8667B&quot;/&gt;&lt;wsp:rsid wsp:val=&quot;00C90993&quot;/&gt;&lt;wsp:rsid wsp:val=&quot;00CA4CE3&quot;/&gt;&lt;wsp:rsid wsp:val=&quot;00CC72FD&quot;/&gt;&lt;wsp:rsid wsp:val=&quot;00CD4F3F&quot;/&gt;&lt;wsp:rsid wsp:val=&quot;00D311F8&quot;/&gt;&lt;wsp:rsid wsp:val=&quot;00D31660&quot;/&gt;&lt;wsp:rsid wsp:val=&quot;00D36B52&quot;/&gt;&lt;wsp:rsid wsp:val=&quot;00D377C8&quot;/&gt;&lt;wsp:rsid wsp:val=&quot;00D41274&quot;/&gt;&lt;wsp:rsid wsp:val=&quot;00D4229C&quot;/&gt;&lt;wsp:rsid wsp:val=&quot;00D43BF3&quot;/&gt;&lt;wsp:rsid wsp:val=&quot;00D549FB&quot;/&gt;&lt;wsp:rsid wsp:val=&quot;00D767BB&quot;/&gt;&lt;wsp:rsid wsp:val=&quot;00D939B0&quot;/&gt;&lt;wsp:rsid wsp:val=&quot;00DA31A2&quot;/&gt;&lt;wsp:rsid wsp:val=&quot;00DB16E0&quot;/&gt;&lt;wsp:rsid wsp:val=&quot;00DB2DF9&quot;/&gt;&lt;wsp:rsid wsp:val=&quot;00DB465D&quot;/&gt;&lt;wsp:rsid wsp:val=&quot;00DB48A2&quot;/&gt;&lt;wsp:rsid wsp:val=&quot;00DB7E63&quot;/&gt;&lt;wsp:rsid wsp:val=&quot;00DC2055&quot;/&gt;&lt;wsp:rsid wsp:val=&quot;00DC3908&quot;/&gt;&lt;wsp:rsid wsp:val=&quot;00DD71E8&quot;/&gt;&lt;wsp:rsid wsp:val=&quot;00DD7F83&quot;/&gt;&lt;wsp:rsid wsp:val=&quot;00DE4EB8&quot;/&gt;&lt;wsp:rsid wsp:val=&quot;00E0641E&quot;/&gt;&lt;wsp:rsid wsp:val=&quot;00E06664&quot;/&gt;&lt;wsp:rsid wsp:val=&quot;00E304BC&quot;/&gt;&lt;wsp:rsid wsp:val=&quot;00E32853&quot;/&gt;&lt;wsp:rsid wsp:val=&quot;00E34EBD&quot;/&gt;&lt;wsp:rsid wsp:val=&quot;00E401F8&quot;/&gt;&lt;wsp:rsid wsp:val=&quot;00E46425&quot;/&gt;&lt;wsp:rsid wsp:val=&quot;00E469FC&quot;/&gt;&lt;wsp:rsid wsp:val=&quot;00E47D0E&quot;/&gt;&lt;wsp:rsid wsp:val=&quot;00E65018&quot;/&gt;&lt;wsp:rsid wsp:val=&quot;00E76CA1&quot;/&gt;&lt;wsp:rsid wsp:val=&quot;00E94339&quot;/&gt;&lt;wsp:rsid wsp:val=&quot;00E97563&quot;/&gt;&lt;wsp:rsid wsp:val=&quot;00EB0B63&quot;/&gt;&lt;wsp:rsid wsp:val=&quot;00EC265C&quot;/&gt;&lt;wsp:rsid wsp:val=&quot;00ED61CB&quot;/&gt;&lt;wsp:rsid wsp:val=&quot;00EE752A&quot;/&gt;&lt;wsp:rsid wsp:val=&quot;00F06A72&quot;/&gt;&lt;wsp:rsid wsp:val=&quot;00F136F0&quot;/&gt;&lt;wsp:rsid wsp:val=&quot;00F20BBB&quot;/&gt;&lt;wsp:rsid wsp:val=&quot;00F36048&quot;/&gt;&lt;wsp:rsid wsp:val=&quot;00F43BD8&quot;/&gt;&lt;wsp:rsid wsp:val=&quot;00F562F3&quot;/&gt;&lt;wsp:rsid wsp:val=&quot;00F74B89&quot;/&gt;&lt;wsp:rsid wsp:val=&quot;00F75133&quot;/&gt;&lt;wsp:rsid wsp:val=&quot;00F83272&quot;/&gt;&lt;wsp:rsid wsp:val=&quot;00F9358D&quot;/&gt;&lt;wsp:rsid wsp:val=&quot;00FA3899&quot;/&gt;&lt;wsp:rsid wsp:val=&quot;00FA4909&quot;/&gt;&lt;wsp:rsid wsp:val=&quot;00FA5164&quot;/&gt;&lt;wsp:rsid wsp:val=&quot;00FA6751&quot;/&gt;&lt;wsp:rsid wsp:val=&quot;00FA6BD7&quot;/&gt;&lt;wsp:rsid wsp:val=&quot;00FB1048&quot;/&gt;&lt;wsp:rsid wsp:val=&quot;00FB62C4&quot;/&gt;&lt;wsp:rsid wsp:val=&quot;00FB7701&quot;/&gt;&lt;wsp:rsid wsp:val=&quot;00FD1AC5&quot;/&gt;&lt;wsp:rsid wsp:val=&quot;00FD5CF0&quot;/&gt;&lt;/wsp:rsids&gt;&lt;/w:docPr&gt;&lt;w:body&gt;&lt;wx:sect&gt;&lt;w:p wsp:rsidR=&quot;0053590D&quot; wsp:rsidRPr=&quot;0053590D&quot; wsp:rsidRDefault=&quot;0053590D&quot; wsp:rsidP=&quot;0053590D&quot;&gt;&lt;m:oMathPara&gt;&lt;m:oMath&gt;&lt;m:sSub&gt;&lt;m:sSubPr&gt;&lt;m:ctrlPr&gt;&lt;w:rPr&gt;&lt;w:rFonts w:ascii=&quot;Cambria Math&quot; w:h-ansi=&quot;Cambria Math&quot;/&gt;&lt;wx:font wx:val=&quot;Cambria Math&quot;/&gt;&lt;w:i/&gt;&lt;w:sz w:val=&quot;32&quot;/&gt;&lt;w:sz-cs w:val=&quot;32&quot;/&gt;&lt;/w:rPr&gt;&lt;/m:ctrlPr&gt;&lt;/m:sSubPr&gt;&lt;m:e&gt;&lt;m:r&gt;&lt;w:rPr&gt;&lt;w:rFonts w:ascii=&quot;Cambria Math&quot; w:h-ansi=&quot;Cambria Math&quot;/&gt;&lt;wx:font wx:val=&quot;Cambria Math&quot;/&gt;&lt;w:i/&gt;&lt;w:sz w:val=&quot;32&quot;/&gt;&lt;w:sz-cs w:val=&quot;32&quot;/&gt;&lt;/w:rPr&gt;&lt;m:t&gt;V&lt;/m:t&gt;&lt;/m:r&gt;&lt;/m:e&gt;&lt;m:sub&gt;&lt;m:r&gt;&lt;w:rPr&gt;&lt;w:rFonts w:ascii=&quot;Cambria Math&quot; w:h-ansi=&quot;Cambria Math&quot;/&gt;&lt;wx:font wx:val=&quot;Cambria Math&quot;/&gt;&lt;w:i/&gt;&lt;w:sz w:val=&quot;32&quot;/&gt;&lt;w:sz-cs w:val=&quot;32&quot;/&gt;&lt;/w:rPr&gt;&lt;m:t&gt;out&lt;/m:t&gt;&lt;/m:r&gt;&lt;/m:sub&gt;&lt;/m:sSub&gt;&lt;m:r&gt;&lt;w:rPr&gt;&lt;w:rFonts w:ascii=&quot;Cambria Math&quot; w:h-ansi=&quot;Cambria Math&quot;/&gt;&lt;wx:font wx:val=&quot;Cambria Math&quot;/&gt;&lt;w:i/&gt;&lt;w:sz w:val=&quot;32&quot;/&gt;&lt;w:sz-cs w:val=&quot;32&quot;/&gt;&lt;/w:rPr&gt;&lt;m:t&gt;=Dâˆ™&lt;/m:t&gt;&lt;/m:r&gt;&lt;m:sSub&gt;&lt;m:sSubPr&gt;&lt;m:ctrlPr&gt;&lt;w:rPr&gt;&lt;w:rFonts w:ascii=&quot;Cambria Math&quot; w:h-ansi=&quot;Cambria Math&quot;/&gt;&lt;wx:font wx:val=&quot;Cambria Math&quot;/&gt;&lt;w:i/&gt;&lt;w:sz w:val=&quot;32&quot;/&gt;&lt;w:sz-cs w:val=&quot;32&quot;/&gt;&lt;/w:rPr&gt;&lt;/m:ctrlPr&gt;&lt;/m:sSubPr&gt;&lt;m:e&gt;&lt;m:r&gt;&lt;w:rPr&gt;&lt;w:rFonts w:ascii=&quot;Cambria Math&quot; w:h-ansi=&quot;Cambria Math&quot;/&gt;&lt;wx:font wx:val=&quot;Cambria Math&quot;/&gt;&lt;w:i/&gt;&lt;w:sz w:val=&quot;32&quot;/&gt;&lt;w:sz-cs w:val=&quot;32&quot;/&gt;&lt;/w:rPr&gt;&lt;m:t&gt;V&lt;/m:t&gt;&lt;/m:r&gt;&lt;/m:e&gt;&lt;m:sub&gt;&lt;m:r&gt;&lt;w:rPr&gt;&lt;w:rFonts w:ascii=&quot;Cambria Math&quot; w:h-ansi=&quot;Cambria Math&quot;/&gt;&lt;wx:font wx:val=&quot;Cambria Math&quot;/&gt;&lt;w:i/&gt;&lt;w:sz w:val=&quot;32&quot;/&gt;&lt;w:sz-cs w:val=&quot;32&quot;/&gt;&lt;/w:rPr&gt;&lt;m:t&gt;in&lt;/m:t&gt;&lt;/m:r&gt;&lt;/m:sub&gt;&lt;/m:sSub&gt;&lt;/m:oMath&gt;&lt;/m:oMathPara&gt;&lt;/w:p&gt;&lt;w:sectPr wsp:rsidR=&quot;00000000&quot; wsp:rsidRPr=&quot;0053590D&quot;&gt;&lt;w:pgSz w:w=&quot;12240&quot; w:h=&quot;15840&quot;/&gt;&lt;w:pgMar w:top=&quot;1440&quot; w:right=&quot;1440&quot; w:bottom=&quot;1440&quot; w:left=&quot;1440&quot; w:header=&quot;720&quot; w:footer=&quot;720&quot; w:gutter=&quot;0&quot;/&gt;&lt;w:cols w:space=&quot;720&quot;/&gt;&lt;/w:sectPr&gt;&lt;/wx:sect&gt;&lt;/w:body&gt;&lt;/w:wordDocument&gt;">
             <v:imagedata r:id="rId16" o:title="" chromakey="white"/>
           </v:shape>
         </w:pict>
@@ -1139,7 +1139,7 @@
           <w:szCs w:val="20"/>
         </w:rPr>
         <w:pict w14:anchorId="51D851BC">
-          <v:shape id="_x0000_i1069" type="#_x0000_t75" style="width:8.2pt;height:13.65pt" equationxml="&lt;?xml version=&quot;1.0&quot; encoding=&quot;UTF-8&quot; standalone=&quot;yes&quot;?&gt;&#10;&lt;?mso-application progid=&quot;Word.Document&quot;?&gt;&#10;&lt;w:wordDocument xmlns:aml=&quot;http://schemas.microsoft.com/aml/2001/core&quot; xmlns:wpc=&quot;http://schemas.microsoft.com/office/word/2010/wordprocessingCanvas&quot; xmlns:cx=&quot;http://schemas.microsoft.com/office/drawing/2014/chartex&quot; xmlns:cx1=&quot;http://schemas.microsoft.com/office/drawing/2015/9/8/chartex&quot; xmlns:cx2=&quot;http://schemas.microsoft.com/office/drawing/2015/10/21/chartex&quot; xmlns:cx3=&quot;http://schemas.microsoft.com/office/drawing/2016/5/9/chartex&quot; xmlns:cx4=&quot;http://schemas.microsoft.com/office/drawing/2016/5/10/chartex&quot; xmlns:cx5=&quot;http://schemas.microsoft.com/office/drawing/2016/5/11/chartex&quot; xmlns:cx6=&quot;http://schemas.microsoft.com/office/drawing/2016/5/12/chartex&quot; xmlns:cx7=&quot;http://schemas.microsoft.com/office/drawing/2016/5/13/chartex&quot; xmlns:cx8=&quot;http://schemas.microsoft.com/office/drawing/2016/5/14/chartex&quot; xmlns:cr=&quot;http://schemas.microsoft.com/office/comments/2020/reactions&quot; xmlns:dt=&quot;uuid:C2F41010-65B3-11d1-A29F-00AA00C14882&quot; xmlns:mc=&quot;http://schemas.openxmlformats.org/markup-compatibility/2006&quot; xmlns:aink=&quot;http://schemas.microsoft.com/office/drawing/2016/ink&quot; xmlns:am3d=&quot;http://schemas.microsoft.com/office/drawing/2017/model3d&quot; xmlns:o=&quot;urn:schemas-microsoft-com:office:office&quot; xmlns:oel=&quot;http://schemas.microsoft.com/office/2019/extlst&quot; xmlns:m=&quot;http://schemas.openxmlformats.org/officeDocument/2006/math&quot; xmlns:v=&quot;urn:schemas-microsoft-com:vml&quot; xmlns:w10=&quot;urn:schemas-microsoft-com:office:word&quot; xmlns:w=&quot;http://schemas.microsoft.com/office/word/2003/wordml&quot; xmlns:wx=&quot;http://schemas.microsoft.com/office/word/2003/auxHint&quot; xmlns:wne=&quot;http://schemas.microsoft.com/office/word/2006/wordml&quot; xmlns:wsp=&quot;http://schemas.microsoft.com/office/word/2003/wordml/sp2&quot; xmlns:sl=&quot;http://schemas.microsoft.com/schemaLibrary/2003/core&quot; w:macrosPresent=&quot;no&quot; w:embeddedObjPresent=&quot;no&quot; w:ocxPresent=&quot;no&quot; xml:space=&quot;preserve&quot;&gt;&lt;w:ignoreSubtree w:val=&quot;http://schemas.microsoft.com/office/word/2003/wordml/sp2&quot;/&gt;&lt;o:DocumentProperties&gt;&lt;o:Version&gt;16&lt;/o:Version&gt;&lt;/o:DocumentProperties&gt;&lt;w:docPr&gt;&lt;w:view w:val=&quot;print&quot;/&gt;&lt;w:zoom w:percent=&quot;100&quot;/&gt;&lt;w:doNotEmbedSystemFonts/&gt;&lt;w:activeWritingStyle w:lang=&quot;EN-AU&quot; w:vendorID=&quot;64&quot; w:dllVersion=&quot;6&quot; w:nlCheck=&quot;on&quot; w:optionSet=&quot;1&quot;/&gt;&lt;w:activeWritingStyle w:lang=&quot;EN-GB&quot; w:vendorID=&quot;64&quot; w:dllVersion=&quot;6&quot; w:nlCheck=&quot;on&quot; w:optionSet=&quot;1&quot;/&gt;&lt;w:activeWritingStyle w:lang=&quot;EN-US&quot; w:vendorID=&quot;64&quot; w:dllVersion=&quot;6&quot; w:nlCheck=&quot;on&quot; w:optionSet=&quot;1&quot;/&gt;&lt;w:activeWritingStyle w:lang=&quot;EN-AU&quot; w:vendorID=&quot;64&quot; w:dllVersion=&quot;0&quot; w:nlCheck=&quot;on&quot; w:optionSet=&quot;0&quot;/&gt;&lt;w:activeWritingStyle w:lang=&quot;EN-GB&quot; w:vendorID=&quot;64&quot; w:dllVersion=&quot;0&quot; w:nlCheck=&quot;on&quot; w:optionSet=&quot;0&quot;/&gt;&lt;w:activeWritingStyle w:lang=&quot;EN-US&quot; w:vendorID=&quot;64&quot; w:dllVersion=&quot;0&quot; w:nlCheck=&quot;on&quot; w:optionSet=&quot;0&quot;/&gt;&lt;w:activeWritingStyle w:lang=&quot;ES-AR&quot; w:vendorID=&quot;64&quot; w:dllVersion=&quot;0&quot; w:nlCheck=&quot;on&quot; w:optionSet=&quot;0&quot;/&gt;&lt;w:activeWritingStyle w:lang=&quot;580A&quot; w:vendorID=&quot;64&quot; w:dllVersion=&quot;0&quot; w:nlCheck=&quot;on&quot; w:optionSet=&quot;0&quot;/&gt;&lt;w:activeWritingStyle w:lang=&quot;PT-BR&quot; w:vendorID=&quot;64&quot; w:dllVersion=&quot;0&quot; w:nlCheck=&quot;on&quot; w:optionSet=&quot;0&quot;/&gt;&lt;w:stylePaneFormatFilter w:val=&quot;3F01&quot;/&gt;&lt;w:defaultTabStop w:val=&quot;720&quot;/&gt;&lt;w:hyphenationZone w:val=&quot;425&quot;/&gt;&lt;w:characterSpacingControl w:val=&quot;DontCompress&quot;/&gt;&lt;w:optimizeForBrowser/&gt;&lt;w:validateAgainstSchema/&gt;&lt;w:saveInvalidXML w:val=&quot;off&quot;/&gt;&lt;w:ignoreMixedContent w:val=&quot;off&quot;/&gt;&lt;w:alwaysShowPlaceholderText w:val=&quot;off&quot;/&gt;&lt;w:compat&gt;&lt;w:breakWrappedTables/&gt;&lt;w:snapToGridInCell/&gt;&lt;w:applyBreakingRules/&gt;&lt;w:wrapTextWithPunct/&gt;&lt;w:useAsianBreakRules/&gt;&lt;w:useWord2002TableStyleRules/&gt;&lt;w:useFELayout/&gt;&lt;/w:compat&gt;&lt;wsp:rsids&gt;&lt;wsp:rsidRoot wsp:val=&quot;00426FBB&quot;/&gt;&lt;wsp:rsid wsp:val=&quot;000002E1&quot;/&gt;&lt;wsp:rsid wsp:val=&quot;00003C97&quot;/&gt;&lt;wsp:rsid wsp:val=&quot;00005565&quot;/&gt;&lt;wsp:rsid wsp:val=&quot;0001754A&quot;/&gt;&lt;wsp:rsid wsp:val=&quot;00017719&quot;/&gt;&lt;wsp:rsid wsp:val=&quot;00027F1D&quot;/&gt;&lt;wsp:rsid wsp:val=&quot;0003296C&quot;/&gt;&lt;wsp:rsid wsp:val=&quot;0003351F&quot;/&gt;&lt;wsp:rsid wsp:val=&quot;00044599&quot;/&gt;&lt;wsp:rsid wsp:val=&quot;000540E6&quot;/&gt;&lt;wsp:rsid wsp:val=&quot;00054421&quot;/&gt;&lt;wsp:rsid wsp:val=&quot;00062E46&quot;/&gt;&lt;wsp:rsid wsp:val=&quot;00074AC8&quot;/&gt;&lt;wsp:rsid wsp:val=&quot;00081408&quot;/&gt;&lt;wsp:rsid wsp:val=&quot;00081EBE&quot;/&gt;&lt;wsp:rsid wsp:val=&quot;00086EDC&quot;/&gt;&lt;wsp:rsid wsp:val=&quot;000B36A3&quot;/&gt;&lt;wsp:rsid wsp:val=&quot;000C013C&quot;/&gt;&lt;wsp:rsid wsp:val=&quot;000E3F84&quot;/&gt;&lt;wsp:rsid wsp:val=&quot;001056DF&quot;/&gt;&lt;wsp:rsid wsp:val=&quot;0010789C&quot;/&gt;&lt;wsp:rsid wsp:val=&quot;00114025&quot;/&gt;&lt;wsp:rsid wsp:val=&quot;001160D2&quot;/&gt;&lt;wsp:rsid wsp:val=&quot;00120636&quot;/&gt;&lt;wsp:rsid wsp:val=&quot;001348A5&quot;/&gt;&lt;wsp:rsid wsp:val=&quot;00151B8E&quot;/&gt;&lt;wsp:rsid wsp:val=&quot;00182170&quot;/&gt;&lt;wsp:rsid wsp:val=&quot;001928FB&quot;/&gt;&lt;wsp:rsid wsp:val=&quot;00192BC7&quot;/&gt;&lt;wsp:rsid wsp:val=&quot;00195BE6&quot;/&gt;&lt;wsp:rsid wsp:val=&quot;001A50EA&quot;/&gt;&lt;wsp:rsid wsp:val=&quot;001F16CD&quot;/&gt;&lt;wsp:rsid wsp:val=&quot;001F47D2&quot;/&gt;&lt;wsp:rsid wsp:val=&quot;002029C8&quot;/&gt;&lt;wsp:rsid wsp:val=&quot;0022285A&quot;/&gt;&lt;wsp:rsid wsp:val=&quot;00224C61&quot;/&gt;&lt;wsp:rsid wsp:val=&quot;00256ABC&quot;/&gt;&lt;wsp:rsid wsp:val=&quot;0027227B&quot;/&gt;&lt;wsp:rsid wsp:val=&quot;00273AC7&quot;/&gt;&lt;wsp:rsid wsp:val=&quot;00273D2C&quot;/&gt;&lt;wsp:rsid wsp:val=&quot;00285ECD&quot;/&gt;&lt;wsp:rsid wsp:val=&quot;00290E1B&quot;/&gt;&lt;wsp:rsid wsp:val=&quot;00291B17&quot;/&gt;&lt;wsp:rsid wsp:val=&quot;00291BB3&quot;/&gt;&lt;wsp:rsid wsp:val=&quot;002A6742&quot;/&gt;&lt;wsp:rsid wsp:val=&quot;002C1A7F&quot;/&gt;&lt;wsp:rsid wsp:val=&quot;002C4239&quot;/&gt;&lt;wsp:rsid wsp:val=&quot;002C559D&quot;/&gt;&lt;wsp:rsid wsp:val=&quot;002D16AE&quot;/&gt;&lt;wsp:rsid wsp:val=&quot;002D2D42&quot;/&gt;&lt;wsp:rsid wsp:val=&quot;002F72D0&quot;/&gt;&lt;wsp:rsid wsp:val=&quot;002F7A4F&quot;/&gt;&lt;wsp:rsid wsp:val=&quot;003003AB&quot;/&gt;&lt;wsp:rsid wsp:val=&quot;00302C35&quot;/&gt;&lt;wsp:rsid wsp:val=&quot;00311C49&quot;/&gt;&lt;wsp:rsid wsp:val=&quot;0032119E&quot;/&gt;&lt;wsp:rsid wsp:val=&quot;00321304&quot;/&gt;&lt;wsp:rsid wsp:val=&quot;00324FC2&quot;/&gt;&lt;wsp:rsid wsp:val=&quot;003312CA&quot;/&gt;&lt;wsp:rsid wsp:val=&quot;00331F84&quot;/&gt;&lt;wsp:rsid wsp:val=&quot;0037721F&quot;/&gt;&lt;wsp:rsid wsp:val=&quot;003950A4&quot;/&gt;&lt;wsp:rsid wsp:val=&quot;003A1E7E&quot;/&gt;&lt;wsp:rsid wsp:val=&quot;003E2FDC&quot;/&gt;&lt;wsp:rsid wsp:val=&quot;003E3577&quot;/&gt;&lt;wsp:rsid wsp:val=&quot;003F3A61&quot;/&gt;&lt;wsp:rsid wsp:val=&quot;00410A5D&quot;/&gt;&lt;wsp:rsid wsp:val=&quot;00414909&quot;/&gt;&lt;wsp:rsid wsp:val=&quot;00416537&quot;/&gt;&lt;wsp:rsid wsp:val=&quot;00425A6A&quot;/&gt;&lt;wsp:rsid wsp:val=&quot;00426FBB&quot;/&gt;&lt;wsp:rsid wsp:val=&quot;00454542&quot;/&gt;&lt;wsp:rsid wsp:val=&quot;0047429A&quot;/&gt;&lt;wsp:rsid wsp:val=&quot;0048374C&quot;/&gt;&lt;wsp:rsid wsp:val=&quot;0048771D&quot;/&gt;&lt;wsp:rsid wsp:val=&quot;004A6605&quot;/&gt;&lt;wsp:rsid wsp:val=&quot;004C45FA&quot;/&gt;&lt;wsp:rsid wsp:val=&quot;004D35A3&quot;/&gt;&lt;wsp:rsid wsp:val=&quot;004E1BD8&quot;/&gt;&lt;wsp:rsid wsp:val=&quot;004E452A&quot;/&gt;&lt;wsp:rsid wsp:val=&quot;004E78E3&quot;/&gt;&lt;wsp:rsid wsp:val=&quot;004F2BFE&quot;/&gt;&lt;wsp:rsid wsp:val=&quot;004F63D3&quot;/&gt;&lt;wsp:rsid wsp:val=&quot;004F7DCF&quot;/&gt;&lt;wsp:rsid wsp:val=&quot;005004BF&quot;/&gt;&lt;wsp:rsid wsp:val=&quot;00502E89&quot;/&gt;&lt;wsp:rsid wsp:val=&quot;00506CFE&quot;/&gt;&lt;wsp:rsid wsp:val=&quot;00510E95&quot;/&gt;&lt;wsp:rsid wsp:val=&quot;005225C3&quot;/&gt;&lt;wsp:rsid wsp:val=&quot;00527D56&quot;/&gt;&lt;wsp:rsid wsp:val=&quot;0053221F&quot;/&gt;&lt;wsp:rsid wsp:val=&quot;00536FAE&quot;/&gt;&lt;wsp:rsid wsp:val=&quot;00542C85&quot;/&gt;&lt;wsp:rsid wsp:val=&quot;00553510&quot;/&gt;&lt;wsp:rsid wsp:val=&quot;00554186&quot;/&gt;&lt;wsp:rsid wsp:val=&quot;00585769&quot;/&gt;&lt;wsp:rsid wsp:val=&quot;00585C61&quot;/&gt;&lt;wsp:rsid wsp:val=&quot;00591130&quot;/&gt;&lt;wsp:rsid wsp:val=&quot;005A3F28&quot;/&gt;&lt;wsp:rsid wsp:val=&quot;005A40BE&quot;/&gt;&lt;wsp:rsid wsp:val=&quot;005B13E2&quot;/&gt;&lt;wsp:rsid wsp:val=&quot;005B47D7&quot;/&gt;&lt;wsp:rsid wsp:val=&quot;005C5526&quot;/&gt;&lt;wsp:rsid wsp:val=&quot;005C62C6&quot;/&gt;&lt;wsp:rsid wsp:val=&quot;005D7B9E&quot;/&gt;&lt;wsp:rsid wsp:val=&quot;005E112E&quot;/&gt;&lt;wsp:rsid wsp:val=&quot;005F0834&quot;/&gt;&lt;wsp:rsid wsp:val=&quot;005F68AB&quot;/&gt;&lt;wsp:rsid wsp:val=&quot;005F6DC3&quot;/&gt;&lt;wsp:rsid wsp:val=&quot;00601A8E&quot;/&gt;&lt;wsp:rsid wsp:val=&quot;0062033E&quot;/&gt;&lt;wsp:rsid wsp:val=&quot;00624482&quot;/&gt;&lt;wsp:rsid wsp:val=&quot;0064799C&quot;/&gt;&lt;wsp:rsid wsp:val=&quot;00654156&quot;/&gt;&lt;wsp:rsid wsp:val=&quot;006B47CA&quot;/&gt;&lt;wsp:rsid wsp:val=&quot;006C304C&quot;/&gt;&lt;wsp:rsid wsp:val=&quot;006C4511&quot;/&gt;&lt;wsp:rsid wsp:val=&quot;006C65F5&quot;/&gt;&lt;wsp:rsid wsp:val=&quot;006C7AAA&quot;/&gt;&lt;wsp:rsid wsp:val=&quot;006D1C2A&quot;/&gt;&lt;wsp:rsid wsp:val=&quot;006D264F&quot;/&gt;&lt;wsp:rsid wsp:val=&quot;006E2A8D&quot;/&gt;&lt;wsp:rsid wsp:val=&quot;006E7574&quot;/&gt;&lt;wsp:rsid wsp:val=&quot;00703430&quot;/&gt;&lt;wsp:rsid wsp:val=&quot;00703548&quot;/&gt;&lt;wsp:rsid wsp:val=&quot;00704E18&quot;/&gt;&lt;wsp:rsid wsp:val=&quot;007069BE&quot;/&gt;&lt;wsp:rsid wsp:val=&quot;00745C86&quot;/&gt;&lt;wsp:rsid wsp:val=&quot;00764603&quot;/&gt;&lt;wsp:rsid wsp:val=&quot;0076604D&quot;/&gt;&lt;wsp:rsid wsp:val=&quot;00790909&quot;/&gt;&lt;wsp:rsid wsp:val=&quot;007B1582&quot;/&gt;&lt;wsp:rsid wsp:val=&quot;007B5A07&quot;/&gt;&lt;wsp:rsid wsp:val=&quot;007C065D&quot;/&gt;&lt;wsp:rsid wsp:val=&quot;007D3E71&quot;/&gt;&lt;wsp:rsid wsp:val=&quot;007E5D6A&quot;/&gt;&lt;wsp:rsid wsp:val=&quot;007E645D&quot;/&gt;&lt;wsp:rsid wsp:val=&quot;007F75CA&quot;/&gt;&lt;wsp:rsid wsp:val=&quot;00814676&quot;/&gt;&lt;wsp:rsid wsp:val=&quot;00821E08&quot;/&gt;&lt;wsp:rsid wsp:val=&quot;00834EFD&quot;/&gt;&lt;wsp:rsid wsp:val=&quot;00844B24&quot;/&gt;&lt;wsp:rsid wsp:val=&quot;0084515F&quot;/&gt;&lt;wsp:rsid wsp:val=&quot;0085092D&quot;/&gt;&lt;wsp:rsid wsp:val=&quot;00865414&quot;/&gt;&lt;wsp:rsid wsp:val=&quot;00877D4C&quot;/&gt;&lt;wsp:rsid wsp:val=&quot;00883903&quot;/&gt;&lt;wsp:rsid wsp:val=&quot;0089763B&quot;/&gt;&lt;wsp:rsid wsp:val=&quot;008B6AE3&quot;/&gt;&lt;wsp:rsid wsp:val=&quot;008C1332&quot;/&gt;&lt;wsp:rsid wsp:val=&quot;008D1045&quot;/&gt;&lt;wsp:rsid wsp:val=&quot;008E5996&quot;/&gt;&lt;wsp:rsid wsp:val=&quot;00901AE1&quot;/&gt;&lt;wsp:rsid wsp:val=&quot;00912F93&quot;/&gt;&lt;wsp:rsid wsp:val=&quot;009205B4&quot;/&gt;&lt;wsp:rsid wsp:val=&quot;00955B59&quot;/&gt;&lt;wsp:rsid wsp:val=&quot;00992262&quot;/&gt;&lt;wsp:rsid wsp:val=&quot;009926BC&quot;/&gt;&lt;wsp:rsid wsp:val=&quot;009A4319&quot;/&gt;&lt;wsp:rsid wsp:val=&quot;009A6C3F&quot;/&gt;&lt;wsp:rsid wsp:val=&quot;009B73F2&quot;/&gt;&lt;wsp:rsid wsp:val=&quot;009C12BD&quot;/&gt;&lt;wsp:rsid wsp:val=&quot;009C50FE&quot;/&gt;&lt;wsp:rsid wsp:val=&quot;009E49DD&quot;/&gt;&lt;wsp:rsid wsp:val=&quot;00A03E75&quot;/&gt;&lt;wsp:rsid wsp:val=&quot;00A20627&quot;/&gt;&lt;wsp:rsid wsp:val=&quot;00A22FE9&quot;/&gt;&lt;wsp:rsid wsp:val=&quot;00A31A44&quot;/&gt;&lt;wsp:rsid wsp:val=&quot;00A32BFA&quot;/&gt;&lt;wsp:rsid wsp:val=&quot;00A3325E&quot;/&gt;&lt;wsp:rsid wsp:val=&quot;00A45FCE&quot;/&gt;&lt;wsp:rsid wsp:val=&quot;00A75671&quot;/&gt;&lt;wsp:rsid wsp:val=&quot;00A773CC&quot;/&gt;&lt;wsp:rsid wsp:val=&quot;00A924D0&quot;/&gt;&lt;wsp:rsid wsp:val=&quot;00A9318B&quot;/&gt;&lt;wsp:rsid wsp:val=&quot;00A94AC1&quot;/&gt;&lt;wsp:rsid wsp:val=&quot;00AB18B7&quot;/&gt;&lt;wsp:rsid wsp:val=&quot;00AD335D&quot;/&gt;&lt;wsp:rsid wsp:val=&quot;00AF114C&quot;/&gt;&lt;wsp:rsid wsp:val=&quot;00AF792B&quot;/&gt;&lt;wsp:rsid wsp:val=&quot;00B33D2F&quot;/&gt;&lt;wsp:rsid wsp:val=&quot;00B40A5B&quot;/&gt;&lt;wsp:rsid wsp:val=&quot;00B45C6B&quot;/&gt;&lt;wsp:rsid wsp:val=&quot;00B55D5E&quot;/&gt;&lt;wsp:rsid wsp:val=&quot;00B57A80&quot;/&gt;&lt;wsp:rsid wsp:val=&quot;00B70E9C&quot;/&gt;&lt;wsp:rsid wsp:val=&quot;00B713D8&quot;/&gt;&lt;wsp:rsid wsp:val=&quot;00B72979&quot;/&gt;&lt;wsp:rsid wsp:val=&quot;00B94516&quot;/&gt;&lt;wsp:rsid wsp:val=&quot;00BA25E2&quot;/&gt;&lt;wsp:rsid wsp:val=&quot;00BB2855&quot;/&gt;&lt;wsp:rsid wsp:val=&quot;00BC5343&quot;/&gt;&lt;wsp:rsid wsp:val=&quot;00BD19C1&quot;/&gt;&lt;wsp:rsid wsp:val=&quot;00BD25B8&quot;/&gt;&lt;wsp:rsid wsp:val=&quot;00C012E1&quot;/&gt;&lt;wsp:rsid wsp:val=&quot;00C06BB4&quot;/&gt;&lt;wsp:rsid wsp:val=&quot;00C10D20&quot;/&gt;&lt;wsp:rsid wsp:val=&quot;00C12E0C&quot;/&gt;&lt;wsp:rsid wsp:val=&quot;00C21916&quot;/&gt;&lt;wsp:rsid wsp:val=&quot;00C34915&quot;/&gt;&lt;wsp:rsid wsp:val=&quot;00C457CA&quot;/&gt;&lt;wsp:rsid wsp:val=&quot;00C53FB6&quot;/&gt;&lt;wsp:rsid wsp:val=&quot;00C57FB7&quot;/&gt;&lt;wsp:rsid wsp:val=&quot;00C644D4&quot;/&gt;&lt;wsp:rsid wsp:val=&quot;00C65F3F&quot;/&gt;&lt;wsp:rsid wsp:val=&quot;00C72414&quot;/&gt;&lt;wsp:rsid wsp:val=&quot;00C72B1A&quot;/&gt;&lt;wsp:rsid wsp:val=&quot;00C8667B&quot;/&gt;&lt;wsp:rsid wsp:val=&quot;00C90993&quot;/&gt;&lt;wsp:rsid wsp:val=&quot;00CA4CE3&quot;/&gt;&lt;wsp:rsid wsp:val=&quot;00CC72FD&quot;/&gt;&lt;wsp:rsid wsp:val=&quot;00CD4F3F&quot;/&gt;&lt;wsp:rsid wsp:val=&quot;00D311F8&quot;/&gt;&lt;wsp:rsid wsp:val=&quot;00D31660&quot;/&gt;&lt;wsp:rsid wsp:val=&quot;00D36B52&quot;/&gt;&lt;wsp:rsid wsp:val=&quot;00D377C8&quot;/&gt;&lt;wsp:rsid wsp:val=&quot;00D41274&quot;/&gt;&lt;wsp:rsid wsp:val=&quot;00D4229C&quot;/&gt;&lt;wsp:rsid wsp:val=&quot;00D43BF3&quot;/&gt;&lt;wsp:rsid wsp:val=&quot;00D549FB&quot;/&gt;&lt;wsp:rsid wsp:val=&quot;00D767BB&quot;/&gt;&lt;wsp:rsid wsp:val=&quot;00D939B0&quot;/&gt;&lt;wsp:rsid wsp:val=&quot;00DA31A2&quot;/&gt;&lt;wsp:rsid wsp:val=&quot;00DB16E0&quot;/&gt;&lt;wsp:rsid wsp:val=&quot;00DB2DF9&quot;/&gt;&lt;wsp:rsid wsp:val=&quot;00DB465D&quot;/&gt;&lt;wsp:rsid wsp:val=&quot;00DB48A2&quot;/&gt;&lt;wsp:rsid wsp:val=&quot;00DB7E63&quot;/&gt;&lt;wsp:rsid wsp:val=&quot;00DC2055&quot;/&gt;&lt;wsp:rsid wsp:val=&quot;00DC3908&quot;/&gt;&lt;wsp:rsid wsp:val=&quot;00DD71E8&quot;/&gt;&lt;wsp:rsid wsp:val=&quot;00DD7F83&quot;/&gt;&lt;wsp:rsid wsp:val=&quot;00DE4EB8&quot;/&gt;&lt;wsp:rsid wsp:val=&quot;00E0641E&quot;/&gt;&lt;wsp:rsid wsp:val=&quot;00E06664&quot;/&gt;&lt;wsp:rsid wsp:val=&quot;00E304BC&quot;/&gt;&lt;wsp:rsid wsp:val=&quot;00E32853&quot;/&gt;&lt;wsp:rsid wsp:val=&quot;00E34EBD&quot;/&gt;&lt;wsp:rsid wsp:val=&quot;00E401F8&quot;/&gt;&lt;wsp:rsid wsp:val=&quot;00E46425&quot;/&gt;&lt;wsp:rsid wsp:val=&quot;00E469FC&quot;/&gt;&lt;wsp:rsid wsp:val=&quot;00E47D0E&quot;/&gt;&lt;wsp:rsid wsp:val=&quot;00E65018&quot;/&gt;&lt;wsp:rsid wsp:val=&quot;00E76CA1&quot;/&gt;&lt;wsp:rsid wsp:val=&quot;00E94339&quot;/&gt;&lt;wsp:rsid wsp:val=&quot;00E97563&quot;/&gt;&lt;wsp:rsid wsp:val=&quot;00EB0B63&quot;/&gt;&lt;wsp:rsid wsp:val=&quot;00EC265C&quot;/&gt;&lt;wsp:rsid wsp:val=&quot;00ED61CB&quot;/&gt;&lt;wsp:rsid wsp:val=&quot;00EE752A&quot;/&gt;&lt;wsp:rsid wsp:val=&quot;00F06A72&quot;/&gt;&lt;wsp:rsid wsp:val=&quot;00F136F0&quot;/&gt;&lt;wsp:rsid wsp:val=&quot;00F20BBB&quot;/&gt;&lt;wsp:rsid wsp:val=&quot;00F36048&quot;/&gt;&lt;wsp:rsid wsp:val=&quot;00F43BD8&quot;/&gt;&lt;wsp:rsid wsp:val=&quot;00F562F3&quot;/&gt;&lt;wsp:rsid wsp:val=&quot;00F74B89&quot;/&gt;&lt;wsp:rsid wsp:val=&quot;00F75133&quot;/&gt;&lt;wsp:rsid wsp:val=&quot;00F83272&quot;/&gt;&lt;wsp:rsid wsp:val=&quot;00F9358D&quot;/&gt;&lt;wsp:rsid wsp:val=&quot;00FA3899&quot;/&gt;&lt;wsp:rsid wsp:val=&quot;00FA4909&quot;/&gt;&lt;wsp:rsid wsp:val=&quot;00FA5164&quot;/&gt;&lt;wsp:rsid wsp:val=&quot;00FA6751&quot;/&gt;&lt;wsp:rsid wsp:val=&quot;00FA6BD7&quot;/&gt;&lt;wsp:rsid wsp:val=&quot;00FB1048&quot;/&gt;&lt;wsp:rsid wsp:val=&quot;00FB62C4&quot;/&gt;&lt;wsp:rsid wsp:val=&quot;00FB7701&quot;/&gt;&lt;wsp:rsid wsp:val=&quot;00FD1AC5&quot;/&gt;&lt;wsp:rsid wsp:val=&quot;00FD5CF0&quot;/&gt;&lt;/wsp:rsids&gt;&lt;/w:docPr&gt;&lt;w:body&gt;&lt;wx:sect&gt;&lt;w:p wsp:rsidR=&quot;00814676&quot; wsp:rsidRDefault=&quot;00814676&quot; wsp:rsidP=&quot;00814676&quot;&gt;&lt;m:oMathPara&gt;&lt;m:oMath&gt;&lt;m:r&gt;&lt;w:rPr&gt;&lt;w:rFonts w:ascii=&quot;Cambria Math&quot; w:fareast=&quot;Times New Roman&quot; w:h-ansi=&quot;Cambria Math&quot;/&gt;&lt;wx:font wx:val=&quot;Cambria Math&quot;/&gt;&lt;w:i/&gt;&lt;/w:rPr&gt;&lt;m:t&gt;D&lt;/m:t&gt;&lt;/m:r&gt;&lt;/m:oMath&gt;&lt;/m:oMathPara&gt;&lt;/w:p&gt;&lt;w:sectPr wsp:rsidR=&quot;00000000&quot;&gt;&lt;w:pgSz w:w=&quot;12240&quot; w:h=&quot;15840&quot;/&gt;&lt;w:pgMar w:top=&quot;1440&quot; w:right=&quot;1440&quot; w:bottom=&quot;1440&quot; w:left=&quot;1440&quot; w:header=&quot;720&quot; w:footer=&quot;720&quot; w:gutter=&quot;0&quot;/&gt;&lt;w:cols w:space=&quot;720&quot;/&gt;&lt;/w:sectPr&gt;&lt;/wx:sect&gt;&lt;/w:body&gt;&lt;/w:wordDocument&gt;">
+          <v:shape id="_x0000_i1036" type="#_x0000_t75" style="width:8.3pt;height:13.85pt" equationxml="&lt;?xml version=&quot;1.0&quot; encoding=&quot;UTF-8&quot; standalone=&quot;yes&quot;?&gt;&#10;&lt;?mso-application progid=&quot;Word.Document&quot;?&gt;&#10;&lt;w:wordDocument xmlns:aml=&quot;http://schemas.microsoft.com/aml/2001/core&quot; xmlns:wpc=&quot;http://schemas.microsoft.com/office/word/2010/wordprocessingCanvas&quot; xmlns:cx=&quot;http://schemas.microsoft.com/office/drawing/2014/chartex&quot; xmlns:cx1=&quot;http://schemas.microsoft.com/office/drawing/2015/9/8/chartex&quot; xmlns:cx2=&quot;http://schemas.microsoft.com/office/drawing/2015/10/21/chartex&quot; xmlns:cx3=&quot;http://schemas.microsoft.com/office/drawing/2016/5/9/chartex&quot; xmlns:cx4=&quot;http://schemas.microsoft.com/office/drawing/2016/5/10/chartex&quot; xmlns:cx5=&quot;http://schemas.microsoft.com/office/drawing/2016/5/11/chartex&quot; xmlns:cx6=&quot;http://schemas.microsoft.com/office/drawing/2016/5/12/chartex&quot; xmlns:cx7=&quot;http://schemas.microsoft.com/office/drawing/2016/5/13/chartex&quot; xmlns:cx8=&quot;http://schemas.microsoft.com/office/drawing/2016/5/14/chartex&quot; xmlns:cr=&quot;http://schemas.microsoft.com/office/comments/2020/reactions&quot; xmlns:dt=&quot;uuid:C2F41010-65B3-11d1-A29F-00AA00C14882&quot; xmlns:mc=&quot;http://schemas.openxmlformats.org/markup-compatibility/2006&quot; xmlns:aink=&quot;http://schemas.microsoft.com/office/drawing/2016/ink&quot; xmlns:am3d=&quot;http://schemas.microsoft.com/office/drawing/2017/model3d&quot; xmlns:o=&quot;urn:schemas-microsoft-com:office:office&quot; xmlns:oel=&quot;http://schemas.microsoft.com/office/2019/extlst&quot; xmlns:m=&quot;http://schemas.openxmlformats.org/officeDocument/2006/math&quot; xmlns:v=&quot;urn:schemas-microsoft-com:vml&quot; xmlns:w10=&quot;urn:schemas-microsoft-com:office:word&quot; xmlns:w=&quot;http://schemas.microsoft.com/office/word/2003/wordml&quot; xmlns:wx=&quot;http://schemas.microsoft.com/office/word/2003/auxHint&quot; xmlns:wne=&quot;http://schemas.microsoft.com/office/word/2006/wordml&quot; xmlns:wsp=&quot;http://schemas.microsoft.com/office/word/2003/wordml/sp2&quot; xmlns:sl=&quot;http://schemas.microsoft.com/schemaLibrary/2003/core&quot; w:macrosPresent=&quot;no&quot; w:embeddedObjPresent=&quot;no&quot; w:ocxPresent=&quot;no&quot; xml:space=&quot;preserve&quot;&gt;&lt;w:ignoreSubtree w:val=&quot;http://schemas.microsoft.com/office/word/2003/wordml/sp2&quot;/&gt;&lt;o:DocumentProperties&gt;&lt;o:Version&gt;16&lt;/o:Version&gt;&lt;/o:DocumentProperties&gt;&lt;w:docPr&gt;&lt;w:view w:val=&quot;print&quot;/&gt;&lt;w:zoom w:percent=&quot;100&quot;/&gt;&lt;w:doNotEmbedSystemFonts/&gt;&lt;w:activeWritingStyle w:lang=&quot;EN-AU&quot; w:vendorID=&quot;64&quot; w:dllVersion=&quot;6&quot; w:nlCheck=&quot;on&quot; w:optionSet=&quot;1&quot;/&gt;&lt;w:activeWritingStyle w:lang=&quot;EN-GB&quot; w:vendorID=&quot;64&quot; w:dllVersion=&quot;6&quot; w:nlCheck=&quot;on&quot; w:optionSet=&quot;1&quot;/&gt;&lt;w:activeWritingStyle w:lang=&quot;EN-US&quot; w:vendorID=&quot;64&quot; w:dllVersion=&quot;6&quot; w:nlCheck=&quot;on&quot; w:optionSet=&quot;1&quot;/&gt;&lt;w:activeWritingStyle w:lang=&quot;EN-AU&quot; w:vendorID=&quot;64&quot; w:dllVersion=&quot;0&quot; w:nlCheck=&quot;on&quot; w:optionSet=&quot;0&quot;/&gt;&lt;w:activeWritingStyle w:lang=&quot;EN-GB&quot; w:vendorID=&quot;64&quot; w:dllVersion=&quot;0&quot; w:nlCheck=&quot;on&quot; w:optionSet=&quot;0&quot;/&gt;&lt;w:activeWritingStyle w:lang=&quot;EN-US&quot; w:vendorID=&quot;64&quot; w:dllVersion=&quot;0&quot; w:nlCheck=&quot;on&quot; w:optionSet=&quot;0&quot;/&gt;&lt;w:activeWritingStyle w:lang=&quot;ES-AR&quot; w:vendorID=&quot;64&quot; w:dllVersion=&quot;0&quot; w:nlCheck=&quot;on&quot; w:optionSet=&quot;0&quot;/&gt;&lt;w:activeWritingStyle w:lang=&quot;580A&quot; w:vendorID=&quot;64&quot; w:dllVersion=&quot;0&quot; w:nlCheck=&quot;on&quot; w:optionSet=&quot;0&quot;/&gt;&lt;w:activeWritingStyle w:lang=&quot;PT-BR&quot; w:vendorID=&quot;64&quot; w:dllVersion=&quot;0&quot; w:nlCheck=&quot;on&quot; w:optionSet=&quot;0&quot;/&gt;&lt;w:stylePaneFormatFilter w:val=&quot;3F01&quot;/&gt;&lt;w:defaultTabStop w:val=&quot;720&quot;/&gt;&lt;w:hyphenationZone w:val=&quot;425&quot;/&gt;&lt;w:characterSpacingControl w:val=&quot;DontCompress&quot;/&gt;&lt;w:optimizeForBrowser/&gt;&lt;w:validateAgainstSchema/&gt;&lt;w:saveInvalidXML w:val=&quot;off&quot;/&gt;&lt;w:ignoreMixedContent w:val=&quot;off&quot;/&gt;&lt;w:alwaysShowPlaceholderText w:val=&quot;off&quot;/&gt;&lt;w:compat&gt;&lt;w:breakWrappedTables/&gt;&lt;w:snapToGridInCell/&gt;&lt;w:applyBreakingRules/&gt;&lt;w:wrapTextWithPunct/&gt;&lt;w:useAsianBreakRules/&gt;&lt;w:useWord2002TableStyleRules/&gt;&lt;w:useFELayout/&gt;&lt;/w:compat&gt;&lt;wsp:rsids&gt;&lt;wsp:rsidRoot wsp:val=&quot;00426FBB&quot;/&gt;&lt;wsp:rsid wsp:val=&quot;000002E1&quot;/&gt;&lt;wsp:rsid wsp:val=&quot;00003C97&quot;/&gt;&lt;wsp:rsid wsp:val=&quot;00005565&quot;/&gt;&lt;wsp:rsid wsp:val=&quot;0001754A&quot;/&gt;&lt;wsp:rsid wsp:val=&quot;00017719&quot;/&gt;&lt;wsp:rsid wsp:val=&quot;00027F1D&quot;/&gt;&lt;wsp:rsid wsp:val=&quot;0003296C&quot;/&gt;&lt;wsp:rsid wsp:val=&quot;0003351F&quot;/&gt;&lt;wsp:rsid wsp:val=&quot;00044599&quot;/&gt;&lt;wsp:rsid wsp:val=&quot;000540E6&quot;/&gt;&lt;wsp:rsid wsp:val=&quot;00054421&quot;/&gt;&lt;wsp:rsid wsp:val=&quot;00062E46&quot;/&gt;&lt;wsp:rsid wsp:val=&quot;00074AC8&quot;/&gt;&lt;wsp:rsid wsp:val=&quot;00081408&quot;/&gt;&lt;wsp:rsid wsp:val=&quot;00081EBE&quot;/&gt;&lt;wsp:rsid wsp:val=&quot;00086EDC&quot;/&gt;&lt;wsp:rsid wsp:val=&quot;000B36A3&quot;/&gt;&lt;wsp:rsid wsp:val=&quot;000C013C&quot;/&gt;&lt;wsp:rsid wsp:val=&quot;000E3F84&quot;/&gt;&lt;wsp:rsid wsp:val=&quot;001056DF&quot;/&gt;&lt;wsp:rsid wsp:val=&quot;0010789C&quot;/&gt;&lt;wsp:rsid wsp:val=&quot;00114025&quot;/&gt;&lt;wsp:rsid wsp:val=&quot;001160D2&quot;/&gt;&lt;wsp:rsid wsp:val=&quot;00120636&quot;/&gt;&lt;wsp:rsid wsp:val=&quot;001348A5&quot;/&gt;&lt;wsp:rsid wsp:val=&quot;00151B8E&quot;/&gt;&lt;wsp:rsid wsp:val=&quot;00182170&quot;/&gt;&lt;wsp:rsid wsp:val=&quot;001928FB&quot;/&gt;&lt;wsp:rsid wsp:val=&quot;00192BC7&quot;/&gt;&lt;wsp:rsid wsp:val=&quot;00195BE6&quot;/&gt;&lt;wsp:rsid wsp:val=&quot;001A50EA&quot;/&gt;&lt;wsp:rsid wsp:val=&quot;001F16CD&quot;/&gt;&lt;wsp:rsid wsp:val=&quot;001F47D2&quot;/&gt;&lt;wsp:rsid wsp:val=&quot;002029C8&quot;/&gt;&lt;wsp:rsid wsp:val=&quot;0022285A&quot;/&gt;&lt;wsp:rsid wsp:val=&quot;00224C61&quot;/&gt;&lt;wsp:rsid wsp:val=&quot;00256ABC&quot;/&gt;&lt;wsp:rsid wsp:val=&quot;0027227B&quot;/&gt;&lt;wsp:rsid wsp:val=&quot;00273AC7&quot;/&gt;&lt;wsp:rsid wsp:val=&quot;00273D2C&quot;/&gt;&lt;wsp:rsid wsp:val=&quot;00285ECD&quot;/&gt;&lt;wsp:rsid wsp:val=&quot;00290E1B&quot;/&gt;&lt;wsp:rsid wsp:val=&quot;00291B17&quot;/&gt;&lt;wsp:rsid wsp:val=&quot;00291BB3&quot;/&gt;&lt;wsp:rsid wsp:val=&quot;002A6742&quot;/&gt;&lt;wsp:rsid wsp:val=&quot;002C1A7F&quot;/&gt;&lt;wsp:rsid wsp:val=&quot;002C4239&quot;/&gt;&lt;wsp:rsid wsp:val=&quot;002C559D&quot;/&gt;&lt;wsp:rsid wsp:val=&quot;002D16AE&quot;/&gt;&lt;wsp:rsid wsp:val=&quot;002D2D42&quot;/&gt;&lt;wsp:rsid wsp:val=&quot;002F72D0&quot;/&gt;&lt;wsp:rsid wsp:val=&quot;002F7A4F&quot;/&gt;&lt;wsp:rsid wsp:val=&quot;003003AB&quot;/&gt;&lt;wsp:rsid wsp:val=&quot;00302C35&quot;/&gt;&lt;wsp:rsid wsp:val=&quot;00311C49&quot;/&gt;&lt;wsp:rsid wsp:val=&quot;0032119E&quot;/&gt;&lt;wsp:rsid wsp:val=&quot;00321304&quot;/&gt;&lt;wsp:rsid wsp:val=&quot;00324FC2&quot;/&gt;&lt;wsp:rsid wsp:val=&quot;003312CA&quot;/&gt;&lt;wsp:rsid wsp:val=&quot;00331F84&quot;/&gt;&lt;wsp:rsid wsp:val=&quot;0037721F&quot;/&gt;&lt;wsp:rsid wsp:val=&quot;003950A4&quot;/&gt;&lt;wsp:rsid wsp:val=&quot;003A1E7E&quot;/&gt;&lt;wsp:rsid wsp:val=&quot;003E2FDC&quot;/&gt;&lt;wsp:rsid wsp:val=&quot;003E3577&quot;/&gt;&lt;wsp:rsid wsp:val=&quot;003F3A61&quot;/&gt;&lt;wsp:rsid wsp:val=&quot;00410A5D&quot;/&gt;&lt;wsp:rsid wsp:val=&quot;00414909&quot;/&gt;&lt;wsp:rsid wsp:val=&quot;00416537&quot;/&gt;&lt;wsp:rsid wsp:val=&quot;00425A6A&quot;/&gt;&lt;wsp:rsid wsp:val=&quot;00426FBB&quot;/&gt;&lt;wsp:rsid wsp:val=&quot;00454542&quot;/&gt;&lt;wsp:rsid wsp:val=&quot;0047429A&quot;/&gt;&lt;wsp:rsid wsp:val=&quot;0048374C&quot;/&gt;&lt;wsp:rsid wsp:val=&quot;0048771D&quot;/&gt;&lt;wsp:rsid wsp:val=&quot;004A6605&quot;/&gt;&lt;wsp:rsid wsp:val=&quot;004C45FA&quot;/&gt;&lt;wsp:rsid wsp:val=&quot;004D35A3&quot;/&gt;&lt;wsp:rsid wsp:val=&quot;004E1BD8&quot;/&gt;&lt;wsp:rsid wsp:val=&quot;004E452A&quot;/&gt;&lt;wsp:rsid wsp:val=&quot;004E78E3&quot;/&gt;&lt;wsp:rsid wsp:val=&quot;004F2BFE&quot;/&gt;&lt;wsp:rsid wsp:val=&quot;004F63D3&quot;/&gt;&lt;wsp:rsid wsp:val=&quot;004F7DCF&quot;/&gt;&lt;wsp:rsid wsp:val=&quot;005004BF&quot;/&gt;&lt;wsp:rsid wsp:val=&quot;00502E89&quot;/&gt;&lt;wsp:rsid wsp:val=&quot;00506CFE&quot;/&gt;&lt;wsp:rsid wsp:val=&quot;00510E95&quot;/&gt;&lt;wsp:rsid wsp:val=&quot;005225C3&quot;/&gt;&lt;wsp:rsid wsp:val=&quot;00527D56&quot;/&gt;&lt;wsp:rsid wsp:val=&quot;0053221F&quot;/&gt;&lt;wsp:rsid wsp:val=&quot;00536FAE&quot;/&gt;&lt;wsp:rsid wsp:val=&quot;00542C85&quot;/&gt;&lt;wsp:rsid wsp:val=&quot;00553510&quot;/&gt;&lt;wsp:rsid wsp:val=&quot;00554186&quot;/&gt;&lt;wsp:rsid wsp:val=&quot;00585769&quot;/&gt;&lt;wsp:rsid wsp:val=&quot;00585C61&quot;/&gt;&lt;wsp:rsid wsp:val=&quot;00591130&quot;/&gt;&lt;wsp:rsid wsp:val=&quot;005A3F28&quot;/&gt;&lt;wsp:rsid wsp:val=&quot;005A40BE&quot;/&gt;&lt;wsp:rsid wsp:val=&quot;005B13E2&quot;/&gt;&lt;wsp:rsid wsp:val=&quot;005B47D7&quot;/&gt;&lt;wsp:rsid wsp:val=&quot;005C5526&quot;/&gt;&lt;wsp:rsid wsp:val=&quot;005C62C6&quot;/&gt;&lt;wsp:rsid wsp:val=&quot;005D7B9E&quot;/&gt;&lt;wsp:rsid wsp:val=&quot;005E112E&quot;/&gt;&lt;wsp:rsid wsp:val=&quot;005F0834&quot;/&gt;&lt;wsp:rsid wsp:val=&quot;005F68AB&quot;/&gt;&lt;wsp:rsid wsp:val=&quot;005F6DC3&quot;/&gt;&lt;wsp:rsid wsp:val=&quot;00601A8E&quot;/&gt;&lt;wsp:rsid wsp:val=&quot;0062033E&quot;/&gt;&lt;wsp:rsid wsp:val=&quot;00624482&quot;/&gt;&lt;wsp:rsid wsp:val=&quot;0064799C&quot;/&gt;&lt;wsp:rsid wsp:val=&quot;00654156&quot;/&gt;&lt;wsp:rsid wsp:val=&quot;006B47CA&quot;/&gt;&lt;wsp:rsid wsp:val=&quot;006C304C&quot;/&gt;&lt;wsp:rsid wsp:val=&quot;006C4511&quot;/&gt;&lt;wsp:rsid wsp:val=&quot;006C65F5&quot;/&gt;&lt;wsp:rsid wsp:val=&quot;006C7AAA&quot;/&gt;&lt;wsp:rsid wsp:val=&quot;006D1C2A&quot;/&gt;&lt;wsp:rsid wsp:val=&quot;006D264F&quot;/&gt;&lt;wsp:rsid wsp:val=&quot;006E2A8D&quot;/&gt;&lt;wsp:rsid wsp:val=&quot;006E7574&quot;/&gt;&lt;wsp:rsid wsp:val=&quot;00703430&quot;/&gt;&lt;wsp:rsid wsp:val=&quot;00703548&quot;/&gt;&lt;wsp:rsid wsp:val=&quot;00704E18&quot;/&gt;&lt;wsp:rsid wsp:val=&quot;007069BE&quot;/&gt;&lt;wsp:rsid wsp:val=&quot;00745C86&quot;/&gt;&lt;wsp:rsid wsp:val=&quot;00764603&quot;/&gt;&lt;wsp:rsid wsp:val=&quot;0076604D&quot;/&gt;&lt;wsp:rsid wsp:val=&quot;00790909&quot;/&gt;&lt;wsp:rsid wsp:val=&quot;007B1582&quot;/&gt;&lt;wsp:rsid wsp:val=&quot;007B5A07&quot;/&gt;&lt;wsp:rsid wsp:val=&quot;007C065D&quot;/&gt;&lt;wsp:rsid wsp:val=&quot;007D3E71&quot;/&gt;&lt;wsp:rsid wsp:val=&quot;007E5D6A&quot;/&gt;&lt;wsp:rsid wsp:val=&quot;007E645D&quot;/&gt;&lt;wsp:rsid wsp:val=&quot;007F75CA&quot;/&gt;&lt;wsp:rsid wsp:val=&quot;00814676&quot;/&gt;&lt;wsp:rsid wsp:val=&quot;00821E08&quot;/&gt;&lt;wsp:rsid wsp:val=&quot;00834EFD&quot;/&gt;&lt;wsp:rsid wsp:val=&quot;00844B24&quot;/&gt;&lt;wsp:rsid wsp:val=&quot;0084515F&quot;/&gt;&lt;wsp:rsid wsp:val=&quot;0085092D&quot;/&gt;&lt;wsp:rsid wsp:val=&quot;00865414&quot;/&gt;&lt;wsp:rsid wsp:val=&quot;00877D4C&quot;/&gt;&lt;wsp:rsid wsp:val=&quot;00883903&quot;/&gt;&lt;wsp:rsid wsp:val=&quot;0089763B&quot;/&gt;&lt;wsp:rsid wsp:val=&quot;008B6AE3&quot;/&gt;&lt;wsp:rsid wsp:val=&quot;008C1332&quot;/&gt;&lt;wsp:rsid wsp:val=&quot;008D1045&quot;/&gt;&lt;wsp:rsid wsp:val=&quot;008E5996&quot;/&gt;&lt;wsp:rsid wsp:val=&quot;00901AE1&quot;/&gt;&lt;wsp:rsid wsp:val=&quot;00912F93&quot;/&gt;&lt;wsp:rsid wsp:val=&quot;009205B4&quot;/&gt;&lt;wsp:rsid wsp:val=&quot;00955B59&quot;/&gt;&lt;wsp:rsid wsp:val=&quot;00992262&quot;/&gt;&lt;wsp:rsid wsp:val=&quot;009926BC&quot;/&gt;&lt;wsp:rsid wsp:val=&quot;009A4319&quot;/&gt;&lt;wsp:rsid wsp:val=&quot;009A6C3F&quot;/&gt;&lt;wsp:rsid wsp:val=&quot;009B73F2&quot;/&gt;&lt;wsp:rsid wsp:val=&quot;009C12BD&quot;/&gt;&lt;wsp:rsid wsp:val=&quot;009C50FE&quot;/&gt;&lt;wsp:rsid wsp:val=&quot;009E49DD&quot;/&gt;&lt;wsp:rsid wsp:val=&quot;00A03E75&quot;/&gt;&lt;wsp:rsid wsp:val=&quot;00A20627&quot;/&gt;&lt;wsp:rsid wsp:val=&quot;00A22FE9&quot;/&gt;&lt;wsp:rsid wsp:val=&quot;00A31A44&quot;/&gt;&lt;wsp:rsid wsp:val=&quot;00A32BFA&quot;/&gt;&lt;wsp:rsid wsp:val=&quot;00A3325E&quot;/&gt;&lt;wsp:rsid wsp:val=&quot;00A45FCE&quot;/&gt;&lt;wsp:rsid wsp:val=&quot;00A75671&quot;/&gt;&lt;wsp:rsid wsp:val=&quot;00A773CC&quot;/&gt;&lt;wsp:rsid wsp:val=&quot;00A924D0&quot;/&gt;&lt;wsp:rsid wsp:val=&quot;00A9318B&quot;/&gt;&lt;wsp:rsid wsp:val=&quot;00A94AC1&quot;/&gt;&lt;wsp:rsid wsp:val=&quot;00AB18B7&quot;/&gt;&lt;wsp:rsid wsp:val=&quot;00AD335D&quot;/&gt;&lt;wsp:rsid wsp:val=&quot;00AF114C&quot;/&gt;&lt;wsp:rsid wsp:val=&quot;00AF792B&quot;/&gt;&lt;wsp:rsid wsp:val=&quot;00B33D2F&quot;/&gt;&lt;wsp:rsid wsp:val=&quot;00B40A5B&quot;/&gt;&lt;wsp:rsid wsp:val=&quot;00B45C6B&quot;/&gt;&lt;wsp:rsid wsp:val=&quot;00B55D5E&quot;/&gt;&lt;wsp:rsid wsp:val=&quot;00B57A80&quot;/&gt;&lt;wsp:rsid wsp:val=&quot;00B70E9C&quot;/&gt;&lt;wsp:rsid wsp:val=&quot;00B713D8&quot;/&gt;&lt;wsp:rsid wsp:val=&quot;00B72979&quot;/&gt;&lt;wsp:rsid wsp:val=&quot;00B94516&quot;/&gt;&lt;wsp:rsid wsp:val=&quot;00BA25E2&quot;/&gt;&lt;wsp:rsid wsp:val=&quot;00BB2855&quot;/&gt;&lt;wsp:rsid wsp:val=&quot;00BC5343&quot;/&gt;&lt;wsp:rsid wsp:val=&quot;00BD19C1&quot;/&gt;&lt;wsp:rsid wsp:val=&quot;00BD25B8&quot;/&gt;&lt;wsp:rsid wsp:val=&quot;00C012E1&quot;/&gt;&lt;wsp:rsid wsp:val=&quot;00C06BB4&quot;/&gt;&lt;wsp:rsid wsp:val=&quot;00C10D20&quot;/&gt;&lt;wsp:rsid wsp:val=&quot;00C12E0C&quot;/&gt;&lt;wsp:rsid wsp:val=&quot;00C21916&quot;/&gt;&lt;wsp:rsid wsp:val=&quot;00C34915&quot;/&gt;&lt;wsp:rsid wsp:val=&quot;00C457CA&quot;/&gt;&lt;wsp:rsid wsp:val=&quot;00C53FB6&quot;/&gt;&lt;wsp:rsid wsp:val=&quot;00C57FB7&quot;/&gt;&lt;wsp:rsid wsp:val=&quot;00C644D4&quot;/&gt;&lt;wsp:rsid wsp:val=&quot;00C65F3F&quot;/&gt;&lt;wsp:rsid wsp:val=&quot;00C72414&quot;/&gt;&lt;wsp:rsid wsp:val=&quot;00C72B1A&quot;/&gt;&lt;wsp:rsid wsp:val=&quot;00C8667B&quot;/&gt;&lt;wsp:rsid wsp:val=&quot;00C90993&quot;/&gt;&lt;wsp:rsid wsp:val=&quot;00CA4CE3&quot;/&gt;&lt;wsp:rsid wsp:val=&quot;00CC72FD&quot;/&gt;&lt;wsp:rsid wsp:val=&quot;00CD4F3F&quot;/&gt;&lt;wsp:rsid wsp:val=&quot;00D311F8&quot;/&gt;&lt;wsp:rsid wsp:val=&quot;00D31660&quot;/&gt;&lt;wsp:rsid wsp:val=&quot;00D36B52&quot;/&gt;&lt;wsp:rsid wsp:val=&quot;00D377C8&quot;/&gt;&lt;wsp:rsid wsp:val=&quot;00D41274&quot;/&gt;&lt;wsp:rsid wsp:val=&quot;00D4229C&quot;/&gt;&lt;wsp:rsid wsp:val=&quot;00D43BF3&quot;/&gt;&lt;wsp:rsid wsp:val=&quot;00D549FB&quot;/&gt;&lt;wsp:rsid wsp:val=&quot;00D767BB&quot;/&gt;&lt;wsp:rsid wsp:val=&quot;00D939B0&quot;/&gt;&lt;wsp:rsid wsp:val=&quot;00DA31A2&quot;/&gt;&lt;wsp:rsid wsp:val=&quot;00DB16E0&quot;/&gt;&lt;wsp:rsid wsp:val=&quot;00DB2DF9&quot;/&gt;&lt;wsp:rsid wsp:val=&quot;00DB465D&quot;/&gt;&lt;wsp:rsid wsp:val=&quot;00DB48A2&quot;/&gt;&lt;wsp:rsid wsp:val=&quot;00DB7E63&quot;/&gt;&lt;wsp:rsid wsp:val=&quot;00DC2055&quot;/&gt;&lt;wsp:rsid wsp:val=&quot;00DC3908&quot;/&gt;&lt;wsp:rsid wsp:val=&quot;00DD71E8&quot;/&gt;&lt;wsp:rsid wsp:val=&quot;00DD7F83&quot;/&gt;&lt;wsp:rsid wsp:val=&quot;00DE4EB8&quot;/&gt;&lt;wsp:rsid wsp:val=&quot;00E0641E&quot;/&gt;&lt;wsp:rsid wsp:val=&quot;00E06664&quot;/&gt;&lt;wsp:rsid wsp:val=&quot;00E304BC&quot;/&gt;&lt;wsp:rsid wsp:val=&quot;00E32853&quot;/&gt;&lt;wsp:rsid wsp:val=&quot;00E34EBD&quot;/&gt;&lt;wsp:rsid wsp:val=&quot;00E401F8&quot;/&gt;&lt;wsp:rsid wsp:val=&quot;00E46425&quot;/&gt;&lt;wsp:rsid wsp:val=&quot;00E469FC&quot;/&gt;&lt;wsp:rsid wsp:val=&quot;00E47D0E&quot;/&gt;&lt;wsp:rsid wsp:val=&quot;00E65018&quot;/&gt;&lt;wsp:rsid wsp:val=&quot;00E76CA1&quot;/&gt;&lt;wsp:rsid wsp:val=&quot;00E94339&quot;/&gt;&lt;wsp:rsid wsp:val=&quot;00E97563&quot;/&gt;&lt;wsp:rsid wsp:val=&quot;00EB0B63&quot;/&gt;&lt;wsp:rsid wsp:val=&quot;00EC265C&quot;/&gt;&lt;wsp:rsid wsp:val=&quot;00ED61CB&quot;/&gt;&lt;wsp:rsid wsp:val=&quot;00EE752A&quot;/&gt;&lt;wsp:rsid wsp:val=&quot;00F06A72&quot;/&gt;&lt;wsp:rsid wsp:val=&quot;00F136F0&quot;/&gt;&lt;wsp:rsid wsp:val=&quot;00F20BBB&quot;/&gt;&lt;wsp:rsid wsp:val=&quot;00F36048&quot;/&gt;&lt;wsp:rsid wsp:val=&quot;00F43BD8&quot;/&gt;&lt;wsp:rsid wsp:val=&quot;00F562F3&quot;/&gt;&lt;wsp:rsid wsp:val=&quot;00F74B89&quot;/&gt;&lt;wsp:rsid wsp:val=&quot;00F75133&quot;/&gt;&lt;wsp:rsid wsp:val=&quot;00F83272&quot;/&gt;&lt;wsp:rsid wsp:val=&quot;00F9358D&quot;/&gt;&lt;wsp:rsid wsp:val=&quot;00FA3899&quot;/&gt;&lt;wsp:rsid wsp:val=&quot;00FA4909&quot;/&gt;&lt;wsp:rsid wsp:val=&quot;00FA5164&quot;/&gt;&lt;wsp:rsid wsp:val=&quot;00FA6751&quot;/&gt;&lt;wsp:rsid wsp:val=&quot;00FA6BD7&quot;/&gt;&lt;wsp:rsid wsp:val=&quot;00FB1048&quot;/&gt;&lt;wsp:rsid wsp:val=&quot;00FB62C4&quot;/&gt;&lt;wsp:rsid wsp:val=&quot;00FB7701&quot;/&gt;&lt;wsp:rsid wsp:val=&quot;00FD1AC5&quot;/&gt;&lt;wsp:rsid wsp:val=&quot;00FD5CF0&quot;/&gt;&lt;/wsp:rsids&gt;&lt;/w:docPr&gt;&lt;w:body&gt;&lt;wx:sect&gt;&lt;w:p wsp:rsidR=&quot;00814676&quot; wsp:rsidRDefault=&quot;00814676&quot; wsp:rsidP=&quot;00814676&quot;&gt;&lt;m:oMathPara&gt;&lt;m:oMath&gt;&lt;m:r&gt;&lt;w:rPr&gt;&lt;w:rFonts w:ascii=&quot;Cambria Math&quot; w:fareast=&quot;Times New Roman&quot; w:h-ansi=&quot;Cambria Math&quot;/&gt;&lt;wx:font wx:val=&quot;Cambria Math&quot;/&gt;&lt;w:i/&gt;&lt;/w:rPr&gt;&lt;m:t&gt;D&lt;/m:t&gt;&lt;/m:r&gt;&lt;/m:oMath&gt;&lt;/m:oMathPara&gt;&lt;/w:p&gt;&lt;w:sectPr wsp:rsidR=&quot;00000000&quot;&gt;&lt;w:pgSz w:w=&quot;12240&quot; w:h=&quot;15840&quot;/&gt;&lt;w:pgMar w:top=&quot;1440&quot; w:right=&quot;1440&quot; w:bottom=&quot;1440&quot; w:left=&quot;1440&quot; w:header=&quot;720&quot; w:footer=&quot;720&quot; w:gutter=&quot;0&quot;/&gt;&lt;w:cols w:space=&quot;720&quot;/&gt;&lt;/w:sectPr&gt;&lt;/wx:sect&gt;&lt;/w:body&gt;&lt;/w:wordDocument&gt;">
             <v:imagedata r:id="rId15" o:title="" chromakey="white"/>
           </v:shape>
         </w:pict>
@@ -1168,7 +1168,7 @@
           <w:szCs w:val="20"/>
         </w:rPr>
         <w:pict w14:anchorId="4CC4E4DA">
-          <v:shape id="_x0000_i1070" type="#_x0000_t75" style="width:8.2pt;height:13.65pt" equationxml="&lt;?xml version=&quot;1.0&quot; encoding=&quot;UTF-8&quot; standalone=&quot;yes&quot;?&gt;&#10;&lt;?mso-application progid=&quot;Word.Document&quot;?&gt;&#10;&lt;w:wordDocument xmlns:aml=&quot;http://schemas.microsoft.com/aml/2001/core&quot; xmlns:wpc=&quot;http://schemas.microsoft.com/office/word/2010/wordprocessingCanvas&quot; xmlns:cx=&quot;http://schemas.microsoft.com/office/drawing/2014/chartex&quot; xmlns:cx1=&quot;http://schemas.microsoft.com/office/drawing/2015/9/8/chartex&quot; xmlns:cx2=&quot;http://schemas.microsoft.com/office/drawing/2015/10/21/chartex&quot; xmlns:cx3=&quot;http://schemas.microsoft.com/office/drawing/2016/5/9/chartex&quot; xmlns:cx4=&quot;http://schemas.microsoft.com/office/drawing/2016/5/10/chartex&quot; xmlns:cx5=&quot;http://schemas.microsoft.com/office/drawing/2016/5/11/chartex&quot; xmlns:cx6=&quot;http://schemas.microsoft.com/office/drawing/2016/5/12/chartex&quot; xmlns:cx7=&quot;http://schemas.microsoft.com/office/drawing/2016/5/13/chartex&quot; xmlns:cx8=&quot;http://schemas.microsoft.com/office/drawing/2016/5/14/chartex&quot; xmlns:cr=&quot;http://schemas.microsoft.com/office/comments/2020/reactions&quot; xmlns:dt=&quot;uuid:C2F41010-65B3-11d1-A29F-00AA00C14882&quot; xmlns:mc=&quot;http://schemas.openxmlformats.org/markup-compatibility/2006&quot; xmlns:aink=&quot;http://schemas.microsoft.com/office/drawing/2016/ink&quot; xmlns:am3d=&quot;http://schemas.microsoft.com/office/drawing/2017/model3d&quot; xmlns:o=&quot;urn:schemas-microsoft-com:office:office&quot; xmlns:oel=&quot;http://schemas.microsoft.com/office/2019/extlst&quot; xmlns:m=&quot;http://schemas.openxmlformats.org/officeDocument/2006/math&quot; xmlns:v=&quot;urn:schemas-microsoft-com:vml&quot; xmlns:w10=&quot;urn:schemas-microsoft-com:office:word&quot; xmlns:w=&quot;http://schemas.microsoft.com/office/word/2003/wordml&quot; xmlns:wx=&quot;http://schemas.microsoft.com/office/word/2003/auxHint&quot; xmlns:wne=&quot;http://schemas.microsoft.com/office/word/2006/wordml&quot; xmlns:wsp=&quot;http://schemas.microsoft.com/office/word/2003/wordml/sp2&quot; xmlns:sl=&quot;http://schemas.microsoft.com/schemaLibrary/2003/core&quot; w:macrosPresent=&quot;no&quot; w:embeddedObjPresent=&quot;no&quot; w:ocxPresent=&quot;no&quot; xml:space=&quot;preserve&quot;&gt;&lt;w:ignoreSubtree w:val=&quot;http://schemas.microsoft.com/office/word/2003/wordml/sp2&quot;/&gt;&lt;o:DocumentProperties&gt;&lt;o:Version&gt;16&lt;/o:Version&gt;&lt;/o:DocumentProperties&gt;&lt;w:docPr&gt;&lt;w:view w:val=&quot;print&quot;/&gt;&lt;w:zoom w:percent=&quot;100&quot;/&gt;&lt;w:doNotEmbedSystemFonts/&gt;&lt;w:activeWritingStyle w:lang=&quot;EN-AU&quot; w:vendorID=&quot;64&quot; w:dllVersion=&quot;6&quot; w:nlCheck=&quot;on&quot; w:optionSet=&quot;1&quot;/&gt;&lt;w:activeWritingStyle w:lang=&quot;EN-GB&quot; w:vendorID=&quot;64&quot; w:dllVersion=&quot;6&quot; w:nlCheck=&quot;on&quot; w:optionSet=&quot;1&quot;/&gt;&lt;w:activeWritingStyle w:lang=&quot;EN-US&quot; w:vendorID=&quot;64&quot; w:dllVersion=&quot;6&quot; w:nlCheck=&quot;on&quot; w:optionSet=&quot;1&quot;/&gt;&lt;w:activeWritingStyle w:lang=&quot;EN-AU&quot; w:vendorID=&quot;64&quot; w:dllVersion=&quot;0&quot; w:nlCheck=&quot;on&quot; w:optionSet=&quot;0&quot;/&gt;&lt;w:activeWritingStyle w:lang=&quot;EN-GB&quot; w:vendorID=&quot;64&quot; w:dllVersion=&quot;0&quot; w:nlCheck=&quot;on&quot; w:optionSet=&quot;0&quot;/&gt;&lt;w:activeWritingStyle w:lang=&quot;EN-US&quot; w:vendorID=&quot;64&quot; w:dllVersion=&quot;0&quot; w:nlCheck=&quot;on&quot; w:optionSet=&quot;0&quot;/&gt;&lt;w:activeWritingStyle w:lang=&quot;ES-AR&quot; w:vendorID=&quot;64&quot; w:dllVersion=&quot;0&quot; w:nlCheck=&quot;on&quot; w:optionSet=&quot;0&quot;/&gt;&lt;w:activeWritingStyle w:lang=&quot;580A&quot; w:vendorID=&quot;64&quot; w:dllVersion=&quot;0&quot; w:nlCheck=&quot;on&quot; w:optionSet=&quot;0&quot;/&gt;&lt;w:activeWritingStyle w:lang=&quot;PT-BR&quot; w:vendorID=&quot;64&quot; w:dllVersion=&quot;0&quot; w:nlCheck=&quot;on&quot; w:optionSet=&quot;0&quot;/&gt;&lt;w:stylePaneFormatFilter w:val=&quot;3F01&quot;/&gt;&lt;w:defaultTabStop w:val=&quot;720&quot;/&gt;&lt;w:hyphenationZone w:val=&quot;425&quot;/&gt;&lt;w:characterSpacingControl w:val=&quot;DontCompress&quot;/&gt;&lt;w:optimizeForBrowser/&gt;&lt;w:validateAgainstSchema/&gt;&lt;w:saveInvalidXML w:val=&quot;off&quot;/&gt;&lt;w:ignoreMixedContent w:val=&quot;off&quot;/&gt;&lt;w:alwaysShowPlaceholderText w:val=&quot;off&quot;/&gt;&lt;w:compat&gt;&lt;w:breakWrappedTables/&gt;&lt;w:snapToGridInCell/&gt;&lt;w:applyBreakingRules/&gt;&lt;w:wrapTextWithPunct/&gt;&lt;w:useAsianBreakRules/&gt;&lt;w:useWord2002TableStyleRules/&gt;&lt;w:useFELayout/&gt;&lt;/w:compat&gt;&lt;wsp:rsids&gt;&lt;wsp:rsidRoot wsp:val=&quot;00426FBB&quot;/&gt;&lt;wsp:rsid wsp:val=&quot;000002E1&quot;/&gt;&lt;wsp:rsid wsp:val=&quot;00003C97&quot;/&gt;&lt;wsp:rsid wsp:val=&quot;00005565&quot;/&gt;&lt;wsp:rsid wsp:val=&quot;0001754A&quot;/&gt;&lt;wsp:rsid wsp:val=&quot;00017719&quot;/&gt;&lt;wsp:rsid wsp:val=&quot;00027F1D&quot;/&gt;&lt;wsp:rsid wsp:val=&quot;0003296C&quot;/&gt;&lt;wsp:rsid wsp:val=&quot;0003351F&quot;/&gt;&lt;wsp:rsid wsp:val=&quot;00044599&quot;/&gt;&lt;wsp:rsid wsp:val=&quot;000540E6&quot;/&gt;&lt;wsp:rsid wsp:val=&quot;00054421&quot;/&gt;&lt;wsp:rsid wsp:val=&quot;00062E46&quot;/&gt;&lt;wsp:rsid wsp:val=&quot;00074AC8&quot;/&gt;&lt;wsp:rsid wsp:val=&quot;00081408&quot;/&gt;&lt;wsp:rsid wsp:val=&quot;00081EBE&quot;/&gt;&lt;wsp:rsid wsp:val=&quot;00086EDC&quot;/&gt;&lt;wsp:rsid wsp:val=&quot;000B36A3&quot;/&gt;&lt;wsp:rsid wsp:val=&quot;000C013C&quot;/&gt;&lt;wsp:rsid wsp:val=&quot;000E3F84&quot;/&gt;&lt;wsp:rsid wsp:val=&quot;001056DF&quot;/&gt;&lt;wsp:rsid wsp:val=&quot;0010789C&quot;/&gt;&lt;wsp:rsid wsp:val=&quot;00114025&quot;/&gt;&lt;wsp:rsid wsp:val=&quot;001160D2&quot;/&gt;&lt;wsp:rsid wsp:val=&quot;00120636&quot;/&gt;&lt;wsp:rsid wsp:val=&quot;001348A5&quot;/&gt;&lt;wsp:rsid wsp:val=&quot;00151B8E&quot;/&gt;&lt;wsp:rsid wsp:val=&quot;00182170&quot;/&gt;&lt;wsp:rsid wsp:val=&quot;001928FB&quot;/&gt;&lt;wsp:rsid wsp:val=&quot;00192BC7&quot;/&gt;&lt;wsp:rsid wsp:val=&quot;00195BE6&quot;/&gt;&lt;wsp:rsid wsp:val=&quot;001A50EA&quot;/&gt;&lt;wsp:rsid wsp:val=&quot;001F16CD&quot;/&gt;&lt;wsp:rsid wsp:val=&quot;001F47D2&quot;/&gt;&lt;wsp:rsid wsp:val=&quot;002029C8&quot;/&gt;&lt;wsp:rsid wsp:val=&quot;0022285A&quot;/&gt;&lt;wsp:rsid wsp:val=&quot;00224C61&quot;/&gt;&lt;wsp:rsid wsp:val=&quot;00256ABC&quot;/&gt;&lt;wsp:rsid wsp:val=&quot;0027227B&quot;/&gt;&lt;wsp:rsid wsp:val=&quot;00273AC7&quot;/&gt;&lt;wsp:rsid wsp:val=&quot;00273D2C&quot;/&gt;&lt;wsp:rsid wsp:val=&quot;00285ECD&quot;/&gt;&lt;wsp:rsid wsp:val=&quot;00290E1B&quot;/&gt;&lt;wsp:rsid wsp:val=&quot;00291B17&quot;/&gt;&lt;wsp:rsid wsp:val=&quot;00291BB3&quot;/&gt;&lt;wsp:rsid wsp:val=&quot;002A6742&quot;/&gt;&lt;wsp:rsid wsp:val=&quot;002C1A7F&quot;/&gt;&lt;wsp:rsid wsp:val=&quot;002C4239&quot;/&gt;&lt;wsp:rsid wsp:val=&quot;002C559D&quot;/&gt;&lt;wsp:rsid wsp:val=&quot;002D16AE&quot;/&gt;&lt;wsp:rsid wsp:val=&quot;002D2D42&quot;/&gt;&lt;wsp:rsid wsp:val=&quot;002F72D0&quot;/&gt;&lt;wsp:rsid wsp:val=&quot;002F7A4F&quot;/&gt;&lt;wsp:rsid wsp:val=&quot;003003AB&quot;/&gt;&lt;wsp:rsid wsp:val=&quot;00302C35&quot;/&gt;&lt;wsp:rsid wsp:val=&quot;00311C49&quot;/&gt;&lt;wsp:rsid wsp:val=&quot;0032119E&quot;/&gt;&lt;wsp:rsid wsp:val=&quot;00321304&quot;/&gt;&lt;wsp:rsid wsp:val=&quot;00324FC2&quot;/&gt;&lt;wsp:rsid wsp:val=&quot;003312CA&quot;/&gt;&lt;wsp:rsid wsp:val=&quot;00331F84&quot;/&gt;&lt;wsp:rsid wsp:val=&quot;0037721F&quot;/&gt;&lt;wsp:rsid wsp:val=&quot;003950A4&quot;/&gt;&lt;wsp:rsid wsp:val=&quot;003A1E7E&quot;/&gt;&lt;wsp:rsid wsp:val=&quot;003E2FDC&quot;/&gt;&lt;wsp:rsid wsp:val=&quot;003E3577&quot;/&gt;&lt;wsp:rsid wsp:val=&quot;003F3A61&quot;/&gt;&lt;wsp:rsid wsp:val=&quot;00410A5D&quot;/&gt;&lt;wsp:rsid wsp:val=&quot;00414909&quot;/&gt;&lt;wsp:rsid wsp:val=&quot;00416537&quot;/&gt;&lt;wsp:rsid wsp:val=&quot;00425A6A&quot;/&gt;&lt;wsp:rsid wsp:val=&quot;00426FBB&quot;/&gt;&lt;wsp:rsid wsp:val=&quot;00454542&quot;/&gt;&lt;wsp:rsid wsp:val=&quot;0047429A&quot;/&gt;&lt;wsp:rsid wsp:val=&quot;0048374C&quot;/&gt;&lt;wsp:rsid wsp:val=&quot;0048771D&quot;/&gt;&lt;wsp:rsid wsp:val=&quot;004A6605&quot;/&gt;&lt;wsp:rsid wsp:val=&quot;004C45FA&quot;/&gt;&lt;wsp:rsid wsp:val=&quot;004D35A3&quot;/&gt;&lt;wsp:rsid wsp:val=&quot;004E1BD8&quot;/&gt;&lt;wsp:rsid wsp:val=&quot;004E452A&quot;/&gt;&lt;wsp:rsid wsp:val=&quot;004E78E3&quot;/&gt;&lt;wsp:rsid wsp:val=&quot;004F2BFE&quot;/&gt;&lt;wsp:rsid wsp:val=&quot;004F63D3&quot;/&gt;&lt;wsp:rsid wsp:val=&quot;004F7DCF&quot;/&gt;&lt;wsp:rsid wsp:val=&quot;005004BF&quot;/&gt;&lt;wsp:rsid wsp:val=&quot;00502E89&quot;/&gt;&lt;wsp:rsid wsp:val=&quot;00506CFE&quot;/&gt;&lt;wsp:rsid wsp:val=&quot;00510E95&quot;/&gt;&lt;wsp:rsid wsp:val=&quot;005225C3&quot;/&gt;&lt;wsp:rsid wsp:val=&quot;00527D56&quot;/&gt;&lt;wsp:rsid wsp:val=&quot;0053221F&quot;/&gt;&lt;wsp:rsid wsp:val=&quot;00536FAE&quot;/&gt;&lt;wsp:rsid wsp:val=&quot;00542C85&quot;/&gt;&lt;wsp:rsid wsp:val=&quot;00553510&quot;/&gt;&lt;wsp:rsid wsp:val=&quot;00554186&quot;/&gt;&lt;wsp:rsid wsp:val=&quot;00585769&quot;/&gt;&lt;wsp:rsid wsp:val=&quot;00585C61&quot;/&gt;&lt;wsp:rsid wsp:val=&quot;00591130&quot;/&gt;&lt;wsp:rsid wsp:val=&quot;005A3F28&quot;/&gt;&lt;wsp:rsid wsp:val=&quot;005A40BE&quot;/&gt;&lt;wsp:rsid wsp:val=&quot;005B13E2&quot;/&gt;&lt;wsp:rsid wsp:val=&quot;005B47D7&quot;/&gt;&lt;wsp:rsid wsp:val=&quot;005C5526&quot;/&gt;&lt;wsp:rsid wsp:val=&quot;005C62C6&quot;/&gt;&lt;wsp:rsid wsp:val=&quot;005D7B9E&quot;/&gt;&lt;wsp:rsid wsp:val=&quot;005E112E&quot;/&gt;&lt;wsp:rsid wsp:val=&quot;005F0834&quot;/&gt;&lt;wsp:rsid wsp:val=&quot;005F68AB&quot;/&gt;&lt;wsp:rsid wsp:val=&quot;005F6DC3&quot;/&gt;&lt;wsp:rsid wsp:val=&quot;00601A8E&quot;/&gt;&lt;wsp:rsid wsp:val=&quot;0062033E&quot;/&gt;&lt;wsp:rsid wsp:val=&quot;00624482&quot;/&gt;&lt;wsp:rsid wsp:val=&quot;0064799C&quot;/&gt;&lt;wsp:rsid wsp:val=&quot;00654156&quot;/&gt;&lt;wsp:rsid wsp:val=&quot;006B47CA&quot;/&gt;&lt;wsp:rsid wsp:val=&quot;006C304C&quot;/&gt;&lt;wsp:rsid wsp:val=&quot;006C4511&quot;/&gt;&lt;wsp:rsid wsp:val=&quot;006C65F5&quot;/&gt;&lt;wsp:rsid wsp:val=&quot;006C7AAA&quot;/&gt;&lt;wsp:rsid wsp:val=&quot;006D1C2A&quot;/&gt;&lt;wsp:rsid wsp:val=&quot;006D264F&quot;/&gt;&lt;wsp:rsid wsp:val=&quot;006E2A8D&quot;/&gt;&lt;wsp:rsid wsp:val=&quot;006E7574&quot;/&gt;&lt;wsp:rsid wsp:val=&quot;00703430&quot;/&gt;&lt;wsp:rsid wsp:val=&quot;00703548&quot;/&gt;&lt;wsp:rsid wsp:val=&quot;00704E18&quot;/&gt;&lt;wsp:rsid wsp:val=&quot;007069BE&quot;/&gt;&lt;wsp:rsid wsp:val=&quot;00745C86&quot;/&gt;&lt;wsp:rsid wsp:val=&quot;00764603&quot;/&gt;&lt;wsp:rsid wsp:val=&quot;0076604D&quot;/&gt;&lt;wsp:rsid wsp:val=&quot;00790909&quot;/&gt;&lt;wsp:rsid wsp:val=&quot;007B1582&quot;/&gt;&lt;wsp:rsid wsp:val=&quot;007B5A07&quot;/&gt;&lt;wsp:rsid wsp:val=&quot;007C065D&quot;/&gt;&lt;wsp:rsid wsp:val=&quot;007D3E71&quot;/&gt;&lt;wsp:rsid wsp:val=&quot;007E5D6A&quot;/&gt;&lt;wsp:rsid wsp:val=&quot;007E645D&quot;/&gt;&lt;wsp:rsid wsp:val=&quot;007F75CA&quot;/&gt;&lt;wsp:rsid wsp:val=&quot;00814676&quot;/&gt;&lt;wsp:rsid wsp:val=&quot;00821E08&quot;/&gt;&lt;wsp:rsid wsp:val=&quot;00834EFD&quot;/&gt;&lt;wsp:rsid wsp:val=&quot;00844B24&quot;/&gt;&lt;wsp:rsid wsp:val=&quot;0084515F&quot;/&gt;&lt;wsp:rsid wsp:val=&quot;0085092D&quot;/&gt;&lt;wsp:rsid wsp:val=&quot;00865414&quot;/&gt;&lt;wsp:rsid wsp:val=&quot;00877D4C&quot;/&gt;&lt;wsp:rsid wsp:val=&quot;00883903&quot;/&gt;&lt;wsp:rsid wsp:val=&quot;0089763B&quot;/&gt;&lt;wsp:rsid wsp:val=&quot;008B6AE3&quot;/&gt;&lt;wsp:rsid wsp:val=&quot;008C1332&quot;/&gt;&lt;wsp:rsid wsp:val=&quot;008D1045&quot;/&gt;&lt;wsp:rsid wsp:val=&quot;008E5996&quot;/&gt;&lt;wsp:rsid wsp:val=&quot;00901AE1&quot;/&gt;&lt;wsp:rsid wsp:val=&quot;00912F93&quot;/&gt;&lt;wsp:rsid wsp:val=&quot;009205B4&quot;/&gt;&lt;wsp:rsid wsp:val=&quot;00955B59&quot;/&gt;&lt;wsp:rsid wsp:val=&quot;00992262&quot;/&gt;&lt;wsp:rsid wsp:val=&quot;009926BC&quot;/&gt;&lt;wsp:rsid wsp:val=&quot;009A4319&quot;/&gt;&lt;wsp:rsid wsp:val=&quot;009A6C3F&quot;/&gt;&lt;wsp:rsid wsp:val=&quot;009B73F2&quot;/&gt;&lt;wsp:rsid wsp:val=&quot;009C12BD&quot;/&gt;&lt;wsp:rsid wsp:val=&quot;009C50FE&quot;/&gt;&lt;wsp:rsid wsp:val=&quot;009E49DD&quot;/&gt;&lt;wsp:rsid wsp:val=&quot;00A03E75&quot;/&gt;&lt;wsp:rsid wsp:val=&quot;00A20627&quot;/&gt;&lt;wsp:rsid wsp:val=&quot;00A22FE9&quot;/&gt;&lt;wsp:rsid wsp:val=&quot;00A31A44&quot;/&gt;&lt;wsp:rsid wsp:val=&quot;00A32BFA&quot;/&gt;&lt;wsp:rsid wsp:val=&quot;00A3325E&quot;/&gt;&lt;wsp:rsid wsp:val=&quot;00A45FCE&quot;/&gt;&lt;wsp:rsid wsp:val=&quot;00A75671&quot;/&gt;&lt;wsp:rsid wsp:val=&quot;00A773CC&quot;/&gt;&lt;wsp:rsid wsp:val=&quot;00A924D0&quot;/&gt;&lt;wsp:rsid wsp:val=&quot;00A9318B&quot;/&gt;&lt;wsp:rsid wsp:val=&quot;00A94AC1&quot;/&gt;&lt;wsp:rsid wsp:val=&quot;00AB18B7&quot;/&gt;&lt;wsp:rsid wsp:val=&quot;00AD335D&quot;/&gt;&lt;wsp:rsid wsp:val=&quot;00AF114C&quot;/&gt;&lt;wsp:rsid wsp:val=&quot;00AF792B&quot;/&gt;&lt;wsp:rsid wsp:val=&quot;00B33D2F&quot;/&gt;&lt;wsp:rsid wsp:val=&quot;00B40A5B&quot;/&gt;&lt;wsp:rsid wsp:val=&quot;00B45C6B&quot;/&gt;&lt;wsp:rsid wsp:val=&quot;00B55D5E&quot;/&gt;&lt;wsp:rsid wsp:val=&quot;00B57A80&quot;/&gt;&lt;wsp:rsid wsp:val=&quot;00B70E9C&quot;/&gt;&lt;wsp:rsid wsp:val=&quot;00B713D8&quot;/&gt;&lt;wsp:rsid wsp:val=&quot;00B72979&quot;/&gt;&lt;wsp:rsid wsp:val=&quot;00B94516&quot;/&gt;&lt;wsp:rsid wsp:val=&quot;00BA25E2&quot;/&gt;&lt;wsp:rsid wsp:val=&quot;00BB2855&quot;/&gt;&lt;wsp:rsid wsp:val=&quot;00BC5343&quot;/&gt;&lt;wsp:rsid wsp:val=&quot;00BD19C1&quot;/&gt;&lt;wsp:rsid wsp:val=&quot;00BD25B8&quot;/&gt;&lt;wsp:rsid wsp:val=&quot;00C012E1&quot;/&gt;&lt;wsp:rsid wsp:val=&quot;00C06BB4&quot;/&gt;&lt;wsp:rsid wsp:val=&quot;00C10D20&quot;/&gt;&lt;wsp:rsid wsp:val=&quot;00C12E0C&quot;/&gt;&lt;wsp:rsid wsp:val=&quot;00C21916&quot;/&gt;&lt;wsp:rsid wsp:val=&quot;00C34915&quot;/&gt;&lt;wsp:rsid wsp:val=&quot;00C457CA&quot;/&gt;&lt;wsp:rsid wsp:val=&quot;00C53FB6&quot;/&gt;&lt;wsp:rsid wsp:val=&quot;00C57FB7&quot;/&gt;&lt;wsp:rsid wsp:val=&quot;00C644D4&quot;/&gt;&lt;wsp:rsid wsp:val=&quot;00C65F3F&quot;/&gt;&lt;wsp:rsid wsp:val=&quot;00C72414&quot;/&gt;&lt;wsp:rsid wsp:val=&quot;00C72B1A&quot;/&gt;&lt;wsp:rsid wsp:val=&quot;00C8667B&quot;/&gt;&lt;wsp:rsid wsp:val=&quot;00C90993&quot;/&gt;&lt;wsp:rsid wsp:val=&quot;00CA4CE3&quot;/&gt;&lt;wsp:rsid wsp:val=&quot;00CC72FD&quot;/&gt;&lt;wsp:rsid wsp:val=&quot;00CD4F3F&quot;/&gt;&lt;wsp:rsid wsp:val=&quot;00D311F8&quot;/&gt;&lt;wsp:rsid wsp:val=&quot;00D31660&quot;/&gt;&lt;wsp:rsid wsp:val=&quot;00D36B52&quot;/&gt;&lt;wsp:rsid wsp:val=&quot;00D377C8&quot;/&gt;&lt;wsp:rsid wsp:val=&quot;00D41274&quot;/&gt;&lt;wsp:rsid wsp:val=&quot;00D4229C&quot;/&gt;&lt;wsp:rsid wsp:val=&quot;00D43BF3&quot;/&gt;&lt;wsp:rsid wsp:val=&quot;00D549FB&quot;/&gt;&lt;wsp:rsid wsp:val=&quot;00D767BB&quot;/&gt;&lt;wsp:rsid wsp:val=&quot;00D939B0&quot;/&gt;&lt;wsp:rsid wsp:val=&quot;00DA31A2&quot;/&gt;&lt;wsp:rsid wsp:val=&quot;00DB16E0&quot;/&gt;&lt;wsp:rsid wsp:val=&quot;00DB2DF9&quot;/&gt;&lt;wsp:rsid wsp:val=&quot;00DB465D&quot;/&gt;&lt;wsp:rsid wsp:val=&quot;00DB48A2&quot;/&gt;&lt;wsp:rsid wsp:val=&quot;00DB7E63&quot;/&gt;&lt;wsp:rsid wsp:val=&quot;00DC2055&quot;/&gt;&lt;wsp:rsid wsp:val=&quot;00DC3908&quot;/&gt;&lt;wsp:rsid wsp:val=&quot;00DD71E8&quot;/&gt;&lt;wsp:rsid wsp:val=&quot;00DD7F83&quot;/&gt;&lt;wsp:rsid wsp:val=&quot;00DE4EB8&quot;/&gt;&lt;wsp:rsid wsp:val=&quot;00E0641E&quot;/&gt;&lt;wsp:rsid wsp:val=&quot;00E06664&quot;/&gt;&lt;wsp:rsid wsp:val=&quot;00E304BC&quot;/&gt;&lt;wsp:rsid wsp:val=&quot;00E32853&quot;/&gt;&lt;wsp:rsid wsp:val=&quot;00E34EBD&quot;/&gt;&lt;wsp:rsid wsp:val=&quot;00E401F8&quot;/&gt;&lt;wsp:rsid wsp:val=&quot;00E46425&quot;/&gt;&lt;wsp:rsid wsp:val=&quot;00E469FC&quot;/&gt;&lt;wsp:rsid wsp:val=&quot;00E47D0E&quot;/&gt;&lt;wsp:rsid wsp:val=&quot;00E65018&quot;/&gt;&lt;wsp:rsid wsp:val=&quot;00E76CA1&quot;/&gt;&lt;wsp:rsid wsp:val=&quot;00E94339&quot;/&gt;&lt;wsp:rsid wsp:val=&quot;00E97563&quot;/&gt;&lt;wsp:rsid wsp:val=&quot;00EB0B63&quot;/&gt;&lt;wsp:rsid wsp:val=&quot;00EC265C&quot;/&gt;&lt;wsp:rsid wsp:val=&quot;00ED61CB&quot;/&gt;&lt;wsp:rsid wsp:val=&quot;00EE752A&quot;/&gt;&lt;wsp:rsid wsp:val=&quot;00F06A72&quot;/&gt;&lt;wsp:rsid wsp:val=&quot;00F136F0&quot;/&gt;&lt;wsp:rsid wsp:val=&quot;00F20BBB&quot;/&gt;&lt;wsp:rsid wsp:val=&quot;00F36048&quot;/&gt;&lt;wsp:rsid wsp:val=&quot;00F43BD8&quot;/&gt;&lt;wsp:rsid wsp:val=&quot;00F562F3&quot;/&gt;&lt;wsp:rsid wsp:val=&quot;00F74B89&quot;/&gt;&lt;wsp:rsid wsp:val=&quot;00F75133&quot;/&gt;&lt;wsp:rsid wsp:val=&quot;00F83272&quot;/&gt;&lt;wsp:rsid wsp:val=&quot;00F9358D&quot;/&gt;&lt;wsp:rsid wsp:val=&quot;00FA3899&quot;/&gt;&lt;wsp:rsid wsp:val=&quot;00FA4909&quot;/&gt;&lt;wsp:rsid wsp:val=&quot;00FA5164&quot;/&gt;&lt;wsp:rsid wsp:val=&quot;00FA6751&quot;/&gt;&lt;wsp:rsid wsp:val=&quot;00FA6BD7&quot;/&gt;&lt;wsp:rsid wsp:val=&quot;00FB1048&quot;/&gt;&lt;wsp:rsid wsp:val=&quot;00FB62C4&quot;/&gt;&lt;wsp:rsid wsp:val=&quot;00FB7701&quot;/&gt;&lt;wsp:rsid wsp:val=&quot;00FD1AC5&quot;/&gt;&lt;wsp:rsid wsp:val=&quot;00FD5CF0&quot;/&gt;&lt;/wsp:rsids&gt;&lt;/w:docPr&gt;&lt;w:body&gt;&lt;wx:sect&gt;&lt;w:p wsp:rsidR=&quot;00814676&quot; wsp:rsidRDefault=&quot;00814676&quot; wsp:rsidP=&quot;00814676&quot;&gt;&lt;m:oMathPara&gt;&lt;m:oMath&gt;&lt;m:r&gt;&lt;w:rPr&gt;&lt;w:rFonts w:ascii=&quot;Cambria Math&quot; w:fareast=&quot;Times New Roman&quot; w:h-ansi=&quot;Cambria Math&quot;/&gt;&lt;wx:font wx:val=&quot;Cambria Math&quot;/&gt;&lt;w:i/&gt;&lt;/w:rPr&gt;&lt;m:t&gt;D&lt;/m:t&gt;&lt;/m:r&gt;&lt;/m:oMath&gt;&lt;/m:oMathPara&gt;&lt;/w:p&gt;&lt;w:sectPr wsp:rsidR=&quot;00000000&quot;&gt;&lt;w:pgSz w:w=&quot;12240&quot; w:h=&quot;15840&quot;/&gt;&lt;w:pgMar w:top=&quot;1440&quot; w:right=&quot;1440&quot; w:bottom=&quot;1440&quot; w:left=&quot;1440&quot; w:header=&quot;720&quot; w:footer=&quot;720&quot; w:gutter=&quot;0&quot;/&gt;&lt;w:cols w:space=&quot;720&quot;/&gt;&lt;/w:sectPr&gt;&lt;/wx:sect&gt;&lt;/w:body&gt;&lt;/w:wordDocument&gt;">
+          <v:shape id="_x0000_i1037" type="#_x0000_t75" style="width:8.3pt;height:13.85pt" equationxml="&lt;?xml version=&quot;1.0&quot; encoding=&quot;UTF-8&quot; standalone=&quot;yes&quot;?&gt;&#10;&lt;?mso-application progid=&quot;Word.Document&quot;?&gt;&#10;&lt;w:wordDocument xmlns:aml=&quot;http://schemas.microsoft.com/aml/2001/core&quot; xmlns:wpc=&quot;http://schemas.microsoft.com/office/word/2010/wordprocessingCanvas&quot; xmlns:cx=&quot;http://schemas.microsoft.com/office/drawing/2014/chartex&quot; xmlns:cx1=&quot;http://schemas.microsoft.com/office/drawing/2015/9/8/chartex&quot; xmlns:cx2=&quot;http://schemas.microsoft.com/office/drawing/2015/10/21/chartex&quot; xmlns:cx3=&quot;http://schemas.microsoft.com/office/drawing/2016/5/9/chartex&quot; xmlns:cx4=&quot;http://schemas.microsoft.com/office/drawing/2016/5/10/chartex&quot; xmlns:cx5=&quot;http://schemas.microsoft.com/office/drawing/2016/5/11/chartex&quot; xmlns:cx6=&quot;http://schemas.microsoft.com/office/drawing/2016/5/12/chartex&quot; xmlns:cx7=&quot;http://schemas.microsoft.com/office/drawing/2016/5/13/chartex&quot; xmlns:cx8=&quot;http://schemas.microsoft.com/office/drawing/2016/5/14/chartex&quot; xmlns:cr=&quot;http://schemas.microsoft.com/office/comments/2020/reactions&quot; xmlns:dt=&quot;uuid:C2F41010-65B3-11d1-A29F-00AA00C14882&quot; xmlns:mc=&quot;http://schemas.openxmlformats.org/markup-compatibility/2006&quot; xmlns:aink=&quot;http://schemas.microsoft.com/office/drawing/2016/ink&quot; xmlns:am3d=&quot;http://schemas.microsoft.com/office/drawing/2017/model3d&quot; xmlns:o=&quot;urn:schemas-microsoft-com:office:office&quot; xmlns:oel=&quot;http://schemas.microsoft.com/office/2019/extlst&quot; xmlns:m=&quot;http://schemas.openxmlformats.org/officeDocument/2006/math&quot; xmlns:v=&quot;urn:schemas-microsoft-com:vml&quot; xmlns:w10=&quot;urn:schemas-microsoft-com:office:word&quot; xmlns:w=&quot;http://schemas.microsoft.com/office/word/2003/wordml&quot; xmlns:wx=&quot;http://schemas.microsoft.com/office/word/2003/auxHint&quot; xmlns:wne=&quot;http://schemas.microsoft.com/office/word/2006/wordml&quot; xmlns:wsp=&quot;http://schemas.microsoft.com/office/word/2003/wordml/sp2&quot; xmlns:sl=&quot;http://schemas.microsoft.com/schemaLibrary/2003/core&quot; w:macrosPresent=&quot;no&quot; w:embeddedObjPresent=&quot;no&quot; w:ocxPresent=&quot;no&quot; xml:space=&quot;preserve&quot;&gt;&lt;w:ignoreSubtree w:val=&quot;http://schemas.microsoft.com/office/word/2003/wordml/sp2&quot;/&gt;&lt;o:DocumentProperties&gt;&lt;o:Version&gt;16&lt;/o:Version&gt;&lt;/o:DocumentProperties&gt;&lt;w:docPr&gt;&lt;w:view w:val=&quot;print&quot;/&gt;&lt;w:zoom w:percent=&quot;100&quot;/&gt;&lt;w:doNotEmbedSystemFonts/&gt;&lt;w:activeWritingStyle w:lang=&quot;EN-AU&quot; w:vendorID=&quot;64&quot; w:dllVersion=&quot;6&quot; w:nlCheck=&quot;on&quot; w:optionSet=&quot;1&quot;/&gt;&lt;w:activeWritingStyle w:lang=&quot;EN-GB&quot; w:vendorID=&quot;64&quot; w:dllVersion=&quot;6&quot; w:nlCheck=&quot;on&quot; w:optionSet=&quot;1&quot;/&gt;&lt;w:activeWritingStyle w:lang=&quot;EN-US&quot; w:vendorID=&quot;64&quot; w:dllVersion=&quot;6&quot; w:nlCheck=&quot;on&quot; w:optionSet=&quot;1&quot;/&gt;&lt;w:activeWritingStyle w:lang=&quot;EN-AU&quot; w:vendorID=&quot;64&quot; w:dllVersion=&quot;0&quot; w:nlCheck=&quot;on&quot; w:optionSet=&quot;0&quot;/&gt;&lt;w:activeWritingStyle w:lang=&quot;EN-GB&quot; w:vendorID=&quot;64&quot; w:dllVersion=&quot;0&quot; w:nlCheck=&quot;on&quot; w:optionSet=&quot;0&quot;/&gt;&lt;w:activeWritingStyle w:lang=&quot;EN-US&quot; w:vendorID=&quot;64&quot; w:dllVersion=&quot;0&quot; w:nlCheck=&quot;on&quot; w:optionSet=&quot;0&quot;/&gt;&lt;w:activeWritingStyle w:lang=&quot;ES-AR&quot; w:vendorID=&quot;64&quot; w:dllVersion=&quot;0&quot; w:nlCheck=&quot;on&quot; w:optionSet=&quot;0&quot;/&gt;&lt;w:activeWritingStyle w:lang=&quot;580A&quot; w:vendorID=&quot;64&quot; w:dllVersion=&quot;0&quot; w:nlCheck=&quot;on&quot; w:optionSet=&quot;0&quot;/&gt;&lt;w:activeWritingStyle w:lang=&quot;PT-BR&quot; w:vendorID=&quot;64&quot; w:dllVersion=&quot;0&quot; w:nlCheck=&quot;on&quot; w:optionSet=&quot;0&quot;/&gt;&lt;w:stylePaneFormatFilter w:val=&quot;3F01&quot;/&gt;&lt;w:defaultTabStop w:val=&quot;720&quot;/&gt;&lt;w:hyphenationZone w:val=&quot;425&quot;/&gt;&lt;w:characterSpacingControl w:val=&quot;DontCompress&quot;/&gt;&lt;w:optimizeForBrowser/&gt;&lt;w:validateAgainstSchema/&gt;&lt;w:saveInvalidXML w:val=&quot;off&quot;/&gt;&lt;w:ignoreMixedContent w:val=&quot;off&quot;/&gt;&lt;w:alwaysShowPlaceholderText w:val=&quot;off&quot;/&gt;&lt;w:compat&gt;&lt;w:breakWrappedTables/&gt;&lt;w:snapToGridInCell/&gt;&lt;w:applyBreakingRules/&gt;&lt;w:wrapTextWithPunct/&gt;&lt;w:useAsianBreakRules/&gt;&lt;w:useWord2002TableStyleRules/&gt;&lt;w:useFELayout/&gt;&lt;/w:compat&gt;&lt;wsp:rsids&gt;&lt;wsp:rsidRoot wsp:val=&quot;00426FBB&quot;/&gt;&lt;wsp:rsid wsp:val=&quot;000002E1&quot;/&gt;&lt;wsp:rsid wsp:val=&quot;00003C97&quot;/&gt;&lt;wsp:rsid wsp:val=&quot;00005565&quot;/&gt;&lt;wsp:rsid wsp:val=&quot;0001754A&quot;/&gt;&lt;wsp:rsid wsp:val=&quot;00017719&quot;/&gt;&lt;wsp:rsid wsp:val=&quot;00027F1D&quot;/&gt;&lt;wsp:rsid wsp:val=&quot;0003296C&quot;/&gt;&lt;wsp:rsid wsp:val=&quot;0003351F&quot;/&gt;&lt;wsp:rsid wsp:val=&quot;00044599&quot;/&gt;&lt;wsp:rsid wsp:val=&quot;000540E6&quot;/&gt;&lt;wsp:rsid wsp:val=&quot;00054421&quot;/&gt;&lt;wsp:rsid wsp:val=&quot;00062E46&quot;/&gt;&lt;wsp:rsid wsp:val=&quot;00074AC8&quot;/&gt;&lt;wsp:rsid wsp:val=&quot;00081408&quot;/&gt;&lt;wsp:rsid wsp:val=&quot;00081EBE&quot;/&gt;&lt;wsp:rsid wsp:val=&quot;00086EDC&quot;/&gt;&lt;wsp:rsid wsp:val=&quot;000B36A3&quot;/&gt;&lt;wsp:rsid wsp:val=&quot;000C013C&quot;/&gt;&lt;wsp:rsid wsp:val=&quot;000E3F84&quot;/&gt;&lt;wsp:rsid wsp:val=&quot;001056DF&quot;/&gt;&lt;wsp:rsid wsp:val=&quot;0010789C&quot;/&gt;&lt;wsp:rsid wsp:val=&quot;00114025&quot;/&gt;&lt;wsp:rsid wsp:val=&quot;001160D2&quot;/&gt;&lt;wsp:rsid wsp:val=&quot;00120636&quot;/&gt;&lt;wsp:rsid wsp:val=&quot;001348A5&quot;/&gt;&lt;wsp:rsid wsp:val=&quot;00151B8E&quot;/&gt;&lt;wsp:rsid wsp:val=&quot;00182170&quot;/&gt;&lt;wsp:rsid wsp:val=&quot;001928FB&quot;/&gt;&lt;wsp:rsid wsp:val=&quot;00192BC7&quot;/&gt;&lt;wsp:rsid wsp:val=&quot;00195BE6&quot;/&gt;&lt;wsp:rsid wsp:val=&quot;001A50EA&quot;/&gt;&lt;wsp:rsid wsp:val=&quot;001F16CD&quot;/&gt;&lt;wsp:rsid wsp:val=&quot;001F47D2&quot;/&gt;&lt;wsp:rsid wsp:val=&quot;002029C8&quot;/&gt;&lt;wsp:rsid wsp:val=&quot;0022285A&quot;/&gt;&lt;wsp:rsid wsp:val=&quot;00224C61&quot;/&gt;&lt;wsp:rsid wsp:val=&quot;00256ABC&quot;/&gt;&lt;wsp:rsid wsp:val=&quot;0027227B&quot;/&gt;&lt;wsp:rsid wsp:val=&quot;00273AC7&quot;/&gt;&lt;wsp:rsid wsp:val=&quot;00273D2C&quot;/&gt;&lt;wsp:rsid wsp:val=&quot;00285ECD&quot;/&gt;&lt;wsp:rsid wsp:val=&quot;00290E1B&quot;/&gt;&lt;wsp:rsid wsp:val=&quot;00291B17&quot;/&gt;&lt;wsp:rsid wsp:val=&quot;00291BB3&quot;/&gt;&lt;wsp:rsid wsp:val=&quot;002A6742&quot;/&gt;&lt;wsp:rsid wsp:val=&quot;002C1A7F&quot;/&gt;&lt;wsp:rsid wsp:val=&quot;002C4239&quot;/&gt;&lt;wsp:rsid wsp:val=&quot;002C559D&quot;/&gt;&lt;wsp:rsid wsp:val=&quot;002D16AE&quot;/&gt;&lt;wsp:rsid wsp:val=&quot;002D2D42&quot;/&gt;&lt;wsp:rsid wsp:val=&quot;002F72D0&quot;/&gt;&lt;wsp:rsid wsp:val=&quot;002F7A4F&quot;/&gt;&lt;wsp:rsid wsp:val=&quot;003003AB&quot;/&gt;&lt;wsp:rsid wsp:val=&quot;00302C35&quot;/&gt;&lt;wsp:rsid wsp:val=&quot;00311C49&quot;/&gt;&lt;wsp:rsid wsp:val=&quot;0032119E&quot;/&gt;&lt;wsp:rsid wsp:val=&quot;00321304&quot;/&gt;&lt;wsp:rsid wsp:val=&quot;00324FC2&quot;/&gt;&lt;wsp:rsid wsp:val=&quot;003312CA&quot;/&gt;&lt;wsp:rsid wsp:val=&quot;00331F84&quot;/&gt;&lt;wsp:rsid wsp:val=&quot;0037721F&quot;/&gt;&lt;wsp:rsid wsp:val=&quot;003950A4&quot;/&gt;&lt;wsp:rsid wsp:val=&quot;003A1E7E&quot;/&gt;&lt;wsp:rsid wsp:val=&quot;003E2FDC&quot;/&gt;&lt;wsp:rsid wsp:val=&quot;003E3577&quot;/&gt;&lt;wsp:rsid wsp:val=&quot;003F3A61&quot;/&gt;&lt;wsp:rsid wsp:val=&quot;00410A5D&quot;/&gt;&lt;wsp:rsid wsp:val=&quot;00414909&quot;/&gt;&lt;wsp:rsid wsp:val=&quot;00416537&quot;/&gt;&lt;wsp:rsid wsp:val=&quot;00425A6A&quot;/&gt;&lt;wsp:rsid wsp:val=&quot;00426FBB&quot;/&gt;&lt;wsp:rsid wsp:val=&quot;00454542&quot;/&gt;&lt;wsp:rsid wsp:val=&quot;0047429A&quot;/&gt;&lt;wsp:rsid wsp:val=&quot;0048374C&quot;/&gt;&lt;wsp:rsid wsp:val=&quot;0048771D&quot;/&gt;&lt;wsp:rsid wsp:val=&quot;004A6605&quot;/&gt;&lt;wsp:rsid wsp:val=&quot;004C45FA&quot;/&gt;&lt;wsp:rsid wsp:val=&quot;004D35A3&quot;/&gt;&lt;wsp:rsid wsp:val=&quot;004E1BD8&quot;/&gt;&lt;wsp:rsid wsp:val=&quot;004E452A&quot;/&gt;&lt;wsp:rsid wsp:val=&quot;004E78E3&quot;/&gt;&lt;wsp:rsid wsp:val=&quot;004F2BFE&quot;/&gt;&lt;wsp:rsid wsp:val=&quot;004F63D3&quot;/&gt;&lt;wsp:rsid wsp:val=&quot;004F7DCF&quot;/&gt;&lt;wsp:rsid wsp:val=&quot;005004BF&quot;/&gt;&lt;wsp:rsid wsp:val=&quot;00502E89&quot;/&gt;&lt;wsp:rsid wsp:val=&quot;00506CFE&quot;/&gt;&lt;wsp:rsid wsp:val=&quot;00510E95&quot;/&gt;&lt;wsp:rsid wsp:val=&quot;005225C3&quot;/&gt;&lt;wsp:rsid wsp:val=&quot;00527D56&quot;/&gt;&lt;wsp:rsid wsp:val=&quot;0053221F&quot;/&gt;&lt;wsp:rsid wsp:val=&quot;00536FAE&quot;/&gt;&lt;wsp:rsid wsp:val=&quot;00542C85&quot;/&gt;&lt;wsp:rsid wsp:val=&quot;00553510&quot;/&gt;&lt;wsp:rsid wsp:val=&quot;00554186&quot;/&gt;&lt;wsp:rsid wsp:val=&quot;00585769&quot;/&gt;&lt;wsp:rsid wsp:val=&quot;00585C61&quot;/&gt;&lt;wsp:rsid wsp:val=&quot;00591130&quot;/&gt;&lt;wsp:rsid wsp:val=&quot;005A3F28&quot;/&gt;&lt;wsp:rsid wsp:val=&quot;005A40BE&quot;/&gt;&lt;wsp:rsid wsp:val=&quot;005B13E2&quot;/&gt;&lt;wsp:rsid wsp:val=&quot;005B47D7&quot;/&gt;&lt;wsp:rsid wsp:val=&quot;005C5526&quot;/&gt;&lt;wsp:rsid wsp:val=&quot;005C62C6&quot;/&gt;&lt;wsp:rsid wsp:val=&quot;005D7B9E&quot;/&gt;&lt;wsp:rsid wsp:val=&quot;005E112E&quot;/&gt;&lt;wsp:rsid wsp:val=&quot;005F0834&quot;/&gt;&lt;wsp:rsid wsp:val=&quot;005F68AB&quot;/&gt;&lt;wsp:rsid wsp:val=&quot;005F6DC3&quot;/&gt;&lt;wsp:rsid wsp:val=&quot;00601A8E&quot;/&gt;&lt;wsp:rsid wsp:val=&quot;0062033E&quot;/&gt;&lt;wsp:rsid wsp:val=&quot;00624482&quot;/&gt;&lt;wsp:rsid wsp:val=&quot;0064799C&quot;/&gt;&lt;wsp:rsid wsp:val=&quot;00654156&quot;/&gt;&lt;wsp:rsid wsp:val=&quot;006B47CA&quot;/&gt;&lt;wsp:rsid wsp:val=&quot;006C304C&quot;/&gt;&lt;wsp:rsid wsp:val=&quot;006C4511&quot;/&gt;&lt;wsp:rsid wsp:val=&quot;006C65F5&quot;/&gt;&lt;wsp:rsid wsp:val=&quot;006C7AAA&quot;/&gt;&lt;wsp:rsid wsp:val=&quot;006D1C2A&quot;/&gt;&lt;wsp:rsid wsp:val=&quot;006D264F&quot;/&gt;&lt;wsp:rsid wsp:val=&quot;006E2A8D&quot;/&gt;&lt;wsp:rsid wsp:val=&quot;006E7574&quot;/&gt;&lt;wsp:rsid wsp:val=&quot;00703430&quot;/&gt;&lt;wsp:rsid wsp:val=&quot;00703548&quot;/&gt;&lt;wsp:rsid wsp:val=&quot;00704E18&quot;/&gt;&lt;wsp:rsid wsp:val=&quot;007069BE&quot;/&gt;&lt;wsp:rsid wsp:val=&quot;00745C86&quot;/&gt;&lt;wsp:rsid wsp:val=&quot;00764603&quot;/&gt;&lt;wsp:rsid wsp:val=&quot;0076604D&quot;/&gt;&lt;wsp:rsid wsp:val=&quot;00790909&quot;/&gt;&lt;wsp:rsid wsp:val=&quot;007B1582&quot;/&gt;&lt;wsp:rsid wsp:val=&quot;007B5A07&quot;/&gt;&lt;wsp:rsid wsp:val=&quot;007C065D&quot;/&gt;&lt;wsp:rsid wsp:val=&quot;007D3E71&quot;/&gt;&lt;wsp:rsid wsp:val=&quot;007E5D6A&quot;/&gt;&lt;wsp:rsid wsp:val=&quot;007E645D&quot;/&gt;&lt;wsp:rsid wsp:val=&quot;007F75CA&quot;/&gt;&lt;wsp:rsid wsp:val=&quot;00814676&quot;/&gt;&lt;wsp:rsid wsp:val=&quot;00821E08&quot;/&gt;&lt;wsp:rsid wsp:val=&quot;00834EFD&quot;/&gt;&lt;wsp:rsid wsp:val=&quot;00844B24&quot;/&gt;&lt;wsp:rsid wsp:val=&quot;0084515F&quot;/&gt;&lt;wsp:rsid wsp:val=&quot;0085092D&quot;/&gt;&lt;wsp:rsid wsp:val=&quot;00865414&quot;/&gt;&lt;wsp:rsid wsp:val=&quot;00877D4C&quot;/&gt;&lt;wsp:rsid wsp:val=&quot;00883903&quot;/&gt;&lt;wsp:rsid wsp:val=&quot;0089763B&quot;/&gt;&lt;wsp:rsid wsp:val=&quot;008B6AE3&quot;/&gt;&lt;wsp:rsid wsp:val=&quot;008C1332&quot;/&gt;&lt;wsp:rsid wsp:val=&quot;008D1045&quot;/&gt;&lt;wsp:rsid wsp:val=&quot;008E5996&quot;/&gt;&lt;wsp:rsid wsp:val=&quot;00901AE1&quot;/&gt;&lt;wsp:rsid wsp:val=&quot;00912F93&quot;/&gt;&lt;wsp:rsid wsp:val=&quot;009205B4&quot;/&gt;&lt;wsp:rsid wsp:val=&quot;00955B59&quot;/&gt;&lt;wsp:rsid wsp:val=&quot;00992262&quot;/&gt;&lt;wsp:rsid wsp:val=&quot;009926BC&quot;/&gt;&lt;wsp:rsid wsp:val=&quot;009A4319&quot;/&gt;&lt;wsp:rsid wsp:val=&quot;009A6C3F&quot;/&gt;&lt;wsp:rsid wsp:val=&quot;009B73F2&quot;/&gt;&lt;wsp:rsid wsp:val=&quot;009C12BD&quot;/&gt;&lt;wsp:rsid wsp:val=&quot;009C50FE&quot;/&gt;&lt;wsp:rsid wsp:val=&quot;009E49DD&quot;/&gt;&lt;wsp:rsid wsp:val=&quot;00A03E75&quot;/&gt;&lt;wsp:rsid wsp:val=&quot;00A20627&quot;/&gt;&lt;wsp:rsid wsp:val=&quot;00A22FE9&quot;/&gt;&lt;wsp:rsid wsp:val=&quot;00A31A44&quot;/&gt;&lt;wsp:rsid wsp:val=&quot;00A32BFA&quot;/&gt;&lt;wsp:rsid wsp:val=&quot;00A3325E&quot;/&gt;&lt;wsp:rsid wsp:val=&quot;00A45FCE&quot;/&gt;&lt;wsp:rsid wsp:val=&quot;00A75671&quot;/&gt;&lt;wsp:rsid wsp:val=&quot;00A773CC&quot;/&gt;&lt;wsp:rsid wsp:val=&quot;00A924D0&quot;/&gt;&lt;wsp:rsid wsp:val=&quot;00A9318B&quot;/&gt;&lt;wsp:rsid wsp:val=&quot;00A94AC1&quot;/&gt;&lt;wsp:rsid wsp:val=&quot;00AB18B7&quot;/&gt;&lt;wsp:rsid wsp:val=&quot;00AD335D&quot;/&gt;&lt;wsp:rsid wsp:val=&quot;00AF114C&quot;/&gt;&lt;wsp:rsid wsp:val=&quot;00AF792B&quot;/&gt;&lt;wsp:rsid wsp:val=&quot;00B33D2F&quot;/&gt;&lt;wsp:rsid wsp:val=&quot;00B40A5B&quot;/&gt;&lt;wsp:rsid wsp:val=&quot;00B45C6B&quot;/&gt;&lt;wsp:rsid wsp:val=&quot;00B55D5E&quot;/&gt;&lt;wsp:rsid wsp:val=&quot;00B57A80&quot;/&gt;&lt;wsp:rsid wsp:val=&quot;00B70E9C&quot;/&gt;&lt;wsp:rsid wsp:val=&quot;00B713D8&quot;/&gt;&lt;wsp:rsid wsp:val=&quot;00B72979&quot;/&gt;&lt;wsp:rsid wsp:val=&quot;00B94516&quot;/&gt;&lt;wsp:rsid wsp:val=&quot;00BA25E2&quot;/&gt;&lt;wsp:rsid wsp:val=&quot;00BB2855&quot;/&gt;&lt;wsp:rsid wsp:val=&quot;00BC5343&quot;/&gt;&lt;wsp:rsid wsp:val=&quot;00BD19C1&quot;/&gt;&lt;wsp:rsid wsp:val=&quot;00BD25B8&quot;/&gt;&lt;wsp:rsid wsp:val=&quot;00C012E1&quot;/&gt;&lt;wsp:rsid wsp:val=&quot;00C06BB4&quot;/&gt;&lt;wsp:rsid wsp:val=&quot;00C10D20&quot;/&gt;&lt;wsp:rsid wsp:val=&quot;00C12E0C&quot;/&gt;&lt;wsp:rsid wsp:val=&quot;00C21916&quot;/&gt;&lt;wsp:rsid wsp:val=&quot;00C34915&quot;/&gt;&lt;wsp:rsid wsp:val=&quot;00C457CA&quot;/&gt;&lt;wsp:rsid wsp:val=&quot;00C53FB6&quot;/&gt;&lt;wsp:rsid wsp:val=&quot;00C57FB7&quot;/&gt;&lt;wsp:rsid wsp:val=&quot;00C644D4&quot;/&gt;&lt;wsp:rsid wsp:val=&quot;00C65F3F&quot;/&gt;&lt;wsp:rsid wsp:val=&quot;00C72414&quot;/&gt;&lt;wsp:rsid wsp:val=&quot;00C72B1A&quot;/&gt;&lt;wsp:rsid wsp:val=&quot;00C8667B&quot;/&gt;&lt;wsp:rsid wsp:val=&quot;00C90993&quot;/&gt;&lt;wsp:rsid wsp:val=&quot;00CA4CE3&quot;/&gt;&lt;wsp:rsid wsp:val=&quot;00CC72FD&quot;/&gt;&lt;wsp:rsid wsp:val=&quot;00CD4F3F&quot;/&gt;&lt;wsp:rsid wsp:val=&quot;00D311F8&quot;/&gt;&lt;wsp:rsid wsp:val=&quot;00D31660&quot;/&gt;&lt;wsp:rsid wsp:val=&quot;00D36B52&quot;/&gt;&lt;wsp:rsid wsp:val=&quot;00D377C8&quot;/&gt;&lt;wsp:rsid wsp:val=&quot;00D41274&quot;/&gt;&lt;wsp:rsid wsp:val=&quot;00D4229C&quot;/&gt;&lt;wsp:rsid wsp:val=&quot;00D43BF3&quot;/&gt;&lt;wsp:rsid wsp:val=&quot;00D549FB&quot;/&gt;&lt;wsp:rsid wsp:val=&quot;00D767BB&quot;/&gt;&lt;wsp:rsid wsp:val=&quot;00D939B0&quot;/&gt;&lt;wsp:rsid wsp:val=&quot;00DA31A2&quot;/&gt;&lt;wsp:rsid wsp:val=&quot;00DB16E0&quot;/&gt;&lt;wsp:rsid wsp:val=&quot;00DB2DF9&quot;/&gt;&lt;wsp:rsid wsp:val=&quot;00DB465D&quot;/&gt;&lt;wsp:rsid wsp:val=&quot;00DB48A2&quot;/&gt;&lt;wsp:rsid wsp:val=&quot;00DB7E63&quot;/&gt;&lt;wsp:rsid wsp:val=&quot;00DC2055&quot;/&gt;&lt;wsp:rsid wsp:val=&quot;00DC3908&quot;/&gt;&lt;wsp:rsid wsp:val=&quot;00DD71E8&quot;/&gt;&lt;wsp:rsid wsp:val=&quot;00DD7F83&quot;/&gt;&lt;wsp:rsid wsp:val=&quot;00DE4EB8&quot;/&gt;&lt;wsp:rsid wsp:val=&quot;00E0641E&quot;/&gt;&lt;wsp:rsid wsp:val=&quot;00E06664&quot;/&gt;&lt;wsp:rsid wsp:val=&quot;00E304BC&quot;/&gt;&lt;wsp:rsid wsp:val=&quot;00E32853&quot;/&gt;&lt;wsp:rsid wsp:val=&quot;00E34EBD&quot;/&gt;&lt;wsp:rsid wsp:val=&quot;00E401F8&quot;/&gt;&lt;wsp:rsid wsp:val=&quot;00E46425&quot;/&gt;&lt;wsp:rsid wsp:val=&quot;00E469FC&quot;/&gt;&lt;wsp:rsid wsp:val=&quot;00E47D0E&quot;/&gt;&lt;wsp:rsid wsp:val=&quot;00E65018&quot;/&gt;&lt;wsp:rsid wsp:val=&quot;00E76CA1&quot;/&gt;&lt;wsp:rsid wsp:val=&quot;00E94339&quot;/&gt;&lt;wsp:rsid wsp:val=&quot;00E97563&quot;/&gt;&lt;wsp:rsid wsp:val=&quot;00EB0B63&quot;/&gt;&lt;wsp:rsid wsp:val=&quot;00EC265C&quot;/&gt;&lt;wsp:rsid wsp:val=&quot;00ED61CB&quot;/&gt;&lt;wsp:rsid wsp:val=&quot;00EE752A&quot;/&gt;&lt;wsp:rsid wsp:val=&quot;00F06A72&quot;/&gt;&lt;wsp:rsid wsp:val=&quot;00F136F0&quot;/&gt;&lt;wsp:rsid wsp:val=&quot;00F20BBB&quot;/&gt;&lt;wsp:rsid wsp:val=&quot;00F36048&quot;/&gt;&lt;wsp:rsid wsp:val=&quot;00F43BD8&quot;/&gt;&lt;wsp:rsid wsp:val=&quot;00F562F3&quot;/&gt;&lt;wsp:rsid wsp:val=&quot;00F74B89&quot;/&gt;&lt;wsp:rsid wsp:val=&quot;00F75133&quot;/&gt;&lt;wsp:rsid wsp:val=&quot;00F83272&quot;/&gt;&lt;wsp:rsid wsp:val=&quot;00F9358D&quot;/&gt;&lt;wsp:rsid wsp:val=&quot;00FA3899&quot;/&gt;&lt;wsp:rsid wsp:val=&quot;00FA4909&quot;/&gt;&lt;wsp:rsid wsp:val=&quot;00FA5164&quot;/&gt;&lt;wsp:rsid wsp:val=&quot;00FA6751&quot;/&gt;&lt;wsp:rsid wsp:val=&quot;00FA6BD7&quot;/&gt;&lt;wsp:rsid wsp:val=&quot;00FB1048&quot;/&gt;&lt;wsp:rsid wsp:val=&quot;00FB62C4&quot;/&gt;&lt;wsp:rsid wsp:val=&quot;00FB7701&quot;/&gt;&lt;wsp:rsid wsp:val=&quot;00FD1AC5&quot;/&gt;&lt;wsp:rsid wsp:val=&quot;00FD5CF0&quot;/&gt;&lt;/wsp:rsids&gt;&lt;/w:docPr&gt;&lt;w:body&gt;&lt;wx:sect&gt;&lt;w:p wsp:rsidR=&quot;00814676&quot; wsp:rsidRDefault=&quot;00814676&quot; wsp:rsidP=&quot;00814676&quot;&gt;&lt;m:oMathPara&gt;&lt;m:oMath&gt;&lt;m:r&gt;&lt;w:rPr&gt;&lt;w:rFonts w:ascii=&quot;Cambria Math&quot; w:fareast=&quot;Times New Roman&quot; w:h-ansi=&quot;Cambria Math&quot;/&gt;&lt;wx:font wx:val=&quot;Cambria Math&quot;/&gt;&lt;w:i/&gt;&lt;/w:rPr&gt;&lt;m:t&gt;D&lt;/m:t&gt;&lt;/m:r&gt;&lt;/m:oMath&gt;&lt;/m:oMathPara&gt;&lt;/w:p&gt;&lt;w:sectPr wsp:rsidR=&quot;00000000&quot;&gt;&lt;w:pgSz w:w=&quot;12240&quot; w:h=&quot;15840&quot;/&gt;&lt;w:pgMar w:top=&quot;1440&quot; w:right=&quot;1440&quot; w:bottom=&quot;1440&quot; w:left=&quot;1440&quot; w:header=&quot;720&quot; w:footer=&quot;720&quot; w:gutter=&quot;0&quot;/&gt;&lt;w:cols w:space=&quot;720&quot;/&gt;&lt;/w:sectPr&gt;&lt;/wx:sect&gt;&lt;/w:body&gt;&lt;/w:wordDocument&gt;">
             <v:imagedata r:id="rId15" o:title="" chromakey="white"/>
           </v:shape>
         </w:pict>
@@ -1214,7 +1214,7 @@
           <w:szCs w:val="20"/>
         </w:rPr>
         <w:pict w14:anchorId="0D9187C9">
-          <v:shape id="_x0000_i1071" type="#_x0000_t75" style="width:15.8pt;height:13.65pt" equationxml="&lt;?xml version=&quot;1.0&quot; encoding=&quot;UTF-8&quot; standalone=&quot;yes&quot;?&gt;&#10;&lt;?mso-application progid=&quot;Word.Document&quot;?&gt;&#10;&lt;w:wordDocument xmlns:aml=&quot;http://schemas.microsoft.com/aml/2001/core&quot; xmlns:wpc=&quot;http://schemas.microsoft.com/office/word/2010/wordprocessingCanvas&quot; xmlns:cx=&quot;http://schemas.microsoft.com/office/drawing/2014/chartex&quot; xmlns:cx1=&quot;http://schemas.microsoft.com/office/drawing/2015/9/8/chartex&quot; xmlns:cx2=&quot;http://schemas.microsoft.com/office/drawing/2015/10/21/chartex&quot; xmlns:cx3=&quot;http://schemas.microsoft.com/office/drawing/2016/5/9/chartex&quot; xmlns:cx4=&quot;http://schemas.microsoft.com/office/drawing/2016/5/10/chartex&quot; xmlns:cx5=&quot;http://schemas.microsoft.com/office/drawing/2016/5/11/chartex&quot; xmlns:cx6=&quot;http://schemas.microsoft.com/office/drawing/2016/5/12/chartex&quot; xmlns:cx7=&quot;http://schemas.microsoft.com/office/drawing/2016/5/13/chartex&quot; xmlns:cx8=&quot;http://schemas.microsoft.com/office/drawing/2016/5/14/chartex&quot; xmlns:cr=&quot;http://schemas.microsoft.com/office/comments/2020/reactions&quot; xmlns:dt=&quot;uuid:C2F41010-65B3-11d1-A29F-00AA00C14882&quot; xmlns:mc=&quot;http://schemas.openxmlformats.org/markup-compatibility/2006&quot; xmlns:aink=&quot;http://schemas.microsoft.com/office/drawing/2016/ink&quot; xmlns:am3d=&quot;http://schemas.microsoft.com/office/drawing/2017/model3d&quot; xmlns:o=&quot;urn:schemas-microsoft-com:office:office&quot; xmlns:oel=&quot;http://schemas.microsoft.com/office/2019/extlst&quot; xmlns:m=&quot;http://schemas.openxmlformats.org/officeDocument/2006/math&quot; xmlns:v=&quot;urn:schemas-microsoft-com:vml&quot; xmlns:w10=&quot;urn:schemas-microsoft-com:office:word&quot; xmlns:w=&quot;http://schemas.microsoft.com/office/word/2003/wordml&quot; xmlns:wx=&quot;http://schemas.microsoft.com/office/word/2003/auxHint&quot; xmlns:wne=&quot;http://schemas.microsoft.com/office/word/2006/wordml&quot; xmlns:wsp=&quot;http://schemas.microsoft.com/office/word/2003/wordml/sp2&quot; xmlns:sl=&quot;http://schemas.microsoft.com/schemaLibrary/2003/core&quot; w:macrosPresent=&quot;no&quot; w:embeddedObjPresent=&quot;no&quot; w:ocxPresent=&quot;no&quot; xml:space=&quot;preserve&quot;&gt;&lt;w:ignoreSubtree w:val=&quot;http://schemas.microsoft.com/office/word/2003/wordml/sp2&quot;/&gt;&lt;o:DocumentProperties&gt;&lt;o:Version&gt;16&lt;/o:Version&gt;&lt;/o:DocumentProperties&gt;&lt;w:docPr&gt;&lt;w:view w:val=&quot;print&quot;/&gt;&lt;w:zoom w:percent=&quot;100&quot;/&gt;&lt;w:doNotEmbedSystemFonts/&gt;&lt;w:activeWritingStyle w:lang=&quot;EN-AU&quot; w:vendorID=&quot;64&quot; w:dllVersion=&quot;6&quot; w:nlCheck=&quot;on&quot; w:optionSet=&quot;1&quot;/&gt;&lt;w:activeWritingStyle w:lang=&quot;EN-GB&quot; w:vendorID=&quot;64&quot; w:dllVersion=&quot;6&quot; w:nlCheck=&quot;on&quot; w:optionSet=&quot;1&quot;/&gt;&lt;w:activeWritingStyle w:lang=&quot;EN-US&quot; w:vendorID=&quot;64&quot; w:dllVersion=&quot;6&quot; w:nlCheck=&quot;on&quot; w:optionSet=&quot;1&quot;/&gt;&lt;w:activeWritingStyle w:lang=&quot;EN-AU&quot; w:vendorID=&quot;64&quot; w:dllVersion=&quot;0&quot; w:nlCheck=&quot;on&quot; w:optionSet=&quot;0&quot;/&gt;&lt;w:activeWritingStyle w:lang=&quot;EN-GB&quot; w:vendorID=&quot;64&quot; w:dllVersion=&quot;0&quot; w:nlCheck=&quot;on&quot; w:optionSet=&quot;0&quot;/&gt;&lt;w:activeWritingStyle w:lang=&quot;EN-US&quot; w:vendorID=&quot;64&quot; w:dllVersion=&quot;0&quot; w:nlCheck=&quot;on&quot; w:optionSet=&quot;0&quot;/&gt;&lt;w:activeWritingStyle w:lang=&quot;ES-AR&quot; w:vendorID=&quot;64&quot; w:dllVersion=&quot;0&quot; w:nlCheck=&quot;on&quot; w:optionSet=&quot;0&quot;/&gt;&lt;w:activeWritingStyle w:lang=&quot;580A&quot; w:vendorID=&quot;64&quot; w:dllVersion=&quot;0&quot; w:nlCheck=&quot;on&quot; w:optionSet=&quot;0&quot;/&gt;&lt;w:activeWritingStyle w:lang=&quot;PT-BR&quot; w:vendorID=&quot;64&quot; w:dllVersion=&quot;0&quot; w:nlCheck=&quot;on&quot; w:optionSet=&quot;0&quot;/&gt;&lt;w:stylePaneFormatFilter w:val=&quot;3F01&quot;/&gt;&lt;w:defaultTabStop w:val=&quot;720&quot;/&gt;&lt;w:hyphenationZone w:val=&quot;425&quot;/&gt;&lt;w:characterSpacingControl w:val=&quot;DontCompress&quot;/&gt;&lt;w:optimizeForBrowser/&gt;&lt;w:validateAgainstSchema/&gt;&lt;w:saveInvalidXML w:val=&quot;off&quot;/&gt;&lt;w:ignoreMixedContent w:val=&quot;off&quot;/&gt;&lt;w:alwaysShowPlaceholderText w:val=&quot;off&quot;/&gt;&lt;w:compat&gt;&lt;w:breakWrappedTables/&gt;&lt;w:snapToGridInCell/&gt;&lt;w:applyBreakingRules/&gt;&lt;w:wrapTextWithPunct/&gt;&lt;w:useAsianBreakRules/&gt;&lt;w:useWord2002TableStyleRules/&gt;&lt;w:useFELayout/&gt;&lt;/w:compat&gt;&lt;wsp:rsids&gt;&lt;wsp:rsidRoot wsp:val=&quot;00426FBB&quot;/&gt;&lt;wsp:rsid wsp:val=&quot;000002E1&quot;/&gt;&lt;wsp:rsid wsp:val=&quot;00003C97&quot;/&gt;&lt;wsp:rsid wsp:val=&quot;00005565&quot;/&gt;&lt;wsp:rsid wsp:val=&quot;0001754A&quot;/&gt;&lt;wsp:rsid wsp:val=&quot;00017719&quot;/&gt;&lt;wsp:rsid wsp:val=&quot;00027F1D&quot;/&gt;&lt;wsp:rsid wsp:val=&quot;0003296C&quot;/&gt;&lt;wsp:rsid wsp:val=&quot;0003351F&quot;/&gt;&lt;wsp:rsid wsp:val=&quot;00044599&quot;/&gt;&lt;wsp:rsid wsp:val=&quot;000540E6&quot;/&gt;&lt;wsp:rsid wsp:val=&quot;00054421&quot;/&gt;&lt;wsp:rsid wsp:val=&quot;00062E46&quot;/&gt;&lt;wsp:rsid wsp:val=&quot;00074AC8&quot;/&gt;&lt;wsp:rsid wsp:val=&quot;00081408&quot;/&gt;&lt;wsp:rsid wsp:val=&quot;00081EBE&quot;/&gt;&lt;wsp:rsid wsp:val=&quot;00086EDC&quot;/&gt;&lt;wsp:rsid wsp:val=&quot;000B36A3&quot;/&gt;&lt;wsp:rsid wsp:val=&quot;000C013C&quot;/&gt;&lt;wsp:rsid wsp:val=&quot;000E3F84&quot;/&gt;&lt;wsp:rsid wsp:val=&quot;001056DF&quot;/&gt;&lt;wsp:rsid wsp:val=&quot;0010789C&quot;/&gt;&lt;wsp:rsid wsp:val=&quot;00114025&quot;/&gt;&lt;wsp:rsid wsp:val=&quot;001160D2&quot;/&gt;&lt;wsp:rsid wsp:val=&quot;00120636&quot;/&gt;&lt;wsp:rsid wsp:val=&quot;001348A5&quot;/&gt;&lt;wsp:rsid wsp:val=&quot;00151B8E&quot;/&gt;&lt;wsp:rsid wsp:val=&quot;00182170&quot;/&gt;&lt;wsp:rsid wsp:val=&quot;001928FB&quot;/&gt;&lt;wsp:rsid wsp:val=&quot;00192BC7&quot;/&gt;&lt;wsp:rsid wsp:val=&quot;00195BE6&quot;/&gt;&lt;wsp:rsid wsp:val=&quot;001A50EA&quot;/&gt;&lt;wsp:rsid wsp:val=&quot;001F16CD&quot;/&gt;&lt;wsp:rsid wsp:val=&quot;001F47D2&quot;/&gt;&lt;wsp:rsid wsp:val=&quot;002029C8&quot;/&gt;&lt;wsp:rsid wsp:val=&quot;0022285A&quot;/&gt;&lt;wsp:rsid wsp:val=&quot;00224C61&quot;/&gt;&lt;wsp:rsid wsp:val=&quot;00256ABC&quot;/&gt;&lt;wsp:rsid wsp:val=&quot;0027227B&quot;/&gt;&lt;wsp:rsid wsp:val=&quot;00273AC7&quot;/&gt;&lt;wsp:rsid wsp:val=&quot;00273D2C&quot;/&gt;&lt;wsp:rsid wsp:val=&quot;00285ECD&quot;/&gt;&lt;wsp:rsid wsp:val=&quot;00290E1B&quot;/&gt;&lt;wsp:rsid wsp:val=&quot;00291B17&quot;/&gt;&lt;wsp:rsid wsp:val=&quot;00291BB3&quot;/&gt;&lt;wsp:rsid wsp:val=&quot;002A6742&quot;/&gt;&lt;wsp:rsid wsp:val=&quot;002C1A7F&quot;/&gt;&lt;wsp:rsid wsp:val=&quot;002C4239&quot;/&gt;&lt;wsp:rsid wsp:val=&quot;002C559D&quot;/&gt;&lt;wsp:rsid wsp:val=&quot;002D16AE&quot;/&gt;&lt;wsp:rsid wsp:val=&quot;002D2D42&quot;/&gt;&lt;wsp:rsid wsp:val=&quot;002F72D0&quot;/&gt;&lt;wsp:rsid wsp:val=&quot;002F7A4F&quot;/&gt;&lt;wsp:rsid wsp:val=&quot;003003AB&quot;/&gt;&lt;wsp:rsid wsp:val=&quot;00302C35&quot;/&gt;&lt;wsp:rsid wsp:val=&quot;00311C49&quot;/&gt;&lt;wsp:rsid wsp:val=&quot;0032119E&quot;/&gt;&lt;wsp:rsid wsp:val=&quot;00321304&quot;/&gt;&lt;wsp:rsid wsp:val=&quot;00324FC2&quot;/&gt;&lt;wsp:rsid wsp:val=&quot;003312CA&quot;/&gt;&lt;wsp:rsid wsp:val=&quot;00331F84&quot;/&gt;&lt;wsp:rsid wsp:val=&quot;0037721F&quot;/&gt;&lt;wsp:rsid wsp:val=&quot;003950A4&quot;/&gt;&lt;wsp:rsid wsp:val=&quot;003A1E7E&quot;/&gt;&lt;wsp:rsid wsp:val=&quot;003E2FDC&quot;/&gt;&lt;wsp:rsid wsp:val=&quot;003E3577&quot;/&gt;&lt;wsp:rsid wsp:val=&quot;003F3A61&quot;/&gt;&lt;wsp:rsid wsp:val=&quot;003F3E2C&quot;/&gt;&lt;wsp:rsid wsp:val=&quot;00410A5D&quot;/&gt;&lt;wsp:rsid wsp:val=&quot;00414909&quot;/&gt;&lt;wsp:rsid wsp:val=&quot;00416537&quot;/&gt;&lt;wsp:rsid wsp:val=&quot;00425A6A&quot;/&gt;&lt;wsp:rsid wsp:val=&quot;00426FBB&quot;/&gt;&lt;wsp:rsid wsp:val=&quot;00454542&quot;/&gt;&lt;wsp:rsid wsp:val=&quot;0047429A&quot;/&gt;&lt;wsp:rsid wsp:val=&quot;0048374C&quot;/&gt;&lt;wsp:rsid wsp:val=&quot;0048771D&quot;/&gt;&lt;wsp:rsid wsp:val=&quot;004A6605&quot;/&gt;&lt;wsp:rsid wsp:val=&quot;004C45FA&quot;/&gt;&lt;wsp:rsid wsp:val=&quot;004D35A3&quot;/&gt;&lt;wsp:rsid wsp:val=&quot;004E1BD8&quot;/&gt;&lt;wsp:rsid wsp:val=&quot;004E452A&quot;/&gt;&lt;wsp:rsid wsp:val=&quot;004E78E3&quot;/&gt;&lt;wsp:rsid wsp:val=&quot;004F2BFE&quot;/&gt;&lt;wsp:rsid wsp:val=&quot;004F63D3&quot;/&gt;&lt;wsp:rsid wsp:val=&quot;004F7DCF&quot;/&gt;&lt;wsp:rsid wsp:val=&quot;005004BF&quot;/&gt;&lt;wsp:rsid wsp:val=&quot;00502E89&quot;/&gt;&lt;wsp:rsid wsp:val=&quot;00506CFE&quot;/&gt;&lt;wsp:rsid wsp:val=&quot;00510E95&quot;/&gt;&lt;wsp:rsid wsp:val=&quot;005225C3&quot;/&gt;&lt;wsp:rsid wsp:val=&quot;00527D56&quot;/&gt;&lt;wsp:rsid wsp:val=&quot;0053221F&quot;/&gt;&lt;wsp:rsid wsp:val=&quot;00536FAE&quot;/&gt;&lt;wsp:rsid wsp:val=&quot;00542C85&quot;/&gt;&lt;wsp:rsid wsp:val=&quot;00553510&quot;/&gt;&lt;wsp:rsid wsp:val=&quot;00554186&quot;/&gt;&lt;wsp:rsid wsp:val=&quot;00585769&quot;/&gt;&lt;wsp:rsid wsp:val=&quot;00585C61&quot;/&gt;&lt;wsp:rsid wsp:val=&quot;00591130&quot;/&gt;&lt;wsp:rsid wsp:val=&quot;005A3F28&quot;/&gt;&lt;wsp:rsid wsp:val=&quot;005A40BE&quot;/&gt;&lt;wsp:rsid wsp:val=&quot;005B13E2&quot;/&gt;&lt;wsp:rsid wsp:val=&quot;005B47D7&quot;/&gt;&lt;wsp:rsid wsp:val=&quot;005C5526&quot;/&gt;&lt;wsp:rsid wsp:val=&quot;005C62C6&quot;/&gt;&lt;wsp:rsid wsp:val=&quot;005D7B9E&quot;/&gt;&lt;wsp:rsid wsp:val=&quot;005E112E&quot;/&gt;&lt;wsp:rsid wsp:val=&quot;005F0834&quot;/&gt;&lt;wsp:rsid wsp:val=&quot;005F68AB&quot;/&gt;&lt;wsp:rsid wsp:val=&quot;005F6DC3&quot;/&gt;&lt;wsp:rsid wsp:val=&quot;00601A8E&quot;/&gt;&lt;wsp:rsid wsp:val=&quot;0062033E&quot;/&gt;&lt;wsp:rsid wsp:val=&quot;00624482&quot;/&gt;&lt;wsp:rsid wsp:val=&quot;0064799C&quot;/&gt;&lt;wsp:rsid wsp:val=&quot;00654156&quot;/&gt;&lt;wsp:rsid wsp:val=&quot;006B47CA&quot;/&gt;&lt;wsp:rsid wsp:val=&quot;006C304C&quot;/&gt;&lt;wsp:rsid wsp:val=&quot;006C4511&quot;/&gt;&lt;wsp:rsid wsp:val=&quot;006C65F5&quot;/&gt;&lt;wsp:rsid wsp:val=&quot;006C7AAA&quot;/&gt;&lt;wsp:rsid wsp:val=&quot;006D1C2A&quot;/&gt;&lt;wsp:rsid wsp:val=&quot;006D264F&quot;/&gt;&lt;wsp:rsid wsp:val=&quot;006E2A8D&quot;/&gt;&lt;wsp:rsid wsp:val=&quot;006E7574&quot;/&gt;&lt;wsp:rsid wsp:val=&quot;00703430&quot;/&gt;&lt;wsp:rsid wsp:val=&quot;00703548&quot;/&gt;&lt;wsp:rsid wsp:val=&quot;00704E18&quot;/&gt;&lt;wsp:rsid wsp:val=&quot;007069BE&quot;/&gt;&lt;wsp:rsid wsp:val=&quot;00745C86&quot;/&gt;&lt;wsp:rsid wsp:val=&quot;00764603&quot;/&gt;&lt;wsp:rsid wsp:val=&quot;0076604D&quot;/&gt;&lt;wsp:rsid wsp:val=&quot;00790909&quot;/&gt;&lt;wsp:rsid wsp:val=&quot;007B1582&quot;/&gt;&lt;wsp:rsid wsp:val=&quot;007B5A07&quot;/&gt;&lt;wsp:rsid wsp:val=&quot;007C065D&quot;/&gt;&lt;wsp:rsid wsp:val=&quot;007D3E71&quot;/&gt;&lt;wsp:rsid wsp:val=&quot;007E5D6A&quot;/&gt;&lt;wsp:rsid wsp:val=&quot;007E645D&quot;/&gt;&lt;wsp:rsid wsp:val=&quot;007F75CA&quot;/&gt;&lt;wsp:rsid wsp:val=&quot;00821E08&quot;/&gt;&lt;wsp:rsid wsp:val=&quot;00834EFD&quot;/&gt;&lt;wsp:rsid wsp:val=&quot;00844B24&quot;/&gt;&lt;wsp:rsid wsp:val=&quot;0084515F&quot;/&gt;&lt;wsp:rsid wsp:val=&quot;0085092D&quot;/&gt;&lt;wsp:rsid wsp:val=&quot;00865414&quot;/&gt;&lt;wsp:rsid wsp:val=&quot;00877D4C&quot;/&gt;&lt;wsp:rsid wsp:val=&quot;00883903&quot;/&gt;&lt;wsp:rsid wsp:val=&quot;0089763B&quot;/&gt;&lt;wsp:rsid wsp:val=&quot;008B6AE3&quot;/&gt;&lt;wsp:rsid wsp:val=&quot;008C1332&quot;/&gt;&lt;wsp:rsid wsp:val=&quot;008D1045&quot;/&gt;&lt;wsp:rsid wsp:val=&quot;008E5996&quot;/&gt;&lt;wsp:rsid wsp:val=&quot;00901AE1&quot;/&gt;&lt;wsp:rsid wsp:val=&quot;00912F93&quot;/&gt;&lt;wsp:rsid wsp:val=&quot;009205B4&quot;/&gt;&lt;wsp:rsid wsp:val=&quot;00955B59&quot;/&gt;&lt;wsp:rsid wsp:val=&quot;00992262&quot;/&gt;&lt;wsp:rsid wsp:val=&quot;009926BC&quot;/&gt;&lt;wsp:rsid wsp:val=&quot;009A4319&quot;/&gt;&lt;wsp:rsid wsp:val=&quot;009A6C3F&quot;/&gt;&lt;wsp:rsid wsp:val=&quot;009B73F2&quot;/&gt;&lt;wsp:rsid wsp:val=&quot;009C12BD&quot;/&gt;&lt;wsp:rsid wsp:val=&quot;009C50FE&quot;/&gt;&lt;wsp:rsid wsp:val=&quot;009E49DD&quot;/&gt;&lt;wsp:rsid wsp:val=&quot;00A03E75&quot;/&gt;&lt;wsp:rsid wsp:val=&quot;00A20627&quot;/&gt;&lt;wsp:rsid wsp:val=&quot;00A22FE9&quot;/&gt;&lt;wsp:rsid wsp:val=&quot;00A31A44&quot;/&gt;&lt;wsp:rsid wsp:val=&quot;00A32BFA&quot;/&gt;&lt;wsp:rsid wsp:val=&quot;00A3325E&quot;/&gt;&lt;wsp:rsid wsp:val=&quot;00A45FCE&quot;/&gt;&lt;wsp:rsid wsp:val=&quot;00A75671&quot;/&gt;&lt;wsp:rsid wsp:val=&quot;00A773CC&quot;/&gt;&lt;wsp:rsid wsp:val=&quot;00A924D0&quot;/&gt;&lt;wsp:rsid wsp:val=&quot;00A9318B&quot;/&gt;&lt;wsp:rsid wsp:val=&quot;00A94AC1&quot;/&gt;&lt;wsp:rsid wsp:val=&quot;00AB18B7&quot;/&gt;&lt;wsp:rsid wsp:val=&quot;00AD335D&quot;/&gt;&lt;wsp:rsid wsp:val=&quot;00AF114C&quot;/&gt;&lt;wsp:rsid wsp:val=&quot;00AF792B&quot;/&gt;&lt;wsp:rsid wsp:val=&quot;00B33D2F&quot;/&gt;&lt;wsp:rsid wsp:val=&quot;00B40A5B&quot;/&gt;&lt;wsp:rsid wsp:val=&quot;00B45C6B&quot;/&gt;&lt;wsp:rsid wsp:val=&quot;00B55D5E&quot;/&gt;&lt;wsp:rsid wsp:val=&quot;00B57A80&quot;/&gt;&lt;wsp:rsid wsp:val=&quot;00B70E9C&quot;/&gt;&lt;wsp:rsid wsp:val=&quot;00B713D8&quot;/&gt;&lt;wsp:rsid wsp:val=&quot;00B72979&quot;/&gt;&lt;wsp:rsid wsp:val=&quot;00B94516&quot;/&gt;&lt;wsp:rsid wsp:val=&quot;00BA25E2&quot;/&gt;&lt;wsp:rsid wsp:val=&quot;00BB2855&quot;/&gt;&lt;wsp:rsid wsp:val=&quot;00BC5343&quot;/&gt;&lt;wsp:rsid wsp:val=&quot;00BD19C1&quot;/&gt;&lt;wsp:rsid wsp:val=&quot;00BD25B8&quot;/&gt;&lt;wsp:rsid wsp:val=&quot;00C012E1&quot;/&gt;&lt;wsp:rsid wsp:val=&quot;00C06BB4&quot;/&gt;&lt;wsp:rsid wsp:val=&quot;00C10D20&quot;/&gt;&lt;wsp:rsid wsp:val=&quot;00C12E0C&quot;/&gt;&lt;wsp:rsid wsp:val=&quot;00C21916&quot;/&gt;&lt;wsp:rsid wsp:val=&quot;00C34915&quot;/&gt;&lt;wsp:rsid wsp:val=&quot;00C457CA&quot;/&gt;&lt;wsp:rsid wsp:val=&quot;00C53FB6&quot;/&gt;&lt;wsp:rsid wsp:val=&quot;00C57FB7&quot;/&gt;&lt;wsp:rsid wsp:val=&quot;00C644D4&quot;/&gt;&lt;wsp:rsid wsp:val=&quot;00C65F3F&quot;/&gt;&lt;wsp:rsid wsp:val=&quot;00C72414&quot;/&gt;&lt;wsp:rsid wsp:val=&quot;00C72B1A&quot;/&gt;&lt;wsp:rsid wsp:val=&quot;00C8667B&quot;/&gt;&lt;wsp:rsid wsp:val=&quot;00C90993&quot;/&gt;&lt;wsp:rsid wsp:val=&quot;00CA4CE3&quot;/&gt;&lt;wsp:rsid wsp:val=&quot;00CC72FD&quot;/&gt;&lt;wsp:rsid wsp:val=&quot;00CD4F3F&quot;/&gt;&lt;wsp:rsid wsp:val=&quot;00D311F8&quot;/&gt;&lt;wsp:rsid wsp:val=&quot;00D31660&quot;/&gt;&lt;wsp:rsid wsp:val=&quot;00D36B52&quot;/&gt;&lt;wsp:rsid wsp:val=&quot;00D377C8&quot;/&gt;&lt;wsp:rsid wsp:val=&quot;00D41274&quot;/&gt;&lt;wsp:rsid wsp:val=&quot;00D4229C&quot;/&gt;&lt;wsp:rsid wsp:val=&quot;00D43BF3&quot;/&gt;&lt;wsp:rsid wsp:val=&quot;00D549FB&quot;/&gt;&lt;wsp:rsid wsp:val=&quot;00D767BB&quot;/&gt;&lt;wsp:rsid wsp:val=&quot;00D939B0&quot;/&gt;&lt;wsp:rsid wsp:val=&quot;00DA31A2&quot;/&gt;&lt;wsp:rsid wsp:val=&quot;00DB16E0&quot;/&gt;&lt;wsp:rsid wsp:val=&quot;00DB2DF9&quot;/&gt;&lt;wsp:rsid wsp:val=&quot;00DB465D&quot;/&gt;&lt;wsp:rsid wsp:val=&quot;00DB48A2&quot;/&gt;&lt;wsp:rsid wsp:val=&quot;00DB7E63&quot;/&gt;&lt;wsp:rsid wsp:val=&quot;00DC2055&quot;/&gt;&lt;wsp:rsid wsp:val=&quot;00DC3908&quot;/&gt;&lt;wsp:rsid wsp:val=&quot;00DD71E8&quot;/&gt;&lt;wsp:rsid wsp:val=&quot;00DD7F83&quot;/&gt;&lt;wsp:rsid wsp:val=&quot;00DE4EB8&quot;/&gt;&lt;wsp:rsid wsp:val=&quot;00E0641E&quot;/&gt;&lt;wsp:rsid wsp:val=&quot;00E06664&quot;/&gt;&lt;wsp:rsid wsp:val=&quot;00E304BC&quot;/&gt;&lt;wsp:rsid wsp:val=&quot;00E32853&quot;/&gt;&lt;wsp:rsid wsp:val=&quot;00E34EBD&quot;/&gt;&lt;wsp:rsid wsp:val=&quot;00E401F8&quot;/&gt;&lt;wsp:rsid wsp:val=&quot;00E46425&quot;/&gt;&lt;wsp:rsid wsp:val=&quot;00E469FC&quot;/&gt;&lt;wsp:rsid wsp:val=&quot;00E47D0E&quot;/&gt;&lt;wsp:rsid wsp:val=&quot;00E65018&quot;/&gt;&lt;wsp:rsid wsp:val=&quot;00E76CA1&quot;/&gt;&lt;wsp:rsid wsp:val=&quot;00E94339&quot;/&gt;&lt;wsp:rsid wsp:val=&quot;00E97563&quot;/&gt;&lt;wsp:rsid wsp:val=&quot;00EB0B63&quot;/&gt;&lt;wsp:rsid wsp:val=&quot;00EC265C&quot;/&gt;&lt;wsp:rsid wsp:val=&quot;00ED61CB&quot;/&gt;&lt;wsp:rsid wsp:val=&quot;00EE752A&quot;/&gt;&lt;wsp:rsid wsp:val=&quot;00F06A72&quot;/&gt;&lt;wsp:rsid wsp:val=&quot;00F136F0&quot;/&gt;&lt;wsp:rsid wsp:val=&quot;00F20BBB&quot;/&gt;&lt;wsp:rsid wsp:val=&quot;00F36048&quot;/&gt;&lt;wsp:rsid wsp:val=&quot;00F43BD8&quot;/&gt;&lt;wsp:rsid wsp:val=&quot;00F562F3&quot;/&gt;&lt;wsp:rsid wsp:val=&quot;00F74B89&quot;/&gt;&lt;wsp:rsid wsp:val=&quot;00F75133&quot;/&gt;&lt;wsp:rsid wsp:val=&quot;00F83272&quot;/&gt;&lt;wsp:rsid wsp:val=&quot;00F9358D&quot;/&gt;&lt;wsp:rsid wsp:val=&quot;00FA3899&quot;/&gt;&lt;wsp:rsid wsp:val=&quot;00FA4909&quot;/&gt;&lt;wsp:rsid wsp:val=&quot;00FA5164&quot;/&gt;&lt;wsp:rsid wsp:val=&quot;00FA6751&quot;/&gt;&lt;wsp:rsid wsp:val=&quot;00FA6BD7&quot;/&gt;&lt;wsp:rsid wsp:val=&quot;00FB1048&quot;/&gt;&lt;wsp:rsid wsp:val=&quot;00FB62C4&quot;/&gt;&lt;wsp:rsid wsp:val=&quot;00FB7701&quot;/&gt;&lt;wsp:rsid wsp:val=&quot;00FD1AC5&quot;/&gt;&lt;wsp:rsid wsp:val=&quot;00FD5CF0&quot;/&gt;&lt;/wsp:rsids&gt;&lt;/w:docPr&gt;&lt;w:body&gt;&lt;wx:sect&gt;&lt;w:p wsp:rsidR=&quot;003F3E2C&quot; wsp:rsidRDefault=&quot;003F3E2C&quot; wsp:rsidP=&quot;003F3E2C&quot;&gt;&lt;m:oMathPara&gt;&lt;m:oMath&gt;&lt;m:sSub&gt;&lt;m:sSubPr&gt;&lt;m:ctrlPr&gt;&lt;w:rPr&gt;&lt;w:rFonts w:ascii=&quot;Cambria Math&quot; w:fareast=&quot;Times New Roman&quot; w:h-ansi=&quot;Cambria Math&quot;/&gt;&lt;wx:font wx:val=&quot;Cambria Math&quot;/&gt;&lt;w:i/&gt;&lt;/w:rPr&gt;&lt;/m:ctrlPr&gt;&lt;/m:sSubPr&gt;&lt;m:e&gt;&lt;m:r&gt;&lt;w:rPr&gt;&lt;w:rFonts w:ascii=&quot;Cambria Math&quot; w:fareast=&quot;Times New Roman&quot; w:h-ansi=&quot;Cambria Math&quot;/&gt;&lt;wx:font wx:val=&quot;Cambria Math&quot;/&gt;&lt;w:i/&gt;&lt;/w:rPr&gt;&lt;m:t&gt;t&lt;/m:t&gt;&lt;/m:r&gt;&lt;/m:e&gt;&lt;m:sub&gt;&lt;m:r&gt;&lt;w:rPr&gt;&lt;w:rFonts w:ascii=&quot;Cambria Math&quot; w:fareast=&quot;Times New Roman&quot; w:h-ansi=&quot;Cambria Math&quot;/&gt;&lt;wx:font wx:val=&quot;Cambria Math&quot;/&gt;&lt;w:i/&gt;&lt;/w:rPr&gt;&lt;m:t&gt;on&lt;/m:t&gt;&lt;/m:r&gt;&lt;/m:sub&gt;&lt;/m:sSub&gt;&lt;/m:oMath&gt;&lt;/m:oMathPara&gt;&lt;/w:p&gt;&lt;w:sectPr wsp:rsidR=&quot;00000000&quot;&gt;&lt;w:pgSz w:w=&quot;12240&quot; w:h=&quot;15840&quot;/&gt;&lt;w:pgMar w:top=&quot;1440&quot; w:right=&quot;1440&quot; w:bottom=&quot;1440&quot; w:left=&quot;1440&quot; w:header=&quot;720&quot; w:footer=&quot;720&quot; w:gutter=&quot;0&quot;/&gt;&lt;w:cols w:space=&quot;720&quot;/&gt;&lt;/w:sectPr&gt;&lt;/wx:sect&gt;&lt;/w:body&gt;&lt;/w:wordDocument&gt;">
+          <v:shape id="_x0000_i1038" type="#_x0000_t75" style="width:15.9pt;height:13.85pt" equationxml="&lt;?xml version=&quot;1.0&quot; encoding=&quot;UTF-8&quot; standalone=&quot;yes&quot;?&gt;&#10;&lt;?mso-application progid=&quot;Word.Document&quot;?&gt;&#10;&lt;w:wordDocument xmlns:aml=&quot;http://schemas.microsoft.com/aml/2001/core&quot; xmlns:wpc=&quot;http://schemas.microsoft.com/office/word/2010/wordprocessingCanvas&quot; xmlns:cx=&quot;http://schemas.microsoft.com/office/drawing/2014/chartex&quot; xmlns:cx1=&quot;http://schemas.microsoft.com/office/drawing/2015/9/8/chartex&quot; xmlns:cx2=&quot;http://schemas.microsoft.com/office/drawing/2015/10/21/chartex&quot; xmlns:cx3=&quot;http://schemas.microsoft.com/office/drawing/2016/5/9/chartex&quot; xmlns:cx4=&quot;http://schemas.microsoft.com/office/drawing/2016/5/10/chartex&quot; xmlns:cx5=&quot;http://schemas.microsoft.com/office/drawing/2016/5/11/chartex&quot; xmlns:cx6=&quot;http://schemas.microsoft.com/office/drawing/2016/5/12/chartex&quot; xmlns:cx7=&quot;http://schemas.microsoft.com/office/drawing/2016/5/13/chartex&quot; xmlns:cx8=&quot;http://schemas.microsoft.com/office/drawing/2016/5/14/chartex&quot; xmlns:cr=&quot;http://schemas.microsoft.com/office/comments/2020/reactions&quot; xmlns:dt=&quot;uuid:C2F41010-65B3-11d1-A29F-00AA00C14882&quot; xmlns:mc=&quot;http://schemas.openxmlformats.org/markup-compatibility/2006&quot; xmlns:aink=&quot;http://schemas.microsoft.com/office/drawing/2016/ink&quot; xmlns:am3d=&quot;http://schemas.microsoft.com/office/drawing/2017/model3d&quot; xmlns:o=&quot;urn:schemas-microsoft-com:office:office&quot; xmlns:oel=&quot;http://schemas.microsoft.com/office/2019/extlst&quot; xmlns:m=&quot;http://schemas.openxmlformats.org/officeDocument/2006/math&quot; xmlns:v=&quot;urn:schemas-microsoft-com:vml&quot; xmlns:w10=&quot;urn:schemas-microsoft-com:office:word&quot; xmlns:w=&quot;http://schemas.microsoft.com/office/word/2003/wordml&quot; xmlns:wx=&quot;http://schemas.microsoft.com/office/word/2003/auxHint&quot; xmlns:wne=&quot;http://schemas.microsoft.com/office/word/2006/wordml&quot; xmlns:wsp=&quot;http://schemas.microsoft.com/office/word/2003/wordml/sp2&quot; xmlns:sl=&quot;http://schemas.microsoft.com/schemaLibrary/2003/core&quot; w:macrosPresent=&quot;no&quot; w:embeddedObjPresent=&quot;no&quot; w:ocxPresent=&quot;no&quot; xml:space=&quot;preserve&quot;&gt;&lt;w:ignoreSubtree w:val=&quot;http://schemas.microsoft.com/office/word/2003/wordml/sp2&quot;/&gt;&lt;o:DocumentProperties&gt;&lt;o:Version&gt;16&lt;/o:Version&gt;&lt;/o:DocumentProperties&gt;&lt;w:docPr&gt;&lt;w:view w:val=&quot;print&quot;/&gt;&lt;w:zoom w:percent=&quot;100&quot;/&gt;&lt;w:doNotEmbedSystemFonts/&gt;&lt;w:activeWritingStyle w:lang=&quot;EN-AU&quot; w:vendorID=&quot;64&quot; w:dllVersion=&quot;6&quot; w:nlCheck=&quot;on&quot; w:optionSet=&quot;1&quot;/&gt;&lt;w:activeWritingStyle w:lang=&quot;EN-GB&quot; w:vendorID=&quot;64&quot; w:dllVersion=&quot;6&quot; w:nlCheck=&quot;on&quot; w:optionSet=&quot;1&quot;/&gt;&lt;w:activeWritingStyle w:lang=&quot;EN-US&quot; w:vendorID=&quot;64&quot; w:dllVersion=&quot;6&quot; w:nlCheck=&quot;on&quot; w:optionSet=&quot;1&quot;/&gt;&lt;w:activeWritingStyle w:lang=&quot;EN-AU&quot; w:vendorID=&quot;64&quot; w:dllVersion=&quot;0&quot; w:nlCheck=&quot;on&quot; w:optionSet=&quot;0&quot;/&gt;&lt;w:activeWritingStyle w:lang=&quot;EN-GB&quot; w:vendorID=&quot;64&quot; w:dllVersion=&quot;0&quot; w:nlCheck=&quot;on&quot; w:optionSet=&quot;0&quot;/&gt;&lt;w:activeWritingStyle w:lang=&quot;EN-US&quot; w:vendorID=&quot;64&quot; w:dllVersion=&quot;0&quot; w:nlCheck=&quot;on&quot; w:optionSet=&quot;0&quot;/&gt;&lt;w:activeWritingStyle w:lang=&quot;ES-AR&quot; w:vendorID=&quot;64&quot; w:dllVersion=&quot;0&quot; w:nlCheck=&quot;on&quot; w:optionSet=&quot;0&quot;/&gt;&lt;w:activeWritingStyle w:lang=&quot;580A&quot; w:vendorID=&quot;64&quot; w:dllVersion=&quot;0&quot; w:nlCheck=&quot;on&quot; w:optionSet=&quot;0&quot;/&gt;&lt;w:activeWritingStyle w:lang=&quot;PT-BR&quot; w:vendorID=&quot;64&quot; w:dllVersion=&quot;0&quot; w:nlCheck=&quot;on&quot; w:optionSet=&quot;0&quot;/&gt;&lt;w:stylePaneFormatFilter w:val=&quot;3F01&quot;/&gt;&lt;w:defaultTabStop w:val=&quot;720&quot;/&gt;&lt;w:hyphenationZone w:val=&quot;425&quot;/&gt;&lt;w:characterSpacingControl w:val=&quot;DontCompress&quot;/&gt;&lt;w:optimizeForBrowser/&gt;&lt;w:validateAgainstSchema/&gt;&lt;w:saveInvalidXML w:val=&quot;off&quot;/&gt;&lt;w:ignoreMixedContent w:val=&quot;off&quot;/&gt;&lt;w:alwaysShowPlaceholderText w:val=&quot;off&quot;/&gt;&lt;w:compat&gt;&lt;w:breakWrappedTables/&gt;&lt;w:snapToGridInCell/&gt;&lt;w:applyBreakingRules/&gt;&lt;w:wrapTextWithPunct/&gt;&lt;w:useAsianBreakRules/&gt;&lt;w:useWord2002TableStyleRules/&gt;&lt;w:useFELayout/&gt;&lt;/w:compat&gt;&lt;wsp:rsids&gt;&lt;wsp:rsidRoot wsp:val=&quot;00426FBB&quot;/&gt;&lt;wsp:rsid wsp:val=&quot;000002E1&quot;/&gt;&lt;wsp:rsid wsp:val=&quot;00003C97&quot;/&gt;&lt;wsp:rsid wsp:val=&quot;00005565&quot;/&gt;&lt;wsp:rsid wsp:val=&quot;0001754A&quot;/&gt;&lt;wsp:rsid wsp:val=&quot;00017719&quot;/&gt;&lt;wsp:rsid wsp:val=&quot;00027F1D&quot;/&gt;&lt;wsp:rsid wsp:val=&quot;0003296C&quot;/&gt;&lt;wsp:rsid wsp:val=&quot;0003351F&quot;/&gt;&lt;wsp:rsid wsp:val=&quot;00044599&quot;/&gt;&lt;wsp:rsid wsp:val=&quot;000540E6&quot;/&gt;&lt;wsp:rsid wsp:val=&quot;00054421&quot;/&gt;&lt;wsp:rsid wsp:val=&quot;00062E46&quot;/&gt;&lt;wsp:rsid wsp:val=&quot;00074AC8&quot;/&gt;&lt;wsp:rsid wsp:val=&quot;00081408&quot;/&gt;&lt;wsp:rsid wsp:val=&quot;00081EBE&quot;/&gt;&lt;wsp:rsid wsp:val=&quot;00086EDC&quot;/&gt;&lt;wsp:rsid wsp:val=&quot;000B36A3&quot;/&gt;&lt;wsp:rsid wsp:val=&quot;000C013C&quot;/&gt;&lt;wsp:rsid wsp:val=&quot;000E3F84&quot;/&gt;&lt;wsp:rsid wsp:val=&quot;001056DF&quot;/&gt;&lt;wsp:rsid wsp:val=&quot;0010789C&quot;/&gt;&lt;wsp:rsid wsp:val=&quot;00114025&quot;/&gt;&lt;wsp:rsid wsp:val=&quot;001160D2&quot;/&gt;&lt;wsp:rsid wsp:val=&quot;00120636&quot;/&gt;&lt;wsp:rsid wsp:val=&quot;001348A5&quot;/&gt;&lt;wsp:rsid wsp:val=&quot;00151B8E&quot;/&gt;&lt;wsp:rsid wsp:val=&quot;00182170&quot;/&gt;&lt;wsp:rsid wsp:val=&quot;001928FB&quot;/&gt;&lt;wsp:rsid wsp:val=&quot;00192BC7&quot;/&gt;&lt;wsp:rsid wsp:val=&quot;00195BE6&quot;/&gt;&lt;wsp:rsid wsp:val=&quot;001A50EA&quot;/&gt;&lt;wsp:rsid wsp:val=&quot;001F16CD&quot;/&gt;&lt;wsp:rsid wsp:val=&quot;001F47D2&quot;/&gt;&lt;wsp:rsid wsp:val=&quot;002029C8&quot;/&gt;&lt;wsp:rsid wsp:val=&quot;0022285A&quot;/&gt;&lt;wsp:rsid wsp:val=&quot;00224C61&quot;/&gt;&lt;wsp:rsid wsp:val=&quot;00256ABC&quot;/&gt;&lt;wsp:rsid wsp:val=&quot;0027227B&quot;/&gt;&lt;wsp:rsid wsp:val=&quot;00273AC7&quot;/&gt;&lt;wsp:rsid wsp:val=&quot;00273D2C&quot;/&gt;&lt;wsp:rsid wsp:val=&quot;00285ECD&quot;/&gt;&lt;wsp:rsid wsp:val=&quot;00290E1B&quot;/&gt;&lt;wsp:rsid wsp:val=&quot;00291B17&quot;/&gt;&lt;wsp:rsid wsp:val=&quot;00291BB3&quot;/&gt;&lt;wsp:rsid wsp:val=&quot;002A6742&quot;/&gt;&lt;wsp:rsid wsp:val=&quot;002C1A7F&quot;/&gt;&lt;wsp:rsid wsp:val=&quot;002C4239&quot;/&gt;&lt;wsp:rsid wsp:val=&quot;002C559D&quot;/&gt;&lt;wsp:rsid wsp:val=&quot;002D16AE&quot;/&gt;&lt;wsp:rsid wsp:val=&quot;002D2D42&quot;/&gt;&lt;wsp:rsid wsp:val=&quot;002F72D0&quot;/&gt;&lt;wsp:rsid wsp:val=&quot;002F7A4F&quot;/&gt;&lt;wsp:rsid wsp:val=&quot;003003AB&quot;/&gt;&lt;wsp:rsid wsp:val=&quot;00302C35&quot;/&gt;&lt;wsp:rsid wsp:val=&quot;00311C49&quot;/&gt;&lt;wsp:rsid wsp:val=&quot;0032119E&quot;/&gt;&lt;wsp:rsid wsp:val=&quot;00321304&quot;/&gt;&lt;wsp:rsid wsp:val=&quot;00324FC2&quot;/&gt;&lt;wsp:rsid wsp:val=&quot;003312CA&quot;/&gt;&lt;wsp:rsid wsp:val=&quot;00331F84&quot;/&gt;&lt;wsp:rsid wsp:val=&quot;0037721F&quot;/&gt;&lt;wsp:rsid wsp:val=&quot;003950A4&quot;/&gt;&lt;wsp:rsid wsp:val=&quot;003A1E7E&quot;/&gt;&lt;wsp:rsid wsp:val=&quot;003E2FDC&quot;/&gt;&lt;wsp:rsid wsp:val=&quot;003E3577&quot;/&gt;&lt;wsp:rsid wsp:val=&quot;003F3A61&quot;/&gt;&lt;wsp:rsid wsp:val=&quot;003F3E2C&quot;/&gt;&lt;wsp:rsid wsp:val=&quot;00410A5D&quot;/&gt;&lt;wsp:rsid wsp:val=&quot;00414909&quot;/&gt;&lt;wsp:rsid wsp:val=&quot;00416537&quot;/&gt;&lt;wsp:rsid wsp:val=&quot;00425A6A&quot;/&gt;&lt;wsp:rsid wsp:val=&quot;00426FBB&quot;/&gt;&lt;wsp:rsid wsp:val=&quot;00454542&quot;/&gt;&lt;wsp:rsid wsp:val=&quot;0047429A&quot;/&gt;&lt;wsp:rsid wsp:val=&quot;0048374C&quot;/&gt;&lt;wsp:rsid wsp:val=&quot;0048771D&quot;/&gt;&lt;wsp:rsid wsp:val=&quot;004A6605&quot;/&gt;&lt;wsp:rsid wsp:val=&quot;004C45FA&quot;/&gt;&lt;wsp:rsid wsp:val=&quot;004D35A3&quot;/&gt;&lt;wsp:rsid wsp:val=&quot;004E1BD8&quot;/&gt;&lt;wsp:rsid wsp:val=&quot;004E452A&quot;/&gt;&lt;wsp:rsid wsp:val=&quot;004E78E3&quot;/&gt;&lt;wsp:rsid wsp:val=&quot;004F2BFE&quot;/&gt;&lt;wsp:rsid wsp:val=&quot;004F63D3&quot;/&gt;&lt;wsp:rsid wsp:val=&quot;004F7DCF&quot;/&gt;&lt;wsp:rsid wsp:val=&quot;005004BF&quot;/&gt;&lt;wsp:rsid wsp:val=&quot;00502E89&quot;/&gt;&lt;wsp:rsid wsp:val=&quot;00506CFE&quot;/&gt;&lt;wsp:rsid wsp:val=&quot;00510E95&quot;/&gt;&lt;wsp:rsid wsp:val=&quot;005225C3&quot;/&gt;&lt;wsp:rsid wsp:val=&quot;00527D56&quot;/&gt;&lt;wsp:rsid wsp:val=&quot;0053221F&quot;/&gt;&lt;wsp:rsid wsp:val=&quot;00536FAE&quot;/&gt;&lt;wsp:rsid wsp:val=&quot;00542C85&quot;/&gt;&lt;wsp:rsid wsp:val=&quot;00553510&quot;/&gt;&lt;wsp:rsid wsp:val=&quot;00554186&quot;/&gt;&lt;wsp:rsid wsp:val=&quot;00585769&quot;/&gt;&lt;wsp:rsid wsp:val=&quot;00585C61&quot;/&gt;&lt;wsp:rsid wsp:val=&quot;00591130&quot;/&gt;&lt;wsp:rsid wsp:val=&quot;005A3F28&quot;/&gt;&lt;wsp:rsid wsp:val=&quot;005A40BE&quot;/&gt;&lt;wsp:rsid wsp:val=&quot;005B13E2&quot;/&gt;&lt;wsp:rsid wsp:val=&quot;005B47D7&quot;/&gt;&lt;wsp:rsid wsp:val=&quot;005C5526&quot;/&gt;&lt;wsp:rsid wsp:val=&quot;005C62C6&quot;/&gt;&lt;wsp:rsid wsp:val=&quot;005D7B9E&quot;/&gt;&lt;wsp:rsid wsp:val=&quot;005E112E&quot;/&gt;&lt;wsp:rsid wsp:val=&quot;005F0834&quot;/&gt;&lt;wsp:rsid wsp:val=&quot;005F68AB&quot;/&gt;&lt;wsp:rsid wsp:val=&quot;005F6DC3&quot;/&gt;&lt;wsp:rsid wsp:val=&quot;00601A8E&quot;/&gt;&lt;wsp:rsid wsp:val=&quot;0062033E&quot;/&gt;&lt;wsp:rsid wsp:val=&quot;00624482&quot;/&gt;&lt;wsp:rsid wsp:val=&quot;0064799C&quot;/&gt;&lt;wsp:rsid wsp:val=&quot;00654156&quot;/&gt;&lt;wsp:rsid wsp:val=&quot;006B47CA&quot;/&gt;&lt;wsp:rsid wsp:val=&quot;006C304C&quot;/&gt;&lt;wsp:rsid wsp:val=&quot;006C4511&quot;/&gt;&lt;wsp:rsid wsp:val=&quot;006C65F5&quot;/&gt;&lt;wsp:rsid wsp:val=&quot;006C7AAA&quot;/&gt;&lt;wsp:rsid wsp:val=&quot;006D1C2A&quot;/&gt;&lt;wsp:rsid wsp:val=&quot;006D264F&quot;/&gt;&lt;wsp:rsid wsp:val=&quot;006E2A8D&quot;/&gt;&lt;wsp:rsid wsp:val=&quot;006E7574&quot;/&gt;&lt;wsp:rsid wsp:val=&quot;00703430&quot;/&gt;&lt;wsp:rsid wsp:val=&quot;00703548&quot;/&gt;&lt;wsp:rsid wsp:val=&quot;00704E18&quot;/&gt;&lt;wsp:rsid wsp:val=&quot;007069BE&quot;/&gt;&lt;wsp:rsid wsp:val=&quot;00745C86&quot;/&gt;&lt;wsp:rsid wsp:val=&quot;00764603&quot;/&gt;&lt;wsp:rsid wsp:val=&quot;0076604D&quot;/&gt;&lt;wsp:rsid wsp:val=&quot;00790909&quot;/&gt;&lt;wsp:rsid wsp:val=&quot;007B1582&quot;/&gt;&lt;wsp:rsid wsp:val=&quot;007B5A07&quot;/&gt;&lt;wsp:rsid wsp:val=&quot;007C065D&quot;/&gt;&lt;wsp:rsid wsp:val=&quot;007D3E71&quot;/&gt;&lt;wsp:rsid wsp:val=&quot;007E5D6A&quot;/&gt;&lt;wsp:rsid wsp:val=&quot;007E645D&quot;/&gt;&lt;wsp:rsid wsp:val=&quot;007F75CA&quot;/&gt;&lt;wsp:rsid wsp:val=&quot;00821E08&quot;/&gt;&lt;wsp:rsid wsp:val=&quot;00834EFD&quot;/&gt;&lt;wsp:rsid wsp:val=&quot;00844B24&quot;/&gt;&lt;wsp:rsid wsp:val=&quot;0084515F&quot;/&gt;&lt;wsp:rsid wsp:val=&quot;0085092D&quot;/&gt;&lt;wsp:rsid wsp:val=&quot;00865414&quot;/&gt;&lt;wsp:rsid wsp:val=&quot;00877D4C&quot;/&gt;&lt;wsp:rsid wsp:val=&quot;00883903&quot;/&gt;&lt;wsp:rsid wsp:val=&quot;0089763B&quot;/&gt;&lt;wsp:rsid wsp:val=&quot;008B6AE3&quot;/&gt;&lt;wsp:rsid wsp:val=&quot;008C1332&quot;/&gt;&lt;wsp:rsid wsp:val=&quot;008D1045&quot;/&gt;&lt;wsp:rsid wsp:val=&quot;008E5996&quot;/&gt;&lt;wsp:rsid wsp:val=&quot;00901AE1&quot;/&gt;&lt;wsp:rsid wsp:val=&quot;00912F93&quot;/&gt;&lt;wsp:rsid wsp:val=&quot;009205B4&quot;/&gt;&lt;wsp:rsid wsp:val=&quot;00955B59&quot;/&gt;&lt;wsp:rsid wsp:val=&quot;00992262&quot;/&gt;&lt;wsp:rsid wsp:val=&quot;009926BC&quot;/&gt;&lt;wsp:rsid wsp:val=&quot;009A4319&quot;/&gt;&lt;wsp:rsid wsp:val=&quot;009A6C3F&quot;/&gt;&lt;wsp:rsid wsp:val=&quot;009B73F2&quot;/&gt;&lt;wsp:rsid wsp:val=&quot;009C12BD&quot;/&gt;&lt;wsp:rsid wsp:val=&quot;009C50FE&quot;/&gt;&lt;wsp:rsid wsp:val=&quot;009E49DD&quot;/&gt;&lt;wsp:rsid wsp:val=&quot;00A03E75&quot;/&gt;&lt;wsp:rsid wsp:val=&quot;00A20627&quot;/&gt;&lt;wsp:rsid wsp:val=&quot;00A22FE9&quot;/&gt;&lt;wsp:rsid wsp:val=&quot;00A31A44&quot;/&gt;&lt;wsp:rsid wsp:val=&quot;00A32BFA&quot;/&gt;&lt;wsp:rsid wsp:val=&quot;00A3325E&quot;/&gt;&lt;wsp:rsid wsp:val=&quot;00A45FCE&quot;/&gt;&lt;wsp:rsid wsp:val=&quot;00A75671&quot;/&gt;&lt;wsp:rsid wsp:val=&quot;00A773CC&quot;/&gt;&lt;wsp:rsid wsp:val=&quot;00A924D0&quot;/&gt;&lt;wsp:rsid wsp:val=&quot;00A9318B&quot;/&gt;&lt;wsp:rsid wsp:val=&quot;00A94AC1&quot;/&gt;&lt;wsp:rsid wsp:val=&quot;00AB18B7&quot;/&gt;&lt;wsp:rsid wsp:val=&quot;00AD335D&quot;/&gt;&lt;wsp:rsid wsp:val=&quot;00AF114C&quot;/&gt;&lt;wsp:rsid wsp:val=&quot;00AF792B&quot;/&gt;&lt;wsp:rsid wsp:val=&quot;00B33D2F&quot;/&gt;&lt;wsp:rsid wsp:val=&quot;00B40A5B&quot;/&gt;&lt;wsp:rsid wsp:val=&quot;00B45C6B&quot;/&gt;&lt;wsp:rsid wsp:val=&quot;00B55D5E&quot;/&gt;&lt;wsp:rsid wsp:val=&quot;00B57A80&quot;/&gt;&lt;wsp:rsid wsp:val=&quot;00B70E9C&quot;/&gt;&lt;wsp:rsid wsp:val=&quot;00B713D8&quot;/&gt;&lt;wsp:rsid wsp:val=&quot;00B72979&quot;/&gt;&lt;wsp:rsid wsp:val=&quot;00B94516&quot;/&gt;&lt;wsp:rsid wsp:val=&quot;00BA25E2&quot;/&gt;&lt;wsp:rsid wsp:val=&quot;00BB2855&quot;/&gt;&lt;wsp:rsid wsp:val=&quot;00BC5343&quot;/&gt;&lt;wsp:rsid wsp:val=&quot;00BD19C1&quot;/&gt;&lt;wsp:rsid wsp:val=&quot;00BD25B8&quot;/&gt;&lt;wsp:rsid wsp:val=&quot;00C012E1&quot;/&gt;&lt;wsp:rsid wsp:val=&quot;00C06BB4&quot;/&gt;&lt;wsp:rsid wsp:val=&quot;00C10D20&quot;/&gt;&lt;wsp:rsid wsp:val=&quot;00C12E0C&quot;/&gt;&lt;wsp:rsid wsp:val=&quot;00C21916&quot;/&gt;&lt;wsp:rsid wsp:val=&quot;00C34915&quot;/&gt;&lt;wsp:rsid wsp:val=&quot;00C457CA&quot;/&gt;&lt;wsp:rsid wsp:val=&quot;00C53FB6&quot;/&gt;&lt;wsp:rsid wsp:val=&quot;00C57FB7&quot;/&gt;&lt;wsp:rsid wsp:val=&quot;00C644D4&quot;/&gt;&lt;wsp:rsid wsp:val=&quot;00C65F3F&quot;/&gt;&lt;wsp:rsid wsp:val=&quot;00C72414&quot;/&gt;&lt;wsp:rsid wsp:val=&quot;00C72B1A&quot;/&gt;&lt;wsp:rsid wsp:val=&quot;00C8667B&quot;/&gt;&lt;wsp:rsid wsp:val=&quot;00C90993&quot;/&gt;&lt;wsp:rsid wsp:val=&quot;00CA4CE3&quot;/&gt;&lt;wsp:rsid wsp:val=&quot;00CC72FD&quot;/&gt;&lt;wsp:rsid wsp:val=&quot;00CD4F3F&quot;/&gt;&lt;wsp:rsid wsp:val=&quot;00D311F8&quot;/&gt;&lt;wsp:rsid wsp:val=&quot;00D31660&quot;/&gt;&lt;wsp:rsid wsp:val=&quot;00D36B52&quot;/&gt;&lt;wsp:rsid wsp:val=&quot;00D377C8&quot;/&gt;&lt;wsp:rsid wsp:val=&quot;00D41274&quot;/&gt;&lt;wsp:rsid wsp:val=&quot;00D4229C&quot;/&gt;&lt;wsp:rsid wsp:val=&quot;00D43BF3&quot;/&gt;&lt;wsp:rsid wsp:val=&quot;00D549FB&quot;/&gt;&lt;wsp:rsid wsp:val=&quot;00D767BB&quot;/&gt;&lt;wsp:rsid wsp:val=&quot;00D939B0&quot;/&gt;&lt;wsp:rsid wsp:val=&quot;00DA31A2&quot;/&gt;&lt;wsp:rsid wsp:val=&quot;00DB16E0&quot;/&gt;&lt;wsp:rsid wsp:val=&quot;00DB2DF9&quot;/&gt;&lt;wsp:rsid wsp:val=&quot;00DB465D&quot;/&gt;&lt;wsp:rsid wsp:val=&quot;00DB48A2&quot;/&gt;&lt;wsp:rsid wsp:val=&quot;00DB7E63&quot;/&gt;&lt;wsp:rsid wsp:val=&quot;00DC2055&quot;/&gt;&lt;wsp:rsid wsp:val=&quot;00DC3908&quot;/&gt;&lt;wsp:rsid wsp:val=&quot;00DD71E8&quot;/&gt;&lt;wsp:rsid wsp:val=&quot;00DD7F83&quot;/&gt;&lt;wsp:rsid wsp:val=&quot;00DE4EB8&quot;/&gt;&lt;wsp:rsid wsp:val=&quot;00E0641E&quot;/&gt;&lt;wsp:rsid wsp:val=&quot;00E06664&quot;/&gt;&lt;wsp:rsid wsp:val=&quot;00E304BC&quot;/&gt;&lt;wsp:rsid wsp:val=&quot;00E32853&quot;/&gt;&lt;wsp:rsid wsp:val=&quot;00E34EBD&quot;/&gt;&lt;wsp:rsid wsp:val=&quot;00E401F8&quot;/&gt;&lt;wsp:rsid wsp:val=&quot;00E46425&quot;/&gt;&lt;wsp:rsid wsp:val=&quot;00E469FC&quot;/&gt;&lt;wsp:rsid wsp:val=&quot;00E47D0E&quot;/&gt;&lt;wsp:rsid wsp:val=&quot;00E65018&quot;/&gt;&lt;wsp:rsid wsp:val=&quot;00E76CA1&quot;/&gt;&lt;wsp:rsid wsp:val=&quot;00E94339&quot;/&gt;&lt;wsp:rsid wsp:val=&quot;00E97563&quot;/&gt;&lt;wsp:rsid wsp:val=&quot;00EB0B63&quot;/&gt;&lt;wsp:rsid wsp:val=&quot;00EC265C&quot;/&gt;&lt;wsp:rsid wsp:val=&quot;00ED61CB&quot;/&gt;&lt;wsp:rsid wsp:val=&quot;00EE752A&quot;/&gt;&lt;wsp:rsid wsp:val=&quot;00F06A72&quot;/&gt;&lt;wsp:rsid wsp:val=&quot;00F136F0&quot;/&gt;&lt;wsp:rsid wsp:val=&quot;00F20BBB&quot;/&gt;&lt;wsp:rsid wsp:val=&quot;00F36048&quot;/&gt;&lt;wsp:rsid wsp:val=&quot;00F43BD8&quot;/&gt;&lt;wsp:rsid wsp:val=&quot;00F562F3&quot;/&gt;&lt;wsp:rsid wsp:val=&quot;00F74B89&quot;/&gt;&lt;wsp:rsid wsp:val=&quot;00F75133&quot;/&gt;&lt;wsp:rsid wsp:val=&quot;00F83272&quot;/&gt;&lt;wsp:rsid wsp:val=&quot;00F9358D&quot;/&gt;&lt;wsp:rsid wsp:val=&quot;00FA3899&quot;/&gt;&lt;wsp:rsid wsp:val=&quot;00FA4909&quot;/&gt;&lt;wsp:rsid wsp:val=&quot;00FA5164&quot;/&gt;&lt;wsp:rsid wsp:val=&quot;00FA6751&quot;/&gt;&lt;wsp:rsid wsp:val=&quot;00FA6BD7&quot;/&gt;&lt;wsp:rsid wsp:val=&quot;00FB1048&quot;/&gt;&lt;wsp:rsid wsp:val=&quot;00FB62C4&quot;/&gt;&lt;wsp:rsid wsp:val=&quot;00FB7701&quot;/&gt;&lt;wsp:rsid wsp:val=&quot;00FD1AC5&quot;/&gt;&lt;wsp:rsid wsp:val=&quot;00FD5CF0&quot;/&gt;&lt;/wsp:rsids&gt;&lt;/w:docPr&gt;&lt;w:body&gt;&lt;wx:sect&gt;&lt;w:p wsp:rsidR=&quot;003F3E2C&quot; wsp:rsidRDefault=&quot;003F3E2C&quot; wsp:rsidP=&quot;003F3E2C&quot;&gt;&lt;m:oMathPara&gt;&lt;m:oMath&gt;&lt;m:sSub&gt;&lt;m:sSubPr&gt;&lt;m:ctrlPr&gt;&lt;w:rPr&gt;&lt;w:rFonts w:ascii=&quot;Cambria Math&quot; w:fareast=&quot;Times New Roman&quot; w:h-ansi=&quot;Cambria Math&quot;/&gt;&lt;wx:font wx:val=&quot;Cambria Math&quot;/&gt;&lt;w:i/&gt;&lt;/w:rPr&gt;&lt;/m:ctrlPr&gt;&lt;/m:sSubPr&gt;&lt;m:e&gt;&lt;m:r&gt;&lt;w:rPr&gt;&lt;w:rFonts w:ascii=&quot;Cambria Math&quot; w:fareast=&quot;Times New Roman&quot; w:h-ansi=&quot;Cambria Math&quot;/&gt;&lt;wx:font wx:val=&quot;Cambria Math&quot;/&gt;&lt;w:i/&gt;&lt;/w:rPr&gt;&lt;m:t&gt;t&lt;/m:t&gt;&lt;/m:r&gt;&lt;/m:e&gt;&lt;m:sub&gt;&lt;m:r&gt;&lt;w:rPr&gt;&lt;w:rFonts w:ascii=&quot;Cambria Math&quot; w:fareast=&quot;Times New Roman&quot; w:h-ansi=&quot;Cambria Math&quot;/&gt;&lt;wx:font wx:val=&quot;Cambria Math&quot;/&gt;&lt;w:i/&gt;&lt;/w:rPr&gt;&lt;m:t&gt;on&lt;/m:t&gt;&lt;/m:r&gt;&lt;/m:sub&gt;&lt;/m:sSub&gt;&lt;/m:oMath&gt;&lt;/m:oMathPara&gt;&lt;/w:p&gt;&lt;w:sectPr wsp:rsidR=&quot;00000000&quot;&gt;&lt;w:pgSz w:w=&quot;12240&quot; w:h=&quot;15840&quot;/&gt;&lt;w:pgMar w:top=&quot;1440&quot; w:right=&quot;1440&quot; w:bottom=&quot;1440&quot; w:left=&quot;1440&quot; w:header=&quot;720&quot; w:footer=&quot;720&quot; w:gutter=&quot;0&quot;/&gt;&lt;w:cols w:space=&quot;720&quot;/&gt;&lt;/w:sectPr&gt;&lt;/wx:sect&gt;&lt;/w:body&gt;&lt;/w:wordDocument&gt;">
             <v:imagedata r:id="rId17" o:title="" chromakey="white"/>
           </v:shape>
         </w:pict>
@@ -1243,7 +1243,7 @@
           <w:szCs w:val="20"/>
         </w:rPr>
         <w:pict w14:anchorId="08A6A7DE">
-          <v:shape id="_x0000_i1072" type="#_x0000_t75" style="width:15.8pt;height:13.65pt" equationxml="&lt;?xml version=&quot;1.0&quot; encoding=&quot;UTF-8&quot; standalone=&quot;yes&quot;?&gt;&#10;&lt;?mso-application progid=&quot;Word.Document&quot;?&gt;&#10;&lt;w:wordDocument xmlns:aml=&quot;http://schemas.microsoft.com/aml/2001/core&quot; xmlns:wpc=&quot;http://schemas.microsoft.com/office/word/2010/wordprocessingCanvas&quot; xmlns:cx=&quot;http://schemas.microsoft.com/office/drawing/2014/chartex&quot; xmlns:cx1=&quot;http://schemas.microsoft.com/office/drawing/2015/9/8/chartex&quot; xmlns:cx2=&quot;http://schemas.microsoft.com/office/drawing/2015/10/21/chartex&quot; xmlns:cx3=&quot;http://schemas.microsoft.com/office/drawing/2016/5/9/chartex&quot; xmlns:cx4=&quot;http://schemas.microsoft.com/office/drawing/2016/5/10/chartex&quot; xmlns:cx5=&quot;http://schemas.microsoft.com/office/drawing/2016/5/11/chartex&quot; xmlns:cx6=&quot;http://schemas.microsoft.com/office/drawing/2016/5/12/chartex&quot; xmlns:cx7=&quot;http://schemas.microsoft.com/office/drawing/2016/5/13/chartex&quot; xmlns:cx8=&quot;http://schemas.microsoft.com/office/drawing/2016/5/14/chartex&quot; xmlns:cr=&quot;http://schemas.microsoft.com/office/comments/2020/reactions&quot; xmlns:dt=&quot;uuid:C2F41010-65B3-11d1-A29F-00AA00C14882&quot; xmlns:mc=&quot;http://schemas.openxmlformats.org/markup-compatibility/2006&quot; xmlns:aink=&quot;http://schemas.microsoft.com/office/drawing/2016/ink&quot; xmlns:am3d=&quot;http://schemas.microsoft.com/office/drawing/2017/model3d&quot; xmlns:o=&quot;urn:schemas-microsoft-com:office:office&quot; xmlns:oel=&quot;http://schemas.microsoft.com/office/2019/extlst&quot; xmlns:m=&quot;http://schemas.openxmlformats.org/officeDocument/2006/math&quot; xmlns:v=&quot;urn:schemas-microsoft-com:vml&quot; xmlns:w10=&quot;urn:schemas-microsoft-com:office:word&quot; xmlns:w=&quot;http://schemas.microsoft.com/office/word/2003/wordml&quot; xmlns:wx=&quot;http://schemas.microsoft.com/office/word/2003/auxHint&quot; xmlns:wne=&quot;http://schemas.microsoft.com/office/word/2006/wordml&quot; xmlns:wsp=&quot;http://schemas.microsoft.com/office/word/2003/wordml/sp2&quot; xmlns:sl=&quot;http://schemas.microsoft.com/schemaLibrary/2003/core&quot; w:macrosPresent=&quot;no&quot; w:embeddedObjPresent=&quot;no&quot; w:ocxPresent=&quot;no&quot; xml:space=&quot;preserve&quot;&gt;&lt;w:ignoreSubtree w:val=&quot;http://schemas.microsoft.com/office/word/2003/wordml/sp2&quot;/&gt;&lt;o:DocumentProperties&gt;&lt;o:Version&gt;16&lt;/o:Version&gt;&lt;/o:DocumentProperties&gt;&lt;w:docPr&gt;&lt;w:view w:val=&quot;print&quot;/&gt;&lt;w:zoom w:percent=&quot;100&quot;/&gt;&lt;w:doNotEmbedSystemFonts/&gt;&lt;w:activeWritingStyle w:lang=&quot;EN-AU&quot; w:vendorID=&quot;64&quot; w:dllVersion=&quot;6&quot; w:nlCheck=&quot;on&quot; w:optionSet=&quot;1&quot;/&gt;&lt;w:activeWritingStyle w:lang=&quot;EN-GB&quot; w:vendorID=&quot;64&quot; w:dllVersion=&quot;6&quot; w:nlCheck=&quot;on&quot; w:optionSet=&quot;1&quot;/&gt;&lt;w:activeWritingStyle w:lang=&quot;EN-US&quot; w:vendorID=&quot;64&quot; w:dllVersion=&quot;6&quot; w:nlCheck=&quot;on&quot; w:optionSet=&quot;1&quot;/&gt;&lt;w:activeWritingStyle w:lang=&quot;EN-AU&quot; w:vendorID=&quot;64&quot; w:dllVersion=&quot;0&quot; w:nlCheck=&quot;on&quot; w:optionSet=&quot;0&quot;/&gt;&lt;w:activeWritingStyle w:lang=&quot;EN-GB&quot; w:vendorID=&quot;64&quot; w:dllVersion=&quot;0&quot; w:nlCheck=&quot;on&quot; w:optionSet=&quot;0&quot;/&gt;&lt;w:activeWritingStyle w:lang=&quot;EN-US&quot; w:vendorID=&quot;64&quot; w:dllVersion=&quot;0&quot; w:nlCheck=&quot;on&quot; w:optionSet=&quot;0&quot;/&gt;&lt;w:activeWritingStyle w:lang=&quot;ES-AR&quot; w:vendorID=&quot;64&quot; w:dllVersion=&quot;0&quot; w:nlCheck=&quot;on&quot; w:optionSet=&quot;0&quot;/&gt;&lt;w:activeWritingStyle w:lang=&quot;580A&quot; w:vendorID=&quot;64&quot; w:dllVersion=&quot;0&quot; w:nlCheck=&quot;on&quot; w:optionSet=&quot;0&quot;/&gt;&lt;w:activeWritingStyle w:lang=&quot;PT-BR&quot; w:vendorID=&quot;64&quot; w:dllVersion=&quot;0&quot; w:nlCheck=&quot;on&quot; w:optionSet=&quot;0&quot;/&gt;&lt;w:stylePaneFormatFilter w:val=&quot;3F01&quot;/&gt;&lt;w:defaultTabStop w:val=&quot;720&quot;/&gt;&lt;w:hyphenationZone w:val=&quot;425&quot;/&gt;&lt;w:characterSpacingControl w:val=&quot;DontCompress&quot;/&gt;&lt;w:optimizeForBrowser/&gt;&lt;w:validateAgainstSchema/&gt;&lt;w:saveInvalidXML w:val=&quot;off&quot;/&gt;&lt;w:ignoreMixedContent w:val=&quot;off&quot;/&gt;&lt;w:alwaysShowPlaceholderText w:val=&quot;off&quot;/&gt;&lt;w:compat&gt;&lt;w:breakWrappedTables/&gt;&lt;w:snapToGridInCell/&gt;&lt;w:applyBreakingRules/&gt;&lt;w:wrapTextWithPunct/&gt;&lt;w:useAsianBreakRules/&gt;&lt;w:useWord2002TableStyleRules/&gt;&lt;w:useFELayout/&gt;&lt;/w:compat&gt;&lt;wsp:rsids&gt;&lt;wsp:rsidRoot wsp:val=&quot;00426FBB&quot;/&gt;&lt;wsp:rsid wsp:val=&quot;000002E1&quot;/&gt;&lt;wsp:rsid wsp:val=&quot;00003C97&quot;/&gt;&lt;wsp:rsid wsp:val=&quot;00005565&quot;/&gt;&lt;wsp:rsid wsp:val=&quot;0001754A&quot;/&gt;&lt;wsp:rsid wsp:val=&quot;00017719&quot;/&gt;&lt;wsp:rsid wsp:val=&quot;00027F1D&quot;/&gt;&lt;wsp:rsid wsp:val=&quot;0003296C&quot;/&gt;&lt;wsp:rsid wsp:val=&quot;0003351F&quot;/&gt;&lt;wsp:rsid wsp:val=&quot;00044599&quot;/&gt;&lt;wsp:rsid wsp:val=&quot;000540E6&quot;/&gt;&lt;wsp:rsid wsp:val=&quot;00054421&quot;/&gt;&lt;wsp:rsid wsp:val=&quot;00062E46&quot;/&gt;&lt;wsp:rsid wsp:val=&quot;00074AC8&quot;/&gt;&lt;wsp:rsid wsp:val=&quot;00081408&quot;/&gt;&lt;wsp:rsid wsp:val=&quot;00081EBE&quot;/&gt;&lt;wsp:rsid wsp:val=&quot;00086EDC&quot;/&gt;&lt;wsp:rsid wsp:val=&quot;000B36A3&quot;/&gt;&lt;wsp:rsid wsp:val=&quot;000C013C&quot;/&gt;&lt;wsp:rsid wsp:val=&quot;000E3F84&quot;/&gt;&lt;wsp:rsid wsp:val=&quot;001056DF&quot;/&gt;&lt;wsp:rsid wsp:val=&quot;0010789C&quot;/&gt;&lt;wsp:rsid wsp:val=&quot;00114025&quot;/&gt;&lt;wsp:rsid wsp:val=&quot;001160D2&quot;/&gt;&lt;wsp:rsid wsp:val=&quot;00120636&quot;/&gt;&lt;wsp:rsid wsp:val=&quot;001348A5&quot;/&gt;&lt;wsp:rsid wsp:val=&quot;00151B8E&quot;/&gt;&lt;wsp:rsid wsp:val=&quot;00182170&quot;/&gt;&lt;wsp:rsid wsp:val=&quot;001928FB&quot;/&gt;&lt;wsp:rsid wsp:val=&quot;00192BC7&quot;/&gt;&lt;wsp:rsid wsp:val=&quot;00195BE6&quot;/&gt;&lt;wsp:rsid wsp:val=&quot;001A50EA&quot;/&gt;&lt;wsp:rsid wsp:val=&quot;001F16CD&quot;/&gt;&lt;wsp:rsid wsp:val=&quot;001F47D2&quot;/&gt;&lt;wsp:rsid wsp:val=&quot;002029C8&quot;/&gt;&lt;wsp:rsid wsp:val=&quot;0022285A&quot;/&gt;&lt;wsp:rsid wsp:val=&quot;00224C61&quot;/&gt;&lt;wsp:rsid wsp:val=&quot;00256ABC&quot;/&gt;&lt;wsp:rsid wsp:val=&quot;0027227B&quot;/&gt;&lt;wsp:rsid wsp:val=&quot;00273AC7&quot;/&gt;&lt;wsp:rsid wsp:val=&quot;00273D2C&quot;/&gt;&lt;wsp:rsid wsp:val=&quot;00285ECD&quot;/&gt;&lt;wsp:rsid wsp:val=&quot;00290E1B&quot;/&gt;&lt;wsp:rsid wsp:val=&quot;00291B17&quot;/&gt;&lt;wsp:rsid wsp:val=&quot;00291BB3&quot;/&gt;&lt;wsp:rsid wsp:val=&quot;002A6742&quot;/&gt;&lt;wsp:rsid wsp:val=&quot;002C1A7F&quot;/&gt;&lt;wsp:rsid wsp:val=&quot;002C4239&quot;/&gt;&lt;wsp:rsid wsp:val=&quot;002C559D&quot;/&gt;&lt;wsp:rsid wsp:val=&quot;002D16AE&quot;/&gt;&lt;wsp:rsid wsp:val=&quot;002D2D42&quot;/&gt;&lt;wsp:rsid wsp:val=&quot;002F72D0&quot;/&gt;&lt;wsp:rsid wsp:val=&quot;002F7A4F&quot;/&gt;&lt;wsp:rsid wsp:val=&quot;003003AB&quot;/&gt;&lt;wsp:rsid wsp:val=&quot;00302C35&quot;/&gt;&lt;wsp:rsid wsp:val=&quot;00311C49&quot;/&gt;&lt;wsp:rsid wsp:val=&quot;0032119E&quot;/&gt;&lt;wsp:rsid wsp:val=&quot;00321304&quot;/&gt;&lt;wsp:rsid wsp:val=&quot;00324FC2&quot;/&gt;&lt;wsp:rsid wsp:val=&quot;003312CA&quot;/&gt;&lt;wsp:rsid wsp:val=&quot;00331F84&quot;/&gt;&lt;wsp:rsid wsp:val=&quot;0037721F&quot;/&gt;&lt;wsp:rsid wsp:val=&quot;003950A4&quot;/&gt;&lt;wsp:rsid wsp:val=&quot;003A1E7E&quot;/&gt;&lt;wsp:rsid wsp:val=&quot;003E2FDC&quot;/&gt;&lt;wsp:rsid wsp:val=&quot;003E3577&quot;/&gt;&lt;wsp:rsid wsp:val=&quot;003F3A61&quot;/&gt;&lt;wsp:rsid wsp:val=&quot;003F3E2C&quot;/&gt;&lt;wsp:rsid wsp:val=&quot;00410A5D&quot;/&gt;&lt;wsp:rsid wsp:val=&quot;00414909&quot;/&gt;&lt;wsp:rsid wsp:val=&quot;00416537&quot;/&gt;&lt;wsp:rsid wsp:val=&quot;00425A6A&quot;/&gt;&lt;wsp:rsid wsp:val=&quot;00426FBB&quot;/&gt;&lt;wsp:rsid wsp:val=&quot;00454542&quot;/&gt;&lt;wsp:rsid wsp:val=&quot;0047429A&quot;/&gt;&lt;wsp:rsid wsp:val=&quot;0048374C&quot;/&gt;&lt;wsp:rsid wsp:val=&quot;0048771D&quot;/&gt;&lt;wsp:rsid wsp:val=&quot;004A6605&quot;/&gt;&lt;wsp:rsid wsp:val=&quot;004C45FA&quot;/&gt;&lt;wsp:rsid wsp:val=&quot;004D35A3&quot;/&gt;&lt;wsp:rsid wsp:val=&quot;004E1BD8&quot;/&gt;&lt;wsp:rsid wsp:val=&quot;004E452A&quot;/&gt;&lt;wsp:rsid wsp:val=&quot;004E78E3&quot;/&gt;&lt;wsp:rsid wsp:val=&quot;004F2BFE&quot;/&gt;&lt;wsp:rsid wsp:val=&quot;004F63D3&quot;/&gt;&lt;wsp:rsid wsp:val=&quot;004F7DCF&quot;/&gt;&lt;wsp:rsid wsp:val=&quot;005004BF&quot;/&gt;&lt;wsp:rsid wsp:val=&quot;00502E89&quot;/&gt;&lt;wsp:rsid wsp:val=&quot;00506CFE&quot;/&gt;&lt;wsp:rsid wsp:val=&quot;00510E95&quot;/&gt;&lt;wsp:rsid wsp:val=&quot;005225C3&quot;/&gt;&lt;wsp:rsid wsp:val=&quot;00527D56&quot;/&gt;&lt;wsp:rsid wsp:val=&quot;0053221F&quot;/&gt;&lt;wsp:rsid wsp:val=&quot;00536FAE&quot;/&gt;&lt;wsp:rsid wsp:val=&quot;00542C85&quot;/&gt;&lt;wsp:rsid wsp:val=&quot;00553510&quot;/&gt;&lt;wsp:rsid wsp:val=&quot;00554186&quot;/&gt;&lt;wsp:rsid wsp:val=&quot;00585769&quot;/&gt;&lt;wsp:rsid wsp:val=&quot;00585C61&quot;/&gt;&lt;wsp:rsid wsp:val=&quot;00591130&quot;/&gt;&lt;wsp:rsid wsp:val=&quot;005A3F28&quot;/&gt;&lt;wsp:rsid wsp:val=&quot;005A40BE&quot;/&gt;&lt;wsp:rsid wsp:val=&quot;005B13E2&quot;/&gt;&lt;wsp:rsid wsp:val=&quot;005B47D7&quot;/&gt;&lt;wsp:rsid wsp:val=&quot;005C5526&quot;/&gt;&lt;wsp:rsid wsp:val=&quot;005C62C6&quot;/&gt;&lt;wsp:rsid wsp:val=&quot;005D7B9E&quot;/&gt;&lt;wsp:rsid wsp:val=&quot;005E112E&quot;/&gt;&lt;wsp:rsid wsp:val=&quot;005F0834&quot;/&gt;&lt;wsp:rsid wsp:val=&quot;005F68AB&quot;/&gt;&lt;wsp:rsid wsp:val=&quot;005F6DC3&quot;/&gt;&lt;wsp:rsid wsp:val=&quot;00601A8E&quot;/&gt;&lt;wsp:rsid wsp:val=&quot;0062033E&quot;/&gt;&lt;wsp:rsid wsp:val=&quot;00624482&quot;/&gt;&lt;wsp:rsid wsp:val=&quot;0064799C&quot;/&gt;&lt;wsp:rsid wsp:val=&quot;00654156&quot;/&gt;&lt;wsp:rsid wsp:val=&quot;006B47CA&quot;/&gt;&lt;wsp:rsid wsp:val=&quot;006C304C&quot;/&gt;&lt;wsp:rsid wsp:val=&quot;006C4511&quot;/&gt;&lt;wsp:rsid wsp:val=&quot;006C65F5&quot;/&gt;&lt;wsp:rsid wsp:val=&quot;006C7AAA&quot;/&gt;&lt;wsp:rsid wsp:val=&quot;006D1C2A&quot;/&gt;&lt;wsp:rsid wsp:val=&quot;006D264F&quot;/&gt;&lt;wsp:rsid wsp:val=&quot;006E2A8D&quot;/&gt;&lt;wsp:rsid wsp:val=&quot;006E7574&quot;/&gt;&lt;wsp:rsid wsp:val=&quot;00703430&quot;/&gt;&lt;wsp:rsid wsp:val=&quot;00703548&quot;/&gt;&lt;wsp:rsid wsp:val=&quot;00704E18&quot;/&gt;&lt;wsp:rsid wsp:val=&quot;007069BE&quot;/&gt;&lt;wsp:rsid wsp:val=&quot;00745C86&quot;/&gt;&lt;wsp:rsid wsp:val=&quot;00764603&quot;/&gt;&lt;wsp:rsid wsp:val=&quot;0076604D&quot;/&gt;&lt;wsp:rsid wsp:val=&quot;00790909&quot;/&gt;&lt;wsp:rsid wsp:val=&quot;007B1582&quot;/&gt;&lt;wsp:rsid wsp:val=&quot;007B5A07&quot;/&gt;&lt;wsp:rsid wsp:val=&quot;007C065D&quot;/&gt;&lt;wsp:rsid wsp:val=&quot;007D3E71&quot;/&gt;&lt;wsp:rsid wsp:val=&quot;007E5D6A&quot;/&gt;&lt;wsp:rsid wsp:val=&quot;007E645D&quot;/&gt;&lt;wsp:rsid wsp:val=&quot;007F75CA&quot;/&gt;&lt;wsp:rsid wsp:val=&quot;00821E08&quot;/&gt;&lt;wsp:rsid wsp:val=&quot;00834EFD&quot;/&gt;&lt;wsp:rsid wsp:val=&quot;00844B24&quot;/&gt;&lt;wsp:rsid wsp:val=&quot;0084515F&quot;/&gt;&lt;wsp:rsid wsp:val=&quot;0085092D&quot;/&gt;&lt;wsp:rsid wsp:val=&quot;00865414&quot;/&gt;&lt;wsp:rsid wsp:val=&quot;00877D4C&quot;/&gt;&lt;wsp:rsid wsp:val=&quot;00883903&quot;/&gt;&lt;wsp:rsid wsp:val=&quot;0089763B&quot;/&gt;&lt;wsp:rsid wsp:val=&quot;008B6AE3&quot;/&gt;&lt;wsp:rsid wsp:val=&quot;008C1332&quot;/&gt;&lt;wsp:rsid wsp:val=&quot;008D1045&quot;/&gt;&lt;wsp:rsid wsp:val=&quot;008E5996&quot;/&gt;&lt;wsp:rsid wsp:val=&quot;00901AE1&quot;/&gt;&lt;wsp:rsid wsp:val=&quot;00912F93&quot;/&gt;&lt;wsp:rsid wsp:val=&quot;009205B4&quot;/&gt;&lt;wsp:rsid wsp:val=&quot;00955B59&quot;/&gt;&lt;wsp:rsid wsp:val=&quot;00992262&quot;/&gt;&lt;wsp:rsid wsp:val=&quot;009926BC&quot;/&gt;&lt;wsp:rsid wsp:val=&quot;009A4319&quot;/&gt;&lt;wsp:rsid wsp:val=&quot;009A6C3F&quot;/&gt;&lt;wsp:rsid wsp:val=&quot;009B73F2&quot;/&gt;&lt;wsp:rsid wsp:val=&quot;009C12BD&quot;/&gt;&lt;wsp:rsid wsp:val=&quot;009C50FE&quot;/&gt;&lt;wsp:rsid wsp:val=&quot;009E49DD&quot;/&gt;&lt;wsp:rsid wsp:val=&quot;00A03E75&quot;/&gt;&lt;wsp:rsid wsp:val=&quot;00A20627&quot;/&gt;&lt;wsp:rsid wsp:val=&quot;00A22FE9&quot;/&gt;&lt;wsp:rsid wsp:val=&quot;00A31A44&quot;/&gt;&lt;wsp:rsid wsp:val=&quot;00A32BFA&quot;/&gt;&lt;wsp:rsid wsp:val=&quot;00A3325E&quot;/&gt;&lt;wsp:rsid wsp:val=&quot;00A45FCE&quot;/&gt;&lt;wsp:rsid wsp:val=&quot;00A75671&quot;/&gt;&lt;wsp:rsid wsp:val=&quot;00A773CC&quot;/&gt;&lt;wsp:rsid wsp:val=&quot;00A924D0&quot;/&gt;&lt;wsp:rsid wsp:val=&quot;00A9318B&quot;/&gt;&lt;wsp:rsid wsp:val=&quot;00A94AC1&quot;/&gt;&lt;wsp:rsid wsp:val=&quot;00AB18B7&quot;/&gt;&lt;wsp:rsid wsp:val=&quot;00AD335D&quot;/&gt;&lt;wsp:rsid wsp:val=&quot;00AF114C&quot;/&gt;&lt;wsp:rsid wsp:val=&quot;00AF792B&quot;/&gt;&lt;wsp:rsid wsp:val=&quot;00B33D2F&quot;/&gt;&lt;wsp:rsid wsp:val=&quot;00B40A5B&quot;/&gt;&lt;wsp:rsid wsp:val=&quot;00B45C6B&quot;/&gt;&lt;wsp:rsid wsp:val=&quot;00B55D5E&quot;/&gt;&lt;wsp:rsid wsp:val=&quot;00B57A80&quot;/&gt;&lt;wsp:rsid wsp:val=&quot;00B70E9C&quot;/&gt;&lt;wsp:rsid wsp:val=&quot;00B713D8&quot;/&gt;&lt;wsp:rsid wsp:val=&quot;00B72979&quot;/&gt;&lt;wsp:rsid wsp:val=&quot;00B94516&quot;/&gt;&lt;wsp:rsid wsp:val=&quot;00BA25E2&quot;/&gt;&lt;wsp:rsid wsp:val=&quot;00BB2855&quot;/&gt;&lt;wsp:rsid wsp:val=&quot;00BC5343&quot;/&gt;&lt;wsp:rsid wsp:val=&quot;00BD19C1&quot;/&gt;&lt;wsp:rsid wsp:val=&quot;00BD25B8&quot;/&gt;&lt;wsp:rsid wsp:val=&quot;00C012E1&quot;/&gt;&lt;wsp:rsid wsp:val=&quot;00C06BB4&quot;/&gt;&lt;wsp:rsid wsp:val=&quot;00C10D20&quot;/&gt;&lt;wsp:rsid wsp:val=&quot;00C12E0C&quot;/&gt;&lt;wsp:rsid wsp:val=&quot;00C21916&quot;/&gt;&lt;wsp:rsid wsp:val=&quot;00C34915&quot;/&gt;&lt;wsp:rsid wsp:val=&quot;00C457CA&quot;/&gt;&lt;wsp:rsid wsp:val=&quot;00C53FB6&quot;/&gt;&lt;wsp:rsid wsp:val=&quot;00C57FB7&quot;/&gt;&lt;wsp:rsid wsp:val=&quot;00C644D4&quot;/&gt;&lt;wsp:rsid wsp:val=&quot;00C65F3F&quot;/&gt;&lt;wsp:rsid wsp:val=&quot;00C72414&quot;/&gt;&lt;wsp:rsid wsp:val=&quot;00C72B1A&quot;/&gt;&lt;wsp:rsid wsp:val=&quot;00C8667B&quot;/&gt;&lt;wsp:rsid wsp:val=&quot;00C90993&quot;/&gt;&lt;wsp:rsid wsp:val=&quot;00CA4CE3&quot;/&gt;&lt;wsp:rsid wsp:val=&quot;00CC72FD&quot;/&gt;&lt;wsp:rsid wsp:val=&quot;00CD4F3F&quot;/&gt;&lt;wsp:rsid wsp:val=&quot;00D311F8&quot;/&gt;&lt;wsp:rsid wsp:val=&quot;00D31660&quot;/&gt;&lt;wsp:rsid wsp:val=&quot;00D36B52&quot;/&gt;&lt;wsp:rsid wsp:val=&quot;00D377C8&quot;/&gt;&lt;wsp:rsid wsp:val=&quot;00D41274&quot;/&gt;&lt;wsp:rsid wsp:val=&quot;00D4229C&quot;/&gt;&lt;wsp:rsid wsp:val=&quot;00D43BF3&quot;/&gt;&lt;wsp:rsid wsp:val=&quot;00D549FB&quot;/&gt;&lt;wsp:rsid wsp:val=&quot;00D767BB&quot;/&gt;&lt;wsp:rsid wsp:val=&quot;00D939B0&quot;/&gt;&lt;wsp:rsid wsp:val=&quot;00DA31A2&quot;/&gt;&lt;wsp:rsid wsp:val=&quot;00DB16E0&quot;/&gt;&lt;wsp:rsid wsp:val=&quot;00DB2DF9&quot;/&gt;&lt;wsp:rsid wsp:val=&quot;00DB465D&quot;/&gt;&lt;wsp:rsid wsp:val=&quot;00DB48A2&quot;/&gt;&lt;wsp:rsid wsp:val=&quot;00DB7E63&quot;/&gt;&lt;wsp:rsid wsp:val=&quot;00DC2055&quot;/&gt;&lt;wsp:rsid wsp:val=&quot;00DC3908&quot;/&gt;&lt;wsp:rsid wsp:val=&quot;00DD71E8&quot;/&gt;&lt;wsp:rsid wsp:val=&quot;00DD7F83&quot;/&gt;&lt;wsp:rsid wsp:val=&quot;00DE4EB8&quot;/&gt;&lt;wsp:rsid wsp:val=&quot;00E0641E&quot;/&gt;&lt;wsp:rsid wsp:val=&quot;00E06664&quot;/&gt;&lt;wsp:rsid wsp:val=&quot;00E304BC&quot;/&gt;&lt;wsp:rsid wsp:val=&quot;00E32853&quot;/&gt;&lt;wsp:rsid wsp:val=&quot;00E34EBD&quot;/&gt;&lt;wsp:rsid wsp:val=&quot;00E401F8&quot;/&gt;&lt;wsp:rsid wsp:val=&quot;00E46425&quot;/&gt;&lt;wsp:rsid wsp:val=&quot;00E469FC&quot;/&gt;&lt;wsp:rsid wsp:val=&quot;00E47D0E&quot;/&gt;&lt;wsp:rsid wsp:val=&quot;00E65018&quot;/&gt;&lt;wsp:rsid wsp:val=&quot;00E76CA1&quot;/&gt;&lt;wsp:rsid wsp:val=&quot;00E94339&quot;/&gt;&lt;wsp:rsid wsp:val=&quot;00E97563&quot;/&gt;&lt;wsp:rsid wsp:val=&quot;00EB0B63&quot;/&gt;&lt;wsp:rsid wsp:val=&quot;00EC265C&quot;/&gt;&lt;wsp:rsid wsp:val=&quot;00ED61CB&quot;/&gt;&lt;wsp:rsid wsp:val=&quot;00EE752A&quot;/&gt;&lt;wsp:rsid wsp:val=&quot;00F06A72&quot;/&gt;&lt;wsp:rsid wsp:val=&quot;00F136F0&quot;/&gt;&lt;wsp:rsid wsp:val=&quot;00F20BBB&quot;/&gt;&lt;wsp:rsid wsp:val=&quot;00F36048&quot;/&gt;&lt;wsp:rsid wsp:val=&quot;00F43BD8&quot;/&gt;&lt;wsp:rsid wsp:val=&quot;00F562F3&quot;/&gt;&lt;wsp:rsid wsp:val=&quot;00F74B89&quot;/&gt;&lt;wsp:rsid wsp:val=&quot;00F75133&quot;/&gt;&lt;wsp:rsid wsp:val=&quot;00F83272&quot;/&gt;&lt;wsp:rsid wsp:val=&quot;00F9358D&quot;/&gt;&lt;wsp:rsid wsp:val=&quot;00FA3899&quot;/&gt;&lt;wsp:rsid wsp:val=&quot;00FA4909&quot;/&gt;&lt;wsp:rsid wsp:val=&quot;00FA5164&quot;/&gt;&lt;wsp:rsid wsp:val=&quot;00FA6751&quot;/&gt;&lt;wsp:rsid wsp:val=&quot;00FA6BD7&quot;/&gt;&lt;wsp:rsid wsp:val=&quot;00FB1048&quot;/&gt;&lt;wsp:rsid wsp:val=&quot;00FB62C4&quot;/&gt;&lt;wsp:rsid wsp:val=&quot;00FB7701&quot;/&gt;&lt;wsp:rsid wsp:val=&quot;00FD1AC5&quot;/&gt;&lt;wsp:rsid wsp:val=&quot;00FD5CF0&quot;/&gt;&lt;/wsp:rsids&gt;&lt;/w:docPr&gt;&lt;w:body&gt;&lt;wx:sect&gt;&lt;w:p wsp:rsidR=&quot;003F3E2C&quot; wsp:rsidRDefault=&quot;003F3E2C&quot; wsp:rsidP=&quot;003F3E2C&quot;&gt;&lt;m:oMathPara&gt;&lt;m:oMath&gt;&lt;m:sSub&gt;&lt;m:sSubPr&gt;&lt;m:ctrlPr&gt;&lt;w:rPr&gt;&lt;w:rFonts w:ascii=&quot;Cambria Math&quot; w:fareast=&quot;Times New Roman&quot; w:h-ansi=&quot;Cambria Math&quot;/&gt;&lt;wx:font wx:val=&quot;Cambria Math&quot;/&gt;&lt;w:i/&gt;&lt;/w:rPr&gt;&lt;/m:ctrlPr&gt;&lt;/m:sSubPr&gt;&lt;m:e&gt;&lt;m:r&gt;&lt;w:rPr&gt;&lt;w:rFonts w:ascii=&quot;Cambria Math&quot; w:fareast=&quot;Times New Roman&quot; w:h-ansi=&quot;Cambria Math&quot;/&gt;&lt;wx:font wx:val=&quot;Cambria Math&quot;/&gt;&lt;w:i/&gt;&lt;/w:rPr&gt;&lt;m:t&gt;t&lt;/m:t&gt;&lt;/m:r&gt;&lt;/m:e&gt;&lt;m:sub&gt;&lt;m:r&gt;&lt;w:rPr&gt;&lt;w:rFonts w:ascii=&quot;Cambria Math&quot; w:fareast=&quot;Times New Roman&quot; w:h-ansi=&quot;Cambria Math&quot;/&gt;&lt;wx:font wx:val=&quot;Cambria Math&quot;/&gt;&lt;w:i/&gt;&lt;/w:rPr&gt;&lt;m:t&gt;on&lt;/m:t&gt;&lt;/m:r&gt;&lt;/m:sub&gt;&lt;/m:sSub&gt;&lt;/m:oMath&gt;&lt;/m:oMathPara&gt;&lt;/w:p&gt;&lt;w:sectPr wsp:rsidR=&quot;00000000&quot;&gt;&lt;w:pgSz w:w=&quot;12240&quot; w:h=&quot;15840&quot;/&gt;&lt;w:pgMar w:top=&quot;1440&quot; w:right=&quot;1440&quot; w:bottom=&quot;1440&quot; w:left=&quot;1440&quot; w:header=&quot;720&quot; w:footer=&quot;720&quot; w:gutter=&quot;0&quot;/&gt;&lt;w:cols w:space=&quot;720&quot;/&gt;&lt;/w:sectPr&gt;&lt;/wx:sect&gt;&lt;/w:body&gt;&lt;/w:wordDocument&gt;">
+          <v:shape id="_x0000_i1039" type="#_x0000_t75" style="width:15.9pt;height:13.85pt" equationxml="&lt;?xml version=&quot;1.0&quot; encoding=&quot;UTF-8&quot; standalone=&quot;yes&quot;?&gt;&#10;&lt;?mso-application progid=&quot;Word.Document&quot;?&gt;&#10;&lt;w:wordDocument xmlns:aml=&quot;http://schemas.microsoft.com/aml/2001/core&quot; xmlns:wpc=&quot;http://schemas.microsoft.com/office/word/2010/wordprocessingCanvas&quot; xmlns:cx=&quot;http://schemas.microsoft.com/office/drawing/2014/chartex&quot; xmlns:cx1=&quot;http://schemas.microsoft.com/office/drawing/2015/9/8/chartex&quot; xmlns:cx2=&quot;http://schemas.microsoft.com/office/drawing/2015/10/21/chartex&quot; xmlns:cx3=&quot;http://schemas.microsoft.com/office/drawing/2016/5/9/chartex&quot; xmlns:cx4=&quot;http://schemas.microsoft.com/office/drawing/2016/5/10/chartex&quot; xmlns:cx5=&quot;http://schemas.microsoft.com/office/drawing/2016/5/11/chartex&quot; xmlns:cx6=&quot;http://schemas.microsoft.com/office/drawing/2016/5/12/chartex&quot; xmlns:cx7=&quot;http://schemas.microsoft.com/office/drawing/2016/5/13/chartex&quot; xmlns:cx8=&quot;http://schemas.microsoft.com/office/drawing/2016/5/14/chartex&quot; xmlns:cr=&quot;http://schemas.microsoft.com/office/comments/2020/reactions&quot; xmlns:dt=&quot;uuid:C2F41010-65B3-11d1-A29F-00AA00C14882&quot; xmlns:mc=&quot;http://schemas.openxmlformats.org/markup-compatibility/2006&quot; xmlns:aink=&quot;http://schemas.microsoft.com/office/drawing/2016/ink&quot; xmlns:am3d=&quot;http://schemas.microsoft.com/office/drawing/2017/model3d&quot; xmlns:o=&quot;urn:schemas-microsoft-com:office:office&quot; xmlns:oel=&quot;http://schemas.microsoft.com/office/2019/extlst&quot; xmlns:m=&quot;http://schemas.openxmlformats.org/officeDocument/2006/math&quot; xmlns:v=&quot;urn:schemas-microsoft-com:vml&quot; xmlns:w10=&quot;urn:schemas-microsoft-com:office:word&quot; xmlns:w=&quot;http://schemas.microsoft.com/office/word/2003/wordml&quot; xmlns:wx=&quot;http://schemas.microsoft.com/office/word/2003/auxHint&quot; xmlns:wne=&quot;http://schemas.microsoft.com/office/word/2006/wordml&quot; xmlns:wsp=&quot;http://schemas.microsoft.com/office/word/2003/wordml/sp2&quot; xmlns:sl=&quot;http://schemas.microsoft.com/schemaLibrary/2003/core&quot; w:macrosPresent=&quot;no&quot; w:embeddedObjPresent=&quot;no&quot; w:ocxPresent=&quot;no&quot; xml:space=&quot;preserve&quot;&gt;&lt;w:ignoreSubtree w:val=&quot;http://schemas.microsoft.com/office/word/2003/wordml/sp2&quot;/&gt;&lt;o:DocumentProperties&gt;&lt;o:Version&gt;16&lt;/o:Version&gt;&lt;/o:DocumentProperties&gt;&lt;w:docPr&gt;&lt;w:view w:val=&quot;print&quot;/&gt;&lt;w:zoom w:percent=&quot;100&quot;/&gt;&lt;w:doNotEmbedSystemFonts/&gt;&lt;w:activeWritingStyle w:lang=&quot;EN-AU&quot; w:vendorID=&quot;64&quot; w:dllVersion=&quot;6&quot; w:nlCheck=&quot;on&quot; w:optionSet=&quot;1&quot;/&gt;&lt;w:activeWritingStyle w:lang=&quot;EN-GB&quot; w:vendorID=&quot;64&quot; w:dllVersion=&quot;6&quot; w:nlCheck=&quot;on&quot; w:optionSet=&quot;1&quot;/&gt;&lt;w:activeWritingStyle w:lang=&quot;EN-US&quot; w:vendorID=&quot;64&quot; w:dllVersion=&quot;6&quot; w:nlCheck=&quot;on&quot; w:optionSet=&quot;1&quot;/&gt;&lt;w:activeWritingStyle w:lang=&quot;EN-AU&quot; w:vendorID=&quot;64&quot; w:dllVersion=&quot;0&quot; w:nlCheck=&quot;on&quot; w:optionSet=&quot;0&quot;/&gt;&lt;w:activeWritingStyle w:lang=&quot;EN-GB&quot; w:vendorID=&quot;64&quot; w:dllVersion=&quot;0&quot; w:nlCheck=&quot;on&quot; w:optionSet=&quot;0&quot;/&gt;&lt;w:activeWritingStyle w:lang=&quot;EN-US&quot; w:vendorID=&quot;64&quot; w:dllVersion=&quot;0&quot; w:nlCheck=&quot;on&quot; w:optionSet=&quot;0&quot;/&gt;&lt;w:activeWritingStyle w:lang=&quot;ES-AR&quot; w:vendorID=&quot;64&quot; w:dllVersion=&quot;0&quot; w:nlCheck=&quot;on&quot; w:optionSet=&quot;0&quot;/&gt;&lt;w:activeWritingStyle w:lang=&quot;580A&quot; w:vendorID=&quot;64&quot; w:dllVersion=&quot;0&quot; w:nlCheck=&quot;on&quot; w:optionSet=&quot;0&quot;/&gt;&lt;w:activeWritingStyle w:lang=&quot;PT-BR&quot; w:vendorID=&quot;64&quot; w:dllVersion=&quot;0&quot; w:nlCheck=&quot;on&quot; w:optionSet=&quot;0&quot;/&gt;&lt;w:stylePaneFormatFilter w:val=&quot;3F01&quot;/&gt;&lt;w:defaultTabStop w:val=&quot;720&quot;/&gt;&lt;w:hyphenationZone w:val=&quot;425&quot;/&gt;&lt;w:characterSpacingControl w:val=&quot;DontCompress&quot;/&gt;&lt;w:optimizeForBrowser/&gt;&lt;w:validateAgainstSchema/&gt;&lt;w:saveInvalidXML w:val=&quot;off&quot;/&gt;&lt;w:ignoreMixedContent w:val=&quot;off&quot;/&gt;&lt;w:alwaysShowPlaceholderText w:val=&quot;off&quot;/&gt;&lt;w:compat&gt;&lt;w:breakWrappedTables/&gt;&lt;w:snapToGridInCell/&gt;&lt;w:applyBreakingRules/&gt;&lt;w:wrapTextWithPunct/&gt;&lt;w:useAsianBreakRules/&gt;&lt;w:useWord2002TableStyleRules/&gt;&lt;w:useFELayout/&gt;&lt;/w:compat&gt;&lt;wsp:rsids&gt;&lt;wsp:rsidRoot wsp:val=&quot;00426FBB&quot;/&gt;&lt;wsp:rsid wsp:val=&quot;000002E1&quot;/&gt;&lt;wsp:rsid wsp:val=&quot;00003C97&quot;/&gt;&lt;wsp:rsid wsp:val=&quot;00005565&quot;/&gt;&lt;wsp:rsid wsp:val=&quot;0001754A&quot;/&gt;&lt;wsp:rsid wsp:val=&quot;00017719&quot;/&gt;&lt;wsp:rsid wsp:val=&quot;00027F1D&quot;/&gt;&lt;wsp:rsid wsp:val=&quot;0003296C&quot;/&gt;&lt;wsp:rsid wsp:val=&quot;0003351F&quot;/&gt;&lt;wsp:rsid wsp:val=&quot;00044599&quot;/&gt;&lt;wsp:rsid wsp:val=&quot;000540E6&quot;/&gt;&lt;wsp:rsid wsp:val=&quot;00054421&quot;/&gt;&lt;wsp:rsid wsp:val=&quot;00062E46&quot;/&gt;&lt;wsp:rsid wsp:val=&quot;00074AC8&quot;/&gt;&lt;wsp:rsid wsp:val=&quot;00081408&quot;/&gt;&lt;wsp:rsid wsp:val=&quot;00081EBE&quot;/&gt;&lt;wsp:rsid wsp:val=&quot;00086EDC&quot;/&gt;&lt;wsp:rsid wsp:val=&quot;000B36A3&quot;/&gt;&lt;wsp:rsid wsp:val=&quot;000C013C&quot;/&gt;&lt;wsp:rsid wsp:val=&quot;000E3F84&quot;/&gt;&lt;wsp:rsid wsp:val=&quot;001056DF&quot;/&gt;&lt;wsp:rsid wsp:val=&quot;0010789C&quot;/&gt;&lt;wsp:rsid wsp:val=&quot;00114025&quot;/&gt;&lt;wsp:rsid wsp:val=&quot;001160D2&quot;/&gt;&lt;wsp:rsid wsp:val=&quot;00120636&quot;/&gt;&lt;wsp:rsid wsp:val=&quot;001348A5&quot;/&gt;&lt;wsp:rsid wsp:val=&quot;00151B8E&quot;/&gt;&lt;wsp:rsid wsp:val=&quot;00182170&quot;/&gt;&lt;wsp:rsid wsp:val=&quot;001928FB&quot;/&gt;&lt;wsp:rsid wsp:val=&quot;00192BC7&quot;/&gt;&lt;wsp:rsid wsp:val=&quot;00195BE6&quot;/&gt;&lt;wsp:rsid wsp:val=&quot;001A50EA&quot;/&gt;&lt;wsp:rsid wsp:val=&quot;001F16CD&quot;/&gt;&lt;wsp:rsid wsp:val=&quot;001F47D2&quot;/&gt;&lt;wsp:rsid wsp:val=&quot;002029C8&quot;/&gt;&lt;wsp:rsid wsp:val=&quot;0022285A&quot;/&gt;&lt;wsp:rsid wsp:val=&quot;00224C61&quot;/&gt;&lt;wsp:rsid wsp:val=&quot;00256ABC&quot;/&gt;&lt;wsp:rsid wsp:val=&quot;0027227B&quot;/&gt;&lt;wsp:rsid wsp:val=&quot;00273AC7&quot;/&gt;&lt;wsp:rsid wsp:val=&quot;00273D2C&quot;/&gt;&lt;wsp:rsid wsp:val=&quot;00285ECD&quot;/&gt;&lt;wsp:rsid wsp:val=&quot;00290E1B&quot;/&gt;&lt;wsp:rsid wsp:val=&quot;00291B17&quot;/&gt;&lt;wsp:rsid wsp:val=&quot;00291BB3&quot;/&gt;&lt;wsp:rsid wsp:val=&quot;002A6742&quot;/&gt;&lt;wsp:rsid wsp:val=&quot;002C1A7F&quot;/&gt;&lt;wsp:rsid wsp:val=&quot;002C4239&quot;/&gt;&lt;wsp:rsid wsp:val=&quot;002C559D&quot;/&gt;&lt;wsp:rsid wsp:val=&quot;002D16AE&quot;/&gt;&lt;wsp:rsid wsp:val=&quot;002D2D42&quot;/&gt;&lt;wsp:rsid wsp:val=&quot;002F72D0&quot;/&gt;&lt;wsp:rsid wsp:val=&quot;002F7A4F&quot;/&gt;&lt;wsp:rsid wsp:val=&quot;003003AB&quot;/&gt;&lt;wsp:rsid wsp:val=&quot;00302C35&quot;/&gt;&lt;wsp:rsid wsp:val=&quot;00311C49&quot;/&gt;&lt;wsp:rsid wsp:val=&quot;0032119E&quot;/&gt;&lt;wsp:rsid wsp:val=&quot;00321304&quot;/&gt;&lt;wsp:rsid wsp:val=&quot;00324FC2&quot;/&gt;&lt;wsp:rsid wsp:val=&quot;003312CA&quot;/&gt;&lt;wsp:rsid wsp:val=&quot;00331F84&quot;/&gt;&lt;wsp:rsid wsp:val=&quot;0037721F&quot;/&gt;&lt;wsp:rsid wsp:val=&quot;003950A4&quot;/&gt;&lt;wsp:rsid wsp:val=&quot;003A1E7E&quot;/&gt;&lt;wsp:rsid wsp:val=&quot;003E2FDC&quot;/&gt;&lt;wsp:rsid wsp:val=&quot;003E3577&quot;/&gt;&lt;wsp:rsid wsp:val=&quot;003F3A61&quot;/&gt;&lt;wsp:rsid wsp:val=&quot;003F3E2C&quot;/&gt;&lt;wsp:rsid wsp:val=&quot;00410A5D&quot;/&gt;&lt;wsp:rsid wsp:val=&quot;00414909&quot;/&gt;&lt;wsp:rsid wsp:val=&quot;00416537&quot;/&gt;&lt;wsp:rsid wsp:val=&quot;00425A6A&quot;/&gt;&lt;wsp:rsid wsp:val=&quot;00426FBB&quot;/&gt;&lt;wsp:rsid wsp:val=&quot;00454542&quot;/&gt;&lt;wsp:rsid wsp:val=&quot;0047429A&quot;/&gt;&lt;wsp:rsid wsp:val=&quot;0048374C&quot;/&gt;&lt;wsp:rsid wsp:val=&quot;0048771D&quot;/&gt;&lt;wsp:rsid wsp:val=&quot;004A6605&quot;/&gt;&lt;wsp:rsid wsp:val=&quot;004C45FA&quot;/&gt;&lt;wsp:rsid wsp:val=&quot;004D35A3&quot;/&gt;&lt;wsp:rsid wsp:val=&quot;004E1BD8&quot;/&gt;&lt;wsp:rsid wsp:val=&quot;004E452A&quot;/&gt;&lt;wsp:rsid wsp:val=&quot;004E78E3&quot;/&gt;&lt;wsp:rsid wsp:val=&quot;004F2BFE&quot;/&gt;&lt;wsp:rsid wsp:val=&quot;004F63D3&quot;/&gt;&lt;wsp:rsid wsp:val=&quot;004F7DCF&quot;/&gt;&lt;wsp:rsid wsp:val=&quot;005004BF&quot;/&gt;&lt;wsp:rsid wsp:val=&quot;00502E89&quot;/&gt;&lt;wsp:rsid wsp:val=&quot;00506CFE&quot;/&gt;&lt;wsp:rsid wsp:val=&quot;00510E95&quot;/&gt;&lt;wsp:rsid wsp:val=&quot;005225C3&quot;/&gt;&lt;wsp:rsid wsp:val=&quot;00527D56&quot;/&gt;&lt;wsp:rsid wsp:val=&quot;0053221F&quot;/&gt;&lt;wsp:rsid wsp:val=&quot;00536FAE&quot;/&gt;&lt;wsp:rsid wsp:val=&quot;00542C85&quot;/&gt;&lt;wsp:rsid wsp:val=&quot;00553510&quot;/&gt;&lt;wsp:rsid wsp:val=&quot;00554186&quot;/&gt;&lt;wsp:rsid wsp:val=&quot;00585769&quot;/&gt;&lt;wsp:rsid wsp:val=&quot;00585C61&quot;/&gt;&lt;wsp:rsid wsp:val=&quot;00591130&quot;/&gt;&lt;wsp:rsid wsp:val=&quot;005A3F28&quot;/&gt;&lt;wsp:rsid wsp:val=&quot;005A40BE&quot;/&gt;&lt;wsp:rsid wsp:val=&quot;005B13E2&quot;/&gt;&lt;wsp:rsid wsp:val=&quot;005B47D7&quot;/&gt;&lt;wsp:rsid wsp:val=&quot;005C5526&quot;/&gt;&lt;wsp:rsid wsp:val=&quot;005C62C6&quot;/&gt;&lt;wsp:rsid wsp:val=&quot;005D7B9E&quot;/&gt;&lt;wsp:rsid wsp:val=&quot;005E112E&quot;/&gt;&lt;wsp:rsid wsp:val=&quot;005F0834&quot;/&gt;&lt;wsp:rsid wsp:val=&quot;005F68AB&quot;/&gt;&lt;wsp:rsid wsp:val=&quot;005F6DC3&quot;/&gt;&lt;wsp:rsid wsp:val=&quot;00601A8E&quot;/&gt;&lt;wsp:rsid wsp:val=&quot;0062033E&quot;/&gt;&lt;wsp:rsid wsp:val=&quot;00624482&quot;/&gt;&lt;wsp:rsid wsp:val=&quot;0064799C&quot;/&gt;&lt;wsp:rsid wsp:val=&quot;00654156&quot;/&gt;&lt;wsp:rsid wsp:val=&quot;006B47CA&quot;/&gt;&lt;wsp:rsid wsp:val=&quot;006C304C&quot;/&gt;&lt;wsp:rsid wsp:val=&quot;006C4511&quot;/&gt;&lt;wsp:rsid wsp:val=&quot;006C65F5&quot;/&gt;&lt;wsp:rsid wsp:val=&quot;006C7AAA&quot;/&gt;&lt;wsp:rsid wsp:val=&quot;006D1C2A&quot;/&gt;&lt;wsp:rsid wsp:val=&quot;006D264F&quot;/&gt;&lt;wsp:rsid wsp:val=&quot;006E2A8D&quot;/&gt;&lt;wsp:rsid wsp:val=&quot;006E7574&quot;/&gt;&lt;wsp:rsid wsp:val=&quot;00703430&quot;/&gt;&lt;wsp:rsid wsp:val=&quot;00703548&quot;/&gt;&lt;wsp:rsid wsp:val=&quot;00704E18&quot;/&gt;&lt;wsp:rsid wsp:val=&quot;007069BE&quot;/&gt;&lt;wsp:rsid wsp:val=&quot;00745C86&quot;/&gt;&lt;wsp:rsid wsp:val=&quot;00764603&quot;/&gt;&lt;wsp:rsid wsp:val=&quot;0076604D&quot;/&gt;&lt;wsp:rsid wsp:val=&quot;00790909&quot;/&gt;&lt;wsp:rsid wsp:val=&quot;007B1582&quot;/&gt;&lt;wsp:rsid wsp:val=&quot;007B5A07&quot;/&gt;&lt;wsp:rsid wsp:val=&quot;007C065D&quot;/&gt;&lt;wsp:rsid wsp:val=&quot;007D3E71&quot;/&gt;&lt;wsp:rsid wsp:val=&quot;007E5D6A&quot;/&gt;&lt;wsp:rsid wsp:val=&quot;007E645D&quot;/&gt;&lt;wsp:rsid wsp:val=&quot;007F75CA&quot;/&gt;&lt;wsp:rsid wsp:val=&quot;00821E08&quot;/&gt;&lt;wsp:rsid wsp:val=&quot;00834EFD&quot;/&gt;&lt;wsp:rsid wsp:val=&quot;00844B24&quot;/&gt;&lt;wsp:rsid wsp:val=&quot;0084515F&quot;/&gt;&lt;wsp:rsid wsp:val=&quot;0085092D&quot;/&gt;&lt;wsp:rsid wsp:val=&quot;00865414&quot;/&gt;&lt;wsp:rsid wsp:val=&quot;00877D4C&quot;/&gt;&lt;wsp:rsid wsp:val=&quot;00883903&quot;/&gt;&lt;wsp:rsid wsp:val=&quot;0089763B&quot;/&gt;&lt;wsp:rsid wsp:val=&quot;008B6AE3&quot;/&gt;&lt;wsp:rsid wsp:val=&quot;008C1332&quot;/&gt;&lt;wsp:rsid wsp:val=&quot;008D1045&quot;/&gt;&lt;wsp:rsid wsp:val=&quot;008E5996&quot;/&gt;&lt;wsp:rsid wsp:val=&quot;00901AE1&quot;/&gt;&lt;wsp:rsid wsp:val=&quot;00912F93&quot;/&gt;&lt;wsp:rsid wsp:val=&quot;009205B4&quot;/&gt;&lt;wsp:rsid wsp:val=&quot;00955B59&quot;/&gt;&lt;wsp:rsid wsp:val=&quot;00992262&quot;/&gt;&lt;wsp:rsid wsp:val=&quot;009926BC&quot;/&gt;&lt;wsp:rsid wsp:val=&quot;009A4319&quot;/&gt;&lt;wsp:rsid wsp:val=&quot;009A6C3F&quot;/&gt;&lt;wsp:rsid wsp:val=&quot;009B73F2&quot;/&gt;&lt;wsp:rsid wsp:val=&quot;009C12BD&quot;/&gt;&lt;wsp:rsid wsp:val=&quot;009C50FE&quot;/&gt;&lt;wsp:rsid wsp:val=&quot;009E49DD&quot;/&gt;&lt;wsp:rsid wsp:val=&quot;00A03E75&quot;/&gt;&lt;wsp:rsid wsp:val=&quot;00A20627&quot;/&gt;&lt;wsp:rsid wsp:val=&quot;00A22FE9&quot;/&gt;&lt;wsp:rsid wsp:val=&quot;00A31A44&quot;/&gt;&lt;wsp:rsid wsp:val=&quot;00A32BFA&quot;/&gt;&lt;wsp:rsid wsp:val=&quot;00A3325E&quot;/&gt;&lt;wsp:rsid wsp:val=&quot;00A45FCE&quot;/&gt;&lt;wsp:rsid wsp:val=&quot;00A75671&quot;/&gt;&lt;wsp:rsid wsp:val=&quot;00A773CC&quot;/&gt;&lt;wsp:rsid wsp:val=&quot;00A924D0&quot;/&gt;&lt;wsp:rsid wsp:val=&quot;00A9318B&quot;/&gt;&lt;wsp:rsid wsp:val=&quot;00A94AC1&quot;/&gt;&lt;wsp:rsid wsp:val=&quot;00AB18B7&quot;/&gt;&lt;wsp:rsid wsp:val=&quot;00AD335D&quot;/&gt;&lt;wsp:rsid wsp:val=&quot;00AF114C&quot;/&gt;&lt;wsp:rsid wsp:val=&quot;00AF792B&quot;/&gt;&lt;wsp:rsid wsp:val=&quot;00B33D2F&quot;/&gt;&lt;wsp:rsid wsp:val=&quot;00B40A5B&quot;/&gt;&lt;wsp:rsid wsp:val=&quot;00B45C6B&quot;/&gt;&lt;wsp:rsid wsp:val=&quot;00B55D5E&quot;/&gt;&lt;wsp:rsid wsp:val=&quot;00B57A80&quot;/&gt;&lt;wsp:rsid wsp:val=&quot;00B70E9C&quot;/&gt;&lt;wsp:rsid wsp:val=&quot;00B713D8&quot;/&gt;&lt;wsp:rsid wsp:val=&quot;00B72979&quot;/&gt;&lt;wsp:rsid wsp:val=&quot;00B94516&quot;/&gt;&lt;wsp:rsid wsp:val=&quot;00BA25E2&quot;/&gt;&lt;wsp:rsid wsp:val=&quot;00BB2855&quot;/&gt;&lt;wsp:rsid wsp:val=&quot;00BC5343&quot;/&gt;&lt;wsp:rsid wsp:val=&quot;00BD19C1&quot;/&gt;&lt;wsp:rsid wsp:val=&quot;00BD25B8&quot;/&gt;&lt;wsp:rsid wsp:val=&quot;00C012E1&quot;/&gt;&lt;wsp:rsid wsp:val=&quot;00C06BB4&quot;/&gt;&lt;wsp:rsid wsp:val=&quot;00C10D20&quot;/&gt;&lt;wsp:rsid wsp:val=&quot;00C12E0C&quot;/&gt;&lt;wsp:rsid wsp:val=&quot;00C21916&quot;/&gt;&lt;wsp:rsid wsp:val=&quot;00C34915&quot;/&gt;&lt;wsp:rsid wsp:val=&quot;00C457CA&quot;/&gt;&lt;wsp:rsid wsp:val=&quot;00C53FB6&quot;/&gt;&lt;wsp:rsid wsp:val=&quot;00C57FB7&quot;/&gt;&lt;wsp:rsid wsp:val=&quot;00C644D4&quot;/&gt;&lt;wsp:rsid wsp:val=&quot;00C65F3F&quot;/&gt;&lt;wsp:rsid wsp:val=&quot;00C72414&quot;/&gt;&lt;wsp:rsid wsp:val=&quot;00C72B1A&quot;/&gt;&lt;wsp:rsid wsp:val=&quot;00C8667B&quot;/&gt;&lt;wsp:rsid wsp:val=&quot;00C90993&quot;/&gt;&lt;wsp:rsid wsp:val=&quot;00CA4CE3&quot;/&gt;&lt;wsp:rsid wsp:val=&quot;00CC72FD&quot;/&gt;&lt;wsp:rsid wsp:val=&quot;00CD4F3F&quot;/&gt;&lt;wsp:rsid wsp:val=&quot;00D311F8&quot;/&gt;&lt;wsp:rsid wsp:val=&quot;00D31660&quot;/&gt;&lt;wsp:rsid wsp:val=&quot;00D36B52&quot;/&gt;&lt;wsp:rsid wsp:val=&quot;00D377C8&quot;/&gt;&lt;wsp:rsid wsp:val=&quot;00D41274&quot;/&gt;&lt;wsp:rsid wsp:val=&quot;00D4229C&quot;/&gt;&lt;wsp:rsid wsp:val=&quot;00D43BF3&quot;/&gt;&lt;wsp:rsid wsp:val=&quot;00D549FB&quot;/&gt;&lt;wsp:rsid wsp:val=&quot;00D767BB&quot;/&gt;&lt;wsp:rsid wsp:val=&quot;00D939B0&quot;/&gt;&lt;wsp:rsid wsp:val=&quot;00DA31A2&quot;/&gt;&lt;wsp:rsid wsp:val=&quot;00DB16E0&quot;/&gt;&lt;wsp:rsid wsp:val=&quot;00DB2DF9&quot;/&gt;&lt;wsp:rsid wsp:val=&quot;00DB465D&quot;/&gt;&lt;wsp:rsid wsp:val=&quot;00DB48A2&quot;/&gt;&lt;wsp:rsid wsp:val=&quot;00DB7E63&quot;/&gt;&lt;wsp:rsid wsp:val=&quot;00DC2055&quot;/&gt;&lt;wsp:rsid wsp:val=&quot;00DC3908&quot;/&gt;&lt;wsp:rsid wsp:val=&quot;00DD71E8&quot;/&gt;&lt;wsp:rsid wsp:val=&quot;00DD7F83&quot;/&gt;&lt;wsp:rsid wsp:val=&quot;00DE4EB8&quot;/&gt;&lt;wsp:rsid wsp:val=&quot;00E0641E&quot;/&gt;&lt;wsp:rsid wsp:val=&quot;00E06664&quot;/&gt;&lt;wsp:rsid wsp:val=&quot;00E304BC&quot;/&gt;&lt;wsp:rsid wsp:val=&quot;00E32853&quot;/&gt;&lt;wsp:rsid wsp:val=&quot;00E34EBD&quot;/&gt;&lt;wsp:rsid wsp:val=&quot;00E401F8&quot;/&gt;&lt;wsp:rsid wsp:val=&quot;00E46425&quot;/&gt;&lt;wsp:rsid wsp:val=&quot;00E469FC&quot;/&gt;&lt;wsp:rsid wsp:val=&quot;00E47D0E&quot;/&gt;&lt;wsp:rsid wsp:val=&quot;00E65018&quot;/&gt;&lt;wsp:rsid wsp:val=&quot;00E76CA1&quot;/&gt;&lt;wsp:rsid wsp:val=&quot;00E94339&quot;/&gt;&lt;wsp:rsid wsp:val=&quot;00E97563&quot;/&gt;&lt;wsp:rsid wsp:val=&quot;00EB0B63&quot;/&gt;&lt;wsp:rsid wsp:val=&quot;00EC265C&quot;/&gt;&lt;wsp:rsid wsp:val=&quot;00ED61CB&quot;/&gt;&lt;wsp:rsid wsp:val=&quot;00EE752A&quot;/&gt;&lt;wsp:rsid wsp:val=&quot;00F06A72&quot;/&gt;&lt;wsp:rsid wsp:val=&quot;00F136F0&quot;/&gt;&lt;wsp:rsid wsp:val=&quot;00F20BBB&quot;/&gt;&lt;wsp:rsid wsp:val=&quot;00F36048&quot;/&gt;&lt;wsp:rsid wsp:val=&quot;00F43BD8&quot;/&gt;&lt;wsp:rsid wsp:val=&quot;00F562F3&quot;/&gt;&lt;wsp:rsid wsp:val=&quot;00F74B89&quot;/&gt;&lt;wsp:rsid wsp:val=&quot;00F75133&quot;/&gt;&lt;wsp:rsid wsp:val=&quot;00F83272&quot;/&gt;&lt;wsp:rsid wsp:val=&quot;00F9358D&quot;/&gt;&lt;wsp:rsid wsp:val=&quot;00FA3899&quot;/&gt;&lt;wsp:rsid wsp:val=&quot;00FA4909&quot;/&gt;&lt;wsp:rsid wsp:val=&quot;00FA5164&quot;/&gt;&lt;wsp:rsid wsp:val=&quot;00FA6751&quot;/&gt;&lt;wsp:rsid wsp:val=&quot;00FA6BD7&quot;/&gt;&lt;wsp:rsid wsp:val=&quot;00FB1048&quot;/&gt;&lt;wsp:rsid wsp:val=&quot;00FB62C4&quot;/&gt;&lt;wsp:rsid wsp:val=&quot;00FB7701&quot;/&gt;&lt;wsp:rsid wsp:val=&quot;00FD1AC5&quot;/&gt;&lt;wsp:rsid wsp:val=&quot;00FD5CF0&quot;/&gt;&lt;/wsp:rsids&gt;&lt;/w:docPr&gt;&lt;w:body&gt;&lt;wx:sect&gt;&lt;w:p wsp:rsidR=&quot;003F3E2C&quot; wsp:rsidRDefault=&quot;003F3E2C&quot; wsp:rsidP=&quot;003F3E2C&quot;&gt;&lt;m:oMathPara&gt;&lt;m:oMath&gt;&lt;m:sSub&gt;&lt;m:sSubPr&gt;&lt;m:ctrlPr&gt;&lt;w:rPr&gt;&lt;w:rFonts w:ascii=&quot;Cambria Math&quot; w:fareast=&quot;Times New Roman&quot; w:h-ansi=&quot;Cambria Math&quot;/&gt;&lt;wx:font wx:val=&quot;Cambria Math&quot;/&gt;&lt;w:i/&gt;&lt;/w:rPr&gt;&lt;/m:ctrlPr&gt;&lt;/m:sSubPr&gt;&lt;m:e&gt;&lt;m:r&gt;&lt;w:rPr&gt;&lt;w:rFonts w:ascii=&quot;Cambria Math&quot; w:fareast=&quot;Times New Roman&quot; w:h-ansi=&quot;Cambria Math&quot;/&gt;&lt;wx:font wx:val=&quot;Cambria Math&quot;/&gt;&lt;w:i/&gt;&lt;/w:rPr&gt;&lt;m:t&gt;t&lt;/m:t&gt;&lt;/m:r&gt;&lt;/m:e&gt;&lt;m:sub&gt;&lt;m:r&gt;&lt;w:rPr&gt;&lt;w:rFonts w:ascii=&quot;Cambria Math&quot; w:fareast=&quot;Times New Roman&quot; w:h-ansi=&quot;Cambria Math&quot;/&gt;&lt;wx:font wx:val=&quot;Cambria Math&quot;/&gt;&lt;w:i/&gt;&lt;/w:rPr&gt;&lt;m:t&gt;on&lt;/m:t&gt;&lt;/m:r&gt;&lt;/m:sub&gt;&lt;/m:sSub&gt;&lt;/m:oMath&gt;&lt;/m:oMathPara&gt;&lt;/w:p&gt;&lt;w:sectPr wsp:rsidR=&quot;00000000&quot;&gt;&lt;w:pgSz w:w=&quot;12240&quot; w:h=&quot;15840&quot;/&gt;&lt;w:pgMar w:top=&quot;1440&quot; w:right=&quot;1440&quot; w:bottom=&quot;1440&quot; w:left=&quot;1440&quot; w:header=&quot;720&quot; w:footer=&quot;720&quot; w:gutter=&quot;0&quot;/&gt;&lt;w:cols w:space=&quot;720&quot;/&gt;&lt;/w:sectPr&gt;&lt;/wx:sect&gt;&lt;/w:body&gt;&lt;/w:wordDocument&gt;">
             <v:imagedata r:id="rId17" o:title="" chromakey="white"/>
           </v:shape>
         </w:pict>
@@ -1289,7 +1289,7 @@
           <w:szCs w:val="20"/>
         </w:rPr>
         <w:pict w14:anchorId="5007C518">
-          <v:shape id="_x0000_i1073" type="#_x0000_t75" style="width:7.1pt;height:13.65pt" equationxml="&lt;?xml version=&quot;1.0&quot; encoding=&quot;UTF-8&quot; standalone=&quot;yes&quot;?&gt;&#10;&lt;?mso-application progid=&quot;Word.Document&quot;?&gt;&#10;&lt;w:wordDocument xmlns:aml=&quot;http://schemas.microsoft.com/aml/2001/core&quot; xmlns:wpc=&quot;http://schemas.microsoft.com/office/word/2010/wordprocessingCanvas&quot; xmlns:cx=&quot;http://schemas.microsoft.com/office/drawing/2014/chartex&quot; xmlns:cx1=&quot;http://schemas.microsoft.com/office/drawing/2015/9/8/chartex&quot; xmlns:cx2=&quot;http://schemas.microsoft.com/office/drawing/2015/10/21/chartex&quot; xmlns:cx3=&quot;http://schemas.microsoft.com/office/drawing/2016/5/9/chartex&quot; xmlns:cx4=&quot;http://schemas.microsoft.com/office/drawing/2016/5/10/chartex&quot; xmlns:cx5=&quot;http://schemas.microsoft.com/office/drawing/2016/5/11/chartex&quot; xmlns:cx6=&quot;http://schemas.microsoft.com/office/drawing/2016/5/12/chartex&quot; xmlns:cx7=&quot;http://schemas.microsoft.com/office/drawing/2016/5/13/chartex&quot; xmlns:cx8=&quot;http://schemas.microsoft.com/office/drawing/2016/5/14/chartex&quot; xmlns:cr=&quot;http://schemas.microsoft.com/office/comments/2020/reactions&quot; xmlns:dt=&quot;uuid:C2F41010-65B3-11d1-A29F-00AA00C14882&quot; xmlns:mc=&quot;http://schemas.openxmlformats.org/markup-compatibility/2006&quot; xmlns:aink=&quot;http://schemas.microsoft.com/office/drawing/2016/ink&quot; xmlns:am3d=&quot;http://schemas.microsoft.com/office/drawing/2017/model3d&quot; xmlns:o=&quot;urn:schemas-microsoft-com:office:office&quot; xmlns:oel=&quot;http://schemas.microsoft.com/office/2019/extlst&quot; xmlns:m=&quot;http://schemas.openxmlformats.org/officeDocument/2006/math&quot; xmlns:v=&quot;urn:schemas-microsoft-com:vml&quot; xmlns:w10=&quot;urn:schemas-microsoft-com:office:word&quot; xmlns:w=&quot;http://schemas.microsoft.com/office/word/2003/wordml&quot; xmlns:wx=&quot;http://schemas.microsoft.com/office/word/2003/auxHint&quot; xmlns:wne=&quot;http://schemas.microsoft.com/office/word/2006/wordml&quot; xmlns:wsp=&quot;http://schemas.microsoft.com/office/word/2003/wordml/sp2&quot; xmlns:sl=&quot;http://schemas.microsoft.com/schemaLibrary/2003/core&quot; w:macrosPresent=&quot;no&quot; w:embeddedObjPresent=&quot;no&quot; w:ocxPresent=&quot;no&quot; xml:space=&quot;preserve&quot;&gt;&lt;w:ignoreSubtree w:val=&quot;http://schemas.microsoft.com/office/word/2003/wordml/sp2&quot;/&gt;&lt;o:DocumentProperties&gt;&lt;o:Version&gt;16&lt;/o:Version&gt;&lt;/o:DocumentProperties&gt;&lt;w:docPr&gt;&lt;w:view w:val=&quot;print&quot;/&gt;&lt;w:zoom w:percent=&quot;100&quot;/&gt;&lt;w:doNotEmbedSystemFonts/&gt;&lt;w:activeWritingStyle w:lang=&quot;EN-AU&quot; w:vendorID=&quot;64&quot; w:dllVersion=&quot;6&quot; w:nlCheck=&quot;on&quot; w:optionSet=&quot;1&quot;/&gt;&lt;w:activeWritingStyle w:lang=&quot;EN-GB&quot; w:vendorID=&quot;64&quot; w:dllVersion=&quot;6&quot; w:nlCheck=&quot;on&quot; w:optionSet=&quot;1&quot;/&gt;&lt;w:activeWritingStyle w:lang=&quot;EN-US&quot; w:vendorID=&quot;64&quot; w:dllVersion=&quot;6&quot; w:nlCheck=&quot;on&quot; w:optionSet=&quot;1&quot;/&gt;&lt;w:activeWritingStyle w:lang=&quot;EN-AU&quot; w:vendorID=&quot;64&quot; w:dllVersion=&quot;0&quot; w:nlCheck=&quot;on&quot; w:optionSet=&quot;0&quot;/&gt;&lt;w:activeWritingStyle w:lang=&quot;EN-GB&quot; w:vendorID=&quot;64&quot; w:dllVersion=&quot;0&quot; w:nlCheck=&quot;on&quot; w:optionSet=&quot;0&quot;/&gt;&lt;w:activeWritingStyle w:lang=&quot;EN-US&quot; w:vendorID=&quot;64&quot; w:dllVersion=&quot;0&quot; w:nlCheck=&quot;on&quot; w:optionSet=&quot;0&quot;/&gt;&lt;w:activeWritingStyle w:lang=&quot;ES-AR&quot; w:vendorID=&quot;64&quot; w:dllVersion=&quot;0&quot; w:nlCheck=&quot;on&quot; w:optionSet=&quot;0&quot;/&gt;&lt;w:activeWritingStyle w:lang=&quot;580A&quot; w:vendorID=&quot;64&quot; w:dllVersion=&quot;0&quot; w:nlCheck=&quot;on&quot; w:optionSet=&quot;0&quot;/&gt;&lt;w:activeWritingStyle w:lang=&quot;PT-BR&quot; w:vendorID=&quot;64&quot; w:dllVersion=&quot;0&quot; w:nlCheck=&quot;on&quot; w:optionSet=&quot;0&quot;/&gt;&lt;w:stylePaneFormatFilter w:val=&quot;3F01&quot;/&gt;&lt;w:defaultTabStop w:val=&quot;720&quot;/&gt;&lt;w:hyphenationZone w:val=&quot;425&quot;/&gt;&lt;w:characterSpacingControl w:val=&quot;DontCompress&quot;/&gt;&lt;w:optimizeForBrowser/&gt;&lt;w:validateAgainstSchema/&gt;&lt;w:saveInvalidXML w:val=&quot;off&quot;/&gt;&lt;w:ignoreMixedContent w:val=&quot;off&quot;/&gt;&lt;w:alwaysShowPlaceholderText w:val=&quot;off&quot;/&gt;&lt;w:compat&gt;&lt;w:breakWrappedTables/&gt;&lt;w:snapToGridInCell/&gt;&lt;w:applyBreakingRules/&gt;&lt;w:wrapTextWithPunct/&gt;&lt;w:useAsianBreakRules/&gt;&lt;w:useWord2002TableStyleRules/&gt;&lt;w:useFELayout/&gt;&lt;/w:compat&gt;&lt;wsp:rsids&gt;&lt;wsp:rsidRoot wsp:val=&quot;00426FBB&quot;/&gt;&lt;wsp:rsid wsp:val=&quot;000002E1&quot;/&gt;&lt;wsp:rsid wsp:val=&quot;00003C97&quot;/&gt;&lt;wsp:rsid wsp:val=&quot;00005565&quot;/&gt;&lt;wsp:rsid wsp:val=&quot;0001754A&quot;/&gt;&lt;wsp:rsid wsp:val=&quot;00017719&quot;/&gt;&lt;wsp:rsid wsp:val=&quot;00027F1D&quot;/&gt;&lt;wsp:rsid wsp:val=&quot;0003296C&quot;/&gt;&lt;wsp:rsid wsp:val=&quot;0003351F&quot;/&gt;&lt;wsp:rsid wsp:val=&quot;00044599&quot;/&gt;&lt;wsp:rsid wsp:val=&quot;000540E6&quot;/&gt;&lt;wsp:rsid wsp:val=&quot;00054421&quot;/&gt;&lt;wsp:rsid wsp:val=&quot;00062E46&quot;/&gt;&lt;wsp:rsid wsp:val=&quot;00074AC8&quot;/&gt;&lt;wsp:rsid wsp:val=&quot;00081408&quot;/&gt;&lt;wsp:rsid wsp:val=&quot;00081EBE&quot;/&gt;&lt;wsp:rsid wsp:val=&quot;00086EDC&quot;/&gt;&lt;wsp:rsid wsp:val=&quot;000B36A3&quot;/&gt;&lt;wsp:rsid wsp:val=&quot;000C013C&quot;/&gt;&lt;wsp:rsid wsp:val=&quot;000E3F84&quot;/&gt;&lt;wsp:rsid wsp:val=&quot;001056DF&quot;/&gt;&lt;wsp:rsid wsp:val=&quot;0010789C&quot;/&gt;&lt;wsp:rsid wsp:val=&quot;00114025&quot;/&gt;&lt;wsp:rsid wsp:val=&quot;001160D2&quot;/&gt;&lt;wsp:rsid wsp:val=&quot;00120636&quot;/&gt;&lt;wsp:rsid wsp:val=&quot;001348A5&quot;/&gt;&lt;wsp:rsid wsp:val=&quot;00151B8E&quot;/&gt;&lt;wsp:rsid wsp:val=&quot;00182170&quot;/&gt;&lt;wsp:rsid wsp:val=&quot;001928FB&quot;/&gt;&lt;wsp:rsid wsp:val=&quot;00192BC7&quot;/&gt;&lt;wsp:rsid wsp:val=&quot;00195BE6&quot;/&gt;&lt;wsp:rsid wsp:val=&quot;001A50EA&quot;/&gt;&lt;wsp:rsid wsp:val=&quot;001F16CD&quot;/&gt;&lt;wsp:rsid wsp:val=&quot;001F47D2&quot;/&gt;&lt;wsp:rsid wsp:val=&quot;002029C8&quot;/&gt;&lt;wsp:rsid wsp:val=&quot;0022285A&quot;/&gt;&lt;wsp:rsid wsp:val=&quot;00224C61&quot;/&gt;&lt;wsp:rsid wsp:val=&quot;00256ABC&quot;/&gt;&lt;wsp:rsid wsp:val=&quot;0027227B&quot;/&gt;&lt;wsp:rsid wsp:val=&quot;00273AC7&quot;/&gt;&lt;wsp:rsid wsp:val=&quot;00273D2C&quot;/&gt;&lt;wsp:rsid wsp:val=&quot;00285ECD&quot;/&gt;&lt;wsp:rsid wsp:val=&quot;00290E1B&quot;/&gt;&lt;wsp:rsid wsp:val=&quot;00291B17&quot;/&gt;&lt;wsp:rsid wsp:val=&quot;00291BB3&quot;/&gt;&lt;wsp:rsid wsp:val=&quot;002A6742&quot;/&gt;&lt;wsp:rsid wsp:val=&quot;002C1A7F&quot;/&gt;&lt;wsp:rsid wsp:val=&quot;002C4239&quot;/&gt;&lt;wsp:rsid wsp:val=&quot;002C559D&quot;/&gt;&lt;wsp:rsid wsp:val=&quot;002D16AE&quot;/&gt;&lt;wsp:rsid wsp:val=&quot;002D2D42&quot;/&gt;&lt;wsp:rsid wsp:val=&quot;002F72D0&quot;/&gt;&lt;wsp:rsid wsp:val=&quot;002F7A4F&quot;/&gt;&lt;wsp:rsid wsp:val=&quot;003003AB&quot;/&gt;&lt;wsp:rsid wsp:val=&quot;00302C35&quot;/&gt;&lt;wsp:rsid wsp:val=&quot;00311C49&quot;/&gt;&lt;wsp:rsid wsp:val=&quot;0032119E&quot;/&gt;&lt;wsp:rsid wsp:val=&quot;00321304&quot;/&gt;&lt;wsp:rsid wsp:val=&quot;00324FC2&quot;/&gt;&lt;wsp:rsid wsp:val=&quot;003312CA&quot;/&gt;&lt;wsp:rsid wsp:val=&quot;00331F84&quot;/&gt;&lt;wsp:rsid wsp:val=&quot;0037721F&quot;/&gt;&lt;wsp:rsid wsp:val=&quot;003950A4&quot;/&gt;&lt;wsp:rsid wsp:val=&quot;003A1E7E&quot;/&gt;&lt;wsp:rsid wsp:val=&quot;003E2FDC&quot;/&gt;&lt;wsp:rsid wsp:val=&quot;003E3577&quot;/&gt;&lt;wsp:rsid wsp:val=&quot;003F3A61&quot;/&gt;&lt;wsp:rsid wsp:val=&quot;00410A5D&quot;/&gt;&lt;wsp:rsid wsp:val=&quot;00414909&quot;/&gt;&lt;wsp:rsid wsp:val=&quot;00416537&quot;/&gt;&lt;wsp:rsid wsp:val=&quot;00425A6A&quot;/&gt;&lt;wsp:rsid wsp:val=&quot;00426FBB&quot;/&gt;&lt;wsp:rsid wsp:val=&quot;00454542&quot;/&gt;&lt;wsp:rsid wsp:val=&quot;0047429A&quot;/&gt;&lt;wsp:rsid wsp:val=&quot;0048374C&quot;/&gt;&lt;wsp:rsid wsp:val=&quot;0048771D&quot;/&gt;&lt;wsp:rsid wsp:val=&quot;004A6605&quot;/&gt;&lt;wsp:rsid wsp:val=&quot;004C45FA&quot;/&gt;&lt;wsp:rsid wsp:val=&quot;004D35A3&quot;/&gt;&lt;wsp:rsid wsp:val=&quot;004E1BD8&quot;/&gt;&lt;wsp:rsid wsp:val=&quot;004E452A&quot;/&gt;&lt;wsp:rsid wsp:val=&quot;004E78E3&quot;/&gt;&lt;wsp:rsid wsp:val=&quot;004F2BFE&quot;/&gt;&lt;wsp:rsid wsp:val=&quot;004F63D3&quot;/&gt;&lt;wsp:rsid wsp:val=&quot;004F7DCF&quot;/&gt;&lt;wsp:rsid wsp:val=&quot;005004BF&quot;/&gt;&lt;wsp:rsid wsp:val=&quot;00502E89&quot;/&gt;&lt;wsp:rsid wsp:val=&quot;00506CFE&quot;/&gt;&lt;wsp:rsid wsp:val=&quot;00510E95&quot;/&gt;&lt;wsp:rsid wsp:val=&quot;005225C3&quot;/&gt;&lt;wsp:rsid wsp:val=&quot;00527D56&quot;/&gt;&lt;wsp:rsid wsp:val=&quot;0053221F&quot;/&gt;&lt;wsp:rsid wsp:val=&quot;00536FAE&quot;/&gt;&lt;wsp:rsid wsp:val=&quot;00542C85&quot;/&gt;&lt;wsp:rsid wsp:val=&quot;00553510&quot;/&gt;&lt;wsp:rsid wsp:val=&quot;00554186&quot;/&gt;&lt;wsp:rsid wsp:val=&quot;00585769&quot;/&gt;&lt;wsp:rsid wsp:val=&quot;00585C61&quot;/&gt;&lt;wsp:rsid wsp:val=&quot;00591130&quot;/&gt;&lt;wsp:rsid wsp:val=&quot;005A3F28&quot;/&gt;&lt;wsp:rsid wsp:val=&quot;005A40BE&quot;/&gt;&lt;wsp:rsid wsp:val=&quot;005B13E2&quot;/&gt;&lt;wsp:rsid wsp:val=&quot;005B47D7&quot;/&gt;&lt;wsp:rsid wsp:val=&quot;005C5526&quot;/&gt;&lt;wsp:rsid wsp:val=&quot;005C62C6&quot;/&gt;&lt;wsp:rsid wsp:val=&quot;005D7B9E&quot;/&gt;&lt;wsp:rsid wsp:val=&quot;005E112E&quot;/&gt;&lt;wsp:rsid wsp:val=&quot;005F0834&quot;/&gt;&lt;wsp:rsid wsp:val=&quot;005F68AB&quot;/&gt;&lt;wsp:rsid wsp:val=&quot;005F6DC3&quot;/&gt;&lt;wsp:rsid wsp:val=&quot;00601A8E&quot;/&gt;&lt;wsp:rsid wsp:val=&quot;0062033E&quot;/&gt;&lt;wsp:rsid wsp:val=&quot;00624482&quot;/&gt;&lt;wsp:rsid wsp:val=&quot;0064799C&quot;/&gt;&lt;wsp:rsid wsp:val=&quot;00654156&quot;/&gt;&lt;wsp:rsid wsp:val=&quot;006B47CA&quot;/&gt;&lt;wsp:rsid wsp:val=&quot;006C304C&quot;/&gt;&lt;wsp:rsid wsp:val=&quot;006C4511&quot;/&gt;&lt;wsp:rsid wsp:val=&quot;006C65F5&quot;/&gt;&lt;wsp:rsid wsp:val=&quot;006C7AAA&quot;/&gt;&lt;wsp:rsid wsp:val=&quot;006D1C2A&quot;/&gt;&lt;wsp:rsid wsp:val=&quot;006D264F&quot;/&gt;&lt;wsp:rsid wsp:val=&quot;006E2A8D&quot;/&gt;&lt;wsp:rsid wsp:val=&quot;006E7574&quot;/&gt;&lt;wsp:rsid wsp:val=&quot;00703430&quot;/&gt;&lt;wsp:rsid wsp:val=&quot;00703548&quot;/&gt;&lt;wsp:rsid wsp:val=&quot;00704E18&quot;/&gt;&lt;wsp:rsid wsp:val=&quot;007069BE&quot;/&gt;&lt;wsp:rsid wsp:val=&quot;007212E9&quot;/&gt;&lt;wsp:rsid wsp:val=&quot;00745C86&quot;/&gt;&lt;wsp:rsid wsp:val=&quot;00764603&quot;/&gt;&lt;wsp:rsid wsp:val=&quot;0076604D&quot;/&gt;&lt;wsp:rsid wsp:val=&quot;00790909&quot;/&gt;&lt;wsp:rsid wsp:val=&quot;007B1582&quot;/&gt;&lt;wsp:rsid wsp:val=&quot;007B5A07&quot;/&gt;&lt;wsp:rsid wsp:val=&quot;007C065D&quot;/&gt;&lt;wsp:rsid wsp:val=&quot;007D3E71&quot;/&gt;&lt;wsp:rsid wsp:val=&quot;007E5D6A&quot;/&gt;&lt;wsp:rsid wsp:val=&quot;007E645D&quot;/&gt;&lt;wsp:rsid wsp:val=&quot;007F75CA&quot;/&gt;&lt;wsp:rsid wsp:val=&quot;00821E08&quot;/&gt;&lt;wsp:rsid wsp:val=&quot;00834EFD&quot;/&gt;&lt;wsp:rsid wsp:val=&quot;00844B24&quot;/&gt;&lt;wsp:rsid wsp:val=&quot;0084515F&quot;/&gt;&lt;wsp:rsid wsp:val=&quot;0085092D&quot;/&gt;&lt;wsp:rsid wsp:val=&quot;00865414&quot;/&gt;&lt;wsp:rsid wsp:val=&quot;00877D4C&quot;/&gt;&lt;wsp:rsid wsp:val=&quot;00883903&quot;/&gt;&lt;wsp:rsid wsp:val=&quot;0089763B&quot;/&gt;&lt;wsp:rsid wsp:val=&quot;008B6AE3&quot;/&gt;&lt;wsp:rsid wsp:val=&quot;008C1332&quot;/&gt;&lt;wsp:rsid wsp:val=&quot;008D1045&quot;/&gt;&lt;wsp:rsid wsp:val=&quot;008E5996&quot;/&gt;&lt;wsp:rsid wsp:val=&quot;00901AE1&quot;/&gt;&lt;wsp:rsid wsp:val=&quot;00912F93&quot;/&gt;&lt;wsp:rsid wsp:val=&quot;009205B4&quot;/&gt;&lt;wsp:rsid wsp:val=&quot;00955B59&quot;/&gt;&lt;wsp:rsid wsp:val=&quot;00992262&quot;/&gt;&lt;wsp:rsid wsp:val=&quot;009926BC&quot;/&gt;&lt;wsp:rsid wsp:val=&quot;009A4319&quot;/&gt;&lt;wsp:rsid wsp:val=&quot;009A6C3F&quot;/&gt;&lt;wsp:rsid wsp:val=&quot;009B73F2&quot;/&gt;&lt;wsp:rsid wsp:val=&quot;009C12BD&quot;/&gt;&lt;wsp:rsid wsp:val=&quot;009C50FE&quot;/&gt;&lt;wsp:rsid wsp:val=&quot;009E49DD&quot;/&gt;&lt;wsp:rsid wsp:val=&quot;00A03E75&quot;/&gt;&lt;wsp:rsid wsp:val=&quot;00A20627&quot;/&gt;&lt;wsp:rsid wsp:val=&quot;00A22FE9&quot;/&gt;&lt;wsp:rsid wsp:val=&quot;00A31A44&quot;/&gt;&lt;wsp:rsid wsp:val=&quot;00A32BFA&quot;/&gt;&lt;wsp:rsid wsp:val=&quot;00A3325E&quot;/&gt;&lt;wsp:rsid wsp:val=&quot;00A45FCE&quot;/&gt;&lt;wsp:rsid wsp:val=&quot;00A75671&quot;/&gt;&lt;wsp:rsid wsp:val=&quot;00A773CC&quot;/&gt;&lt;wsp:rsid wsp:val=&quot;00A924D0&quot;/&gt;&lt;wsp:rsid wsp:val=&quot;00A9318B&quot;/&gt;&lt;wsp:rsid wsp:val=&quot;00A94AC1&quot;/&gt;&lt;wsp:rsid wsp:val=&quot;00AB18B7&quot;/&gt;&lt;wsp:rsid wsp:val=&quot;00AD335D&quot;/&gt;&lt;wsp:rsid wsp:val=&quot;00AF114C&quot;/&gt;&lt;wsp:rsid wsp:val=&quot;00AF792B&quot;/&gt;&lt;wsp:rsid wsp:val=&quot;00B33D2F&quot;/&gt;&lt;wsp:rsid wsp:val=&quot;00B40A5B&quot;/&gt;&lt;wsp:rsid wsp:val=&quot;00B45C6B&quot;/&gt;&lt;wsp:rsid wsp:val=&quot;00B55D5E&quot;/&gt;&lt;wsp:rsid wsp:val=&quot;00B57A80&quot;/&gt;&lt;wsp:rsid wsp:val=&quot;00B70E9C&quot;/&gt;&lt;wsp:rsid wsp:val=&quot;00B713D8&quot;/&gt;&lt;wsp:rsid wsp:val=&quot;00B72979&quot;/&gt;&lt;wsp:rsid wsp:val=&quot;00B94516&quot;/&gt;&lt;wsp:rsid wsp:val=&quot;00BA25E2&quot;/&gt;&lt;wsp:rsid wsp:val=&quot;00BB2855&quot;/&gt;&lt;wsp:rsid wsp:val=&quot;00BC5343&quot;/&gt;&lt;wsp:rsid wsp:val=&quot;00BD19C1&quot;/&gt;&lt;wsp:rsid wsp:val=&quot;00BD25B8&quot;/&gt;&lt;wsp:rsid wsp:val=&quot;00C012E1&quot;/&gt;&lt;wsp:rsid wsp:val=&quot;00C06BB4&quot;/&gt;&lt;wsp:rsid wsp:val=&quot;00C10D20&quot;/&gt;&lt;wsp:rsid wsp:val=&quot;00C12E0C&quot;/&gt;&lt;wsp:rsid wsp:val=&quot;00C21916&quot;/&gt;&lt;wsp:rsid wsp:val=&quot;00C34915&quot;/&gt;&lt;wsp:rsid wsp:val=&quot;00C457CA&quot;/&gt;&lt;wsp:rsid wsp:val=&quot;00C53FB6&quot;/&gt;&lt;wsp:rsid wsp:val=&quot;00C57FB7&quot;/&gt;&lt;wsp:rsid wsp:val=&quot;00C644D4&quot;/&gt;&lt;wsp:rsid wsp:val=&quot;00C65F3F&quot;/&gt;&lt;wsp:rsid wsp:val=&quot;00C72414&quot;/&gt;&lt;wsp:rsid wsp:val=&quot;00C72B1A&quot;/&gt;&lt;wsp:rsid wsp:val=&quot;00C8667B&quot;/&gt;&lt;wsp:rsid wsp:val=&quot;00C90993&quot;/&gt;&lt;wsp:rsid wsp:val=&quot;00CA4CE3&quot;/&gt;&lt;wsp:rsid wsp:val=&quot;00CC72FD&quot;/&gt;&lt;wsp:rsid wsp:val=&quot;00CD4F3F&quot;/&gt;&lt;wsp:rsid wsp:val=&quot;00D311F8&quot;/&gt;&lt;wsp:rsid wsp:val=&quot;00D31660&quot;/&gt;&lt;wsp:rsid wsp:val=&quot;00D36B52&quot;/&gt;&lt;wsp:rsid wsp:val=&quot;00D377C8&quot;/&gt;&lt;wsp:rsid wsp:val=&quot;00D41274&quot;/&gt;&lt;wsp:rsid wsp:val=&quot;00D4229C&quot;/&gt;&lt;wsp:rsid wsp:val=&quot;00D43BF3&quot;/&gt;&lt;wsp:rsid wsp:val=&quot;00D549FB&quot;/&gt;&lt;wsp:rsid wsp:val=&quot;00D767BB&quot;/&gt;&lt;wsp:rsid wsp:val=&quot;00D939B0&quot;/&gt;&lt;wsp:rsid wsp:val=&quot;00DA31A2&quot;/&gt;&lt;wsp:rsid wsp:val=&quot;00DB16E0&quot;/&gt;&lt;wsp:rsid wsp:val=&quot;00DB2DF9&quot;/&gt;&lt;wsp:rsid wsp:val=&quot;00DB465D&quot;/&gt;&lt;wsp:rsid wsp:val=&quot;00DB48A2&quot;/&gt;&lt;wsp:rsid wsp:val=&quot;00DB7E63&quot;/&gt;&lt;wsp:rsid wsp:val=&quot;00DC2055&quot;/&gt;&lt;wsp:rsid wsp:val=&quot;00DC3908&quot;/&gt;&lt;wsp:rsid wsp:val=&quot;00DD71E8&quot;/&gt;&lt;wsp:rsid wsp:val=&quot;00DD7F83&quot;/&gt;&lt;wsp:rsid wsp:val=&quot;00DE4EB8&quot;/&gt;&lt;wsp:rsid wsp:val=&quot;00E0641E&quot;/&gt;&lt;wsp:rsid wsp:val=&quot;00E06664&quot;/&gt;&lt;wsp:rsid wsp:val=&quot;00E304BC&quot;/&gt;&lt;wsp:rsid wsp:val=&quot;00E32853&quot;/&gt;&lt;wsp:rsid wsp:val=&quot;00E34EBD&quot;/&gt;&lt;wsp:rsid wsp:val=&quot;00E401F8&quot;/&gt;&lt;wsp:rsid wsp:val=&quot;00E46425&quot;/&gt;&lt;wsp:rsid wsp:val=&quot;00E469FC&quot;/&gt;&lt;wsp:rsid wsp:val=&quot;00E47D0E&quot;/&gt;&lt;wsp:rsid wsp:val=&quot;00E65018&quot;/&gt;&lt;wsp:rsid wsp:val=&quot;00E76CA1&quot;/&gt;&lt;wsp:rsid wsp:val=&quot;00E94339&quot;/&gt;&lt;wsp:rsid wsp:val=&quot;00E97563&quot;/&gt;&lt;wsp:rsid wsp:val=&quot;00EB0B63&quot;/&gt;&lt;wsp:rsid wsp:val=&quot;00EC265C&quot;/&gt;&lt;wsp:rsid wsp:val=&quot;00ED61CB&quot;/&gt;&lt;wsp:rsid wsp:val=&quot;00EE752A&quot;/&gt;&lt;wsp:rsid wsp:val=&quot;00F06A72&quot;/&gt;&lt;wsp:rsid wsp:val=&quot;00F136F0&quot;/&gt;&lt;wsp:rsid wsp:val=&quot;00F20BBB&quot;/&gt;&lt;wsp:rsid wsp:val=&quot;00F36048&quot;/&gt;&lt;wsp:rsid wsp:val=&quot;00F43BD8&quot;/&gt;&lt;wsp:rsid wsp:val=&quot;00F562F3&quot;/&gt;&lt;wsp:rsid wsp:val=&quot;00F74B89&quot;/&gt;&lt;wsp:rsid wsp:val=&quot;00F75133&quot;/&gt;&lt;wsp:rsid wsp:val=&quot;00F83272&quot;/&gt;&lt;wsp:rsid wsp:val=&quot;00F9358D&quot;/&gt;&lt;wsp:rsid wsp:val=&quot;00FA3899&quot;/&gt;&lt;wsp:rsid wsp:val=&quot;00FA4909&quot;/&gt;&lt;wsp:rsid wsp:val=&quot;00FA5164&quot;/&gt;&lt;wsp:rsid wsp:val=&quot;00FA6751&quot;/&gt;&lt;wsp:rsid wsp:val=&quot;00FA6BD7&quot;/&gt;&lt;wsp:rsid wsp:val=&quot;00FB1048&quot;/&gt;&lt;wsp:rsid wsp:val=&quot;00FB62C4&quot;/&gt;&lt;wsp:rsid wsp:val=&quot;00FB7701&quot;/&gt;&lt;wsp:rsid wsp:val=&quot;00FD1AC5&quot;/&gt;&lt;wsp:rsid wsp:val=&quot;00FD5CF0&quot;/&gt;&lt;/wsp:rsids&gt;&lt;/w:docPr&gt;&lt;w:body&gt;&lt;wx:sect&gt;&lt;w:p wsp:rsidR=&quot;007212E9&quot; wsp:rsidRDefault=&quot;007212E9&quot; wsp:rsidP=&quot;007212E9&quot;&gt;&lt;m:oMathPara&gt;&lt;m:oMath&gt;&lt;m:r&gt;&lt;w:rPr&gt;&lt;w:rFonts w:ascii=&quot;Cambria Math&quot; w:fareast=&quot;Times New Roman&quot; w:h-ansi=&quot;Cambria Math&quot;/&gt;&lt;wx:font wx:val=&quot;Cambria Math&quot;/&gt;&lt;w:i/&gt;&lt;/w:rPr&gt;&lt;m:t&gt;T&lt;/m:t&gt;&lt;/m:r&gt;&lt;/m:oMath&gt;&lt;/m:oMathPara&gt;&lt;/w:p&gt;&lt;w:sectPr wsp:rsidR=&quot;00000000&quot;&gt;&lt;w:pgSz w:w=&quot;12240&quot; w:h=&quot;15840&quot;/&gt;&lt;w:pgMar w:top=&quot;1440&quot; w:right=&quot;1440&quot; w:bottom=&quot;1440&quot; w:left=&quot;1440&quot; w:header=&quot;720&quot; w:footer=&quot;720&quot; w:gutter=&quot;0&quot;/&gt;&lt;w:cols w:space=&quot;720&quot;/&gt;&lt;/w:sectPr&gt;&lt;/wx:sect&gt;&lt;/w:body&gt;&lt;/w:wordDocument&gt;">
+          <v:shape id="_x0000_i1040" type="#_x0000_t75" style="width:6.9pt;height:13.85pt" equationxml="&lt;?xml version=&quot;1.0&quot; encoding=&quot;UTF-8&quot; standalone=&quot;yes&quot;?&gt;&#10;&lt;?mso-application progid=&quot;Word.Document&quot;?&gt;&#10;&lt;w:wordDocument xmlns:aml=&quot;http://schemas.microsoft.com/aml/2001/core&quot; xmlns:wpc=&quot;http://schemas.microsoft.com/office/word/2010/wordprocessingCanvas&quot; xmlns:cx=&quot;http://schemas.microsoft.com/office/drawing/2014/chartex&quot; xmlns:cx1=&quot;http://schemas.microsoft.com/office/drawing/2015/9/8/chartex&quot; xmlns:cx2=&quot;http://schemas.microsoft.com/office/drawing/2015/10/21/chartex&quot; xmlns:cx3=&quot;http://schemas.microsoft.com/office/drawing/2016/5/9/chartex&quot; xmlns:cx4=&quot;http://schemas.microsoft.com/office/drawing/2016/5/10/chartex&quot; xmlns:cx5=&quot;http://schemas.microsoft.com/office/drawing/2016/5/11/chartex&quot; xmlns:cx6=&quot;http://schemas.microsoft.com/office/drawing/2016/5/12/chartex&quot; xmlns:cx7=&quot;http://schemas.microsoft.com/office/drawing/2016/5/13/chartex&quot; xmlns:cx8=&quot;http://schemas.microsoft.com/office/drawing/2016/5/14/chartex&quot; xmlns:cr=&quot;http://schemas.microsoft.com/office/comments/2020/reactions&quot; xmlns:dt=&quot;uuid:C2F41010-65B3-11d1-A29F-00AA00C14882&quot; xmlns:mc=&quot;http://schemas.openxmlformats.org/markup-compatibility/2006&quot; xmlns:aink=&quot;http://schemas.microsoft.com/office/drawing/2016/ink&quot; xmlns:am3d=&quot;http://schemas.microsoft.com/office/drawing/2017/model3d&quot; xmlns:o=&quot;urn:schemas-microsoft-com:office:office&quot; xmlns:oel=&quot;http://schemas.microsoft.com/office/2019/extlst&quot; xmlns:m=&quot;http://schemas.openxmlformats.org/officeDocument/2006/math&quot; xmlns:v=&quot;urn:schemas-microsoft-com:vml&quot; xmlns:w10=&quot;urn:schemas-microsoft-com:office:word&quot; xmlns:w=&quot;http://schemas.microsoft.com/office/word/2003/wordml&quot; xmlns:wx=&quot;http://schemas.microsoft.com/office/word/2003/auxHint&quot; xmlns:wne=&quot;http://schemas.microsoft.com/office/word/2006/wordml&quot; xmlns:wsp=&quot;http://schemas.microsoft.com/office/word/2003/wordml/sp2&quot; xmlns:sl=&quot;http://schemas.microsoft.com/schemaLibrary/2003/core&quot; w:macrosPresent=&quot;no&quot; w:embeddedObjPresent=&quot;no&quot; w:ocxPresent=&quot;no&quot; xml:space=&quot;preserve&quot;&gt;&lt;w:ignoreSubtree w:val=&quot;http://schemas.microsoft.com/office/word/2003/wordml/sp2&quot;/&gt;&lt;o:DocumentProperties&gt;&lt;o:Version&gt;16&lt;/o:Version&gt;&lt;/o:DocumentProperties&gt;&lt;w:docPr&gt;&lt;w:view w:val=&quot;print&quot;/&gt;&lt;w:zoom w:percent=&quot;100&quot;/&gt;&lt;w:doNotEmbedSystemFonts/&gt;&lt;w:activeWritingStyle w:lang=&quot;EN-AU&quot; w:vendorID=&quot;64&quot; w:dllVersion=&quot;6&quot; w:nlCheck=&quot;on&quot; w:optionSet=&quot;1&quot;/&gt;&lt;w:activeWritingStyle w:lang=&quot;EN-GB&quot; w:vendorID=&quot;64&quot; w:dllVersion=&quot;6&quot; w:nlCheck=&quot;on&quot; w:optionSet=&quot;1&quot;/&gt;&lt;w:activeWritingStyle w:lang=&quot;EN-US&quot; w:vendorID=&quot;64&quot; w:dllVersion=&quot;6&quot; w:nlCheck=&quot;on&quot; w:optionSet=&quot;1&quot;/&gt;&lt;w:activeWritingStyle w:lang=&quot;EN-AU&quot; w:vendorID=&quot;64&quot; w:dllVersion=&quot;0&quot; w:nlCheck=&quot;on&quot; w:optionSet=&quot;0&quot;/&gt;&lt;w:activeWritingStyle w:lang=&quot;EN-GB&quot; w:vendorID=&quot;64&quot; w:dllVersion=&quot;0&quot; w:nlCheck=&quot;on&quot; w:optionSet=&quot;0&quot;/&gt;&lt;w:activeWritingStyle w:lang=&quot;EN-US&quot; w:vendorID=&quot;64&quot; w:dllVersion=&quot;0&quot; w:nlCheck=&quot;on&quot; w:optionSet=&quot;0&quot;/&gt;&lt;w:activeWritingStyle w:lang=&quot;ES-AR&quot; w:vendorID=&quot;64&quot; w:dllVersion=&quot;0&quot; w:nlCheck=&quot;on&quot; w:optionSet=&quot;0&quot;/&gt;&lt;w:activeWritingStyle w:lang=&quot;580A&quot; w:vendorID=&quot;64&quot; w:dllVersion=&quot;0&quot; w:nlCheck=&quot;on&quot; w:optionSet=&quot;0&quot;/&gt;&lt;w:activeWritingStyle w:lang=&quot;PT-BR&quot; w:vendorID=&quot;64&quot; w:dllVersion=&quot;0&quot; w:nlCheck=&quot;on&quot; w:optionSet=&quot;0&quot;/&gt;&lt;w:stylePaneFormatFilter w:val=&quot;3F01&quot;/&gt;&lt;w:defaultTabStop w:val=&quot;720&quot;/&gt;&lt;w:hyphenationZone w:val=&quot;425&quot;/&gt;&lt;w:characterSpacingControl w:val=&quot;DontCompress&quot;/&gt;&lt;w:optimizeForBrowser/&gt;&lt;w:validateAgainstSchema/&gt;&lt;w:saveInvalidXML w:val=&quot;off&quot;/&gt;&lt;w:ignoreMixedContent w:val=&quot;off&quot;/&gt;&lt;w:alwaysShowPlaceholderText w:val=&quot;off&quot;/&gt;&lt;w:compat&gt;&lt;w:breakWrappedTables/&gt;&lt;w:snapToGridInCell/&gt;&lt;w:applyBreakingRules/&gt;&lt;w:wrapTextWithPunct/&gt;&lt;w:useAsianBreakRules/&gt;&lt;w:useWord2002TableStyleRules/&gt;&lt;w:useFELayout/&gt;&lt;/w:compat&gt;&lt;wsp:rsids&gt;&lt;wsp:rsidRoot wsp:val=&quot;00426FBB&quot;/&gt;&lt;wsp:rsid wsp:val=&quot;000002E1&quot;/&gt;&lt;wsp:rsid wsp:val=&quot;00003C97&quot;/&gt;&lt;wsp:rsid wsp:val=&quot;00005565&quot;/&gt;&lt;wsp:rsid wsp:val=&quot;0001754A&quot;/&gt;&lt;wsp:rsid wsp:val=&quot;00017719&quot;/&gt;&lt;wsp:rsid wsp:val=&quot;00027F1D&quot;/&gt;&lt;wsp:rsid wsp:val=&quot;0003296C&quot;/&gt;&lt;wsp:rsid wsp:val=&quot;0003351F&quot;/&gt;&lt;wsp:rsid wsp:val=&quot;00044599&quot;/&gt;&lt;wsp:rsid wsp:val=&quot;000540E6&quot;/&gt;&lt;wsp:rsid wsp:val=&quot;00054421&quot;/&gt;&lt;wsp:rsid wsp:val=&quot;00062E46&quot;/&gt;&lt;wsp:rsid wsp:val=&quot;00074AC8&quot;/&gt;&lt;wsp:rsid wsp:val=&quot;00081408&quot;/&gt;&lt;wsp:rsid wsp:val=&quot;00081EBE&quot;/&gt;&lt;wsp:rsid wsp:val=&quot;00086EDC&quot;/&gt;&lt;wsp:rsid wsp:val=&quot;000B36A3&quot;/&gt;&lt;wsp:rsid wsp:val=&quot;000C013C&quot;/&gt;&lt;wsp:rsid wsp:val=&quot;000E3F84&quot;/&gt;&lt;wsp:rsid wsp:val=&quot;001056DF&quot;/&gt;&lt;wsp:rsid wsp:val=&quot;0010789C&quot;/&gt;&lt;wsp:rsid wsp:val=&quot;00114025&quot;/&gt;&lt;wsp:rsid wsp:val=&quot;001160D2&quot;/&gt;&lt;wsp:rsid wsp:val=&quot;00120636&quot;/&gt;&lt;wsp:rsid wsp:val=&quot;001348A5&quot;/&gt;&lt;wsp:rsid wsp:val=&quot;00151B8E&quot;/&gt;&lt;wsp:rsid wsp:val=&quot;00182170&quot;/&gt;&lt;wsp:rsid wsp:val=&quot;001928FB&quot;/&gt;&lt;wsp:rsid wsp:val=&quot;00192BC7&quot;/&gt;&lt;wsp:rsid wsp:val=&quot;00195BE6&quot;/&gt;&lt;wsp:rsid wsp:val=&quot;001A50EA&quot;/&gt;&lt;wsp:rsid wsp:val=&quot;001F16CD&quot;/&gt;&lt;wsp:rsid wsp:val=&quot;001F47D2&quot;/&gt;&lt;wsp:rsid wsp:val=&quot;002029C8&quot;/&gt;&lt;wsp:rsid wsp:val=&quot;0022285A&quot;/&gt;&lt;wsp:rsid wsp:val=&quot;00224C61&quot;/&gt;&lt;wsp:rsid wsp:val=&quot;00256ABC&quot;/&gt;&lt;wsp:rsid wsp:val=&quot;0027227B&quot;/&gt;&lt;wsp:rsid wsp:val=&quot;00273AC7&quot;/&gt;&lt;wsp:rsid wsp:val=&quot;00273D2C&quot;/&gt;&lt;wsp:rsid wsp:val=&quot;00285ECD&quot;/&gt;&lt;wsp:rsid wsp:val=&quot;00290E1B&quot;/&gt;&lt;wsp:rsid wsp:val=&quot;00291B17&quot;/&gt;&lt;wsp:rsid wsp:val=&quot;00291BB3&quot;/&gt;&lt;wsp:rsid wsp:val=&quot;002A6742&quot;/&gt;&lt;wsp:rsid wsp:val=&quot;002C1A7F&quot;/&gt;&lt;wsp:rsid wsp:val=&quot;002C4239&quot;/&gt;&lt;wsp:rsid wsp:val=&quot;002C559D&quot;/&gt;&lt;wsp:rsid wsp:val=&quot;002D16AE&quot;/&gt;&lt;wsp:rsid wsp:val=&quot;002D2D42&quot;/&gt;&lt;wsp:rsid wsp:val=&quot;002F72D0&quot;/&gt;&lt;wsp:rsid wsp:val=&quot;002F7A4F&quot;/&gt;&lt;wsp:rsid wsp:val=&quot;003003AB&quot;/&gt;&lt;wsp:rsid wsp:val=&quot;00302C35&quot;/&gt;&lt;wsp:rsid wsp:val=&quot;00311C49&quot;/&gt;&lt;wsp:rsid wsp:val=&quot;0032119E&quot;/&gt;&lt;wsp:rsid wsp:val=&quot;00321304&quot;/&gt;&lt;wsp:rsid wsp:val=&quot;00324FC2&quot;/&gt;&lt;wsp:rsid wsp:val=&quot;003312CA&quot;/&gt;&lt;wsp:rsid wsp:val=&quot;00331F84&quot;/&gt;&lt;wsp:rsid wsp:val=&quot;0037721F&quot;/&gt;&lt;wsp:rsid wsp:val=&quot;003950A4&quot;/&gt;&lt;wsp:rsid wsp:val=&quot;003A1E7E&quot;/&gt;&lt;wsp:rsid wsp:val=&quot;003E2FDC&quot;/&gt;&lt;wsp:rsid wsp:val=&quot;003E3577&quot;/&gt;&lt;wsp:rsid wsp:val=&quot;003F3A61&quot;/&gt;&lt;wsp:rsid wsp:val=&quot;00410A5D&quot;/&gt;&lt;wsp:rsid wsp:val=&quot;00414909&quot;/&gt;&lt;wsp:rsid wsp:val=&quot;00416537&quot;/&gt;&lt;wsp:rsid wsp:val=&quot;00425A6A&quot;/&gt;&lt;wsp:rsid wsp:val=&quot;00426FBB&quot;/&gt;&lt;wsp:rsid wsp:val=&quot;00454542&quot;/&gt;&lt;wsp:rsid wsp:val=&quot;0047429A&quot;/&gt;&lt;wsp:rsid wsp:val=&quot;0048374C&quot;/&gt;&lt;wsp:rsid wsp:val=&quot;0048771D&quot;/&gt;&lt;wsp:rsid wsp:val=&quot;004A6605&quot;/&gt;&lt;wsp:rsid wsp:val=&quot;004C45FA&quot;/&gt;&lt;wsp:rsid wsp:val=&quot;004D35A3&quot;/&gt;&lt;wsp:rsid wsp:val=&quot;004E1BD8&quot;/&gt;&lt;wsp:rsid wsp:val=&quot;004E452A&quot;/&gt;&lt;wsp:rsid wsp:val=&quot;004E78E3&quot;/&gt;&lt;wsp:rsid wsp:val=&quot;004F2BFE&quot;/&gt;&lt;wsp:rsid wsp:val=&quot;004F63D3&quot;/&gt;&lt;wsp:rsid wsp:val=&quot;004F7DCF&quot;/&gt;&lt;wsp:rsid wsp:val=&quot;005004BF&quot;/&gt;&lt;wsp:rsid wsp:val=&quot;00502E89&quot;/&gt;&lt;wsp:rsid wsp:val=&quot;00506CFE&quot;/&gt;&lt;wsp:rsid wsp:val=&quot;00510E95&quot;/&gt;&lt;wsp:rsid wsp:val=&quot;005225C3&quot;/&gt;&lt;wsp:rsid wsp:val=&quot;00527D56&quot;/&gt;&lt;wsp:rsid wsp:val=&quot;0053221F&quot;/&gt;&lt;wsp:rsid wsp:val=&quot;00536FAE&quot;/&gt;&lt;wsp:rsid wsp:val=&quot;00542C85&quot;/&gt;&lt;wsp:rsid wsp:val=&quot;00553510&quot;/&gt;&lt;wsp:rsid wsp:val=&quot;00554186&quot;/&gt;&lt;wsp:rsid wsp:val=&quot;00585769&quot;/&gt;&lt;wsp:rsid wsp:val=&quot;00585C61&quot;/&gt;&lt;wsp:rsid wsp:val=&quot;00591130&quot;/&gt;&lt;wsp:rsid wsp:val=&quot;005A3F28&quot;/&gt;&lt;wsp:rsid wsp:val=&quot;005A40BE&quot;/&gt;&lt;wsp:rsid wsp:val=&quot;005B13E2&quot;/&gt;&lt;wsp:rsid wsp:val=&quot;005B47D7&quot;/&gt;&lt;wsp:rsid wsp:val=&quot;005C5526&quot;/&gt;&lt;wsp:rsid wsp:val=&quot;005C62C6&quot;/&gt;&lt;wsp:rsid wsp:val=&quot;005D7B9E&quot;/&gt;&lt;wsp:rsid wsp:val=&quot;005E112E&quot;/&gt;&lt;wsp:rsid wsp:val=&quot;005F0834&quot;/&gt;&lt;wsp:rsid wsp:val=&quot;005F68AB&quot;/&gt;&lt;wsp:rsid wsp:val=&quot;005F6DC3&quot;/&gt;&lt;wsp:rsid wsp:val=&quot;00601A8E&quot;/&gt;&lt;wsp:rsid wsp:val=&quot;0062033E&quot;/&gt;&lt;wsp:rsid wsp:val=&quot;00624482&quot;/&gt;&lt;wsp:rsid wsp:val=&quot;0064799C&quot;/&gt;&lt;wsp:rsid wsp:val=&quot;00654156&quot;/&gt;&lt;wsp:rsid wsp:val=&quot;006B47CA&quot;/&gt;&lt;wsp:rsid wsp:val=&quot;006C304C&quot;/&gt;&lt;wsp:rsid wsp:val=&quot;006C4511&quot;/&gt;&lt;wsp:rsid wsp:val=&quot;006C65F5&quot;/&gt;&lt;wsp:rsid wsp:val=&quot;006C7AAA&quot;/&gt;&lt;wsp:rsid wsp:val=&quot;006D1C2A&quot;/&gt;&lt;wsp:rsid wsp:val=&quot;006D264F&quot;/&gt;&lt;wsp:rsid wsp:val=&quot;006E2A8D&quot;/&gt;&lt;wsp:rsid wsp:val=&quot;006E7574&quot;/&gt;&lt;wsp:rsid wsp:val=&quot;00703430&quot;/&gt;&lt;wsp:rsid wsp:val=&quot;00703548&quot;/&gt;&lt;wsp:rsid wsp:val=&quot;00704E18&quot;/&gt;&lt;wsp:rsid wsp:val=&quot;007069BE&quot;/&gt;&lt;wsp:rsid wsp:val=&quot;007212E9&quot;/&gt;&lt;wsp:rsid wsp:val=&quot;00745C86&quot;/&gt;&lt;wsp:rsid wsp:val=&quot;00764603&quot;/&gt;&lt;wsp:rsid wsp:val=&quot;0076604D&quot;/&gt;&lt;wsp:rsid wsp:val=&quot;00790909&quot;/&gt;&lt;wsp:rsid wsp:val=&quot;007B1582&quot;/&gt;&lt;wsp:rsid wsp:val=&quot;007B5A07&quot;/&gt;&lt;wsp:rsid wsp:val=&quot;007C065D&quot;/&gt;&lt;wsp:rsid wsp:val=&quot;007D3E71&quot;/&gt;&lt;wsp:rsid wsp:val=&quot;007E5D6A&quot;/&gt;&lt;wsp:rsid wsp:val=&quot;007E645D&quot;/&gt;&lt;wsp:rsid wsp:val=&quot;007F75CA&quot;/&gt;&lt;wsp:rsid wsp:val=&quot;00821E08&quot;/&gt;&lt;wsp:rsid wsp:val=&quot;00834EFD&quot;/&gt;&lt;wsp:rsid wsp:val=&quot;00844B24&quot;/&gt;&lt;wsp:rsid wsp:val=&quot;0084515F&quot;/&gt;&lt;wsp:rsid wsp:val=&quot;0085092D&quot;/&gt;&lt;wsp:rsid wsp:val=&quot;00865414&quot;/&gt;&lt;wsp:rsid wsp:val=&quot;00877D4C&quot;/&gt;&lt;wsp:rsid wsp:val=&quot;00883903&quot;/&gt;&lt;wsp:rsid wsp:val=&quot;0089763B&quot;/&gt;&lt;wsp:rsid wsp:val=&quot;008B6AE3&quot;/&gt;&lt;wsp:rsid wsp:val=&quot;008C1332&quot;/&gt;&lt;wsp:rsid wsp:val=&quot;008D1045&quot;/&gt;&lt;wsp:rsid wsp:val=&quot;008E5996&quot;/&gt;&lt;wsp:rsid wsp:val=&quot;00901AE1&quot;/&gt;&lt;wsp:rsid wsp:val=&quot;00912F93&quot;/&gt;&lt;wsp:rsid wsp:val=&quot;009205B4&quot;/&gt;&lt;wsp:rsid wsp:val=&quot;00955B59&quot;/&gt;&lt;wsp:rsid wsp:val=&quot;00992262&quot;/&gt;&lt;wsp:rsid wsp:val=&quot;009926BC&quot;/&gt;&lt;wsp:rsid wsp:val=&quot;009A4319&quot;/&gt;&lt;wsp:rsid wsp:val=&quot;009A6C3F&quot;/&gt;&lt;wsp:rsid wsp:val=&quot;009B73F2&quot;/&gt;&lt;wsp:rsid wsp:val=&quot;009C12BD&quot;/&gt;&lt;wsp:rsid wsp:val=&quot;009C50FE&quot;/&gt;&lt;wsp:rsid wsp:val=&quot;009E49DD&quot;/&gt;&lt;wsp:rsid wsp:val=&quot;00A03E75&quot;/&gt;&lt;wsp:rsid wsp:val=&quot;00A20627&quot;/&gt;&lt;wsp:rsid wsp:val=&quot;00A22FE9&quot;/&gt;&lt;wsp:rsid wsp:val=&quot;00A31A44&quot;/&gt;&lt;wsp:rsid wsp:val=&quot;00A32BFA&quot;/&gt;&lt;wsp:rsid wsp:val=&quot;00A3325E&quot;/&gt;&lt;wsp:rsid wsp:val=&quot;00A45FCE&quot;/&gt;&lt;wsp:rsid wsp:val=&quot;00A75671&quot;/&gt;&lt;wsp:rsid wsp:val=&quot;00A773CC&quot;/&gt;&lt;wsp:rsid wsp:val=&quot;00A924D0&quot;/&gt;&lt;wsp:rsid wsp:val=&quot;00A9318B&quot;/&gt;&lt;wsp:rsid wsp:val=&quot;00A94AC1&quot;/&gt;&lt;wsp:rsid wsp:val=&quot;00AB18B7&quot;/&gt;&lt;wsp:rsid wsp:val=&quot;00AD335D&quot;/&gt;&lt;wsp:rsid wsp:val=&quot;00AF114C&quot;/&gt;&lt;wsp:rsid wsp:val=&quot;00AF792B&quot;/&gt;&lt;wsp:rsid wsp:val=&quot;00B33D2F&quot;/&gt;&lt;wsp:rsid wsp:val=&quot;00B40A5B&quot;/&gt;&lt;wsp:rsid wsp:val=&quot;00B45C6B&quot;/&gt;&lt;wsp:rsid wsp:val=&quot;00B55D5E&quot;/&gt;&lt;wsp:rsid wsp:val=&quot;00B57A80&quot;/&gt;&lt;wsp:rsid wsp:val=&quot;00B70E9C&quot;/&gt;&lt;wsp:rsid wsp:val=&quot;00B713D8&quot;/&gt;&lt;wsp:rsid wsp:val=&quot;00B72979&quot;/&gt;&lt;wsp:rsid wsp:val=&quot;00B94516&quot;/&gt;&lt;wsp:rsid wsp:val=&quot;00BA25E2&quot;/&gt;&lt;wsp:rsid wsp:val=&quot;00BB2855&quot;/&gt;&lt;wsp:rsid wsp:val=&quot;00BC5343&quot;/&gt;&lt;wsp:rsid wsp:val=&quot;00BD19C1&quot;/&gt;&lt;wsp:rsid wsp:val=&quot;00BD25B8&quot;/&gt;&lt;wsp:rsid wsp:val=&quot;00C012E1&quot;/&gt;&lt;wsp:rsid wsp:val=&quot;00C06BB4&quot;/&gt;&lt;wsp:rsid wsp:val=&quot;00C10D20&quot;/&gt;&lt;wsp:rsid wsp:val=&quot;00C12E0C&quot;/&gt;&lt;wsp:rsid wsp:val=&quot;00C21916&quot;/&gt;&lt;wsp:rsid wsp:val=&quot;00C34915&quot;/&gt;&lt;wsp:rsid wsp:val=&quot;00C457CA&quot;/&gt;&lt;wsp:rsid wsp:val=&quot;00C53FB6&quot;/&gt;&lt;wsp:rsid wsp:val=&quot;00C57FB7&quot;/&gt;&lt;wsp:rsid wsp:val=&quot;00C644D4&quot;/&gt;&lt;wsp:rsid wsp:val=&quot;00C65F3F&quot;/&gt;&lt;wsp:rsid wsp:val=&quot;00C72414&quot;/&gt;&lt;wsp:rsid wsp:val=&quot;00C72B1A&quot;/&gt;&lt;wsp:rsid wsp:val=&quot;00C8667B&quot;/&gt;&lt;wsp:rsid wsp:val=&quot;00C90993&quot;/&gt;&lt;wsp:rsid wsp:val=&quot;00CA4CE3&quot;/&gt;&lt;wsp:rsid wsp:val=&quot;00CC72FD&quot;/&gt;&lt;wsp:rsid wsp:val=&quot;00CD4F3F&quot;/&gt;&lt;wsp:rsid wsp:val=&quot;00D311F8&quot;/&gt;&lt;wsp:rsid wsp:val=&quot;00D31660&quot;/&gt;&lt;wsp:rsid wsp:val=&quot;00D36B52&quot;/&gt;&lt;wsp:rsid wsp:val=&quot;00D377C8&quot;/&gt;&lt;wsp:rsid wsp:val=&quot;00D41274&quot;/&gt;&lt;wsp:rsid wsp:val=&quot;00D4229C&quot;/&gt;&lt;wsp:rsid wsp:val=&quot;00D43BF3&quot;/&gt;&lt;wsp:rsid wsp:val=&quot;00D549FB&quot;/&gt;&lt;wsp:rsid wsp:val=&quot;00D767BB&quot;/&gt;&lt;wsp:rsid wsp:val=&quot;00D939B0&quot;/&gt;&lt;wsp:rsid wsp:val=&quot;00DA31A2&quot;/&gt;&lt;wsp:rsid wsp:val=&quot;00DB16E0&quot;/&gt;&lt;wsp:rsid wsp:val=&quot;00DB2DF9&quot;/&gt;&lt;wsp:rsid wsp:val=&quot;00DB465D&quot;/&gt;&lt;wsp:rsid wsp:val=&quot;00DB48A2&quot;/&gt;&lt;wsp:rsid wsp:val=&quot;00DB7E63&quot;/&gt;&lt;wsp:rsid wsp:val=&quot;00DC2055&quot;/&gt;&lt;wsp:rsid wsp:val=&quot;00DC3908&quot;/&gt;&lt;wsp:rsid wsp:val=&quot;00DD71E8&quot;/&gt;&lt;wsp:rsid wsp:val=&quot;00DD7F83&quot;/&gt;&lt;wsp:rsid wsp:val=&quot;00DE4EB8&quot;/&gt;&lt;wsp:rsid wsp:val=&quot;00E0641E&quot;/&gt;&lt;wsp:rsid wsp:val=&quot;00E06664&quot;/&gt;&lt;wsp:rsid wsp:val=&quot;00E304BC&quot;/&gt;&lt;wsp:rsid wsp:val=&quot;00E32853&quot;/&gt;&lt;wsp:rsid wsp:val=&quot;00E34EBD&quot;/&gt;&lt;wsp:rsid wsp:val=&quot;00E401F8&quot;/&gt;&lt;wsp:rsid wsp:val=&quot;00E46425&quot;/&gt;&lt;wsp:rsid wsp:val=&quot;00E469FC&quot;/&gt;&lt;wsp:rsid wsp:val=&quot;00E47D0E&quot;/&gt;&lt;wsp:rsid wsp:val=&quot;00E65018&quot;/&gt;&lt;wsp:rsid wsp:val=&quot;00E76CA1&quot;/&gt;&lt;wsp:rsid wsp:val=&quot;00E94339&quot;/&gt;&lt;wsp:rsid wsp:val=&quot;00E97563&quot;/&gt;&lt;wsp:rsid wsp:val=&quot;00EB0B63&quot;/&gt;&lt;wsp:rsid wsp:val=&quot;00EC265C&quot;/&gt;&lt;wsp:rsid wsp:val=&quot;00ED61CB&quot;/&gt;&lt;wsp:rsid wsp:val=&quot;00EE752A&quot;/&gt;&lt;wsp:rsid wsp:val=&quot;00F06A72&quot;/&gt;&lt;wsp:rsid wsp:val=&quot;00F136F0&quot;/&gt;&lt;wsp:rsid wsp:val=&quot;00F20BBB&quot;/&gt;&lt;wsp:rsid wsp:val=&quot;00F36048&quot;/&gt;&lt;wsp:rsid wsp:val=&quot;00F43BD8&quot;/&gt;&lt;wsp:rsid wsp:val=&quot;00F562F3&quot;/&gt;&lt;wsp:rsid wsp:val=&quot;00F74B89&quot;/&gt;&lt;wsp:rsid wsp:val=&quot;00F75133&quot;/&gt;&lt;wsp:rsid wsp:val=&quot;00F83272&quot;/&gt;&lt;wsp:rsid wsp:val=&quot;00F9358D&quot;/&gt;&lt;wsp:rsid wsp:val=&quot;00FA3899&quot;/&gt;&lt;wsp:rsid wsp:val=&quot;00FA4909&quot;/&gt;&lt;wsp:rsid wsp:val=&quot;00FA5164&quot;/&gt;&lt;wsp:rsid wsp:val=&quot;00FA6751&quot;/&gt;&lt;wsp:rsid wsp:val=&quot;00FA6BD7&quot;/&gt;&lt;wsp:rsid wsp:val=&quot;00FB1048&quot;/&gt;&lt;wsp:rsid wsp:val=&quot;00FB62C4&quot;/&gt;&lt;wsp:rsid wsp:val=&quot;00FB7701&quot;/&gt;&lt;wsp:rsid wsp:val=&quot;00FD1AC5&quot;/&gt;&lt;wsp:rsid wsp:val=&quot;00FD5CF0&quot;/&gt;&lt;/wsp:rsids&gt;&lt;/w:docPr&gt;&lt;w:body&gt;&lt;wx:sect&gt;&lt;w:p wsp:rsidR=&quot;007212E9&quot; wsp:rsidRDefault=&quot;007212E9&quot; wsp:rsidP=&quot;007212E9&quot;&gt;&lt;m:oMathPara&gt;&lt;m:oMath&gt;&lt;m:r&gt;&lt;w:rPr&gt;&lt;w:rFonts w:ascii=&quot;Cambria Math&quot; w:fareast=&quot;Times New Roman&quot; w:h-ansi=&quot;Cambria Math&quot;/&gt;&lt;wx:font wx:val=&quot;Cambria Math&quot;/&gt;&lt;w:i/&gt;&lt;/w:rPr&gt;&lt;m:t&gt;T&lt;/m:t&gt;&lt;/m:r&gt;&lt;/m:oMath&gt;&lt;/m:oMathPara&gt;&lt;/w:p&gt;&lt;w:sectPr wsp:rsidR=&quot;00000000&quot;&gt;&lt;w:pgSz w:w=&quot;12240&quot; w:h=&quot;15840&quot;/&gt;&lt;w:pgMar w:top=&quot;1440&quot; w:right=&quot;1440&quot; w:bottom=&quot;1440&quot; w:left=&quot;1440&quot; w:header=&quot;720&quot; w:footer=&quot;720&quot; w:gutter=&quot;0&quot;/&gt;&lt;w:cols w:space=&quot;720&quot;/&gt;&lt;/w:sectPr&gt;&lt;/wx:sect&gt;&lt;/w:body&gt;&lt;/w:wordDocument&gt;">
             <v:imagedata r:id="rId18" o:title="" chromakey="white"/>
           </v:shape>
         </w:pict>
@@ -1318,7 +1318,7 @@
           <w:szCs w:val="20"/>
         </w:rPr>
         <w:pict w14:anchorId="79F8D3FD">
-          <v:shape id="_x0000_i1074" type="#_x0000_t75" style="width:7.1pt;height:13.65pt" equationxml="&lt;?xml version=&quot;1.0&quot; encoding=&quot;UTF-8&quot; standalone=&quot;yes&quot;?&gt;&#10;&lt;?mso-application progid=&quot;Word.Document&quot;?&gt;&#10;&lt;w:wordDocument xmlns:aml=&quot;http://schemas.microsoft.com/aml/2001/core&quot; xmlns:wpc=&quot;http://schemas.microsoft.com/office/word/2010/wordprocessingCanvas&quot; xmlns:cx=&quot;http://schemas.microsoft.com/office/drawing/2014/chartex&quot; xmlns:cx1=&quot;http://schemas.microsoft.com/office/drawing/2015/9/8/chartex&quot; xmlns:cx2=&quot;http://schemas.microsoft.com/office/drawing/2015/10/21/chartex&quot; xmlns:cx3=&quot;http://schemas.microsoft.com/office/drawing/2016/5/9/chartex&quot; xmlns:cx4=&quot;http://schemas.microsoft.com/office/drawing/2016/5/10/chartex&quot; xmlns:cx5=&quot;http://schemas.microsoft.com/office/drawing/2016/5/11/chartex&quot; xmlns:cx6=&quot;http://schemas.microsoft.com/office/drawing/2016/5/12/chartex&quot; xmlns:cx7=&quot;http://schemas.microsoft.com/office/drawing/2016/5/13/chartex&quot; xmlns:cx8=&quot;http://schemas.microsoft.com/office/drawing/2016/5/14/chartex&quot; xmlns:cr=&quot;http://schemas.microsoft.com/office/comments/2020/reactions&quot; xmlns:dt=&quot;uuid:C2F41010-65B3-11d1-A29F-00AA00C14882&quot; xmlns:mc=&quot;http://schemas.openxmlformats.org/markup-compatibility/2006&quot; xmlns:aink=&quot;http://schemas.microsoft.com/office/drawing/2016/ink&quot; xmlns:am3d=&quot;http://schemas.microsoft.com/office/drawing/2017/model3d&quot; xmlns:o=&quot;urn:schemas-microsoft-com:office:office&quot; xmlns:oel=&quot;http://schemas.microsoft.com/office/2019/extlst&quot; xmlns:m=&quot;http://schemas.openxmlformats.org/officeDocument/2006/math&quot; xmlns:v=&quot;urn:schemas-microsoft-com:vml&quot; xmlns:w10=&quot;urn:schemas-microsoft-com:office:word&quot; xmlns:w=&quot;http://schemas.microsoft.com/office/word/2003/wordml&quot; xmlns:wx=&quot;http://schemas.microsoft.com/office/word/2003/auxHint&quot; xmlns:wne=&quot;http://schemas.microsoft.com/office/word/2006/wordml&quot; xmlns:wsp=&quot;http://schemas.microsoft.com/office/word/2003/wordml/sp2&quot; xmlns:sl=&quot;http://schemas.microsoft.com/schemaLibrary/2003/core&quot; w:macrosPresent=&quot;no&quot; w:embeddedObjPresent=&quot;no&quot; w:ocxPresent=&quot;no&quot; xml:space=&quot;preserve&quot;&gt;&lt;w:ignoreSubtree w:val=&quot;http://schemas.microsoft.com/office/word/2003/wordml/sp2&quot;/&gt;&lt;o:DocumentProperties&gt;&lt;o:Version&gt;16&lt;/o:Version&gt;&lt;/o:DocumentProperties&gt;&lt;w:docPr&gt;&lt;w:view w:val=&quot;print&quot;/&gt;&lt;w:zoom w:percent=&quot;100&quot;/&gt;&lt;w:doNotEmbedSystemFonts/&gt;&lt;w:activeWritingStyle w:lang=&quot;EN-AU&quot; w:vendorID=&quot;64&quot; w:dllVersion=&quot;6&quot; w:nlCheck=&quot;on&quot; w:optionSet=&quot;1&quot;/&gt;&lt;w:activeWritingStyle w:lang=&quot;EN-GB&quot; w:vendorID=&quot;64&quot; w:dllVersion=&quot;6&quot; w:nlCheck=&quot;on&quot; w:optionSet=&quot;1&quot;/&gt;&lt;w:activeWritingStyle w:lang=&quot;EN-US&quot; w:vendorID=&quot;64&quot; w:dllVersion=&quot;6&quot; w:nlCheck=&quot;on&quot; w:optionSet=&quot;1&quot;/&gt;&lt;w:activeWritingStyle w:lang=&quot;EN-AU&quot; w:vendorID=&quot;64&quot; w:dllVersion=&quot;0&quot; w:nlCheck=&quot;on&quot; w:optionSet=&quot;0&quot;/&gt;&lt;w:activeWritingStyle w:lang=&quot;EN-GB&quot; w:vendorID=&quot;64&quot; w:dllVersion=&quot;0&quot; w:nlCheck=&quot;on&quot; w:optionSet=&quot;0&quot;/&gt;&lt;w:activeWritingStyle w:lang=&quot;EN-US&quot; w:vendorID=&quot;64&quot; w:dllVersion=&quot;0&quot; w:nlCheck=&quot;on&quot; w:optionSet=&quot;0&quot;/&gt;&lt;w:activeWritingStyle w:lang=&quot;ES-AR&quot; w:vendorID=&quot;64&quot; w:dllVersion=&quot;0&quot; w:nlCheck=&quot;on&quot; w:optionSet=&quot;0&quot;/&gt;&lt;w:activeWritingStyle w:lang=&quot;580A&quot; w:vendorID=&quot;64&quot; w:dllVersion=&quot;0&quot; w:nlCheck=&quot;on&quot; w:optionSet=&quot;0&quot;/&gt;&lt;w:activeWritingStyle w:lang=&quot;PT-BR&quot; w:vendorID=&quot;64&quot; w:dllVersion=&quot;0&quot; w:nlCheck=&quot;on&quot; w:optionSet=&quot;0&quot;/&gt;&lt;w:stylePaneFormatFilter w:val=&quot;3F01&quot;/&gt;&lt;w:defaultTabStop w:val=&quot;720&quot;/&gt;&lt;w:hyphenationZone w:val=&quot;425&quot;/&gt;&lt;w:characterSpacingControl w:val=&quot;DontCompress&quot;/&gt;&lt;w:optimizeForBrowser/&gt;&lt;w:validateAgainstSchema/&gt;&lt;w:saveInvalidXML w:val=&quot;off&quot;/&gt;&lt;w:ignoreMixedContent w:val=&quot;off&quot;/&gt;&lt;w:alwaysShowPlaceholderText w:val=&quot;off&quot;/&gt;&lt;w:compat&gt;&lt;w:breakWrappedTables/&gt;&lt;w:snapToGridInCell/&gt;&lt;w:applyBreakingRules/&gt;&lt;w:wrapTextWithPunct/&gt;&lt;w:useAsianBreakRules/&gt;&lt;w:useWord2002TableStyleRules/&gt;&lt;w:useFELayout/&gt;&lt;/w:compat&gt;&lt;wsp:rsids&gt;&lt;wsp:rsidRoot wsp:val=&quot;00426FBB&quot;/&gt;&lt;wsp:rsid wsp:val=&quot;000002E1&quot;/&gt;&lt;wsp:rsid wsp:val=&quot;00003C97&quot;/&gt;&lt;wsp:rsid wsp:val=&quot;00005565&quot;/&gt;&lt;wsp:rsid wsp:val=&quot;0001754A&quot;/&gt;&lt;wsp:rsid wsp:val=&quot;00017719&quot;/&gt;&lt;wsp:rsid wsp:val=&quot;00027F1D&quot;/&gt;&lt;wsp:rsid wsp:val=&quot;0003296C&quot;/&gt;&lt;wsp:rsid wsp:val=&quot;0003351F&quot;/&gt;&lt;wsp:rsid wsp:val=&quot;00044599&quot;/&gt;&lt;wsp:rsid wsp:val=&quot;000540E6&quot;/&gt;&lt;wsp:rsid wsp:val=&quot;00054421&quot;/&gt;&lt;wsp:rsid wsp:val=&quot;00062E46&quot;/&gt;&lt;wsp:rsid wsp:val=&quot;00074AC8&quot;/&gt;&lt;wsp:rsid wsp:val=&quot;00081408&quot;/&gt;&lt;wsp:rsid wsp:val=&quot;00081EBE&quot;/&gt;&lt;wsp:rsid wsp:val=&quot;00086EDC&quot;/&gt;&lt;wsp:rsid wsp:val=&quot;000B36A3&quot;/&gt;&lt;wsp:rsid wsp:val=&quot;000C013C&quot;/&gt;&lt;wsp:rsid wsp:val=&quot;000E3F84&quot;/&gt;&lt;wsp:rsid wsp:val=&quot;001056DF&quot;/&gt;&lt;wsp:rsid wsp:val=&quot;0010789C&quot;/&gt;&lt;wsp:rsid wsp:val=&quot;00114025&quot;/&gt;&lt;wsp:rsid wsp:val=&quot;001160D2&quot;/&gt;&lt;wsp:rsid wsp:val=&quot;00120636&quot;/&gt;&lt;wsp:rsid wsp:val=&quot;001348A5&quot;/&gt;&lt;wsp:rsid wsp:val=&quot;00151B8E&quot;/&gt;&lt;wsp:rsid wsp:val=&quot;00182170&quot;/&gt;&lt;wsp:rsid wsp:val=&quot;001928FB&quot;/&gt;&lt;wsp:rsid wsp:val=&quot;00192BC7&quot;/&gt;&lt;wsp:rsid wsp:val=&quot;00195BE6&quot;/&gt;&lt;wsp:rsid wsp:val=&quot;001A50EA&quot;/&gt;&lt;wsp:rsid wsp:val=&quot;001F16CD&quot;/&gt;&lt;wsp:rsid wsp:val=&quot;001F47D2&quot;/&gt;&lt;wsp:rsid wsp:val=&quot;002029C8&quot;/&gt;&lt;wsp:rsid wsp:val=&quot;0022285A&quot;/&gt;&lt;wsp:rsid wsp:val=&quot;00224C61&quot;/&gt;&lt;wsp:rsid wsp:val=&quot;00256ABC&quot;/&gt;&lt;wsp:rsid wsp:val=&quot;0027227B&quot;/&gt;&lt;wsp:rsid wsp:val=&quot;00273AC7&quot;/&gt;&lt;wsp:rsid wsp:val=&quot;00273D2C&quot;/&gt;&lt;wsp:rsid wsp:val=&quot;00285ECD&quot;/&gt;&lt;wsp:rsid wsp:val=&quot;00290E1B&quot;/&gt;&lt;wsp:rsid wsp:val=&quot;00291B17&quot;/&gt;&lt;wsp:rsid wsp:val=&quot;00291BB3&quot;/&gt;&lt;wsp:rsid wsp:val=&quot;002A6742&quot;/&gt;&lt;wsp:rsid wsp:val=&quot;002C1A7F&quot;/&gt;&lt;wsp:rsid wsp:val=&quot;002C4239&quot;/&gt;&lt;wsp:rsid wsp:val=&quot;002C559D&quot;/&gt;&lt;wsp:rsid wsp:val=&quot;002D16AE&quot;/&gt;&lt;wsp:rsid wsp:val=&quot;002D2D42&quot;/&gt;&lt;wsp:rsid wsp:val=&quot;002F72D0&quot;/&gt;&lt;wsp:rsid wsp:val=&quot;002F7A4F&quot;/&gt;&lt;wsp:rsid wsp:val=&quot;003003AB&quot;/&gt;&lt;wsp:rsid wsp:val=&quot;00302C35&quot;/&gt;&lt;wsp:rsid wsp:val=&quot;00311C49&quot;/&gt;&lt;wsp:rsid wsp:val=&quot;0032119E&quot;/&gt;&lt;wsp:rsid wsp:val=&quot;00321304&quot;/&gt;&lt;wsp:rsid wsp:val=&quot;00324FC2&quot;/&gt;&lt;wsp:rsid wsp:val=&quot;003312CA&quot;/&gt;&lt;wsp:rsid wsp:val=&quot;00331F84&quot;/&gt;&lt;wsp:rsid wsp:val=&quot;0037721F&quot;/&gt;&lt;wsp:rsid wsp:val=&quot;003950A4&quot;/&gt;&lt;wsp:rsid wsp:val=&quot;003A1E7E&quot;/&gt;&lt;wsp:rsid wsp:val=&quot;003E2FDC&quot;/&gt;&lt;wsp:rsid wsp:val=&quot;003E3577&quot;/&gt;&lt;wsp:rsid wsp:val=&quot;003F3A61&quot;/&gt;&lt;wsp:rsid wsp:val=&quot;00410A5D&quot;/&gt;&lt;wsp:rsid wsp:val=&quot;00414909&quot;/&gt;&lt;wsp:rsid wsp:val=&quot;00416537&quot;/&gt;&lt;wsp:rsid wsp:val=&quot;00425A6A&quot;/&gt;&lt;wsp:rsid wsp:val=&quot;00426FBB&quot;/&gt;&lt;wsp:rsid wsp:val=&quot;00454542&quot;/&gt;&lt;wsp:rsid wsp:val=&quot;0047429A&quot;/&gt;&lt;wsp:rsid wsp:val=&quot;0048374C&quot;/&gt;&lt;wsp:rsid wsp:val=&quot;0048771D&quot;/&gt;&lt;wsp:rsid wsp:val=&quot;004A6605&quot;/&gt;&lt;wsp:rsid wsp:val=&quot;004C45FA&quot;/&gt;&lt;wsp:rsid wsp:val=&quot;004D35A3&quot;/&gt;&lt;wsp:rsid wsp:val=&quot;004E1BD8&quot;/&gt;&lt;wsp:rsid wsp:val=&quot;004E452A&quot;/&gt;&lt;wsp:rsid wsp:val=&quot;004E78E3&quot;/&gt;&lt;wsp:rsid wsp:val=&quot;004F2BFE&quot;/&gt;&lt;wsp:rsid wsp:val=&quot;004F63D3&quot;/&gt;&lt;wsp:rsid wsp:val=&quot;004F7DCF&quot;/&gt;&lt;wsp:rsid wsp:val=&quot;005004BF&quot;/&gt;&lt;wsp:rsid wsp:val=&quot;00502E89&quot;/&gt;&lt;wsp:rsid wsp:val=&quot;00506CFE&quot;/&gt;&lt;wsp:rsid wsp:val=&quot;00510E95&quot;/&gt;&lt;wsp:rsid wsp:val=&quot;005225C3&quot;/&gt;&lt;wsp:rsid wsp:val=&quot;00527D56&quot;/&gt;&lt;wsp:rsid wsp:val=&quot;0053221F&quot;/&gt;&lt;wsp:rsid wsp:val=&quot;00536FAE&quot;/&gt;&lt;wsp:rsid wsp:val=&quot;00542C85&quot;/&gt;&lt;wsp:rsid wsp:val=&quot;00553510&quot;/&gt;&lt;wsp:rsid wsp:val=&quot;00554186&quot;/&gt;&lt;wsp:rsid wsp:val=&quot;00585769&quot;/&gt;&lt;wsp:rsid wsp:val=&quot;00585C61&quot;/&gt;&lt;wsp:rsid wsp:val=&quot;00591130&quot;/&gt;&lt;wsp:rsid wsp:val=&quot;005A3F28&quot;/&gt;&lt;wsp:rsid wsp:val=&quot;005A40BE&quot;/&gt;&lt;wsp:rsid wsp:val=&quot;005B13E2&quot;/&gt;&lt;wsp:rsid wsp:val=&quot;005B47D7&quot;/&gt;&lt;wsp:rsid wsp:val=&quot;005C5526&quot;/&gt;&lt;wsp:rsid wsp:val=&quot;005C62C6&quot;/&gt;&lt;wsp:rsid wsp:val=&quot;005D7B9E&quot;/&gt;&lt;wsp:rsid wsp:val=&quot;005E112E&quot;/&gt;&lt;wsp:rsid wsp:val=&quot;005F0834&quot;/&gt;&lt;wsp:rsid wsp:val=&quot;005F68AB&quot;/&gt;&lt;wsp:rsid wsp:val=&quot;005F6DC3&quot;/&gt;&lt;wsp:rsid wsp:val=&quot;00601A8E&quot;/&gt;&lt;wsp:rsid wsp:val=&quot;0062033E&quot;/&gt;&lt;wsp:rsid wsp:val=&quot;00624482&quot;/&gt;&lt;wsp:rsid wsp:val=&quot;0064799C&quot;/&gt;&lt;wsp:rsid wsp:val=&quot;00654156&quot;/&gt;&lt;wsp:rsid wsp:val=&quot;006B47CA&quot;/&gt;&lt;wsp:rsid wsp:val=&quot;006C304C&quot;/&gt;&lt;wsp:rsid wsp:val=&quot;006C4511&quot;/&gt;&lt;wsp:rsid wsp:val=&quot;006C65F5&quot;/&gt;&lt;wsp:rsid wsp:val=&quot;006C7AAA&quot;/&gt;&lt;wsp:rsid wsp:val=&quot;006D1C2A&quot;/&gt;&lt;wsp:rsid wsp:val=&quot;006D264F&quot;/&gt;&lt;wsp:rsid wsp:val=&quot;006E2A8D&quot;/&gt;&lt;wsp:rsid wsp:val=&quot;006E7574&quot;/&gt;&lt;wsp:rsid wsp:val=&quot;00703430&quot;/&gt;&lt;wsp:rsid wsp:val=&quot;00703548&quot;/&gt;&lt;wsp:rsid wsp:val=&quot;00704E18&quot;/&gt;&lt;wsp:rsid wsp:val=&quot;007069BE&quot;/&gt;&lt;wsp:rsid wsp:val=&quot;007212E9&quot;/&gt;&lt;wsp:rsid wsp:val=&quot;00745C86&quot;/&gt;&lt;wsp:rsid wsp:val=&quot;00764603&quot;/&gt;&lt;wsp:rsid wsp:val=&quot;0076604D&quot;/&gt;&lt;wsp:rsid wsp:val=&quot;00790909&quot;/&gt;&lt;wsp:rsid wsp:val=&quot;007B1582&quot;/&gt;&lt;wsp:rsid wsp:val=&quot;007B5A07&quot;/&gt;&lt;wsp:rsid wsp:val=&quot;007C065D&quot;/&gt;&lt;wsp:rsid wsp:val=&quot;007D3E71&quot;/&gt;&lt;wsp:rsid wsp:val=&quot;007E5D6A&quot;/&gt;&lt;wsp:rsid wsp:val=&quot;007E645D&quot;/&gt;&lt;wsp:rsid wsp:val=&quot;007F75CA&quot;/&gt;&lt;wsp:rsid wsp:val=&quot;00821E08&quot;/&gt;&lt;wsp:rsid wsp:val=&quot;00834EFD&quot;/&gt;&lt;wsp:rsid wsp:val=&quot;00844B24&quot;/&gt;&lt;wsp:rsid wsp:val=&quot;0084515F&quot;/&gt;&lt;wsp:rsid wsp:val=&quot;0085092D&quot;/&gt;&lt;wsp:rsid wsp:val=&quot;00865414&quot;/&gt;&lt;wsp:rsid wsp:val=&quot;00877D4C&quot;/&gt;&lt;wsp:rsid wsp:val=&quot;00883903&quot;/&gt;&lt;wsp:rsid wsp:val=&quot;0089763B&quot;/&gt;&lt;wsp:rsid wsp:val=&quot;008B6AE3&quot;/&gt;&lt;wsp:rsid wsp:val=&quot;008C1332&quot;/&gt;&lt;wsp:rsid wsp:val=&quot;008D1045&quot;/&gt;&lt;wsp:rsid wsp:val=&quot;008E5996&quot;/&gt;&lt;wsp:rsid wsp:val=&quot;00901AE1&quot;/&gt;&lt;wsp:rsid wsp:val=&quot;00912F93&quot;/&gt;&lt;wsp:rsid wsp:val=&quot;009205B4&quot;/&gt;&lt;wsp:rsid wsp:val=&quot;00955B59&quot;/&gt;&lt;wsp:rsid wsp:val=&quot;00992262&quot;/&gt;&lt;wsp:rsid wsp:val=&quot;009926BC&quot;/&gt;&lt;wsp:rsid wsp:val=&quot;009A4319&quot;/&gt;&lt;wsp:rsid wsp:val=&quot;009A6C3F&quot;/&gt;&lt;wsp:rsid wsp:val=&quot;009B73F2&quot;/&gt;&lt;wsp:rsid wsp:val=&quot;009C12BD&quot;/&gt;&lt;wsp:rsid wsp:val=&quot;009C50FE&quot;/&gt;&lt;wsp:rsid wsp:val=&quot;009E49DD&quot;/&gt;&lt;wsp:rsid wsp:val=&quot;00A03E75&quot;/&gt;&lt;wsp:rsid wsp:val=&quot;00A20627&quot;/&gt;&lt;wsp:rsid wsp:val=&quot;00A22FE9&quot;/&gt;&lt;wsp:rsid wsp:val=&quot;00A31A44&quot;/&gt;&lt;wsp:rsid wsp:val=&quot;00A32BFA&quot;/&gt;&lt;wsp:rsid wsp:val=&quot;00A3325E&quot;/&gt;&lt;wsp:rsid wsp:val=&quot;00A45FCE&quot;/&gt;&lt;wsp:rsid wsp:val=&quot;00A75671&quot;/&gt;&lt;wsp:rsid wsp:val=&quot;00A773CC&quot;/&gt;&lt;wsp:rsid wsp:val=&quot;00A924D0&quot;/&gt;&lt;wsp:rsid wsp:val=&quot;00A9318B&quot;/&gt;&lt;wsp:rsid wsp:val=&quot;00A94AC1&quot;/&gt;&lt;wsp:rsid wsp:val=&quot;00AB18B7&quot;/&gt;&lt;wsp:rsid wsp:val=&quot;00AD335D&quot;/&gt;&lt;wsp:rsid wsp:val=&quot;00AF114C&quot;/&gt;&lt;wsp:rsid wsp:val=&quot;00AF792B&quot;/&gt;&lt;wsp:rsid wsp:val=&quot;00B33D2F&quot;/&gt;&lt;wsp:rsid wsp:val=&quot;00B40A5B&quot;/&gt;&lt;wsp:rsid wsp:val=&quot;00B45C6B&quot;/&gt;&lt;wsp:rsid wsp:val=&quot;00B55D5E&quot;/&gt;&lt;wsp:rsid wsp:val=&quot;00B57A80&quot;/&gt;&lt;wsp:rsid wsp:val=&quot;00B70E9C&quot;/&gt;&lt;wsp:rsid wsp:val=&quot;00B713D8&quot;/&gt;&lt;wsp:rsid wsp:val=&quot;00B72979&quot;/&gt;&lt;wsp:rsid wsp:val=&quot;00B94516&quot;/&gt;&lt;wsp:rsid wsp:val=&quot;00BA25E2&quot;/&gt;&lt;wsp:rsid wsp:val=&quot;00BB2855&quot;/&gt;&lt;wsp:rsid wsp:val=&quot;00BC5343&quot;/&gt;&lt;wsp:rsid wsp:val=&quot;00BD19C1&quot;/&gt;&lt;wsp:rsid wsp:val=&quot;00BD25B8&quot;/&gt;&lt;wsp:rsid wsp:val=&quot;00C012E1&quot;/&gt;&lt;wsp:rsid wsp:val=&quot;00C06BB4&quot;/&gt;&lt;wsp:rsid wsp:val=&quot;00C10D20&quot;/&gt;&lt;wsp:rsid wsp:val=&quot;00C12E0C&quot;/&gt;&lt;wsp:rsid wsp:val=&quot;00C21916&quot;/&gt;&lt;wsp:rsid wsp:val=&quot;00C34915&quot;/&gt;&lt;wsp:rsid wsp:val=&quot;00C457CA&quot;/&gt;&lt;wsp:rsid wsp:val=&quot;00C53FB6&quot;/&gt;&lt;wsp:rsid wsp:val=&quot;00C57FB7&quot;/&gt;&lt;wsp:rsid wsp:val=&quot;00C644D4&quot;/&gt;&lt;wsp:rsid wsp:val=&quot;00C65F3F&quot;/&gt;&lt;wsp:rsid wsp:val=&quot;00C72414&quot;/&gt;&lt;wsp:rsid wsp:val=&quot;00C72B1A&quot;/&gt;&lt;wsp:rsid wsp:val=&quot;00C8667B&quot;/&gt;&lt;wsp:rsid wsp:val=&quot;00C90993&quot;/&gt;&lt;wsp:rsid wsp:val=&quot;00CA4CE3&quot;/&gt;&lt;wsp:rsid wsp:val=&quot;00CC72FD&quot;/&gt;&lt;wsp:rsid wsp:val=&quot;00CD4F3F&quot;/&gt;&lt;wsp:rsid wsp:val=&quot;00D311F8&quot;/&gt;&lt;wsp:rsid wsp:val=&quot;00D31660&quot;/&gt;&lt;wsp:rsid wsp:val=&quot;00D36B52&quot;/&gt;&lt;wsp:rsid wsp:val=&quot;00D377C8&quot;/&gt;&lt;wsp:rsid wsp:val=&quot;00D41274&quot;/&gt;&lt;wsp:rsid wsp:val=&quot;00D4229C&quot;/&gt;&lt;wsp:rsid wsp:val=&quot;00D43BF3&quot;/&gt;&lt;wsp:rsid wsp:val=&quot;00D549FB&quot;/&gt;&lt;wsp:rsid wsp:val=&quot;00D767BB&quot;/&gt;&lt;wsp:rsid wsp:val=&quot;00D939B0&quot;/&gt;&lt;wsp:rsid wsp:val=&quot;00DA31A2&quot;/&gt;&lt;wsp:rsid wsp:val=&quot;00DB16E0&quot;/&gt;&lt;wsp:rsid wsp:val=&quot;00DB2DF9&quot;/&gt;&lt;wsp:rsid wsp:val=&quot;00DB465D&quot;/&gt;&lt;wsp:rsid wsp:val=&quot;00DB48A2&quot;/&gt;&lt;wsp:rsid wsp:val=&quot;00DB7E63&quot;/&gt;&lt;wsp:rsid wsp:val=&quot;00DC2055&quot;/&gt;&lt;wsp:rsid wsp:val=&quot;00DC3908&quot;/&gt;&lt;wsp:rsid wsp:val=&quot;00DD71E8&quot;/&gt;&lt;wsp:rsid wsp:val=&quot;00DD7F83&quot;/&gt;&lt;wsp:rsid wsp:val=&quot;00DE4EB8&quot;/&gt;&lt;wsp:rsid wsp:val=&quot;00E0641E&quot;/&gt;&lt;wsp:rsid wsp:val=&quot;00E06664&quot;/&gt;&lt;wsp:rsid wsp:val=&quot;00E304BC&quot;/&gt;&lt;wsp:rsid wsp:val=&quot;00E32853&quot;/&gt;&lt;wsp:rsid wsp:val=&quot;00E34EBD&quot;/&gt;&lt;wsp:rsid wsp:val=&quot;00E401F8&quot;/&gt;&lt;wsp:rsid wsp:val=&quot;00E46425&quot;/&gt;&lt;wsp:rsid wsp:val=&quot;00E469FC&quot;/&gt;&lt;wsp:rsid wsp:val=&quot;00E47D0E&quot;/&gt;&lt;wsp:rsid wsp:val=&quot;00E65018&quot;/&gt;&lt;wsp:rsid wsp:val=&quot;00E76CA1&quot;/&gt;&lt;wsp:rsid wsp:val=&quot;00E94339&quot;/&gt;&lt;wsp:rsid wsp:val=&quot;00E97563&quot;/&gt;&lt;wsp:rsid wsp:val=&quot;00EB0B63&quot;/&gt;&lt;wsp:rsid wsp:val=&quot;00EC265C&quot;/&gt;&lt;wsp:rsid wsp:val=&quot;00ED61CB&quot;/&gt;&lt;wsp:rsid wsp:val=&quot;00EE752A&quot;/&gt;&lt;wsp:rsid wsp:val=&quot;00F06A72&quot;/&gt;&lt;wsp:rsid wsp:val=&quot;00F136F0&quot;/&gt;&lt;wsp:rsid wsp:val=&quot;00F20BBB&quot;/&gt;&lt;wsp:rsid wsp:val=&quot;00F36048&quot;/&gt;&lt;wsp:rsid wsp:val=&quot;00F43BD8&quot;/&gt;&lt;wsp:rsid wsp:val=&quot;00F562F3&quot;/&gt;&lt;wsp:rsid wsp:val=&quot;00F74B89&quot;/&gt;&lt;wsp:rsid wsp:val=&quot;00F75133&quot;/&gt;&lt;wsp:rsid wsp:val=&quot;00F83272&quot;/&gt;&lt;wsp:rsid wsp:val=&quot;00F9358D&quot;/&gt;&lt;wsp:rsid wsp:val=&quot;00FA3899&quot;/&gt;&lt;wsp:rsid wsp:val=&quot;00FA4909&quot;/&gt;&lt;wsp:rsid wsp:val=&quot;00FA5164&quot;/&gt;&lt;wsp:rsid wsp:val=&quot;00FA6751&quot;/&gt;&lt;wsp:rsid wsp:val=&quot;00FA6BD7&quot;/&gt;&lt;wsp:rsid wsp:val=&quot;00FB1048&quot;/&gt;&lt;wsp:rsid wsp:val=&quot;00FB62C4&quot;/&gt;&lt;wsp:rsid wsp:val=&quot;00FB7701&quot;/&gt;&lt;wsp:rsid wsp:val=&quot;00FD1AC5&quot;/&gt;&lt;wsp:rsid wsp:val=&quot;00FD5CF0&quot;/&gt;&lt;/wsp:rsids&gt;&lt;/w:docPr&gt;&lt;w:body&gt;&lt;wx:sect&gt;&lt;w:p wsp:rsidR=&quot;007212E9&quot; wsp:rsidRDefault=&quot;007212E9&quot; wsp:rsidP=&quot;007212E9&quot;&gt;&lt;m:oMathPara&gt;&lt;m:oMath&gt;&lt;m:r&gt;&lt;w:rPr&gt;&lt;w:rFonts w:ascii=&quot;Cambria Math&quot; w:fareast=&quot;Times New Roman&quot; w:h-ansi=&quot;Cambria Math&quot;/&gt;&lt;wx:font wx:val=&quot;Cambria Math&quot;/&gt;&lt;w:i/&gt;&lt;/w:rPr&gt;&lt;m:t&gt;T&lt;/m:t&gt;&lt;/m:r&gt;&lt;/m:oMath&gt;&lt;/m:oMathPara&gt;&lt;/w:p&gt;&lt;w:sectPr wsp:rsidR=&quot;00000000&quot;&gt;&lt;w:pgSz w:w=&quot;12240&quot; w:h=&quot;15840&quot;/&gt;&lt;w:pgMar w:top=&quot;1440&quot; w:right=&quot;1440&quot; w:bottom=&quot;1440&quot; w:left=&quot;1440&quot; w:header=&quot;720&quot; w:footer=&quot;720&quot; w:gutter=&quot;0&quot;/&gt;&lt;w:cols w:space=&quot;720&quot;/&gt;&lt;/w:sectPr&gt;&lt;/wx:sect&gt;&lt;/w:body&gt;&lt;/w:wordDocument&gt;">
+          <v:shape id="_x0000_i1041" type="#_x0000_t75" style="width:6.9pt;height:13.85pt" equationxml="&lt;?xml version=&quot;1.0&quot; encoding=&quot;UTF-8&quot; standalone=&quot;yes&quot;?&gt;&#10;&lt;?mso-application progid=&quot;Word.Document&quot;?&gt;&#10;&lt;w:wordDocument xmlns:aml=&quot;http://schemas.microsoft.com/aml/2001/core&quot; xmlns:wpc=&quot;http://schemas.microsoft.com/office/word/2010/wordprocessingCanvas&quot; xmlns:cx=&quot;http://schemas.microsoft.com/office/drawing/2014/chartex&quot; xmlns:cx1=&quot;http://schemas.microsoft.com/office/drawing/2015/9/8/chartex&quot; xmlns:cx2=&quot;http://schemas.microsoft.com/office/drawing/2015/10/21/chartex&quot; xmlns:cx3=&quot;http://schemas.microsoft.com/office/drawing/2016/5/9/chartex&quot; xmlns:cx4=&quot;http://schemas.microsoft.com/office/drawing/2016/5/10/chartex&quot; xmlns:cx5=&quot;http://schemas.microsoft.com/office/drawing/2016/5/11/chartex&quot; xmlns:cx6=&quot;http://schemas.microsoft.com/office/drawing/2016/5/12/chartex&quot; xmlns:cx7=&quot;http://schemas.microsoft.com/office/drawing/2016/5/13/chartex&quot; xmlns:cx8=&quot;http://schemas.microsoft.com/office/drawing/2016/5/14/chartex&quot; xmlns:cr=&quot;http://schemas.microsoft.com/office/comments/2020/reactions&quot; xmlns:dt=&quot;uuid:C2F41010-65B3-11d1-A29F-00AA00C14882&quot; xmlns:mc=&quot;http://schemas.openxmlformats.org/markup-compatibility/2006&quot; xmlns:aink=&quot;http://schemas.microsoft.com/office/drawing/2016/ink&quot; xmlns:am3d=&quot;http://schemas.microsoft.com/office/drawing/2017/model3d&quot; xmlns:o=&quot;urn:schemas-microsoft-com:office:office&quot; xmlns:oel=&quot;http://schemas.microsoft.com/office/2019/extlst&quot; xmlns:m=&quot;http://schemas.openxmlformats.org/officeDocument/2006/math&quot; xmlns:v=&quot;urn:schemas-microsoft-com:vml&quot; xmlns:w10=&quot;urn:schemas-microsoft-com:office:word&quot; xmlns:w=&quot;http://schemas.microsoft.com/office/word/2003/wordml&quot; xmlns:wx=&quot;http://schemas.microsoft.com/office/word/2003/auxHint&quot; xmlns:wne=&quot;http://schemas.microsoft.com/office/word/2006/wordml&quot; xmlns:wsp=&quot;http://schemas.microsoft.com/office/word/2003/wordml/sp2&quot; xmlns:sl=&quot;http://schemas.microsoft.com/schemaLibrary/2003/core&quot; w:macrosPresent=&quot;no&quot; w:embeddedObjPresent=&quot;no&quot; w:ocxPresent=&quot;no&quot; xml:space=&quot;preserve&quot;&gt;&lt;w:ignoreSubtree w:val=&quot;http://schemas.microsoft.com/office/word/2003/wordml/sp2&quot;/&gt;&lt;o:DocumentProperties&gt;&lt;o:Version&gt;16&lt;/o:Version&gt;&lt;/o:DocumentProperties&gt;&lt;w:docPr&gt;&lt;w:view w:val=&quot;print&quot;/&gt;&lt;w:zoom w:percent=&quot;100&quot;/&gt;&lt;w:doNotEmbedSystemFonts/&gt;&lt;w:activeWritingStyle w:lang=&quot;EN-AU&quot; w:vendorID=&quot;64&quot; w:dllVersion=&quot;6&quot; w:nlCheck=&quot;on&quot; w:optionSet=&quot;1&quot;/&gt;&lt;w:activeWritingStyle w:lang=&quot;EN-GB&quot; w:vendorID=&quot;64&quot; w:dllVersion=&quot;6&quot; w:nlCheck=&quot;on&quot; w:optionSet=&quot;1&quot;/&gt;&lt;w:activeWritingStyle w:lang=&quot;EN-US&quot; w:vendorID=&quot;64&quot; w:dllVersion=&quot;6&quot; w:nlCheck=&quot;on&quot; w:optionSet=&quot;1&quot;/&gt;&lt;w:activeWritingStyle w:lang=&quot;EN-AU&quot; w:vendorID=&quot;64&quot; w:dllVersion=&quot;0&quot; w:nlCheck=&quot;on&quot; w:optionSet=&quot;0&quot;/&gt;&lt;w:activeWritingStyle w:lang=&quot;EN-GB&quot; w:vendorID=&quot;64&quot; w:dllVersion=&quot;0&quot; w:nlCheck=&quot;on&quot; w:optionSet=&quot;0&quot;/&gt;&lt;w:activeWritingStyle w:lang=&quot;EN-US&quot; w:vendorID=&quot;64&quot; w:dllVersion=&quot;0&quot; w:nlCheck=&quot;on&quot; w:optionSet=&quot;0&quot;/&gt;&lt;w:activeWritingStyle w:lang=&quot;ES-AR&quot; w:vendorID=&quot;64&quot; w:dllVersion=&quot;0&quot; w:nlCheck=&quot;on&quot; w:optionSet=&quot;0&quot;/&gt;&lt;w:activeWritingStyle w:lang=&quot;580A&quot; w:vendorID=&quot;64&quot; w:dllVersion=&quot;0&quot; w:nlCheck=&quot;on&quot; w:optionSet=&quot;0&quot;/&gt;&lt;w:activeWritingStyle w:lang=&quot;PT-BR&quot; w:vendorID=&quot;64&quot; w:dllVersion=&quot;0&quot; w:nlCheck=&quot;on&quot; w:optionSet=&quot;0&quot;/&gt;&lt;w:stylePaneFormatFilter w:val=&quot;3F01&quot;/&gt;&lt;w:defaultTabStop w:val=&quot;720&quot;/&gt;&lt;w:hyphenationZone w:val=&quot;425&quot;/&gt;&lt;w:characterSpacingControl w:val=&quot;DontCompress&quot;/&gt;&lt;w:optimizeForBrowser/&gt;&lt;w:validateAgainstSchema/&gt;&lt;w:saveInvalidXML w:val=&quot;off&quot;/&gt;&lt;w:ignoreMixedContent w:val=&quot;off&quot;/&gt;&lt;w:alwaysShowPlaceholderText w:val=&quot;off&quot;/&gt;&lt;w:compat&gt;&lt;w:breakWrappedTables/&gt;&lt;w:snapToGridInCell/&gt;&lt;w:applyBreakingRules/&gt;&lt;w:wrapTextWithPunct/&gt;&lt;w:useAsianBreakRules/&gt;&lt;w:useWord2002TableStyleRules/&gt;&lt;w:useFELayout/&gt;&lt;/w:compat&gt;&lt;wsp:rsids&gt;&lt;wsp:rsidRoot wsp:val=&quot;00426FBB&quot;/&gt;&lt;wsp:rsid wsp:val=&quot;000002E1&quot;/&gt;&lt;wsp:rsid wsp:val=&quot;00003C97&quot;/&gt;&lt;wsp:rsid wsp:val=&quot;00005565&quot;/&gt;&lt;wsp:rsid wsp:val=&quot;0001754A&quot;/&gt;&lt;wsp:rsid wsp:val=&quot;00017719&quot;/&gt;&lt;wsp:rsid wsp:val=&quot;00027F1D&quot;/&gt;&lt;wsp:rsid wsp:val=&quot;0003296C&quot;/&gt;&lt;wsp:rsid wsp:val=&quot;0003351F&quot;/&gt;&lt;wsp:rsid wsp:val=&quot;00044599&quot;/&gt;&lt;wsp:rsid wsp:val=&quot;000540E6&quot;/&gt;&lt;wsp:rsid wsp:val=&quot;00054421&quot;/&gt;&lt;wsp:rsid wsp:val=&quot;00062E46&quot;/&gt;&lt;wsp:rsid wsp:val=&quot;00074AC8&quot;/&gt;&lt;wsp:rsid wsp:val=&quot;00081408&quot;/&gt;&lt;wsp:rsid wsp:val=&quot;00081EBE&quot;/&gt;&lt;wsp:rsid wsp:val=&quot;00086EDC&quot;/&gt;&lt;wsp:rsid wsp:val=&quot;000B36A3&quot;/&gt;&lt;wsp:rsid wsp:val=&quot;000C013C&quot;/&gt;&lt;wsp:rsid wsp:val=&quot;000E3F84&quot;/&gt;&lt;wsp:rsid wsp:val=&quot;001056DF&quot;/&gt;&lt;wsp:rsid wsp:val=&quot;0010789C&quot;/&gt;&lt;wsp:rsid wsp:val=&quot;00114025&quot;/&gt;&lt;wsp:rsid wsp:val=&quot;001160D2&quot;/&gt;&lt;wsp:rsid wsp:val=&quot;00120636&quot;/&gt;&lt;wsp:rsid wsp:val=&quot;001348A5&quot;/&gt;&lt;wsp:rsid wsp:val=&quot;00151B8E&quot;/&gt;&lt;wsp:rsid wsp:val=&quot;00182170&quot;/&gt;&lt;wsp:rsid wsp:val=&quot;001928FB&quot;/&gt;&lt;wsp:rsid wsp:val=&quot;00192BC7&quot;/&gt;&lt;wsp:rsid wsp:val=&quot;00195BE6&quot;/&gt;&lt;wsp:rsid wsp:val=&quot;001A50EA&quot;/&gt;&lt;wsp:rsid wsp:val=&quot;001F16CD&quot;/&gt;&lt;wsp:rsid wsp:val=&quot;001F47D2&quot;/&gt;&lt;wsp:rsid wsp:val=&quot;002029C8&quot;/&gt;&lt;wsp:rsid wsp:val=&quot;0022285A&quot;/&gt;&lt;wsp:rsid wsp:val=&quot;00224C61&quot;/&gt;&lt;wsp:rsid wsp:val=&quot;00256ABC&quot;/&gt;&lt;wsp:rsid wsp:val=&quot;0027227B&quot;/&gt;&lt;wsp:rsid wsp:val=&quot;00273AC7&quot;/&gt;&lt;wsp:rsid wsp:val=&quot;00273D2C&quot;/&gt;&lt;wsp:rsid wsp:val=&quot;00285ECD&quot;/&gt;&lt;wsp:rsid wsp:val=&quot;00290E1B&quot;/&gt;&lt;wsp:rsid wsp:val=&quot;00291B17&quot;/&gt;&lt;wsp:rsid wsp:val=&quot;00291BB3&quot;/&gt;&lt;wsp:rsid wsp:val=&quot;002A6742&quot;/&gt;&lt;wsp:rsid wsp:val=&quot;002C1A7F&quot;/&gt;&lt;wsp:rsid wsp:val=&quot;002C4239&quot;/&gt;&lt;wsp:rsid wsp:val=&quot;002C559D&quot;/&gt;&lt;wsp:rsid wsp:val=&quot;002D16AE&quot;/&gt;&lt;wsp:rsid wsp:val=&quot;002D2D42&quot;/&gt;&lt;wsp:rsid wsp:val=&quot;002F72D0&quot;/&gt;&lt;wsp:rsid wsp:val=&quot;002F7A4F&quot;/&gt;&lt;wsp:rsid wsp:val=&quot;003003AB&quot;/&gt;&lt;wsp:rsid wsp:val=&quot;00302C35&quot;/&gt;&lt;wsp:rsid wsp:val=&quot;00311C49&quot;/&gt;&lt;wsp:rsid wsp:val=&quot;0032119E&quot;/&gt;&lt;wsp:rsid wsp:val=&quot;00321304&quot;/&gt;&lt;wsp:rsid wsp:val=&quot;00324FC2&quot;/&gt;&lt;wsp:rsid wsp:val=&quot;003312CA&quot;/&gt;&lt;wsp:rsid wsp:val=&quot;00331F84&quot;/&gt;&lt;wsp:rsid wsp:val=&quot;0037721F&quot;/&gt;&lt;wsp:rsid wsp:val=&quot;003950A4&quot;/&gt;&lt;wsp:rsid wsp:val=&quot;003A1E7E&quot;/&gt;&lt;wsp:rsid wsp:val=&quot;003E2FDC&quot;/&gt;&lt;wsp:rsid wsp:val=&quot;003E3577&quot;/&gt;&lt;wsp:rsid wsp:val=&quot;003F3A61&quot;/&gt;&lt;wsp:rsid wsp:val=&quot;00410A5D&quot;/&gt;&lt;wsp:rsid wsp:val=&quot;00414909&quot;/&gt;&lt;wsp:rsid wsp:val=&quot;00416537&quot;/&gt;&lt;wsp:rsid wsp:val=&quot;00425A6A&quot;/&gt;&lt;wsp:rsid wsp:val=&quot;00426FBB&quot;/&gt;&lt;wsp:rsid wsp:val=&quot;00454542&quot;/&gt;&lt;wsp:rsid wsp:val=&quot;0047429A&quot;/&gt;&lt;wsp:rsid wsp:val=&quot;0048374C&quot;/&gt;&lt;wsp:rsid wsp:val=&quot;0048771D&quot;/&gt;&lt;wsp:rsid wsp:val=&quot;004A6605&quot;/&gt;&lt;wsp:rsid wsp:val=&quot;004C45FA&quot;/&gt;&lt;wsp:rsid wsp:val=&quot;004D35A3&quot;/&gt;&lt;wsp:rsid wsp:val=&quot;004E1BD8&quot;/&gt;&lt;wsp:rsid wsp:val=&quot;004E452A&quot;/&gt;&lt;wsp:rsid wsp:val=&quot;004E78E3&quot;/&gt;&lt;wsp:rsid wsp:val=&quot;004F2BFE&quot;/&gt;&lt;wsp:rsid wsp:val=&quot;004F63D3&quot;/&gt;&lt;wsp:rsid wsp:val=&quot;004F7DCF&quot;/&gt;&lt;wsp:rsid wsp:val=&quot;005004BF&quot;/&gt;&lt;wsp:rsid wsp:val=&quot;00502E89&quot;/&gt;&lt;wsp:rsid wsp:val=&quot;00506CFE&quot;/&gt;&lt;wsp:rsid wsp:val=&quot;00510E95&quot;/&gt;&lt;wsp:rsid wsp:val=&quot;005225C3&quot;/&gt;&lt;wsp:rsid wsp:val=&quot;00527D56&quot;/&gt;&lt;wsp:rsid wsp:val=&quot;0053221F&quot;/&gt;&lt;wsp:rsid wsp:val=&quot;00536FAE&quot;/&gt;&lt;wsp:rsid wsp:val=&quot;00542C85&quot;/&gt;&lt;wsp:rsid wsp:val=&quot;00553510&quot;/&gt;&lt;wsp:rsid wsp:val=&quot;00554186&quot;/&gt;&lt;wsp:rsid wsp:val=&quot;00585769&quot;/&gt;&lt;wsp:rsid wsp:val=&quot;00585C61&quot;/&gt;&lt;wsp:rsid wsp:val=&quot;00591130&quot;/&gt;&lt;wsp:rsid wsp:val=&quot;005A3F28&quot;/&gt;&lt;wsp:rsid wsp:val=&quot;005A40BE&quot;/&gt;&lt;wsp:rsid wsp:val=&quot;005B13E2&quot;/&gt;&lt;wsp:rsid wsp:val=&quot;005B47D7&quot;/&gt;&lt;wsp:rsid wsp:val=&quot;005C5526&quot;/&gt;&lt;wsp:rsid wsp:val=&quot;005C62C6&quot;/&gt;&lt;wsp:rsid wsp:val=&quot;005D7B9E&quot;/&gt;&lt;wsp:rsid wsp:val=&quot;005E112E&quot;/&gt;&lt;wsp:rsid wsp:val=&quot;005F0834&quot;/&gt;&lt;wsp:rsid wsp:val=&quot;005F68AB&quot;/&gt;&lt;wsp:rsid wsp:val=&quot;005F6DC3&quot;/&gt;&lt;wsp:rsid wsp:val=&quot;00601A8E&quot;/&gt;&lt;wsp:rsid wsp:val=&quot;0062033E&quot;/&gt;&lt;wsp:rsid wsp:val=&quot;00624482&quot;/&gt;&lt;wsp:rsid wsp:val=&quot;0064799C&quot;/&gt;&lt;wsp:rsid wsp:val=&quot;00654156&quot;/&gt;&lt;wsp:rsid wsp:val=&quot;006B47CA&quot;/&gt;&lt;wsp:rsid wsp:val=&quot;006C304C&quot;/&gt;&lt;wsp:rsid wsp:val=&quot;006C4511&quot;/&gt;&lt;wsp:rsid wsp:val=&quot;006C65F5&quot;/&gt;&lt;wsp:rsid wsp:val=&quot;006C7AAA&quot;/&gt;&lt;wsp:rsid wsp:val=&quot;006D1C2A&quot;/&gt;&lt;wsp:rsid wsp:val=&quot;006D264F&quot;/&gt;&lt;wsp:rsid wsp:val=&quot;006E2A8D&quot;/&gt;&lt;wsp:rsid wsp:val=&quot;006E7574&quot;/&gt;&lt;wsp:rsid wsp:val=&quot;00703430&quot;/&gt;&lt;wsp:rsid wsp:val=&quot;00703548&quot;/&gt;&lt;wsp:rsid wsp:val=&quot;00704E18&quot;/&gt;&lt;wsp:rsid wsp:val=&quot;007069BE&quot;/&gt;&lt;wsp:rsid wsp:val=&quot;007212E9&quot;/&gt;&lt;wsp:rsid wsp:val=&quot;00745C86&quot;/&gt;&lt;wsp:rsid wsp:val=&quot;00764603&quot;/&gt;&lt;wsp:rsid wsp:val=&quot;0076604D&quot;/&gt;&lt;wsp:rsid wsp:val=&quot;00790909&quot;/&gt;&lt;wsp:rsid wsp:val=&quot;007B1582&quot;/&gt;&lt;wsp:rsid wsp:val=&quot;007B5A07&quot;/&gt;&lt;wsp:rsid wsp:val=&quot;007C065D&quot;/&gt;&lt;wsp:rsid wsp:val=&quot;007D3E71&quot;/&gt;&lt;wsp:rsid wsp:val=&quot;007E5D6A&quot;/&gt;&lt;wsp:rsid wsp:val=&quot;007E645D&quot;/&gt;&lt;wsp:rsid wsp:val=&quot;007F75CA&quot;/&gt;&lt;wsp:rsid wsp:val=&quot;00821E08&quot;/&gt;&lt;wsp:rsid wsp:val=&quot;00834EFD&quot;/&gt;&lt;wsp:rsid wsp:val=&quot;00844B24&quot;/&gt;&lt;wsp:rsid wsp:val=&quot;0084515F&quot;/&gt;&lt;wsp:rsid wsp:val=&quot;0085092D&quot;/&gt;&lt;wsp:rsid wsp:val=&quot;00865414&quot;/&gt;&lt;wsp:rsid wsp:val=&quot;00877D4C&quot;/&gt;&lt;wsp:rsid wsp:val=&quot;00883903&quot;/&gt;&lt;wsp:rsid wsp:val=&quot;0089763B&quot;/&gt;&lt;wsp:rsid wsp:val=&quot;008B6AE3&quot;/&gt;&lt;wsp:rsid wsp:val=&quot;008C1332&quot;/&gt;&lt;wsp:rsid wsp:val=&quot;008D1045&quot;/&gt;&lt;wsp:rsid wsp:val=&quot;008E5996&quot;/&gt;&lt;wsp:rsid wsp:val=&quot;00901AE1&quot;/&gt;&lt;wsp:rsid wsp:val=&quot;00912F93&quot;/&gt;&lt;wsp:rsid wsp:val=&quot;009205B4&quot;/&gt;&lt;wsp:rsid wsp:val=&quot;00955B59&quot;/&gt;&lt;wsp:rsid wsp:val=&quot;00992262&quot;/&gt;&lt;wsp:rsid wsp:val=&quot;009926BC&quot;/&gt;&lt;wsp:rsid wsp:val=&quot;009A4319&quot;/&gt;&lt;wsp:rsid wsp:val=&quot;009A6C3F&quot;/&gt;&lt;wsp:rsid wsp:val=&quot;009B73F2&quot;/&gt;&lt;wsp:rsid wsp:val=&quot;009C12BD&quot;/&gt;&lt;wsp:rsid wsp:val=&quot;009C50FE&quot;/&gt;&lt;wsp:rsid wsp:val=&quot;009E49DD&quot;/&gt;&lt;wsp:rsid wsp:val=&quot;00A03E75&quot;/&gt;&lt;wsp:rsid wsp:val=&quot;00A20627&quot;/&gt;&lt;wsp:rsid wsp:val=&quot;00A22FE9&quot;/&gt;&lt;wsp:rsid wsp:val=&quot;00A31A44&quot;/&gt;&lt;wsp:rsid wsp:val=&quot;00A32BFA&quot;/&gt;&lt;wsp:rsid wsp:val=&quot;00A3325E&quot;/&gt;&lt;wsp:rsid wsp:val=&quot;00A45FCE&quot;/&gt;&lt;wsp:rsid wsp:val=&quot;00A75671&quot;/&gt;&lt;wsp:rsid wsp:val=&quot;00A773CC&quot;/&gt;&lt;wsp:rsid wsp:val=&quot;00A924D0&quot;/&gt;&lt;wsp:rsid wsp:val=&quot;00A9318B&quot;/&gt;&lt;wsp:rsid wsp:val=&quot;00A94AC1&quot;/&gt;&lt;wsp:rsid wsp:val=&quot;00AB18B7&quot;/&gt;&lt;wsp:rsid wsp:val=&quot;00AD335D&quot;/&gt;&lt;wsp:rsid wsp:val=&quot;00AF114C&quot;/&gt;&lt;wsp:rsid wsp:val=&quot;00AF792B&quot;/&gt;&lt;wsp:rsid wsp:val=&quot;00B33D2F&quot;/&gt;&lt;wsp:rsid wsp:val=&quot;00B40A5B&quot;/&gt;&lt;wsp:rsid wsp:val=&quot;00B45C6B&quot;/&gt;&lt;wsp:rsid wsp:val=&quot;00B55D5E&quot;/&gt;&lt;wsp:rsid wsp:val=&quot;00B57A80&quot;/&gt;&lt;wsp:rsid wsp:val=&quot;00B70E9C&quot;/&gt;&lt;wsp:rsid wsp:val=&quot;00B713D8&quot;/&gt;&lt;wsp:rsid wsp:val=&quot;00B72979&quot;/&gt;&lt;wsp:rsid wsp:val=&quot;00B94516&quot;/&gt;&lt;wsp:rsid wsp:val=&quot;00BA25E2&quot;/&gt;&lt;wsp:rsid wsp:val=&quot;00BB2855&quot;/&gt;&lt;wsp:rsid wsp:val=&quot;00BC5343&quot;/&gt;&lt;wsp:rsid wsp:val=&quot;00BD19C1&quot;/&gt;&lt;wsp:rsid wsp:val=&quot;00BD25B8&quot;/&gt;&lt;wsp:rsid wsp:val=&quot;00C012E1&quot;/&gt;&lt;wsp:rsid wsp:val=&quot;00C06BB4&quot;/&gt;&lt;wsp:rsid wsp:val=&quot;00C10D20&quot;/&gt;&lt;wsp:rsid wsp:val=&quot;00C12E0C&quot;/&gt;&lt;wsp:rsid wsp:val=&quot;00C21916&quot;/&gt;&lt;wsp:rsid wsp:val=&quot;00C34915&quot;/&gt;&lt;wsp:rsid wsp:val=&quot;00C457CA&quot;/&gt;&lt;wsp:rsid wsp:val=&quot;00C53FB6&quot;/&gt;&lt;wsp:rsid wsp:val=&quot;00C57FB7&quot;/&gt;&lt;wsp:rsid wsp:val=&quot;00C644D4&quot;/&gt;&lt;wsp:rsid wsp:val=&quot;00C65F3F&quot;/&gt;&lt;wsp:rsid wsp:val=&quot;00C72414&quot;/&gt;&lt;wsp:rsid wsp:val=&quot;00C72B1A&quot;/&gt;&lt;wsp:rsid wsp:val=&quot;00C8667B&quot;/&gt;&lt;wsp:rsid wsp:val=&quot;00C90993&quot;/&gt;&lt;wsp:rsid wsp:val=&quot;00CA4CE3&quot;/&gt;&lt;wsp:rsid wsp:val=&quot;00CC72FD&quot;/&gt;&lt;wsp:rsid wsp:val=&quot;00CD4F3F&quot;/&gt;&lt;wsp:rsid wsp:val=&quot;00D311F8&quot;/&gt;&lt;wsp:rsid wsp:val=&quot;00D31660&quot;/&gt;&lt;wsp:rsid wsp:val=&quot;00D36B52&quot;/&gt;&lt;wsp:rsid wsp:val=&quot;00D377C8&quot;/&gt;&lt;wsp:rsid wsp:val=&quot;00D41274&quot;/&gt;&lt;wsp:rsid wsp:val=&quot;00D4229C&quot;/&gt;&lt;wsp:rsid wsp:val=&quot;00D43BF3&quot;/&gt;&lt;wsp:rsid wsp:val=&quot;00D549FB&quot;/&gt;&lt;wsp:rsid wsp:val=&quot;00D767BB&quot;/&gt;&lt;wsp:rsid wsp:val=&quot;00D939B0&quot;/&gt;&lt;wsp:rsid wsp:val=&quot;00DA31A2&quot;/&gt;&lt;wsp:rsid wsp:val=&quot;00DB16E0&quot;/&gt;&lt;wsp:rsid wsp:val=&quot;00DB2DF9&quot;/&gt;&lt;wsp:rsid wsp:val=&quot;00DB465D&quot;/&gt;&lt;wsp:rsid wsp:val=&quot;00DB48A2&quot;/&gt;&lt;wsp:rsid wsp:val=&quot;00DB7E63&quot;/&gt;&lt;wsp:rsid wsp:val=&quot;00DC2055&quot;/&gt;&lt;wsp:rsid wsp:val=&quot;00DC3908&quot;/&gt;&lt;wsp:rsid wsp:val=&quot;00DD71E8&quot;/&gt;&lt;wsp:rsid wsp:val=&quot;00DD7F83&quot;/&gt;&lt;wsp:rsid wsp:val=&quot;00DE4EB8&quot;/&gt;&lt;wsp:rsid wsp:val=&quot;00E0641E&quot;/&gt;&lt;wsp:rsid wsp:val=&quot;00E06664&quot;/&gt;&lt;wsp:rsid wsp:val=&quot;00E304BC&quot;/&gt;&lt;wsp:rsid wsp:val=&quot;00E32853&quot;/&gt;&lt;wsp:rsid wsp:val=&quot;00E34EBD&quot;/&gt;&lt;wsp:rsid wsp:val=&quot;00E401F8&quot;/&gt;&lt;wsp:rsid wsp:val=&quot;00E46425&quot;/&gt;&lt;wsp:rsid wsp:val=&quot;00E469FC&quot;/&gt;&lt;wsp:rsid wsp:val=&quot;00E47D0E&quot;/&gt;&lt;wsp:rsid wsp:val=&quot;00E65018&quot;/&gt;&lt;wsp:rsid wsp:val=&quot;00E76CA1&quot;/&gt;&lt;wsp:rsid wsp:val=&quot;00E94339&quot;/&gt;&lt;wsp:rsid wsp:val=&quot;00E97563&quot;/&gt;&lt;wsp:rsid wsp:val=&quot;00EB0B63&quot;/&gt;&lt;wsp:rsid wsp:val=&quot;00EC265C&quot;/&gt;&lt;wsp:rsid wsp:val=&quot;00ED61CB&quot;/&gt;&lt;wsp:rsid wsp:val=&quot;00EE752A&quot;/&gt;&lt;wsp:rsid wsp:val=&quot;00F06A72&quot;/&gt;&lt;wsp:rsid wsp:val=&quot;00F136F0&quot;/&gt;&lt;wsp:rsid wsp:val=&quot;00F20BBB&quot;/&gt;&lt;wsp:rsid wsp:val=&quot;00F36048&quot;/&gt;&lt;wsp:rsid wsp:val=&quot;00F43BD8&quot;/&gt;&lt;wsp:rsid wsp:val=&quot;00F562F3&quot;/&gt;&lt;wsp:rsid wsp:val=&quot;00F74B89&quot;/&gt;&lt;wsp:rsid wsp:val=&quot;00F75133&quot;/&gt;&lt;wsp:rsid wsp:val=&quot;00F83272&quot;/&gt;&lt;wsp:rsid wsp:val=&quot;00F9358D&quot;/&gt;&lt;wsp:rsid wsp:val=&quot;00FA3899&quot;/&gt;&lt;wsp:rsid wsp:val=&quot;00FA4909&quot;/&gt;&lt;wsp:rsid wsp:val=&quot;00FA5164&quot;/&gt;&lt;wsp:rsid wsp:val=&quot;00FA6751&quot;/&gt;&lt;wsp:rsid wsp:val=&quot;00FA6BD7&quot;/&gt;&lt;wsp:rsid wsp:val=&quot;00FB1048&quot;/&gt;&lt;wsp:rsid wsp:val=&quot;00FB62C4&quot;/&gt;&lt;wsp:rsid wsp:val=&quot;00FB7701&quot;/&gt;&lt;wsp:rsid wsp:val=&quot;00FD1AC5&quot;/&gt;&lt;wsp:rsid wsp:val=&quot;00FD5CF0&quot;/&gt;&lt;/wsp:rsids&gt;&lt;/w:docPr&gt;&lt;w:body&gt;&lt;wx:sect&gt;&lt;w:p wsp:rsidR=&quot;007212E9&quot; wsp:rsidRDefault=&quot;007212E9&quot; wsp:rsidP=&quot;007212E9&quot;&gt;&lt;m:oMathPara&gt;&lt;m:oMath&gt;&lt;m:r&gt;&lt;w:rPr&gt;&lt;w:rFonts w:ascii=&quot;Cambria Math&quot; w:fareast=&quot;Times New Roman&quot; w:h-ansi=&quot;Cambria Math&quot;/&gt;&lt;wx:font wx:val=&quot;Cambria Math&quot;/&gt;&lt;w:i/&gt;&lt;/w:rPr&gt;&lt;m:t&gt;T&lt;/m:t&gt;&lt;/m:r&gt;&lt;/m:oMath&gt;&lt;/m:oMathPara&gt;&lt;/w:p&gt;&lt;w:sectPr wsp:rsidR=&quot;00000000&quot;&gt;&lt;w:pgSz w:w=&quot;12240&quot; w:h=&quot;15840&quot;/&gt;&lt;w:pgMar w:top=&quot;1440&quot; w:right=&quot;1440&quot; w:bottom=&quot;1440&quot; w:left=&quot;1440&quot; w:header=&quot;720&quot; w:footer=&quot;720&quot; w:gutter=&quot;0&quot;/&gt;&lt;w:cols w:space=&quot;720&quot;/&gt;&lt;/w:sectPr&gt;&lt;/wx:sect&gt;&lt;/w:body&gt;&lt;/w:wordDocument&gt;">
             <v:imagedata r:id="rId18" o:title="" chromakey="white"/>
           </v:shape>
         </w:pict>
@@ -1395,19 +1395,19 @@
         <w:tblLook w:val="04A0" w:firstRow="1" w:lastRow="0" w:firstColumn="1" w:lastColumn="0" w:noHBand="0" w:noVBand="1"/>
       </w:tblPr>
       <w:tblGrid>
-        <w:gridCol w:w="2255"/>
-        <w:gridCol w:w="993"/>
-        <w:gridCol w:w="850"/>
-        <w:gridCol w:w="898"/>
+        <w:gridCol w:w="2261"/>
+        <w:gridCol w:w="995"/>
+        <w:gridCol w:w="852"/>
+        <w:gridCol w:w="900"/>
       </w:tblGrid>
       <w:tr>
         <w:trPr>
-          <w:trHeight w:val="207"/>
+          <w:trHeight w:val="25"/>
           <w:jc w:val="center"/>
         </w:trPr>
         <w:tc>
           <w:tcPr>
-            <w:tcW w:w="2255" w:type="dxa"/>
+            <w:tcW w:w="2261" w:type="dxa"/>
             <w:shd w:val="clear" w:color="auto" w:fill="8FBC8F"/>
           </w:tcPr>
           <w:p>
@@ -1435,7 +1435,7 @@
         </w:tc>
         <w:tc>
           <w:tcPr>
-            <w:tcW w:w="993" w:type="dxa"/>
+            <w:tcW w:w="995" w:type="dxa"/>
             <w:shd w:val="clear" w:color="auto" w:fill="8FBC8F"/>
           </w:tcPr>
           <w:p>
@@ -1463,7 +1463,7 @@
         </w:tc>
         <w:tc>
           <w:tcPr>
-            <w:tcW w:w="850" w:type="dxa"/>
+            <w:tcW w:w="852" w:type="dxa"/>
             <w:shd w:val="clear" w:color="auto" w:fill="8FBC8F"/>
           </w:tcPr>
           <w:p>
@@ -1491,7 +1491,7 @@
         </w:tc>
         <w:tc>
           <w:tcPr>
-            <w:tcW w:w="898" w:type="dxa"/>
+            <w:tcW w:w="900" w:type="dxa"/>
             <w:shd w:val="clear" w:color="auto" w:fill="8FBC8F"/>
           </w:tcPr>
           <w:p>
@@ -1520,12 +1520,12 @@
       </w:tr>
       <w:tr>
         <w:trPr>
-          <w:trHeight w:val="281"/>
+          <w:trHeight w:val="34"/>
           <w:jc w:val="center"/>
         </w:trPr>
         <w:tc>
           <w:tcPr>
-            <w:tcW w:w="2255" w:type="dxa"/>
+            <w:tcW w:w="2261" w:type="dxa"/>
             <w:shd w:val="clear" w:color="auto" w:fill="auto"/>
           </w:tcPr>
           <w:p>
@@ -1553,7 +1553,7 @@
         </w:tc>
         <w:tc>
           <w:tcPr>
-            <w:tcW w:w="993" w:type="dxa"/>
+            <w:tcW w:w="995" w:type="dxa"/>
             <w:shd w:val="clear" w:color="auto" w:fill="auto"/>
           </w:tcPr>
           <w:p>
@@ -1570,7 +1570,7 @@
                 <w:szCs w:val="18"/>
               </w:rPr>
               <w:pict w14:anchorId="43B29154">
-                <v:shape id="_x0000_i1439" type="#_x0000_t75" style="width:15.25pt;height:13.65pt" equationxml="&lt;?xml version=&quot;1.0&quot; encoding=&quot;UTF-8&quot; standalone=&quot;yes&quot;?&gt;&#10;&lt;?mso-application progid=&quot;Word.Document&quot;?&gt;&#10;&lt;w:wordDocument xmlns:aml=&quot;http://schemas.microsoft.com/aml/2001/core&quot; xmlns:wpc=&quot;http://schemas.microsoft.com/office/word/2010/wordprocessingCanvas&quot; xmlns:cx=&quot;http://schemas.microsoft.com/office/drawing/2014/chartex&quot; xmlns:cx1=&quot;http://schemas.microsoft.com/office/drawing/2015/9/8/chartex&quot; xmlns:cx2=&quot;http://schemas.microsoft.com/office/drawing/2015/10/21/chartex&quot; xmlns:cx3=&quot;http://schemas.microsoft.com/office/drawing/2016/5/9/chartex&quot; xmlns:cx4=&quot;http://schemas.microsoft.com/office/drawing/2016/5/10/chartex&quot; xmlns:cx5=&quot;http://schemas.microsoft.com/office/drawing/2016/5/11/chartex&quot; xmlns:cx6=&quot;http://schemas.microsoft.com/office/drawing/2016/5/12/chartex&quot; xmlns:cx7=&quot;http://schemas.microsoft.com/office/drawing/2016/5/13/chartex&quot; xmlns:cx8=&quot;http://schemas.microsoft.com/office/drawing/2016/5/14/chartex&quot; xmlns:cr=&quot;http://schemas.microsoft.com/office/comments/2020/reactions&quot; xmlns:dt=&quot;uuid:C2F41010-65B3-11d1-A29F-00AA00C14882&quot; xmlns:mc=&quot;http://schemas.openxmlformats.org/markup-compatibility/2006&quot; xmlns:aink=&quot;http://schemas.microsoft.com/office/drawing/2016/ink&quot; xmlns:am3d=&quot;http://schemas.microsoft.com/office/drawing/2017/model3d&quot; xmlns:o=&quot;urn:schemas-microsoft-com:office:office&quot; xmlns:oel=&quot;http://schemas.microsoft.com/office/2019/extlst&quot; xmlns:m=&quot;http://schemas.openxmlformats.org/officeDocument/2006/math&quot; xmlns:v=&quot;urn:schemas-microsoft-com:vml&quot; xmlns:w10=&quot;urn:schemas-microsoft-com:office:word&quot; xmlns:w=&quot;http://schemas.microsoft.com/office/word/2003/wordml&quot; xmlns:wx=&quot;http://schemas.microsoft.com/office/word/2003/auxHint&quot; xmlns:wne=&quot;http://schemas.microsoft.com/office/word/2006/wordml&quot; xmlns:wsp=&quot;http://schemas.microsoft.com/office/word/2003/wordml/sp2&quot; xmlns:sl=&quot;http://schemas.microsoft.com/schemaLibrary/2003/core&quot; w:macrosPresent=&quot;no&quot; w:embeddedObjPresent=&quot;no&quot; w:ocxPresent=&quot;no&quot; xml:space=&quot;preserve&quot;&gt;&lt;w:ignoreSubtree w:val=&quot;http://schemas.microsoft.com/office/word/2003/wordml/sp2&quot;/&gt;&lt;o:DocumentProperties&gt;&lt;o:Version&gt;16&lt;/o:Version&gt;&lt;/o:DocumentProperties&gt;&lt;w:docPr&gt;&lt;w:view w:val=&quot;print&quot;/&gt;&lt;w:zoom w:percent=&quot;100&quot;/&gt;&lt;w:doNotEmbedSystemFonts/&gt;&lt;w:activeWritingStyle w:lang=&quot;EN-AU&quot; w:vendorID=&quot;64&quot; w:dllVersion=&quot;6&quot; w:nlCheck=&quot;on&quot; w:optionSet=&quot;1&quot;/&gt;&lt;w:activeWritingStyle w:lang=&quot;EN-GB&quot; w:vendorID=&quot;64&quot; w:dllVersion=&quot;6&quot; w:nlCheck=&quot;on&quot; w:optionSet=&quot;1&quot;/&gt;&lt;w:activeWritingStyle w:lang=&quot;EN-US&quot; w:vendorID=&quot;64&quot; w:dllVersion=&quot;6&quot; w:nlCheck=&quot;on&quot; w:optionSet=&quot;1&quot;/&gt;&lt;w:activeWritingStyle w:lang=&quot;EN-AU&quot; w:vendorID=&quot;64&quot; w:dllVersion=&quot;0&quot; w:nlCheck=&quot;on&quot; w:optionSet=&quot;0&quot;/&gt;&lt;w:activeWritingStyle w:lang=&quot;EN-GB&quot; w:vendorID=&quot;64&quot; w:dllVersion=&quot;0&quot; w:nlCheck=&quot;on&quot; w:optionSet=&quot;0&quot;/&gt;&lt;w:activeWritingStyle w:lang=&quot;EN-US&quot; w:vendorID=&quot;64&quot; w:dllVersion=&quot;0&quot; w:nlCheck=&quot;on&quot; w:optionSet=&quot;0&quot;/&gt;&lt;w:activeWritingStyle w:lang=&quot;ES-AR&quot; w:vendorID=&quot;64&quot; w:dllVersion=&quot;0&quot; w:nlCheck=&quot;on&quot; w:optionSet=&quot;0&quot;/&gt;&lt;w:activeWritingStyle w:lang=&quot;580A&quot; w:vendorID=&quot;64&quot; w:dllVersion=&quot;0&quot; w:nlCheck=&quot;on&quot; w:optionSet=&quot;0&quot;/&gt;&lt;w:activeWritingStyle w:lang=&quot;PT-BR&quot; w:vendorID=&quot;64&quot; w:dllVersion=&quot;0&quot; w:nlCheck=&quot;on&quot; w:optionSet=&quot;0&quot;/&gt;&lt;w:stylePaneFormatFilter w:val=&quot;3F01&quot;/&gt;&lt;w:defaultTabStop w:val=&quot;720&quot;/&gt;&lt;w:hyphenationZone w:val=&quot;425&quot;/&gt;&lt;w:characterSpacingControl w:val=&quot;DontCompress&quot;/&gt;&lt;w:optimizeForBrowser/&gt;&lt;w:validateAgainstSchema/&gt;&lt;w:saveInvalidXML w:val=&quot;off&quot;/&gt;&lt;w:ignoreMixedContent w:val=&quot;off&quot;/&gt;&lt;w:alwaysShowPlaceholderText w:val=&quot;off&quot;/&gt;&lt;w:compat&gt;&lt;w:breakWrappedTables/&gt;&lt;w:snapToGridInCell/&gt;&lt;w:applyBreakingRules/&gt;&lt;w:wrapTextWithPunct/&gt;&lt;w:useAsianBreakRules/&gt;&lt;w:useWord2002TableStyleRules/&gt;&lt;w:useFELayout/&gt;&lt;/w:compat&gt;&lt;wsp:rsids&gt;&lt;wsp:rsidRoot wsp:val=&quot;00426FBB&quot;/&gt;&lt;wsp:rsid wsp:val=&quot;000002E1&quot;/&gt;&lt;wsp:rsid wsp:val=&quot;00003C97&quot;/&gt;&lt;wsp:rsid wsp:val=&quot;00005565&quot;/&gt;&lt;wsp:rsid wsp:val=&quot;0001754A&quot;/&gt;&lt;wsp:rsid wsp:val=&quot;00017719&quot;/&gt;&lt;wsp:rsid wsp:val=&quot;00027F1D&quot;/&gt;&lt;wsp:rsid wsp:val=&quot;0003296C&quot;/&gt;&lt;wsp:rsid wsp:val=&quot;0003351F&quot;/&gt;&lt;wsp:rsid wsp:val=&quot;00044599&quot;/&gt;&lt;wsp:rsid wsp:val=&quot;000540E6&quot;/&gt;&lt;wsp:rsid wsp:val=&quot;00054421&quot;/&gt;&lt;wsp:rsid wsp:val=&quot;00062E46&quot;/&gt;&lt;wsp:rsid wsp:val=&quot;00074AC8&quot;/&gt;&lt;wsp:rsid wsp:val=&quot;00081408&quot;/&gt;&lt;wsp:rsid wsp:val=&quot;00081EBE&quot;/&gt;&lt;wsp:rsid wsp:val=&quot;00086EDC&quot;/&gt;&lt;wsp:rsid wsp:val=&quot;000B1236&quot;/&gt;&lt;wsp:rsid wsp:val=&quot;000B36A3&quot;/&gt;&lt;wsp:rsid wsp:val=&quot;000C013C&quot;/&gt;&lt;wsp:rsid wsp:val=&quot;000E3F84&quot;/&gt;&lt;wsp:rsid wsp:val=&quot;001056DF&quot;/&gt;&lt;wsp:rsid wsp:val=&quot;0010789C&quot;/&gt;&lt;wsp:rsid wsp:val=&quot;00114025&quot;/&gt;&lt;wsp:rsid wsp:val=&quot;001160D2&quot;/&gt;&lt;wsp:rsid wsp:val=&quot;00120636&quot;/&gt;&lt;wsp:rsid wsp:val=&quot;001348A5&quot;/&gt;&lt;wsp:rsid wsp:val=&quot;00151B8E&quot;/&gt;&lt;wsp:rsid wsp:val=&quot;00182170&quot;/&gt;&lt;wsp:rsid wsp:val=&quot;001928FB&quot;/&gt;&lt;wsp:rsid wsp:val=&quot;00192BC7&quot;/&gt;&lt;wsp:rsid wsp:val=&quot;00195BE6&quot;/&gt;&lt;wsp:rsid wsp:val=&quot;001A50EA&quot;/&gt;&lt;wsp:rsid wsp:val=&quot;001F16CD&quot;/&gt;&lt;wsp:rsid wsp:val=&quot;001F47D2&quot;/&gt;&lt;wsp:rsid wsp:val=&quot;002029C8&quot;/&gt;&lt;wsp:rsid wsp:val=&quot;0022285A&quot;/&gt;&lt;wsp:rsid wsp:val=&quot;00224C61&quot;/&gt;&lt;wsp:rsid wsp:val=&quot;00256ABC&quot;/&gt;&lt;wsp:rsid wsp:val=&quot;0027227B&quot;/&gt;&lt;wsp:rsid wsp:val=&quot;00273AC7&quot;/&gt;&lt;wsp:rsid wsp:val=&quot;00273D2C&quot;/&gt;&lt;wsp:rsid wsp:val=&quot;00285ECD&quot;/&gt;&lt;wsp:rsid wsp:val=&quot;00290E1B&quot;/&gt;&lt;wsp:rsid wsp:val=&quot;00291B17&quot;/&gt;&lt;wsp:rsid wsp:val=&quot;00291BB3&quot;/&gt;&lt;wsp:rsid wsp:val=&quot;002A6742&quot;/&gt;&lt;wsp:rsid wsp:val=&quot;002C1A7F&quot;/&gt;&lt;wsp:rsid wsp:val=&quot;002C4239&quot;/&gt;&lt;wsp:rsid wsp:val=&quot;002C559D&quot;/&gt;&lt;wsp:rsid wsp:val=&quot;002D16AE&quot;/&gt;&lt;wsp:rsid wsp:val=&quot;002D2D42&quot;/&gt;&lt;wsp:rsid wsp:val=&quot;002F72D0&quot;/&gt;&lt;wsp:rsid wsp:val=&quot;002F7A4F&quot;/&gt;&lt;wsp:rsid wsp:val=&quot;003003AB&quot;/&gt;&lt;wsp:rsid wsp:val=&quot;00302C35&quot;/&gt;&lt;wsp:rsid wsp:val=&quot;00311C49&quot;/&gt;&lt;wsp:rsid wsp:val=&quot;0032119E&quot;/&gt;&lt;wsp:rsid wsp:val=&quot;00321304&quot;/&gt;&lt;wsp:rsid wsp:val=&quot;00324FC2&quot;/&gt;&lt;wsp:rsid wsp:val=&quot;003312CA&quot;/&gt;&lt;wsp:rsid wsp:val=&quot;00331F84&quot;/&gt;&lt;wsp:rsid wsp:val=&quot;0037721F&quot;/&gt;&lt;wsp:rsid wsp:val=&quot;003950A4&quot;/&gt;&lt;wsp:rsid wsp:val=&quot;003A1E7E&quot;/&gt;&lt;wsp:rsid wsp:val=&quot;003E2FDC&quot;/&gt;&lt;wsp:rsid wsp:val=&quot;003E3577&quot;/&gt;&lt;wsp:rsid wsp:val=&quot;003F3A61&quot;/&gt;&lt;wsp:rsid wsp:val=&quot;00410A5D&quot;/&gt;&lt;wsp:rsid wsp:val=&quot;00414909&quot;/&gt;&lt;wsp:rsid wsp:val=&quot;00416537&quot;/&gt;&lt;wsp:rsid wsp:val=&quot;00425A6A&quot;/&gt;&lt;wsp:rsid wsp:val=&quot;00426FBB&quot;/&gt;&lt;wsp:rsid wsp:val=&quot;00454542&quot;/&gt;&lt;wsp:rsid wsp:val=&quot;0047429A&quot;/&gt;&lt;wsp:rsid wsp:val=&quot;0048374C&quot;/&gt;&lt;wsp:rsid wsp:val=&quot;0048771D&quot;/&gt;&lt;wsp:rsid wsp:val=&quot;004A6605&quot;/&gt;&lt;wsp:rsid wsp:val=&quot;004C45FA&quot;/&gt;&lt;wsp:rsid wsp:val=&quot;004D35A3&quot;/&gt;&lt;wsp:rsid wsp:val=&quot;004E1BD8&quot;/&gt;&lt;wsp:rsid wsp:val=&quot;004E452A&quot;/&gt;&lt;wsp:rsid wsp:val=&quot;004E78E3&quot;/&gt;&lt;wsp:rsid wsp:val=&quot;004F2BFE&quot;/&gt;&lt;wsp:rsid wsp:val=&quot;004F63D3&quot;/&gt;&lt;wsp:rsid wsp:val=&quot;004F7DCF&quot;/&gt;&lt;wsp:rsid wsp:val=&quot;005004BF&quot;/&gt;&lt;wsp:rsid wsp:val=&quot;00502E89&quot;/&gt;&lt;wsp:rsid wsp:val=&quot;00506CFE&quot;/&gt;&lt;wsp:rsid wsp:val=&quot;00510E95&quot;/&gt;&lt;wsp:rsid wsp:val=&quot;005225C3&quot;/&gt;&lt;wsp:rsid wsp:val=&quot;00527D56&quot;/&gt;&lt;wsp:rsid wsp:val=&quot;0053221F&quot;/&gt;&lt;wsp:rsid wsp:val=&quot;00536FAE&quot;/&gt;&lt;wsp:rsid wsp:val=&quot;00542C85&quot;/&gt;&lt;wsp:rsid wsp:val=&quot;00553510&quot;/&gt;&lt;wsp:rsid wsp:val=&quot;00554186&quot;/&gt;&lt;wsp:rsid wsp:val=&quot;00585769&quot;/&gt;&lt;wsp:rsid wsp:val=&quot;00585C61&quot;/&gt;&lt;wsp:rsid wsp:val=&quot;00591130&quot;/&gt;&lt;wsp:rsid wsp:val=&quot;005A3F28&quot;/&gt;&lt;wsp:rsid wsp:val=&quot;005A40BE&quot;/&gt;&lt;wsp:rsid wsp:val=&quot;005B13E2&quot;/&gt;&lt;wsp:rsid wsp:val=&quot;005B47D7&quot;/&gt;&lt;wsp:rsid wsp:val=&quot;005C5526&quot;/&gt;&lt;wsp:rsid wsp:val=&quot;005C62C6&quot;/&gt;&lt;wsp:rsid wsp:val=&quot;005D7B9E&quot;/&gt;&lt;wsp:rsid wsp:val=&quot;005E112E&quot;/&gt;&lt;wsp:rsid wsp:val=&quot;005F0834&quot;/&gt;&lt;wsp:rsid wsp:val=&quot;005F68AB&quot;/&gt;&lt;wsp:rsid wsp:val=&quot;005F6DC3&quot;/&gt;&lt;wsp:rsid wsp:val=&quot;00601A8E&quot;/&gt;&lt;wsp:rsid wsp:val=&quot;0062033E&quot;/&gt;&lt;wsp:rsid wsp:val=&quot;00624482&quot;/&gt;&lt;wsp:rsid wsp:val=&quot;0064799C&quot;/&gt;&lt;wsp:rsid wsp:val=&quot;00654156&quot;/&gt;&lt;wsp:rsid wsp:val=&quot;00656ADC&quot;/&gt;&lt;wsp:rsid wsp:val=&quot;006B47CA&quot;/&gt;&lt;wsp:rsid wsp:val=&quot;006C304C&quot;/&gt;&lt;wsp:rsid wsp:val=&quot;006C4511&quot;/&gt;&lt;wsp:rsid wsp:val=&quot;006C65F5&quot;/&gt;&lt;wsp:rsid wsp:val=&quot;006C7AAA&quot;/&gt;&lt;wsp:rsid wsp:val=&quot;006D1C2A&quot;/&gt;&lt;wsp:rsid wsp:val=&quot;006D264F&quot;/&gt;&lt;wsp:rsid wsp:val=&quot;006D4E89&quot;/&gt;&lt;wsp:rsid wsp:val=&quot;006E074F&quot;/&gt;&lt;wsp:rsid wsp:val=&quot;006E2A8D&quot;/&gt;&lt;wsp:rsid wsp:val=&quot;006E7574&quot;/&gt;&lt;wsp:rsid wsp:val=&quot;00703430&quot;/&gt;&lt;wsp:rsid wsp:val=&quot;00703548&quot;/&gt;&lt;wsp:rsid wsp:val=&quot;00704E18&quot;/&gt;&lt;wsp:rsid wsp:val=&quot;007069BE&quot;/&gt;&lt;wsp:rsid wsp:val=&quot;00745C86&quot;/&gt;&lt;wsp:rsid wsp:val=&quot;00764603&quot;/&gt;&lt;wsp:rsid wsp:val=&quot;0076604D&quot;/&gt;&lt;wsp:rsid wsp:val=&quot;00790909&quot;/&gt;&lt;wsp:rsid wsp:val=&quot;007B1582&quot;/&gt;&lt;wsp:rsid wsp:val=&quot;007B5A07&quot;/&gt;&lt;wsp:rsid wsp:val=&quot;007C065D&quot;/&gt;&lt;wsp:rsid wsp:val=&quot;007D3E71&quot;/&gt;&lt;wsp:rsid wsp:val=&quot;007E5D6A&quot;/&gt;&lt;wsp:rsid wsp:val=&quot;007E645D&quot;/&gt;&lt;wsp:rsid wsp:val=&quot;007F75CA&quot;/&gt;&lt;wsp:rsid wsp:val=&quot;00821E08&quot;/&gt;&lt;wsp:rsid wsp:val=&quot;00834EFD&quot;/&gt;&lt;wsp:rsid wsp:val=&quot;00844B24&quot;/&gt;&lt;wsp:rsid wsp:val=&quot;0084515F&quot;/&gt;&lt;wsp:rsid wsp:val=&quot;0085092D&quot;/&gt;&lt;wsp:rsid wsp:val=&quot;00865414&quot;/&gt;&lt;wsp:rsid wsp:val=&quot;00877D4C&quot;/&gt;&lt;wsp:rsid wsp:val=&quot;00883903&quot;/&gt;&lt;wsp:rsid wsp:val=&quot;0089763B&quot;/&gt;&lt;wsp:rsid wsp:val=&quot;008B6AE3&quot;/&gt;&lt;wsp:rsid wsp:val=&quot;008C1332&quot;/&gt;&lt;wsp:rsid wsp:val=&quot;008D1045&quot;/&gt;&lt;wsp:rsid wsp:val=&quot;008E5996&quot;/&gt;&lt;wsp:rsid wsp:val=&quot;00901AE1&quot;/&gt;&lt;wsp:rsid wsp:val=&quot;00912F93&quot;/&gt;&lt;wsp:rsid wsp:val=&quot;009205B4&quot;/&gt;&lt;wsp:rsid wsp:val=&quot;00955B59&quot;/&gt;&lt;wsp:rsid wsp:val=&quot;00992262&quot;/&gt;&lt;wsp:rsid wsp:val=&quot;009926BC&quot;/&gt;&lt;wsp:rsid wsp:val=&quot;009A4319&quot;/&gt;&lt;wsp:rsid wsp:val=&quot;009A6C3F&quot;/&gt;&lt;wsp:rsid wsp:val=&quot;009B73F2&quot;/&gt;&lt;wsp:rsid wsp:val=&quot;009C12BD&quot;/&gt;&lt;wsp:rsid wsp:val=&quot;009C50FE&quot;/&gt;&lt;wsp:rsid wsp:val=&quot;009E49DD&quot;/&gt;&lt;wsp:rsid wsp:val=&quot;00A03E75&quot;/&gt;&lt;wsp:rsid wsp:val=&quot;00A20627&quot;/&gt;&lt;wsp:rsid wsp:val=&quot;00A22FE9&quot;/&gt;&lt;wsp:rsid wsp:val=&quot;00A31A44&quot;/&gt;&lt;wsp:rsid wsp:val=&quot;00A32BFA&quot;/&gt;&lt;wsp:rsid wsp:val=&quot;00A3325E&quot;/&gt;&lt;wsp:rsid wsp:val=&quot;00A45FCE&quot;/&gt;&lt;wsp:rsid wsp:val=&quot;00A75671&quot;/&gt;&lt;wsp:rsid wsp:val=&quot;00A773CC&quot;/&gt;&lt;wsp:rsid wsp:val=&quot;00A924D0&quot;/&gt;&lt;wsp:rsid wsp:val=&quot;00A9318B&quot;/&gt;&lt;wsp:rsid wsp:val=&quot;00A94AC1&quot;/&gt;&lt;wsp:rsid wsp:val=&quot;00AB18B7&quot;/&gt;&lt;wsp:rsid wsp:val=&quot;00AD335D&quot;/&gt;&lt;wsp:rsid wsp:val=&quot;00AF114C&quot;/&gt;&lt;wsp:rsid wsp:val=&quot;00AF792B&quot;/&gt;&lt;wsp:rsid wsp:val=&quot;00B33D2F&quot;/&gt;&lt;wsp:rsid wsp:val=&quot;00B40A5B&quot;/&gt;&lt;wsp:rsid wsp:val=&quot;00B45C6B&quot;/&gt;&lt;wsp:rsid wsp:val=&quot;00B55D5E&quot;/&gt;&lt;wsp:rsid wsp:val=&quot;00B57A80&quot;/&gt;&lt;wsp:rsid wsp:val=&quot;00B70E9C&quot;/&gt;&lt;wsp:rsid wsp:val=&quot;00B713D8&quot;/&gt;&lt;wsp:rsid wsp:val=&quot;00B72979&quot;/&gt;&lt;wsp:rsid wsp:val=&quot;00B94516&quot;/&gt;&lt;wsp:rsid wsp:val=&quot;00BA25E2&quot;/&gt;&lt;wsp:rsid wsp:val=&quot;00BB2855&quot;/&gt;&lt;wsp:rsid wsp:val=&quot;00BC5343&quot;/&gt;&lt;wsp:rsid wsp:val=&quot;00BD19C1&quot;/&gt;&lt;wsp:rsid wsp:val=&quot;00BD25B8&quot;/&gt;&lt;wsp:rsid wsp:val=&quot;00C012E1&quot;/&gt;&lt;wsp:rsid wsp:val=&quot;00C06BB4&quot;/&gt;&lt;wsp:rsid wsp:val=&quot;00C10D20&quot;/&gt;&lt;wsp:rsid wsp:val=&quot;00C12E0C&quot;/&gt;&lt;wsp:rsid wsp:val=&quot;00C21916&quot;/&gt;&lt;wsp:rsid wsp:val=&quot;00C34915&quot;/&gt;&lt;wsp:rsid wsp:val=&quot;00C457CA&quot;/&gt;&lt;wsp:rsid wsp:val=&quot;00C53FB6&quot;/&gt;&lt;wsp:rsid wsp:val=&quot;00C57FB7&quot;/&gt;&lt;wsp:rsid wsp:val=&quot;00C644D4&quot;/&gt;&lt;wsp:rsid wsp:val=&quot;00C65F3F&quot;/&gt;&lt;wsp:rsid wsp:val=&quot;00C72414&quot;/&gt;&lt;wsp:rsid wsp:val=&quot;00C72B1A&quot;/&gt;&lt;wsp:rsid wsp:val=&quot;00C8667B&quot;/&gt;&lt;wsp:rsid wsp:val=&quot;00C90993&quot;/&gt;&lt;wsp:rsid wsp:val=&quot;00CA4CE3&quot;/&gt;&lt;wsp:rsid wsp:val=&quot;00CC72FD&quot;/&gt;&lt;wsp:rsid wsp:val=&quot;00CD4F3F&quot;/&gt;&lt;wsp:rsid wsp:val=&quot;00D311F8&quot;/&gt;&lt;wsp:rsid wsp:val=&quot;00D31660&quot;/&gt;&lt;wsp:rsid wsp:val=&quot;00D36B52&quot;/&gt;&lt;wsp:rsid wsp:val=&quot;00D377C8&quot;/&gt;&lt;wsp:rsid wsp:val=&quot;00D41274&quot;/&gt;&lt;wsp:rsid wsp:val=&quot;00D4229C&quot;/&gt;&lt;wsp:rsid wsp:val=&quot;00D43BF3&quot;/&gt;&lt;wsp:rsid wsp:val=&quot;00D549FB&quot;/&gt;&lt;wsp:rsid wsp:val=&quot;00D767BB&quot;/&gt;&lt;wsp:rsid wsp:val=&quot;00D939B0&quot;/&gt;&lt;wsp:rsid wsp:val=&quot;00DA31A2&quot;/&gt;&lt;wsp:rsid wsp:val=&quot;00DB16E0&quot;/&gt;&lt;wsp:rsid wsp:val=&quot;00DB2DF9&quot;/&gt;&lt;wsp:rsid wsp:val=&quot;00DB465D&quot;/&gt;&lt;wsp:rsid wsp:val=&quot;00DB48A2&quot;/&gt;&lt;wsp:rsid wsp:val=&quot;00DB7E63&quot;/&gt;&lt;wsp:rsid wsp:val=&quot;00DC2055&quot;/&gt;&lt;wsp:rsid wsp:val=&quot;00DC3908&quot;/&gt;&lt;wsp:rsid wsp:val=&quot;00DD71E8&quot;/&gt;&lt;wsp:rsid wsp:val=&quot;00DD7F83&quot;/&gt;&lt;wsp:rsid wsp:val=&quot;00DE4EB8&quot;/&gt;&lt;wsp:rsid wsp:val=&quot;00E0641E&quot;/&gt;&lt;wsp:rsid wsp:val=&quot;00E06664&quot;/&gt;&lt;wsp:rsid wsp:val=&quot;00E304BC&quot;/&gt;&lt;wsp:rsid wsp:val=&quot;00E32853&quot;/&gt;&lt;wsp:rsid wsp:val=&quot;00E34EBD&quot;/&gt;&lt;wsp:rsid wsp:val=&quot;00E401F8&quot;/&gt;&lt;wsp:rsid wsp:val=&quot;00E46425&quot;/&gt;&lt;wsp:rsid wsp:val=&quot;00E469FC&quot;/&gt;&lt;wsp:rsid wsp:val=&quot;00E47D0E&quot;/&gt;&lt;wsp:rsid wsp:val=&quot;00E65018&quot;/&gt;&lt;wsp:rsid wsp:val=&quot;00E76CA1&quot;/&gt;&lt;wsp:rsid wsp:val=&quot;00E94339&quot;/&gt;&lt;wsp:rsid wsp:val=&quot;00E97563&quot;/&gt;&lt;wsp:rsid wsp:val=&quot;00EB0B63&quot;/&gt;&lt;wsp:rsid wsp:val=&quot;00EC265C&quot;/&gt;&lt;wsp:rsid wsp:val=&quot;00ED61CB&quot;/&gt;&lt;wsp:rsid wsp:val=&quot;00EE752A&quot;/&gt;&lt;wsp:rsid wsp:val=&quot;00F06A72&quot;/&gt;&lt;wsp:rsid wsp:val=&quot;00F136F0&quot;/&gt;&lt;wsp:rsid wsp:val=&quot;00F20BBB&quot;/&gt;&lt;wsp:rsid wsp:val=&quot;00F36048&quot;/&gt;&lt;wsp:rsid wsp:val=&quot;00F43BD8&quot;/&gt;&lt;wsp:rsid wsp:val=&quot;00F562F3&quot;/&gt;&lt;wsp:rsid wsp:val=&quot;00F74B89&quot;/&gt;&lt;wsp:rsid wsp:val=&quot;00F75133&quot;/&gt;&lt;wsp:rsid wsp:val=&quot;00F83272&quot;/&gt;&lt;wsp:rsid wsp:val=&quot;00F9358D&quot;/&gt;&lt;wsp:rsid wsp:val=&quot;00FA3899&quot;/&gt;&lt;wsp:rsid wsp:val=&quot;00FA4909&quot;/&gt;&lt;wsp:rsid wsp:val=&quot;00FA5164&quot;/&gt;&lt;wsp:rsid wsp:val=&quot;00FA6751&quot;/&gt;&lt;wsp:rsid wsp:val=&quot;00FA6BD7&quot;/&gt;&lt;wsp:rsid wsp:val=&quot;00FB1048&quot;/&gt;&lt;wsp:rsid wsp:val=&quot;00FB62C4&quot;/&gt;&lt;wsp:rsid wsp:val=&quot;00FB7701&quot;/&gt;&lt;wsp:rsid wsp:val=&quot;00FD1AC5&quot;/&gt;&lt;wsp:rsid wsp:val=&quot;00FD5CF0&quot;/&gt;&lt;/wsp:rsids&gt;&lt;/w:docPr&gt;&lt;w:body&gt;&lt;wx:sect&gt;&lt;w:p wsp:rsidR=&quot;006E074F&quot; wsp:rsidRPr=&quot;006E074F&quot; wsp:rsidRDefault=&quot;006E074F&quot; wsp:rsidP=&quot;006E074F&quot;&gt;&lt;m:oMathPara&gt;&lt;m:oMath&gt;&lt;m:sSub&gt;&lt;m:sSubPr&gt;&lt;m:ctrlPr&gt;&lt;w:rPr&gt;&lt;w:rFonts w:ascii=&quot;Cambria Math&quot; w:h-ansi=&quot;Cambria Math&quot;/&gt;&lt;wx:font wx:val=&quot;Cambria Math&quot;/&gt;&lt;w:i/&gt;&lt;/w:rPr&gt;&lt;/m:ctrlPr&gt;&lt;/m:sSubPr&gt;&lt;m:e&gt;&lt;m:r&gt;&lt;w:rPr&gt;&lt;w:rFonts w:ascii=&quot;Cambria Math&quot; w:h-ansi=&quot;Cambria Math&quot;/&gt;&lt;wx:font wx:val=&quot;Cambria Math&quot;/&gt;&lt;w:i/&gt;&lt;/w:rPr&gt;&lt;m:t&gt;V&lt;/m:t&gt;&lt;/m:r&gt;&lt;/m:e&gt;&lt;m:sub&gt;&lt;m:r&gt;&lt;w:rPr&gt;&lt;w:rFonts w:ascii=&quot;Cambria Math&quot; w:h-ansi=&quot;Cambria Math&quot;/&gt;&lt;wx:font wx:val=&quot;Cambria Math&quot;/&gt;&lt;w:i/&gt;&lt;/w:rPr&gt;&lt;m:t&gt;in&lt;/m:t&gt;&lt;/m:r&gt;&lt;/m:sub&gt;&lt;/m:sSub&gt;&lt;/m:oMath&gt;&lt;/m:oMathPara&gt;&lt;/w:p&gt;&lt;w:sectPr wsp:rsidR=&quot;00000000&quot; wsp:rsidRPr=&quot;006E074F&quot;&gt;&lt;w:pgSz w:w=&quot;12240&quot; w:h=&quot;15840&quot;/&gt;&lt;w:pgMar w:top=&quot;1440&quot; w:right=&quot;1440&quot; w:bottom=&quot;1440&quot; w:left=&quot;1440&quot; w:header=&quot;720&quot; w:footer=&quot;720&quot; w:gutter=&quot;0&quot;/&gt;&lt;w:cols w:space=&quot;720&quot;/&gt;&lt;/w:sectPr&gt;&lt;/wx:sect&gt;&lt;/w:body&gt;&lt;/w:wordDocument&gt;">
+                <v:shape id="_x0000_i1042" type="#_x0000_t75" style="width:15.25pt;height:13.85pt" equationxml="&lt;?xml version=&quot;1.0&quot; encoding=&quot;UTF-8&quot; standalone=&quot;yes&quot;?&gt;&#10;&lt;?mso-application progid=&quot;Word.Document&quot;?&gt;&#10;&lt;w:wordDocument xmlns:aml=&quot;http://schemas.microsoft.com/aml/2001/core&quot; xmlns:wpc=&quot;http://schemas.microsoft.com/office/word/2010/wordprocessingCanvas&quot; xmlns:cx=&quot;http://schemas.microsoft.com/office/drawing/2014/chartex&quot; xmlns:cx1=&quot;http://schemas.microsoft.com/office/drawing/2015/9/8/chartex&quot; xmlns:cx2=&quot;http://schemas.microsoft.com/office/drawing/2015/10/21/chartex&quot; xmlns:cx3=&quot;http://schemas.microsoft.com/office/drawing/2016/5/9/chartex&quot; xmlns:cx4=&quot;http://schemas.microsoft.com/office/drawing/2016/5/10/chartex&quot; xmlns:cx5=&quot;http://schemas.microsoft.com/office/drawing/2016/5/11/chartex&quot; xmlns:cx6=&quot;http://schemas.microsoft.com/office/drawing/2016/5/12/chartex&quot; xmlns:cx7=&quot;http://schemas.microsoft.com/office/drawing/2016/5/13/chartex&quot; xmlns:cx8=&quot;http://schemas.microsoft.com/office/drawing/2016/5/14/chartex&quot; xmlns:cr=&quot;http://schemas.microsoft.com/office/comments/2020/reactions&quot; xmlns:dt=&quot;uuid:C2F41010-65B3-11d1-A29F-00AA00C14882&quot; xmlns:mc=&quot;http://schemas.openxmlformats.org/markup-compatibility/2006&quot; xmlns:aink=&quot;http://schemas.microsoft.com/office/drawing/2016/ink&quot; xmlns:am3d=&quot;http://schemas.microsoft.com/office/drawing/2017/model3d&quot; xmlns:o=&quot;urn:schemas-microsoft-com:office:office&quot; xmlns:oel=&quot;http://schemas.microsoft.com/office/2019/extlst&quot; xmlns:m=&quot;http://schemas.openxmlformats.org/officeDocument/2006/math&quot; xmlns:v=&quot;urn:schemas-microsoft-com:vml&quot; xmlns:w10=&quot;urn:schemas-microsoft-com:office:word&quot; xmlns:w=&quot;http://schemas.microsoft.com/office/word/2003/wordml&quot; xmlns:wx=&quot;http://schemas.microsoft.com/office/word/2003/auxHint&quot; xmlns:wne=&quot;http://schemas.microsoft.com/office/word/2006/wordml&quot; xmlns:wsp=&quot;http://schemas.microsoft.com/office/word/2003/wordml/sp2&quot; xmlns:sl=&quot;http://schemas.microsoft.com/schemaLibrary/2003/core&quot; w:macrosPresent=&quot;no&quot; w:embeddedObjPresent=&quot;no&quot; w:ocxPresent=&quot;no&quot; xml:space=&quot;preserve&quot;&gt;&lt;w:ignoreSubtree w:val=&quot;http://schemas.microsoft.com/office/word/2003/wordml/sp2&quot;/&gt;&lt;o:DocumentProperties&gt;&lt;o:Version&gt;16&lt;/o:Version&gt;&lt;/o:DocumentProperties&gt;&lt;w:docPr&gt;&lt;w:view w:val=&quot;print&quot;/&gt;&lt;w:zoom w:percent=&quot;100&quot;/&gt;&lt;w:doNotEmbedSystemFonts/&gt;&lt;w:activeWritingStyle w:lang=&quot;EN-AU&quot; w:vendorID=&quot;64&quot; w:dllVersion=&quot;6&quot; w:nlCheck=&quot;on&quot; w:optionSet=&quot;1&quot;/&gt;&lt;w:activeWritingStyle w:lang=&quot;EN-GB&quot; w:vendorID=&quot;64&quot; w:dllVersion=&quot;6&quot; w:nlCheck=&quot;on&quot; w:optionSet=&quot;1&quot;/&gt;&lt;w:activeWritingStyle w:lang=&quot;EN-US&quot; w:vendorID=&quot;64&quot; w:dllVersion=&quot;6&quot; w:nlCheck=&quot;on&quot; w:optionSet=&quot;1&quot;/&gt;&lt;w:activeWritingStyle w:lang=&quot;EN-AU&quot; w:vendorID=&quot;64&quot; w:dllVersion=&quot;0&quot; w:nlCheck=&quot;on&quot; w:optionSet=&quot;0&quot;/&gt;&lt;w:activeWritingStyle w:lang=&quot;EN-GB&quot; w:vendorID=&quot;64&quot; w:dllVersion=&quot;0&quot; w:nlCheck=&quot;on&quot; w:optionSet=&quot;0&quot;/&gt;&lt;w:activeWritingStyle w:lang=&quot;EN-US&quot; w:vendorID=&quot;64&quot; w:dllVersion=&quot;0&quot; w:nlCheck=&quot;on&quot; w:optionSet=&quot;0&quot;/&gt;&lt;w:activeWritingStyle w:lang=&quot;ES-AR&quot; w:vendorID=&quot;64&quot; w:dllVersion=&quot;0&quot; w:nlCheck=&quot;on&quot; w:optionSet=&quot;0&quot;/&gt;&lt;w:activeWritingStyle w:lang=&quot;580A&quot; w:vendorID=&quot;64&quot; w:dllVersion=&quot;0&quot; w:nlCheck=&quot;on&quot; w:optionSet=&quot;0&quot;/&gt;&lt;w:activeWritingStyle w:lang=&quot;PT-BR&quot; w:vendorID=&quot;64&quot; w:dllVersion=&quot;0&quot; w:nlCheck=&quot;on&quot; w:optionSet=&quot;0&quot;/&gt;&lt;w:stylePaneFormatFilter w:val=&quot;3F01&quot;/&gt;&lt;w:defaultTabStop w:val=&quot;720&quot;/&gt;&lt;w:hyphenationZone w:val=&quot;425&quot;/&gt;&lt;w:characterSpacingControl w:val=&quot;DontCompress&quot;/&gt;&lt;w:optimizeForBrowser/&gt;&lt;w:validateAgainstSchema/&gt;&lt;w:saveInvalidXML w:val=&quot;off&quot;/&gt;&lt;w:ignoreMixedContent w:val=&quot;off&quot;/&gt;&lt;w:alwaysShowPlaceholderText w:val=&quot;off&quot;/&gt;&lt;w:compat&gt;&lt;w:breakWrappedTables/&gt;&lt;w:snapToGridInCell/&gt;&lt;w:applyBreakingRules/&gt;&lt;w:wrapTextWithPunct/&gt;&lt;w:useAsianBreakRules/&gt;&lt;w:useWord2002TableStyleRules/&gt;&lt;w:useFELayout/&gt;&lt;/w:compat&gt;&lt;wsp:rsids&gt;&lt;wsp:rsidRoot wsp:val=&quot;00426FBB&quot;/&gt;&lt;wsp:rsid wsp:val=&quot;000002E1&quot;/&gt;&lt;wsp:rsid wsp:val=&quot;00003C97&quot;/&gt;&lt;wsp:rsid wsp:val=&quot;00005565&quot;/&gt;&lt;wsp:rsid wsp:val=&quot;0001754A&quot;/&gt;&lt;wsp:rsid wsp:val=&quot;00017719&quot;/&gt;&lt;wsp:rsid wsp:val=&quot;00027F1D&quot;/&gt;&lt;wsp:rsid wsp:val=&quot;0003296C&quot;/&gt;&lt;wsp:rsid wsp:val=&quot;0003351F&quot;/&gt;&lt;wsp:rsid wsp:val=&quot;00044599&quot;/&gt;&lt;wsp:rsid wsp:val=&quot;000540E6&quot;/&gt;&lt;wsp:rsid wsp:val=&quot;00054421&quot;/&gt;&lt;wsp:rsid wsp:val=&quot;00062E46&quot;/&gt;&lt;wsp:rsid wsp:val=&quot;00074AC8&quot;/&gt;&lt;wsp:rsid wsp:val=&quot;00081408&quot;/&gt;&lt;wsp:rsid wsp:val=&quot;00081EBE&quot;/&gt;&lt;wsp:rsid wsp:val=&quot;00086EDC&quot;/&gt;&lt;wsp:rsid wsp:val=&quot;000B1236&quot;/&gt;&lt;wsp:rsid wsp:val=&quot;000B36A3&quot;/&gt;&lt;wsp:rsid wsp:val=&quot;000C013C&quot;/&gt;&lt;wsp:rsid wsp:val=&quot;000E3F84&quot;/&gt;&lt;wsp:rsid wsp:val=&quot;001056DF&quot;/&gt;&lt;wsp:rsid wsp:val=&quot;0010789C&quot;/&gt;&lt;wsp:rsid wsp:val=&quot;00114025&quot;/&gt;&lt;wsp:rsid wsp:val=&quot;001160D2&quot;/&gt;&lt;wsp:rsid wsp:val=&quot;00120636&quot;/&gt;&lt;wsp:rsid wsp:val=&quot;001348A5&quot;/&gt;&lt;wsp:rsid wsp:val=&quot;00151B8E&quot;/&gt;&lt;wsp:rsid wsp:val=&quot;00182170&quot;/&gt;&lt;wsp:rsid wsp:val=&quot;001928FB&quot;/&gt;&lt;wsp:rsid wsp:val=&quot;00192BC7&quot;/&gt;&lt;wsp:rsid wsp:val=&quot;00195BE6&quot;/&gt;&lt;wsp:rsid wsp:val=&quot;001A50EA&quot;/&gt;&lt;wsp:rsid wsp:val=&quot;001F16CD&quot;/&gt;&lt;wsp:rsid wsp:val=&quot;001F47D2&quot;/&gt;&lt;wsp:rsid wsp:val=&quot;002029C8&quot;/&gt;&lt;wsp:rsid wsp:val=&quot;0022285A&quot;/&gt;&lt;wsp:rsid wsp:val=&quot;00224C61&quot;/&gt;&lt;wsp:rsid wsp:val=&quot;00256ABC&quot;/&gt;&lt;wsp:rsid wsp:val=&quot;0027227B&quot;/&gt;&lt;wsp:rsid wsp:val=&quot;00273AC7&quot;/&gt;&lt;wsp:rsid wsp:val=&quot;00273D2C&quot;/&gt;&lt;wsp:rsid wsp:val=&quot;00285ECD&quot;/&gt;&lt;wsp:rsid wsp:val=&quot;00290E1B&quot;/&gt;&lt;wsp:rsid wsp:val=&quot;00291B17&quot;/&gt;&lt;wsp:rsid wsp:val=&quot;00291BB3&quot;/&gt;&lt;wsp:rsid wsp:val=&quot;002A6742&quot;/&gt;&lt;wsp:rsid wsp:val=&quot;002C1A7F&quot;/&gt;&lt;wsp:rsid wsp:val=&quot;002C4239&quot;/&gt;&lt;wsp:rsid wsp:val=&quot;002C559D&quot;/&gt;&lt;wsp:rsid wsp:val=&quot;002D16AE&quot;/&gt;&lt;wsp:rsid wsp:val=&quot;002D2D42&quot;/&gt;&lt;wsp:rsid wsp:val=&quot;002F72D0&quot;/&gt;&lt;wsp:rsid wsp:val=&quot;002F7A4F&quot;/&gt;&lt;wsp:rsid wsp:val=&quot;003003AB&quot;/&gt;&lt;wsp:rsid wsp:val=&quot;00302C35&quot;/&gt;&lt;wsp:rsid wsp:val=&quot;00311C49&quot;/&gt;&lt;wsp:rsid wsp:val=&quot;0032119E&quot;/&gt;&lt;wsp:rsid wsp:val=&quot;00321304&quot;/&gt;&lt;wsp:rsid wsp:val=&quot;00324FC2&quot;/&gt;&lt;wsp:rsid wsp:val=&quot;003312CA&quot;/&gt;&lt;wsp:rsid wsp:val=&quot;00331F84&quot;/&gt;&lt;wsp:rsid wsp:val=&quot;0037721F&quot;/&gt;&lt;wsp:rsid wsp:val=&quot;003950A4&quot;/&gt;&lt;wsp:rsid wsp:val=&quot;003A1E7E&quot;/&gt;&lt;wsp:rsid wsp:val=&quot;003E2FDC&quot;/&gt;&lt;wsp:rsid wsp:val=&quot;003E3577&quot;/&gt;&lt;wsp:rsid wsp:val=&quot;003F3A61&quot;/&gt;&lt;wsp:rsid wsp:val=&quot;00410A5D&quot;/&gt;&lt;wsp:rsid wsp:val=&quot;00414909&quot;/&gt;&lt;wsp:rsid wsp:val=&quot;00416537&quot;/&gt;&lt;wsp:rsid wsp:val=&quot;00425A6A&quot;/&gt;&lt;wsp:rsid wsp:val=&quot;00426FBB&quot;/&gt;&lt;wsp:rsid wsp:val=&quot;00454542&quot;/&gt;&lt;wsp:rsid wsp:val=&quot;0047429A&quot;/&gt;&lt;wsp:rsid wsp:val=&quot;0048374C&quot;/&gt;&lt;wsp:rsid wsp:val=&quot;0048771D&quot;/&gt;&lt;wsp:rsid wsp:val=&quot;004A6605&quot;/&gt;&lt;wsp:rsid wsp:val=&quot;004C45FA&quot;/&gt;&lt;wsp:rsid wsp:val=&quot;004D35A3&quot;/&gt;&lt;wsp:rsid wsp:val=&quot;004E1BD8&quot;/&gt;&lt;wsp:rsid wsp:val=&quot;004E452A&quot;/&gt;&lt;wsp:rsid wsp:val=&quot;004E78E3&quot;/&gt;&lt;wsp:rsid wsp:val=&quot;004F2BFE&quot;/&gt;&lt;wsp:rsid wsp:val=&quot;004F63D3&quot;/&gt;&lt;wsp:rsid wsp:val=&quot;004F7DCF&quot;/&gt;&lt;wsp:rsid wsp:val=&quot;005004BF&quot;/&gt;&lt;wsp:rsid wsp:val=&quot;00502E89&quot;/&gt;&lt;wsp:rsid wsp:val=&quot;00506CFE&quot;/&gt;&lt;wsp:rsid wsp:val=&quot;00510E95&quot;/&gt;&lt;wsp:rsid wsp:val=&quot;005225C3&quot;/&gt;&lt;wsp:rsid wsp:val=&quot;00527D56&quot;/&gt;&lt;wsp:rsid wsp:val=&quot;0053221F&quot;/&gt;&lt;wsp:rsid wsp:val=&quot;00536FAE&quot;/&gt;&lt;wsp:rsid wsp:val=&quot;00542C85&quot;/&gt;&lt;wsp:rsid wsp:val=&quot;00553510&quot;/&gt;&lt;wsp:rsid wsp:val=&quot;00554186&quot;/&gt;&lt;wsp:rsid wsp:val=&quot;00585769&quot;/&gt;&lt;wsp:rsid wsp:val=&quot;00585C61&quot;/&gt;&lt;wsp:rsid wsp:val=&quot;00591130&quot;/&gt;&lt;wsp:rsid wsp:val=&quot;005A3F28&quot;/&gt;&lt;wsp:rsid wsp:val=&quot;005A40BE&quot;/&gt;&lt;wsp:rsid wsp:val=&quot;005B13E2&quot;/&gt;&lt;wsp:rsid wsp:val=&quot;005B47D7&quot;/&gt;&lt;wsp:rsid wsp:val=&quot;005C5526&quot;/&gt;&lt;wsp:rsid wsp:val=&quot;005C62C6&quot;/&gt;&lt;wsp:rsid wsp:val=&quot;005D7B9E&quot;/&gt;&lt;wsp:rsid wsp:val=&quot;005E112E&quot;/&gt;&lt;wsp:rsid wsp:val=&quot;005F0834&quot;/&gt;&lt;wsp:rsid wsp:val=&quot;005F68AB&quot;/&gt;&lt;wsp:rsid wsp:val=&quot;005F6DC3&quot;/&gt;&lt;wsp:rsid wsp:val=&quot;00601A8E&quot;/&gt;&lt;wsp:rsid wsp:val=&quot;0062033E&quot;/&gt;&lt;wsp:rsid wsp:val=&quot;00624482&quot;/&gt;&lt;wsp:rsid wsp:val=&quot;0064799C&quot;/&gt;&lt;wsp:rsid wsp:val=&quot;00654156&quot;/&gt;&lt;wsp:rsid wsp:val=&quot;00656ADC&quot;/&gt;&lt;wsp:rsid wsp:val=&quot;006B47CA&quot;/&gt;&lt;wsp:rsid wsp:val=&quot;006C304C&quot;/&gt;&lt;wsp:rsid wsp:val=&quot;006C4511&quot;/&gt;&lt;wsp:rsid wsp:val=&quot;006C65F5&quot;/&gt;&lt;wsp:rsid wsp:val=&quot;006C7AAA&quot;/&gt;&lt;wsp:rsid wsp:val=&quot;006D1C2A&quot;/&gt;&lt;wsp:rsid wsp:val=&quot;006D264F&quot;/&gt;&lt;wsp:rsid wsp:val=&quot;006D4E89&quot;/&gt;&lt;wsp:rsid wsp:val=&quot;006E074F&quot;/&gt;&lt;wsp:rsid wsp:val=&quot;006E2A8D&quot;/&gt;&lt;wsp:rsid wsp:val=&quot;006E7574&quot;/&gt;&lt;wsp:rsid wsp:val=&quot;00703430&quot;/&gt;&lt;wsp:rsid wsp:val=&quot;00703548&quot;/&gt;&lt;wsp:rsid wsp:val=&quot;00704E18&quot;/&gt;&lt;wsp:rsid wsp:val=&quot;007069BE&quot;/&gt;&lt;wsp:rsid wsp:val=&quot;00745C86&quot;/&gt;&lt;wsp:rsid wsp:val=&quot;00764603&quot;/&gt;&lt;wsp:rsid wsp:val=&quot;0076604D&quot;/&gt;&lt;wsp:rsid wsp:val=&quot;00790909&quot;/&gt;&lt;wsp:rsid wsp:val=&quot;007B1582&quot;/&gt;&lt;wsp:rsid wsp:val=&quot;007B5A07&quot;/&gt;&lt;wsp:rsid wsp:val=&quot;007C065D&quot;/&gt;&lt;wsp:rsid wsp:val=&quot;007D3E71&quot;/&gt;&lt;wsp:rsid wsp:val=&quot;007E5D6A&quot;/&gt;&lt;wsp:rsid wsp:val=&quot;007E645D&quot;/&gt;&lt;wsp:rsid wsp:val=&quot;007F75CA&quot;/&gt;&lt;wsp:rsid wsp:val=&quot;00821E08&quot;/&gt;&lt;wsp:rsid wsp:val=&quot;00834EFD&quot;/&gt;&lt;wsp:rsid wsp:val=&quot;00844B24&quot;/&gt;&lt;wsp:rsid wsp:val=&quot;0084515F&quot;/&gt;&lt;wsp:rsid wsp:val=&quot;0085092D&quot;/&gt;&lt;wsp:rsid wsp:val=&quot;00865414&quot;/&gt;&lt;wsp:rsid wsp:val=&quot;00877D4C&quot;/&gt;&lt;wsp:rsid wsp:val=&quot;00883903&quot;/&gt;&lt;wsp:rsid wsp:val=&quot;0089763B&quot;/&gt;&lt;wsp:rsid wsp:val=&quot;008B6AE3&quot;/&gt;&lt;wsp:rsid wsp:val=&quot;008C1332&quot;/&gt;&lt;wsp:rsid wsp:val=&quot;008D1045&quot;/&gt;&lt;wsp:rsid wsp:val=&quot;008E5996&quot;/&gt;&lt;wsp:rsid wsp:val=&quot;00901AE1&quot;/&gt;&lt;wsp:rsid wsp:val=&quot;00912F93&quot;/&gt;&lt;wsp:rsid wsp:val=&quot;009205B4&quot;/&gt;&lt;wsp:rsid wsp:val=&quot;00955B59&quot;/&gt;&lt;wsp:rsid wsp:val=&quot;00992262&quot;/&gt;&lt;wsp:rsid wsp:val=&quot;009926BC&quot;/&gt;&lt;wsp:rsid wsp:val=&quot;009A4319&quot;/&gt;&lt;wsp:rsid wsp:val=&quot;009A6C3F&quot;/&gt;&lt;wsp:rsid wsp:val=&quot;009B73F2&quot;/&gt;&lt;wsp:rsid wsp:val=&quot;009C12BD&quot;/&gt;&lt;wsp:rsid wsp:val=&quot;009C50FE&quot;/&gt;&lt;wsp:rsid wsp:val=&quot;009E49DD&quot;/&gt;&lt;wsp:rsid wsp:val=&quot;00A03E75&quot;/&gt;&lt;wsp:rsid wsp:val=&quot;00A20627&quot;/&gt;&lt;wsp:rsid wsp:val=&quot;00A22FE9&quot;/&gt;&lt;wsp:rsid wsp:val=&quot;00A31A44&quot;/&gt;&lt;wsp:rsid wsp:val=&quot;00A32BFA&quot;/&gt;&lt;wsp:rsid wsp:val=&quot;00A3325E&quot;/&gt;&lt;wsp:rsid wsp:val=&quot;00A45FCE&quot;/&gt;&lt;wsp:rsid wsp:val=&quot;00A75671&quot;/&gt;&lt;wsp:rsid wsp:val=&quot;00A773CC&quot;/&gt;&lt;wsp:rsid wsp:val=&quot;00A924D0&quot;/&gt;&lt;wsp:rsid wsp:val=&quot;00A9318B&quot;/&gt;&lt;wsp:rsid wsp:val=&quot;00A94AC1&quot;/&gt;&lt;wsp:rsid wsp:val=&quot;00AB18B7&quot;/&gt;&lt;wsp:rsid wsp:val=&quot;00AD335D&quot;/&gt;&lt;wsp:rsid wsp:val=&quot;00AF114C&quot;/&gt;&lt;wsp:rsid wsp:val=&quot;00AF792B&quot;/&gt;&lt;wsp:rsid wsp:val=&quot;00B33D2F&quot;/&gt;&lt;wsp:rsid wsp:val=&quot;00B40A5B&quot;/&gt;&lt;wsp:rsid wsp:val=&quot;00B45C6B&quot;/&gt;&lt;wsp:rsid wsp:val=&quot;00B55D5E&quot;/&gt;&lt;wsp:rsid wsp:val=&quot;00B57A80&quot;/&gt;&lt;wsp:rsid wsp:val=&quot;00B70E9C&quot;/&gt;&lt;wsp:rsid wsp:val=&quot;00B713D8&quot;/&gt;&lt;wsp:rsid wsp:val=&quot;00B72979&quot;/&gt;&lt;wsp:rsid wsp:val=&quot;00B94516&quot;/&gt;&lt;wsp:rsid wsp:val=&quot;00BA25E2&quot;/&gt;&lt;wsp:rsid wsp:val=&quot;00BB2855&quot;/&gt;&lt;wsp:rsid wsp:val=&quot;00BC5343&quot;/&gt;&lt;wsp:rsid wsp:val=&quot;00BD19C1&quot;/&gt;&lt;wsp:rsid wsp:val=&quot;00BD25B8&quot;/&gt;&lt;wsp:rsid wsp:val=&quot;00C012E1&quot;/&gt;&lt;wsp:rsid wsp:val=&quot;00C06BB4&quot;/&gt;&lt;wsp:rsid wsp:val=&quot;00C10D20&quot;/&gt;&lt;wsp:rsid wsp:val=&quot;00C12E0C&quot;/&gt;&lt;wsp:rsid wsp:val=&quot;00C21916&quot;/&gt;&lt;wsp:rsid wsp:val=&quot;00C34915&quot;/&gt;&lt;wsp:rsid wsp:val=&quot;00C457CA&quot;/&gt;&lt;wsp:rsid wsp:val=&quot;00C53FB6&quot;/&gt;&lt;wsp:rsid wsp:val=&quot;00C57FB7&quot;/&gt;&lt;wsp:rsid wsp:val=&quot;00C644D4&quot;/&gt;&lt;wsp:rsid wsp:val=&quot;00C65F3F&quot;/&gt;&lt;wsp:rsid wsp:val=&quot;00C72414&quot;/&gt;&lt;wsp:rsid wsp:val=&quot;00C72B1A&quot;/&gt;&lt;wsp:rsid wsp:val=&quot;00C8667B&quot;/&gt;&lt;wsp:rsid wsp:val=&quot;00C90993&quot;/&gt;&lt;wsp:rsid wsp:val=&quot;00CA4CE3&quot;/&gt;&lt;wsp:rsid wsp:val=&quot;00CC72FD&quot;/&gt;&lt;wsp:rsid wsp:val=&quot;00CD4F3F&quot;/&gt;&lt;wsp:rsid wsp:val=&quot;00D311F8&quot;/&gt;&lt;wsp:rsid wsp:val=&quot;00D31660&quot;/&gt;&lt;wsp:rsid wsp:val=&quot;00D36B52&quot;/&gt;&lt;wsp:rsid wsp:val=&quot;00D377C8&quot;/&gt;&lt;wsp:rsid wsp:val=&quot;00D41274&quot;/&gt;&lt;wsp:rsid wsp:val=&quot;00D4229C&quot;/&gt;&lt;wsp:rsid wsp:val=&quot;00D43BF3&quot;/&gt;&lt;wsp:rsid wsp:val=&quot;00D549FB&quot;/&gt;&lt;wsp:rsid wsp:val=&quot;00D767BB&quot;/&gt;&lt;wsp:rsid wsp:val=&quot;00D939B0&quot;/&gt;&lt;wsp:rsid wsp:val=&quot;00DA31A2&quot;/&gt;&lt;wsp:rsid wsp:val=&quot;00DB16E0&quot;/&gt;&lt;wsp:rsid wsp:val=&quot;00DB2DF9&quot;/&gt;&lt;wsp:rsid wsp:val=&quot;00DB465D&quot;/&gt;&lt;wsp:rsid wsp:val=&quot;00DB48A2&quot;/&gt;&lt;wsp:rsid wsp:val=&quot;00DB7E63&quot;/&gt;&lt;wsp:rsid wsp:val=&quot;00DC2055&quot;/&gt;&lt;wsp:rsid wsp:val=&quot;00DC3908&quot;/&gt;&lt;wsp:rsid wsp:val=&quot;00DD71E8&quot;/&gt;&lt;wsp:rsid wsp:val=&quot;00DD7F83&quot;/&gt;&lt;wsp:rsid wsp:val=&quot;00DE4EB8&quot;/&gt;&lt;wsp:rsid wsp:val=&quot;00E0641E&quot;/&gt;&lt;wsp:rsid wsp:val=&quot;00E06664&quot;/&gt;&lt;wsp:rsid wsp:val=&quot;00E304BC&quot;/&gt;&lt;wsp:rsid wsp:val=&quot;00E32853&quot;/&gt;&lt;wsp:rsid wsp:val=&quot;00E34EBD&quot;/&gt;&lt;wsp:rsid wsp:val=&quot;00E401F8&quot;/&gt;&lt;wsp:rsid wsp:val=&quot;00E46425&quot;/&gt;&lt;wsp:rsid wsp:val=&quot;00E469FC&quot;/&gt;&lt;wsp:rsid wsp:val=&quot;00E47D0E&quot;/&gt;&lt;wsp:rsid wsp:val=&quot;00E65018&quot;/&gt;&lt;wsp:rsid wsp:val=&quot;00E76CA1&quot;/&gt;&lt;wsp:rsid wsp:val=&quot;00E94339&quot;/&gt;&lt;wsp:rsid wsp:val=&quot;00E97563&quot;/&gt;&lt;wsp:rsid wsp:val=&quot;00EB0B63&quot;/&gt;&lt;wsp:rsid wsp:val=&quot;00EC265C&quot;/&gt;&lt;wsp:rsid wsp:val=&quot;00ED61CB&quot;/&gt;&lt;wsp:rsid wsp:val=&quot;00EE752A&quot;/&gt;&lt;wsp:rsid wsp:val=&quot;00F06A72&quot;/&gt;&lt;wsp:rsid wsp:val=&quot;00F136F0&quot;/&gt;&lt;wsp:rsid wsp:val=&quot;00F20BBB&quot;/&gt;&lt;wsp:rsid wsp:val=&quot;00F36048&quot;/&gt;&lt;wsp:rsid wsp:val=&quot;00F43BD8&quot;/&gt;&lt;wsp:rsid wsp:val=&quot;00F562F3&quot;/&gt;&lt;wsp:rsid wsp:val=&quot;00F74B89&quot;/&gt;&lt;wsp:rsid wsp:val=&quot;00F75133&quot;/&gt;&lt;wsp:rsid wsp:val=&quot;00F83272&quot;/&gt;&lt;wsp:rsid wsp:val=&quot;00F9358D&quot;/&gt;&lt;wsp:rsid wsp:val=&quot;00FA3899&quot;/&gt;&lt;wsp:rsid wsp:val=&quot;00FA4909&quot;/&gt;&lt;wsp:rsid wsp:val=&quot;00FA5164&quot;/&gt;&lt;wsp:rsid wsp:val=&quot;00FA6751&quot;/&gt;&lt;wsp:rsid wsp:val=&quot;00FA6BD7&quot;/&gt;&lt;wsp:rsid wsp:val=&quot;00FB1048&quot;/&gt;&lt;wsp:rsid wsp:val=&quot;00FB62C4&quot;/&gt;&lt;wsp:rsid wsp:val=&quot;00FB7701&quot;/&gt;&lt;wsp:rsid wsp:val=&quot;00FD1AC5&quot;/&gt;&lt;wsp:rsid wsp:val=&quot;00FD5CF0&quot;/&gt;&lt;/wsp:rsids&gt;&lt;/w:docPr&gt;&lt;w:body&gt;&lt;wx:sect&gt;&lt;w:p wsp:rsidR=&quot;006E074F&quot; wsp:rsidRPr=&quot;006E074F&quot; wsp:rsidRDefault=&quot;006E074F&quot; wsp:rsidP=&quot;006E074F&quot;&gt;&lt;m:oMathPara&gt;&lt;m:oMath&gt;&lt;m:sSub&gt;&lt;m:sSubPr&gt;&lt;m:ctrlPr&gt;&lt;w:rPr&gt;&lt;w:rFonts w:ascii=&quot;Cambria Math&quot; w:h-ansi=&quot;Cambria Math&quot;/&gt;&lt;wx:font wx:val=&quot;Cambria Math&quot;/&gt;&lt;w:i/&gt;&lt;/w:rPr&gt;&lt;/m:ctrlPr&gt;&lt;/m:sSubPr&gt;&lt;m:e&gt;&lt;m:r&gt;&lt;w:rPr&gt;&lt;w:rFonts w:ascii=&quot;Cambria Math&quot; w:h-ansi=&quot;Cambria Math&quot;/&gt;&lt;wx:font wx:val=&quot;Cambria Math&quot;/&gt;&lt;w:i/&gt;&lt;/w:rPr&gt;&lt;m:t&gt;V&lt;/m:t&gt;&lt;/m:r&gt;&lt;/m:e&gt;&lt;m:sub&gt;&lt;m:r&gt;&lt;w:rPr&gt;&lt;w:rFonts w:ascii=&quot;Cambria Math&quot; w:h-ansi=&quot;Cambria Math&quot;/&gt;&lt;wx:font wx:val=&quot;Cambria Math&quot;/&gt;&lt;w:i/&gt;&lt;/w:rPr&gt;&lt;m:t&gt;in&lt;/m:t&gt;&lt;/m:r&gt;&lt;/m:sub&gt;&lt;/m:sSub&gt;&lt;/m:oMath&gt;&lt;/m:oMathPara&gt;&lt;/w:p&gt;&lt;w:sectPr wsp:rsidR=&quot;00000000&quot; wsp:rsidRPr=&quot;006E074F&quot;&gt;&lt;w:pgSz w:w=&quot;12240&quot; w:h=&quot;15840&quot;/&gt;&lt;w:pgMar w:top=&quot;1440&quot; w:right=&quot;1440&quot; w:bottom=&quot;1440&quot; w:left=&quot;1440&quot; w:header=&quot;720&quot; w:footer=&quot;720&quot; w:gutter=&quot;0&quot;/&gt;&lt;w:cols w:space=&quot;720&quot;/&gt;&lt;/w:sectPr&gt;&lt;/wx:sect&gt;&lt;/w:body&gt;&lt;/w:wordDocument&gt;">
                   <v:imagedata r:id="rId13" o:title="" chromakey="white"/>
                 </v:shape>
               </w:pict>
@@ -1579,7 +1579,7 @@
         </w:tc>
         <w:tc>
           <w:tcPr>
-            <w:tcW w:w="850" w:type="dxa"/>
+            <w:tcW w:w="852" w:type="dxa"/>
             <w:shd w:val="clear" w:color="auto" w:fill="auto"/>
           </w:tcPr>
           <w:p>
@@ -1601,7 +1601,7 @@
         </w:tc>
         <w:tc>
           <w:tcPr>
-            <w:tcW w:w="898" w:type="dxa"/>
+            <w:tcW w:w="900" w:type="dxa"/>
             <w:shd w:val="clear" w:color="auto" w:fill="auto"/>
           </w:tcPr>
           <w:p>
@@ -1624,12 +1624,12 @@
       </w:tr>
       <w:tr>
         <w:trPr>
-          <w:trHeight w:val="281"/>
+          <w:trHeight w:val="34"/>
           <w:jc w:val="center"/>
         </w:trPr>
         <w:tc>
           <w:tcPr>
-            <w:tcW w:w="2255" w:type="dxa"/>
+            <w:tcW w:w="2261" w:type="dxa"/>
             <w:shd w:val="clear" w:color="auto" w:fill="D9D9D9"/>
           </w:tcPr>
           <w:p>
@@ -1657,7 +1657,7 @@
         </w:tc>
         <w:tc>
           <w:tcPr>
-            <w:tcW w:w="993" w:type="dxa"/>
+            <w:tcW w:w="995" w:type="dxa"/>
             <w:shd w:val="clear" w:color="auto" w:fill="D9D9D9"/>
           </w:tcPr>
           <w:p>
@@ -1674,7 +1674,7 @@
                 <w:szCs w:val="18"/>
               </w:rPr>
               <w:pict w14:anchorId="6099D56A">
-                <v:shape id="_x0000_i1440" type="#_x0000_t75" style="width:21.25pt;height:13.65pt" equationxml="&lt;?xml version=&quot;1.0&quot; encoding=&quot;UTF-8&quot; standalone=&quot;yes&quot;?&gt;&#10;&lt;?mso-application progid=&quot;Word.Document&quot;?&gt;&#10;&lt;w:wordDocument xmlns:aml=&quot;http://schemas.microsoft.com/aml/2001/core&quot; xmlns:wpc=&quot;http://schemas.microsoft.com/office/word/2010/wordprocessingCanvas&quot; xmlns:cx=&quot;http://schemas.microsoft.com/office/drawing/2014/chartex&quot; xmlns:cx1=&quot;http://schemas.microsoft.com/office/drawing/2015/9/8/chartex&quot; xmlns:cx2=&quot;http://schemas.microsoft.com/office/drawing/2015/10/21/chartex&quot; xmlns:cx3=&quot;http://schemas.microsoft.com/office/drawing/2016/5/9/chartex&quot; xmlns:cx4=&quot;http://schemas.microsoft.com/office/drawing/2016/5/10/chartex&quot; xmlns:cx5=&quot;http://schemas.microsoft.com/office/drawing/2016/5/11/chartex&quot; xmlns:cx6=&quot;http://schemas.microsoft.com/office/drawing/2016/5/12/chartex&quot; xmlns:cx7=&quot;http://schemas.microsoft.com/office/drawing/2016/5/13/chartex&quot; xmlns:cx8=&quot;http://schemas.microsoft.com/office/drawing/2016/5/14/chartex&quot; xmlns:cr=&quot;http://schemas.microsoft.com/office/comments/2020/reactions&quot; xmlns:dt=&quot;uuid:C2F41010-65B3-11d1-A29F-00AA00C14882&quot; xmlns:mc=&quot;http://schemas.openxmlformats.org/markup-compatibility/2006&quot; xmlns:aink=&quot;http://schemas.microsoft.com/office/drawing/2016/ink&quot; xmlns:am3d=&quot;http://schemas.microsoft.com/office/drawing/2017/model3d&quot; xmlns:o=&quot;urn:schemas-microsoft-com:office:office&quot; xmlns:oel=&quot;http://schemas.microsoft.com/office/2019/extlst&quot; xmlns:m=&quot;http://schemas.openxmlformats.org/officeDocument/2006/math&quot; xmlns:v=&quot;urn:schemas-microsoft-com:vml&quot; xmlns:w10=&quot;urn:schemas-microsoft-com:office:word&quot; xmlns:w=&quot;http://schemas.microsoft.com/office/word/2003/wordml&quot; xmlns:wx=&quot;http://schemas.microsoft.com/office/word/2003/auxHint&quot; xmlns:wne=&quot;http://schemas.microsoft.com/office/word/2006/wordml&quot; xmlns:wsp=&quot;http://schemas.microsoft.com/office/word/2003/wordml/sp2&quot; xmlns:sl=&quot;http://schemas.microsoft.com/schemaLibrary/2003/core&quot; w:macrosPresent=&quot;no&quot; w:embeddedObjPresent=&quot;no&quot; w:ocxPresent=&quot;no&quot; xml:space=&quot;preserve&quot;&gt;&lt;w:ignoreSubtree w:val=&quot;http://schemas.microsoft.com/office/word/2003/wordml/sp2&quot;/&gt;&lt;o:DocumentProperties&gt;&lt;o:Version&gt;16&lt;/o:Version&gt;&lt;/o:DocumentProperties&gt;&lt;w:docPr&gt;&lt;w:view w:val=&quot;print&quot;/&gt;&lt;w:zoom w:percent=&quot;100&quot;/&gt;&lt;w:doNotEmbedSystemFonts/&gt;&lt;w:activeWritingStyle w:lang=&quot;EN-AU&quot; w:vendorID=&quot;64&quot; w:dllVersion=&quot;6&quot; w:nlCheck=&quot;on&quot; w:optionSet=&quot;1&quot;/&gt;&lt;w:activeWritingStyle w:lang=&quot;EN-GB&quot; w:vendorID=&quot;64&quot; w:dllVersion=&quot;6&quot; w:nlCheck=&quot;on&quot; w:optionSet=&quot;1&quot;/&gt;&lt;w:activeWritingStyle w:lang=&quot;EN-US&quot; w:vendorID=&quot;64&quot; w:dllVersion=&quot;6&quot; w:nlCheck=&quot;on&quot; w:optionSet=&quot;1&quot;/&gt;&lt;w:activeWritingStyle w:lang=&quot;EN-AU&quot; w:vendorID=&quot;64&quot; w:dllVersion=&quot;0&quot; w:nlCheck=&quot;on&quot; w:optionSet=&quot;0&quot;/&gt;&lt;w:activeWritingStyle w:lang=&quot;EN-GB&quot; w:vendorID=&quot;64&quot; w:dllVersion=&quot;0&quot; w:nlCheck=&quot;on&quot; w:optionSet=&quot;0&quot;/&gt;&lt;w:activeWritingStyle w:lang=&quot;EN-US&quot; w:vendorID=&quot;64&quot; w:dllVersion=&quot;0&quot; w:nlCheck=&quot;on&quot; w:optionSet=&quot;0&quot;/&gt;&lt;w:activeWritingStyle w:lang=&quot;ES-AR&quot; w:vendorID=&quot;64&quot; w:dllVersion=&quot;0&quot; w:nlCheck=&quot;on&quot; w:optionSet=&quot;0&quot;/&gt;&lt;w:activeWritingStyle w:lang=&quot;580A&quot; w:vendorID=&quot;64&quot; w:dllVersion=&quot;0&quot; w:nlCheck=&quot;on&quot; w:optionSet=&quot;0&quot;/&gt;&lt;w:activeWritingStyle w:lang=&quot;PT-BR&quot; w:vendorID=&quot;64&quot; w:dllVersion=&quot;0&quot; w:nlCheck=&quot;on&quot; w:optionSet=&quot;0&quot;/&gt;&lt;w:stylePaneFormatFilter w:val=&quot;3F01&quot;/&gt;&lt;w:defaultTabStop w:val=&quot;720&quot;/&gt;&lt;w:hyphenationZone w:val=&quot;425&quot;/&gt;&lt;w:characterSpacingControl w:val=&quot;DontCompress&quot;/&gt;&lt;w:optimizeForBrowser/&gt;&lt;w:validateAgainstSchema/&gt;&lt;w:saveInvalidXML w:val=&quot;off&quot;/&gt;&lt;w:ignoreMixedContent w:val=&quot;off&quot;/&gt;&lt;w:alwaysShowPlaceholderText w:val=&quot;off&quot;/&gt;&lt;w:compat&gt;&lt;w:breakWrappedTables/&gt;&lt;w:snapToGridInCell/&gt;&lt;w:applyBreakingRules/&gt;&lt;w:wrapTextWithPunct/&gt;&lt;w:useAsianBreakRules/&gt;&lt;w:useWord2002TableStyleRules/&gt;&lt;w:useFELayout/&gt;&lt;/w:compat&gt;&lt;wsp:rsids&gt;&lt;wsp:rsidRoot wsp:val=&quot;00426FBB&quot;/&gt;&lt;wsp:rsid wsp:val=&quot;000002E1&quot;/&gt;&lt;wsp:rsid wsp:val=&quot;00003C97&quot;/&gt;&lt;wsp:rsid wsp:val=&quot;00005565&quot;/&gt;&lt;wsp:rsid wsp:val=&quot;0001754A&quot;/&gt;&lt;wsp:rsid wsp:val=&quot;00017719&quot;/&gt;&lt;wsp:rsid wsp:val=&quot;00027F1D&quot;/&gt;&lt;wsp:rsid wsp:val=&quot;0003296C&quot;/&gt;&lt;wsp:rsid wsp:val=&quot;0003351F&quot;/&gt;&lt;wsp:rsid wsp:val=&quot;00044599&quot;/&gt;&lt;wsp:rsid wsp:val=&quot;000540E6&quot;/&gt;&lt;wsp:rsid wsp:val=&quot;00054421&quot;/&gt;&lt;wsp:rsid wsp:val=&quot;00062E46&quot;/&gt;&lt;wsp:rsid wsp:val=&quot;00072A44&quot;/&gt;&lt;wsp:rsid wsp:val=&quot;00074AC8&quot;/&gt;&lt;wsp:rsid wsp:val=&quot;00081408&quot;/&gt;&lt;wsp:rsid wsp:val=&quot;00081EBE&quot;/&gt;&lt;wsp:rsid wsp:val=&quot;00086EDC&quot;/&gt;&lt;wsp:rsid wsp:val=&quot;000B1236&quot;/&gt;&lt;wsp:rsid wsp:val=&quot;000B36A3&quot;/&gt;&lt;wsp:rsid wsp:val=&quot;000C013C&quot;/&gt;&lt;wsp:rsid wsp:val=&quot;000E3F84&quot;/&gt;&lt;wsp:rsid wsp:val=&quot;001056DF&quot;/&gt;&lt;wsp:rsid wsp:val=&quot;0010789C&quot;/&gt;&lt;wsp:rsid wsp:val=&quot;00114025&quot;/&gt;&lt;wsp:rsid wsp:val=&quot;001160D2&quot;/&gt;&lt;wsp:rsid wsp:val=&quot;00120636&quot;/&gt;&lt;wsp:rsid wsp:val=&quot;001348A5&quot;/&gt;&lt;wsp:rsid wsp:val=&quot;00151B8E&quot;/&gt;&lt;wsp:rsid wsp:val=&quot;00182170&quot;/&gt;&lt;wsp:rsid wsp:val=&quot;001928FB&quot;/&gt;&lt;wsp:rsid wsp:val=&quot;00192BC7&quot;/&gt;&lt;wsp:rsid wsp:val=&quot;00195BE6&quot;/&gt;&lt;wsp:rsid wsp:val=&quot;001A50EA&quot;/&gt;&lt;wsp:rsid wsp:val=&quot;001F16CD&quot;/&gt;&lt;wsp:rsid wsp:val=&quot;001F47D2&quot;/&gt;&lt;wsp:rsid wsp:val=&quot;002029C8&quot;/&gt;&lt;wsp:rsid wsp:val=&quot;0022285A&quot;/&gt;&lt;wsp:rsid wsp:val=&quot;00224C61&quot;/&gt;&lt;wsp:rsid wsp:val=&quot;00256ABC&quot;/&gt;&lt;wsp:rsid wsp:val=&quot;0027227B&quot;/&gt;&lt;wsp:rsid wsp:val=&quot;00273AC7&quot;/&gt;&lt;wsp:rsid wsp:val=&quot;00273D2C&quot;/&gt;&lt;wsp:rsid wsp:val=&quot;00285ECD&quot;/&gt;&lt;wsp:rsid wsp:val=&quot;00290E1B&quot;/&gt;&lt;wsp:rsid wsp:val=&quot;00291B17&quot;/&gt;&lt;wsp:rsid wsp:val=&quot;00291BB3&quot;/&gt;&lt;wsp:rsid wsp:val=&quot;002A6742&quot;/&gt;&lt;wsp:rsid wsp:val=&quot;002C1A7F&quot;/&gt;&lt;wsp:rsid wsp:val=&quot;002C4239&quot;/&gt;&lt;wsp:rsid wsp:val=&quot;002C559D&quot;/&gt;&lt;wsp:rsid wsp:val=&quot;002D16AE&quot;/&gt;&lt;wsp:rsid wsp:val=&quot;002D2D42&quot;/&gt;&lt;wsp:rsid wsp:val=&quot;002F72D0&quot;/&gt;&lt;wsp:rsid wsp:val=&quot;002F7A4F&quot;/&gt;&lt;wsp:rsid wsp:val=&quot;003003AB&quot;/&gt;&lt;wsp:rsid wsp:val=&quot;00302C35&quot;/&gt;&lt;wsp:rsid wsp:val=&quot;00311C49&quot;/&gt;&lt;wsp:rsid wsp:val=&quot;0032119E&quot;/&gt;&lt;wsp:rsid wsp:val=&quot;00321304&quot;/&gt;&lt;wsp:rsid wsp:val=&quot;00324FC2&quot;/&gt;&lt;wsp:rsid wsp:val=&quot;003312CA&quot;/&gt;&lt;wsp:rsid wsp:val=&quot;00331F84&quot;/&gt;&lt;wsp:rsid wsp:val=&quot;0037721F&quot;/&gt;&lt;wsp:rsid wsp:val=&quot;003950A4&quot;/&gt;&lt;wsp:rsid wsp:val=&quot;003A1E7E&quot;/&gt;&lt;wsp:rsid wsp:val=&quot;003E2FDC&quot;/&gt;&lt;wsp:rsid wsp:val=&quot;003E3577&quot;/&gt;&lt;wsp:rsid wsp:val=&quot;003F3A61&quot;/&gt;&lt;wsp:rsid wsp:val=&quot;00410A5D&quot;/&gt;&lt;wsp:rsid wsp:val=&quot;00414909&quot;/&gt;&lt;wsp:rsid wsp:val=&quot;00416537&quot;/&gt;&lt;wsp:rsid wsp:val=&quot;00425A6A&quot;/&gt;&lt;wsp:rsid wsp:val=&quot;00426FBB&quot;/&gt;&lt;wsp:rsid wsp:val=&quot;00454542&quot;/&gt;&lt;wsp:rsid wsp:val=&quot;0047429A&quot;/&gt;&lt;wsp:rsid wsp:val=&quot;0048374C&quot;/&gt;&lt;wsp:rsid wsp:val=&quot;0048771D&quot;/&gt;&lt;wsp:rsid wsp:val=&quot;004A6605&quot;/&gt;&lt;wsp:rsid wsp:val=&quot;004C45FA&quot;/&gt;&lt;wsp:rsid wsp:val=&quot;004D35A3&quot;/&gt;&lt;wsp:rsid wsp:val=&quot;004E1BD8&quot;/&gt;&lt;wsp:rsid wsp:val=&quot;004E452A&quot;/&gt;&lt;wsp:rsid wsp:val=&quot;004E78E3&quot;/&gt;&lt;wsp:rsid wsp:val=&quot;004F2BFE&quot;/&gt;&lt;wsp:rsid wsp:val=&quot;004F63D3&quot;/&gt;&lt;wsp:rsid wsp:val=&quot;004F7DCF&quot;/&gt;&lt;wsp:rsid wsp:val=&quot;005004BF&quot;/&gt;&lt;wsp:rsid wsp:val=&quot;00502E89&quot;/&gt;&lt;wsp:rsid wsp:val=&quot;00506CFE&quot;/&gt;&lt;wsp:rsid wsp:val=&quot;00510E95&quot;/&gt;&lt;wsp:rsid wsp:val=&quot;005225C3&quot;/&gt;&lt;wsp:rsid wsp:val=&quot;00527D56&quot;/&gt;&lt;wsp:rsid wsp:val=&quot;0053221F&quot;/&gt;&lt;wsp:rsid wsp:val=&quot;00536FAE&quot;/&gt;&lt;wsp:rsid wsp:val=&quot;00542C85&quot;/&gt;&lt;wsp:rsid wsp:val=&quot;00553510&quot;/&gt;&lt;wsp:rsid wsp:val=&quot;00554186&quot;/&gt;&lt;wsp:rsid wsp:val=&quot;00585769&quot;/&gt;&lt;wsp:rsid wsp:val=&quot;00585C61&quot;/&gt;&lt;wsp:rsid wsp:val=&quot;00591130&quot;/&gt;&lt;wsp:rsid wsp:val=&quot;005A3F28&quot;/&gt;&lt;wsp:rsid wsp:val=&quot;005A40BE&quot;/&gt;&lt;wsp:rsid wsp:val=&quot;005B13E2&quot;/&gt;&lt;wsp:rsid wsp:val=&quot;005B47D7&quot;/&gt;&lt;wsp:rsid wsp:val=&quot;005C5526&quot;/&gt;&lt;wsp:rsid wsp:val=&quot;005C62C6&quot;/&gt;&lt;wsp:rsid wsp:val=&quot;005D7B9E&quot;/&gt;&lt;wsp:rsid wsp:val=&quot;005E112E&quot;/&gt;&lt;wsp:rsid wsp:val=&quot;005F0834&quot;/&gt;&lt;wsp:rsid wsp:val=&quot;005F68AB&quot;/&gt;&lt;wsp:rsid wsp:val=&quot;005F6DC3&quot;/&gt;&lt;wsp:rsid wsp:val=&quot;00601A8E&quot;/&gt;&lt;wsp:rsid wsp:val=&quot;0062033E&quot;/&gt;&lt;wsp:rsid wsp:val=&quot;00624482&quot;/&gt;&lt;wsp:rsid wsp:val=&quot;0064799C&quot;/&gt;&lt;wsp:rsid wsp:val=&quot;00654156&quot;/&gt;&lt;wsp:rsid wsp:val=&quot;00656ADC&quot;/&gt;&lt;wsp:rsid wsp:val=&quot;006B47CA&quot;/&gt;&lt;wsp:rsid wsp:val=&quot;006C304C&quot;/&gt;&lt;wsp:rsid wsp:val=&quot;006C4511&quot;/&gt;&lt;wsp:rsid wsp:val=&quot;006C65F5&quot;/&gt;&lt;wsp:rsid wsp:val=&quot;006C7AAA&quot;/&gt;&lt;wsp:rsid wsp:val=&quot;006D1C2A&quot;/&gt;&lt;wsp:rsid wsp:val=&quot;006D264F&quot;/&gt;&lt;wsp:rsid wsp:val=&quot;006D4E89&quot;/&gt;&lt;wsp:rsid wsp:val=&quot;006E2A8D&quot;/&gt;&lt;wsp:rsid wsp:val=&quot;006E7574&quot;/&gt;&lt;wsp:rsid wsp:val=&quot;00703430&quot;/&gt;&lt;wsp:rsid wsp:val=&quot;00703548&quot;/&gt;&lt;wsp:rsid wsp:val=&quot;00704E18&quot;/&gt;&lt;wsp:rsid wsp:val=&quot;007069BE&quot;/&gt;&lt;wsp:rsid wsp:val=&quot;00745C86&quot;/&gt;&lt;wsp:rsid wsp:val=&quot;00764603&quot;/&gt;&lt;wsp:rsid wsp:val=&quot;0076604D&quot;/&gt;&lt;wsp:rsid wsp:val=&quot;00790909&quot;/&gt;&lt;wsp:rsid wsp:val=&quot;007B1582&quot;/&gt;&lt;wsp:rsid wsp:val=&quot;007B5A07&quot;/&gt;&lt;wsp:rsid wsp:val=&quot;007C065D&quot;/&gt;&lt;wsp:rsid wsp:val=&quot;007D3E71&quot;/&gt;&lt;wsp:rsid wsp:val=&quot;007E5D6A&quot;/&gt;&lt;wsp:rsid wsp:val=&quot;007E645D&quot;/&gt;&lt;wsp:rsid wsp:val=&quot;007F75CA&quot;/&gt;&lt;wsp:rsid wsp:val=&quot;00821E08&quot;/&gt;&lt;wsp:rsid wsp:val=&quot;00834EFD&quot;/&gt;&lt;wsp:rsid wsp:val=&quot;00844B24&quot;/&gt;&lt;wsp:rsid wsp:val=&quot;0084515F&quot;/&gt;&lt;wsp:rsid wsp:val=&quot;0085092D&quot;/&gt;&lt;wsp:rsid wsp:val=&quot;00865414&quot;/&gt;&lt;wsp:rsid wsp:val=&quot;00877D4C&quot;/&gt;&lt;wsp:rsid wsp:val=&quot;00883903&quot;/&gt;&lt;wsp:rsid wsp:val=&quot;0089763B&quot;/&gt;&lt;wsp:rsid wsp:val=&quot;008B6AE3&quot;/&gt;&lt;wsp:rsid wsp:val=&quot;008C1332&quot;/&gt;&lt;wsp:rsid wsp:val=&quot;008D1045&quot;/&gt;&lt;wsp:rsid wsp:val=&quot;008E5996&quot;/&gt;&lt;wsp:rsid wsp:val=&quot;00901AE1&quot;/&gt;&lt;wsp:rsid wsp:val=&quot;00912F93&quot;/&gt;&lt;wsp:rsid wsp:val=&quot;009205B4&quot;/&gt;&lt;wsp:rsid wsp:val=&quot;00955B59&quot;/&gt;&lt;wsp:rsid wsp:val=&quot;00992262&quot;/&gt;&lt;wsp:rsid wsp:val=&quot;009926BC&quot;/&gt;&lt;wsp:rsid wsp:val=&quot;009A4319&quot;/&gt;&lt;wsp:rsid wsp:val=&quot;009A6C3F&quot;/&gt;&lt;wsp:rsid wsp:val=&quot;009B73F2&quot;/&gt;&lt;wsp:rsid wsp:val=&quot;009C12BD&quot;/&gt;&lt;wsp:rsid wsp:val=&quot;009C50FE&quot;/&gt;&lt;wsp:rsid wsp:val=&quot;009E49DD&quot;/&gt;&lt;wsp:rsid wsp:val=&quot;00A03E75&quot;/&gt;&lt;wsp:rsid wsp:val=&quot;00A20627&quot;/&gt;&lt;wsp:rsid wsp:val=&quot;00A22FE9&quot;/&gt;&lt;wsp:rsid wsp:val=&quot;00A31A44&quot;/&gt;&lt;wsp:rsid wsp:val=&quot;00A32BFA&quot;/&gt;&lt;wsp:rsid wsp:val=&quot;00A3325E&quot;/&gt;&lt;wsp:rsid wsp:val=&quot;00A45FCE&quot;/&gt;&lt;wsp:rsid wsp:val=&quot;00A75671&quot;/&gt;&lt;wsp:rsid wsp:val=&quot;00A773CC&quot;/&gt;&lt;wsp:rsid wsp:val=&quot;00A924D0&quot;/&gt;&lt;wsp:rsid wsp:val=&quot;00A9318B&quot;/&gt;&lt;wsp:rsid wsp:val=&quot;00A94AC1&quot;/&gt;&lt;wsp:rsid wsp:val=&quot;00AB18B7&quot;/&gt;&lt;wsp:rsid wsp:val=&quot;00AD335D&quot;/&gt;&lt;wsp:rsid wsp:val=&quot;00AF114C&quot;/&gt;&lt;wsp:rsid wsp:val=&quot;00AF792B&quot;/&gt;&lt;wsp:rsid wsp:val=&quot;00B33D2F&quot;/&gt;&lt;wsp:rsid wsp:val=&quot;00B40A5B&quot;/&gt;&lt;wsp:rsid wsp:val=&quot;00B45C6B&quot;/&gt;&lt;wsp:rsid wsp:val=&quot;00B55D5E&quot;/&gt;&lt;wsp:rsid wsp:val=&quot;00B57A80&quot;/&gt;&lt;wsp:rsid wsp:val=&quot;00B70E9C&quot;/&gt;&lt;wsp:rsid wsp:val=&quot;00B713D8&quot;/&gt;&lt;wsp:rsid wsp:val=&quot;00B72979&quot;/&gt;&lt;wsp:rsid wsp:val=&quot;00B94516&quot;/&gt;&lt;wsp:rsid wsp:val=&quot;00BA25E2&quot;/&gt;&lt;wsp:rsid wsp:val=&quot;00BB2855&quot;/&gt;&lt;wsp:rsid wsp:val=&quot;00BC5343&quot;/&gt;&lt;wsp:rsid wsp:val=&quot;00BD19C1&quot;/&gt;&lt;wsp:rsid wsp:val=&quot;00BD25B8&quot;/&gt;&lt;wsp:rsid wsp:val=&quot;00C012E1&quot;/&gt;&lt;wsp:rsid wsp:val=&quot;00C06BB4&quot;/&gt;&lt;wsp:rsid wsp:val=&quot;00C10D20&quot;/&gt;&lt;wsp:rsid wsp:val=&quot;00C12E0C&quot;/&gt;&lt;wsp:rsid wsp:val=&quot;00C21916&quot;/&gt;&lt;wsp:rsid wsp:val=&quot;00C34915&quot;/&gt;&lt;wsp:rsid wsp:val=&quot;00C457CA&quot;/&gt;&lt;wsp:rsid wsp:val=&quot;00C53FB6&quot;/&gt;&lt;wsp:rsid wsp:val=&quot;00C57FB7&quot;/&gt;&lt;wsp:rsid wsp:val=&quot;00C644D4&quot;/&gt;&lt;wsp:rsid wsp:val=&quot;00C65F3F&quot;/&gt;&lt;wsp:rsid wsp:val=&quot;00C72414&quot;/&gt;&lt;wsp:rsid wsp:val=&quot;00C72B1A&quot;/&gt;&lt;wsp:rsid wsp:val=&quot;00C8667B&quot;/&gt;&lt;wsp:rsid wsp:val=&quot;00C90993&quot;/&gt;&lt;wsp:rsid wsp:val=&quot;00CA4CE3&quot;/&gt;&lt;wsp:rsid wsp:val=&quot;00CC72FD&quot;/&gt;&lt;wsp:rsid wsp:val=&quot;00CD4F3F&quot;/&gt;&lt;wsp:rsid wsp:val=&quot;00D311F8&quot;/&gt;&lt;wsp:rsid wsp:val=&quot;00D31660&quot;/&gt;&lt;wsp:rsid wsp:val=&quot;00D36B52&quot;/&gt;&lt;wsp:rsid wsp:val=&quot;00D377C8&quot;/&gt;&lt;wsp:rsid wsp:val=&quot;00D41274&quot;/&gt;&lt;wsp:rsid wsp:val=&quot;00D4229C&quot;/&gt;&lt;wsp:rsid wsp:val=&quot;00D43BF3&quot;/&gt;&lt;wsp:rsid wsp:val=&quot;00D549FB&quot;/&gt;&lt;wsp:rsid wsp:val=&quot;00D767BB&quot;/&gt;&lt;wsp:rsid wsp:val=&quot;00D939B0&quot;/&gt;&lt;wsp:rsid wsp:val=&quot;00DA31A2&quot;/&gt;&lt;wsp:rsid wsp:val=&quot;00DB16E0&quot;/&gt;&lt;wsp:rsid wsp:val=&quot;00DB2DF9&quot;/&gt;&lt;wsp:rsid wsp:val=&quot;00DB465D&quot;/&gt;&lt;wsp:rsid wsp:val=&quot;00DB48A2&quot;/&gt;&lt;wsp:rsid wsp:val=&quot;00DB7E63&quot;/&gt;&lt;wsp:rsid wsp:val=&quot;00DC2055&quot;/&gt;&lt;wsp:rsid wsp:val=&quot;00DC3908&quot;/&gt;&lt;wsp:rsid wsp:val=&quot;00DD71E8&quot;/&gt;&lt;wsp:rsid wsp:val=&quot;00DD7F83&quot;/&gt;&lt;wsp:rsid wsp:val=&quot;00DE4EB8&quot;/&gt;&lt;wsp:rsid wsp:val=&quot;00E0641E&quot;/&gt;&lt;wsp:rsid wsp:val=&quot;00E06664&quot;/&gt;&lt;wsp:rsid wsp:val=&quot;00E304BC&quot;/&gt;&lt;wsp:rsid wsp:val=&quot;00E32853&quot;/&gt;&lt;wsp:rsid wsp:val=&quot;00E34EBD&quot;/&gt;&lt;wsp:rsid wsp:val=&quot;00E401F8&quot;/&gt;&lt;wsp:rsid wsp:val=&quot;00E46425&quot;/&gt;&lt;wsp:rsid wsp:val=&quot;00E469FC&quot;/&gt;&lt;wsp:rsid wsp:val=&quot;00E47D0E&quot;/&gt;&lt;wsp:rsid wsp:val=&quot;00E65018&quot;/&gt;&lt;wsp:rsid wsp:val=&quot;00E76CA1&quot;/&gt;&lt;wsp:rsid wsp:val=&quot;00E94339&quot;/&gt;&lt;wsp:rsid wsp:val=&quot;00E97563&quot;/&gt;&lt;wsp:rsid wsp:val=&quot;00EB0B63&quot;/&gt;&lt;wsp:rsid wsp:val=&quot;00EC265C&quot;/&gt;&lt;wsp:rsid wsp:val=&quot;00ED61CB&quot;/&gt;&lt;wsp:rsid wsp:val=&quot;00EE752A&quot;/&gt;&lt;wsp:rsid wsp:val=&quot;00F06A72&quot;/&gt;&lt;wsp:rsid wsp:val=&quot;00F136F0&quot;/&gt;&lt;wsp:rsid wsp:val=&quot;00F20BBB&quot;/&gt;&lt;wsp:rsid wsp:val=&quot;00F36048&quot;/&gt;&lt;wsp:rsid wsp:val=&quot;00F43BD8&quot;/&gt;&lt;wsp:rsid wsp:val=&quot;00F562F3&quot;/&gt;&lt;wsp:rsid wsp:val=&quot;00F74B89&quot;/&gt;&lt;wsp:rsid wsp:val=&quot;00F75133&quot;/&gt;&lt;wsp:rsid wsp:val=&quot;00F83272&quot;/&gt;&lt;wsp:rsid wsp:val=&quot;00F9358D&quot;/&gt;&lt;wsp:rsid wsp:val=&quot;00FA3899&quot;/&gt;&lt;wsp:rsid wsp:val=&quot;00FA4909&quot;/&gt;&lt;wsp:rsid wsp:val=&quot;00FA5164&quot;/&gt;&lt;wsp:rsid wsp:val=&quot;00FA6751&quot;/&gt;&lt;wsp:rsid wsp:val=&quot;00FA6BD7&quot;/&gt;&lt;wsp:rsid wsp:val=&quot;00FB1048&quot;/&gt;&lt;wsp:rsid wsp:val=&quot;00FB62C4&quot;/&gt;&lt;wsp:rsid wsp:val=&quot;00FB7701&quot;/&gt;&lt;wsp:rsid wsp:val=&quot;00FD1AC5&quot;/&gt;&lt;wsp:rsid wsp:val=&quot;00FD5CF0&quot;/&gt;&lt;/wsp:rsids&gt;&lt;/w:docPr&gt;&lt;w:body&gt;&lt;wx:sect&gt;&lt;w:p wsp:rsidR=&quot;00072A44&quot; wsp:rsidRPr=&quot;00072A44&quot; wsp:rsidRDefault=&quot;00072A44&quot; wsp:rsidP=&quot;00072A44&quot;&gt;&lt;m:oMathPara&gt;&lt;m:oMath&gt;&lt;m:sSub&gt;&lt;m:sSubPr&gt;&lt;m:ctrlPr&gt;&lt;w:rPr&gt;&lt;w:rFonts w:ascii=&quot;Cambria Math&quot; w:h-ansi=&quot;Cambria Math&quot;/&gt;&lt;wx:font wx:val=&quot;Cambria Math&quot;/&gt;&lt;w:i/&gt;&lt;/w:rPr&gt;&lt;/m:ctrlPr&gt;&lt;/m:sSubPr&gt;&lt;m:e&gt;&lt;m:r&gt;&lt;w:rPr&gt;&lt;w:rFonts w:ascii=&quot;Cambria Math&quot; w:h-ansi=&quot;Cambria Math&quot;/&gt;&lt;wx:font wx:val=&quot;Cambria Math&quot;/&gt;&lt;w:i/&gt;&lt;/w:rPr&gt;&lt;m:t&gt;V&lt;/m:t&gt;&lt;/m:r&gt;&lt;/m:e&gt;&lt;m:sub&gt;&lt;m:r&gt;&lt;w:rPr&gt;&lt;w:rFonts w:ascii=&quot;Cambria Math&quot; w:h-ansi=&quot;Cambria Math&quot;/&gt;&lt;wx:font wx:val=&quot;Cambria Math&quot;/&gt;&lt;w:i/&gt;&lt;/w:rPr&gt;&lt;m:t&gt;out&lt;/m:t&gt;&lt;/m:r&gt;&lt;/m:sub&gt;&lt;/m:sSub&gt;&lt;/m:oMath&gt;&lt;/m:oMathPara&gt;&lt;/w:p&gt;&lt;w:sectPr wsp:rsidR=&quot;00000000&quot; wsp:rsidRPr=&quot;00072A44&quot;&gt;&lt;w:pgSz w:w=&quot;12240&quot; w:h=&quot;15840&quot;/&gt;&lt;w:pgMar w:top=&quot;1440&quot; w:right=&quot;1440&quot; w:bottom=&quot;1440&quot; w:left=&quot;1440&quot; w:header=&quot;720&quot; w:footer=&quot;720&quot; w:gutter=&quot;0&quot;/&gt;&lt;w:cols w:space=&quot;720&quot;/&gt;&lt;/w:sectPr&gt;&lt;/wx:sect&gt;&lt;/w:body&gt;&lt;/w:wordDocument&gt;">
+                <v:shape id="_x0000_i1043" type="#_x0000_t75" style="width:21.45pt;height:13.85pt" equationxml="&lt;?xml version=&quot;1.0&quot; encoding=&quot;UTF-8&quot; standalone=&quot;yes&quot;?&gt;&#10;&lt;?mso-application progid=&quot;Word.Document&quot;?&gt;&#10;&lt;w:wordDocument xmlns:aml=&quot;http://schemas.microsoft.com/aml/2001/core&quot; xmlns:wpc=&quot;http://schemas.microsoft.com/office/word/2010/wordprocessingCanvas&quot; xmlns:cx=&quot;http://schemas.microsoft.com/office/drawing/2014/chartex&quot; xmlns:cx1=&quot;http://schemas.microsoft.com/office/drawing/2015/9/8/chartex&quot; xmlns:cx2=&quot;http://schemas.microsoft.com/office/drawing/2015/10/21/chartex&quot; xmlns:cx3=&quot;http://schemas.microsoft.com/office/drawing/2016/5/9/chartex&quot; xmlns:cx4=&quot;http://schemas.microsoft.com/office/drawing/2016/5/10/chartex&quot; xmlns:cx5=&quot;http://schemas.microsoft.com/office/drawing/2016/5/11/chartex&quot; xmlns:cx6=&quot;http://schemas.microsoft.com/office/drawing/2016/5/12/chartex&quot; xmlns:cx7=&quot;http://schemas.microsoft.com/office/drawing/2016/5/13/chartex&quot; xmlns:cx8=&quot;http://schemas.microsoft.com/office/drawing/2016/5/14/chartex&quot; xmlns:cr=&quot;http://schemas.microsoft.com/office/comments/2020/reactions&quot; xmlns:dt=&quot;uuid:C2F41010-65B3-11d1-A29F-00AA00C14882&quot; xmlns:mc=&quot;http://schemas.openxmlformats.org/markup-compatibility/2006&quot; xmlns:aink=&quot;http://schemas.microsoft.com/office/drawing/2016/ink&quot; xmlns:am3d=&quot;http://schemas.microsoft.com/office/drawing/2017/model3d&quot; xmlns:o=&quot;urn:schemas-microsoft-com:office:office&quot; xmlns:oel=&quot;http://schemas.microsoft.com/office/2019/extlst&quot; xmlns:m=&quot;http://schemas.openxmlformats.org/officeDocument/2006/math&quot; xmlns:v=&quot;urn:schemas-microsoft-com:vml&quot; xmlns:w10=&quot;urn:schemas-microsoft-com:office:word&quot; xmlns:w=&quot;http://schemas.microsoft.com/office/word/2003/wordml&quot; xmlns:wx=&quot;http://schemas.microsoft.com/office/word/2003/auxHint&quot; xmlns:wne=&quot;http://schemas.microsoft.com/office/word/2006/wordml&quot; xmlns:wsp=&quot;http://schemas.microsoft.com/office/word/2003/wordml/sp2&quot; xmlns:sl=&quot;http://schemas.microsoft.com/schemaLibrary/2003/core&quot; w:macrosPresent=&quot;no&quot; w:embeddedObjPresent=&quot;no&quot; w:ocxPresent=&quot;no&quot; xml:space=&quot;preserve&quot;&gt;&lt;w:ignoreSubtree w:val=&quot;http://schemas.microsoft.com/office/word/2003/wordml/sp2&quot;/&gt;&lt;o:DocumentProperties&gt;&lt;o:Version&gt;16&lt;/o:Version&gt;&lt;/o:DocumentProperties&gt;&lt;w:docPr&gt;&lt;w:view w:val=&quot;print&quot;/&gt;&lt;w:zoom w:percent=&quot;100&quot;/&gt;&lt;w:doNotEmbedSystemFonts/&gt;&lt;w:activeWritingStyle w:lang=&quot;EN-AU&quot; w:vendorID=&quot;64&quot; w:dllVersion=&quot;6&quot; w:nlCheck=&quot;on&quot; w:optionSet=&quot;1&quot;/&gt;&lt;w:activeWritingStyle w:lang=&quot;EN-GB&quot; w:vendorID=&quot;64&quot; w:dllVersion=&quot;6&quot; w:nlCheck=&quot;on&quot; w:optionSet=&quot;1&quot;/&gt;&lt;w:activeWritingStyle w:lang=&quot;EN-US&quot; w:vendorID=&quot;64&quot; w:dllVersion=&quot;6&quot; w:nlCheck=&quot;on&quot; w:optionSet=&quot;1&quot;/&gt;&lt;w:activeWritingStyle w:lang=&quot;EN-AU&quot; w:vendorID=&quot;64&quot; w:dllVersion=&quot;0&quot; w:nlCheck=&quot;on&quot; w:optionSet=&quot;0&quot;/&gt;&lt;w:activeWritingStyle w:lang=&quot;EN-GB&quot; w:vendorID=&quot;64&quot; w:dllVersion=&quot;0&quot; w:nlCheck=&quot;on&quot; w:optionSet=&quot;0&quot;/&gt;&lt;w:activeWritingStyle w:lang=&quot;EN-US&quot; w:vendorID=&quot;64&quot; w:dllVersion=&quot;0&quot; w:nlCheck=&quot;on&quot; w:optionSet=&quot;0&quot;/&gt;&lt;w:activeWritingStyle w:lang=&quot;ES-AR&quot; w:vendorID=&quot;64&quot; w:dllVersion=&quot;0&quot; w:nlCheck=&quot;on&quot; w:optionSet=&quot;0&quot;/&gt;&lt;w:activeWritingStyle w:lang=&quot;580A&quot; w:vendorID=&quot;64&quot; w:dllVersion=&quot;0&quot; w:nlCheck=&quot;on&quot; w:optionSet=&quot;0&quot;/&gt;&lt;w:activeWritingStyle w:lang=&quot;PT-BR&quot; w:vendorID=&quot;64&quot; w:dllVersion=&quot;0&quot; w:nlCheck=&quot;on&quot; w:optionSet=&quot;0&quot;/&gt;&lt;w:stylePaneFormatFilter w:val=&quot;3F01&quot;/&gt;&lt;w:defaultTabStop w:val=&quot;720&quot;/&gt;&lt;w:hyphenationZone w:val=&quot;425&quot;/&gt;&lt;w:characterSpacingControl w:val=&quot;DontCompress&quot;/&gt;&lt;w:optimizeForBrowser/&gt;&lt;w:validateAgainstSchema/&gt;&lt;w:saveInvalidXML w:val=&quot;off&quot;/&gt;&lt;w:ignoreMixedContent w:val=&quot;off&quot;/&gt;&lt;w:alwaysShowPlaceholderText w:val=&quot;off&quot;/&gt;&lt;w:compat&gt;&lt;w:breakWrappedTables/&gt;&lt;w:snapToGridInCell/&gt;&lt;w:applyBreakingRules/&gt;&lt;w:wrapTextWithPunct/&gt;&lt;w:useAsianBreakRules/&gt;&lt;w:useWord2002TableStyleRules/&gt;&lt;w:useFELayout/&gt;&lt;/w:compat&gt;&lt;wsp:rsids&gt;&lt;wsp:rsidRoot wsp:val=&quot;00426FBB&quot;/&gt;&lt;wsp:rsid wsp:val=&quot;000002E1&quot;/&gt;&lt;wsp:rsid wsp:val=&quot;00003C97&quot;/&gt;&lt;wsp:rsid wsp:val=&quot;00005565&quot;/&gt;&lt;wsp:rsid wsp:val=&quot;0001754A&quot;/&gt;&lt;wsp:rsid wsp:val=&quot;00017719&quot;/&gt;&lt;wsp:rsid wsp:val=&quot;00027F1D&quot;/&gt;&lt;wsp:rsid wsp:val=&quot;0003296C&quot;/&gt;&lt;wsp:rsid wsp:val=&quot;0003351F&quot;/&gt;&lt;wsp:rsid wsp:val=&quot;00044599&quot;/&gt;&lt;wsp:rsid wsp:val=&quot;000540E6&quot;/&gt;&lt;wsp:rsid wsp:val=&quot;00054421&quot;/&gt;&lt;wsp:rsid wsp:val=&quot;00062E46&quot;/&gt;&lt;wsp:rsid wsp:val=&quot;00072A44&quot;/&gt;&lt;wsp:rsid wsp:val=&quot;00074AC8&quot;/&gt;&lt;wsp:rsid wsp:val=&quot;00081408&quot;/&gt;&lt;wsp:rsid wsp:val=&quot;00081EBE&quot;/&gt;&lt;wsp:rsid wsp:val=&quot;00086EDC&quot;/&gt;&lt;wsp:rsid wsp:val=&quot;000B1236&quot;/&gt;&lt;wsp:rsid wsp:val=&quot;000B36A3&quot;/&gt;&lt;wsp:rsid wsp:val=&quot;000C013C&quot;/&gt;&lt;wsp:rsid wsp:val=&quot;000E3F84&quot;/&gt;&lt;wsp:rsid wsp:val=&quot;001056DF&quot;/&gt;&lt;wsp:rsid wsp:val=&quot;0010789C&quot;/&gt;&lt;wsp:rsid wsp:val=&quot;00114025&quot;/&gt;&lt;wsp:rsid wsp:val=&quot;001160D2&quot;/&gt;&lt;wsp:rsid wsp:val=&quot;00120636&quot;/&gt;&lt;wsp:rsid wsp:val=&quot;001348A5&quot;/&gt;&lt;wsp:rsid wsp:val=&quot;00151B8E&quot;/&gt;&lt;wsp:rsid wsp:val=&quot;00182170&quot;/&gt;&lt;wsp:rsid wsp:val=&quot;001928FB&quot;/&gt;&lt;wsp:rsid wsp:val=&quot;00192BC7&quot;/&gt;&lt;wsp:rsid wsp:val=&quot;00195BE6&quot;/&gt;&lt;wsp:rsid wsp:val=&quot;001A50EA&quot;/&gt;&lt;wsp:rsid wsp:val=&quot;001F16CD&quot;/&gt;&lt;wsp:rsid wsp:val=&quot;001F47D2&quot;/&gt;&lt;wsp:rsid wsp:val=&quot;002029C8&quot;/&gt;&lt;wsp:rsid wsp:val=&quot;0022285A&quot;/&gt;&lt;wsp:rsid wsp:val=&quot;00224C61&quot;/&gt;&lt;wsp:rsid wsp:val=&quot;00256ABC&quot;/&gt;&lt;wsp:rsid wsp:val=&quot;0027227B&quot;/&gt;&lt;wsp:rsid wsp:val=&quot;00273AC7&quot;/&gt;&lt;wsp:rsid wsp:val=&quot;00273D2C&quot;/&gt;&lt;wsp:rsid wsp:val=&quot;00285ECD&quot;/&gt;&lt;wsp:rsid wsp:val=&quot;00290E1B&quot;/&gt;&lt;wsp:rsid wsp:val=&quot;00291B17&quot;/&gt;&lt;wsp:rsid wsp:val=&quot;00291BB3&quot;/&gt;&lt;wsp:rsid wsp:val=&quot;002A6742&quot;/&gt;&lt;wsp:rsid wsp:val=&quot;002C1A7F&quot;/&gt;&lt;wsp:rsid wsp:val=&quot;002C4239&quot;/&gt;&lt;wsp:rsid wsp:val=&quot;002C559D&quot;/&gt;&lt;wsp:rsid wsp:val=&quot;002D16AE&quot;/&gt;&lt;wsp:rsid wsp:val=&quot;002D2D42&quot;/&gt;&lt;wsp:rsid wsp:val=&quot;002F72D0&quot;/&gt;&lt;wsp:rsid wsp:val=&quot;002F7A4F&quot;/&gt;&lt;wsp:rsid wsp:val=&quot;003003AB&quot;/&gt;&lt;wsp:rsid wsp:val=&quot;00302C35&quot;/&gt;&lt;wsp:rsid wsp:val=&quot;00311C49&quot;/&gt;&lt;wsp:rsid wsp:val=&quot;0032119E&quot;/&gt;&lt;wsp:rsid wsp:val=&quot;00321304&quot;/&gt;&lt;wsp:rsid wsp:val=&quot;00324FC2&quot;/&gt;&lt;wsp:rsid wsp:val=&quot;003312CA&quot;/&gt;&lt;wsp:rsid wsp:val=&quot;00331F84&quot;/&gt;&lt;wsp:rsid wsp:val=&quot;0037721F&quot;/&gt;&lt;wsp:rsid wsp:val=&quot;003950A4&quot;/&gt;&lt;wsp:rsid wsp:val=&quot;003A1E7E&quot;/&gt;&lt;wsp:rsid wsp:val=&quot;003E2FDC&quot;/&gt;&lt;wsp:rsid wsp:val=&quot;003E3577&quot;/&gt;&lt;wsp:rsid wsp:val=&quot;003F3A61&quot;/&gt;&lt;wsp:rsid wsp:val=&quot;00410A5D&quot;/&gt;&lt;wsp:rsid wsp:val=&quot;00414909&quot;/&gt;&lt;wsp:rsid wsp:val=&quot;00416537&quot;/&gt;&lt;wsp:rsid wsp:val=&quot;00425A6A&quot;/&gt;&lt;wsp:rsid wsp:val=&quot;00426FBB&quot;/&gt;&lt;wsp:rsid wsp:val=&quot;00454542&quot;/&gt;&lt;wsp:rsid wsp:val=&quot;0047429A&quot;/&gt;&lt;wsp:rsid wsp:val=&quot;0048374C&quot;/&gt;&lt;wsp:rsid wsp:val=&quot;0048771D&quot;/&gt;&lt;wsp:rsid wsp:val=&quot;004A6605&quot;/&gt;&lt;wsp:rsid wsp:val=&quot;004C45FA&quot;/&gt;&lt;wsp:rsid wsp:val=&quot;004D35A3&quot;/&gt;&lt;wsp:rsid wsp:val=&quot;004E1BD8&quot;/&gt;&lt;wsp:rsid wsp:val=&quot;004E452A&quot;/&gt;&lt;wsp:rsid wsp:val=&quot;004E78E3&quot;/&gt;&lt;wsp:rsid wsp:val=&quot;004F2BFE&quot;/&gt;&lt;wsp:rsid wsp:val=&quot;004F63D3&quot;/&gt;&lt;wsp:rsid wsp:val=&quot;004F7DCF&quot;/&gt;&lt;wsp:rsid wsp:val=&quot;005004BF&quot;/&gt;&lt;wsp:rsid wsp:val=&quot;00502E89&quot;/&gt;&lt;wsp:rsid wsp:val=&quot;00506CFE&quot;/&gt;&lt;wsp:rsid wsp:val=&quot;00510E95&quot;/&gt;&lt;wsp:rsid wsp:val=&quot;005225C3&quot;/&gt;&lt;wsp:rsid wsp:val=&quot;00527D56&quot;/&gt;&lt;wsp:rsid wsp:val=&quot;0053221F&quot;/&gt;&lt;wsp:rsid wsp:val=&quot;00536FAE&quot;/&gt;&lt;wsp:rsid wsp:val=&quot;00542C85&quot;/&gt;&lt;wsp:rsid wsp:val=&quot;00553510&quot;/&gt;&lt;wsp:rsid wsp:val=&quot;00554186&quot;/&gt;&lt;wsp:rsid wsp:val=&quot;00585769&quot;/&gt;&lt;wsp:rsid wsp:val=&quot;00585C61&quot;/&gt;&lt;wsp:rsid wsp:val=&quot;00591130&quot;/&gt;&lt;wsp:rsid wsp:val=&quot;005A3F28&quot;/&gt;&lt;wsp:rsid wsp:val=&quot;005A40BE&quot;/&gt;&lt;wsp:rsid wsp:val=&quot;005B13E2&quot;/&gt;&lt;wsp:rsid wsp:val=&quot;005B47D7&quot;/&gt;&lt;wsp:rsid wsp:val=&quot;005C5526&quot;/&gt;&lt;wsp:rsid wsp:val=&quot;005C62C6&quot;/&gt;&lt;wsp:rsid wsp:val=&quot;005D7B9E&quot;/&gt;&lt;wsp:rsid wsp:val=&quot;005E112E&quot;/&gt;&lt;wsp:rsid wsp:val=&quot;005F0834&quot;/&gt;&lt;wsp:rsid wsp:val=&quot;005F68AB&quot;/&gt;&lt;wsp:rsid wsp:val=&quot;005F6DC3&quot;/&gt;&lt;wsp:rsid wsp:val=&quot;00601A8E&quot;/&gt;&lt;wsp:rsid wsp:val=&quot;0062033E&quot;/&gt;&lt;wsp:rsid wsp:val=&quot;00624482&quot;/&gt;&lt;wsp:rsid wsp:val=&quot;0064799C&quot;/&gt;&lt;wsp:rsid wsp:val=&quot;00654156&quot;/&gt;&lt;wsp:rsid wsp:val=&quot;00656ADC&quot;/&gt;&lt;wsp:rsid wsp:val=&quot;006B47CA&quot;/&gt;&lt;wsp:rsid wsp:val=&quot;006C304C&quot;/&gt;&lt;wsp:rsid wsp:val=&quot;006C4511&quot;/&gt;&lt;wsp:rsid wsp:val=&quot;006C65F5&quot;/&gt;&lt;wsp:rsid wsp:val=&quot;006C7AAA&quot;/&gt;&lt;wsp:rsid wsp:val=&quot;006D1C2A&quot;/&gt;&lt;wsp:rsid wsp:val=&quot;006D264F&quot;/&gt;&lt;wsp:rsid wsp:val=&quot;006D4E89&quot;/&gt;&lt;wsp:rsid wsp:val=&quot;006E2A8D&quot;/&gt;&lt;wsp:rsid wsp:val=&quot;006E7574&quot;/&gt;&lt;wsp:rsid wsp:val=&quot;00703430&quot;/&gt;&lt;wsp:rsid wsp:val=&quot;00703548&quot;/&gt;&lt;wsp:rsid wsp:val=&quot;00704E18&quot;/&gt;&lt;wsp:rsid wsp:val=&quot;007069BE&quot;/&gt;&lt;wsp:rsid wsp:val=&quot;00745C86&quot;/&gt;&lt;wsp:rsid wsp:val=&quot;00764603&quot;/&gt;&lt;wsp:rsid wsp:val=&quot;0076604D&quot;/&gt;&lt;wsp:rsid wsp:val=&quot;00790909&quot;/&gt;&lt;wsp:rsid wsp:val=&quot;007B1582&quot;/&gt;&lt;wsp:rsid wsp:val=&quot;007B5A07&quot;/&gt;&lt;wsp:rsid wsp:val=&quot;007C065D&quot;/&gt;&lt;wsp:rsid wsp:val=&quot;007D3E71&quot;/&gt;&lt;wsp:rsid wsp:val=&quot;007E5D6A&quot;/&gt;&lt;wsp:rsid wsp:val=&quot;007E645D&quot;/&gt;&lt;wsp:rsid wsp:val=&quot;007F75CA&quot;/&gt;&lt;wsp:rsid wsp:val=&quot;00821E08&quot;/&gt;&lt;wsp:rsid wsp:val=&quot;00834EFD&quot;/&gt;&lt;wsp:rsid wsp:val=&quot;00844B24&quot;/&gt;&lt;wsp:rsid wsp:val=&quot;0084515F&quot;/&gt;&lt;wsp:rsid wsp:val=&quot;0085092D&quot;/&gt;&lt;wsp:rsid wsp:val=&quot;00865414&quot;/&gt;&lt;wsp:rsid wsp:val=&quot;00877D4C&quot;/&gt;&lt;wsp:rsid wsp:val=&quot;00883903&quot;/&gt;&lt;wsp:rsid wsp:val=&quot;0089763B&quot;/&gt;&lt;wsp:rsid wsp:val=&quot;008B6AE3&quot;/&gt;&lt;wsp:rsid wsp:val=&quot;008C1332&quot;/&gt;&lt;wsp:rsid wsp:val=&quot;008D1045&quot;/&gt;&lt;wsp:rsid wsp:val=&quot;008E5996&quot;/&gt;&lt;wsp:rsid wsp:val=&quot;00901AE1&quot;/&gt;&lt;wsp:rsid wsp:val=&quot;00912F93&quot;/&gt;&lt;wsp:rsid wsp:val=&quot;009205B4&quot;/&gt;&lt;wsp:rsid wsp:val=&quot;00955B59&quot;/&gt;&lt;wsp:rsid wsp:val=&quot;00992262&quot;/&gt;&lt;wsp:rsid wsp:val=&quot;009926BC&quot;/&gt;&lt;wsp:rsid wsp:val=&quot;009A4319&quot;/&gt;&lt;wsp:rsid wsp:val=&quot;009A6C3F&quot;/&gt;&lt;wsp:rsid wsp:val=&quot;009B73F2&quot;/&gt;&lt;wsp:rsid wsp:val=&quot;009C12BD&quot;/&gt;&lt;wsp:rsid wsp:val=&quot;009C50FE&quot;/&gt;&lt;wsp:rsid wsp:val=&quot;009E49DD&quot;/&gt;&lt;wsp:rsid wsp:val=&quot;00A03E75&quot;/&gt;&lt;wsp:rsid wsp:val=&quot;00A20627&quot;/&gt;&lt;wsp:rsid wsp:val=&quot;00A22FE9&quot;/&gt;&lt;wsp:rsid wsp:val=&quot;00A31A44&quot;/&gt;&lt;wsp:rsid wsp:val=&quot;00A32BFA&quot;/&gt;&lt;wsp:rsid wsp:val=&quot;00A3325E&quot;/&gt;&lt;wsp:rsid wsp:val=&quot;00A45FCE&quot;/&gt;&lt;wsp:rsid wsp:val=&quot;00A75671&quot;/&gt;&lt;wsp:rsid wsp:val=&quot;00A773CC&quot;/&gt;&lt;wsp:rsid wsp:val=&quot;00A924D0&quot;/&gt;&lt;wsp:rsid wsp:val=&quot;00A9318B&quot;/&gt;&lt;wsp:rsid wsp:val=&quot;00A94AC1&quot;/&gt;&lt;wsp:rsid wsp:val=&quot;00AB18B7&quot;/&gt;&lt;wsp:rsid wsp:val=&quot;00AD335D&quot;/&gt;&lt;wsp:rsid wsp:val=&quot;00AF114C&quot;/&gt;&lt;wsp:rsid wsp:val=&quot;00AF792B&quot;/&gt;&lt;wsp:rsid wsp:val=&quot;00B33D2F&quot;/&gt;&lt;wsp:rsid wsp:val=&quot;00B40A5B&quot;/&gt;&lt;wsp:rsid wsp:val=&quot;00B45C6B&quot;/&gt;&lt;wsp:rsid wsp:val=&quot;00B55D5E&quot;/&gt;&lt;wsp:rsid wsp:val=&quot;00B57A80&quot;/&gt;&lt;wsp:rsid wsp:val=&quot;00B70E9C&quot;/&gt;&lt;wsp:rsid wsp:val=&quot;00B713D8&quot;/&gt;&lt;wsp:rsid wsp:val=&quot;00B72979&quot;/&gt;&lt;wsp:rsid wsp:val=&quot;00B94516&quot;/&gt;&lt;wsp:rsid wsp:val=&quot;00BA25E2&quot;/&gt;&lt;wsp:rsid wsp:val=&quot;00BB2855&quot;/&gt;&lt;wsp:rsid wsp:val=&quot;00BC5343&quot;/&gt;&lt;wsp:rsid wsp:val=&quot;00BD19C1&quot;/&gt;&lt;wsp:rsid wsp:val=&quot;00BD25B8&quot;/&gt;&lt;wsp:rsid wsp:val=&quot;00C012E1&quot;/&gt;&lt;wsp:rsid wsp:val=&quot;00C06BB4&quot;/&gt;&lt;wsp:rsid wsp:val=&quot;00C10D20&quot;/&gt;&lt;wsp:rsid wsp:val=&quot;00C12E0C&quot;/&gt;&lt;wsp:rsid wsp:val=&quot;00C21916&quot;/&gt;&lt;wsp:rsid wsp:val=&quot;00C34915&quot;/&gt;&lt;wsp:rsid wsp:val=&quot;00C457CA&quot;/&gt;&lt;wsp:rsid wsp:val=&quot;00C53FB6&quot;/&gt;&lt;wsp:rsid wsp:val=&quot;00C57FB7&quot;/&gt;&lt;wsp:rsid wsp:val=&quot;00C644D4&quot;/&gt;&lt;wsp:rsid wsp:val=&quot;00C65F3F&quot;/&gt;&lt;wsp:rsid wsp:val=&quot;00C72414&quot;/&gt;&lt;wsp:rsid wsp:val=&quot;00C72B1A&quot;/&gt;&lt;wsp:rsid wsp:val=&quot;00C8667B&quot;/&gt;&lt;wsp:rsid wsp:val=&quot;00C90993&quot;/&gt;&lt;wsp:rsid wsp:val=&quot;00CA4CE3&quot;/&gt;&lt;wsp:rsid wsp:val=&quot;00CC72FD&quot;/&gt;&lt;wsp:rsid wsp:val=&quot;00CD4F3F&quot;/&gt;&lt;wsp:rsid wsp:val=&quot;00D311F8&quot;/&gt;&lt;wsp:rsid wsp:val=&quot;00D31660&quot;/&gt;&lt;wsp:rsid wsp:val=&quot;00D36B52&quot;/&gt;&lt;wsp:rsid wsp:val=&quot;00D377C8&quot;/&gt;&lt;wsp:rsid wsp:val=&quot;00D41274&quot;/&gt;&lt;wsp:rsid wsp:val=&quot;00D4229C&quot;/&gt;&lt;wsp:rsid wsp:val=&quot;00D43BF3&quot;/&gt;&lt;wsp:rsid wsp:val=&quot;00D549FB&quot;/&gt;&lt;wsp:rsid wsp:val=&quot;00D767BB&quot;/&gt;&lt;wsp:rsid wsp:val=&quot;00D939B0&quot;/&gt;&lt;wsp:rsid wsp:val=&quot;00DA31A2&quot;/&gt;&lt;wsp:rsid wsp:val=&quot;00DB16E0&quot;/&gt;&lt;wsp:rsid wsp:val=&quot;00DB2DF9&quot;/&gt;&lt;wsp:rsid wsp:val=&quot;00DB465D&quot;/&gt;&lt;wsp:rsid wsp:val=&quot;00DB48A2&quot;/&gt;&lt;wsp:rsid wsp:val=&quot;00DB7E63&quot;/&gt;&lt;wsp:rsid wsp:val=&quot;00DC2055&quot;/&gt;&lt;wsp:rsid wsp:val=&quot;00DC3908&quot;/&gt;&lt;wsp:rsid wsp:val=&quot;00DD71E8&quot;/&gt;&lt;wsp:rsid wsp:val=&quot;00DD7F83&quot;/&gt;&lt;wsp:rsid wsp:val=&quot;00DE4EB8&quot;/&gt;&lt;wsp:rsid wsp:val=&quot;00E0641E&quot;/&gt;&lt;wsp:rsid wsp:val=&quot;00E06664&quot;/&gt;&lt;wsp:rsid wsp:val=&quot;00E304BC&quot;/&gt;&lt;wsp:rsid wsp:val=&quot;00E32853&quot;/&gt;&lt;wsp:rsid wsp:val=&quot;00E34EBD&quot;/&gt;&lt;wsp:rsid wsp:val=&quot;00E401F8&quot;/&gt;&lt;wsp:rsid wsp:val=&quot;00E46425&quot;/&gt;&lt;wsp:rsid wsp:val=&quot;00E469FC&quot;/&gt;&lt;wsp:rsid wsp:val=&quot;00E47D0E&quot;/&gt;&lt;wsp:rsid wsp:val=&quot;00E65018&quot;/&gt;&lt;wsp:rsid wsp:val=&quot;00E76CA1&quot;/&gt;&lt;wsp:rsid wsp:val=&quot;00E94339&quot;/&gt;&lt;wsp:rsid wsp:val=&quot;00E97563&quot;/&gt;&lt;wsp:rsid wsp:val=&quot;00EB0B63&quot;/&gt;&lt;wsp:rsid wsp:val=&quot;00EC265C&quot;/&gt;&lt;wsp:rsid wsp:val=&quot;00ED61CB&quot;/&gt;&lt;wsp:rsid wsp:val=&quot;00EE752A&quot;/&gt;&lt;wsp:rsid wsp:val=&quot;00F06A72&quot;/&gt;&lt;wsp:rsid wsp:val=&quot;00F136F0&quot;/&gt;&lt;wsp:rsid wsp:val=&quot;00F20BBB&quot;/&gt;&lt;wsp:rsid wsp:val=&quot;00F36048&quot;/&gt;&lt;wsp:rsid wsp:val=&quot;00F43BD8&quot;/&gt;&lt;wsp:rsid wsp:val=&quot;00F562F3&quot;/&gt;&lt;wsp:rsid wsp:val=&quot;00F74B89&quot;/&gt;&lt;wsp:rsid wsp:val=&quot;00F75133&quot;/&gt;&lt;wsp:rsid wsp:val=&quot;00F83272&quot;/&gt;&lt;wsp:rsid wsp:val=&quot;00F9358D&quot;/&gt;&lt;wsp:rsid wsp:val=&quot;00FA3899&quot;/&gt;&lt;wsp:rsid wsp:val=&quot;00FA4909&quot;/&gt;&lt;wsp:rsid wsp:val=&quot;00FA5164&quot;/&gt;&lt;wsp:rsid wsp:val=&quot;00FA6751&quot;/&gt;&lt;wsp:rsid wsp:val=&quot;00FA6BD7&quot;/&gt;&lt;wsp:rsid wsp:val=&quot;00FB1048&quot;/&gt;&lt;wsp:rsid wsp:val=&quot;00FB62C4&quot;/&gt;&lt;wsp:rsid wsp:val=&quot;00FB7701&quot;/&gt;&lt;wsp:rsid wsp:val=&quot;00FD1AC5&quot;/&gt;&lt;wsp:rsid wsp:val=&quot;00FD5CF0&quot;/&gt;&lt;/wsp:rsids&gt;&lt;/w:docPr&gt;&lt;w:body&gt;&lt;wx:sect&gt;&lt;w:p wsp:rsidR=&quot;00072A44&quot; wsp:rsidRPr=&quot;00072A44&quot; wsp:rsidRDefault=&quot;00072A44&quot; wsp:rsidP=&quot;00072A44&quot;&gt;&lt;m:oMathPara&gt;&lt;m:oMath&gt;&lt;m:sSub&gt;&lt;m:sSubPr&gt;&lt;m:ctrlPr&gt;&lt;w:rPr&gt;&lt;w:rFonts w:ascii=&quot;Cambria Math&quot; w:h-ansi=&quot;Cambria Math&quot;/&gt;&lt;wx:font wx:val=&quot;Cambria Math&quot;/&gt;&lt;w:i/&gt;&lt;/w:rPr&gt;&lt;/m:ctrlPr&gt;&lt;/m:sSubPr&gt;&lt;m:e&gt;&lt;m:r&gt;&lt;w:rPr&gt;&lt;w:rFonts w:ascii=&quot;Cambria Math&quot; w:h-ansi=&quot;Cambria Math&quot;/&gt;&lt;wx:font wx:val=&quot;Cambria Math&quot;/&gt;&lt;w:i/&gt;&lt;/w:rPr&gt;&lt;m:t&gt;V&lt;/m:t&gt;&lt;/m:r&gt;&lt;/m:e&gt;&lt;m:sub&gt;&lt;m:r&gt;&lt;w:rPr&gt;&lt;w:rFonts w:ascii=&quot;Cambria Math&quot; w:h-ansi=&quot;Cambria Math&quot;/&gt;&lt;wx:font wx:val=&quot;Cambria Math&quot;/&gt;&lt;w:i/&gt;&lt;/w:rPr&gt;&lt;m:t&gt;out&lt;/m:t&gt;&lt;/m:r&gt;&lt;/m:sub&gt;&lt;/m:sSub&gt;&lt;/m:oMath&gt;&lt;/m:oMathPara&gt;&lt;/w:p&gt;&lt;w:sectPr wsp:rsidR=&quot;00000000&quot; wsp:rsidRPr=&quot;00072A44&quot;&gt;&lt;w:pgSz w:w=&quot;12240&quot; w:h=&quot;15840&quot;/&gt;&lt;w:pgMar w:top=&quot;1440&quot; w:right=&quot;1440&quot; w:bottom=&quot;1440&quot; w:left=&quot;1440&quot; w:header=&quot;720&quot; w:footer=&quot;720&quot; w:gutter=&quot;0&quot;/&gt;&lt;w:cols w:space=&quot;720&quot;/&gt;&lt;/w:sectPr&gt;&lt;/wx:sect&gt;&lt;/w:body&gt;&lt;/w:wordDocument&gt;">
                   <v:imagedata r:id="rId14" o:title="" chromakey="white"/>
                 </v:shape>
               </w:pict>
@@ -1683,7 +1683,7 @@
         </w:tc>
         <w:tc>
           <w:tcPr>
-            <w:tcW w:w="850" w:type="dxa"/>
+            <w:tcW w:w="852" w:type="dxa"/>
             <w:shd w:val="clear" w:color="auto" w:fill="D9D9D9"/>
           </w:tcPr>
           <w:p>
@@ -1705,7 +1705,7 @@
         </w:tc>
         <w:tc>
           <w:tcPr>
-            <w:tcW w:w="898" w:type="dxa"/>
+            <w:tcW w:w="900" w:type="dxa"/>
             <w:shd w:val="clear" w:color="auto" w:fill="D9D9D9"/>
           </w:tcPr>
           <w:p>
@@ -1728,12 +1728,12 @@
       </w:tr>
       <w:tr>
         <w:trPr>
-          <w:trHeight w:val="281"/>
+          <w:trHeight w:val="34"/>
           <w:jc w:val="center"/>
         </w:trPr>
         <w:tc>
           <w:tcPr>
-            <w:tcW w:w="2255" w:type="dxa"/>
+            <w:tcW w:w="2261" w:type="dxa"/>
             <w:shd w:val="clear" w:color="auto" w:fill="auto"/>
           </w:tcPr>
           <w:p>
@@ -1754,7 +1754,7 @@
         </w:tc>
         <w:tc>
           <w:tcPr>
-            <w:tcW w:w="993" w:type="dxa"/>
+            <w:tcW w:w="995" w:type="dxa"/>
             <w:shd w:val="clear" w:color="auto" w:fill="auto"/>
           </w:tcPr>
           <w:p>
@@ -1771,7 +1771,7 @@
                 <w:szCs w:val="18"/>
               </w:rPr>
               <w:pict w14:anchorId="1541DB5D">
-                <v:shape id="_x0000_i1441" type="#_x0000_t75" style="width:18.55pt;height:13.65pt" equationxml="&lt;?xml version=&quot;1.0&quot; encoding=&quot;UTF-8&quot; standalone=&quot;yes&quot;?&gt;&#10;&lt;?mso-application progid=&quot;Word.Document&quot;?&gt;&#10;&lt;w:wordDocument xmlns:aml=&quot;http://schemas.microsoft.com/aml/2001/core&quot; xmlns:wpc=&quot;http://schemas.microsoft.com/office/word/2010/wordprocessingCanvas&quot; xmlns:cx=&quot;http://schemas.microsoft.com/office/drawing/2014/chartex&quot; xmlns:cx1=&quot;http://schemas.microsoft.com/office/drawing/2015/9/8/chartex&quot; xmlns:cx2=&quot;http://schemas.microsoft.com/office/drawing/2015/10/21/chartex&quot; xmlns:cx3=&quot;http://schemas.microsoft.com/office/drawing/2016/5/9/chartex&quot; xmlns:cx4=&quot;http://schemas.microsoft.com/office/drawing/2016/5/10/chartex&quot; xmlns:cx5=&quot;http://schemas.microsoft.com/office/drawing/2016/5/11/chartex&quot; xmlns:cx6=&quot;http://schemas.microsoft.com/office/drawing/2016/5/12/chartex&quot; xmlns:cx7=&quot;http://schemas.microsoft.com/office/drawing/2016/5/13/chartex&quot; xmlns:cx8=&quot;http://schemas.microsoft.com/office/drawing/2016/5/14/chartex&quot; xmlns:cr=&quot;http://schemas.microsoft.com/office/comments/2020/reactions&quot; xmlns:dt=&quot;uuid:C2F41010-65B3-11d1-A29F-00AA00C14882&quot; xmlns:mc=&quot;http://schemas.openxmlformats.org/markup-compatibility/2006&quot; xmlns:aink=&quot;http://schemas.microsoft.com/office/drawing/2016/ink&quot; xmlns:am3d=&quot;http://schemas.microsoft.com/office/drawing/2017/model3d&quot; xmlns:o=&quot;urn:schemas-microsoft-com:office:office&quot; xmlns:oel=&quot;http://schemas.microsoft.com/office/2019/extlst&quot; xmlns:m=&quot;http://schemas.openxmlformats.org/officeDocument/2006/math&quot; xmlns:v=&quot;urn:schemas-microsoft-com:vml&quot; xmlns:w10=&quot;urn:schemas-microsoft-com:office:word&quot; xmlns:w=&quot;http://schemas.microsoft.com/office/word/2003/wordml&quot; xmlns:wx=&quot;http://schemas.microsoft.com/office/word/2003/auxHint&quot; xmlns:wne=&quot;http://schemas.microsoft.com/office/word/2006/wordml&quot; xmlns:wsp=&quot;http://schemas.microsoft.com/office/word/2003/wordml/sp2&quot; xmlns:sl=&quot;http://schemas.microsoft.com/schemaLibrary/2003/core&quot; w:macrosPresent=&quot;no&quot; w:embeddedObjPresent=&quot;no&quot; w:ocxPresent=&quot;no&quot; xml:space=&quot;preserve&quot;&gt;&lt;w:ignoreSubtree w:val=&quot;http://schemas.microsoft.com/office/word/2003/wordml/sp2&quot;/&gt;&lt;o:DocumentProperties&gt;&lt;o:Version&gt;16&lt;/o:Version&gt;&lt;/o:DocumentProperties&gt;&lt;w:docPr&gt;&lt;w:view w:val=&quot;print&quot;/&gt;&lt;w:zoom w:percent=&quot;100&quot;/&gt;&lt;w:doNotEmbedSystemFonts/&gt;&lt;w:activeWritingStyle w:lang=&quot;EN-AU&quot; w:vendorID=&quot;64&quot; w:dllVersion=&quot;6&quot; w:nlCheck=&quot;on&quot; w:optionSet=&quot;1&quot;/&gt;&lt;w:activeWritingStyle w:lang=&quot;EN-GB&quot; w:vendorID=&quot;64&quot; w:dllVersion=&quot;6&quot; w:nlCheck=&quot;on&quot; w:optionSet=&quot;1&quot;/&gt;&lt;w:activeWritingStyle w:lang=&quot;EN-US&quot; w:vendorID=&quot;64&quot; w:dllVersion=&quot;6&quot; w:nlCheck=&quot;on&quot; w:optionSet=&quot;1&quot;/&gt;&lt;w:activeWritingStyle w:lang=&quot;EN-AU&quot; w:vendorID=&quot;64&quot; w:dllVersion=&quot;0&quot; w:nlCheck=&quot;on&quot; w:optionSet=&quot;0&quot;/&gt;&lt;w:activeWritingStyle w:lang=&quot;EN-GB&quot; w:vendorID=&quot;64&quot; w:dllVersion=&quot;0&quot; w:nlCheck=&quot;on&quot; w:optionSet=&quot;0&quot;/&gt;&lt;w:activeWritingStyle w:lang=&quot;EN-US&quot; w:vendorID=&quot;64&quot; w:dllVersion=&quot;0&quot; w:nlCheck=&quot;on&quot; w:optionSet=&quot;0&quot;/&gt;&lt;w:activeWritingStyle w:lang=&quot;ES-AR&quot; w:vendorID=&quot;64&quot; w:dllVersion=&quot;0&quot; w:nlCheck=&quot;on&quot; w:optionSet=&quot;0&quot;/&gt;&lt;w:activeWritingStyle w:lang=&quot;580A&quot; w:vendorID=&quot;64&quot; w:dllVersion=&quot;0&quot; w:nlCheck=&quot;on&quot; w:optionSet=&quot;0&quot;/&gt;&lt;w:activeWritingStyle w:lang=&quot;PT-BR&quot; w:vendorID=&quot;64&quot; w:dllVersion=&quot;0&quot; w:nlCheck=&quot;on&quot; w:optionSet=&quot;0&quot;/&gt;&lt;w:stylePaneFormatFilter w:val=&quot;3F01&quot;/&gt;&lt;w:defaultTabStop w:val=&quot;720&quot;/&gt;&lt;w:hyphenationZone w:val=&quot;425&quot;/&gt;&lt;w:characterSpacingControl w:val=&quot;DontCompress&quot;/&gt;&lt;w:optimizeForBrowser/&gt;&lt;w:validateAgainstSchema/&gt;&lt;w:saveInvalidXML w:val=&quot;off&quot;/&gt;&lt;w:ignoreMixedContent w:val=&quot;off&quot;/&gt;&lt;w:alwaysShowPlaceholderText w:val=&quot;off&quot;/&gt;&lt;w:compat&gt;&lt;w:breakWrappedTables/&gt;&lt;w:snapToGridInCell/&gt;&lt;w:applyBreakingRules/&gt;&lt;w:wrapTextWithPunct/&gt;&lt;w:useAsianBreakRules/&gt;&lt;w:useWord2002TableStyleRules/&gt;&lt;w:useFELayout/&gt;&lt;/w:compat&gt;&lt;wsp:rsids&gt;&lt;wsp:rsidRoot wsp:val=&quot;00426FBB&quot;/&gt;&lt;wsp:rsid wsp:val=&quot;000002E1&quot;/&gt;&lt;wsp:rsid wsp:val=&quot;00003C97&quot;/&gt;&lt;wsp:rsid wsp:val=&quot;00005565&quot;/&gt;&lt;wsp:rsid wsp:val=&quot;0001754A&quot;/&gt;&lt;wsp:rsid wsp:val=&quot;00017719&quot;/&gt;&lt;wsp:rsid wsp:val=&quot;00027F1D&quot;/&gt;&lt;wsp:rsid wsp:val=&quot;0003296C&quot;/&gt;&lt;wsp:rsid wsp:val=&quot;0003351F&quot;/&gt;&lt;wsp:rsid wsp:val=&quot;00044599&quot;/&gt;&lt;wsp:rsid wsp:val=&quot;000540E6&quot;/&gt;&lt;wsp:rsid wsp:val=&quot;00054421&quot;/&gt;&lt;wsp:rsid wsp:val=&quot;00062E46&quot;/&gt;&lt;wsp:rsid wsp:val=&quot;00074AC8&quot;/&gt;&lt;wsp:rsid wsp:val=&quot;00081408&quot;/&gt;&lt;wsp:rsid wsp:val=&quot;00081EBE&quot;/&gt;&lt;wsp:rsid wsp:val=&quot;00086EDC&quot;/&gt;&lt;wsp:rsid wsp:val=&quot;000B1236&quot;/&gt;&lt;wsp:rsid wsp:val=&quot;000B36A3&quot;/&gt;&lt;wsp:rsid wsp:val=&quot;000C013C&quot;/&gt;&lt;wsp:rsid wsp:val=&quot;000E3F84&quot;/&gt;&lt;wsp:rsid wsp:val=&quot;001056DF&quot;/&gt;&lt;wsp:rsid wsp:val=&quot;0010789C&quot;/&gt;&lt;wsp:rsid wsp:val=&quot;00114025&quot;/&gt;&lt;wsp:rsid wsp:val=&quot;001160D2&quot;/&gt;&lt;wsp:rsid wsp:val=&quot;00120636&quot;/&gt;&lt;wsp:rsid wsp:val=&quot;001348A5&quot;/&gt;&lt;wsp:rsid wsp:val=&quot;00151B8E&quot;/&gt;&lt;wsp:rsid wsp:val=&quot;00182170&quot;/&gt;&lt;wsp:rsid wsp:val=&quot;001928FB&quot;/&gt;&lt;wsp:rsid wsp:val=&quot;00192BC7&quot;/&gt;&lt;wsp:rsid wsp:val=&quot;00195BE6&quot;/&gt;&lt;wsp:rsid wsp:val=&quot;001A50EA&quot;/&gt;&lt;wsp:rsid wsp:val=&quot;001F16CD&quot;/&gt;&lt;wsp:rsid wsp:val=&quot;001F47D2&quot;/&gt;&lt;wsp:rsid wsp:val=&quot;002029C8&quot;/&gt;&lt;wsp:rsid wsp:val=&quot;0022285A&quot;/&gt;&lt;wsp:rsid wsp:val=&quot;00224C61&quot;/&gt;&lt;wsp:rsid wsp:val=&quot;00256ABC&quot;/&gt;&lt;wsp:rsid wsp:val=&quot;0027227B&quot;/&gt;&lt;wsp:rsid wsp:val=&quot;00273AC7&quot;/&gt;&lt;wsp:rsid wsp:val=&quot;00273D2C&quot;/&gt;&lt;wsp:rsid wsp:val=&quot;00285ECD&quot;/&gt;&lt;wsp:rsid wsp:val=&quot;00290E1B&quot;/&gt;&lt;wsp:rsid wsp:val=&quot;00291B17&quot;/&gt;&lt;wsp:rsid wsp:val=&quot;00291BB3&quot;/&gt;&lt;wsp:rsid wsp:val=&quot;002A6742&quot;/&gt;&lt;wsp:rsid wsp:val=&quot;002C1A7F&quot;/&gt;&lt;wsp:rsid wsp:val=&quot;002C4239&quot;/&gt;&lt;wsp:rsid wsp:val=&quot;002C559D&quot;/&gt;&lt;wsp:rsid wsp:val=&quot;002D16AE&quot;/&gt;&lt;wsp:rsid wsp:val=&quot;002D2D42&quot;/&gt;&lt;wsp:rsid wsp:val=&quot;002F72D0&quot;/&gt;&lt;wsp:rsid wsp:val=&quot;002F7A4F&quot;/&gt;&lt;wsp:rsid wsp:val=&quot;003003AB&quot;/&gt;&lt;wsp:rsid wsp:val=&quot;00302C35&quot;/&gt;&lt;wsp:rsid wsp:val=&quot;00311C49&quot;/&gt;&lt;wsp:rsid wsp:val=&quot;00313E88&quot;/&gt;&lt;wsp:rsid wsp:val=&quot;0032119E&quot;/&gt;&lt;wsp:rsid wsp:val=&quot;00321304&quot;/&gt;&lt;wsp:rsid wsp:val=&quot;00324FC2&quot;/&gt;&lt;wsp:rsid wsp:val=&quot;003312CA&quot;/&gt;&lt;wsp:rsid wsp:val=&quot;00331F84&quot;/&gt;&lt;wsp:rsid wsp:val=&quot;0037721F&quot;/&gt;&lt;wsp:rsid wsp:val=&quot;003950A4&quot;/&gt;&lt;wsp:rsid wsp:val=&quot;003A1E7E&quot;/&gt;&lt;wsp:rsid wsp:val=&quot;003E2FDC&quot;/&gt;&lt;wsp:rsid wsp:val=&quot;003E3577&quot;/&gt;&lt;wsp:rsid wsp:val=&quot;003F3A61&quot;/&gt;&lt;wsp:rsid wsp:val=&quot;00410A5D&quot;/&gt;&lt;wsp:rsid wsp:val=&quot;00414909&quot;/&gt;&lt;wsp:rsid wsp:val=&quot;00416537&quot;/&gt;&lt;wsp:rsid wsp:val=&quot;00425A6A&quot;/&gt;&lt;wsp:rsid wsp:val=&quot;00426FBB&quot;/&gt;&lt;wsp:rsid wsp:val=&quot;00454542&quot;/&gt;&lt;wsp:rsid wsp:val=&quot;0047429A&quot;/&gt;&lt;wsp:rsid wsp:val=&quot;0048374C&quot;/&gt;&lt;wsp:rsid wsp:val=&quot;0048771D&quot;/&gt;&lt;wsp:rsid wsp:val=&quot;004A6605&quot;/&gt;&lt;wsp:rsid wsp:val=&quot;004C45FA&quot;/&gt;&lt;wsp:rsid wsp:val=&quot;004D35A3&quot;/&gt;&lt;wsp:rsid wsp:val=&quot;004E1BD8&quot;/&gt;&lt;wsp:rsid wsp:val=&quot;004E452A&quot;/&gt;&lt;wsp:rsid wsp:val=&quot;004E78E3&quot;/&gt;&lt;wsp:rsid wsp:val=&quot;004F2BFE&quot;/&gt;&lt;wsp:rsid wsp:val=&quot;004F63D3&quot;/&gt;&lt;wsp:rsid wsp:val=&quot;004F7DCF&quot;/&gt;&lt;wsp:rsid wsp:val=&quot;005004BF&quot;/&gt;&lt;wsp:rsid wsp:val=&quot;00502E89&quot;/&gt;&lt;wsp:rsid wsp:val=&quot;00506CFE&quot;/&gt;&lt;wsp:rsid wsp:val=&quot;00510E95&quot;/&gt;&lt;wsp:rsid wsp:val=&quot;005225C3&quot;/&gt;&lt;wsp:rsid wsp:val=&quot;00527D56&quot;/&gt;&lt;wsp:rsid wsp:val=&quot;0053221F&quot;/&gt;&lt;wsp:rsid wsp:val=&quot;00536FAE&quot;/&gt;&lt;wsp:rsid wsp:val=&quot;00542C85&quot;/&gt;&lt;wsp:rsid wsp:val=&quot;00553510&quot;/&gt;&lt;wsp:rsid wsp:val=&quot;00554186&quot;/&gt;&lt;wsp:rsid wsp:val=&quot;00585769&quot;/&gt;&lt;wsp:rsid wsp:val=&quot;00585C61&quot;/&gt;&lt;wsp:rsid wsp:val=&quot;00591130&quot;/&gt;&lt;wsp:rsid wsp:val=&quot;005A3F28&quot;/&gt;&lt;wsp:rsid wsp:val=&quot;005A40BE&quot;/&gt;&lt;wsp:rsid wsp:val=&quot;005B13E2&quot;/&gt;&lt;wsp:rsid wsp:val=&quot;005B47D7&quot;/&gt;&lt;wsp:rsid wsp:val=&quot;005C5526&quot;/&gt;&lt;wsp:rsid wsp:val=&quot;005C62C6&quot;/&gt;&lt;wsp:rsid wsp:val=&quot;005D7B9E&quot;/&gt;&lt;wsp:rsid wsp:val=&quot;005E112E&quot;/&gt;&lt;wsp:rsid wsp:val=&quot;005F0834&quot;/&gt;&lt;wsp:rsid wsp:val=&quot;005F68AB&quot;/&gt;&lt;wsp:rsid wsp:val=&quot;005F6DC3&quot;/&gt;&lt;wsp:rsid wsp:val=&quot;00601A8E&quot;/&gt;&lt;wsp:rsid wsp:val=&quot;0062033E&quot;/&gt;&lt;wsp:rsid wsp:val=&quot;00624482&quot;/&gt;&lt;wsp:rsid wsp:val=&quot;0064799C&quot;/&gt;&lt;wsp:rsid wsp:val=&quot;00654156&quot;/&gt;&lt;wsp:rsid wsp:val=&quot;00656ADC&quot;/&gt;&lt;wsp:rsid wsp:val=&quot;006B47CA&quot;/&gt;&lt;wsp:rsid wsp:val=&quot;006C304C&quot;/&gt;&lt;wsp:rsid wsp:val=&quot;006C4511&quot;/&gt;&lt;wsp:rsid wsp:val=&quot;006C65F5&quot;/&gt;&lt;wsp:rsid wsp:val=&quot;006C7AAA&quot;/&gt;&lt;wsp:rsid wsp:val=&quot;006D1C2A&quot;/&gt;&lt;wsp:rsid wsp:val=&quot;006D264F&quot;/&gt;&lt;wsp:rsid wsp:val=&quot;006D4E89&quot;/&gt;&lt;wsp:rsid wsp:val=&quot;006E2A8D&quot;/&gt;&lt;wsp:rsid wsp:val=&quot;006E7574&quot;/&gt;&lt;wsp:rsid wsp:val=&quot;00703430&quot;/&gt;&lt;wsp:rsid wsp:val=&quot;00703548&quot;/&gt;&lt;wsp:rsid wsp:val=&quot;00704E18&quot;/&gt;&lt;wsp:rsid wsp:val=&quot;007069BE&quot;/&gt;&lt;wsp:rsid wsp:val=&quot;00745C86&quot;/&gt;&lt;wsp:rsid wsp:val=&quot;00764603&quot;/&gt;&lt;wsp:rsid wsp:val=&quot;0076604D&quot;/&gt;&lt;wsp:rsid wsp:val=&quot;00790909&quot;/&gt;&lt;wsp:rsid wsp:val=&quot;007B1582&quot;/&gt;&lt;wsp:rsid wsp:val=&quot;007B5A07&quot;/&gt;&lt;wsp:rsid wsp:val=&quot;007C065D&quot;/&gt;&lt;wsp:rsid wsp:val=&quot;007D3E71&quot;/&gt;&lt;wsp:rsid wsp:val=&quot;007E5D6A&quot;/&gt;&lt;wsp:rsid wsp:val=&quot;007E645D&quot;/&gt;&lt;wsp:rsid wsp:val=&quot;007F75CA&quot;/&gt;&lt;wsp:rsid wsp:val=&quot;00821E08&quot;/&gt;&lt;wsp:rsid wsp:val=&quot;00834EFD&quot;/&gt;&lt;wsp:rsid wsp:val=&quot;00844B24&quot;/&gt;&lt;wsp:rsid wsp:val=&quot;0084515F&quot;/&gt;&lt;wsp:rsid wsp:val=&quot;0085092D&quot;/&gt;&lt;wsp:rsid wsp:val=&quot;00865414&quot;/&gt;&lt;wsp:rsid wsp:val=&quot;00877D4C&quot;/&gt;&lt;wsp:rsid wsp:val=&quot;00883903&quot;/&gt;&lt;wsp:rsid wsp:val=&quot;0089763B&quot;/&gt;&lt;wsp:rsid wsp:val=&quot;008B6AE3&quot;/&gt;&lt;wsp:rsid wsp:val=&quot;008C1332&quot;/&gt;&lt;wsp:rsid wsp:val=&quot;008D1045&quot;/&gt;&lt;wsp:rsid wsp:val=&quot;008E5996&quot;/&gt;&lt;wsp:rsid wsp:val=&quot;00901AE1&quot;/&gt;&lt;wsp:rsid wsp:val=&quot;00912F93&quot;/&gt;&lt;wsp:rsid wsp:val=&quot;009205B4&quot;/&gt;&lt;wsp:rsid wsp:val=&quot;00955B59&quot;/&gt;&lt;wsp:rsid wsp:val=&quot;00992262&quot;/&gt;&lt;wsp:rsid wsp:val=&quot;009926BC&quot;/&gt;&lt;wsp:rsid wsp:val=&quot;009A4319&quot;/&gt;&lt;wsp:rsid wsp:val=&quot;009A6C3F&quot;/&gt;&lt;wsp:rsid wsp:val=&quot;009B73F2&quot;/&gt;&lt;wsp:rsid wsp:val=&quot;009C12BD&quot;/&gt;&lt;wsp:rsid wsp:val=&quot;009C50FE&quot;/&gt;&lt;wsp:rsid wsp:val=&quot;009E49DD&quot;/&gt;&lt;wsp:rsid wsp:val=&quot;00A03E75&quot;/&gt;&lt;wsp:rsid wsp:val=&quot;00A20627&quot;/&gt;&lt;wsp:rsid wsp:val=&quot;00A22FE9&quot;/&gt;&lt;wsp:rsid wsp:val=&quot;00A31A44&quot;/&gt;&lt;wsp:rsid wsp:val=&quot;00A32BFA&quot;/&gt;&lt;wsp:rsid wsp:val=&quot;00A3325E&quot;/&gt;&lt;wsp:rsid wsp:val=&quot;00A45FCE&quot;/&gt;&lt;wsp:rsid wsp:val=&quot;00A75671&quot;/&gt;&lt;wsp:rsid wsp:val=&quot;00A773CC&quot;/&gt;&lt;wsp:rsid wsp:val=&quot;00A924D0&quot;/&gt;&lt;wsp:rsid wsp:val=&quot;00A9318B&quot;/&gt;&lt;wsp:rsid wsp:val=&quot;00A94AC1&quot;/&gt;&lt;wsp:rsid wsp:val=&quot;00AB18B7&quot;/&gt;&lt;wsp:rsid wsp:val=&quot;00AD335D&quot;/&gt;&lt;wsp:rsid wsp:val=&quot;00AF114C&quot;/&gt;&lt;wsp:rsid wsp:val=&quot;00AF792B&quot;/&gt;&lt;wsp:rsid wsp:val=&quot;00B33D2F&quot;/&gt;&lt;wsp:rsid wsp:val=&quot;00B40A5B&quot;/&gt;&lt;wsp:rsid wsp:val=&quot;00B45C6B&quot;/&gt;&lt;wsp:rsid wsp:val=&quot;00B55D5E&quot;/&gt;&lt;wsp:rsid wsp:val=&quot;00B57A80&quot;/&gt;&lt;wsp:rsid wsp:val=&quot;00B70E9C&quot;/&gt;&lt;wsp:rsid wsp:val=&quot;00B713D8&quot;/&gt;&lt;wsp:rsid wsp:val=&quot;00B72979&quot;/&gt;&lt;wsp:rsid wsp:val=&quot;00B94516&quot;/&gt;&lt;wsp:rsid wsp:val=&quot;00BA25E2&quot;/&gt;&lt;wsp:rsid wsp:val=&quot;00BB2855&quot;/&gt;&lt;wsp:rsid wsp:val=&quot;00BC5343&quot;/&gt;&lt;wsp:rsid wsp:val=&quot;00BD19C1&quot;/&gt;&lt;wsp:rsid wsp:val=&quot;00BD25B8&quot;/&gt;&lt;wsp:rsid wsp:val=&quot;00C012E1&quot;/&gt;&lt;wsp:rsid wsp:val=&quot;00C06BB4&quot;/&gt;&lt;wsp:rsid wsp:val=&quot;00C10D20&quot;/&gt;&lt;wsp:rsid wsp:val=&quot;00C12E0C&quot;/&gt;&lt;wsp:rsid wsp:val=&quot;00C21916&quot;/&gt;&lt;wsp:rsid wsp:val=&quot;00C34915&quot;/&gt;&lt;wsp:rsid wsp:val=&quot;00C457CA&quot;/&gt;&lt;wsp:rsid wsp:val=&quot;00C53FB6&quot;/&gt;&lt;wsp:rsid wsp:val=&quot;00C57FB7&quot;/&gt;&lt;wsp:rsid wsp:val=&quot;00C644D4&quot;/&gt;&lt;wsp:rsid wsp:val=&quot;00C65F3F&quot;/&gt;&lt;wsp:rsid wsp:val=&quot;00C72414&quot;/&gt;&lt;wsp:rsid wsp:val=&quot;00C72B1A&quot;/&gt;&lt;wsp:rsid wsp:val=&quot;00C8667B&quot;/&gt;&lt;wsp:rsid wsp:val=&quot;00C90993&quot;/&gt;&lt;wsp:rsid wsp:val=&quot;00CA4CE3&quot;/&gt;&lt;wsp:rsid wsp:val=&quot;00CC72FD&quot;/&gt;&lt;wsp:rsid wsp:val=&quot;00CD4F3F&quot;/&gt;&lt;wsp:rsid wsp:val=&quot;00D311F8&quot;/&gt;&lt;wsp:rsid wsp:val=&quot;00D31660&quot;/&gt;&lt;wsp:rsid wsp:val=&quot;00D36B52&quot;/&gt;&lt;wsp:rsid wsp:val=&quot;00D377C8&quot;/&gt;&lt;wsp:rsid wsp:val=&quot;00D41274&quot;/&gt;&lt;wsp:rsid wsp:val=&quot;00D4229C&quot;/&gt;&lt;wsp:rsid wsp:val=&quot;00D43BF3&quot;/&gt;&lt;wsp:rsid wsp:val=&quot;00D549FB&quot;/&gt;&lt;wsp:rsid wsp:val=&quot;00D767BB&quot;/&gt;&lt;wsp:rsid wsp:val=&quot;00D939B0&quot;/&gt;&lt;wsp:rsid wsp:val=&quot;00DA31A2&quot;/&gt;&lt;wsp:rsid wsp:val=&quot;00DB16E0&quot;/&gt;&lt;wsp:rsid wsp:val=&quot;00DB2DF9&quot;/&gt;&lt;wsp:rsid wsp:val=&quot;00DB465D&quot;/&gt;&lt;wsp:rsid wsp:val=&quot;00DB48A2&quot;/&gt;&lt;wsp:rsid wsp:val=&quot;00DB7E63&quot;/&gt;&lt;wsp:rsid wsp:val=&quot;00DC2055&quot;/&gt;&lt;wsp:rsid wsp:val=&quot;00DC3908&quot;/&gt;&lt;wsp:rsid wsp:val=&quot;00DD71E8&quot;/&gt;&lt;wsp:rsid wsp:val=&quot;00DD7F83&quot;/&gt;&lt;wsp:rsid wsp:val=&quot;00DE4EB8&quot;/&gt;&lt;wsp:rsid wsp:val=&quot;00E0641E&quot;/&gt;&lt;wsp:rsid wsp:val=&quot;00E06664&quot;/&gt;&lt;wsp:rsid wsp:val=&quot;00E304BC&quot;/&gt;&lt;wsp:rsid wsp:val=&quot;00E32853&quot;/&gt;&lt;wsp:rsid wsp:val=&quot;00E34EBD&quot;/&gt;&lt;wsp:rsid wsp:val=&quot;00E401F8&quot;/&gt;&lt;wsp:rsid wsp:val=&quot;00E46425&quot;/&gt;&lt;wsp:rsid wsp:val=&quot;00E469FC&quot;/&gt;&lt;wsp:rsid wsp:val=&quot;00E47D0E&quot;/&gt;&lt;wsp:rsid wsp:val=&quot;00E65018&quot;/&gt;&lt;wsp:rsid wsp:val=&quot;00E76CA1&quot;/&gt;&lt;wsp:rsid wsp:val=&quot;00E94339&quot;/&gt;&lt;wsp:rsid wsp:val=&quot;00E97563&quot;/&gt;&lt;wsp:rsid wsp:val=&quot;00EB0B63&quot;/&gt;&lt;wsp:rsid wsp:val=&quot;00EC265C&quot;/&gt;&lt;wsp:rsid wsp:val=&quot;00ED61CB&quot;/&gt;&lt;wsp:rsid wsp:val=&quot;00EE752A&quot;/&gt;&lt;wsp:rsid wsp:val=&quot;00F06A72&quot;/&gt;&lt;wsp:rsid wsp:val=&quot;00F136F0&quot;/&gt;&lt;wsp:rsid wsp:val=&quot;00F20BBB&quot;/&gt;&lt;wsp:rsid wsp:val=&quot;00F36048&quot;/&gt;&lt;wsp:rsid wsp:val=&quot;00F43BD8&quot;/&gt;&lt;wsp:rsid wsp:val=&quot;00F562F3&quot;/&gt;&lt;wsp:rsid wsp:val=&quot;00F74B89&quot;/&gt;&lt;wsp:rsid wsp:val=&quot;00F75133&quot;/&gt;&lt;wsp:rsid wsp:val=&quot;00F83272&quot;/&gt;&lt;wsp:rsid wsp:val=&quot;00F9358D&quot;/&gt;&lt;wsp:rsid wsp:val=&quot;00FA3899&quot;/&gt;&lt;wsp:rsid wsp:val=&quot;00FA4909&quot;/&gt;&lt;wsp:rsid wsp:val=&quot;00FA5164&quot;/&gt;&lt;wsp:rsid wsp:val=&quot;00FA6751&quot;/&gt;&lt;wsp:rsid wsp:val=&quot;00FA6BD7&quot;/&gt;&lt;wsp:rsid wsp:val=&quot;00FB1048&quot;/&gt;&lt;wsp:rsid wsp:val=&quot;00FB62C4&quot;/&gt;&lt;wsp:rsid wsp:val=&quot;00FB7701&quot;/&gt;&lt;wsp:rsid wsp:val=&quot;00FD1AC5&quot;/&gt;&lt;wsp:rsid wsp:val=&quot;00FD5CF0&quot;/&gt;&lt;/wsp:rsids&gt;&lt;/w:docPr&gt;&lt;w:body&gt;&lt;wx:sect&gt;&lt;w:p wsp:rsidR=&quot;00313E88&quot; wsp:rsidRPr=&quot;00313E88&quot; wsp:rsidRDefault=&quot;00313E88&quot; wsp:rsidP=&quot;00313E88&quot;&gt;&lt;m:oMathPara&gt;&lt;m:oMath&gt;&lt;m:sSub&gt;&lt;m:sSubPr&gt;&lt;m:ctrlPr&gt;&lt;w:rPr&gt;&lt;w:rFonts w:ascii=&quot;Cambria Math&quot; w:h-ansi=&quot;Cambria Math&quot;/&gt;&lt;wx:font wx:val=&quot;Cambria Math&quot;/&gt;&lt;w:i/&gt;&lt;/w:rPr&gt;&lt;/m:ctrlPr&gt;&lt;/m:sSubPr&gt;&lt;m:e&gt;&lt;m:r&gt;&lt;w:rPr&gt;&lt;w:rFonts w:ascii=&quot;Cambria Math&quot; w:h-ansi=&quot;Cambria Math&quot;/&gt;&lt;wx:font wx:val=&quot;Cambria Math&quot;/&gt;&lt;w:i/&gt;&lt;/w:rPr&gt;&lt;m:t&gt;I&lt;/m:t&gt;&lt;/m:r&gt;&lt;/m:e&gt;&lt;m:sub&gt;&lt;m:r&gt;&lt;w:rPr&gt;&lt;w:rFonts w:ascii=&quot;Cambria Math&quot; w:h-ansi=&quot;Cambria Math&quot;/&gt;&lt;wx:font wx:val=&quot;Cambria Math&quot;/&gt;&lt;w:i/&gt;&lt;/w:rPr&gt;&lt;m:t&gt;out&lt;/m:t&gt;&lt;/m:r&gt;&lt;/m:sub&gt;&lt;/m:sSub&gt;&lt;/m:oMath&gt;&lt;/m:oMathPara&gt;&lt;/w:p&gt;&lt;w:sectPr wsp:rsidR=&quot;00000000&quot; wsp:rsidRPr=&quot;00313E88&quot;&gt;&lt;w:pgSz w:w=&quot;12240&quot; w:h=&quot;15840&quot;/&gt;&lt;w:pgMar w:top=&quot;1440&quot; w:right=&quot;1440&quot; w:bottom=&quot;1440&quot; w:left=&quot;1440&quot; w:header=&quot;720&quot; w:footer=&quot;720&quot; w:gutter=&quot;0&quot;/&gt;&lt;w:cols w:space=&quot;720&quot;/&gt;&lt;/w:sectPr&gt;&lt;/wx:sect&gt;&lt;/w:body&gt;&lt;/w:wordDocument&gt;">
+                <v:shape id="_x0000_i1044" type="#_x0000_t75" style="width:18.7pt;height:13.85pt" equationxml="&lt;?xml version=&quot;1.0&quot; encoding=&quot;UTF-8&quot; standalone=&quot;yes&quot;?&gt;&#10;&lt;?mso-application progid=&quot;Word.Document&quot;?&gt;&#10;&lt;w:wordDocument xmlns:aml=&quot;http://schemas.microsoft.com/aml/2001/core&quot; xmlns:wpc=&quot;http://schemas.microsoft.com/office/word/2010/wordprocessingCanvas&quot; xmlns:cx=&quot;http://schemas.microsoft.com/office/drawing/2014/chartex&quot; xmlns:cx1=&quot;http://schemas.microsoft.com/office/drawing/2015/9/8/chartex&quot; xmlns:cx2=&quot;http://schemas.microsoft.com/office/drawing/2015/10/21/chartex&quot; xmlns:cx3=&quot;http://schemas.microsoft.com/office/drawing/2016/5/9/chartex&quot; xmlns:cx4=&quot;http://schemas.microsoft.com/office/drawing/2016/5/10/chartex&quot; xmlns:cx5=&quot;http://schemas.microsoft.com/office/drawing/2016/5/11/chartex&quot; xmlns:cx6=&quot;http://schemas.microsoft.com/office/drawing/2016/5/12/chartex&quot; xmlns:cx7=&quot;http://schemas.microsoft.com/office/drawing/2016/5/13/chartex&quot; xmlns:cx8=&quot;http://schemas.microsoft.com/office/drawing/2016/5/14/chartex&quot; xmlns:cr=&quot;http://schemas.microsoft.com/office/comments/2020/reactions&quot; xmlns:dt=&quot;uuid:C2F41010-65B3-11d1-A29F-00AA00C14882&quot; xmlns:mc=&quot;http://schemas.openxmlformats.org/markup-compatibility/2006&quot; xmlns:aink=&quot;http://schemas.microsoft.com/office/drawing/2016/ink&quot; xmlns:am3d=&quot;http://schemas.microsoft.com/office/drawing/2017/model3d&quot; xmlns:o=&quot;urn:schemas-microsoft-com:office:office&quot; xmlns:oel=&quot;http://schemas.microsoft.com/office/2019/extlst&quot; xmlns:m=&quot;http://schemas.openxmlformats.org/officeDocument/2006/math&quot; xmlns:v=&quot;urn:schemas-microsoft-com:vml&quot; xmlns:w10=&quot;urn:schemas-microsoft-com:office:word&quot; xmlns:w=&quot;http://schemas.microsoft.com/office/word/2003/wordml&quot; xmlns:wx=&quot;http://schemas.microsoft.com/office/word/2003/auxHint&quot; xmlns:wne=&quot;http://schemas.microsoft.com/office/word/2006/wordml&quot; xmlns:wsp=&quot;http://schemas.microsoft.com/office/word/2003/wordml/sp2&quot; xmlns:sl=&quot;http://schemas.microsoft.com/schemaLibrary/2003/core&quot; w:macrosPresent=&quot;no&quot; w:embeddedObjPresent=&quot;no&quot; w:ocxPresent=&quot;no&quot; xml:space=&quot;preserve&quot;&gt;&lt;w:ignoreSubtree w:val=&quot;http://schemas.microsoft.com/office/word/2003/wordml/sp2&quot;/&gt;&lt;o:DocumentProperties&gt;&lt;o:Version&gt;16&lt;/o:Version&gt;&lt;/o:DocumentProperties&gt;&lt;w:docPr&gt;&lt;w:view w:val=&quot;print&quot;/&gt;&lt;w:zoom w:percent=&quot;100&quot;/&gt;&lt;w:doNotEmbedSystemFonts/&gt;&lt;w:activeWritingStyle w:lang=&quot;EN-AU&quot; w:vendorID=&quot;64&quot; w:dllVersion=&quot;6&quot; w:nlCheck=&quot;on&quot; w:optionSet=&quot;1&quot;/&gt;&lt;w:activeWritingStyle w:lang=&quot;EN-GB&quot; w:vendorID=&quot;64&quot; w:dllVersion=&quot;6&quot; w:nlCheck=&quot;on&quot; w:optionSet=&quot;1&quot;/&gt;&lt;w:activeWritingStyle w:lang=&quot;EN-US&quot; w:vendorID=&quot;64&quot; w:dllVersion=&quot;6&quot; w:nlCheck=&quot;on&quot; w:optionSet=&quot;1&quot;/&gt;&lt;w:activeWritingStyle w:lang=&quot;EN-AU&quot; w:vendorID=&quot;64&quot; w:dllVersion=&quot;0&quot; w:nlCheck=&quot;on&quot; w:optionSet=&quot;0&quot;/&gt;&lt;w:activeWritingStyle w:lang=&quot;EN-GB&quot; w:vendorID=&quot;64&quot; w:dllVersion=&quot;0&quot; w:nlCheck=&quot;on&quot; w:optionSet=&quot;0&quot;/&gt;&lt;w:activeWritingStyle w:lang=&quot;EN-US&quot; w:vendorID=&quot;64&quot; w:dllVersion=&quot;0&quot; w:nlCheck=&quot;on&quot; w:optionSet=&quot;0&quot;/&gt;&lt;w:activeWritingStyle w:lang=&quot;ES-AR&quot; w:vendorID=&quot;64&quot; w:dllVersion=&quot;0&quot; w:nlCheck=&quot;on&quot; w:optionSet=&quot;0&quot;/&gt;&lt;w:activeWritingStyle w:lang=&quot;580A&quot; w:vendorID=&quot;64&quot; w:dllVersion=&quot;0&quot; w:nlCheck=&quot;on&quot; w:optionSet=&quot;0&quot;/&gt;&lt;w:activeWritingStyle w:lang=&quot;PT-BR&quot; w:vendorID=&quot;64&quot; w:dllVersion=&quot;0&quot; w:nlCheck=&quot;on&quot; w:optionSet=&quot;0&quot;/&gt;&lt;w:stylePaneFormatFilter w:val=&quot;3F01&quot;/&gt;&lt;w:defaultTabStop w:val=&quot;720&quot;/&gt;&lt;w:hyphenationZone w:val=&quot;425&quot;/&gt;&lt;w:characterSpacingControl w:val=&quot;DontCompress&quot;/&gt;&lt;w:optimizeForBrowser/&gt;&lt;w:validateAgainstSchema/&gt;&lt;w:saveInvalidXML w:val=&quot;off&quot;/&gt;&lt;w:ignoreMixedContent w:val=&quot;off&quot;/&gt;&lt;w:alwaysShowPlaceholderText w:val=&quot;off&quot;/&gt;&lt;w:compat&gt;&lt;w:breakWrappedTables/&gt;&lt;w:snapToGridInCell/&gt;&lt;w:applyBreakingRules/&gt;&lt;w:wrapTextWithPunct/&gt;&lt;w:useAsianBreakRules/&gt;&lt;w:useWord2002TableStyleRules/&gt;&lt;w:useFELayout/&gt;&lt;/w:compat&gt;&lt;wsp:rsids&gt;&lt;wsp:rsidRoot wsp:val=&quot;00426FBB&quot;/&gt;&lt;wsp:rsid wsp:val=&quot;000002E1&quot;/&gt;&lt;wsp:rsid wsp:val=&quot;00003C97&quot;/&gt;&lt;wsp:rsid wsp:val=&quot;00005565&quot;/&gt;&lt;wsp:rsid wsp:val=&quot;0001754A&quot;/&gt;&lt;wsp:rsid wsp:val=&quot;00017719&quot;/&gt;&lt;wsp:rsid wsp:val=&quot;00027F1D&quot;/&gt;&lt;wsp:rsid wsp:val=&quot;0003296C&quot;/&gt;&lt;wsp:rsid wsp:val=&quot;0003351F&quot;/&gt;&lt;wsp:rsid wsp:val=&quot;00044599&quot;/&gt;&lt;wsp:rsid wsp:val=&quot;000540E6&quot;/&gt;&lt;wsp:rsid wsp:val=&quot;00054421&quot;/&gt;&lt;wsp:rsid wsp:val=&quot;00062E46&quot;/&gt;&lt;wsp:rsid wsp:val=&quot;00074AC8&quot;/&gt;&lt;wsp:rsid wsp:val=&quot;00081408&quot;/&gt;&lt;wsp:rsid wsp:val=&quot;00081EBE&quot;/&gt;&lt;wsp:rsid wsp:val=&quot;00086EDC&quot;/&gt;&lt;wsp:rsid wsp:val=&quot;000B1236&quot;/&gt;&lt;wsp:rsid wsp:val=&quot;000B36A3&quot;/&gt;&lt;wsp:rsid wsp:val=&quot;000C013C&quot;/&gt;&lt;wsp:rsid wsp:val=&quot;000E3F84&quot;/&gt;&lt;wsp:rsid wsp:val=&quot;001056DF&quot;/&gt;&lt;wsp:rsid wsp:val=&quot;0010789C&quot;/&gt;&lt;wsp:rsid wsp:val=&quot;00114025&quot;/&gt;&lt;wsp:rsid wsp:val=&quot;001160D2&quot;/&gt;&lt;wsp:rsid wsp:val=&quot;00120636&quot;/&gt;&lt;wsp:rsid wsp:val=&quot;001348A5&quot;/&gt;&lt;wsp:rsid wsp:val=&quot;00151B8E&quot;/&gt;&lt;wsp:rsid wsp:val=&quot;00182170&quot;/&gt;&lt;wsp:rsid wsp:val=&quot;001928FB&quot;/&gt;&lt;wsp:rsid wsp:val=&quot;00192BC7&quot;/&gt;&lt;wsp:rsid wsp:val=&quot;00195BE6&quot;/&gt;&lt;wsp:rsid wsp:val=&quot;001A50EA&quot;/&gt;&lt;wsp:rsid wsp:val=&quot;001F16CD&quot;/&gt;&lt;wsp:rsid wsp:val=&quot;001F47D2&quot;/&gt;&lt;wsp:rsid wsp:val=&quot;002029C8&quot;/&gt;&lt;wsp:rsid wsp:val=&quot;0022285A&quot;/&gt;&lt;wsp:rsid wsp:val=&quot;00224C61&quot;/&gt;&lt;wsp:rsid wsp:val=&quot;00256ABC&quot;/&gt;&lt;wsp:rsid wsp:val=&quot;0027227B&quot;/&gt;&lt;wsp:rsid wsp:val=&quot;00273AC7&quot;/&gt;&lt;wsp:rsid wsp:val=&quot;00273D2C&quot;/&gt;&lt;wsp:rsid wsp:val=&quot;00285ECD&quot;/&gt;&lt;wsp:rsid wsp:val=&quot;00290E1B&quot;/&gt;&lt;wsp:rsid wsp:val=&quot;00291B17&quot;/&gt;&lt;wsp:rsid wsp:val=&quot;00291BB3&quot;/&gt;&lt;wsp:rsid wsp:val=&quot;002A6742&quot;/&gt;&lt;wsp:rsid wsp:val=&quot;002C1A7F&quot;/&gt;&lt;wsp:rsid wsp:val=&quot;002C4239&quot;/&gt;&lt;wsp:rsid wsp:val=&quot;002C559D&quot;/&gt;&lt;wsp:rsid wsp:val=&quot;002D16AE&quot;/&gt;&lt;wsp:rsid wsp:val=&quot;002D2D42&quot;/&gt;&lt;wsp:rsid wsp:val=&quot;002F72D0&quot;/&gt;&lt;wsp:rsid wsp:val=&quot;002F7A4F&quot;/&gt;&lt;wsp:rsid wsp:val=&quot;003003AB&quot;/&gt;&lt;wsp:rsid wsp:val=&quot;00302C35&quot;/&gt;&lt;wsp:rsid wsp:val=&quot;00311C49&quot;/&gt;&lt;wsp:rsid wsp:val=&quot;00313E88&quot;/&gt;&lt;wsp:rsid wsp:val=&quot;0032119E&quot;/&gt;&lt;wsp:rsid wsp:val=&quot;00321304&quot;/&gt;&lt;wsp:rsid wsp:val=&quot;00324FC2&quot;/&gt;&lt;wsp:rsid wsp:val=&quot;003312CA&quot;/&gt;&lt;wsp:rsid wsp:val=&quot;00331F84&quot;/&gt;&lt;wsp:rsid wsp:val=&quot;0037721F&quot;/&gt;&lt;wsp:rsid wsp:val=&quot;003950A4&quot;/&gt;&lt;wsp:rsid wsp:val=&quot;003A1E7E&quot;/&gt;&lt;wsp:rsid wsp:val=&quot;003E2FDC&quot;/&gt;&lt;wsp:rsid wsp:val=&quot;003E3577&quot;/&gt;&lt;wsp:rsid wsp:val=&quot;003F3A61&quot;/&gt;&lt;wsp:rsid wsp:val=&quot;00410A5D&quot;/&gt;&lt;wsp:rsid wsp:val=&quot;00414909&quot;/&gt;&lt;wsp:rsid wsp:val=&quot;00416537&quot;/&gt;&lt;wsp:rsid wsp:val=&quot;00425A6A&quot;/&gt;&lt;wsp:rsid wsp:val=&quot;00426FBB&quot;/&gt;&lt;wsp:rsid wsp:val=&quot;00454542&quot;/&gt;&lt;wsp:rsid wsp:val=&quot;0047429A&quot;/&gt;&lt;wsp:rsid wsp:val=&quot;0048374C&quot;/&gt;&lt;wsp:rsid wsp:val=&quot;0048771D&quot;/&gt;&lt;wsp:rsid wsp:val=&quot;004A6605&quot;/&gt;&lt;wsp:rsid wsp:val=&quot;004C45FA&quot;/&gt;&lt;wsp:rsid wsp:val=&quot;004D35A3&quot;/&gt;&lt;wsp:rsid wsp:val=&quot;004E1BD8&quot;/&gt;&lt;wsp:rsid wsp:val=&quot;004E452A&quot;/&gt;&lt;wsp:rsid wsp:val=&quot;004E78E3&quot;/&gt;&lt;wsp:rsid wsp:val=&quot;004F2BFE&quot;/&gt;&lt;wsp:rsid wsp:val=&quot;004F63D3&quot;/&gt;&lt;wsp:rsid wsp:val=&quot;004F7DCF&quot;/&gt;&lt;wsp:rsid wsp:val=&quot;005004BF&quot;/&gt;&lt;wsp:rsid wsp:val=&quot;00502E89&quot;/&gt;&lt;wsp:rsid wsp:val=&quot;00506CFE&quot;/&gt;&lt;wsp:rsid wsp:val=&quot;00510E95&quot;/&gt;&lt;wsp:rsid wsp:val=&quot;005225C3&quot;/&gt;&lt;wsp:rsid wsp:val=&quot;00527D56&quot;/&gt;&lt;wsp:rsid wsp:val=&quot;0053221F&quot;/&gt;&lt;wsp:rsid wsp:val=&quot;00536FAE&quot;/&gt;&lt;wsp:rsid wsp:val=&quot;00542C85&quot;/&gt;&lt;wsp:rsid wsp:val=&quot;00553510&quot;/&gt;&lt;wsp:rsid wsp:val=&quot;00554186&quot;/&gt;&lt;wsp:rsid wsp:val=&quot;00585769&quot;/&gt;&lt;wsp:rsid wsp:val=&quot;00585C61&quot;/&gt;&lt;wsp:rsid wsp:val=&quot;00591130&quot;/&gt;&lt;wsp:rsid wsp:val=&quot;005A3F28&quot;/&gt;&lt;wsp:rsid wsp:val=&quot;005A40BE&quot;/&gt;&lt;wsp:rsid wsp:val=&quot;005B13E2&quot;/&gt;&lt;wsp:rsid wsp:val=&quot;005B47D7&quot;/&gt;&lt;wsp:rsid wsp:val=&quot;005C5526&quot;/&gt;&lt;wsp:rsid wsp:val=&quot;005C62C6&quot;/&gt;&lt;wsp:rsid wsp:val=&quot;005D7B9E&quot;/&gt;&lt;wsp:rsid wsp:val=&quot;005E112E&quot;/&gt;&lt;wsp:rsid wsp:val=&quot;005F0834&quot;/&gt;&lt;wsp:rsid wsp:val=&quot;005F68AB&quot;/&gt;&lt;wsp:rsid wsp:val=&quot;005F6DC3&quot;/&gt;&lt;wsp:rsid wsp:val=&quot;00601A8E&quot;/&gt;&lt;wsp:rsid wsp:val=&quot;0062033E&quot;/&gt;&lt;wsp:rsid wsp:val=&quot;00624482&quot;/&gt;&lt;wsp:rsid wsp:val=&quot;0064799C&quot;/&gt;&lt;wsp:rsid wsp:val=&quot;00654156&quot;/&gt;&lt;wsp:rsid wsp:val=&quot;00656ADC&quot;/&gt;&lt;wsp:rsid wsp:val=&quot;006B47CA&quot;/&gt;&lt;wsp:rsid wsp:val=&quot;006C304C&quot;/&gt;&lt;wsp:rsid wsp:val=&quot;006C4511&quot;/&gt;&lt;wsp:rsid wsp:val=&quot;006C65F5&quot;/&gt;&lt;wsp:rsid wsp:val=&quot;006C7AAA&quot;/&gt;&lt;wsp:rsid wsp:val=&quot;006D1C2A&quot;/&gt;&lt;wsp:rsid wsp:val=&quot;006D264F&quot;/&gt;&lt;wsp:rsid wsp:val=&quot;006D4E89&quot;/&gt;&lt;wsp:rsid wsp:val=&quot;006E2A8D&quot;/&gt;&lt;wsp:rsid wsp:val=&quot;006E7574&quot;/&gt;&lt;wsp:rsid wsp:val=&quot;00703430&quot;/&gt;&lt;wsp:rsid wsp:val=&quot;00703548&quot;/&gt;&lt;wsp:rsid wsp:val=&quot;00704E18&quot;/&gt;&lt;wsp:rsid wsp:val=&quot;007069BE&quot;/&gt;&lt;wsp:rsid wsp:val=&quot;00745C86&quot;/&gt;&lt;wsp:rsid wsp:val=&quot;00764603&quot;/&gt;&lt;wsp:rsid wsp:val=&quot;0076604D&quot;/&gt;&lt;wsp:rsid wsp:val=&quot;00790909&quot;/&gt;&lt;wsp:rsid wsp:val=&quot;007B1582&quot;/&gt;&lt;wsp:rsid wsp:val=&quot;007B5A07&quot;/&gt;&lt;wsp:rsid wsp:val=&quot;007C065D&quot;/&gt;&lt;wsp:rsid wsp:val=&quot;007D3E71&quot;/&gt;&lt;wsp:rsid wsp:val=&quot;007E5D6A&quot;/&gt;&lt;wsp:rsid wsp:val=&quot;007E645D&quot;/&gt;&lt;wsp:rsid wsp:val=&quot;007F75CA&quot;/&gt;&lt;wsp:rsid wsp:val=&quot;00821E08&quot;/&gt;&lt;wsp:rsid wsp:val=&quot;00834EFD&quot;/&gt;&lt;wsp:rsid wsp:val=&quot;00844B24&quot;/&gt;&lt;wsp:rsid wsp:val=&quot;0084515F&quot;/&gt;&lt;wsp:rsid wsp:val=&quot;0085092D&quot;/&gt;&lt;wsp:rsid wsp:val=&quot;00865414&quot;/&gt;&lt;wsp:rsid wsp:val=&quot;00877D4C&quot;/&gt;&lt;wsp:rsid wsp:val=&quot;00883903&quot;/&gt;&lt;wsp:rsid wsp:val=&quot;0089763B&quot;/&gt;&lt;wsp:rsid wsp:val=&quot;008B6AE3&quot;/&gt;&lt;wsp:rsid wsp:val=&quot;008C1332&quot;/&gt;&lt;wsp:rsid wsp:val=&quot;008D1045&quot;/&gt;&lt;wsp:rsid wsp:val=&quot;008E5996&quot;/&gt;&lt;wsp:rsid wsp:val=&quot;00901AE1&quot;/&gt;&lt;wsp:rsid wsp:val=&quot;00912F93&quot;/&gt;&lt;wsp:rsid wsp:val=&quot;009205B4&quot;/&gt;&lt;wsp:rsid wsp:val=&quot;00955B59&quot;/&gt;&lt;wsp:rsid wsp:val=&quot;00992262&quot;/&gt;&lt;wsp:rsid wsp:val=&quot;009926BC&quot;/&gt;&lt;wsp:rsid wsp:val=&quot;009A4319&quot;/&gt;&lt;wsp:rsid wsp:val=&quot;009A6C3F&quot;/&gt;&lt;wsp:rsid wsp:val=&quot;009B73F2&quot;/&gt;&lt;wsp:rsid wsp:val=&quot;009C12BD&quot;/&gt;&lt;wsp:rsid wsp:val=&quot;009C50FE&quot;/&gt;&lt;wsp:rsid wsp:val=&quot;009E49DD&quot;/&gt;&lt;wsp:rsid wsp:val=&quot;00A03E75&quot;/&gt;&lt;wsp:rsid wsp:val=&quot;00A20627&quot;/&gt;&lt;wsp:rsid wsp:val=&quot;00A22FE9&quot;/&gt;&lt;wsp:rsid wsp:val=&quot;00A31A44&quot;/&gt;&lt;wsp:rsid wsp:val=&quot;00A32BFA&quot;/&gt;&lt;wsp:rsid wsp:val=&quot;00A3325E&quot;/&gt;&lt;wsp:rsid wsp:val=&quot;00A45FCE&quot;/&gt;&lt;wsp:rsid wsp:val=&quot;00A75671&quot;/&gt;&lt;wsp:rsid wsp:val=&quot;00A773CC&quot;/&gt;&lt;wsp:rsid wsp:val=&quot;00A924D0&quot;/&gt;&lt;wsp:rsid wsp:val=&quot;00A9318B&quot;/&gt;&lt;wsp:rsid wsp:val=&quot;00A94AC1&quot;/&gt;&lt;wsp:rsid wsp:val=&quot;00AB18B7&quot;/&gt;&lt;wsp:rsid wsp:val=&quot;00AD335D&quot;/&gt;&lt;wsp:rsid wsp:val=&quot;00AF114C&quot;/&gt;&lt;wsp:rsid wsp:val=&quot;00AF792B&quot;/&gt;&lt;wsp:rsid wsp:val=&quot;00B33D2F&quot;/&gt;&lt;wsp:rsid wsp:val=&quot;00B40A5B&quot;/&gt;&lt;wsp:rsid wsp:val=&quot;00B45C6B&quot;/&gt;&lt;wsp:rsid wsp:val=&quot;00B55D5E&quot;/&gt;&lt;wsp:rsid wsp:val=&quot;00B57A80&quot;/&gt;&lt;wsp:rsid wsp:val=&quot;00B70E9C&quot;/&gt;&lt;wsp:rsid wsp:val=&quot;00B713D8&quot;/&gt;&lt;wsp:rsid wsp:val=&quot;00B72979&quot;/&gt;&lt;wsp:rsid wsp:val=&quot;00B94516&quot;/&gt;&lt;wsp:rsid wsp:val=&quot;00BA25E2&quot;/&gt;&lt;wsp:rsid wsp:val=&quot;00BB2855&quot;/&gt;&lt;wsp:rsid wsp:val=&quot;00BC5343&quot;/&gt;&lt;wsp:rsid wsp:val=&quot;00BD19C1&quot;/&gt;&lt;wsp:rsid wsp:val=&quot;00BD25B8&quot;/&gt;&lt;wsp:rsid wsp:val=&quot;00C012E1&quot;/&gt;&lt;wsp:rsid wsp:val=&quot;00C06BB4&quot;/&gt;&lt;wsp:rsid wsp:val=&quot;00C10D20&quot;/&gt;&lt;wsp:rsid wsp:val=&quot;00C12E0C&quot;/&gt;&lt;wsp:rsid wsp:val=&quot;00C21916&quot;/&gt;&lt;wsp:rsid wsp:val=&quot;00C34915&quot;/&gt;&lt;wsp:rsid wsp:val=&quot;00C457CA&quot;/&gt;&lt;wsp:rsid wsp:val=&quot;00C53FB6&quot;/&gt;&lt;wsp:rsid wsp:val=&quot;00C57FB7&quot;/&gt;&lt;wsp:rsid wsp:val=&quot;00C644D4&quot;/&gt;&lt;wsp:rsid wsp:val=&quot;00C65F3F&quot;/&gt;&lt;wsp:rsid wsp:val=&quot;00C72414&quot;/&gt;&lt;wsp:rsid wsp:val=&quot;00C72B1A&quot;/&gt;&lt;wsp:rsid wsp:val=&quot;00C8667B&quot;/&gt;&lt;wsp:rsid wsp:val=&quot;00C90993&quot;/&gt;&lt;wsp:rsid wsp:val=&quot;00CA4CE3&quot;/&gt;&lt;wsp:rsid wsp:val=&quot;00CC72FD&quot;/&gt;&lt;wsp:rsid wsp:val=&quot;00CD4F3F&quot;/&gt;&lt;wsp:rsid wsp:val=&quot;00D311F8&quot;/&gt;&lt;wsp:rsid wsp:val=&quot;00D31660&quot;/&gt;&lt;wsp:rsid wsp:val=&quot;00D36B52&quot;/&gt;&lt;wsp:rsid wsp:val=&quot;00D377C8&quot;/&gt;&lt;wsp:rsid wsp:val=&quot;00D41274&quot;/&gt;&lt;wsp:rsid wsp:val=&quot;00D4229C&quot;/&gt;&lt;wsp:rsid wsp:val=&quot;00D43BF3&quot;/&gt;&lt;wsp:rsid wsp:val=&quot;00D549FB&quot;/&gt;&lt;wsp:rsid wsp:val=&quot;00D767BB&quot;/&gt;&lt;wsp:rsid wsp:val=&quot;00D939B0&quot;/&gt;&lt;wsp:rsid wsp:val=&quot;00DA31A2&quot;/&gt;&lt;wsp:rsid wsp:val=&quot;00DB16E0&quot;/&gt;&lt;wsp:rsid wsp:val=&quot;00DB2DF9&quot;/&gt;&lt;wsp:rsid wsp:val=&quot;00DB465D&quot;/&gt;&lt;wsp:rsid wsp:val=&quot;00DB48A2&quot;/&gt;&lt;wsp:rsid wsp:val=&quot;00DB7E63&quot;/&gt;&lt;wsp:rsid wsp:val=&quot;00DC2055&quot;/&gt;&lt;wsp:rsid wsp:val=&quot;00DC3908&quot;/&gt;&lt;wsp:rsid wsp:val=&quot;00DD71E8&quot;/&gt;&lt;wsp:rsid wsp:val=&quot;00DD7F83&quot;/&gt;&lt;wsp:rsid wsp:val=&quot;00DE4EB8&quot;/&gt;&lt;wsp:rsid wsp:val=&quot;00E0641E&quot;/&gt;&lt;wsp:rsid wsp:val=&quot;00E06664&quot;/&gt;&lt;wsp:rsid wsp:val=&quot;00E304BC&quot;/&gt;&lt;wsp:rsid wsp:val=&quot;00E32853&quot;/&gt;&lt;wsp:rsid wsp:val=&quot;00E34EBD&quot;/&gt;&lt;wsp:rsid wsp:val=&quot;00E401F8&quot;/&gt;&lt;wsp:rsid wsp:val=&quot;00E46425&quot;/&gt;&lt;wsp:rsid wsp:val=&quot;00E469FC&quot;/&gt;&lt;wsp:rsid wsp:val=&quot;00E47D0E&quot;/&gt;&lt;wsp:rsid wsp:val=&quot;00E65018&quot;/&gt;&lt;wsp:rsid wsp:val=&quot;00E76CA1&quot;/&gt;&lt;wsp:rsid wsp:val=&quot;00E94339&quot;/&gt;&lt;wsp:rsid wsp:val=&quot;00E97563&quot;/&gt;&lt;wsp:rsid wsp:val=&quot;00EB0B63&quot;/&gt;&lt;wsp:rsid wsp:val=&quot;00EC265C&quot;/&gt;&lt;wsp:rsid wsp:val=&quot;00ED61CB&quot;/&gt;&lt;wsp:rsid wsp:val=&quot;00EE752A&quot;/&gt;&lt;wsp:rsid wsp:val=&quot;00F06A72&quot;/&gt;&lt;wsp:rsid wsp:val=&quot;00F136F0&quot;/&gt;&lt;wsp:rsid wsp:val=&quot;00F20BBB&quot;/&gt;&lt;wsp:rsid wsp:val=&quot;00F36048&quot;/&gt;&lt;wsp:rsid wsp:val=&quot;00F43BD8&quot;/&gt;&lt;wsp:rsid wsp:val=&quot;00F562F3&quot;/&gt;&lt;wsp:rsid wsp:val=&quot;00F74B89&quot;/&gt;&lt;wsp:rsid wsp:val=&quot;00F75133&quot;/&gt;&lt;wsp:rsid wsp:val=&quot;00F83272&quot;/&gt;&lt;wsp:rsid wsp:val=&quot;00F9358D&quot;/&gt;&lt;wsp:rsid wsp:val=&quot;00FA3899&quot;/&gt;&lt;wsp:rsid wsp:val=&quot;00FA4909&quot;/&gt;&lt;wsp:rsid wsp:val=&quot;00FA5164&quot;/&gt;&lt;wsp:rsid wsp:val=&quot;00FA6751&quot;/&gt;&lt;wsp:rsid wsp:val=&quot;00FA6BD7&quot;/&gt;&lt;wsp:rsid wsp:val=&quot;00FB1048&quot;/&gt;&lt;wsp:rsid wsp:val=&quot;00FB62C4&quot;/&gt;&lt;wsp:rsid wsp:val=&quot;00FB7701&quot;/&gt;&lt;wsp:rsid wsp:val=&quot;00FD1AC5&quot;/&gt;&lt;wsp:rsid wsp:val=&quot;00FD5CF0&quot;/&gt;&lt;/wsp:rsids&gt;&lt;/w:docPr&gt;&lt;w:body&gt;&lt;wx:sect&gt;&lt;w:p wsp:rsidR=&quot;00313E88&quot; wsp:rsidRPr=&quot;00313E88&quot; wsp:rsidRDefault=&quot;00313E88&quot; wsp:rsidP=&quot;00313E88&quot;&gt;&lt;m:oMathPara&gt;&lt;m:oMath&gt;&lt;m:sSub&gt;&lt;m:sSubPr&gt;&lt;m:ctrlPr&gt;&lt;w:rPr&gt;&lt;w:rFonts w:ascii=&quot;Cambria Math&quot; w:h-ansi=&quot;Cambria Math&quot;/&gt;&lt;wx:font wx:val=&quot;Cambria Math&quot;/&gt;&lt;w:i/&gt;&lt;/w:rPr&gt;&lt;/m:ctrlPr&gt;&lt;/m:sSubPr&gt;&lt;m:e&gt;&lt;m:r&gt;&lt;w:rPr&gt;&lt;w:rFonts w:ascii=&quot;Cambria Math&quot; w:h-ansi=&quot;Cambria Math&quot;/&gt;&lt;wx:font wx:val=&quot;Cambria Math&quot;/&gt;&lt;w:i/&gt;&lt;/w:rPr&gt;&lt;m:t&gt;I&lt;/m:t&gt;&lt;/m:r&gt;&lt;/m:e&gt;&lt;m:sub&gt;&lt;m:r&gt;&lt;w:rPr&gt;&lt;w:rFonts w:ascii=&quot;Cambria Math&quot; w:h-ansi=&quot;Cambria Math&quot;/&gt;&lt;wx:font wx:val=&quot;Cambria Math&quot;/&gt;&lt;w:i/&gt;&lt;/w:rPr&gt;&lt;m:t&gt;out&lt;/m:t&gt;&lt;/m:r&gt;&lt;/m:sub&gt;&lt;/m:sSub&gt;&lt;/m:oMath&gt;&lt;/m:oMathPara&gt;&lt;/w:p&gt;&lt;w:sectPr wsp:rsidR=&quot;00000000&quot; wsp:rsidRPr=&quot;00313E88&quot;&gt;&lt;w:pgSz w:w=&quot;12240&quot; w:h=&quot;15840&quot;/&gt;&lt;w:pgMar w:top=&quot;1440&quot; w:right=&quot;1440&quot; w:bottom=&quot;1440&quot; w:left=&quot;1440&quot; w:header=&quot;720&quot; w:footer=&quot;720&quot; w:gutter=&quot;0&quot;/&gt;&lt;w:cols w:space=&quot;720&quot;/&gt;&lt;/w:sectPr&gt;&lt;/wx:sect&gt;&lt;/w:body&gt;&lt;/w:wordDocument&gt;">
                   <v:imagedata r:id="rId19" o:title="" chromakey="white"/>
                 </v:shape>
               </w:pict>
@@ -1780,7 +1780,7 @@
         </w:tc>
         <w:tc>
           <w:tcPr>
-            <w:tcW w:w="850" w:type="dxa"/>
+            <w:tcW w:w="852" w:type="dxa"/>
             <w:shd w:val="clear" w:color="auto" w:fill="auto"/>
           </w:tcPr>
           <w:p>
@@ -1802,7 +1802,7 @@
         </w:tc>
         <w:tc>
           <w:tcPr>
-            <w:tcW w:w="898" w:type="dxa"/>
+            <w:tcW w:w="900" w:type="dxa"/>
             <w:shd w:val="clear" w:color="auto" w:fill="auto"/>
           </w:tcPr>
           <w:p>
@@ -1825,12 +1825,12 @@
       </w:tr>
       <w:tr>
         <w:trPr>
-          <w:trHeight w:val="415"/>
+          <w:trHeight w:val="51"/>
           <w:jc w:val="center"/>
         </w:trPr>
         <w:tc>
           <w:tcPr>
-            <w:tcW w:w="2255" w:type="dxa"/>
+            <w:tcW w:w="2261" w:type="dxa"/>
             <w:shd w:val="clear" w:color="auto" w:fill="D9D9D9"/>
           </w:tcPr>
           <w:p>
@@ -1851,7 +1851,7 @@
         </w:tc>
         <w:tc>
           <w:tcPr>
-            <w:tcW w:w="993" w:type="dxa"/>
+            <w:tcW w:w="995" w:type="dxa"/>
             <w:shd w:val="clear" w:color="auto" w:fill="D9D9D9"/>
           </w:tcPr>
           <w:p>
@@ -1868,7 +1868,7 @@
                 <w:szCs w:val="18"/>
               </w:rPr>
               <w:pict w14:anchorId="01CD5BD7">
-                <v:shape id="_x0000_i1442" type="#_x0000_t75" style="width:9.25pt;height:13.65pt" equationxml="&lt;?xml version=&quot;1.0&quot; encoding=&quot;UTF-8&quot; standalone=&quot;yes&quot;?&gt;&#10;&lt;?mso-application progid=&quot;Word.Document&quot;?&gt;&#10;&lt;w:wordDocument xmlns:aml=&quot;http://schemas.microsoft.com/aml/2001/core&quot; xmlns:wpc=&quot;http://schemas.microsoft.com/office/word/2010/wordprocessingCanvas&quot; xmlns:cx=&quot;http://schemas.microsoft.com/office/drawing/2014/chartex&quot; xmlns:cx1=&quot;http://schemas.microsoft.com/office/drawing/2015/9/8/chartex&quot; xmlns:cx2=&quot;http://schemas.microsoft.com/office/drawing/2015/10/21/chartex&quot; xmlns:cx3=&quot;http://schemas.microsoft.com/office/drawing/2016/5/9/chartex&quot; xmlns:cx4=&quot;http://schemas.microsoft.com/office/drawing/2016/5/10/chartex&quot; xmlns:cx5=&quot;http://schemas.microsoft.com/office/drawing/2016/5/11/chartex&quot; xmlns:cx6=&quot;http://schemas.microsoft.com/office/drawing/2016/5/12/chartex&quot; xmlns:cx7=&quot;http://schemas.microsoft.com/office/drawing/2016/5/13/chartex&quot; xmlns:cx8=&quot;http://schemas.microsoft.com/office/drawing/2016/5/14/chartex&quot; xmlns:cr=&quot;http://schemas.microsoft.com/office/comments/2020/reactions&quot; xmlns:dt=&quot;uuid:C2F41010-65B3-11d1-A29F-00AA00C14882&quot; xmlns:mc=&quot;http://schemas.openxmlformats.org/markup-compatibility/2006&quot; xmlns:aink=&quot;http://schemas.microsoft.com/office/drawing/2016/ink&quot; xmlns:am3d=&quot;http://schemas.microsoft.com/office/drawing/2017/model3d&quot; xmlns:o=&quot;urn:schemas-microsoft-com:office:office&quot; xmlns:oel=&quot;http://schemas.microsoft.com/office/2019/extlst&quot; xmlns:m=&quot;http://schemas.openxmlformats.org/officeDocument/2006/math&quot; xmlns:v=&quot;urn:schemas-microsoft-com:vml&quot; xmlns:w10=&quot;urn:schemas-microsoft-com:office:word&quot; xmlns:w=&quot;http://schemas.microsoft.com/office/word/2003/wordml&quot; xmlns:wx=&quot;http://schemas.microsoft.com/office/word/2003/auxHint&quot; xmlns:wne=&quot;http://schemas.microsoft.com/office/word/2006/wordml&quot; xmlns:wsp=&quot;http://schemas.microsoft.com/office/word/2003/wordml/sp2&quot; xmlns:sl=&quot;http://schemas.microsoft.com/schemaLibrary/2003/core&quot; w:macrosPresent=&quot;no&quot; w:embeddedObjPresent=&quot;no&quot; w:ocxPresent=&quot;no&quot; xml:space=&quot;preserve&quot;&gt;&lt;w:ignoreSubtree w:val=&quot;http://schemas.microsoft.com/office/word/2003/wordml/sp2&quot;/&gt;&lt;o:DocumentProperties&gt;&lt;o:Version&gt;16&lt;/o:Version&gt;&lt;/o:DocumentProperties&gt;&lt;w:docPr&gt;&lt;w:view w:val=&quot;print&quot;/&gt;&lt;w:zoom w:percent=&quot;100&quot;/&gt;&lt;w:doNotEmbedSystemFonts/&gt;&lt;w:activeWritingStyle w:lang=&quot;EN-AU&quot; w:vendorID=&quot;64&quot; w:dllVersion=&quot;6&quot; w:nlCheck=&quot;on&quot; w:optionSet=&quot;1&quot;/&gt;&lt;w:activeWritingStyle w:lang=&quot;EN-GB&quot; w:vendorID=&quot;64&quot; w:dllVersion=&quot;6&quot; w:nlCheck=&quot;on&quot; w:optionSet=&quot;1&quot;/&gt;&lt;w:activeWritingStyle w:lang=&quot;EN-US&quot; w:vendorID=&quot;64&quot; w:dllVersion=&quot;6&quot; w:nlCheck=&quot;on&quot; w:optionSet=&quot;1&quot;/&gt;&lt;w:activeWritingStyle w:lang=&quot;EN-AU&quot; w:vendorID=&quot;64&quot; w:dllVersion=&quot;0&quot; w:nlCheck=&quot;on&quot; w:optionSet=&quot;0&quot;/&gt;&lt;w:activeWritingStyle w:lang=&quot;EN-GB&quot; w:vendorID=&quot;64&quot; w:dllVersion=&quot;0&quot; w:nlCheck=&quot;on&quot; w:optionSet=&quot;0&quot;/&gt;&lt;w:activeWritingStyle w:lang=&quot;EN-US&quot; w:vendorID=&quot;64&quot; w:dllVersion=&quot;0&quot; w:nlCheck=&quot;on&quot; w:optionSet=&quot;0&quot;/&gt;&lt;w:activeWritingStyle w:lang=&quot;ES-AR&quot; w:vendorID=&quot;64&quot; w:dllVersion=&quot;0&quot; w:nlCheck=&quot;on&quot; w:optionSet=&quot;0&quot;/&gt;&lt;w:activeWritingStyle w:lang=&quot;580A&quot; w:vendorID=&quot;64&quot; w:dllVersion=&quot;0&quot; w:nlCheck=&quot;on&quot; w:optionSet=&quot;0&quot;/&gt;&lt;w:activeWritingStyle w:lang=&quot;PT-BR&quot; w:vendorID=&quot;64&quot; w:dllVersion=&quot;0&quot; w:nlCheck=&quot;on&quot; w:optionSet=&quot;0&quot;/&gt;&lt;w:stylePaneFormatFilter w:val=&quot;3F01&quot;/&gt;&lt;w:defaultTabStop w:val=&quot;720&quot;/&gt;&lt;w:hyphenationZone w:val=&quot;425&quot;/&gt;&lt;w:characterSpacingControl w:val=&quot;DontCompress&quot;/&gt;&lt;w:optimizeForBrowser/&gt;&lt;w:validateAgainstSchema/&gt;&lt;w:saveInvalidXML w:val=&quot;off&quot;/&gt;&lt;w:ignoreMixedContent w:val=&quot;off&quot;/&gt;&lt;w:alwaysShowPlaceholderText w:val=&quot;off&quot;/&gt;&lt;w:compat&gt;&lt;w:breakWrappedTables/&gt;&lt;w:snapToGridInCell/&gt;&lt;w:applyBreakingRules/&gt;&lt;w:wrapTextWithPunct/&gt;&lt;w:useAsianBreakRules/&gt;&lt;w:useWord2002TableStyleRules/&gt;&lt;w:useFELayout/&gt;&lt;/w:compat&gt;&lt;wsp:rsids&gt;&lt;wsp:rsidRoot wsp:val=&quot;00426FBB&quot;/&gt;&lt;wsp:rsid wsp:val=&quot;000002E1&quot;/&gt;&lt;wsp:rsid wsp:val=&quot;00003C97&quot;/&gt;&lt;wsp:rsid wsp:val=&quot;00005565&quot;/&gt;&lt;wsp:rsid wsp:val=&quot;0001754A&quot;/&gt;&lt;wsp:rsid wsp:val=&quot;00017719&quot;/&gt;&lt;wsp:rsid wsp:val=&quot;00027F1D&quot;/&gt;&lt;wsp:rsid wsp:val=&quot;0003296C&quot;/&gt;&lt;wsp:rsid wsp:val=&quot;0003351F&quot;/&gt;&lt;wsp:rsid wsp:val=&quot;00044599&quot;/&gt;&lt;wsp:rsid wsp:val=&quot;000540E6&quot;/&gt;&lt;wsp:rsid wsp:val=&quot;00054421&quot;/&gt;&lt;wsp:rsid wsp:val=&quot;00062E46&quot;/&gt;&lt;wsp:rsid wsp:val=&quot;00074AC8&quot;/&gt;&lt;wsp:rsid wsp:val=&quot;00081408&quot;/&gt;&lt;wsp:rsid wsp:val=&quot;00081EBE&quot;/&gt;&lt;wsp:rsid wsp:val=&quot;00086EDC&quot;/&gt;&lt;wsp:rsid wsp:val=&quot;000B1236&quot;/&gt;&lt;wsp:rsid wsp:val=&quot;000B36A3&quot;/&gt;&lt;wsp:rsid wsp:val=&quot;000C013C&quot;/&gt;&lt;wsp:rsid wsp:val=&quot;000E3F84&quot;/&gt;&lt;wsp:rsid wsp:val=&quot;001056DF&quot;/&gt;&lt;wsp:rsid wsp:val=&quot;0010789C&quot;/&gt;&lt;wsp:rsid wsp:val=&quot;00114025&quot;/&gt;&lt;wsp:rsid wsp:val=&quot;001160D2&quot;/&gt;&lt;wsp:rsid wsp:val=&quot;00120636&quot;/&gt;&lt;wsp:rsid wsp:val=&quot;001348A5&quot;/&gt;&lt;wsp:rsid wsp:val=&quot;00151B8E&quot;/&gt;&lt;wsp:rsid wsp:val=&quot;00182170&quot;/&gt;&lt;wsp:rsid wsp:val=&quot;001928FB&quot;/&gt;&lt;wsp:rsid wsp:val=&quot;00192BC7&quot;/&gt;&lt;wsp:rsid wsp:val=&quot;00195BE6&quot;/&gt;&lt;wsp:rsid wsp:val=&quot;001A50EA&quot;/&gt;&lt;wsp:rsid wsp:val=&quot;001F16CD&quot;/&gt;&lt;wsp:rsid wsp:val=&quot;001F47D2&quot;/&gt;&lt;wsp:rsid wsp:val=&quot;002029C8&quot;/&gt;&lt;wsp:rsid wsp:val=&quot;0022285A&quot;/&gt;&lt;wsp:rsid wsp:val=&quot;00224C61&quot;/&gt;&lt;wsp:rsid wsp:val=&quot;00256ABC&quot;/&gt;&lt;wsp:rsid wsp:val=&quot;0027227B&quot;/&gt;&lt;wsp:rsid wsp:val=&quot;00273AC7&quot;/&gt;&lt;wsp:rsid wsp:val=&quot;00273D2C&quot;/&gt;&lt;wsp:rsid wsp:val=&quot;00285ECD&quot;/&gt;&lt;wsp:rsid wsp:val=&quot;00290E1B&quot;/&gt;&lt;wsp:rsid wsp:val=&quot;00291B17&quot;/&gt;&lt;wsp:rsid wsp:val=&quot;00291BB3&quot;/&gt;&lt;wsp:rsid wsp:val=&quot;002A6742&quot;/&gt;&lt;wsp:rsid wsp:val=&quot;002C1A7F&quot;/&gt;&lt;wsp:rsid wsp:val=&quot;002C4239&quot;/&gt;&lt;wsp:rsid wsp:val=&quot;002C559D&quot;/&gt;&lt;wsp:rsid wsp:val=&quot;002D16AE&quot;/&gt;&lt;wsp:rsid wsp:val=&quot;002D2D42&quot;/&gt;&lt;wsp:rsid wsp:val=&quot;002F72D0&quot;/&gt;&lt;wsp:rsid wsp:val=&quot;002F7A4F&quot;/&gt;&lt;wsp:rsid wsp:val=&quot;003003AB&quot;/&gt;&lt;wsp:rsid wsp:val=&quot;00302C35&quot;/&gt;&lt;wsp:rsid wsp:val=&quot;00311C49&quot;/&gt;&lt;wsp:rsid wsp:val=&quot;0032119E&quot;/&gt;&lt;wsp:rsid wsp:val=&quot;00321304&quot;/&gt;&lt;wsp:rsid wsp:val=&quot;00324FC2&quot;/&gt;&lt;wsp:rsid wsp:val=&quot;003312CA&quot;/&gt;&lt;wsp:rsid wsp:val=&quot;00331F84&quot;/&gt;&lt;wsp:rsid wsp:val=&quot;0037721F&quot;/&gt;&lt;wsp:rsid wsp:val=&quot;003950A4&quot;/&gt;&lt;wsp:rsid wsp:val=&quot;003A1E7E&quot;/&gt;&lt;wsp:rsid wsp:val=&quot;003E2FDC&quot;/&gt;&lt;wsp:rsid wsp:val=&quot;003E3577&quot;/&gt;&lt;wsp:rsid wsp:val=&quot;003F3A61&quot;/&gt;&lt;wsp:rsid wsp:val=&quot;00410A5D&quot;/&gt;&lt;wsp:rsid wsp:val=&quot;00414909&quot;/&gt;&lt;wsp:rsid wsp:val=&quot;00416537&quot;/&gt;&lt;wsp:rsid wsp:val=&quot;00425A6A&quot;/&gt;&lt;wsp:rsid wsp:val=&quot;00426FBB&quot;/&gt;&lt;wsp:rsid wsp:val=&quot;00454542&quot;/&gt;&lt;wsp:rsid wsp:val=&quot;0047429A&quot;/&gt;&lt;wsp:rsid wsp:val=&quot;0048374C&quot;/&gt;&lt;wsp:rsid wsp:val=&quot;0048771D&quot;/&gt;&lt;wsp:rsid wsp:val=&quot;004A3A1F&quot;/&gt;&lt;wsp:rsid wsp:val=&quot;004A6605&quot;/&gt;&lt;wsp:rsid wsp:val=&quot;004C45FA&quot;/&gt;&lt;wsp:rsid wsp:val=&quot;004D35A3&quot;/&gt;&lt;wsp:rsid wsp:val=&quot;004E1BD8&quot;/&gt;&lt;wsp:rsid wsp:val=&quot;004E452A&quot;/&gt;&lt;wsp:rsid wsp:val=&quot;004E78E3&quot;/&gt;&lt;wsp:rsid wsp:val=&quot;004F2BFE&quot;/&gt;&lt;wsp:rsid wsp:val=&quot;004F63D3&quot;/&gt;&lt;wsp:rsid wsp:val=&quot;004F7DCF&quot;/&gt;&lt;wsp:rsid wsp:val=&quot;005004BF&quot;/&gt;&lt;wsp:rsid wsp:val=&quot;00502E89&quot;/&gt;&lt;wsp:rsid wsp:val=&quot;00506CFE&quot;/&gt;&lt;wsp:rsid wsp:val=&quot;00510E95&quot;/&gt;&lt;wsp:rsid wsp:val=&quot;005225C3&quot;/&gt;&lt;wsp:rsid wsp:val=&quot;00527D56&quot;/&gt;&lt;wsp:rsid wsp:val=&quot;0053221F&quot;/&gt;&lt;wsp:rsid wsp:val=&quot;00536FAE&quot;/&gt;&lt;wsp:rsid wsp:val=&quot;00542C85&quot;/&gt;&lt;wsp:rsid wsp:val=&quot;00553510&quot;/&gt;&lt;wsp:rsid wsp:val=&quot;00554186&quot;/&gt;&lt;wsp:rsid wsp:val=&quot;00585769&quot;/&gt;&lt;wsp:rsid wsp:val=&quot;00585C61&quot;/&gt;&lt;wsp:rsid wsp:val=&quot;00591130&quot;/&gt;&lt;wsp:rsid wsp:val=&quot;005A3F28&quot;/&gt;&lt;wsp:rsid wsp:val=&quot;005A40BE&quot;/&gt;&lt;wsp:rsid wsp:val=&quot;005B13E2&quot;/&gt;&lt;wsp:rsid wsp:val=&quot;005B47D7&quot;/&gt;&lt;wsp:rsid wsp:val=&quot;005C5526&quot;/&gt;&lt;wsp:rsid wsp:val=&quot;005C62C6&quot;/&gt;&lt;wsp:rsid wsp:val=&quot;005D7B9E&quot;/&gt;&lt;wsp:rsid wsp:val=&quot;005E112E&quot;/&gt;&lt;wsp:rsid wsp:val=&quot;005F0834&quot;/&gt;&lt;wsp:rsid wsp:val=&quot;005F68AB&quot;/&gt;&lt;wsp:rsid wsp:val=&quot;005F6DC3&quot;/&gt;&lt;wsp:rsid wsp:val=&quot;00601A8E&quot;/&gt;&lt;wsp:rsid wsp:val=&quot;0062033E&quot;/&gt;&lt;wsp:rsid wsp:val=&quot;00624482&quot;/&gt;&lt;wsp:rsid wsp:val=&quot;0064799C&quot;/&gt;&lt;wsp:rsid wsp:val=&quot;00654156&quot;/&gt;&lt;wsp:rsid wsp:val=&quot;00656ADC&quot;/&gt;&lt;wsp:rsid wsp:val=&quot;006B47CA&quot;/&gt;&lt;wsp:rsid wsp:val=&quot;006C304C&quot;/&gt;&lt;wsp:rsid wsp:val=&quot;006C4511&quot;/&gt;&lt;wsp:rsid wsp:val=&quot;006C65F5&quot;/&gt;&lt;wsp:rsid wsp:val=&quot;006C7AAA&quot;/&gt;&lt;wsp:rsid wsp:val=&quot;006D1C2A&quot;/&gt;&lt;wsp:rsid wsp:val=&quot;006D264F&quot;/&gt;&lt;wsp:rsid wsp:val=&quot;006D4E89&quot;/&gt;&lt;wsp:rsid wsp:val=&quot;006E2A8D&quot;/&gt;&lt;wsp:rsid wsp:val=&quot;006E7574&quot;/&gt;&lt;wsp:rsid wsp:val=&quot;00703430&quot;/&gt;&lt;wsp:rsid wsp:val=&quot;00703548&quot;/&gt;&lt;wsp:rsid wsp:val=&quot;00704E18&quot;/&gt;&lt;wsp:rsid wsp:val=&quot;007069BE&quot;/&gt;&lt;wsp:rsid wsp:val=&quot;00745C86&quot;/&gt;&lt;wsp:rsid wsp:val=&quot;00764603&quot;/&gt;&lt;wsp:rsid wsp:val=&quot;0076604D&quot;/&gt;&lt;wsp:rsid wsp:val=&quot;00790909&quot;/&gt;&lt;wsp:rsid wsp:val=&quot;007B1582&quot;/&gt;&lt;wsp:rsid wsp:val=&quot;007B5A07&quot;/&gt;&lt;wsp:rsid wsp:val=&quot;007C065D&quot;/&gt;&lt;wsp:rsid wsp:val=&quot;007D3E71&quot;/&gt;&lt;wsp:rsid wsp:val=&quot;007E5D6A&quot;/&gt;&lt;wsp:rsid wsp:val=&quot;007E645D&quot;/&gt;&lt;wsp:rsid wsp:val=&quot;007F75CA&quot;/&gt;&lt;wsp:rsid wsp:val=&quot;00821E08&quot;/&gt;&lt;wsp:rsid wsp:val=&quot;00834EFD&quot;/&gt;&lt;wsp:rsid wsp:val=&quot;00844B24&quot;/&gt;&lt;wsp:rsid wsp:val=&quot;0084515F&quot;/&gt;&lt;wsp:rsid wsp:val=&quot;0085092D&quot;/&gt;&lt;wsp:rsid wsp:val=&quot;00865414&quot;/&gt;&lt;wsp:rsid wsp:val=&quot;00877D4C&quot;/&gt;&lt;wsp:rsid wsp:val=&quot;00883903&quot;/&gt;&lt;wsp:rsid wsp:val=&quot;0089763B&quot;/&gt;&lt;wsp:rsid wsp:val=&quot;008B6AE3&quot;/&gt;&lt;wsp:rsid wsp:val=&quot;008C1332&quot;/&gt;&lt;wsp:rsid wsp:val=&quot;008D1045&quot;/&gt;&lt;wsp:rsid wsp:val=&quot;008E5996&quot;/&gt;&lt;wsp:rsid wsp:val=&quot;00901AE1&quot;/&gt;&lt;wsp:rsid wsp:val=&quot;00912F93&quot;/&gt;&lt;wsp:rsid wsp:val=&quot;009205B4&quot;/&gt;&lt;wsp:rsid wsp:val=&quot;00955B59&quot;/&gt;&lt;wsp:rsid wsp:val=&quot;00992262&quot;/&gt;&lt;wsp:rsid wsp:val=&quot;009926BC&quot;/&gt;&lt;wsp:rsid wsp:val=&quot;009A4319&quot;/&gt;&lt;wsp:rsid wsp:val=&quot;009A6C3F&quot;/&gt;&lt;wsp:rsid wsp:val=&quot;009B73F2&quot;/&gt;&lt;wsp:rsid wsp:val=&quot;009C12BD&quot;/&gt;&lt;wsp:rsid wsp:val=&quot;009C50FE&quot;/&gt;&lt;wsp:rsid wsp:val=&quot;009E49DD&quot;/&gt;&lt;wsp:rsid wsp:val=&quot;00A03E75&quot;/&gt;&lt;wsp:rsid wsp:val=&quot;00A20627&quot;/&gt;&lt;wsp:rsid wsp:val=&quot;00A22FE9&quot;/&gt;&lt;wsp:rsid wsp:val=&quot;00A31A44&quot;/&gt;&lt;wsp:rsid wsp:val=&quot;00A32BFA&quot;/&gt;&lt;wsp:rsid wsp:val=&quot;00A3325E&quot;/&gt;&lt;wsp:rsid wsp:val=&quot;00A45FCE&quot;/&gt;&lt;wsp:rsid wsp:val=&quot;00A75671&quot;/&gt;&lt;wsp:rsid wsp:val=&quot;00A773CC&quot;/&gt;&lt;wsp:rsid wsp:val=&quot;00A924D0&quot;/&gt;&lt;wsp:rsid wsp:val=&quot;00A9318B&quot;/&gt;&lt;wsp:rsid wsp:val=&quot;00A94AC1&quot;/&gt;&lt;wsp:rsid wsp:val=&quot;00AB18B7&quot;/&gt;&lt;wsp:rsid wsp:val=&quot;00AD335D&quot;/&gt;&lt;wsp:rsid wsp:val=&quot;00AF114C&quot;/&gt;&lt;wsp:rsid wsp:val=&quot;00AF792B&quot;/&gt;&lt;wsp:rsid wsp:val=&quot;00B33D2F&quot;/&gt;&lt;wsp:rsid wsp:val=&quot;00B40A5B&quot;/&gt;&lt;wsp:rsid wsp:val=&quot;00B45C6B&quot;/&gt;&lt;wsp:rsid wsp:val=&quot;00B55D5E&quot;/&gt;&lt;wsp:rsid wsp:val=&quot;00B57A80&quot;/&gt;&lt;wsp:rsid wsp:val=&quot;00B70E9C&quot;/&gt;&lt;wsp:rsid wsp:val=&quot;00B713D8&quot;/&gt;&lt;wsp:rsid wsp:val=&quot;00B72979&quot;/&gt;&lt;wsp:rsid wsp:val=&quot;00B94516&quot;/&gt;&lt;wsp:rsid wsp:val=&quot;00BA25E2&quot;/&gt;&lt;wsp:rsid wsp:val=&quot;00BB2855&quot;/&gt;&lt;wsp:rsid wsp:val=&quot;00BC5343&quot;/&gt;&lt;wsp:rsid wsp:val=&quot;00BD19C1&quot;/&gt;&lt;wsp:rsid wsp:val=&quot;00BD25B8&quot;/&gt;&lt;wsp:rsid wsp:val=&quot;00C012E1&quot;/&gt;&lt;wsp:rsid wsp:val=&quot;00C06BB4&quot;/&gt;&lt;wsp:rsid wsp:val=&quot;00C10D20&quot;/&gt;&lt;wsp:rsid wsp:val=&quot;00C12E0C&quot;/&gt;&lt;wsp:rsid wsp:val=&quot;00C21916&quot;/&gt;&lt;wsp:rsid wsp:val=&quot;00C34915&quot;/&gt;&lt;wsp:rsid wsp:val=&quot;00C457CA&quot;/&gt;&lt;wsp:rsid wsp:val=&quot;00C53FB6&quot;/&gt;&lt;wsp:rsid wsp:val=&quot;00C57FB7&quot;/&gt;&lt;wsp:rsid wsp:val=&quot;00C644D4&quot;/&gt;&lt;wsp:rsid wsp:val=&quot;00C65F3F&quot;/&gt;&lt;wsp:rsid wsp:val=&quot;00C72414&quot;/&gt;&lt;wsp:rsid wsp:val=&quot;00C72B1A&quot;/&gt;&lt;wsp:rsid wsp:val=&quot;00C8667B&quot;/&gt;&lt;wsp:rsid wsp:val=&quot;00C90993&quot;/&gt;&lt;wsp:rsid wsp:val=&quot;00CA4CE3&quot;/&gt;&lt;wsp:rsid wsp:val=&quot;00CC72FD&quot;/&gt;&lt;wsp:rsid wsp:val=&quot;00CD4F3F&quot;/&gt;&lt;wsp:rsid wsp:val=&quot;00D311F8&quot;/&gt;&lt;wsp:rsid wsp:val=&quot;00D31660&quot;/&gt;&lt;wsp:rsid wsp:val=&quot;00D36B52&quot;/&gt;&lt;wsp:rsid wsp:val=&quot;00D377C8&quot;/&gt;&lt;wsp:rsid wsp:val=&quot;00D41274&quot;/&gt;&lt;wsp:rsid wsp:val=&quot;00D4229C&quot;/&gt;&lt;wsp:rsid wsp:val=&quot;00D43BF3&quot;/&gt;&lt;wsp:rsid wsp:val=&quot;00D549FB&quot;/&gt;&lt;wsp:rsid wsp:val=&quot;00D767BB&quot;/&gt;&lt;wsp:rsid wsp:val=&quot;00D939B0&quot;/&gt;&lt;wsp:rsid wsp:val=&quot;00DA31A2&quot;/&gt;&lt;wsp:rsid wsp:val=&quot;00DB16E0&quot;/&gt;&lt;wsp:rsid wsp:val=&quot;00DB2DF9&quot;/&gt;&lt;wsp:rsid wsp:val=&quot;00DB465D&quot;/&gt;&lt;wsp:rsid wsp:val=&quot;00DB48A2&quot;/&gt;&lt;wsp:rsid wsp:val=&quot;00DB7E63&quot;/&gt;&lt;wsp:rsid wsp:val=&quot;00DC2055&quot;/&gt;&lt;wsp:rsid wsp:val=&quot;00DC3908&quot;/&gt;&lt;wsp:rsid wsp:val=&quot;00DD71E8&quot;/&gt;&lt;wsp:rsid wsp:val=&quot;00DD7F83&quot;/&gt;&lt;wsp:rsid wsp:val=&quot;00DE4EB8&quot;/&gt;&lt;wsp:rsid wsp:val=&quot;00E0641E&quot;/&gt;&lt;wsp:rsid wsp:val=&quot;00E06664&quot;/&gt;&lt;wsp:rsid wsp:val=&quot;00E304BC&quot;/&gt;&lt;wsp:rsid wsp:val=&quot;00E32853&quot;/&gt;&lt;wsp:rsid wsp:val=&quot;00E34EBD&quot;/&gt;&lt;wsp:rsid wsp:val=&quot;00E401F8&quot;/&gt;&lt;wsp:rsid wsp:val=&quot;00E46425&quot;/&gt;&lt;wsp:rsid wsp:val=&quot;00E469FC&quot;/&gt;&lt;wsp:rsid wsp:val=&quot;00E47D0E&quot;/&gt;&lt;wsp:rsid wsp:val=&quot;00E65018&quot;/&gt;&lt;wsp:rsid wsp:val=&quot;00E76CA1&quot;/&gt;&lt;wsp:rsid wsp:val=&quot;00E94339&quot;/&gt;&lt;wsp:rsid wsp:val=&quot;00E97563&quot;/&gt;&lt;wsp:rsid wsp:val=&quot;00EB0B63&quot;/&gt;&lt;wsp:rsid wsp:val=&quot;00EC265C&quot;/&gt;&lt;wsp:rsid wsp:val=&quot;00ED61CB&quot;/&gt;&lt;wsp:rsid wsp:val=&quot;00EE752A&quot;/&gt;&lt;wsp:rsid wsp:val=&quot;00F06A72&quot;/&gt;&lt;wsp:rsid wsp:val=&quot;00F136F0&quot;/&gt;&lt;wsp:rsid wsp:val=&quot;00F20BBB&quot;/&gt;&lt;wsp:rsid wsp:val=&quot;00F36048&quot;/&gt;&lt;wsp:rsid wsp:val=&quot;00F43BD8&quot;/&gt;&lt;wsp:rsid wsp:val=&quot;00F562F3&quot;/&gt;&lt;wsp:rsid wsp:val=&quot;00F74B89&quot;/&gt;&lt;wsp:rsid wsp:val=&quot;00F75133&quot;/&gt;&lt;wsp:rsid wsp:val=&quot;00F83272&quot;/&gt;&lt;wsp:rsid wsp:val=&quot;00F9358D&quot;/&gt;&lt;wsp:rsid wsp:val=&quot;00FA3899&quot;/&gt;&lt;wsp:rsid wsp:val=&quot;00FA4909&quot;/&gt;&lt;wsp:rsid wsp:val=&quot;00FA5164&quot;/&gt;&lt;wsp:rsid wsp:val=&quot;00FA6751&quot;/&gt;&lt;wsp:rsid wsp:val=&quot;00FA6BD7&quot;/&gt;&lt;wsp:rsid wsp:val=&quot;00FB1048&quot;/&gt;&lt;wsp:rsid wsp:val=&quot;00FB62C4&quot;/&gt;&lt;wsp:rsid wsp:val=&quot;00FB7701&quot;/&gt;&lt;wsp:rsid wsp:val=&quot;00FD1AC5&quot;/&gt;&lt;wsp:rsid wsp:val=&quot;00FD5CF0&quot;/&gt;&lt;/wsp:rsids&gt;&lt;/w:docPr&gt;&lt;w:body&gt;&lt;wx:sect&gt;&lt;w:p wsp:rsidR=&quot;004A3A1F&quot; wsp:rsidRPr=&quot;004A3A1F&quot; wsp:rsidRDefault=&quot;004A3A1F&quot; wsp:rsidP=&quot;004A3A1F&quot;&gt;&lt;m:oMathPara&gt;&lt;m:oMath&gt;&lt;m:sSub&gt;&lt;m:sSubPr&gt;&lt;m:ctrlPr&gt;&lt;w:rPr&gt;&lt;w:rFonts w:ascii=&quot;Cambria Math&quot; w:h-ansi=&quot;Cambria Math&quot;/&gt;&lt;wx:font wx:val=&quot;Cambria Math&quot;/&gt;&lt;w:i/&gt;&lt;/w:rPr&gt;&lt;/m:ctrlPr&gt;&lt;/m:sSubPr&gt;&lt;m:e&gt;&lt;m:r&gt;&lt;w:rPr&gt;&lt;w:rFonts w:ascii=&quot;Cambria Math&quot; w:h-ansi=&quot;Cambria Math&quot;/&gt;&lt;wx:font wx:val=&quot;Cambria Math&quot;/&gt;&lt;w:i/&gt;&lt;/w:rPr&gt;&lt;m:t&gt;f&lt;/m:t&gt;&lt;/m:r&gt;&lt;/m:e&gt;&lt;m:sub&gt;&lt;m:r&gt;&lt;w:rPr&gt;&lt;w:rFonts w:ascii=&quot;Cambria Math&quot; w:h-ansi=&quot;Cambria Math&quot;/&gt;&lt;wx:font wx:val=&quot;Cambria Math&quot;/&gt;&lt;w:i/&gt;&lt;/w:rPr&gt;&lt;m:t&gt;s&lt;/m:t&gt;&lt;/m:r&gt;&lt;/m:sub&gt;&lt;/m:sSub&gt;&lt;/m:oMath&gt;&lt;/m:oMathPara&gt;&lt;/w:p&gt;&lt;w:sectPr wsp:rsidR=&quot;00000000&quot; wsp:rsidRPr=&quot;004A3A1F&quot;&gt;&lt;w:pgSz w:w=&quot;12240&quot; w:h=&quot;15840&quot;/&gt;&lt;w:pgMar w:top=&quot;1440&quot; w:right=&quot;1440&quot; w:bottom=&quot;1440&quot; w:left=&quot;1440&quot; w:header=&quot;720&quot; w:footer=&quot;720&quot; w:gutter=&quot;0&quot;/&gt;&lt;w:cols w:space=&quot;720&quot;/&gt;&lt;/w:sectPr&gt;&lt;/wx:sect&gt;&lt;/w:body&gt;&lt;/w:wordDocument&gt;">
+                <v:shape id="_x0000_i1045" type="#_x0000_t75" style="width:9pt;height:13.85pt" equationxml="&lt;?xml version=&quot;1.0&quot; encoding=&quot;UTF-8&quot; standalone=&quot;yes&quot;?&gt;&#10;&lt;?mso-application progid=&quot;Word.Document&quot;?&gt;&#10;&lt;w:wordDocument xmlns:aml=&quot;http://schemas.microsoft.com/aml/2001/core&quot; xmlns:wpc=&quot;http://schemas.microsoft.com/office/word/2010/wordprocessingCanvas&quot; xmlns:cx=&quot;http://schemas.microsoft.com/office/drawing/2014/chartex&quot; xmlns:cx1=&quot;http://schemas.microsoft.com/office/drawing/2015/9/8/chartex&quot; xmlns:cx2=&quot;http://schemas.microsoft.com/office/drawing/2015/10/21/chartex&quot; xmlns:cx3=&quot;http://schemas.microsoft.com/office/drawing/2016/5/9/chartex&quot; xmlns:cx4=&quot;http://schemas.microsoft.com/office/drawing/2016/5/10/chartex&quot; xmlns:cx5=&quot;http://schemas.microsoft.com/office/drawing/2016/5/11/chartex&quot; xmlns:cx6=&quot;http://schemas.microsoft.com/office/drawing/2016/5/12/chartex&quot; xmlns:cx7=&quot;http://schemas.microsoft.com/office/drawing/2016/5/13/chartex&quot; xmlns:cx8=&quot;http://schemas.microsoft.com/office/drawing/2016/5/14/chartex&quot; xmlns:cr=&quot;http://schemas.microsoft.com/office/comments/2020/reactions&quot; xmlns:dt=&quot;uuid:C2F41010-65B3-11d1-A29F-00AA00C14882&quot; xmlns:mc=&quot;http://schemas.openxmlformats.org/markup-compatibility/2006&quot; xmlns:aink=&quot;http://schemas.microsoft.com/office/drawing/2016/ink&quot; xmlns:am3d=&quot;http://schemas.microsoft.com/office/drawing/2017/model3d&quot; xmlns:o=&quot;urn:schemas-microsoft-com:office:office&quot; xmlns:oel=&quot;http://schemas.microsoft.com/office/2019/extlst&quot; xmlns:m=&quot;http://schemas.openxmlformats.org/officeDocument/2006/math&quot; xmlns:v=&quot;urn:schemas-microsoft-com:vml&quot; xmlns:w10=&quot;urn:schemas-microsoft-com:office:word&quot; xmlns:w=&quot;http://schemas.microsoft.com/office/word/2003/wordml&quot; xmlns:wx=&quot;http://schemas.microsoft.com/office/word/2003/auxHint&quot; xmlns:wne=&quot;http://schemas.microsoft.com/office/word/2006/wordml&quot; xmlns:wsp=&quot;http://schemas.microsoft.com/office/word/2003/wordml/sp2&quot; xmlns:sl=&quot;http://schemas.microsoft.com/schemaLibrary/2003/core&quot; w:macrosPresent=&quot;no&quot; w:embeddedObjPresent=&quot;no&quot; w:ocxPresent=&quot;no&quot; xml:space=&quot;preserve&quot;&gt;&lt;w:ignoreSubtree w:val=&quot;http://schemas.microsoft.com/office/word/2003/wordml/sp2&quot;/&gt;&lt;o:DocumentProperties&gt;&lt;o:Version&gt;16&lt;/o:Version&gt;&lt;/o:DocumentProperties&gt;&lt;w:docPr&gt;&lt;w:view w:val=&quot;print&quot;/&gt;&lt;w:zoom w:percent=&quot;100&quot;/&gt;&lt;w:doNotEmbedSystemFonts/&gt;&lt;w:activeWritingStyle w:lang=&quot;EN-AU&quot; w:vendorID=&quot;64&quot; w:dllVersion=&quot;6&quot; w:nlCheck=&quot;on&quot; w:optionSet=&quot;1&quot;/&gt;&lt;w:activeWritingStyle w:lang=&quot;EN-GB&quot; w:vendorID=&quot;64&quot; w:dllVersion=&quot;6&quot; w:nlCheck=&quot;on&quot; w:optionSet=&quot;1&quot;/&gt;&lt;w:activeWritingStyle w:lang=&quot;EN-US&quot; w:vendorID=&quot;64&quot; w:dllVersion=&quot;6&quot; w:nlCheck=&quot;on&quot; w:optionSet=&quot;1&quot;/&gt;&lt;w:activeWritingStyle w:lang=&quot;EN-AU&quot; w:vendorID=&quot;64&quot; w:dllVersion=&quot;0&quot; w:nlCheck=&quot;on&quot; w:optionSet=&quot;0&quot;/&gt;&lt;w:activeWritingStyle w:lang=&quot;EN-GB&quot; w:vendorID=&quot;64&quot; w:dllVersion=&quot;0&quot; w:nlCheck=&quot;on&quot; w:optionSet=&quot;0&quot;/&gt;&lt;w:activeWritingStyle w:lang=&quot;EN-US&quot; w:vendorID=&quot;64&quot; w:dllVersion=&quot;0&quot; w:nlCheck=&quot;on&quot; w:optionSet=&quot;0&quot;/&gt;&lt;w:activeWritingStyle w:lang=&quot;ES-AR&quot; w:vendorID=&quot;64&quot; w:dllVersion=&quot;0&quot; w:nlCheck=&quot;on&quot; w:optionSet=&quot;0&quot;/&gt;&lt;w:activeWritingStyle w:lang=&quot;580A&quot; w:vendorID=&quot;64&quot; w:dllVersion=&quot;0&quot; w:nlCheck=&quot;on&quot; w:optionSet=&quot;0&quot;/&gt;&lt;w:activeWritingStyle w:lang=&quot;PT-BR&quot; w:vendorID=&quot;64&quot; w:dllVersion=&quot;0&quot; w:nlCheck=&quot;on&quot; w:optionSet=&quot;0&quot;/&gt;&lt;w:stylePaneFormatFilter w:val=&quot;3F01&quot;/&gt;&lt;w:defaultTabStop w:val=&quot;720&quot;/&gt;&lt;w:hyphenationZone w:val=&quot;425&quot;/&gt;&lt;w:characterSpacingControl w:val=&quot;DontCompress&quot;/&gt;&lt;w:optimizeForBrowser/&gt;&lt;w:validateAgainstSchema/&gt;&lt;w:saveInvalidXML w:val=&quot;off&quot;/&gt;&lt;w:ignoreMixedContent w:val=&quot;off&quot;/&gt;&lt;w:alwaysShowPlaceholderText w:val=&quot;off&quot;/&gt;&lt;w:compat&gt;&lt;w:breakWrappedTables/&gt;&lt;w:snapToGridInCell/&gt;&lt;w:applyBreakingRules/&gt;&lt;w:wrapTextWithPunct/&gt;&lt;w:useAsianBreakRules/&gt;&lt;w:useWord2002TableStyleRules/&gt;&lt;w:useFELayout/&gt;&lt;/w:compat&gt;&lt;wsp:rsids&gt;&lt;wsp:rsidRoot wsp:val=&quot;00426FBB&quot;/&gt;&lt;wsp:rsid wsp:val=&quot;000002E1&quot;/&gt;&lt;wsp:rsid wsp:val=&quot;00003C97&quot;/&gt;&lt;wsp:rsid wsp:val=&quot;00005565&quot;/&gt;&lt;wsp:rsid wsp:val=&quot;0001754A&quot;/&gt;&lt;wsp:rsid wsp:val=&quot;00017719&quot;/&gt;&lt;wsp:rsid wsp:val=&quot;00027F1D&quot;/&gt;&lt;wsp:rsid wsp:val=&quot;0003296C&quot;/&gt;&lt;wsp:rsid wsp:val=&quot;0003351F&quot;/&gt;&lt;wsp:rsid wsp:val=&quot;00044599&quot;/&gt;&lt;wsp:rsid wsp:val=&quot;000540E6&quot;/&gt;&lt;wsp:rsid wsp:val=&quot;00054421&quot;/&gt;&lt;wsp:rsid wsp:val=&quot;00062E46&quot;/&gt;&lt;wsp:rsid wsp:val=&quot;00074AC8&quot;/&gt;&lt;wsp:rsid wsp:val=&quot;00081408&quot;/&gt;&lt;wsp:rsid wsp:val=&quot;00081EBE&quot;/&gt;&lt;wsp:rsid wsp:val=&quot;00086EDC&quot;/&gt;&lt;wsp:rsid wsp:val=&quot;000B1236&quot;/&gt;&lt;wsp:rsid wsp:val=&quot;000B36A3&quot;/&gt;&lt;wsp:rsid wsp:val=&quot;000C013C&quot;/&gt;&lt;wsp:rsid wsp:val=&quot;000E3F84&quot;/&gt;&lt;wsp:rsid wsp:val=&quot;001056DF&quot;/&gt;&lt;wsp:rsid wsp:val=&quot;0010789C&quot;/&gt;&lt;wsp:rsid wsp:val=&quot;00114025&quot;/&gt;&lt;wsp:rsid wsp:val=&quot;001160D2&quot;/&gt;&lt;wsp:rsid wsp:val=&quot;00120636&quot;/&gt;&lt;wsp:rsid wsp:val=&quot;001348A5&quot;/&gt;&lt;wsp:rsid wsp:val=&quot;00151B8E&quot;/&gt;&lt;wsp:rsid wsp:val=&quot;00182170&quot;/&gt;&lt;wsp:rsid wsp:val=&quot;001928FB&quot;/&gt;&lt;wsp:rsid wsp:val=&quot;00192BC7&quot;/&gt;&lt;wsp:rsid wsp:val=&quot;00195BE6&quot;/&gt;&lt;wsp:rsid wsp:val=&quot;001A50EA&quot;/&gt;&lt;wsp:rsid wsp:val=&quot;001F16CD&quot;/&gt;&lt;wsp:rsid wsp:val=&quot;001F47D2&quot;/&gt;&lt;wsp:rsid wsp:val=&quot;002029C8&quot;/&gt;&lt;wsp:rsid wsp:val=&quot;0022285A&quot;/&gt;&lt;wsp:rsid wsp:val=&quot;00224C61&quot;/&gt;&lt;wsp:rsid wsp:val=&quot;00256ABC&quot;/&gt;&lt;wsp:rsid wsp:val=&quot;0027227B&quot;/&gt;&lt;wsp:rsid wsp:val=&quot;00273AC7&quot;/&gt;&lt;wsp:rsid wsp:val=&quot;00273D2C&quot;/&gt;&lt;wsp:rsid wsp:val=&quot;00285ECD&quot;/&gt;&lt;wsp:rsid wsp:val=&quot;00290E1B&quot;/&gt;&lt;wsp:rsid wsp:val=&quot;00291B17&quot;/&gt;&lt;wsp:rsid wsp:val=&quot;00291BB3&quot;/&gt;&lt;wsp:rsid wsp:val=&quot;002A6742&quot;/&gt;&lt;wsp:rsid wsp:val=&quot;002C1A7F&quot;/&gt;&lt;wsp:rsid wsp:val=&quot;002C4239&quot;/&gt;&lt;wsp:rsid wsp:val=&quot;002C559D&quot;/&gt;&lt;wsp:rsid wsp:val=&quot;002D16AE&quot;/&gt;&lt;wsp:rsid wsp:val=&quot;002D2D42&quot;/&gt;&lt;wsp:rsid wsp:val=&quot;002F72D0&quot;/&gt;&lt;wsp:rsid wsp:val=&quot;002F7A4F&quot;/&gt;&lt;wsp:rsid wsp:val=&quot;003003AB&quot;/&gt;&lt;wsp:rsid wsp:val=&quot;00302C35&quot;/&gt;&lt;wsp:rsid wsp:val=&quot;00311C49&quot;/&gt;&lt;wsp:rsid wsp:val=&quot;0032119E&quot;/&gt;&lt;wsp:rsid wsp:val=&quot;00321304&quot;/&gt;&lt;wsp:rsid wsp:val=&quot;00324FC2&quot;/&gt;&lt;wsp:rsid wsp:val=&quot;003312CA&quot;/&gt;&lt;wsp:rsid wsp:val=&quot;00331F84&quot;/&gt;&lt;wsp:rsid wsp:val=&quot;0037721F&quot;/&gt;&lt;wsp:rsid wsp:val=&quot;003950A4&quot;/&gt;&lt;wsp:rsid wsp:val=&quot;003A1E7E&quot;/&gt;&lt;wsp:rsid wsp:val=&quot;003E2FDC&quot;/&gt;&lt;wsp:rsid wsp:val=&quot;003E3577&quot;/&gt;&lt;wsp:rsid wsp:val=&quot;003F3A61&quot;/&gt;&lt;wsp:rsid wsp:val=&quot;00410A5D&quot;/&gt;&lt;wsp:rsid wsp:val=&quot;00414909&quot;/&gt;&lt;wsp:rsid wsp:val=&quot;00416537&quot;/&gt;&lt;wsp:rsid wsp:val=&quot;00425A6A&quot;/&gt;&lt;wsp:rsid wsp:val=&quot;00426FBB&quot;/&gt;&lt;wsp:rsid wsp:val=&quot;00454542&quot;/&gt;&lt;wsp:rsid wsp:val=&quot;0047429A&quot;/&gt;&lt;wsp:rsid wsp:val=&quot;0048374C&quot;/&gt;&lt;wsp:rsid wsp:val=&quot;0048771D&quot;/&gt;&lt;wsp:rsid wsp:val=&quot;004A3A1F&quot;/&gt;&lt;wsp:rsid wsp:val=&quot;004A6605&quot;/&gt;&lt;wsp:rsid wsp:val=&quot;004C45FA&quot;/&gt;&lt;wsp:rsid wsp:val=&quot;004D35A3&quot;/&gt;&lt;wsp:rsid wsp:val=&quot;004E1BD8&quot;/&gt;&lt;wsp:rsid wsp:val=&quot;004E452A&quot;/&gt;&lt;wsp:rsid wsp:val=&quot;004E78E3&quot;/&gt;&lt;wsp:rsid wsp:val=&quot;004F2BFE&quot;/&gt;&lt;wsp:rsid wsp:val=&quot;004F63D3&quot;/&gt;&lt;wsp:rsid wsp:val=&quot;004F7DCF&quot;/&gt;&lt;wsp:rsid wsp:val=&quot;005004BF&quot;/&gt;&lt;wsp:rsid wsp:val=&quot;00502E89&quot;/&gt;&lt;wsp:rsid wsp:val=&quot;00506CFE&quot;/&gt;&lt;wsp:rsid wsp:val=&quot;00510E95&quot;/&gt;&lt;wsp:rsid wsp:val=&quot;005225C3&quot;/&gt;&lt;wsp:rsid wsp:val=&quot;00527D56&quot;/&gt;&lt;wsp:rsid wsp:val=&quot;0053221F&quot;/&gt;&lt;wsp:rsid wsp:val=&quot;00536FAE&quot;/&gt;&lt;wsp:rsid wsp:val=&quot;00542C85&quot;/&gt;&lt;wsp:rsid wsp:val=&quot;00553510&quot;/&gt;&lt;wsp:rsid wsp:val=&quot;00554186&quot;/&gt;&lt;wsp:rsid wsp:val=&quot;00585769&quot;/&gt;&lt;wsp:rsid wsp:val=&quot;00585C61&quot;/&gt;&lt;wsp:rsid wsp:val=&quot;00591130&quot;/&gt;&lt;wsp:rsid wsp:val=&quot;005A3F28&quot;/&gt;&lt;wsp:rsid wsp:val=&quot;005A40BE&quot;/&gt;&lt;wsp:rsid wsp:val=&quot;005B13E2&quot;/&gt;&lt;wsp:rsid wsp:val=&quot;005B47D7&quot;/&gt;&lt;wsp:rsid wsp:val=&quot;005C5526&quot;/&gt;&lt;wsp:rsid wsp:val=&quot;005C62C6&quot;/&gt;&lt;wsp:rsid wsp:val=&quot;005D7B9E&quot;/&gt;&lt;wsp:rsid wsp:val=&quot;005E112E&quot;/&gt;&lt;wsp:rsid wsp:val=&quot;005F0834&quot;/&gt;&lt;wsp:rsid wsp:val=&quot;005F68AB&quot;/&gt;&lt;wsp:rsid wsp:val=&quot;005F6DC3&quot;/&gt;&lt;wsp:rsid wsp:val=&quot;00601A8E&quot;/&gt;&lt;wsp:rsid wsp:val=&quot;0062033E&quot;/&gt;&lt;wsp:rsid wsp:val=&quot;00624482&quot;/&gt;&lt;wsp:rsid wsp:val=&quot;0064799C&quot;/&gt;&lt;wsp:rsid wsp:val=&quot;00654156&quot;/&gt;&lt;wsp:rsid wsp:val=&quot;00656ADC&quot;/&gt;&lt;wsp:rsid wsp:val=&quot;006B47CA&quot;/&gt;&lt;wsp:rsid wsp:val=&quot;006C304C&quot;/&gt;&lt;wsp:rsid wsp:val=&quot;006C4511&quot;/&gt;&lt;wsp:rsid wsp:val=&quot;006C65F5&quot;/&gt;&lt;wsp:rsid wsp:val=&quot;006C7AAA&quot;/&gt;&lt;wsp:rsid wsp:val=&quot;006D1C2A&quot;/&gt;&lt;wsp:rsid wsp:val=&quot;006D264F&quot;/&gt;&lt;wsp:rsid wsp:val=&quot;006D4E89&quot;/&gt;&lt;wsp:rsid wsp:val=&quot;006E2A8D&quot;/&gt;&lt;wsp:rsid wsp:val=&quot;006E7574&quot;/&gt;&lt;wsp:rsid wsp:val=&quot;00703430&quot;/&gt;&lt;wsp:rsid wsp:val=&quot;00703548&quot;/&gt;&lt;wsp:rsid wsp:val=&quot;00704E18&quot;/&gt;&lt;wsp:rsid wsp:val=&quot;007069BE&quot;/&gt;&lt;wsp:rsid wsp:val=&quot;00745C86&quot;/&gt;&lt;wsp:rsid wsp:val=&quot;00764603&quot;/&gt;&lt;wsp:rsid wsp:val=&quot;0076604D&quot;/&gt;&lt;wsp:rsid wsp:val=&quot;00790909&quot;/&gt;&lt;wsp:rsid wsp:val=&quot;007B1582&quot;/&gt;&lt;wsp:rsid wsp:val=&quot;007B5A07&quot;/&gt;&lt;wsp:rsid wsp:val=&quot;007C065D&quot;/&gt;&lt;wsp:rsid wsp:val=&quot;007D3E71&quot;/&gt;&lt;wsp:rsid wsp:val=&quot;007E5D6A&quot;/&gt;&lt;wsp:rsid wsp:val=&quot;007E645D&quot;/&gt;&lt;wsp:rsid wsp:val=&quot;007F75CA&quot;/&gt;&lt;wsp:rsid wsp:val=&quot;00821E08&quot;/&gt;&lt;wsp:rsid wsp:val=&quot;00834EFD&quot;/&gt;&lt;wsp:rsid wsp:val=&quot;00844B24&quot;/&gt;&lt;wsp:rsid wsp:val=&quot;0084515F&quot;/&gt;&lt;wsp:rsid wsp:val=&quot;0085092D&quot;/&gt;&lt;wsp:rsid wsp:val=&quot;00865414&quot;/&gt;&lt;wsp:rsid wsp:val=&quot;00877D4C&quot;/&gt;&lt;wsp:rsid wsp:val=&quot;00883903&quot;/&gt;&lt;wsp:rsid wsp:val=&quot;0089763B&quot;/&gt;&lt;wsp:rsid wsp:val=&quot;008B6AE3&quot;/&gt;&lt;wsp:rsid wsp:val=&quot;008C1332&quot;/&gt;&lt;wsp:rsid wsp:val=&quot;008D1045&quot;/&gt;&lt;wsp:rsid wsp:val=&quot;008E5996&quot;/&gt;&lt;wsp:rsid wsp:val=&quot;00901AE1&quot;/&gt;&lt;wsp:rsid wsp:val=&quot;00912F93&quot;/&gt;&lt;wsp:rsid wsp:val=&quot;009205B4&quot;/&gt;&lt;wsp:rsid wsp:val=&quot;00955B59&quot;/&gt;&lt;wsp:rsid wsp:val=&quot;00992262&quot;/&gt;&lt;wsp:rsid wsp:val=&quot;009926BC&quot;/&gt;&lt;wsp:rsid wsp:val=&quot;009A4319&quot;/&gt;&lt;wsp:rsid wsp:val=&quot;009A6C3F&quot;/&gt;&lt;wsp:rsid wsp:val=&quot;009B73F2&quot;/&gt;&lt;wsp:rsid wsp:val=&quot;009C12BD&quot;/&gt;&lt;wsp:rsid wsp:val=&quot;009C50FE&quot;/&gt;&lt;wsp:rsid wsp:val=&quot;009E49DD&quot;/&gt;&lt;wsp:rsid wsp:val=&quot;00A03E75&quot;/&gt;&lt;wsp:rsid wsp:val=&quot;00A20627&quot;/&gt;&lt;wsp:rsid wsp:val=&quot;00A22FE9&quot;/&gt;&lt;wsp:rsid wsp:val=&quot;00A31A44&quot;/&gt;&lt;wsp:rsid wsp:val=&quot;00A32BFA&quot;/&gt;&lt;wsp:rsid wsp:val=&quot;00A3325E&quot;/&gt;&lt;wsp:rsid wsp:val=&quot;00A45FCE&quot;/&gt;&lt;wsp:rsid wsp:val=&quot;00A75671&quot;/&gt;&lt;wsp:rsid wsp:val=&quot;00A773CC&quot;/&gt;&lt;wsp:rsid wsp:val=&quot;00A924D0&quot;/&gt;&lt;wsp:rsid wsp:val=&quot;00A9318B&quot;/&gt;&lt;wsp:rsid wsp:val=&quot;00A94AC1&quot;/&gt;&lt;wsp:rsid wsp:val=&quot;00AB18B7&quot;/&gt;&lt;wsp:rsid wsp:val=&quot;00AD335D&quot;/&gt;&lt;wsp:rsid wsp:val=&quot;00AF114C&quot;/&gt;&lt;wsp:rsid wsp:val=&quot;00AF792B&quot;/&gt;&lt;wsp:rsid wsp:val=&quot;00B33D2F&quot;/&gt;&lt;wsp:rsid wsp:val=&quot;00B40A5B&quot;/&gt;&lt;wsp:rsid wsp:val=&quot;00B45C6B&quot;/&gt;&lt;wsp:rsid wsp:val=&quot;00B55D5E&quot;/&gt;&lt;wsp:rsid wsp:val=&quot;00B57A80&quot;/&gt;&lt;wsp:rsid wsp:val=&quot;00B70E9C&quot;/&gt;&lt;wsp:rsid wsp:val=&quot;00B713D8&quot;/&gt;&lt;wsp:rsid wsp:val=&quot;00B72979&quot;/&gt;&lt;wsp:rsid wsp:val=&quot;00B94516&quot;/&gt;&lt;wsp:rsid wsp:val=&quot;00BA25E2&quot;/&gt;&lt;wsp:rsid wsp:val=&quot;00BB2855&quot;/&gt;&lt;wsp:rsid wsp:val=&quot;00BC5343&quot;/&gt;&lt;wsp:rsid wsp:val=&quot;00BD19C1&quot;/&gt;&lt;wsp:rsid wsp:val=&quot;00BD25B8&quot;/&gt;&lt;wsp:rsid wsp:val=&quot;00C012E1&quot;/&gt;&lt;wsp:rsid wsp:val=&quot;00C06BB4&quot;/&gt;&lt;wsp:rsid wsp:val=&quot;00C10D20&quot;/&gt;&lt;wsp:rsid wsp:val=&quot;00C12E0C&quot;/&gt;&lt;wsp:rsid wsp:val=&quot;00C21916&quot;/&gt;&lt;wsp:rsid wsp:val=&quot;00C34915&quot;/&gt;&lt;wsp:rsid wsp:val=&quot;00C457CA&quot;/&gt;&lt;wsp:rsid wsp:val=&quot;00C53FB6&quot;/&gt;&lt;wsp:rsid wsp:val=&quot;00C57FB7&quot;/&gt;&lt;wsp:rsid wsp:val=&quot;00C644D4&quot;/&gt;&lt;wsp:rsid wsp:val=&quot;00C65F3F&quot;/&gt;&lt;wsp:rsid wsp:val=&quot;00C72414&quot;/&gt;&lt;wsp:rsid wsp:val=&quot;00C72B1A&quot;/&gt;&lt;wsp:rsid wsp:val=&quot;00C8667B&quot;/&gt;&lt;wsp:rsid wsp:val=&quot;00C90993&quot;/&gt;&lt;wsp:rsid wsp:val=&quot;00CA4CE3&quot;/&gt;&lt;wsp:rsid wsp:val=&quot;00CC72FD&quot;/&gt;&lt;wsp:rsid wsp:val=&quot;00CD4F3F&quot;/&gt;&lt;wsp:rsid wsp:val=&quot;00D311F8&quot;/&gt;&lt;wsp:rsid wsp:val=&quot;00D31660&quot;/&gt;&lt;wsp:rsid wsp:val=&quot;00D36B52&quot;/&gt;&lt;wsp:rsid wsp:val=&quot;00D377C8&quot;/&gt;&lt;wsp:rsid wsp:val=&quot;00D41274&quot;/&gt;&lt;wsp:rsid wsp:val=&quot;00D4229C&quot;/&gt;&lt;wsp:rsid wsp:val=&quot;00D43BF3&quot;/&gt;&lt;wsp:rsid wsp:val=&quot;00D549FB&quot;/&gt;&lt;wsp:rsid wsp:val=&quot;00D767BB&quot;/&gt;&lt;wsp:rsid wsp:val=&quot;00D939B0&quot;/&gt;&lt;wsp:rsid wsp:val=&quot;00DA31A2&quot;/&gt;&lt;wsp:rsid wsp:val=&quot;00DB16E0&quot;/&gt;&lt;wsp:rsid wsp:val=&quot;00DB2DF9&quot;/&gt;&lt;wsp:rsid wsp:val=&quot;00DB465D&quot;/&gt;&lt;wsp:rsid wsp:val=&quot;00DB48A2&quot;/&gt;&lt;wsp:rsid wsp:val=&quot;00DB7E63&quot;/&gt;&lt;wsp:rsid wsp:val=&quot;00DC2055&quot;/&gt;&lt;wsp:rsid wsp:val=&quot;00DC3908&quot;/&gt;&lt;wsp:rsid wsp:val=&quot;00DD71E8&quot;/&gt;&lt;wsp:rsid wsp:val=&quot;00DD7F83&quot;/&gt;&lt;wsp:rsid wsp:val=&quot;00DE4EB8&quot;/&gt;&lt;wsp:rsid wsp:val=&quot;00E0641E&quot;/&gt;&lt;wsp:rsid wsp:val=&quot;00E06664&quot;/&gt;&lt;wsp:rsid wsp:val=&quot;00E304BC&quot;/&gt;&lt;wsp:rsid wsp:val=&quot;00E32853&quot;/&gt;&lt;wsp:rsid wsp:val=&quot;00E34EBD&quot;/&gt;&lt;wsp:rsid wsp:val=&quot;00E401F8&quot;/&gt;&lt;wsp:rsid wsp:val=&quot;00E46425&quot;/&gt;&lt;wsp:rsid wsp:val=&quot;00E469FC&quot;/&gt;&lt;wsp:rsid wsp:val=&quot;00E47D0E&quot;/&gt;&lt;wsp:rsid wsp:val=&quot;00E65018&quot;/&gt;&lt;wsp:rsid wsp:val=&quot;00E76CA1&quot;/&gt;&lt;wsp:rsid wsp:val=&quot;00E94339&quot;/&gt;&lt;wsp:rsid wsp:val=&quot;00E97563&quot;/&gt;&lt;wsp:rsid wsp:val=&quot;00EB0B63&quot;/&gt;&lt;wsp:rsid wsp:val=&quot;00EC265C&quot;/&gt;&lt;wsp:rsid wsp:val=&quot;00ED61CB&quot;/&gt;&lt;wsp:rsid wsp:val=&quot;00EE752A&quot;/&gt;&lt;wsp:rsid wsp:val=&quot;00F06A72&quot;/&gt;&lt;wsp:rsid wsp:val=&quot;00F136F0&quot;/&gt;&lt;wsp:rsid wsp:val=&quot;00F20BBB&quot;/&gt;&lt;wsp:rsid wsp:val=&quot;00F36048&quot;/&gt;&lt;wsp:rsid wsp:val=&quot;00F43BD8&quot;/&gt;&lt;wsp:rsid wsp:val=&quot;00F562F3&quot;/&gt;&lt;wsp:rsid wsp:val=&quot;00F74B89&quot;/&gt;&lt;wsp:rsid wsp:val=&quot;00F75133&quot;/&gt;&lt;wsp:rsid wsp:val=&quot;00F83272&quot;/&gt;&lt;wsp:rsid wsp:val=&quot;00F9358D&quot;/&gt;&lt;wsp:rsid wsp:val=&quot;00FA3899&quot;/&gt;&lt;wsp:rsid wsp:val=&quot;00FA4909&quot;/&gt;&lt;wsp:rsid wsp:val=&quot;00FA5164&quot;/&gt;&lt;wsp:rsid wsp:val=&quot;00FA6751&quot;/&gt;&lt;wsp:rsid wsp:val=&quot;00FA6BD7&quot;/&gt;&lt;wsp:rsid wsp:val=&quot;00FB1048&quot;/&gt;&lt;wsp:rsid wsp:val=&quot;00FB62C4&quot;/&gt;&lt;wsp:rsid wsp:val=&quot;00FB7701&quot;/&gt;&lt;wsp:rsid wsp:val=&quot;00FD1AC5&quot;/&gt;&lt;wsp:rsid wsp:val=&quot;00FD5CF0&quot;/&gt;&lt;/wsp:rsids&gt;&lt;/w:docPr&gt;&lt;w:body&gt;&lt;wx:sect&gt;&lt;w:p wsp:rsidR=&quot;004A3A1F&quot; wsp:rsidRPr=&quot;004A3A1F&quot; wsp:rsidRDefault=&quot;004A3A1F&quot; wsp:rsidP=&quot;004A3A1F&quot;&gt;&lt;m:oMathPara&gt;&lt;m:oMath&gt;&lt;m:sSub&gt;&lt;m:sSubPr&gt;&lt;m:ctrlPr&gt;&lt;w:rPr&gt;&lt;w:rFonts w:ascii=&quot;Cambria Math&quot; w:h-ansi=&quot;Cambria Math&quot;/&gt;&lt;wx:font wx:val=&quot;Cambria Math&quot;/&gt;&lt;w:i/&gt;&lt;/w:rPr&gt;&lt;/m:ctrlPr&gt;&lt;/m:sSubPr&gt;&lt;m:e&gt;&lt;m:r&gt;&lt;w:rPr&gt;&lt;w:rFonts w:ascii=&quot;Cambria Math&quot; w:h-ansi=&quot;Cambria Math&quot;/&gt;&lt;wx:font wx:val=&quot;Cambria Math&quot;/&gt;&lt;w:i/&gt;&lt;/w:rPr&gt;&lt;m:t&gt;f&lt;/m:t&gt;&lt;/m:r&gt;&lt;/m:e&gt;&lt;m:sub&gt;&lt;m:r&gt;&lt;w:rPr&gt;&lt;w:rFonts w:ascii=&quot;Cambria Math&quot; w:h-ansi=&quot;Cambria Math&quot;/&gt;&lt;wx:font wx:val=&quot;Cambria Math&quot;/&gt;&lt;w:i/&gt;&lt;/w:rPr&gt;&lt;m:t&gt;s&lt;/m:t&gt;&lt;/m:r&gt;&lt;/m:sub&gt;&lt;/m:sSub&gt;&lt;/m:oMath&gt;&lt;/m:oMathPara&gt;&lt;/w:p&gt;&lt;w:sectPr wsp:rsidR=&quot;00000000&quot; wsp:rsidRPr=&quot;004A3A1F&quot;&gt;&lt;w:pgSz w:w=&quot;12240&quot; w:h=&quot;15840&quot;/&gt;&lt;w:pgMar w:top=&quot;1440&quot; w:right=&quot;1440&quot; w:bottom=&quot;1440&quot; w:left=&quot;1440&quot; w:header=&quot;720&quot; w:footer=&quot;720&quot; w:gutter=&quot;0&quot;/&gt;&lt;w:cols w:space=&quot;720&quot;/&gt;&lt;/w:sectPr&gt;&lt;/wx:sect&gt;&lt;/w:body&gt;&lt;/w:wordDocument&gt;">
                   <v:imagedata r:id="rId20" o:title="" chromakey="white"/>
                 </v:shape>
               </w:pict>
@@ -1877,7 +1877,7 @@
         </w:tc>
         <w:tc>
           <w:tcPr>
-            <w:tcW w:w="850" w:type="dxa"/>
+            <w:tcW w:w="852" w:type="dxa"/>
             <w:shd w:val="clear" w:color="auto" w:fill="D9D9D9"/>
           </w:tcPr>
           <w:p>
@@ -1899,7 +1899,7 @@
         </w:tc>
         <w:tc>
           <w:tcPr>
-            <w:tcW w:w="898" w:type="dxa"/>
+            <w:tcW w:w="900" w:type="dxa"/>
             <w:shd w:val="clear" w:color="auto" w:fill="D9D9D9"/>
           </w:tcPr>
           <w:p>
@@ -1922,12 +1922,12 @@
       </w:tr>
       <w:tr>
         <w:trPr>
-          <w:trHeight w:val="281"/>
+          <w:trHeight w:val="34"/>
           <w:jc w:val="center"/>
         </w:trPr>
         <w:tc>
           <w:tcPr>
-            <w:tcW w:w="2255" w:type="dxa"/>
+            <w:tcW w:w="2261" w:type="dxa"/>
             <w:shd w:val="clear" w:color="auto" w:fill="auto"/>
           </w:tcPr>
           <w:p>
@@ -1955,7 +1955,7 @@
         </w:tc>
         <w:tc>
           <w:tcPr>
-            <w:tcW w:w="993" w:type="dxa"/>
+            <w:tcW w:w="995" w:type="dxa"/>
             <w:shd w:val="clear" w:color="auto" w:fill="auto"/>
           </w:tcPr>
           <w:p>
@@ -1972,7 +1972,7 @@
                 <w:szCs w:val="18"/>
               </w:rPr>
               <w:pict w14:anchorId="07B0D496">
-                <v:shape id="_x0000_i1443" type="#_x0000_t75" style="width:28.35pt;height:13.65pt" equationxml="&lt;?xml version=&quot;1.0&quot; encoding=&quot;UTF-8&quot; standalone=&quot;yes&quot;?&gt;&#10;&lt;?mso-application progid=&quot;Word.Document&quot;?&gt;&#10;&lt;w:wordDocument xmlns:aml=&quot;http://schemas.microsoft.com/aml/2001/core&quot; xmlns:wpc=&quot;http://schemas.microsoft.com/office/word/2010/wordprocessingCanvas&quot; xmlns:cx=&quot;http://schemas.microsoft.com/office/drawing/2014/chartex&quot; xmlns:cx1=&quot;http://schemas.microsoft.com/office/drawing/2015/9/8/chartex&quot; xmlns:cx2=&quot;http://schemas.microsoft.com/office/drawing/2015/10/21/chartex&quot; xmlns:cx3=&quot;http://schemas.microsoft.com/office/drawing/2016/5/9/chartex&quot; xmlns:cx4=&quot;http://schemas.microsoft.com/office/drawing/2016/5/10/chartex&quot; xmlns:cx5=&quot;http://schemas.microsoft.com/office/drawing/2016/5/11/chartex&quot; xmlns:cx6=&quot;http://schemas.microsoft.com/office/drawing/2016/5/12/chartex&quot; xmlns:cx7=&quot;http://schemas.microsoft.com/office/drawing/2016/5/13/chartex&quot; xmlns:cx8=&quot;http://schemas.microsoft.com/office/drawing/2016/5/14/chartex&quot; xmlns:cr=&quot;http://schemas.microsoft.com/office/comments/2020/reactions&quot; xmlns:dt=&quot;uuid:C2F41010-65B3-11d1-A29F-00AA00C14882&quot; xmlns:mc=&quot;http://schemas.openxmlformats.org/markup-compatibility/2006&quot; xmlns:aink=&quot;http://schemas.microsoft.com/office/drawing/2016/ink&quot; xmlns:am3d=&quot;http://schemas.microsoft.com/office/drawing/2017/model3d&quot; xmlns:o=&quot;urn:schemas-microsoft-com:office:office&quot; xmlns:oel=&quot;http://schemas.microsoft.com/office/2019/extlst&quot; xmlns:m=&quot;http://schemas.openxmlformats.org/officeDocument/2006/math&quot; xmlns:v=&quot;urn:schemas-microsoft-com:vml&quot; xmlns:w10=&quot;urn:schemas-microsoft-com:office:word&quot; xmlns:w=&quot;http://schemas.microsoft.com/office/word/2003/wordml&quot; xmlns:wx=&quot;http://schemas.microsoft.com/office/word/2003/auxHint&quot; xmlns:wne=&quot;http://schemas.microsoft.com/office/word/2006/wordml&quot; xmlns:wsp=&quot;http://schemas.microsoft.com/office/word/2003/wordml/sp2&quot; xmlns:sl=&quot;http://schemas.microsoft.com/schemaLibrary/2003/core&quot; w:macrosPresent=&quot;no&quot; w:embeddedObjPresent=&quot;no&quot; w:ocxPresent=&quot;no&quot; xml:space=&quot;preserve&quot;&gt;&lt;w:ignoreSubtree w:val=&quot;http://schemas.microsoft.com/office/word/2003/wordml/sp2&quot;/&gt;&lt;o:DocumentProperties&gt;&lt;o:Version&gt;16&lt;/o:Version&gt;&lt;/o:DocumentProperties&gt;&lt;w:docPr&gt;&lt;w:view w:val=&quot;print&quot;/&gt;&lt;w:zoom w:percent=&quot;100&quot;/&gt;&lt;w:doNotEmbedSystemFonts/&gt;&lt;w:activeWritingStyle w:lang=&quot;EN-AU&quot; w:vendorID=&quot;64&quot; w:dllVersion=&quot;6&quot; w:nlCheck=&quot;on&quot; w:optionSet=&quot;1&quot;/&gt;&lt;w:activeWritingStyle w:lang=&quot;EN-GB&quot; w:vendorID=&quot;64&quot; w:dllVersion=&quot;6&quot; w:nlCheck=&quot;on&quot; w:optionSet=&quot;1&quot;/&gt;&lt;w:activeWritingStyle w:lang=&quot;EN-US&quot; w:vendorID=&quot;64&quot; w:dllVersion=&quot;6&quot; w:nlCheck=&quot;on&quot; w:optionSet=&quot;1&quot;/&gt;&lt;w:activeWritingStyle w:lang=&quot;EN-AU&quot; w:vendorID=&quot;64&quot; w:dllVersion=&quot;0&quot; w:nlCheck=&quot;on&quot; w:optionSet=&quot;0&quot;/&gt;&lt;w:activeWritingStyle w:lang=&quot;EN-GB&quot; w:vendorID=&quot;64&quot; w:dllVersion=&quot;0&quot; w:nlCheck=&quot;on&quot; w:optionSet=&quot;0&quot;/&gt;&lt;w:activeWritingStyle w:lang=&quot;EN-US&quot; w:vendorID=&quot;64&quot; w:dllVersion=&quot;0&quot; w:nlCheck=&quot;on&quot; w:optionSet=&quot;0&quot;/&gt;&lt;w:activeWritingStyle w:lang=&quot;ES-AR&quot; w:vendorID=&quot;64&quot; w:dllVersion=&quot;0&quot; w:nlCheck=&quot;on&quot; w:optionSet=&quot;0&quot;/&gt;&lt;w:activeWritingStyle w:lang=&quot;580A&quot; w:vendorID=&quot;64&quot; w:dllVersion=&quot;0&quot; w:nlCheck=&quot;on&quot; w:optionSet=&quot;0&quot;/&gt;&lt;w:activeWritingStyle w:lang=&quot;PT-BR&quot; w:vendorID=&quot;64&quot; w:dllVersion=&quot;0&quot; w:nlCheck=&quot;on&quot; w:optionSet=&quot;0&quot;/&gt;&lt;w:stylePaneFormatFilter w:val=&quot;3F01&quot;/&gt;&lt;w:defaultTabStop w:val=&quot;720&quot;/&gt;&lt;w:hyphenationZone w:val=&quot;425&quot;/&gt;&lt;w:characterSpacingControl w:val=&quot;DontCompress&quot;/&gt;&lt;w:optimizeForBrowser/&gt;&lt;w:validateAgainstSchema/&gt;&lt;w:saveInvalidXML w:val=&quot;off&quot;/&gt;&lt;w:ignoreMixedContent w:val=&quot;off&quot;/&gt;&lt;w:alwaysShowPlaceholderText w:val=&quot;off&quot;/&gt;&lt;w:compat&gt;&lt;w:breakWrappedTables/&gt;&lt;w:snapToGridInCell/&gt;&lt;w:applyBreakingRules/&gt;&lt;w:wrapTextWithPunct/&gt;&lt;w:useAsianBreakRules/&gt;&lt;w:useWord2002TableStyleRules/&gt;&lt;w:useFELayout/&gt;&lt;/w:compat&gt;&lt;wsp:rsids&gt;&lt;wsp:rsidRoot wsp:val=&quot;00426FBB&quot;/&gt;&lt;wsp:rsid wsp:val=&quot;000002E1&quot;/&gt;&lt;wsp:rsid wsp:val=&quot;00003C97&quot;/&gt;&lt;wsp:rsid wsp:val=&quot;00005565&quot;/&gt;&lt;wsp:rsid wsp:val=&quot;0001754A&quot;/&gt;&lt;wsp:rsid wsp:val=&quot;00017719&quot;/&gt;&lt;wsp:rsid wsp:val=&quot;00027F1D&quot;/&gt;&lt;wsp:rsid wsp:val=&quot;0003296C&quot;/&gt;&lt;wsp:rsid wsp:val=&quot;0003351F&quot;/&gt;&lt;wsp:rsid wsp:val=&quot;00044599&quot;/&gt;&lt;wsp:rsid wsp:val=&quot;000540E6&quot;/&gt;&lt;wsp:rsid wsp:val=&quot;00054421&quot;/&gt;&lt;wsp:rsid wsp:val=&quot;00062E46&quot;/&gt;&lt;wsp:rsid wsp:val=&quot;00074AC8&quot;/&gt;&lt;wsp:rsid wsp:val=&quot;00081408&quot;/&gt;&lt;wsp:rsid wsp:val=&quot;00081EBE&quot;/&gt;&lt;wsp:rsid wsp:val=&quot;00086EDC&quot;/&gt;&lt;wsp:rsid wsp:val=&quot;000B1236&quot;/&gt;&lt;wsp:rsid wsp:val=&quot;000B36A3&quot;/&gt;&lt;wsp:rsid wsp:val=&quot;000C013C&quot;/&gt;&lt;wsp:rsid wsp:val=&quot;000E3F84&quot;/&gt;&lt;wsp:rsid wsp:val=&quot;001056DF&quot;/&gt;&lt;wsp:rsid wsp:val=&quot;0010789C&quot;/&gt;&lt;wsp:rsid wsp:val=&quot;00114025&quot;/&gt;&lt;wsp:rsid wsp:val=&quot;001160D2&quot;/&gt;&lt;wsp:rsid wsp:val=&quot;00120636&quot;/&gt;&lt;wsp:rsid wsp:val=&quot;001348A5&quot;/&gt;&lt;wsp:rsid wsp:val=&quot;00151B8E&quot;/&gt;&lt;wsp:rsid wsp:val=&quot;00182170&quot;/&gt;&lt;wsp:rsid wsp:val=&quot;001928FB&quot;/&gt;&lt;wsp:rsid wsp:val=&quot;00192BC7&quot;/&gt;&lt;wsp:rsid wsp:val=&quot;00195BE6&quot;/&gt;&lt;wsp:rsid wsp:val=&quot;001A50EA&quot;/&gt;&lt;wsp:rsid wsp:val=&quot;001F16CD&quot;/&gt;&lt;wsp:rsid wsp:val=&quot;001F47D2&quot;/&gt;&lt;wsp:rsid wsp:val=&quot;002029C8&quot;/&gt;&lt;wsp:rsid wsp:val=&quot;0022285A&quot;/&gt;&lt;wsp:rsid wsp:val=&quot;00224C61&quot;/&gt;&lt;wsp:rsid wsp:val=&quot;00256ABC&quot;/&gt;&lt;wsp:rsid wsp:val=&quot;0027227B&quot;/&gt;&lt;wsp:rsid wsp:val=&quot;00273AC7&quot;/&gt;&lt;wsp:rsid wsp:val=&quot;00273D2C&quot;/&gt;&lt;wsp:rsid wsp:val=&quot;00285ECD&quot;/&gt;&lt;wsp:rsid wsp:val=&quot;00290E1B&quot;/&gt;&lt;wsp:rsid wsp:val=&quot;00291B17&quot;/&gt;&lt;wsp:rsid wsp:val=&quot;00291BB3&quot;/&gt;&lt;wsp:rsid wsp:val=&quot;002A6742&quot;/&gt;&lt;wsp:rsid wsp:val=&quot;002C1A7F&quot;/&gt;&lt;wsp:rsid wsp:val=&quot;002C4239&quot;/&gt;&lt;wsp:rsid wsp:val=&quot;002C559D&quot;/&gt;&lt;wsp:rsid wsp:val=&quot;002D16AE&quot;/&gt;&lt;wsp:rsid wsp:val=&quot;002D2D42&quot;/&gt;&lt;wsp:rsid wsp:val=&quot;002F72D0&quot;/&gt;&lt;wsp:rsid wsp:val=&quot;002F7A4F&quot;/&gt;&lt;wsp:rsid wsp:val=&quot;003003AB&quot;/&gt;&lt;wsp:rsid wsp:val=&quot;00302C35&quot;/&gt;&lt;wsp:rsid wsp:val=&quot;00311C49&quot;/&gt;&lt;wsp:rsid wsp:val=&quot;0032119E&quot;/&gt;&lt;wsp:rsid wsp:val=&quot;00321304&quot;/&gt;&lt;wsp:rsid wsp:val=&quot;00324FC2&quot;/&gt;&lt;wsp:rsid wsp:val=&quot;003312CA&quot;/&gt;&lt;wsp:rsid wsp:val=&quot;00331F84&quot;/&gt;&lt;wsp:rsid wsp:val=&quot;0037721F&quot;/&gt;&lt;wsp:rsid wsp:val=&quot;003950A4&quot;/&gt;&lt;wsp:rsid wsp:val=&quot;003A1E7E&quot;/&gt;&lt;wsp:rsid wsp:val=&quot;003E2FDC&quot;/&gt;&lt;wsp:rsid wsp:val=&quot;003E3577&quot;/&gt;&lt;wsp:rsid wsp:val=&quot;003F3A61&quot;/&gt;&lt;wsp:rsid wsp:val=&quot;00410A5D&quot;/&gt;&lt;wsp:rsid wsp:val=&quot;00414909&quot;/&gt;&lt;wsp:rsid wsp:val=&quot;00416537&quot;/&gt;&lt;wsp:rsid wsp:val=&quot;00425A6A&quot;/&gt;&lt;wsp:rsid wsp:val=&quot;00426FBB&quot;/&gt;&lt;wsp:rsid wsp:val=&quot;00454542&quot;/&gt;&lt;wsp:rsid wsp:val=&quot;0047429A&quot;/&gt;&lt;wsp:rsid wsp:val=&quot;0048374C&quot;/&gt;&lt;wsp:rsid wsp:val=&quot;0048771D&quot;/&gt;&lt;wsp:rsid wsp:val=&quot;004A6605&quot;/&gt;&lt;wsp:rsid wsp:val=&quot;004C45FA&quot;/&gt;&lt;wsp:rsid wsp:val=&quot;004D35A3&quot;/&gt;&lt;wsp:rsid wsp:val=&quot;004E1BD8&quot;/&gt;&lt;wsp:rsid wsp:val=&quot;004E452A&quot;/&gt;&lt;wsp:rsid wsp:val=&quot;004E78E3&quot;/&gt;&lt;wsp:rsid wsp:val=&quot;004F2BFE&quot;/&gt;&lt;wsp:rsid wsp:val=&quot;004F63D3&quot;/&gt;&lt;wsp:rsid wsp:val=&quot;004F7DCF&quot;/&gt;&lt;wsp:rsid wsp:val=&quot;005004BF&quot;/&gt;&lt;wsp:rsid wsp:val=&quot;00502E89&quot;/&gt;&lt;wsp:rsid wsp:val=&quot;00506CFE&quot;/&gt;&lt;wsp:rsid wsp:val=&quot;00510E95&quot;/&gt;&lt;wsp:rsid wsp:val=&quot;005225C3&quot;/&gt;&lt;wsp:rsid wsp:val=&quot;00527D56&quot;/&gt;&lt;wsp:rsid wsp:val=&quot;0053221F&quot;/&gt;&lt;wsp:rsid wsp:val=&quot;00536FAE&quot;/&gt;&lt;wsp:rsid wsp:val=&quot;00542C85&quot;/&gt;&lt;wsp:rsid wsp:val=&quot;00553510&quot;/&gt;&lt;wsp:rsid wsp:val=&quot;00554186&quot;/&gt;&lt;wsp:rsid wsp:val=&quot;00585769&quot;/&gt;&lt;wsp:rsid wsp:val=&quot;00585C61&quot;/&gt;&lt;wsp:rsid wsp:val=&quot;00591130&quot;/&gt;&lt;wsp:rsid wsp:val=&quot;005A3F28&quot;/&gt;&lt;wsp:rsid wsp:val=&quot;005A40BE&quot;/&gt;&lt;wsp:rsid wsp:val=&quot;005B13E2&quot;/&gt;&lt;wsp:rsid wsp:val=&quot;005B47D7&quot;/&gt;&lt;wsp:rsid wsp:val=&quot;005C5526&quot;/&gt;&lt;wsp:rsid wsp:val=&quot;005C62C6&quot;/&gt;&lt;wsp:rsid wsp:val=&quot;005D7B9E&quot;/&gt;&lt;wsp:rsid wsp:val=&quot;005E112E&quot;/&gt;&lt;wsp:rsid wsp:val=&quot;005F0834&quot;/&gt;&lt;wsp:rsid wsp:val=&quot;005F68AB&quot;/&gt;&lt;wsp:rsid wsp:val=&quot;005F6DC3&quot;/&gt;&lt;wsp:rsid wsp:val=&quot;00601A8E&quot;/&gt;&lt;wsp:rsid wsp:val=&quot;0062033E&quot;/&gt;&lt;wsp:rsid wsp:val=&quot;00624482&quot;/&gt;&lt;wsp:rsid wsp:val=&quot;0064799C&quot;/&gt;&lt;wsp:rsid wsp:val=&quot;00654156&quot;/&gt;&lt;wsp:rsid wsp:val=&quot;00656ADC&quot;/&gt;&lt;wsp:rsid wsp:val=&quot;006B47CA&quot;/&gt;&lt;wsp:rsid wsp:val=&quot;006C304C&quot;/&gt;&lt;wsp:rsid wsp:val=&quot;006C4511&quot;/&gt;&lt;wsp:rsid wsp:val=&quot;006C65F5&quot;/&gt;&lt;wsp:rsid wsp:val=&quot;006C7AAA&quot;/&gt;&lt;wsp:rsid wsp:val=&quot;006D1C2A&quot;/&gt;&lt;wsp:rsid wsp:val=&quot;006D264F&quot;/&gt;&lt;wsp:rsid wsp:val=&quot;006D4E89&quot;/&gt;&lt;wsp:rsid wsp:val=&quot;006E2A8D&quot;/&gt;&lt;wsp:rsid wsp:val=&quot;006E7574&quot;/&gt;&lt;wsp:rsid wsp:val=&quot;00703430&quot;/&gt;&lt;wsp:rsid wsp:val=&quot;00703548&quot;/&gt;&lt;wsp:rsid wsp:val=&quot;00704E18&quot;/&gt;&lt;wsp:rsid wsp:val=&quot;007069BE&quot;/&gt;&lt;wsp:rsid wsp:val=&quot;00745C86&quot;/&gt;&lt;wsp:rsid wsp:val=&quot;00764603&quot;/&gt;&lt;wsp:rsid wsp:val=&quot;0076604D&quot;/&gt;&lt;wsp:rsid wsp:val=&quot;00790909&quot;/&gt;&lt;wsp:rsid wsp:val=&quot;007B1582&quot;/&gt;&lt;wsp:rsid wsp:val=&quot;007B5A07&quot;/&gt;&lt;wsp:rsid wsp:val=&quot;007C065D&quot;/&gt;&lt;wsp:rsid wsp:val=&quot;007D3E71&quot;/&gt;&lt;wsp:rsid wsp:val=&quot;007E5D6A&quot;/&gt;&lt;wsp:rsid wsp:val=&quot;007E645D&quot;/&gt;&lt;wsp:rsid wsp:val=&quot;007F75CA&quot;/&gt;&lt;wsp:rsid wsp:val=&quot;00821E08&quot;/&gt;&lt;wsp:rsid wsp:val=&quot;00834EFD&quot;/&gt;&lt;wsp:rsid wsp:val=&quot;00844B24&quot;/&gt;&lt;wsp:rsid wsp:val=&quot;0084515F&quot;/&gt;&lt;wsp:rsid wsp:val=&quot;0085092D&quot;/&gt;&lt;wsp:rsid wsp:val=&quot;00865414&quot;/&gt;&lt;wsp:rsid wsp:val=&quot;00877D4C&quot;/&gt;&lt;wsp:rsid wsp:val=&quot;00883903&quot;/&gt;&lt;wsp:rsid wsp:val=&quot;0089763B&quot;/&gt;&lt;wsp:rsid wsp:val=&quot;008B6AE3&quot;/&gt;&lt;wsp:rsid wsp:val=&quot;008C1332&quot;/&gt;&lt;wsp:rsid wsp:val=&quot;008D1045&quot;/&gt;&lt;wsp:rsid wsp:val=&quot;008E5996&quot;/&gt;&lt;wsp:rsid wsp:val=&quot;00901AE1&quot;/&gt;&lt;wsp:rsid wsp:val=&quot;00912F93&quot;/&gt;&lt;wsp:rsid wsp:val=&quot;009205B4&quot;/&gt;&lt;wsp:rsid wsp:val=&quot;00955B59&quot;/&gt;&lt;wsp:rsid wsp:val=&quot;00992262&quot;/&gt;&lt;wsp:rsid wsp:val=&quot;009926BC&quot;/&gt;&lt;wsp:rsid wsp:val=&quot;009A4319&quot;/&gt;&lt;wsp:rsid wsp:val=&quot;009A6C3F&quot;/&gt;&lt;wsp:rsid wsp:val=&quot;009B73F2&quot;/&gt;&lt;wsp:rsid wsp:val=&quot;009C12BD&quot;/&gt;&lt;wsp:rsid wsp:val=&quot;009C50FE&quot;/&gt;&lt;wsp:rsid wsp:val=&quot;009E49DD&quot;/&gt;&lt;wsp:rsid wsp:val=&quot;00A03E75&quot;/&gt;&lt;wsp:rsid wsp:val=&quot;00A20627&quot;/&gt;&lt;wsp:rsid wsp:val=&quot;00A22FE9&quot;/&gt;&lt;wsp:rsid wsp:val=&quot;00A31A44&quot;/&gt;&lt;wsp:rsid wsp:val=&quot;00A32BFA&quot;/&gt;&lt;wsp:rsid wsp:val=&quot;00A3325E&quot;/&gt;&lt;wsp:rsid wsp:val=&quot;00A45FCE&quot;/&gt;&lt;wsp:rsid wsp:val=&quot;00A75671&quot;/&gt;&lt;wsp:rsid wsp:val=&quot;00A773CC&quot;/&gt;&lt;wsp:rsid wsp:val=&quot;00A924D0&quot;/&gt;&lt;wsp:rsid wsp:val=&quot;00A9318B&quot;/&gt;&lt;wsp:rsid wsp:val=&quot;00A94AC1&quot;/&gt;&lt;wsp:rsid wsp:val=&quot;00AB18B7&quot;/&gt;&lt;wsp:rsid wsp:val=&quot;00AD335D&quot;/&gt;&lt;wsp:rsid wsp:val=&quot;00AF114C&quot;/&gt;&lt;wsp:rsid wsp:val=&quot;00AF792B&quot;/&gt;&lt;wsp:rsid wsp:val=&quot;00B33D2F&quot;/&gt;&lt;wsp:rsid wsp:val=&quot;00B40A5B&quot;/&gt;&lt;wsp:rsid wsp:val=&quot;00B45C6B&quot;/&gt;&lt;wsp:rsid wsp:val=&quot;00B55D5E&quot;/&gt;&lt;wsp:rsid wsp:val=&quot;00B57A80&quot;/&gt;&lt;wsp:rsid wsp:val=&quot;00B70E9C&quot;/&gt;&lt;wsp:rsid wsp:val=&quot;00B713D8&quot;/&gt;&lt;wsp:rsid wsp:val=&quot;00B72979&quot;/&gt;&lt;wsp:rsid wsp:val=&quot;00B94516&quot;/&gt;&lt;wsp:rsid wsp:val=&quot;00BA25E2&quot;/&gt;&lt;wsp:rsid wsp:val=&quot;00BB2855&quot;/&gt;&lt;wsp:rsid wsp:val=&quot;00BC5343&quot;/&gt;&lt;wsp:rsid wsp:val=&quot;00BD19C1&quot;/&gt;&lt;wsp:rsid wsp:val=&quot;00BD25B8&quot;/&gt;&lt;wsp:rsid wsp:val=&quot;00C012E1&quot;/&gt;&lt;wsp:rsid wsp:val=&quot;00C06BB4&quot;/&gt;&lt;wsp:rsid wsp:val=&quot;00C10D20&quot;/&gt;&lt;wsp:rsid wsp:val=&quot;00C12E0C&quot;/&gt;&lt;wsp:rsid wsp:val=&quot;00C21916&quot;/&gt;&lt;wsp:rsid wsp:val=&quot;00C34915&quot;/&gt;&lt;wsp:rsid wsp:val=&quot;00C41ED5&quot;/&gt;&lt;wsp:rsid wsp:val=&quot;00C457CA&quot;/&gt;&lt;wsp:rsid wsp:val=&quot;00C53FB6&quot;/&gt;&lt;wsp:rsid wsp:val=&quot;00C57FB7&quot;/&gt;&lt;wsp:rsid wsp:val=&quot;00C644D4&quot;/&gt;&lt;wsp:rsid wsp:val=&quot;00C65F3F&quot;/&gt;&lt;wsp:rsid wsp:val=&quot;00C72414&quot;/&gt;&lt;wsp:rsid wsp:val=&quot;00C72B1A&quot;/&gt;&lt;wsp:rsid wsp:val=&quot;00C8667B&quot;/&gt;&lt;wsp:rsid wsp:val=&quot;00C90993&quot;/&gt;&lt;wsp:rsid wsp:val=&quot;00CA4CE3&quot;/&gt;&lt;wsp:rsid wsp:val=&quot;00CC72FD&quot;/&gt;&lt;wsp:rsid wsp:val=&quot;00CD4F3F&quot;/&gt;&lt;wsp:rsid wsp:val=&quot;00D311F8&quot;/&gt;&lt;wsp:rsid wsp:val=&quot;00D31660&quot;/&gt;&lt;wsp:rsid wsp:val=&quot;00D36B52&quot;/&gt;&lt;wsp:rsid wsp:val=&quot;00D377C8&quot;/&gt;&lt;wsp:rsid wsp:val=&quot;00D41274&quot;/&gt;&lt;wsp:rsid wsp:val=&quot;00D4229C&quot;/&gt;&lt;wsp:rsid wsp:val=&quot;00D43BF3&quot;/&gt;&lt;wsp:rsid wsp:val=&quot;00D549FB&quot;/&gt;&lt;wsp:rsid wsp:val=&quot;00D767BB&quot;/&gt;&lt;wsp:rsid wsp:val=&quot;00D939B0&quot;/&gt;&lt;wsp:rsid wsp:val=&quot;00DA31A2&quot;/&gt;&lt;wsp:rsid wsp:val=&quot;00DB16E0&quot;/&gt;&lt;wsp:rsid wsp:val=&quot;00DB2DF9&quot;/&gt;&lt;wsp:rsid wsp:val=&quot;00DB465D&quot;/&gt;&lt;wsp:rsid wsp:val=&quot;00DB48A2&quot;/&gt;&lt;wsp:rsid wsp:val=&quot;00DB7E63&quot;/&gt;&lt;wsp:rsid wsp:val=&quot;00DC2055&quot;/&gt;&lt;wsp:rsid wsp:val=&quot;00DC3908&quot;/&gt;&lt;wsp:rsid wsp:val=&quot;00DD71E8&quot;/&gt;&lt;wsp:rsid wsp:val=&quot;00DD7F83&quot;/&gt;&lt;wsp:rsid wsp:val=&quot;00DE4EB8&quot;/&gt;&lt;wsp:rsid wsp:val=&quot;00E0641E&quot;/&gt;&lt;wsp:rsid wsp:val=&quot;00E06664&quot;/&gt;&lt;wsp:rsid wsp:val=&quot;00E304BC&quot;/&gt;&lt;wsp:rsid wsp:val=&quot;00E32853&quot;/&gt;&lt;wsp:rsid wsp:val=&quot;00E34EBD&quot;/&gt;&lt;wsp:rsid wsp:val=&quot;00E401F8&quot;/&gt;&lt;wsp:rsid wsp:val=&quot;00E46425&quot;/&gt;&lt;wsp:rsid wsp:val=&quot;00E469FC&quot;/&gt;&lt;wsp:rsid wsp:val=&quot;00E47D0E&quot;/&gt;&lt;wsp:rsid wsp:val=&quot;00E65018&quot;/&gt;&lt;wsp:rsid wsp:val=&quot;00E76CA1&quot;/&gt;&lt;wsp:rsid wsp:val=&quot;00E94339&quot;/&gt;&lt;wsp:rsid wsp:val=&quot;00E97563&quot;/&gt;&lt;wsp:rsid wsp:val=&quot;00EB0B63&quot;/&gt;&lt;wsp:rsid wsp:val=&quot;00EC265C&quot;/&gt;&lt;wsp:rsid wsp:val=&quot;00ED61CB&quot;/&gt;&lt;wsp:rsid wsp:val=&quot;00EE752A&quot;/&gt;&lt;wsp:rsid wsp:val=&quot;00F06A72&quot;/&gt;&lt;wsp:rsid wsp:val=&quot;00F136F0&quot;/&gt;&lt;wsp:rsid wsp:val=&quot;00F20BBB&quot;/&gt;&lt;wsp:rsid wsp:val=&quot;00F36048&quot;/&gt;&lt;wsp:rsid wsp:val=&quot;00F43BD8&quot;/&gt;&lt;wsp:rsid wsp:val=&quot;00F562F3&quot;/&gt;&lt;wsp:rsid wsp:val=&quot;00F74B89&quot;/&gt;&lt;wsp:rsid wsp:val=&quot;00F75133&quot;/&gt;&lt;wsp:rsid wsp:val=&quot;00F83272&quot;/&gt;&lt;wsp:rsid wsp:val=&quot;00F9358D&quot;/&gt;&lt;wsp:rsid wsp:val=&quot;00FA3899&quot;/&gt;&lt;wsp:rsid wsp:val=&quot;00FA4909&quot;/&gt;&lt;wsp:rsid wsp:val=&quot;00FA5164&quot;/&gt;&lt;wsp:rsid wsp:val=&quot;00FA6751&quot;/&gt;&lt;wsp:rsid wsp:val=&quot;00FA6BD7&quot;/&gt;&lt;wsp:rsid wsp:val=&quot;00FB1048&quot;/&gt;&lt;wsp:rsid wsp:val=&quot;00FB62C4&quot;/&gt;&lt;wsp:rsid wsp:val=&quot;00FB7701&quot;/&gt;&lt;wsp:rsid wsp:val=&quot;00FD1AC5&quot;/&gt;&lt;wsp:rsid wsp:val=&quot;00FD5CF0&quot;/&gt;&lt;/wsp:rsids&gt;&lt;/w:docPr&gt;&lt;w:body&gt;&lt;wx:sect&gt;&lt;w:p wsp:rsidR=&quot;00C41ED5&quot; wsp:rsidRPr=&quot;00C41ED5&quot; wsp:rsidRDefault=&quot;00C41ED5&quot; wsp:rsidP=&quot;00C41ED5&quot;&gt;&lt;m:oMathPara&gt;&lt;m:oMath&gt;&lt;m:r&gt;&lt;m:rPr&gt;&lt;m:sty m:val=&quot;p&quot;/&gt;&lt;/m:rPr&gt;&lt;w:rPr&gt;&lt;w:rFonts w:ascii=&quot;Cambria Math&quot; w:h-ansi=&quot;Cambria Math&quot;/&gt;&lt;wx:font wx:val=&quot;Cambria Math&quot;/&gt;&lt;/w:rPr&gt;&lt;m:t&gt;Î”&lt;/m:t&gt;&lt;/m:r&gt;&lt;m:sSub&gt;&lt;m:sSubPr&gt;&lt;m:ctrlPr&gt;&lt;w:rPr&gt;&lt;w:rFonts w:ascii=&quot;Cambria Math&quot; w:h-ansi=&quot;Cambria Math&quot;/&gt;&lt;wx:font wx:val=&quot;Cambria Math&quot;/&gt;&lt;w:i/&gt;&lt;/w:rPr&gt;&lt;/m:ctrlPr&gt;&lt;/m:sSubPr&gt;&lt;m:e&gt;&lt;m:r&gt;&lt;w:rPr&gt;&lt;w:rFonts w:ascii=&quot;Cambria Math&quot; w:h-ansi=&quot;Cambria Math&quot;/&gt;&lt;wx:font wx:val=&quot;Cambria Math&quot;/&gt;&lt;w:i/&gt;&lt;/w:rPr&gt;&lt;m:t&gt;V&lt;/m:t&gt;&lt;/m:r&gt;&lt;/m:e&gt;&lt;m:sub&gt;&lt;m:r&gt;&lt;w:rPr&gt;&lt;w:rFonts w:ascii=&quot;Cambria Math&quot; w:h-ansi=&quot;Cambria Math&quot;/&gt;&lt;wx:font wx:val=&quot;Cambria Math&quot;/&gt;&lt;w:i/&gt;&lt;/w:rPr&gt;&lt;m:t&gt;out&lt;/m:t&gt;&lt;/m:r&gt;&lt;/m:sub&gt;&lt;/m:sSub&gt;&lt;/m:oMath&gt;&lt;/m:oMathPara&gt;&lt;/w:p&gt;&lt;w:sectPr wsp:rsidR=&quot;00000000&quot; wsp:rsidRPr=&quot;00C41ED5&quot;&gt;&lt;w:pgSz w:w=&quot;12240&quot; w:h=&quot;15840&quot;/&gt;&lt;w:pgMar w:top=&quot;1440&quot; w:right=&quot;1440&quot; w:bottom=&quot;1440&quot; w:left=&quot;1440&quot; w:header=&quot;720&quot; w:footer=&quot;720&quot; w:gutter=&quot;0&quot;/&gt;&lt;w:cols w:space=&quot;720&quot;/&gt;&lt;/w:sectPr&gt;&lt;/wx:sect&gt;&lt;/w:body&gt;&lt;/w:wordDocument&gt;">
+                <v:shape id="_x0000_i1046" type="#_x0000_t75" style="width:28.4pt;height:13.85pt" equationxml="&lt;?xml version=&quot;1.0&quot; encoding=&quot;UTF-8&quot; standalone=&quot;yes&quot;?&gt;&#10;&lt;?mso-application progid=&quot;Word.Document&quot;?&gt;&#10;&lt;w:wordDocument xmlns:aml=&quot;http://schemas.microsoft.com/aml/2001/core&quot; xmlns:wpc=&quot;http://schemas.microsoft.com/office/word/2010/wordprocessingCanvas&quot; xmlns:cx=&quot;http://schemas.microsoft.com/office/drawing/2014/chartex&quot; xmlns:cx1=&quot;http://schemas.microsoft.com/office/drawing/2015/9/8/chartex&quot; xmlns:cx2=&quot;http://schemas.microsoft.com/office/drawing/2015/10/21/chartex&quot; xmlns:cx3=&quot;http://schemas.microsoft.com/office/drawing/2016/5/9/chartex&quot; xmlns:cx4=&quot;http://schemas.microsoft.com/office/drawing/2016/5/10/chartex&quot; xmlns:cx5=&quot;http://schemas.microsoft.com/office/drawing/2016/5/11/chartex&quot; xmlns:cx6=&quot;http://schemas.microsoft.com/office/drawing/2016/5/12/chartex&quot; xmlns:cx7=&quot;http://schemas.microsoft.com/office/drawing/2016/5/13/chartex&quot; xmlns:cx8=&quot;http://schemas.microsoft.com/office/drawing/2016/5/14/chartex&quot; xmlns:cr=&quot;http://schemas.microsoft.com/office/comments/2020/reactions&quot; xmlns:dt=&quot;uuid:C2F41010-65B3-11d1-A29F-00AA00C14882&quot; xmlns:mc=&quot;http://schemas.openxmlformats.org/markup-compatibility/2006&quot; xmlns:aink=&quot;http://schemas.microsoft.com/office/drawing/2016/ink&quot; xmlns:am3d=&quot;http://schemas.microsoft.com/office/drawing/2017/model3d&quot; xmlns:o=&quot;urn:schemas-microsoft-com:office:office&quot; xmlns:oel=&quot;http://schemas.microsoft.com/office/2019/extlst&quot; xmlns:m=&quot;http://schemas.openxmlformats.org/officeDocument/2006/math&quot; xmlns:v=&quot;urn:schemas-microsoft-com:vml&quot; xmlns:w10=&quot;urn:schemas-microsoft-com:office:word&quot; xmlns:w=&quot;http://schemas.microsoft.com/office/word/2003/wordml&quot; xmlns:wx=&quot;http://schemas.microsoft.com/office/word/2003/auxHint&quot; xmlns:wne=&quot;http://schemas.microsoft.com/office/word/2006/wordml&quot; xmlns:wsp=&quot;http://schemas.microsoft.com/office/word/2003/wordml/sp2&quot; xmlns:sl=&quot;http://schemas.microsoft.com/schemaLibrary/2003/core&quot; w:macrosPresent=&quot;no&quot; w:embeddedObjPresent=&quot;no&quot; w:ocxPresent=&quot;no&quot; xml:space=&quot;preserve&quot;&gt;&lt;w:ignoreSubtree w:val=&quot;http://schemas.microsoft.com/office/word/2003/wordml/sp2&quot;/&gt;&lt;o:DocumentProperties&gt;&lt;o:Version&gt;16&lt;/o:Version&gt;&lt;/o:DocumentProperties&gt;&lt;w:docPr&gt;&lt;w:view w:val=&quot;print&quot;/&gt;&lt;w:zoom w:percent=&quot;100&quot;/&gt;&lt;w:doNotEmbedSystemFonts/&gt;&lt;w:activeWritingStyle w:lang=&quot;EN-AU&quot; w:vendorID=&quot;64&quot; w:dllVersion=&quot;6&quot; w:nlCheck=&quot;on&quot; w:optionSet=&quot;1&quot;/&gt;&lt;w:activeWritingStyle w:lang=&quot;EN-GB&quot; w:vendorID=&quot;64&quot; w:dllVersion=&quot;6&quot; w:nlCheck=&quot;on&quot; w:optionSet=&quot;1&quot;/&gt;&lt;w:activeWritingStyle w:lang=&quot;EN-US&quot; w:vendorID=&quot;64&quot; w:dllVersion=&quot;6&quot; w:nlCheck=&quot;on&quot; w:optionSet=&quot;1&quot;/&gt;&lt;w:activeWritingStyle w:lang=&quot;EN-AU&quot; w:vendorID=&quot;64&quot; w:dllVersion=&quot;0&quot; w:nlCheck=&quot;on&quot; w:optionSet=&quot;0&quot;/&gt;&lt;w:activeWritingStyle w:lang=&quot;EN-GB&quot; w:vendorID=&quot;64&quot; w:dllVersion=&quot;0&quot; w:nlCheck=&quot;on&quot; w:optionSet=&quot;0&quot;/&gt;&lt;w:activeWritingStyle w:lang=&quot;EN-US&quot; w:vendorID=&quot;64&quot; w:dllVersion=&quot;0&quot; w:nlCheck=&quot;on&quot; w:optionSet=&quot;0&quot;/&gt;&lt;w:activeWritingStyle w:lang=&quot;ES-AR&quot; w:vendorID=&quot;64&quot; w:dllVersion=&quot;0&quot; w:nlCheck=&quot;on&quot; w:optionSet=&quot;0&quot;/&gt;&lt;w:activeWritingStyle w:lang=&quot;580A&quot; w:vendorID=&quot;64&quot; w:dllVersion=&quot;0&quot; w:nlCheck=&quot;on&quot; w:optionSet=&quot;0&quot;/&gt;&lt;w:activeWritingStyle w:lang=&quot;PT-BR&quot; w:vendorID=&quot;64&quot; w:dllVersion=&quot;0&quot; w:nlCheck=&quot;on&quot; w:optionSet=&quot;0&quot;/&gt;&lt;w:stylePaneFormatFilter w:val=&quot;3F01&quot;/&gt;&lt;w:defaultTabStop w:val=&quot;720&quot;/&gt;&lt;w:hyphenationZone w:val=&quot;425&quot;/&gt;&lt;w:characterSpacingControl w:val=&quot;DontCompress&quot;/&gt;&lt;w:optimizeForBrowser/&gt;&lt;w:validateAgainstSchema/&gt;&lt;w:saveInvalidXML w:val=&quot;off&quot;/&gt;&lt;w:ignoreMixedContent w:val=&quot;off&quot;/&gt;&lt;w:alwaysShowPlaceholderText w:val=&quot;off&quot;/&gt;&lt;w:compat&gt;&lt;w:breakWrappedTables/&gt;&lt;w:snapToGridInCell/&gt;&lt;w:applyBreakingRules/&gt;&lt;w:wrapTextWithPunct/&gt;&lt;w:useAsianBreakRules/&gt;&lt;w:useWord2002TableStyleRules/&gt;&lt;w:useFELayout/&gt;&lt;/w:compat&gt;&lt;wsp:rsids&gt;&lt;wsp:rsidRoot wsp:val=&quot;00426FBB&quot;/&gt;&lt;wsp:rsid wsp:val=&quot;000002E1&quot;/&gt;&lt;wsp:rsid wsp:val=&quot;00003C97&quot;/&gt;&lt;wsp:rsid wsp:val=&quot;00005565&quot;/&gt;&lt;wsp:rsid wsp:val=&quot;0001754A&quot;/&gt;&lt;wsp:rsid wsp:val=&quot;00017719&quot;/&gt;&lt;wsp:rsid wsp:val=&quot;00027F1D&quot;/&gt;&lt;wsp:rsid wsp:val=&quot;0003296C&quot;/&gt;&lt;wsp:rsid wsp:val=&quot;0003351F&quot;/&gt;&lt;wsp:rsid wsp:val=&quot;00044599&quot;/&gt;&lt;wsp:rsid wsp:val=&quot;000540E6&quot;/&gt;&lt;wsp:rsid wsp:val=&quot;00054421&quot;/&gt;&lt;wsp:rsid wsp:val=&quot;00062E46&quot;/&gt;&lt;wsp:rsid wsp:val=&quot;00074AC8&quot;/&gt;&lt;wsp:rsid wsp:val=&quot;00081408&quot;/&gt;&lt;wsp:rsid wsp:val=&quot;00081EBE&quot;/&gt;&lt;wsp:rsid wsp:val=&quot;00086EDC&quot;/&gt;&lt;wsp:rsid wsp:val=&quot;000B1236&quot;/&gt;&lt;wsp:rsid wsp:val=&quot;000B36A3&quot;/&gt;&lt;wsp:rsid wsp:val=&quot;000C013C&quot;/&gt;&lt;wsp:rsid wsp:val=&quot;000E3F84&quot;/&gt;&lt;wsp:rsid wsp:val=&quot;001056DF&quot;/&gt;&lt;wsp:rsid wsp:val=&quot;0010789C&quot;/&gt;&lt;wsp:rsid wsp:val=&quot;00114025&quot;/&gt;&lt;wsp:rsid wsp:val=&quot;001160D2&quot;/&gt;&lt;wsp:rsid wsp:val=&quot;00120636&quot;/&gt;&lt;wsp:rsid wsp:val=&quot;001348A5&quot;/&gt;&lt;wsp:rsid wsp:val=&quot;00151B8E&quot;/&gt;&lt;wsp:rsid wsp:val=&quot;00182170&quot;/&gt;&lt;wsp:rsid wsp:val=&quot;001928FB&quot;/&gt;&lt;wsp:rsid wsp:val=&quot;00192BC7&quot;/&gt;&lt;wsp:rsid wsp:val=&quot;00195BE6&quot;/&gt;&lt;wsp:rsid wsp:val=&quot;001A50EA&quot;/&gt;&lt;wsp:rsid wsp:val=&quot;001F16CD&quot;/&gt;&lt;wsp:rsid wsp:val=&quot;001F47D2&quot;/&gt;&lt;wsp:rsid wsp:val=&quot;002029C8&quot;/&gt;&lt;wsp:rsid wsp:val=&quot;0022285A&quot;/&gt;&lt;wsp:rsid wsp:val=&quot;00224C61&quot;/&gt;&lt;wsp:rsid wsp:val=&quot;00256ABC&quot;/&gt;&lt;wsp:rsid wsp:val=&quot;0027227B&quot;/&gt;&lt;wsp:rsid wsp:val=&quot;00273AC7&quot;/&gt;&lt;wsp:rsid wsp:val=&quot;00273D2C&quot;/&gt;&lt;wsp:rsid wsp:val=&quot;00285ECD&quot;/&gt;&lt;wsp:rsid wsp:val=&quot;00290E1B&quot;/&gt;&lt;wsp:rsid wsp:val=&quot;00291B17&quot;/&gt;&lt;wsp:rsid wsp:val=&quot;00291BB3&quot;/&gt;&lt;wsp:rsid wsp:val=&quot;002A6742&quot;/&gt;&lt;wsp:rsid wsp:val=&quot;002C1A7F&quot;/&gt;&lt;wsp:rsid wsp:val=&quot;002C4239&quot;/&gt;&lt;wsp:rsid wsp:val=&quot;002C559D&quot;/&gt;&lt;wsp:rsid wsp:val=&quot;002D16AE&quot;/&gt;&lt;wsp:rsid wsp:val=&quot;002D2D42&quot;/&gt;&lt;wsp:rsid wsp:val=&quot;002F72D0&quot;/&gt;&lt;wsp:rsid wsp:val=&quot;002F7A4F&quot;/&gt;&lt;wsp:rsid wsp:val=&quot;003003AB&quot;/&gt;&lt;wsp:rsid wsp:val=&quot;00302C35&quot;/&gt;&lt;wsp:rsid wsp:val=&quot;00311C49&quot;/&gt;&lt;wsp:rsid wsp:val=&quot;0032119E&quot;/&gt;&lt;wsp:rsid wsp:val=&quot;00321304&quot;/&gt;&lt;wsp:rsid wsp:val=&quot;00324FC2&quot;/&gt;&lt;wsp:rsid wsp:val=&quot;003312CA&quot;/&gt;&lt;wsp:rsid wsp:val=&quot;00331F84&quot;/&gt;&lt;wsp:rsid wsp:val=&quot;0037721F&quot;/&gt;&lt;wsp:rsid wsp:val=&quot;003950A4&quot;/&gt;&lt;wsp:rsid wsp:val=&quot;003A1E7E&quot;/&gt;&lt;wsp:rsid wsp:val=&quot;003E2FDC&quot;/&gt;&lt;wsp:rsid wsp:val=&quot;003E3577&quot;/&gt;&lt;wsp:rsid wsp:val=&quot;003F3A61&quot;/&gt;&lt;wsp:rsid wsp:val=&quot;00410A5D&quot;/&gt;&lt;wsp:rsid wsp:val=&quot;00414909&quot;/&gt;&lt;wsp:rsid wsp:val=&quot;00416537&quot;/&gt;&lt;wsp:rsid wsp:val=&quot;00425A6A&quot;/&gt;&lt;wsp:rsid wsp:val=&quot;00426FBB&quot;/&gt;&lt;wsp:rsid wsp:val=&quot;00454542&quot;/&gt;&lt;wsp:rsid wsp:val=&quot;0047429A&quot;/&gt;&lt;wsp:rsid wsp:val=&quot;0048374C&quot;/&gt;&lt;wsp:rsid wsp:val=&quot;0048771D&quot;/&gt;&lt;wsp:rsid wsp:val=&quot;004A6605&quot;/&gt;&lt;wsp:rsid wsp:val=&quot;004C45FA&quot;/&gt;&lt;wsp:rsid wsp:val=&quot;004D35A3&quot;/&gt;&lt;wsp:rsid wsp:val=&quot;004E1BD8&quot;/&gt;&lt;wsp:rsid wsp:val=&quot;004E452A&quot;/&gt;&lt;wsp:rsid wsp:val=&quot;004E78E3&quot;/&gt;&lt;wsp:rsid wsp:val=&quot;004F2BFE&quot;/&gt;&lt;wsp:rsid wsp:val=&quot;004F63D3&quot;/&gt;&lt;wsp:rsid wsp:val=&quot;004F7DCF&quot;/&gt;&lt;wsp:rsid wsp:val=&quot;005004BF&quot;/&gt;&lt;wsp:rsid wsp:val=&quot;00502E89&quot;/&gt;&lt;wsp:rsid wsp:val=&quot;00506CFE&quot;/&gt;&lt;wsp:rsid wsp:val=&quot;00510E95&quot;/&gt;&lt;wsp:rsid wsp:val=&quot;005225C3&quot;/&gt;&lt;wsp:rsid wsp:val=&quot;00527D56&quot;/&gt;&lt;wsp:rsid wsp:val=&quot;0053221F&quot;/&gt;&lt;wsp:rsid wsp:val=&quot;00536FAE&quot;/&gt;&lt;wsp:rsid wsp:val=&quot;00542C85&quot;/&gt;&lt;wsp:rsid wsp:val=&quot;00553510&quot;/&gt;&lt;wsp:rsid wsp:val=&quot;00554186&quot;/&gt;&lt;wsp:rsid wsp:val=&quot;00585769&quot;/&gt;&lt;wsp:rsid wsp:val=&quot;00585C61&quot;/&gt;&lt;wsp:rsid wsp:val=&quot;00591130&quot;/&gt;&lt;wsp:rsid wsp:val=&quot;005A3F28&quot;/&gt;&lt;wsp:rsid wsp:val=&quot;005A40BE&quot;/&gt;&lt;wsp:rsid wsp:val=&quot;005B13E2&quot;/&gt;&lt;wsp:rsid wsp:val=&quot;005B47D7&quot;/&gt;&lt;wsp:rsid wsp:val=&quot;005C5526&quot;/&gt;&lt;wsp:rsid wsp:val=&quot;005C62C6&quot;/&gt;&lt;wsp:rsid wsp:val=&quot;005D7B9E&quot;/&gt;&lt;wsp:rsid wsp:val=&quot;005E112E&quot;/&gt;&lt;wsp:rsid wsp:val=&quot;005F0834&quot;/&gt;&lt;wsp:rsid wsp:val=&quot;005F68AB&quot;/&gt;&lt;wsp:rsid wsp:val=&quot;005F6DC3&quot;/&gt;&lt;wsp:rsid wsp:val=&quot;00601A8E&quot;/&gt;&lt;wsp:rsid wsp:val=&quot;0062033E&quot;/&gt;&lt;wsp:rsid wsp:val=&quot;00624482&quot;/&gt;&lt;wsp:rsid wsp:val=&quot;0064799C&quot;/&gt;&lt;wsp:rsid wsp:val=&quot;00654156&quot;/&gt;&lt;wsp:rsid wsp:val=&quot;00656ADC&quot;/&gt;&lt;wsp:rsid wsp:val=&quot;006B47CA&quot;/&gt;&lt;wsp:rsid wsp:val=&quot;006C304C&quot;/&gt;&lt;wsp:rsid wsp:val=&quot;006C4511&quot;/&gt;&lt;wsp:rsid wsp:val=&quot;006C65F5&quot;/&gt;&lt;wsp:rsid wsp:val=&quot;006C7AAA&quot;/&gt;&lt;wsp:rsid wsp:val=&quot;006D1C2A&quot;/&gt;&lt;wsp:rsid wsp:val=&quot;006D264F&quot;/&gt;&lt;wsp:rsid wsp:val=&quot;006D4E89&quot;/&gt;&lt;wsp:rsid wsp:val=&quot;006E2A8D&quot;/&gt;&lt;wsp:rsid wsp:val=&quot;006E7574&quot;/&gt;&lt;wsp:rsid wsp:val=&quot;00703430&quot;/&gt;&lt;wsp:rsid wsp:val=&quot;00703548&quot;/&gt;&lt;wsp:rsid wsp:val=&quot;00704E18&quot;/&gt;&lt;wsp:rsid wsp:val=&quot;007069BE&quot;/&gt;&lt;wsp:rsid wsp:val=&quot;00745C86&quot;/&gt;&lt;wsp:rsid wsp:val=&quot;00764603&quot;/&gt;&lt;wsp:rsid wsp:val=&quot;0076604D&quot;/&gt;&lt;wsp:rsid wsp:val=&quot;00790909&quot;/&gt;&lt;wsp:rsid wsp:val=&quot;007B1582&quot;/&gt;&lt;wsp:rsid wsp:val=&quot;007B5A07&quot;/&gt;&lt;wsp:rsid wsp:val=&quot;007C065D&quot;/&gt;&lt;wsp:rsid wsp:val=&quot;007D3E71&quot;/&gt;&lt;wsp:rsid wsp:val=&quot;007E5D6A&quot;/&gt;&lt;wsp:rsid wsp:val=&quot;007E645D&quot;/&gt;&lt;wsp:rsid wsp:val=&quot;007F75CA&quot;/&gt;&lt;wsp:rsid wsp:val=&quot;00821E08&quot;/&gt;&lt;wsp:rsid wsp:val=&quot;00834EFD&quot;/&gt;&lt;wsp:rsid wsp:val=&quot;00844B24&quot;/&gt;&lt;wsp:rsid wsp:val=&quot;0084515F&quot;/&gt;&lt;wsp:rsid wsp:val=&quot;0085092D&quot;/&gt;&lt;wsp:rsid wsp:val=&quot;00865414&quot;/&gt;&lt;wsp:rsid wsp:val=&quot;00877D4C&quot;/&gt;&lt;wsp:rsid wsp:val=&quot;00883903&quot;/&gt;&lt;wsp:rsid wsp:val=&quot;0089763B&quot;/&gt;&lt;wsp:rsid wsp:val=&quot;008B6AE3&quot;/&gt;&lt;wsp:rsid wsp:val=&quot;008C1332&quot;/&gt;&lt;wsp:rsid wsp:val=&quot;008D1045&quot;/&gt;&lt;wsp:rsid wsp:val=&quot;008E5996&quot;/&gt;&lt;wsp:rsid wsp:val=&quot;00901AE1&quot;/&gt;&lt;wsp:rsid wsp:val=&quot;00912F93&quot;/&gt;&lt;wsp:rsid wsp:val=&quot;009205B4&quot;/&gt;&lt;wsp:rsid wsp:val=&quot;00955B59&quot;/&gt;&lt;wsp:rsid wsp:val=&quot;00992262&quot;/&gt;&lt;wsp:rsid wsp:val=&quot;009926BC&quot;/&gt;&lt;wsp:rsid wsp:val=&quot;009A4319&quot;/&gt;&lt;wsp:rsid wsp:val=&quot;009A6C3F&quot;/&gt;&lt;wsp:rsid wsp:val=&quot;009B73F2&quot;/&gt;&lt;wsp:rsid wsp:val=&quot;009C12BD&quot;/&gt;&lt;wsp:rsid wsp:val=&quot;009C50FE&quot;/&gt;&lt;wsp:rsid wsp:val=&quot;009E49DD&quot;/&gt;&lt;wsp:rsid wsp:val=&quot;00A03E75&quot;/&gt;&lt;wsp:rsid wsp:val=&quot;00A20627&quot;/&gt;&lt;wsp:rsid wsp:val=&quot;00A22FE9&quot;/&gt;&lt;wsp:rsid wsp:val=&quot;00A31A44&quot;/&gt;&lt;wsp:rsid wsp:val=&quot;00A32BFA&quot;/&gt;&lt;wsp:rsid wsp:val=&quot;00A3325E&quot;/&gt;&lt;wsp:rsid wsp:val=&quot;00A45FCE&quot;/&gt;&lt;wsp:rsid wsp:val=&quot;00A75671&quot;/&gt;&lt;wsp:rsid wsp:val=&quot;00A773CC&quot;/&gt;&lt;wsp:rsid wsp:val=&quot;00A924D0&quot;/&gt;&lt;wsp:rsid wsp:val=&quot;00A9318B&quot;/&gt;&lt;wsp:rsid wsp:val=&quot;00A94AC1&quot;/&gt;&lt;wsp:rsid wsp:val=&quot;00AB18B7&quot;/&gt;&lt;wsp:rsid wsp:val=&quot;00AD335D&quot;/&gt;&lt;wsp:rsid wsp:val=&quot;00AF114C&quot;/&gt;&lt;wsp:rsid wsp:val=&quot;00AF792B&quot;/&gt;&lt;wsp:rsid wsp:val=&quot;00B33D2F&quot;/&gt;&lt;wsp:rsid wsp:val=&quot;00B40A5B&quot;/&gt;&lt;wsp:rsid wsp:val=&quot;00B45C6B&quot;/&gt;&lt;wsp:rsid wsp:val=&quot;00B55D5E&quot;/&gt;&lt;wsp:rsid wsp:val=&quot;00B57A80&quot;/&gt;&lt;wsp:rsid wsp:val=&quot;00B70E9C&quot;/&gt;&lt;wsp:rsid wsp:val=&quot;00B713D8&quot;/&gt;&lt;wsp:rsid wsp:val=&quot;00B72979&quot;/&gt;&lt;wsp:rsid wsp:val=&quot;00B94516&quot;/&gt;&lt;wsp:rsid wsp:val=&quot;00BA25E2&quot;/&gt;&lt;wsp:rsid wsp:val=&quot;00BB2855&quot;/&gt;&lt;wsp:rsid wsp:val=&quot;00BC5343&quot;/&gt;&lt;wsp:rsid wsp:val=&quot;00BD19C1&quot;/&gt;&lt;wsp:rsid wsp:val=&quot;00BD25B8&quot;/&gt;&lt;wsp:rsid wsp:val=&quot;00C012E1&quot;/&gt;&lt;wsp:rsid wsp:val=&quot;00C06BB4&quot;/&gt;&lt;wsp:rsid wsp:val=&quot;00C10D20&quot;/&gt;&lt;wsp:rsid wsp:val=&quot;00C12E0C&quot;/&gt;&lt;wsp:rsid wsp:val=&quot;00C21916&quot;/&gt;&lt;wsp:rsid wsp:val=&quot;00C34915&quot;/&gt;&lt;wsp:rsid wsp:val=&quot;00C41ED5&quot;/&gt;&lt;wsp:rsid wsp:val=&quot;00C457CA&quot;/&gt;&lt;wsp:rsid wsp:val=&quot;00C53FB6&quot;/&gt;&lt;wsp:rsid wsp:val=&quot;00C57FB7&quot;/&gt;&lt;wsp:rsid wsp:val=&quot;00C644D4&quot;/&gt;&lt;wsp:rsid wsp:val=&quot;00C65F3F&quot;/&gt;&lt;wsp:rsid wsp:val=&quot;00C72414&quot;/&gt;&lt;wsp:rsid wsp:val=&quot;00C72B1A&quot;/&gt;&lt;wsp:rsid wsp:val=&quot;00C8667B&quot;/&gt;&lt;wsp:rsid wsp:val=&quot;00C90993&quot;/&gt;&lt;wsp:rsid wsp:val=&quot;00CA4CE3&quot;/&gt;&lt;wsp:rsid wsp:val=&quot;00CC72FD&quot;/&gt;&lt;wsp:rsid wsp:val=&quot;00CD4F3F&quot;/&gt;&lt;wsp:rsid wsp:val=&quot;00D311F8&quot;/&gt;&lt;wsp:rsid wsp:val=&quot;00D31660&quot;/&gt;&lt;wsp:rsid wsp:val=&quot;00D36B52&quot;/&gt;&lt;wsp:rsid wsp:val=&quot;00D377C8&quot;/&gt;&lt;wsp:rsid wsp:val=&quot;00D41274&quot;/&gt;&lt;wsp:rsid wsp:val=&quot;00D4229C&quot;/&gt;&lt;wsp:rsid wsp:val=&quot;00D43BF3&quot;/&gt;&lt;wsp:rsid wsp:val=&quot;00D549FB&quot;/&gt;&lt;wsp:rsid wsp:val=&quot;00D767BB&quot;/&gt;&lt;wsp:rsid wsp:val=&quot;00D939B0&quot;/&gt;&lt;wsp:rsid wsp:val=&quot;00DA31A2&quot;/&gt;&lt;wsp:rsid wsp:val=&quot;00DB16E0&quot;/&gt;&lt;wsp:rsid wsp:val=&quot;00DB2DF9&quot;/&gt;&lt;wsp:rsid wsp:val=&quot;00DB465D&quot;/&gt;&lt;wsp:rsid wsp:val=&quot;00DB48A2&quot;/&gt;&lt;wsp:rsid wsp:val=&quot;00DB7E63&quot;/&gt;&lt;wsp:rsid wsp:val=&quot;00DC2055&quot;/&gt;&lt;wsp:rsid wsp:val=&quot;00DC3908&quot;/&gt;&lt;wsp:rsid wsp:val=&quot;00DD71E8&quot;/&gt;&lt;wsp:rsid wsp:val=&quot;00DD7F83&quot;/&gt;&lt;wsp:rsid wsp:val=&quot;00DE4EB8&quot;/&gt;&lt;wsp:rsid wsp:val=&quot;00E0641E&quot;/&gt;&lt;wsp:rsid wsp:val=&quot;00E06664&quot;/&gt;&lt;wsp:rsid wsp:val=&quot;00E304BC&quot;/&gt;&lt;wsp:rsid wsp:val=&quot;00E32853&quot;/&gt;&lt;wsp:rsid wsp:val=&quot;00E34EBD&quot;/&gt;&lt;wsp:rsid wsp:val=&quot;00E401F8&quot;/&gt;&lt;wsp:rsid wsp:val=&quot;00E46425&quot;/&gt;&lt;wsp:rsid wsp:val=&quot;00E469FC&quot;/&gt;&lt;wsp:rsid wsp:val=&quot;00E47D0E&quot;/&gt;&lt;wsp:rsid wsp:val=&quot;00E65018&quot;/&gt;&lt;wsp:rsid wsp:val=&quot;00E76CA1&quot;/&gt;&lt;wsp:rsid wsp:val=&quot;00E94339&quot;/&gt;&lt;wsp:rsid wsp:val=&quot;00E97563&quot;/&gt;&lt;wsp:rsid wsp:val=&quot;00EB0B63&quot;/&gt;&lt;wsp:rsid wsp:val=&quot;00EC265C&quot;/&gt;&lt;wsp:rsid wsp:val=&quot;00ED61CB&quot;/&gt;&lt;wsp:rsid wsp:val=&quot;00EE752A&quot;/&gt;&lt;wsp:rsid wsp:val=&quot;00F06A72&quot;/&gt;&lt;wsp:rsid wsp:val=&quot;00F136F0&quot;/&gt;&lt;wsp:rsid wsp:val=&quot;00F20BBB&quot;/&gt;&lt;wsp:rsid wsp:val=&quot;00F36048&quot;/&gt;&lt;wsp:rsid wsp:val=&quot;00F43BD8&quot;/&gt;&lt;wsp:rsid wsp:val=&quot;00F562F3&quot;/&gt;&lt;wsp:rsid wsp:val=&quot;00F74B89&quot;/&gt;&lt;wsp:rsid wsp:val=&quot;00F75133&quot;/&gt;&lt;wsp:rsid wsp:val=&quot;00F83272&quot;/&gt;&lt;wsp:rsid wsp:val=&quot;00F9358D&quot;/&gt;&lt;wsp:rsid wsp:val=&quot;00FA3899&quot;/&gt;&lt;wsp:rsid wsp:val=&quot;00FA4909&quot;/&gt;&lt;wsp:rsid wsp:val=&quot;00FA5164&quot;/&gt;&lt;wsp:rsid wsp:val=&quot;00FA6751&quot;/&gt;&lt;wsp:rsid wsp:val=&quot;00FA6BD7&quot;/&gt;&lt;wsp:rsid wsp:val=&quot;00FB1048&quot;/&gt;&lt;wsp:rsid wsp:val=&quot;00FB62C4&quot;/&gt;&lt;wsp:rsid wsp:val=&quot;00FB7701&quot;/&gt;&lt;wsp:rsid wsp:val=&quot;00FD1AC5&quot;/&gt;&lt;wsp:rsid wsp:val=&quot;00FD5CF0&quot;/&gt;&lt;/wsp:rsids&gt;&lt;/w:docPr&gt;&lt;w:body&gt;&lt;wx:sect&gt;&lt;w:p wsp:rsidR=&quot;00C41ED5&quot; wsp:rsidRPr=&quot;00C41ED5&quot; wsp:rsidRDefault=&quot;00C41ED5&quot; wsp:rsidP=&quot;00C41ED5&quot;&gt;&lt;m:oMathPara&gt;&lt;m:oMath&gt;&lt;m:r&gt;&lt;m:rPr&gt;&lt;m:sty m:val=&quot;p&quot;/&gt;&lt;/m:rPr&gt;&lt;w:rPr&gt;&lt;w:rFonts w:ascii=&quot;Cambria Math&quot; w:h-ansi=&quot;Cambria Math&quot;/&gt;&lt;wx:font wx:val=&quot;Cambria Math&quot;/&gt;&lt;/w:rPr&gt;&lt;m:t&gt;Î”&lt;/m:t&gt;&lt;/m:r&gt;&lt;m:sSub&gt;&lt;m:sSubPr&gt;&lt;m:ctrlPr&gt;&lt;w:rPr&gt;&lt;w:rFonts w:ascii=&quot;Cambria Math&quot; w:h-ansi=&quot;Cambria Math&quot;/&gt;&lt;wx:font wx:val=&quot;Cambria Math&quot;/&gt;&lt;w:i/&gt;&lt;/w:rPr&gt;&lt;/m:ctrlPr&gt;&lt;/m:sSubPr&gt;&lt;m:e&gt;&lt;m:r&gt;&lt;w:rPr&gt;&lt;w:rFonts w:ascii=&quot;Cambria Math&quot; w:h-ansi=&quot;Cambria Math&quot;/&gt;&lt;wx:font wx:val=&quot;Cambria Math&quot;/&gt;&lt;w:i/&gt;&lt;/w:rPr&gt;&lt;m:t&gt;V&lt;/m:t&gt;&lt;/m:r&gt;&lt;/m:e&gt;&lt;m:sub&gt;&lt;m:r&gt;&lt;w:rPr&gt;&lt;w:rFonts w:ascii=&quot;Cambria Math&quot; w:h-ansi=&quot;Cambria Math&quot;/&gt;&lt;wx:font wx:val=&quot;Cambria Math&quot;/&gt;&lt;w:i/&gt;&lt;/w:rPr&gt;&lt;m:t&gt;out&lt;/m:t&gt;&lt;/m:r&gt;&lt;/m:sub&gt;&lt;/m:sSub&gt;&lt;/m:oMath&gt;&lt;/m:oMathPara&gt;&lt;/w:p&gt;&lt;w:sectPr wsp:rsidR=&quot;00000000&quot; wsp:rsidRPr=&quot;00C41ED5&quot;&gt;&lt;w:pgSz w:w=&quot;12240&quot; w:h=&quot;15840&quot;/&gt;&lt;w:pgMar w:top=&quot;1440&quot; w:right=&quot;1440&quot; w:bottom=&quot;1440&quot; w:left=&quot;1440&quot; w:header=&quot;720&quot; w:footer=&quot;720&quot; w:gutter=&quot;0&quot;/&gt;&lt;w:cols w:space=&quot;720&quot;/&gt;&lt;/w:sectPr&gt;&lt;/wx:sect&gt;&lt;/w:body&gt;&lt;/w:wordDocument&gt;">
                   <v:imagedata r:id="rId21" o:title="" chromakey="white"/>
                 </v:shape>
               </w:pict>
@@ -1981,7 +1981,7 @@
         </w:tc>
         <w:tc>
           <w:tcPr>
-            <w:tcW w:w="850" w:type="dxa"/>
+            <w:tcW w:w="852" w:type="dxa"/>
             <w:shd w:val="clear" w:color="auto" w:fill="auto"/>
           </w:tcPr>
           <w:p>
@@ -1998,7 +1998,7 @@
                 <w:szCs w:val="18"/>
               </w:rPr>
               <w:pict w14:anchorId="0D7BE168">
-                <v:shape id="_x0000_i1444" type="#_x0000_t75" style="width:25.65pt;height:13.65pt" equationxml="&lt;?xml version=&quot;1.0&quot; encoding=&quot;UTF-8&quot; standalone=&quot;yes&quot;?&gt;&#10;&lt;?mso-application progid=&quot;Word.Document&quot;?&gt;&#10;&lt;w:wordDocument xmlns:aml=&quot;http://schemas.microsoft.com/aml/2001/core&quot; xmlns:wpc=&quot;http://schemas.microsoft.com/office/word/2010/wordprocessingCanvas&quot; xmlns:cx=&quot;http://schemas.microsoft.com/office/drawing/2014/chartex&quot; xmlns:cx1=&quot;http://schemas.microsoft.com/office/drawing/2015/9/8/chartex&quot; xmlns:cx2=&quot;http://schemas.microsoft.com/office/drawing/2015/10/21/chartex&quot; xmlns:cx3=&quot;http://schemas.microsoft.com/office/drawing/2016/5/9/chartex&quot; xmlns:cx4=&quot;http://schemas.microsoft.com/office/drawing/2016/5/10/chartex&quot; xmlns:cx5=&quot;http://schemas.microsoft.com/office/drawing/2016/5/11/chartex&quot; xmlns:cx6=&quot;http://schemas.microsoft.com/office/drawing/2016/5/12/chartex&quot; xmlns:cx7=&quot;http://schemas.microsoft.com/office/drawing/2016/5/13/chartex&quot; xmlns:cx8=&quot;http://schemas.microsoft.com/office/drawing/2016/5/14/chartex&quot; xmlns:cr=&quot;http://schemas.microsoft.com/office/comments/2020/reactions&quot; xmlns:dt=&quot;uuid:C2F41010-65B3-11d1-A29F-00AA00C14882&quot; xmlns:mc=&quot;http://schemas.openxmlformats.org/markup-compatibility/2006&quot; xmlns:aink=&quot;http://schemas.microsoft.com/office/drawing/2016/ink&quot; xmlns:am3d=&quot;http://schemas.microsoft.com/office/drawing/2017/model3d&quot; xmlns:o=&quot;urn:schemas-microsoft-com:office:office&quot; xmlns:oel=&quot;http://schemas.microsoft.com/office/2019/extlst&quot; xmlns:m=&quot;http://schemas.openxmlformats.org/officeDocument/2006/math&quot; xmlns:v=&quot;urn:schemas-microsoft-com:vml&quot; xmlns:w10=&quot;urn:schemas-microsoft-com:office:word&quot; xmlns:w=&quot;http://schemas.microsoft.com/office/word/2003/wordml&quot; xmlns:wx=&quot;http://schemas.microsoft.com/office/word/2003/auxHint&quot; xmlns:wne=&quot;http://schemas.microsoft.com/office/word/2006/wordml&quot; xmlns:wsp=&quot;http://schemas.microsoft.com/office/word/2003/wordml/sp2&quot; xmlns:sl=&quot;http://schemas.microsoft.com/schemaLibrary/2003/core&quot; w:macrosPresent=&quot;no&quot; w:embeddedObjPresent=&quot;no&quot; w:ocxPresent=&quot;no&quot; xml:space=&quot;preserve&quot;&gt;&lt;w:ignoreSubtree w:val=&quot;http://schemas.microsoft.com/office/word/2003/wordml/sp2&quot;/&gt;&lt;o:DocumentProperties&gt;&lt;o:Version&gt;16&lt;/o:Version&gt;&lt;/o:DocumentProperties&gt;&lt;w:docPr&gt;&lt;w:view w:val=&quot;print&quot;/&gt;&lt;w:zoom w:percent=&quot;100&quot;/&gt;&lt;w:doNotEmbedSystemFonts/&gt;&lt;w:activeWritingStyle w:lang=&quot;EN-AU&quot; w:vendorID=&quot;64&quot; w:dllVersion=&quot;6&quot; w:nlCheck=&quot;on&quot; w:optionSet=&quot;1&quot;/&gt;&lt;w:activeWritingStyle w:lang=&quot;EN-GB&quot; w:vendorID=&quot;64&quot; w:dllVersion=&quot;6&quot; w:nlCheck=&quot;on&quot; w:optionSet=&quot;1&quot;/&gt;&lt;w:activeWritingStyle w:lang=&quot;EN-US&quot; w:vendorID=&quot;64&quot; w:dllVersion=&quot;6&quot; w:nlCheck=&quot;on&quot; w:optionSet=&quot;1&quot;/&gt;&lt;w:activeWritingStyle w:lang=&quot;EN-AU&quot; w:vendorID=&quot;64&quot; w:dllVersion=&quot;0&quot; w:nlCheck=&quot;on&quot; w:optionSet=&quot;0&quot;/&gt;&lt;w:activeWritingStyle w:lang=&quot;EN-GB&quot; w:vendorID=&quot;64&quot; w:dllVersion=&quot;0&quot; w:nlCheck=&quot;on&quot; w:optionSet=&quot;0&quot;/&gt;&lt;w:activeWritingStyle w:lang=&quot;EN-US&quot; w:vendorID=&quot;64&quot; w:dllVersion=&quot;0&quot; w:nlCheck=&quot;on&quot; w:optionSet=&quot;0&quot;/&gt;&lt;w:activeWritingStyle w:lang=&quot;ES-AR&quot; w:vendorID=&quot;64&quot; w:dllVersion=&quot;0&quot; w:nlCheck=&quot;on&quot; w:optionSet=&quot;0&quot;/&gt;&lt;w:activeWritingStyle w:lang=&quot;580A&quot; w:vendorID=&quot;64&quot; w:dllVersion=&quot;0&quot; w:nlCheck=&quot;on&quot; w:optionSet=&quot;0&quot;/&gt;&lt;w:activeWritingStyle w:lang=&quot;PT-BR&quot; w:vendorID=&quot;64&quot; w:dllVersion=&quot;0&quot; w:nlCheck=&quot;on&quot; w:optionSet=&quot;0&quot;/&gt;&lt;w:stylePaneFormatFilter w:val=&quot;3F01&quot;/&gt;&lt;w:defaultTabStop w:val=&quot;720&quot;/&gt;&lt;w:hyphenationZone w:val=&quot;425&quot;/&gt;&lt;w:characterSpacingControl w:val=&quot;DontCompress&quot;/&gt;&lt;w:optimizeForBrowser/&gt;&lt;w:validateAgainstSchema/&gt;&lt;w:saveInvalidXML w:val=&quot;off&quot;/&gt;&lt;w:ignoreMixedContent w:val=&quot;off&quot;/&gt;&lt;w:alwaysShowPlaceholderText w:val=&quot;off&quot;/&gt;&lt;w:compat&gt;&lt;w:breakWrappedTables/&gt;&lt;w:snapToGridInCell/&gt;&lt;w:applyBreakingRules/&gt;&lt;w:wrapTextWithPunct/&gt;&lt;w:useAsianBreakRules/&gt;&lt;w:useWord2002TableStyleRules/&gt;&lt;w:useFELayout/&gt;&lt;/w:compat&gt;&lt;wsp:rsids&gt;&lt;wsp:rsidRoot wsp:val=&quot;00426FBB&quot;/&gt;&lt;wsp:rsid wsp:val=&quot;000002E1&quot;/&gt;&lt;wsp:rsid wsp:val=&quot;00003C97&quot;/&gt;&lt;wsp:rsid wsp:val=&quot;00005565&quot;/&gt;&lt;wsp:rsid wsp:val=&quot;0001754A&quot;/&gt;&lt;wsp:rsid wsp:val=&quot;00017719&quot;/&gt;&lt;wsp:rsid wsp:val=&quot;00027F1D&quot;/&gt;&lt;wsp:rsid wsp:val=&quot;0003296C&quot;/&gt;&lt;wsp:rsid wsp:val=&quot;0003351F&quot;/&gt;&lt;wsp:rsid wsp:val=&quot;00044599&quot;/&gt;&lt;wsp:rsid wsp:val=&quot;000540E6&quot;/&gt;&lt;wsp:rsid wsp:val=&quot;00054421&quot;/&gt;&lt;wsp:rsid wsp:val=&quot;00062E46&quot;/&gt;&lt;wsp:rsid wsp:val=&quot;00074AC8&quot;/&gt;&lt;wsp:rsid wsp:val=&quot;00081408&quot;/&gt;&lt;wsp:rsid wsp:val=&quot;00081EBE&quot;/&gt;&lt;wsp:rsid wsp:val=&quot;00086EDC&quot;/&gt;&lt;wsp:rsid wsp:val=&quot;000B1236&quot;/&gt;&lt;wsp:rsid wsp:val=&quot;000B36A3&quot;/&gt;&lt;wsp:rsid wsp:val=&quot;000C013C&quot;/&gt;&lt;wsp:rsid wsp:val=&quot;000E3F84&quot;/&gt;&lt;wsp:rsid wsp:val=&quot;001056DF&quot;/&gt;&lt;wsp:rsid wsp:val=&quot;0010789C&quot;/&gt;&lt;wsp:rsid wsp:val=&quot;00114025&quot;/&gt;&lt;wsp:rsid wsp:val=&quot;001160D2&quot;/&gt;&lt;wsp:rsid wsp:val=&quot;00120636&quot;/&gt;&lt;wsp:rsid wsp:val=&quot;001348A5&quot;/&gt;&lt;wsp:rsid wsp:val=&quot;00151B8E&quot;/&gt;&lt;wsp:rsid wsp:val=&quot;00182170&quot;/&gt;&lt;wsp:rsid wsp:val=&quot;001928FB&quot;/&gt;&lt;wsp:rsid wsp:val=&quot;00192BC7&quot;/&gt;&lt;wsp:rsid wsp:val=&quot;00195BE6&quot;/&gt;&lt;wsp:rsid wsp:val=&quot;001A50EA&quot;/&gt;&lt;wsp:rsid wsp:val=&quot;001F16CD&quot;/&gt;&lt;wsp:rsid wsp:val=&quot;001F47D2&quot;/&gt;&lt;wsp:rsid wsp:val=&quot;002029C8&quot;/&gt;&lt;wsp:rsid wsp:val=&quot;0022285A&quot;/&gt;&lt;wsp:rsid wsp:val=&quot;00224C61&quot;/&gt;&lt;wsp:rsid wsp:val=&quot;00256ABC&quot;/&gt;&lt;wsp:rsid wsp:val=&quot;0027227B&quot;/&gt;&lt;wsp:rsid wsp:val=&quot;00273AC7&quot;/&gt;&lt;wsp:rsid wsp:val=&quot;00273D2C&quot;/&gt;&lt;wsp:rsid wsp:val=&quot;00285ECD&quot;/&gt;&lt;wsp:rsid wsp:val=&quot;00290E1B&quot;/&gt;&lt;wsp:rsid wsp:val=&quot;00291B17&quot;/&gt;&lt;wsp:rsid wsp:val=&quot;00291BB3&quot;/&gt;&lt;wsp:rsid wsp:val=&quot;002A6742&quot;/&gt;&lt;wsp:rsid wsp:val=&quot;002C1A7F&quot;/&gt;&lt;wsp:rsid wsp:val=&quot;002C4239&quot;/&gt;&lt;wsp:rsid wsp:val=&quot;002C559D&quot;/&gt;&lt;wsp:rsid wsp:val=&quot;002D16AE&quot;/&gt;&lt;wsp:rsid wsp:val=&quot;002D2D42&quot;/&gt;&lt;wsp:rsid wsp:val=&quot;002F72D0&quot;/&gt;&lt;wsp:rsid wsp:val=&quot;002F7A4F&quot;/&gt;&lt;wsp:rsid wsp:val=&quot;003003AB&quot;/&gt;&lt;wsp:rsid wsp:val=&quot;00302C35&quot;/&gt;&lt;wsp:rsid wsp:val=&quot;00311C49&quot;/&gt;&lt;wsp:rsid wsp:val=&quot;0032119E&quot;/&gt;&lt;wsp:rsid wsp:val=&quot;00321304&quot;/&gt;&lt;wsp:rsid wsp:val=&quot;00324FC2&quot;/&gt;&lt;wsp:rsid wsp:val=&quot;003312CA&quot;/&gt;&lt;wsp:rsid wsp:val=&quot;00331F84&quot;/&gt;&lt;wsp:rsid wsp:val=&quot;0037721F&quot;/&gt;&lt;wsp:rsid wsp:val=&quot;003950A4&quot;/&gt;&lt;wsp:rsid wsp:val=&quot;003A1E7E&quot;/&gt;&lt;wsp:rsid wsp:val=&quot;003E2FDC&quot;/&gt;&lt;wsp:rsid wsp:val=&quot;003E3577&quot;/&gt;&lt;wsp:rsid wsp:val=&quot;003F3A61&quot;/&gt;&lt;wsp:rsid wsp:val=&quot;00410A5D&quot;/&gt;&lt;wsp:rsid wsp:val=&quot;00414909&quot;/&gt;&lt;wsp:rsid wsp:val=&quot;00416537&quot;/&gt;&lt;wsp:rsid wsp:val=&quot;00425A6A&quot;/&gt;&lt;wsp:rsid wsp:val=&quot;00426FBB&quot;/&gt;&lt;wsp:rsid wsp:val=&quot;00454542&quot;/&gt;&lt;wsp:rsid wsp:val=&quot;0047429A&quot;/&gt;&lt;wsp:rsid wsp:val=&quot;0048374C&quot;/&gt;&lt;wsp:rsid wsp:val=&quot;0048771D&quot;/&gt;&lt;wsp:rsid wsp:val=&quot;004A6605&quot;/&gt;&lt;wsp:rsid wsp:val=&quot;004C45FA&quot;/&gt;&lt;wsp:rsid wsp:val=&quot;004D35A3&quot;/&gt;&lt;wsp:rsid wsp:val=&quot;004E1BD8&quot;/&gt;&lt;wsp:rsid wsp:val=&quot;004E452A&quot;/&gt;&lt;wsp:rsid wsp:val=&quot;004E78E3&quot;/&gt;&lt;wsp:rsid wsp:val=&quot;004F2BFE&quot;/&gt;&lt;wsp:rsid wsp:val=&quot;004F63D3&quot;/&gt;&lt;wsp:rsid wsp:val=&quot;004F7DCF&quot;/&gt;&lt;wsp:rsid wsp:val=&quot;005004BF&quot;/&gt;&lt;wsp:rsid wsp:val=&quot;00502E89&quot;/&gt;&lt;wsp:rsid wsp:val=&quot;00506CFE&quot;/&gt;&lt;wsp:rsid wsp:val=&quot;00510E95&quot;/&gt;&lt;wsp:rsid wsp:val=&quot;005225C3&quot;/&gt;&lt;wsp:rsid wsp:val=&quot;00527D56&quot;/&gt;&lt;wsp:rsid wsp:val=&quot;0053221F&quot;/&gt;&lt;wsp:rsid wsp:val=&quot;00536FAE&quot;/&gt;&lt;wsp:rsid wsp:val=&quot;00542C85&quot;/&gt;&lt;wsp:rsid wsp:val=&quot;00553510&quot;/&gt;&lt;wsp:rsid wsp:val=&quot;00554186&quot;/&gt;&lt;wsp:rsid wsp:val=&quot;00585769&quot;/&gt;&lt;wsp:rsid wsp:val=&quot;00585C61&quot;/&gt;&lt;wsp:rsid wsp:val=&quot;00591130&quot;/&gt;&lt;wsp:rsid wsp:val=&quot;005A3F28&quot;/&gt;&lt;wsp:rsid wsp:val=&quot;005A40BE&quot;/&gt;&lt;wsp:rsid wsp:val=&quot;005B13E2&quot;/&gt;&lt;wsp:rsid wsp:val=&quot;005B47D7&quot;/&gt;&lt;wsp:rsid wsp:val=&quot;005C5526&quot;/&gt;&lt;wsp:rsid wsp:val=&quot;005C62C6&quot;/&gt;&lt;wsp:rsid wsp:val=&quot;005D7B9E&quot;/&gt;&lt;wsp:rsid wsp:val=&quot;005E112E&quot;/&gt;&lt;wsp:rsid wsp:val=&quot;005F0834&quot;/&gt;&lt;wsp:rsid wsp:val=&quot;005F68AB&quot;/&gt;&lt;wsp:rsid wsp:val=&quot;005F6DC3&quot;/&gt;&lt;wsp:rsid wsp:val=&quot;00601A8E&quot;/&gt;&lt;wsp:rsid wsp:val=&quot;0062033E&quot;/&gt;&lt;wsp:rsid wsp:val=&quot;00624482&quot;/&gt;&lt;wsp:rsid wsp:val=&quot;0064799C&quot;/&gt;&lt;wsp:rsid wsp:val=&quot;00654156&quot;/&gt;&lt;wsp:rsid wsp:val=&quot;00656ADC&quot;/&gt;&lt;wsp:rsid wsp:val=&quot;006B47CA&quot;/&gt;&lt;wsp:rsid wsp:val=&quot;006C304C&quot;/&gt;&lt;wsp:rsid wsp:val=&quot;006C4511&quot;/&gt;&lt;wsp:rsid wsp:val=&quot;006C65F5&quot;/&gt;&lt;wsp:rsid wsp:val=&quot;006C7AAA&quot;/&gt;&lt;wsp:rsid wsp:val=&quot;006D1C2A&quot;/&gt;&lt;wsp:rsid wsp:val=&quot;006D264F&quot;/&gt;&lt;wsp:rsid wsp:val=&quot;006D4E89&quot;/&gt;&lt;wsp:rsid wsp:val=&quot;006E2A8D&quot;/&gt;&lt;wsp:rsid wsp:val=&quot;006E7574&quot;/&gt;&lt;wsp:rsid wsp:val=&quot;00703430&quot;/&gt;&lt;wsp:rsid wsp:val=&quot;00703548&quot;/&gt;&lt;wsp:rsid wsp:val=&quot;00704E18&quot;/&gt;&lt;wsp:rsid wsp:val=&quot;007069BE&quot;/&gt;&lt;wsp:rsid wsp:val=&quot;00745C86&quot;/&gt;&lt;wsp:rsid wsp:val=&quot;00764603&quot;/&gt;&lt;wsp:rsid wsp:val=&quot;0076604D&quot;/&gt;&lt;wsp:rsid wsp:val=&quot;00790909&quot;/&gt;&lt;wsp:rsid wsp:val=&quot;007B1582&quot;/&gt;&lt;wsp:rsid wsp:val=&quot;007B5A07&quot;/&gt;&lt;wsp:rsid wsp:val=&quot;007C065D&quot;/&gt;&lt;wsp:rsid wsp:val=&quot;007D3E71&quot;/&gt;&lt;wsp:rsid wsp:val=&quot;007E5D6A&quot;/&gt;&lt;wsp:rsid wsp:val=&quot;007E645D&quot;/&gt;&lt;wsp:rsid wsp:val=&quot;007F75CA&quot;/&gt;&lt;wsp:rsid wsp:val=&quot;00821E08&quot;/&gt;&lt;wsp:rsid wsp:val=&quot;00834EFD&quot;/&gt;&lt;wsp:rsid wsp:val=&quot;00844B24&quot;/&gt;&lt;wsp:rsid wsp:val=&quot;0084515F&quot;/&gt;&lt;wsp:rsid wsp:val=&quot;0085092D&quot;/&gt;&lt;wsp:rsid wsp:val=&quot;00865414&quot;/&gt;&lt;wsp:rsid wsp:val=&quot;00877D4C&quot;/&gt;&lt;wsp:rsid wsp:val=&quot;00883903&quot;/&gt;&lt;wsp:rsid wsp:val=&quot;0089763B&quot;/&gt;&lt;wsp:rsid wsp:val=&quot;008B6AE3&quot;/&gt;&lt;wsp:rsid wsp:val=&quot;008C1332&quot;/&gt;&lt;wsp:rsid wsp:val=&quot;008D1045&quot;/&gt;&lt;wsp:rsid wsp:val=&quot;008E5996&quot;/&gt;&lt;wsp:rsid wsp:val=&quot;00901AE1&quot;/&gt;&lt;wsp:rsid wsp:val=&quot;00912F93&quot;/&gt;&lt;wsp:rsid wsp:val=&quot;009205B4&quot;/&gt;&lt;wsp:rsid wsp:val=&quot;00955B59&quot;/&gt;&lt;wsp:rsid wsp:val=&quot;00992262&quot;/&gt;&lt;wsp:rsid wsp:val=&quot;009926BC&quot;/&gt;&lt;wsp:rsid wsp:val=&quot;009A4319&quot;/&gt;&lt;wsp:rsid wsp:val=&quot;009A6C3F&quot;/&gt;&lt;wsp:rsid wsp:val=&quot;009B73F2&quot;/&gt;&lt;wsp:rsid wsp:val=&quot;009C12BD&quot;/&gt;&lt;wsp:rsid wsp:val=&quot;009C50FE&quot;/&gt;&lt;wsp:rsid wsp:val=&quot;009E49DD&quot;/&gt;&lt;wsp:rsid wsp:val=&quot;00A03E75&quot;/&gt;&lt;wsp:rsid wsp:val=&quot;00A20627&quot;/&gt;&lt;wsp:rsid wsp:val=&quot;00A22FE9&quot;/&gt;&lt;wsp:rsid wsp:val=&quot;00A31A44&quot;/&gt;&lt;wsp:rsid wsp:val=&quot;00A32BFA&quot;/&gt;&lt;wsp:rsid wsp:val=&quot;00A3325E&quot;/&gt;&lt;wsp:rsid wsp:val=&quot;00A45FCE&quot;/&gt;&lt;wsp:rsid wsp:val=&quot;00A75671&quot;/&gt;&lt;wsp:rsid wsp:val=&quot;00A773CC&quot;/&gt;&lt;wsp:rsid wsp:val=&quot;00A924D0&quot;/&gt;&lt;wsp:rsid wsp:val=&quot;00A9318B&quot;/&gt;&lt;wsp:rsid wsp:val=&quot;00A94AC1&quot;/&gt;&lt;wsp:rsid wsp:val=&quot;00AB18B7&quot;/&gt;&lt;wsp:rsid wsp:val=&quot;00AD335D&quot;/&gt;&lt;wsp:rsid wsp:val=&quot;00AF114C&quot;/&gt;&lt;wsp:rsid wsp:val=&quot;00AF792B&quot;/&gt;&lt;wsp:rsid wsp:val=&quot;00B33D2F&quot;/&gt;&lt;wsp:rsid wsp:val=&quot;00B40A5B&quot;/&gt;&lt;wsp:rsid wsp:val=&quot;00B45C6B&quot;/&gt;&lt;wsp:rsid wsp:val=&quot;00B55D5E&quot;/&gt;&lt;wsp:rsid wsp:val=&quot;00B57A80&quot;/&gt;&lt;wsp:rsid wsp:val=&quot;00B70E9C&quot;/&gt;&lt;wsp:rsid wsp:val=&quot;00B713D8&quot;/&gt;&lt;wsp:rsid wsp:val=&quot;00B72979&quot;/&gt;&lt;wsp:rsid wsp:val=&quot;00B94516&quot;/&gt;&lt;wsp:rsid wsp:val=&quot;00BA25E2&quot;/&gt;&lt;wsp:rsid wsp:val=&quot;00BB2855&quot;/&gt;&lt;wsp:rsid wsp:val=&quot;00BC5343&quot;/&gt;&lt;wsp:rsid wsp:val=&quot;00BD19C1&quot;/&gt;&lt;wsp:rsid wsp:val=&quot;00BD25B8&quot;/&gt;&lt;wsp:rsid wsp:val=&quot;00C012E1&quot;/&gt;&lt;wsp:rsid wsp:val=&quot;00C06BB4&quot;/&gt;&lt;wsp:rsid wsp:val=&quot;00C10D20&quot;/&gt;&lt;wsp:rsid wsp:val=&quot;00C12E0C&quot;/&gt;&lt;wsp:rsid wsp:val=&quot;00C21916&quot;/&gt;&lt;wsp:rsid wsp:val=&quot;00C34915&quot;/&gt;&lt;wsp:rsid wsp:val=&quot;00C457CA&quot;/&gt;&lt;wsp:rsid wsp:val=&quot;00C53FB6&quot;/&gt;&lt;wsp:rsid wsp:val=&quot;00C57FB7&quot;/&gt;&lt;wsp:rsid wsp:val=&quot;00C644D4&quot;/&gt;&lt;wsp:rsid wsp:val=&quot;00C65F3F&quot;/&gt;&lt;wsp:rsid wsp:val=&quot;00C72414&quot;/&gt;&lt;wsp:rsid wsp:val=&quot;00C72B1A&quot;/&gt;&lt;wsp:rsid wsp:val=&quot;00C8667B&quot;/&gt;&lt;wsp:rsid wsp:val=&quot;00C90993&quot;/&gt;&lt;wsp:rsid wsp:val=&quot;00CA4CE3&quot;/&gt;&lt;wsp:rsid wsp:val=&quot;00CC72FD&quot;/&gt;&lt;wsp:rsid wsp:val=&quot;00CD4F3F&quot;/&gt;&lt;wsp:rsid wsp:val=&quot;00D311F8&quot;/&gt;&lt;wsp:rsid wsp:val=&quot;00D31660&quot;/&gt;&lt;wsp:rsid wsp:val=&quot;00D36B52&quot;/&gt;&lt;wsp:rsid wsp:val=&quot;00D377C8&quot;/&gt;&lt;wsp:rsid wsp:val=&quot;00D41274&quot;/&gt;&lt;wsp:rsid wsp:val=&quot;00D4229C&quot;/&gt;&lt;wsp:rsid wsp:val=&quot;00D43BF3&quot;/&gt;&lt;wsp:rsid wsp:val=&quot;00D549FB&quot;/&gt;&lt;wsp:rsid wsp:val=&quot;00D767BB&quot;/&gt;&lt;wsp:rsid wsp:val=&quot;00D939B0&quot;/&gt;&lt;wsp:rsid wsp:val=&quot;00DA31A2&quot;/&gt;&lt;wsp:rsid wsp:val=&quot;00DB16E0&quot;/&gt;&lt;wsp:rsid wsp:val=&quot;00DB2DF9&quot;/&gt;&lt;wsp:rsid wsp:val=&quot;00DB465D&quot;/&gt;&lt;wsp:rsid wsp:val=&quot;00DB48A2&quot;/&gt;&lt;wsp:rsid wsp:val=&quot;00DB7E63&quot;/&gt;&lt;wsp:rsid wsp:val=&quot;00DC2055&quot;/&gt;&lt;wsp:rsid wsp:val=&quot;00DC3908&quot;/&gt;&lt;wsp:rsid wsp:val=&quot;00DD71E8&quot;/&gt;&lt;wsp:rsid wsp:val=&quot;00DD7F83&quot;/&gt;&lt;wsp:rsid wsp:val=&quot;00DE4EB8&quot;/&gt;&lt;wsp:rsid wsp:val=&quot;00E0641E&quot;/&gt;&lt;wsp:rsid wsp:val=&quot;00E06664&quot;/&gt;&lt;wsp:rsid wsp:val=&quot;00E304BC&quot;/&gt;&lt;wsp:rsid wsp:val=&quot;00E32853&quot;/&gt;&lt;wsp:rsid wsp:val=&quot;00E34EBD&quot;/&gt;&lt;wsp:rsid wsp:val=&quot;00E401F8&quot;/&gt;&lt;wsp:rsid wsp:val=&quot;00E46425&quot;/&gt;&lt;wsp:rsid wsp:val=&quot;00E469FC&quot;/&gt;&lt;wsp:rsid wsp:val=&quot;00E47D0E&quot;/&gt;&lt;wsp:rsid wsp:val=&quot;00E65018&quot;/&gt;&lt;wsp:rsid wsp:val=&quot;00E76CA1&quot;/&gt;&lt;wsp:rsid wsp:val=&quot;00E94339&quot;/&gt;&lt;wsp:rsid wsp:val=&quot;00E97563&quot;/&gt;&lt;wsp:rsid wsp:val=&quot;00EB0B63&quot;/&gt;&lt;wsp:rsid wsp:val=&quot;00EC265C&quot;/&gt;&lt;wsp:rsid wsp:val=&quot;00ED61CB&quot;/&gt;&lt;wsp:rsid wsp:val=&quot;00EE752A&quot;/&gt;&lt;wsp:rsid wsp:val=&quot;00F06A72&quot;/&gt;&lt;wsp:rsid wsp:val=&quot;00F136F0&quot;/&gt;&lt;wsp:rsid wsp:val=&quot;00F20BBB&quot;/&gt;&lt;wsp:rsid wsp:val=&quot;00F36048&quot;/&gt;&lt;wsp:rsid wsp:val=&quot;00F43BD8&quot;/&gt;&lt;wsp:rsid wsp:val=&quot;00F562F3&quot;/&gt;&lt;wsp:rsid wsp:val=&quot;00F74B89&quot;/&gt;&lt;wsp:rsid wsp:val=&quot;00F75133&quot;/&gt;&lt;wsp:rsid wsp:val=&quot;00F83272&quot;/&gt;&lt;wsp:rsid wsp:val=&quot;00F9358D&quot;/&gt;&lt;wsp:rsid wsp:val=&quot;00FA3899&quot;/&gt;&lt;wsp:rsid wsp:val=&quot;00FA4909&quot;/&gt;&lt;wsp:rsid wsp:val=&quot;00FA5164&quot;/&gt;&lt;wsp:rsid wsp:val=&quot;00FA6751&quot;/&gt;&lt;wsp:rsid wsp:val=&quot;00FA6BD7&quot;/&gt;&lt;wsp:rsid wsp:val=&quot;00FA720C&quot;/&gt;&lt;wsp:rsid wsp:val=&quot;00FB1048&quot;/&gt;&lt;wsp:rsid wsp:val=&quot;00FB62C4&quot;/&gt;&lt;wsp:rsid wsp:val=&quot;00FB7701&quot;/&gt;&lt;wsp:rsid wsp:val=&quot;00FD1AC5&quot;/&gt;&lt;wsp:rsid wsp:val=&quot;00FD5CF0&quot;/&gt;&lt;/wsp:rsids&gt;&lt;/w:docPr&gt;&lt;w:body&gt;&lt;wx:sect&gt;&lt;w:p wsp:rsidR=&quot;00FA720C&quot; wsp:rsidRPr=&quot;00FA720C&quot; wsp:rsidRDefault=&quot;00FA720C&quot; wsp:rsidP=&quot;00FA720C&quot;&gt;&lt;m:oMathPara&gt;&lt;m:oMath&gt;&lt;m:r&gt;&lt;w:rPr&gt;&lt;w:rFonts w:ascii=&quot;Cambria Math&quot; w:h-ansi=&quot;Cambria Math&quot;/&gt;&lt;wx:font wx:val=&quot;Cambria Math&quot;/&gt;&lt;w:i/&gt;&lt;/w:rPr&gt;&lt;m:t&gt;â‰¤25&lt;/m:t&gt;&lt;/m:r&gt;&lt;/m:oMath&gt;&lt;/m:oMathPara&gt;&lt;/w:p&gt;&lt;w:sectPr wsp:rsidR=&quot;00000000&quot; wsp:rsidRPr=&quot;00FA720C&quot;&gt;&lt;w:pgSz w:w=&quot;12240&quot; w:h=&quot;15840&quot;/&gt;&lt;w:pgMar w:top=&quot;1440&quot; w:right=&quot;1440&quot; w:bottom=&quot;1440&quot; w:left=&quot;1440&quot; w:header=&quot;720&quot; w:footer=&quot;720&quot; w:gutter=&quot;0&quot;/&gt;&lt;w:cols w:space=&quot;720&quot;/&gt;&lt;/w:sectPr&gt;&lt;/wx:sect&gt;&lt;/w:body&gt;&lt;/w:wordDocument&gt;">
+                <v:shape id="_x0000_i1047" type="#_x0000_t75" style="width:25.6pt;height:13.85pt" equationxml="&lt;?xml version=&quot;1.0&quot; encoding=&quot;UTF-8&quot; standalone=&quot;yes&quot;?&gt;&#10;&lt;?mso-application progid=&quot;Word.Document&quot;?&gt;&#10;&lt;w:wordDocument xmlns:aml=&quot;http://schemas.microsoft.com/aml/2001/core&quot; xmlns:wpc=&quot;http://schemas.microsoft.com/office/word/2010/wordprocessingCanvas&quot; xmlns:cx=&quot;http://schemas.microsoft.com/office/drawing/2014/chartex&quot; xmlns:cx1=&quot;http://schemas.microsoft.com/office/drawing/2015/9/8/chartex&quot; xmlns:cx2=&quot;http://schemas.microsoft.com/office/drawing/2015/10/21/chartex&quot; xmlns:cx3=&quot;http://schemas.microsoft.com/office/drawing/2016/5/9/chartex&quot; xmlns:cx4=&quot;http://schemas.microsoft.com/office/drawing/2016/5/10/chartex&quot; xmlns:cx5=&quot;http://schemas.microsoft.com/office/drawing/2016/5/11/chartex&quot; xmlns:cx6=&quot;http://schemas.microsoft.com/office/drawing/2016/5/12/chartex&quot; xmlns:cx7=&quot;http://schemas.microsoft.com/office/drawing/2016/5/13/chartex&quot; xmlns:cx8=&quot;http://schemas.microsoft.com/office/drawing/2016/5/14/chartex&quot; xmlns:cr=&quot;http://schemas.microsoft.com/office/comments/2020/reactions&quot; xmlns:dt=&quot;uuid:C2F41010-65B3-11d1-A29F-00AA00C14882&quot; xmlns:mc=&quot;http://schemas.openxmlformats.org/markup-compatibility/2006&quot; xmlns:aink=&quot;http://schemas.microsoft.com/office/drawing/2016/ink&quot; xmlns:am3d=&quot;http://schemas.microsoft.com/office/drawing/2017/model3d&quot; xmlns:o=&quot;urn:schemas-microsoft-com:office:office&quot; xmlns:oel=&quot;http://schemas.microsoft.com/office/2019/extlst&quot; xmlns:m=&quot;http://schemas.openxmlformats.org/officeDocument/2006/math&quot; xmlns:v=&quot;urn:schemas-microsoft-com:vml&quot; xmlns:w10=&quot;urn:schemas-microsoft-com:office:word&quot; xmlns:w=&quot;http://schemas.microsoft.com/office/word/2003/wordml&quot; xmlns:wx=&quot;http://schemas.microsoft.com/office/word/2003/auxHint&quot; xmlns:wne=&quot;http://schemas.microsoft.com/office/word/2006/wordml&quot; xmlns:wsp=&quot;http://schemas.microsoft.com/office/word/2003/wordml/sp2&quot; xmlns:sl=&quot;http://schemas.microsoft.com/schemaLibrary/2003/core&quot; w:macrosPresent=&quot;no&quot; w:embeddedObjPresent=&quot;no&quot; w:ocxPresent=&quot;no&quot; xml:space=&quot;preserve&quot;&gt;&lt;w:ignoreSubtree w:val=&quot;http://schemas.microsoft.com/office/word/2003/wordml/sp2&quot;/&gt;&lt;o:DocumentProperties&gt;&lt;o:Version&gt;16&lt;/o:Version&gt;&lt;/o:DocumentProperties&gt;&lt;w:docPr&gt;&lt;w:view w:val=&quot;print&quot;/&gt;&lt;w:zoom w:percent=&quot;100&quot;/&gt;&lt;w:doNotEmbedSystemFonts/&gt;&lt;w:activeWritingStyle w:lang=&quot;EN-AU&quot; w:vendorID=&quot;64&quot; w:dllVersion=&quot;6&quot; w:nlCheck=&quot;on&quot; w:optionSet=&quot;1&quot;/&gt;&lt;w:activeWritingStyle w:lang=&quot;EN-GB&quot; w:vendorID=&quot;64&quot; w:dllVersion=&quot;6&quot; w:nlCheck=&quot;on&quot; w:optionSet=&quot;1&quot;/&gt;&lt;w:activeWritingStyle w:lang=&quot;EN-US&quot; w:vendorID=&quot;64&quot; w:dllVersion=&quot;6&quot; w:nlCheck=&quot;on&quot; w:optionSet=&quot;1&quot;/&gt;&lt;w:activeWritingStyle w:lang=&quot;EN-AU&quot; w:vendorID=&quot;64&quot; w:dllVersion=&quot;0&quot; w:nlCheck=&quot;on&quot; w:optionSet=&quot;0&quot;/&gt;&lt;w:activeWritingStyle w:lang=&quot;EN-GB&quot; w:vendorID=&quot;64&quot; w:dllVersion=&quot;0&quot; w:nlCheck=&quot;on&quot; w:optionSet=&quot;0&quot;/&gt;&lt;w:activeWritingStyle w:lang=&quot;EN-US&quot; w:vendorID=&quot;64&quot; w:dllVersion=&quot;0&quot; w:nlCheck=&quot;on&quot; w:optionSet=&quot;0&quot;/&gt;&lt;w:activeWritingStyle w:lang=&quot;ES-AR&quot; w:vendorID=&quot;64&quot; w:dllVersion=&quot;0&quot; w:nlCheck=&quot;on&quot; w:optionSet=&quot;0&quot;/&gt;&lt;w:activeWritingStyle w:lang=&quot;580A&quot; w:vendorID=&quot;64&quot; w:dllVersion=&quot;0&quot; w:nlCheck=&quot;on&quot; w:optionSet=&quot;0&quot;/&gt;&lt;w:activeWritingStyle w:lang=&quot;PT-BR&quot; w:vendorID=&quot;64&quot; w:dllVersion=&quot;0&quot; w:nlCheck=&quot;on&quot; w:optionSet=&quot;0&quot;/&gt;&lt;w:stylePaneFormatFilter w:val=&quot;3F01&quot;/&gt;&lt;w:defaultTabStop w:val=&quot;720&quot;/&gt;&lt;w:hyphenationZone w:val=&quot;425&quot;/&gt;&lt;w:characterSpacingControl w:val=&quot;DontCompress&quot;/&gt;&lt;w:optimizeForBrowser/&gt;&lt;w:validateAgainstSchema/&gt;&lt;w:saveInvalidXML w:val=&quot;off&quot;/&gt;&lt;w:ignoreMixedContent w:val=&quot;off&quot;/&gt;&lt;w:alwaysShowPlaceholderText w:val=&quot;off&quot;/&gt;&lt;w:compat&gt;&lt;w:breakWrappedTables/&gt;&lt;w:snapToGridInCell/&gt;&lt;w:applyBreakingRules/&gt;&lt;w:wrapTextWithPunct/&gt;&lt;w:useAsianBreakRules/&gt;&lt;w:useWord2002TableStyleRules/&gt;&lt;w:useFELayout/&gt;&lt;/w:compat&gt;&lt;wsp:rsids&gt;&lt;wsp:rsidRoot wsp:val=&quot;00426FBB&quot;/&gt;&lt;wsp:rsid wsp:val=&quot;000002E1&quot;/&gt;&lt;wsp:rsid wsp:val=&quot;00003C97&quot;/&gt;&lt;wsp:rsid wsp:val=&quot;00005565&quot;/&gt;&lt;wsp:rsid wsp:val=&quot;0001754A&quot;/&gt;&lt;wsp:rsid wsp:val=&quot;00017719&quot;/&gt;&lt;wsp:rsid wsp:val=&quot;00027F1D&quot;/&gt;&lt;wsp:rsid wsp:val=&quot;0003296C&quot;/&gt;&lt;wsp:rsid wsp:val=&quot;0003351F&quot;/&gt;&lt;wsp:rsid wsp:val=&quot;00044599&quot;/&gt;&lt;wsp:rsid wsp:val=&quot;000540E6&quot;/&gt;&lt;wsp:rsid wsp:val=&quot;00054421&quot;/&gt;&lt;wsp:rsid wsp:val=&quot;00062E46&quot;/&gt;&lt;wsp:rsid wsp:val=&quot;00074AC8&quot;/&gt;&lt;wsp:rsid wsp:val=&quot;00081408&quot;/&gt;&lt;wsp:rsid wsp:val=&quot;00081EBE&quot;/&gt;&lt;wsp:rsid wsp:val=&quot;00086EDC&quot;/&gt;&lt;wsp:rsid wsp:val=&quot;000B1236&quot;/&gt;&lt;wsp:rsid wsp:val=&quot;000B36A3&quot;/&gt;&lt;wsp:rsid wsp:val=&quot;000C013C&quot;/&gt;&lt;wsp:rsid wsp:val=&quot;000E3F84&quot;/&gt;&lt;wsp:rsid wsp:val=&quot;001056DF&quot;/&gt;&lt;wsp:rsid wsp:val=&quot;0010789C&quot;/&gt;&lt;wsp:rsid wsp:val=&quot;00114025&quot;/&gt;&lt;wsp:rsid wsp:val=&quot;001160D2&quot;/&gt;&lt;wsp:rsid wsp:val=&quot;00120636&quot;/&gt;&lt;wsp:rsid wsp:val=&quot;001348A5&quot;/&gt;&lt;wsp:rsid wsp:val=&quot;00151B8E&quot;/&gt;&lt;wsp:rsid wsp:val=&quot;00182170&quot;/&gt;&lt;wsp:rsid wsp:val=&quot;001928FB&quot;/&gt;&lt;wsp:rsid wsp:val=&quot;00192BC7&quot;/&gt;&lt;wsp:rsid wsp:val=&quot;00195BE6&quot;/&gt;&lt;wsp:rsid wsp:val=&quot;001A50EA&quot;/&gt;&lt;wsp:rsid wsp:val=&quot;001F16CD&quot;/&gt;&lt;wsp:rsid wsp:val=&quot;001F47D2&quot;/&gt;&lt;wsp:rsid wsp:val=&quot;002029C8&quot;/&gt;&lt;wsp:rsid wsp:val=&quot;0022285A&quot;/&gt;&lt;wsp:rsid wsp:val=&quot;00224C61&quot;/&gt;&lt;wsp:rsid wsp:val=&quot;00256ABC&quot;/&gt;&lt;wsp:rsid wsp:val=&quot;0027227B&quot;/&gt;&lt;wsp:rsid wsp:val=&quot;00273AC7&quot;/&gt;&lt;wsp:rsid wsp:val=&quot;00273D2C&quot;/&gt;&lt;wsp:rsid wsp:val=&quot;00285ECD&quot;/&gt;&lt;wsp:rsid wsp:val=&quot;00290E1B&quot;/&gt;&lt;wsp:rsid wsp:val=&quot;00291B17&quot;/&gt;&lt;wsp:rsid wsp:val=&quot;00291BB3&quot;/&gt;&lt;wsp:rsid wsp:val=&quot;002A6742&quot;/&gt;&lt;wsp:rsid wsp:val=&quot;002C1A7F&quot;/&gt;&lt;wsp:rsid wsp:val=&quot;002C4239&quot;/&gt;&lt;wsp:rsid wsp:val=&quot;002C559D&quot;/&gt;&lt;wsp:rsid wsp:val=&quot;002D16AE&quot;/&gt;&lt;wsp:rsid wsp:val=&quot;002D2D42&quot;/&gt;&lt;wsp:rsid wsp:val=&quot;002F72D0&quot;/&gt;&lt;wsp:rsid wsp:val=&quot;002F7A4F&quot;/&gt;&lt;wsp:rsid wsp:val=&quot;003003AB&quot;/&gt;&lt;wsp:rsid wsp:val=&quot;00302C35&quot;/&gt;&lt;wsp:rsid wsp:val=&quot;00311C49&quot;/&gt;&lt;wsp:rsid wsp:val=&quot;0032119E&quot;/&gt;&lt;wsp:rsid wsp:val=&quot;00321304&quot;/&gt;&lt;wsp:rsid wsp:val=&quot;00324FC2&quot;/&gt;&lt;wsp:rsid wsp:val=&quot;003312CA&quot;/&gt;&lt;wsp:rsid wsp:val=&quot;00331F84&quot;/&gt;&lt;wsp:rsid wsp:val=&quot;0037721F&quot;/&gt;&lt;wsp:rsid wsp:val=&quot;003950A4&quot;/&gt;&lt;wsp:rsid wsp:val=&quot;003A1E7E&quot;/&gt;&lt;wsp:rsid wsp:val=&quot;003E2FDC&quot;/&gt;&lt;wsp:rsid wsp:val=&quot;003E3577&quot;/&gt;&lt;wsp:rsid wsp:val=&quot;003F3A61&quot;/&gt;&lt;wsp:rsid wsp:val=&quot;00410A5D&quot;/&gt;&lt;wsp:rsid wsp:val=&quot;00414909&quot;/&gt;&lt;wsp:rsid wsp:val=&quot;00416537&quot;/&gt;&lt;wsp:rsid wsp:val=&quot;00425A6A&quot;/&gt;&lt;wsp:rsid wsp:val=&quot;00426FBB&quot;/&gt;&lt;wsp:rsid wsp:val=&quot;00454542&quot;/&gt;&lt;wsp:rsid wsp:val=&quot;0047429A&quot;/&gt;&lt;wsp:rsid wsp:val=&quot;0048374C&quot;/&gt;&lt;wsp:rsid wsp:val=&quot;0048771D&quot;/&gt;&lt;wsp:rsid wsp:val=&quot;004A6605&quot;/&gt;&lt;wsp:rsid wsp:val=&quot;004C45FA&quot;/&gt;&lt;wsp:rsid wsp:val=&quot;004D35A3&quot;/&gt;&lt;wsp:rsid wsp:val=&quot;004E1BD8&quot;/&gt;&lt;wsp:rsid wsp:val=&quot;004E452A&quot;/&gt;&lt;wsp:rsid wsp:val=&quot;004E78E3&quot;/&gt;&lt;wsp:rsid wsp:val=&quot;004F2BFE&quot;/&gt;&lt;wsp:rsid wsp:val=&quot;004F63D3&quot;/&gt;&lt;wsp:rsid wsp:val=&quot;004F7DCF&quot;/&gt;&lt;wsp:rsid wsp:val=&quot;005004BF&quot;/&gt;&lt;wsp:rsid wsp:val=&quot;00502E89&quot;/&gt;&lt;wsp:rsid wsp:val=&quot;00506CFE&quot;/&gt;&lt;wsp:rsid wsp:val=&quot;00510E95&quot;/&gt;&lt;wsp:rsid wsp:val=&quot;005225C3&quot;/&gt;&lt;wsp:rsid wsp:val=&quot;00527D56&quot;/&gt;&lt;wsp:rsid wsp:val=&quot;0053221F&quot;/&gt;&lt;wsp:rsid wsp:val=&quot;00536FAE&quot;/&gt;&lt;wsp:rsid wsp:val=&quot;00542C85&quot;/&gt;&lt;wsp:rsid wsp:val=&quot;00553510&quot;/&gt;&lt;wsp:rsid wsp:val=&quot;00554186&quot;/&gt;&lt;wsp:rsid wsp:val=&quot;00585769&quot;/&gt;&lt;wsp:rsid wsp:val=&quot;00585C61&quot;/&gt;&lt;wsp:rsid wsp:val=&quot;00591130&quot;/&gt;&lt;wsp:rsid wsp:val=&quot;005A3F28&quot;/&gt;&lt;wsp:rsid wsp:val=&quot;005A40BE&quot;/&gt;&lt;wsp:rsid wsp:val=&quot;005B13E2&quot;/&gt;&lt;wsp:rsid wsp:val=&quot;005B47D7&quot;/&gt;&lt;wsp:rsid wsp:val=&quot;005C5526&quot;/&gt;&lt;wsp:rsid wsp:val=&quot;005C62C6&quot;/&gt;&lt;wsp:rsid wsp:val=&quot;005D7B9E&quot;/&gt;&lt;wsp:rsid wsp:val=&quot;005E112E&quot;/&gt;&lt;wsp:rsid wsp:val=&quot;005F0834&quot;/&gt;&lt;wsp:rsid wsp:val=&quot;005F68AB&quot;/&gt;&lt;wsp:rsid wsp:val=&quot;005F6DC3&quot;/&gt;&lt;wsp:rsid wsp:val=&quot;00601A8E&quot;/&gt;&lt;wsp:rsid wsp:val=&quot;0062033E&quot;/&gt;&lt;wsp:rsid wsp:val=&quot;00624482&quot;/&gt;&lt;wsp:rsid wsp:val=&quot;0064799C&quot;/&gt;&lt;wsp:rsid wsp:val=&quot;00654156&quot;/&gt;&lt;wsp:rsid wsp:val=&quot;00656ADC&quot;/&gt;&lt;wsp:rsid wsp:val=&quot;006B47CA&quot;/&gt;&lt;wsp:rsid wsp:val=&quot;006C304C&quot;/&gt;&lt;wsp:rsid wsp:val=&quot;006C4511&quot;/&gt;&lt;wsp:rsid wsp:val=&quot;006C65F5&quot;/&gt;&lt;wsp:rsid wsp:val=&quot;006C7AAA&quot;/&gt;&lt;wsp:rsid wsp:val=&quot;006D1C2A&quot;/&gt;&lt;wsp:rsid wsp:val=&quot;006D264F&quot;/&gt;&lt;wsp:rsid wsp:val=&quot;006D4E89&quot;/&gt;&lt;wsp:rsid wsp:val=&quot;006E2A8D&quot;/&gt;&lt;wsp:rsid wsp:val=&quot;006E7574&quot;/&gt;&lt;wsp:rsid wsp:val=&quot;00703430&quot;/&gt;&lt;wsp:rsid wsp:val=&quot;00703548&quot;/&gt;&lt;wsp:rsid wsp:val=&quot;00704E18&quot;/&gt;&lt;wsp:rsid wsp:val=&quot;007069BE&quot;/&gt;&lt;wsp:rsid wsp:val=&quot;00745C86&quot;/&gt;&lt;wsp:rsid wsp:val=&quot;00764603&quot;/&gt;&lt;wsp:rsid wsp:val=&quot;0076604D&quot;/&gt;&lt;wsp:rsid wsp:val=&quot;00790909&quot;/&gt;&lt;wsp:rsid wsp:val=&quot;007B1582&quot;/&gt;&lt;wsp:rsid wsp:val=&quot;007B5A07&quot;/&gt;&lt;wsp:rsid wsp:val=&quot;007C065D&quot;/&gt;&lt;wsp:rsid wsp:val=&quot;007D3E71&quot;/&gt;&lt;wsp:rsid wsp:val=&quot;007E5D6A&quot;/&gt;&lt;wsp:rsid wsp:val=&quot;007E645D&quot;/&gt;&lt;wsp:rsid wsp:val=&quot;007F75CA&quot;/&gt;&lt;wsp:rsid wsp:val=&quot;00821E08&quot;/&gt;&lt;wsp:rsid wsp:val=&quot;00834EFD&quot;/&gt;&lt;wsp:rsid wsp:val=&quot;00844B24&quot;/&gt;&lt;wsp:rsid wsp:val=&quot;0084515F&quot;/&gt;&lt;wsp:rsid wsp:val=&quot;0085092D&quot;/&gt;&lt;wsp:rsid wsp:val=&quot;00865414&quot;/&gt;&lt;wsp:rsid wsp:val=&quot;00877D4C&quot;/&gt;&lt;wsp:rsid wsp:val=&quot;00883903&quot;/&gt;&lt;wsp:rsid wsp:val=&quot;0089763B&quot;/&gt;&lt;wsp:rsid wsp:val=&quot;008B6AE3&quot;/&gt;&lt;wsp:rsid wsp:val=&quot;008C1332&quot;/&gt;&lt;wsp:rsid wsp:val=&quot;008D1045&quot;/&gt;&lt;wsp:rsid wsp:val=&quot;008E5996&quot;/&gt;&lt;wsp:rsid wsp:val=&quot;00901AE1&quot;/&gt;&lt;wsp:rsid wsp:val=&quot;00912F93&quot;/&gt;&lt;wsp:rsid wsp:val=&quot;009205B4&quot;/&gt;&lt;wsp:rsid wsp:val=&quot;00955B59&quot;/&gt;&lt;wsp:rsid wsp:val=&quot;00992262&quot;/&gt;&lt;wsp:rsid wsp:val=&quot;009926BC&quot;/&gt;&lt;wsp:rsid wsp:val=&quot;009A4319&quot;/&gt;&lt;wsp:rsid wsp:val=&quot;009A6C3F&quot;/&gt;&lt;wsp:rsid wsp:val=&quot;009B73F2&quot;/&gt;&lt;wsp:rsid wsp:val=&quot;009C12BD&quot;/&gt;&lt;wsp:rsid wsp:val=&quot;009C50FE&quot;/&gt;&lt;wsp:rsid wsp:val=&quot;009E49DD&quot;/&gt;&lt;wsp:rsid wsp:val=&quot;00A03E75&quot;/&gt;&lt;wsp:rsid wsp:val=&quot;00A20627&quot;/&gt;&lt;wsp:rsid wsp:val=&quot;00A22FE9&quot;/&gt;&lt;wsp:rsid wsp:val=&quot;00A31A44&quot;/&gt;&lt;wsp:rsid wsp:val=&quot;00A32BFA&quot;/&gt;&lt;wsp:rsid wsp:val=&quot;00A3325E&quot;/&gt;&lt;wsp:rsid wsp:val=&quot;00A45FCE&quot;/&gt;&lt;wsp:rsid wsp:val=&quot;00A75671&quot;/&gt;&lt;wsp:rsid wsp:val=&quot;00A773CC&quot;/&gt;&lt;wsp:rsid wsp:val=&quot;00A924D0&quot;/&gt;&lt;wsp:rsid wsp:val=&quot;00A9318B&quot;/&gt;&lt;wsp:rsid wsp:val=&quot;00A94AC1&quot;/&gt;&lt;wsp:rsid wsp:val=&quot;00AB18B7&quot;/&gt;&lt;wsp:rsid wsp:val=&quot;00AD335D&quot;/&gt;&lt;wsp:rsid wsp:val=&quot;00AF114C&quot;/&gt;&lt;wsp:rsid wsp:val=&quot;00AF792B&quot;/&gt;&lt;wsp:rsid wsp:val=&quot;00B33D2F&quot;/&gt;&lt;wsp:rsid wsp:val=&quot;00B40A5B&quot;/&gt;&lt;wsp:rsid wsp:val=&quot;00B45C6B&quot;/&gt;&lt;wsp:rsid wsp:val=&quot;00B55D5E&quot;/&gt;&lt;wsp:rsid wsp:val=&quot;00B57A80&quot;/&gt;&lt;wsp:rsid wsp:val=&quot;00B70E9C&quot;/&gt;&lt;wsp:rsid wsp:val=&quot;00B713D8&quot;/&gt;&lt;wsp:rsid wsp:val=&quot;00B72979&quot;/&gt;&lt;wsp:rsid wsp:val=&quot;00B94516&quot;/&gt;&lt;wsp:rsid wsp:val=&quot;00BA25E2&quot;/&gt;&lt;wsp:rsid wsp:val=&quot;00BB2855&quot;/&gt;&lt;wsp:rsid wsp:val=&quot;00BC5343&quot;/&gt;&lt;wsp:rsid wsp:val=&quot;00BD19C1&quot;/&gt;&lt;wsp:rsid wsp:val=&quot;00BD25B8&quot;/&gt;&lt;wsp:rsid wsp:val=&quot;00C012E1&quot;/&gt;&lt;wsp:rsid wsp:val=&quot;00C06BB4&quot;/&gt;&lt;wsp:rsid wsp:val=&quot;00C10D20&quot;/&gt;&lt;wsp:rsid wsp:val=&quot;00C12E0C&quot;/&gt;&lt;wsp:rsid wsp:val=&quot;00C21916&quot;/&gt;&lt;wsp:rsid wsp:val=&quot;00C34915&quot;/&gt;&lt;wsp:rsid wsp:val=&quot;00C457CA&quot;/&gt;&lt;wsp:rsid wsp:val=&quot;00C53FB6&quot;/&gt;&lt;wsp:rsid wsp:val=&quot;00C57FB7&quot;/&gt;&lt;wsp:rsid wsp:val=&quot;00C644D4&quot;/&gt;&lt;wsp:rsid wsp:val=&quot;00C65F3F&quot;/&gt;&lt;wsp:rsid wsp:val=&quot;00C72414&quot;/&gt;&lt;wsp:rsid wsp:val=&quot;00C72B1A&quot;/&gt;&lt;wsp:rsid wsp:val=&quot;00C8667B&quot;/&gt;&lt;wsp:rsid wsp:val=&quot;00C90993&quot;/&gt;&lt;wsp:rsid wsp:val=&quot;00CA4CE3&quot;/&gt;&lt;wsp:rsid wsp:val=&quot;00CC72FD&quot;/&gt;&lt;wsp:rsid wsp:val=&quot;00CD4F3F&quot;/&gt;&lt;wsp:rsid wsp:val=&quot;00D311F8&quot;/&gt;&lt;wsp:rsid wsp:val=&quot;00D31660&quot;/&gt;&lt;wsp:rsid wsp:val=&quot;00D36B52&quot;/&gt;&lt;wsp:rsid wsp:val=&quot;00D377C8&quot;/&gt;&lt;wsp:rsid wsp:val=&quot;00D41274&quot;/&gt;&lt;wsp:rsid wsp:val=&quot;00D4229C&quot;/&gt;&lt;wsp:rsid wsp:val=&quot;00D43BF3&quot;/&gt;&lt;wsp:rsid wsp:val=&quot;00D549FB&quot;/&gt;&lt;wsp:rsid wsp:val=&quot;00D767BB&quot;/&gt;&lt;wsp:rsid wsp:val=&quot;00D939B0&quot;/&gt;&lt;wsp:rsid wsp:val=&quot;00DA31A2&quot;/&gt;&lt;wsp:rsid wsp:val=&quot;00DB16E0&quot;/&gt;&lt;wsp:rsid wsp:val=&quot;00DB2DF9&quot;/&gt;&lt;wsp:rsid wsp:val=&quot;00DB465D&quot;/&gt;&lt;wsp:rsid wsp:val=&quot;00DB48A2&quot;/&gt;&lt;wsp:rsid wsp:val=&quot;00DB7E63&quot;/&gt;&lt;wsp:rsid wsp:val=&quot;00DC2055&quot;/&gt;&lt;wsp:rsid wsp:val=&quot;00DC3908&quot;/&gt;&lt;wsp:rsid wsp:val=&quot;00DD71E8&quot;/&gt;&lt;wsp:rsid wsp:val=&quot;00DD7F83&quot;/&gt;&lt;wsp:rsid wsp:val=&quot;00DE4EB8&quot;/&gt;&lt;wsp:rsid wsp:val=&quot;00E0641E&quot;/&gt;&lt;wsp:rsid wsp:val=&quot;00E06664&quot;/&gt;&lt;wsp:rsid wsp:val=&quot;00E304BC&quot;/&gt;&lt;wsp:rsid wsp:val=&quot;00E32853&quot;/&gt;&lt;wsp:rsid wsp:val=&quot;00E34EBD&quot;/&gt;&lt;wsp:rsid wsp:val=&quot;00E401F8&quot;/&gt;&lt;wsp:rsid wsp:val=&quot;00E46425&quot;/&gt;&lt;wsp:rsid wsp:val=&quot;00E469FC&quot;/&gt;&lt;wsp:rsid wsp:val=&quot;00E47D0E&quot;/&gt;&lt;wsp:rsid wsp:val=&quot;00E65018&quot;/&gt;&lt;wsp:rsid wsp:val=&quot;00E76CA1&quot;/&gt;&lt;wsp:rsid wsp:val=&quot;00E94339&quot;/&gt;&lt;wsp:rsid wsp:val=&quot;00E97563&quot;/&gt;&lt;wsp:rsid wsp:val=&quot;00EB0B63&quot;/&gt;&lt;wsp:rsid wsp:val=&quot;00EC265C&quot;/&gt;&lt;wsp:rsid wsp:val=&quot;00ED61CB&quot;/&gt;&lt;wsp:rsid wsp:val=&quot;00EE752A&quot;/&gt;&lt;wsp:rsid wsp:val=&quot;00F06A72&quot;/&gt;&lt;wsp:rsid wsp:val=&quot;00F136F0&quot;/&gt;&lt;wsp:rsid wsp:val=&quot;00F20BBB&quot;/&gt;&lt;wsp:rsid wsp:val=&quot;00F36048&quot;/&gt;&lt;wsp:rsid wsp:val=&quot;00F43BD8&quot;/&gt;&lt;wsp:rsid wsp:val=&quot;00F562F3&quot;/&gt;&lt;wsp:rsid wsp:val=&quot;00F74B89&quot;/&gt;&lt;wsp:rsid wsp:val=&quot;00F75133&quot;/&gt;&lt;wsp:rsid wsp:val=&quot;00F83272&quot;/&gt;&lt;wsp:rsid wsp:val=&quot;00F9358D&quot;/&gt;&lt;wsp:rsid wsp:val=&quot;00FA3899&quot;/&gt;&lt;wsp:rsid wsp:val=&quot;00FA4909&quot;/&gt;&lt;wsp:rsid wsp:val=&quot;00FA5164&quot;/&gt;&lt;wsp:rsid wsp:val=&quot;00FA6751&quot;/&gt;&lt;wsp:rsid wsp:val=&quot;00FA6BD7&quot;/&gt;&lt;wsp:rsid wsp:val=&quot;00FA720C&quot;/&gt;&lt;wsp:rsid wsp:val=&quot;00FB1048&quot;/&gt;&lt;wsp:rsid wsp:val=&quot;00FB62C4&quot;/&gt;&lt;wsp:rsid wsp:val=&quot;00FB7701&quot;/&gt;&lt;wsp:rsid wsp:val=&quot;00FD1AC5&quot;/&gt;&lt;wsp:rsid wsp:val=&quot;00FD5CF0&quot;/&gt;&lt;/wsp:rsids&gt;&lt;/w:docPr&gt;&lt;w:body&gt;&lt;wx:sect&gt;&lt;w:p wsp:rsidR=&quot;00FA720C&quot; wsp:rsidRPr=&quot;00FA720C&quot; wsp:rsidRDefault=&quot;00FA720C&quot; wsp:rsidP=&quot;00FA720C&quot;&gt;&lt;m:oMathPara&gt;&lt;m:oMath&gt;&lt;m:r&gt;&lt;w:rPr&gt;&lt;w:rFonts w:ascii=&quot;Cambria Math&quot; w:h-ansi=&quot;Cambria Math&quot;/&gt;&lt;wx:font wx:val=&quot;Cambria Math&quot;/&gt;&lt;w:i/&gt;&lt;/w:rPr&gt;&lt;m:t&gt;â‰¤25&lt;/m:t&gt;&lt;/m:r&gt;&lt;/m:oMath&gt;&lt;/m:oMathPara&gt;&lt;/w:p&gt;&lt;w:sectPr wsp:rsidR=&quot;00000000&quot; wsp:rsidRPr=&quot;00FA720C&quot;&gt;&lt;w:pgSz w:w=&quot;12240&quot; w:h=&quot;15840&quot;/&gt;&lt;w:pgMar w:top=&quot;1440&quot; w:right=&quot;1440&quot; w:bottom=&quot;1440&quot; w:left=&quot;1440&quot; w:header=&quot;720&quot; w:footer=&quot;720&quot; w:gutter=&quot;0&quot;/&gt;&lt;w:cols w:space=&quot;720&quot;/&gt;&lt;/w:sectPr&gt;&lt;/wx:sect&gt;&lt;/w:body&gt;&lt;/w:wordDocument&gt;">
                   <v:imagedata r:id="rId22" o:title="" chromakey="white"/>
                 </v:shape>
               </w:pict>
@@ -2007,7 +2007,7 @@
         </w:tc>
         <w:tc>
           <w:tcPr>
-            <w:tcW w:w="898" w:type="dxa"/>
+            <w:tcW w:w="900" w:type="dxa"/>
             <w:shd w:val="clear" w:color="auto" w:fill="auto"/>
           </w:tcPr>
           <w:p>
@@ -2063,19 +2063,19 @@
         <w:tblLook w:val="04A0" w:firstRow="1" w:lastRow="0" w:firstColumn="1" w:lastColumn="0" w:noHBand="0" w:noVBand="1"/>
       </w:tblPr>
       <w:tblGrid>
-        <w:gridCol w:w="2336"/>
-        <w:gridCol w:w="976"/>
-        <w:gridCol w:w="942"/>
+        <w:gridCol w:w="2329"/>
+        <w:gridCol w:w="973"/>
+        <w:gridCol w:w="939"/>
         <w:gridCol w:w="787"/>
       </w:tblGrid>
       <w:tr>
         <w:trPr>
-          <w:trHeight w:val="199"/>
+          <w:trHeight w:val="192"/>
           <w:jc w:val="center"/>
         </w:trPr>
         <w:tc>
           <w:tcPr>
-            <w:tcW w:w="2336" w:type="dxa"/>
+            <w:tcW w:w="2329" w:type="dxa"/>
             <w:shd w:val="clear" w:color="auto" w:fill="8FBC8F"/>
           </w:tcPr>
           <w:p>
@@ -2103,7 +2103,7 @@
         </w:tc>
         <w:tc>
           <w:tcPr>
-            <w:tcW w:w="976" w:type="dxa"/>
+            <w:tcW w:w="973" w:type="dxa"/>
             <w:shd w:val="clear" w:color="auto" w:fill="8FBC8F"/>
           </w:tcPr>
           <w:p>
@@ -2131,7 +2131,7 @@
         </w:tc>
         <w:tc>
           <w:tcPr>
-            <w:tcW w:w="942" w:type="dxa"/>
+            <w:tcW w:w="939" w:type="dxa"/>
             <w:shd w:val="clear" w:color="auto" w:fill="8FBC8F"/>
           </w:tcPr>
           <w:p>
@@ -2159,7 +2159,7 @@
         </w:tc>
         <w:tc>
           <w:tcPr>
-            <w:tcW w:w="774" w:type="dxa"/>
+            <w:tcW w:w="784" w:type="dxa"/>
             <w:shd w:val="clear" w:color="auto" w:fill="8FBC8F"/>
           </w:tcPr>
           <w:p>
@@ -2188,12 +2188,12 @@
       </w:tr>
       <w:tr>
         <w:trPr>
-          <w:trHeight w:val="269"/>
+          <w:trHeight w:val="260"/>
           <w:jc w:val="center"/>
         </w:trPr>
         <w:tc>
           <w:tcPr>
-            <w:tcW w:w="2336" w:type="dxa"/>
+            <w:tcW w:w="2329" w:type="dxa"/>
             <w:shd w:val="clear" w:color="auto" w:fill="auto"/>
           </w:tcPr>
           <w:p>
@@ -2214,7 +2214,7 @@
         </w:tc>
         <w:tc>
           <w:tcPr>
-            <w:tcW w:w="976" w:type="dxa"/>
+            <w:tcW w:w="973" w:type="dxa"/>
             <w:shd w:val="clear" w:color="auto" w:fill="auto"/>
           </w:tcPr>
           <w:p>
@@ -2231,7 +2231,7 @@
                 <w:szCs w:val="18"/>
               </w:rPr>
               <w:pict w14:anchorId="7E442C3E">
-                <v:shape id="_x0000_i1907" type="#_x0000_t75" style="width:15.25pt;height:13.65pt" equationxml="&lt;?xml version=&quot;1.0&quot; encoding=&quot;UTF-8&quot; standalone=&quot;yes&quot;?&gt;&#10;&lt;?mso-application progid=&quot;Word.Document&quot;?&gt;&#10;&lt;w:wordDocument xmlns:aml=&quot;http://schemas.microsoft.com/aml/2001/core&quot; xmlns:wpc=&quot;http://schemas.microsoft.com/office/word/2010/wordprocessingCanvas&quot; xmlns:cx=&quot;http://schemas.microsoft.com/office/drawing/2014/chartex&quot; xmlns:cx1=&quot;http://schemas.microsoft.com/office/drawing/2015/9/8/chartex&quot; xmlns:cx2=&quot;http://schemas.microsoft.com/office/drawing/2015/10/21/chartex&quot; xmlns:cx3=&quot;http://schemas.microsoft.com/office/drawing/2016/5/9/chartex&quot; xmlns:cx4=&quot;http://schemas.microsoft.com/office/drawing/2016/5/10/chartex&quot; xmlns:cx5=&quot;http://schemas.microsoft.com/office/drawing/2016/5/11/chartex&quot; xmlns:cx6=&quot;http://schemas.microsoft.com/office/drawing/2016/5/12/chartex&quot; xmlns:cx7=&quot;http://schemas.microsoft.com/office/drawing/2016/5/13/chartex&quot; xmlns:cx8=&quot;http://schemas.microsoft.com/office/drawing/2016/5/14/chartex&quot; xmlns:cr=&quot;http://schemas.microsoft.com/office/comments/2020/reactions&quot; xmlns:dt=&quot;uuid:C2F41010-65B3-11d1-A29F-00AA00C14882&quot; xmlns:mc=&quot;http://schemas.openxmlformats.org/markup-compatibility/2006&quot; xmlns:aink=&quot;http://schemas.microsoft.com/office/drawing/2016/ink&quot; xmlns:am3d=&quot;http://schemas.microsoft.com/office/drawing/2017/model3d&quot; xmlns:o=&quot;urn:schemas-microsoft-com:office:office&quot; xmlns:oel=&quot;http://schemas.microsoft.com/office/2019/extlst&quot; xmlns:m=&quot;http://schemas.openxmlformats.org/officeDocument/2006/math&quot; xmlns:v=&quot;urn:schemas-microsoft-com:vml&quot; xmlns:w10=&quot;urn:schemas-microsoft-com:office:word&quot; xmlns:w=&quot;http://schemas.microsoft.com/office/word/2003/wordml&quot; xmlns:wx=&quot;http://schemas.microsoft.com/office/word/2003/auxHint&quot; xmlns:wne=&quot;http://schemas.microsoft.com/office/word/2006/wordml&quot; xmlns:wsp=&quot;http://schemas.microsoft.com/office/word/2003/wordml/sp2&quot; xmlns:sl=&quot;http://schemas.microsoft.com/schemaLibrary/2003/core&quot; w:macrosPresent=&quot;no&quot; w:embeddedObjPresent=&quot;no&quot; w:ocxPresent=&quot;no&quot; xml:space=&quot;preserve&quot;&gt;&lt;w:ignoreSubtree w:val=&quot;http://schemas.microsoft.com/office/word/2003/wordml/sp2&quot;/&gt;&lt;o:DocumentProperties&gt;&lt;o:Version&gt;16&lt;/o:Version&gt;&lt;/o:DocumentProperties&gt;&lt;w:docPr&gt;&lt;w:view w:val=&quot;print&quot;/&gt;&lt;w:zoom w:percent=&quot;100&quot;/&gt;&lt;w:doNotEmbedSystemFonts/&gt;&lt;w:activeWritingStyle w:lang=&quot;EN-AU&quot; w:vendorID=&quot;64&quot; w:dllVersion=&quot;6&quot; w:nlCheck=&quot;on&quot; w:optionSet=&quot;1&quot;/&gt;&lt;w:activeWritingStyle w:lang=&quot;EN-GB&quot; w:vendorID=&quot;64&quot; w:dllVersion=&quot;6&quot; w:nlCheck=&quot;on&quot; w:optionSet=&quot;1&quot;/&gt;&lt;w:activeWritingStyle w:lang=&quot;EN-US&quot; w:vendorID=&quot;64&quot; w:dllVersion=&quot;6&quot; w:nlCheck=&quot;on&quot; w:optionSet=&quot;1&quot;/&gt;&lt;w:activeWritingStyle w:lang=&quot;EN-AU&quot; w:vendorID=&quot;64&quot; w:dllVersion=&quot;0&quot; w:nlCheck=&quot;on&quot; w:optionSet=&quot;0&quot;/&gt;&lt;w:activeWritingStyle w:lang=&quot;EN-GB&quot; w:vendorID=&quot;64&quot; w:dllVersion=&quot;0&quot; w:nlCheck=&quot;on&quot; w:optionSet=&quot;0&quot;/&gt;&lt;w:activeWritingStyle w:lang=&quot;EN-US&quot; w:vendorID=&quot;64&quot; w:dllVersion=&quot;0&quot; w:nlCheck=&quot;on&quot; w:optionSet=&quot;0&quot;/&gt;&lt;w:activeWritingStyle w:lang=&quot;ES-AR&quot; w:vendorID=&quot;64&quot; w:dllVersion=&quot;0&quot; w:nlCheck=&quot;on&quot; w:optionSet=&quot;0&quot;/&gt;&lt;w:activeWritingStyle w:lang=&quot;580A&quot; w:vendorID=&quot;64&quot; w:dllVersion=&quot;0&quot; w:nlCheck=&quot;on&quot; w:optionSet=&quot;0&quot;/&gt;&lt;w:activeWritingStyle w:lang=&quot;PT-BR&quot; w:vendorID=&quot;64&quot; w:dllVersion=&quot;0&quot; w:nlCheck=&quot;on&quot; w:optionSet=&quot;0&quot;/&gt;&lt;w:stylePaneFormatFilter w:val=&quot;3F01&quot;/&gt;&lt;w:defaultTabStop w:val=&quot;720&quot;/&gt;&lt;w:hyphenationZone w:val=&quot;425&quot;/&gt;&lt;w:characterSpacingControl w:val=&quot;DontCompress&quot;/&gt;&lt;w:optimizeForBrowser/&gt;&lt;w:validateAgainstSchema/&gt;&lt;w:saveInvalidXML w:val=&quot;off&quot;/&gt;&lt;w:ignoreMixedContent w:val=&quot;off&quot;/&gt;&lt;w:alwaysShowPlaceholderText w:val=&quot;off&quot;/&gt;&lt;w:compat&gt;&lt;w:breakWrappedTables/&gt;&lt;w:snapToGridInCell/&gt;&lt;w:applyBreakingRules/&gt;&lt;w:wrapTextWithPunct/&gt;&lt;w:useAsianBreakRules/&gt;&lt;w:useWord2002TableStyleRules/&gt;&lt;w:useFELayout/&gt;&lt;/w:compat&gt;&lt;wsp:rsids&gt;&lt;wsp:rsidRoot wsp:val=&quot;00426FBB&quot;/&gt;&lt;wsp:rsid wsp:val=&quot;000002E1&quot;/&gt;&lt;wsp:rsid wsp:val=&quot;00003C97&quot;/&gt;&lt;wsp:rsid wsp:val=&quot;00005565&quot;/&gt;&lt;wsp:rsid wsp:val=&quot;0001754A&quot;/&gt;&lt;wsp:rsid wsp:val=&quot;00017719&quot;/&gt;&lt;wsp:rsid wsp:val=&quot;00027F1D&quot;/&gt;&lt;wsp:rsid wsp:val=&quot;0003296C&quot;/&gt;&lt;wsp:rsid wsp:val=&quot;0003351F&quot;/&gt;&lt;wsp:rsid wsp:val=&quot;00044599&quot;/&gt;&lt;wsp:rsid wsp:val=&quot;000540E6&quot;/&gt;&lt;wsp:rsid wsp:val=&quot;00054421&quot;/&gt;&lt;wsp:rsid wsp:val=&quot;00062E46&quot;/&gt;&lt;wsp:rsid wsp:val=&quot;00074AC8&quot;/&gt;&lt;wsp:rsid wsp:val=&quot;00081408&quot;/&gt;&lt;wsp:rsid wsp:val=&quot;00081EBE&quot;/&gt;&lt;wsp:rsid wsp:val=&quot;00086EDC&quot;/&gt;&lt;wsp:rsid wsp:val=&quot;000B1236&quot;/&gt;&lt;wsp:rsid wsp:val=&quot;000B36A3&quot;/&gt;&lt;wsp:rsid wsp:val=&quot;000C013C&quot;/&gt;&lt;wsp:rsid wsp:val=&quot;000E3F84&quot;/&gt;&lt;wsp:rsid wsp:val=&quot;001056DF&quot;/&gt;&lt;wsp:rsid wsp:val=&quot;0010789C&quot;/&gt;&lt;wsp:rsid wsp:val=&quot;00114025&quot;/&gt;&lt;wsp:rsid wsp:val=&quot;001160D2&quot;/&gt;&lt;wsp:rsid wsp:val=&quot;00120636&quot;/&gt;&lt;wsp:rsid wsp:val=&quot;001348A5&quot;/&gt;&lt;wsp:rsid wsp:val=&quot;00151B8E&quot;/&gt;&lt;wsp:rsid wsp:val=&quot;00182170&quot;/&gt;&lt;wsp:rsid wsp:val=&quot;001928FB&quot;/&gt;&lt;wsp:rsid wsp:val=&quot;00192BC7&quot;/&gt;&lt;wsp:rsid wsp:val=&quot;00195BE6&quot;/&gt;&lt;wsp:rsid wsp:val=&quot;001A3C37&quot;/&gt;&lt;wsp:rsid wsp:val=&quot;001A50EA&quot;/&gt;&lt;wsp:rsid wsp:val=&quot;001F16CD&quot;/&gt;&lt;wsp:rsid wsp:val=&quot;001F47D2&quot;/&gt;&lt;wsp:rsid wsp:val=&quot;002029C8&quot;/&gt;&lt;wsp:rsid wsp:val=&quot;0022285A&quot;/&gt;&lt;wsp:rsid wsp:val=&quot;00224C61&quot;/&gt;&lt;wsp:rsid wsp:val=&quot;00256ABC&quot;/&gt;&lt;wsp:rsid wsp:val=&quot;0027227B&quot;/&gt;&lt;wsp:rsid wsp:val=&quot;00273AC7&quot;/&gt;&lt;wsp:rsid wsp:val=&quot;00273D2C&quot;/&gt;&lt;wsp:rsid wsp:val=&quot;00285ECD&quot;/&gt;&lt;wsp:rsid wsp:val=&quot;00290E1B&quot;/&gt;&lt;wsp:rsid wsp:val=&quot;00291B17&quot;/&gt;&lt;wsp:rsid wsp:val=&quot;00291BB3&quot;/&gt;&lt;wsp:rsid wsp:val=&quot;002A6742&quot;/&gt;&lt;wsp:rsid wsp:val=&quot;002C1A7F&quot;/&gt;&lt;wsp:rsid wsp:val=&quot;002C4239&quot;/&gt;&lt;wsp:rsid wsp:val=&quot;002C559D&quot;/&gt;&lt;wsp:rsid wsp:val=&quot;002D16AE&quot;/&gt;&lt;wsp:rsid wsp:val=&quot;002D2D42&quot;/&gt;&lt;wsp:rsid wsp:val=&quot;002F72D0&quot;/&gt;&lt;wsp:rsid wsp:val=&quot;002F7A4F&quot;/&gt;&lt;wsp:rsid wsp:val=&quot;003003AB&quot;/&gt;&lt;wsp:rsid wsp:val=&quot;00302C35&quot;/&gt;&lt;wsp:rsid wsp:val=&quot;00311C49&quot;/&gt;&lt;wsp:rsid wsp:val=&quot;0032119E&quot;/&gt;&lt;wsp:rsid wsp:val=&quot;00321304&quot;/&gt;&lt;wsp:rsid wsp:val=&quot;00324FC2&quot;/&gt;&lt;wsp:rsid wsp:val=&quot;003312CA&quot;/&gt;&lt;wsp:rsid wsp:val=&quot;00331F84&quot;/&gt;&lt;wsp:rsid wsp:val=&quot;0037721F&quot;/&gt;&lt;wsp:rsid wsp:val=&quot;003950A4&quot;/&gt;&lt;wsp:rsid wsp:val=&quot;003A1E7E&quot;/&gt;&lt;wsp:rsid wsp:val=&quot;003E2FDC&quot;/&gt;&lt;wsp:rsid wsp:val=&quot;003E3577&quot;/&gt;&lt;wsp:rsid wsp:val=&quot;003F3A61&quot;/&gt;&lt;wsp:rsid wsp:val=&quot;00410A5D&quot;/&gt;&lt;wsp:rsid wsp:val=&quot;00412368&quot;/&gt;&lt;wsp:rsid wsp:val=&quot;00414909&quot;/&gt;&lt;wsp:rsid wsp:val=&quot;00416537&quot;/&gt;&lt;wsp:rsid wsp:val=&quot;00425A6A&quot;/&gt;&lt;wsp:rsid wsp:val=&quot;00426FBB&quot;/&gt;&lt;wsp:rsid wsp:val=&quot;00454542&quot;/&gt;&lt;wsp:rsid wsp:val=&quot;0047429A&quot;/&gt;&lt;wsp:rsid wsp:val=&quot;0048374C&quot;/&gt;&lt;wsp:rsid wsp:val=&quot;0048771D&quot;/&gt;&lt;wsp:rsid wsp:val=&quot;004A6605&quot;/&gt;&lt;wsp:rsid wsp:val=&quot;004C45FA&quot;/&gt;&lt;wsp:rsid wsp:val=&quot;004D35A3&quot;/&gt;&lt;wsp:rsid wsp:val=&quot;004E1BD8&quot;/&gt;&lt;wsp:rsid wsp:val=&quot;004E452A&quot;/&gt;&lt;wsp:rsid wsp:val=&quot;004E78E3&quot;/&gt;&lt;wsp:rsid wsp:val=&quot;004F2BFE&quot;/&gt;&lt;wsp:rsid wsp:val=&quot;004F63D3&quot;/&gt;&lt;wsp:rsid wsp:val=&quot;004F7DCF&quot;/&gt;&lt;wsp:rsid wsp:val=&quot;005004BF&quot;/&gt;&lt;wsp:rsid wsp:val=&quot;00502E89&quot;/&gt;&lt;wsp:rsid wsp:val=&quot;00506CFE&quot;/&gt;&lt;wsp:rsid wsp:val=&quot;00510E95&quot;/&gt;&lt;wsp:rsid wsp:val=&quot;005225C3&quot;/&gt;&lt;wsp:rsid wsp:val=&quot;00527D56&quot;/&gt;&lt;wsp:rsid wsp:val=&quot;0053221F&quot;/&gt;&lt;wsp:rsid wsp:val=&quot;00536FAE&quot;/&gt;&lt;wsp:rsid wsp:val=&quot;00542C85&quot;/&gt;&lt;wsp:rsid wsp:val=&quot;00553510&quot;/&gt;&lt;wsp:rsid wsp:val=&quot;00554186&quot;/&gt;&lt;wsp:rsid wsp:val=&quot;00585769&quot;/&gt;&lt;wsp:rsid wsp:val=&quot;00585C61&quot;/&gt;&lt;wsp:rsid wsp:val=&quot;00591130&quot;/&gt;&lt;wsp:rsid wsp:val=&quot;005A3F28&quot;/&gt;&lt;wsp:rsid wsp:val=&quot;005A40BE&quot;/&gt;&lt;wsp:rsid wsp:val=&quot;005B13E2&quot;/&gt;&lt;wsp:rsid wsp:val=&quot;005B47D7&quot;/&gt;&lt;wsp:rsid wsp:val=&quot;005C5526&quot;/&gt;&lt;wsp:rsid wsp:val=&quot;005C62C6&quot;/&gt;&lt;wsp:rsid wsp:val=&quot;005D7B9E&quot;/&gt;&lt;wsp:rsid wsp:val=&quot;005E112E&quot;/&gt;&lt;wsp:rsid wsp:val=&quot;005F0834&quot;/&gt;&lt;wsp:rsid wsp:val=&quot;005F68AB&quot;/&gt;&lt;wsp:rsid wsp:val=&quot;005F6DC3&quot;/&gt;&lt;wsp:rsid wsp:val=&quot;00601A8E&quot;/&gt;&lt;wsp:rsid wsp:val=&quot;0062033E&quot;/&gt;&lt;wsp:rsid wsp:val=&quot;00624482&quot;/&gt;&lt;wsp:rsid wsp:val=&quot;0064799C&quot;/&gt;&lt;wsp:rsid wsp:val=&quot;00654156&quot;/&gt;&lt;wsp:rsid wsp:val=&quot;00656ADC&quot;/&gt;&lt;wsp:rsid wsp:val=&quot;006B47CA&quot;/&gt;&lt;wsp:rsid wsp:val=&quot;006C304C&quot;/&gt;&lt;wsp:rsid wsp:val=&quot;006C4511&quot;/&gt;&lt;wsp:rsid wsp:val=&quot;006C65F5&quot;/&gt;&lt;wsp:rsid wsp:val=&quot;006C7AAA&quot;/&gt;&lt;wsp:rsid wsp:val=&quot;006D1C2A&quot;/&gt;&lt;wsp:rsid wsp:val=&quot;006D264F&quot;/&gt;&lt;wsp:rsid wsp:val=&quot;006D4E89&quot;/&gt;&lt;wsp:rsid wsp:val=&quot;006E2A8D&quot;/&gt;&lt;wsp:rsid wsp:val=&quot;006E7574&quot;/&gt;&lt;wsp:rsid wsp:val=&quot;00703430&quot;/&gt;&lt;wsp:rsid wsp:val=&quot;00703548&quot;/&gt;&lt;wsp:rsid wsp:val=&quot;00704E18&quot;/&gt;&lt;wsp:rsid wsp:val=&quot;007069BE&quot;/&gt;&lt;wsp:rsid wsp:val=&quot;00745C86&quot;/&gt;&lt;wsp:rsid wsp:val=&quot;00764603&quot;/&gt;&lt;wsp:rsid wsp:val=&quot;0076604D&quot;/&gt;&lt;wsp:rsid wsp:val=&quot;00790909&quot;/&gt;&lt;wsp:rsid wsp:val=&quot;007929AF&quot;/&gt;&lt;wsp:rsid wsp:val=&quot;007B1582&quot;/&gt;&lt;wsp:rsid wsp:val=&quot;007B5A07&quot;/&gt;&lt;wsp:rsid wsp:val=&quot;007C065D&quot;/&gt;&lt;wsp:rsid wsp:val=&quot;007D3E71&quot;/&gt;&lt;wsp:rsid wsp:val=&quot;007E5D6A&quot;/&gt;&lt;wsp:rsid wsp:val=&quot;007E645D&quot;/&gt;&lt;wsp:rsid wsp:val=&quot;007F75CA&quot;/&gt;&lt;wsp:rsid wsp:val=&quot;00821E08&quot;/&gt;&lt;wsp:rsid wsp:val=&quot;00834EFD&quot;/&gt;&lt;wsp:rsid wsp:val=&quot;00844B24&quot;/&gt;&lt;wsp:rsid wsp:val=&quot;0084515F&quot;/&gt;&lt;wsp:rsid wsp:val=&quot;0085092D&quot;/&gt;&lt;wsp:rsid wsp:val=&quot;00865414&quot;/&gt;&lt;wsp:rsid wsp:val=&quot;00877D4C&quot;/&gt;&lt;wsp:rsid wsp:val=&quot;00883903&quot;/&gt;&lt;wsp:rsid wsp:val=&quot;00891C30&quot;/&gt;&lt;wsp:rsid wsp:val=&quot;0089763B&quot;/&gt;&lt;wsp:rsid wsp:val=&quot;008B6AE3&quot;/&gt;&lt;wsp:rsid wsp:val=&quot;008C1332&quot;/&gt;&lt;wsp:rsid wsp:val=&quot;008D1045&quot;/&gt;&lt;wsp:rsid wsp:val=&quot;008E5996&quot;/&gt;&lt;wsp:rsid wsp:val=&quot;00901AE1&quot;/&gt;&lt;wsp:rsid wsp:val=&quot;00912F93&quot;/&gt;&lt;wsp:rsid wsp:val=&quot;009205B4&quot;/&gt;&lt;wsp:rsid wsp:val=&quot;00955B59&quot;/&gt;&lt;wsp:rsid wsp:val=&quot;00992262&quot;/&gt;&lt;wsp:rsid wsp:val=&quot;009926BC&quot;/&gt;&lt;wsp:rsid wsp:val=&quot;009A4319&quot;/&gt;&lt;wsp:rsid wsp:val=&quot;009A6C3F&quot;/&gt;&lt;wsp:rsid wsp:val=&quot;009B73F2&quot;/&gt;&lt;wsp:rsid wsp:val=&quot;009C12BD&quot;/&gt;&lt;wsp:rsid wsp:val=&quot;009C50FE&quot;/&gt;&lt;wsp:rsid wsp:val=&quot;009E49DD&quot;/&gt;&lt;wsp:rsid wsp:val=&quot;00A03E75&quot;/&gt;&lt;wsp:rsid wsp:val=&quot;00A20627&quot;/&gt;&lt;wsp:rsid wsp:val=&quot;00A22FE9&quot;/&gt;&lt;wsp:rsid wsp:val=&quot;00A31A44&quot;/&gt;&lt;wsp:rsid wsp:val=&quot;00A32BFA&quot;/&gt;&lt;wsp:rsid wsp:val=&quot;00A3325E&quot;/&gt;&lt;wsp:rsid wsp:val=&quot;00A45FCE&quot;/&gt;&lt;wsp:rsid wsp:val=&quot;00A75671&quot;/&gt;&lt;wsp:rsid wsp:val=&quot;00A773CC&quot;/&gt;&lt;wsp:rsid wsp:val=&quot;00A924D0&quot;/&gt;&lt;wsp:rsid wsp:val=&quot;00A9318B&quot;/&gt;&lt;wsp:rsid wsp:val=&quot;00A94AC1&quot;/&gt;&lt;wsp:rsid wsp:val=&quot;00AB18B7&quot;/&gt;&lt;wsp:rsid wsp:val=&quot;00AD335D&quot;/&gt;&lt;wsp:rsid wsp:val=&quot;00AF114C&quot;/&gt;&lt;wsp:rsid wsp:val=&quot;00AF792B&quot;/&gt;&lt;wsp:rsid wsp:val=&quot;00B32137&quot;/&gt;&lt;wsp:rsid wsp:val=&quot;00B33D2F&quot;/&gt;&lt;wsp:rsid wsp:val=&quot;00B40A5B&quot;/&gt;&lt;wsp:rsid wsp:val=&quot;00B45C6B&quot;/&gt;&lt;wsp:rsid wsp:val=&quot;00B55D5E&quot;/&gt;&lt;wsp:rsid wsp:val=&quot;00B57A80&quot;/&gt;&lt;wsp:rsid wsp:val=&quot;00B70E9C&quot;/&gt;&lt;wsp:rsid wsp:val=&quot;00B713D8&quot;/&gt;&lt;wsp:rsid wsp:val=&quot;00B72979&quot;/&gt;&lt;wsp:rsid wsp:val=&quot;00B94516&quot;/&gt;&lt;wsp:rsid wsp:val=&quot;00BA25E2&quot;/&gt;&lt;wsp:rsid wsp:val=&quot;00BB2855&quot;/&gt;&lt;wsp:rsid wsp:val=&quot;00BC5343&quot;/&gt;&lt;wsp:rsid wsp:val=&quot;00BD19C1&quot;/&gt;&lt;wsp:rsid wsp:val=&quot;00BD25B8&quot;/&gt;&lt;wsp:rsid wsp:val=&quot;00C012E1&quot;/&gt;&lt;wsp:rsid wsp:val=&quot;00C06BB4&quot;/&gt;&lt;wsp:rsid wsp:val=&quot;00C10D20&quot;/&gt;&lt;wsp:rsid wsp:val=&quot;00C12E0C&quot;/&gt;&lt;wsp:rsid wsp:val=&quot;00C21916&quot;/&gt;&lt;wsp:rsid wsp:val=&quot;00C34915&quot;/&gt;&lt;wsp:rsid wsp:val=&quot;00C457CA&quot;/&gt;&lt;wsp:rsid wsp:val=&quot;00C53FB6&quot;/&gt;&lt;wsp:rsid wsp:val=&quot;00C57FB7&quot;/&gt;&lt;wsp:rsid wsp:val=&quot;00C644D4&quot;/&gt;&lt;wsp:rsid wsp:val=&quot;00C65F3F&quot;/&gt;&lt;wsp:rsid wsp:val=&quot;00C72414&quot;/&gt;&lt;wsp:rsid wsp:val=&quot;00C72B1A&quot;/&gt;&lt;wsp:rsid wsp:val=&quot;00C8667B&quot;/&gt;&lt;wsp:rsid wsp:val=&quot;00C90993&quot;/&gt;&lt;wsp:rsid wsp:val=&quot;00CA4CE3&quot;/&gt;&lt;wsp:rsid wsp:val=&quot;00CC72FD&quot;/&gt;&lt;wsp:rsid wsp:val=&quot;00CD1D23&quot;/&gt;&lt;wsp:rsid wsp:val=&quot;00CD4F3F&quot;/&gt;&lt;wsp:rsid wsp:val=&quot;00D311F8&quot;/&gt;&lt;wsp:rsid wsp:val=&quot;00D31660&quot;/&gt;&lt;wsp:rsid wsp:val=&quot;00D36B52&quot;/&gt;&lt;wsp:rsid wsp:val=&quot;00D377C8&quot;/&gt;&lt;wsp:rsid wsp:val=&quot;00D41274&quot;/&gt;&lt;wsp:rsid wsp:val=&quot;00D4229C&quot;/&gt;&lt;wsp:rsid wsp:val=&quot;00D43BF3&quot;/&gt;&lt;wsp:rsid wsp:val=&quot;00D549FB&quot;/&gt;&lt;wsp:rsid wsp:val=&quot;00D56487&quot;/&gt;&lt;wsp:rsid wsp:val=&quot;00D767BB&quot;/&gt;&lt;wsp:rsid wsp:val=&quot;00D939B0&quot;/&gt;&lt;wsp:rsid wsp:val=&quot;00DA31A2&quot;/&gt;&lt;wsp:rsid wsp:val=&quot;00DB16E0&quot;/&gt;&lt;wsp:rsid wsp:val=&quot;00DB2DF9&quot;/&gt;&lt;wsp:rsid wsp:val=&quot;00DB465D&quot;/&gt;&lt;wsp:rsid wsp:val=&quot;00DB48A2&quot;/&gt;&lt;wsp:rsid wsp:val=&quot;00DB7E63&quot;/&gt;&lt;wsp:rsid wsp:val=&quot;00DC2055&quot;/&gt;&lt;wsp:rsid wsp:val=&quot;00DC3908&quot;/&gt;&lt;wsp:rsid wsp:val=&quot;00DD71E8&quot;/&gt;&lt;wsp:rsid wsp:val=&quot;00DD7F83&quot;/&gt;&lt;wsp:rsid wsp:val=&quot;00DE4EB8&quot;/&gt;&lt;wsp:rsid wsp:val=&quot;00E0641E&quot;/&gt;&lt;wsp:rsid wsp:val=&quot;00E06664&quot;/&gt;&lt;wsp:rsid wsp:val=&quot;00E304BC&quot;/&gt;&lt;wsp:rsid wsp:val=&quot;00E32853&quot;/&gt;&lt;wsp:rsid wsp:val=&quot;00E34EBD&quot;/&gt;&lt;wsp:rsid wsp:val=&quot;00E401F8&quot;/&gt;&lt;wsp:rsid wsp:val=&quot;00E46425&quot;/&gt;&lt;wsp:rsid wsp:val=&quot;00E469FC&quot;/&gt;&lt;wsp:rsid wsp:val=&quot;00E47D0E&quot;/&gt;&lt;wsp:rsid wsp:val=&quot;00E65018&quot;/&gt;&lt;wsp:rsid wsp:val=&quot;00E76CA1&quot;/&gt;&lt;wsp:rsid wsp:val=&quot;00E94339&quot;/&gt;&lt;wsp:rsid wsp:val=&quot;00E97563&quot;/&gt;&lt;wsp:rsid wsp:val=&quot;00EB0B63&quot;/&gt;&lt;wsp:rsid wsp:val=&quot;00EC265C&quot;/&gt;&lt;wsp:rsid wsp:val=&quot;00ED61CB&quot;/&gt;&lt;wsp:rsid wsp:val=&quot;00EE752A&quot;/&gt;&lt;wsp:rsid wsp:val=&quot;00F06A72&quot;/&gt;&lt;wsp:rsid wsp:val=&quot;00F136F0&quot;/&gt;&lt;wsp:rsid wsp:val=&quot;00F20BBB&quot;/&gt;&lt;wsp:rsid wsp:val=&quot;00F36048&quot;/&gt;&lt;wsp:rsid wsp:val=&quot;00F43BD8&quot;/&gt;&lt;wsp:rsid wsp:val=&quot;00F562F3&quot;/&gt;&lt;wsp:rsid wsp:val=&quot;00F74B89&quot;/&gt;&lt;wsp:rsid wsp:val=&quot;00F75133&quot;/&gt;&lt;wsp:rsid wsp:val=&quot;00F83272&quot;/&gt;&lt;wsp:rsid wsp:val=&quot;00F9358D&quot;/&gt;&lt;wsp:rsid wsp:val=&quot;00F9369B&quot;/&gt;&lt;wsp:rsid wsp:val=&quot;00FA3899&quot;/&gt;&lt;wsp:rsid wsp:val=&quot;00FA4909&quot;/&gt;&lt;wsp:rsid wsp:val=&quot;00FA5164&quot;/&gt;&lt;wsp:rsid wsp:val=&quot;00FA6751&quot;/&gt;&lt;wsp:rsid wsp:val=&quot;00FA6BD7&quot;/&gt;&lt;wsp:rsid wsp:val=&quot;00FB1048&quot;/&gt;&lt;wsp:rsid wsp:val=&quot;00FB62C4&quot;/&gt;&lt;wsp:rsid wsp:val=&quot;00FB7701&quot;/&gt;&lt;wsp:rsid wsp:val=&quot;00FD1AC5&quot;/&gt;&lt;wsp:rsid wsp:val=&quot;00FD5CF0&quot;/&gt;&lt;/wsp:rsids&gt;&lt;/w:docPr&gt;&lt;w:body&gt;&lt;wx:sect&gt;&lt;w:p wsp:rsidR=&quot;00412368&quot; wsp:rsidRPr=&quot;00412368&quot; wsp:rsidRDefault=&quot;00412368&quot; wsp:rsidP=&quot;00412368&quot;&gt;&lt;m:oMathPara&gt;&lt;m:oMath&gt;&lt;m:sSub&gt;&lt;m:sSubPr&gt;&lt;m:ctrlPr&gt;&lt;w:rPr&gt;&lt;w:rFonts w:ascii=&quot;Cambria Math&quot; w:h-ansi=&quot;Cambria Math&quot;/&gt;&lt;wx:font wx:val=&quot;Cambria Math&quot;/&gt;&lt;w:i/&gt;&lt;/w:rPr&gt;&lt;/m:ctrlPr&gt;&lt;/m:sSubPr&gt;&lt;m:e&gt;&lt;m:r&gt;&lt;w:rPr&gt;&lt;w:rFonts w:ascii=&quot;Cambria Math&quot; w:h-ansi=&quot;Cambria Math&quot;/&gt;&lt;wx:font wx:val=&quot;Cambria Math&quot;/&gt;&lt;w:i/&gt;&lt;/w:rPr&gt;&lt;m:t&gt;V&lt;/m:t&gt;&lt;/m:r&gt;&lt;/m:e&gt;&lt;m:sub&gt;&lt;m:r&gt;&lt;w:rPr&gt;&lt;w:rFonts w:ascii=&quot;Cambria Math&quot; w:h-ansi=&quot;Cambria Math&quot;/&gt;&lt;wx:font wx:val=&quot;Cambria Math&quot;/&gt;&lt;w:i/&gt;&lt;/w:rPr&gt;&lt;m:t&gt;in&lt;/m:t&gt;&lt;/m:r&gt;&lt;/m:sub&gt;&lt;/m:sSub&gt;&lt;/m:oMath&gt;&lt;/m:oMathPara&gt;&lt;/w:p&gt;&lt;w:sectPr wsp:rsidR=&quot;00000000&quot; wsp:rsidRPr=&quot;00412368&quot;&gt;&lt;w:pgSz w:w=&quot;12240&quot; w:h=&quot;15840&quot;/&gt;&lt;w:pgMar w:top=&quot;1440&quot; w:right=&quot;1440&quot; w:bottom=&quot;1440&quot; w:left=&quot;1440&quot; w:header=&quot;720&quot; w:footer=&quot;720&quot; w:gutter=&quot;0&quot;/&gt;&lt;w:cols w:space=&quot;720&quot;/&gt;&lt;/w:sectPr&gt;&lt;/wx:sect&gt;&lt;/w:body&gt;&lt;/w:wordDocument&gt;">
+                <v:shape id="_x0000_i1048" type="#_x0000_t75" style="width:15.25pt;height:13.85pt" equationxml="&lt;?xml version=&quot;1.0&quot; encoding=&quot;UTF-8&quot; standalone=&quot;yes&quot;?&gt;&#10;&lt;?mso-application progid=&quot;Word.Document&quot;?&gt;&#10;&lt;w:wordDocument xmlns:aml=&quot;http://schemas.microsoft.com/aml/2001/core&quot; xmlns:wpc=&quot;http://schemas.microsoft.com/office/word/2010/wordprocessingCanvas&quot; xmlns:cx=&quot;http://schemas.microsoft.com/office/drawing/2014/chartex&quot; xmlns:cx1=&quot;http://schemas.microsoft.com/office/drawing/2015/9/8/chartex&quot; xmlns:cx2=&quot;http://schemas.microsoft.com/office/drawing/2015/10/21/chartex&quot; xmlns:cx3=&quot;http://schemas.microsoft.com/office/drawing/2016/5/9/chartex&quot; xmlns:cx4=&quot;http://schemas.microsoft.com/office/drawing/2016/5/10/chartex&quot; xmlns:cx5=&quot;http://schemas.microsoft.com/office/drawing/2016/5/11/chartex&quot; xmlns:cx6=&quot;http://schemas.microsoft.com/office/drawing/2016/5/12/chartex&quot; xmlns:cx7=&quot;http://schemas.microsoft.com/office/drawing/2016/5/13/chartex&quot; xmlns:cx8=&quot;http://schemas.microsoft.com/office/drawing/2016/5/14/chartex&quot; xmlns:cr=&quot;http://schemas.microsoft.com/office/comments/2020/reactions&quot; xmlns:dt=&quot;uuid:C2F41010-65B3-11d1-A29F-00AA00C14882&quot; xmlns:mc=&quot;http://schemas.openxmlformats.org/markup-compatibility/2006&quot; xmlns:aink=&quot;http://schemas.microsoft.com/office/drawing/2016/ink&quot; xmlns:am3d=&quot;http://schemas.microsoft.com/office/drawing/2017/model3d&quot; xmlns:o=&quot;urn:schemas-microsoft-com:office:office&quot; xmlns:oel=&quot;http://schemas.microsoft.com/office/2019/extlst&quot; xmlns:m=&quot;http://schemas.openxmlformats.org/officeDocument/2006/math&quot; xmlns:v=&quot;urn:schemas-microsoft-com:vml&quot; xmlns:w10=&quot;urn:schemas-microsoft-com:office:word&quot; xmlns:w=&quot;http://schemas.microsoft.com/office/word/2003/wordml&quot; xmlns:wx=&quot;http://schemas.microsoft.com/office/word/2003/auxHint&quot; xmlns:wne=&quot;http://schemas.microsoft.com/office/word/2006/wordml&quot; xmlns:wsp=&quot;http://schemas.microsoft.com/office/word/2003/wordml/sp2&quot; xmlns:sl=&quot;http://schemas.microsoft.com/schemaLibrary/2003/core&quot; w:macrosPresent=&quot;no&quot; w:embeddedObjPresent=&quot;no&quot; w:ocxPresent=&quot;no&quot; xml:space=&quot;preserve&quot;&gt;&lt;w:ignoreSubtree w:val=&quot;http://schemas.microsoft.com/office/word/2003/wordml/sp2&quot;/&gt;&lt;o:DocumentProperties&gt;&lt;o:Version&gt;16&lt;/o:Version&gt;&lt;/o:DocumentProperties&gt;&lt;w:docPr&gt;&lt;w:view w:val=&quot;print&quot;/&gt;&lt;w:zoom w:percent=&quot;100&quot;/&gt;&lt;w:doNotEmbedSystemFonts/&gt;&lt;w:activeWritingStyle w:lang=&quot;EN-AU&quot; w:vendorID=&quot;64&quot; w:dllVersion=&quot;6&quot; w:nlCheck=&quot;on&quot; w:optionSet=&quot;1&quot;/&gt;&lt;w:activeWritingStyle w:lang=&quot;EN-GB&quot; w:vendorID=&quot;64&quot; w:dllVersion=&quot;6&quot; w:nlCheck=&quot;on&quot; w:optionSet=&quot;1&quot;/&gt;&lt;w:activeWritingStyle w:lang=&quot;EN-US&quot; w:vendorID=&quot;64&quot; w:dllVersion=&quot;6&quot; w:nlCheck=&quot;on&quot; w:optionSet=&quot;1&quot;/&gt;&lt;w:activeWritingStyle w:lang=&quot;EN-AU&quot; w:vendorID=&quot;64&quot; w:dllVersion=&quot;0&quot; w:nlCheck=&quot;on&quot; w:optionSet=&quot;0&quot;/&gt;&lt;w:activeWritingStyle w:lang=&quot;EN-GB&quot; w:vendorID=&quot;64&quot; w:dllVersion=&quot;0&quot; w:nlCheck=&quot;on&quot; w:optionSet=&quot;0&quot;/&gt;&lt;w:activeWritingStyle w:lang=&quot;EN-US&quot; w:vendorID=&quot;64&quot; w:dllVersion=&quot;0&quot; w:nlCheck=&quot;on&quot; w:optionSet=&quot;0&quot;/&gt;&lt;w:activeWritingStyle w:lang=&quot;ES-AR&quot; w:vendorID=&quot;64&quot; w:dllVersion=&quot;0&quot; w:nlCheck=&quot;on&quot; w:optionSet=&quot;0&quot;/&gt;&lt;w:activeWritingStyle w:lang=&quot;580A&quot; w:vendorID=&quot;64&quot; w:dllVersion=&quot;0&quot; w:nlCheck=&quot;on&quot; w:optionSet=&quot;0&quot;/&gt;&lt;w:activeWritingStyle w:lang=&quot;PT-BR&quot; w:vendorID=&quot;64&quot; w:dllVersion=&quot;0&quot; w:nlCheck=&quot;on&quot; w:optionSet=&quot;0&quot;/&gt;&lt;w:stylePaneFormatFilter w:val=&quot;3F01&quot;/&gt;&lt;w:defaultTabStop w:val=&quot;720&quot;/&gt;&lt;w:hyphenationZone w:val=&quot;425&quot;/&gt;&lt;w:characterSpacingControl w:val=&quot;DontCompress&quot;/&gt;&lt;w:optimizeForBrowser/&gt;&lt;w:validateAgainstSchema/&gt;&lt;w:saveInvalidXML w:val=&quot;off&quot;/&gt;&lt;w:ignoreMixedContent w:val=&quot;off&quot;/&gt;&lt;w:alwaysShowPlaceholderText w:val=&quot;off&quot;/&gt;&lt;w:compat&gt;&lt;w:breakWrappedTables/&gt;&lt;w:snapToGridInCell/&gt;&lt;w:applyBreakingRules/&gt;&lt;w:wrapTextWithPunct/&gt;&lt;w:useAsianBreakRules/&gt;&lt;w:useWord2002TableStyleRules/&gt;&lt;w:useFELayout/&gt;&lt;/w:compat&gt;&lt;wsp:rsids&gt;&lt;wsp:rsidRoot wsp:val=&quot;00426FBB&quot;/&gt;&lt;wsp:rsid wsp:val=&quot;000002E1&quot;/&gt;&lt;wsp:rsid wsp:val=&quot;00003C97&quot;/&gt;&lt;wsp:rsid wsp:val=&quot;00005565&quot;/&gt;&lt;wsp:rsid wsp:val=&quot;0001754A&quot;/&gt;&lt;wsp:rsid wsp:val=&quot;00017719&quot;/&gt;&lt;wsp:rsid wsp:val=&quot;00027F1D&quot;/&gt;&lt;wsp:rsid wsp:val=&quot;0003296C&quot;/&gt;&lt;wsp:rsid wsp:val=&quot;0003351F&quot;/&gt;&lt;wsp:rsid wsp:val=&quot;00044599&quot;/&gt;&lt;wsp:rsid wsp:val=&quot;000540E6&quot;/&gt;&lt;wsp:rsid wsp:val=&quot;00054421&quot;/&gt;&lt;wsp:rsid wsp:val=&quot;00062E46&quot;/&gt;&lt;wsp:rsid wsp:val=&quot;00074AC8&quot;/&gt;&lt;wsp:rsid wsp:val=&quot;00081408&quot;/&gt;&lt;wsp:rsid wsp:val=&quot;00081EBE&quot;/&gt;&lt;wsp:rsid wsp:val=&quot;00086EDC&quot;/&gt;&lt;wsp:rsid wsp:val=&quot;000B1236&quot;/&gt;&lt;wsp:rsid wsp:val=&quot;000B36A3&quot;/&gt;&lt;wsp:rsid wsp:val=&quot;000C013C&quot;/&gt;&lt;wsp:rsid wsp:val=&quot;000E3F84&quot;/&gt;&lt;wsp:rsid wsp:val=&quot;001056DF&quot;/&gt;&lt;wsp:rsid wsp:val=&quot;0010789C&quot;/&gt;&lt;wsp:rsid wsp:val=&quot;00114025&quot;/&gt;&lt;wsp:rsid wsp:val=&quot;001160D2&quot;/&gt;&lt;wsp:rsid wsp:val=&quot;00120636&quot;/&gt;&lt;wsp:rsid wsp:val=&quot;001348A5&quot;/&gt;&lt;wsp:rsid wsp:val=&quot;00151B8E&quot;/&gt;&lt;wsp:rsid wsp:val=&quot;00182170&quot;/&gt;&lt;wsp:rsid wsp:val=&quot;001928FB&quot;/&gt;&lt;wsp:rsid wsp:val=&quot;00192BC7&quot;/&gt;&lt;wsp:rsid wsp:val=&quot;00195BE6&quot;/&gt;&lt;wsp:rsid wsp:val=&quot;001A3C37&quot;/&gt;&lt;wsp:rsid wsp:val=&quot;001A50EA&quot;/&gt;&lt;wsp:rsid wsp:val=&quot;001F16CD&quot;/&gt;&lt;wsp:rsid wsp:val=&quot;001F47D2&quot;/&gt;&lt;wsp:rsid wsp:val=&quot;002029C8&quot;/&gt;&lt;wsp:rsid wsp:val=&quot;0022285A&quot;/&gt;&lt;wsp:rsid wsp:val=&quot;00224C61&quot;/&gt;&lt;wsp:rsid wsp:val=&quot;00256ABC&quot;/&gt;&lt;wsp:rsid wsp:val=&quot;0027227B&quot;/&gt;&lt;wsp:rsid wsp:val=&quot;00273AC7&quot;/&gt;&lt;wsp:rsid wsp:val=&quot;00273D2C&quot;/&gt;&lt;wsp:rsid wsp:val=&quot;00285ECD&quot;/&gt;&lt;wsp:rsid wsp:val=&quot;00290E1B&quot;/&gt;&lt;wsp:rsid wsp:val=&quot;00291B17&quot;/&gt;&lt;wsp:rsid wsp:val=&quot;00291BB3&quot;/&gt;&lt;wsp:rsid wsp:val=&quot;002A6742&quot;/&gt;&lt;wsp:rsid wsp:val=&quot;002C1A7F&quot;/&gt;&lt;wsp:rsid wsp:val=&quot;002C4239&quot;/&gt;&lt;wsp:rsid wsp:val=&quot;002C559D&quot;/&gt;&lt;wsp:rsid wsp:val=&quot;002D16AE&quot;/&gt;&lt;wsp:rsid wsp:val=&quot;002D2D42&quot;/&gt;&lt;wsp:rsid wsp:val=&quot;002F72D0&quot;/&gt;&lt;wsp:rsid wsp:val=&quot;002F7A4F&quot;/&gt;&lt;wsp:rsid wsp:val=&quot;003003AB&quot;/&gt;&lt;wsp:rsid wsp:val=&quot;00302C35&quot;/&gt;&lt;wsp:rsid wsp:val=&quot;00311C49&quot;/&gt;&lt;wsp:rsid wsp:val=&quot;0032119E&quot;/&gt;&lt;wsp:rsid wsp:val=&quot;00321304&quot;/&gt;&lt;wsp:rsid wsp:val=&quot;00324FC2&quot;/&gt;&lt;wsp:rsid wsp:val=&quot;003312CA&quot;/&gt;&lt;wsp:rsid wsp:val=&quot;00331F84&quot;/&gt;&lt;wsp:rsid wsp:val=&quot;0037721F&quot;/&gt;&lt;wsp:rsid wsp:val=&quot;003950A4&quot;/&gt;&lt;wsp:rsid wsp:val=&quot;003A1E7E&quot;/&gt;&lt;wsp:rsid wsp:val=&quot;003E2FDC&quot;/&gt;&lt;wsp:rsid wsp:val=&quot;003E3577&quot;/&gt;&lt;wsp:rsid wsp:val=&quot;003F3A61&quot;/&gt;&lt;wsp:rsid wsp:val=&quot;00410A5D&quot;/&gt;&lt;wsp:rsid wsp:val=&quot;00412368&quot;/&gt;&lt;wsp:rsid wsp:val=&quot;00414909&quot;/&gt;&lt;wsp:rsid wsp:val=&quot;00416537&quot;/&gt;&lt;wsp:rsid wsp:val=&quot;00425A6A&quot;/&gt;&lt;wsp:rsid wsp:val=&quot;00426FBB&quot;/&gt;&lt;wsp:rsid wsp:val=&quot;00454542&quot;/&gt;&lt;wsp:rsid wsp:val=&quot;0047429A&quot;/&gt;&lt;wsp:rsid wsp:val=&quot;0048374C&quot;/&gt;&lt;wsp:rsid wsp:val=&quot;0048771D&quot;/&gt;&lt;wsp:rsid wsp:val=&quot;004A6605&quot;/&gt;&lt;wsp:rsid wsp:val=&quot;004C45FA&quot;/&gt;&lt;wsp:rsid wsp:val=&quot;004D35A3&quot;/&gt;&lt;wsp:rsid wsp:val=&quot;004E1BD8&quot;/&gt;&lt;wsp:rsid wsp:val=&quot;004E452A&quot;/&gt;&lt;wsp:rsid wsp:val=&quot;004E78E3&quot;/&gt;&lt;wsp:rsid wsp:val=&quot;004F2BFE&quot;/&gt;&lt;wsp:rsid wsp:val=&quot;004F63D3&quot;/&gt;&lt;wsp:rsid wsp:val=&quot;004F7DCF&quot;/&gt;&lt;wsp:rsid wsp:val=&quot;005004BF&quot;/&gt;&lt;wsp:rsid wsp:val=&quot;00502E89&quot;/&gt;&lt;wsp:rsid wsp:val=&quot;00506CFE&quot;/&gt;&lt;wsp:rsid wsp:val=&quot;00510E95&quot;/&gt;&lt;wsp:rsid wsp:val=&quot;005225C3&quot;/&gt;&lt;wsp:rsid wsp:val=&quot;00527D56&quot;/&gt;&lt;wsp:rsid wsp:val=&quot;0053221F&quot;/&gt;&lt;wsp:rsid wsp:val=&quot;00536FAE&quot;/&gt;&lt;wsp:rsid wsp:val=&quot;00542C85&quot;/&gt;&lt;wsp:rsid wsp:val=&quot;00553510&quot;/&gt;&lt;wsp:rsid wsp:val=&quot;00554186&quot;/&gt;&lt;wsp:rsid wsp:val=&quot;00585769&quot;/&gt;&lt;wsp:rsid wsp:val=&quot;00585C61&quot;/&gt;&lt;wsp:rsid wsp:val=&quot;00591130&quot;/&gt;&lt;wsp:rsid wsp:val=&quot;005A3F28&quot;/&gt;&lt;wsp:rsid wsp:val=&quot;005A40BE&quot;/&gt;&lt;wsp:rsid wsp:val=&quot;005B13E2&quot;/&gt;&lt;wsp:rsid wsp:val=&quot;005B47D7&quot;/&gt;&lt;wsp:rsid wsp:val=&quot;005C5526&quot;/&gt;&lt;wsp:rsid wsp:val=&quot;005C62C6&quot;/&gt;&lt;wsp:rsid wsp:val=&quot;005D7B9E&quot;/&gt;&lt;wsp:rsid wsp:val=&quot;005E112E&quot;/&gt;&lt;wsp:rsid wsp:val=&quot;005F0834&quot;/&gt;&lt;wsp:rsid wsp:val=&quot;005F68AB&quot;/&gt;&lt;wsp:rsid wsp:val=&quot;005F6DC3&quot;/&gt;&lt;wsp:rsid wsp:val=&quot;00601A8E&quot;/&gt;&lt;wsp:rsid wsp:val=&quot;0062033E&quot;/&gt;&lt;wsp:rsid wsp:val=&quot;00624482&quot;/&gt;&lt;wsp:rsid wsp:val=&quot;0064799C&quot;/&gt;&lt;wsp:rsid wsp:val=&quot;00654156&quot;/&gt;&lt;wsp:rsid wsp:val=&quot;00656ADC&quot;/&gt;&lt;wsp:rsid wsp:val=&quot;006B47CA&quot;/&gt;&lt;wsp:rsid wsp:val=&quot;006C304C&quot;/&gt;&lt;wsp:rsid wsp:val=&quot;006C4511&quot;/&gt;&lt;wsp:rsid wsp:val=&quot;006C65F5&quot;/&gt;&lt;wsp:rsid wsp:val=&quot;006C7AAA&quot;/&gt;&lt;wsp:rsid wsp:val=&quot;006D1C2A&quot;/&gt;&lt;wsp:rsid wsp:val=&quot;006D264F&quot;/&gt;&lt;wsp:rsid wsp:val=&quot;006D4E89&quot;/&gt;&lt;wsp:rsid wsp:val=&quot;006E2A8D&quot;/&gt;&lt;wsp:rsid wsp:val=&quot;006E7574&quot;/&gt;&lt;wsp:rsid wsp:val=&quot;00703430&quot;/&gt;&lt;wsp:rsid wsp:val=&quot;00703548&quot;/&gt;&lt;wsp:rsid wsp:val=&quot;00704E18&quot;/&gt;&lt;wsp:rsid wsp:val=&quot;007069BE&quot;/&gt;&lt;wsp:rsid wsp:val=&quot;00745C86&quot;/&gt;&lt;wsp:rsid wsp:val=&quot;00764603&quot;/&gt;&lt;wsp:rsid wsp:val=&quot;0076604D&quot;/&gt;&lt;wsp:rsid wsp:val=&quot;00790909&quot;/&gt;&lt;wsp:rsid wsp:val=&quot;007929AF&quot;/&gt;&lt;wsp:rsid wsp:val=&quot;007B1582&quot;/&gt;&lt;wsp:rsid wsp:val=&quot;007B5A07&quot;/&gt;&lt;wsp:rsid wsp:val=&quot;007C065D&quot;/&gt;&lt;wsp:rsid wsp:val=&quot;007D3E71&quot;/&gt;&lt;wsp:rsid wsp:val=&quot;007E5D6A&quot;/&gt;&lt;wsp:rsid wsp:val=&quot;007E645D&quot;/&gt;&lt;wsp:rsid wsp:val=&quot;007F75CA&quot;/&gt;&lt;wsp:rsid wsp:val=&quot;00821E08&quot;/&gt;&lt;wsp:rsid wsp:val=&quot;00834EFD&quot;/&gt;&lt;wsp:rsid wsp:val=&quot;00844B24&quot;/&gt;&lt;wsp:rsid wsp:val=&quot;0084515F&quot;/&gt;&lt;wsp:rsid wsp:val=&quot;0085092D&quot;/&gt;&lt;wsp:rsid wsp:val=&quot;00865414&quot;/&gt;&lt;wsp:rsid wsp:val=&quot;00877D4C&quot;/&gt;&lt;wsp:rsid wsp:val=&quot;00883903&quot;/&gt;&lt;wsp:rsid wsp:val=&quot;00891C30&quot;/&gt;&lt;wsp:rsid wsp:val=&quot;0089763B&quot;/&gt;&lt;wsp:rsid wsp:val=&quot;008B6AE3&quot;/&gt;&lt;wsp:rsid wsp:val=&quot;008C1332&quot;/&gt;&lt;wsp:rsid wsp:val=&quot;008D1045&quot;/&gt;&lt;wsp:rsid wsp:val=&quot;008E5996&quot;/&gt;&lt;wsp:rsid wsp:val=&quot;00901AE1&quot;/&gt;&lt;wsp:rsid wsp:val=&quot;00912F93&quot;/&gt;&lt;wsp:rsid wsp:val=&quot;009205B4&quot;/&gt;&lt;wsp:rsid wsp:val=&quot;00955B59&quot;/&gt;&lt;wsp:rsid wsp:val=&quot;00992262&quot;/&gt;&lt;wsp:rsid wsp:val=&quot;009926BC&quot;/&gt;&lt;wsp:rsid wsp:val=&quot;009A4319&quot;/&gt;&lt;wsp:rsid wsp:val=&quot;009A6C3F&quot;/&gt;&lt;wsp:rsid wsp:val=&quot;009B73F2&quot;/&gt;&lt;wsp:rsid wsp:val=&quot;009C12BD&quot;/&gt;&lt;wsp:rsid wsp:val=&quot;009C50FE&quot;/&gt;&lt;wsp:rsid wsp:val=&quot;009E49DD&quot;/&gt;&lt;wsp:rsid wsp:val=&quot;00A03E75&quot;/&gt;&lt;wsp:rsid wsp:val=&quot;00A20627&quot;/&gt;&lt;wsp:rsid wsp:val=&quot;00A22FE9&quot;/&gt;&lt;wsp:rsid wsp:val=&quot;00A31A44&quot;/&gt;&lt;wsp:rsid wsp:val=&quot;00A32BFA&quot;/&gt;&lt;wsp:rsid wsp:val=&quot;00A3325E&quot;/&gt;&lt;wsp:rsid wsp:val=&quot;00A45FCE&quot;/&gt;&lt;wsp:rsid wsp:val=&quot;00A75671&quot;/&gt;&lt;wsp:rsid wsp:val=&quot;00A773CC&quot;/&gt;&lt;wsp:rsid wsp:val=&quot;00A924D0&quot;/&gt;&lt;wsp:rsid wsp:val=&quot;00A9318B&quot;/&gt;&lt;wsp:rsid wsp:val=&quot;00A94AC1&quot;/&gt;&lt;wsp:rsid wsp:val=&quot;00AB18B7&quot;/&gt;&lt;wsp:rsid wsp:val=&quot;00AD335D&quot;/&gt;&lt;wsp:rsid wsp:val=&quot;00AF114C&quot;/&gt;&lt;wsp:rsid wsp:val=&quot;00AF792B&quot;/&gt;&lt;wsp:rsid wsp:val=&quot;00B32137&quot;/&gt;&lt;wsp:rsid wsp:val=&quot;00B33D2F&quot;/&gt;&lt;wsp:rsid wsp:val=&quot;00B40A5B&quot;/&gt;&lt;wsp:rsid wsp:val=&quot;00B45C6B&quot;/&gt;&lt;wsp:rsid wsp:val=&quot;00B55D5E&quot;/&gt;&lt;wsp:rsid wsp:val=&quot;00B57A80&quot;/&gt;&lt;wsp:rsid wsp:val=&quot;00B70E9C&quot;/&gt;&lt;wsp:rsid wsp:val=&quot;00B713D8&quot;/&gt;&lt;wsp:rsid wsp:val=&quot;00B72979&quot;/&gt;&lt;wsp:rsid wsp:val=&quot;00B94516&quot;/&gt;&lt;wsp:rsid wsp:val=&quot;00BA25E2&quot;/&gt;&lt;wsp:rsid wsp:val=&quot;00BB2855&quot;/&gt;&lt;wsp:rsid wsp:val=&quot;00BC5343&quot;/&gt;&lt;wsp:rsid wsp:val=&quot;00BD19C1&quot;/&gt;&lt;wsp:rsid wsp:val=&quot;00BD25B8&quot;/&gt;&lt;wsp:rsid wsp:val=&quot;00C012E1&quot;/&gt;&lt;wsp:rsid wsp:val=&quot;00C06BB4&quot;/&gt;&lt;wsp:rsid wsp:val=&quot;00C10D20&quot;/&gt;&lt;wsp:rsid wsp:val=&quot;00C12E0C&quot;/&gt;&lt;wsp:rsid wsp:val=&quot;00C21916&quot;/&gt;&lt;wsp:rsid wsp:val=&quot;00C34915&quot;/&gt;&lt;wsp:rsid wsp:val=&quot;00C457CA&quot;/&gt;&lt;wsp:rsid wsp:val=&quot;00C53FB6&quot;/&gt;&lt;wsp:rsid wsp:val=&quot;00C57FB7&quot;/&gt;&lt;wsp:rsid wsp:val=&quot;00C644D4&quot;/&gt;&lt;wsp:rsid wsp:val=&quot;00C65F3F&quot;/&gt;&lt;wsp:rsid wsp:val=&quot;00C72414&quot;/&gt;&lt;wsp:rsid wsp:val=&quot;00C72B1A&quot;/&gt;&lt;wsp:rsid wsp:val=&quot;00C8667B&quot;/&gt;&lt;wsp:rsid wsp:val=&quot;00C90993&quot;/&gt;&lt;wsp:rsid wsp:val=&quot;00CA4CE3&quot;/&gt;&lt;wsp:rsid wsp:val=&quot;00CC72FD&quot;/&gt;&lt;wsp:rsid wsp:val=&quot;00CD1D23&quot;/&gt;&lt;wsp:rsid wsp:val=&quot;00CD4F3F&quot;/&gt;&lt;wsp:rsid wsp:val=&quot;00D311F8&quot;/&gt;&lt;wsp:rsid wsp:val=&quot;00D31660&quot;/&gt;&lt;wsp:rsid wsp:val=&quot;00D36B52&quot;/&gt;&lt;wsp:rsid wsp:val=&quot;00D377C8&quot;/&gt;&lt;wsp:rsid wsp:val=&quot;00D41274&quot;/&gt;&lt;wsp:rsid wsp:val=&quot;00D4229C&quot;/&gt;&lt;wsp:rsid wsp:val=&quot;00D43BF3&quot;/&gt;&lt;wsp:rsid wsp:val=&quot;00D549FB&quot;/&gt;&lt;wsp:rsid wsp:val=&quot;00D56487&quot;/&gt;&lt;wsp:rsid wsp:val=&quot;00D767BB&quot;/&gt;&lt;wsp:rsid wsp:val=&quot;00D939B0&quot;/&gt;&lt;wsp:rsid wsp:val=&quot;00DA31A2&quot;/&gt;&lt;wsp:rsid wsp:val=&quot;00DB16E0&quot;/&gt;&lt;wsp:rsid wsp:val=&quot;00DB2DF9&quot;/&gt;&lt;wsp:rsid wsp:val=&quot;00DB465D&quot;/&gt;&lt;wsp:rsid wsp:val=&quot;00DB48A2&quot;/&gt;&lt;wsp:rsid wsp:val=&quot;00DB7E63&quot;/&gt;&lt;wsp:rsid wsp:val=&quot;00DC2055&quot;/&gt;&lt;wsp:rsid wsp:val=&quot;00DC3908&quot;/&gt;&lt;wsp:rsid wsp:val=&quot;00DD71E8&quot;/&gt;&lt;wsp:rsid wsp:val=&quot;00DD7F83&quot;/&gt;&lt;wsp:rsid wsp:val=&quot;00DE4EB8&quot;/&gt;&lt;wsp:rsid wsp:val=&quot;00E0641E&quot;/&gt;&lt;wsp:rsid wsp:val=&quot;00E06664&quot;/&gt;&lt;wsp:rsid wsp:val=&quot;00E304BC&quot;/&gt;&lt;wsp:rsid wsp:val=&quot;00E32853&quot;/&gt;&lt;wsp:rsid wsp:val=&quot;00E34EBD&quot;/&gt;&lt;wsp:rsid wsp:val=&quot;00E401F8&quot;/&gt;&lt;wsp:rsid wsp:val=&quot;00E46425&quot;/&gt;&lt;wsp:rsid wsp:val=&quot;00E469FC&quot;/&gt;&lt;wsp:rsid wsp:val=&quot;00E47D0E&quot;/&gt;&lt;wsp:rsid wsp:val=&quot;00E65018&quot;/&gt;&lt;wsp:rsid wsp:val=&quot;00E76CA1&quot;/&gt;&lt;wsp:rsid wsp:val=&quot;00E94339&quot;/&gt;&lt;wsp:rsid wsp:val=&quot;00E97563&quot;/&gt;&lt;wsp:rsid wsp:val=&quot;00EB0B63&quot;/&gt;&lt;wsp:rsid wsp:val=&quot;00EC265C&quot;/&gt;&lt;wsp:rsid wsp:val=&quot;00ED61CB&quot;/&gt;&lt;wsp:rsid wsp:val=&quot;00EE752A&quot;/&gt;&lt;wsp:rsid wsp:val=&quot;00F06A72&quot;/&gt;&lt;wsp:rsid wsp:val=&quot;00F136F0&quot;/&gt;&lt;wsp:rsid wsp:val=&quot;00F20BBB&quot;/&gt;&lt;wsp:rsid wsp:val=&quot;00F36048&quot;/&gt;&lt;wsp:rsid wsp:val=&quot;00F43BD8&quot;/&gt;&lt;wsp:rsid wsp:val=&quot;00F562F3&quot;/&gt;&lt;wsp:rsid wsp:val=&quot;00F74B89&quot;/&gt;&lt;wsp:rsid wsp:val=&quot;00F75133&quot;/&gt;&lt;wsp:rsid wsp:val=&quot;00F83272&quot;/&gt;&lt;wsp:rsid wsp:val=&quot;00F9358D&quot;/&gt;&lt;wsp:rsid wsp:val=&quot;00F9369B&quot;/&gt;&lt;wsp:rsid wsp:val=&quot;00FA3899&quot;/&gt;&lt;wsp:rsid wsp:val=&quot;00FA4909&quot;/&gt;&lt;wsp:rsid wsp:val=&quot;00FA5164&quot;/&gt;&lt;wsp:rsid wsp:val=&quot;00FA6751&quot;/&gt;&lt;wsp:rsid wsp:val=&quot;00FA6BD7&quot;/&gt;&lt;wsp:rsid wsp:val=&quot;00FB1048&quot;/&gt;&lt;wsp:rsid wsp:val=&quot;00FB62C4&quot;/&gt;&lt;wsp:rsid wsp:val=&quot;00FB7701&quot;/&gt;&lt;wsp:rsid wsp:val=&quot;00FD1AC5&quot;/&gt;&lt;wsp:rsid wsp:val=&quot;00FD5CF0&quot;/&gt;&lt;/wsp:rsids&gt;&lt;/w:docPr&gt;&lt;w:body&gt;&lt;wx:sect&gt;&lt;w:p wsp:rsidR=&quot;00412368&quot; wsp:rsidRPr=&quot;00412368&quot; wsp:rsidRDefault=&quot;00412368&quot; wsp:rsidP=&quot;00412368&quot;&gt;&lt;m:oMathPara&gt;&lt;m:oMath&gt;&lt;m:sSub&gt;&lt;m:sSubPr&gt;&lt;m:ctrlPr&gt;&lt;w:rPr&gt;&lt;w:rFonts w:ascii=&quot;Cambria Math&quot; w:h-ansi=&quot;Cambria Math&quot;/&gt;&lt;wx:font wx:val=&quot;Cambria Math&quot;/&gt;&lt;w:i/&gt;&lt;/w:rPr&gt;&lt;/m:ctrlPr&gt;&lt;/m:sSubPr&gt;&lt;m:e&gt;&lt;m:r&gt;&lt;w:rPr&gt;&lt;w:rFonts w:ascii=&quot;Cambria Math&quot; w:h-ansi=&quot;Cambria Math&quot;/&gt;&lt;wx:font wx:val=&quot;Cambria Math&quot;/&gt;&lt;w:i/&gt;&lt;/w:rPr&gt;&lt;m:t&gt;V&lt;/m:t&gt;&lt;/m:r&gt;&lt;/m:e&gt;&lt;m:sub&gt;&lt;m:r&gt;&lt;w:rPr&gt;&lt;w:rFonts w:ascii=&quot;Cambria Math&quot; w:h-ansi=&quot;Cambria Math&quot;/&gt;&lt;wx:font wx:val=&quot;Cambria Math&quot;/&gt;&lt;w:i/&gt;&lt;/w:rPr&gt;&lt;m:t&gt;in&lt;/m:t&gt;&lt;/m:r&gt;&lt;/m:sub&gt;&lt;/m:sSub&gt;&lt;/m:oMath&gt;&lt;/m:oMathPara&gt;&lt;/w:p&gt;&lt;w:sectPr wsp:rsidR=&quot;00000000&quot; wsp:rsidRPr=&quot;00412368&quot;&gt;&lt;w:pgSz w:w=&quot;12240&quot; w:h=&quot;15840&quot;/&gt;&lt;w:pgMar w:top=&quot;1440&quot; w:right=&quot;1440&quot; w:bottom=&quot;1440&quot; w:left=&quot;1440&quot; w:header=&quot;720&quot; w:footer=&quot;720&quot; w:gutter=&quot;0&quot;/&gt;&lt;w:cols w:space=&quot;720&quot;/&gt;&lt;/w:sectPr&gt;&lt;/wx:sect&gt;&lt;/w:body&gt;&lt;/w:wordDocument&gt;">
                   <v:imagedata r:id="rId13" o:title="" chromakey="white"/>
                 </v:shape>
               </w:pict>
@@ -2240,7 +2240,7 @@
         </w:tc>
         <w:tc>
           <w:tcPr>
-            <w:tcW w:w="942" w:type="dxa"/>
+            <w:tcW w:w="939" w:type="dxa"/>
             <w:shd w:val="clear" w:color="auto" w:fill="auto"/>
           </w:tcPr>
           <w:p>
@@ -2262,7 +2262,7 @@
         </w:tc>
         <w:tc>
           <w:tcPr>
-            <w:tcW w:w="774" w:type="dxa"/>
+            <w:tcW w:w="784" w:type="dxa"/>
             <w:shd w:val="clear" w:color="auto" w:fill="auto"/>
           </w:tcPr>
           <w:p>
@@ -2285,12 +2285,12 @@
       </w:tr>
       <w:tr>
         <w:trPr>
-          <w:trHeight w:val="269"/>
+          <w:trHeight w:val="260"/>
           <w:jc w:val="center"/>
         </w:trPr>
         <w:tc>
           <w:tcPr>
-            <w:tcW w:w="2336" w:type="dxa"/>
+            <w:tcW w:w="2329" w:type="dxa"/>
             <w:shd w:val="clear" w:color="auto" w:fill="D9D9D9"/>
           </w:tcPr>
           <w:p>
@@ -2311,7 +2311,7 @@
         </w:tc>
         <w:tc>
           <w:tcPr>
-            <w:tcW w:w="976" w:type="dxa"/>
+            <w:tcW w:w="973" w:type="dxa"/>
             <w:shd w:val="clear" w:color="auto" w:fill="D9D9D9"/>
           </w:tcPr>
           <w:p>
@@ -2328,7 +2328,7 @@
                 <w:szCs w:val="18"/>
               </w:rPr>
               <w:pict w14:anchorId="47C35544">
-                <v:shape id="_x0000_i1908" type="#_x0000_t75" style="width:21.25pt;height:13.65pt" equationxml="&lt;?xml version=&quot;1.0&quot; encoding=&quot;UTF-8&quot; standalone=&quot;yes&quot;?&gt;&#10;&lt;?mso-application progid=&quot;Word.Document&quot;?&gt;&#10;&lt;w:wordDocument xmlns:aml=&quot;http://schemas.microsoft.com/aml/2001/core&quot; xmlns:wpc=&quot;http://schemas.microsoft.com/office/word/2010/wordprocessingCanvas&quot; xmlns:cx=&quot;http://schemas.microsoft.com/office/drawing/2014/chartex&quot; xmlns:cx1=&quot;http://schemas.microsoft.com/office/drawing/2015/9/8/chartex&quot; xmlns:cx2=&quot;http://schemas.microsoft.com/office/drawing/2015/10/21/chartex&quot; xmlns:cx3=&quot;http://schemas.microsoft.com/office/drawing/2016/5/9/chartex&quot; xmlns:cx4=&quot;http://schemas.microsoft.com/office/drawing/2016/5/10/chartex&quot; xmlns:cx5=&quot;http://schemas.microsoft.com/office/drawing/2016/5/11/chartex&quot; xmlns:cx6=&quot;http://schemas.microsoft.com/office/drawing/2016/5/12/chartex&quot; xmlns:cx7=&quot;http://schemas.microsoft.com/office/drawing/2016/5/13/chartex&quot; xmlns:cx8=&quot;http://schemas.microsoft.com/office/drawing/2016/5/14/chartex&quot; xmlns:cr=&quot;http://schemas.microsoft.com/office/comments/2020/reactions&quot; xmlns:dt=&quot;uuid:C2F41010-65B3-11d1-A29F-00AA00C14882&quot; xmlns:mc=&quot;http://schemas.openxmlformats.org/markup-compatibility/2006&quot; xmlns:aink=&quot;http://schemas.microsoft.com/office/drawing/2016/ink&quot; xmlns:am3d=&quot;http://schemas.microsoft.com/office/drawing/2017/model3d&quot; xmlns:o=&quot;urn:schemas-microsoft-com:office:office&quot; xmlns:oel=&quot;http://schemas.microsoft.com/office/2019/extlst&quot; xmlns:m=&quot;http://schemas.openxmlformats.org/officeDocument/2006/math&quot; xmlns:v=&quot;urn:schemas-microsoft-com:vml&quot; xmlns:w10=&quot;urn:schemas-microsoft-com:office:word&quot; xmlns:w=&quot;http://schemas.microsoft.com/office/word/2003/wordml&quot; xmlns:wx=&quot;http://schemas.microsoft.com/office/word/2003/auxHint&quot; xmlns:wne=&quot;http://schemas.microsoft.com/office/word/2006/wordml&quot; xmlns:wsp=&quot;http://schemas.microsoft.com/office/word/2003/wordml/sp2&quot; xmlns:sl=&quot;http://schemas.microsoft.com/schemaLibrary/2003/core&quot; w:macrosPresent=&quot;no&quot; w:embeddedObjPresent=&quot;no&quot; w:ocxPresent=&quot;no&quot; xml:space=&quot;preserve&quot;&gt;&lt;w:ignoreSubtree w:val=&quot;http://schemas.microsoft.com/office/word/2003/wordml/sp2&quot;/&gt;&lt;o:DocumentProperties&gt;&lt;o:Version&gt;16&lt;/o:Version&gt;&lt;/o:DocumentProperties&gt;&lt;w:docPr&gt;&lt;w:view w:val=&quot;print&quot;/&gt;&lt;w:zoom w:percent=&quot;100&quot;/&gt;&lt;w:doNotEmbedSystemFonts/&gt;&lt;w:activeWritingStyle w:lang=&quot;EN-AU&quot; w:vendorID=&quot;64&quot; w:dllVersion=&quot;6&quot; w:nlCheck=&quot;on&quot; w:optionSet=&quot;1&quot;/&gt;&lt;w:activeWritingStyle w:lang=&quot;EN-GB&quot; w:vendorID=&quot;64&quot; w:dllVersion=&quot;6&quot; w:nlCheck=&quot;on&quot; w:optionSet=&quot;1&quot;/&gt;&lt;w:activeWritingStyle w:lang=&quot;EN-US&quot; w:vendorID=&quot;64&quot; w:dllVersion=&quot;6&quot; w:nlCheck=&quot;on&quot; w:optionSet=&quot;1&quot;/&gt;&lt;w:activeWritingStyle w:lang=&quot;EN-AU&quot; w:vendorID=&quot;64&quot; w:dllVersion=&quot;0&quot; w:nlCheck=&quot;on&quot; w:optionSet=&quot;0&quot;/&gt;&lt;w:activeWritingStyle w:lang=&quot;EN-GB&quot; w:vendorID=&quot;64&quot; w:dllVersion=&quot;0&quot; w:nlCheck=&quot;on&quot; w:optionSet=&quot;0&quot;/&gt;&lt;w:activeWritingStyle w:lang=&quot;EN-US&quot; w:vendorID=&quot;64&quot; w:dllVersion=&quot;0&quot; w:nlCheck=&quot;on&quot; w:optionSet=&quot;0&quot;/&gt;&lt;w:activeWritingStyle w:lang=&quot;ES-AR&quot; w:vendorID=&quot;64&quot; w:dllVersion=&quot;0&quot; w:nlCheck=&quot;on&quot; w:optionSet=&quot;0&quot;/&gt;&lt;w:activeWritingStyle w:lang=&quot;580A&quot; w:vendorID=&quot;64&quot; w:dllVersion=&quot;0&quot; w:nlCheck=&quot;on&quot; w:optionSet=&quot;0&quot;/&gt;&lt;w:activeWritingStyle w:lang=&quot;PT-BR&quot; w:vendorID=&quot;64&quot; w:dllVersion=&quot;0&quot; w:nlCheck=&quot;on&quot; w:optionSet=&quot;0&quot;/&gt;&lt;w:stylePaneFormatFilter w:val=&quot;3F01&quot;/&gt;&lt;w:defaultTabStop w:val=&quot;720&quot;/&gt;&lt;w:hyphenationZone w:val=&quot;425&quot;/&gt;&lt;w:characterSpacingControl w:val=&quot;DontCompress&quot;/&gt;&lt;w:optimizeForBrowser/&gt;&lt;w:validateAgainstSchema/&gt;&lt;w:saveInvalidXML w:val=&quot;off&quot;/&gt;&lt;w:ignoreMixedContent w:val=&quot;off&quot;/&gt;&lt;w:alwaysShowPlaceholderText w:val=&quot;off&quot;/&gt;&lt;w:compat&gt;&lt;w:breakWrappedTables/&gt;&lt;w:snapToGridInCell/&gt;&lt;w:applyBreakingRules/&gt;&lt;w:wrapTextWithPunct/&gt;&lt;w:useAsianBreakRules/&gt;&lt;w:useWord2002TableStyleRules/&gt;&lt;w:useFELayout/&gt;&lt;/w:compat&gt;&lt;wsp:rsids&gt;&lt;wsp:rsidRoot wsp:val=&quot;00426FBB&quot;/&gt;&lt;wsp:rsid wsp:val=&quot;000002E1&quot;/&gt;&lt;wsp:rsid wsp:val=&quot;00003C97&quot;/&gt;&lt;wsp:rsid wsp:val=&quot;00005565&quot;/&gt;&lt;wsp:rsid wsp:val=&quot;0001754A&quot;/&gt;&lt;wsp:rsid wsp:val=&quot;00017719&quot;/&gt;&lt;wsp:rsid wsp:val=&quot;00027F1D&quot;/&gt;&lt;wsp:rsid wsp:val=&quot;0003296C&quot;/&gt;&lt;wsp:rsid wsp:val=&quot;0003351F&quot;/&gt;&lt;wsp:rsid wsp:val=&quot;00044599&quot;/&gt;&lt;wsp:rsid wsp:val=&quot;000540E6&quot;/&gt;&lt;wsp:rsid wsp:val=&quot;00054421&quot;/&gt;&lt;wsp:rsid wsp:val=&quot;00062E46&quot;/&gt;&lt;wsp:rsid wsp:val=&quot;00074AC8&quot;/&gt;&lt;wsp:rsid wsp:val=&quot;00081408&quot;/&gt;&lt;wsp:rsid wsp:val=&quot;00081EBE&quot;/&gt;&lt;wsp:rsid wsp:val=&quot;00086EDC&quot;/&gt;&lt;wsp:rsid wsp:val=&quot;000B1236&quot;/&gt;&lt;wsp:rsid wsp:val=&quot;000B36A3&quot;/&gt;&lt;wsp:rsid wsp:val=&quot;000C013C&quot;/&gt;&lt;wsp:rsid wsp:val=&quot;000E3F84&quot;/&gt;&lt;wsp:rsid wsp:val=&quot;001056DF&quot;/&gt;&lt;wsp:rsid wsp:val=&quot;0010789C&quot;/&gt;&lt;wsp:rsid wsp:val=&quot;00114025&quot;/&gt;&lt;wsp:rsid wsp:val=&quot;001160D2&quot;/&gt;&lt;wsp:rsid wsp:val=&quot;00120636&quot;/&gt;&lt;wsp:rsid wsp:val=&quot;001348A5&quot;/&gt;&lt;wsp:rsid wsp:val=&quot;00151B8E&quot;/&gt;&lt;wsp:rsid wsp:val=&quot;00182170&quot;/&gt;&lt;wsp:rsid wsp:val=&quot;001928FB&quot;/&gt;&lt;wsp:rsid wsp:val=&quot;00192BC7&quot;/&gt;&lt;wsp:rsid wsp:val=&quot;00195BE6&quot;/&gt;&lt;wsp:rsid wsp:val=&quot;001A3C37&quot;/&gt;&lt;wsp:rsid wsp:val=&quot;001A50EA&quot;/&gt;&lt;wsp:rsid wsp:val=&quot;001F16CD&quot;/&gt;&lt;wsp:rsid wsp:val=&quot;001F47D2&quot;/&gt;&lt;wsp:rsid wsp:val=&quot;002029C8&quot;/&gt;&lt;wsp:rsid wsp:val=&quot;0022285A&quot;/&gt;&lt;wsp:rsid wsp:val=&quot;00224C61&quot;/&gt;&lt;wsp:rsid wsp:val=&quot;00256ABC&quot;/&gt;&lt;wsp:rsid wsp:val=&quot;0027227B&quot;/&gt;&lt;wsp:rsid wsp:val=&quot;00273AC7&quot;/&gt;&lt;wsp:rsid wsp:val=&quot;00273D2C&quot;/&gt;&lt;wsp:rsid wsp:val=&quot;00285ECD&quot;/&gt;&lt;wsp:rsid wsp:val=&quot;00290E1B&quot;/&gt;&lt;wsp:rsid wsp:val=&quot;00291B17&quot;/&gt;&lt;wsp:rsid wsp:val=&quot;00291BB3&quot;/&gt;&lt;wsp:rsid wsp:val=&quot;002A6742&quot;/&gt;&lt;wsp:rsid wsp:val=&quot;002C1A7F&quot;/&gt;&lt;wsp:rsid wsp:val=&quot;002C4239&quot;/&gt;&lt;wsp:rsid wsp:val=&quot;002C559D&quot;/&gt;&lt;wsp:rsid wsp:val=&quot;002D16AE&quot;/&gt;&lt;wsp:rsid wsp:val=&quot;002D2D42&quot;/&gt;&lt;wsp:rsid wsp:val=&quot;002F72D0&quot;/&gt;&lt;wsp:rsid wsp:val=&quot;002F7A4F&quot;/&gt;&lt;wsp:rsid wsp:val=&quot;003003AB&quot;/&gt;&lt;wsp:rsid wsp:val=&quot;00302C35&quot;/&gt;&lt;wsp:rsid wsp:val=&quot;00311C49&quot;/&gt;&lt;wsp:rsid wsp:val=&quot;0032119E&quot;/&gt;&lt;wsp:rsid wsp:val=&quot;00321304&quot;/&gt;&lt;wsp:rsid wsp:val=&quot;00324FC2&quot;/&gt;&lt;wsp:rsid wsp:val=&quot;003312CA&quot;/&gt;&lt;wsp:rsid wsp:val=&quot;00331F84&quot;/&gt;&lt;wsp:rsid wsp:val=&quot;0037721F&quot;/&gt;&lt;wsp:rsid wsp:val=&quot;003950A4&quot;/&gt;&lt;wsp:rsid wsp:val=&quot;003A1E7E&quot;/&gt;&lt;wsp:rsid wsp:val=&quot;003E2FDC&quot;/&gt;&lt;wsp:rsid wsp:val=&quot;003E3577&quot;/&gt;&lt;wsp:rsid wsp:val=&quot;003F3A61&quot;/&gt;&lt;wsp:rsid wsp:val=&quot;00410A5D&quot;/&gt;&lt;wsp:rsid wsp:val=&quot;00414909&quot;/&gt;&lt;wsp:rsid wsp:val=&quot;00416537&quot;/&gt;&lt;wsp:rsid wsp:val=&quot;00425A6A&quot;/&gt;&lt;wsp:rsid wsp:val=&quot;00426FBB&quot;/&gt;&lt;wsp:rsid wsp:val=&quot;00454542&quot;/&gt;&lt;wsp:rsid wsp:val=&quot;0047429A&quot;/&gt;&lt;wsp:rsid wsp:val=&quot;0048374C&quot;/&gt;&lt;wsp:rsid wsp:val=&quot;0048771D&quot;/&gt;&lt;wsp:rsid wsp:val=&quot;004A6605&quot;/&gt;&lt;wsp:rsid wsp:val=&quot;004C45FA&quot;/&gt;&lt;wsp:rsid wsp:val=&quot;004D35A3&quot;/&gt;&lt;wsp:rsid wsp:val=&quot;004E1BD8&quot;/&gt;&lt;wsp:rsid wsp:val=&quot;004E452A&quot;/&gt;&lt;wsp:rsid wsp:val=&quot;004E78E3&quot;/&gt;&lt;wsp:rsid wsp:val=&quot;004F2BFE&quot;/&gt;&lt;wsp:rsid wsp:val=&quot;004F63D3&quot;/&gt;&lt;wsp:rsid wsp:val=&quot;004F7DCF&quot;/&gt;&lt;wsp:rsid wsp:val=&quot;005004BF&quot;/&gt;&lt;wsp:rsid wsp:val=&quot;00502E89&quot;/&gt;&lt;wsp:rsid wsp:val=&quot;00506CFE&quot;/&gt;&lt;wsp:rsid wsp:val=&quot;00510E95&quot;/&gt;&lt;wsp:rsid wsp:val=&quot;005225C3&quot;/&gt;&lt;wsp:rsid wsp:val=&quot;00527D56&quot;/&gt;&lt;wsp:rsid wsp:val=&quot;0053221F&quot;/&gt;&lt;wsp:rsid wsp:val=&quot;00536FAE&quot;/&gt;&lt;wsp:rsid wsp:val=&quot;00542C85&quot;/&gt;&lt;wsp:rsid wsp:val=&quot;00553510&quot;/&gt;&lt;wsp:rsid wsp:val=&quot;00554186&quot;/&gt;&lt;wsp:rsid wsp:val=&quot;00585769&quot;/&gt;&lt;wsp:rsid wsp:val=&quot;00585C61&quot;/&gt;&lt;wsp:rsid wsp:val=&quot;00591130&quot;/&gt;&lt;wsp:rsid wsp:val=&quot;005A3F28&quot;/&gt;&lt;wsp:rsid wsp:val=&quot;005A40BE&quot;/&gt;&lt;wsp:rsid wsp:val=&quot;005B13E2&quot;/&gt;&lt;wsp:rsid wsp:val=&quot;005B47D7&quot;/&gt;&lt;wsp:rsid wsp:val=&quot;005C5526&quot;/&gt;&lt;wsp:rsid wsp:val=&quot;005C62C6&quot;/&gt;&lt;wsp:rsid wsp:val=&quot;005D7B9E&quot;/&gt;&lt;wsp:rsid wsp:val=&quot;005E112E&quot;/&gt;&lt;wsp:rsid wsp:val=&quot;005F0834&quot;/&gt;&lt;wsp:rsid wsp:val=&quot;005F68AB&quot;/&gt;&lt;wsp:rsid wsp:val=&quot;005F6DC3&quot;/&gt;&lt;wsp:rsid wsp:val=&quot;00601A8E&quot;/&gt;&lt;wsp:rsid wsp:val=&quot;0062033E&quot;/&gt;&lt;wsp:rsid wsp:val=&quot;00624482&quot;/&gt;&lt;wsp:rsid wsp:val=&quot;0064799C&quot;/&gt;&lt;wsp:rsid wsp:val=&quot;00654156&quot;/&gt;&lt;wsp:rsid wsp:val=&quot;00656ADC&quot;/&gt;&lt;wsp:rsid wsp:val=&quot;006B47CA&quot;/&gt;&lt;wsp:rsid wsp:val=&quot;006C304C&quot;/&gt;&lt;wsp:rsid wsp:val=&quot;006C4511&quot;/&gt;&lt;wsp:rsid wsp:val=&quot;006C65F5&quot;/&gt;&lt;wsp:rsid wsp:val=&quot;006C7AAA&quot;/&gt;&lt;wsp:rsid wsp:val=&quot;006D1C2A&quot;/&gt;&lt;wsp:rsid wsp:val=&quot;006D264F&quot;/&gt;&lt;wsp:rsid wsp:val=&quot;006D4E89&quot;/&gt;&lt;wsp:rsid wsp:val=&quot;006E2A8D&quot;/&gt;&lt;wsp:rsid wsp:val=&quot;006E7574&quot;/&gt;&lt;wsp:rsid wsp:val=&quot;00703430&quot;/&gt;&lt;wsp:rsid wsp:val=&quot;00703548&quot;/&gt;&lt;wsp:rsid wsp:val=&quot;00704E18&quot;/&gt;&lt;wsp:rsid wsp:val=&quot;007069BE&quot;/&gt;&lt;wsp:rsid wsp:val=&quot;00745C86&quot;/&gt;&lt;wsp:rsid wsp:val=&quot;00764603&quot;/&gt;&lt;wsp:rsid wsp:val=&quot;0076604D&quot;/&gt;&lt;wsp:rsid wsp:val=&quot;00790909&quot;/&gt;&lt;wsp:rsid wsp:val=&quot;007929AF&quot;/&gt;&lt;wsp:rsid wsp:val=&quot;007B1582&quot;/&gt;&lt;wsp:rsid wsp:val=&quot;007B5A07&quot;/&gt;&lt;wsp:rsid wsp:val=&quot;007C065D&quot;/&gt;&lt;wsp:rsid wsp:val=&quot;007D3E71&quot;/&gt;&lt;wsp:rsid wsp:val=&quot;007E5D6A&quot;/&gt;&lt;wsp:rsid wsp:val=&quot;007E645D&quot;/&gt;&lt;wsp:rsid wsp:val=&quot;007F75CA&quot;/&gt;&lt;wsp:rsid wsp:val=&quot;00821E08&quot;/&gt;&lt;wsp:rsid wsp:val=&quot;00834EFD&quot;/&gt;&lt;wsp:rsid wsp:val=&quot;00844B24&quot;/&gt;&lt;wsp:rsid wsp:val=&quot;0084515F&quot;/&gt;&lt;wsp:rsid wsp:val=&quot;0085092D&quot;/&gt;&lt;wsp:rsid wsp:val=&quot;00865414&quot;/&gt;&lt;wsp:rsid wsp:val=&quot;00877D4C&quot;/&gt;&lt;wsp:rsid wsp:val=&quot;00883903&quot;/&gt;&lt;wsp:rsid wsp:val=&quot;00891C30&quot;/&gt;&lt;wsp:rsid wsp:val=&quot;0089763B&quot;/&gt;&lt;wsp:rsid wsp:val=&quot;008B6AE3&quot;/&gt;&lt;wsp:rsid wsp:val=&quot;008C1332&quot;/&gt;&lt;wsp:rsid wsp:val=&quot;008D1045&quot;/&gt;&lt;wsp:rsid wsp:val=&quot;008E5996&quot;/&gt;&lt;wsp:rsid wsp:val=&quot;00901AE1&quot;/&gt;&lt;wsp:rsid wsp:val=&quot;00912F93&quot;/&gt;&lt;wsp:rsid wsp:val=&quot;009205B4&quot;/&gt;&lt;wsp:rsid wsp:val=&quot;00955B59&quot;/&gt;&lt;wsp:rsid wsp:val=&quot;00992262&quot;/&gt;&lt;wsp:rsid wsp:val=&quot;009926BC&quot;/&gt;&lt;wsp:rsid wsp:val=&quot;009A4319&quot;/&gt;&lt;wsp:rsid wsp:val=&quot;009A6C3F&quot;/&gt;&lt;wsp:rsid wsp:val=&quot;009B73F2&quot;/&gt;&lt;wsp:rsid wsp:val=&quot;009C12BD&quot;/&gt;&lt;wsp:rsid wsp:val=&quot;009C50FE&quot;/&gt;&lt;wsp:rsid wsp:val=&quot;009E49DD&quot;/&gt;&lt;wsp:rsid wsp:val=&quot;00A03E75&quot;/&gt;&lt;wsp:rsid wsp:val=&quot;00A20627&quot;/&gt;&lt;wsp:rsid wsp:val=&quot;00A22FE9&quot;/&gt;&lt;wsp:rsid wsp:val=&quot;00A31A44&quot;/&gt;&lt;wsp:rsid wsp:val=&quot;00A32BFA&quot;/&gt;&lt;wsp:rsid wsp:val=&quot;00A3325E&quot;/&gt;&lt;wsp:rsid wsp:val=&quot;00A45FCE&quot;/&gt;&lt;wsp:rsid wsp:val=&quot;00A6001D&quot;/&gt;&lt;wsp:rsid wsp:val=&quot;00A75671&quot;/&gt;&lt;wsp:rsid wsp:val=&quot;00A773CC&quot;/&gt;&lt;wsp:rsid wsp:val=&quot;00A924D0&quot;/&gt;&lt;wsp:rsid wsp:val=&quot;00A9318B&quot;/&gt;&lt;wsp:rsid wsp:val=&quot;00A94AC1&quot;/&gt;&lt;wsp:rsid wsp:val=&quot;00AB18B7&quot;/&gt;&lt;wsp:rsid wsp:val=&quot;00AD335D&quot;/&gt;&lt;wsp:rsid wsp:val=&quot;00AF114C&quot;/&gt;&lt;wsp:rsid wsp:val=&quot;00AF792B&quot;/&gt;&lt;wsp:rsid wsp:val=&quot;00B32137&quot;/&gt;&lt;wsp:rsid wsp:val=&quot;00B33D2F&quot;/&gt;&lt;wsp:rsid wsp:val=&quot;00B40A5B&quot;/&gt;&lt;wsp:rsid wsp:val=&quot;00B45C6B&quot;/&gt;&lt;wsp:rsid wsp:val=&quot;00B55D5E&quot;/&gt;&lt;wsp:rsid wsp:val=&quot;00B57A80&quot;/&gt;&lt;wsp:rsid wsp:val=&quot;00B70E9C&quot;/&gt;&lt;wsp:rsid wsp:val=&quot;00B713D8&quot;/&gt;&lt;wsp:rsid wsp:val=&quot;00B72979&quot;/&gt;&lt;wsp:rsid wsp:val=&quot;00B94516&quot;/&gt;&lt;wsp:rsid wsp:val=&quot;00BA25E2&quot;/&gt;&lt;wsp:rsid wsp:val=&quot;00BB2855&quot;/&gt;&lt;wsp:rsid wsp:val=&quot;00BC5343&quot;/&gt;&lt;wsp:rsid wsp:val=&quot;00BD19C1&quot;/&gt;&lt;wsp:rsid wsp:val=&quot;00BD25B8&quot;/&gt;&lt;wsp:rsid wsp:val=&quot;00C012E1&quot;/&gt;&lt;wsp:rsid wsp:val=&quot;00C06BB4&quot;/&gt;&lt;wsp:rsid wsp:val=&quot;00C10D20&quot;/&gt;&lt;wsp:rsid wsp:val=&quot;00C12E0C&quot;/&gt;&lt;wsp:rsid wsp:val=&quot;00C21916&quot;/&gt;&lt;wsp:rsid wsp:val=&quot;00C34915&quot;/&gt;&lt;wsp:rsid wsp:val=&quot;00C457CA&quot;/&gt;&lt;wsp:rsid wsp:val=&quot;00C53FB6&quot;/&gt;&lt;wsp:rsid wsp:val=&quot;00C57FB7&quot;/&gt;&lt;wsp:rsid wsp:val=&quot;00C644D4&quot;/&gt;&lt;wsp:rsid wsp:val=&quot;00C65F3F&quot;/&gt;&lt;wsp:rsid wsp:val=&quot;00C72414&quot;/&gt;&lt;wsp:rsid wsp:val=&quot;00C72B1A&quot;/&gt;&lt;wsp:rsid wsp:val=&quot;00C8667B&quot;/&gt;&lt;wsp:rsid wsp:val=&quot;00C90993&quot;/&gt;&lt;wsp:rsid wsp:val=&quot;00CA4CE3&quot;/&gt;&lt;wsp:rsid wsp:val=&quot;00CC72FD&quot;/&gt;&lt;wsp:rsid wsp:val=&quot;00CD1D23&quot;/&gt;&lt;wsp:rsid wsp:val=&quot;00CD4F3F&quot;/&gt;&lt;wsp:rsid wsp:val=&quot;00D311F8&quot;/&gt;&lt;wsp:rsid wsp:val=&quot;00D31660&quot;/&gt;&lt;wsp:rsid wsp:val=&quot;00D36B52&quot;/&gt;&lt;wsp:rsid wsp:val=&quot;00D377C8&quot;/&gt;&lt;wsp:rsid wsp:val=&quot;00D41274&quot;/&gt;&lt;wsp:rsid wsp:val=&quot;00D4229C&quot;/&gt;&lt;wsp:rsid wsp:val=&quot;00D43BF3&quot;/&gt;&lt;wsp:rsid wsp:val=&quot;00D549FB&quot;/&gt;&lt;wsp:rsid wsp:val=&quot;00D56487&quot;/&gt;&lt;wsp:rsid wsp:val=&quot;00D767BB&quot;/&gt;&lt;wsp:rsid wsp:val=&quot;00D939B0&quot;/&gt;&lt;wsp:rsid wsp:val=&quot;00DA31A2&quot;/&gt;&lt;wsp:rsid wsp:val=&quot;00DB16E0&quot;/&gt;&lt;wsp:rsid wsp:val=&quot;00DB2DF9&quot;/&gt;&lt;wsp:rsid wsp:val=&quot;00DB465D&quot;/&gt;&lt;wsp:rsid wsp:val=&quot;00DB48A2&quot;/&gt;&lt;wsp:rsid wsp:val=&quot;00DB7E63&quot;/&gt;&lt;wsp:rsid wsp:val=&quot;00DC2055&quot;/&gt;&lt;wsp:rsid wsp:val=&quot;00DC3908&quot;/&gt;&lt;wsp:rsid wsp:val=&quot;00DD71E8&quot;/&gt;&lt;wsp:rsid wsp:val=&quot;00DD7F83&quot;/&gt;&lt;wsp:rsid wsp:val=&quot;00DE4EB8&quot;/&gt;&lt;wsp:rsid wsp:val=&quot;00E0641E&quot;/&gt;&lt;wsp:rsid wsp:val=&quot;00E06664&quot;/&gt;&lt;wsp:rsid wsp:val=&quot;00E304BC&quot;/&gt;&lt;wsp:rsid wsp:val=&quot;00E32853&quot;/&gt;&lt;wsp:rsid wsp:val=&quot;00E34EBD&quot;/&gt;&lt;wsp:rsid wsp:val=&quot;00E401F8&quot;/&gt;&lt;wsp:rsid wsp:val=&quot;00E46425&quot;/&gt;&lt;wsp:rsid wsp:val=&quot;00E469FC&quot;/&gt;&lt;wsp:rsid wsp:val=&quot;00E47D0E&quot;/&gt;&lt;wsp:rsid wsp:val=&quot;00E65018&quot;/&gt;&lt;wsp:rsid wsp:val=&quot;00E76CA1&quot;/&gt;&lt;wsp:rsid wsp:val=&quot;00E94339&quot;/&gt;&lt;wsp:rsid wsp:val=&quot;00E97563&quot;/&gt;&lt;wsp:rsid wsp:val=&quot;00EB0B63&quot;/&gt;&lt;wsp:rsid wsp:val=&quot;00EC265C&quot;/&gt;&lt;wsp:rsid wsp:val=&quot;00ED61CB&quot;/&gt;&lt;wsp:rsid wsp:val=&quot;00EE752A&quot;/&gt;&lt;wsp:rsid wsp:val=&quot;00F06A72&quot;/&gt;&lt;wsp:rsid wsp:val=&quot;00F136F0&quot;/&gt;&lt;wsp:rsid wsp:val=&quot;00F20BBB&quot;/&gt;&lt;wsp:rsid wsp:val=&quot;00F36048&quot;/&gt;&lt;wsp:rsid wsp:val=&quot;00F43BD8&quot;/&gt;&lt;wsp:rsid wsp:val=&quot;00F562F3&quot;/&gt;&lt;wsp:rsid wsp:val=&quot;00F74B89&quot;/&gt;&lt;wsp:rsid wsp:val=&quot;00F75133&quot;/&gt;&lt;wsp:rsid wsp:val=&quot;00F83272&quot;/&gt;&lt;wsp:rsid wsp:val=&quot;00F9358D&quot;/&gt;&lt;wsp:rsid wsp:val=&quot;00F9369B&quot;/&gt;&lt;wsp:rsid wsp:val=&quot;00FA3899&quot;/&gt;&lt;wsp:rsid wsp:val=&quot;00FA4909&quot;/&gt;&lt;wsp:rsid wsp:val=&quot;00FA5164&quot;/&gt;&lt;wsp:rsid wsp:val=&quot;00FA6751&quot;/&gt;&lt;wsp:rsid wsp:val=&quot;00FA6BD7&quot;/&gt;&lt;wsp:rsid wsp:val=&quot;00FB1048&quot;/&gt;&lt;wsp:rsid wsp:val=&quot;00FB62C4&quot;/&gt;&lt;wsp:rsid wsp:val=&quot;00FB7701&quot;/&gt;&lt;wsp:rsid wsp:val=&quot;00FD1AC5&quot;/&gt;&lt;wsp:rsid wsp:val=&quot;00FD5CF0&quot;/&gt;&lt;/wsp:rsids&gt;&lt;/w:docPr&gt;&lt;w:body&gt;&lt;wx:sect&gt;&lt;w:p wsp:rsidR=&quot;00A6001D&quot; wsp:rsidRPr=&quot;00A6001D&quot; wsp:rsidRDefault=&quot;00A6001D&quot; wsp:rsidP=&quot;00A6001D&quot;&gt;&lt;m:oMathPara&gt;&lt;m:oMath&gt;&lt;m:sSub&gt;&lt;m:sSubPr&gt;&lt;m:ctrlPr&gt;&lt;w:rPr&gt;&lt;w:rFonts w:ascii=&quot;Cambria Math&quot; w:h-ansi=&quot;Cambria Math&quot;/&gt;&lt;wx:font wx:val=&quot;Cambria Math&quot;/&gt;&lt;w:i/&gt;&lt;/w:rPr&gt;&lt;/m:ctrlPr&gt;&lt;/m:sSubPr&gt;&lt;m:e&gt;&lt;m:r&gt;&lt;w:rPr&gt;&lt;w:rFonts w:ascii=&quot;Cambria Math&quot; w:h-ansi=&quot;Cambria Math&quot;/&gt;&lt;wx:font wx:val=&quot;Cambria Math&quot;/&gt;&lt;w:i/&gt;&lt;/w:rPr&gt;&lt;m:t&gt;V&lt;/m:t&gt;&lt;/m:r&gt;&lt;/m:e&gt;&lt;m:sub&gt;&lt;m:r&gt;&lt;w:rPr&gt;&lt;w:rFonts w:ascii=&quot;Cambria Math&quot; w:h-ansi=&quot;Cambria Math&quot;/&gt;&lt;wx:font wx:val=&quot;Cambria Math&quot;/&gt;&lt;w:i/&gt;&lt;/w:rPr&gt;&lt;m:t&gt;out&lt;/m:t&gt;&lt;/m:r&gt;&lt;/m:sub&gt;&lt;/m:sSub&gt;&lt;/m:oMath&gt;&lt;/m:oMathPara&gt;&lt;/w:p&gt;&lt;w:sectPr wsp:rsidR=&quot;00000000&quot; wsp:rsidRPr=&quot;00A6001D&quot;&gt;&lt;w:pgSz w:w=&quot;12240&quot; w:h=&quot;15840&quot;/&gt;&lt;w:pgMar w:top=&quot;1440&quot; w:right=&quot;1440&quot; w:bottom=&quot;1440&quot; w:left=&quot;1440&quot; w:header=&quot;720&quot; w:footer=&quot;720&quot; w:gutter=&quot;0&quot;/&gt;&lt;w:cols w:space=&quot;720&quot;/&gt;&lt;/w:sectPr&gt;&lt;/wx:sect&gt;&lt;/w:body&gt;&lt;/w:wordDocument&gt;">
+                <v:shape id="_x0000_i1049" type="#_x0000_t75" style="width:21.45pt;height:13.85pt" equationxml="&lt;?xml version=&quot;1.0&quot; encoding=&quot;UTF-8&quot; standalone=&quot;yes&quot;?&gt;&#10;&lt;?mso-application progid=&quot;Word.Document&quot;?&gt;&#10;&lt;w:wordDocument xmlns:aml=&quot;http://schemas.microsoft.com/aml/2001/core&quot; xmlns:wpc=&quot;http://schemas.microsoft.com/office/word/2010/wordprocessingCanvas&quot; xmlns:cx=&quot;http://schemas.microsoft.com/office/drawing/2014/chartex&quot; xmlns:cx1=&quot;http://schemas.microsoft.com/office/drawing/2015/9/8/chartex&quot; xmlns:cx2=&quot;http://schemas.microsoft.com/office/drawing/2015/10/21/chartex&quot; xmlns:cx3=&quot;http://schemas.microsoft.com/office/drawing/2016/5/9/chartex&quot; xmlns:cx4=&quot;http://schemas.microsoft.com/office/drawing/2016/5/10/chartex&quot; xmlns:cx5=&quot;http://schemas.microsoft.com/office/drawing/2016/5/11/chartex&quot; xmlns:cx6=&quot;http://schemas.microsoft.com/office/drawing/2016/5/12/chartex&quot; xmlns:cx7=&quot;http://schemas.microsoft.com/office/drawing/2016/5/13/chartex&quot; xmlns:cx8=&quot;http://schemas.microsoft.com/office/drawing/2016/5/14/chartex&quot; xmlns:cr=&quot;http://schemas.microsoft.com/office/comments/2020/reactions&quot; xmlns:dt=&quot;uuid:C2F41010-65B3-11d1-A29F-00AA00C14882&quot; xmlns:mc=&quot;http://schemas.openxmlformats.org/markup-compatibility/2006&quot; xmlns:aink=&quot;http://schemas.microsoft.com/office/drawing/2016/ink&quot; xmlns:am3d=&quot;http://schemas.microsoft.com/office/drawing/2017/model3d&quot; xmlns:o=&quot;urn:schemas-microsoft-com:office:office&quot; xmlns:oel=&quot;http://schemas.microsoft.com/office/2019/extlst&quot; xmlns:m=&quot;http://schemas.openxmlformats.org/officeDocument/2006/math&quot; xmlns:v=&quot;urn:schemas-microsoft-com:vml&quot; xmlns:w10=&quot;urn:schemas-microsoft-com:office:word&quot; xmlns:w=&quot;http://schemas.microsoft.com/office/word/2003/wordml&quot; xmlns:wx=&quot;http://schemas.microsoft.com/office/word/2003/auxHint&quot; xmlns:wne=&quot;http://schemas.microsoft.com/office/word/2006/wordml&quot; xmlns:wsp=&quot;http://schemas.microsoft.com/office/word/2003/wordml/sp2&quot; xmlns:sl=&quot;http://schemas.microsoft.com/schemaLibrary/2003/core&quot; w:macrosPresent=&quot;no&quot; w:embeddedObjPresent=&quot;no&quot; w:ocxPresent=&quot;no&quot; xml:space=&quot;preserve&quot;&gt;&lt;w:ignoreSubtree w:val=&quot;http://schemas.microsoft.com/office/word/2003/wordml/sp2&quot;/&gt;&lt;o:DocumentProperties&gt;&lt;o:Version&gt;16&lt;/o:Version&gt;&lt;/o:DocumentProperties&gt;&lt;w:docPr&gt;&lt;w:view w:val=&quot;print&quot;/&gt;&lt;w:zoom w:percent=&quot;100&quot;/&gt;&lt;w:doNotEmbedSystemFonts/&gt;&lt;w:activeWritingStyle w:lang=&quot;EN-AU&quot; w:vendorID=&quot;64&quot; w:dllVersion=&quot;6&quot; w:nlCheck=&quot;on&quot; w:optionSet=&quot;1&quot;/&gt;&lt;w:activeWritingStyle w:lang=&quot;EN-GB&quot; w:vendorID=&quot;64&quot; w:dllVersion=&quot;6&quot; w:nlCheck=&quot;on&quot; w:optionSet=&quot;1&quot;/&gt;&lt;w:activeWritingStyle w:lang=&quot;EN-US&quot; w:vendorID=&quot;64&quot; w:dllVersion=&quot;6&quot; w:nlCheck=&quot;on&quot; w:optionSet=&quot;1&quot;/&gt;&lt;w:activeWritingStyle w:lang=&quot;EN-AU&quot; w:vendorID=&quot;64&quot; w:dllVersion=&quot;0&quot; w:nlCheck=&quot;on&quot; w:optionSet=&quot;0&quot;/&gt;&lt;w:activeWritingStyle w:lang=&quot;EN-GB&quot; w:vendorID=&quot;64&quot; w:dllVersion=&quot;0&quot; w:nlCheck=&quot;on&quot; w:optionSet=&quot;0&quot;/&gt;&lt;w:activeWritingStyle w:lang=&quot;EN-US&quot; w:vendorID=&quot;64&quot; w:dllVersion=&quot;0&quot; w:nlCheck=&quot;on&quot; w:optionSet=&quot;0&quot;/&gt;&lt;w:activeWritingStyle w:lang=&quot;ES-AR&quot; w:vendorID=&quot;64&quot; w:dllVersion=&quot;0&quot; w:nlCheck=&quot;on&quot; w:optionSet=&quot;0&quot;/&gt;&lt;w:activeWritingStyle w:lang=&quot;580A&quot; w:vendorID=&quot;64&quot; w:dllVersion=&quot;0&quot; w:nlCheck=&quot;on&quot; w:optionSet=&quot;0&quot;/&gt;&lt;w:activeWritingStyle w:lang=&quot;PT-BR&quot; w:vendorID=&quot;64&quot; w:dllVersion=&quot;0&quot; w:nlCheck=&quot;on&quot; w:optionSet=&quot;0&quot;/&gt;&lt;w:stylePaneFormatFilter w:val=&quot;3F01&quot;/&gt;&lt;w:defaultTabStop w:val=&quot;720&quot;/&gt;&lt;w:hyphenationZone w:val=&quot;425&quot;/&gt;&lt;w:characterSpacingControl w:val=&quot;DontCompress&quot;/&gt;&lt;w:optimizeForBrowser/&gt;&lt;w:validateAgainstSchema/&gt;&lt;w:saveInvalidXML w:val=&quot;off&quot;/&gt;&lt;w:ignoreMixedContent w:val=&quot;off&quot;/&gt;&lt;w:alwaysShowPlaceholderText w:val=&quot;off&quot;/&gt;&lt;w:compat&gt;&lt;w:breakWrappedTables/&gt;&lt;w:snapToGridInCell/&gt;&lt;w:applyBreakingRules/&gt;&lt;w:wrapTextWithPunct/&gt;&lt;w:useAsianBreakRules/&gt;&lt;w:useWord2002TableStyleRules/&gt;&lt;w:useFELayout/&gt;&lt;/w:compat&gt;&lt;wsp:rsids&gt;&lt;wsp:rsidRoot wsp:val=&quot;00426FBB&quot;/&gt;&lt;wsp:rsid wsp:val=&quot;000002E1&quot;/&gt;&lt;wsp:rsid wsp:val=&quot;00003C97&quot;/&gt;&lt;wsp:rsid wsp:val=&quot;00005565&quot;/&gt;&lt;wsp:rsid wsp:val=&quot;0001754A&quot;/&gt;&lt;wsp:rsid wsp:val=&quot;00017719&quot;/&gt;&lt;wsp:rsid wsp:val=&quot;00027F1D&quot;/&gt;&lt;wsp:rsid wsp:val=&quot;0003296C&quot;/&gt;&lt;wsp:rsid wsp:val=&quot;0003351F&quot;/&gt;&lt;wsp:rsid wsp:val=&quot;00044599&quot;/&gt;&lt;wsp:rsid wsp:val=&quot;000540E6&quot;/&gt;&lt;wsp:rsid wsp:val=&quot;00054421&quot;/&gt;&lt;wsp:rsid wsp:val=&quot;00062E46&quot;/&gt;&lt;wsp:rsid wsp:val=&quot;00074AC8&quot;/&gt;&lt;wsp:rsid wsp:val=&quot;00081408&quot;/&gt;&lt;wsp:rsid wsp:val=&quot;00081EBE&quot;/&gt;&lt;wsp:rsid wsp:val=&quot;00086EDC&quot;/&gt;&lt;wsp:rsid wsp:val=&quot;000B1236&quot;/&gt;&lt;wsp:rsid wsp:val=&quot;000B36A3&quot;/&gt;&lt;wsp:rsid wsp:val=&quot;000C013C&quot;/&gt;&lt;wsp:rsid wsp:val=&quot;000E3F84&quot;/&gt;&lt;wsp:rsid wsp:val=&quot;001056DF&quot;/&gt;&lt;wsp:rsid wsp:val=&quot;0010789C&quot;/&gt;&lt;wsp:rsid wsp:val=&quot;00114025&quot;/&gt;&lt;wsp:rsid wsp:val=&quot;001160D2&quot;/&gt;&lt;wsp:rsid wsp:val=&quot;00120636&quot;/&gt;&lt;wsp:rsid wsp:val=&quot;001348A5&quot;/&gt;&lt;wsp:rsid wsp:val=&quot;00151B8E&quot;/&gt;&lt;wsp:rsid wsp:val=&quot;00182170&quot;/&gt;&lt;wsp:rsid wsp:val=&quot;001928FB&quot;/&gt;&lt;wsp:rsid wsp:val=&quot;00192BC7&quot;/&gt;&lt;wsp:rsid wsp:val=&quot;00195BE6&quot;/&gt;&lt;wsp:rsid wsp:val=&quot;001A3C37&quot;/&gt;&lt;wsp:rsid wsp:val=&quot;001A50EA&quot;/&gt;&lt;wsp:rsid wsp:val=&quot;001F16CD&quot;/&gt;&lt;wsp:rsid wsp:val=&quot;001F47D2&quot;/&gt;&lt;wsp:rsid wsp:val=&quot;002029C8&quot;/&gt;&lt;wsp:rsid wsp:val=&quot;0022285A&quot;/&gt;&lt;wsp:rsid wsp:val=&quot;00224C61&quot;/&gt;&lt;wsp:rsid wsp:val=&quot;00256ABC&quot;/&gt;&lt;wsp:rsid wsp:val=&quot;0027227B&quot;/&gt;&lt;wsp:rsid wsp:val=&quot;00273AC7&quot;/&gt;&lt;wsp:rsid wsp:val=&quot;00273D2C&quot;/&gt;&lt;wsp:rsid wsp:val=&quot;00285ECD&quot;/&gt;&lt;wsp:rsid wsp:val=&quot;00290E1B&quot;/&gt;&lt;wsp:rsid wsp:val=&quot;00291B17&quot;/&gt;&lt;wsp:rsid wsp:val=&quot;00291BB3&quot;/&gt;&lt;wsp:rsid wsp:val=&quot;002A6742&quot;/&gt;&lt;wsp:rsid wsp:val=&quot;002C1A7F&quot;/&gt;&lt;wsp:rsid wsp:val=&quot;002C4239&quot;/&gt;&lt;wsp:rsid wsp:val=&quot;002C559D&quot;/&gt;&lt;wsp:rsid wsp:val=&quot;002D16AE&quot;/&gt;&lt;wsp:rsid wsp:val=&quot;002D2D42&quot;/&gt;&lt;wsp:rsid wsp:val=&quot;002F72D0&quot;/&gt;&lt;wsp:rsid wsp:val=&quot;002F7A4F&quot;/&gt;&lt;wsp:rsid wsp:val=&quot;003003AB&quot;/&gt;&lt;wsp:rsid wsp:val=&quot;00302C35&quot;/&gt;&lt;wsp:rsid wsp:val=&quot;00311C49&quot;/&gt;&lt;wsp:rsid wsp:val=&quot;0032119E&quot;/&gt;&lt;wsp:rsid wsp:val=&quot;00321304&quot;/&gt;&lt;wsp:rsid wsp:val=&quot;00324FC2&quot;/&gt;&lt;wsp:rsid wsp:val=&quot;003312CA&quot;/&gt;&lt;wsp:rsid wsp:val=&quot;00331F84&quot;/&gt;&lt;wsp:rsid wsp:val=&quot;0037721F&quot;/&gt;&lt;wsp:rsid wsp:val=&quot;003950A4&quot;/&gt;&lt;wsp:rsid wsp:val=&quot;003A1E7E&quot;/&gt;&lt;wsp:rsid wsp:val=&quot;003E2FDC&quot;/&gt;&lt;wsp:rsid wsp:val=&quot;003E3577&quot;/&gt;&lt;wsp:rsid wsp:val=&quot;003F3A61&quot;/&gt;&lt;wsp:rsid wsp:val=&quot;00410A5D&quot;/&gt;&lt;wsp:rsid wsp:val=&quot;00414909&quot;/&gt;&lt;wsp:rsid wsp:val=&quot;00416537&quot;/&gt;&lt;wsp:rsid wsp:val=&quot;00425A6A&quot;/&gt;&lt;wsp:rsid wsp:val=&quot;00426FBB&quot;/&gt;&lt;wsp:rsid wsp:val=&quot;00454542&quot;/&gt;&lt;wsp:rsid wsp:val=&quot;0047429A&quot;/&gt;&lt;wsp:rsid wsp:val=&quot;0048374C&quot;/&gt;&lt;wsp:rsid wsp:val=&quot;0048771D&quot;/&gt;&lt;wsp:rsid wsp:val=&quot;004A6605&quot;/&gt;&lt;wsp:rsid wsp:val=&quot;004C45FA&quot;/&gt;&lt;wsp:rsid wsp:val=&quot;004D35A3&quot;/&gt;&lt;wsp:rsid wsp:val=&quot;004E1BD8&quot;/&gt;&lt;wsp:rsid wsp:val=&quot;004E452A&quot;/&gt;&lt;wsp:rsid wsp:val=&quot;004E78E3&quot;/&gt;&lt;wsp:rsid wsp:val=&quot;004F2BFE&quot;/&gt;&lt;wsp:rsid wsp:val=&quot;004F63D3&quot;/&gt;&lt;wsp:rsid wsp:val=&quot;004F7DCF&quot;/&gt;&lt;wsp:rsid wsp:val=&quot;005004BF&quot;/&gt;&lt;wsp:rsid wsp:val=&quot;00502E89&quot;/&gt;&lt;wsp:rsid wsp:val=&quot;00506CFE&quot;/&gt;&lt;wsp:rsid wsp:val=&quot;00510E95&quot;/&gt;&lt;wsp:rsid wsp:val=&quot;005225C3&quot;/&gt;&lt;wsp:rsid wsp:val=&quot;00527D56&quot;/&gt;&lt;wsp:rsid wsp:val=&quot;0053221F&quot;/&gt;&lt;wsp:rsid wsp:val=&quot;00536FAE&quot;/&gt;&lt;wsp:rsid wsp:val=&quot;00542C85&quot;/&gt;&lt;wsp:rsid wsp:val=&quot;00553510&quot;/&gt;&lt;wsp:rsid wsp:val=&quot;00554186&quot;/&gt;&lt;wsp:rsid wsp:val=&quot;00585769&quot;/&gt;&lt;wsp:rsid wsp:val=&quot;00585C61&quot;/&gt;&lt;wsp:rsid wsp:val=&quot;00591130&quot;/&gt;&lt;wsp:rsid wsp:val=&quot;005A3F28&quot;/&gt;&lt;wsp:rsid wsp:val=&quot;005A40BE&quot;/&gt;&lt;wsp:rsid wsp:val=&quot;005B13E2&quot;/&gt;&lt;wsp:rsid wsp:val=&quot;005B47D7&quot;/&gt;&lt;wsp:rsid wsp:val=&quot;005C5526&quot;/&gt;&lt;wsp:rsid wsp:val=&quot;005C62C6&quot;/&gt;&lt;wsp:rsid wsp:val=&quot;005D7B9E&quot;/&gt;&lt;wsp:rsid wsp:val=&quot;005E112E&quot;/&gt;&lt;wsp:rsid wsp:val=&quot;005F0834&quot;/&gt;&lt;wsp:rsid wsp:val=&quot;005F68AB&quot;/&gt;&lt;wsp:rsid wsp:val=&quot;005F6DC3&quot;/&gt;&lt;wsp:rsid wsp:val=&quot;00601A8E&quot;/&gt;&lt;wsp:rsid wsp:val=&quot;0062033E&quot;/&gt;&lt;wsp:rsid wsp:val=&quot;00624482&quot;/&gt;&lt;wsp:rsid wsp:val=&quot;0064799C&quot;/&gt;&lt;wsp:rsid wsp:val=&quot;00654156&quot;/&gt;&lt;wsp:rsid wsp:val=&quot;00656ADC&quot;/&gt;&lt;wsp:rsid wsp:val=&quot;006B47CA&quot;/&gt;&lt;wsp:rsid wsp:val=&quot;006C304C&quot;/&gt;&lt;wsp:rsid wsp:val=&quot;006C4511&quot;/&gt;&lt;wsp:rsid wsp:val=&quot;006C65F5&quot;/&gt;&lt;wsp:rsid wsp:val=&quot;006C7AAA&quot;/&gt;&lt;wsp:rsid wsp:val=&quot;006D1C2A&quot;/&gt;&lt;wsp:rsid wsp:val=&quot;006D264F&quot;/&gt;&lt;wsp:rsid wsp:val=&quot;006D4E89&quot;/&gt;&lt;wsp:rsid wsp:val=&quot;006E2A8D&quot;/&gt;&lt;wsp:rsid wsp:val=&quot;006E7574&quot;/&gt;&lt;wsp:rsid wsp:val=&quot;00703430&quot;/&gt;&lt;wsp:rsid wsp:val=&quot;00703548&quot;/&gt;&lt;wsp:rsid wsp:val=&quot;00704E18&quot;/&gt;&lt;wsp:rsid wsp:val=&quot;007069BE&quot;/&gt;&lt;wsp:rsid wsp:val=&quot;00745C86&quot;/&gt;&lt;wsp:rsid wsp:val=&quot;00764603&quot;/&gt;&lt;wsp:rsid wsp:val=&quot;0076604D&quot;/&gt;&lt;wsp:rsid wsp:val=&quot;00790909&quot;/&gt;&lt;wsp:rsid wsp:val=&quot;007929AF&quot;/&gt;&lt;wsp:rsid wsp:val=&quot;007B1582&quot;/&gt;&lt;wsp:rsid wsp:val=&quot;007B5A07&quot;/&gt;&lt;wsp:rsid wsp:val=&quot;007C065D&quot;/&gt;&lt;wsp:rsid wsp:val=&quot;007D3E71&quot;/&gt;&lt;wsp:rsid wsp:val=&quot;007E5D6A&quot;/&gt;&lt;wsp:rsid wsp:val=&quot;007E645D&quot;/&gt;&lt;wsp:rsid wsp:val=&quot;007F75CA&quot;/&gt;&lt;wsp:rsid wsp:val=&quot;00821E08&quot;/&gt;&lt;wsp:rsid wsp:val=&quot;00834EFD&quot;/&gt;&lt;wsp:rsid wsp:val=&quot;00844B24&quot;/&gt;&lt;wsp:rsid wsp:val=&quot;0084515F&quot;/&gt;&lt;wsp:rsid wsp:val=&quot;0085092D&quot;/&gt;&lt;wsp:rsid wsp:val=&quot;00865414&quot;/&gt;&lt;wsp:rsid wsp:val=&quot;00877D4C&quot;/&gt;&lt;wsp:rsid wsp:val=&quot;00883903&quot;/&gt;&lt;wsp:rsid wsp:val=&quot;00891C30&quot;/&gt;&lt;wsp:rsid wsp:val=&quot;0089763B&quot;/&gt;&lt;wsp:rsid wsp:val=&quot;008B6AE3&quot;/&gt;&lt;wsp:rsid wsp:val=&quot;008C1332&quot;/&gt;&lt;wsp:rsid wsp:val=&quot;008D1045&quot;/&gt;&lt;wsp:rsid wsp:val=&quot;008E5996&quot;/&gt;&lt;wsp:rsid wsp:val=&quot;00901AE1&quot;/&gt;&lt;wsp:rsid wsp:val=&quot;00912F93&quot;/&gt;&lt;wsp:rsid wsp:val=&quot;009205B4&quot;/&gt;&lt;wsp:rsid wsp:val=&quot;00955B59&quot;/&gt;&lt;wsp:rsid wsp:val=&quot;00992262&quot;/&gt;&lt;wsp:rsid wsp:val=&quot;009926BC&quot;/&gt;&lt;wsp:rsid wsp:val=&quot;009A4319&quot;/&gt;&lt;wsp:rsid wsp:val=&quot;009A6C3F&quot;/&gt;&lt;wsp:rsid wsp:val=&quot;009B73F2&quot;/&gt;&lt;wsp:rsid wsp:val=&quot;009C12BD&quot;/&gt;&lt;wsp:rsid wsp:val=&quot;009C50FE&quot;/&gt;&lt;wsp:rsid wsp:val=&quot;009E49DD&quot;/&gt;&lt;wsp:rsid wsp:val=&quot;00A03E75&quot;/&gt;&lt;wsp:rsid wsp:val=&quot;00A20627&quot;/&gt;&lt;wsp:rsid wsp:val=&quot;00A22FE9&quot;/&gt;&lt;wsp:rsid wsp:val=&quot;00A31A44&quot;/&gt;&lt;wsp:rsid wsp:val=&quot;00A32BFA&quot;/&gt;&lt;wsp:rsid wsp:val=&quot;00A3325E&quot;/&gt;&lt;wsp:rsid wsp:val=&quot;00A45FCE&quot;/&gt;&lt;wsp:rsid wsp:val=&quot;00A6001D&quot;/&gt;&lt;wsp:rsid wsp:val=&quot;00A75671&quot;/&gt;&lt;wsp:rsid wsp:val=&quot;00A773CC&quot;/&gt;&lt;wsp:rsid wsp:val=&quot;00A924D0&quot;/&gt;&lt;wsp:rsid wsp:val=&quot;00A9318B&quot;/&gt;&lt;wsp:rsid wsp:val=&quot;00A94AC1&quot;/&gt;&lt;wsp:rsid wsp:val=&quot;00AB18B7&quot;/&gt;&lt;wsp:rsid wsp:val=&quot;00AD335D&quot;/&gt;&lt;wsp:rsid wsp:val=&quot;00AF114C&quot;/&gt;&lt;wsp:rsid wsp:val=&quot;00AF792B&quot;/&gt;&lt;wsp:rsid wsp:val=&quot;00B32137&quot;/&gt;&lt;wsp:rsid wsp:val=&quot;00B33D2F&quot;/&gt;&lt;wsp:rsid wsp:val=&quot;00B40A5B&quot;/&gt;&lt;wsp:rsid wsp:val=&quot;00B45C6B&quot;/&gt;&lt;wsp:rsid wsp:val=&quot;00B55D5E&quot;/&gt;&lt;wsp:rsid wsp:val=&quot;00B57A80&quot;/&gt;&lt;wsp:rsid wsp:val=&quot;00B70E9C&quot;/&gt;&lt;wsp:rsid wsp:val=&quot;00B713D8&quot;/&gt;&lt;wsp:rsid wsp:val=&quot;00B72979&quot;/&gt;&lt;wsp:rsid wsp:val=&quot;00B94516&quot;/&gt;&lt;wsp:rsid wsp:val=&quot;00BA25E2&quot;/&gt;&lt;wsp:rsid wsp:val=&quot;00BB2855&quot;/&gt;&lt;wsp:rsid wsp:val=&quot;00BC5343&quot;/&gt;&lt;wsp:rsid wsp:val=&quot;00BD19C1&quot;/&gt;&lt;wsp:rsid wsp:val=&quot;00BD25B8&quot;/&gt;&lt;wsp:rsid wsp:val=&quot;00C012E1&quot;/&gt;&lt;wsp:rsid wsp:val=&quot;00C06BB4&quot;/&gt;&lt;wsp:rsid wsp:val=&quot;00C10D20&quot;/&gt;&lt;wsp:rsid wsp:val=&quot;00C12E0C&quot;/&gt;&lt;wsp:rsid wsp:val=&quot;00C21916&quot;/&gt;&lt;wsp:rsid wsp:val=&quot;00C34915&quot;/&gt;&lt;wsp:rsid wsp:val=&quot;00C457CA&quot;/&gt;&lt;wsp:rsid wsp:val=&quot;00C53FB6&quot;/&gt;&lt;wsp:rsid wsp:val=&quot;00C57FB7&quot;/&gt;&lt;wsp:rsid wsp:val=&quot;00C644D4&quot;/&gt;&lt;wsp:rsid wsp:val=&quot;00C65F3F&quot;/&gt;&lt;wsp:rsid wsp:val=&quot;00C72414&quot;/&gt;&lt;wsp:rsid wsp:val=&quot;00C72B1A&quot;/&gt;&lt;wsp:rsid wsp:val=&quot;00C8667B&quot;/&gt;&lt;wsp:rsid wsp:val=&quot;00C90993&quot;/&gt;&lt;wsp:rsid wsp:val=&quot;00CA4CE3&quot;/&gt;&lt;wsp:rsid wsp:val=&quot;00CC72FD&quot;/&gt;&lt;wsp:rsid wsp:val=&quot;00CD1D23&quot;/&gt;&lt;wsp:rsid wsp:val=&quot;00CD4F3F&quot;/&gt;&lt;wsp:rsid wsp:val=&quot;00D311F8&quot;/&gt;&lt;wsp:rsid wsp:val=&quot;00D31660&quot;/&gt;&lt;wsp:rsid wsp:val=&quot;00D36B52&quot;/&gt;&lt;wsp:rsid wsp:val=&quot;00D377C8&quot;/&gt;&lt;wsp:rsid wsp:val=&quot;00D41274&quot;/&gt;&lt;wsp:rsid wsp:val=&quot;00D4229C&quot;/&gt;&lt;wsp:rsid wsp:val=&quot;00D43BF3&quot;/&gt;&lt;wsp:rsid wsp:val=&quot;00D549FB&quot;/&gt;&lt;wsp:rsid wsp:val=&quot;00D56487&quot;/&gt;&lt;wsp:rsid wsp:val=&quot;00D767BB&quot;/&gt;&lt;wsp:rsid wsp:val=&quot;00D939B0&quot;/&gt;&lt;wsp:rsid wsp:val=&quot;00DA31A2&quot;/&gt;&lt;wsp:rsid wsp:val=&quot;00DB16E0&quot;/&gt;&lt;wsp:rsid wsp:val=&quot;00DB2DF9&quot;/&gt;&lt;wsp:rsid wsp:val=&quot;00DB465D&quot;/&gt;&lt;wsp:rsid wsp:val=&quot;00DB48A2&quot;/&gt;&lt;wsp:rsid wsp:val=&quot;00DB7E63&quot;/&gt;&lt;wsp:rsid wsp:val=&quot;00DC2055&quot;/&gt;&lt;wsp:rsid wsp:val=&quot;00DC3908&quot;/&gt;&lt;wsp:rsid wsp:val=&quot;00DD71E8&quot;/&gt;&lt;wsp:rsid wsp:val=&quot;00DD7F83&quot;/&gt;&lt;wsp:rsid wsp:val=&quot;00DE4EB8&quot;/&gt;&lt;wsp:rsid wsp:val=&quot;00E0641E&quot;/&gt;&lt;wsp:rsid wsp:val=&quot;00E06664&quot;/&gt;&lt;wsp:rsid wsp:val=&quot;00E304BC&quot;/&gt;&lt;wsp:rsid wsp:val=&quot;00E32853&quot;/&gt;&lt;wsp:rsid wsp:val=&quot;00E34EBD&quot;/&gt;&lt;wsp:rsid wsp:val=&quot;00E401F8&quot;/&gt;&lt;wsp:rsid wsp:val=&quot;00E46425&quot;/&gt;&lt;wsp:rsid wsp:val=&quot;00E469FC&quot;/&gt;&lt;wsp:rsid wsp:val=&quot;00E47D0E&quot;/&gt;&lt;wsp:rsid wsp:val=&quot;00E65018&quot;/&gt;&lt;wsp:rsid wsp:val=&quot;00E76CA1&quot;/&gt;&lt;wsp:rsid wsp:val=&quot;00E94339&quot;/&gt;&lt;wsp:rsid wsp:val=&quot;00E97563&quot;/&gt;&lt;wsp:rsid wsp:val=&quot;00EB0B63&quot;/&gt;&lt;wsp:rsid wsp:val=&quot;00EC265C&quot;/&gt;&lt;wsp:rsid wsp:val=&quot;00ED61CB&quot;/&gt;&lt;wsp:rsid wsp:val=&quot;00EE752A&quot;/&gt;&lt;wsp:rsid wsp:val=&quot;00F06A72&quot;/&gt;&lt;wsp:rsid wsp:val=&quot;00F136F0&quot;/&gt;&lt;wsp:rsid wsp:val=&quot;00F20BBB&quot;/&gt;&lt;wsp:rsid wsp:val=&quot;00F36048&quot;/&gt;&lt;wsp:rsid wsp:val=&quot;00F43BD8&quot;/&gt;&lt;wsp:rsid wsp:val=&quot;00F562F3&quot;/&gt;&lt;wsp:rsid wsp:val=&quot;00F74B89&quot;/&gt;&lt;wsp:rsid wsp:val=&quot;00F75133&quot;/&gt;&lt;wsp:rsid wsp:val=&quot;00F83272&quot;/&gt;&lt;wsp:rsid wsp:val=&quot;00F9358D&quot;/&gt;&lt;wsp:rsid wsp:val=&quot;00F9369B&quot;/&gt;&lt;wsp:rsid wsp:val=&quot;00FA3899&quot;/&gt;&lt;wsp:rsid wsp:val=&quot;00FA4909&quot;/&gt;&lt;wsp:rsid wsp:val=&quot;00FA5164&quot;/&gt;&lt;wsp:rsid wsp:val=&quot;00FA6751&quot;/&gt;&lt;wsp:rsid wsp:val=&quot;00FA6BD7&quot;/&gt;&lt;wsp:rsid wsp:val=&quot;00FB1048&quot;/&gt;&lt;wsp:rsid wsp:val=&quot;00FB62C4&quot;/&gt;&lt;wsp:rsid wsp:val=&quot;00FB7701&quot;/&gt;&lt;wsp:rsid wsp:val=&quot;00FD1AC5&quot;/&gt;&lt;wsp:rsid wsp:val=&quot;00FD5CF0&quot;/&gt;&lt;/wsp:rsids&gt;&lt;/w:docPr&gt;&lt;w:body&gt;&lt;wx:sect&gt;&lt;w:p wsp:rsidR=&quot;00A6001D&quot; wsp:rsidRPr=&quot;00A6001D&quot; wsp:rsidRDefault=&quot;00A6001D&quot; wsp:rsidP=&quot;00A6001D&quot;&gt;&lt;m:oMathPara&gt;&lt;m:oMath&gt;&lt;m:sSub&gt;&lt;m:sSubPr&gt;&lt;m:ctrlPr&gt;&lt;w:rPr&gt;&lt;w:rFonts w:ascii=&quot;Cambria Math&quot; w:h-ansi=&quot;Cambria Math&quot;/&gt;&lt;wx:font wx:val=&quot;Cambria Math&quot;/&gt;&lt;w:i/&gt;&lt;/w:rPr&gt;&lt;/m:ctrlPr&gt;&lt;/m:sSubPr&gt;&lt;m:e&gt;&lt;m:r&gt;&lt;w:rPr&gt;&lt;w:rFonts w:ascii=&quot;Cambria Math&quot; w:h-ansi=&quot;Cambria Math&quot;/&gt;&lt;wx:font wx:val=&quot;Cambria Math&quot;/&gt;&lt;w:i/&gt;&lt;/w:rPr&gt;&lt;m:t&gt;V&lt;/m:t&gt;&lt;/m:r&gt;&lt;/m:e&gt;&lt;m:sub&gt;&lt;m:r&gt;&lt;w:rPr&gt;&lt;w:rFonts w:ascii=&quot;Cambria Math&quot; w:h-ansi=&quot;Cambria Math&quot;/&gt;&lt;wx:font wx:val=&quot;Cambria Math&quot;/&gt;&lt;w:i/&gt;&lt;/w:rPr&gt;&lt;m:t&gt;out&lt;/m:t&gt;&lt;/m:r&gt;&lt;/m:sub&gt;&lt;/m:sSub&gt;&lt;/m:oMath&gt;&lt;/m:oMathPara&gt;&lt;/w:p&gt;&lt;w:sectPr wsp:rsidR=&quot;00000000&quot; wsp:rsidRPr=&quot;00A6001D&quot;&gt;&lt;w:pgSz w:w=&quot;12240&quot; w:h=&quot;15840&quot;/&gt;&lt;w:pgMar w:top=&quot;1440&quot; w:right=&quot;1440&quot; w:bottom=&quot;1440&quot; w:left=&quot;1440&quot; w:header=&quot;720&quot; w:footer=&quot;720&quot; w:gutter=&quot;0&quot;/&gt;&lt;w:cols w:space=&quot;720&quot;/&gt;&lt;/w:sectPr&gt;&lt;/wx:sect&gt;&lt;/w:body&gt;&lt;/w:wordDocument&gt;">
                   <v:imagedata r:id="rId14" o:title="" chromakey="white"/>
                 </v:shape>
               </w:pict>
@@ -2337,7 +2337,7 @@
         </w:tc>
         <w:tc>
           <w:tcPr>
-            <w:tcW w:w="942" w:type="dxa"/>
+            <w:tcW w:w="939" w:type="dxa"/>
             <w:shd w:val="clear" w:color="auto" w:fill="D9D9D9"/>
           </w:tcPr>
           <w:p>
@@ -2359,7 +2359,7 @@
         </w:tc>
         <w:tc>
           <w:tcPr>
-            <w:tcW w:w="774" w:type="dxa"/>
+            <w:tcW w:w="784" w:type="dxa"/>
             <w:shd w:val="clear" w:color="auto" w:fill="D9D9D9"/>
           </w:tcPr>
           <w:p>
@@ -2382,12 +2382,12 @@
       </w:tr>
       <w:tr>
         <w:trPr>
-          <w:trHeight w:val="269"/>
+          <w:trHeight w:val="260"/>
           <w:jc w:val="center"/>
         </w:trPr>
         <w:tc>
           <w:tcPr>
-            <w:tcW w:w="2336" w:type="dxa"/>
+            <w:tcW w:w="2329" w:type="dxa"/>
             <w:shd w:val="clear" w:color="auto" w:fill="auto"/>
           </w:tcPr>
           <w:p>
@@ -2408,7 +2408,7 @@
         </w:tc>
         <w:tc>
           <w:tcPr>
-            <w:tcW w:w="976" w:type="dxa"/>
+            <w:tcW w:w="973" w:type="dxa"/>
             <w:shd w:val="clear" w:color="auto" w:fill="auto"/>
           </w:tcPr>
           <w:p>
@@ -2425,7 +2425,7 @@
                 <w:szCs w:val="18"/>
               </w:rPr>
               <w:pict w14:anchorId="6F32FE0E">
-                <v:shape id="_x0000_i1909" type="#_x0000_t75" style="width:18.55pt;height:13.65pt" equationxml="&lt;?xml version=&quot;1.0&quot; encoding=&quot;UTF-8&quot; standalone=&quot;yes&quot;?&gt;&#10;&lt;?mso-application progid=&quot;Word.Document&quot;?&gt;&#10;&lt;w:wordDocument xmlns:aml=&quot;http://schemas.microsoft.com/aml/2001/core&quot; xmlns:wpc=&quot;http://schemas.microsoft.com/office/word/2010/wordprocessingCanvas&quot; xmlns:cx=&quot;http://schemas.microsoft.com/office/drawing/2014/chartex&quot; xmlns:cx1=&quot;http://schemas.microsoft.com/office/drawing/2015/9/8/chartex&quot; xmlns:cx2=&quot;http://schemas.microsoft.com/office/drawing/2015/10/21/chartex&quot; xmlns:cx3=&quot;http://schemas.microsoft.com/office/drawing/2016/5/9/chartex&quot; xmlns:cx4=&quot;http://schemas.microsoft.com/office/drawing/2016/5/10/chartex&quot; xmlns:cx5=&quot;http://schemas.microsoft.com/office/drawing/2016/5/11/chartex&quot; xmlns:cx6=&quot;http://schemas.microsoft.com/office/drawing/2016/5/12/chartex&quot; xmlns:cx7=&quot;http://schemas.microsoft.com/office/drawing/2016/5/13/chartex&quot; xmlns:cx8=&quot;http://schemas.microsoft.com/office/drawing/2016/5/14/chartex&quot; xmlns:cr=&quot;http://schemas.microsoft.com/office/comments/2020/reactions&quot; xmlns:dt=&quot;uuid:C2F41010-65B3-11d1-A29F-00AA00C14882&quot; xmlns:mc=&quot;http://schemas.openxmlformats.org/markup-compatibility/2006&quot; xmlns:aink=&quot;http://schemas.microsoft.com/office/drawing/2016/ink&quot; xmlns:am3d=&quot;http://schemas.microsoft.com/office/drawing/2017/model3d&quot; xmlns:o=&quot;urn:schemas-microsoft-com:office:office&quot; xmlns:oel=&quot;http://schemas.microsoft.com/office/2019/extlst&quot; xmlns:m=&quot;http://schemas.openxmlformats.org/officeDocument/2006/math&quot; xmlns:v=&quot;urn:schemas-microsoft-com:vml&quot; xmlns:w10=&quot;urn:schemas-microsoft-com:office:word&quot; xmlns:w=&quot;http://schemas.microsoft.com/office/word/2003/wordml&quot; xmlns:wx=&quot;http://schemas.microsoft.com/office/word/2003/auxHint&quot; xmlns:wne=&quot;http://schemas.microsoft.com/office/word/2006/wordml&quot; xmlns:wsp=&quot;http://schemas.microsoft.com/office/word/2003/wordml/sp2&quot; xmlns:sl=&quot;http://schemas.microsoft.com/schemaLibrary/2003/core&quot; w:macrosPresent=&quot;no&quot; w:embeddedObjPresent=&quot;no&quot; w:ocxPresent=&quot;no&quot; xml:space=&quot;preserve&quot;&gt;&lt;w:ignoreSubtree w:val=&quot;http://schemas.microsoft.com/office/word/2003/wordml/sp2&quot;/&gt;&lt;o:DocumentProperties&gt;&lt;o:Version&gt;16&lt;/o:Version&gt;&lt;/o:DocumentProperties&gt;&lt;w:docPr&gt;&lt;w:view w:val=&quot;print&quot;/&gt;&lt;w:zoom w:percent=&quot;100&quot;/&gt;&lt;w:doNotEmbedSystemFonts/&gt;&lt;w:activeWritingStyle w:lang=&quot;EN-AU&quot; w:vendorID=&quot;64&quot; w:dllVersion=&quot;6&quot; w:nlCheck=&quot;on&quot; w:optionSet=&quot;1&quot;/&gt;&lt;w:activeWritingStyle w:lang=&quot;EN-GB&quot; w:vendorID=&quot;64&quot; w:dllVersion=&quot;6&quot; w:nlCheck=&quot;on&quot; w:optionSet=&quot;1&quot;/&gt;&lt;w:activeWritingStyle w:lang=&quot;EN-US&quot; w:vendorID=&quot;64&quot; w:dllVersion=&quot;6&quot; w:nlCheck=&quot;on&quot; w:optionSet=&quot;1&quot;/&gt;&lt;w:activeWritingStyle w:lang=&quot;EN-AU&quot; w:vendorID=&quot;64&quot; w:dllVersion=&quot;0&quot; w:nlCheck=&quot;on&quot; w:optionSet=&quot;0&quot;/&gt;&lt;w:activeWritingStyle w:lang=&quot;EN-GB&quot; w:vendorID=&quot;64&quot; w:dllVersion=&quot;0&quot; w:nlCheck=&quot;on&quot; w:optionSet=&quot;0&quot;/&gt;&lt;w:activeWritingStyle w:lang=&quot;EN-US&quot; w:vendorID=&quot;64&quot; w:dllVersion=&quot;0&quot; w:nlCheck=&quot;on&quot; w:optionSet=&quot;0&quot;/&gt;&lt;w:activeWritingStyle w:lang=&quot;ES-AR&quot; w:vendorID=&quot;64&quot; w:dllVersion=&quot;0&quot; w:nlCheck=&quot;on&quot; w:optionSet=&quot;0&quot;/&gt;&lt;w:activeWritingStyle w:lang=&quot;580A&quot; w:vendorID=&quot;64&quot; w:dllVersion=&quot;0&quot; w:nlCheck=&quot;on&quot; w:optionSet=&quot;0&quot;/&gt;&lt;w:activeWritingStyle w:lang=&quot;PT-BR&quot; w:vendorID=&quot;64&quot; w:dllVersion=&quot;0&quot; w:nlCheck=&quot;on&quot; w:optionSet=&quot;0&quot;/&gt;&lt;w:stylePaneFormatFilter w:val=&quot;3F01&quot;/&gt;&lt;w:defaultTabStop w:val=&quot;720&quot;/&gt;&lt;w:hyphenationZone w:val=&quot;425&quot;/&gt;&lt;w:characterSpacingControl w:val=&quot;DontCompress&quot;/&gt;&lt;w:optimizeForBrowser/&gt;&lt;w:validateAgainstSchema/&gt;&lt;w:saveInvalidXML w:val=&quot;off&quot;/&gt;&lt;w:ignoreMixedContent w:val=&quot;off&quot;/&gt;&lt;w:alwaysShowPlaceholderText w:val=&quot;off&quot;/&gt;&lt;w:compat&gt;&lt;w:breakWrappedTables/&gt;&lt;w:snapToGridInCell/&gt;&lt;w:applyBreakingRules/&gt;&lt;w:wrapTextWithPunct/&gt;&lt;w:useAsianBreakRules/&gt;&lt;w:useWord2002TableStyleRules/&gt;&lt;w:useFELayout/&gt;&lt;/w:compat&gt;&lt;wsp:rsids&gt;&lt;wsp:rsidRoot wsp:val=&quot;00426FBB&quot;/&gt;&lt;wsp:rsid wsp:val=&quot;000002E1&quot;/&gt;&lt;wsp:rsid wsp:val=&quot;00003C97&quot;/&gt;&lt;wsp:rsid wsp:val=&quot;00005565&quot;/&gt;&lt;wsp:rsid wsp:val=&quot;0001754A&quot;/&gt;&lt;wsp:rsid wsp:val=&quot;00017719&quot;/&gt;&lt;wsp:rsid wsp:val=&quot;00027F1D&quot;/&gt;&lt;wsp:rsid wsp:val=&quot;0003296C&quot;/&gt;&lt;wsp:rsid wsp:val=&quot;0003351F&quot;/&gt;&lt;wsp:rsid wsp:val=&quot;00044599&quot;/&gt;&lt;wsp:rsid wsp:val=&quot;000540E6&quot;/&gt;&lt;wsp:rsid wsp:val=&quot;00054421&quot;/&gt;&lt;wsp:rsid wsp:val=&quot;00062E46&quot;/&gt;&lt;wsp:rsid wsp:val=&quot;00074AC8&quot;/&gt;&lt;wsp:rsid wsp:val=&quot;00081408&quot;/&gt;&lt;wsp:rsid wsp:val=&quot;00081EBE&quot;/&gt;&lt;wsp:rsid wsp:val=&quot;00086EDC&quot;/&gt;&lt;wsp:rsid wsp:val=&quot;000B1236&quot;/&gt;&lt;wsp:rsid wsp:val=&quot;000B36A3&quot;/&gt;&lt;wsp:rsid wsp:val=&quot;000C013C&quot;/&gt;&lt;wsp:rsid wsp:val=&quot;000E3F84&quot;/&gt;&lt;wsp:rsid wsp:val=&quot;001056DF&quot;/&gt;&lt;wsp:rsid wsp:val=&quot;0010789C&quot;/&gt;&lt;wsp:rsid wsp:val=&quot;00114025&quot;/&gt;&lt;wsp:rsid wsp:val=&quot;001160D2&quot;/&gt;&lt;wsp:rsid wsp:val=&quot;00120636&quot;/&gt;&lt;wsp:rsid wsp:val=&quot;001348A5&quot;/&gt;&lt;wsp:rsid wsp:val=&quot;00151B8E&quot;/&gt;&lt;wsp:rsid wsp:val=&quot;00182170&quot;/&gt;&lt;wsp:rsid wsp:val=&quot;001928FB&quot;/&gt;&lt;wsp:rsid wsp:val=&quot;00192BC7&quot;/&gt;&lt;wsp:rsid wsp:val=&quot;00195BE6&quot;/&gt;&lt;wsp:rsid wsp:val=&quot;001A3C37&quot;/&gt;&lt;wsp:rsid wsp:val=&quot;001A50EA&quot;/&gt;&lt;wsp:rsid wsp:val=&quot;001F16CD&quot;/&gt;&lt;wsp:rsid wsp:val=&quot;001F47D2&quot;/&gt;&lt;wsp:rsid wsp:val=&quot;002029C8&quot;/&gt;&lt;wsp:rsid wsp:val=&quot;0022285A&quot;/&gt;&lt;wsp:rsid wsp:val=&quot;00224C61&quot;/&gt;&lt;wsp:rsid wsp:val=&quot;002522D3&quot;/&gt;&lt;wsp:rsid wsp:val=&quot;00256ABC&quot;/&gt;&lt;wsp:rsid wsp:val=&quot;0027227B&quot;/&gt;&lt;wsp:rsid wsp:val=&quot;00273AC7&quot;/&gt;&lt;wsp:rsid wsp:val=&quot;00273D2C&quot;/&gt;&lt;wsp:rsid wsp:val=&quot;00285ECD&quot;/&gt;&lt;wsp:rsid wsp:val=&quot;00290E1B&quot;/&gt;&lt;wsp:rsid wsp:val=&quot;00291B17&quot;/&gt;&lt;wsp:rsid wsp:val=&quot;00291BB3&quot;/&gt;&lt;wsp:rsid wsp:val=&quot;002A6742&quot;/&gt;&lt;wsp:rsid wsp:val=&quot;002C1A7F&quot;/&gt;&lt;wsp:rsid wsp:val=&quot;002C4239&quot;/&gt;&lt;wsp:rsid wsp:val=&quot;002C559D&quot;/&gt;&lt;wsp:rsid wsp:val=&quot;002D16AE&quot;/&gt;&lt;wsp:rsid wsp:val=&quot;002D2D42&quot;/&gt;&lt;wsp:rsid wsp:val=&quot;002F72D0&quot;/&gt;&lt;wsp:rsid wsp:val=&quot;002F7A4F&quot;/&gt;&lt;wsp:rsid wsp:val=&quot;003003AB&quot;/&gt;&lt;wsp:rsid wsp:val=&quot;00302C35&quot;/&gt;&lt;wsp:rsid wsp:val=&quot;00311C49&quot;/&gt;&lt;wsp:rsid wsp:val=&quot;0032119E&quot;/&gt;&lt;wsp:rsid wsp:val=&quot;00321304&quot;/&gt;&lt;wsp:rsid wsp:val=&quot;00324FC2&quot;/&gt;&lt;wsp:rsid wsp:val=&quot;003312CA&quot;/&gt;&lt;wsp:rsid wsp:val=&quot;00331F84&quot;/&gt;&lt;wsp:rsid wsp:val=&quot;0037721F&quot;/&gt;&lt;wsp:rsid wsp:val=&quot;003950A4&quot;/&gt;&lt;wsp:rsid wsp:val=&quot;003A1E7E&quot;/&gt;&lt;wsp:rsid wsp:val=&quot;003E2FDC&quot;/&gt;&lt;wsp:rsid wsp:val=&quot;003E3577&quot;/&gt;&lt;wsp:rsid wsp:val=&quot;003F3A61&quot;/&gt;&lt;wsp:rsid wsp:val=&quot;00410A5D&quot;/&gt;&lt;wsp:rsid wsp:val=&quot;00414909&quot;/&gt;&lt;wsp:rsid wsp:val=&quot;00416537&quot;/&gt;&lt;wsp:rsid wsp:val=&quot;00425A6A&quot;/&gt;&lt;wsp:rsid wsp:val=&quot;00426FBB&quot;/&gt;&lt;wsp:rsid wsp:val=&quot;00454542&quot;/&gt;&lt;wsp:rsid wsp:val=&quot;0047429A&quot;/&gt;&lt;wsp:rsid wsp:val=&quot;0048374C&quot;/&gt;&lt;wsp:rsid wsp:val=&quot;0048771D&quot;/&gt;&lt;wsp:rsid wsp:val=&quot;004A6605&quot;/&gt;&lt;wsp:rsid wsp:val=&quot;004C45FA&quot;/&gt;&lt;wsp:rsid wsp:val=&quot;004D35A3&quot;/&gt;&lt;wsp:rsid wsp:val=&quot;004E1BD8&quot;/&gt;&lt;wsp:rsid wsp:val=&quot;004E452A&quot;/&gt;&lt;wsp:rsid wsp:val=&quot;004E78E3&quot;/&gt;&lt;wsp:rsid wsp:val=&quot;004F2BFE&quot;/&gt;&lt;wsp:rsid wsp:val=&quot;004F63D3&quot;/&gt;&lt;wsp:rsid wsp:val=&quot;004F7DCF&quot;/&gt;&lt;wsp:rsid wsp:val=&quot;005004BF&quot;/&gt;&lt;wsp:rsid wsp:val=&quot;00502E89&quot;/&gt;&lt;wsp:rsid wsp:val=&quot;00506CFE&quot;/&gt;&lt;wsp:rsid wsp:val=&quot;00510E95&quot;/&gt;&lt;wsp:rsid wsp:val=&quot;005225C3&quot;/&gt;&lt;wsp:rsid wsp:val=&quot;00527D56&quot;/&gt;&lt;wsp:rsid wsp:val=&quot;0053221F&quot;/&gt;&lt;wsp:rsid wsp:val=&quot;00536FAE&quot;/&gt;&lt;wsp:rsid wsp:val=&quot;00542C85&quot;/&gt;&lt;wsp:rsid wsp:val=&quot;00553510&quot;/&gt;&lt;wsp:rsid wsp:val=&quot;00554186&quot;/&gt;&lt;wsp:rsid wsp:val=&quot;00585769&quot;/&gt;&lt;wsp:rsid wsp:val=&quot;00585C61&quot;/&gt;&lt;wsp:rsid wsp:val=&quot;00591130&quot;/&gt;&lt;wsp:rsid wsp:val=&quot;005A3F28&quot;/&gt;&lt;wsp:rsid wsp:val=&quot;005A40BE&quot;/&gt;&lt;wsp:rsid wsp:val=&quot;005B13E2&quot;/&gt;&lt;wsp:rsid wsp:val=&quot;005B47D7&quot;/&gt;&lt;wsp:rsid wsp:val=&quot;005C5526&quot;/&gt;&lt;wsp:rsid wsp:val=&quot;005C62C6&quot;/&gt;&lt;wsp:rsid wsp:val=&quot;005D7B9E&quot;/&gt;&lt;wsp:rsid wsp:val=&quot;005E112E&quot;/&gt;&lt;wsp:rsid wsp:val=&quot;005F0834&quot;/&gt;&lt;wsp:rsid wsp:val=&quot;005F68AB&quot;/&gt;&lt;wsp:rsid wsp:val=&quot;005F6DC3&quot;/&gt;&lt;wsp:rsid wsp:val=&quot;00601A8E&quot;/&gt;&lt;wsp:rsid wsp:val=&quot;0062033E&quot;/&gt;&lt;wsp:rsid wsp:val=&quot;00624482&quot;/&gt;&lt;wsp:rsid wsp:val=&quot;0064799C&quot;/&gt;&lt;wsp:rsid wsp:val=&quot;00654156&quot;/&gt;&lt;wsp:rsid wsp:val=&quot;00656ADC&quot;/&gt;&lt;wsp:rsid wsp:val=&quot;006B47CA&quot;/&gt;&lt;wsp:rsid wsp:val=&quot;006C304C&quot;/&gt;&lt;wsp:rsid wsp:val=&quot;006C4511&quot;/&gt;&lt;wsp:rsid wsp:val=&quot;006C65F5&quot;/&gt;&lt;wsp:rsid wsp:val=&quot;006C7AAA&quot;/&gt;&lt;wsp:rsid wsp:val=&quot;006D1C2A&quot;/&gt;&lt;wsp:rsid wsp:val=&quot;006D264F&quot;/&gt;&lt;wsp:rsid wsp:val=&quot;006D4E89&quot;/&gt;&lt;wsp:rsid wsp:val=&quot;006E2A8D&quot;/&gt;&lt;wsp:rsid wsp:val=&quot;006E7574&quot;/&gt;&lt;wsp:rsid wsp:val=&quot;00703430&quot;/&gt;&lt;wsp:rsid wsp:val=&quot;00703548&quot;/&gt;&lt;wsp:rsid wsp:val=&quot;00704E18&quot;/&gt;&lt;wsp:rsid wsp:val=&quot;007069BE&quot;/&gt;&lt;wsp:rsid wsp:val=&quot;00745C86&quot;/&gt;&lt;wsp:rsid wsp:val=&quot;00764603&quot;/&gt;&lt;wsp:rsid wsp:val=&quot;0076604D&quot;/&gt;&lt;wsp:rsid wsp:val=&quot;00790909&quot;/&gt;&lt;wsp:rsid wsp:val=&quot;007929AF&quot;/&gt;&lt;wsp:rsid wsp:val=&quot;007B1582&quot;/&gt;&lt;wsp:rsid wsp:val=&quot;007B5A07&quot;/&gt;&lt;wsp:rsid wsp:val=&quot;007C065D&quot;/&gt;&lt;wsp:rsid wsp:val=&quot;007D3E71&quot;/&gt;&lt;wsp:rsid wsp:val=&quot;007E5D6A&quot;/&gt;&lt;wsp:rsid wsp:val=&quot;007E645D&quot;/&gt;&lt;wsp:rsid wsp:val=&quot;007F75CA&quot;/&gt;&lt;wsp:rsid wsp:val=&quot;00821E08&quot;/&gt;&lt;wsp:rsid wsp:val=&quot;00834EFD&quot;/&gt;&lt;wsp:rsid wsp:val=&quot;00844B24&quot;/&gt;&lt;wsp:rsid wsp:val=&quot;0084515F&quot;/&gt;&lt;wsp:rsid wsp:val=&quot;0085092D&quot;/&gt;&lt;wsp:rsid wsp:val=&quot;00865414&quot;/&gt;&lt;wsp:rsid wsp:val=&quot;00877D4C&quot;/&gt;&lt;wsp:rsid wsp:val=&quot;00883903&quot;/&gt;&lt;wsp:rsid wsp:val=&quot;00891C30&quot;/&gt;&lt;wsp:rsid wsp:val=&quot;0089763B&quot;/&gt;&lt;wsp:rsid wsp:val=&quot;008B6AE3&quot;/&gt;&lt;wsp:rsid wsp:val=&quot;008C1332&quot;/&gt;&lt;wsp:rsid wsp:val=&quot;008D1045&quot;/&gt;&lt;wsp:rsid wsp:val=&quot;008E5996&quot;/&gt;&lt;wsp:rsid wsp:val=&quot;00901AE1&quot;/&gt;&lt;wsp:rsid wsp:val=&quot;00912F93&quot;/&gt;&lt;wsp:rsid wsp:val=&quot;009205B4&quot;/&gt;&lt;wsp:rsid wsp:val=&quot;00955B59&quot;/&gt;&lt;wsp:rsid wsp:val=&quot;00992262&quot;/&gt;&lt;wsp:rsid wsp:val=&quot;009926BC&quot;/&gt;&lt;wsp:rsid wsp:val=&quot;009A4319&quot;/&gt;&lt;wsp:rsid wsp:val=&quot;009A6C3F&quot;/&gt;&lt;wsp:rsid wsp:val=&quot;009B73F2&quot;/&gt;&lt;wsp:rsid wsp:val=&quot;009C12BD&quot;/&gt;&lt;wsp:rsid wsp:val=&quot;009C50FE&quot;/&gt;&lt;wsp:rsid wsp:val=&quot;009E49DD&quot;/&gt;&lt;wsp:rsid wsp:val=&quot;00A03E75&quot;/&gt;&lt;wsp:rsid wsp:val=&quot;00A20627&quot;/&gt;&lt;wsp:rsid wsp:val=&quot;00A22FE9&quot;/&gt;&lt;wsp:rsid wsp:val=&quot;00A31A44&quot;/&gt;&lt;wsp:rsid wsp:val=&quot;00A32BFA&quot;/&gt;&lt;wsp:rsid wsp:val=&quot;00A3325E&quot;/&gt;&lt;wsp:rsid wsp:val=&quot;00A45FCE&quot;/&gt;&lt;wsp:rsid wsp:val=&quot;00A75671&quot;/&gt;&lt;wsp:rsid wsp:val=&quot;00A773CC&quot;/&gt;&lt;wsp:rsid wsp:val=&quot;00A924D0&quot;/&gt;&lt;wsp:rsid wsp:val=&quot;00A9318B&quot;/&gt;&lt;wsp:rsid wsp:val=&quot;00A94AC1&quot;/&gt;&lt;wsp:rsid wsp:val=&quot;00AB18B7&quot;/&gt;&lt;wsp:rsid wsp:val=&quot;00AD335D&quot;/&gt;&lt;wsp:rsid wsp:val=&quot;00AF114C&quot;/&gt;&lt;wsp:rsid wsp:val=&quot;00AF792B&quot;/&gt;&lt;wsp:rsid wsp:val=&quot;00B32137&quot;/&gt;&lt;wsp:rsid wsp:val=&quot;00B33D2F&quot;/&gt;&lt;wsp:rsid wsp:val=&quot;00B40A5B&quot;/&gt;&lt;wsp:rsid wsp:val=&quot;00B45C6B&quot;/&gt;&lt;wsp:rsid wsp:val=&quot;00B55D5E&quot;/&gt;&lt;wsp:rsid wsp:val=&quot;00B57A80&quot;/&gt;&lt;wsp:rsid wsp:val=&quot;00B70E9C&quot;/&gt;&lt;wsp:rsid wsp:val=&quot;00B713D8&quot;/&gt;&lt;wsp:rsid wsp:val=&quot;00B72979&quot;/&gt;&lt;wsp:rsid wsp:val=&quot;00B94516&quot;/&gt;&lt;wsp:rsid wsp:val=&quot;00BA25E2&quot;/&gt;&lt;wsp:rsid wsp:val=&quot;00BB2855&quot;/&gt;&lt;wsp:rsid wsp:val=&quot;00BC5343&quot;/&gt;&lt;wsp:rsid wsp:val=&quot;00BD19C1&quot;/&gt;&lt;wsp:rsid wsp:val=&quot;00BD25B8&quot;/&gt;&lt;wsp:rsid wsp:val=&quot;00C012E1&quot;/&gt;&lt;wsp:rsid wsp:val=&quot;00C06BB4&quot;/&gt;&lt;wsp:rsid wsp:val=&quot;00C10D20&quot;/&gt;&lt;wsp:rsid wsp:val=&quot;00C12E0C&quot;/&gt;&lt;wsp:rsid wsp:val=&quot;00C21916&quot;/&gt;&lt;wsp:rsid wsp:val=&quot;00C34915&quot;/&gt;&lt;wsp:rsid wsp:val=&quot;00C457CA&quot;/&gt;&lt;wsp:rsid wsp:val=&quot;00C53FB6&quot;/&gt;&lt;wsp:rsid wsp:val=&quot;00C57FB7&quot;/&gt;&lt;wsp:rsid wsp:val=&quot;00C644D4&quot;/&gt;&lt;wsp:rsid wsp:val=&quot;00C65F3F&quot;/&gt;&lt;wsp:rsid wsp:val=&quot;00C72414&quot;/&gt;&lt;wsp:rsid wsp:val=&quot;00C72B1A&quot;/&gt;&lt;wsp:rsid wsp:val=&quot;00C8667B&quot;/&gt;&lt;wsp:rsid wsp:val=&quot;00C90993&quot;/&gt;&lt;wsp:rsid wsp:val=&quot;00CA4CE3&quot;/&gt;&lt;wsp:rsid wsp:val=&quot;00CC72FD&quot;/&gt;&lt;wsp:rsid wsp:val=&quot;00CD1D23&quot;/&gt;&lt;wsp:rsid wsp:val=&quot;00CD4F3F&quot;/&gt;&lt;wsp:rsid wsp:val=&quot;00D311F8&quot;/&gt;&lt;wsp:rsid wsp:val=&quot;00D31660&quot;/&gt;&lt;wsp:rsid wsp:val=&quot;00D36B52&quot;/&gt;&lt;wsp:rsid wsp:val=&quot;00D377C8&quot;/&gt;&lt;wsp:rsid wsp:val=&quot;00D41274&quot;/&gt;&lt;wsp:rsid wsp:val=&quot;00D4229C&quot;/&gt;&lt;wsp:rsid wsp:val=&quot;00D43BF3&quot;/&gt;&lt;wsp:rsid wsp:val=&quot;00D549FB&quot;/&gt;&lt;wsp:rsid wsp:val=&quot;00D56487&quot;/&gt;&lt;wsp:rsid wsp:val=&quot;00D767BB&quot;/&gt;&lt;wsp:rsid wsp:val=&quot;00D939B0&quot;/&gt;&lt;wsp:rsid wsp:val=&quot;00DA31A2&quot;/&gt;&lt;wsp:rsid wsp:val=&quot;00DB16E0&quot;/&gt;&lt;wsp:rsid wsp:val=&quot;00DB2DF9&quot;/&gt;&lt;wsp:rsid wsp:val=&quot;00DB465D&quot;/&gt;&lt;wsp:rsid wsp:val=&quot;00DB48A2&quot;/&gt;&lt;wsp:rsid wsp:val=&quot;00DB7E63&quot;/&gt;&lt;wsp:rsid wsp:val=&quot;00DC2055&quot;/&gt;&lt;wsp:rsid wsp:val=&quot;00DC3908&quot;/&gt;&lt;wsp:rsid wsp:val=&quot;00DD71E8&quot;/&gt;&lt;wsp:rsid wsp:val=&quot;00DD7F83&quot;/&gt;&lt;wsp:rsid wsp:val=&quot;00DE4EB8&quot;/&gt;&lt;wsp:rsid wsp:val=&quot;00E0641E&quot;/&gt;&lt;wsp:rsid wsp:val=&quot;00E06664&quot;/&gt;&lt;wsp:rsid wsp:val=&quot;00E304BC&quot;/&gt;&lt;wsp:rsid wsp:val=&quot;00E32853&quot;/&gt;&lt;wsp:rsid wsp:val=&quot;00E34EBD&quot;/&gt;&lt;wsp:rsid wsp:val=&quot;00E401F8&quot;/&gt;&lt;wsp:rsid wsp:val=&quot;00E46425&quot;/&gt;&lt;wsp:rsid wsp:val=&quot;00E469FC&quot;/&gt;&lt;wsp:rsid wsp:val=&quot;00E47D0E&quot;/&gt;&lt;wsp:rsid wsp:val=&quot;00E65018&quot;/&gt;&lt;wsp:rsid wsp:val=&quot;00E76CA1&quot;/&gt;&lt;wsp:rsid wsp:val=&quot;00E94339&quot;/&gt;&lt;wsp:rsid wsp:val=&quot;00E97563&quot;/&gt;&lt;wsp:rsid wsp:val=&quot;00EB0B63&quot;/&gt;&lt;wsp:rsid wsp:val=&quot;00EC265C&quot;/&gt;&lt;wsp:rsid wsp:val=&quot;00ED61CB&quot;/&gt;&lt;wsp:rsid wsp:val=&quot;00EE752A&quot;/&gt;&lt;wsp:rsid wsp:val=&quot;00F06A72&quot;/&gt;&lt;wsp:rsid wsp:val=&quot;00F136F0&quot;/&gt;&lt;wsp:rsid wsp:val=&quot;00F20BBB&quot;/&gt;&lt;wsp:rsid wsp:val=&quot;00F36048&quot;/&gt;&lt;wsp:rsid wsp:val=&quot;00F43BD8&quot;/&gt;&lt;wsp:rsid wsp:val=&quot;00F562F3&quot;/&gt;&lt;wsp:rsid wsp:val=&quot;00F74B89&quot;/&gt;&lt;wsp:rsid wsp:val=&quot;00F75133&quot;/&gt;&lt;wsp:rsid wsp:val=&quot;00F83272&quot;/&gt;&lt;wsp:rsid wsp:val=&quot;00F9358D&quot;/&gt;&lt;wsp:rsid wsp:val=&quot;00F9369B&quot;/&gt;&lt;wsp:rsid wsp:val=&quot;00FA3899&quot;/&gt;&lt;wsp:rsid wsp:val=&quot;00FA4909&quot;/&gt;&lt;wsp:rsid wsp:val=&quot;00FA5164&quot;/&gt;&lt;wsp:rsid wsp:val=&quot;00FA6751&quot;/&gt;&lt;wsp:rsid wsp:val=&quot;00FA6BD7&quot;/&gt;&lt;wsp:rsid wsp:val=&quot;00FB1048&quot;/&gt;&lt;wsp:rsid wsp:val=&quot;00FB62C4&quot;/&gt;&lt;wsp:rsid wsp:val=&quot;00FB7701&quot;/&gt;&lt;wsp:rsid wsp:val=&quot;00FD1AC5&quot;/&gt;&lt;wsp:rsid wsp:val=&quot;00FD5CF0&quot;/&gt;&lt;/wsp:rsids&gt;&lt;/w:docPr&gt;&lt;w:body&gt;&lt;wx:sect&gt;&lt;w:p wsp:rsidR=&quot;002522D3&quot; wsp:rsidRPr=&quot;002522D3&quot; wsp:rsidRDefault=&quot;002522D3&quot; wsp:rsidP=&quot;002522D3&quot;&gt;&lt;m:oMathPara&gt;&lt;m:oMath&gt;&lt;m:sSub&gt;&lt;m:sSubPr&gt;&lt;m:ctrlPr&gt;&lt;w:rPr&gt;&lt;w:rFonts w:ascii=&quot;Cambria Math&quot; w:h-ansi=&quot;Cambria Math&quot;/&gt;&lt;wx:font wx:val=&quot;Cambria Math&quot;/&gt;&lt;w:i/&gt;&lt;/w:rPr&gt;&lt;/m:ctrlPr&gt;&lt;/m:sSubPr&gt;&lt;m:e&gt;&lt;m:r&gt;&lt;w:rPr&gt;&lt;w:rFonts w:ascii=&quot;Cambria Math&quot; w:h-ansi=&quot;Cambria Math&quot;/&gt;&lt;wx:font wx:val=&quot;Cambria Math&quot;/&gt;&lt;w:i/&gt;&lt;/w:rPr&gt;&lt;m:t&gt;I&lt;/m:t&gt;&lt;/m:r&gt;&lt;/m:e&gt;&lt;m:sub&gt;&lt;m:r&gt;&lt;w:rPr&gt;&lt;w:rFonts w:ascii=&quot;Cambria Math&quot; w:h-ansi=&quot;Cambria Math&quot;/&gt;&lt;wx:font wx:val=&quot;Cambria Math&quot;/&gt;&lt;w:i/&gt;&lt;/w:rPr&gt;&lt;m:t&gt;out&lt;/m:t&gt;&lt;/m:r&gt;&lt;/m:sub&gt;&lt;/m:sSub&gt;&lt;/m:oMath&gt;&lt;/m:oMathPara&gt;&lt;/w:p&gt;&lt;w:sectPr wsp:rsidR=&quot;00000000&quot; wsp:rsidRPr=&quot;002522D3&quot;&gt;&lt;w:pgSz w:w=&quot;12240&quot; w:h=&quot;15840&quot;/&gt;&lt;w:pgMar w:top=&quot;1440&quot; w:right=&quot;1440&quot; w:bottom=&quot;1440&quot; w:left=&quot;1440&quot; w:header=&quot;720&quot; w:footer=&quot;720&quot; w:gutter=&quot;0&quot;/&gt;&lt;w:cols w:space=&quot;720&quot;/&gt;&lt;/w:sectPr&gt;&lt;/wx:sect&gt;&lt;/w:body&gt;&lt;/w:wordDocument&gt;">
+                <v:shape id="_x0000_i1050" type="#_x0000_t75" style="width:18.7pt;height:13.85pt" equationxml="&lt;?xml version=&quot;1.0&quot; encoding=&quot;UTF-8&quot; standalone=&quot;yes&quot;?&gt;&#10;&lt;?mso-application progid=&quot;Word.Document&quot;?&gt;&#10;&lt;w:wordDocument xmlns:aml=&quot;http://schemas.microsoft.com/aml/2001/core&quot; xmlns:wpc=&quot;http://schemas.microsoft.com/office/word/2010/wordprocessingCanvas&quot; xmlns:cx=&quot;http://schemas.microsoft.com/office/drawing/2014/chartex&quot; xmlns:cx1=&quot;http://schemas.microsoft.com/office/drawing/2015/9/8/chartex&quot; xmlns:cx2=&quot;http://schemas.microsoft.com/office/drawing/2015/10/21/chartex&quot; xmlns:cx3=&quot;http://schemas.microsoft.com/office/drawing/2016/5/9/chartex&quot; xmlns:cx4=&quot;http://schemas.microsoft.com/office/drawing/2016/5/10/chartex&quot; xmlns:cx5=&quot;http://schemas.microsoft.com/office/drawing/2016/5/11/chartex&quot; xmlns:cx6=&quot;http://schemas.microsoft.com/office/drawing/2016/5/12/chartex&quot; xmlns:cx7=&quot;http://schemas.microsoft.com/office/drawing/2016/5/13/chartex&quot; xmlns:cx8=&quot;http://schemas.microsoft.com/office/drawing/2016/5/14/chartex&quot; xmlns:cr=&quot;http://schemas.microsoft.com/office/comments/2020/reactions&quot; xmlns:dt=&quot;uuid:C2F41010-65B3-11d1-A29F-00AA00C14882&quot; xmlns:mc=&quot;http://schemas.openxmlformats.org/markup-compatibility/2006&quot; xmlns:aink=&quot;http://schemas.microsoft.com/office/drawing/2016/ink&quot; xmlns:am3d=&quot;http://schemas.microsoft.com/office/drawing/2017/model3d&quot; xmlns:o=&quot;urn:schemas-microsoft-com:office:office&quot; xmlns:oel=&quot;http://schemas.microsoft.com/office/2019/extlst&quot; xmlns:m=&quot;http://schemas.openxmlformats.org/officeDocument/2006/math&quot; xmlns:v=&quot;urn:schemas-microsoft-com:vml&quot; xmlns:w10=&quot;urn:schemas-microsoft-com:office:word&quot; xmlns:w=&quot;http://schemas.microsoft.com/office/word/2003/wordml&quot; xmlns:wx=&quot;http://schemas.microsoft.com/office/word/2003/auxHint&quot; xmlns:wne=&quot;http://schemas.microsoft.com/office/word/2006/wordml&quot; xmlns:wsp=&quot;http://schemas.microsoft.com/office/word/2003/wordml/sp2&quot; xmlns:sl=&quot;http://schemas.microsoft.com/schemaLibrary/2003/core&quot; w:macrosPresent=&quot;no&quot; w:embeddedObjPresent=&quot;no&quot; w:ocxPresent=&quot;no&quot; xml:space=&quot;preserve&quot;&gt;&lt;w:ignoreSubtree w:val=&quot;http://schemas.microsoft.com/office/word/2003/wordml/sp2&quot;/&gt;&lt;o:DocumentProperties&gt;&lt;o:Version&gt;16&lt;/o:Version&gt;&lt;/o:DocumentProperties&gt;&lt;w:docPr&gt;&lt;w:view w:val=&quot;print&quot;/&gt;&lt;w:zoom w:percent=&quot;100&quot;/&gt;&lt;w:doNotEmbedSystemFonts/&gt;&lt;w:activeWritingStyle w:lang=&quot;EN-AU&quot; w:vendorID=&quot;64&quot; w:dllVersion=&quot;6&quot; w:nlCheck=&quot;on&quot; w:optionSet=&quot;1&quot;/&gt;&lt;w:activeWritingStyle w:lang=&quot;EN-GB&quot; w:vendorID=&quot;64&quot; w:dllVersion=&quot;6&quot; w:nlCheck=&quot;on&quot; w:optionSet=&quot;1&quot;/&gt;&lt;w:activeWritingStyle w:lang=&quot;EN-US&quot; w:vendorID=&quot;64&quot; w:dllVersion=&quot;6&quot; w:nlCheck=&quot;on&quot; w:optionSet=&quot;1&quot;/&gt;&lt;w:activeWritingStyle w:lang=&quot;EN-AU&quot; w:vendorID=&quot;64&quot; w:dllVersion=&quot;0&quot; w:nlCheck=&quot;on&quot; w:optionSet=&quot;0&quot;/&gt;&lt;w:activeWritingStyle w:lang=&quot;EN-GB&quot; w:vendorID=&quot;64&quot; w:dllVersion=&quot;0&quot; w:nlCheck=&quot;on&quot; w:optionSet=&quot;0&quot;/&gt;&lt;w:activeWritingStyle w:lang=&quot;EN-US&quot; w:vendorID=&quot;64&quot; w:dllVersion=&quot;0&quot; w:nlCheck=&quot;on&quot; w:optionSet=&quot;0&quot;/&gt;&lt;w:activeWritingStyle w:lang=&quot;ES-AR&quot; w:vendorID=&quot;64&quot; w:dllVersion=&quot;0&quot; w:nlCheck=&quot;on&quot; w:optionSet=&quot;0&quot;/&gt;&lt;w:activeWritingStyle w:lang=&quot;580A&quot; w:vendorID=&quot;64&quot; w:dllVersion=&quot;0&quot; w:nlCheck=&quot;on&quot; w:optionSet=&quot;0&quot;/&gt;&lt;w:activeWritingStyle w:lang=&quot;PT-BR&quot; w:vendorID=&quot;64&quot; w:dllVersion=&quot;0&quot; w:nlCheck=&quot;on&quot; w:optionSet=&quot;0&quot;/&gt;&lt;w:stylePaneFormatFilter w:val=&quot;3F01&quot;/&gt;&lt;w:defaultTabStop w:val=&quot;720&quot;/&gt;&lt;w:hyphenationZone w:val=&quot;425&quot;/&gt;&lt;w:characterSpacingControl w:val=&quot;DontCompress&quot;/&gt;&lt;w:optimizeForBrowser/&gt;&lt;w:validateAgainstSchema/&gt;&lt;w:saveInvalidXML w:val=&quot;off&quot;/&gt;&lt;w:ignoreMixedContent w:val=&quot;off&quot;/&gt;&lt;w:alwaysShowPlaceholderText w:val=&quot;off&quot;/&gt;&lt;w:compat&gt;&lt;w:breakWrappedTables/&gt;&lt;w:snapToGridInCell/&gt;&lt;w:applyBreakingRules/&gt;&lt;w:wrapTextWithPunct/&gt;&lt;w:useAsianBreakRules/&gt;&lt;w:useWord2002TableStyleRules/&gt;&lt;w:useFELayout/&gt;&lt;/w:compat&gt;&lt;wsp:rsids&gt;&lt;wsp:rsidRoot wsp:val=&quot;00426FBB&quot;/&gt;&lt;wsp:rsid wsp:val=&quot;000002E1&quot;/&gt;&lt;wsp:rsid wsp:val=&quot;00003C97&quot;/&gt;&lt;wsp:rsid wsp:val=&quot;00005565&quot;/&gt;&lt;wsp:rsid wsp:val=&quot;0001754A&quot;/&gt;&lt;wsp:rsid wsp:val=&quot;00017719&quot;/&gt;&lt;wsp:rsid wsp:val=&quot;00027F1D&quot;/&gt;&lt;wsp:rsid wsp:val=&quot;0003296C&quot;/&gt;&lt;wsp:rsid wsp:val=&quot;0003351F&quot;/&gt;&lt;wsp:rsid wsp:val=&quot;00044599&quot;/&gt;&lt;wsp:rsid wsp:val=&quot;000540E6&quot;/&gt;&lt;wsp:rsid wsp:val=&quot;00054421&quot;/&gt;&lt;wsp:rsid wsp:val=&quot;00062E46&quot;/&gt;&lt;wsp:rsid wsp:val=&quot;00074AC8&quot;/&gt;&lt;wsp:rsid wsp:val=&quot;00081408&quot;/&gt;&lt;wsp:rsid wsp:val=&quot;00081EBE&quot;/&gt;&lt;wsp:rsid wsp:val=&quot;00086EDC&quot;/&gt;&lt;wsp:rsid wsp:val=&quot;000B1236&quot;/&gt;&lt;wsp:rsid wsp:val=&quot;000B36A3&quot;/&gt;&lt;wsp:rsid wsp:val=&quot;000C013C&quot;/&gt;&lt;wsp:rsid wsp:val=&quot;000E3F84&quot;/&gt;&lt;wsp:rsid wsp:val=&quot;001056DF&quot;/&gt;&lt;wsp:rsid wsp:val=&quot;0010789C&quot;/&gt;&lt;wsp:rsid wsp:val=&quot;00114025&quot;/&gt;&lt;wsp:rsid wsp:val=&quot;001160D2&quot;/&gt;&lt;wsp:rsid wsp:val=&quot;00120636&quot;/&gt;&lt;wsp:rsid wsp:val=&quot;001348A5&quot;/&gt;&lt;wsp:rsid wsp:val=&quot;00151B8E&quot;/&gt;&lt;wsp:rsid wsp:val=&quot;00182170&quot;/&gt;&lt;wsp:rsid wsp:val=&quot;001928FB&quot;/&gt;&lt;wsp:rsid wsp:val=&quot;00192BC7&quot;/&gt;&lt;wsp:rsid wsp:val=&quot;00195BE6&quot;/&gt;&lt;wsp:rsid wsp:val=&quot;001A3C37&quot;/&gt;&lt;wsp:rsid wsp:val=&quot;001A50EA&quot;/&gt;&lt;wsp:rsid wsp:val=&quot;001F16CD&quot;/&gt;&lt;wsp:rsid wsp:val=&quot;001F47D2&quot;/&gt;&lt;wsp:rsid wsp:val=&quot;002029C8&quot;/&gt;&lt;wsp:rsid wsp:val=&quot;0022285A&quot;/&gt;&lt;wsp:rsid wsp:val=&quot;00224C61&quot;/&gt;&lt;wsp:rsid wsp:val=&quot;002522D3&quot;/&gt;&lt;wsp:rsid wsp:val=&quot;00256ABC&quot;/&gt;&lt;wsp:rsid wsp:val=&quot;0027227B&quot;/&gt;&lt;wsp:rsid wsp:val=&quot;00273AC7&quot;/&gt;&lt;wsp:rsid wsp:val=&quot;00273D2C&quot;/&gt;&lt;wsp:rsid wsp:val=&quot;00285ECD&quot;/&gt;&lt;wsp:rsid wsp:val=&quot;00290E1B&quot;/&gt;&lt;wsp:rsid wsp:val=&quot;00291B17&quot;/&gt;&lt;wsp:rsid wsp:val=&quot;00291BB3&quot;/&gt;&lt;wsp:rsid wsp:val=&quot;002A6742&quot;/&gt;&lt;wsp:rsid wsp:val=&quot;002C1A7F&quot;/&gt;&lt;wsp:rsid wsp:val=&quot;002C4239&quot;/&gt;&lt;wsp:rsid wsp:val=&quot;002C559D&quot;/&gt;&lt;wsp:rsid wsp:val=&quot;002D16AE&quot;/&gt;&lt;wsp:rsid wsp:val=&quot;002D2D42&quot;/&gt;&lt;wsp:rsid wsp:val=&quot;002F72D0&quot;/&gt;&lt;wsp:rsid wsp:val=&quot;002F7A4F&quot;/&gt;&lt;wsp:rsid wsp:val=&quot;003003AB&quot;/&gt;&lt;wsp:rsid wsp:val=&quot;00302C35&quot;/&gt;&lt;wsp:rsid wsp:val=&quot;00311C49&quot;/&gt;&lt;wsp:rsid wsp:val=&quot;0032119E&quot;/&gt;&lt;wsp:rsid wsp:val=&quot;00321304&quot;/&gt;&lt;wsp:rsid wsp:val=&quot;00324FC2&quot;/&gt;&lt;wsp:rsid wsp:val=&quot;003312CA&quot;/&gt;&lt;wsp:rsid wsp:val=&quot;00331F84&quot;/&gt;&lt;wsp:rsid wsp:val=&quot;0037721F&quot;/&gt;&lt;wsp:rsid wsp:val=&quot;003950A4&quot;/&gt;&lt;wsp:rsid wsp:val=&quot;003A1E7E&quot;/&gt;&lt;wsp:rsid wsp:val=&quot;003E2FDC&quot;/&gt;&lt;wsp:rsid wsp:val=&quot;003E3577&quot;/&gt;&lt;wsp:rsid wsp:val=&quot;003F3A61&quot;/&gt;&lt;wsp:rsid wsp:val=&quot;00410A5D&quot;/&gt;&lt;wsp:rsid wsp:val=&quot;00414909&quot;/&gt;&lt;wsp:rsid wsp:val=&quot;00416537&quot;/&gt;&lt;wsp:rsid wsp:val=&quot;00425A6A&quot;/&gt;&lt;wsp:rsid wsp:val=&quot;00426FBB&quot;/&gt;&lt;wsp:rsid wsp:val=&quot;00454542&quot;/&gt;&lt;wsp:rsid wsp:val=&quot;0047429A&quot;/&gt;&lt;wsp:rsid wsp:val=&quot;0048374C&quot;/&gt;&lt;wsp:rsid wsp:val=&quot;0048771D&quot;/&gt;&lt;wsp:rsid wsp:val=&quot;004A6605&quot;/&gt;&lt;wsp:rsid wsp:val=&quot;004C45FA&quot;/&gt;&lt;wsp:rsid wsp:val=&quot;004D35A3&quot;/&gt;&lt;wsp:rsid wsp:val=&quot;004E1BD8&quot;/&gt;&lt;wsp:rsid wsp:val=&quot;004E452A&quot;/&gt;&lt;wsp:rsid wsp:val=&quot;004E78E3&quot;/&gt;&lt;wsp:rsid wsp:val=&quot;004F2BFE&quot;/&gt;&lt;wsp:rsid wsp:val=&quot;004F63D3&quot;/&gt;&lt;wsp:rsid wsp:val=&quot;004F7DCF&quot;/&gt;&lt;wsp:rsid wsp:val=&quot;005004BF&quot;/&gt;&lt;wsp:rsid wsp:val=&quot;00502E89&quot;/&gt;&lt;wsp:rsid wsp:val=&quot;00506CFE&quot;/&gt;&lt;wsp:rsid wsp:val=&quot;00510E95&quot;/&gt;&lt;wsp:rsid wsp:val=&quot;005225C3&quot;/&gt;&lt;wsp:rsid wsp:val=&quot;00527D56&quot;/&gt;&lt;wsp:rsid wsp:val=&quot;0053221F&quot;/&gt;&lt;wsp:rsid wsp:val=&quot;00536FAE&quot;/&gt;&lt;wsp:rsid wsp:val=&quot;00542C85&quot;/&gt;&lt;wsp:rsid wsp:val=&quot;00553510&quot;/&gt;&lt;wsp:rsid wsp:val=&quot;00554186&quot;/&gt;&lt;wsp:rsid wsp:val=&quot;00585769&quot;/&gt;&lt;wsp:rsid wsp:val=&quot;00585C61&quot;/&gt;&lt;wsp:rsid wsp:val=&quot;00591130&quot;/&gt;&lt;wsp:rsid wsp:val=&quot;005A3F28&quot;/&gt;&lt;wsp:rsid wsp:val=&quot;005A40BE&quot;/&gt;&lt;wsp:rsid wsp:val=&quot;005B13E2&quot;/&gt;&lt;wsp:rsid wsp:val=&quot;005B47D7&quot;/&gt;&lt;wsp:rsid wsp:val=&quot;005C5526&quot;/&gt;&lt;wsp:rsid wsp:val=&quot;005C62C6&quot;/&gt;&lt;wsp:rsid wsp:val=&quot;005D7B9E&quot;/&gt;&lt;wsp:rsid wsp:val=&quot;005E112E&quot;/&gt;&lt;wsp:rsid wsp:val=&quot;005F0834&quot;/&gt;&lt;wsp:rsid wsp:val=&quot;005F68AB&quot;/&gt;&lt;wsp:rsid wsp:val=&quot;005F6DC3&quot;/&gt;&lt;wsp:rsid wsp:val=&quot;00601A8E&quot;/&gt;&lt;wsp:rsid wsp:val=&quot;0062033E&quot;/&gt;&lt;wsp:rsid wsp:val=&quot;00624482&quot;/&gt;&lt;wsp:rsid wsp:val=&quot;0064799C&quot;/&gt;&lt;wsp:rsid wsp:val=&quot;00654156&quot;/&gt;&lt;wsp:rsid wsp:val=&quot;00656ADC&quot;/&gt;&lt;wsp:rsid wsp:val=&quot;006B47CA&quot;/&gt;&lt;wsp:rsid wsp:val=&quot;006C304C&quot;/&gt;&lt;wsp:rsid wsp:val=&quot;006C4511&quot;/&gt;&lt;wsp:rsid wsp:val=&quot;006C65F5&quot;/&gt;&lt;wsp:rsid wsp:val=&quot;006C7AAA&quot;/&gt;&lt;wsp:rsid wsp:val=&quot;006D1C2A&quot;/&gt;&lt;wsp:rsid wsp:val=&quot;006D264F&quot;/&gt;&lt;wsp:rsid wsp:val=&quot;006D4E89&quot;/&gt;&lt;wsp:rsid wsp:val=&quot;006E2A8D&quot;/&gt;&lt;wsp:rsid wsp:val=&quot;006E7574&quot;/&gt;&lt;wsp:rsid wsp:val=&quot;00703430&quot;/&gt;&lt;wsp:rsid wsp:val=&quot;00703548&quot;/&gt;&lt;wsp:rsid wsp:val=&quot;00704E18&quot;/&gt;&lt;wsp:rsid wsp:val=&quot;007069BE&quot;/&gt;&lt;wsp:rsid wsp:val=&quot;00745C86&quot;/&gt;&lt;wsp:rsid wsp:val=&quot;00764603&quot;/&gt;&lt;wsp:rsid wsp:val=&quot;0076604D&quot;/&gt;&lt;wsp:rsid wsp:val=&quot;00790909&quot;/&gt;&lt;wsp:rsid wsp:val=&quot;007929AF&quot;/&gt;&lt;wsp:rsid wsp:val=&quot;007B1582&quot;/&gt;&lt;wsp:rsid wsp:val=&quot;007B5A07&quot;/&gt;&lt;wsp:rsid wsp:val=&quot;007C065D&quot;/&gt;&lt;wsp:rsid wsp:val=&quot;007D3E71&quot;/&gt;&lt;wsp:rsid wsp:val=&quot;007E5D6A&quot;/&gt;&lt;wsp:rsid wsp:val=&quot;007E645D&quot;/&gt;&lt;wsp:rsid wsp:val=&quot;007F75CA&quot;/&gt;&lt;wsp:rsid wsp:val=&quot;00821E08&quot;/&gt;&lt;wsp:rsid wsp:val=&quot;00834EFD&quot;/&gt;&lt;wsp:rsid wsp:val=&quot;00844B24&quot;/&gt;&lt;wsp:rsid wsp:val=&quot;0084515F&quot;/&gt;&lt;wsp:rsid wsp:val=&quot;0085092D&quot;/&gt;&lt;wsp:rsid wsp:val=&quot;00865414&quot;/&gt;&lt;wsp:rsid wsp:val=&quot;00877D4C&quot;/&gt;&lt;wsp:rsid wsp:val=&quot;00883903&quot;/&gt;&lt;wsp:rsid wsp:val=&quot;00891C30&quot;/&gt;&lt;wsp:rsid wsp:val=&quot;0089763B&quot;/&gt;&lt;wsp:rsid wsp:val=&quot;008B6AE3&quot;/&gt;&lt;wsp:rsid wsp:val=&quot;008C1332&quot;/&gt;&lt;wsp:rsid wsp:val=&quot;008D1045&quot;/&gt;&lt;wsp:rsid wsp:val=&quot;008E5996&quot;/&gt;&lt;wsp:rsid wsp:val=&quot;00901AE1&quot;/&gt;&lt;wsp:rsid wsp:val=&quot;00912F93&quot;/&gt;&lt;wsp:rsid wsp:val=&quot;009205B4&quot;/&gt;&lt;wsp:rsid wsp:val=&quot;00955B59&quot;/&gt;&lt;wsp:rsid wsp:val=&quot;00992262&quot;/&gt;&lt;wsp:rsid wsp:val=&quot;009926BC&quot;/&gt;&lt;wsp:rsid wsp:val=&quot;009A4319&quot;/&gt;&lt;wsp:rsid wsp:val=&quot;009A6C3F&quot;/&gt;&lt;wsp:rsid wsp:val=&quot;009B73F2&quot;/&gt;&lt;wsp:rsid wsp:val=&quot;009C12BD&quot;/&gt;&lt;wsp:rsid wsp:val=&quot;009C50FE&quot;/&gt;&lt;wsp:rsid wsp:val=&quot;009E49DD&quot;/&gt;&lt;wsp:rsid wsp:val=&quot;00A03E75&quot;/&gt;&lt;wsp:rsid wsp:val=&quot;00A20627&quot;/&gt;&lt;wsp:rsid wsp:val=&quot;00A22FE9&quot;/&gt;&lt;wsp:rsid wsp:val=&quot;00A31A44&quot;/&gt;&lt;wsp:rsid wsp:val=&quot;00A32BFA&quot;/&gt;&lt;wsp:rsid wsp:val=&quot;00A3325E&quot;/&gt;&lt;wsp:rsid wsp:val=&quot;00A45FCE&quot;/&gt;&lt;wsp:rsid wsp:val=&quot;00A75671&quot;/&gt;&lt;wsp:rsid wsp:val=&quot;00A773CC&quot;/&gt;&lt;wsp:rsid wsp:val=&quot;00A924D0&quot;/&gt;&lt;wsp:rsid wsp:val=&quot;00A9318B&quot;/&gt;&lt;wsp:rsid wsp:val=&quot;00A94AC1&quot;/&gt;&lt;wsp:rsid wsp:val=&quot;00AB18B7&quot;/&gt;&lt;wsp:rsid wsp:val=&quot;00AD335D&quot;/&gt;&lt;wsp:rsid wsp:val=&quot;00AF114C&quot;/&gt;&lt;wsp:rsid wsp:val=&quot;00AF792B&quot;/&gt;&lt;wsp:rsid wsp:val=&quot;00B32137&quot;/&gt;&lt;wsp:rsid wsp:val=&quot;00B33D2F&quot;/&gt;&lt;wsp:rsid wsp:val=&quot;00B40A5B&quot;/&gt;&lt;wsp:rsid wsp:val=&quot;00B45C6B&quot;/&gt;&lt;wsp:rsid wsp:val=&quot;00B55D5E&quot;/&gt;&lt;wsp:rsid wsp:val=&quot;00B57A80&quot;/&gt;&lt;wsp:rsid wsp:val=&quot;00B70E9C&quot;/&gt;&lt;wsp:rsid wsp:val=&quot;00B713D8&quot;/&gt;&lt;wsp:rsid wsp:val=&quot;00B72979&quot;/&gt;&lt;wsp:rsid wsp:val=&quot;00B94516&quot;/&gt;&lt;wsp:rsid wsp:val=&quot;00BA25E2&quot;/&gt;&lt;wsp:rsid wsp:val=&quot;00BB2855&quot;/&gt;&lt;wsp:rsid wsp:val=&quot;00BC5343&quot;/&gt;&lt;wsp:rsid wsp:val=&quot;00BD19C1&quot;/&gt;&lt;wsp:rsid wsp:val=&quot;00BD25B8&quot;/&gt;&lt;wsp:rsid wsp:val=&quot;00C012E1&quot;/&gt;&lt;wsp:rsid wsp:val=&quot;00C06BB4&quot;/&gt;&lt;wsp:rsid wsp:val=&quot;00C10D20&quot;/&gt;&lt;wsp:rsid wsp:val=&quot;00C12E0C&quot;/&gt;&lt;wsp:rsid wsp:val=&quot;00C21916&quot;/&gt;&lt;wsp:rsid wsp:val=&quot;00C34915&quot;/&gt;&lt;wsp:rsid wsp:val=&quot;00C457CA&quot;/&gt;&lt;wsp:rsid wsp:val=&quot;00C53FB6&quot;/&gt;&lt;wsp:rsid wsp:val=&quot;00C57FB7&quot;/&gt;&lt;wsp:rsid wsp:val=&quot;00C644D4&quot;/&gt;&lt;wsp:rsid wsp:val=&quot;00C65F3F&quot;/&gt;&lt;wsp:rsid wsp:val=&quot;00C72414&quot;/&gt;&lt;wsp:rsid wsp:val=&quot;00C72B1A&quot;/&gt;&lt;wsp:rsid wsp:val=&quot;00C8667B&quot;/&gt;&lt;wsp:rsid wsp:val=&quot;00C90993&quot;/&gt;&lt;wsp:rsid wsp:val=&quot;00CA4CE3&quot;/&gt;&lt;wsp:rsid wsp:val=&quot;00CC72FD&quot;/&gt;&lt;wsp:rsid wsp:val=&quot;00CD1D23&quot;/&gt;&lt;wsp:rsid wsp:val=&quot;00CD4F3F&quot;/&gt;&lt;wsp:rsid wsp:val=&quot;00D311F8&quot;/&gt;&lt;wsp:rsid wsp:val=&quot;00D31660&quot;/&gt;&lt;wsp:rsid wsp:val=&quot;00D36B52&quot;/&gt;&lt;wsp:rsid wsp:val=&quot;00D377C8&quot;/&gt;&lt;wsp:rsid wsp:val=&quot;00D41274&quot;/&gt;&lt;wsp:rsid wsp:val=&quot;00D4229C&quot;/&gt;&lt;wsp:rsid wsp:val=&quot;00D43BF3&quot;/&gt;&lt;wsp:rsid wsp:val=&quot;00D549FB&quot;/&gt;&lt;wsp:rsid wsp:val=&quot;00D56487&quot;/&gt;&lt;wsp:rsid wsp:val=&quot;00D767BB&quot;/&gt;&lt;wsp:rsid wsp:val=&quot;00D939B0&quot;/&gt;&lt;wsp:rsid wsp:val=&quot;00DA31A2&quot;/&gt;&lt;wsp:rsid wsp:val=&quot;00DB16E0&quot;/&gt;&lt;wsp:rsid wsp:val=&quot;00DB2DF9&quot;/&gt;&lt;wsp:rsid wsp:val=&quot;00DB465D&quot;/&gt;&lt;wsp:rsid wsp:val=&quot;00DB48A2&quot;/&gt;&lt;wsp:rsid wsp:val=&quot;00DB7E63&quot;/&gt;&lt;wsp:rsid wsp:val=&quot;00DC2055&quot;/&gt;&lt;wsp:rsid wsp:val=&quot;00DC3908&quot;/&gt;&lt;wsp:rsid wsp:val=&quot;00DD71E8&quot;/&gt;&lt;wsp:rsid wsp:val=&quot;00DD7F83&quot;/&gt;&lt;wsp:rsid wsp:val=&quot;00DE4EB8&quot;/&gt;&lt;wsp:rsid wsp:val=&quot;00E0641E&quot;/&gt;&lt;wsp:rsid wsp:val=&quot;00E06664&quot;/&gt;&lt;wsp:rsid wsp:val=&quot;00E304BC&quot;/&gt;&lt;wsp:rsid wsp:val=&quot;00E32853&quot;/&gt;&lt;wsp:rsid wsp:val=&quot;00E34EBD&quot;/&gt;&lt;wsp:rsid wsp:val=&quot;00E401F8&quot;/&gt;&lt;wsp:rsid wsp:val=&quot;00E46425&quot;/&gt;&lt;wsp:rsid wsp:val=&quot;00E469FC&quot;/&gt;&lt;wsp:rsid wsp:val=&quot;00E47D0E&quot;/&gt;&lt;wsp:rsid wsp:val=&quot;00E65018&quot;/&gt;&lt;wsp:rsid wsp:val=&quot;00E76CA1&quot;/&gt;&lt;wsp:rsid wsp:val=&quot;00E94339&quot;/&gt;&lt;wsp:rsid wsp:val=&quot;00E97563&quot;/&gt;&lt;wsp:rsid wsp:val=&quot;00EB0B63&quot;/&gt;&lt;wsp:rsid wsp:val=&quot;00EC265C&quot;/&gt;&lt;wsp:rsid wsp:val=&quot;00ED61CB&quot;/&gt;&lt;wsp:rsid wsp:val=&quot;00EE752A&quot;/&gt;&lt;wsp:rsid wsp:val=&quot;00F06A72&quot;/&gt;&lt;wsp:rsid wsp:val=&quot;00F136F0&quot;/&gt;&lt;wsp:rsid wsp:val=&quot;00F20BBB&quot;/&gt;&lt;wsp:rsid wsp:val=&quot;00F36048&quot;/&gt;&lt;wsp:rsid wsp:val=&quot;00F43BD8&quot;/&gt;&lt;wsp:rsid wsp:val=&quot;00F562F3&quot;/&gt;&lt;wsp:rsid wsp:val=&quot;00F74B89&quot;/&gt;&lt;wsp:rsid wsp:val=&quot;00F75133&quot;/&gt;&lt;wsp:rsid wsp:val=&quot;00F83272&quot;/&gt;&lt;wsp:rsid wsp:val=&quot;00F9358D&quot;/&gt;&lt;wsp:rsid wsp:val=&quot;00F9369B&quot;/&gt;&lt;wsp:rsid wsp:val=&quot;00FA3899&quot;/&gt;&lt;wsp:rsid wsp:val=&quot;00FA4909&quot;/&gt;&lt;wsp:rsid wsp:val=&quot;00FA5164&quot;/&gt;&lt;wsp:rsid wsp:val=&quot;00FA6751&quot;/&gt;&lt;wsp:rsid wsp:val=&quot;00FA6BD7&quot;/&gt;&lt;wsp:rsid wsp:val=&quot;00FB1048&quot;/&gt;&lt;wsp:rsid wsp:val=&quot;00FB62C4&quot;/&gt;&lt;wsp:rsid wsp:val=&quot;00FB7701&quot;/&gt;&lt;wsp:rsid wsp:val=&quot;00FD1AC5&quot;/&gt;&lt;wsp:rsid wsp:val=&quot;00FD5CF0&quot;/&gt;&lt;/wsp:rsids&gt;&lt;/w:docPr&gt;&lt;w:body&gt;&lt;wx:sect&gt;&lt;w:p wsp:rsidR=&quot;002522D3&quot; wsp:rsidRPr=&quot;002522D3&quot; wsp:rsidRDefault=&quot;002522D3&quot; wsp:rsidP=&quot;002522D3&quot;&gt;&lt;m:oMathPara&gt;&lt;m:oMath&gt;&lt;m:sSub&gt;&lt;m:sSubPr&gt;&lt;m:ctrlPr&gt;&lt;w:rPr&gt;&lt;w:rFonts w:ascii=&quot;Cambria Math&quot; w:h-ansi=&quot;Cambria Math&quot;/&gt;&lt;wx:font wx:val=&quot;Cambria Math&quot;/&gt;&lt;w:i/&gt;&lt;/w:rPr&gt;&lt;/m:ctrlPr&gt;&lt;/m:sSubPr&gt;&lt;m:e&gt;&lt;m:r&gt;&lt;w:rPr&gt;&lt;w:rFonts w:ascii=&quot;Cambria Math&quot; w:h-ansi=&quot;Cambria Math&quot;/&gt;&lt;wx:font wx:val=&quot;Cambria Math&quot;/&gt;&lt;w:i/&gt;&lt;/w:rPr&gt;&lt;m:t&gt;I&lt;/m:t&gt;&lt;/m:r&gt;&lt;/m:e&gt;&lt;m:sub&gt;&lt;m:r&gt;&lt;w:rPr&gt;&lt;w:rFonts w:ascii=&quot;Cambria Math&quot; w:h-ansi=&quot;Cambria Math&quot;/&gt;&lt;wx:font wx:val=&quot;Cambria Math&quot;/&gt;&lt;w:i/&gt;&lt;/w:rPr&gt;&lt;m:t&gt;out&lt;/m:t&gt;&lt;/m:r&gt;&lt;/m:sub&gt;&lt;/m:sSub&gt;&lt;/m:oMath&gt;&lt;/m:oMathPara&gt;&lt;/w:p&gt;&lt;w:sectPr wsp:rsidR=&quot;00000000&quot; wsp:rsidRPr=&quot;002522D3&quot;&gt;&lt;w:pgSz w:w=&quot;12240&quot; w:h=&quot;15840&quot;/&gt;&lt;w:pgMar w:top=&quot;1440&quot; w:right=&quot;1440&quot; w:bottom=&quot;1440&quot; w:left=&quot;1440&quot; w:header=&quot;720&quot; w:footer=&quot;720&quot; w:gutter=&quot;0&quot;/&gt;&lt;w:cols w:space=&quot;720&quot;/&gt;&lt;/w:sectPr&gt;&lt;/wx:sect&gt;&lt;/w:body&gt;&lt;/w:wordDocument&gt;">
                   <v:imagedata r:id="rId19" o:title="" chromakey="white"/>
                 </v:shape>
               </w:pict>
@@ -2434,7 +2434,7 @@
         </w:tc>
         <w:tc>
           <w:tcPr>
-            <w:tcW w:w="942" w:type="dxa"/>
+            <w:tcW w:w="939" w:type="dxa"/>
             <w:shd w:val="clear" w:color="auto" w:fill="auto"/>
           </w:tcPr>
           <w:p>
@@ -2456,7 +2456,7 @@
         </w:tc>
         <w:tc>
           <w:tcPr>
-            <w:tcW w:w="774" w:type="dxa"/>
+            <w:tcW w:w="784" w:type="dxa"/>
             <w:shd w:val="clear" w:color="auto" w:fill="auto"/>
           </w:tcPr>
           <w:p>
@@ -2479,12 +2479,12 @@
       </w:tr>
       <w:tr>
         <w:trPr>
-          <w:trHeight w:val="399"/>
+          <w:trHeight w:val="386"/>
           <w:jc w:val="center"/>
         </w:trPr>
         <w:tc>
           <w:tcPr>
-            <w:tcW w:w="2336" w:type="dxa"/>
+            <w:tcW w:w="2329" w:type="dxa"/>
             <w:shd w:val="clear" w:color="auto" w:fill="D9D9D9"/>
           </w:tcPr>
           <w:p>
@@ -2505,7 +2505,7 @@
         </w:tc>
         <w:tc>
           <w:tcPr>
-            <w:tcW w:w="976" w:type="dxa"/>
+            <w:tcW w:w="973" w:type="dxa"/>
             <w:shd w:val="clear" w:color="auto" w:fill="D9D9D9"/>
           </w:tcPr>
           <w:p>
@@ -2522,7 +2522,7 @@
                 <w:szCs w:val="18"/>
               </w:rPr>
               <w:pict w14:anchorId="6B179145">
-                <v:shape id="_x0000_i1910" type="#_x0000_t75" style="width:9.25pt;height:13.65pt" equationxml="&lt;?xml version=&quot;1.0&quot; encoding=&quot;UTF-8&quot; standalone=&quot;yes&quot;?&gt;&#10;&lt;?mso-application progid=&quot;Word.Document&quot;?&gt;&#10;&lt;w:wordDocument xmlns:aml=&quot;http://schemas.microsoft.com/aml/2001/core&quot; xmlns:wpc=&quot;http://schemas.microsoft.com/office/word/2010/wordprocessingCanvas&quot; xmlns:cx=&quot;http://schemas.microsoft.com/office/drawing/2014/chartex&quot; xmlns:cx1=&quot;http://schemas.microsoft.com/office/drawing/2015/9/8/chartex&quot; xmlns:cx2=&quot;http://schemas.microsoft.com/office/drawing/2015/10/21/chartex&quot; xmlns:cx3=&quot;http://schemas.microsoft.com/office/drawing/2016/5/9/chartex&quot; xmlns:cx4=&quot;http://schemas.microsoft.com/office/drawing/2016/5/10/chartex&quot; xmlns:cx5=&quot;http://schemas.microsoft.com/office/drawing/2016/5/11/chartex&quot; xmlns:cx6=&quot;http://schemas.microsoft.com/office/drawing/2016/5/12/chartex&quot; xmlns:cx7=&quot;http://schemas.microsoft.com/office/drawing/2016/5/13/chartex&quot; xmlns:cx8=&quot;http://schemas.microsoft.com/office/drawing/2016/5/14/chartex&quot; xmlns:cr=&quot;http://schemas.microsoft.com/office/comments/2020/reactions&quot; xmlns:dt=&quot;uuid:C2F41010-65B3-11d1-A29F-00AA00C14882&quot; xmlns:mc=&quot;http://schemas.openxmlformats.org/markup-compatibility/2006&quot; xmlns:aink=&quot;http://schemas.microsoft.com/office/drawing/2016/ink&quot; xmlns:am3d=&quot;http://schemas.microsoft.com/office/drawing/2017/model3d&quot; xmlns:o=&quot;urn:schemas-microsoft-com:office:office&quot; xmlns:oel=&quot;http://schemas.microsoft.com/office/2019/extlst&quot; xmlns:m=&quot;http://schemas.openxmlformats.org/officeDocument/2006/math&quot; xmlns:v=&quot;urn:schemas-microsoft-com:vml&quot; xmlns:w10=&quot;urn:schemas-microsoft-com:office:word&quot; xmlns:w=&quot;http://schemas.microsoft.com/office/word/2003/wordml&quot; xmlns:wx=&quot;http://schemas.microsoft.com/office/word/2003/auxHint&quot; xmlns:wne=&quot;http://schemas.microsoft.com/office/word/2006/wordml&quot; xmlns:wsp=&quot;http://schemas.microsoft.com/office/word/2003/wordml/sp2&quot; xmlns:sl=&quot;http://schemas.microsoft.com/schemaLibrary/2003/core&quot; w:macrosPresent=&quot;no&quot; w:embeddedObjPresent=&quot;no&quot; w:ocxPresent=&quot;no&quot; xml:space=&quot;preserve&quot;&gt;&lt;w:ignoreSubtree w:val=&quot;http://schemas.microsoft.com/office/word/2003/wordml/sp2&quot;/&gt;&lt;o:DocumentProperties&gt;&lt;o:Version&gt;16&lt;/o:Version&gt;&lt;/o:DocumentProperties&gt;&lt;w:docPr&gt;&lt;w:view w:val=&quot;print&quot;/&gt;&lt;w:zoom w:percent=&quot;100&quot;/&gt;&lt;w:doNotEmbedSystemFonts/&gt;&lt;w:activeWritingStyle w:lang=&quot;EN-AU&quot; w:vendorID=&quot;64&quot; w:dllVersion=&quot;6&quot; w:nlCheck=&quot;on&quot; w:optionSet=&quot;1&quot;/&gt;&lt;w:activeWritingStyle w:lang=&quot;EN-GB&quot; w:vendorID=&quot;64&quot; w:dllVersion=&quot;6&quot; w:nlCheck=&quot;on&quot; w:optionSet=&quot;1&quot;/&gt;&lt;w:activeWritingStyle w:lang=&quot;EN-US&quot; w:vendorID=&quot;64&quot; w:dllVersion=&quot;6&quot; w:nlCheck=&quot;on&quot; w:optionSet=&quot;1&quot;/&gt;&lt;w:activeWritingStyle w:lang=&quot;EN-AU&quot; w:vendorID=&quot;64&quot; w:dllVersion=&quot;0&quot; w:nlCheck=&quot;on&quot; w:optionSet=&quot;0&quot;/&gt;&lt;w:activeWritingStyle w:lang=&quot;EN-GB&quot; w:vendorID=&quot;64&quot; w:dllVersion=&quot;0&quot; w:nlCheck=&quot;on&quot; w:optionSet=&quot;0&quot;/&gt;&lt;w:activeWritingStyle w:lang=&quot;EN-US&quot; w:vendorID=&quot;64&quot; w:dllVersion=&quot;0&quot; w:nlCheck=&quot;on&quot; w:optionSet=&quot;0&quot;/&gt;&lt;w:activeWritingStyle w:lang=&quot;ES-AR&quot; w:vendorID=&quot;64&quot; w:dllVersion=&quot;0&quot; w:nlCheck=&quot;on&quot; w:optionSet=&quot;0&quot;/&gt;&lt;w:activeWritingStyle w:lang=&quot;580A&quot; w:vendorID=&quot;64&quot; w:dllVersion=&quot;0&quot; w:nlCheck=&quot;on&quot; w:optionSet=&quot;0&quot;/&gt;&lt;w:activeWritingStyle w:lang=&quot;PT-BR&quot; w:vendorID=&quot;64&quot; w:dllVersion=&quot;0&quot; w:nlCheck=&quot;on&quot; w:optionSet=&quot;0&quot;/&gt;&lt;w:stylePaneFormatFilter w:val=&quot;3F01&quot;/&gt;&lt;w:defaultTabStop w:val=&quot;720&quot;/&gt;&lt;w:hyphenationZone w:val=&quot;425&quot;/&gt;&lt;w:characterSpacingControl w:val=&quot;DontCompress&quot;/&gt;&lt;w:optimizeForBrowser/&gt;&lt;w:validateAgainstSchema/&gt;&lt;w:saveInvalidXML w:val=&quot;off&quot;/&gt;&lt;w:ignoreMixedContent w:val=&quot;off&quot;/&gt;&lt;w:alwaysShowPlaceholderText w:val=&quot;off&quot;/&gt;&lt;w:compat&gt;&lt;w:breakWrappedTables/&gt;&lt;w:snapToGridInCell/&gt;&lt;w:applyBreakingRules/&gt;&lt;w:wrapTextWithPunct/&gt;&lt;w:useAsianBreakRules/&gt;&lt;w:useWord2002TableStyleRules/&gt;&lt;w:useFELayout/&gt;&lt;/w:compat&gt;&lt;wsp:rsids&gt;&lt;wsp:rsidRoot wsp:val=&quot;00426FBB&quot;/&gt;&lt;wsp:rsid wsp:val=&quot;000002E1&quot;/&gt;&lt;wsp:rsid wsp:val=&quot;00003C97&quot;/&gt;&lt;wsp:rsid wsp:val=&quot;00005565&quot;/&gt;&lt;wsp:rsid wsp:val=&quot;0001754A&quot;/&gt;&lt;wsp:rsid wsp:val=&quot;00017719&quot;/&gt;&lt;wsp:rsid wsp:val=&quot;00027F1D&quot;/&gt;&lt;wsp:rsid wsp:val=&quot;0003296C&quot;/&gt;&lt;wsp:rsid wsp:val=&quot;0003351F&quot;/&gt;&lt;wsp:rsid wsp:val=&quot;00044599&quot;/&gt;&lt;wsp:rsid wsp:val=&quot;000540E6&quot;/&gt;&lt;wsp:rsid wsp:val=&quot;00054421&quot;/&gt;&lt;wsp:rsid wsp:val=&quot;00062E46&quot;/&gt;&lt;wsp:rsid wsp:val=&quot;00074AC8&quot;/&gt;&lt;wsp:rsid wsp:val=&quot;00081408&quot;/&gt;&lt;wsp:rsid wsp:val=&quot;00081EBE&quot;/&gt;&lt;wsp:rsid wsp:val=&quot;00086EDC&quot;/&gt;&lt;wsp:rsid wsp:val=&quot;000B1236&quot;/&gt;&lt;wsp:rsid wsp:val=&quot;000B36A3&quot;/&gt;&lt;wsp:rsid wsp:val=&quot;000C013C&quot;/&gt;&lt;wsp:rsid wsp:val=&quot;000E3F84&quot;/&gt;&lt;wsp:rsid wsp:val=&quot;001056DF&quot;/&gt;&lt;wsp:rsid wsp:val=&quot;0010789C&quot;/&gt;&lt;wsp:rsid wsp:val=&quot;00114025&quot;/&gt;&lt;wsp:rsid wsp:val=&quot;001160D2&quot;/&gt;&lt;wsp:rsid wsp:val=&quot;00120636&quot;/&gt;&lt;wsp:rsid wsp:val=&quot;001348A5&quot;/&gt;&lt;wsp:rsid wsp:val=&quot;00151B8E&quot;/&gt;&lt;wsp:rsid wsp:val=&quot;00182170&quot;/&gt;&lt;wsp:rsid wsp:val=&quot;001928FB&quot;/&gt;&lt;wsp:rsid wsp:val=&quot;00192BC7&quot;/&gt;&lt;wsp:rsid wsp:val=&quot;00195BE6&quot;/&gt;&lt;wsp:rsid wsp:val=&quot;001A3C37&quot;/&gt;&lt;wsp:rsid wsp:val=&quot;001A50EA&quot;/&gt;&lt;wsp:rsid wsp:val=&quot;001F16CD&quot;/&gt;&lt;wsp:rsid wsp:val=&quot;001F47D2&quot;/&gt;&lt;wsp:rsid wsp:val=&quot;002029C8&quot;/&gt;&lt;wsp:rsid wsp:val=&quot;0022285A&quot;/&gt;&lt;wsp:rsid wsp:val=&quot;00224C61&quot;/&gt;&lt;wsp:rsid wsp:val=&quot;00256ABC&quot;/&gt;&lt;wsp:rsid wsp:val=&quot;0027227B&quot;/&gt;&lt;wsp:rsid wsp:val=&quot;00273AC7&quot;/&gt;&lt;wsp:rsid wsp:val=&quot;00273D2C&quot;/&gt;&lt;wsp:rsid wsp:val=&quot;00285ECD&quot;/&gt;&lt;wsp:rsid wsp:val=&quot;00290E1B&quot;/&gt;&lt;wsp:rsid wsp:val=&quot;00291B17&quot;/&gt;&lt;wsp:rsid wsp:val=&quot;00291BB3&quot;/&gt;&lt;wsp:rsid wsp:val=&quot;002A6742&quot;/&gt;&lt;wsp:rsid wsp:val=&quot;002C1A7F&quot;/&gt;&lt;wsp:rsid wsp:val=&quot;002C4239&quot;/&gt;&lt;wsp:rsid wsp:val=&quot;002C559D&quot;/&gt;&lt;wsp:rsid wsp:val=&quot;002D16AE&quot;/&gt;&lt;wsp:rsid wsp:val=&quot;002D2D42&quot;/&gt;&lt;wsp:rsid wsp:val=&quot;002F72D0&quot;/&gt;&lt;wsp:rsid wsp:val=&quot;002F7A4F&quot;/&gt;&lt;wsp:rsid wsp:val=&quot;003003AB&quot;/&gt;&lt;wsp:rsid wsp:val=&quot;00302C35&quot;/&gt;&lt;wsp:rsid wsp:val=&quot;00311C49&quot;/&gt;&lt;wsp:rsid wsp:val=&quot;0032119E&quot;/&gt;&lt;wsp:rsid wsp:val=&quot;00321304&quot;/&gt;&lt;wsp:rsid wsp:val=&quot;00324FC2&quot;/&gt;&lt;wsp:rsid wsp:val=&quot;003312CA&quot;/&gt;&lt;wsp:rsid wsp:val=&quot;00331F84&quot;/&gt;&lt;wsp:rsid wsp:val=&quot;0037721F&quot;/&gt;&lt;wsp:rsid wsp:val=&quot;003950A4&quot;/&gt;&lt;wsp:rsid wsp:val=&quot;003A1E7E&quot;/&gt;&lt;wsp:rsid wsp:val=&quot;003E2FDC&quot;/&gt;&lt;wsp:rsid wsp:val=&quot;003E3577&quot;/&gt;&lt;wsp:rsid wsp:val=&quot;003F3A61&quot;/&gt;&lt;wsp:rsid wsp:val=&quot;00410A5D&quot;/&gt;&lt;wsp:rsid wsp:val=&quot;00414909&quot;/&gt;&lt;wsp:rsid wsp:val=&quot;00416537&quot;/&gt;&lt;wsp:rsid wsp:val=&quot;00425A6A&quot;/&gt;&lt;wsp:rsid wsp:val=&quot;00426FBB&quot;/&gt;&lt;wsp:rsid wsp:val=&quot;00454542&quot;/&gt;&lt;wsp:rsid wsp:val=&quot;0047429A&quot;/&gt;&lt;wsp:rsid wsp:val=&quot;0048374C&quot;/&gt;&lt;wsp:rsid wsp:val=&quot;0048771D&quot;/&gt;&lt;wsp:rsid wsp:val=&quot;004A6605&quot;/&gt;&lt;wsp:rsid wsp:val=&quot;004C45FA&quot;/&gt;&lt;wsp:rsid wsp:val=&quot;004D35A3&quot;/&gt;&lt;wsp:rsid wsp:val=&quot;004E1BD8&quot;/&gt;&lt;wsp:rsid wsp:val=&quot;004E452A&quot;/&gt;&lt;wsp:rsid wsp:val=&quot;004E78E3&quot;/&gt;&lt;wsp:rsid wsp:val=&quot;004F2BFE&quot;/&gt;&lt;wsp:rsid wsp:val=&quot;004F63D3&quot;/&gt;&lt;wsp:rsid wsp:val=&quot;004F7DCF&quot;/&gt;&lt;wsp:rsid wsp:val=&quot;005004BF&quot;/&gt;&lt;wsp:rsid wsp:val=&quot;00502E89&quot;/&gt;&lt;wsp:rsid wsp:val=&quot;00506CFE&quot;/&gt;&lt;wsp:rsid wsp:val=&quot;00510E95&quot;/&gt;&lt;wsp:rsid wsp:val=&quot;005225C3&quot;/&gt;&lt;wsp:rsid wsp:val=&quot;00527D56&quot;/&gt;&lt;wsp:rsid wsp:val=&quot;0053221F&quot;/&gt;&lt;wsp:rsid wsp:val=&quot;00536FAE&quot;/&gt;&lt;wsp:rsid wsp:val=&quot;00542C85&quot;/&gt;&lt;wsp:rsid wsp:val=&quot;00553510&quot;/&gt;&lt;wsp:rsid wsp:val=&quot;00554186&quot;/&gt;&lt;wsp:rsid wsp:val=&quot;00585769&quot;/&gt;&lt;wsp:rsid wsp:val=&quot;00585C61&quot;/&gt;&lt;wsp:rsid wsp:val=&quot;00591130&quot;/&gt;&lt;wsp:rsid wsp:val=&quot;005A3F28&quot;/&gt;&lt;wsp:rsid wsp:val=&quot;005A40BE&quot;/&gt;&lt;wsp:rsid wsp:val=&quot;005B13E2&quot;/&gt;&lt;wsp:rsid wsp:val=&quot;005B47D7&quot;/&gt;&lt;wsp:rsid wsp:val=&quot;005C5526&quot;/&gt;&lt;wsp:rsid wsp:val=&quot;005C62C6&quot;/&gt;&lt;wsp:rsid wsp:val=&quot;005D7B9E&quot;/&gt;&lt;wsp:rsid wsp:val=&quot;005E112E&quot;/&gt;&lt;wsp:rsid wsp:val=&quot;005F0834&quot;/&gt;&lt;wsp:rsid wsp:val=&quot;005F68AB&quot;/&gt;&lt;wsp:rsid wsp:val=&quot;005F6DC3&quot;/&gt;&lt;wsp:rsid wsp:val=&quot;00601A8E&quot;/&gt;&lt;wsp:rsid wsp:val=&quot;0062033E&quot;/&gt;&lt;wsp:rsid wsp:val=&quot;00624482&quot;/&gt;&lt;wsp:rsid wsp:val=&quot;0064799C&quot;/&gt;&lt;wsp:rsid wsp:val=&quot;00654156&quot;/&gt;&lt;wsp:rsid wsp:val=&quot;00656ADC&quot;/&gt;&lt;wsp:rsid wsp:val=&quot;006B47CA&quot;/&gt;&lt;wsp:rsid wsp:val=&quot;006C304C&quot;/&gt;&lt;wsp:rsid wsp:val=&quot;006C4511&quot;/&gt;&lt;wsp:rsid wsp:val=&quot;006C65F5&quot;/&gt;&lt;wsp:rsid wsp:val=&quot;006C7AAA&quot;/&gt;&lt;wsp:rsid wsp:val=&quot;006D1C2A&quot;/&gt;&lt;wsp:rsid wsp:val=&quot;006D264F&quot;/&gt;&lt;wsp:rsid wsp:val=&quot;006D4E89&quot;/&gt;&lt;wsp:rsid wsp:val=&quot;006E2A8D&quot;/&gt;&lt;wsp:rsid wsp:val=&quot;006E7574&quot;/&gt;&lt;wsp:rsid wsp:val=&quot;00703430&quot;/&gt;&lt;wsp:rsid wsp:val=&quot;00703548&quot;/&gt;&lt;wsp:rsid wsp:val=&quot;00704E18&quot;/&gt;&lt;wsp:rsid wsp:val=&quot;007069BE&quot;/&gt;&lt;wsp:rsid wsp:val=&quot;00745C86&quot;/&gt;&lt;wsp:rsid wsp:val=&quot;00764603&quot;/&gt;&lt;wsp:rsid wsp:val=&quot;0076604D&quot;/&gt;&lt;wsp:rsid wsp:val=&quot;00790909&quot;/&gt;&lt;wsp:rsid wsp:val=&quot;00790F89&quot;/&gt;&lt;wsp:rsid wsp:val=&quot;007929AF&quot;/&gt;&lt;wsp:rsid wsp:val=&quot;007B1582&quot;/&gt;&lt;wsp:rsid wsp:val=&quot;007B5A07&quot;/&gt;&lt;wsp:rsid wsp:val=&quot;007C065D&quot;/&gt;&lt;wsp:rsid wsp:val=&quot;007D3E71&quot;/&gt;&lt;wsp:rsid wsp:val=&quot;007E5D6A&quot;/&gt;&lt;wsp:rsid wsp:val=&quot;007E645D&quot;/&gt;&lt;wsp:rsid wsp:val=&quot;007F75CA&quot;/&gt;&lt;wsp:rsid wsp:val=&quot;00821E08&quot;/&gt;&lt;wsp:rsid wsp:val=&quot;00834EFD&quot;/&gt;&lt;wsp:rsid wsp:val=&quot;00844B24&quot;/&gt;&lt;wsp:rsid wsp:val=&quot;0084515F&quot;/&gt;&lt;wsp:rsid wsp:val=&quot;0085092D&quot;/&gt;&lt;wsp:rsid wsp:val=&quot;00865414&quot;/&gt;&lt;wsp:rsid wsp:val=&quot;00877D4C&quot;/&gt;&lt;wsp:rsid wsp:val=&quot;00883903&quot;/&gt;&lt;wsp:rsid wsp:val=&quot;00891C30&quot;/&gt;&lt;wsp:rsid wsp:val=&quot;0089763B&quot;/&gt;&lt;wsp:rsid wsp:val=&quot;008B6AE3&quot;/&gt;&lt;wsp:rsid wsp:val=&quot;008C1332&quot;/&gt;&lt;wsp:rsid wsp:val=&quot;008D1045&quot;/&gt;&lt;wsp:rsid wsp:val=&quot;008E5996&quot;/&gt;&lt;wsp:rsid wsp:val=&quot;00901AE1&quot;/&gt;&lt;wsp:rsid wsp:val=&quot;00912F93&quot;/&gt;&lt;wsp:rsid wsp:val=&quot;009205B4&quot;/&gt;&lt;wsp:rsid wsp:val=&quot;00955B59&quot;/&gt;&lt;wsp:rsid wsp:val=&quot;00992262&quot;/&gt;&lt;wsp:rsid wsp:val=&quot;009926BC&quot;/&gt;&lt;wsp:rsid wsp:val=&quot;009A4319&quot;/&gt;&lt;wsp:rsid wsp:val=&quot;009A6C3F&quot;/&gt;&lt;wsp:rsid wsp:val=&quot;009B73F2&quot;/&gt;&lt;wsp:rsid wsp:val=&quot;009C12BD&quot;/&gt;&lt;wsp:rsid wsp:val=&quot;009C50FE&quot;/&gt;&lt;wsp:rsid wsp:val=&quot;009E49DD&quot;/&gt;&lt;wsp:rsid wsp:val=&quot;00A03E75&quot;/&gt;&lt;wsp:rsid wsp:val=&quot;00A20627&quot;/&gt;&lt;wsp:rsid wsp:val=&quot;00A22FE9&quot;/&gt;&lt;wsp:rsid wsp:val=&quot;00A31A44&quot;/&gt;&lt;wsp:rsid wsp:val=&quot;00A32BFA&quot;/&gt;&lt;wsp:rsid wsp:val=&quot;00A3325E&quot;/&gt;&lt;wsp:rsid wsp:val=&quot;00A45FCE&quot;/&gt;&lt;wsp:rsid wsp:val=&quot;00A75671&quot;/&gt;&lt;wsp:rsid wsp:val=&quot;00A773CC&quot;/&gt;&lt;wsp:rsid wsp:val=&quot;00A924D0&quot;/&gt;&lt;wsp:rsid wsp:val=&quot;00A9318B&quot;/&gt;&lt;wsp:rsid wsp:val=&quot;00A94AC1&quot;/&gt;&lt;wsp:rsid wsp:val=&quot;00AB18B7&quot;/&gt;&lt;wsp:rsid wsp:val=&quot;00AD335D&quot;/&gt;&lt;wsp:rsid wsp:val=&quot;00AF114C&quot;/&gt;&lt;wsp:rsid wsp:val=&quot;00AF792B&quot;/&gt;&lt;wsp:rsid wsp:val=&quot;00B32137&quot;/&gt;&lt;wsp:rsid wsp:val=&quot;00B33D2F&quot;/&gt;&lt;wsp:rsid wsp:val=&quot;00B40A5B&quot;/&gt;&lt;wsp:rsid wsp:val=&quot;00B45C6B&quot;/&gt;&lt;wsp:rsid wsp:val=&quot;00B55D5E&quot;/&gt;&lt;wsp:rsid wsp:val=&quot;00B57A80&quot;/&gt;&lt;wsp:rsid wsp:val=&quot;00B70E9C&quot;/&gt;&lt;wsp:rsid wsp:val=&quot;00B713D8&quot;/&gt;&lt;wsp:rsid wsp:val=&quot;00B72979&quot;/&gt;&lt;wsp:rsid wsp:val=&quot;00B94516&quot;/&gt;&lt;wsp:rsid wsp:val=&quot;00BA25E2&quot;/&gt;&lt;wsp:rsid wsp:val=&quot;00BB2855&quot;/&gt;&lt;wsp:rsid wsp:val=&quot;00BC5343&quot;/&gt;&lt;wsp:rsid wsp:val=&quot;00BD19C1&quot;/&gt;&lt;wsp:rsid wsp:val=&quot;00BD25B8&quot;/&gt;&lt;wsp:rsid wsp:val=&quot;00C012E1&quot;/&gt;&lt;wsp:rsid wsp:val=&quot;00C06BB4&quot;/&gt;&lt;wsp:rsid wsp:val=&quot;00C10D20&quot;/&gt;&lt;wsp:rsid wsp:val=&quot;00C12E0C&quot;/&gt;&lt;wsp:rsid wsp:val=&quot;00C21916&quot;/&gt;&lt;wsp:rsid wsp:val=&quot;00C34915&quot;/&gt;&lt;wsp:rsid wsp:val=&quot;00C457CA&quot;/&gt;&lt;wsp:rsid wsp:val=&quot;00C53FB6&quot;/&gt;&lt;wsp:rsid wsp:val=&quot;00C57FB7&quot;/&gt;&lt;wsp:rsid wsp:val=&quot;00C644D4&quot;/&gt;&lt;wsp:rsid wsp:val=&quot;00C65F3F&quot;/&gt;&lt;wsp:rsid wsp:val=&quot;00C72414&quot;/&gt;&lt;wsp:rsid wsp:val=&quot;00C72B1A&quot;/&gt;&lt;wsp:rsid wsp:val=&quot;00C8667B&quot;/&gt;&lt;wsp:rsid wsp:val=&quot;00C90993&quot;/&gt;&lt;wsp:rsid wsp:val=&quot;00CA4CE3&quot;/&gt;&lt;wsp:rsid wsp:val=&quot;00CC72FD&quot;/&gt;&lt;wsp:rsid wsp:val=&quot;00CD1D23&quot;/&gt;&lt;wsp:rsid wsp:val=&quot;00CD4F3F&quot;/&gt;&lt;wsp:rsid wsp:val=&quot;00D311F8&quot;/&gt;&lt;wsp:rsid wsp:val=&quot;00D31660&quot;/&gt;&lt;wsp:rsid wsp:val=&quot;00D36B52&quot;/&gt;&lt;wsp:rsid wsp:val=&quot;00D377C8&quot;/&gt;&lt;wsp:rsid wsp:val=&quot;00D41274&quot;/&gt;&lt;wsp:rsid wsp:val=&quot;00D4229C&quot;/&gt;&lt;wsp:rsid wsp:val=&quot;00D43BF3&quot;/&gt;&lt;wsp:rsid wsp:val=&quot;00D549FB&quot;/&gt;&lt;wsp:rsid wsp:val=&quot;00D56487&quot;/&gt;&lt;wsp:rsid wsp:val=&quot;00D767BB&quot;/&gt;&lt;wsp:rsid wsp:val=&quot;00D939B0&quot;/&gt;&lt;wsp:rsid wsp:val=&quot;00DA31A2&quot;/&gt;&lt;wsp:rsid wsp:val=&quot;00DB16E0&quot;/&gt;&lt;wsp:rsid wsp:val=&quot;00DB2DF9&quot;/&gt;&lt;wsp:rsid wsp:val=&quot;00DB465D&quot;/&gt;&lt;wsp:rsid wsp:val=&quot;00DB48A2&quot;/&gt;&lt;wsp:rsid wsp:val=&quot;00DB7E63&quot;/&gt;&lt;wsp:rsid wsp:val=&quot;00DC2055&quot;/&gt;&lt;wsp:rsid wsp:val=&quot;00DC3908&quot;/&gt;&lt;wsp:rsid wsp:val=&quot;00DD71E8&quot;/&gt;&lt;wsp:rsid wsp:val=&quot;00DD7F83&quot;/&gt;&lt;wsp:rsid wsp:val=&quot;00DE4EB8&quot;/&gt;&lt;wsp:rsid wsp:val=&quot;00E0641E&quot;/&gt;&lt;wsp:rsid wsp:val=&quot;00E06664&quot;/&gt;&lt;wsp:rsid wsp:val=&quot;00E304BC&quot;/&gt;&lt;wsp:rsid wsp:val=&quot;00E32853&quot;/&gt;&lt;wsp:rsid wsp:val=&quot;00E34EBD&quot;/&gt;&lt;wsp:rsid wsp:val=&quot;00E401F8&quot;/&gt;&lt;wsp:rsid wsp:val=&quot;00E46425&quot;/&gt;&lt;wsp:rsid wsp:val=&quot;00E469FC&quot;/&gt;&lt;wsp:rsid wsp:val=&quot;00E47D0E&quot;/&gt;&lt;wsp:rsid wsp:val=&quot;00E65018&quot;/&gt;&lt;wsp:rsid wsp:val=&quot;00E76CA1&quot;/&gt;&lt;wsp:rsid wsp:val=&quot;00E94339&quot;/&gt;&lt;wsp:rsid wsp:val=&quot;00E97563&quot;/&gt;&lt;wsp:rsid wsp:val=&quot;00EB0B63&quot;/&gt;&lt;wsp:rsid wsp:val=&quot;00EC265C&quot;/&gt;&lt;wsp:rsid wsp:val=&quot;00ED61CB&quot;/&gt;&lt;wsp:rsid wsp:val=&quot;00EE752A&quot;/&gt;&lt;wsp:rsid wsp:val=&quot;00F06A72&quot;/&gt;&lt;wsp:rsid wsp:val=&quot;00F136F0&quot;/&gt;&lt;wsp:rsid wsp:val=&quot;00F20BBB&quot;/&gt;&lt;wsp:rsid wsp:val=&quot;00F36048&quot;/&gt;&lt;wsp:rsid wsp:val=&quot;00F43BD8&quot;/&gt;&lt;wsp:rsid wsp:val=&quot;00F562F3&quot;/&gt;&lt;wsp:rsid wsp:val=&quot;00F74B89&quot;/&gt;&lt;wsp:rsid wsp:val=&quot;00F75133&quot;/&gt;&lt;wsp:rsid wsp:val=&quot;00F83272&quot;/&gt;&lt;wsp:rsid wsp:val=&quot;00F9358D&quot;/&gt;&lt;wsp:rsid wsp:val=&quot;00F9369B&quot;/&gt;&lt;wsp:rsid wsp:val=&quot;00FA3899&quot;/&gt;&lt;wsp:rsid wsp:val=&quot;00FA4909&quot;/&gt;&lt;wsp:rsid wsp:val=&quot;00FA5164&quot;/&gt;&lt;wsp:rsid wsp:val=&quot;00FA6751&quot;/&gt;&lt;wsp:rsid wsp:val=&quot;00FA6BD7&quot;/&gt;&lt;wsp:rsid wsp:val=&quot;00FB1048&quot;/&gt;&lt;wsp:rsid wsp:val=&quot;00FB62C4&quot;/&gt;&lt;wsp:rsid wsp:val=&quot;00FB7701&quot;/&gt;&lt;wsp:rsid wsp:val=&quot;00FD1AC5&quot;/&gt;&lt;wsp:rsid wsp:val=&quot;00FD5CF0&quot;/&gt;&lt;/wsp:rsids&gt;&lt;/w:docPr&gt;&lt;w:body&gt;&lt;wx:sect&gt;&lt;w:p wsp:rsidR=&quot;00790F89&quot; wsp:rsidRPr=&quot;00790F89&quot; wsp:rsidRDefault=&quot;00790F89&quot; wsp:rsidP=&quot;00790F89&quot;&gt;&lt;m:oMathPara&gt;&lt;m:oMath&gt;&lt;m:sSub&gt;&lt;m:sSubPr&gt;&lt;m:ctrlPr&gt;&lt;w:rPr&gt;&lt;w:rFonts w:ascii=&quot;Cambria Math&quot; w:h-ansi=&quot;Cambria Math&quot;/&gt;&lt;wx:font wx:val=&quot;Cambria Math&quot;/&gt;&lt;w:i/&gt;&lt;/w:rPr&gt;&lt;/m:ctrlPr&gt;&lt;/m:sSubPr&gt;&lt;m:e&gt;&lt;m:r&gt;&lt;w:rPr&gt;&lt;w:rFonts w:ascii=&quot;Cambria Math&quot; w:h-ansi=&quot;Cambria Math&quot;/&gt;&lt;wx:font wx:val=&quot;Cambria Math&quot;/&gt;&lt;w:i/&gt;&lt;/w:rPr&gt;&lt;m:t&gt;f&lt;/m:t&gt;&lt;/m:r&gt;&lt;/m:e&gt;&lt;m:sub&gt;&lt;m:r&gt;&lt;w:rPr&gt;&lt;w:rFonts w:ascii=&quot;Cambria Math&quot; w:h-ansi=&quot;Cambria Math&quot;/&gt;&lt;wx:font wx:val=&quot;Cambria Math&quot;/&gt;&lt;w:i/&gt;&lt;/w:rPr&gt;&lt;m:t&gt;s&lt;/m:t&gt;&lt;/m:r&gt;&lt;/m:sub&gt;&lt;/m:sSub&gt;&lt;/m:oMath&gt;&lt;/m:oMathPara&gt;&lt;/w:p&gt;&lt;w:sectPr wsp:rsidR=&quot;00000000&quot; wsp:rsidRPr=&quot;00790F89&quot;&gt;&lt;w:pgSz w:w=&quot;12240&quot; w:h=&quot;15840&quot;/&gt;&lt;w:pgMar w:top=&quot;1440&quot; w:right=&quot;1440&quot; w:bottom=&quot;1440&quot; w:left=&quot;1440&quot; w:header=&quot;720&quot; w:footer=&quot;720&quot; w:gutter=&quot;0&quot;/&gt;&lt;w:cols w:space=&quot;720&quot;/&gt;&lt;/w:sectPr&gt;&lt;/wx:sect&gt;&lt;/w:body&gt;&lt;/w:wordDocument&gt;">
+                <v:shape id="_x0000_i1051" type="#_x0000_t75" style="width:9pt;height:13.85pt" equationxml="&lt;?xml version=&quot;1.0&quot; encoding=&quot;UTF-8&quot; standalone=&quot;yes&quot;?&gt;&#10;&lt;?mso-application progid=&quot;Word.Document&quot;?&gt;&#10;&lt;w:wordDocument xmlns:aml=&quot;http://schemas.microsoft.com/aml/2001/core&quot; xmlns:wpc=&quot;http://schemas.microsoft.com/office/word/2010/wordprocessingCanvas&quot; xmlns:cx=&quot;http://schemas.microsoft.com/office/drawing/2014/chartex&quot; xmlns:cx1=&quot;http://schemas.microsoft.com/office/drawing/2015/9/8/chartex&quot; xmlns:cx2=&quot;http://schemas.microsoft.com/office/drawing/2015/10/21/chartex&quot; xmlns:cx3=&quot;http://schemas.microsoft.com/office/drawing/2016/5/9/chartex&quot; xmlns:cx4=&quot;http://schemas.microsoft.com/office/drawing/2016/5/10/chartex&quot; xmlns:cx5=&quot;http://schemas.microsoft.com/office/drawing/2016/5/11/chartex&quot; xmlns:cx6=&quot;http://schemas.microsoft.com/office/drawing/2016/5/12/chartex&quot; xmlns:cx7=&quot;http://schemas.microsoft.com/office/drawing/2016/5/13/chartex&quot; xmlns:cx8=&quot;http://schemas.microsoft.com/office/drawing/2016/5/14/chartex&quot; xmlns:cr=&quot;http://schemas.microsoft.com/office/comments/2020/reactions&quot; xmlns:dt=&quot;uuid:C2F41010-65B3-11d1-A29F-00AA00C14882&quot; xmlns:mc=&quot;http://schemas.openxmlformats.org/markup-compatibility/2006&quot; xmlns:aink=&quot;http://schemas.microsoft.com/office/drawing/2016/ink&quot; xmlns:am3d=&quot;http://schemas.microsoft.com/office/drawing/2017/model3d&quot; xmlns:o=&quot;urn:schemas-microsoft-com:office:office&quot; xmlns:oel=&quot;http://schemas.microsoft.com/office/2019/extlst&quot; xmlns:m=&quot;http://schemas.openxmlformats.org/officeDocument/2006/math&quot; xmlns:v=&quot;urn:schemas-microsoft-com:vml&quot; xmlns:w10=&quot;urn:schemas-microsoft-com:office:word&quot; xmlns:w=&quot;http://schemas.microsoft.com/office/word/2003/wordml&quot; xmlns:wx=&quot;http://schemas.microsoft.com/office/word/2003/auxHint&quot; xmlns:wne=&quot;http://schemas.microsoft.com/office/word/2006/wordml&quot; xmlns:wsp=&quot;http://schemas.microsoft.com/office/word/2003/wordml/sp2&quot; xmlns:sl=&quot;http://schemas.microsoft.com/schemaLibrary/2003/core&quot; w:macrosPresent=&quot;no&quot; w:embeddedObjPresent=&quot;no&quot; w:ocxPresent=&quot;no&quot; xml:space=&quot;preserve&quot;&gt;&lt;w:ignoreSubtree w:val=&quot;http://schemas.microsoft.com/office/word/2003/wordml/sp2&quot;/&gt;&lt;o:DocumentProperties&gt;&lt;o:Version&gt;16&lt;/o:Version&gt;&lt;/o:DocumentProperties&gt;&lt;w:docPr&gt;&lt;w:view w:val=&quot;print&quot;/&gt;&lt;w:zoom w:percent=&quot;100&quot;/&gt;&lt;w:doNotEmbedSystemFonts/&gt;&lt;w:activeWritingStyle w:lang=&quot;EN-AU&quot; w:vendorID=&quot;64&quot; w:dllVersion=&quot;6&quot; w:nlCheck=&quot;on&quot; w:optionSet=&quot;1&quot;/&gt;&lt;w:activeWritingStyle w:lang=&quot;EN-GB&quot; w:vendorID=&quot;64&quot; w:dllVersion=&quot;6&quot; w:nlCheck=&quot;on&quot; w:optionSet=&quot;1&quot;/&gt;&lt;w:activeWritingStyle w:lang=&quot;EN-US&quot; w:vendorID=&quot;64&quot; w:dllVersion=&quot;6&quot; w:nlCheck=&quot;on&quot; w:optionSet=&quot;1&quot;/&gt;&lt;w:activeWritingStyle w:lang=&quot;EN-AU&quot; w:vendorID=&quot;64&quot; w:dllVersion=&quot;0&quot; w:nlCheck=&quot;on&quot; w:optionSet=&quot;0&quot;/&gt;&lt;w:activeWritingStyle w:lang=&quot;EN-GB&quot; w:vendorID=&quot;64&quot; w:dllVersion=&quot;0&quot; w:nlCheck=&quot;on&quot; w:optionSet=&quot;0&quot;/&gt;&lt;w:activeWritingStyle w:lang=&quot;EN-US&quot; w:vendorID=&quot;64&quot; w:dllVersion=&quot;0&quot; w:nlCheck=&quot;on&quot; w:optionSet=&quot;0&quot;/&gt;&lt;w:activeWritingStyle w:lang=&quot;ES-AR&quot; w:vendorID=&quot;64&quot; w:dllVersion=&quot;0&quot; w:nlCheck=&quot;on&quot; w:optionSet=&quot;0&quot;/&gt;&lt;w:activeWritingStyle w:lang=&quot;580A&quot; w:vendorID=&quot;64&quot; w:dllVersion=&quot;0&quot; w:nlCheck=&quot;on&quot; w:optionSet=&quot;0&quot;/&gt;&lt;w:activeWritingStyle w:lang=&quot;PT-BR&quot; w:vendorID=&quot;64&quot; w:dllVersion=&quot;0&quot; w:nlCheck=&quot;on&quot; w:optionSet=&quot;0&quot;/&gt;&lt;w:stylePaneFormatFilter w:val=&quot;3F01&quot;/&gt;&lt;w:defaultTabStop w:val=&quot;720&quot;/&gt;&lt;w:hyphenationZone w:val=&quot;425&quot;/&gt;&lt;w:characterSpacingControl w:val=&quot;DontCompress&quot;/&gt;&lt;w:optimizeForBrowser/&gt;&lt;w:validateAgainstSchema/&gt;&lt;w:saveInvalidXML w:val=&quot;off&quot;/&gt;&lt;w:ignoreMixedContent w:val=&quot;off&quot;/&gt;&lt;w:alwaysShowPlaceholderText w:val=&quot;off&quot;/&gt;&lt;w:compat&gt;&lt;w:breakWrappedTables/&gt;&lt;w:snapToGridInCell/&gt;&lt;w:applyBreakingRules/&gt;&lt;w:wrapTextWithPunct/&gt;&lt;w:useAsianBreakRules/&gt;&lt;w:useWord2002TableStyleRules/&gt;&lt;w:useFELayout/&gt;&lt;/w:compat&gt;&lt;wsp:rsids&gt;&lt;wsp:rsidRoot wsp:val=&quot;00426FBB&quot;/&gt;&lt;wsp:rsid wsp:val=&quot;000002E1&quot;/&gt;&lt;wsp:rsid wsp:val=&quot;00003C97&quot;/&gt;&lt;wsp:rsid wsp:val=&quot;00005565&quot;/&gt;&lt;wsp:rsid wsp:val=&quot;0001754A&quot;/&gt;&lt;wsp:rsid wsp:val=&quot;00017719&quot;/&gt;&lt;wsp:rsid wsp:val=&quot;00027F1D&quot;/&gt;&lt;wsp:rsid wsp:val=&quot;0003296C&quot;/&gt;&lt;wsp:rsid wsp:val=&quot;0003351F&quot;/&gt;&lt;wsp:rsid wsp:val=&quot;00044599&quot;/&gt;&lt;wsp:rsid wsp:val=&quot;000540E6&quot;/&gt;&lt;wsp:rsid wsp:val=&quot;00054421&quot;/&gt;&lt;wsp:rsid wsp:val=&quot;00062E46&quot;/&gt;&lt;wsp:rsid wsp:val=&quot;00074AC8&quot;/&gt;&lt;wsp:rsid wsp:val=&quot;00081408&quot;/&gt;&lt;wsp:rsid wsp:val=&quot;00081EBE&quot;/&gt;&lt;wsp:rsid wsp:val=&quot;00086EDC&quot;/&gt;&lt;wsp:rsid wsp:val=&quot;000B1236&quot;/&gt;&lt;wsp:rsid wsp:val=&quot;000B36A3&quot;/&gt;&lt;wsp:rsid wsp:val=&quot;000C013C&quot;/&gt;&lt;wsp:rsid wsp:val=&quot;000E3F84&quot;/&gt;&lt;wsp:rsid wsp:val=&quot;001056DF&quot;/&gt;&lt;wsp:rsid wsp:val=&quot;0010789C&quot;/&gt;&lt;wsp:rsid wsp:val=&quot;00114025&quot;/&gt;&lt;wsp:rsid wsp:val=&quot;001160D2&quot;/&gt;&lt;wsp:rsid wsp:val=&quot;00120636&quot;/&gt;&lt;wsp:rsid wsp:val=&quot;001348A5&quot;/&gt;&lt;wsp:rsid wsp:val=&quot;00151B8E&quot;/&gt;&lt;wsp:rsid wsp:val=&quot;00182170&quot;/&gt;&lt;wsp:rsid wsp:val=&quot;001928FB&quot;/&gt;&lt;wsp:rsid wsp:val=&quot;00192BC7&quot;/&gt;&lt;wsp:rsid wsp:val=&quot;00195BE6&quot;/&gt;&lt;wsp:rsid wsp:val=&quot;001A3C37&quot;/&gt;&lt;wsp:rsid wsp:val=&quot;001A50EA&quot;/&gt;&lt;wsp:rsid wsp:val=&quot;001F16CD&quot;/&gt;&lt;wsp:rsid wsp:val=&quot;001F47D2&quot;/&gt;&lt;wsp:rsid wsp:val=&quot;002029C8&quot;/&gt;&lt;wsp:rsid wsp:val=&quot;0022285A&quot;/&gt;&lt;wsp:rsid wsp:val=&quot;00224C61&quot;/&gt;&lt;wsp:rsid wsp:val=&quot;00256ABC&quot;/&gt;&lt;wsp:rsid wsp:val=&quot;0027227B&quot;/&gt;&lt;wsp:rsid wsp:val=&quot;00273AC7&quot;/&gt;&lt;wsp:rsid wsp:val=&quot;00273D2C&quot;/&gt;&lt;wsp:rsid wsp:val=&quot;00285ECD&quot;/&gt;&lt;wsp:rsid wsp:val=&quot;00290E1B&quot;/&gt;&lt;wsp:rsid wsp:val=&quot;00291B17&quot;/&gt;&lt;wsp:rsid wsp:val=&quot;00291BB3&quot;/&gt;&lt;wsp:rsid wsp:val=&quot;002A6742&quot;/&gt;&lt;wsp:rsid wsp:val=&quot;002C1A7F&quot;/&gt;&lt;wsp:rsid wsp:val=&quot;002C4239&quot;/&gt;&lt;wsp:rsid wsp:val=&quot;002C559D&quot;/&gt;&lt;wsp:rsid wsp:val=&quot;002D16AE&quot;/&gt;&lt;wsp:rsid wsp:val=&quot;002D2D42&quot;/&gt;&lt;wsp:rsid wsp:val=&quot;002F72D0&quot;/&gt;&lt;wsp:rsid wsp:val=&quot;002F7A4F&quot;/&gt;&lt;wsp:rsid wsp:val=&quot;003003AB&quot;/&gt;&lt;wsp:rsid wsp:val=&quot;00302C35&quot;/&gt;&lt;wsp:rsid wsp:val=&quot;00311C49&quot;/&gt;&lt;wsp:rsid wsp:val=&quot;0032119E&quot;/&gt;&lt;wsp:rsid wsp:val=&quot;00321304&quot;/&gt;&lt;wsp:rsid wsp:val=&quot;00324FC2&quot;/&gt;&lt;wsp:rsid wsp:val=&quot;003312CA&quot;/&gt;&lt;wsp:rsid wsp:val=&quot;00331F84&quot;/&gt;&lt;wsp:rsid wsp:val=&quot;0037721F&quot;/&gt;&lt;wsp:rsid wsp:val=&quot;003950A4&quot;/&gt;&lt;wsp:rsid wsp:val=&quot;003A1E7E&quot;/&gt;&lt;wsp:rsid wsp:val=&quot;003E2FDC&quot;/&gt;&lt;wsp:rsid wsp:val=&quot;003E3577&quot;/&gt;&lt;wsp:rsid wsp:val=&quot;003F3A61&quot;/&gt;&lt;wsp:rsid wsp:val=&quot;00410A5D&quot;/&gt;&lt;wsp:rsid wsp:val=&quot;00414909&quot;/&gt;&lt;wsp:rsid wsp:val=&quot;00416537&quot;/&gt;&lt;wsp:rsid wsp:val=&quot;00425A6A&quot;/&gt;&lt;wsp:rsid wsp:val=&quot;00426FBB&quot;/&gt;&lt;wsp:rsid wsp:val=&quot;00454542&quot;/&gt;&lt;wsp:rsid wsp:val=&quot;0047429A&quot;/&gt;&lt;wsp:rsid wsp:val=&quot;0048374C&quot;/&gt;&lt;wsp:rsid wsp:val=&quot;0048771D&quot;/&gt;&lt;wsp:rsid wsp:val=&quot;004A6605&quot;/&gt;&lt;wsp:rsid wsp:val=&quot;004C45FA&quot;/&gt;&lt;wsp:rsid wsp:val=&quot;004D35A3&quot;/&gt;&lt;wsp:rsid wsp:val=&quot;004E1BD8&quot;/&gt;&lt;wsp:rsid wsp:val=&quot;004E452A&quot;/&gt;&lt;wsp:rsid wsp:val=&quot;004E78E3&quot;/&gt;&lt;wsp:rsid wsp:val=&quot;004F2BFE&quot;/&gt;&lt;wsp:rsid wsp:val=&quot;004F63D3&quot;/&gt;&lt;wsp:rsid wsp:val=&quot;004F7DCF&quot;/&gt;&lt;wsp:rsid wsp:val=&quot;005004BF&quot;/&gt;&lt;wsp:rsid wsp:val=&quot;00502E89&quot;/&gt;&lt;wsp:rsid wsp:val=&quot;00506CFE&quot;/&gt;&lt;wsp:rsid wsp:val=&quot;00510E95&quot;/&gt;&lt;wsp:rsid wsp:val=&quot;005225C3&quot;/&gt;&lt;wsp:rsid wsp:val=&quot;00527D56&quot;/&gt;&lt;wsp:rsid wsp:val=&quot;0053221F&quot;/&gt;&lt;wsp:rsid wsp:val=&quot;00536FAE&quot;/&gt;&lt;wsp:rsid wsp:val=&quot;00542C85&quot;/&gt;&lt;wsp:rsid wsp:val=&quot;00553510&quot;/&gt;&lt;wsp:rsid wsp:val=&quot;00554186&quot;/&gt;&lt;wsp:rsid wsp:val=&quot;00585769&quot;/&gt;&lt;wsp:rsid wsp:val=&quot;00585C61&quot;/&gt;&lt;wsp:rsid wsp:val=&quot;00591130&quot;/&gt;&lt;wsp:rsid wsp:val=&quot;005A3F28&quot;/&gt;&lt;wsp:rsid wsp:val=&quot;005A40BE&quot;/&gt;&lt;wsp:rsid wsp:val=&quot;005B13E2&quot;/&gt;&lt;wsp:rsid wsp:val=&quot;005B47D7&quot;/&gt;&lt;wsp:rsid wsp:val=&quot;005C5526&quot;/&gt;&lt;wsp:rsid wsp:val=&quot;005C62C6&quot;/&gt;&lt;wsp:rsid wsp:val=&quot;005D7B9E&quot;/&gt;&lt;wsp:rsid wsp:val=&quot;005E112E&quot;/&gt;&lt;wsp:rsid wsp:val=&quot;005F0834&quot;/&gt;&lt;wsp:rsid wsp:val=&quot;005F68AB&quot;/&gt;&lt;wsp:rsid wsp:val=&quot;005F6DC3&quot;/&gt;&lt;wsp:rsid wsp:val=&quot;00601A8E&quot;/&gt;&lt;wsp:rsid wsp:val=&quot;0062033E&quot;/&gt;&lt;wsp:rsid wsp:val=&quot;00624482&quot;/&gt;&lt;wsp:rsid wsp:val=&quot;0064799C&quot;/&gt;&lt;wsp:rsid wsp:val=&quot;00654156&quot;/&gt;&lt;wsp:rsid wsp:val=&quot;00656ADC&quot;/&gt;&lt;wsp:rsid wsp:val=&quot;006B47CA&quot;/&gt;&lt;wsp:rsid wsp:val=&quot;006C304C&quot;/&gt;&lt;wsp:rsid wsp:val=&quot;006C4511&quot;/&gt;&lt;wsp:rsid wsp:val=&quot;006C65F5&quot;/&gt;&lt;wsp:rsid wsp:val=&quot;006C7AAA&quot;/&gt;&lt;wsp:rsid wsp:val=&quot;006D1C2A&quot;/&gt;&lt;wsp:rsid wsp:val=&quot;006D264F&quot;/&gt;&lt;wsp:rsid wsp:val=&quot;006D4E89&quot;/&gt;&lt;wsp:rsid wsp:val=&quot;006E2A8D&quot;/&gt;&lt;wsp:rsid wsp:val=&quot;006E7574&quot;/&gt;&lt;wsp:rsid wsp:val=&quot;00703430&quot;/&gt;&lt;wsp:rsid wsp:val=&quot;00703548&quot;/&gt;&lt;wsp:rsid wsp:val=&quot;00704E18&quot;/&gt;&lt;wsp:rsid wsp:val=&quot;007069BE&quot;/&gt;&lt;wsp:rsid wsp:val=&quot;00745C86&quot;/&gt;&lt;wsp:rsid wsp:val=&quot;00764603&quot;/&gt;&lt;wsp:rsid wsp:val=&quot;0076604D&quot;/&gt;&lt;wsp:rsid wsp:val=&quot;00790909&quot;/&gt;&lt;wsp:rsid wsp:val=&quot;00790F89&quot;/&gt;&lt;wsp:rsid wsp:val=&quot;007929AF&quot;/&gt;&lt;wsp:rsid wsp:val=&quot;007B1582&quot;/&gt;&lt;wsp:rsid wsp:val=&quot;007B5A07&quot;/&gt;&lt;wsp:rsid wsp:val=&quot;007C065D&quot;/&gt;&lt;wsp:rsid wsp:val=&quot;007D3E71&quot;/&gt;&lt;wsp:rsid wsp:val=&quot;007E5D6A&quot;/&gt;&lt;wsp:rsid wsp:val=&quot;007E645D&quot;/&gt;&lt;wsp:rsid wsp:val=&quot;007F75CA&quot;/&gt;&lt;wsp:rsid wsp:val=&quot;00821E08&quot;/&gt;&lt;wsp:rsid wsp:val=&quot;00834EFD&quot;/&gt;&lt;wsp:rsid wsp:val=&quot;00844B24&quot;/&gt;&lt;wsp:rsid wsp:val=&quot;0084515F&quot;/&gt;&lt;wsp:rsid wsp:val=&quot;0085092D&quot;/&gt;&lt;wsp:rsid wsp:val=&quot;00865414&quot;/&gt;&lt;wsp:rsid wsp:val=&quot;00877D4C&quot;/&gt;&lt;wsp:rsid wsp:val=&quot;00883903&quot;/&gt;&lt;wsp:rsid wsp:val=&quot;00891C30&quot;/&gt;&lt;wsp:rsid wsp:val=&quot;0089763B&quot;/&gt;&lt;wsp:rsid wsp:val=&quot;008B6AE3&quot;/&gt;&lt;wsp:rsid wsp:val=&quot;008C1332&quot;/&gt;&lt;wsp:rsid wsp:val=&quot;008D1045&quot;/&gt;&lt;wsp:rsid wsp:val=&quot;008E5996&quot;/&gt;&lt;wsp:rsid wsp:val=&quot;00901AE1&quot;/&gt;&lt;wsp:rsid wsp:val=&quot;00912F93&quot;/&gt;&lt;wsp:rsid wsp:val=&quot;009205B4&quot;/&gt;&lt;wsp:rsid wsp:val=&quot;00955B59&quot;/&gt;&lt;wsp:rsid wsp:val=&quot;00992262&quot;/&gt;&lt;wsp:rsid wsp:val=&quot;009926BC&quot;/&gt;&lt;wsp:rsid wsp:val=&quot;009A4319&quot;/&gt;&lt;wsp:rsid wsp:val=&quot;009A6C3F&quot;/&gt;&lt;wsp:rsid wsp:val=&quot;009B73F2&quot;/&gt;&lt;wsp:rsid wsp:val=&quot;009C12BD&quot;/&gt;&lt;wsp:rsid wsp:val=&quot;009C50FE&quot;/&gt;&lt;wsp:rsid wsp:val=&quot;009E49DD&quot;/&gt;&lt;wsp:rsid wsp:val=&quot;00A03E75&quot;/&gt;&lt;wsp:rsid wsp:val=&quot;00A20627&quot;/&gt;&lt;wsp:rsid wsp:val=&quot;00A22FE9&quot;/&gt;&lt;wsp:rsid wsp:val=&quot;00A31A44&quot;/&gt;&lt;wsp:rsid wsp:val=&quot;00A32BFA&quot;/&gt;&lt;wsp:rsid wsp:val=&quot;00A3325E&quot;/&gt;&lt;wsp:rsid wsp:val=&quot;00A45FCE&quot;/&gt;&lt;wsp:rsid wsp:val=&quot;00A75671&quot;/&gt;&lt;wsp:rsid wsp:val=&quot;00A773CC&quot;/&gt;&lt;wsp:rsid wsp:val=&quot;00A924D0&quot;/&gt;&lt;wsp:rsid wsp:val=&quot;00A9318B&quot;/&gt;&lt;wsp:rsid wsp:val=&quot;00A94AC1&quot;/&gt;&lt;wsp:rsid wsp:val=&quot;00AB18B7&quot;/&gt;&lt;wsp:rsid wsp:val=&quot;00AD335D&quot;/&gt;&lt;wsp:rsid wsp:val=&quot;00AF114C&quot;/&gt;&lt;wsp:rsid wsp:val=&quot;00AF792B&quot;/&gt;&lt;wsp:rsid wsp:val=&quot;00B32137&quot;/&gt;&lt;wsp:rsid wsp:val=&quot;00B33D2F&quot;/&gt;&lt;wsp:rsid wsp:val=&quot;00B40A5B&quot;/&gt;&lt;wsp:rsid wsp:val=&quot;00B45C6B&quot;/&gt;&lt;wsp:rsid wsp:val=&quot;00B55D5E&quot;/&gt;&lt;wsp:rsid wsp:val=&quot;00B57A80&quot;/&gt;&lt;wsp:rsid wsp:val=&quot;00B70E9C&quot;/&gt;&lt;wsp:rsid wsp:val=&quot;00B713D8&quot;/&gt;&lt;wsp:rsid wsp:val=&quot;00B72979&quot;/&gt;&lt;wsp:rsid wsp:val=&quot;00B94516&quot;/&gt;&lt;wsp:rsid wsp:val=&quot;00BA25E2&quot;/&gt;&lt;wsp:rsid wsp:val=&quot;00BB2855&quot;/&gt;&lt;wsp:rsid wsp:val=&quot;00BC5343&quot;/&gt;&lt;wsp:rsid wsp:val=&quot;00BD19C1&quot;/&gt;&lt;wsp:rsid wsp:val=&quot;00BD25B8&quot;/&gt;&lt;wsp:rsid wsp:val=&quot;00C012E1&quot;/&gt;&lt;wsp:rsid wsp:val=&quot;00C06BB4&quot;/&gt;&lt;wsp:rsid wsp:val=&quot;00C10D20&quot;/&gt;&lt;wsp:rsid wsp:val=&quot;00C12E0C&quot;/&gt;&lt;wsp:rsid wsp:val=&quot;00C21916&quot;/&gt;&lt;wsp:rsid wsp:val=&quot;00C34915&quot;/&gt;&lt;wsp:rsid wsp:val=&quot;00C457CA&quot;/&gt;&lt;wsp:rsid wsp:val=&quot;00C53FB6&quot;/&gt;&lt;wsp:rsid wsp:val=&quot;00C57FB7&quot;/&gt;&lt;wsp:rsid wsp:val=&quot;00C644D4&quot;/&gt;&lt;wsp:rsid wsp:val=&quot;00C65F3F&quot;/&gt;&lt;wsp:rsid wsp:val=&quot;00C72414&quot;/&gt;&lt;wsp:rsid wsp:val=&quot;00C72B1A&quot;/&gt;&lt;wsp:rsid wsp:val=&quot;00C8667B&quot;/&gt;&lt;wsp:rsid wsp:val=&quot;00C90993&quot;/&gt;&lt;wsp:rsid wsp:val=&quot;00CA4CE3&quot;/&gt;&lt;wsp:rsid wsp:val=&quot;00CC72FD&quot;/&gt;&lt;wsp:rsid wsp:val=&quot;00CD1D23&quot;/&gt;&lt;wsp:rsid wsp:val=&quot;00CD4F3F&quot;/&gt;&lt;wsp:rsid wsp:val=&quot;00D311F8&quot;/&gt;&lt;wsp:rsid wsp:val=&quot;00D31660&quot;/&gt;&lt;wsp:rsid wsp:val=&quot;00D36B52&quot;/&gt;&lt;wsp:rsid wsp:val=&quot;00D377C8&quot;/&gt;&lt;wsp:rsid wsp:val=&quot;00D41274&quot;/&gt;&lt;wsp:rsid wsp:val=&quot;00D4229C&quot;/&gt;&lt;wsp:rsid wsp:val=&quot;00D43BF3&quot;/&gt;&lt;wsp:rsid wsp:val=&quot;00D549FB&quot;/&gt;&lt;wsp:rsid wsp:val=&quot;00D56487&quot;/&gt;&lt;wsp:rsid wsp:val=&quot;00D767BB&quot;/&gt;&lt;wsp:rsid wsp:val=&quot;00D939B0&quot;/&gt;&lt;wsp:rsid wsp:val=&quot;00DA31A2&quot;/&gt;&lt;wsp:rsid wsp:val=&quot;00DB16E0&quot;/&gt;&lt;wsp:rsid wsp:val=&quot;00DB2DF9&quot;/&gt;&lt;wsp:rsid wsp:val=&quot;00DB465D&quot;/&gt;&lt;wsp:rsid wsp:val=&quot;00DB48A2&quot;/&gt;&lt;wsp:rsid wsp:val=&quot;00DB7E63&quot;/&gt;&lt;wsp:rsid wsp:val=&quot;00DC2055&quot;/&gt;&lt;wsp:rsid wsp:val=&quot;00DC3908&quot;/&gt;&lt;wsp:rsid wsp:val=&quot;00DD71E8&quot;/&gt;&lt;wsp:rsid wsp:val=&quot;00DD7F83&quot;/&gt;&lt;wsp:rsid wsp:val=&quot;00DE4EB8&quot;/&gt;&lt;wsp:rsid wsp:val=&quot;00E0641E&quot;/&gt;&lt;wsp:rsid wsp:val=&quot;00E06664&quot;/&gt;&lt;wsp:rsid wsp:val=&quot;00E304BC&quot;/&gt;&lt;wsp:rsid wsp:val=&quot;00E32853&quot;/&gt;&lt;wsp:rsid wsp:val=&quot;00E34EBD&quot;/&gt;&lt;wsp:rsid wsp:val=&quot;00E401F8&quot;/&gt;&lt;wsp:rsid wsp:val=&quot;00E46425&quot;/&gt;&lt;wsp:rsid wsp:val=&quot;00E469FC&quot;/&gt;&lt;wsp:rsid wsp:val=&quot;00E47D0E&quot;/&gt;&lt;wsp:rsid wsp:val=&quot;00E65018&quot;/&gt;&lt;wsp:rsid wsp:val=&quot;00E76CA1&quot;/&gt;&lt;wsp:rsid wsp:val=&quot;00E94339&quot;/&gt;&lt;wsp:rsid wsp:val=&quot;00E97563&quot;/&gt;&lt;wsp:rsid wsp:val=&quot;00EB0B63&quot;/&gt;&lt;wsp:rsid wsp:val=&quot;00EC265C&quot;/&gt;&lt;wsp:rsid wsp:val=&quot;00ED61CB&quot;/&gt;&lt;wsp:rsid wsp:val=&quot;00EE752A&quot;/&gt;&lt;wsp:rsid wsp:val=&quot;00F06A72&quot;/&gt;&lt;wsp:rsid wsp:val=&quot;00F136F0&quot;/&gt;&lt;wsp:rsid wsp:val=&quot;00F20BBB&quot;/&gt;&lt;wsp:rsid wsp:val=&quot;00F36048&quot;/&gt;&lt;wsp:rsid wsp:val=&quot;00F43BD8&quot;/&gt;&lt;wsp:rsid wsp:val=&quot;00F562F3&quot;/&gt;&lt;wsp:rsid wsp:val=&quot;00F74B89&quot;/&gt;&lt;wsp:rsid wsp:val=&quot;00F75133&quot;/&gt;&lt;wsp:rsid wsp:val=&quot;00F83272&quot;/&gt;&lt;wsp:rsid wsp:val=&quot;00F9358D&quot;/&gt;&lt;wsp:rsid wsp:val=&quot;00F9369B&quot;/&gt;&lt;wsp:rsid wsp:val=&quot;00FA3899&quot;/&gt;&lt;wsp:rsid wsp:val=&quot;00FA4909&quot;/&gt;&lt;wsp:rsid wsp:val=&quot;00FA5164&quot;/&gt;&lt;wsp:rsid wsp:val=&quot;00FA6751&quot;/&gt;&lt;wsp:rsid wsp:val=&quot;00FA6BD7&quot;/&gt;&lt;wsp:rsid wsp:val=&quot;00FB1048&quot;/&gt;&lt;wsp:rsid wsp:val=&quot;00FB62C4&quot;/&gt;&lt;wsp:rsid wsp:val=&quot;00FB7701&quot;/&gt;&lt;wsp:rsid wsp:val=&quot;00FD1AC5&quot;/&gt;&lt;wsp:rsid wsp:val=&quot;00FD5CF0&quot;/&gt;&lt;/wsp:rsids&gt;&lt;/w:docPr&gt;&lt;w:body&gt;&lt;wx:sect&gt;&lt;w:p wsp:rsidR=&quot;00790F89&quot; wsp:rsidRPr=&quot;00790F89&quot; wsp:rsidRDefault=&quot;00790F89&quot; wsp:rsidP=&quot;00790F89&quot;&gt;&lt;m:oMathPara&gt;&lt;m:oMath&gt;&lt;m:sSub&gt;&lt;m:sSubPr&gt;&lt;m:ctrlPr&gt;&lt;w:rPr&gt;&lt;w:rFonts w:ascii=&quot;Cambria Math&quot; w:h-ansi=&quot;Cambria Math&quot;/&gt;&lt;wx:font wx:val=&quot;Cambria Math&quot;/&gt;&lt;w:i/&gt;&lt;/w:rPr&gt;&lt;/m:ctrlPr&gt;&lt;/m:sSubPr&gt;&lt;m:e&gt;&lt;m:r&gt;&lt;w:rPr&gt;&lt;w:rFonts w:ascii=&quot;Cambria Math&quot; w:h-ansi=&quot;Cambria Math&quot;/&gt;&lt;wx:font wx:val=&quot;Cambria Math&quot;/&gt;&lt;w:i/&gt;&lt;/w:rPr&gt;&lt;m:t&gt;f&lt;/m:t&gt;&lt;/m:r&gt;&lt;/m:e&gt;&lt;m:sub&gt;&lt;m:r&gt;&lt;w:rPr&gt;&lt;w:rFonts w:ascii=&quot;Cambria Math&quot; w:h-ansi=&quot;Cambria Math&quot;/&gt;&lt;wx:font wx:val=&quot;Cambria Math&quot;/&gt;&lt;w:i/&gt;&lt;/w:rPr&gt;&lt;m:t&gt;s&lt;/m:t&gt;&lt;/m:r&gt;&lt;/m:sub&gt;&lt;/m:sSub&gt;&lt;/m:oMath&gt;&lt;/m:oMathPara&gt;&lt;/w:p&gt;&lt;w:sectPr wsp:rsidR=&quot;00000000&quot; wsp:rsidRPr=&quot;00790F89&quot;&gt;&lt;w:pgSz w:w=&quot;12240&quot; w:h=&quot;15840&quot;/&gt;&lt;w:pgMar w:top=&quot;1440&quot; w:right=&quot;1440&quot; w:bottom=&quot;1440&quot; w:left=&quot;1440&quot; w:header=&quot;720&quot; w:footer=&quot;720&quot; w:gutter=&quot;0&quot;/&gt;&lt;w:cols w:space=&quot;720&quot;/&gt;&lt;/w:sectPr&gt;&lt;/wx:sect&gt;&lt;/w:body&gt;&lt;/w:wordDocument&gt;">
                   <v:imagedata r:id="rId20" o:title="" chromakey="white"/>
                 </v:shape>
               </w:pict>
@@ -2531,7 +2531,7 @@
         </w:tc>
         <w:tc>
           <w:tcPr>
-            <w:tcW w:w="942" w:type="dxa"/>
+            <w:tcW w:w="939" w:type="dxa"/>
             <w:shd w:val="clear" w:color="auto" w:fill="D9D9D9"/>
           </w:tcPr>
           <w:p>
@@ -2553,7 +2553,7 @@
         </w:tc>
         <w:tc>
           <w:tcPr>
-            <w:tcW w:w="774" w:type="dxa"/>
+            <w:tcW w:w="784" w:type="dxa"/>
             <w:shd w:val="clear" w:color="auto" w:fill="D9D9D9"/>
           </w:tcPr>
           <w:p>
@@ -2576,12 +2576,12 @@
       </w:tr>
       <w:tr>
         <w:trPr>
-          <w:trHeight w:val="269"/>
+          <w:trHeight w:val="260"/>
           <w:jc w:val="center"/>
         </w:trPr>
         <w:tc>
           <w:tcPr>
-            <w:tcW w:w="2336" w:type="dxa"/>
+            <w:tcW w:w="2329" w:type="dxa"/>
             <w:shd w:val="clear" w:color="auto" w:fill="auto"/>
           </w:tcPr>
           <w:p>
@@ -2602,7 +2602,7 @@
         </w:tc>
         <w:tc>
           <w:tcPr>
-            <w:tcW w:w="976" w:type="dxa"/>
+            <w:tcW w:w="973" w:type="dxa"/>
             <w:shd w:val="clear" w:color="auto" w:fill="auto"/>
           </w:tcPr>
           <w:p>
@@ -2619,7 +2619,7 @@
                 <w:szCs w:val="18"/>
               </w:rPr>
               <w:pict w14:anchorId="4EE02274">
-                <v:shape id="_x0000_i1911" type="#_x0000_t75" style="width:28.35pt;height:13.65pt" equationxml="&lt;?xml version=&quot;1.0&quot; encoding=&quot;UTF-8&quot; standalone=&quot;yes&quot;?&gt;&#10;&lt;?mso-application progid=&quot;Word.Document&quot;?&gt;&#10;&lt;w:wordDocument xmlns:aml=&quot;http://schemas.microsoft.com/aml/2001/core&quot; xmlns:wpc=&quot;http://schemas.microsoft.com/office/word/2010/wordprocessingCanvas&quot; xmlns:cx=&quot;http://schemas.microsoft.com/office/drawing/2014/chartex&quot; xmlns:cx1=&quot;http://schemas.microsoft.com/office/drawing/2015/9/8/chartex&quot; xmlns:cx2=&quot;http://schemas.microsoft.com/office/drawing/2015/10/21/chartex&quot; xmlns:cx3=&quot;http://schemas.microsoft.com/office/drawing/2016/5/9/chartex&quot; xmlns:cx4=&quot;http://schemas.microsoft.com/office/drawing/2016/5/10/chartex&quot; xmlns:cx5=&quot;http://schemas.microsoft.com/office/drawing/2016/5/11/chartex&quot; xmlns:cx6=&quot;http://schemas.microsoft.com/office/drawing/2016/5/12/chartex&quot; xmlns:cx7=&quot;http://schemas.microsoft.com/office/drawing/2016/5/13/chartex&quot; xmlns:cx8=&quot;http://schemas.microsoft.com/office/drawing/2016/5/14/chartex&quot; xmlns:cr=&quot;http://schemas.microsoft.com/office/comments/2020/reactions&quot; xmlns:dt=&quot;uuid:C2F41010-65B3-11d1-A29F-00AA00C14882&quot; xmlns:mc=&quot;http://schemas.openxmlformats.org/markup-compatibility/2006&quot; xmlns:aink=&quot;http://schemas.microsoft.com/office/drawing/2016/ink&quot; xmlns:am3d=&quot;http://schemas.microsoft.com/office/drawing/2017/model3d&quot; xmlns:o=&quot;urn:schemas-microsoft-com:office:office&quot; xmlns:oel=&quot;http://schemas.microsoft.com/office/2019/extlst&quot; xmlns:m=&quot;http://schemas.openxmlformats.org/officeDocument/2006/math&quot; xmlns:v=&quot;urn:schemas-microsoft-com:vml&quot; xmlns:w10=&quot;urn:schemas-microsoft-com:office:word&quot; xmlns:w=&quot;http://schemas.microsoft.com/office/word/2003/wordml&quot; xmlns:wx=&quot;http://schemas.microsoft.com/office/word/2003/auxHint&quot; xmlns:wne=&quot;http://schemas.microsoft.com/office/word/2006/wordml&quot; xmlns:wsp=&quot;http://schemas.microsoft.com/office/word/2003/wordml/sp2&quot; xmlns:sl=&quot;http://schemas.microsoft.com/schemaLibrary/2003/core&quot; w:macrosPresent=&quot;no&quot; w:embeddedObjPresent=&quot;no&quot; w:ocxPresent=&quot;no&quot; xml:space=&quot;preserve&quot;&gt;&lt;w:ignoreSubtree w:val=&quot;http://schemas.microsoft.com/office/word/2003/wordml/sp2&quot;/&gt;&lt;o:DocumentProperties&gt;&lt;o:Version&gt;16&lt;/o:Version&gt;&lt;/o:DocumentProperties&gt;&lt;w:docPr&gt;&lt;w:view w:val=&quot;print&quot;/&gt;&lt;w:zoom w:percent=&quot;100&quot;/&gt;&lt;w:doNotEmbedSystemFonts/&gt;&lt;w:activeWritingStyle w:lang=&quot;EN-AU&quot; w:vendorID=&quot;64&quot; w:dllVersion=&quot;6&quot; w:nlCheck=&quot;on&quot; w:optionSet=&quot;1&quot;/&gt;&lt;w:activeWritingStyle w:lang=&quot;EN-GB&quot; w:vendorID=&quot;64&quot; w:dllVersion=&quot;6&quot; w:nlCheck=&quot;on&quot; w:optionSet=&quot;1&quot;/&gt;&lt;w:activeWritingStyle w:lang=&quot;EN-US&quot; w:vendorID=&quot;64&quot; w:dllVersion=&quot;6&quot; w:nlCheck=&quot;on&quot; w:optionSet=&quot;1&quot;/&gt;&lt;w:activeWritingStyle w:lang=&quot;EN-AU&quot; w:vendorID=&quot;64&quot; w:dllVersion=&quot;0&quot; w:nlCheck=&quot;on&quot; w:optionSet=&quot;0&quot;/&gt;&lt;w:activeWritingStyle w:lang=&quot;EN-GB&quot; w:vendorID=&quot;64&quot; w:dllVersion=&quot;0&quot; w:nlCheck=&quot;on&quot; w:optionSet=&quot;0&quot;/&gt;&lt;w:activeWritingStyle w:lang=&quot;EN-US&quot; w:vendorID=&quot;64&quot; w:dllVersion=&quot;0&quot; w:nlCheck=&quot;on&quot; w:optionSet=&quot;0&quot;/&gt;&lt;w:activeWritingStyle w:lang=&quot;ES-AR&quot; w:vendorID=&quot;64&quot; w:dllVersion=&quot;0&quot; w:nlCheck=&quot;on&quot; w:optionSet=&quot;0&quot;/&gt;&lt;w:activeWritingStyle w:lang=&quot;580A&quot; w:vendorID=&quot;64&quot; w:dllVersion=&quot;0&quot; w:nlCheck=&quot;on&quot; w:optionSet=&quot;0&quot;/&gt;&lt;w:activeWritingStyle w:lang=&quot;PT-BR&quot; w:vendorID=&quot;64&quot; w:dllVersion=&quot;0&quot; w:nlCheck=&quot;on&quot; w:optionSet=&quot;0&quot;/&gt;&lt;w:stylePaneFormatFilter w:val=&quot;3F01&quot;/&gt;&lt;w:defaultTabStop w:val=&quot;720&quot;/&gt;&lt;w:hyphenationZone w:val=&quot;425&quot;/&gt;&lt;w:characterSpacingControl w:val=&quot;DontCompress&quot;/&gt;&lt;w:optimizeForBrowser/&gt;&lt;w:validateAgainstSchema/&gt;&lt;w:saveInvalidXML w:val=&quot;off&quot;/&gt;&lt;w:ignoreMixedContent w:val=&quot;off&quot;/&gt;&lt;w:alwaysShowPlaceholderText w:val=&quot;off&quot;/&gt;&lt;w:compat&gt;&lt;w:breakWrappedTables/&gt;&lt;w:snapToGridInCell/&gt;&lt;w:applyBreakingRules/&gt;&lt;w:wrapTextWithPunct/&gt;&lt;w:useAsianBreakRules/&gt;&lt;w:useWord2002TableStyleRules/&gt;&lt;w:useFELayout/&gt;&lt;/w:compat&gt;&lt;wsp:rsids&gt;&lt;wsp:rsidRoot wsp:val=&quot;00426FBB&quot;/&gt;&lt;wsp:rsid wsp:val=&quot;000002E1&quot;/&gt;&lt;wsp:rsid wsp:val=&quot;00003C97&quot;/&gt;&lt;wsp:rsid wsp:val=&quot;00005565&quot;/&gt;&lt;wsp:rsid wsp:val=&quot;0001754A&quot;/&gt;&lt;wsp:rsid wsp:val=&quot;00017719&quot;/&gt;&lt;wsp:rsid wsp:val=&quot;00027F1D&quot;/&gt;&lt;wsp:rsid wsp:val=&quot;0003296C&quot;/&gt;&lt;wsp:rsid wsp:val=&quot;0003351F&quot;/&gt;&lt;wsp:rsid wsp:val=&quot;00044599&quot;/&gt;&lt;wsp:rsid wsp:val=&quot;000540E6&quot;/&gt;&lt;wsp:rsid wsp:val=&quot;00054421&quot;/&gt;&lt;wsp:rsid wsp:val=&quot;00062E46&quot;/&gt;&lt;wsp:rsid wsp:val=&quot;00074AC8&quot;/&gt;&lt;wsp:rsid wsp:val=&quot;00081408&quot;/&gt;&lt;wsp:rsid wsp:val=&quot;00081EBE&quot;/&gt;&lt;wsp:rsid wsp:val=&quot;00086EDC&quot;/&gt;&lt;wsp:rsid wsp:val=&quot;000B1236&quot;/&gt;&lt;wsp:rsid wsp:val=&quot;000B36A3&quot;/&gt;&lt;wsp:rsid wsp:val=&quot;000C013C&quot;/&gt;&lt;wsp:rsid wsp:val=&quot;000E3F84&quot;/&gt;&lt;wsp:rsid wsp:val=&quot;001056DF&quot;/&gt;&lt;wsp:rsid wsp:val=&quot;0010789C&quot;/&gt;&lt;wsp:rsid wsp:val=&quot;00114025&quot;/&gt;&lt;wsp:rsid wsp:val=&quot;001160D2&quot;/&gt;&lt;wsp:rsid wsp:val=&quot;00120636&quot;/&gt;&lt;wsp:rsid wsp:val=&quot;001348A5&quot;/&gt;&lt;wsp:rsid wsp:val=&quot;00151B8E&quot;/&gt;&lt;wsp:rsid wsp:val=&quot;00182170&quot;/&gt;&lt;wsp:rsid wsp:val=&quot;001928FB&quot;/&gt;&lt;wsp:rsid wsp:val=&quot;00192BC7&quot;/&gt;&lt;wsp:rsid wsp:val=&quot;00195BE6&quot;/&gt;&lt;wsp:rsid wsp:val=&quot;001A3C37&quot;/&gt;&lt;wsp:rsid wsp:val=&quot;001A50EA&quot;/&gt;&lt;wsp:rsid wsp:val=&quot;001F16CD&quot;/&gt;&lt;wsp:rsid wsp:val=&quot;001F47D2&quot;/&gt;&lt;wsp:rsid wsp:val=&quot;002029C8&quot;/&gt;&lt;wsp:rsid wsp:val=&quot;0022285A&quot;/&gt;&lt;wsp:rsid wsp:val=&quot;00224C61&quot;/&gt;&lt;wsp:rsid wsp:val=&quot;00256ABC&quot;/&gt;&lt;wsp:rsid wsp:val=&quot;0027227B&quot;/&gt;&lt;wsp:rsid wsp:val=&quot;00273AC7&quot;/&gt;&lt;wsp:rsid wsp:val=&quot;00273D2C&quot;/&gt;&lt;wsp:rsid wsp:val=&quot;00285ECD&quot;/&gt;&lt;wsp:rsid wsp:val=&quot;00290E1B&quot;/&gt;&lt;wsp:rsid wsp:val=&quot;00291B17&quot;/&gt;&lt;wsp:rsid wsp:val=&quot;00291BB3&quot;/&gt;&lt;wsp:rsid wsp:val=&quot;002A6742&quot;/&gt;&lt;wsp:rsid wsp:val=&quot;002C1A7F&quot;/&gt;&lt;wsp:rsid wsp:val=&quot;002C4239&quot;/&gt;&lt;wsp:rsid wsp:val=&quot;002C559D&quot;/&gt;&lt;wsp:rsid wsp:val=&quot;002D16AE&quot;/&gt;&lt;wsp:rsid wsp:val=&quot;002D2D42&quot;/&gt;&lt;wsp:rsid wsp:val=&quot;002F72D0&quot;/&gt;&lt;wsp:rsid wsp:val=&quot;002F7A4F&quot;/&gt;&lt;wsp:rsid wsp:val=&quot;003003AB&quot;/&gt;&lt;wsp:rsid wsp:val=&quot;00302C35&quot;/&gt;&lt;wsp:rsid wsp:val=&quot;00311C49&quot;/&gt;&lt;wsp:rsid wsp:val=&quot;0032119E&quot;/&gt;&lt;wsp:rsid wsp:val=&quot;00321304&quot;/&gt;&lt;wsp:rsid wsp:val=&quot;00324FC2&quot;/&gt;&lt;wsp:rsid wsp:val=&quot;003312CA&quot;/&gt;&lt;wsp:rsid wsp:val=&quot;00331F84&quot;/&gt;&lt;wsp:rsid wsp:val=&quot;0037721F&quot;/&gt;&lt;wsp:rsid wsp:val=&quot;003950A4&quot;/&gt;&lt;wsp:rsid wsp:val=&quot;003A1E7E&quot;/&gt;&lt;wsp:rsid wsp:val=&quot;003E2FDC&quot;/&gt;&lt;wsp:rsid wsp:val=&quot;003E3577&quot;/&gt;&lt;wsp:rsid wsp:val=&quot;003F3A61&quot;/&gt;&lt;wsp:rsid wsp:val=&quot;004026BC&quot;/&gt;&lt;wsp:rsid wsp:val=&quot;00410A5D&quot;/&gt;&lt;wsp:rsid wsp:val=&quot;00414909&quot;/&gt;&lt;wsp:rsid wsp:val=&quot;00416537&quot;/&gt;&lt;wsp:rsid wsp:val=&quot;00425A6A&quot;/&gt;&lt;wsp:rsid wsp:val=&quot;00426FBB&quot;/&gt;&lt;wsp:rsid wsp:val=&quot;00454542&quot;/&gt;&lt;wsp:rsid wsp:val=&quot;0047429A&quot;/&gt;&lt;wsp:rsid wsp:val=&quot;0048374C&quot;/&gt;&lt;wsp:rsid wsp:val=&quot;0048771D&quot;/&gt;&lt;wsp:rsid wsp:val=&quot;004A6605&quot;/&gt;&lt;wsp:rsid wsp:val=&quot;004C45FA&quot;/&gt;&lt;wsp:rsid wsp:val=&quot;004D35A3&quot;/&gt;&lt;wsp:rsid wsp:val=&quot;004E1BD8&quot;/&gt;&lt;wsp:rsid wsp:val=&quot;004E452A&quot;/&gt;&lt;wsp:rsid wsp:val=&quot;004E78E3&quot;/&gt;&lt;wsp:rsid wsp:val=&quot;004F2BFE&quot;/&gt;&lt;wsp:rsid wsp:val=&quot;004F63D3&quot;/&gt;&lt;wsp:rsid wsp:val=&quot;004F7DCF&quot;/&gt;&lt;wsp:rsid wsp:val=&quot;005004BF&quot;/&gt;&lt;wsp:rsid wsp:val=&quot;00502E89&quot;/&gt;&lt;wsp:rsid wsp:val=&quot;00506CFE&quot;/&gt;&lt;wsp:rsid wsp:val=&quot;00510E95&quot;/&gt;&lt;wsp:rsid wsp:val=&quot;005225C3&quot;/&gt;&lt;wsp:rsid wsp:val=&quot;00527D56&quot;/&gt;&lt;wsp:rsid wsp:val=&quot;0053221F&quot;/&gt;&lt;wsp:rsid wsp:val=&quot;00536FAE&quot;/&gt;&lt;wsp:rsid wsp:val=&quot;00542C85&quot;/&gt;&lt;wsp:rsid wsp:val=&quot;00553510&quot;/&gt;&lt;wsp:rsid wsp:val=&quot;00554186&quot;/&gt;&lt;wsp:rsid wsp:val=&quot;00585769&quot;/&gt;&lt;wsp:rsid wsp:val=&quot;00585C61&quot;/&gt;&lt;wsp:rsid wsp:val=&quot;00591130&quot;/&gt;&lt;wsp:rsid wsp:val=&quot;005A3F28&quot;/&gt;&lt;wsp:rsid wsp:val=&quot;005A40BE&quot;/&gt;&lt;wsp:rsid wsp:val=&quot;005B13E2&quot;/&gt;&lt;wsp:rsid wsp:val=&quot;005B47D7&quot;/&gt;&lt;wsp:rsid wsp:val=&quot;005C5526&quot;/&gt;&lt;wsp:rsid wsp:val=&quot;005C62C6&quot;/&gt;&lt;wsp:rsid wsp:val=&quot;005D7B9E&quot;/&gt;&lt;wsp:rsid wsp:val=&quot;005E112E&quot;/&gt;&lt;wsp:rsid wsp:val=&quot;005F0834&quot;/&gt;&lt;wsp:rsid wsp:val=&quot;005F68AB&quot;/&gt;&lt;wsp:rsid wsp:val=&quot;005F6DC3&quot;/&gt;&lt;wsp:rsid wsp:val=&quot;00601A8E&quot;/&gt;&lt;wsp:rsid wsp:val=&quot;0062033E&quot;/&gt;&lt;wsp:rsid wsp:val=&quot;00624482&quot;/&gt;&lt;wsp:rsid wsp:val=&quot;0064799C&quot;/&gt;&lt;wsp:rsid wsp:val=&quot;00654156&quot;/&gt;&lt;wsp:rsid wsp:val=&quot;00656ADC&quot;/&gt;&lt;wsp:rsid wsp:val=&quot;006B47CA&quot;/&gt;&lt;wsp:rsid wsp:val=&quot;006C304C&quot;/&gt;&lt;wsp:rsid wsp:val=&quot;006C4511&quot;/&gt;&lt;wsp:rsid wsp:val=&quot;006C65F5&quot;/&gt;&lt;wsp:rsid wsp:val=&quot;006C7AAA&quot;/&gt;&lt;wsp:rsid wsp:val=&quot;006D1C2A&quot;/&gt;&lt;wsp:rsid wsp:val=&quot;006D264F&quot;/&gt;&lt;wsp:rsid wsp:val=&quot;006D4E89&quot;/&gt;&lt;wsp:rsid wsp:val=&quot;006E2A8D&quot;/&gt;&lt;wsp:rsid wsp:val=&quot;006E7574&quot;/&gt;&lt;wsp:rsid wsp:val=&quot;00703430&quot;/&gt;&lt;wsp:rsid wsp:val=&quot;00703548&quot;/&gt;&lt;wsp:rsid wsp:val=&quot;00704E18&quot;/&gt;&lt;wsp:rsid wsp:val=&quot;007069BE&quot;/&gt;&lt;wsp:rsid wsp:val=&quot;00745C86&quot;/&gt;&lt;wsp:rsid wsp:val=&quot;00764603&quot;/&gt;&lt;wsp:rsid wsp:val=&quot;0076604D&quot;/&gt;&lt;wsp:rsid wsp:val=&quot;00790909&quot;/&gt;&lt;wsp:rsid wsp:val=&quot;007929AF&quot;/&gt;&lt;wsp:rsid wsp:val=&quot;007B1582&quot;/&gt;&lt;wsp:rsid wsp:val=&quot;007B5A07&quot;/&gt;&lt;wsp:rsid wsp:val=&quot;007C065D&quot;/&gt;&lt;wsp:rsid wsp:val=&quot;007D3E71&quot;/&gt;&lt;wsp:rsid wsp:val=&quot;007E5D6A&quot;/&gt;&lt;wsp:rsid wsp:val=&quot;007E645D&quot;/&gt;&lt;wsp:rsid wsp:val=&quot;007F75CA&quot;/&gt;&lt;wsp:rsid wsp:val=&quot;00821E08&quot;/&gt;&lt;wsp:rsid wsp:val=&quot;00834EFD&quot;/&gt;&lt;wsp:rsid wsp:val=&quot;00844B24&quot;/&gt;&lt;wsp:rsid wsp:val=&quot;0084515F&quot;/&gt;&lt;wsp:rsid wsp:val=&quot;0085092D&quot;/&gt;&lt;wsp:rsid wsp:val=&quot;00865414&quot;/&gt;&lt;wsp:rsid wsp:val=&quot;00877D4C&quot;/&gt;&lt;wsp:rsid wsp:val=&quot;00883903&quot;/&gt;&lt;wsp:rsid wsp:val=&quot;00891C30&quot;/&gt;&lt;wsp:rsid wsp:val=&quot;0089763B&quot;/&gt;&lt;wsp:rsid wsp:val=&quot;008B6AE3&quot;/&gt;&lt;wsp:rsid wsp:val=&quot;008C1332&quot;/&gt;&lt;wsp:rsid wsp:val=&quot;008D1045&quot;/&gt;&lt;wsp:rsid wsp:val=&quot;008E5996&quot;/&gt;&lt;wsp:rsid wsp:val=&quot;00901AE1&quot;/&gt;&lt;wsp:rsid wsp:val=&quot;00912F93&quot;/&gt;&lt;wsp:rsid wsp:val=&quot;009205B4&quot;/&gt;&lt;wsp:rsid wsp:val=&quot;00955B59&quot;/&gt;&lt;wsp:rsid wsp:val=&quot;00992262&quot;/&gt;&lt;wsp:rsid wsp:val=&quot;009926BC&quot;/&gt;&lt;wsp:rsid wsp:val=&quot;009A4319&quot;/&gt;&lt;wsp:rsid wsp:val=&quot;009A6C3F&quot;/&gt;&lt;wsp:rsid wsp:val=&quot;009B73F2&quot;/&gt;&lt;wsp:rsid wsp:val=&quot;009C12BD&quot;/&gt;&lt;wsp:rsid wsp:val=&quot;009C50FE&quot;/&gt;&lt;wsp:rsid wsp:val=&quot;009E49DD&quot;/&gt;&lt;wsp:rsid wsp:val=&quot;00A03E75&quot;/&gt;&lt;wsp:rsid wsp:val=&quot;00A20627&quot;/&gt;&lt;wsp:rsid wsp:val=&quot;00A22FE9&quot;/&gt;&lt;wsp:rsid wsp:val=&quot;00A31A44&quot;/&gt;&lt;wsp:rsid wsp:val=&quot;00A32BFA&quot;/&gt;&lt;wsp:rsid wsp:val=&quot;00A3325E&quot;/&gt;&lt;wsp:rsid wsp:val=&quot;00A45FCE&quot;/&gt;&lt;wsp:rsid wsp:val=&quot;00A75671&quot;/&gt;&lt;wsp:rsid wsp:val=&quot;00A773CC&quot;/&gt;&lt;wsp:rsid wsp:val=&quot;00A924D0&quot;/&gt;&lt;wsp:rsid wsp:val=&quot;00A9318B&quot;/&gt;&lt;wsp:rsid wsp:val=&quot;00A94AC1&quot;/&gt;&lt;wsp:rsid wsp:val=&quot;00AB18B7&quot;/&gt;&lt;wsp:rsid wsp:val=&quot;00AD335D&quot;/&gt;&lt;wsp:rsid wsp:val=&quot;00AF114C&quot;/&gt;&lt;wsp:rsid wsp:val=&quot;00AF792B&quot;/&gt;&lt;wsp:rsid wsp:val=&quot;00B32137&quot;/&gt;&lt;wsp:rsid wsp:val=&quot;00B33D2F&quot;/&gt;&lt;wsp:rsid wsp:val=&quot;00B40A5B&quot;/&gt;&lt;wsp:rsid wsp:val=&quot;00B45C6B&quot;/&gt;&lt;wsp:rsid wsp:val=&quot;00B55D5E&quot;/&gt;&lt;wsp:rsid wsp:val=&quot;00B57A80&quot;/&gt;&lt;wsp:rsid wsp:val=&quot;00B70E9C&quot;/&gt;&lt;wsp:rsid wsp:val=&quot;00B713D8&quot;/&gt;&lt;wsp:rsid wsp:val=&quot;00B72979&quot;/&gt;&lt;wsp:rsid wsp:val=&quot;00B94516&quot;/&gt;&lt;wsp:rsid wsp:val=&quot;00BA25E2&quot;/&gt;&lt;wsp:rsid wsp:val=&quot;00BB2855&quot;/&gt;&lt;wsp:rsid wsp:val=&quot;00BC5343&quot;/&gt;&lt;wsp:rsid wsp:val=&quot;00BD19C1&quot;/&gt;&lt;wsp:rsid wsp:val=&quot;00BD25B8&quot;/&gt;&lt;wsp:rsid wsp:val=&quot;00C012E1&quot;/&gt;&lt;wsp:rsid wsp:val=&quot;00C06BB4&quot;/&gt;&lt;wsp:rsid wsp:val=&quot;00C10D20&quot;/&gt;&lt;wsp:rsid wsp:val=&quot;00C12E0C&quot;/&gt;&lt;wsp:rsid wsp:val=&quot;00C21916&quot;/&gt;&lt;wsp:rsid wsp:val=&quot;00C34915&quot;/&gt;&lt;wsp:rsid wsp:val=&quot;00C457CA&quot;/&gt;&lt;wsp:rsid wsp:val=&quot;00C53FB6&quot;/&gt;&lt;wsp:rsid wsp:val=&quot;00C57FB7&quot;/&gt;&lt;wsp:rsid wsp:val=&quot;00C644D4&quot;/&gt;&lt;wsp:rsid wsp:val=&quot;00C65F3F&quot;/&gt;&lt;wsp:rsid wsp:val=&quot;00C72414&quot;/&gt;&lt;wsp:rsid wsp:val=&quot;00C72B1A&quot;/&gt;&lt;wsp:rsid wsp:val=&quot;00C8667B&quot;/&gt;&lt;wsp:rsid wsp:val=&quot;00C90993&quot;/&gt;&lt;wsp:rsid wsp:val=&quot;00CA4CE3&quot;/&gt;&lt;wsp:rsid wsp:val=&quot;00CC72FD&quot;/&gt;&lt;wsp:rsid wsp:val=&quot;00CD1D23&quot;/&gt;&lt;wsp:rsid wsp:val=&quot;00CD4F3F&quot;/&gt;&lt;wsp:rsid wsp:val=&quot;00D311F8&quot;/&gt;&lt;wsp:rsid wsp:val=&quot;00D31660&quot;/&gt;&lt;wsp:rsid wsp:val=&quot;00D36B52&quot;/&gt;&lt;wsp:rsid wsp:val=&quot;00D377C8&quot;/&gt;&lt;wsp:rsid wsp:val=&quot;00D41274&quot;/&gt;&lt;wsp:rsid wsp:val=&quot;00D4229C&quot;/&gt;&lt;wsp:rsid wsp:val=&quot;00D43BF3&quot;/&gt;&lt;wsp:rsid wsp:val=&quot;00D549FB&quot;/&gt;&lt;wsp:rsid wsp:val=&quot;00D56487&quot;/&gt;&lt;wsp:rsid wsp:val=&quot;00D767BB&quot;/&gt;&lt;wsp:rsid wsp:val=&quot;00D939B0&quot;/&gt;&lt;wsp:rsid wsp:val=&quot;00DA31A2&quot;/&gt;&lt;wsp:rsid wsp:val=&quot;00DB16E0&quot;/&gt;&lt;wsp:rsid wsp:val=&quot;00DB2DF9&quot;/&gt;&lt;wsp:rsid wsp:val=&quot;00DB465D&quot;/&gt;&lt;wsp:rsid wsp:val=&quot;00DB48A2&quot;/&gt;&lt;wsp:rsid wsp:val=&quot;00DB7E63&quot;/&gt;&lt;wsp:rsid wsp:val=&quot;00DC2055&quot;/&gt;&lt;wsp:rsid wsp:val=&quot;00DC3908&quot;/&gt;&lt;wsp:rsid wsp:val=&quot;00DD71E8&quot;/&gt;&lt;wsp:rsid wsp:val=&quot;00DD7F83&quot;/&gt;&lt;wsp:rsid wsp:val=&quot;00DE4EB8&quot;/&gt;&lt;wsp:rsid wsp:val=&quot;00E0641E&quot;/&gt;&lt;wsp:rsid wsp:val=&quot;00E06664&quot;/&gt;&lt;wsp:rsid wsp:val=&quot;00E304BC&quot;/&gt;&lt;wsp:rsid wsp:val=&quot;00E32853&quot;/&gt;&lt;wsp:rsid wsp:val=&quot;00E34EBD&quot;/&gt;&lt;wsp:rsid wsp:val=&quot;00E401F8&quot;/&gt;&lt;wsp:rsid wsp:val=&quot;00E46425&quot;/&gt;&lt;wsp:rsid wsp:val=&quot;00E469FC&quot;/&gt;&lt;wsp:rsid wsp:val=&quot;00E47D0E&quot;/&gt;&lt;wsp:rsid wsp:val=&quot;00E65018&quot;/&gt;&lt;wsp:rsid wsp:val=&quot;00E76CA1&quot;/&gt;&lt;wsp:rsid wsp:val=&quot;00E94339&quot;/&gt;&lt;wsp:rsid wsp:val=&quot;00E97563&quot;/&gt;&lt;wsp:rsid wsp:val=&quot;00EB0B63&quot;/&gt;&lt;wsp:rsid wsp:val=&quot;00EC265C&quot;/&gt;&lt;wsp:rsid wsp:val=&quot;00ED61CB&quot;/&gt;&lt;wsp:rsid wsp:val=&quot;00EE752A&quot;/&gt;&lt;wsp:rsid wsp:val=&quot;00F06A72&quot;/&gt;&lt;wsp:rsid wsp:val=&quot;00F136F0&quot;/&gt;&lt;wsp:rsid wsp:val=&quot;00F20BBB&quot;/&gt;&lt;wsp:rsid wsp:val=&quot;00F36048&quot;/&gt;&lt;wsp:rsid wsp:val=&quot;00F43BD8&quot;/&gt;&lt;wsp:rsid wsp:val=&quot;00F562F3&quot;/&gt;&lt;wsp:rsid wsp:val=&quot;00F74B89&quot;/&gt;&lt;wsp:rsid wsp:val=&quot;00F75133&quot;/&gt;&lt;wsp:rsid wsp:val=&quot;00F83272&quot;/&gt;&lt;wsp:rsid wsp:val=&quot;00F9358D&quot;/&gt;&lt;wsp:rsid wsp:val=&quot;00F9369B&quot;/&gt;&lt;wsp:rsid wsp:val=&quot;00FA3899&quot;/&gt;&lt;wsp:rsid wsp:val=&quot;00FA4909&quot;/&gt;&lt;wsp:rsid wsp:val=&quot;00FA5164&quot;/&gt;&lt;wsp:rsid wsp:val=&quot;00FA6751&quot;/&gt;&lt;wsp:rsid wsp:val=&quot;00FA6BD7&quot;/&gt;&lt;wsp:rsid wsp:val=&quot;00FB1048&quot;/&gt;&lt;wsp:rsid wsp:val=&quot;00FB62C4&quot;/&gt;&lt;wsp:rsid wsp:val=&quot;00FB7701&quot;/&gt;&lt;wsp:rsid wsp:val=&quot;00FD1AC5&quot;/&gt;&lt;wsp:rsid wsp:val=&quot;00FD5CF0&quot;/&gt;&lt;/wsp:rsids&gt;&lt;/w:docPr&gt;&lt;w:body&gt;&lt;wx:sect&gt;&lt;w:p wsp:rsidR=&quot;004026BC&quot; wsp:rsidRPr=&quot;004026BC&quot; wsp:rsidRDefault=&quot;004026BC&quot; wsp:rsidP=&quot;004026BC&quot;&gt;&lt;m:oMathPara&gt;&lt;m:oMath&gt;&lt;m:r&gt;&lt;m:rPr&gt;&lt;m:sty m:val=&quot;p&quot;/&gt;&lt;/m:rPr&gt;&lt;w:rPr&gt;&lt;w:rFonts w:ascii=&quot;Cambria Math&quot; w:h-ansi=&quot;Cambria Math&quot;/&gt;&lt;wx:font wx:val=&quot;Cambria Math&quot;/&gt;&lt;/w:rPr&gt;&lt;m:t&gt;Î”&lt;/m:t&gt;&lt;/m:r&gt;&lt;m:sSub&gt;&lt;m:sSubPr&gt;&lt;m:ctrlPr&gt;&lt;w:rPr&gt;&lt;w:rFonts w:ascii=&quot;Cambria Math&quot; w:h-ansi=&quot;Cambria Math&quot;/&gt;&lt;wx:font wx:val=&quot;Cambria Math&quot;/&gt;&lt;w:i/&gt;&lt;/w:rPr&gt;&lt;/m:ctrlPr&gt;&lt;/m:sSubPr&gt;&lt;m:e&gt;&lt;m:r&gt;&lt;w:rPr&gt;&lt;w:rFonts w:ascii=&quot;Cambria Math&quot; w:h-ansi=&quot;Cambria Math&quot;/&gt;&lt;wx:font wx:val=&quot;Cambria Math&quot;/&gt;&lt;w:i/&gt;&lt;/w:rPr&gt;&lt;m:t&gt;V&lt;/m:t&gt;&lt;/m:r&gt;&lt;/m:e&gt;&lt;m:sub&gt;&lt;m:r&gt;&lt;w:rPr&gt;&lt;w:rFonts w:ascii=&quot;Cambria Math&quot; w:h-ansi=&quot;Cambria Math&quot;/&gt;&lt;wx:font wx:val=&quot;Cambria Math&quot;/&gt;&lt;w:i/&gt;&lt;/w:rPr&gt;&lt;m:t&gt;out&lt;/m:t&gt;&lt;/m:r&gt;&lt;/m:sub&gt;&lt;/m:sSub&gt;&lt;/m:oMath&gt;&lt;/m:oMathPara&gt;&lt;/w:p&gt;&lt;w:sectPr wsp:rsidR=&quot;00000000&quot; wsp:rsidRPr=&quot;004026BC&quot;&gt;&lt;w:pgSz w:w=&quot;12240&quot; w:h=&quot;15840&quot;/&gt;&lt;w:pgMar w:top=&quot;1440&quot; w:right=&quot;1440&quot; w:bottom=&quot;1440&quot; w:left=&quot;1440&quot; w:header=&quot;720&quot; w:footer=&quot;720&quot; w:gutter=&quot;0&quot;/&gt;&lt;w:cols w:space=&quot;720&quot;/&gt;&lt;/w:sectPr&gt;&lt;/wx:sect&gt;&lt;/w:body&gt;&lt;/w:wordDocument&gt;">
+                <v:shape id="_x0000_i1052" type="#_x0000_t75" style="width:28.4pt;height:13.85pt" equationxml="&lt;?xml version=&quot;1.0&quot; encoding=&quot;UTF-8&quot; standalone=&quot;yes&quot;?&gt;&#10;&lt;?mso-application progid=&quot;Word.Document&quot;?&gt;&#10;&lt;w:wordDocument xmlns:aml=&quot;http://schemas.microsoft.com/aml/2001/core&quot; xmlns:wpc=&quot;http://schemas.microsoft.com/office/word/2010/wordprocessingCanvas&quot; xmlns:cx=&quot;http://schemas.microsoft.com/office/drawing/2014/chartex&quot; xmlns:cx1=&quot;http://schemas.microsoft.com/office/drawing/2015/9/8/chartex&quot; xmlns:cx2=&quot;http://schemas.microsoft.com/office/drawing/2015/10/21/chartex&quot; xmlns:cx3=&quot;http://schemas.microsoft.com/office/drawing/2016/5/9/chartex&quot; xmlns:cx4=&quot;http://schemas.microsoft.com/office/drawing/2016/5/10/chartex&quot; xmlns:cx5=&quot;http://schemas.microsoft.com/office/drawing/2016/5/11/chartex&quot; xmlns:cx6=&quot;http://schemas.microsoft.com/office/drawing/2016/5/12/chartex&quot; xmlns:cx7=&quot;http://schemas.microsoft.com/office/drawing/2016/5/13/chartex&quot; xmlns:cx8=&quot;http://schemas.microsoft.com/office/drawing/2016/5/14/chartex&quot; xmlns:cr=&quot;http://schemas.microsoft.com/office/comments/2020/reactions&quot; xmlns:dt=&quot;uuid:C2F41010-65B3-11d1-A29F-00AA00C14882&quot; xmlns:mc=&quot;http://schemas.openxmlformats.org/markup-compatibility/2006&quot; xmlns:aink=&quot;http://schemas.microsoft.com/office/drawing/2016/ink&quot; xmlns:am3d=&quot;http://schemas.microsoft.com/office/drawing/2017/model3d&quot; xmlns:o=&quot;urn:schemas-microsoft-com:office:office&quot; xmlns:oel=&quot;http://schemas.microsoft.com/office/2019/extlst&quot; xmlns:m=&quot;http://schemas.openxmlformats.org/officeDocument/2006/math&quot; xmlns:v=&quot;urn:schemas-microsoft-com:vml&quot; xmlns:w10=&quot;urn:schemas-microsoft-com:office:word&quot; xmlns:w=&quot;http://schemas.microsoft.com/office/word/2003/wordml&quot; xmlns:wx=&quot;http://schemas.microsoft.com/office/word/2003/auxHint&quot; xmlns:wne=&quot;http://schemas.microsoft.com/office/word/2006/wordml&quot; xmlns:wsp=&quot;http://schemas.microsoft.com/office/word/2003/wordml/sp2&quot; xmlns:sl=&quot;http://schemas.microsoft.com/schemaLibrary/2003/core&quot; w:macrosPresent=&quot;no&quot; w:embeddedObjPresent=&quot;no&quot; w:ocxPresent=&quot;no&quot; xml:space=&quot;preserve&quot;&gt;&lt;w:ignoreSubtree w:val=&quot;http://schemas.microsoft.com/office/word/2003/wordml/sp2&quot;/&gt;&lt;o:DocumentProperties&gt;&lt;o:Version&gt;16&lt;/o:Version&gt;&lt;/o:DocumentProperties&gt;&lt;w:docPr&gt;&lt;w:view w:val=&quot;print&quot;/&gt;&lt;w:zoom w:percent=&quot;100&quot;/&gt;&lt;w:doNotEmbedSystemFonts/&gt;&lt;w:activeWritingStyle w:lang=&quot;EN-AU&quot; w:vendorID=&quot;64&quot; w:dllVersion=&quot;6&quot; w:nlCheck=&quot;on&quot; w:optionSet=&quot;1&quot;/&gt;&lt;w:activeWritingStyle w:lang=&quot;EN-GB&quot; w:vendorID=&quot;64&quot; w:dllVersion=&quot;6&quot; w:nlCheck=&quot;on&quot; w:optionSet=&quot;1&quot;/&gt;&lt;w:activeWritingStyle w:lang=&quot;EN-US&quot; w:vendorID=&quot;64&quot; w:dllVersion=&quot;6&quot; w:nlCheck=&quot;on&quot; w:optionSet=&quot;1&quot;/&gt;&lt;w:activeWritingStyle w:lang=&quot;EN-AU&quot; w:vendorID=&quot;64&quot; w:dllVersion=&quot;0&quot; w:nlCheck=&quot;on&quot; w:optionSet=&quot;0&quot;/&gt;&lt;w:activeWritingStyle w:lang=&quot;EN-GB&quot; w:vendorID=&quot;64&quot; w:dllVersion=&quot;0&quot; w:nlCheck=&quot;on&quot; w:optionSet=&quot;0&quot;/&gt;&lt;w:activeWritingStyle w:lang=&quot;EN-US&quot; w:vendorID=&quot;64&quot; w:dllVersion=&quot;0&quot; w:nlCheck=&quot;on&quot; w:optionSet=&quot;0&quot;/&gt;&lt;w:activeWritingStyle w:lang=&quot;ES-AR&quot; w:vendorID=&quot;64&quot; w:dllVersion=&quot;0&quot; w:nlCheck=&quot;on&quot; w:optionSet=&quot;0&quot;/&gt;&lt;w:activeWritingStyle w:lang=&quot;580A&quot; w:vendorID=&quot;64&quot; w:dllVersion=&quot;0&quot; w:nlCheck=&quot;on&quot; w:optionSet=&quot;0&quot;/&gt;&lt;w:activeWritingStyle w:lang=&quot;PT-BR&quot; w:vendorID=&quot;64&quot; w:dllVersion=&quot;0&quot; w:nlCheck=&quot;on&quot; w:optionSet=&quot;0&quot;/&gt;&lt;w:stylePaneFormatFilter w:val=&quot;3F01&quot;/&gt;&lt;w:defaultTabStop w:val=&quot;720&quot;/&gt;&lt;w:hyphenationZone w:val=&quot;425&quot;/&gt;&lt;w:characterSpacingControl w:val=&quot;DontCompress&quot;/&gt;&lt;w:optimizeForBrowser/&gt;&lt;w:validateAgainstSchema/&gt;&lt;w:saveInvalidXML w:val=&quot;off&quot;/&gt;&lt;w:ignoreMixedContent w:val=&quot;off&quot;/&gt;&lt;w:alwaysShowPlaceholderText w:val=&quot;off&quot;/&gt;&lt;w:compat&gt;&lt;w:breakWrappedTables/&gt;&lt;w:snapToGridInCell/&gt;&lt;w:applyBreakingRules/&gt;&lt;w:wrapTextWithPunct/&gt;&lt;w:useAsianBreakRules/&gt;&lt;w:useWord2002TableStyleRules/&gt;&lt;w:useFELayout/&gt;&lt;/w:compat&gt;&lt;wsp:rsids&gt;&lt;wsp:rsidRoot wsp:val=&quot;00426FBB&quot;/&gt;&lt;wsp:rsid wsp:val=&quot;000002E1&quot;/&gt;&lt;wsp:rsid wsp:val=&quot;00003C97&quot;/&gt;&lt;wsp:rsid wsp:val=&quot;00005565&quot;/&gt;&lt;wsp:rsid wsp:val=&quot;0001754A&quot;/&gt;&lt;wsp:rsid wsp:val=&quot;00017719&quot;/&gt;&lt;wsp:rsid wsp:val=&quot;00027F1D&quot;/&gt;&lt;wsp:rsid wsp:val=&quot;0003296C&quot;/&gt;&lt;wsp:rsid wsp:val=&quot;0003351F&quot;/&gt;&lt;wsp:rsid wsp:val=&quot;00044599&quot;/&gt;&lt;wsp:rsid wsp:val=&quot;000540E6&quot;/&gt;&lt;wsp:rsid wsp:val=&quot;00054421&quot;/&gt;&lt;wsp:rsid wsp:val=&quot;00062E46&quot;/&gt;&lt;wsp:rsid wsp:val=&quot;00074AC8&quot;/&gt;&lt;wsp:rsid wsp:val=&quot;00081408&quot;/&gt;&lt;wsp:rsid wsp:val=&quot;00081EBE&quot;/&gt;&lt;wsp:rsid wsp:val=&quot;00086EDC&quot;/&gt;&lt;wsp:rsid wsp:val=&quot;000B1236&quot;/&gt;&lt;wsp:rsid wsp:val=&quot;000B36A3&quot;/&gt;&lt;wsp:rsid wsp:val=&quot;000C013C&quot;/&gt;&lt;wsp:rsid wsp:val=&quot;000E3F84&quot;/&gt;&lt;wsp:rsid wsp:val=&quot;001056DF&quot;/&gt;&lt;wsp:rsid wsp:val=&quot;0010789C&quot;/&gt;&lt;wsp:rsid wsp:val=&quot;00114025&quot;/&gt;&lt;wsp:rsid wsp:val=&quot;001160D2&quot;/&gt;&lt;wsp:rsid wsp:val=&quot;00120636&quot;/&gt;&lt;wsp:rsid wsp:val=&quot;001348A5&quot;/&gt;&lt;wsp:rsid wsp:val=&quot;00151B8E&quot;/&gt;&lt;wsp:rsid wsp:val=&quot;00182170&quot;/&gt;&lt;wsp:rsid wsp:val=&quot;001928FB&quot;/&gt;&lt;wsp:rsid wsp:val=&quot;00192BC7&quot;/&gt;&lt;wsp:rsid wsp:val=&quot;00195BE6&quot;/&gt;&lt;wsp:rsid wsp:val=&quot;001A3C37&quot;/&gt;&lt;wsp:rsid wsp:val=&quot;001A50EA&quot;/&gt;&lt;wsp:rsid wsp:val=&quot;001F16CD&quot;/&gt;&lt;wsp:rsid wsp:val=&quot;001F47D2&quot;/&gt;&lt;wsp:rsid wsp:val=&quot;002029C8&quot;/&gt;&lt;wsp:rsid wsp:val=&quot;0022285A&quot;/&gt;&lt;wsp:rsid wsp:val=&quot;00224C61&quot;/&gt;&lt;wsp:rsid wsp:val=&quot;00256ABC&quot;/&gt;&lt;wsp:rsid wsp:val=&quot;0027227B&quot;/&gt;&lt;wsp:rsid wsp:val=&quot;00273AC7&quot;/&gt;&lt;wsp:rsid wsp:val=&quot;00273D2C&quot;/&gt;&lt;wsp:rsid wsp:val=&quot;00285ECD&quot;/&gt;&lt;wsp:rsid wsp:val=&quot;00290E1B&quot;/&gt;&lt;wsp:rsid wsp:val=&quot;00291B17&quot;/&gt;&lt;wsp:rsid wsp:val=&quot;00291BB3&quot;/&gt;&lt;wsp:rsid wsp:val=&quot;002A6742&quot;/&gt;&lt;wsp:rsid wsp:val=&quot;002C1A7F&quot;/&gt;&lt;wsp:rsid wsp:val=&quot;002C4239&quot;/&gt;&lt;wsp:rsid wsp:val=&quot;002C559D&quot;/&gt;&lt;wsp:rsid wsp:val=&quot;002D16AE&quot;/&gt;&lt;wsp:rsid wsp:val=&quot;002D2D42&quot;/&gt;&lt;wsp:rsid wsp:val=&quot;002F72D0&quot;/&gt;&lt;wsp:rsid wsp:val=&quot;002F7A4F&quot;/&gt;&lt;wsp:rsid wsp:val=&quot;003003AB&quot;/&gt;&lt;wsp:rsid wsp:val=&quot;00302C35&quot;/&gt;&lt;wsp:rsid wsp:val=&quot;00311C49&quot;/&gt;&lt;wsp:rsid wsp:val=&quot;0032119E&quot;/&gt;&lt;wsp:rsid wsp:val=&quot;00321304&quot;/&gt;&lt;wsp:rsid wsp:val=&quot;00324FC2&quot;/&gt;&lt;wsp:rsid wsp:val=&quot;003312CA&quot;/&gt;&lt;wsp:rsid wsp:val=&quot;00331F84&quot;/&gt;&lt;wsp:rsid wsp:val=&quot;0037721F&quot;/&gt;&lt;wsp:rsid wsp:val=&quot;003950A4&quot;/&gt;&lt;wsp:rsid wsp:val=&quot;003A1E7E&quot;/&gt;&lt;wsp:rsid wsp:val=&quot;003E2FDC&quot;/&gt;&lt;wsp:rsid wsp:val=&quot;003E3577&quot;/&gt;&lt;wsp:rsid wsp:val=&quot;003F3A61&quot;/&gt;&lt;wsp:rsid wsp:val=&quot;004026BC&quot;/&gt;&lt;wsp:rsid wsp:val=&quot;00410A5D&quot;/&gt;&lt;wsp:rsid wsp:val=&quot;00414909&quot;/&gt;&lt;wsp:rsid wsp:val=&quot;00416537&quot;/&gt;&lt;wsp:rsid wsp:val=&quot;00425A6A&quot;/&gt;&lt;wsp:rsid wsp:val=&quot;00426FBB&quot;/&gt;&lt;wsp:rsid wsp:val=&quot;00454542&quot;/&gt;&lt;wsp:rsid wsp:val=&quot;0047429A&quot;/&gt;&lt;wsp:rsid wsp:val=&quot;0048374C&quot;/&gt;&lt;wsp:rsid wsp:val=&quot;0048771D&quot;/&gt;&lt;wsp:rsid wsp:val=&quot;004A6605&quot;/&gt;&lt;wsp:rsid wsp:val=&quot;004C45FA&quot;/&gt;&lt;wsp:rsid wsp:val=&quot;004D35A3&quot;/&gt;&lt;wsp:rsid wsp:val=&quot;004E1BD8&quot;/&gt;&lt;wsp:rsid wsp:val=&quot;004E452A&quot;/&gt;&lt;wsp:rsid wsp:val=&quot;004E78E3&quot;/&gt;&lt;wsp:rsid wsp:val=&quot;004F2BFE&quot;/&gt;&lt;wsp:rsid wsp:val=&quot;004F63D3&quot;/&gt;&lt;wsp:rsid wsp:val=&quot;004F7DCF&quot;/&gt;&lt;wsp:rsid wsp:val=&quot;005004BF&quot;/&gt;&lt;wsp:rsid wsp:val=&quot;00502E89&quot;/&gt;&lt;wsp:rsid wsp:val=&quot;00506CFE&quot;/&gt;&lt;wsp:rsid wsp:val=&quot;00510E95&quot;/&gt;&lt;wsp:rsid wsp:val=&quot;005225C3&quot;/&gt;&lt;wsp:rsid wsp:val=&quot;00527D56&quot;/&gt;&lt;wsp:rsid wsp:val=&quot;0053221F&quot;/&gt;&lt;wsp:rsid wsp:val=&quot;00536FAE&quot;/&gt;&lt;wsp:rsid wsp:val=&quot;00542C85&quot;/&gt;&lt;wsp:rsid wsp:val=&quot;00553510&quot;/&gt;&lt;wsp:rsid wsp:val=&quot;00554186&quot;/&gt;&lt;wsp:rsid wsp:val=&quot;00585769&quot;/&gt;&lt;wsp:rsid wsp:val=&quot;00585C61&quot;/&gt;&lt;wsp:rsid wsp:val=&quot;00591130&quot;/&gt;&lt;wsp:rsid wsp:val=&quot;005A3F28&quot;/&gt;&lt;wsp:rsid wsp:val=&quot;005A40BE&quot;/&gt;&lt;wsp:rsid wsp:val=&quot;005B13E2&quot;/&gt;&lt;wsp:rsid wsp:val=&quot;005B47D7&quot;/&gt;&lt;wsp:rsid wsp:val=&quot;005C5526&quot;/&gt;&lt;wsp:rsid wsp:val=&quot;005C62C6&quot;/&gt;&lt;wsp:rsid wsp:val=&quot;005D7B9E&quot;/&gt;&lt;wsp:rsid wsp:val=&quot;005E112E&quot;/&gt;&lt;wsp:rsid wsp:val=&quot;005F0834&quot;/&gt;&lt;wsp:rsid wsp:val=&quot;005F68AB&quot;/&gt;&lt;wsp:rsid wsp:val=&quot;005F6DC3&quot;/&gt;&lt;wsp:rsid wsp:val=&quot;00601A8E&quot;/&gt;&lt;wsp:rsid wsp:val=&quot;0062033E&quot;/&gt;&lt;wsp:rsid wsp:val=&quot;00624482&quot;/&gt;&lt;wsp:rsid wsp:val=&quot;0064799C&quot;/&gt;&lt;wsp:rsid wsp:val=&quot;00654156&quot;/&gt;&lt;wsp:rsid wsp:val=&quot;00656ADC&quot;/&gt;&lt;wsp:rsid wsp:val=&quot;006B47CA&quot;/&gt;&lt;wsp:rsid wsp:val=&quot;006C304C&quot;/&gt;&lt;wsp:rsid wsp:val=&quot;006C4511&quot;/&gt;&lt;wsp:rsid wsp:val=&quot;006C65F5&quot;/&gt;&lt;wsp:rsid wsp:val=&quot;006C7AAA&quot;/&gt;&lt;wsp:rsid wsp:val=&quot;006D1C2A&quot;/&gt;&lt;wsp:rsid wsp:val=&quot;006D264F&quot;/&gt;&lt;wsp:rsid wsp:val=&quot;006D4E89&quot;/&gt;&lt;wsp:rsid wsp:val=&quot;006E2A8D&quot;/&gt;&lt;wsp:rsid wsp:val=&quot;006E7574&quot;/&gt;&lt;wsp:rsid wsp:val=&quot;00703430&quot;/&gt;&lt;wsp:rsid wsp:val=&quot;00703548&quot;/&gt;&lt;wsp:rsid wsp:val=&quot;00704E18&quot;/&gt;&lt;wsp:rsid wsp:val=&quot;007069BE&quot;/&gt;&lt;wsp:rsid wsp:val=&quot;00745C86&quot;/&gt;&lt;wsp:rsid wsp:val=&quot;00764603&quot;/&gt;&lt;wsp:rsid wsp:val=&quot;0076604D&quot;/&gt;&lt;wsp:rsid wsp:val=&quot;00790909&quot;/&gt;&lt;wsp:rsid wsp:val=&quot;007929AF&quot;/&gt;&lt;wsp:rsid wsp:val=&quot;007B1582&quot;/&gt;&lt;wsp:rsid wsp:val=&quot;007B5A07&quot;/&gt;&lt;wsp:rsid wsp:val=&quot;007C065D&quot;/&gt;&lt;wsp:rsid wsp:val=&quot;007D3E71&quot;/&gt;&lt;wsp:rsid wsp:val=&quot;007E5D6A&quot;/&gt;&lt;wsp:rsid wsp:val=&quot;007E645D&quot;/&gt;&lt;wsp:rsid wsp:val=&quot;007F75CA&quot;/&gt;&lt;wsp:rsid wsp:val=&quot;00821E08&quot;/&gt;&lt;wsp:rsid wsp:val=&quot;00834EFD&quot;/&gt;&lt;wsp:rsid wsp:val=&quot;00844B24&quot;/&gt;&lt;wsp:rsid wsp:val=&quot;0084515F&quot;/&gt;&lt;wsp:rsid wsp:val=&quot;0085092D&quot;/&gt;&lt;wsp:rsid wsp:val=&quot;00865414&quot;/&gt;&lt;wsp:rsid wsp:val=&quot;00877D4C&quot;/&gt;&lt;wsp:rsid wsp:val=&quot;00883903&quot;/&gt;&lt;wsp:rsid wsp:val=&quot;00891C30&quot;/&gt;&lt;wsp:rsid wsp:val=&quot;0089763B&quot;/&gt;&lt;wsp:rsid wsp:val=&quot;008B6AE3&quot;/&gt;&lt;wsp:rsid wsp:val=&quot;008C1332&quot;/&gt;&lt;wsp:rsid wsp:val=&quot;008D1045&quot;/&gt;&lt;wsp:rsid wsp:val=&quot;008E5996&quot;/&gt;&lt;wsp:rsid wsp:val=&quot;00901AE1&quot;/&gt;&lt;wsp:rsid wsp:val=&quot;00912F93&quot;/&gt;&lt;wsp:rsid wsp:val=&quot;009205B4&quot;/&gt;&lt;wsp:rsid wsp:val=&quot;00955B59&quot;/&gt;&lt;wsp:rsid wsp:val=&quot;00992262&quot;/&gt;&lt;wsp:rsid wsp:val=&quot;009926BC&quot;/&gt;&lt;wsp:rsid wsp:val=&quot;009A4319&quot;/&gt;&lt;wsp:rsid wsp:val=&quot;009A6C3F&quot;/&gt;&lt;wsp:rsid wsp:val=&quot;009B73F2&quot;/&gt;&lt;wsp:rsid wsp:val=&quot;009C12BD&quot;/&gt;&lt;wsp:rsid wsp:val=&quot;009C50FE&quot;/&gt;&lt;wsp:rsid wsp:val=&quot;009E49DD&quot;/&gt;&lt;wsp:rsid wsp:val=&quot;00A03E75&quot;/&gt;&lt;wsp:rsid wsp:val=&quot;00A20627&quot;/&gt;&lt;wsp:rsid wsp:val=&quot;00A22FE9&quot;/&gt;&lt;wsp:rsid wsp:val=&quot;00A31A44&quot;/&gt;&lt;wsp:rsid wsp:val=&quot;00A32BFA&quot;/&gt;&lt;wsp:rsid wsp:val=&quot;00A3325E&quot;/&gt;&lt;wsp:rsid wsp:val=&quot;00A45FCE&quot;/&gt;&lt;wsp:rsid wsp:val=&quot;00A75671&quot;/&gt;&lt;wsp:rsid wsp:val=&quot;00A773CC&quot;/&gt;&lt;wsp:rsid wsp:val=&quot;00A924D0&quot;/&gt;&lt;wsp:rsid wsp:val=&quot;00A9318B&quot;/&gt;&lt;wsp:rsid wsp:val=&quot;00A94AC1&quot;/&gt;&lt;wsp:rsid wsp:val=&quot;00AB18B7&quot;/&gt;&lt;wsp:rsid wsp:val=&quot;00AD335D&quot;/&gt;&lt;wsp:rsid wsp:val=&quot;00AF114C&quot;/&gt;&lt;wsp:rsid wsp:val=&quot;00AF792B&quot;/&gt;&lt;wsp:rsid wsp:val=&quot;00B32137&quot;/&gt;&lt;wsp:rsid wsp:val=&quot;00B33D2F&quot;/&gt;&lt;wsp:rsid wsp:val=&quot;00B40A5B&quot;/&gt;&lt;wsp:rsid wsp:val=&quot;00B45C6B&quot;/&gt;&lt;wsp:rsid wsp:val=&quot;00B55D5E&quot;/&gt;&lt;wsp:rsid wsp:val=&quot;00B57A80&quot;/&gt;&lt;wsp:rsid wsp:val=&quot;00B70E9C&quot;/&gt;&lt;wsp:rsid wsp:val=&quot;00B713D8&quot;/&gt;&lt;wsp:rsid wsp:val=&quot;00B72979&quot;/&gt;&lt;wsp:rsid wsp:val=&quot;00B94516&quot;/&gt;&lt;wsp:rsid wsp:val=&quot;00BA25E2&quot;/&gt;&lt;wsp:rsid wsp:val=&quot;00BB2855&quot;/&gt;&lt;wsp:rsid wsp:val=&quot;00BC5343&quot;/&gt;&lt;wsp:rsid wsp:val=&quot;00BD19C1&quot;/&gt;&lt;wsp:rsid wsp:val=&quot;00BD25B8&quot;/&gt;&lt;wsp:rsid wsp:val=&quot;00C012E1&quot;/&gt;&lt;wsp:rsid wsp:val=&quot;00C06BB4&quot;/&gt;&lt;wsp:rsid wsp:val=&quot;00C10D20&quot;/&gt;&lt;wsp:rsid wsp:val=&quot;00C12E0C&quot;/&gt;&lt;wsp:rsid wsp:val=&quot;00C21916&quot;/&gt;&lt;wsp:rsid wsp:val=&quot;00C34915&quot;/&gt;&lt;wsp:rsid wsp:val=&quot;00C457CA&quot;/&gt;&lt;wsp:rsid wsp:val=&quot;00C53FB6&quot;/&gt;&lt;wsp:rsid wsp:val=&quot;00C57FB7&quot;/&gt;&lt;wsp:rsid wsp:val=&quot;00C644D4&quot;/&gt;&lt;wsp:rsid wsp:val=&quot;00C65F3F&quot;/&gt;&lt;wsp:rsid wsp:val=&quot;00C72414&quot;/&gt;&lt;wsp:rsid wsp:val=&quot;00C72B1A&quot;/&gt;&lt;wsp:rsid wsp:val=&quot;00C8667B&quot;/&gt;&lt;wsp:rsid wsp:val=&quot;00C90993&quot;/&gt;&lt;wsp:rsid wsp:val=&quot;00CA4CE3&quot;/&gt;&lt;wsp:rsid wsp:val=&quot;00CC72FD&quot;/&gt;&lt;wsp:rsid wsp:val=&quot;00CD1D23&quot;/&gt;&lt;wsp:rsid wsp:val=&quot;00CD4F3F&quot;/&gt;&lt;wsp:rsid wsp:val=&quot;00D311F8&quot;/&gt;&lt;wsp:rsid wsp:val=&quot;00D31660&quot;/&gt;&lt;wsp:rsid wsp:val=&quot;00D36B52&quot;/&gt;&lt;wsp:rsid wsp:val=&quot;00D377C8&quot;/&gt;&lt;wsp:rsid wsp:val=&quot;00D41274&quot;/&gt;&lt;wsp:rsid wsp:val=&quot;00D4229C&quot;/&gt;&lt;wsp:rsid wsp:val=&quot;00D43BF3&quot;/&gt;&lt;wsp:rsid wsp:val=&quot;00D549FB&quot;/&gt;&lt;wsp:rsid wsp:val=&quot;00D56487&quot;/&gt;&lt;wsp:rsid wsp:val=&quot;00D767BB&quot;/&gt;&lt;wsp:rsid wsp:val=&quot;00D939B0&quot;/&gt;&lt;wsp:rsid wsp:val=&quot;00DA31A2&quot;/&gt;&lt;wsp:rsid wsp:val=&quot;00DB16E0&quot;/&gt;&lt;wsp:rsid wsp:val=&quot;00DB2DF9&quot;/&gt;&lt;wsp:rsid wsp:val=&quot;00DB465D&quot;/&gt;&lt;wsp:rsid wsp:val=&quot;00DB48A2&quot;/&gt;&lt;wsp:rsid wsp:val=&quot;00DB7E63&quot;/&gt;&lt;wsp:rsid wsp:val=&quot;00DC2055&quot;/&gt;&lt;wsp:rsid wsp:val=&quot;00DC3908&quot;/&gt;&lt;wsp:rsid wsp:val=&quot;00DD71E8&quot;/&gt;&lt;wsp:rsid wsp:val=&quot;00DD7F83&quot;/&gt;&lt;wsp:rsid wsp:val=&quot;00DE4EB8&quot;/&gt;&lt;wsp:rsid wsp:val=&quot;00E0641E&quot;/&gt;&lt;wsp:rsid wsp:val=&quot;00E06664&quot;/&gt;&lt;wsp:rsid wsp:val=&quot;00E304BC&quot;/&gt;&lt;wsp:rsid wsp:val=&quot;00E32853&quot;/&gt;&lt;wsp:rsid wsp:val=&quot;00E34EBD&quot;/&gt;&lt;wsp:rsid wsp:val=&quot;00E401F8&quot;/&gt;&lt;wsp:rsid wsp:val=&quot;00E46425&quot;/&gt;&lt;wsp:rsid wsp:val=&quot;00E469FC&quot;/&gt;&lt;wsp:rsid wsp:val=&quot;00E47D0E&quot;/&gt;&lt;wsp:rsid wsp:val=&quot;00E65018&quot;/&gt;&lt;wsp:rsid wsp:val=&quot;00E76CA1&quot;/&gt;&lt;wsp:rsid wsp:val=&quot;00E94339&quot;/&gt;&lt;wsp:rsid wsp:val=&quot;00E97563&quot;/&gt;&lt;wsp:rsid wsp:val=&quot;00EB0B63&quot;/&gt;&lt;wsp:rsid wsp:val=&quot;00EC265C&quot;/&gt;&lt;wsp:rsid wsp:val=&quot;00ED61CB&quot;/&gt;&lt;wsp:rsid wsp:val=&quot;00EE752A&quot;/&gt;&lt;wsp:rsid wsp:val=&quot;00F06A72&quot;/&gt;&lt;wsp:rsid wsp:val=&quot;00F136F0&quot;/&gt;&lt;wsp:rsid wsp:val=&quot;00F20BBB&quot;/&gt;&lt;wsp:rsid wsp:val=&quot;00F36048&quot;/&gt;&lt;wsp:rsid wsp:val=&quot;00F43BD8&quot;/&gt;&lt;wsp:rsid wsp:val=&quot;00F562F3&quot;/&gt;&lt;wsp:rsid wsp:val=&quot;00F74B89&quot;/&gt;&lt;wsp:rsid wsp:val=&quot;00F75133&quot;/&gt;&lt;wsp:rsid wsp:val=&quot;00F83272&quot;/&gt;&lt;wsp:rsid wsp:val=&quot;00F9358D&quot;/&gt;&lt;wsp:rsid wsp:val=&quot;00F9369B&quot;/&gt;&lt;wsp:rsid wsp:val=&quot;00FA3899&quot;/&gt;&lt;wsp:rsid wsp:val=&quot;00FA4909&quot;/&gt;&lt;wsp:rsid wsp:val=&quot;00FA5164&quot;/&gt;&lt;wsp:rsid wsp:val=&quot;00FA6751&quot;/&gt;&lt;wsp:rsid wsp:val=&quot;00FA6BD7&quot;/&gt;&lt;wsp:rsid wsp:val=&quot;00FB1048&quot;/&gt;&lt;wsp:rsid wsp:val=&quot;00FB62C4&quot;/&gt;&lt;wsp:rsid wsp:val=&quot;00FB7701&quot;/&gt;&lt;wsp:rsid wsp:val=&quot;00FD1AC5&quot;/&gt;&lt;wsp:rsid wsp:val=&quot;00FD5CF0&quot;/&gt;&lt;/wsp:rsids&gt;&lt;/w:docPr&gt;&lt;w:body&gt;&lt;wx:sect&gt;&lt;w:p wsp:rsidR=&quot;004026BC&quot; wsp:rsidRPr=&quot;004026BC&quot; wsp:rsidRDefault=&quot;004026BC&quot; wsp:rsidP=&quot;004026BC&quot;&gt;&lt;m:oMathPara&gt;&lt;m:oMath&gt;&lt;m:r&gt;&lt;m:rPr&gt;&lt;m:sty m:val=&quot;p&quot;/&gt;&lt;/m:rPr&gt;&lt;w:rPr&gt;&lt;w:rFonts w:ascii=&quot;Cambria Math&quot; w:h-ansi=&quot;Cambria Math&quot;/&gt;&lt;wx:font wx:val=&quot;Cambria Math&quot;/&gt;&lt;/w:rPr&gt;&lt;m:t&gt;Î”&lt;/m:t&gt;&lt;/m:r&gt;&lt;m:sSub&gt;&lt;m:sSubPr&gt;&lt;m:ctrlPr&gt;&lt;w:rPr&gt;&lt;w:rFonts w:ascii=&quot;Cambria Math&quot; w:h-ansi=&quot;Cambria Math&quot;/&gt;&lt;wx:font wx:val=&quot;Cambria Math&quot;/&gt;&lt;w:i/&gt;&lt;/w:rPr&gt;&lt;/m:ctrlPr&gt;&lt;/m:sSubPr&gt;&lt;m:e&gt;&lt;m:r&gt;&lt;w:rPr&gt;&lt;w:rFonts w:ascii=&quot;Cambria Math&quot; w:h-ansi=&quot;Cambria Math&quot;/&gt;&lt;wx:font wx:val=&quot;Cambria Math&quot;/&gt;&lt;w:i/&gt;&lt;/w:rPr&gt;&lt;m:t&gt;V&lt;/m:t&gt;&lt;/m:r&gt;&lt;/m:e&gt;&lt;m:sub&gt;&lt;m:r&gt;&lt;w:rPr&gt;&lt;w:rFonts w:ascii=&quot;Cambria Math&quot; w:h-ansi=&quot;Cambria Math&quot;/&gt;&lt;wx:font wx:val=&quot;Cambria Math&quot;/&gt;&lt;w:i/&gt;&lt;/w:rPr&gt;&lt;m:t&gt;out&lt;/m:t&gt;&lt;/m:r&gt;&lt;/m:sub&gt;&lt;/m:sSub&gt;&lt;/m:oMath&gt;&lt;/m:oMathPara&gt;&lt;/w:p&gt;&lt;w:sectPr wsp:rsidR=&quot;00000000&quot; wsp:rsidRPr=&quot;004026BC&quot;&gt;&lt;w:pgSz w:w=&quot;12240&quot; w:h=&quot;15840&quot;/&gt;&lt;w:pgMar w:top=&quot;1440&quot; w:right=&quot;1440&quot; w:bottom=&quot;1440&quot; w:left=&quot;1440&quot; w:header=&quot;720&quot; w:footer=&quot;720&quot; w:gutter=&quot;0&quot;/&gt;&lt;w:cols w:space=&quot;720&quot;/&gt;&lt;/w:sectPr&gt;&lt;/wx:sect&gt;&lt;/w:body&gt;&lt;/w:wordDocument&gt;">
                   <v:imagedata r:id="rId21" o:title="" chromakey="white"/>
                 </v:shape>
               </w:pict>
@@ -2628,7 +2628,7 @@
         </w:tc>
         <w:tc>
           <w:tcPr>
-            <w:tcW w:w="942" w:type="dxa"/>
+            <w:tcW w:w="939" w:type="dxa"/>
             <w:shd w:val="clear" w:color="auto" w:fill="auto"/>
           </w:tcPr>
           <w:p>
@@ -2645,7 +2645,7 @@
                 <w:szCs w:val="18"/>
               </w:rPr>
               <w:pict w14:anchorId="1264B309">
-                <v:shape id="_x0000_i1912" type="#_x0000_t75" style="width:25.65pt;height:13.65pt" equationxml="&lt;?xml version=&quot;1.0&quot; encoding=&quot;UTF-8&quot; standalone=&quot;yes&quot;?&gt;&#10;&lt;?mso-application progid=&quot;Word.Document&quot;?&gt;&#10;&lt;w:wordDocument xmlns:aml=&quot;http://schemas.microsoft.com/aml/2001/core&quot; xmlns:wpc=&quot;http://schemas.microsoft.com/office/word/2010/wordprocessingCanvas&quot; xmlns:cx=&quot;http://schemas.microsoft.com/office/drawing/2014/chartex&quot; xmlns:cx1=&quot;http://schemas.microsoft.com/office/drawing/2015/9/8/chartex&quot; xmlns:cx2=&quot;http://schemas.microsoft.com/office/drawing/2015/10/21/chartex&quot; xmlns:cx3=&quot;http://schemas.microsoft.com/office/drawing/2016/5/9/chartex&quot; xmlns:cx4=&quot;http://schemas.microsoft.com/office/drawing/2016/5/10/chartex&quot; xmlns:cx5=&quot;http://schemas.microsoft.com/office/drawing/2016/5/11/chartex&quot; xmlns:cx6=&quot;http://schemas.microsoft.com/office/drawing/2016/5/12/chartex&quot; xmlns:cx7=&quot;http://schemas.microsoft.com/office/drawing/2016/5/13/chartex&quot; xmlns:cx8=&quot;http://schemas.microsoft.com/office/drawing/2016/5/14/chartex&quot; xmlns:cr=&quot;http://schemas.microsoft.com/office/comments/2020/reactions&quot; xmlns:dt=&quot;uuid:C2F41010-65B3-11d1-A29F-00AA00C14882&quot; xmlns:mc=&quot;http://schemas.openxmlformats.org/markup-compatibility/2006&quot; xmlns:aink=&quot;http://schemas.microsoft.com/office/drawing/2016/ink&quot; xmlns:am3d=&quot;http://schemas.microsoft.com/office/drawing/2017/model3d&quot; xmlns:o=&quot;urn:schemas-microsoft-com:office:office&quot; xmlns:oel=&quot;http://schemas.microsoft.com/office/2019/extlst&quot; xmlns:m=&quot;http://schemas.openxmlformats.org/officeDocument/2006/math&quot; xmlns:v=&quot;urn:schemas-microsoft-com:vml&quot; xmlns:w10=&quot;urn:schemas-microsoft-com:office:word&quot; xmlns:w=&quot;http://schemas.microsoft.com/office/word/2003/wordml&quot; xmlns:wx=&quot;http://schemas.microsoft.com/office/word/2003/auxHint&quot; xmlns:wne=&quot;http://schemas.microsoft.com/office/word/2006/wordml&quot; xmlns:wsp=&quot;http://schemas.microsoft.com/office/word/2003/wordml/sp2&quot; xmlns:sl=&quot;http://schemas.microsoft.com/schemaLibrary/2003/core&quot; w:macrosPresent=&quot;no&quot; w:embeddedObjPresent=&quot;no&quot; w:ocxPresent=&quot;no&quot; xml:space=&quot;preserve&quot;&gt;&lt;w:ignoreSubtree w:val=&quot;http://schemas.microsoft.com/office/word/2003/wordml/sp2&quot;/&gt;&lt;o:DocumentProperties&gt;&lt;o:Version&gt;16&lt;/o:Version&gt;&lt;/o:DocumentProperties&gt;&lt;w:docPr&gt;&lt;w:view w:val=&quot;print&quot;/&gt;&lt;w:zoom w:percent=&quot;100&quot;/&gt;&lt;w:doNotEmbedSystemFonts/&gt;&lt;w:activeWritingStyle w:lang=&quot;EN-AU&quot; w:vendorID=&quot;64&quot; w:dllVersion=&quot;6&quot; w:nlCheck=&quot;on&quot; w:optionSet=&quot;1&quot;/&gt;&lt;w:activeWritingStyle w:lang=&quot;EN-GB&quot; w:vendorID=&quot;64&quot; w:dllVersion=&quot;6&quot; w:nlCheck=&quot;on&quot; w:optionSet=&quot;1&quot;/&gt;&lt;w:activeWritingStyle w:lang=&quot;EN-US&quot; w:vendorID=&quot;64&quot; w:dllVersion=&quot;6&quot; w:nlCheck=&quot;on&quot; w:optionSet=&quot;1&quot;/&gt;&lt;w:activeWritingStyle w:lang=&quot;EN-AU&quot; w:vendorID=&quot;64&quot; w:dllVersion=&quot;0&quot; w:nlCheck=&quot;on&quot; w:optionSet=&quot;0&quot;/&gt;&lt;w:activeWritingStyle w:lang=&quot;EN-GB&quot; w:vendorID=&quot;64&quot; w:dllVersion=&quot;0&quot; w:nlCheck=&quot;on&quot; w:optionSet=&quot;0&quot;/&gt;&lt;w:activeWritingStyle w:lang=&quot;EN-US&quot; w:vendorID=&quot;64&quot; w:dllVersion=&quot;0&quot; w:nlCheck=&quot;on&quot; w:optionSet=&quot;0&quot;/&gt;&lt;w:activeWritingStyle w:lang=&quot;ES-AR&quot; w:vendorID=&quot;64&quot; w:dllVersion=&quot;0&quot; w:nlCheck=&quot;on&quot; w:optionSet=&quot;0&quot;/&gt;&lt;w:activeWritingStyle w:lang=&quot;580A&quot; w:vendorID=&quot;64&quot; w:dllVersion=&quot;0&quot; w:nlCheck=&quot;on&quot; w:optionSet=&quot;0&quot;/&gt;&lt;w:activeWritingStyle w:lang=&quot;PT-BR&quot; w:vendorID=&quot;64&quot; w:dllVersion=&quot;0&quot; w:nlCheck=&quot;on&quot; w:optionSet=&quot;0&quot;/&gt;&lt;w:stylePaneFormatFilter w:val=&quot;3F01&quot;/&gt;&lt;w:defaultTabStop w:val=&quot;720&quot;/&gt;&lt;w:hyphenationZone w:val=&quot;425&quot;/&gt;&lt;w:characterSpacingControl w:val=&quot;DontCompress&quot;/&gt;&lt;w:optimizeForBrowser/&gt;&lt;w:validateAgainstSchema/&gt;&lt;w:saveInvalidXML w:val=&quot;off&quot;/&gt;&lt;w:ignoreMixedContent w:val=&quot;off&quot;/&gt;&lt;w:alwaysShowPlaceholderText w:val=&quot;off&quot;/&gt;&lt;w:compat&gt;&lt;w:breakWrappedTables/&gt;&lt;w:snapToGridInCell/&gt;&lt;w:applyBreakingRules/&gt;&lt;w:wrapTextWithPunct/&gt;&lt;w:useAsianBreakRules/&gt;&lt;w:useWord2002TableStyleRules/&gt;&lt;w:useFELayout/&gt;&lt;/w:compat&gt;&lt;wsp:rsids&gt;&lt;wsp:rsidRoot wsp:val=&quot;00426FBB&quot;/&gt;&lt;wsp:rsid wsp:val=&quot;000002E1&quot;/&gt;&lt;wsp:rsid wsp:val=&quot;00003C97&quot;/&gt;&lt;wsp:rsid wsp:val=&quot;00005565&quot;/&gt;&lt;wsp:rsid wsp:val=&quot;0001754A&quot;/&gt;&lt;wsp:rsid wsp:val=&quot;00017719&quot;/&gt;&lt;wsp:rsid wsp:val=&quot;00027F1D&quot;/&gt;&lt;wsp:rsid wsp:val=&quot;0003296C&quot;/&gt;&lt;wsp:rsid wsp:val=&quot;0003351F&quot;/&gt;&lt;wsp:rsid wsp:val=&quot;00044599&quot;/&gt;&lt;wsp:rsid wsp:val=&quot;000540E6&quot;/&gt;&lt;wsp:rsid wsp:val=&quot;00054421&quot;/&gt;&lt;wsp:rsid wsp:val=&quot;00062E46&quot;/&gt;&lt;wsp:rsid wsp:val=&quot;00074AC8&quot;/&gt;&lt;wsp:rsid wsp:val=&quot;00081408&quot;/&gt;&lt;wsp:rsid wsp:val=&quot;00081EBE&quot;/&gt;&lt;wsp:rsid wsp:val=&quot;00086EDC&quot;/&gt;&lt;wsp:rsid wsp:val=&quot;000B1236&quot;/&gt;&lt;wsp:rsid wsp:val=&quot;000B36A3&quot;/&gt;&lt;wsp:rsid wsp:val=&quot;000C013C&quot;/&gt;&lt;wsp:rsid wsp:val=&quot;000E3F84&quot;/&gt;&lt;wsp:rsid wsp:val=&quot;001056DF&quot;/&gt;&lt;wsp:rsid wsp:val=&quot;0010789C&quot;/&gt;&lt;wsp:rsid wsp:val=&quot;00114025&quot;/&gt;&lt;wsp:rsid wsp:val=&quot;001160D2&quot;/&gt;&lt;wsp:rsid wsp:val=&quot;00120636&quot;/&gt;&lt;wsp:rsid wsp:val=&quot;001348A5&quot;/&gt;&lt;wsp:rsid wsp:val=&quot;00151B8E&quot;/&gt;&lt;wsp:rsid wsp:val=&quot;00182170&quot;/&gt;&lt;wsp:rsid wsp:val=&quot;001928FB&quot;/&gt;&lt;wsp:rsid wsp:val=&quot;00192BC7&quot;/&gt;&lt;wsp:rsid wsp:val=&quot;00195BE6&quot;/&gt;&lt;wsp:rsid wsp:val=&quot;001A3C37&quot;/&gt;&lt;wsp:rsid wsp:val=&quot;001A50EA&quot;/&gt;&lt;wsp:rsid wsp:val=&quot;001F16CD&quot;/&gt;&lt;wsp:rsid wsp:val=&quot;001F47D2&quot;/&gt;&lt;wsp:rsid wsp:val=&quot;002029C8&quot;/&gt;&lt;wsp:rsid wsp:val=&quot;0022285A&quot;/&gt;&lt;wsp:rsid wsp:val=&quot;00224C61&quot;/&gt;&lt;wsp:rsid wsp:val=&quot;00256ABC&quot;/&gt;&lt;wsp:rsid wsp:val=&quot;0027227B&quot;/&gt;&lt;wsp:rsid wsp:val=&quot;00273AC7&quot;/&gt;&lt;wsp:rsid wsp:val=&quot;00273D2C&quot;/&gt;&lt;wsp:rsid wsp:val=&quot;00285ECD&quot;/&gt;&lt;wsp:rsid wsp:val=&quot;00290E1B&quot;/&gt;&lt;wsp:rsid wsp:val=&quot;00291B17&quot;/&gt;&lt;wsp:rsid wsp:val=&quot;00291BB3&quot;/&gt;&lt;wsp:rsid wsp:val=&quot;002A6742&quot;/&gt;&lt;wsp:rsid wsp:val=&quot;002C1A7F&quot;/&gt;&lt;wsp:rsid wsp:val=&quot;002C4239&quot;/&gt;&lt;wsp:rsid wsp:val=&quot;002C559D&quot;/&gt;&lt;wsp:rsid wsp:val=&quot;002D16AE&quot;/&gt;&lt;wsp:rsid wsp:val=&quot;002D2D42&quot;/&gt;&lt;wsp:rsid wsp:val=&quot;002F72D0&quot;/&gt;&lt;wsp:rsid wsp:val=&quot;002F7A4F&quot;/&gt;&lt;wsp:rsid wsp:val=&quot;003003AB&quot;/&gt;&lt;wsp:rsid wsp:val=&quot;00302C35&quot;/&gt;&lt;wsp:rsid wsp:val=&quot;00311C49&quot;/&gt;&lt;wsp:rsid wsp:val=&quot;0032119E&quot;/&gt;&lt;wsp:rsid wsp:val=&quot;00321304&quot;/&gt;&lt;wsp:rsid wsp:val=&quot;00324FC2&quot;/&gt;&lt;wsp:rsid wsp:val=&quot;003312CA&quot;/&gt;&lt;wsp:rsid wsp:val=&quot;00331F84&quot;/&gt;&lt;wsp:rsid wsp:val=&quot;0037721F&quot;/&gt;&lt;wsp:rsid wsp:val=&quot;003950A4&quot;/&gt;&lt;wsp:rsid wsp:val=&quot;003A1E7E&quot;/&gt;&lt;wsp:rsid wsp:val=&quot;003E2FDC&quot;/&gt;&lt;wsp:rsid wsp:val=&quot;003E3577&quot;/&gt;&lt;wsp:rsid wsp:val=&quot;003F3A61&quot;/&gt;&lt;wsp:rsid wsp:val=&quot;00410A5D&quot;/&gt;&lt;wsp:rsid wsp:val=&quot;00414909&quot;/&gt;&lt;wsp:rsid wsp:val=&quot;00416537&quot;/&gt;&lt;wsp:rsid wsp:val=&quot;00425A6A&quot;/&gt;&lt;wsp:rsid wsp:val=&quot;00426FBB&quot;/&gt;&lt;wsp:rsid wsp:val=&quot;00454542&quot;/&gt;&lt;wsp:rsid wsp:val=&quot;0047429A&quot;/&gt;&lt;wsp:rsid wsp:val=&quot;0048374C&quot;/&gt;&lt;wsp:rsid wsp:val=&quot;0048771D&quot;/&gt;&lt;wsp:rsid wsp:val=&quot;004A6605&quot;/&gt;&lt;wsp:rsid wsp:val=&quot;004C45FA&quot;/&gt;&lt;wsp:rsid wsp:val=&quot;004D35A3&quot;/&gt;&lt;wsp:rsid wsp:val=&quot;004E1BD8&quot;/&gt;&lt;wsp:rsid wsp:val=&quot;004E452A&quot;/&gt;&lt;wsp:rsid wsp:val=&quot;004E78E3&quot;/&gt;&lt;wsp:rsid wsp:val=&quot;004F2BFE&quot;/&gt;&lt;wsp:rsid wsp:val=&quot;004F63D3&quot;/&gt;&lt;wsp:rsid wsp:val=&quot;004F7DCF&quot;/&gt;&lt;wsp:rsid wsp:val=&quot;005004BF&quot;/&gt;&lt;wsp:rsid wsp:val=&quot;00502E89&quot;/&gt;&lt;wsp:rsid wsp:val=&quot;00506CFE&quot;/&gt;&lt;wsp:rsid wsp:val=&quot;00510E95&quot;/&gt;&lt;wsp:rsid wsp:val=&quot;005225C3&quot;/&gt;&lt;wsp:rsid wsp:val=&quot;00527D56&quot;/&gt;&lt;wsp:rsid wsp:val=&quot;0053221F&quot;/&gt;&lt;wsp:rsid wsp:val=&quot;00536FAE&quot;/&gt;&lt;wsp:rsid wsp:val=&quot;00542C85&quot;/&gt;&lt;wsp:rsid wsp:val=&quot;00553510&quot;/&gt;&lt;wsp:rsid wsp:val=&quot;00554186&quot;/&gt;&lt;wsp:rsid wsp:val=&quot;00585769&quot;/&gt;&lt;wsp:rsid wsp:val=&quot;00585C61&quot;/&gt;&lt;wsp:rsid wsp:val=&quot;00591130&quot;/&gt;&lt;wsp:rsid wsp:val=&quot;005A3F28&quot;/&gt;&lt;wsp:rsid wsp:val=&quot;005A40BE&quot;/&gt;&lt;wsp:rsid wsp:val=&quot;005B13E2&quot;/&gt;&lt;wsp:rsid wsp:val=&quot;005B47D7&quot;/&gt;&lt;wsp:rsid wsp:val=&quot;005C5526&quot;/&gt;&lt;wsp:rsid wsp:val=&quot;005C62C6&quot;/&gt;&lt;wsp:rsid wsp:val=&quot;005D7B9E&quot;/&gt;&lt;wsp:rsid wsp:val=&quot;005E112E&quot;/&gt;&lt;wsp:rsid wsp:val=&quot;005F0834&quot;/&gt;&lt;wsp:rsid wsp:val=&quot;005F68AB&quot;/&gt;&lt;wsp:rsid wsp:val=&quot;005F6DC3&quot;/&gt;&lt;wsp:rsid wsp:val=&quot;00601A8E&quot;/&gt;&lt;wsp:rsid wsp:val=&quot;0062033E&quot;/&gt;&lt;wsp:rsid wsp:val=&quot;00624482&quot;/&gt;&lt;wsp:rsid wsp:val=&quot;0064799C&quot;/&gt;&lt;wsp:rsid wsp:val=&quot;00654156&quot;/&gt;&lt;wsp:rsid wsp:val=&quot;00656ADC&quot;/&gt;&lt;wsp:rsid wsp:val=&quot;006B47CA&quot;/&gt;&lt;wsp:rsid wsp:val=&quot;006C304C&quot;/&gt;&lt;wsp:rsid wsp:val=&quot;006C4511&quot;/&gt;&lt;wsp:rsid wsp:val=&quot;006C65F5&quot;/&gt;&lt;wsp:rsid wsp:val=&quot;006C7AAA&quot;/&gt;&lt;wsp:rsid wsp:val=&quot;006D1C2A&quot;/&gt;&lt;wsp:rsid wsp:val=&quot;006D264F&quot;/&gt;&lt;wsp:rsid wsp:val=&quot;006D4E89&quot;/&gt;&lt;wsp:rsid wsp:val=&quot;006E2A8D&quot;/&gt;&lt;wsp:rsid wsp:val=&quot;006E7574&quot;/&gt;&lt;wsp:rsid wsp:val=&quot;00703430&quot;/&gt;&lt;wsp:rsid wsp:val=&quot;00703548&quot;/&gt;&lt;wsp:rsid wsp:val=&quot;00704E18&quot;/&gt;&lt;wsp:rsid wsp:val=&quot;007069BE&quot;/&gt;&lt;wsp:rsid wsp:val=&quot;00745C86&quot;/&gt;&lt;wsp:rsid wsp:val=&quot;00764603&quot;/&gt;&lt;wsp:rsid wsp:val=&quot;0076604D&quot;/&gt;&lt;wsp:rsid wsp:val=&quot;00790909&quot;/&gt;&lt;wsp:rsid wsp:val=&quot;007929AF&quot;/&gt;&lt;wsp:rsid wsp:val=&quot;007B1582&quot;/&gt;&lt;wsp:rsid wsp:val=&quot;007B5A07&quot;/&gt;&lt;wsp:rsid wsp:val=&quot;007C065D&quot;/&gt;&lt;wsp:rsid wsp:val=&quot;007D3E71&quot;/&gt;&lt;wsp:rsid wsp:val=&quot;007E5D6A&quot;/&gt;&lt;wsp:rsid wsp:val=&quot;007E645D&quot;/&gt;&lt;wsp:rsid wsp:val=&quot;007F75CA&quot;/&gt;&lt;wsp:rsid wsp:val=&quot;00821E08&quot;/&gt;&lt;wsp:rsid wsp:val=&quot;00834EFD&quot;/&gt;&lt;wsp:rsid wsp:val=&quot;00844B24&quot;/&gt;&lt;wsp:rsid wsp:val=&quot;0084515F&quot;/&gt;&lt;wsp:rsid wsp:val=&quot;0085092D&quot;/&gt;&lt;wsp:rsid wsp:val=&quot;00865414&quot;/&gt;&lt;wsp:rsid wsp:val=&quot;00877D4C&quot;/&gt;&lt;wsp:rsid wsp:val=&quot;00883903&quot;/&gt;&lt;wsp:rsid wsp:val=&quot;00891C30&quot;/&gt;&lt;wsp:rsid wsp:val=&quot;0089763B&quot;/&gt;&lt;wsp:rsid wsp:val=&quot;008B6AE3&quot;/&gt;&lt;wsp:rsid wsp:val=&quot;008C1332&quot;/&gt;&lt;wsp:rsid wsp:val=&quot;008D1045&quot;/&gt;&lt;wsp:rsid wsp:val=&quot;008E5996&quot;/&gt;&lt;wsp:rsid wsp:val=&quot;00901AE1&quot;/&gt;&lt;wsp:rsid wsp:val=&quot;00912F93&quot;/&gt;&lt;wsp:rsid wsp:val=&quot;009205B4&quot;/&gt;&lt;wsp:rsid wsp:val=&quot;00955B59&quot;/&gt;&lt;wsp:rsid wsp:val=&quot;00992262&quot;/&gt;&lt;wsp:rsid wsp:val=&quot;009926BC&quot;/&gt;&lt;wsp:rsid wsp:val=&quot;009A4319&quot;/&gt;&lt;wsp:rsid wsp:val=&quot;009A6C3F&quot;/&gt;&lt;wsp:rsid wsp:val=&quot;009B73F2&quot;/&gt;&lt;wsp:rsid wsp:val=&quot;009C12BD&quot;/&gt;&lt;wsp:rsid wsp:val=&quot;009C50FE&quot;/&gt;&lt;wsp:rsid wsp:val=&quot;009E49DD&quot;/&gt;&lt;wsp:rsid wsp:val=&quot;00A03E75&quot;/&gt;&lt;wsp:rsid wsp:val=&quot;00A20627&quot;/&gt;&lt;wsp:rsid wsp:val=&quot;00A22FE9&quot;/&gt;&lt;wsp:rsid wsp:val=&quot;00A31A44&quot;/&gt;&lt;wsp:rsid wsp:val=&quot;00A32BFA&quot;/&gt;&lt;wsp:rsid wsp:val=&quot;00A3325E&quot;/&gt;&lt;wsp:rsid wsp:val=&quot;00A45FCE&quot;/&gt;&lt;wsp:rsid wsp:val=&quot;00A75671&quot;/&gt;&lt;wsp:rsid wsp:val=&quot;00A773CC&quot;/&gt;&lt;wsp:rsid wsp:val=&quot;00A924D0&quot;/&gt;&lt;wsp:rsid wsp:val=&quot;00A9318B&quot;/&gt;&lt;wsp:rsid wsp:val=&quot;00A94AC1&quot;/&gt;&lt;wsp:rsid wsp:val=&quot;00AB18B7&quot;/&gt;&lt;wsp:rsid wsp:val=&quot;00AD335D&quot;/&gt;&lt;wsp:rsid wsp:val=&quot;00AF114C&quot;/&gt;&lt;wsp:rsid wsp:val=&quot;00AF792B&quot;/&gt;&lt;wsp:rsid wsp:val=&quot;00B32137&quot;/&gt;&lt;wsp:rsid wsp:val=&quot;00B33D2F&quot;/&gt;&lt;wsp:rsid wsp:val=&quot;00B40A5B&quot;/&gt;&lt;wsp:rsid wsp:val=&quot;00B45C6B&quot;/&gt;&lt;wsp:rsid wsp:val=&quot;00B55D5E&quot;/&gt;&lt;wsp:rsid wsp:val=&quot;00B57A80&quot;/&gt;&lt;wsp:rsid wsp:val=&quot;00B70E9C&quot;/&gt;&lt;wsp:rsid wsp:val=&quot;00B713D8&quot;/&gt;&lt;wsp:rsid wsp:val=&quot;00B72979&quot;/&gt;&lt;wsp:rsid wsp:val=&quot;00B94516&quot;/&gt;&lt;wsp:rsid wsp:val=&quot;00BA25E2&quot;/&gt;&lt;wsp:rsid wsp:val=&quot;00BB2855&quot;/&gt;&lt;wsp:rsid wsp:val=&quot;00BC5343&quot;/&gt;&lt;wsp:rsid wsp:val=&quot;00BD19C1&quot;/&gt;&lt;wsp:rsid wsp:val=&quot;00BD25B8&quot;/&gt;&lt;wsp:rsid wsp:val=&quot;00C012E1&quot;/&gt;&lt;wsp:rsid wsp:val=&quot;00C06BB4&quot;/&gt;&lt;wsp:rsid wsp:val=&quot;00C10D20&quot;/&gt;&lt;wsp:rsid wsp:val=&quot;00C12E0C&quot;/&gt;&lt;wsp:rsid wsp:val=&quot;00C21916&quot;/&gt;&lt;wsp:rsid wsp:val=&quot;00C32887&quot;/&gt;&lt;wsp:rsid wsp:val=&quot;00C34915&quot;/&gt;&lt;wsp:rsid wsp:val=&quot;00C457CA&quot;/&gt;&lt;wsp:rsid wsp:val=&quot;00C53FB6&quot;/&gt;&lt;wsp:rsid wsp:val=&quot;00C57FB7&quot;/&gt;&lt;wsp:rsid wsp:val=&quot;00C644D4&quot;/&gt;&lt;wsp:rsid wsp:val=&quot;00C65F3F&quot;/&gt;&lt;wsp:rsid wsp:val=&quot;00C72414&quot;/&gt;&lt;wsp:rsid wsp:val=&quot;00C72B1A&quot;/&gt;&lt;wsp:rsid wsp:val=&quot;00C8667B&quot;/&gt;&lt;wsp:rsid wsp:val=&quot;00C90993&quot;/&gt;&lt;wsp:rsid wsp:val=&quot;00CA4CE3&quot;/&gt;&lt;wsp:rsid wsp:val=&quot;00CC72FD&quot;/&gt;&lt;wsp:rsid wsp:val=&quot;00CD1D23&quot;/&gt;&lt;wsp:rsid wsp:val=&quot;00CD4F3F&quot;/&gt;&lt;wsp:rsid wsp:val=&quot;00D311F8&quot;/&gt;&lt;wsp:rsid wsp:val=&quot;00D31660&quot;/&gt;&lt;wsp:rsid wsp:val=&quot;00D36B52&quot;/&gt;&lt;wsp:rsid wsp:val=&quot;00D377C8&quot;/&gt;&lt;wsp:rsid wsp:val=&quot;00D41274&quot;/&gt;&lt;wsp:rsid wsp:val=&quot;00D4229C&quot;/&gt;&lt;wsp:rsid wsp:val=&quot;00D43BF3&quot;/&gt;&lt;wsp:rsid wsp:val=&quot;00D549FB&quot;/&gt;&lt;wsp:rsid wsp:val=&quot;00D56487&quot;/&gt;&lt;wsp:rsid wsp:val=&quot;00D767BB&quot;/&gt;&lt;wsp:rsid wsp:val=&quot;00D939B0&quot;/&gt;&lt;wsp:rsid wsp:val=&quot;00DA31A2&quot;/&gt;&lt;wsp:rsid wsp:val=&quot;00DB16E0&quot;/&gt;&lt;wsp:rsid wsp:val=&quot;00DB2DF9&quot;/&gt;&lt;wsp:rsid wsp:val=&quot;00DB465D&quot;/&gt;&lt;wsp:rsid wsp:val=&quot;00DB48A2&quot;/&gt;&lt;wsp:rsid wsp:val=&quot;00DB7E63&quot;/&gt;&lt;wsp:rsid wsp:val=&quot;00DC2055&quot;/&gt;&lt;wsp:rsid wsp:val=&quot;00DC3908&quot;/&gt;&lt;wsp:rsid wsp:val=&quot;00DD71E8&quot;/&gt;&lt;wsp:rsid wsp:val=&quot;00DD7F83&quot;/&gt;&lt;wsp:rsid wsp:val=&quot;00DE4EB8&quot;/&gt;&lt;wsp:rsid wsp:val=&quot;00E0641E&quot;/&gt;&lt;wsp:rsid wsp:val=&quot;00E06664&quot;/&gt;&lt;wsp:rsid wsp:val=&quot;00E304BC&quot;/&gt;&lt;wsp:rsid wsp:val=&quot;00E32853&quot;/&gt;&lt;wsp:rsid wsp:val=&quot;00E34EBD&quot;/&gt;&lt;wsp:rsid wsp:val=&quot;00E401F8&quot;/&gt;&lt;wsp:rsid wsp:val=&quot;00E46425&quot;/&gt;&lt;wsp:rsid wsp:val=&quot;00E469FC&quot;/&gt;&lt;wsp:rsid wsp:val=&quot;00E47D0E&quot;/&gt;&lt;wsp:rsid wsp:val=&quot;00E65018&quot;/&gt;&lt;wsp:rsid wsp:val=&quot;00E76CA1&quot;/&gt;&lt;wsp:rsid wsp:val=&quot;00E94339&quot;/&gt;&lt;wsp:rsid wsp:val=&quot;00E97563&quot;/&gt;&lt;wsp:rsid wsp:val=&quot;00EB0B63&quot;/&gt;&lt;wsp:rsid wsp:val=&quot;00EC265C&quot;/&gt;&lt;wsp:rsid wsp:val=&quot;00ED61CB&quot;/&gt;&lt;wsp:rsid wsp:val=&quot;00EE752A&quot;/&gt;&lt;wsp:rsid wsp:val=&quot;00F06A72&quot;/&gt;&lt;wsp:rsid wsp:val=&quot;00F136F0&quot;/&gt;&lt;wsp:rsid wsp:val=&quot;00F20BBB&quot;/&gt;&lt;wsp:rsid wsp:val=&quot;00F36048&quot;/&gt;&lt;wsp:rsid wsp:val=&quot;00F43BD8&quot;/&gt;&lt;wsp:rsid wsp:val=&quot;00F562F3&quot;/&gt;&lt;wsp:rsid wsp:val=&quot;00F74B89&quot;/&gt;&lt;wsp:rsid wsp:val=&quot;00F75133&quot;/&gt;&lt;wsp:rsid wsp:val=&quot;00F83272&quot;/&gt;&lt;wsp:rsid wsp:val=&quot;00F9358D&quot;/&gt;&lt;wsp:rsid wsp:val=&quot;00F9369B&quot;/&gt;&lt;wsp:rsid wsp:val=&quot;00FA3899&quot;/&gt;&lt;wsp:rsid wsp:val=&quot;00FA4909&quot;/&gt;&lt;wsp:rsid wsp:val=&quot;00FA5164&quot;/&gt;&lt;wsp:rsid wsp:val=&quot;00FA6751&quot;/&gt;&lt;wsp:rsid wsp:val=&quot;00FA6BD7&quot;/&gt;&lt;wsp:rsid wsp:val=&quot;00FB1048&quot;/&gt;&lt;wsp:rsid wsp:val=&quot;00FB62C4&quot;/&gt;&lt;wsp:rsid wsp:val=&quot;00FB7701&quot;/&gt;&lt;wsp:rsid wsp:val=&quot;00FD1AC5&quot;/&gt;&lt;wsp:rsid wsp:val=&quot;00FD5CF0&quot;/&gt;&lt;/wsp:rsids&gt;&lt;/w:docPr&gt;&lt;w:body&gt;&lt;wx:sect&gt;&lt;w:p wsp:rsidR=&quot;00C32887&quot; wsp:rsidRPr=&quot;00C32887&quot; wsp:rsidRDefault=&quot;00C32887&quot; wsp:rsidP=&quot;00C32887&quot;&gt;&lt;m:oMathPara&gt;&lt;m:oMath&gt;&lt;m:r&gt;&lt;w:rPr&gt;&lt;w:rFonts w:ascii=&quot;Cambria Math&quot; w:h-ansi=&quot;Cambria Math&quot;/&gt;&lt;wx:font wx:val=&quot;Cambria Math&quot;/&gt;&lt;w:i/&gt;&lt;/w:rPr&gt;&lt;m:t&gt;â‰¤25&lt;/m:t&gt;&lt;/m:r&gt;&lt;/m:oMath&gt;&lt;/m:oMathPara&gt;&lt;/w:p&gt;&lt;w:sectPr wsp:rsidR=&quot;00000000&quot; wsp:rsidRPr=&quot;00C32887&quot;&gt;&lt;w:pgSz w:w=&quot;12240&quot; w:h=&quot;15840&quot;/&gt;&lt;w:pgMar w:top=&quot;1440&quot; w:right=&quot;1440&quot; w:bottom=&quot;1440&quot; w:left=&quot;1440&quot; w:header=&quot;720&quot; w:footer=&quot;720&quot; w:gutter=&quot;0&quot;/&gt;&lt;w:cols w:space=&quot;720&quot;/&gt;&lt;/w:sectPr&gt;&lt;/wx:sect&gt;&lt;/w:body&gt;&lt;/w:wordDocument&gt;">
+                <v:shape id="_x0000_i1053" type="#_x0000_t75" style="width:25.6pt;height:13.85pt" equationxml="&lt;?xml version=&quot;1.0&quot; encoding=&quot;UTF-8&quot; standalone=&quot;yes&quot;?&gt;&#10;&lt;?mso-application progid=&quot;Word.Document&quot;?&gt;&#10;&lt;w:wordDocument xmlns:aml=&quot;http://schemas.microsoft.com/aml/2001/core&quot; xmlns:wpc=&quot;http://schemas.microsoft.com/office/word/2010/wordprocessingCanvas&quot; xmlns:cx=&quot;http://schemas.microsoft.com/office/drawing/2014/chartex&quot; xmlns:cx1=&quot;http://schemas.microsoft.com/office/drawing/2015/9/8/chartex&quot; xmlns:cx2=&quot;http://schemas.microsoft.com/office/drawing/2015/10/21/chartex&quot; xmlns:cx3=&quot;http://schemas.microsoft.com/office/drawing/2016/5/9/chartex&quot; xmlns:cx4=&quot;http://schemas.microsoft.com/office/drawing/2016/5/10/chartex&quot; xmlns:cx5=&quot;http://schemas.microsoft.com/office/drawing/2016/5/11/chartex&quot; xmlns:cx6=&quot;http://schemas.microsoft.com/office/drawing/2016/5/12/chartex&quot; xmlns:cx7=&quot;http://schemas.microsoft.com/office/drawing/2016/5/13/chartex&quot; xmlns:cx8=&quot;http://schemas.microsoft.com/office/drawing/2016/5/14/chartex&quot; xmlns:cr=&quot;http://schemas.microsoft.com/office/comments/2020/reactions&quot; xmlns:dt=&quot;uuid:C2F41010-65B3-11d1-A29F-00AA00C14882&quot; xmlns:mc=&quot;http://schemas.openxmlformats.org/markup-compatibility/2006&quot; xmlns:aink=&quot;http://schemas.microsoft.com/office/drawing/2016/ink&quot; xmlns:am3d=&quot;http://schemas.microsoft.com/office/drawing/2017/model3d&quot; xmlns:o=&quot;urn:schemas-microsoft-com:office:office&quot; xmlns:oel=&quot;http://schemas.microsoft.com/office/2019/extlst&quot; xmlns:m=&quot;http://schemas.openxmlformats.org/officeDocument/2006/math&quot; xmlns:v=&quot;urn:schemas-microsoft-com:vml&quot; xmlns:w10=&quot;urn:schemas-microsoft-com:office:word&quot; xmlns:w=&quot;http://schemas.microsoft.com/office/word/2003/wordml&quot; xmlns:wx=&quot;http://schemas.microsoft.com/office/word/2003/auxHint&quot; xmlns:wne=&quot;http://schemas.microsoft.com/office/word/2006/wordml&quot; xmlns:wsp=&quot;http://schemas.microsoft.com/office/word/2003/wordml/sp2&quot; xmlns:sl=&quot;http://schemas.microsoft.com/schemaLibrary/2003/core&quot; w:macrosPresent=&quot;no&quot; w:embeddedObjPresent=&quot;no&quot; w:ocxPresent=&quot;no&quot; xml:space=&quot;preserve&quot;&gt;&lt;w:ignoreSubtree w:val=&quot;http://schemas.microsoft.com/office/word/2003/wordml/sp2&quot;/&gt;&lt;o:DocumentProperties&gt;&lt;o:Version&gt;16&lt;/o:Version&gt;&lt;/o:DocumentProperties&gt;&lt;w:docPr&gt;&lt;w:view w:val=&quot;print&quot;/&gt;&lt;w:zoom w:percent=&quot;100&quot;/&gt;&lt;w:doNotEmbedSystemFonts/&gt;&lt;w:activeWritingStyle w:lang=&quot;EN-AU&quot; w:vendorID=&quot;64&quot; w:dllVersion=&quot;6&quot; w:nlCheck=&quot;on&quot; w:optionSet=&quot;1&quot;/&gt;&lt;w:activeWritingStyle w:lang=&quot;EN-GB&quot; w:vendorID=&quot;64&quot; w:dllVersion=&quot;6&quot; w:nlCheck=&quot;on&quot; w:optionSet=&quot;1&quot;/&gt;&lt;w:activeWritingStyle w:lang=&quot;EN-US&quot; w:vendorID=&quot;64&quot; w:dllVersion=&quot;6&quot; w:nlCheck=&quot;on&quot; w:optionSet=&quot;1&quot;/&gt;&lt;w:activeWritingStyle w:lang=&quot;EN-AU&quot; w:vendorID=&quot;64&quot; w:dllVersion=&quot;0&quot; w:nlCheck=&quot;on&quot; w:optionSet=&quot;0&quot;/&gt;&lt;w:activeWritingStyle w:lang=&quot;EN-GB&quot; w:vendorID=&quot;64&quot; w:dllVersion=&quot;0&quot; w:nlCheck=&quot;on&quot; w:optionSet=&quot;0&quot;/&gt;&lt;w:activeWritingStyle w:lang=&quot;EN-US&quot; w:vendorID=&quot;64&quot; w:dllVersion=&quot;0&quot; w:nlCheck=&quot;on&quot; w:optionSet=&quot;0&quot;/&gt;&lt;w:activeWritingStyle w:lang=&quot;ES-AR&quot; w:vendorID=&quot;64&quot; w:dllVersion=&quot;0&quot; w:nlCheck=&quot;on&quot; w:optionSet=&quot;0&quot;/&gt;&lt;w:activeWritingStyle w:lang=&quot;580A&quot; w:vendorID=&quot;64&quot; w:dllVersion=&quot;0&quot; w:nlCheck=&quot;on&quot; w:optionSet=&quot;0&quot;/&gt;&lt;w:activeWritingStyle w:lang=&quot;PT-BR&quot; w:vendorID=&quot;64&quot; w:dllVersion=&quot;0&quot; w:nlCheck=&quot;on&quot; w:optionSet=&quot;0&quot;/&gt;&lt;w:stylePaneFormatFilter w:val=&quot;3F01&quot;/&gt;&lt;w:defaultTabStop w:val=&quot;720&quot;/&gt;&lt;w:hyphenationZone w:val=&quot;425&quot;/&gt;&lt;w:characterSpacingControl w:val=&quot;DontCompress&quot;/&gt;&lt;w:optimizeForBrowser/&gt;&lt;w:validateAgainstSchema/&gt;&lt;w:saveInvalidXML w:val=&quot;off&quot;/&gt;&lt;w:ignoreMixedContent w:val=&quot;off&quot;/&gt;&lt;w:alwaysShowPlaceholderText w:val=&quot;off&quot;/&gt;&lt;w:compat&gt;&lt;w:breakWrappedTables/&gt;&lt;w:snapToGridInCell/&gt;&lt;w:applyBreakingRules/&gt;&lt;w:wrapTextWithPunct/&gt;&lt;w:useAsianBreakRules/&gt;&lt;w:useWord2002TableStyleRules/&gt;&lt;w:useFELayout/&gt;&lt;/w:compat&gt;&lt;wsp:rsids&gt;&lt;wsp:rsidRoot wsp:val=&quot;00426FBB&quot;/&gt;&lt;wsp:rsid wsp:val=&quot;000002E1&quot;/&gt;&lt;wsp:rsid wsp:val=&quot;00003C97&quot;/&gt;&lt;wsp:rsid wsp:val=&quot;00005565&quot;/&gt;&lt;wsp:rsid wsp:val=&quot;0001754A&quot;/&gt;&lt;wsp:rsid wsp:val=&quot;00017719&quot;/&gt;&lt;wsp:rsid wsp:val=&quot;00027F1D&quot;/&gt;&lt;wsp:rsid wsp:val=&quot;0003296C&quot;/&gt;&lt;wsp:rsid wsp:val=&quot;0003351F&quot;/&gt;&lt;wsp:rsid wsp:val=&quot;00044599&quot;/&gt;&lt;wsp:rsid wsp:val=&quot;000540E6&quot;/&gt;&lt;wsp:rsid wsp:val=&quot;00054421&quot;/&gt;&lt;wsp:rsid wsp:val=&quot;00062E46&quot;/&gt;&lt;wsp:rsid wsp:val=&quot;00074AC8&quot;/&gt;&lt;wsp:rsid wsp:val=&quot;00081408&quot;/&gt;&lt;wsp:rsid wsp:val=&quot;00081EBE&quot;/&gt;&lt;wsp:rsid wsp:val=&quot;00086EDC&quot;/&gt;&lt;wsp:rsid wsp:val=&quot;000B1236&quot;/&gt;&lt;wsp:rsid wsp:val=&quot;000B36A3&quot;/&gt;&lt;wsp:rsid wsp:val=&quot;000C013C&quot;/&gt;&lt;wsp:rsid wsp:val=&quot;000E3F84&quot;/&gt;&lt;wsp:rsid wsp:val=&quot;001056DF&quot;/&gt;&lt;wsp:rsid wsp:val=&quot;0010789C&quot;/&gt;&lt;wsp:rsid wsp:val=&quot;00114025&quot;/&gt;&lt;wsp:rsid wsp:val=&quot;001160D2&quot;/&gt;&lt;wsp:rsid wsp:val=&quot;00120636&quot;/&gt;&lt;wsp:rsid wsp:val=&quot;001348A5&quot;/&gt;&lt;wsp:rsid wsp:val=&quot;00151B8E&quot;/&gt;&lt;wsp:rsid wsp:val=&quot;00182170&quot;/&gt;&lt;wsp:rsid wsp:val=&quot;001928FB&quot;/&gt;&lt;wsp:rsid wsp:val=&quot;00192BC7&quot;/&gt;&lt;wsp:rsid wsp:val=&quot;00195BE6&quot;/&gt;&lt;wsp:rsid wsp:val=&quot;001A3C37&quot;/&gt;&lt;wsp:rsid wsp:val=&quot;001A50EA&quot;/&gt;&lt;wsp:rsid wsp:val=&quot;001F16CD&quot;/&gt;&lt;wsp:rsid wsp:val=&quot;001F47D2&quot;/&gt;&lt;wsp:rsid wsp:val=&quot;002029C8&quot;/&gt;&lt;wsp:rsid wsp:val=&quot;0022285A&quot;/&gt;&lt;wsp:rsid wsp:val=&quot;00224C61&quot;/&gt;&lt;wsp:rsid wsp:val=&quot;00256ABC&quot;/&gt;&lt;wsp:rsid wsp:val=&quot;0027227B&quot;/&gt;&lt;wsp:rsid wsp:val=&quot;00273AC7&quot;/&gt;&lt;wsp:rsid wsp:val=&quot;00273D2C&quot;/&gt;&lt;wsp:rsid wsp:val=&quot;00285ECD&quot;/&gt;&lt;wsp:rsid wsp:val=&quot;00290E1B&quot;/&gt;&lt;wsp:rsid wsp:val=&quot;00291B17&quot;/&gt;&lt;wsp:rsid wsp:val=&quot;00291BB3&quot;/&gt;&lt;wsp:rsid wsp:val=&quot;002A6742&quot;/&gt;&lt;wsp:rsid wsp:val=&quot;002C1A7F&quot;/&gt;&lt;wsp:rsid wsp:val=&quot;002C4239&quot;/&gt;&lt;wsp:rsid wsp:val=&quot;002C559D&quot;/&gt;&lt;wsp:rsid wsp:val=&quot;002D16AE&quot;/&gt;&lt;wsp:rsid wsp:val=&quot;002D2D42&quot;/&gt;&lt;wsp:rsid wsp:val=&quot;002F72D0&quot;/&gt;&lt;wsp:rsid wsp:val=&quot;002F7A4F&quot;/&gt;&lt;wsp:rsid wsp:val=&quot;003003AB&quot;/&gt;&lt;wsp:rsid wsp:val=&quot;00302C35&quot;/&gt;&lt;wsp:rsid wsp:val=&quot;00311C49&quot;/&gt;&lt;wsp:rsid wsp:val=&quot;0032119E&quot;/&gt;&lt;wsp:rsid wsp:val=&quot;00321304&quot;/&gt;&lt;wsp:rsid wsp:val=&quot;00324FC2&quot;/&gt;&lt;wsp:rsid wsp:val=&quot;003312CA&quot;/&gt;&lt;wsp:rsid wsp:val=&quot;00331F84&quot;/&gt;&lt;wsp:rsid wsp:val=&quot;0037721F&quot;/&gt;&lt;wsp:rsid wsp:val=&quot;003950A4&quot;/&gt;&lt;wsp:rsid wsp:val=&quot;003A1E7E&quot;/&gt;&lt;wsp:rsid wsp:val=&quot;003E2FDC&quot;/&gt;&lt;wsp:rsid wsp:val=&quot;003E3577&quot;/&gt;&lt;wsp:rsid wsp:val=&quot;003F3A61&quot;/&gt;&lt;wsp:rsid wsp:val=&quot;00410A5D&quot;/&gt;&lt;wsp:rsid wsp:val=&quot;00414909&quot;/&gt;&lt;wsp:rsid wsp:val=&quot;00416537&quot;/&gt;&lt;wsp:rsid wsp:val=&quot;00425A6A&quot;/&gt;&lt;wsp:rsid wsp:val=&quot;00426FBB&quot;/&gt;&lt;wsp:rsid wsp:val=&quot;00454542&quot;/&gt;&lt;wsp:rsid wsp:val=&quot;0047429A&quot;/&gt;&lt;wsp:rsid wsp:val=&quot;0048374C&quot;/&gt;&lt;wsp:rsid wsp:val=&quot;0048771D&quot;/&gt;&lt;wsp:rsid wsp:val=&quot;004A6605&quot;/&gt;&lt;wsp:rsid wsp:val=&quot;004C45FA&quot;/&gt;&lt;wsp:rsid wsp:val=&quot;004D35A3&quot;/&gt;&lt;wsp:rsid wsp:val=&quot;004E1BD8&quot;/&gt;&lt;wsp:rsid wsp:val=&quot;004E452A&quot;/&gt;&lt;wsp:rsid wsp:val=&quot;004E78E3&quot;/&gt;&lt;wsp:rsid wsp:val=&quot;004F2BFE&quot;/&gt;&lt;wsp:rsid wsp:val=&quot;004F63D3&quot;/&gt;&lt;wsp:rsid wsp:val=&quot;004F7DCF&quot;/&gt;&lt;wsp:rsid wsp:val=&quot;005004BF&quot;/&gt;&lt;wsp:rsid wsp:val=&quot;00502E89&quot;/&gt;&lt;wsp:rsid wsp:val=&quot;00506CFE&quot;/&gt;&lt;wsp:rsid wsp:val=&quot;00510E95&quot;/&gt;&lt;wsp:rsid wsp:val=&quot;005225C3&quot;/&gt;&lt;wsp:rsid wsp:val=&quot;00527D56&quot;/&gt;&lt;wsp:rsid wsp:val=&quot;0053221F&quot;/&gt;&lt;wsp:rsid wsp:val=&quot;00536FAE&quot;/&gt;&lt;wsp:rsid wsp:val=&quot;00542C85&quot;/&gt;&lt;wsp:rsid wsp:val=&quot;00553510&quot;/&gt;&lt;wsp:rsid wsp:val=&quot;00554186&quot;/&gt;&lt;wsp:rsid wsp:val=&quot;00585769&quot;/&gt;&lt;wsp:rsid wsp:val=&quot;00585C61&quot;/&gt;&lt;wsp:rsid wsp:val=&quot;00591130&quot;/&gt;&lt;wsp:rsid wsp:val=&quot;005A3F28&quot;/&gt;&lt;wsp:rsid wsp:val=&quot;005A40BE&quot;/&gt;&lt;wsp:rsid wsp:val=&quot;005B13E2&quot;/&gt;&lt;wsp:rsid wsp:val=&quot;005B47D7&quot;/&gt;&lt;wsp:rsid wsp:val=&quot;005C5526&quot;/&gt;&lt;wsp:rsid wsp:val=&quot;005C62C6&quot;/&gt;&lt;wsp:rsid wsp:val=&quot;005D7B9E&quot;/&gt;&lt;wsp:rsid wsp:val=&quot;005E112E&quot;/&gt;&lt;wsp:rsid wsp:val=&quot;005F0834&quot;/&gt;&lt;wsp:rsid wsp:val=&quot;005F68AB&quot;/&gt;&lt;wsp:rsid wsp:val=&quot;005F6DC3&quot;/&gt;&lt;wsp:rsid wsp:val=&quot;00601A8E&quot;/&gt;&lt;wsp:rsid wsp:val=&quot;0062033E&quot;/&gt;&lt;wsp:rsid wsp:val=&quot;00624482&quot;/&gt;&lt;wsp:rsid wsp:val=&quot;0064799C&quot;/&gt;&lt;wsp:rsid wsp:val=&quot;00654156&quot;/&gt;&lt;wsp:rsid wsp:val=&quot;00656ADC&quot;/&gt;&lt;wsp:rsid wsp:val=&quot;006B47CA&quot;/&gt;&lt;wsp:rsid wsp:val=&quot;006C304C&quot;/&gt;&lt;wsp:rsid wsp:val=&quot;006C4511&quot;/&gt;&lt;wsp:rsid wsp:val=&quot;006C65F5&quot;/&gt;&lt;wsp:rsid wsp:val=&quot;006C7AAA&quot;/&gt;&lt;wsp:rsid wsp:val=&quot;006D1C2A&quot;/&gt;&lt;wsp:rsid wsp:val=&quot;006D264F&quot;/&gt;&lt;wsp:rsid wsp:val=&quot;006D4E89&quot;/&gt;&lt;wsp:rsid wsp:val=&quot;006E2A8D&quot;/&gt;&lt;wsp:rsid wsp:val=&quot;006E7574&quot;/&gt;&lt;wsp:rsid wsp:val=&quot;00703430&quot;/&gt;&lt;wsp:rsid wsp:val=&quot;00703548&quot;/&gt;&lt;wsp:rsid wsp:val=&quot;00704E18&quot;/&gt;&lt;wsp:rsid wsp:val=&quot;007069BE&quot;/&gt;&lt;wsp:rsid wsp:val=&quot;00745C86&quot;/&gt;&lt;wsp:rsid wsp:val=&quot;00764603&quot;/&gt;&lt;wsp:rsid wsp:val=&quot;0076604D&quot;/&gt;&lt;wsp:rsid wsp:val=&quot;00790909&quot;/&gt;&lt;wsp:rsid wsp:val=&quot;007929AF&quot;/&gt;&lt;wsp:rsid wsp:val=&quot;007B1582&quot;/&gt;&lt;wsp:rsid wsp:val=&quot;007B5A07&quot;/&gt;&lt;wsp:rsid wsp:val=&quot;007C065D&quot;/&gt;&lt;wsp:rsid wsp:val=&quot;007D3E71&quot;/&gt;&lt;wsp:rsid wsp:val=&quot;007E5D6A&quot;/&gt;&lt;wsp:rsid wsp:val=&quot;007E645D&quot;/&gt;&lt;wsp:rsid wsp:val=&quot;007F75CA&quot;/&gt;&lt;wsp:rsid wsp:val=&quot;00821E08&quot;/&gt;&lt;wsp:rsid wsp:val=&quot;00834EFD&quot;/&gt;&lt;wsp:rsid wsp:val=&quot;00844B24&quot;/&gt;&lt;wsp:rsid wsp:val=&quot;0084515F&quot;/&gt;&lt;wsp:rsid wsp:val=&quot;0085092D&quot;/&gt;&lt;wsp:rsid wsp:val=&quot;00865414&quot;/&gt;&lt;wsp:rsid wsp:val=&quot;00877D4C&quot;/&gt;&lt;wsp:rsid wsp:val=&quot;00883903&quot;/&gt;&lt;wsp:rsid wsp:val=&quot;00891C30&quot;/&gt;&lt;wsp:rsid wsp:val=&quot;0089763B&quot;/&gt;&lt;wsp:rsid wsp:val=&quot;008B6AE3&quot;/&gt;&lt;wsp:rsid wsp:val=&quot;008C1332&quot;/&gt;&lt;wsp:rsid wsp:val=&quot;008D1045&quot;/&gt;&lt;wsp:rsid wsp:val=&quot;008E5996&quot;/&gt;&lt;wsp:rsid wsp:val=&quot;00901AE1&quot;/&gt;&lt;wsp:rsid wsp:val=&quot;00912F93&quot;/&gt;&lt;wsp:rsid wsp:val=&quot;009205B4&quot;/&gt;&lt;wsp:rsid wsp:val=&quot;00955B59&quot;/&gt;&lt;wsp:rsid wsp:val=&quot;00992262&quot;/&gt;&lt;wsp:rsid wsp:val=&quot;009926BC&quot;/&gt;&lt;wsp:rsid wsp:val=&quot;009A4319&quot;/&gt;&lt;wsp:rsid wsp:val=&quot;009A6C3F&quot;/&gt;&lt;wsp:rsid wsp:val=&quot;009B73F2&quot;/&gt;&lt;wsp:rsid wsp:val=&quot;009C12BD&quot;/&gt;&lt;wsp:rsid wsp:val=&quot;009C50FE&quot;/&gt;&lt;wsp:rsid wsp:val=&quot;009E49DD&quot;/&gt;&lt;wsp:rsid wsp:val=&quot;00A03E75&quot;/&gt;&lt;wsp:rsid wsp:val=&quot;00A20627&quot;/&gt;&lt;wsp:rsid wsp:val=&quot;00A22FE9&quot;/&gt;&lt;wsp:rsid wsp:val=&quot;00A31A44&quot;/&gt;&lt;wsp:rsid wsp:val=&quot;00A32BFA&quot;/&gt;&lt;wsp:rsid wsp:val=&quot;00A3325E&quot;/&gt;&lt;wsp:rsid wsp:val=&quot;00A45FCE&quot;/&gt;&lt;wsp:rsid wsp:val=&quot;00A75671&quot;/&gt;&lt;wsp:rsid wsp:val=&quot;00A773CC&quot;/&gt;&lt;wsp:rsid wsp:val=&quot;00A924D0&quot;/&gt;&lt;wsp:rsid wsp:val=&quot;00A9318B&quot;/&gt;&lt;wsp:rsid wsp:val=&quot;00A94AC1&quot;/&gt;&lt;wsp:rsid wsp:val=&quot;00AB18B7&quot;/&gt;&lt;wsp:rsid wsp:val=&quot;00AD335D&quot;/&gt;&lt;wsp:rsid wsp:val=&quot;00AF114C&quot;/&gt;&lt;wsp:rsid wsp:val=&quot;00AF792B&quot;/&gt;&lt;wsp:rsid wsp:val=&quot;00B32137&quot;/&gt;&lt;wsp:rsid wsp:val=&quot;00B33D2F&quot;/&gt;&lt;wsp:rsid wsp:val=&quot;00B40A5B&quot;/&gt;&lt;wsp:rsid wsp:val=&quot;00B45C6B&quot;/&gt;&lt;wsp:rsid wsp:val=&quot;00B55D5E&quot;/&gt;&lt;wsp:rsid wsp:val=&quot;00B57A80&quot;/&gt;&lt;wsp:rsid wsp:val=&quot;00B70E9C&quot;/&gt;&lt;wsp:rsid wsp:val=&quot;00B713D8&quot;/&gt;&lt;wsp:rsid wsp:val=&quot;00B72979&quot;/&gt;&lt;wsp:rsid wsp:val=&quot;00B94516&quot;/&gt;&lt;wsp:rsid wsp:val=&quot;00BA25E2&quot;/&gt;&lt;wsp:rsid wsp:val=&quot;00BB2855&quot;/&gt;&lt;wsp:rsid wsp:val=&quot;00BC5343&quot;/&gt;&lt;wsp:rsid wsp:val=&quot;00BD19C1&quot;/&gt;&lt;wsp:rsid wsp:val=&quot;00BD25B8&quot;/&gt;&lt;wsp:rsid wsp:val=&quot;00C012E1&quot;/&gt;&lt;wsp:rsid wsp:val=&quot;00C06BB4&quot;/&gt;&lt;wsp:rsid wsp:val=&quot;00C10D20&quot;/&gt;&lt;wsp:rsid wsp:val=&quot;00C12E0C&quot;/&gt;&lt;wsp:rsid wsp:val=&quot;00C21916&quot;/&gt;&lt;wsp:rsid wsp:val=&quot;00C32887&quot;/&gt;&lt;wsp:rsid wsp:val=&quot;00C34915&quot;/&gt;&lt;wsp:rsid wsp:val=&quot;00C457CA&quot;/&gt;&lt;wsp:rsid wsp:val=&quot;00C53FB6&quot;/&gt;&lt;wsp:rsid wsp:val=&quot;00C57FB7&quot;/&gt;&lt;wsp:rsid wsp:val=&quot;00C644D4&quot;/&gt;&lt;wsp:rsid wsp:val=&quot;00C65F3F&quot;/&gt;&lt;wsp:rsid wsp:val=&quot;00C72414&quot;/&gt;&lt;wsp:rsid wsp:val=&quot;00C72B1A&quot;/&gt;&lt;wsp:rsid wsp:val=&quot;00C8667B&quot;/&gt;&lt;wsp:rsid wsp:val=&quot;00C90993&quot;/&gt;&lt;wsp:rsid wsp:val=&quot;00CA4CE3&quot;/&gt;&lt;wsp:rsid wsp:val=&quot;00CC72FD&quot;/&gt;&lt;wsp:rsid wsp:val=&quot;00CD1D23&quot;/&gt;&lt;wsp:rsid wsp:val=&quot;00CD4F3F&quot;/&gt;&lt;wsp:rsid wsp:val=&quot;00D311F8&quot;/&gt;&lt;wsp:rsid wsp:val=&quot;00D31660&quot;/&gt;&lt;wsp:rsid wsp:val=&quot;00D36B52&quot;/&gt;&lt;wsp:rsid wsp:val=&quot;00D377C8&quot;/&gt;&lt;wsp:rsid wsp:val=&quot;00D41274&quot;/&gt;&lt;wsp:rsid wsp:val=&quot;00D4229C&quot;/&gt;&lt;wsp:rsid wsp:val=&quot;00D43BF3&quot;/&gt;&lt;wsp:rsid wsp:val=&quot;00D549FB&quot;/&gt;&lt;wsp:rsid wsp:val=&quot;00D56487&quot;/&gt;&lt;wsp:rsid wsp:val=&quot;00D767BB&quot;/&gt;&lt;wsp:rsid wsp:val=&quot;00D939B0&quot;/&gt;&lt;wsp:rsid wsp:val=&quot;00DA31A2&quot;/&gt;&lt;wsp:rsid wsp:val=&quot;00DB16E0&quot;/&gt;&lt;wsp:rsid wsp:val=&quot;00DB2DF9&quot;/&gt;&lt;wsp:rsid wsp:val=&quot;00DB465D&quot;/&gt;&lt;wsp:rsid wsp:val=&quot;00DB48A2&quot;/&gt;&lt;wsp:rsid wsp:val=&quot;00DB7E63&quot;/&gt;&lt;wsp:rsid wsp:val=&quot;00DC2055&quot;/&gt;&lt;wsp:rsid wsp:val=&quot;00DC3908&quot;/&gt;&lt;wsp:rsid wsp:val=&quot;00DD71E8&quot;/&gt;&lt;wsp:rsid wsp:val=&quot;00DD7F83&quot;/&gt;&lt;wsp:rsid wsp:val=&quot;00DE4EB8&quot;/&gt;&lt;wsp:rsid wsp:val=&quot;00E0641E&quot;/&gt;&lt;wsp:rsid wsp:val=&quot;00E06664&quot;/&gt;&lt;wsp:rsid wsp:val=&quot;00E304BC&quot;/&gt;&lt;wsp:rsid wsp:val=&quot;00E32853&quot;/&gt;&lt;wsp:rsid wsp:val=&quot;00E34EBD&quot;/&gt;&lt;wsp:rsid wsp:val=&quot;00E401F8&quot;/&gt;&lt;wsp:rsid wsp:val=&quot;00E46425&quot;/&gt;&lt;wsp:rsid wsp:val=&quot;00E469FC&quot;/&gt;&lt;wsp:rsid wsp:val=&quot;00E47D0E&quot;/&gt;&lt;wsp:rsid wsp:val=&quot;00E65018&quot;/&gt;&lt;wsp:rsid wsp:val=&quot;00E76CA1&quot;/&gt;&lt;wsp:rsid wsp:val=&quot;00E94339&quot;/&gt;&lt;wsp:rsid wsp:val=&quot;00E97563&quot;/&gt;&lt;wsp:rsid wsp:val=&quot;00EB0B63&quot;/&gt;&lt;wsp:rsid wsp:val=&quot;00EC265C&quot;/&gt;&lt;wsp:rsid wsp:val=&quot;00ED61CB&quot;/&gt;&lt;wsp:rsid wsp:val=&quot;00EE752A&quot;/&gt;&lt;wsp:rsid wsp:val=&quot;00F06A72&quot;/&gt;&lt;wsp:rsid wsp:val=&quot;00F136F0&quot;/&gt;&lt;wsp:rsid wsp:val=&quot;00F20BBB&quot;/&gt;&lt;wsp:rsid wsp:val=&quot;00F36048&quot;/&gt;&lt;wsp:rsid wsp:val=&quot;00F43BD8&quot;/&gt;&lt;wsp:rsid wsp:val=&quot;00F562F3&quot;/&gt;&lt;wsp:rsid wsp:val=&quot;00F74B89&quot;/&gt;&lt;wsp:rsid wsp:val=&quot;00F75133&quot;/&gt;&lt;wsp:rsid wsp:val=&quot;00F83272&quot;/&gt;&lt;wsp:rsid wsp:val=&quot;00F9358D&quot;/&gt;&lt;wsp:rsid wsp:val=&quot;00F9369B&quot;/&gt;&lt;wsp:rsid wsp:val=&quot;00FA3899&quot;/&gt;&lt;wsp:rsid wsp:val=&quot;00FA4909&quot;/&gt;&lt;wsp:rsid wsp:val=&quot;00FA5164&quot;/&gt;&lt;wsp:rsid wsp:val=&quot;00FA6751&quot;/&gt;&lt;wsp:rsid wsp:val=&quot;00FA6BD7&quot;/&gt;&lt;wsp:rsid wsp:val=&quot;00FB1048&quot;/&gt;&lt;wsp:rsid wsp:val=&quot;00FB62C4&quot;/&gt;&lt;wsp:rsid wsp:val=&quot;00FB7701&quot;/&gt;&lt;wsp:rsid wsp:val=&quot;00FD1AC5&quot;/&gt;&lt;wsp:rsid wsp:val=&quot;00FD5CF0&quot;/&gt;&lt;/wsp:rsids&gt;&lt;/w:docPr&gt;&lt;w:body&gt;&lt;wx:sect&gt;&lt;w:p wsp:rsidR=&quot;00C32887&quot; wsp:rsidRPr=&quot;00C32887&quot; wsp:rsidRDefault=&quot;00C32887&quot; wsp:rsidP=&quot;00C32887&quot;&gt;&lt;m:oMathPara&gt;&lt;m:oMath&gt;&lt;m:r&gt;&lt;w:rPr&gt;&lt;w:rFonts w:ascii=&quot;Cambria Math&quot; w:h-ansi=&quot;Cambria Math&quot;/&gt;&lt;wx:font wx:val=&quot;Cambria Math&quot;/&gt;&lt;w:i/&gt;&lt;/w:rPr&gt;&lt;m:t&gt;â‰¤25&lt;/m:t&gt;&lt;/m:r&gt;&lt;/m:oMath&gt;&lt;/m:oMathPara&gt;&lt;/w:p&gt;&lt;w:sectPr wsp:rsidR=&quot;00000000&quot; wsp:rsidRPr=&quot;00C32887&quot;&gt;&lt;w:pgSz w:w=&quot;12240&quot; w:h=&quot;15840&quot;/&gt;&lt;w:pgMar w:top=&quot;1440&quot; w:right=&quot;1440&quot; w:bottom=&quot;1440&quot; w:left=&quot;1440&quot; w:header=&quot;720&quot; w:footer=&quot;720&quot; w:gutter=&quot;0&quot;/&gt;&lt;w:cols w:space=&quot;720&quot;/&gt;&lt;/w:sectPr&gt;&lt;/wx:sect&gt;&lt;/w:body&gt;&lt;/w:wordDocument&gt;">
                   <v:imagedata r:id="rId22" o:title="" chromakey="white"/>
                 </v:shape>
               </w:pict>
@@ -2654,7 +2654,7 @@
         </w:tc>
         <w:tc>
           <w:tcPr>
-            <w:tcW w:w="774" w:type="dxa"/>
+            <w:tcW w:w="784" w:type="dxa"/>
             <w:shd w:val="clear" w:color="auto" w:fill="auto"/>
           </w:tcPr>
           <w:p>
@@ -2676,46 +2676,6 @@
         </w:tc>
       </w:tr>
     </w:tbl>
-    <w:p>
-      <w:pPr>
-        <w:pStyle w:val="IEEEParagraph"/>
-        <w:rPr>
-          <w:lang w:val="es-AR"/>
-        </w:rPr>
-      </w:pPr>
-    </w:p>
-    <w:p>
-      <w:pPr>
-        <w:pStyle w:val="IEEEParagraph"/>
-        <w:rPr>
-          <w:lang w:val="es-AR"/>
-        </w:rPr>
-      </w:pPr>
-    </w:p>
-    <w:p>
-      <w:pPr>
-        <w:pStyle w:val="IEEEParagraph"/>
-        <w:rPr>
-          <w:lang w:val="es-AR"/>
-        </w:rPr>
-      </w:pPr>
-    </w:p>
-    <w:p>
-      <w:pPr>
-        <w:pStyle w:val="IEEEParagraph"/>
-        <w:rPr>
-          <w:lang w:val="es-AR"/>
-        </w:rPr>
-      </w:pPr>
-    </w:p>
-    <w:p>
-      <w:pPr>
-        <w:pStyle w:val="IEEEParagraph"/>
-        <w:rPr>
-          <w:lang w:val="es-AR"/>
-        </w:rPr>
-      </w:pPr>
-    </w:p>
     <w:p>
       <w:pPr>
         <w:pStyle w:val="IEEEParagraph"/>
@@ -2757,17 +2717,17 @@
         <w:tblLook w:val="04A0" w:firstRow="1" w:lastRow="0" w:firstColumn="1" w:lastColumn="0" w:noHBand="0" w:noVBand="1"/>
       </w:tblPr>
       <w:tblGrid>
-        <w:gridCol w:w="1825"/>
-        <w:gridCol w:w="3184"/>
+        <w:gridCol w:w="1799"/>
+        <w:gridCol w:w="3140"/>
       </w:tblGrid>
       <w:tr>
         <w:trPr>
-          <w:trHeight w:val="198"/>
+          <w:trHeight w:val="194"/>
           <w:jc w:val="center"/>
         </w:trPr>
         <w:tc>
           <w:tcPr>
-            <w:tcW w:w="1825" w:type="dxa"/>
+            <w:tcW w:w="1799" w:type="dxa"/>
             <w:shd w:val="clear" w:color="auto" w:fill="404040"/>
             <w:vAlign w:val="center"/>
           </w:tcPr>
@@ -2796,7 +2756,7 @@
         </w:tc>
         <w:tc>
           <w:tcPr>
-            <w:tcW w:w="3184" w:type="dxa"/>
+            <w:tcW w:w="3140" w:type="dxa"/>
             <w:shd w:val="clear" w:color="auto" w:fill="404040"/>
             <w:vAlign w:val="center"/>
           </w:tcPr>
@@ -2826,12 +2786,12 @@
       </w:tr>
       <w:tr>
         <w:trPr>
-          <w:trHeight w:val="514"/>
+          <w:trHeight w:val="505"/>
           <w:jc w:val="center"/>
         </w:trPr>
         <w:tc>
           <w:tcPr>
-            <w:tcW w:w="1825" w:type="dxa"/>
+            <w:tcW w:w="1799" w:type="dxa"/>
             <w:shd w:val="clear" w:color="auto" w:fill="auto"/>
             <w:vAlign w:val="center"/>
           </w:tcPr>
@@ -2853,7 +2813,7 @@
         </w:tc>
         <w:tc>
           <w:tcPr>
-            <w:tcW w:w="3184" w:type="dxa"/>
+            <w:tcW w:w="3140" w:type="dxa"/>
             <w:shd w:val="clear" w:color="auto" w:fill="auto"/>
             <w:vAlign w:val="center"/>
           </w:tcPr>
@@ -2872,7 +2832,7 @@
                 <w:szCs w:val="16"/>
               </w:rPr>
               <w:pict w14:anchorId="7B70C106">
-                <v:shape id="_x0000_i1781" type="#_x0000_t75" style="width:96.55pt;height:25.1pt" equationxml="&lt;?xml version=&quot;1.0&quot; encoding=&quot;UTF-8&quot; standalone=&quot;yes&quot;?&gt;&#10;&lt;?mso-application progid=&quot;Word.Document&quot;?&gt;&#10;&lt;w:wordDocument xmlns:aml=&quot;http://schemas.microsoft.com/aml/2001/core&quot; xmlns:wpc=&quot;http://schemas.microsoft.com/office/word/2010/wordprocessingCanvas&quot; xmlns:cx=&quot;http://schemas.microsoft.com/office/drawing/2014/chartex&quot; xmlns:cx1=&quot;http://schemas.microsoft.com/office/drawing/2015/9/8/chartex&quot; xmlns:cx2=&quot;http://schemas.microsoft.com/office/drawing/2015/10/21/chartex&quot; xmlns:cx3=&quot;http://schemas.microsoft.com/office/drawing/2016/5/9/chartex&quot; xmlns:cx4=&quot;http://schemas.microsoft.com/office/drawing/2016/5/10/chartex&quot; xmlns:cx5=&quot;http://schemas.microsoft.com/office/drawing/2016/5/11/chartex&quot; xmlns:cx6=&quot;http://schemas.microsoft.com/office/drawing/2016/5/12/chartex&quot; xmlns:cx7=&quot;http://schemas.microsoft.com/office/drawing/2016/5/13/chartex&quot; xmlns:cx8=&quot;http://schemas.microsoft.com/office/drawing/2016/5/14/chartex&quot; xmlns:cr=&quot;http://schemas.microsoft.com/office/comments/2020/reactions&quot; xmlns:dt=&quot;uuid:C2F41010-65B3-11d1-A29F-00AA00C14882&quot; xmlns:mc=&quot;http://schemas.openxmlformats.org/markup-compatibility/2006&quot; xmlns:aink=&quot;http://schemas.microsoft.com/office/drawing/2016/ink&quot; xmlns:am3d=&quot;http://schemas.microsoft.com/office/drawing/2017/model3d&quot; xmlns:o=&quot;urn:schemas-microsoft-com:office:office&quot; xmlns:oel=&quot;http://schemas.microsoft.com/office/2019/extlst&quot; xmlns:m=&quot;http://schemas.openxmlformats.org/officeDocument/2006/math&quot; xmlns:v=&quot;urn:schemas-microsoft-com:vml&quot; xmlns:w10=&quot;urn:schemas-microsoft-com:office:word&quot; xmlns:w=&quot;http://schemas.microsoft.com/office/word/2003/wordml&quot; xmlns:wx=&quot;http://schemas.microsoft.com/office/word/2003/auxHint&quot; xmlns:wne=&quot;http://schemas.microsoft.com/office/word/2006/wordml&quot; xmlns:wsp=&quot;http://schemas.microsoft.com/office/word/2003/wordml/sp2&quot; xmlns:sl=&quot;http://schemas.microsoft.com/schemaLibrary/2003/core&quot; w:macrosPresent=&quot;no&quot; w:embeddedObjPresent=&quot;no&quot; w:ocxPresent=&quot;no&quot; xml:space=&quot;preserve&quot;&gt;&lt;w:ignoreSubtree w:val=&quot;http://schemas.microsoft.com/office/word/2003/wordml/sp2&quot;/&gt;&lt;o:DocumentProperties&gt;&lt;o:Version&gt;16&lt;/o:Version&gt;&lt;/o:DocumentProperties&gt;&lt;w:docPr&gt;&lt;w:view w:val=&quot;print&quot;/&gt;&lt;w:zoom w:percent=&quot;100&quot;/&gt;&lt;w:doNotEmbedSystemFonts/&gt;&lt;w:activeWritingStyle w:lang=&quot;EN-AU&quot; w:vendorID=&quot;64&quot; w:dllVersion=&quot;6&quot; w:nlCheck=&quot;on&quot; w:optionSet=&quot;1&quot;/&gt;&lt;w:activeWritingStyle w:lang=&quot;EN-GB&quot; w:vendorID=&quot;64&quot; w:dllVersion=&quot;6&quot; w:nlCheck=&quot;on&quot; w:optionSet=&quot;1&quot;/&gt;&lt;w:activeWritingStyle w:lang=&quot;EN-US&quot; w:vendorID=&quot;64&quot; w:dllVersion=&quot;6&quot; w:nlCheck=&quot;on&quot; w:optionSet=&quot;1&quot;/&gt;&lt;w:activeWritingStyle w:lang=&quot;EN-AU&quot; w:vendorID=&quot;64&quot; w:dllVersion=&quot;0&quot; w:nlCheck=&quot;on&quot; w:optionSet=&quot;0&quot;/&gt;&lt;w:activeWritingStyle w:lang=&quot;EN-GB&quot; w:vendorID=&quot;64&quot; w:dllVersion=&quot;0&quot; w:nlCheck=&quot;on&quot; w:optionSet=&quot;0&quot;/&gt;&lt;w:activeWritingStyle w:lang=&quot;EN-US&quot; w:vendorID=&quot;64&quot; w:dllVersion=&quot;0&quot; w:nlCheck=&quot;on&quot; w:optionSet=&quot;0&quot;/&gt;&lt;w:activeWritingStyle w:lang=&quot;ES-AR&quot; w:vendorID=&quot;64&quot; w:dllVersion=&quot;0&quot; w:nlCheck=&quot;on&quot; w:optionSet=&quot;0&quot;/&gt;&lt;w:activeWritingStyle w:lang=&quot;580A&quot; w:vendorID=&quot;64&quot; w:dllVersion=&quot;0&quot; w:nlCheck=&quot;on&quot; w:optionSet=&quot;0&quot;/&gt;&lt;w:activeWritingStyle w:lang=&quot;PT-BR&quot; w:vendorID=&quot;64&quot; w:dllVersion=&quot;0&quot; w:nlCheck=&quot;on&quot; w:optionSet=&quot;0&quot;/&gt;&lt;w:stylePaneFormatFilter w:val=&quot;3F01&quot;/&gt;&lt;w:defaultTabStop w:val=&quot;720&quot;/&gt;&lt;w:hyphenationZone w:val=&quot;425&quot;/&gt;&lt;w:characterSpacingControl w:val=&quot;DontCompress&quot;/&gt;&lt;w:optimizeForBrowser/&gt;&lt;w:validateAgainstSchema/&gt;&lt;w:saveInvalidXML w:val=&quot;off&quot;/&gt;&lt;w:ignoreMixedContent w:val=&quot;off&quot;/&gt;&lt;w:alwaysShowPlaceholderText w:val=&quot;off&quot;/&gt;&lt;w:compat&gt;&lt;w:breakWrappedTables/&gt;&lt;w:snapToGridInCell/&gt;&lt;w:applyBreakingRules/&gt;&lt;w:wrapTextWithPunct/&gt;&lt;w:useAsianBreakRules/&gt;&lt;w:useWord2002TableStyleRules/&gt;&lt;w:useFELayout/&gt;&lt;/w:compat&gt;&lt;wsp:rsids&gt;&lt;wsp:rsidRoot wsp:val=&quot;00426FBB&quot;/&gt;&lt;wsp:rsid wsp:val=&quot;000002E1&quot;/&gt;&lt;wsp:rsid wsp:val=&quot;00003C97&quot;/&gt;&lt;wsp:rsid wsp:val=&quot;00005565&quot;/&gt;&lt;wsp:rsid wsp:val=&quot;0001754A&quot;/&gt;&lt;wsp:rsid wsp:val=&quot;00017719&quot;/&gt;&lt;wsp:rsid wsp:val=&quot;00027F1D&quot;/&gt;&lt;wsp:rsid wsp:val=&quot;0003296C&quot;/&gt;&lt;wsp:rsid wsp:val=&quot;0003351F&quot;/&gt;&lt;wsp:rsid wsp:val=&quot;00044599&quot;/&gt;&lt;wsp:rsid wsp:val=&quot;000540E6&quot;/&gt;&lt;wsp:rsid wsp:val=&quot;00054421&quot;/&gt;&lt;wsp:rsid wsp:val=&quot;00062E46&quot;/&gt;&lt;wsp:rsid wsp:val=&quot;00074AC8&quot;/&gt;&lt;wsp:rsid wsp:val=&quot;00081408&quot;/&gt;&lt;wsp:rsid wsp:val=&quot;00081EBE&quot;/&gt;&lt;wsp:rsid wsp:val=&quot;00086EDC&quot;/&gt;&lt;wsp:rsid wsp:val=&quot;000B1236&quot;/&gt;&lt;wsp:rsid wsp:val=&quot;000B36A3&quot;/&gt;&lt;wsp:rsid wsp:val=&quot;000C013C&quot;/&gt;&lt;wsp:rsid wsp:val=&quot;000E3F84&quot;/&gt;&lt;wsp:rsid wsp:val=&quot;001056DF&quot;/&gt;&lt;wsp:rsid wsp:val=&quot;0010789C&quot;/&gt;&lt;wsp:rsid wsp:val=&quot;00114025&quot;/&gt;&lt;wsp:rsid wsp:val=&quot;001160D2&quot;/&gt;&lt;wsp:rsid wsp:val=&quot;00120636&quot;/&gt;&lt;wsp:rsid wsp:val=&quot;001348A5&quot;/&gt;&lt;wsp:rsid wsp:val=&quot;00151B8E&quot;/&gt;&lt;wsp:rsid wsp:val=&quot;00182170&quot;/&gt;&lt;wsp:rsid wsp:val=&quot;001928FB&quot;/&gt;&lt;wsp:rsid wsp:val=&quot;00192BC7&quot;/&gt;&lt;wsp:rsid wsp:val=&quot;00195BE6&quot;/&gt;&lt;wsp:rsid wsp:val=&quot;001A3C37&quot;/&gt;&lt;wsp:rsid wsp:val=&quot;001A50EA&quot;/&gt;&lt;wsp:rsid wsp:val=&quot;001F16CD&quot;/&gt;&lt;wsp:rsid wsp:val=&quot;001F2E7C&quot;/&gt;&lt;wsp:rsid wsp:val=&quot;001F47D2&quot;/&gt;&lt;wsp:rsid wsp:val=&quot;002029C8&quot;/&gt;&lt;wsp:rsid wsp:val=&quot;0022285A&quot;/&gt;&lt;wsp:rsid wsp:val=&quot;00224C61&quot;/&gt;&lt;wsp:rsid wsp:val=&quot;00256ABC&quot;/&gt;&lt;wsp:rsid wsp:val=&quot;0027227B&quot;/&gt;&lt;wsp:rsid wsp:val=&quot;00273AC7&quot;/&gt;&lt;wsp:rsid wsp:val=&quot;00273D2C&quot;/&gt;&lt;wsp:rsid wsp:val=&quot;00285ECD&quot;/&gt;&lt;wsp:rsid wsp:val=&quot;00290E1B&quot;/&gt;&lt;wsp:rsid wsp:val=&quot;00291B17&quot;/&gt;&lt;wsp:rsid wsp:val=&quot;00291BB3&quot;/&gt;&lt;wsp:rsid wsp:val=&quot;002A6742&quot;/&gt;&lt;wsp:rsid wsp:val=&quot;002C1A7F&quot;/&gt;&lt;wsp:rsid wsp:val=&quot;002C4239&quot;/&gt;&lt;wsp:rsid wsp:val=&quot;002C559D&quot;/&gt;&lt;wsp:rsid wsp:val=&quot;002D16AE&quot;/&gt;&lt;wsp:rsid wsp:val=&quot;002D2D42&quot;/&gt;&lt;wsp:rsid wsp:val=&quot;002F72D0&quot;/&gt;&lt;wsp:rsid wsp:val=&quot;002F7A4F&quot;/&gt;&lt;wsp:rsid wsp:val=&quot;003003AB&quot;/&gt;&lt;wsp:rsid wsp:val=&quot;00302C35&quot;/&gt;&lt;wsp:rsid wsp:val=&quot;00311C49&quot;/&gt;&lt;wsp:rsid wsp:val=&quot;0032119E&quot;/&gt;&lt;wsp:rsid wsp:val=&quot;00321304&quot;/&gt;&lt;wsp:rsid wsp:val=&quot;00324FC2&quot;/&gt;&lt;wsp:rsid wsp:val=&quot;003312CA&quot;/&gt;&lt;wsp:rsid wsp:val=&quot;00331F84&quot;/&gt;&lt;wsp:rsid wsp:val=&quot;003329D6&quot;/&gt;&lt;wsp:rsid wsp:val=&quot;0037721F&quot;/&gt;&lt;wsp:rsid wsp:val=&quot;003950A4&quot;/&gt;&lt;wsp:rsid wsp:val=&quot;003A1E7E&quot;/&gt;&lt;wsp:rsid wsp:val=&quot;003E2FDC&quot;/&gt;&lt;wsp:rsid wsp:val=&quot;003E3577&quot;/&gt;&lt;wsp:rsid wsp:val=&quot;003F3A61&quot;/&gt;&lt;wsp:rsid wsp:val=&quot;00410A5D&quot;/&gt;&lt;wsp:rsid wsp:val=&quot;00414909&quot;/&gt;&lt;wsp:rsid wsp:val=&quot;00416537&quot;/&gt;&lt;wsp:rsid wsp:val=&quot;00425A6A&quot;/&gt;&lt;wsp:rsid wsp:val=&quot;00426FBB&quot;/&gt;&lt;wsp:rsid wsp:val=&quot;00454542&quot;/&gt;&lt;wsp:rsid wsp:val=&quot;0047429A&quot;/&gt;&lt;wsp:rsid wsp:val=&quot;0048374C&quot;/&gt;&lt;wsp:rsid wsp:val=&quot;0048771D&quot;/&gt;&lt;wsp:rsid wsp:val=&quot;004A6605&quot;/&gt;&lt;wsp:rsid wsp:val=&quot;004C45FA&quot;/&gt;&lt;wsp:rsid wsp:val=&quot;004D35A3&quot;/&gt;&lt;wsp:rsid wsp:val=&quot;004E1BD8&quot;/&gt;&lt;wsp:rsid wsp:val=&quot;004E452A&quot;/&gt;&lt;wsp:rsid wsp:val=&quot;004E78E3&quot;/&gt;&lt;wsp:rsid wsp:val=&quot;004F2BFE&quot;/&gt;&lt;wsp:rsid wsp:val=&quot;004F63D3&quot;/&gt;&lt;wsp:rsid wsp:val=&quot;004F7DCF&quot;/&gt;&lt;wsp:rsid wsp:val=&quot;005004BF&quot;/&gt;&lt;wsp:rsid wsp:val=&quot;00502E89&quot;/&gt;&lt;wsp:rsid wsp:val=&quot;00506CFE&quot;/&gt;&lt;wsp:rsid wsp:val=&quot;00510E95&quot;/&gt;&lt;wsp:rsid wsp:val=&quot;005225C3&quot;/&gt;&lt;wsp:rsid wsp:val=&quot;00527D56&quot;/&gt;&lt;wsp:rsid wsp:val=&quot;0053221F&quot;/&gt;&lt;wsp:rsid wsp:val=&quot;00536FAE&quot;/&gt;&lt;wsp:rsid wsp:val=&quot;00542C85&quot;/&gt;&lt;wsp:rsid wsp:val=&quot;00553510&quot;/&gt;&lt;wsp:rsid wsp:val=&quot;00554186&quot;/&gt;&lt;wsp:rsid wsp:val=&quot;00585769&quot;/&gt;&lt;wsp:rsid wsp:val=&quot;00585C61&quot;/&gt;&lt;wsp:rsid wsp:val=&quot;00591130&quot;/&gt;&lt;wsp:rsid wsp:val=&quot;005A3F28&quot;/&gt;&lt;wsp:rsid wsp:val=&quot;005A40BE&quot;/&gt;&lt;wsp:rsid wsp:val=&quot;005B13E2&quot;/&gt;&lt;wsp:rsid wsp:val=&quot;005B47D7&quot;/&gt;&lt;wsp:rsid wsp:val=&quot;005C5526&quot;/&gt;&lt;wsp:rsid wsp:val=&quot;005C62C6&quot;/&gt;&lt;wsp:rsid wsp:val=&quot;005D7B9E&quot;/&gt;&lt;wsp:rsid wsp:val=&quot;005E112E&quot;/&gt;&lt;wsp:rsid wsp:val=&quot;005F0834&quot;/&gt;&lt;wsp:rsid wsp:val=&quot;005F68AB&quot;/&gt;&lt;wsp:rsid wsp:val=&quot;005F6DC3&quot;/&gt;&lt;wsp:rsid wsp:val=&quot;00601A8E&quot;/&gt;&lt;wsp:rsid wsp:val=&quot;0062033E&quot;/&gt;&lt;wsp:rsid wsp:val=&quot;00624482&quot;/&gt;&lt;wsp:rsid wsp:val=&quot;0064799C&quot;/&gt;&lt;wsp:rsid wsp:val=&quot;00654156&quot;/&gt;&lt;wsp:rsid wsp:val=&quot;00656ADC&quot;/&gt;&lt;wsp:rsid wsp:val=&quot;006B47CA&quot;/&gt;&lt;wsp:rsid wsp:val=&quot;006C304C&quot;/&gt;&lt;wsp:rsid wsp:val=&quot;006C4511&quot;/&gt;&lt;wsp:rsid wsp:val=&quot;006C65F5&quot;/&gt;&lt;wsp:rsid wsp:val=&quot;006C7AAA&quot;/&gt;&lt;wsp:rsid wsp:val=&quot;006D1C2A&quot;/&gt;&lt;wsp:rsid wsp:val=&quot;006D264F&quot;/&gt;&lt;wsp:rsid wsp:val=&quot;006D4E89&quot;/&gt;&lt;wsp:rsid wsp:val=&quot;006E2A8D&quot;/&gt;&lt;wsp:rsid wsp:val=&quot;006E7574&quot;/&gt;&lt;wsp:rsid wsp:val=&quot;00703430&quot;/&gt;&lt;wsp:rsid wsp:val=&quot;00703548&quot;/&gt;&lt;wsp:rsid wsp:val=&quot;00704E18&quot;/&gt;&lt;wsp:rsid wsp:val=&quot;007069BE&quot;/&gt;&lt;wsp:rsid wsp:val=&quot;00745C86&quot;/&gt;&lt;wsp:rsid wsp:val=&quot;00764603&quot;/&gt;&lt;wsp:rsid wsp:val=&quot;0076604D&quot;/&gt;&lt;wsp:rsid wsp:val=&quot;00790909&quot;/&gt;&lt;wsp:rsid wsp:val=&quot;007929AF&quot;/&gt;&lt;wsp:rsid wsp:val=&quot;007B1582&quot;/&gt;&lt;wsp:rsid wsp:val=&quot;007B5A07&quot;/&gt;&lt;wsp:rsid wsp:val=&quot;007C065D&quot;/&gt;&lt;wsp:rsid wsp:val=&quot;007D3E71&quot;/&gt;&lt;wsp:rsid wsp:val=&quot;007E5D6A&quot;/&gt;&lt;wsp:rsid wsp:val=&quot;007E645D&quot;/&gt;&lt;wsp:rsid wsp:val=&quot;007F75CA&quot;/&gt;&lt;wsp:rsid wsp:val=&quot;00821E08&quot;/&gt;&lt;wsp:rsid wsp:val=&quot;00834EFD&quot;/&gt;&lt;wsp:rsid wsp:val=&quot;00844B24&quot;/&gt;&lt;wsp:rsid wsp:val=&quot;0084515F&quot;/&gt;&lt;wsp:rsid wsp:val=&quot;0085092D&quot;/&gt;&lt;wsp:rsid wsp:val=&quot;00865414&quot;/&gt;&lt;wsp:rsid wsp:val=&quot;00877D4C&quot;/&gt;&lt;wsp:rsid wsp:val=&quot;008831DC&quot;/&gt;&lt;wsp:rsid wsp:val=&quot;00883903&quot;/&gt;&lt;wsp:rsid wsp:val=&quot;00891C30&quot;/&gt;&lt;wsp:rsid wsp:val=&quot;00897219&quot;/&gt;&lt;wsp:rsid wsp:val=&quot;0089763B&quot;/&gt;&lt;wsp:rsid wsp:val=&quot;008B6AE3&quot;/&gt;&lt;wsp:rsid wsp:val=&quot;008C1332&quot;/&gt;&lt;wsp:rsid wsp:val=&quot;008D1045&quot;/&gt;&lt;wsp:rsid wsp:val=&quot;008E5996&quot;/&gt;&lt;wsp:rsid wsp:val=&quot;00901AE1&quot;/&gt;&lt;wsp:rsid wsp:val=&quot;00912F93&quot;/&gt;&lt;wsp:rsid wsp:val=&quot;009205B4&quot;/&gt;&lt;wsp:rsid wsp:val=&quot;00955B59&quot;/&gt;&lt;wsp:rsid wsp:val=&quot;00992262&quot;/&gt;&lt;wsp:rsid wsp:val=&quot;009926BC&quot;/&gt;&lt;wsp:rsid wsp:val=&quot;009A4319&quot;/&gt;&lt;wsp:rsid wsp:val=&quot;009A6C3F&quot;/&gt;&lt;wsp:rsid wsp:val=&quot;009B73F2&quot;/&gt;&lt;wsp:rsid wsp:val=&quot;009C12BD&quot;/&gt;&lt;wsp:rsid wsp:val=&quot;009C50FE&quot;/&gt;&lt;wsp:rsid wsp:val=&quot;009E49DD&quot;/&gt;&lt;wsp:rsid wsp:val=&quot;00A03E75&quot;/&gt;&lt;wsp:rsid wsp:val=&quot;00A20627&quot;/&gt;&lt;wsp:rsid wsp:val=&quot;00A22FE9&quot;/&gt;&lt;wsp:rsid wsp:val=&quot;00A31A44&quot;/&gt;&lt;wsp:rsid wsp:val=&quot;00A32BFA&quot;/&gt;&lt;wsp:rsid wsp:val=&quot;00A3325E&quot;/&gt;&lt;wsp:rsid wsp:val=&quot;00A45FCE&quot;/&gt;&lt;wsp:rsid wsp:val=&quot;00A75671&quot;/&gt;&lt;wsp:rsid wsp:val=&quot;00A773CC&quot;/&gt;&lt;wsp:rsid wsp:val=&quot;00A924D0&quot;/&gt;&lt;wsp:rsid wsp:val=&quot;00A9318B&quot;/&gt;&lt;wsp:rsid wsp:val=&quot;00A94AC1&quot;/&gt;&lt;wsp:rsid wsp:val=&quot;00AB18B7&quot;/&gt;&lt;wsp:rsid wsp:val=&quot;00AD335D&quot;/&gt;&lt;wsp:rsid wsp:val=&quot;00AF114C&quot;/&gt;&lt;wsp:rsid wsp:val=&quot;00AF792B&quot;/&gt;&lt;wsp:rsid wsp:val=&quot;00B32137&quot;/&gt;&lt;wsp:rsid wsp:val=&quot;00B33D2F&quot;/&gt;&lt;wsp:rsid wsp:val=&quot;00B40A5B&quot;/&gt;&lt;wsp:rsid wsp:val=&quot;00B45C6B&quot;/&gt;&lt;wsp:rsid wsp:val=&quot;00B55D5E&quot;/&gt;&lt;wsp:rsid wsp:val=&quot;00B57A80&quot;/&gt;&lt;wsp:rsid wsp:val=&quot;00B70E9C&quot;/&gt;&lt;wsp:rsid wsp:val=&quot;00B713D8&quot;/&gt;&lt;wsp:rsid wsp:val=&quot;00B72979&quot;/&gt;&lt;wsp:rsid wsp:val=&quot;00B94516&quot;/&gt;&lt;wsp:rsid wsp:val=&quot;00BA25E2&quot;/&gt;&lt;wsp:rsid wsp:val=&quot;00BB2855&quot;/&gt;&lt;wsp:rsid wsp:val=&quot;00BC5343&quot;/&gt;&lt;wsp:rsid wsp:val=&quot;00BD19C1&quot;/&gt;&lt;wsp:rsid wsp:val=&quot;00BD25B8&quot;/&gt;&lt;wsp:rsid wsp:val=&quot;00C012E1&quot;/&gt;&lt;wsp:rsid wsp:val=&quot;00C06BB4&quot;/&gt;&lt;wsp:rsid wsp:val=&quot;00C10D20&quot;/&gt;&lt;wsp:rsid wsp:val=&quot;00C12E0C&quot;/&gt;&lt;wsp:rsid wsp:val=&quot;00C21916&quot;/&gt;&lt;wsp:rsid wsp:val=&quot;00C34915&quot;/&gt;&lt;wsp:rsid wsp:val=&quot;00C457CA&quot;/&gt;&lt;wsp:rsid wsp:val=&quot;00C53FB6&quot;/&gt;&lt;wsp:rsid wsp:val=&quot;00C57FB7&quot;/&gt;&lt;wsp:rsid wsp:val=&quot;00C644D4&quot;/&gt;&lt;wsp:rsid wsp:val=&quot;00C65F3F&quot;/&gt;&lt;wsp:rsid wsp:val=&quot;00C72414&quot;/&gt;&lt;wsp:rsid wsp:val=&quot;00C72B1A&quot;/&gt;&lt;wsp:rsid wsp:val=&quot;00C8667B&quot;/&gt;&lt;wsp:rsid wsp:val=&quot;00C90993&quot;/&gt;&lt;wsp:rsid wsp:val=&quot;00CA4CE3&quot;/&gt;&lt;wsp:rsid wsp:val=&quot;00CC72FD&quot;/&gt;&lt;wsp:rsid wsp:val=&quot;00CD1D23&quot;/&gt;&lt;wsp:rsid wsp:val=&quot;00CD4F3F&quot;/&gt;&lt;wsp:rsid wsp:val=&quot;00D311F8&quot;/&gt;&lt;wsp:rsid wsp:val=&quot;00D31660&quot;/&gt;&lt;wsp:rsid wsp:val=&quot;00D36B52&quot;/&gt;&lt;wsp:rsid wsp:val=&quot;00D377C8&quot;/&gt;&lt;wsp:rsid wsp:val=&quot;00D41274&quot;/&gt;&lt;wsp:rsid wsp:val=&quot;00D4229C&quot;/&gt;&lt;wsp:rsid wsp:val=&quot;00D43BF3&quot;/&gt;&lt;wsp:rsid wsp:val=&quot;00D549FB&quot;/&gt;&lt;wsp:rsid wsp:val=&quot;00D56487&quot;/&gt;&lt;wsp:rsid wsp:val=&quot;00D767BB&quot;/&gt;&lt;wsp:rsid wsp:val=&quot;00D939B0&quot;/&gt;&lt;wsp:rsid wsp:val=&quot;00DA31A2&quot;/&gt;&lt;wsp:rsid wsp:val=&quot;00DB16E0&quot;/&gt;&lt;wsp:rsid wsp:val=&quot;00DB2DF9&quot;/&gt;&lt;wsp:rsid wsp:val=&quot;00DB465D&quot;/&gt;&lt;wsp:rsid wsp:val=&quot;00DB48A2&quot;/&gt;&lt;wsp:rsid wsp:val=&quot;00DB7E63&quot;/&gt;&lt;wsp:rsid wsp:val=&quot;00DC2055&quot;/&gt;&lt;wsp:rsid wsp:val=&quot;00DC3908&quot;/&gt;&lt;wsp:rsid wsp:val=&quot;00DD71E8&quot;/&gt;&lt;wsp:rsid wsp:val=&quot;00DD7F83&quot;/&gt;&lt;wsp:rsid wsp:val=&quot;00DE4EB8&quot;/&gt;&lt;wsp:rsid wsp:val=&quot;00E0641E&quot;/&gt;&lt;wsp:rsid wsp:val=&quot;00E06664&quot;/&gt;&lt;wsp:rsid wsp:val=&quot;00E304BC&quot;/&gt;&lt;wsp:rsid wsp:val=&quot;00E32853&quot;/&gt;&lt;wsp:rsid wsp:val=&quot;00E34EBD&quot;/&gt;&lt;wsp:rsid wsp:val=&quot;00E401F8&quot;/&gt;&lt;wsp:rsid wsp:val=&quot;00E46425&quot;/&gt;&lt;wsp:rsid wsp:val=&quot;00E469FC&quot;/&gt;&lt;wsp:rsid wsp:val=&quot;00E47D0E&quot;/&gt;&lt;wsp:rsid wsp:val=&quot;00E65018&quot;/&gt;&lt;wsp:rsid wsp:val=&quot;00E76CA1&quot;/&gt;&lt;wsp:rsid wsp:val=&quot;00E94339&quot;/&gt;&lt;wsp:rsid wsp:val=&quot;00E97563&quot;/&gt;&lt;wsp:rsid wsp:val=&quot;00EB0B63&quot;/&gt;&lt;wsp:rsid wsp:val=&quot;00EC265C&quot;/&gt;&lt;wsp:rsid wsp:val=&quot;00ED61CB&quot;/&gt;&lt;wsp:rsid wsp:val=&quot;00EE752A&quot;/&gt;&lt;wsp:rsid wsp:val=&quot;00F06A72&quot;/&gt;&lt;wsp:rsid wsp:val=&quot;00F136F0&quot;/&gt;&lt;wsp:rsid wsp:val=&quot;00F20BBB&quot;/&gt;&lt;wsp:rsid wsp:val=&quot;00F36048&quot;/&gt;&lt;wsp:rsid wsp:val=&quot;00F43BD8&quot;/&gt;&lt;wsp:rsid wsp:val=&quot;00F562F3&quot;/&gt;&lt;wsp:rsid wsp:val=&quot;00F74B89&quot;/&gt;&lt;wsp:rsid wsp:val=&quot;00F75133&quot;/&gt;&lt;wsp:rsid wsp:val=&quot;00F83272&quot;/&gt;&lt;wsp:rsid wsp:val=&quot;00F9358D&quot;/&gt;&lt;wsp:rsid wsp:val=&quot;00F9369B&quot;/&gt;&lt;wsp:rsid wsp:val=&quot;00FA3899&quot;/&gt;&lt;wsp:rsid wsp:val=&quot;00FA4909&quot;/&gt;&lt;wsp:rsid wsp:val=&quot;00FA5164&quot;/&gt;&lt;wsp:rsid wsp:val=&quot;00FA6751&quot;/&gt;&lt;wsp:rsid wsp:val=&quot;00FA6BD7&quot;/&gt;&lt;wsp:rsid wsp:val=&quot;00FB1048&quot;/&gt;&lt;wsp:rsid wsp:val=&quot;00FB62C4&quot;/&gt;&lt;wsp:rsid wsp:val=&quot;00FB7701&quot;/&gt;&lt;wsp:rsid wsp:val=&quot;00FD1AC5&quot;/&gt;&lt;wsp:rsid wsp:val=&quot;00FD5CF0&quot;/&gt;&lt;/wsp:rsids&gt;&lt;/w:docPr&gt;&lt;w:body&gt;&lt;wx:sect&gt;&lt;w:p wsp:rsidR=&quot;001F2E7C&quot; wsp:rsidRPr=&quot;001F2E7C&quot; wsp:rsidRDefault=&quot;001F2E7C&quot; wsp:rsidP=&quot;001F2E7C&quot;&gt;&lt;m:oMathPara&gt;&lt;m:oMath&gt;&lt;m:f&gt;&lt;m:fPr&gt;&lt;m:ctrlPr&gt;&lt;w:rPr&gt;&lt;w:rFonts w:ascii=&quot;Cambria Math&quot; w:h-ansi=&quot;Cambria Math&quot;/&gt;&lt;wx:font wx:val=&quot;Cambria Math&quot;/&gt;&lt;w:i/&gt;&lt;/w:rPr&gt;&lt;/m:ctrlPr&gt;&lt;/m:fPr&gt;&lt;m:num&gt;&lt;m:sSub&gt;&lt;m:sSubPr&gt;&lt;m:ctrlPr&gt;&lt;w:rPr&gt;&lt;w:rFonts w:ascii=&quot;Cambria Math&quot; w:h-ansi=&quot;Cambria Math&quot;/&gt;&lt;wx:font wx:val=&quot;Cambria Math&quot;/&gt;&lt;w:i/&gt;&lt;/w:rPr&gt;&lt;/m:ctrlPr&gt;&lt;/m:sSubPr&gt;&lt;m:e&gt;&lt;m:r&gt;&lt;w:rPr&gt;&lt;w:rFonts w:ascii=&quot;Cambria Math&quot; w:h-ansi=&quot;Cambria Math&quot;/&gt;&lt;wx:font wx:val=&quot;Cambria Math&quot;/&gt;&lt;w:i/&gt;&lt;/w:rPr&gt;&lt;m:t&gt;t&lt;/m:t&gt;&lt;/m:r&gt;&lt;/m:e&gt;&lt;m:sub&gt;&lt;m:r&gt;&lt;w:rPr&gt;&lt;w:rFonts w:ascii=&quot;Cambria Math&quot; w:h-ansi=&quot;Cambria Math&quot;/&gt;&lt;wx:font wx:val=&quot;Cambria Math&quot;/&gt;&lt;w:i/&gt;&lt;/w:rPr&gt;&lt;m:t&gt;on&lt;/m:t&gt;&lt;/m:r&gt;&lt;/m:sub&gt;&lt;/m:sSub&gt;&lt;/m:num&gt;&lt;m:den&gt;&lt;m:sSub&gt;&lt;m:sSubPr&gt;&lt;m:ctrlPr&gt;&lt;w:rPr&gt;&lt;w:rFonts w:ascii=&quot;Cambria Math&quot; w:h-ansi=&quot;Cambria Math&quot;/&gt;&lt;wx:font wx:val=&quot;Cambria Math&quot;/&gt;&lt;w:i/&gt;&lt;/w:rPr&gt;&lt;/m:ctrlPr&gt;&lt;/m:sSubPr&gt;&lt;m:e&gt;&lt;m:r&gt;&lt;w:rPr&gt;&lt;w:rFonts w:ascii=&quot;Cambria Math&quot; w:h-ansi=&quot;Cambria Math&quot;/&gt;&lt;wx:font wx:val=&quot;Cambria Math&quot;/&gt;&lt;w:i/&gt;&lt;/w:rPr&gt;&lt;m:t&gt;t&lt;/m:t&gt;&lt;/m:r&gt;&lt;/m:e&gt;&lt;m:sub&gt;&lt;m:r&gt;&lt;w:rPr&gt;&lt;w:rFonts w:ascii=&quot;Cambria Math&quot; w:h-ansi=&quot;Cambria Math&quot;/&gt;&lt;wx:font wx:val=&quot;Cambria Math&quot;/&gt;&lt;w:i/&gt;&lt;/w:rPr&gt;&lt;m:t&gt;off&lt;/m:t&gt;&lt;/m:r&gt;&lt;/m:sub&gt;&lt;/m:sSub&gt;&lt;/m:den&gt;&lt;/m:f&gt;&lt;m:r&gt;&lt;w:rPr&gt;&lt;w:rFonts w:ascii=&quot;Cambria Math&quot; w:h-ansi=&quot;Cambria Math&quot;/&gt;&lt;wx:font wx:val=&quot;Cambria Math&quot;/&gt;&lt;w:i/&gt;&lt;/w:rPr&gt;&lt;m:t&gt;=&lt;/m:t&gt;&lt;/m:r&gt;&lt;m:f&gt;&lt;m:fPr&gt;&lt;m:ctrlPr&gt;&lt;w:rPr&gt;&lt;w:rFonts w:ascii=&quot;Cambria Math&quot; w:h-ansi=&quot;Cambria Math&quot;/&gt;&lt;wx:font wx:val=&quot;Cambria Math&quot;/&gt;&lt;w:i/&gt;&lt;/w:rPr&gt;&lt;/m:ctrlPr&gt;&lt;/m:fPr&gt;&lt;m:num&gt;&lt;m:sSub&gt;&lt;m:sSubPr&gt;&lt;m:ctrlPr&gt;&lt;w:rPr&gt;&lt;w:rFonts w:ascii=&quot;Cambria Math&quot; w:h-ansi=&quot;Cambria Math&quot;/&gt;&lt;wx:font wx:val=&quot;Cambria Math&quot;/&gt;&lt;w:i/&gt;&lt;/w:rPr&gt;&lt;/m:ctrlPr&gt;&lt;/m:sSubPr&gt;&lt;m:e&gt;&lt;m:r&gt;&lt;w:rPr&gt;&lt;w:rFonts w:ascii=&quot;Cambria Math&quot; w:h-ansi=&quot;Cambria Math&quot;/&gt;&lt;wx:font wx:val=&quot;Cambria Math&quot;/&gt;&lt;w:i/&gt;&lt;/w:rPr&gt;&lt;m:t&gt;V&lt;/m:t&gt;&lt;/m:r&gt;&lt;/m:e&gt;&lt;m:sub&gt;&lt;m:r&gt;&lt;w:rPr&gt;&lt;w:rFonts w:ascii=&quot;Cambria Math&quot; w:h-ansi=&quot;Cambria Math&quot;/&gt;&lt;wx:font wx:val=&quot;Cambria Math&quot;/&gt;&lt;w:i/&gt;&lt;/w:rPr&gt;&lt;m:t&gt;out&lt;/m:t&gt;&lt;/m:r&gt;&lt;/m:sub&gt;&lt;/m:sSub&gt;&lt;m:r&gt;&lt;w:rPr&gt;&lt;w:rFonts w:ascii=&quot;Cambria Math&quot; w:h-ansi=&quot;Cambria Math&quot;/&gt;&lt;wx:font wx:val=&quot;Cambria Math&quot;/&gt;&lt;w:i/&gt;&lt;/w:rPr&gt;&lt;m:t&gt;+&lt;/m:t&gt;&lt;/m:r&gt;&lt;m:sSub&gt;&lt;m:sSubPr&gt;&lt;m:ctrlPr&gt;&lt;w:rPr&gt;&lt;w:rFonts w:ascii=&quot;Cambria Math&quot; w:h-ansi=&quot;Cambria Math&quot;/&gt;&lt;wx:font wx:val=&quot;Cambria Math&quot;/&gt;&lt;w:i/&gt;&lt;/w:rPr&gt;&lt;/m:ctrlPr&gt;&lt;/m:sSubPr&gt;&lt;m:e&gt;&lt;m:r&gt;&lt;w:rPr&gt;&lt;w:rFonts w:ascii=&quot;Cambria Math&quot; w:h-ansi=&quot;Cambria Math&quot;/&gt;&lt;wx:font wx:val=&quot;Cambria Math&quot;/&gt;&lt;w:i/&gt;&lt;/w:rPr&gt;&lt;m:t&gt;V&lt;/m:t&gt;&lt;/m:r&gt;&lt;/m:e&gt;&lt;m:sub&gt;&lt;m:r&gt;&lt;w:rPr&gt;&lt;w:rFonts w:ascii=&quot;Cambria Math&quot; w:h-ansi=&quot;Cambria Math&quot;/&gt;&lt;wx:font wx:val=&quot;Cambria Math&quot;/&gt;&lt;w:i/&gt;&lt;/w:rPr&gt;&lt;m:t&gt;F&lt;/m:t&gt;&lt;/m:r&gt;&lt;/m:sub&gt;&lt;/m:sSub&gt;&lt;/m:num&gt;&lt;m:den&gt;&lt;m:sSub&gt;&lt;m:sSubPr&gt;&lt;m:ctrlPr&gt;&lt;w:rPr&gt;&lt;w:rFonts w:ascii=&quot;Cambria Math&quot; w:h-ansi=&quot;Cambria Math&quot;/&gt;&lt;wx:font wx:val=&quot;Cambria Math&quot;/&gt;&lt;w:i/&gt;&lt;/w:rPr&gt;&lt;/m:ctrlPr&gt;&lt;/m:sSubPr&gt;&lt;m:e&gt;&lt;m:r&gt;&lt;w:rPr&gt;&lt;w:rFonts w:ascii=&quot;Cambria Math&quot; w:h-ansi=&quot;Cambria Math&quot;/&gt;&lt;wx:font wx:val=&quot;Cambria Math&quot;/&gt;&lt;w:i/&gt;&lt;/w:rPr&gt;&lt;m:t&gt;V&lt;/m:t&gt;&lt;/m:r&gt;&lt;/m:e&gt;&lt;m:sub&gt;&lt;m:r&gt;&lt;w:rPr&gt;&lt;w:rFonts w:ascii=&quot;Cambria Math&quot; w:h-ansi=&quot;Cambria Math&quot;/&gt;&lt;wx:font wx:val=&quot;Cambria Math&quot;/&gt;&lt;w:i/&gt;&lt;/w:rPr&gt;&lt;m:t&gt;in&lt;/m:t&gt;&lt;/m:r&gt;&lt;/m:sub&gt;&lt;/m:sSub&gt;&lt;m:r&gt;&lt;w:rPr&gt;&lt;w:rFonts w:ascii=&quot;Cambria Math&quot; w:h-ansi=&quot;Cambria Math&quot;/&gt;&lt;wx:font wx:val=&quot;Cambria Math&quot;/&gt;&lt;w:i/&gt;&lt;/w:rPr&gt;&lt;m:t&gt;-&lt;/m:t&gt;&lt;/m:r&gt;&lt;m:sSub&gt;&lt;m:sSubPr&gt;&lt;m:ctrlPr&gt;&lt;w:rPr&gt;&lt;w:rFonts w:ascii=&quot;Cambria Math&quot; w:h-ansi=&quot;Cambria Math&quot;/&gt;&lt;wx:font wx:val=&quot;Cambria Math&quot;/&gt;&lt;w:i/&gt;&lt;/w:rPr&gt;&lt;/m:ctrlPr&gt;&lt;/m:sSubPr&gt;&lt;m:e&gt;&lt;m:r&gt;&lt;w:rPr&gt;&lt;w:rFonts w:ascii=&quot;Cambria Math&quot; w:h-ansi=&quot;Cambria Math&quot;/&gt;&lt;wx:font wx:val=&quot;Cambria Math&quot;/&gt;&lt;w:i/&gt;&lt;/w:rPr&gt;&lt;m:t&gt;V&lt;/m:t&gt;&lt;/m:r&gt;&lt;/m:e&gt;&lt;m:sub&gt;&lt;m:r&gt;&lt;w:rPr&gt;&lt;w:rFonts w:ascii=&quot;Cambria Math&quot; w:h-ansi=&quot;Cambria Math&quot;/&gt;&lt;wx:font wx:val=&quot;Cambria Math&quot;/&gt;&lt;w:i/&gt;&lt;/w:rPr&gt;&lt;m:t&gt;out&lt;/m:t&gt;&lt;/m:r&gt;&lt;/m:sub&gt;&lt;/m:sSub&gt;&lt;m:r&gt;&lt;w:rPr&gt;&lt;w:rFonts w:ascii=&quot;Cambria Math&quot; w:h-ansi=&quot;Cambria Math&quot;/&gt;&lt;wx:font wx:val=&quot;Cambria Math&quot;/&gt;&lt;w:i/&gt;&lt;/w:rPr&gt;&lt;m:t&gt;-&lt;/m:t&gt;&lt;/m:r&gt;&lt;m:sSub&gt;&lt;m:sSubPr&gt;&lt;m:ctrlPr&gt;&lt;w:rPr&gt;&lt;w:rFonts w:ascii=&quot;Cambria Math&quot; w:h-ansi=&quot;Cambria Math&quot;/&gt;&lt;wx:font wx:val=&quot;Cambria Math&quot;/&gt;&lt;w:i/&gt;&lt;/w:rPr&gt;&lt;/m:ctrlPr&gt;&lt;/m:sSubPr&gt;&lt;m:e&gt;&lt;m:r&gt;&lt;w:rPr&gt;&lt;w:rFonts w:ascii=&quot;Cambria Math&quot; w:h-ansi=&quot;Cambria Math&quot;/&gt;&lt;wx:font wx:val=&quot;Cambria Math&quot;/&gt;&lt;w:i/&gt;&lt;/w:rPr&gt;&lt;m:t&gt;V&lt;/m:t&gt;&lt;/m:r&gt;&lt;/m:e&gt;&lt;m:sub&gt;&lt;m:r&gt;&lt;w:rPr&gt;&lt;w:rFonts w:ascii=&quot;Cambria Math&quot; w:h-ansi=&quot;Cambria Math&quot;/&gt;&lt;wx:font wx:val=&quot;Cambria Math&quot;/&gt;&lt;w:i/&gt;&lt;/w:rPr&gt;&lt;m:t&gt;sat&lt;/m:t&gt;&lt;/m:r&gt;&lt;/m:sub&gt;&lt;/m:sSub&gt;&lt;/m:den&gt;&lt;/m:f&gt;&lt;/m:oMath&gt;&lt;/m:oMathPara&gt;&lt;/w:p&gt;&lt;w:sectPr wsp:rsidR=&quot;00000000&quot; wsp:rsidRPr=&quot;001F2E7C&quot;&gt;&lt;w:pgSz w:w=&quot;12240&quot; w:h=&quot;15840&quot;/&gt;&lt;w:pgMar w:top=&quot;1440&quot; w:right=&quot;1440&quot; w:bottom=&quot;1440&quot; w:left=&quot;1440&quot; w:header=&quot;720&quot; w:footer=&quot;720&quot; w:gutter=&quot;0&quot;/&gt;&lt;w:cols w:space=&quot;720&quot;/&gt;&lt;/w:sectPr&gt;&lt;/wx:sect&gt;&lt;/w:body&gt;&lt;/w:wordDocument&gt;">
+                <v:shape id="_x0000_i1054" type="#_x0000_t75" style="width:96.9pt;height:24.9pt" equationxml="&lt;?xml version=&quot;1.0&quot; encoding=&quot;UTF-8&quot; standalone=&quot;yes&quot;?&gt;&#10;&lt;?mso-application progid=&quot;Word.Document&quot;?&gt;&#10;&lt;w:wordDocument xmlns:aml=&quot;http://schemas.microsoft.com/aml/2001/core&quot; xmlns:wpc=&quot;http://schemas.microsoft.com/office/word/2010/wordprocessingCanvas&quot; xmlns:cx=&quot;http://schemas.microsoft.com/office/drawing/2014/chartex&quot; xmlns:cx1=&quot;http://schemas.microsoft.com/office/drawing/2015/9/8/chartex&quot; xmlns:cx2=&quot;http://schemas.microsoft.com/office/drawing/2015/10/21/chartex&quot; xmlns:cx3=&quot;http://schemas.microsoft.com/office/drawing/2016/5/9/chartex&quot; xmlns:cx4=&quot;http://schemas.microsoft.com/office/drawing/2016/5/10/chartex&quot; xmlns:cx5=&quot;http://schemas.microsoft.com/office/drawing/2016/5/11/chartex&quot; xmlns:cx6=&quot;http://schemas.microsoft.com/office/drawing/2016/5/12/chartex&quot; xmlns:cx7=&quot;http://schemas.microsoft.com/office/drawing/2016/5/13/chartex&quot; xmlns:cx8=&quot;http://schemas.microsoft.com/office/drawing/2016/5/14/chartex&quot; xmlns:cr=&quot;http://schemas.microsoft.com/office/comments/2020/reactions&quot; xmlns:dt=&quot;uuid:C2F41010-65B3-11d1-A29F-00AA00C14882&quot; xmlns:mc=&quot;http://schemas.openxmlformats.org/markup-compatibility/2006&quot; xmlns:aink=&quot;http://schemas.microsoft.com/office/drawing/2016/ink&quot; xmlns:am3d=&quot;http://schemas.microsoft.com/office/drawing/2017/model3d&quot; xmlns:o=&quot;urn:schemas-microsoft-com:office:office&quot; xmlns:oel=&quot;http://schemas.microsoft.com/office/2019/extlst&quot; xmlns:m=&quot;http://schemas.openxmlformats.org/officeDocument/2006/math&quot; xmlns:v=&quot;urn:schemas-microsoft-com:vml&quot; xmlns:w10=&quot;urn:schemas-microsoft-com:office:word&quot; xmlns:w=&quot;http://schemas.microsoft.com/office/word/2003/wordml&quot; xmlns:wx=&quot;http://schemas.microsoft.com/office/word/2003/auxHint&quot; xmlns:wne=&quot;http://schemas.microsoft.com/office/word/2006/wordml&quot; xmlns:wsp=&quot;http://schemas.microsoft.com/office/word/2003/wordml/sp2&quot; xmlns:sl=&quot;http://schemas.microsoft.com/schemaLibrary/2003/core&quot; w:macrosPresent=&quot;no&quot; w:embeddedObjPresent=&quot;no&quot; w:ocxPresent=&quot;no&quot; xml:space=&quot;preserve&quot;&gt;&lt;w:ignoreSubtree w:val=&quot;http://schemas.microsoft.com/office/word/2003/wordml/sp2&quot;/&gt;&lt;o:DocumentProperties&gt;&lt;o:Version&gt;16&lt;/o:Version&gt;&lt;/o:DocumentProperties&gt;&lt;w:docPr&gt;&lt;w:view w:val=&quot;print&quot;/&gt;&lt;w:zoom w:percent=&quot;100&quot;/&gt;&lt;w:doNotEmbedSystemFonts/&gt;&lt;w:activeWritingStyle w:lang=&quot;EN-AU&quot; w:vendorID=&quot;64&quot; w:dllVersion=&quot;6&quot; w:nlCheck=&quot;on&quot; w:optionSet=&quot;1&quot;/&gt;&lt;w:activeWritingStyle w:lang=&quot;EN-GB&quot; w:vendorID=&quot;64&quot; w:dllVersion=&quot;6&quot; w:nlCheck=&quot;on&quot; w:optionSet=&quot;1&quot;/&gt;&lt;w:activeWritingStyle w:lang=&quot;EN-US&quot; w:vendorID=&quot;64&quot; w:dllVersion=&quot;6&quot; w:nlCheck=&quot;on&quot; w:optionSet=&quot;1&quot;/&gt;&lt;w:activeWritingStyle w:lang=&quot;EN-AU&quot; w:vendorID=&quot;64&quot; w:dllVersion=&quot;0&quot; w:nlCheck=&quot;on&quot; w:optionSet=&quot;0&quot;/&gt;&lt;w:activeWritingStyle w:lang=&quot;EN-GB&quot; w:vendorID=&quot;64&quot; w:dllVersion=&quot;0&quot; w:nlCheck=&quot;on&quot; w:optionSet=&quot;0&quot;/&gt;&lt;w:activeWritingStyle w:lang=&quot;EN-US&quot; w:vendorID=&quot;64&quot; w:dllVersion=&quot;0&quot; w:nlCheck=&quot;on&quot; w:optionSet=&quot;0&quot;/&gt;&lt;w:activeWritingStyle w:lang=&quot;ES-AR&quot; w:vendorID=&quot;64&quot; w:dllVersion=&quot;0&quot; w:nlCheck=&quot;on&quot; w:optionSet=&quot;0&quot;/&gt;&lt;w:activeWritingStyle w:lang=&quot;580A&quot; w:vendorID=&quot;64&quot; w:dllVersion=&quot;0&quot; w:nlCheck=&quot;on&quot; w:optionSet=&quot;0&quot;/&gt;&lt;w:activeWritingStyle w:lang=&quot;PT-BR&quot; w:vendorID=&quot;64&quot; w:dllVersion=&quot;0&quot; w:nlCheck=&quot;on&quot; w:optionSet=&quot;0&quot;/&gt;&lt;w:stylePaneFormatFilter w:val=&quot;3F01&quot;/&gt;&lt;w:defaultTabStop w:val=&quot;720&quot;/&gt;&lt;w:hyphenationZone w:val=&quot;425&quot;/&gt;&lt;w:characterSpacingControl w:val=&quot;DontCompress&quot;/&gt;&lt;w:optimizeForBrowser/&gt;&lt;w:validateAgainstSchema/&gt;&lt;w:saveInvalidXML w:val=&quot;off&quot;/&gt;&lt;w:ignoreMixedContent w:val=&quot;off&quot;/&gt;&lt;w:alwaysShowPlaceholderText w:val=&quot;off&quot;/&gt;&lt;w:compat&gt;&lt;w:breakWrappedTables/&gt;&lt;w:snapToGridInCell/&gt;&lt;w:applyBreakingRules/&gt;&lt;w:wrapTextWithPunct/&gt;&lt;w:useAsianBreakRules/&gt;&lt;w:useWord2002TableStyleRules/&gt;&lt;w:useFELayout/&gt;&lt;/w:compat&gt;&lt;wsp:rsids&gt;&lt;wsp:rsidRoot wsp:val=&quot;00426FBB&quot;/&gt;&lt;wsp:rsid wsp:val=&quot;000002E1&quot;/&gt;&lt;wsp:rsid wsp:val=&quot;00003C97&quot;/&gt;&lt;wsp:rsid wsp:val=&quot;00005565&quot;/&gt;&lt;wsp:rsid wsp:val=&quot;0001754A&quot;/&gt;&lt;wsp:rsid wsp:val=&quot;00017719&quot;/&gt;&lt;wsp:rsid wsp:val=&quot;00027F1D&quot;/&gt;&lt;wsp:rsid wsp:val=&quot;0003296C&quot;/&gt;&lt;wsp:rsid wsp:val=&quot;0003351F&quot;/&gt;&lt;wsp:rsid wsp:val=&quot;00044599&quot;/&gt;&lt;wsp:rsid wsp:val=&quot;000540E6&quot;/&gt;&lt;wsp:rsid wsp:val=&quot;00054421&quot;/&gt;&lt;wsp:rsid wsp:val=&quot;00062E46&quot;/&gt;&lt;wsp:rsid wsp:val=&quot;00074AC8&quot;/&gt;&lt;wsp:rsid wsp:val=&quot;00081408&quot;/&gt;&lt;wsp:rsid wsp:val=&quot;00081EBE&quot;/&gt;&lt;wsp:rsid wsp:val=&quot;00086EDC&quot;/&gt;&lt;wsp:rsid wsp:val=&quot;000B1236&quot;/&gt;&lt;wsp:rsid wsp:val=&quot;000B36A3&quot;/&gt;&lt;wsp:rsid wsp:val=&quot;000C013C&quot;/&gt;&lt;wsp:rsid wsp:val=&quot;000E3F84&quot;/&gt;&lt;wsp:rsid wsp:val=&quot;001056DF&quot;/&gt;&lt;wsp:rsid wsp:val=&quot;0010789C&quot;/&gt;&lt;wsp:rsid wsp:val=&quot;00114025&quot;/&gt;&lt;wsp:rsid wsp:val=&quot;001160D2&quot;/&gt;&lt;wsp:rsid wsp:val=&quot;00120636&quot;/&gt;&lt;wsp:rsid wsp:val=&quot;001348A5&quot;/&gt;&lt;wsp:rsid wsp:val=&quot;00151B8E&quot;/&gt;&lt;wsp:rsid wsp:val=&quot;00182170&quot;/&gt;&lt;wsp:rsid wsp:val=&quot;001928FB&quot;/&gt;&lt;wsp:rsid wsp:val=&quot;00192BC7&quot;/&gt;&lt;wsp:rsid wsp:val=&quot;00195BE6&quot;/&gt;&lt;wsp:rsid wsp:val=&quot;001A3C37&quot;/&gt;&lt;wsp:rsid wsp:val=&quot;001A50EA&quot;/&gt;&lt;wsp:rsid wsp:val=&quot;001F16CD&quot;/&gt;&lt;wsp:rsid wsp:val=&quot;001F2E7C&quot;/&gt;&lt;wsp:rsid wsp:val=&quot;001F47D2&quot;/&gt;&lt;wsp:rsid wsp:val=&quot;002029C8&quot;/&gt;&lt;wsp:rsid wsp:val=&quot;0022285A&quot;/&gt;&lt;wsp:rsid wsp:val=&quot;00224C61&quot;/&gt;&lt;wsp:rsid wsp:val=&quot;00256ABC&quot;/&gt;&lt;wsp:rsid wsp:val=&quot;0027227B&quot;/&gt;&lt;wsp:rsid wsp:val=&quot;00273AC7&quot;/&gt;&lt;wsp:rsid wsp:val=&quot;00273D2C&quot;/&gt;&lt;wsp:rsid wsp:val=&quot;00285ECD&quot;/&gt;&lt;wsp:rsid wsp:val=&quot;00290E1B&quot;/&gt;&lt;wsp:rsid wsp:val=&quot;00291B17&quot;/&gt;&lt;wsp:rsid wsp:val=&quot;00291BB3&quot;/&gt;&lt;wsp:rsid wsp:val=&quot;002A6742&quot;/&gt;&lt;wsp:rsid wsp:val=&quot;002C1A7F&quot;/&gt;&lt;wsp:rsid wsp:val=&quot;002C4239&quot;/&gt;&lt;wsp:rsid wsp:val=&quot;002C559D&quot;/&gt;&lt;wsp:rsid wsp:val=&quot;002D16AE&quot;/&gt;&lt;wsp:rsid wsp:val=&quot;002D2D42&quot;/&gt;&lt;wsp:rsid wsp:val=&quot;002F72D0&quot;/&gt;&lt;wsp:rsid wsp:val=&quot;002F7A4F&quot;/&gt;&lt;wsp:rsid wsp:val=&quot;003003AB&quot;/&gt;&lt;wsp:rsid wsp:val=&quot;00302C35&quot;/&gt;&lt;wsp:rsid wsp:val=&quot;00311C49&quot;/&gt;&lt;wsp:rsid wsp:val=&quot;0032119E&quot;/&gt;&lt;wsp:rsid wsp:val=&quot;00321304&quot;/&gt;&lt;wsp:rsid wsp:val=&quot;00324FC2&quot;/&gt;&lt;wsp:rsid wsp:val=&quot;003312CA&quot;/&gt;&lt;wsp:rsid wsp:val=&quot;00331F84&quot;/&gt;&lt;wsp:rsid wsp:val=&quot;003329D6&quot;/&gt;&lt;wsp:rsid wsp:val=&quot;0037721F&quot;/&gt;&lt;wsp:rsid wsp:val=&quot;003950A4&quot;/&gt;&lt;wsp:rsid wsp:val=&quot;003A1E7E&quot;/&gt;&lt;wsp:rsid wsp:val=&quot;003E2FDC&quot;/&gt;&lt;wsp:rsid wsp:val=&quot;003E3577&quot;/&gt;&lt;wsp:rsid wsp:val=&quot;003F3A61&quot;/&gt;&lt;wsp:rsid wsp:val=&quot;00410A5D&quot;/&gt;&lt;wsp:rsid wsp:val=&quot;00414909&quot;/&gt;&lt;wsp:rsid wsp:val=&quot;00416537&quot;/&gt;&lt;wsp:rsid wsp:val=&quot;00425A6A&quot;/&gt;&lt;wsp:rsid wsp:val=&quot;00426FBB&quot;/&gt;&lt;wsp:rsid wsp:val=&quot;00454542&quot;/&gt;&lt;wsp:rsid wsp:val=&quot;0047429A&quot;/&gt;&lt;wsp:rsid wsp:val=&quot;0048374C&quot;/&gt;&lt;wsp:rsid wsp:val=&quot;0048771D&quot;/&gt;&lt;wsp:rsid wsp:val=&quot;004A6605&quot;/&gt;&lt;wsp:rsid wsp:val=&quot;004C45FA&quot;/&gt;&lt;wsp:rsid wsp:val=&quot;004D35A3&quot;/&gt;&lt;wsp:rsid wsp:val=&quot;004E1BD8&quot;/&gt;&lt;wsp:rsid wsp:val=&quot;004E452A&quot;/&gt;&lt;wsp:rsid wsp:val=&quot;004E78E3&quot;/&gt;&lt;wsp:rsid wsp:val=&quot;004F2BFE&quot;/&gt;&lt;wsp:rsid wsp:val=&quot;004F63D3&quot;/&gt;&lt;wsp:rsid wsp:val=&quot;004F7DCF&quot;/&gt;&lt;wsp:rsid wsp:val=&quot;005004BF&quot;/&gt;&lt;wsp:rsid wsp:val=&quot;00502E89&quot;/&gt;&lt;wsp:rsid wsp:val=&quot;00506CFE&quot;/&gt;&lt;wsp:rsid wsp:val=&quot;00510E95&quot;/&gt;&lt;wsp:rsid wsp:val=&quot;005225C3&quot;/&gt;&lt;wsp:rsid wsp:val=&quot;00527D56&quot;/&gt;&lt;wsp:rsid wsp:val=&quot;0053221F&quot;/&gt;&lt;wsp:rsid wsp:val=&quot;00536FAE&quot;/&gt;&lt;wsp:rsid wsp:val=&quot;00542C85&quot;/&gt;&lt;wsp:rsid wsp:val=&quot;00553510&quot;/&gt;&lt;wsp:rsid wsp:val=&quot;00554186&quot;/&gt;&lt;wsp:rsid wsp:val=&quot;00585769&quot;/&gt;&lt;wsp:rsid wsp:val=&quot;00585C61&quot;/&gt;&lt;wsp:rsid wsp:val=&quot;00591130&quot;/&gt;&lt;wsp:rsid wsp:val=&quot;005A3F28&quot;/&gt;&lt;wsp:rsid wsp:val=&quot;005A40BE&quot;/&gt;&lt;wsp:rsid wsp:val=&quot;005B13E2&quot;/&gt;&lt;wsp:rsid wsp:val=&quot;005B47D7&quot;/&gt;&lt;wsp:rsid wsp:val=&quot;005C5526&quot;/&gt;&lt;wsp:rsid wsp:val=&quot;005C62C6&quot;/&gt;&lt;wsp:rsid wsp:val=&quot;005D7B9E&quot;/&gt;&lt;wsp:rsid wsp:val=&quot;005E112E&quot;/&gt;&lt;wsp:rsid wsp:val=&quot;005F0834&quot;/&gt;&lt;wsp:rsid wsp:val=&quot;005F68AB&quot;/&gt;&lt;wsp:rsid wsp:val=&quot;005F6DC3&quot;/&gt;&lt;wsp:rsid wsp:val=&quot;00601A8E&quot;/&gt;&lt;wsp:rsid wsp:val=&quot;0062033E&quot;/&gt;&lt;wsp:rsid wsp:val=&quot;00624482&quot;/&gt;&lt;wsp:rsid wsp:val=&quot;0064799C&quot;/&gt;&lt;wsp:rsid wsp:val=&quot;00654156&quot;/&gt;&lt;wsp:rsid wsp:val=&quot;00656ADC&quot;/&gt;&lt;wsp:rsid wsp:val=&quot;006B47CA&quot;/&gt;&lt;wsp:rsid wsp:val=&quot;006C304C&quot;/&gt;&lt;wsp:rsid wsp:val=&quot;006C4511&quot;/&gt;&lt;wsp:rsid wsp:val=&quot;006C65F5&quot;/&gt;&lt;wsp:rsid wsp:val=&quot;006C7AAA&quot;/&gt;&lt;wsp:rsid wsp:val=&quot;006D1C2A&quot;/&gt;&lt;wsp:rsid wsp:val=&quot;006D264F&quot;/&gt;&lt;wsp:rsid wsp:val=&quot;006D4E89&quot;/&gt;&lt;wsp:rsid wsp:val=&quot;006E2A8D&quot;/&gt;&lt;wsp:rsid wsp:val=&quot;006E7574&quot;/&gt;&lt;wsp:rsid wsp:val=&quot;00703430&quot;/&gt;&lt;wsp:rsid wsp:val=&quot;00703548&quot;/&gt;&lt;wsp:rsid wsp:val=&quot;00704E18&quot;/&gt;&lt;wsp:rsid wsp:val=&quot;007069BE&quot;/&gt;&lt;wsp:rsid wsp:val=&quot;00745C86&quot;/&gt;&lt;wsp:rsid wsp:val=&quot;00764603&quot;/&gt;&lt;wsp:rsid wsp:val=&quot;0076604D&quot;/&gt;&lt;wsp:rsid wsp:val=&quot;00790909&quot;/&gt;&lt;wsp:rsid wsp:val=&quot;007929AF&quot;/&gt;&lt;wsp:rsid wsp:val=&quot;007B1582&quot;/&gt;&lt;wsp:rsid wsp:val=&quot;007B5A07&quot;/&gt;&lt;wsp:rsid wsp:val=&quot;007C065D&quot;/&gt;&lt;wsp:rsid wsp:val=&quot;007D3E71&quot;/&gt;&lt;wsp:rsid wsp:val=&quot;007E5D6A&quot;/&gt;&lt;wsp:rsid wsp:val=&quot;007E645D&quot;/&gt;&lt;wsp:rsid wsp:val=&quot;007F75CA&quot;/&gt;&lt;wsp:rsid wsp:val=&quot;00821E08&quot;/&gt;&lt;wsp:rsid wsp:val=&quot;00834EFD&quot;/&gt;&lt;wsp:rsid wsp:val=&quot;00844B24&quot;/&gt;&lt;wsp:rsid wsp:val=&quot;0084515F&quot;/&gt;&lt;wsp:rsid wsp:val=&quot;0085092D&quot;/&gt;&lt;wsp:rsid wsp:val=&quot;00865414&quot;/&gt;&lt;wsp:rsid wsp:val=&quot;00877D4C&quot;/&gt;&lt;wsp:rsid wsp:val=&quot;008831DC&quot;/&gt;&lt;wsp:rsid wsp:val=&quot;00883903&quot;/&gt;&lt;wsp:rsid wsp:val=&quot;00891C30&quot;/&gt;&lt;wsp:rsid wsp:val=&quot;00897219&quot;/&gt;&lt;wsp:rsid wsp:val=&quot;0089763B&quot;/&gt;&lt;wsp:rsid wsp:val=&quot;008B6AE3&quot;/&gt;&lt;wsp:rsid wsp:val=&quot;008C1332&quot;/&gt;&lt;wsp:rsid wsp:val=&quot;008D1045&quot;/&gt;&lt;wsp:rsid wsp:val=&quot;008E5996&quot;/&gt;&lt;wsp:rsid wsp:val=&quot;00901AE1&quot;/&gt;&lt;wsp:rsid wsp:val=&quot;00912F93&quot;/&gt;&lt;wsp:rsid wsp:val=&quot;009205B4&quot;/&gt;&lt;wsp:rsid wsp:val=&quot;00955B59&quot;/&gt;&lt;wsp:rsid wsp:val=&quot;00992262&quot;/&gt;&lt;wsp:rsid wsp:val=&quot;009926BC&quot;/&gt;&lt;wsp:rsid wsp:val=&quot;009A4319&quot;/&gt;&lt;wsp:rsid wsp:val=&quot;009A6C3F&quot;/&gt;&lt;wsp:rsid wsp:val=&quot;009B73F2&quot;/&gt;&lt;wsp:rsid wsp:val=&quot;009C12BD&quot;/&gt;&lt;wsp:rsid wsp:val=&quot;009C50FE&quot;/&gt;&lt;wsp:rsid wsp:val=&quot;009E49DD&quot;/&gt;&lt;wsp:rsid wsp:val=&quot;00A03E75&quot;/&gt;&lt;wsp:rsid wsp:val=&quot;00A20627&quot;/&gt;&lt;wsp:rsid wsp:val=&quot;00A22FE9&quot;/&gt;&lt;wsp:rsid wsp:val=&quot;00A31A44&quot;/&gt;&lt;wsp:rsid wsp:val=&quot;00A32BFA&quot;/&gt;&lt;wsp:rsid wsp:val=&quot;00A3325E&quot;/&gt;&lt;wsp:rsid wsp:val=&quot;00A45FCE&quot;/&gt;&lt;wsp:rsid wsp:val=&quot;00A75671&quot;/&gt;&lt;wsp:rsid wsp:val=&quot;00A773CC&quot;/&gt;&lt;wsp:rsid wsp:val=&quot;00A924D0&quot;/&gt;&lt;wsp:rsid wsp:val=&quot;00A9318B&quot;/&gt;&lt;wsp:rsid wsp:val=&quot;00A94AC1&quot;/&gt;&lt;wsp:rsid wsp:val=&quot;00AB18B7&quot;/&gt;&lt;wsp:rsid wsp:val=&quot;00AD335D&quot;/&gt;&lt;wsp:rsid wsp:val=&quot;00AF114C&quot;/&gt;&lt;wsp:rsid wsp:val=&quot;00AF792B&quot;/&gt;&lt;wsp:rsid wsp:val=&quot;00B32137&quot;/&gt;&lt;wsp:rsid wsp:val=&quot;00B33D2F&quot;/&gt;&lt;wsp:rsid wsp:val=&quot;00B40A5B&quot;/&gt;&lt;wsp:rsid wsp:val=&quot;00B45C6B&quot;/&gt;&lt;wsp:rsid wsp:val=&quot;00B55D5E&quot;/&gt;&lt;wsp:rsid wsp:val=&quot;00B57A80&quot;/&gt;&lt;wsp:rsid wsp:val=&quot;00B70E9C&quot;/&gt;&lt;wsp:rsid wsp:val=&quot;00B713D8&quot;/&gt;&lt;wsp:rsid wsp:val=&quot;00B72979&quot;/&gt;&lt;wsp:rsid wsp:val=&quot;00B94516&quot;/&gt;&lt;wsp:rsid wsp:val=&quot;00BA25E2&quot;/&gt;&lt;wsp:rsid wsp:val=&quot;00BB2855&quot;/&gt;&lt;wsp:rsid wsp:val=&quot;00BC5343&quot;/&gt;&lt;wsp:rsid wsp:val=&quot;00BD19C1&quot;/&gt;&lt;wsp:rsid wsp:val=&quot;00BD25B8&quot;/&gt;&lt;wsp:rsid wsp:val=&quot;00C012E1&quot;/&gt;&lt;wsp:rsid wsp:val=&quot;00C06BB4&quot;/&gt;&lt;wsp:rsid wsp:val=&quot;00C10D20&quot;/&gt;&lt;wsp:rsid wsp:val=&quot;00C12E0C&quot;/&gt;&lt;wsp:rsid wsp:val=&quot;00C21916&quot;/&gt;&lt;wsp:rsid wsp:val=&quot;00C34915&quot;/&gt;&lt;wsp:rsid wsp:val=&quot;00C457CA&quot;/&gt;&lt;wsp:rsid wsp:val=&quot;00C53FB6&quot;/&gt;&lt;wsp:rsid wsp:val=&quot;00C57FB7&quot;/&gt;&lt;wsp:rsid wsp:val=&quot;00C644D4&quot;/&gt;&lt;wsp:rsid wsp:val=&quot;00C65F3F&quot;/&gt;&lt;wsp:rsid wsp:val=&quot;00C72414&quot;/&gt;&lt;wsp:rsid wsp:val=&quot;00C72B1A&quot;/&gt;&lt;wsp:rsid wsp:val=&quot;00C8667B&quot;/&gt;&lt;wsp:rsid wsp:val=&quot;00C90993&quot;/&gt;&lt;wsp:rsid wsp:val=&quot;00CA4CE3&quot;/&gt;&lt;wsp:rsid wsp:val=&quot;00CC72FD&quot;/&gt;&lt;wsp:rsid wsp:val=&quot;00CD1D23&quot;/&gt;&lt;wsp:rsid wsp:val=&quot;00CD4F3F&quot;/&gt;&lt;wsp:rsid wsp:val=&quot;00D311F8&quot;/&gt;&lt;wsp:rsid wsp:val=&quot;00D31660&quot;/&gt;&lt;wsp:rsid wsp:val=&quot;00D36B52&quot;/&gt;&lt;wsp:rsid wsp:val=&quot;00D377C8&quot;/&gt;&lt;wsp:rsid wsp:val=&quot;00D41274&quot;/&gt;&lt;wsp:rsid wsp:val=&quot;00D4229C&quot;/&gt;&lt;wsp:rsid wsp:val=&quot;00D43BF3&quot;/&gt;&lt;wsp:rsid wsp:val=&quot;00D549FB&quot;/&gt;&lt;wsp:rsid wsp:val=&quot;00D56487&quot;/&gt;&lt;wsp:rsid wsp:val=&quot;00D767BB&quot;/&gt;&lt;wsp:rsid wsp:val=&quot;00D939B0&quot;/&gt;&lt;wsp:rsid wsp:val=&quot;00DA31A2&quot;/&gt;&lt;wsp:rsid wsp:val=&quot;00DB16E0&quot;/&gt;&lt;wsp:rsid wsp:val=&quot;00DB2DF9&quot;/&gt;&lt;wsp:rsid wsp:val=&quot;00DB465D&quot;/&gt;&lt;wsp:rsid wsp:val=&quot;00DB48A2&quot;/&gt;&lt;wsp:rsid wsp:val=&quot;00DB7E63&quot;/&gt;&lt;wsp:rsid wsp:val=&quot;00DC2055&quot;/&gt;&lt;wsp:rsid wsp:val=&quot;00DC3908&quot;/&gt;&lt;wsp:rsid wsp:val=&quot;00DD71E8&quot;/&gt;&lt;wsp:rsid wsp:val=&quot;00DD7F83&quot;/&gt;&lt;wsp:rsid wsp:val=&quot;00DE4EB8&quot;/&gt;&lt;wsp:rsid wsp:val=&quot;00E0641E&quot;/&gt;&lt;wsp:rsid wsp:val=&quot;00E06664&quot;/&gt;&lt;wsp:rsid wsp:val=&quot;00E304BC&quot;/&gt;&lt;wsp:rsid wsp:val=&quot;00E32853&quot;/&gt;&lt;wsp:rsid wsp:val=&quot;00E34EBD&quot;/&gt;&lt;wsp:rsid wsp:val=&quot;00E401F8&quot;/&gt;&lt;wsp:rsid wsp:val=&quot;00E46425&quot;/&gt;&lt;wsp:rsid wsp:val=&quot;00E469FC&quot;/&gt;&lt;wsp:rsid wsp:val=&quot;00E47D0E&quot;/&gt;&lt;wsp:rsid wsp:val=&quot;00E65018&quot;/&gt;&lt;wsp:rsid wsp:val=&quot;00E76CA1&quot;/&gt;&lt;wsp:rsid wsp:val=&quot;00E94339&quot;/&gt;&lt;wsp:rsid wsp:val=&quot;00E97563&quot;/&gt;&lt;wsp:rsid wsp:val=&quot;00EB0B63&quot;/&gt;&lt;wsp:rsid wsp:val=&quot;00EC265C&quot;/&gt;&lt;wsp:rsid wsp:val=&quot;00ED61CB&quot;/&gt;&lt;wsp:rsid wsp:val=&quot;00EE752A&quot;/&gt;&lt;wsp:rsid wsp:val=&quot;00F06A72&quot;/&gt;&lt;wsp:rsid wsp:val=&quot;00F136F0&quot;/&gt;&lt;wsp:rsid wsp:val=&quot;00F20BBB&quot;/&gt;&lt;wsp:rsid wsp:val=&quot;00F36048&quot;/&gt;&lt;wsp:rsid wsp:val=&quot;00F43BD8&quot;/&gt;&lt;wsp:rsid wsp:val=&quot;00F562F3&quot;/&gt;&lt;wsp:rsid wsp:val=&quot;00F74B89&quot;/&gt;&lt;wsp:rsid wsp:val=&quot;00F75133&quot;/&gt;&lt;wsp:rsid wsp:val=&quot;00F83272&quot;/&gt;&lt;wsp:rsid wsp:val=&quot;00F9358D&quot;/&gt;&lt;wsp:rsid wsp:val=&quot;00F9369B&quot;/&gt;&lt;wsp:rsid wsp:val=&quot;00FA3899&quot;/&gt;&lt;wsp:rsid wsp:val=&quot;00FA4909&quot;/&gt;&lt;wsp:rsid wsp:val=&quot;00FA5164&quot;/&gt;&lt;wsp:rsid wsp:val=&quot;00FA6751&quot;/&gt;&lt;wsp:rsid wsp:val=&quot;00FA6BD7&quot;/&gt;&lt;wsp:rsid wsp:val=&quot;00FB1048&quot;/&gt;&lt;wsp:rsid wsp:val=&quot;00FB62C4&quot;/&gt;&lt;wsp:rsid wsp:val=&quot;00FB7701&quot;/&gt;&lt;wsp:rsid wsp:val=&quot;00FD1AC5&quot;/&gt;&lt;wsp:rsid wsp:val=&quot;00FD5CF0&quot;/&gt;&lt;/wsp:rsids&gt;&lt;/w:docPr&gt;&lt;w:body&gt;&lt;wx:sect&gt;&lt;w:p wsp:rsidR=&quot;001F2E7C&quot; wsp:rsidRPr=&quot;001F2E7C&quot; wsp:rsidRDefault=&quot;001F2E7C&quot; wsp:rsidP=&quot;001F2E7C&quot;&gt;&lt;m:oMathPara&gt;&lt;m:oMath&gt;&lt;m:f&gt;&lt;m:fPr&gt;&lt;m:ctrlPr&gt;&lt;w:rPr&gt;&lt;w:rFonts w:ascii=&quot;Cambria Math&quot; w:h-ansi=&quot;Cambria Math&quot;/&gt;&lt;wx:font wx:val=&quot;Cambria Math&quot;/&gt;&lt;w:i/&gt;&lt;/w:rPr&gt;&lt;/m:ctrlPr&gt;&lt;/m:fPr&gt;&lt;m:num&gt;&lt;m:sSub&gt;&lt;m:sSubPr&gt;&lt;m:ctrlPr&gt;&lt;w:rPr&gt;&lt;w:rFonts w:ascii=&quot;Cambria Math&quot; w:h-ansi=&quot;Cambria Math&quot;/&gt;&lt;wx:font wx:val=&quot;Cambria Math&quot;/&gt;&lt;w:i/&gt;&lt;/w:rPr&gt;&lt;/m:ctrlPr&gt;&lt;/m:sSubPr&gt;&lt;m:e&gt;&lt;m:r&gt;&lt;w:rPr&gt;&lt;w:rFonts w:ascii=&quot;Cambria Math&quot; w:h-ansi=&quot;Cambria Math&quot;/&gt;&lt;wx:font wx:val=&quot;Cambria Math&quot;/&gt;&lt;w:i/&gt;&lt;/w:rPr&gt;&lt;m:t&gt;t&lt;/m:t&gt;&lt;/m:r&gt;&lt;/m:e&gt;&lt;m:sub&gt;&lt;m:r&gt;&lt;w:rPr&gt;&lt;w:rFonts w:ascii=&quot;Cambria Math&quot; w:h-ansi=&quot;Cambria Math&quot;/&gt;&lt;wx:font wx:val=&quot;Cambria Math&quot;/&gt;&lt;w:i/&gt;&lt;/w:rPr&gt;&lt;m:t&gt;on&lt;/m:t&gt;&lt;/m:r&gt;&lt;/m:sub&gt;&lt;/m:sSub&gt;&lt;/m:num&gt;&lt;m:den&gt;&lt;m:sSub&gt;&lt;m:sSubPr&gt;&lt;m:ctrlPr&gt;&lt;w:rPr&gt;&lt;w:rFonts w:ascii=&quot;Cambria Math&quot; w:h-ansi=&quot;Cambria Math&quot;/&gt;&lt;wx:font wx:val=&quot;Cambria Math&quot;/&gt;&lt;w:i/&gt;&lt;/w:rPr&gt;&lt;/m:ctrlPr&gt;&lt;/m:sSubPr&gt;&lt;m:e&gt;&lt;m:r&gt;&lt;w:rPr&gt;&lt;w:rFonts w:ascii=&quot;Cambria Math&quot; w:h-ansi=&quot;Cambria Math&quot;/&gt;&lt;wx:font wx:val=&quot;Cambria Math&quot;/&gt;&lt;w:i/&gt;&lt;/w:rPr&gt;&lt;m:t&gt;t&lt;/m:t&gt;&lt;/m:r&gt;&lt;/m:e&gt;&lt;m:sub&gt;&lt;m:r&gt;&lt;w:rPr&gt;&lt;w:rFonts w:ascii=&quot;Cambria Math&quot; w:h-ansi=&quot;Cambria Math&quot;/&gt;&lt;wx:font wx:val=&quot;Cambria Math&quot;/&gt;&lt;w:i/&gt;&lt;/w:rPr&gt;&lt;m:t&gt;off&lt;/m:t&gt;&lt;/m:r&gt;&lt;/m:sub&gt;&lt;/m:sSub&gt;&lt;/m:den&gt;&lt;/m:f&gt;&lt;m:r&gt;&lt;w:rPr&gt;&lt;w:rFonts w:ascii=&quot;Cambria Math&quot; w:h-ansi=&quot;Cambria Math&quot;/&gt;&lt;wx:font wx:val=&quot;Cambria Math&quot;/&gt;&lt;w:i/&gt;&lt;/w:rPr&gt;&lt;m:t&gt;=&lt;/m:t&gt;&lt;/m:r&gt;&lt;m:f&gt;&lt;m:fPr&gt;&lt;m:ctrlPr&gt;&lt;w:rPr&gt;&lt;w:rFonts w:ascii=&quot;Cambria Math&quot; w:h-ansi=&quot;Cambria Math&quot;/&gt;&lt;wx:font wx:val=&quot;Cambria Math&quot;/&gt;&lt;w:i/&gt;&lt;/w:rPr&gt;&lt;/m:ctrlPr&gt;&lt;/m:fPr&gt;&lt;m:num&gt;&lt;m:sSub&gt;&lt;m:sSubPr&gt;&lt;m:ctrlPr&gt;&lt;w:rPr&gt;&lt;w:rFonts w:ascii=&quot;Cambria Math&quot; w:h-ansi=&quot;Cambria Math&quot;/&gt;&lt;wx:font wx:val=&quot;Cambria Math&quot;/&gt;&lt;w:i/&gt;&lt;/w:rPr&gt;&lt;/m:ctrlPr&gt;&lt;/m:sSubPr&gt;&lt;m:e&gt;&lt;m:r&gt;&lt;w:rPr&gt;&lt;w:rFonts w:ascii=&quot;Cambria Math&quot; w:h-ansi=&quot;Cambria Math&quot;/&gt;&lt;wx:font wx:val=&quot;Cambria Math&quot;/&gt;&lt;w:i/&gt;&lt;/w:rPr&gt;&lt;m:t&gt;V&lt;/m:t&gt;&lt;/m:r&gt;&lt;/m:e&gt;&lt;m:sub&gt;&lt;m:r&gt;&lt;w:rPr&gt;&lt;w:rFonts w:ascii=&quot;Cambria Math&quot; w:h-ansi=&quot;Cambria Math&quot;/&gt;&lt;wx:font wx:val=&quot;Cambria Math&quot;/&gt;&lt;w:i/&gt;&lt;/w:rPr&gt;&lt;m:t&gt;out&lt;/m:t&gt;&lt;/m:r&gt;&lt;/m:sub&gt;&lt;/m:sSub&gt;&lt;m:r&gt;&lt;w:rPr&gt;&lt;w:rFonts w:ascii=&quot;Cambria Math&quot; w:h-ansi=&quot;Cambria Math&quot;/&gt;&lt;wx:font wx:val=&quot;Cambria Math&quot;/&gt;&lt;w:i/&gt;&lt;/w:rPr&gt;&lt;m:t&gt;+&lt;/m:t&gt;&lt;/m:r&gt;&lt;m:sSub&gt;&lt;m:sSubPr&gt;&lt;m:ctrlPr&gt;&lt;w:rPr&gt;&lt;w:rFonts w:ascii=&quot;Cambria Math&quot; w:h-ansi=&quot;Cambria Math&quot;/&gt;&lt;wx:font wx:val=&quot;Cambria Math&quot;/&gt;&lt;w:i/&gt;&lt;/w:rPr&gt;&lt;/m:ctrlPr&gt;&lt;/m:sSubPr&gt;&lt;m:e&gt;&lt;m:r&gt;&lt;w:rPr&gt;&lt;w:rFonts w:ascii=&quot;Cambria Math&quot; w:h-ansi=&quot;Cambria Math&quot;/&gt;&lt;wx:font wx:val=&quot;Cambria Math&quot;/&gt;&lt;w:i/&gt;&lt;/w:rPr&gt;&lt;m:t&gt;V&lt;/m:t&gt;&lt;/m:r&gt;&lt;/m:e&gt;&lt;m:sub&gt;&lt;m:r&gt;&lt;w:rPr&gt;&lt;w:rFonts w:ascii=&quot;Cambria Math&quot; w:h-ansi=&quot;Cambria Math&quot;/&gt;&lt;wx:font wx:val=&quot;Cambria Math&quot;/&gt;&lt;w:i/&gt;&lt;/w:rPr&gt;&lt;m:t&gt;F&lt;/m:t&gt;&lt;/m:r&gt;&lt;/m:sub&gt;&lt;/m:sSub&gt;&lt;/m:num&gt;&lt;m:den&gt;&lt;m:sSub&gt;&lt;m:sSubPr&gt;&lt;m:ctrlPr&gt;&lt;w:rPr&gt;&lt;w:rFonts w:ascii=&quot;Cambria Math&quot; w:h-ansi=&quot;Cambria Math&quot;/&gt;&lt;wx:font wx:val=&quot;Cambria Math&quot;/&gt;&lt;w:i/&gt;&lt;/w:rPr&gt;&lt;/m:ctrlPr&gt;&lt;/m:sSubPr&gt;&lt;m:e&gt;&lt;m:r&gt;&lt;w:rPr&gt;&lt;w:rFonts w:ascii=&quot;Cambria Math&quot; w:h-ansi=&quot;Cambria Math&quot;/&gt;&lt;wx:font wx:val=&quot;Cambria Math&quot;/&gt;&lt;w:i/&gt;&lt;/w:rPr&gt;&lt;m:t&gt;V&lt;/m:t&gt;&lt;/m:r&gt;&lt;/m:e&gt;&lt;m:sub&gt;&lt;m:r&gt;&lt;w:rPr&gt;&lt;w:rFonts w:ascii=&quot;Cambria Math&quot; w:h-ansi=&quot;Cambria Math&quot;/&gt;&lt;wx:font wx:val=&quot;Cambria Math&quot;/&gt;&lt;w:i/&gt;&lt;/w:rPr&gt;&lt;m:t&gt;in&lt;/m:t&gt;&lt;/m:r&gt;&lt;/m:sub&gt;&lt;/m:sSub&gt;&lt;m:r&gt;&lt;w:rPr&gt;&lt;w:rFonts w:ascii=&quot;Cambria Math&quot; w:h-ansi=&quot;Cambria Math&quot;/&gt;&lt;wx:font wx:val=&quot;Cambria Math&quot;/&gt;&lt;w:i/&gt;&lt;/w:rPr&gt;&lt;m:t&gt;-&lt;/m:t&gt;&lt;/m:r&gt;&lt;m:sSub&gt;&lt;m:sSubPr&gt;&lt;m:ctrlPr&gt;&lt;w:rPr&gt;&lt;w:rFonts w:ascii=&quot;Cambria Math&quot; w:h-ansi=&quot;Cambria Math&quot;/&gt;&lt;wx:font wx:val=&quot;Cambria Math&quot;/&gt;&lt;w:i/&gt;&lt;/w:rPr&gt;&lt;/m:ctrlPr&gt;&lt;/m:sSubPr&gt;&lt;m:e&gt;&lt;m:r&gt;&lt;w:rPr&gt;&lt;w:rFonts w:ascii=&quot;Cambria Math&quot; w:h-ansi=&quot;Cambria Math&quot;/&gt;&lt;wx:font wx:val=&quot;Cambria Math&quot;/&gt;&lt;w:i/&gt;&lt;/w:rPr&gt;&lt;m:t&gt;V&lt;/m:t&gt;&lt;/m:r&gt;&lt;/m:e&gt;&lt;m:sub&gt;&lt;m:r&gt;&lt;w:rPr&gt;&lt;w:rFonts w:ascii=&quot;Cambria Math&quot; w:h-ansi=&quot;Cambria Math&quot;/&gt;&lt;wx:font wx:val=&quot;Cambria Math&quot;/&gt;&lt;w:i/&gt;&lt;/w:rPr&gt;&lt;m:t&gt;out&lt;/m:t&gt;&lt;/m:r&gt;&lt;/m:sub&gt;&lt;/m:sSub&gt;&lt;m:r&gt;&lt;w:rPr&gt;&lt;w:rFonts w:ascii=&quot;Cambria Math&quot; w:h-ansi=&quot;Cambria Math&quot;/&gt;&lt;wx:font wx:val=&quot;Cambria Math&quot;/&gt;&lt;w:i/&gt;&lt;/w:rPr&gt;&lt;m:t&gt;-&lt;/m:t&gt;&lt;/m:r&gt;&lt;m:sSub&gt;&lt;m:sSubPr&gt;&lt;m:ctrlPr&gt;&lt;w:rPr&gt;&lt;w:rFonts w:ascii=&quot;Cambria Math&quot; w:h-ansi=&quot;Cambria Math&quot;/&gt;&lt;wx:font wx:val=&quot;Cambria Math&quot;/&gt;&lt;w:i/&gt;&lt;/w:rPr&gt;&lt;/m:ctrlPr&gt;&lt;/m:sSubPr&gt;&lt;m:e&gt;&lt;m:r&gt;&lt;w:rPr&gt;&lt;w:rFonts w:ascii=&quot;Cambria Math&quot; w:h-ansi=&quot;Cambria Math&quot;/&gt;&lt;wx:font wx:val=&quot;Cambria Math&quot;/&gt;&lt;w:i/&gt;&lt;/w:rPr&gt;&lt;m:t&gt;V&lt;/m:t&gt;&lt;/m:r&gt;&lt;/m:e&gt;&lt;m:sub&gt;&lt;m:r&gt;&lt;w:rPr&gt;&lt;w:rFonts w:ascii=&quot;Cambria Math&quot; w:h-ansi=&quot;Cambria Math&quot;/&gt;&lt;wx:font wx:val=&quot;Cambria Math&quot;/&gt;&lt;w:i/&gt;&lt;/w:rPr&gt;&lt;m:t&gt;sat&lt;/m:t&gt;&lt;/m:r&gt;&lt;/m:sub&gt;&lt;/m:sSub&gt;&lt;/m:den&gt;&lt;/m:f&gt;&lt;/m:oMath&gt;&lt;/m:oMathPara&gt;&lt;/w:p&gt;&lt;w:sectPr wsp:rsidR=&quot;00000000&quot; wsp:rsidRPr=&quot;001F2E7C&quot;&gt;&lt;w:pgSz w:w=&quot;12240&quot; w:h=&quot;15840&quot;/&gt;&lt;w:pgMar w:top=&quot;1440&quot; w:right=&quot;1440&quot; w:bottom=&quot;1440&quot; w:left=&quot;1440&quot; w:header=&quot;720&quot; w:footer=&quot;720&quot; w:gutter=&quot;0&quot;/&gt;&lt;w:cols w:space=&quot;720&quot;/&gt;&lt;/w:sectPr&gt;&lt;/wx:sect&gt;&lt;/w:body&gt;&lt;/w:wordDocument&gt;">
                   <v:imagedata r:id="rId23" o:title="" chromakey="white"/>
                 </v:shape>
               </w:pict>
@@ -2882,12 +2842,12 @@
       </w:tr>
       <w:tr>
         <w:trPr>
-          <w:trHeight w:val="480"/>
+          <w:trHeight w:val="472"/>
           <w:jc w:val="center"/>
         </w:trPr>
         <w:tc>
           <w:tcPr>
-            <w:tcW w:w="1825" w:type="dxa"/>
+            <w:tcW w:w="1799" w:type="dxa"/>
             <w:shd w:val="clear" w:color="auto" w:fill="D9D9D9"/>
             <w:vAlign w:val="center"/>
           </w:tcPr>
@@ -2909,7 +2869,7 @@
         </w:tc>
         <w:tc>
           <w:tcPr>
-            <w:tcW w:w="3184" w:type="dxa"/>
+            <w:tcW w:w="3140" w:type="dxa"/>
             <w:shd w:val="clear" w:color="auto" w:fill="D9D9D9"/>
             <w:vAlign w:val="center"/>
           </w:tcPr>
@@ -2928,7 +2888,7 @@
                 <w:szCs w:val="16"/>
               </w:rPr>
               <w:pict w14:anchorId="0BEE31E8">
-                <v:shape id="_x0000_i1782" type="#_x0000_t75" style="width:25.1pt;height:24.55pt" equationxml="&lt;?xml version=&quot;1.0&quot; encoding=&quot;UTF-8&quot; standalone=&quot;yes&quot;?&gt;&#10;&lt;?mso-application progid=&quot;Word.Document&quot;?&gt;&#10;&lt;w:wordDocument xmlns:aml=&quot;http://schemas.microsoft.com/aml/2001/core&quot; xmlns:wpc=&quot;http://schemas.microsoft.com/office/word/2010/wordprocessingCanvas&quot; xmlns:cx=&quot;http://schemas.microsoft.com/office/drawing/2014/chartex&quot; xmlns:cx1=&quot;http://schemas.microsoft.com/office/drawing/2015/9/8/chartex&quot; xmlns:cx2=&quot;http://schemas.microsoft.com/office/drawing/2015/10/21/chartex&quot; xmlns:cx3=&quot;http://schemas.microsoft.com/office/drawing/2016/5/9/chartex&quot; xmlns:cx4=&quot;http://schemas.microsoft.com/office/drawing/2016/5/10/chartex&quot; xmlns:cx5=&quot;http://schemas.microsoft.com/office/drawing/2016/5/11/chartex&quot; xmlns:cx6=&quot;http://schemas.microsoft.com/office/drawing/2016/5/12/chartex&quot; xmlns:cx7=&quot;http://schemas.microsoft.com/office/drawing/2016/5/13/chartex&quot; xmlns:cx8=&quot;http://schemas.microsoft.com/office/drawing/2016/5/14/chartex&quot; xmlns:cr=&quot;http://schemas.microsoft.com/office/comments/2020/reactions&quot; xmlns:dt=&quot;uuid:C2F41010-65B3-11d1-A29F-00AA00C14882&quot; xmlns:mc=&quot;http://schemas.openxmlformats.org/markup-compatibility/2006&quot; xmlns:aink=&quot;http://schemas.microsoft.com/office/drawing/2016/ink&quot; xmlns:am3d=&quot;http://schemas.microsoft.com/office/drawing/2017/model3d&quot; xmlns:o=&quot;urn:schemas-microsoft-com:office:office&quot; xmlns:oel=&quot;http://schemas.microsoft.com/office/2019/extlst&quot; xmlns:m=&quot;http://schemas.openxmlformats.org/officeDocument/2006/math&quot; xmlns:v=&quot;urn:schemas-microsoft-com:vml&quot; xmlns:w10=&quot;urn:schemas-microsoft-com:office:word&quot; xmlns:w=&quot;http://schemas.microsoft.com/office/word/2003/wordml&quot; xmlns:wx=&quot;http://schemas.microsoft.com/office/word/2003/auxHint&quot; xmlns:wne=&quot;http://schemas.microsoft.com/office/word/2006/wordml&quot; xmlns:wsp=&quot;http://schemas.microsoft.com/office/word/2003/wordml/sp2&quot; xmlns:sl=&quot;http://schemas.microsoft.com/schemaLibrary/2003/core&quot; w:macrosPresent=&quot;no&quot; w:embeddedObjPresent=&quot;no&quot; w:ocxPresent=&quot;no&quot; xml:space=&quot;preserve&quot;&gt;&lt;w:ignoreSubtree w:val=&quot;http://schemas.microsoft.com/office/word/2003/wordml/sp2&quot;/&gt;&lt;o:DocumentProperties&gt;&lt;o:Version&gt;16&lt;/o:Version&gt;&lt;/o:DocumentProperties&gt;&lt;w:docPr&gt;&lt;w:view w:val=&quot;print&quot;/&gt;&lt;w:zoom w:percent=&quot;100&quot;/&gt;&lt;w:doNotEmbedSystemFonts/&gt;&lt;w:activeWritingStyle w:lang=&quot;EN-AU&quot; w:vendorID=&quot;64&quot; w:dllVersion=&quot;6&quot; w:nlCheck=&quot;on&quot; w:optionSet=&quot;1&quot;/&gt;&lt;w:activeWritingStyle w:lang=&quot;EN-GB&quot; w:vendorID=&quot;64&quot; w:dllVersion=&quot;6&quot; w:nlCheck=&quot;on&quot; w:optionSet=&quot;1&quot;/&gt;&lt;w:activeWritingStyle w:lang=&quot;EN-US&quot; w:vendorID=&quot;64&quot; w:dllVersion=&quot;6&quot; w:nlCheck=&quot;on&quot; w:optionSet=&quot;1&quot;/&gt;&lt;w:activeWritingStyle w:lang=&quot;EN-AU&quot; w:vendorID=&quot;64&quot; w:dllVersion=&quot;0&quot; w:nlCheck=&quot;on&quot; w:optionSet=&quot;0&quot;/&gt;&lt;w:activeWritingStyle w:lang=&quot;EN-GB&quot; w:vendorID=&quot;64&quot; w:dllVersion=&quot;0&quot; w:nlCheck=&quot;on&quot; w:optionSet=&quot;0&quot;/&gt;&lt;w:activeWritingStyle w:lang=&quot;EN-US&quot; w:vendorID=&quot;64&quot; w:dllVersion=&quot;0&quot; w:nlCheck=&quot;on&quot; w:optionSet=&quot;0&quot;/&gt;&lt;w:activeWritingStyle w:lang=&quot;ES-AR&quot; w:vendorID=&quot;64&quot; w:dllVersion=&quot;0&quot; w:nlCheck=&quot;on&quot; w:optionSet=&quot;0&quot;/&gt;&lt;w:activeWritingStyle w:lang=&quot;580A&quot; w:vendorID=&quot;64&quot; w:dllVersion=&quot;0&quot; w:nlCheck=&quot;on&quot; w:optionSet=&quot;0&quot;/&gt;&lt;w:activeWritingStyle w:lang=&quot;PT-BR&quot; w:vendorID=&quot;64&quot; w:dllVersion=&quot;0&quot; w:nlCheck=&quot;on&quot; w:optionSet=&quot;0&quot;/&gt;&lt;w:stylePaneFormatFilter w:val=&quot;3F01&quot;/&gt;&lt;w:defaultTabStop w:val=&quot;720&quot;/&gt;&lt;w:hyphenationZone w:val=&quot;425&quot;/&gt;&lt;w:characterSpacingControl w:val=&quot;DontCompress&quot;/&gt;&lt;w:optimizeForBrowser/&gt;&lt;w:validateAgainstSchema/&gt;&lt;w:saveInvalidXML w:val=&quot;off&quot;/&gt;&lt;w:ignoreMixedContent w:val=&quot;off&quot;/&gt;&lt;w:alwaysShowPlaceholderText w:val=&quot;off&quot;/&gt;&lt;w:compat&gt;&lt;w:breakWrappedTables/&gt;&lt;w:snapToGridInCell/&gt;&lt;w:applyBreakingRules/&gt;&lt;w:wrapTextWithPunct/&gt;&lt;w:useAsianBreakRules/&gt;&lt;w:useWord2002TableStyleRules/&gt;&lt;w:useFELayout/&gt;&lt;/w:compat&gt;&lt;wsp:rsids&gt;&lt;wsp:rsidRoot wsp:val=&quot;00426FBB&quot;/&gt;&lt;wsp:rsid wsp:val=&quot;000002E1&quot;/&gt;&lt;wsp:rsid wsp:val=&quot;00003C97&quot;/&gt;&lt;wsp:rsid wsp:val=&quot;00005565&quot;/&gt;&lt;wsp:rsid wsp:val=&quot;0001754A&quot;/&gt;&lt;wsp:rsid wsp:val=&quot;00017719&quot;/&gt;&lt;wsp:rsid wsp:val=&quot;00027F1D&quot;/&gt;&lt;wsp:rsid wsp:val=&quot;0003296C&quot;/&gt;&lt;wsp:rsid wsp:val=&quot;0003351F&quot;/&gt;&lt;wsp:rsid wsp:val=&quot;00044599&quot;/&gt;&lt;wsp:rsid wsp:val=&quot;000540E6&quot;/&gt;&lt;wsp:rsid wsp:val=&quot;00054421&quot;/&gt;&lt;wsp:rsid wsp:val=&quot;00062E46&quot;/&gt;&lt;wsp:rsid wsp:val=&quot;00074AC8&quot;/&gt;&lt;wsp:rsid wsp:val=&quot;00081408&quot;/&gt;&lt;wsp:rsid wsp:val=&quot;00081EBE&quot;/&gt;&lt;wsp:rsid wsp:val=&quot;00086EDC&quot;/&gt;&lt;wsp:rsid wsp:val=&quot;000B1236&quot;/&gt;&lt;wsp:rsid wsp:val=&quot;000B36A3&quot;/&gt;&lt;wsp:rsid wsp:val=&quot;000C013C&quot;/&gt;&lt;wsp:rsid wsp:val=&quot;000E3F84&quot;/&gt;&lt;wsp:rsid wsp:val=&quot;001056DF&quot;/&gt;&lt;wsp:rsid wsp:val=&quot;0010789C&quot;/&gt;&lt;wsp:rsid wsp:val=&quot;00114025&quot;/&gt;&lt;wsp:rsid wsp:val=&quot;001160D2&quot;/&gt;&lt;wsp:rsid wsp:val=&quot;00120636&quot;/&gt;&lt;wsp:rsid wsp:val=&quot;001348A5&quot;/&gt;&lt;wsp:rsid wsp:val=&quot;00141F48&quot;/&gt;&lt;wsp:rsid wsp:val=&quot;00151B8E&quot;/&gt;&lt;wsp:rsid wsp:val=&quot;00182170&quot;/&gt;&lt;wsp:rsid wsp:val=&quot;001928FB&quot;/&gt;&lt;wsp:rsid wsp:val=&quot;00192BC7&quot;/&gt;&lt;wsp:rsid wsp:val=&quot;00195BE6&quot;/&gt;&lt;wsp:rsid wsp:val=&quot;001A3C37&quot;/&gt;&lt;wsp:rsid wsp:val=&quot;001A50EA&quot;/&gt;&lt;wsp:rsid wsp:val=&quot;001F16CD&quot;/&gt;&lt;wsp:rsid wsp:val=&quot;001F47D2&quot;/&gt;&lt;wsp:rsid wsp:val=&quot;002029C8&quot;/&gt;&lt;wsp:rsid wsp:val=&quot;0022285A&quot;/&gt;&lt;wsp:rsid wsp:val=&quot;00224C61&quot;/&gt;&lt;wsp:rsid wsp:val=&quot;00256ABC&quot;/&gt;&lt;wsp:rsid wsp:val=&quot;0027227B&quot;/&gt;&lt;wsp:rsid wsp:val=&quot;00273AC7&quot;/&gt;&lt;wsp:rsid wsp:val=&quot;00273D2C&quot;/&gt;&lt;wsp:rsid wsp:val=&quot;00285ECD&quot;/&gt;&lt;wsp:rsid wsp:val=&quot;00290E1B&quot;/&gt;&lt;wsp:rsid wsp:val=&quot;00291B17&quot;/&gt;&lt;wsp:rsid wsp:val=&quot;00291BB3&quot;/&gt;&lt;wsp:rsid wsp:val=&quot;002A6742&quot;/&gt;&lt;wsp:rsid wsp:val=&quot;002C1A7F&quot;/&gt;&lt;wsp:rsid wsp:val=&quot;002C4239&quot;/&gt;&lt;wsp:rsid wsp:val=&quot;002C559D&quot;/&gt;&lt;wsp:rsid wsp:val=&quot;002D16AE&quot;/&gt;&lt;wsp:rsid wsp:val=&quot;002D2D42&quot;/&gt;&lt;wsp:rsid wsp:val=&quot;002F72D0&quot;/&gt;&lt;wsp:rsid wsp:val=&quot;002F7A4F&quot;/&gt;&lt;wsp:rsid wsp:val=&quot;003003AB&quot;/&gt;&lt;wsp:rsid wsp:val=&quot;00302C35&quot;/&gt;&lt;wsp:rsid wsp:val=&quot;00311C49&quot;/&gt;&lt;wsp:rsid wsp:val=&quot;0032119E&quot;/&gt;&lt;wsp:rsid wsp:val=&quot;00321304&quot;/&gt;&lt;wsp:rsid wsp:val=&quot;00324FC2&quot;/&gt;&lt;wsp:rsid wsp:val=&quot;003312CA&quot;/&gt;&lt;wsp:rsid wsp:val=&quot;00331F84&quot;/&gt;&lt;wsp:rsid wsp:val=&quot;003329D6&quot;/&gt;&lt;wsp:rsid wsp:val=&quot;0037721F&quot;/&gt;&lt;wsp:rsid wsp:val=&quot;003950A4&quot;/&gt;&lt;wsp:rsid wsp:val=&quot;003A1E7E&quot;/&gt;&lt;wsp:rsid wsp:val=&quot;003E2FDC&quot;/&gt;&lt;wsp:rsid wsp:val=&quot;003E3577&quot;/&gt;&lt;wsp:rsid wsp:val=&quot;003F3A61&quot;/&gt;&lt;wsp:rsid wsp:val=&quot;00410A5D&quot;/&gt;&lt;wsp:rsid wsp:val=&quot;00414909&quot;/&gt;&lt;wsp:rsid wsp:val=&quot;00416537&quot;/&gt;&lt;wsp:rsid wsp:val=&quot;00425A6A&quot;/&gt;&lt;wsp:rsid wsp:val=&quot;00426FBB&quot;/&gt;&lt;wsp:rsid wsp:val=&quot;00454542&quot;/&gt;&lt;wsp:rsid wsp:val=&quot;0047429A&quot;/&gt;&lt;wsp:rsid wsp:val=&quot;0048374C&quot;/&gt;&lt;wsp:rsid wsp:val=&quot;0048771D&quot;/&gt;&lt;wsp:rsid wsp:val=&quot;004A6605&quot;/&gt;&lt;wsp:rsid wsp:val=&quot;004C45FA&quot;/&gt;&lt;wsp:rsid wsp:val=&quot;004D35A3&quot;/&gt;&lt;wsp:rsid wsp:val=&quot;004E1BD8&quot;/&gt;&lt;wsp:rsid wsp:val=&quot;004E452A&quot;/&gt;&lt;wsp:rsid wsp:val=&quot;004E78E3&quot;/&gt;&lt;wsp:rsid wsp:val=&quot;004F2BFE&quot;/&gt;&lt;wsp:rsid wsp:val=&quot;004F63D3&quot;/&gt;&lt;wsp:rsid wsp:val=&quot;004F7DCF&quot;/&gt;&lt;wsp:rsid wsp:val=&quot;005004BF&quot;/&gt;&lt;wsp:rsid wsp:val=&quot;00502E89&quot;/&gt;&lt;wsp:rsid wsp:val=&quot;00506CFE&quot;/&gt;&lt;wsp:rsid wsp:val=&quot;00510E95&quot;/&gt;&lt;wsp:rsid wsp:val=&quot;005225C3&quot;/&gt;&lt;wsp:rsid wsp:val=&quot;00527D56&quot;/&gt;&lt;wsp:rsid wsp:val=&quot;0053221F&quot;/&gt;&lt;wsp:rsid wsp:val=&quot;00536FAE&quot;/&gt;&lt;wsp:rsid wsp:val=&quot;00542C85&quot;/&gt;&lt;wsp:rsid wsp:val=&quot;00553510&quot;/&gt;&lt;wsp:rsid wsp:val=&quot;00554186&quot;/&gt;&lt;wsp:rsid wsp:val=&quot;00585769&quot;/&gt;&lt;wsp:rsid wsp:val=&quot;00585C61&quot;/&gt;&lt;wsp:rsid wsp:val=&quot;00591130&quot;/&gt;&lt;wsp:rsid wsp:val=&quot;005A3F28&quot;/&gt;&lt;wsp:rsid wsp:val=&quot;005A40BE&quot;/&gt;&lt;wsp:rsid wsp:val=&quot;005B13E2&quot;/&gt;&lt;wsp:rsid wsp:val=&quot;005B47D7&quot;/&gt;&lt;wsp:rsid wsp:val=&quot;005C5526&quot;/&gt;&lt;wsp:rsid wsp:val=&quot;005C62C6&quot;/&gt;&lt;wsp:rsid wsp:val=&quot;005D7B9E&quot;/&gt;&lt;wsp:rsid wsp:val=&quot;005E112E&quot;/&gt;&lt;wsp:rsid wsp:val=&quot;005F0834&quot;/&gt;&lt;wsp:rsid wsp:val=&quot;005F68AB&quot;/&gt;&lt;wsp:rsid wsp:val=&quot;005F6DC3&quot;/&gt;&lt;wsp:rsid wsp:val=&quot;00601A8E&quot;/&gt;&lt;wsp:rsid wsp:val=&quot;0062033E&quot;/&gt;&lt;wsp:rsid wsp:val=&quot;00624482&quot;/&gt;&lt;wsp:rsid wsp:val=&quot;0064799C&quot;/&gt;&lt;wsp:rsid wsp:val=&quot;00654156&quot;/&gt;&lt;wsp:rsid wsp:val=&quot;00656ADC&quot;/&gt;&lt;wsp:rsid wsp:val=&quot;006B47CA&quot;/&gt;&lt;wsp:rsid wsp:val=&quot;006C304C&quot;/&gt;&lt;wsp:rsid wsp:val=&quot;006C4511&quot;/&gt;&lt;wsp:rsid wsp:val=&quot;006C65F5&quot;/&gt;&lt;wsp:rsid wsp:val=&quot;006C7AAA&quot;/&gt;&lt;wsp:rsid wsp:val=&quot;006D1C2A&quot;/&gt;&lt;wsp:rsid wsp:val=&quot;006D264F&quot;/&gt;&lt;wsp:rsid wsp:val=&quot;006D4E89&quot;/&gt;&lt;wsp:rsid wsp:val=&quot;006E2A8D&quot;/&gt;&lt;wsp:rsid wsp:val=&quot;006E7574&quot;/&gt;&lt;wsp:rsid wsp:val=&quot;00703430&quot;/&gt;&lt;wsp:rsid wsp:val=&quot;00703548&quot;/&gt;&lt;wsp:rsid wsp:val=&quot;00704E18&quot;/&gt;&lt;wsp:rsid wsp:val=&quot;007069BE&quot;/&gt;&lt;wsp:rsid wsp:val=&quot;00745C86&quot;/&gt;&lt;wsp:rsid wsp:val=&quot;00764603&quot;/&gt;&lt;wsp:rsid wsp:val=&quot;0076604D&quot;/&gt;&lt;wsp:rsid wsp:val=&quot;00790909&quot;/&gt;&lt;wsp:rsid wsp:val=&quot;007929AF&quot;/&gt;&lt;wsp:rsid wsp:val=&quot;007B1582&quot;/&gt;&lt;wsp:rsid wsp:val=&quot;007B5A07&quot;/&gt;&lt;wsp:rsid wsp:val=&quot;007C065D&quot;/&gt;&lt;wsp:rsid wsp:val=&quot;007D3E71&quot;/&gt;&lt;wsp:rsid wsp:val=&quot;007E5D6A&quot;/&gt;&lt;wsp:rsid wsp:val=&quot;007E645D&quot;/&gt;&lt;wsp:rsid wsp:val=&quot;007F75CA&quot;/&gt;&lt;wsp:rsid wsp:val=&quot;00821E08&quot;/&gt;&lt;wsp:rsid wsp:val=&quot;00834EFD&quot;/&gt;&lt;wsp:rsid wsp:val=&quot;00844B24&quot;/&gt;&lt;wsp:rsid wsp:val=&quot;0084515F&quot;/&gt;&lt;wsp:rsid wsp:val=&quot;0085092D&quot;/&gt;&lt;wsp:rsid wsp:val=&quot;00865414&quot;/&gt;&lt;wsp:rsid wsp:val=&quot;00877D4C&quot;/&gt;&lt;wsp:rsid wsp:val=&quot;008831DC&quot;/&gt;&lt;wsp:rsid wsp:val=&quot;00883903&quot;/&gt;&lt;wsp:rsid wsp:val=&quot;00891C30&quot;/&gt;&lt;wsp:rsid wsp:val=&quot;00897219&quot;/&gt;&lt;wsp:rsid wsp:val=&quot;0089763B&quot;/&gt;&lt;wsp:rsid wsp:val=&quot;008B6AE3&quot;/&gt;&lt;wsp:rsid wsp:val=&quot;008C1332&quot;/&gt;&lt;wsp:rsid wsp:val=&quot;008D1045&quot;/&gt;&lt;wsp:rsid wsp:val=&quot;008E5996&quot;/&gt;&lt;wsp:rsid wsp:val=&quot;00901AE1&quot;/&gt;&lt;wsp:rsid wsp:val=&quot;00912F93&quot;/&gt;&lt;wsp:rsid wsp:val=&quot;009205B4&quot;/&gt;&lt;wsp:rsid wsp:val=&quot;00955B59&quot;/&gt;&lt;wsp:rsid wsp:val=&quot;00992262&quot;/&gt;&lt;wsp:rsid wsp:val=&quot;009926BC&quot;/&gt;&lt;wsp:rsid wsp:val=&quot;009A4319&quot;/&gt;&lt;wsp:rsid wsp:val=&quot;009A6C3F&quot;/&gt;&lt;wsp:rsid wsp:val=&quot;009B73F2&quot;/&gt;&lt;wsp:rsid wsp:val=&quot;009C12BD&quot;/&gt;&lt;wsp:rsid wsp:val=&quot;009C50FE&quot;/&gt;&lt;wsp:rsid wsp:val=&quot;009E49DD&quot;/&gt;&lt;wsp:rsid wsp:val=&quot;00A03E75&quot;/&gt;&lt;wsp:rsid wsp:val=&quot;00A20627&quot;/&gt;&lt;wsp:rsid wsp:val=&quot;00A22FE9&quot;/&gt;&lt;wsp:rsid wsp:val=&quot;00A31A44&quot;/&gt;&lt;wsp:rsid wsp:val=&quot;00A32BFA&quot;/&gt;&lt;wsp:rsid wsp:val=&quot;00A3325E&quot;/&gt;&lt;wsp:rsid wsp:val=&quot;00A45FCE&quot;/&gt;&lt;wsp:rsid wsp:val=&quot;00A75671&quot;/&gt;&lt;wsp:rsid wsp:val=&quot;00A773CC&quot;/&gt;&lt;wsp:rsid wsp:val=&quot;00A924D0&quot;/&gt;&lt;wsp:rsid wsp:val=&quot;00A9318B&quot;/&gt;&lt;wsp:rsid wsp:val=&quot;00A94AC1&quot;/&gt;&lt;wsp:rsid wsp:val=&quot;00AB18B7&quot;/&gt;&lt;wsp:rsid wsp:val=&quot;00AD335D&quot;/&gt;&lt;wsp:rsid wsp:val=&quot;00AF114C&quot;/&gt;&lt;wsp:rsid wsp:val=&quot;00AF792B&quot;/&gt;&lt;wsp:rsid wsp:val=&quot;00B32137&quot;/&gt;&lt;wsp:rsid wsp:val=&quot;00B33D2F&quot;/&gt;&lt;wsp:rsid wsp:val=&quot;00B40A5B&quot;/&gt;&lt;wsp:rsid wsp:val=&quot;00B45C6B&quot;/&gt;&lt;wsp:rsid wsp:val=&quot;00B55D5E&quot;/&gt;&lt;wsp:rsid wsp:val=&quot;00B57A80&quot;/&gt;&lt;wsp:rsid wsp:val=&quot;00B70E9C&quot;/&gt;&lt;wsp:rsid wsp:val=&quot;00B713D8&quot;/&gt;&lt;wsp:rsid wsp:val=&quot;00B72979&quot;/&gt;&lt;wsp:rsid wsp:val=&quot;00B94516&quot;/&gt;&lt;wsp:rsid wsp:val=&quot;00BA25E2&quot;/&gt;&lt;wsp:rsid wsp:val=&quot;00BB2855&quot;/&gt;&lt;wsp:rsid wsp:val=&quot;00BC5343&quot;/&gt;&lt;wsp:rsid wsp:val=&quot;00BD19C1&quot;/&gt;&lt;wsp:rsid wsp:val=&quot;00BD25B8&quot;/&gt;&lt;wsp:rsid wsp:val=&quot;00C012E1&quot;/&gt;&lt;wsp:rsid wsp:val=&quot;00C06BB4&quot;/&gt;&lt;wsp:rsid wsp:val=&quot;00C10D20&quot;/&gt;&lt;wsp:rsid wsp:val=&quot;00C12E0C&quot;/&gt;&lt;wsp:rsid wsp:val=&quot;00C21916&quot;/&gt;&lt;wsp:rsid wsp:val=&quot;00C34915&quot;/&gt;&lt;wsp:rsid wsp:val=&quot;00C457CA&quot;/&gt;&lt;wsp:rsid wsp:val=&quot;00C53FB6&quot;/&gt;&lt;wsp:rsid wsp:val=&quot;00C57FB7&quot;/&gt;&lt;wsp:rsid wsp:val=&quot;00C644D4&quot;/&gt;&lt;wsp:rsid wsp:val=&quot;00C65F3F&quot;/&gt;&lt;wsp:rsid wsp:val=&quot;00C72414&quot;/&gt;&lt;wsp:rsid wsp:val=&quot;00C72B1A&quot;/&gt;&lt;wsp:rsid wsp:val=&quot;00C8667B&quot;/&gt;&lt;wsp:rsid wsp:val=&quot;00C90993&quot;/&gt;&lt;wsp:rsid wsp:val=&quot;00CA4CE3&quot;/&gt;&lt;wsp:rsid wsp:val=&quot;00CC72FD&quot;/&gt;&lt;wsp:rsid wsp:val=&quot;00CD1D23&quot;/&gt;&lt;wsp:rsid wsp:val=&quot;00CD4F3F&quot;/&gt;&lt;wsp:rsid wsp:val=&quot;00D311F8&quot;/&gt;&lt;wsp:rsid wsp:val=&quot;00D31660&quot;/&gt;&lt;wsp:rsid wsp:val=&quot;00D36B52&quot;/&gt;&lt;wsp:rsid wsp:val=&quot;00D377C8&quot;/&gt;&lt;wsp:rsid wsp:val=&quot;00D41274&quot;/&gt;&lt;wsp:rsid wsp:val=&quot;00D4229C&quot;/&gt;&lt;wsp:rsid wsp:val=&quot;00D43BF3&quot;/&gt;&lt;wsp:rsid wsp:val=&quot;00D549FB&quot;/&gt;&lt;wsp:rsid wsp:val=&quot;00D56487&quot;/&gt;&lt;wsp:rsid wsp:val=&quot;00D767BB&quot;/&gt;&lt;wsp:rsid wsp:val=&quot;00D939B0&quot;/&gt;&lt;wsp:rsid wsp:val=&quot;00DA31A2&quot;/&gt;&lt;wsp:rsid wsp:val=&quot;00DB16E0&quot;/&gt;&lt;wsp:rsid wsp:val=&quot;00DB2DF9&quot;/&gt;&lt;wsp:rsid wsp:val=&quot;00DB465D&quot;/&gt;&lt;wsp:rsid wsp:val=&quot;00DB48A2&quot;/&gt;&lt;wsp:rsid wsp:val=&quot;00DB7E63&quot;/&gt;&lt;wsp:rsid wsp:val=&quot;00DC2055&quot;/&gt;&lt;wsp:rsid wsp:val=&quot;00DC3908&quot;/&gt;&lt;wsp:rsid wsp:val=&quot;00DD71E8&quot;/&gt;&lt;wsp:rsid wsp:val=&quot;00DD7F83&quot;/&gt;&lt;wsp:rsid wsp:val=&quot;00DE4EB8&quot;/&gt;&lt;wsp:rsid wsp:val=&quot;00E0641E&quot;/&gt;&lt;wsp:rsid wsp:val=&quot;00E06664&quot;/&gt;&lt;wsp:rsid wsp:val=&quot;00E304BC&quot;/&gt;&lt;wsp:rsid wsp:val=&quot;00E32853&quot;/&gt;&lt;wsp:rsid wsp:val=&quot;00E34EBD&quot;/&gt;&lt;wsp:rsid wsp:val=&quot;00E401F8&quot;/&gt;&lt;wsp:rsid wsp:val=&quot;00E46425&quot;/&gt;&lt;wsp:rsid wsp:val=&quot;00E469FC&quot;/&gt;&lt;wsp:rsid wsp:val=&quot;00E47D0E&quot;/&gt;&lt;wsp:rsid wsp:val=&quot;00E65018&quot;/&gt;&lt;wsp:rsid wsp:val=&quot;00E76CA1&quot;/&gt;&lt;wsp:rsid wsp:val=&quot;00E94339&quot;/&gt;&lt;wsp:rsid wsp:val=&quot;00E97563&quot;/&gt;&lt;wsp:rsid wsp:val=&quot;00EB0B63&quot;/&gt;&lt;wsp:rsid wsp:val=&quot;00EC265C&quot;/&gt;&lt;wsp:rsid wsp:val=&quot;00ED61CB&quot;/&gt;&lt;wsp:rsid wsp:val=&quot;00EE752A&quot;/&gt;&lt;wsp:rsid wsp:val=&quot;00F06A72&quot;/&gt;&lt;wsp:rsid wsp:val=&quot;00F136F0&quot;/&gt;&lt;wsp:rsid wsp:val=&quot;00F20BBB&quot;/&gt;&lt;wsp:rsid wsp:val=&quot;00F36048&quot;/&gt;&lt;wsp:rsid wsp:val=&quot;00F43BD8&quot;/&gt;&lt;wsp:rsid wsp:val=&quot;00F562F3&quot;/&gt;&lt;wsp:rsid wsp:val=&quot;00F74B89&quot;/&gt;&lt;wsp:rsid wsp:val=&quot;00F75133&quot;/&gt;&lt;wsp:rsid wsp:val=&quot;00F83272&quot;/&gt;&lt;wsp:rsid wsp:val=&quot;00F9358D&quot;/&gt;&lt;wsp:rsid wsp:val=&quot;00F9369B&quot;/&gt;&lt;wsp:rsid wsp:val=&quot;00FA3899&quot;/&gt;&lt;wsp:rsid wsp:val=&quot;00FA4909&quot;/&gt;&lt;wsp:rsid wsp:val=&quot;00FA5164&quot;/&gt;&lt;wsp:rsid wsp:val=&quot;00FA6751&quot;/&gt;&lt;wsp:rsid wsp:val=&quot;00FA6BD7&quot;/&gt;&lt;wsp:rsid wsp:val=&quot;00FB1048&quot;/&gt;&lt;wsp:rsid wsp:val=&quot;00FB62C4&quot;/&gt;&lt;wsp:rsid wsp:val=&quot;00FB7701&quot;/&gt;&lt;wsp:rsid wsp:val=&quot;00FD1AC5&quot;/&gt;&lt;wsp:rsid wsp:val=&quot;00FD5CF0&quot;/&gt;&lt;/wsp:rsids&gt;&lt;/w:docPr&gt;&lt;w:body&gt;&lt;wx:sect&gt;&lt;w:p wsp:rsidR=&quot;00141F48&quot; wsp:rsidRPr=&quot;00141F48&quot; wsp:rsidRDefault=&quot;00141F48&quot; wsp:rsidP=&quot;00141F48&quot;&gt;&lt;m:oMathPara&gt;&lt;m:oMath&gt;&lt;m:r&gt;&lt;w:rPr&gt;&lt;w:rFonts w:ascii=&quot;Cambria Math&quot; w:h-ansi=&quot;Cambria Math&quot;/&gt;&lt;wx:font wx:val=&quot;Cambria Math&quot;/&gt;&lt;w:i/&gt;&lt;/w:rPr&gt;&lt;m:t&gt;T=&lt;/m:t&gt;&lt;/m:r&gt;&lt;m:f&gt;&lt;m:fPr&gt;&lt;m:ctrlPr&gt;&lt;w:rPr&gt;&lt;w:rFonts w:ascii=&quot;Cambria Math&quot; w:h-ansi=&quot;Cambria Math&quot;/&gt;&lt;wx:font wx:val=&quot;Cambria Math&quot;/&gt;&lt;w:i/&gt;&lt;/w:rPr&gt;&lt;/m:ctrlPr&gt;&lt;/m:fPr&gt;&lt;m:num&gt;&lt;m:r&gt;&lt;w:rPr&gt;&lt;w:rFonts w:ascii=&quot;Cambria Math&quot; w:h-ansi=&quot;Cambria Math&quot;/&gt;&lt;wx:font wx:val=&quot;Cambria Math&quot;/&gt;&lt;w:i/&gt;&lt;/w:rPr&gt;&lt;m:t&gt;1&lt;/m:t&gt;&lt;/m:r&gt;&lt;/m:num&gt;&lt;m:den&gt;&lt;m:r&gt;&lt;w:rPr&gt;&lt;w:rFonts w:ascii=&quot;Cambria Math&quot; w:h-ansi=&quot;Cambria Math&quot;/&gt;&lt;wx:font wx:val=&quot;Cambria Math&quot;/&gt;&lt;w:i/&gt;&lt;/w:rPr&gt;&lt;m:t&gt;f&lt;/m:t&gt;&lt;/m:r&gt;&lt;/m:den&gt;&lt;/m:f&gt;&lt;/m:oMath&gt;&lt;/m:oMathPara&gt;&lt;/w:p&gt;&lt;w:sectPr wsp:rsidR=&quot;00000000&quot; wsp:rsidRPr=&quot;00141F48&quot;&gt;&lt;w:pgSz w:w=&quot;12240&quot; w:h=&quot;15840&quot;/&gt;&lt;w:pgMar w:top=&quot;1440&quot; w:right=&quot;1440&quot; w:bottom=&quot;1440&quot; w:left=&quot;1440&quot; w:header=&quot;720&quot; w:footer=&quot;720&quot; w:gutter=&quot;0&quot;/&gt;&lt;w:cols w:space=&quot;720&quot;/&gt;&lt;/w:sectPr&gt;&lt;/wx:sect&gt;&lt;/w:body&gt;&lt;/w:wordDocument&gt;">
+                <v:shape id="_x0000_i1055" type="#_x0000_t75" style="width:24.9pt;height:24.25pt" equationxml="&lt;?xml version=&quot;1.0&quot; encoding=&quot;UTF-8&quot; standalone=&quot;yes&quot;?&gt;&#10;&lt;?mso-application progid=&quot;Word.Document&quot;?&gt;&#10;&lt;w:wordDocument xmlns:aml=&quot;http://schemas.microsoft.com/aml/2001/core&quot; xmlns:wpc=&quot;http://schemas.microsoft.com/office/word/2010/wordprocessingCanvas&quot; xmlns:cx=&quot;http://schemas.microsoft.com/office/drawing/2014/chartex&quot; xmlns:cx1=&quot;http://schemas.microsoft.com/office/drawing/2015/9/8/chartex&quot; xmlns:cx2=&quot;http://schemas.microsoft.com/office/drawing/2015/10/21/chartex&quot; xmlns:cx3=&quot;http://schemas.microsoft.com/office/drawing/2016/5/9/chartex&quot; xmlns:cx4=&quot;http://schemas.microsoft.com/office/drawing/2016/5/10/chartex&quot; xmlns:cx5=&quot;http://schemas.microsoft.com/office/drawing/2016/5/11/chartex&quot; xmlns:cx6=&quot;http://schemas.microsoft.com/office/drawing/2016/5/12/chartex&quot; xmlns:cx7=&quot;http://schemas.microsoft.com/office/drawing/2016/5/13/chartex&quot; xmlns:cx8=&quot;http://schemas.microsoft.com/office/drawing/2016/5/14/chartex&quot; xmlns:cr=&quot;http://schemas.microsoft.com/office/comments/2020/reactions&quot; xmlns:dt=&quot;uuid:C2F41010-65B3-11d1-A29F-00AA00C14882&quot; xmlns:mc=&quot;http://schemas.openxmlformats.org/markup-compatibility/2006&quot; xmlns:aink=&quot;http://schemas.microsoft.com/office/drawing/2016/ink&quot; xmlns:am3d=&quot;http://schemas.microsoft.com/office/drawing/2017/model3d&quot; xmlns:o=&quot;urn:schemas-microsoft-com:office:office&quot; xmlns:oel=&quot;http://schemas.microsoft.com/office/2019/extlst&quot; xmlns:m=&quot;http://schemas.openxmlformats.org/officeDocument/2006/math&quot; xmlns:v=&quot;urn:schemas-microsoft-com:vml&quot; xmlns:w10=&quot;urn:schemas-microsoft-com:office:word&quot; xmlns:w=&quot;http://schemas.microsoft.com/office/word/2003/wordml&quot; xmlns:wx=&quot;http://schemas.microsoft.com/office/word/2003/auxHint&quot; xmlns:wne=&quot;http://schemas.microsoft.com/office/word/2006/wordml&quot; xmlns:wsp=&quot;http://schemas.microsoft.com/office/word/2003/wordml/sp2&quot; xmlns:sl=&quot;http://schemas.microsoft.com/schemaLibrary/2003/core&quot; w:macrosPresent=&quot;no&quot; w:embeddedObjPresent=&quot;no&quot; w:ocxPresent=&quot;no&quot; xml:space=&quot;preserve&quot;&gt;&lt;w:ignoreSubtree w:val=&quot;http://schemas.microsoft.com/office/word/2003/wordml/sp2&quot;/&gt;&lt;o:DocumentProperties&gt;&lt;o:Version&gt;16&lt;/o:Version&gt;&lt;/o:DocumentProperties&gt;&lt;w:docPr&gt;&lt;w:view w:val=&quot;print&quot;/&gt;&lt;w:zoom w:percent=&quot;100&quot;/&gt;&lt;w:doNotEmbedSystemFonts/&gt;&lt;w:activeWritingStyle w:lang=&quot;EN-AU&quot; w:vendorID=&quot;64&quot; w:dllVersion=&quot;6&quot; w:nlCheck=&quot;on&quot; w:optionSet=&quot;1&quot;/&gt;&lt;w:activeWritingStyle w:lang=&quot;EN-GB&quot; w:vendorID=&quot;64&quot; w:dllVersion=&quot;6&quot; w:nlCheck=&quot;on&quot; w:optionSet=&quot;1&quot;/&gt;&lt;w:activeWritingStyle w:lang=&quot;EN-US&quot; w:vendorID=&quot;64&quot; w:dllVersion=&quot;6&quot; w:nlCheck=&quot;on&quot; w:optionSet=&quot;1&quot;/&gt;&lt;w:activeWritingStyle w:lang=&quot;EN-AU&quot; w:vendorID=&quot;64&quot; w:dllVersion=&quot;0&quot; w:nlCheck=&quot;on&quot; w:optionSet=&quot;0&quot;/&gt;&lt;w:activeWritingStyle w:lang=&quot;EN-GB&quot; w:vendorID=&quot;64&quot; w:dllVersion=&quot;0&quot; w:nlCheck=&quot;on&quot; w:optionSet=&quot;0&quot;/&gt;&lt;w:activeWritingStyle w:lang=&quot;EN-US&quot; w:vendorID=&quot;64&quot; w:dllVersion=&quot;0&quot; w:nlCheck=&quot;on&quot; w:optionSet=&quot;0&quot;/&gt;&lt;w:activeWritingStyle w:lang=&quot;ES-AR&quot; w:vendorID=&quot;64&quot; w:dllVersion=&quot;0&quot; w:nlCheck=&quot;on&quot; w:optionSet=&quot;0&quot;/&gt;&lt;w:activeWritingStyle w:lang=&quot;580A&quot; w:vendorID=&quot;64&quot; w:dllVersion=&quot;0&quot; w:nlCheck=&quot;on&quot; w:optionSet=&quot;0&quot;/&gt;&lt;w:activeWritingStyle w:lang=&quot;PT-BR&quot; w:vendorID=&quot;64&quot; w:dllVersion=&quot;0&quot; w:nlCheck=&quot;on&quot; w:optionSet=&quot;0&quot;/&gt;&lt;w:stylePaneFormatFilter w:val=&quot;3F01&quot;/&gt;&lt;w:defaultTabStop w:val=&quot;720&quot;/&gt;&lt;w:hyphenationZone w:val=&quot;425&quot;/&gt;&lt;w:characterSpacingControl w:val=&quot;DontCompress&quot;/&gt;&lt;w:optimizeForBrowser/&gt;&lt;w:validateAgainstSchema/&gt;&lt;w:saveInvalidXML w:val=&quot;off&quot;/&gt;&lt;w:ignoreMixedContent w:val=&quot;off&quot;/&gt;&lt;w:alwaysShowPlaceholderText w:val=&quot;off&quot;/&gt;&lt;w:compat&gt;&lt;w:breakWrappedTables/&gt;&lt;w:snapToGridInCell/&gt;&lt;w:applyBreakingRules/&gt;&lt;w:wrapTextWithPunct/&gt;&lt;w:useAsianBreakRules/&gt;&lt;w:useWord2002TableStyleRules/&gt;&lt;w:useFELayout/&gt;&lt;/w:compat&gt;&lt;wsp:rsids&gt;&lt;wsp:rsidRoot wsp:val=&quot;00426FBB&quot;/&gt;&lt;wsp:rsid wsp:val=&quot;000002E1&quot;/&gt;&lt;wsp:rsid wsp:val=&quot;00003C97&quot;/&gt;&lt;wsp:rsid wsp:val=&quot;00005565&quot;/&gt;&lt;wsp:rsid wsp:val=&quot;0001754A&quot;/&gt;&lt;wsp:rsid wsp:val=&quot;00017719&quot;/&gt;&lt;wsp:rsid wsp:val=&quot;00027F1D&quot;/&gt;&lt;wsp:rsid wsp:val=&quot;0003296C&quot;/&gt;&lt;wsp:rsid wsp:val=&quot;0003351F&quot;/&gt;&lt;wsp:rsid wsp:val=&quot;00044599&quot;/&gt;&lt;wsp:rsid wsp:val=&quot;000540E6&quot;/&gt;&lt;wsp:rsid wsp:val=&quot;00054421&quot;/&gt;&lt;wsp:rsid wsp:val=&quot;00062E46&quot;/&gt;&lt;wsp:rsid wsp:val=&quot;00074AC8&quot;/&gt;&lt;wsp:rsid wsp:val=&quot;00081408&quot;/&gt;&lt;wsp:rsid wsp:val=&quot;00081EBE&quot;/&gt;&lt;wsp:rsid wsp:val=&quot;00086EDC&quot;/&gt;&lt;wsp:rsid wsp:val=&quot;000B1236&quot;/&gt;&lt;wsp:rsid wsp:val=&quot;000B36A3&quot;/&gt;&lt;wsp:rsid wsp:val=&quot;000C013C&quot;/&gt;&lt;wsp:rsid wsp:val=&quot;000E3F84&quot;/&gt;&lt;wsp:rsid wsp:val=&quot;001056DF&quot;/&gt;&lt;wsp:rsid wsp:val=&quot;0010789C&quot;/&gt;&lt;wsp:rsid wsp:val=&quot;00114025&quot;/&gt;&lt;wsp:rsid wsp:val=&quot;001160D2&quot;/&gt;&lt;wsp:rsid wsp:val=&quot;00120636&quot;/&gt;&lt;wsp:rsid wsp:val=&quot;001348A5&quot;/&gt;&lt;wsp:rsid wsp:val=&quot;00141F48&quot;/&gt;&lt;wsp:rsid wsp:val=&quot;00151B8E&quot;/&gt;&lt;wsp:rsid wsp:val=&quot;00182170&quot;/&gt;&lt;wsp:rsid wsp:val=&quot;001928FB&quot;/&gt;&lt;wsp:rsid wsp:val=&quot;00192BC7&quot;/&gt;&lt;wsp:rsid wsp:val=&quot;00195BE6&quot;/&gt;&lt;wsp:rsid wsp:val=&quot;001A3C37&quot;/&gt;&lt;wsp:rsid wsp:val=&quot;001A50EA&quot;/&gt;&lt;wsp:rsid wsp:val=&quot;001F16CD&quot;/&gt;&lt;wsp:rsid wsp:val=&quot;001F47D2&quot;/&gt;&lt;wsp:rsid wsp:val=&quot;002029C8&quot;/&gt;&lt;wsp:rsid wsp:val=&quot;0022285A&quot;/&gt;&lt;wsp:rsid wsp:val=&quot;00224C61&quot;/&gt;&lt;wsp:rsid wsp:val=&quot;00256ABC&quot;/&gt;&lt;wsp:rsid wsp:val=&quot;0027227B&quot;/&gt;&lt;wsp:rsid wsp:val=&quot;00273AC7&quot;/&gt;&lt;wsp:rsid wsp:val=&quot;00273D2C&quot;/&gt;&lt;wsp:rsid wsp:val=&quot;00285ECD&quot;/&gt;&lt;wsp:rsid wsp:val=&quot;00290E1B&quot;/&gt;&lt;wsp:rsid wsp:val=&quot;00291B17&quot;/&gt;&lt;wsp:rsid wsp:val=&quot;00291BB3&quot;/&gt;&lt;wsp:rsid wsp:val=&quot;002A6742&quot;/&gt;&lt;wsp:rsid wsp:val=&quot;002C1A7F&quot;/&gt;&lt;wsp:rsid wsp:val=&quot;002C4239&quot;/&gt;&lt;wsp:rsid wsp:val=&quot;002C559D&quot;/&gt;&lt;wsp:rsid wsp:val=&quot;002D16AE&quot;/&gt;&lt;wsp:rsid wsp:val=&quot;002D2D42&quot;/&gt;&lt;wsp:rsid wsp:val=&quot;002F72D0&quot;/&gt;&lt;wsp:rsid wsp:val=&quot;002F7A4F&quot;/&gt;&lt;wsp:rsid wsp:val=&quot;003003AB&quot;/&gt;&lt;wsp:rsid wsp:val=&quot;00302C35&quot;/&gt;&lt;wsp:rsid wsp:val=&quot;00311C49&quot;/&gt;&lt;wsp:rsid wsp:val=&quot;0032119E&quot;/&gt;&lt;wsp:rsid wsp:val=&quot;00321304&quot;/&gt;&lt;wsp:rsid wsp:val=&quot;00324FC2&quot;/&gt;&lt;wsp:rsid wsp:val=&quot;003312CA&quot;/&gt;&lt;wsp:rsid wsp:val=&quot;00331F84&quot;/&gt;&lt;wsp:rsid wsp:val=&quot;003329D6&quot;/&gt;&lt;wsp:rsid wsp:val=&quot;0037721F&quot;/&gt;&lt;wsp:rsid wsp:val=&quot;003950A4&quot;/&gt;&lt;wsp:rsid wsp:val=&quot;003A1E7E&quot;/&gt;&lt;wsp:rsid wsp:val=&quot;003E2FDC&quot;/&gt;&lt;wsp:rsid wsp:val=&quot;003E3577&quot;/&gt;&lt;wsp:rsid wsp:val=&quot;003F3A61&quot;/&gt;&lt;wsp:rsid wsp:val=&quot;00410A5D&quot;/&gt;&lt;wsp:rsid wsp:val=&quot;00414909&quot;/&gt;&lt;wsp:rsid wsp:val=&quot;00416537&quot;/&gt;&lt;wsp:rsid wsp:val=&quot;00425A6A&quot;/&gt;&lt;wsp:rsid wsp:val=&quot;00426FBB&quot;/&gt;&lt;wsp:rsid wsp:val=&quot;00454542&quot;/&gt;&lt;wsp:rsid wsp:val=&quot;0047429A&quot;/&gt;&lt;wsp:rsid wsp:val=&quot;0048374C&quot;/&gt;&lt;wsp:rsid wsp:val=&quot;0048771D&quot;/&gt;&lt;wsp:rsid wsp:val=&quot;004A6605&quot;/&gt;&lt;wsp:rsid wsp:val=&quot;004C45FA&quot;/&gt;&lt;wsp:rsid wsp:val=&quot;004D35A3&quot;/&gt;&lt;wsp:rsid wsp:val=&quot;004E1BD8&quot;/&gt;&lt;wsp:rsid wsp:val=&quot;004E452A&quot;/&gt;&lt;wsp:rsid wsp:val=&quot;004E78E3&quot;/&gt;&lt;wsp:rsid wsp:val=&quot;004F2BFE&quot;/&gt;&lt;wsp:rsid wsp:val=&quot;004F63D3&quot;/&gt;&lt;wsp:rsid wsp:val=&quot;004F7DCF&quot;/&gt;&lt;wsp:rsid wsp:val=&quot;005004BF&quot;/&gt;&lt;wsp:rsid wsp:val=&quot;00502E89&quot;/&gt;&lt;wsp:rsid wsp:val=&quot;00506CFE&quot;/&gt;&lt;wsp:rsid wsp:val=&quot;00510E95&quot;/&gt;&lt;wsp:rsid wsp:val=&quot;005225C3&quot;/&gt;&lt;wsp:rsid wsp:val=&quot;00527D56&quot;/&gt;&lt;wsp:rsid wsp:val=&quot;0053221F&quot;/&gt;&lt;wsp:rsid wsp:val=&quot;00536FAE&quot;/&gt;&lt;wsp:rsid wsp:val=&quot;00542C85&quot;/&gt;&lt;wsp:rsid wsp:val=&quot;00553510&quot;/&gt;&lt;wsp:rsid wsp:val=&quot;00554186&quot;/&gt;&lt;wsp:rsid wsp:val=&quot;00585769&quot;/&gt;&lt;wsp:rsid wsp:val=&quot;00585C61&quot;/&gt;&lt;wsp:rsid wsp:val=&quot;00591130&quot;/&gt;&lt;wsp:rsid wsp:val=&quot;005A3F28&quot;/&gt;&lt;wsp:rsid wsp:val=&quot;005A40BE&quot;/&gt;&lt;wsp:rsid wsp:val=&quot;005B13E2&quot;/&gt;&lt;wsp:rsid wsp:val=&quot;005B47D7&quot;/&gt;&lt;wsp:rsid wsp:val=&quot;005C5526&quot;/&gt;&lt;wsp:rsid wsp:val=&quot;005C62C6&quot;/&gt;&lt;wsp:rsid wsp:val=&quot;005D7B9E&quot;/&gt;&lt;wsp:rsid wsp:val=&quot;005E112E&quot;/&gt;&lt;wsp:rsid wsp:val=&quot;005F0834&quot;/&gt;&lt;wsp:rsid wsp:val=&quot;005F68AB&quot;/&gt;&lt;wsp:rsid wsp:val=&quot;005F6DC3&quot;/&gt;&lt;wsp:rsid wsp:val=&quot;00601A8E&quot;/&gt;&lt;wsp:rsid wsp:val=&quot;0062033E&quot;/&gt;&lt;wsp:rsid wsp:val=&quot;00624482&quot;/&gt;&lt;wsp:rsid wsp:val=&quot;0064799C&quot;/&gt;&lt;wsp:rsid wsp:val=&quot;00654156&quot;/&gt;&lt;wsp:rsid wsp:val=&quot;00656ADC&quot;/&gt;&lt;wsp:rsid wsp:val=&quot;006B47CA&quot;/&gt;&lt;wsp:rsid wsp:val=&quot;006C304C&quot;/&gt;&lt;wsp:rsid wsp:val=&quot;006C4511&quot;/&gt;&lt;wsp:rsid wsp:val=&quot;006C65F5&quot;/&gt;&lt;wsp:rsid wsp:val=&quot;006C7AAA&quot;/&gt;&lt;wsp:rsid wsp:val=&quot;006D1C2A&quot;/&gt;&lt;wsp:rsid wsp:val=&quot;006D264F&quot;/&gt;&lt;wsp:rsid wsp:val=&quot;006D4E89&quot;/&gt;&lt;wsp:rsid wsp:val=&quot;006E2A8D&quot;/&gt;&lt;wsp:rsid wsp:val=&quot;006E7574&quot;/&gt;&lt;wsp:rsid wsp:val=&quot;00703430&quot;/&gt;&lt;wsp:rsid wsp:val=&quot;00703548&quot;/&gt;&lt;wsp:rsid wsp:val=&quot;00704E18&quot;/&gt;&lt;wsp:rsid wsp:val=&quot;007069BE&quot;/&gt;&lt;wsp:rsid wsp:val=&quot;00745C86&quot;/&gt;&lt;wsp:rsid wsp:val=&quot;00764603&quot;/&gt;&lt;wsp:rsid wsp:val=&quot;0076604D&quot;/&gt;&lt;wsp:rsid wsp:val=&quot;00790909&quot;/&gt;&lt;wsp:rsid wsp:val=&quot;007929AF&quot;/&gt;&lt;wsp:rsid wsp:val=&quot;007B1582&quot;/&gt;&lt;wsp:rsid wsp:val=&quot;007B5A07&quot;/&gt;&lt;wsp:rsid wsp:val=&quot;007C065D&quot;/&gt;&lt;wsp:rsid wsp:val=&quot;007D3E71&quot;/&gt;&lt;wsp:rsid wsp:val=&quot;007E5D6A&quot;/&gt;&lt;wsp:rsid wsp:val=&quot;007E645D&quot;/&gt;&lt;wsp:rsid wsp:val=&quot;007F75CA&quot;/&gt;&lt;wsp:rsid wsp:val=&quot;00821E08&quot;/&gt;&lt;wsp:rsid wsp:val=&quot;00834EFD&quot;/&gt;&lt;wsp:rsid wsp:val=&quot;00844B24&quot;/&gt;&lt;wsp:rsid wsp:val=&quot;0084515F&quot;/&gt;&lt;wsp:rsid wsp:val=&quot;0085092D&quot;/&gt;&lt;wsp:rsid wsp:val=&quot;00865414&quot;/&gt;&lt;wsp:rsid wsp:val=&quot;00877D4C&quot;/&gt;&lt;wsp:rsid wsp:val=&quot;008831DC&quot;/&gt;&lt;wsp:rsid wsp:val=&quot;00883903&quot;/&gt;&lt;wsp:rsid wsp:val=&quot;00891C30&quot;/&gt;&lt;wsp:rsid wsp:val=&quot;00897219&quot;/&gt;&lt;wsp:rsid wsp:val=&quot;0089763B&quot;/&gt;&lt;wsp:rsid wsp:val=&quot;008B6AE3&quot;/&gt;&lt;wsp:rsid wsp:val=&quot;008C1332&quot;/&gt;&lt;wsp:rsid wsp:val=&quot;008D1045&quot;/&gt;&lt;wsp:rsid wsp:val=&quot;008E5996&quot;/&gt;&lt;wsp:rsid wsp:val=&quot;00901AE1&quot;/&gt;&lt;wsp:rsid wsp:val=&quot;00912F93&quot;/&gt;&lt;wsp:rsid wsp:val=&quot;009205B4&quot;/&gt;&lt;wsp:rsid wsp:val=&quot;00955B59&quot;/&gt;&lt;wsp:rsid wsp:val=&quot;00992262&quot;/&gt;&lt;wsp:rsid wsp:val=&quot;009926BC&quot;/&gt;&lt;wsp:rsid wsp:val=&quot;009A4319&quot;/&gt;&lt;wsp:rsid wsp:val=&quot;009A6C3F&quot;/&gt;&lt;wsp:rsid wsp:val=&quot;009B73F2&quot;/&gt;&lt;wsp:rsid wsp:val=&quot;009C12BD&quot;/&gt;&lt;wsp:rsid wsp:val=&quot;009C50FE&quot;/&gt;&lt;wsp:rsid wsp:val=&quot;009E49DD&quot;/&gt;&lt;wsp:rsid wsp:val=&quot;00A03E75&quot;/&gt;&lt;wsp:rsid wsp:val=&quot;00A20627&quot;/&gt;&lt;wsp:rsid wsp:val=&quot;00A22FE9&quot;/&gt;&lt;wsp:rsid wsp:val=&quot;00A31A44&quot;/&gt;&lt;wsp:rsid wsp:val=&quot;00A32BFA&quot;/&gt;&lt;wsp:rsid wsp:val=&quot;00A3325E&quot;/&gt;&lt;wsp:rsid wsp:val=&quot;00A45FCE&quot;/&gt;&lt;wsp:rsid wsp:val=&quot;00A75671&quot;/&gt;&lt;wsp:rsid wsp:val=&quot;00A773CC&quot;/&gt;&lt;wsp:rsid wsp:val=&quot;00A924D0&quot;/&gt;&lt;wsp:rsid wsp:val=&quot;00A9318B&quot;/&gt;&lt;wsp:rsid wsp:val=&quot;00A94AC1&quot;/&gt;&lt;wsp:rsid wsp:val=&quot;00AB18B7&quot;/&gt;&lt;wsp:rsid wsp:val=&quot;00AD335D&quot;/&gt;&lt;wsp:rsid wsp:val=&quot;00AF114C&quot;/&gt;&lt;wsp:rsid wsp:val=&quot;00AF792B&quot;/&gt;&lt;wsp:rsid wsp:val=&quot;00B32137&quot;/&gt;&lt;wsp:rsid wsp:val=&quot;00B33D2F&quot;/&gt;&lt;wsp:rsid wsp:val=&quot;00B40A5B&quot;/&gt;&lt;wsp:rsid wsp:val=&quot;00B45C6B&quot;/&gt;&lt;wsp:rsid wsp:val=&quot;00B55D5E&quot;/&gt;&lt;wsp:rsid wsp:val=&quot;00B57A80&quot;/&gt;&lt;wsp:rsid wsp:val=&quot;00B70E9C&quot;/&gt;&lt;wsp:rsid wsp:val=&quot;00B713D8&quot;/&gt;&lt;wsp:rsid wsp:val=&quot;00B72979&quot;/&gt;&lt;wsp:rsid wsp:val=&quot;00B94516&quot;/&gt;&lt;wsp:rsid wsp:val=&quot;00BA25E2&quot;/&gt;&lt;wsp:rsid wsp:val=&quot;00BB2855&quot;/&gt;&lt;wsp:rsid wsp:val=&quot;00BC5343&quot;/&gt;&lt;wsp:rsid wsp:val=&quot;00BD19C1&quot;/&gt;&lt;wsp:rsid wsp:val=&quot;00BD25B8&quot;/&gt;&lt;wsp:rsid wsp:val=&quot;00C012E1&quot;/&gt;&lt;wsp:rsid wsp:val=&quot;00C06BB4&quot;/&gt;&lt;wsp:rsid wsp:val=&quot;00C10D20&quot;/&gt;&lt;wsp:rsid wsp:val=&quot;00C12E0C&quot;/&gt;&lt;wsp:rsid wsp:val=&quot;00C21916&quot;/&gt;&lt;wsp:rsid wsp:val=&quot;00C34915&quot;/&gt;&lt;wsp:rsid wsp:val=&quot;00C457CA&quot;/&gt;&lt;wsp:rsid wsp:val=&quot;00C53FB6&quot;/&gt;&lt;wsp:rsid wsp:val=&quot;00C57FB7&quot;/&gt;&lt;wsp:rsid wsp:val=&quot;00C644D4&quot;/&gt;&lt;wsp:rsid wsp:val=&quot;00C65F3F&quot;/&gt;&lt;wsp:rsid wsp:val=&quot;00C72414&quot;/&gt;&lt;wsp:rsid wsp:val=&quot;00C72B1A&quot;/&gt;&lt;wsp:rsid wsp:val=&quot;00C8667B&quot;/&gt;&lt;wsp:rsid wsp:val=&quot;00C90993&quot;/&gt;&lt;wsp:rsid wsp:val=&quot;00CA4CE3&quot;/&gt;&lt;wsp:rsid wsp:val=&quot;00CC72FD&quot;/&gt;&lt;wsp:rsid wsp:val=&quot;00CD1D23&quot;/&gt;&lt;wsp:rsid wsp:val=&quot;00CD4F3F&quot;/&gt;&lt;wsp:rsid wsp:val=&quot;00D311F8&quot;/&gt;&lt;wsp:rsid wsp:val=&quot;00D31660&quot;/&gt;&lt;wsp:rsid wsp:val=&quot;00D36B52&quot;/&gt;&lt;wsp:rsid wsp:val=&quot;00D377C8&quot;/&gt;&lt;wsp:rsid wsp:val=&quot;00D41274&quot;/&gt;&lt;wsp:rsid wsp:val=&quot;00D4229C&quot;/&gt;&lt;wsp:rsid wsp:val=&quot;00D43BF3&quot;/&gt;&lt;wsp:rsid wsp:val=&quot;00D549FB&quot;/&gt;&lt;wsp:rsid wsp:val=&quot;00D56487&quot;/&gt;&lt;wsp:rsid wsp:val=&quot;00D767BB&quot;/&gt;&lt;wsp:rsid wsp:val=&quot;00D939B0&quot;/&gt;&lt;wsp:rsid wsp:val=&quot;00DA31A2&quot;/&gt;&lt;wsp:rsid wsp:val=&quot;00DB16E0&quot;/&gt;&lt;wsp:rsid wsp:val=&quot;00DB2DF9&quot;/&gt;&lt;wsp:rsid wsp:val=&quot;00DB465D&quot;/&gt;&lt;wsp:rsid wsp:val=&quot;00DB48A2&quot;/&gt;&lt;wsp:rsid wsp:val=&quot;00DB7E63&quot;/&gt;&lt;wsp:rsid wsp:val=&quot;00DC2055&quot;/&gt;&lt;wsp:rsid wsp:val=&quot;00DC3908&quot;/&gt;&lt;wsp:rsid wsp:val=&quot;00DD71E8&quot;/&gt;&lt;wsp:rsid wsp:val=&quot;00DD7F83&quot;/&gt;&lt;wsp:rsid wsp:val=&quot;00DE4EB8&quot;/&gt;&lt;wsp:rsid wsp:val=&quot;00E0641E&quot;/&gt;&lt;wsp:rsid wsp:val=&quot;00E06664&quot;/&gt;&lt;wsp:rsid wsp:val=&quot;00E304BC&quot;/&gt;&lt;wsp:rsid wsp:val=&quot;00E32853&quot;/&gt;&lt;wsp:rsid wsp:val=&quot;00E34EBD&quot;/&gt;&lt;wsp:rsid wsp:val=&quot;00E401F8&quot;/&gt;&lt;wsp:rsid wsp:val=&quot;00E46425&quot;/&gt;&lt;wsp:rsid wsp:val=&quot;00E469FC&quot;/&gt;&lt;wsp:rsid wsp:val=&quot;00E47D0E&quot;/&gt;&lt;wsp:rsid wsp:val=&quot;00E65018&quot;/&gt;&lt;wsp:rsid wsp:val=&quot;00E76CA1&quot;/&gt;&lt;wsp:rsid wsp:val=&quot;00E94339&quot;/&gt;&lt;wsp:rsid wsp:val=&quot;00E97563&quot;/&gt;&lt;wsp:rsid wsp:val=&quot;00EB0B63&quot;/&gt;&lt;wsp:rsid wsp:val=&quot;00EC265C&quot;/&gt;&lt;wsp:rsid wsp:val=&quot;00ED61CB&quot;/&gt;&lt;wsp:rsid wsp:val=&quot;00EE752A&quot;/&gt;&lt;wsp:rsid wsp:val=&quot;00F06A72&quot;/&gt;&lt;wsp:rsid wsp:val=&quot;00F136F0&quot;/&gt;&lt;wsp:rsid wsp:val=&quot;00F20BBB&quot;/&gt;&lt;wsp:rsid wsp:val=&quot;00F36048&quot;/&gt;&lt;wsp:rsid wsp:val=&quot;00F43BD8&quot;/&gt;&lt;wsp:rsid wsp:val=&quot;00F562F3&quot;/&gt;&lt;wsp:rsid wsp:val=&quot;00F74B89&quot;/&gt;&lt;wsp:rsid wsp:val=&quot;00F75133&quot;/&gt;&lt;wsp:rsid wsp:val=&quot;00F83272&quot;/&gt;&lt;wsp:rsid wsp:val=&quot;00F9358D&quot;/&gt;&lt;wsp:rsid wsp:val=&quot;00F9369B&quot;/&gt;&lt;wsp:rsid wsp:val=&quot;00FA3899&quot;/&gt;&lt;wsp:rsid wsp:val=&quot;00FA4909&quot;/&gt;&lt;wsp:rsid wsp:val=&quot;00FA5164&quot;/&gt;&lt;wsp:rsid wsp:val=&quot;00FA6751&quot;/&gt;&lt;wsp:rsid wsp:val=&quot;00FA6BD7&quot;/&gt;&lt;wsp:rsid wsp:val=&quot;00FB1048&quot;/&gt;&lt;wsp:rsid wsp:val=&quot;00FB62C4&quot;/&gt;&lt;wsp:rsid wsp:val=&quot;00FB7701&quot;/&gt;&lt;wsp:rsid wsp:val=&quot;00FD1AC5&quot;/&gt;&lt;wsp:rsid wsp:val=&quot;00FD5CF0&quot;/&gt;&lt;/wsp:rsids&gt;&lt;/w:docPr&gt;&lt;w:body&gt;&lt;wx:sect&gt;&lt;w:p wsp:rsidR=&quot;00141F48&quot; wsp:rsidRPr=&quot;00141F48&quot; wsp:rsidRDefault=&quot;00141F48&quot; wsp:rsidP=&quot;00141F48&quot;&gt;&lt;m:oMathPara&gt;&lt;m:oMath&gt;&lt;m:r&gt;&lt;w:rPr&gt;&lt;w:rFonts w:ascii=&quot;Cambria Math&quot; w:h-ansi=&quot;Cambria Math&quot;/&gt;&lt;wx:font wx:val=&quot;Cambria Math&quot;/&gt;&lt;w:i/&gt;&lt;/w:rPr&gt;&lt;m:t&gt;T=&lt;/m:t&gt;&lt;/m:r&gt;&lt;m:f&gt;&lt;m:fPr&gt;&lt;m:ctrlPr&gt;&lt;w:rPr&gt;&lt;w:rFonts w:ascii=&quot;Cambria Math&quot; w:h-ansi=&quot;Cambria Math&quot;/&gt;&lt;wx:font wx:val=&quot;Cambria Math&quot;/&gt;&lt;w:i/&gt;&lt;/w:rPr&gt;&lt;/m:ctrlPr&gt;&lt;/m:fPr&gt;&lt;m:num&gt;&lt;m:r&gt;&lt;w:rPr&gt;&lt;w:rFonts w:ascii=&quot;Cambria Math&quot; w:h-ansi=&quot;Cambria Math&quot;/&gt;&lt;wx:font wx:val=&quot;Cambria Math&quot;/&gt;&lt;w:i/&gt;&lt;/w:rPr&gt;&lt;m:t&gt;1&lt;/m:t&gt;&lt;/m:r&gt;&lt;/m:num&gt;&lt;m:den&gt;&lt;m:r&gt;&lt;w:rPr&gt;&lt;w:rFonts w:ascii=&quot;Cambria Math&quot; w:h-ansi=&quot;Cambria Math&quot;/&gt;&lt;wx:font wx:val=&quot;Cambria Math&quot;/&gt;&lt;w:i/&gt;&lt;/w:rPr&gt;&lt;m:t&gt;f&lt;/m:t&gt;&lt;/m:r&gt;&lt;/m:den&gt;&lt;/m:f&gt;&lt;/m:oMath&gt;&lt;/m:oMathPara&gt;&lt;/w:p&gt;&lt;w:sectPr wsp:rsidR=&quot;00000000&quot; wsp:rsidRPr=&quot;00141F48&quot;&gt;&lt;w:pgSz w:w=&quot;12240&quot; w:h=&quot;15840&quot;/&gt;&lt;w:pgMar w:top=&quot;1440&quot; w:right=&quot;1440&quot; w:bottom=&quot;1440&quot; w:left=&quot;1440&quot; w:header=&quot;720&quot; w:footer=&quot;720&quot; w:gutter=&quot;0&quot;/&gt;&lt;w:cols w:space=&quot;720&quot;/&gt;&lt;/w:sectPr&gt;&lt;/wx:sect&gt;&lt;/w:body&gt;&lt;/w:wordDocument&gt;">
                   <v:imagedata r:id="rId24" o:title="" chromakey="white"/>
                 </v:shape>
               </w:pict>
@@ -2938,12 +2898,12 @@
       </w:tr>
       <w:tr>
         <w:trPr>
-          <w:trHeight w:val="714"/>
+          <w:trHeight w:val="702"/>
           <w:jc w:val="center"/>
         </w:trPr>
         <w:tc>
           <w:tcPr>
-            <w:tcW w:w="1825" w:type="dxa"/>
+            <w:tcW w:w="1799" w:type="dxa"/>
             <w:shd w:val="clear" w:color="auto" w:fill="auto"/>
             <w:vAlign w:val="center"/>
           </w:tcPr>
@@ -2965,7 +2925,7 @@
         </w:tc>
         <w:tc>
           <w:tcPr>
-            <w:tcW w:w="3184" w:type="dxa"/>
+            <w:tcW w:w="3140" w:type="dxa"/>
             <w:shd w:val="clear" w:color="auto" w:fill="auto"/>
             <w:vAlign w:val="center"/>
           </w:tcPr>
@@ -2983,7 +2943,7 @@
                 <w:szCs w:val="16"/>
               </w:rPr>
               <w:pict w14:anchorId="2BB06158">
-                <v:shape id="_x0000_i1783" type="#_x0000_t75" style="width:62.2pt;height:33.25pt" equationxml="&lt;?xml version=&quot;1.0&quot; encoding=&quot;UTF-8&quot; standalone=&quot;yes&quot;?&gt;&#10;&lt;?mso-application progid=&quot;Word.Document&quot;?&gt;&#10;&lt;w:wordDocument xmlns:aml=&quot;http://schemas.microsoft.com/aml/2001/core&quot; xmlns:wpc=&quot;http://schemas.microsoft.com/office/word/2010/wordprocessingCanvas&quot; xmlns:cx=&quot;http://schemas.microsoft.com/office/drawing/2014/chartex&quot; xmlns:cx1=&quot;http://schemas.microsoft.com/office/drawing/2015/9/8/chartex&quot; xmlns:cx2=&quot;http://schemas.microsoft.com/office/drawing/2015/10/21/chartex&quot; xmlns:cx3=&quot;http://schemas.microsoft.com/office/drawing/2016/5/9/chartex&quot; xmlns:cx4=&quot;http://schemas.microsoft.com/office/drawing/2016/5/10/chartex&quot; xmlns:cx5=&quot;http://schemas.microsoft.com/office/drawing/2016/5/11/chartex&quot; xmlns:cx6=&quot;http://schemas.microsoft.com/office/drawing/2016/5/12/chartex&quot; xmlns:cx7=&quot;http://schemas.microsoft.com/office/drawing/2016/5/13/chartex&quot; xmlns:cx8=&quot;http://schemas.microsoft.com/office/drawing/2016/5/14/chartex&quot; xmlns:cr=&quot;http://schemas.microsoft.com/office/comments/2020/reactions&quot; xmlns:dt=&quot;uuid:C2F41010-65B3-11d1-A29F-00AA00C14882&quot; xmlns:mc=&quot;http://schemas.openxmlformats.org/markup-compatibility/2006&quot; xmlns:aink=&quot;http://schemas.microsoft.com/office/drawing/2016/ink&quot; xmlns:am3d=&quot;http://schemas.microsoft.com/office/drawing/2017/model3d&quot; xmlns:o=&quot;urn:schemas-microsoft-com:office:office&quot; xmlns:oel=&quot;http://schemas.microsoft.com/office/2019/extlst&quot; xmlns:m=&quot;http://schemas.openxmlformats.org/officeDocument/2006/math&quot; xmlns:v=&quot;urn:schemas-microsoft-com:vml&quot; xmlns:w10=&quot;urn:schemas-microsoft-com:office:word&quot; xmlns:w=&quot;http://schemas.microsoft.com/office/word/2003/wordml&quot; xmlns:wx=&quot;http://schemas.microsoft.com/office/word/2003/auxHint&quot; xmlns:wne=&quot;http://schemas.microsoft.com/office/word/2006/wordml&quot; xmlns:wsp=&quot;http://schemas.microsoft.com/office/word/2003/wordml/sp2&quot; xmlns:sl=&quot;http://schemas.microsoft.com/schemaLibrary/2003/core&quot; w:macrosPresent=&quot;no&quot; w:embeddedObjPresent=&quot;no&quot; w:ocxPresent=&quot;no&quot; xml:space=&quot;preserve&quot;&gt;&lt;w:ignoreSubtree w:val=&quot;http://schemas.microsoft.com/office/word/2003/wordml/sp2&quot;/&gt;&lt;o:DocumentProperties&gt;&lt;o:Version&gt;16&lt;/o:Version&gt;&lt;/o:DocumentProperties&gt;&lt;w:docPr&gt;&lt;w:view w:val=&quot;print&quot;/&gt;&lt;w:zoom w:percent=&quot;100&quot;/&gt;&lt;w:doNotEmbedSystemFonts/&gt;&lt;w:activeWritingStyle w:lang=&quot;EN-AU&quot; w:vendorID=&quot;64&quot; w:dllVersion=&quot;6&quot; w:nlCheck=&quot;on&quot; w:optionSet=&quot;1&quot;/&gt;&lt;w:activeWritingStyle w:lang=&quot;EN-GB&quot; w:vendorID=&quot;64&quot; w:dllVersion=&quot;6&quot; w:nlCheck=&quot;on&quot; w:optionSet=&quot;1&quot;/&gt;&lt;w:activeWritingStyle w:lang=&quot;EN-US&quot; w:vendorID=&quot;64&quot; w:dllVersion=&quot;6&quot; w:nlCheck=&quot;on&quot; w:optionSet=&quot;1&quot;/&gt;&lt;w:activeWritingStyle w:lang=&quot;EN-AU&quot; w:vendorID=&quot;64&quot; w:dllVersion=&quot;0&quot; w:nlCheck=&quot;on&quot; w:optionSet=&quot;0&quot;/&gt;&lt;w:activeWritingStyle w:lang=&quot;EN-GB&quot; w:vendorID=&quot;64&quot; w:dllVersion=&quot;0&quot; w:nlCheck=&quot;on&quot; w:optionSet=&quot;0&quot;/&gt;&lt;w:activeWritingStyle w:lang=&quot;EN-US&quot; w:vendorID=&quot;64&quot; w:dllVersion=&quot;0&quot; w:nlCheck=&quot;on&quot; w:optionSet=&quot;0&quot;/&gt;&lt;w:activeWritingStyle w:lang=&quot;ES-AR&quot; w:vendorID=&quot;64&quot; w:dllVersion=&quot;0&quot; w:nlCheck=&quot;on&quot; w:optionSet=&quot;0&quot;/&gt;&lt;w:activeWritingStyle w:lang=&quot;580A&quot; w:vendorID=&quot;64&quot; w:dllVersion=&quot;0&quot; w:nlCheck=&quot;on&quot; w:optionSet=&quot;0&quot;/&gt;&lt;w:activeWritingStyle w:lang=&quot;PT-BR&quot; w:vendorID=&quot;64&quot; w:dllVersion=&quot;0&quot; w:nlCheck=&quot;on&quot; w:optionSet=&quot;0&quot;/&gt;&lt;w:stylePaneFormatFilter w:val=&quot;3F01&quot;/&gt;&lt;w:defaultTabStop w:val=&quot;720&quot;/&gt;&lt;w:hyphenationZone w:val=&quot;425&quot;/&gt;&lt;w:characterSpacingControl w:val=&quot;DontCompress&quot;/&gt;&lt;w:optimizeForBrowser/&gt;&lt;w:validateAgainstSchema/&gt;&lt;w:saveInvalidXML w:val=&quot;off&quot;/&gt;&lt;w:ignoreMixedContent w:val=&quot;off&quot;/&gt;&lt;w:alwaysShowPlaceholderText w:val=&quot;off&quot;/&gt;&lt;w:compat&gt;&lt;w:breakWrappedTables/&gt;&lt;w:snapToGridInCell/&gt;&lt;w:applyBreakingRules/&gt;&lt;w:wrapTextWithPunct/&gt;&lt;w:useAsianBreakRules/&gt;&lt;w:useWord2002TableStyleRules/&gt;&lt;w:useFELayout/&gt;&lt;/w:compat&gt;&lt;wsp:rsids&gt;&lt;wsp:rsidRoot wsp:val=&quot;00426FBB&quot;/&gt;&lt;wsp:rsid wsp:val=&quot;000002E1&quot;/&gt;&lt;wsp:rsid wsp:val=&quot;00003C97&quot;/&gt;&lt;wsp:rsid wsp:val=&quot;00005565&quot;/&gt;&lt;wsp:rsid wsp:val=&quot;0001754A&quot;/&gt;&lt;wsp:rsid wsp:val=&quot;00017719&quot;/&gt;&lt;wsp:rsid wsp:val=&quot;00027F1D&quot;/&gt;&lt;wsp:rsid wsp:val=&quot;0003296C&quot;/&gt;&lt;wsp:rsid wsp:val=&quot;0003351F&quot;/&gt;&lt;wsp:rsid wsp:val=&quot;00044599&quot;/&gt;&lt;wsp:rsid wsp:val=&quot;000540E6&quot;/&gt;&lt;wsp:rsid wsp:val=&quot;00054421&quot;/&gt;&lt;wsp:rsid wsp:val=&quot;00062E46&quot;/&gt;&lt;wsp:rsid wsp:val=&quot;00074AC8&quot;/&gt;&lt;wsp:rsid wsp:val=&quot;00081408&quot;/&gt;&lt;wsp:rsid wsp:val=&quot;00081EBE&quot;/&gt;&lt;wsp:rsid wsp:val=&quot;00086EDC&quot;/&gt;&lt;wsp:rsid wsp:val=&quot;000B1236&quot;/&gt;&lt;wsp:rsid wsp:val=&quot;000B36A3&quot;/&gt;&lt;wsp:rsid wsp:val=&quot;000C013C&quot;/&gt;&lt;wsp:rsid wsp:val=&quot;000E3F84&quot;/&gt;&lt;wsp:rsid wsp:val=&quot;001056DF&quot;/&gt;&lt;wsp:rsid wsp:val=&quot;0010789C&quot;/&gt;&lt;wsp:rsid wsp:val=&quot;00114025&quot;/&gt;&lt;wsp:rsid wsp:val=&quot;001160D2&quot;/&gt;&lt;wsp:rsid wsp:val=&quot;00120636&quot;/&gt;&lt;wsp:rsid wsp:val=&quot;001348A5&quot;/&gt;&lt;wsp:rsid wsp:val=&quot;00151B8E&quot;/&gt;&lt;wsp:rsid wsp:val=&quot;00182170&quot;/&gt;&lt;wsp:rsid wsp:val=&quot;001928FB&quot;/&gt;&lt;wsp:rsid wsp:val=&quot;00192BC7&quot;/&gt;&lt;wsp:rsid wsp:val=&quot;00195BE6&quot;/&gt;&lt;wsp:rsid wsp:val=&quot;001A3C37&quot;/&gt;&lt;wsp:rsid wsp:val=&quot;001A50EA&quot;/&gt;&lt;wsp:rsid wsp:val=&quot;001F16CD&quot;/&gt;&lt;wsp:rsid wsp:val=&quot;001F47D2&quot;/&gt;&lt;wsp:rsid wsp:val=&quot;002029C8&quot;/&gt;&lt;wsp:rsid wsp:val=&quot;0022285A&quot;/&gt;&lt;wsp:rsid wsp:val=&quot;00224C61&quot;/&gt;&lt;wsp:rsid wsp:val=&quot;00240CBB&quot;/&gt;&lt;wsp:rsid wsp:val=&quot;00256ABC&quot;/&gt;&lt;wsp:rsid wsp:val=&quot;0027227B&quot;/&gt;&lt;wsp:rsid wsp:val=&quot;00273AC7&quot;/&gt;&lt;wsp:rsid wsp:val=&quot;00273D2C&quot;/&gt;&lt;wsp:rsid wsp:val=&quot;00285ECD&quot;/&gt;&lt;wsp:rsid wsp:val=&quot;00290E1B&quot;/&gt;&lt;wsp:rsid wsp:val=&quot;00291B17&quot;/&gt;&lt;wsp:rsid wsp:val=&quot;00291BB3&quot;/&gt;&lt;wsp:rsid wsp:val=&quot;002A6742&quot;/&gt;&lt;wsp:rsid wsp:val=&quot;002C1A7F&quot;/&gt;&lt;wsp:rsid wsp:val=&quot;002C4239&quot;/&gt;&lt;wsp:rsid wsp:val=&quot;002C559D&quot;/&gt;&lt;wsp:rsid wsp:val=&quot;002D16AE&quot;/&gt;&lt;wsp:rsid wsp:val=&quot;002D2D42&quot;/&gt;&lt;wsp:rsid wsp:val=&quot;002F72D0&quot;/&gt;&lt;wsp:rsid wsp:val=&quot;002F7A4F&quot;/&gt;&lt;wsp:rsid wsp:val=&quot;003003AB&quot;/&gt;&lt;wsp:rsid wsp:val=&quot;00302C35&quot;/&gt;&lt;wsp:rsid wsp:val=&quot;00311C49&quot;/&gt;&lt;wsp:rsid wsp:val=&quot;0032119E&quot;/&gt;&lt;wsp:rsid wsp:val=&quot;00321304&quot;/&gt;&lt;wsp:rsid wsp:val=&quot;00324FC2&quot;/&gt;&lt;wsp:rsid wsp:val=&quot;003312CA&quot;/&gt;&lt;wsp:rsid wsp:val=&quot;00331F84&quot;/&gt;&lt;wsp:rsid wsp:val=&quot;003329D6&quot;/&gt;&lt;wsp:rsid wsp:val=&quot;0037721F&quot;/&gt;&lt;wsp:rsid wsp:val=&quot;003950A4&quot;/&gt;&lt;wsp:rsid wsp:val=&quot;003A1E7E&quot;/&gt;&lt;wsp:rsid wsp:val=&quot;003E2FDC&quot;/&gt;&lt;wsp:rsid wsp:val=&quot;003E3577&quot;/&gt;&lt;wsp:rsid wsp:val=&quot;003F3A61&quot;/&gt;&lt;wsp:rsid wsp:val=&quot;00410A5D&quot;/&gt;&lt;wsp:rsid wsp:val=&quot;00414909&quot;/&gt;&lt;wsp:rsid wsp:val=&quot;00416537&quot;/&gt;&lt;wsp:rsid wsp:val=&quot;00425A6A&quot;/&gt;&lt;wsp:rsid wsp:val=&quot;00426FBB&quot;/&gt;&lt;wsp:rsid wsp:val=&quot;00454542&quot;/&gt;&lt;wsp:rsid wsp:val=&quot;0047429A&quot;/&gt;&lt;wsp:rsid wsp:val=&quot;0048374C&quot;/&gt;&lt;wsp:rsid wsp:val=&quot;0048771D&quot;/&gt;&lt;wsp:rsid wsp:val=&quot;004A6605&quot;/&gt;&lt;wsp:rsid wsp:val=&quot;004C45FA&quot;/&gt;&lt;wsp:rsid wsp:val=&quot;004D35A3&quot;/&gt;&lt;wsp:rsid wsp:val=&quot;004E1BD8&quot;/&gt;&lt;wsp:rsid wsp:val=&quot;004E452A&quot;/&gt;&lt;wsp:rsid wsp:val=&quot;004E78E3&quot;/&gt;&lt;wsp:rsid wsp:val=&quot;004F2BFE&quot;/&gt;&lt;wsp:rsid wsp:val=&quot;004F63D3&quot;/&gt;&lt;wsp:rsid wsp:val=&quot;004F7DCF&quot;/&gt;&lt;wsp:rsid wsp:val=&quot;005004BF&quot;/&gt;&lt;wsp:rsid wsp:val=&quot;00502E89&quot;/&gt;&lt;wsp:rsid wsp:val=&quot;00506CFE&quot;/&gt;&lt;wsp:rsid wsp:val=&quot;00510E95&quot;/&gt;&lt;wsp:rsid wsp:val=&quot;005225C3&quot;/&gt;&lt;wsp:rsid wsp:val=&quot;00527D56&quot;/&gt;&lt;wsp:rsid wsp:val=&quot;0053221F&quot;/&gt;&lt;wsp:rsid wsp:val=&quot;00536FAE&quot;/&gt;&lt;wsp:rsid wsp:val=&quot;00542C85&quot;/&gt;&lt;wsp:rsid wsp:val=&quot;00553510&quot;/&gt;&lt;wsp:rsid wsp:val=&quot;00554186&quot;/&gt;&lt;wsp:rsid wsp:val=&quot;00585769&quot;/&gt;&lt;wsp:rsid wsp:val=&quot;00585C61&quot;/&gt;&lt;wsp:rsid wsp:val=&quot;00591130&quot;/&gt;&lt;wsp:rsid wsp:val=&quot;005A3F28&quot;/&gt;&lt;wsp:rsid wsp:val=&quot;005A40BE&quot;/&gt;&lt;wsp:rsid wsp:val=&quot;005B13E2&quot;/&gt;&lt;wsp:rsid wsp:val=&quot;005B47D7&quot;/&gt;&lt;wsp:rsid wsp:val=&quot;005C5526&quot;/&gt;&lt;wsp:rsid wsp:val=&quot;005C62C6&quot;/&gt;&lt;wsp:rsid wsp:val=&quot;005D7B9E&quot;/&gt;&lt;wsp:rsid wsp:val=&quot;005E112E&quot;/&gt;&lt;wsp:rsid wsp:val=&quot;005F0834&quot;/&gt;&lt;wsp:rsid wsp:val=&quot;005F68AB&quot;/&gt;&lt;wsp:rsid wsp:val=&quot;005F6DC3&quot;/&gt;&lt;wsp:rsid wsp:val=&quot;00601A8E&quot;/&gt;&lt;wsp:rsid wsp:val=&quot;0062033E&quot;/&gt;&lt;wsp:rsid wsp:val=&quot;00624482&quot;/&gt;&lt;wsp:rsid wsp:val=&quot;0064799C&quot;/&gt;&lt;wsp:rsid wsp:val=&quot;00654156&quot;/&gt;&lt;wsp:rsid wsp:val=&quot;00656ADC&quot;/&gt;&lt;wsp:rsid wsp:val=&quot;006B47CA&quot;/&gt;&lt;wsp:rsid wsp:val=&quot;006C304C&quot;/&gt;&lt;wsp:rsid wsp:val=&quot;006C4511&quot;/&gt;&lt;wsp:rsid wsp:val=&quot;006C65F5&quot;/&gt;&lt;wsp:rsid wsp:val=&quot;006C7AAA&quot;/&gt;&lt;wsp:rsid wsp:val=&quot;006D1C2A&quot;/&gt;&lt;wsp:rsid wsp:val=&quot;006D264F&quot;/&gt;&lt;wsp:rsid wsp:val=&quot;006D4E89&quot;/&gt;&lt;wsp:rsid wsp:val=&quot;006E2A8D&quot;/&gt;&lt;wsp:rsid wsp:val=&quot;006E7574&quot;/&gt;&lt;wsp:rsid wsp:val=&quot;00703430&quot;/&gt;&lt;wsp:rsid wsp:val=&quot;00703548&quot;/&gt;&lt;wsp:rsid wsp:val=&quot;00704E18&quot;/&gt;&lt;wsp:rsid wsp:val=&quot;007069BE&quot;/&gt;&lt;wsp:rsid wsp:val=&quot;00745C86&quot;/&gt;&lt;wsp:rsid wsp:val=&quot;00764603&quot;/&gt;&lt;wsp:rsid wsp:val=&quot;0076604D&quot;/&gt;&lt;wsp:rsid wsp:val=&quot;00790909&quot;/&gt;&lt;wsp:rsid wsp:val=&quot;007929AF&quot;/&gt;&lt;wsp:rsid wsp:val=&quot;007B1582&quot;/&gt;&lt;wsp:rsid wsp:val=&quot;007B5A07&quot;/&gt;&lt;wsp:rsid wsp:val=&quot;007C065D&quot;/&gt;&lt;wsp:rsid wsp:val=&quot;007D3E71&quot;/&gt;&lt;wsp:rsid wsp:val=&quot;007E5D6A&quot;/&gt;&lt;wsp:rsid wsp:val=&quot;007E645D&quot;/&gt;&lt;wsp:rsid wsp:val=&quot;007F75CA&quot;/&gt;&lt;wsp:rsid wsp:val=&quot;00821E08&quot;/&gt;&lt;wsp:rsid wsp:val=&quot;00834EFD&quot;/&gt;&lt;wsp:rsid wsp:val=&quot;00844B24&quot;/&gt;&lt;wsp:rsid wsp:val=&quot;0084515F&quot;/&gt;&lt;wsp:rsid wsp:val=&quot;0085092D&quot;/&gt;&lt;wsp:rsid wsp:val=&quot;00865414&quot;/&gt;&lt;wsp:rsid wsp:val=&quot;00877D4C&quot;/&gt;&lt;wsp:rsid wsp:val=&quot;008831DC&quot;/&gt;&lt;wsp:rsid wsp:val=&quot;00883903&quot;/&gt;&lt;wsp:rsid wsp:val=&quot;00891C30&quot;/&gt;&lt;wsp:rsid wsp:val=&quot;00897219&quot;/&gt;&lt;wsp:rsid wsp:val=&quot;0089763B&quot;/&gt;&lt;wsp:rsid wsp:val=&quot;008B6AE3&quot;/&gt;&lt;wsp:rsid wsp:val=&quot;008C1332&quot;/&gt;&lt;wsp:rsid wsp:val=&quot;008D1045&quot;/&gt;&lt;wsp:rsid wsp:val=&quot;008E5996&quot;/&gt;&lt;wsp:rsid wsp:val=&quot;00901AE1&quot;/&gt;&lt;wsp:rsid wsp:val=&quot;00912F93&quot;/&gt;&lt;wsp:rsid wsp:val=&quot;009205B4&quot;/&gt;&lt;wsp:rsid wsp:val=&quot;00955B59&quot;/&gt;&lt;wsp:rsid wsp:val=&quot;00992262&quot;/&gt;&lt;wsp:rsid wsp:val=&quot;009926BC&quot;/&gt;&lt;wsp:rsid wsp:val=&quot;009A4319&quot;/&gt;&lt;wsp:rsid wsp:val=&quot;009A6C3F&quot;/&gt;&lt;wsp:rsid wsp:val=&quot;009B73F2&quot;/&gt;&lt;wsp:rsid wsp:val=&quot;009C12BD&quot;/&gt;&lt;wsp:rsid wsp:val=&quot;009C50FE&quot;/&gt;&lt;wsp:rsid wsp:val=&quot;009E49DD&quot;/&gt;&lt;wsp:rsid wsp:val=&quot;00A03E75&quot;/&gt;&lt;wsp:rsid wsp:val=&quot;00A20627&quot;/&gt;&lt;wsp:rsid wsp:val=&quot;00A22FE9&quot;/&gt;&lt;wsp:rsid wsp:val=&quot;00A31A44&quot;/&gt;&lt;wsp:rsid wsp:val=&quot;00A32BFA&quot;/&gt;&lt;wsp:rsid wsp:val=&quot;00A3325E&quot;/&gt;&lt;wsp:rsid wsp:val=&quot;00A45FCE&quot;/&gt;&lt;wsp:rsid wsp:val=&quot;00A75671&quot;/&gt;&lt;wsp:rsid wsp:val=&quot;00A773CC&quot;/&gt;&lt;wsp:rsid wsp:val=&quot;00A924D0&quot;/&gt;&lt;wsp:rsid wsp:val=&quot;00A9318B&quot;/&gt;&lt;wsp:rsid wsp:val=&quot;00A94AC1&quot;/&gt;&lt;wsp:rsid wsp:val=&quot;00AB18B7&quot;/&gt;&lt;wsp:rsid wsp:val=&quot;00AD335D&quot;/&gt;&lt;wsp:rsid wsp:val=&quot;00AF114C&quot;/&gt;&lt;wsp:rsid wsp:val=&quot;00AF792B&quot;/&gt;&lt;wsp:rsid wsp:val=&quot;00B32137&quot;/&gt;&lt;wsp:rsid wsp:val=&quot;00B33D2F&quot;/&gt;&lt;wsp:rsid wsp:val=&quot;00B40A5B&quot;/&gt;&lt;wsp:rsid wsp:val=&quot;00B45C6B&quot;/&gt;&lt;wsp:rsid wsp:val=&quot;00B55D5E&quot;/&gt;&lt;wsp:rsid wsp:val=&quot;00B57A80&quot;/&gt;&lt;wsp:rsid wsp:val=&quot;00B70E9C&quot;/&gt;&lt;wsp:rsid wsp:val=&quot;00B713D8&quot;/&gt;&lt;wsp:rsid wsp:val=&quot;00B72979&quot;/&gt;&lt;wsp:rsid wsp:val=&quot;00B94516&quot;/&gt;&lt;wsp:rsid wsp:val=&quot;00BA25E2&quot;/&gt;&lt;wsp:rsid wsp:val=&quot;00BB2855&quot;/&gt;&lt;wsp:rsid wsp:val=&quot;00BC5343&quot;/&gt;&lt;wsp:rsid wsp:val=&quot;00BD19C1&quot;/&gt;&lt;wsp:rsid wsp:val=&quot;00BD25B8&quot;/&gt;&lt;wsp:rsid wsp:val=&quot;00C012E1&quot;/&gt;&lt;wsp:rsid wsp:val=&quot;00C06BB4&quot;/&gt;&lt;wsp:rsid wsp:val=&quot;00C10D20&quot;/&gt;&lt;wsp:rsid wsp:val=&quot;00C12E0C&quot;/&gt;&lt;wsp:rsid wsp:val=&quot;00C21916&quot;/&gt;&lt;wsp:rsid wsp:val=&quot;00C34915&quot;/&gt;&lt;wsp:rsid wsp:val=&quot;00C457CA&quot;/&gt;&lt;wsp:rsid wsp:val=&quot;00C53FB6&quot;/&gt;&lt;wsp:rsid wsp:val=&quot;00C57FB7&quot;/&gt;&lt;wsp:rsid wsp:val=&quot;00C644D4&quot;/&gt;&lt;wsp:rsid wsp:val=&quot;00C65F3F&quot;/&gt;&lt;wsp:rsid wsp:val=&quot;00C72414&quot;/&gt;&lt;wsp:rsid wsp:val=&quot;00C72B1A&quot;/&gt;&lt;wsp:rsid wsp:val=&quot;00C8667B&quot;/&gt;&lt;wsp:rsid wsp:val=&quot;00C90993&quot;/&gt;&lt;wsp:rsid wsp:val=&quot;00CA4CE3&quot;/&gt;&lt;wsp:rsid wsp:val=&quot;00CC72FD&quot;/&gt;&lt;wsp:rsid wsp:val=&quot;00CD1D23&quot;/&gt;&lt;wsp:rsid wsp:val=&quot;00CD4F3F&quot;/&gt;&lt;wsp:rsid wsp:val=&quot;00D311F8&quot;/&gt;&lt;wsp:rsid wsp:val=&quot;00D31660&quot;/&gt;&lt;wsp:rsid wsp:val=&quot;00D36B52&quot;/&gt;&lt;wsp:rsid wsp:val=&quot;00D377C8&quot;/&gt;&lt;wsp:rsid wsp:val=&quot;00D41274&quot;/&gt;&lt;wsp:rsid wsp:val=&quot;00D4229C&quot;/&gt;&lt;wsp:rsid wsp:val=&quot;00D43BF3&quot;/&gt;&lt;wsp:rsid wsp:val=&quot;00D549FB&quot;/&gt;&lt;wsp:rsid wsp:val=&quot;00D56487&quot;/&gt;&lt;wsp:rsid wsp:val=&quot;00D767BB&quot;/&gt;&lt;wsp:rsid wsp:val=&quot;00D939B0&quot;/&gt;&lt;wsp:rsid wsp:val=&quot;00DA31A2&quot;/&gt;&lt;wsp:rsid wsp:val=&quot;00DB16E0&quot;/&gt;&lt;wsp:rsid wsp:val=&quot;00DB2DF9&quot;/&gt;&lt;wsp:rsid wsp:val=&quot;00DB465D&quot;/&gt;&lt;wsp:rsid wsp:val=&quot;00DB48A2&quot;/&gt;&lt;wsp:rsid wsp:val=&quot;00DB7E63&quot;/&gt;&lt;wsp:rsid wsp:val=&quot;00DC2055&quot;/&gt;&lt;wsp:rsid wsp:val=&quot;00DC3908&quot;/&gt;&lt;wsp:rsid wsp:val=&quot;00DD71E8&quot;/&gt;&lt;wsp:rsid wsp:val=&quot;00DD7F83&quot;/&gt;&lt;wsp:rsid wsp:val=&quot;00DE4EB8&quot;/&gt;&lt;wsp:rsid wsp:val=&quot;00E0641E&quot;/&gt;&lt;wsp:rsid wsp:val=&quot;00E06664&quot;/&gt;&lt;wsp:rsid wsp:val=&quot;00E304BC&quot;/&gt;&lt;wsp:rsid wsp:val=&quot;00E32853&quot;/&gt;&lt;wsp:rsid wsp:val=&quot;00E34EBD&quot;/&gt;&lt;wsp:rsid wsp:val=&quot;00E401F8&quot;/&gt;&lt;wsp:rsid wsp:val=&quot;00E46425&quot;/&gt;&lt;wsp:rsid wsp:val=&quot;00E469FC&quot;/&gt;&lt;wsp:rsid wsp:val=&quot;00E47D0E&quot;/&gt;&lt;wsp:rsid wsp:val=&quot;00E65018&quot;/&gt;&lt;wsp:rsid wsp:val=&quot;00E76CA1&quot;/&gt;&lt;wsp:rsid wsp:val=&quot;00E94339&quot;/&gt;&lt;wsp:rsid wsp:val=&quot;00E97563&quot;/&gt;&lt;wsp:rsid wsp:val=&quot;00EB0B63&quot;/&gt;&lt;wsp:rsid wsp:val=&quot;00EC265C&quot;/&gt;&lt;wsp:rsid wsp:val=&quot;00ED61CB&quot;/&gt;&lt;wsp:rsid wsp:val=&quot;00EE752A&quot;/&gt;&lt;wsp:rsid wsp:val=&quot;00F06A72&quot;/&gt;&lt;wsp:rsid wsp:val=&quot;00F136F0&quot;/&gt;&lt;wsp:rsid wsp:val=&quot;00F20BBB&quot;/&gt;&lt;wsp:rsid wsp:val=&quot;00F36048&quot;/&gt;&lt;wsp:rsid wsp:val=&quot;00F43BD8&quot;/&gt;&lt;wsp:rsid wsp:val=&quot;00F562F3&quot;/&gt;&lt;wsp:rsid wsp:val=&quot;00F74B89&quot;/&gt;&lt;wsp:rsid wsp:val=&quot;00F75133&quot;/&gt;&lt;wsp:rsid wsp:val=&quot;00F83272&quot;/&gt;&lt;wsp:rsid wsp:val=&quot;00F9358D&quot;/&gt;&lt;wsp:rsid wsp:val=&quot;00F9369B&quot;/&gt;&lt;wsp:rsid wsp:val=&quot;00FA3899&quot;/&gt;&lt;wsp:rsid wsp:val=&quot;00FA4909&quot;/&gt;&lt;wsp:rsid wsp:val=&quot;00FA5164&quot;/&gt;&lt;wsp:rsid wsp:val=&quot;00FA6751&quot;/&gt;&lt;wsp:rsid wsp:val=&quot;00FA6BD7&quot;/&gt;&lt;wsp:rsid wsp:val=&quot;00FB1048&quot;/&gt;&lt;wsp:rsid wsp:val=&quot;00FB62C4&quot;/&gt;&lt;wsp:rsid wsp:val=&quot;00FB7701&quot;/&gt;&lt;wsp:rsid wsp:val=&quot;00FD1AC5&quot;/&gt;&lt;wsp:rsid wsp:val=&quot;00FD5CF0&quot;/&gt;&lt;/wsp:rsids&gt;&lt;/w:docPr&gt;&lt;w:body&gt;&lt;wx:sect&gt;&lt;w:p wsp:rsidR=&quot;00240CBB&quot; wsp:rsidRPr=&quot;00240CBB&quot; wsp:rsidRDefault=&quot;00240CBB&quot; wsp:rsidP=&quot;00240CBB&quot;&gt;&lt;m:oMathPara&gt;&lt;m:oMath&gt;&lt;m:sSub&gt;&lt;m:sSubPr&gt;&lt;m:ctrlPr&gt;&lt;w:rPr&gt;&lt;w:rFonts w:ascii=&quot;Cambria Math&quot; w:h-ansi=&quot;Cambria Math&quot;/&gt;&lt;wx:font wx:val=&quot;Cambria Math&quot;/&gt;&lt;w:i/&gt;&lt;/w:rPr&gt;&lt;/m:ctrlPr&gt;&lt;/m:sSubPr&gt;&lt;m:e&gt;&lt;m:r&gt;&lt;w:rPr&gt;&lt;w:rFonts w:ascii=&quot;Cambria Math&quot; w:h-ansi=&quot;Cambria Math&quot;/&gt;&lt;wx:font wx:val=&quot;Cambria Math&quot;/&gt;&lt;w:i/&gt;&lt;/w:rPr&gt;&lt;m:t&gt;t&lt;/m:t&gt;&lt;/m:r&gt;&lt;/m:e&gt;&lt;m:sub&gt;&lt;m:r&gt;&lt;w:rPr&gt;&lt;w:rFonts w:ascii=&quot;Cambria Math&quot; w:h-ansi=&quot;Cambria Math&quot;/&gt;&lt;wx:font wx:val=&quot;Cambria Math&quot;/&gt;&lt;w:i/&gt;&lt;/w:rPr&gt;&lt;m:t&gt;off&lt;/m:t&gt;&lt;/m:r&gt;&lt;/m:sub&gt;&lt;/m:sSub&gt;&lt;m:r&gt;&lt;w:rPr&gt;&lt;w:rFonts w:ascii=&quot;Cambria Math&quot; w:h-ansi=&quot;Cambria Math&quot;/&gt;&lt;wx:font wx:val=&quot;Cambria Math&quot;/&gt;&lt;w:i/&gt;&lt;/w:rPr&gt;&lt;m:t&gt;=&lt;/m:t&gt;&lt;/m:r&gt;&lt;m:f&gt;&lt;m:fPr&gt;&lt;m:ctrlPr&gt;&lt;w:rPr&gt;&lt;w:rFonts w:ascii=&quot;Cambria Math&quot; w:h-ansi=&quot;Cambria Math&quot;/&gt;&lt;wx:font wx:val=&quot;Cambria Math&quot;/&gt;&lt;w:i/&gt;&lt;/w:rPr&gt;&lt;/m:ctrlPr&gt;&lt;/m:fPr&gt;&lt;m:num&gt;&lt;m:r&gt;&lt;w:rPr&gt;&lt;w:rFonts w:ascii=&quot;Cambria Math&quot; w:h-ansi=&quot;Cambria Math&quot;/&gt;&lt;wx:font wx:val=&quot;Cambria Math&quot;/&gt;&lt;w:i/&gt;&lt;/w:rPr&gt;&lt;m:t&gt;T&lt;/m:t&gt;&lt;/m:r&gt;&lt;/m:num&gt;&lt;m:den&gt;&lt;m:f&gt;&lt;m:fPr&gt;&lt;m:ctrlPr&gt;&lt;w:rPr&gt;&lt;w:rFonts w:ascii=&quot;Cambria Math&quot; w:h-ansi=&quot;Cambria Math&quot;/&gt;&lt;wx:font wx:val=&quot;Cambria Math&quot;/&gt;&lt;w:i/&gt;&lt;/w:rPr&gt;&lt;/m:ctrlPr&gt;&lt;/m:fPr&gt;&lt;m:num&gt;&lt;m:sSub&gt;&lt;m:sSubPr&gt;&lt;m:ctrlPr&gt;&lt;w:rPr&gt;&lt;w:rFonts w:ascii=&quot;Cambria Math&quot; w:h-ansi=&quot;Cambria Math&quot;/&gt;&lt;wx:font wx:val=&quot;Cambria Math&quot;/&gt;&lt;w:i/&gt;&lt;/w:rPr&gt;&lt;/m:ctrlPr&gt;&lt;/m:sSubPr&gt;&lt;m:e&gt;&lt;m:r&gt;&lt;w:rPr&gt;&lt;w:rFonts w:ascii=&quot;Cambria Math&quot; w:h-ansi=&quot;Cambria Math&quot;/&gt;&lt;wx:font wx:val=&quot;Cambria Math&quot;/&gt;&lt;w:i/&gt;&lt;/w:rPr&gt;&lt;m:t&gt;t&lt;/m:t&gt;&lt;/m:r&gt;&lt;/m:e&gt;&lt;m:sub&gt;&lt;m:r&gt;&lt;w:rPr&gt;&lt;w:rFonts w:ascii=&quot;Cambria Math&quot; w:h-ansi=&quot;Cambria Math&quot;/&gt;&lt;wx:font wx:val=&quot;Cambria Math&quot;/&gt;&lt;w:i/&gt;&lt;/w:rPr&gt;&lt;m:t&gt;on&lt;/m:t&gt;&lt;/m:r&gt;&lt;/m:sub&gt;&lt;/m:sSub&gt;&lt;/m:num&gt;&lt;m:den&gt;&lt;m:sSub&gt;&lt;m:sSubPr&gt;&lt;m:ctrlPr&gt;&lt;w:rPr&gt;&lt;w:rFonts w:ascii=&quot;Cambria Math&quot; w:h-ansi=&quot;Cambria Math&quot;/&gt;&lt;wx:font wx:val=&quot;Cambria Math&quot;/&gt;&lt;w:i/&gt;&lt;/w:rPr&gt;&lt;/m:ctrlPr&gt;&lt;/m:sSubPr&gt;&lt;m:e&gt;&lt;m:r&gt;&lt;w:rPr&gt;&lt;w:rFonts w:ascii=&quot;Cambria Math&quot; w:h-ansi=&quot;Cambria Math&quot;/&gt;&lt;wx:font wx:val=&quot;Cambria Math&quot;/&gt;&lt;w:i/&gt;&lt;/w:rPr&gt;&lt;m:t&gt;t&lt;/m:t&gt;&lt;/m:r&gt;&lt;/m:e&gt;&lt;m:sub&gt;&lt;m:r&gt;&lt;w:rPr&gt;&lt;w:rFonts w:ascii=&quot;Cambria Math&quot; w:h-ansi=&quot;Cambria Math&quot;/&gt;&lt;wx:font wx:val=&quot;Cambria Math&quot;/&gt;&lt;w:i/&gt;&lt;/w:rPr&gt;&lt;m:t&gt;off&lt;/m:t&gt;&lt;/m:r&gt;&lt;/m:sub&gt;&lt;/m:sSub&gt;&lt;/m:den&gt;&lt;/m:f&gt;&lt;m:r&gt;&lt;w:rPr&gt;&lt;w:rFonts w:ascii=&quot;Cambria Math&quot; w:h-ansi=&quot;Cambria Math&quot;/&gt;&lt;wx:font wx:val=&quot;Cambria Math&quot;/&gt;&lt;w:i/&gt;&lt;/w:rPr&gt;&lt;m:t&gt;+1&lt;/m:t&gt;&lt;/m:r&gt;&lt;/m:den&gt;&lt;/m:f&gt;&lt;/m:oMath&gt;&lt;/m:oMathPara&gt;&lt;/w:p&gt;&lt;w:sectPr wsp:rsidR=&quot;00000000&quot; wsp:rsidRPr=&quot;00240CBB&quot;&gt;&lt;w:pgSz w:w=&quot;12240&quot; w:h=&quot;15840&quot;/&gt;&lt;w:pgMar w:top=&quot;1440&quot; w:right=&quot;1440&quot; w:bottom=&quot;1440&quot; w:left=&quot;1440&quot; w:header=&quot;720&quot; w:footer=&quot;720&quot; w:gutter=&quot;0&quot;/&gt;&lt;w:cols w:space=&quot;720&quot;/&gt;&lt;/w:sectPr&gt;&lt;/wx:sect&gt;&lt;/w:body&gt;&lt;/w:wordDocument&gt;">
+                <v:shape id="_x0000_i1056" type="#_x0000_t75" style="width:62.3pt;height:33.25pt" equationxml="&lt;?xml version=&quot;1.0&quot; encoding=&quot;UTF-8&quot; standalone=&quot;yes&quot;?&gt;&#10;&lt;?mso-application progid=&quot;Word.Document&quot;?&gt;&#10;&lt;w:wordDocument xmlns:aml=&quot;http://schemas.microsoft.com/aml/2001/core&quot; xmlns:wpc=&quot;http://schemas.microsoft.com/office/word/2010/wordprocessingCanvas&quot; xmlns:cx=&quot;http://schemas.microsoft.com/office/drawing/2014/chartex&quot; xmlns:cx1=&quot;http://schemas.microsoft.com/office/drawing/2015/9/8/chartex&quot; xmlns:cx2=&quot;http://schemas.microsoft.com/office/drawing/2015/10/21/chartex&quot; xmlns:cx3=&quot;http://schemas.microsoft.com/office/drawing/2016/5/9/chartex&quot; xmlns:cx4=&quot;http://schemas.microsoft.com/office/drawing/2016/5/10/chartex&quot; xmlns:cx5=&quot;http://schemas.microsoft.com/office/drawing/2016/5/11/chartex&quot; xmlns:cx6=&quot;http://schemas.microsoft.com/office/drawing/2016/5/12/chartex&quot; xmlns:cx7=&quot;http://schemas.microsoft.com/office/drawing/2016/5/13/chartex&quot; xmlns:cx8=&quot;http://schemas.microsoft.com/office/drawing/2016/5/14/chartex&quot; xmlns:cr=&quot;http://schemas.microsoft.com/office/comments/2020/reactions&quot; xmlns:dt=&quot;uuid:C2F41010-65B3-11d1-A29F-00AA00C14882&quot; xmlns:mc=&quot;http://schemas.openxmlformats.org/markup-compatibility/2006&quot; xmlns:aink=&quot;http://schemas.microsoft.com/office/drawing/2016/ink&quot; xmlns:am3d=&quot;http://schemas.microsoft.com/office/drawing/2017/model3d&quot; xmlns:o=&quot;urn:schemas-microsoft-com:office:office&quot; xmlns:oel=&quot;http://schemas.microsoft.com/office/2019/extlst&quot; xmlns:m=&quot;http://schemas.openxmlformats.org/officeDocument/2006/math&quot; xmlns:v=&quot;urn:schemas-microsoft-com:vml&quot; xmlns:w10=&quot;urn:schemas-microsoft-com:office:word&quot; xmlns:w=&quot;http://schemas.microsoft.com/office/word/2003/wordml&quot; xmlns:wx=&quot;http://schemas.microsoft.com/office/word/2003/auxHint&quot; xmlns:wne=&quot;http://schemas.microsoft.com/office/word/2006/wordml&quot; xmlns:wsp=&quot;http://schemas.microsoft.com/office/word/2003/wordml/sp2&quot; xmlns:sl=&quot;http://schemas.microsoft.com/schemaLibrary/2003/core&quot; w:macrosPresent=&quot;no&quot; w:embeddedObjPresent=&quot;no&quot; w:ocxPresent=&quot;no&quot; xml:space=&quot;preserve&quot;&gt;&lt;w:ignoreSubtree w:val=&quot;http://schemas.microsoft.com/office/word/2003/wordml/sp2&quot;/&gt;&lt;o:DocumentProperties&gt;&lt;o:Version&gt;16&lt;/o:Version&gt;&lt;/o:DocumentProperties&gt;&lt;w:docPr&gt;&lt;w:view w:val=&quot;print&quot;/&gt;&lt;w:zoom w:percent=&quot;100&quot;/&gt;&lt;w:doNotEmbedSystemFonts/&gt;&lt;w:activeWritingStyle w:lang=&quot;EN-AU&quot; w:vendorID=&quot;64&quot; w:dllVersion=&quot;6&quot; w:nlCheck=&quot;on&quot; w:optionSet=&quot;1&quot;/&gt;&lt;w:activeWritingStyle w:lang=&quot;EN-GB&quot; w:vendorID=&quot;64&quot; w:dllVersion=&quot;6&quot; w:nlCheck=&quot;on&quot; w:optionSet=&quot;1&quot;/&gt;&lt;w:activeWritingStyle w:lang=&quot;EN-US&quot; w:vendorID=&quot;64&quot; w:dllVersion=&quot;6&quot; w:nlCheck=&quot;on&quot; w:optionSet=&quot;1&quot;/&gt;&lt;w:activeWritingStyle w:lang=&quot;EN-AU&quot; w:vendorID=&quot;64&quot; w:dllVersion=&quot;0&quot; w:nlCheck=&quot;on&quot; w:optionSet=&quot;0&quot;/&gt;&lt;w:activeWritingStyle w:lang=&quot;EN-GB&quot; w:vendorID=&quot;64&quot; w:dllVersion=&quot;0&quot; w:nlCheck=&quot;on&quot; w:optionSet=&quot;0&quot;/&gt;&lt;w:activeWritingStyle w:lang=&quot;EN-US&quot; w:vendorID=&quot;64&quot; w:dllVersion=&quot;0&quot; w:nlCheck=&quot;on&quot; w:optionSet=&quot;0&quot;/&gt;&lt;w:activeWritingStyle w:lang=&quot;ES-AR&quot; w:vendorID=&quot;64&quot; w:dllVersion=&quot;0&quot; w:nlCheck=&quot;on&quot; w:optionSet=&quot;0&quot;/&gt;&lt;w:activeWritingStyle w:lang=&quot;580A&quot; w:vendorID=&quot;64&quot; w:dllVersion=&quot;0&quot; w:nlCheck=&quot;on&quot; w:optionSet=&quot;0&quot;/&gt;&lt;w:activeWritingStyle w:lang=&quot;PT-BR&quot; w:vendorID=&quot;64&quot; w:dllVersion=&quot;0&quot; w:nlCheck=&quot;on&quot; w:optionSet=&quot;0&quot;/&gt;&lt;w:stylePaneFormatFilter w:val=&quot;3F01&quot;/&gt;&lt;w:defaultTabStop w:val=&quot;720&quot;/&gt;&lt;w:hyphenationZone w:val=&quot;425&quot;/&gt;&lt;w:characterSpacingControl w:val=&quot;DontCompress&quot;/&gt;&lt;w:optimizeForBrowser/&gt;&lt;w:validateAgainstSchema/&gt;&lt;w:saveInvalidXML w:val=&quot;off&quot;/&gt;&lt;w:ignoreMixedContent w:val=&quot;off&quot;/&gt;&lt;w:alwaysShowPlaceholderText w:val=&quot;off&quot;/&gt;&lt;w:compat&gt;&lt;w:breakWrappedTables/&gt;&lt;w:snapToGridInCell/&gt;&lt;w:applyBreakingRules/&gt;&lt;w:wrapTextWithPunct/&gt;&lt;w:useAsianBreakRules/&gt;&lt;w:useWord2002TableStyleRules/&gt;&lt;w:useFELayout/&gt;&lt;/w:compat&gt;&lt;wsp:rsids&gt;&lt;wsp:rsidRoot wsp:val=&quot;00426FBB&quot;/&gt;&lt;wsp:rsid wsp:val=&quot;000002E1&quot;/&gt;&lt;wsp:rsid wsp:val=&quot;00003C97&quot;/&gt;&lt;wsp:rsid wsp:val=&quot;00005565&quot;/&gt;&lt;wsp:rsid wsp:val=&quot;0001754A&quot;/&gt;&lt;wsp:rsid wsp:val=&quot;00017719&quot;/&gt;&lt;wsp:rsid wsp:val=&quot;00027F1D&quot;/&gt;&lt;wsp:rsid wsp:val=&quot;0003296C&quot;/&gt;&lt;wsp:rsid wsp:val=&quot;0003351F&quot;/&gt;&lt;wsp:rsid wsp:val=&quot;00044599&quot;/&gt;&lt;wsp:rsid wsp:val=&quot;000540E6&quot;/&gt;&lt;wsp:rsid wsp:val=&quot;00054421&quot;/&gt;&lt;wsp:rsid wsp:val=&quot;00062E46&quot;/&gt;&lt;wsp:rsid wsp:val=&quot;00074AC8&quot;/&gt;&lt;wsp:rsid wsp:val=&quot;00081408&quot;/&gt;&lt;wsp:rsid wsp:val=&quot;00081EBE&quot;/&gt;&lt;wsp:rsid wsp:val=&quot;00086EDC&quot;/&gt;&lt;wsp:rsid wsp:val=&quot;000B1236&quot;/&gt;&lt;wsp:rsid wsp:val=&quot;000B36A3&quot;/&gt;&lt;wsp:rsid wsp:val=&quot;000C013C&quot;/&gt;&lt;wsp:rsid wsp:val=&quot;000E3F84&quot;/&gt;&lt;wsp:rsid wsp:val=&quot;001056DF&quot;/&gt;&lt;wsp:rsid wsp:val=&quot;0010789C&quot;/&gt;&lt;wsp:rsid wsp:val=&quot;00114025&quot;/&gt;&lt;wsp:rsid wsp:val=&quot;001160D2&quot;/&gt;&lt;wsp:rsid wsp:val=&quot;00120636&quot;/&gt;&lt;wsp:rsid wsp:val=&quot;001348A5&quot;/&gt;&lt;wsp:rsid wsp:val=&quot;00151B8E&quot;/&gt;&lt;wsp:rsid wsp:val=&quot;00182170&quot;/&gt;&lt;wsp:rsid wsp:val=&quot;001928FB&quot;/&gt;&lt;wsp:rsid wsp:val=&quot;00192BC7&quot;/&gt;&lt;wsp:rsid wsp:val=&quot;00195BE6&quot;/&gt;&lt;wsp:rsid wsp:val=&quot;001A3C37&quot;/&gt;&lt;wsp:rsid wsp:val=&quot;001A50EA&quot;/&gt;&lt;wsp:rsid wsp:val=&quot;001F16CD&quot;/&gt;&lt;wsp:rsid wsp:val=&quot;001F47D2&quot;/&gt;&lt;wsp:rsid wsp:val=&quot;002029C8&quot;/&gt;&lt;wsp:rsid wsp:val=&quot;0022285A&quot;/&gt;&lt;wsp:rsid wsp:val=&quot;00224C61&quot;/&gt;&lt;wsp:rsid wsp:val=&quot;00240CBB&quot;/&gt;&lt;wsp:rsid wsp:val=&quot;00256ABC&quot;/&gt;&lt;wsp:rsid wsp:val=&quot;0027227B&quot;/&gt;&lt;wsp:rsid wsp:val=&quot;00273AC7&quot;/&gt;&lt;wsp:rsid wsp:val=&quot;00273D2C&quot;/&gt;&lt;wsp:rsid wsp:val=&quot;00285ECD&quot;/&gt;&lt;wsp:rsid wsp:val=&quot;00290E1B&quot;/&gt;&lt;wsp:rsid wsp:val=&quot;00291B17&quot;/&gt;&lt;wsp:rsid wsp:val=&quot;00291BB3&quot;/&gt;&lt;wsp:rsid wsp:val=&quot;002A6742&quot;/&gt;&lt;wsp:rsid wsp:val=&quot;002C1A7F&quot;/&gt;&lt;wsp:rsid wsp:val=&quot;002C4239&quot;/&gt;&lt;wsp:rsid wsp:val=&quot;002C559D&quot;/&gt;&lt;wsp:rsid wsp:val=&quot;002D16AE&quot;/&gt;&lt;wsp:rsid wsp:val=&quot;002D2D42&quot;/&gt;&lt;wsp:rsid wsp:val=&quot;002F72D0&quot;/&gt;&lt;wsp:rsid wsp:val=&quot;002F7A4F&quot;/&gt;&lt;wsp:rsid wsp:val=&quot;003003AB&quot;/&gt;&lt;wsp:rsid wsp:val=&quot;00302C35&quot;/&gt;&lt;wsp:rsid wsp:val=&quot;00311C49&quot;/&gt;&lt;wsp:rsid wsp:val=&quot;0032119E&quot;/&gt;&lt;wsp:rsid wsp:val=&quot;00321304&quot;/&gt;&lt;wsp:rsid wsp:val=&quot;00324FC2&quot;/&gt;&lt;wsp:rsid wsp:val=&quot;003312CA&quot;/&gt;&lt;wsp:rsid wsp:val=&quot;00331F84&quot;/&gt;&lt;wsp:rsid wsp:val=&quot;003329D6&quot;/&gt;&lt;wsp:rsid wsp:val=&quot;0037721F&quot;/&gt;&lt;wsp:rsid wsp:val=&quot;003950A4&quot;/&gt;&lt;wsp:rsid wsp:val=&quot;003A1E7E&quot;/&gt;&lt;wsp:rsid wsp:val=&quot;003E2FDC&quot;/&gt;&lt;wsp:rsid wsp:val=&quot;003E3577&quot;/&gt;&lt;wsp:rsid wsp:val=&quot;003F3A61&quot;/&gt;&lt;wsp:rsid wsp:val=&quot;00410A5D&quot;/&gt;&lt;wsp:rsid wsp:val=&quot;00414909&quot;/&gt;&lt;wsp:rsid wsp:val=&quot;00416537&quot;/&gt;&lt;wsp:rsid wsp:val=&quot;00425A6A&quot;/&gt;&lt;wsp:rsid wsp:val=&quot;00426FBB&quot;/&gt;&lt;wsp:rsid wsp:val=&quot;00454542&quot;/&gt;&lt;wsp:rsid wsp:val=&quot;0047429A&quot;/&gt;&lt;wsp:rsid wsp:val=&quot;0048374C&quot;/&gt;&lt;wsp:rsid wsp:val=&quot;0048771D&quot;/&gt;&lt;wsp:rsid wsp:val=&quot;004A6605&quot;/&gt;&lt;wsp:rsid wsp:val=&quot;004C45FA&quot;/&gt;&lt;wsp:rsid wsp:val=&quot;004D35A3&quot;/&gt;&lt;wsp:rsid wsp:val=&quot;004E1BD8&quot;/&gt;&lt;wsp:rsid wsp:val=&quot;004E452A&quot;/&gt;&lt;wsp:rsid wsp:val=&quot;004E78E3&quot;/&gt;&lt;wsp:rsid wsp:val=&quot;004F2BFE&quot;/&gt;&lt;wsp:rsid wsp:val=&quot;004F63D3&quot;/&gt;&lt;wsp:rsid wsp:val=&quot;004F7DCF&quot;/&gt;&lt;wsp:rsid wsp:val=&quot;005004BF&quot;/&gt;&lt;wsp:rsid wsp:val=&quot;00502E89&quot;/&gt;&lt;wsp:rsid wsp:val=&quot;00506CFE&quot;/&gt;&lt;wsp:rsid wsp:val=&quot;00510E95&quot;/&gt;&lt;wsp:rsid wsp:val=&quot;005225C3&quot;/&gt;&lt;wsp:rsid wsp:val=&quot;00527D56&quot;/&gt;&lt;wsp:rsid wsp:val=&quot;0053221F&quot;/&gt;&lt;wsp:rsid wsp:val=&quot;00536FAE&quot;/&gt;&lt;wsp:rsid wsp:val=&quot;00542C85&quot;/&gt;&lt;wsp:rsid wsp:val=&quot;00553510&quot;/&gt;&lt;wsp:rsid wsp:val=&quot;00554186&quot;/&gt;&lt;wsp:rsid wsp:val=&quot;00585769&quot;/&gt;&lt;wsp:rsid wsp:val=&quot;00585C61&quot;/&gt;&lt;wsp:rsid wsp:val=&quot;00591130&quot;/&gt;&lt;wsp:rsid wsp:val=&quot;005A3F28&quot;/&gt;&lt;wsp:rsid wsp:val=&quot;005A40BE&quot;/&gt;&lt;wsp:rsid wsp:val=&quot;005B13E2&quot;/&gt;&lt;wsp:rsid wsp:val=&quot;005B47D7&quot;/&gt;&lt;wsp:rsid wsp:val=&quot;005C5526&quot;/&gt;&lt;wsp:rsid wsp:val=&quot;005C62C6&quot;/&gt;&lt;wsp:rsid wsp:val=&quot;005D7B9E&quot;/&gt;&lt;wsp:rsid wsp:val=&quot;005E112E&quot;/&gt;&lt;wsp:rsid wsp:val=&quot;005F0834&quot;/&gt;&lt;wsp:rsid wsp:val=&quot;005F68AB&quot;/&gt;&lt;wsp:rsid wsp:val=&quot;005F6DC3&quot;/&gt;&lt;wsp:rsid wsp:val=&quot;00601A8E&quot;/&gt;&lt;wsp:rsid wsp:val=&quot;0062033E&quot;/&gt;&lt;wsp:rsid wsp:val=&quot;00624482&quot;/&gt;&lt;wsp:rsid wsp:val=&quot;0064799C&quot;/&gt;&lt;wsp:rsid wsp:val=&quot;00654156&quot;/&gt;&lt;wsp:rsid wsp:val=&quot;00656ADC&quot;/&gt;&lt;wsp:rsid wsp:val=&quot;006B47CA&quot;/&gt;&lt;wsp:rsid wsp:val=&quot;006C304C&quot;/&gt;&lt;wsp:rsid wsp:val=&quot;006C4511&quot;/&gt;&lt;wsp:rsid wsp:val=&quot;006C65F5&quot;/&gt;&lt;wsp:rsid wsp:val=&quot;006C7AAA&quot;/&gt;&lt;wsp:rsid wsp:val=&quot;006D1C2A&quot;/&gt;&lt;wsp:rsid wsp:val=&quot;006D264F&quot;/&gt;&lt;wsp:rsid wsp:val=&quot;006D4E89&quot;/&gt;&lt;wsp:rsid wsp:val=&quot;006E2A8D&quot;/&gt;&lt;wsp:rsid wsp:val=&quot;006E7574&quot;/&gt;&lt;wsp:rsid wsp:val=&quot;00703430&quot;/&gt;&lt;wsp:rsid wsp:val=&quot;00703548&quot;/&gt;&lt;wsp:rsid wsp:val=&quot;00704E18&quot;/&gt;&lt;wsp:rsid wsp:val=&quot;007069BE&quot;/&gt;&lt;wsp:rsid wsp:val=&quot;00745C86&quot;/&gt;&lt;wsp:rsid wsp:val=&quot;00764603&quot;/&gt;&lt;wsp:rsid wsp:val=&quot;0076604D&quot;/&gt;&lt;wsp:rsid wsp:val=&quot;00790909&quot;/&gt;&lt;wsp:rsid wsp:val=&quot;007929AF&quot;/&gt;&lt;wsp:rsid wsp:val=&quot;007B1582&quot;/&gt;&lt;wsp:rsid wsp:val=&quot;007B5A07&quot;/&gt;&lt;wsp:rsid wsp:val=&quot;007C065D&quot;/&gt;&lt;wsp:rsid wsp:val=&quot;007D3E71&quot;/&gt;&lt;wsp:rsid wsp:val=&quot;007E5D6A&quot;/&gt;&lt;wsp:rsid wsp:val=&quot;007E645D&quot;/&gt;&lt;wsp:rsid wsp:val=&quot;007F75CA&quot;/&gt;&lt;wsp:rsid wsp:val=&quot;00821E08&quot;/&gt;&lt;wsp:rsid wsp:val=&quot;00834EFD&quot;/&gt;&lt;wsp:rsid wsp:val=&quot;00844B24&quot;/&gt;&lt;wsp:rsid wsp:val=&quot;0084515F&quot;/&gt;&lt;wsp:rsid wsp:val=&quot;0085092D&quot;/&gt;&lt;wsp:rsid wsp:val=&quot;00865414&quot;/&gt;&lt;wsp:rsid wsp:val=&quot;00877D4C&quot;/&gt;&lt;wsp:rsid wsp:val=&quot;008831DC&quot;/&gt;&lt;wsp:rsid wsp:val=&quot;00883903&quot;/&gt;&lt;wsp:rsid wsp:val=&quot;00891C30&quot;/&gt;&lt;wsp:rsid wsp:val=&quot;00897219&quot;/&gt;&lt;wsp:rsid wsp:val=&quot;0089763B&quot;/&gt;&lt;wsp:rsid wsp:val=&quot;008B6AE3&quot;/&gt;&lt;wsp:rsid wsp:val=&quot;008C1332&quot;/&gt;&lt;wsp:rsid wsp:val=&quot;008D1045&quot;/&gt;&lt;wsp:rsid wsp:val=&quot;008E5996&quot;/&gt;&lt;wsp:rsid wsp:val=&quot;00901AE1&quot;/&gt;&lt;wsp:rsid wsp:val=&quot;00912F93&quot;/&gt;&lt;wsp:rsid wsp:val=&quot;009205B4&quot;/&gt;&lt;wsp:rsid wsp:val=&quot;00955B59&quot;/&gt;&lt;wsp:rsid wsp:val=&quot;00992262&quot;/&gt;&lt;wsp:rsid wsp:val=&quot;009926BC&quot;/&gt;&lt;wsp:rsid wsp:val=&quot;009A4319&quot;/&gt;&lt;wsp:rsid wsp:val=&quot;009A6C3F&quot;/&gt;&lt;wsp:rsid wsp:val=&quot;009B73F2&quot;/&gt;&lt;wsp:rsid wsp:val=&quot;009C12BD&quot;/&gt;&lt;wsp:rsid wsp:val=&quot;009C50FE&quot;/&gt;&lt;wsp:rsid wsp:val=&quot;009E49DD&quot;/&gt;&lt;wsp:rsid wsp:val=&quot;00A03E75&quot;/&gt;&lt;wsp:rsid wsp:val=&quot;00A20627&quot;/&gt;&lt;wsp:rsid wsp:val=&quot;00A22FE9&quot;/&gt;&lt;wsp:rsid wsp:val=&quot;00A31A44&quot;/&gt;&lt;wsp:rsid wsp:val=&quot;00A32BFA&quot;/&gt;&lt;wsp:rsid wsp:val=&quot;00A3325E&quot;/&gt;&lt;wsp:rsid wsp:val=&quot;00A45FCE&quot;/&gt;&lt;wsp:rsid wsp:val=&quot;00A75671&quot;/&gt;&lt;wsp:rsid wsp:val=&quot;00A773CC&quot;/&gt;&lt;wsp:rsid wsp:val=&quot;00A924D0&quot;/&gt;&lt;wsp:rsid wsp:val=&quot;00A9318B&quot;/&gt;&lt;wsp:rsid wsp:val=&quot;00A94AC1&quot;/&gt;&lt;wsp:rsid wsp:val=&quot;00AB18B7&quot;/&gt;&lt;wsp:rsid wsp:val=&quot;00AD335D&quot;/&gt;&lt;wsp:rsid wsp:val=&quot;00AF114C&quot;/&gt;&lt;wsp:rsid wsp:val=&quot;00AF792B&quot;/&gt;&lt;wsp:rsid wsp:val=&quot;00B32137&quot;/&gt;&lt;wsp:rsid wsp:val=&quot;00B33D2F&quot;/&gt;&lt;wsp:rsid wsp:val=&quot;00B40A5B&quot;/&gt;&lt;wsp:rsid wsp:val=&quot;00B45C6B&quot;/&gt;&lt;wsp:rsid wsp:val=&quot;00B55D5E&quot;/&gt;&lt;wsp:rsid wsp:val=&quot;00B57A80&quot;/&gt;&lt;wsp:rsid wsp:val=&quot;00B70E9C&quot;/&gt;&lt;wsp:rsid wsp:val=&quot;00B713D8&quot;/&gt;&lt;wsp:rsid wsp:val=&quot;00B72979&quot;/&gt;&lt;wsp:rsid wsp:val=&quot;00B94516&quot;/&gt;&lt;wsp:rsid wsp:val=&quot;00BA25E2&quot;/&gt;&lt;wsp:rsid wsp:val=&quot;00BB2855&quot;/&gt;&lt;wsp:rsid wsp:val=&quot;00BC5343&quot;/&gt;&lt;wsp:rsid wsp:val=&quot;00BD19C1&quot;/&gt;&lt;wsp:rsid wsp:val=&quot;00BD25B8&quot;/&gt;&lt;wsp:rsid wsp:val=&quot;00C012E1&quot;/&gt;&lt;wsp:rsid wsp:val=&quot;00C06BB4&quot;/&gt;&lt;wsp:rsid wsp:val=&quot;00C10D20&quot;/&gt;&lt;wsp:rsid wsp:val=&quot;00C12E0C&quot;/&gt;&lt;wsp:rsid wsp:val=&quot;00C21916&quot;/&gt;&lt;wsp:rsid wsp:val=&quot;00C34915&quot;/&gt;&lt;wsp:rsid wsp:val=&quot;00C457CA&quot;/&gt;&lt;wsp:rsid wsp:val=&quot;00C53FB6&quot;/&gt;&lt;wsp:rsid wsp:val=&quot;00C57FB7&quot;/&gt;&lt;wsp:rsid wsp:val=&quot;00C644D4&quot;/&gt;&lt;wsp:rsid wsp:val=&quot;00C65F3F&quot;/&gt;&lt;wsp:rsid wsp:val=&quot;00C72414&quot;/&gt;&lt;wsp:rsid wsp:val=&quot;00C72B1A&quot;/&gt;&lt;wsp:rsid wsp:val=&quot;00C8667B&quot;/&gt;&lt;wsp:rsid wsp:val=&quot;00C90993&quot;/&gt;&lt;wsp:rsid wsp:val=&quot;00CA4CE3&quot;/&gt;&lt;wsp:rsid wsp:val=&quot;00CC72FD&quot;/&gt;&lt;wsp:rsid wsp:val=&quot;00CD1D23&quot;/&gt;&lt;wsp:rsid wsp:val=&quot;00CD4F3F&quot;/&gt;&lt;wsp:rsid wsp:val=&quot;00D311F8&quot;/&gt;&lt;wsp:rsid wsp:val=&quot;00D31660&quot;/&gt;&lt;wsp:rsid wsp:val=&quot;00D36B52&quot;/&gt;&lt;wsp:rsid wsp:val=&quot;00D377C8&quot;/&gt;&lt;wsp:rsid wsp:val=&quot;00D41274&quot;/&gt;&lt;wsp:rsid wsp:val=&quot;00D4229C&quot;/&gt;&lt;wsp:rsid wsp:val=&quot;00D43BF3&quot;/&gt;&lt;wsp:rsid wsp:val=&quot;00D549FB&quot;/&gt;&lt;wsp:rsid wsp:val=&quot;00D56487&quot;/&gt;&lt;wsp:rsid wsp:val=&quot;00D767BB&quot;/&gt;&lt;wsp:rsid wsp:val=&quot;00D939B0&quot;/&gt;&lt;wsp:rsid wsp:val=&quot;00DA31A2&quot;/&gt;&lt;wsp:rsid wsp:val=&quot;00DB16E0&quot;/&gt;&lt;wsp:rsid wsp:val=&quot;00DB2DF9&quot;/&gt;&lt;wsp:rsid wsp:val=&quot;00DB465D&quot;/&gt;&lt;wsp:rsid wsp:val=&quot;00DB48A2&quot;/&gt;&lt;wsp:rsid wsp:val=&quot;00DB7E63&quot;/&gt;&lt;wsp:rsid wsp:val=&quot;00DC2055&quot;/&gt;&lt;wsp:rsid wsp:val=&quot;00DC3908&quot;/&gt;&lt;wsp:rsid wsp:val=&quot;00DD71E8&quot;/&gt;&lt;wsp:rsid wsp:val=&quot;00DD7F83&quot;/&gt;&lt;wsp:rsid wsp:val=&quot;00DE4EB8&quot;/&gt;&lt;wsp:rsid wsp:val=&quot;00E0641E&quot;/&gt;&lt;wsp:rsid wsp:val=&quot;00E06664&quot;/&gt;&lt;wsp:rsid wsp:val=&quot;00E304BC&quot;/&gt;&lt;wsp:rsid wsp:val=&quot;00E32853&quot;/&gt;&lt;wsp:rsid wsp:val=&quot;00E34EBD&quot;/&gt;&lt;wsp:rsid wsp:val=&quot;00E401F8&quot;/&gt;&lt;wsp:rsid wsp:val=&quot;00E46425&quot;/&gt;&lt;wsp:rsid wsp:val=&quot;00E469FC&quot;/&gt;&lt;wsp:rsid wsp:val=&quot;00E47D0E&quot;/&gt;&lt;wsp:rsid wsp:val=&quot;00E65018&quot;/&gt;&lt;wsp:rsid wsp:val=&quot;00E76CA1&quot;/&gt;&lt;wsp:rsid wsp:val=&quot;00E94339&quot;/&gt;&lt;wsp:rsid wsp:val=&quot;00E97563&quot;/&gt;&lt;wsp:rsid wsp:val=&quot;00EB0B63&quot;/&gt;&lt;wsp:rsid wsp:val=&quot;00EC265C&quot;/&gt;&lt;wsp:rsid wsp:val=&quot;00ED61CB&quot;/&gt;&lt;wsp:rsid wsp:val=&quot;00EE752A&quot;/&gt;&lt;wsp:rsid wsp:val=&quot;00F06A72&quot;/&gt;&lt;wsp:rsid wsp:val=&quot;00F136F0&quot;/&gt;&lt;wsp:rsid wsp:val=&quot;00F20BBB&quot;/&gt;&lt;wsp:rsid wsp:val=&quot;00F36048&quot;/&gt;&lt;wsp:rsid wsp:val=&quot;00F43BD8&quot;/&gt;&lt;wsp:rsid wsp:val=&quot;00F562F3&quot;/&gt;&lt;wsp:rsid wsp:val=&quot;00F74B89&quot;/&gt;&lt;wsp:rsid wsp:val=&quot;00F75133&quot;/&gt;&lt;wsp:rsid wsp:val=&quot;00F83272&quot;/&gt;&lt;wsp:rsid wsp:val=&quot;00F9358D&quot;/&gt;&lt;wsp:rsid wsp:val=&quot;00F9369B&quot;/&gt;&lt;wsp:rsid wsp:val=&quot;00FA3899&quot;/&gt;&lt;wsp:rsid wsp:val=&quot;00FA4909&quot;/&gt;&lt;wsp:rsid wsp:val=&quot;00FA5164&quot;/&gt;&lt;wsp:rsid wsp:val=&quot;00FA6751&quot;/&gt;&lt;wsp:rsid wsp:val=&quot;00FA6BD7&quot;/&gt;&lt;wsp:rsid wsp:val=&quot;00FB1048&quot;/&gt;&lt;wsp:rsid wsp:val=&quot;00FB62C4&quot;/&gt;&lt;wsp:rsid wsp:val=&quot;00FB7701&quot;/&gt;&lt;wsp:rsid wsp:val=&quot;00FD1AC5&quot;/&gt;&lt;wsp:rsid wsp:val=&quot;00FD5CF0&quot;/&gt;&lt;/wsp:rsids&gt;&lt;/w:docPr&gt;&lt;w:body&gt;&lt;wx:sect&gt;&lt;w:p wsp:rsidR=&quot;00240CBB&quot; wsp:rsidRPr=&quot;00240CBB&quot; wsp:rsidRDefault=&quot;00240CBB&quot; wsp:rsidP=&quot;00240CBB&quot;&gt;&lt;m:oMathPara&gt;&lt;m:oMath&gt;&lt;m:sSub&gt;&lt;m:sSubPr&gt;&lt;m:ctrlPr&gt;&lt;w:rPr&gt;&lt;w:rFonts w:ascii=&quot;Cambria Math&quot; w:h-ansi=&quot;Cambria Math&quot;/&gt;&lt;wx:font wx:val=&quot;Cambria Math&quot;/&gt;&lt;w:i/&gt;&lt;/w:rPr&gt;&lt;/m:ctrlPr&gt;&lt;/m:sSubPr&gt;&lt;m:e&gt;&lt;m:r&gt;&lt;w:rPr&gt;&lt;w:rFonts w:ascii=&quot;Cambria Math&quot; w:h-ansi=&quot;Cambria Math&quot;/&gt;&lt;wx:font wx:val=&quot;Cambria Math&quot;/&gt;&lt;w:i/&gt;&lt;/w:rPr&gt;&lt;m:t&gt;t&lt;/m:t&gt;&lt;/m:r&gt;&lt;/m:e&gt;&lt;m:sub&gt;&lt;m:r&gt;&lt;w:rPr&gt;&lt;w:rFonts w:ascii=&quot;Cambria Math&quot; w:h-ansi=&quot;Cambria Math&quot;/&gt;&lt;wx:font wx:val=&quot;Cambria Math&quot;/&gt;&lt;w:i/&gt;&lt;/w:rPr&gt;&lt;m:t&gt;off&lt;/m:t&gt;&lt;/m:r&gt;&lt;/m:sub&gt;&lt;/m:sSub&gt;&lt;m:r&gt;&lt;w:rPr&gt;&lt;w:rFonts w:ascii=&quot;Cambria Math&quot; w:h-ansi=&quot;Cambria Math&quot;/&gt;&lt;wx:font wx:val=&quot;Cambria Math&quot;/&gt;&lt;w:i/&gt;&lt;/w:rPr&gt;&lt;m:t&gt;=&lt;/m:t&gt;&lt;/m:r&gt;&lt;m:f&gt;&lt;m:fPr&gt;&lt;m:ctrlPr&gt;&lt;w:rPr&gt;&lt;w:rFonts w:ascii=&quot;Cambria Math&quot; w:h-ansi=&quot;Cambria Math&quot;/&gt;&lt;wx:font wx:val=&quot;Cambria Math&quot;/&gt;&lt;w:i/&gt;&lt;/w:rPr&gt;&lt;/m:ctrlPr&gt;&lt;/m:fPr&gt;&lt;m:num&gt;&lt;m:r&gt;&lt;w:rPr&gt;&lt;w:rFonts w:ascii=&quot;Cambria Math&quot; w:h-ansi=&quot;Cambria Math&quot;/&gt;&lt;wx:font wx:val=&quot;Cambria Math&quot;/&gt;&lt;w:i/&gt;&lt;/w:rPr&gt;&lt;m:t&gt;T&lt;/m:t&gt;&lt;/m:r&gt;&lt;/m:num&gt;&lt;m:den&gt;&lt;m:f&gt;&lt;m:fPr&gt;&lt;m:ctrlPr&gt;&lt;w:rPr&gt;&lt;w:rFonts w:ascii=&quot;Cambria Math&quot; w:h-ansi=&quot;Cambria Math&quot;/&gt;&lt;wx:font wx:val=&quot;Cambria Math&quot;/&gt;&lt;w:i/&gt;&lt;/w:rPr&gt;&lt;/m:ctrlPr&gt;&lt;/m:fPr&gt;&lt;m:num&gt;&lt;m:sSub&gt;&lt;m:sSubPr&gt;&lt;m:ctrlPr&gt;&lt;w:rPr&gt;&lt;w:rFonts w:ascii=&quot;Cambria Math&quot; w:h-ansi=&quot;Cambria Math&quot;/&gt;&lt;wx:font wx:val=&quot;Cambria Math&quot;/&gt;&lt;w:i/&gt;&lt;/w:rPr&gt;&lt;/m:ctrlPr&gt;&lt;/m:sSubPr&gt;&lt;m:e&gt;&lt;m:r&gt;&lt;w:rPr&gt;&lt;w:rFonts w:ascii=&quot;Cambria Math&quot; w:h-ansi=&quot;Cambria Math&quot;/&gt;&lt;wx:font wx:val=&quot;Cambria Math&quot;/&gt;&lt;w:i/&gt;&lt;/w:rPr&gt;&lt;m:t&gt;t&lt;/m:t&gt;&lt;/m:r&gt;&lt;/m:e&gt;&lt;m:sub&gt;&lt;m:r&gt;&lt;w:rPr&gt;&lt;w:rFonts w:ascii=&quot;Cambria Math&quot; w:h-ansi=&quot;Cambria Math&quot;/&gt;&lt;wx:font wx:val=&quot;Cambria Math&quot;/&gt;&lt;w:i/&gt;&lt;/w:rPr&gt;&lt;m:t&gt;on&lt;/m:t&gt;&lt;/m:r&gt;&lt;/m:sub&gt;&lt;/m:sSub&gt;&lt;/m:num&gt;&lt;m:den&gt;&lt;m:sSub&gt;&lt;m:sSubPr&gt;&lt;m:ctrlPr&gt;&lt;w:rPr&gt;&lt;w:rFonts w:ascii=&quot;Cambria Math&quot; w:h-ansi=&quot;Cambria Math&quot;/&gt;&lt;wx:font wx:val=&quot;Cambria Math&quot;/&gt;&lt;w:i/&gt;&lt;/w:rPr&gt;&lt;/m:ctrlPr&gt;&lt;/m:sSubPr&gt;&lt;m:e&gt;&lt;m:r&gt;&lt;w:rPr&gt;&lt;w:rFonts w:ascii=&quot;Cambria Math&quot; w:h-ansi=&quot;Cambria Math&quot;/&gt;&lt;wx:font wx:val=&quot;Cambria Math&quot;/&gt;&lt;w:i/&gt;&lt;/w:rPr&gt;&lt;m:t&gt;t&lt;/m:t&gt;&lt;/m:r&gt;&lt;/m:e&gt;&lt;m:sub&gt;&lt;m:r&gt;&lt;w:rPr&gt;&lt;w:rFonts w:ascii=&quot;Cambria Math&quot; w:h-ansi=&quot;Cambria Math&quot;/&gt;&lt;wx:font wx:val=&quot;Cambria Math&quot;/&gt;&lt;w:i/&gt;&lt;/w:rPr&gt;&lt;m:t&gt;off&lt;/m:t&gt;&lt;/m:r&gt;&lt;/m:sub&gt;&lt;/m:sSub&gt;&lt;/m:den&gt;&lt;/m:f&gt;&lt;m:r&gt;&lt;w:rPr&gt;&lt;w:rFonts w:ascii=&quot;Cambria Math&quot; w:h-ansi=&quot;Cambria Math&quot;/&gt;&lt;wx:font wx:val=&quot;Cambria Math&quot;/&gt;&lt;w:i/&gt;&lt;/w:rPr&gt;&lt;m:t&gt;+1&lt;/m:t&gt;&lt;/m:r&gt;&lt;/m:den&gt;&lt;/m:f&gt;&lt;/m:oMath&gt;&lt;/m:oMathPara&gt;&lt;/w:p&gt;&lt;w:sectPr wsp:rsidR=&quot;00000000&quot; wsp:rsidRPr=&quot;00240CBB&quot;&gt;&lt;w:pgSz w:w=&quot;12240&quot; w:h=&quot;15840&quot;/&gt;&lt;w:pgMar w:top=&quot;1440&quot; w:right=&quot;1440&quot; w:bottom=&quot;1440&quot; w:left=&quot;1440&quot; w:header=&quot;720&quot; w:footer=&quot;720&quot; w:gutter=&quot;0&quot;/&gt;&lt;w:cols w:space=&quot;720&quot;/&gt;&lt;/w:sectPr&gt;&lt;/wx:sect&gt;&lt;/w:body&gt;&lt;/w:wordDocument&gt;">
                   <v:imagedata r:id="rId25" o:title="" chromakey="white"/>
                 </v:shape>
               </w:pict>
@@ -2993,12 +2953,12 @@
       </w:tr>
       <w:tr>
         <w:trPr>
-          <w:trHeight w:val="635"/>
+          <w:trHeight w:val="624"/>
           <w:jc w:val="center"/>
         </w:trPr>
         <w:tc>
           <w:tcPr>
-            <w:tcW w:w="1825" w:type="dxa"/>
+            <w:tcW w:w="1799" w:type="dxa"/>
             <w:shd w:val="clear" w:color="auto" w:fill="D9D9D9"/>
             <w:vAlign w:val="center"/>
           </w:tcPr>
@@ -3020,7 +2980,7 @@
         </w:tc>
         <w:tc>
           <w:tcPr>
-            <w:tcW w:w="3184" w:type="dxa"/>
+            <w:tcW w:w="3140" w:type="dxa"/>
             <w:shd w:val="clear" w:color="auto" w:fill="D9D9D9"/>
             <w:vAlign w:val="center"/>
           </w:tcPr>
@@ -3038,7 +2998,7 @@
                 <w:szCs w:val="16"/>
               </w:rPr>
               <w:pict w14:anchorId="4B0E1DC8">
-                <v:shape id="_x0000_i1784" type="#_x0000_t75" style="width:71.45pt;height:15.25pt" equationxml="&lt;?xml version=&quot;1.0&quot; encoding=&quot;UTF-8&quot; standalone=&quot;yes&quot;?&gt;&#10;&lt;?mso-application progid=&quot;Word.Document&quot;?&gt;&#10;&lt;w:wordDocument xmlns:aml=&quot;http://schemas.microsoft.com/aml/2001/core&quot; xmlns:wpc=&quot;http://schemas.microsoft.com/office/word/2010/wordprocessingCanvas&quot; xmlns:cx=&quot;http://schemas.microsoft.com/office/drawing/2014/chartex&quot; xmlns:cx1=&quot;http://schemas.microsoft.com/office/drawing/2015/9/8/chartex&quot; xmlns:cx2=&quot;http://schemas.microsoft.com/office/drawing/2015/10/21/chartex&quot; xmlns:cx3=&quot;http://schemas.microsoft.com/office/drawing/2016/5/9/chartex&quot; xmlns:cx4=&quot;http://schemas.microsoft.com/office/drawing/2016/5/10/chartex&quot; xmlns:cx5=&quot;http://schemas.microsoft.com/office/drawing/2016/5/11/chartex&quot; xmlns:cx6=&quot;http://schemas.microsoft.com/office/drawing/2016/5/12/chartex&quot; xmlns:cx7=&quot;http://schemas.microsoft.com/office/drawing/2016/5/13/chartex&quot; xmlns:cx8=&quot;http://schemas.microsoft.com/office/drawing/2016/5/14/chartex&quot; xmlns:cr=&quot;http://schemas.microsoft.com/office/comments/2020/reactions&quot; xmlns:dt=&quot;uuid:C2F41010-65B3-11d1-A29F-00AA00C14882&quot; xmlns:mc=&quot;http://schemas.openxmlformats.org/markup-compatibility/2006&quot; xmlns:aink=&quot;http://schemas.microsoft.com/office/drawing/2016/ink&quot; xmlns:am3d=&quot;http://schemas.microsoft.com/office/drawing/2017/model3d&quot; xmlns:o=&quot;urn:schemas-microsoft-com:office:office&quot; xmlns:oel=&quot;http://schemas.microsoft.com/office/2019/extlst&quot; xmlns:m=&quot;http://schemas.openxmlformats.org/officeDocument/2006/math&quot; xmlns:v=&quot;urn:schemas-microsoft-com:vml&quot; xmlns:w10=&quot;urn:schemas-microsoft-com:office:word&quot; xmlns:w=&quot;http://schemas.microsoft.com/office/word/2003/wordml&quot; xmlns:wx=&quot;http://schemas.microsoft.com/office/word/2003/auxHint&quot; xmlns:wne=&quot;http://schemas.microsoft.com/office/word/2006/wordml&quot; xmlns:wsp=&quot;http://schemas.microsoft.com/office/word/2003/wordml/sp2&quot; xmlns:sl=&quot;http://schemas.microsoft.com/schemaLibrary/2003/core&quot; w:macrosPresent=&quot;no&quot; w:embeddedObjPresent=&quot;no&quot; w:ocxPresent=&quot;no&quot; xml:space=&quot;preserve&quot;&gt;&lt;w:ignoreSubtree w:val=&quot;http://schemas.microsoft.com/office/word/2003/wordml/sp2&quot;/&gt;&lt;o:DocumentProperties&gt;&lt;o:Version&gt;16&lt;/o:Version&gt;&lt;/o:DocumentProperties&gt;&lt;w:docPr&gt;&lt;w:view w:val=&quot;print&quot;/&gt;&lt;w:zoom w:percent=&quot;100&quot;/&gt;&lt;w:doNotEmbedSystemFonts/&gt;&lt;w:activeWritingStyle w:lang=&quot;EN-AU&quot; w:vendorID=&quot;64&quot; w:dllVersion=&quot;6&quot; w:nlCheck=&quot;on&quot; w:optionSet=&quot;1&quot;/&gt;&lt;w:activeWritingStyle w:lang=&quot;EN-GB&quot; w:vendorID=&quot;64&quot; w:dllVersion=&quot;6&quot; w:nlCheck=&quot;on&quot; w:optionSet=&quot;1&quot;/&gt;&lt;w:activeWritingStyle w:lang=&quot;EN-US&quot; w:vendorID=&quot;64&quot; w:dllVersion=&quot;6&quot; w:nlCheck=&quot;on&quot; w:optionSet=&quot;1&quot;/&gt;&lt;w:activeWritingStyle w:lang=&quot;EN-AU&quot; w:vendorID=&quot;64&quot; w:dllVersion=&quot;0&quot; w:nlCheck=&quot;on&quot; w:optionSet=&quot;0&quot;/&gt;&lt;w:activeWritingStyle w:lang=&quot;EN-GB&quot; w:vendorID=&quot;64&quot; w:dllVersion=&quot;0&quot; w:nlCheck=&quot;on&quot; w:optionSet=&quot;0&quot;/&gt;&lt;w:activeWritingStyle w:lang=&quot;EN-US&quot; w:vendorID=&quot;64&quot; w:dllVersion=&quot;0&quot; w:nlCheck=&quot;on&quot; w:optionSet=&quot;0&quot;/&gt;&lt;w:activeWritingStyle w:lang=&quot;ES-AR&quot; w:vendorID=&quot;64&quot; w:dllVersion=&quot;0&quot; w:nlCheck=&quot;on&quot; w:optionSet=&quot;0&quot;/&gt;&lt;w:activeWritingStyle w:lang=&quot;580A&quot; w:vendorID=&quot;64&quot; w:dllVersion=&quot;0&quot; w:nlCheck=&quot;on&quot; w:optionSet=&quot;0&quot;/&gt;&lt;w:activeWritingStyle w:lang=&quot;PT-BR&quot; w:vendorID=&quot;64&quot; w:dllVersion=&quot;0&quot; w:nlCheck=&quot;on&quot; w:optionSet=&quot;0&quot;/&gt;&lt;w:stylePaneFormatFilter w:val=&quot;3F01&quot;/&gt;&lt;w:defaultTabStop w:val=&quot;720&quot;/&gt;&lt;w:hyphenationZone w:val=&quot;425&quot;/&gt;&lt;w:characterSpacingControl w:val=&quot;DontCompress&quot;/&gt;&lt;w:optimizeForBrowser/&gt;&lt;w:validateAgainstSchema/&gt;&lt;w:saveInvalidXML w:val=&quot;off&quot;/&gt;&lt;w:ignoreMixedContent w:val=&quot;off&quot;/&gt;&lt;w:alwaysShowPlaceholderText w:val=&quot;off&quot;/&gt;&lt;w:compat&gt;&lt;w:breakWrappedTables/&gt;&lt;w:snapToGridInCell/&gt;&lt;w:applyBreakingRules/&gt;&lt;w:wrapTextWithPunct/&gt;&lt;w:useAsianBreakRules/&gt;&lt;w:useWord2002TableStyleRules/&gt;&lt;w:useFELayout/&gt;&lt;/w:compat&gt;&lt;wsp:rsids&gt;&lt;wsp:rsidRoot wsp:val=&quot;00426FBB&quot;/&gt;&lt;wsp:rsid wsp:val=&quot;000002E1&quot;/&gt;&lt;wsp:rsid wsp:val=&quot;00003C97&quot;/&gt;&lt;wsp:rsid wsp:val=&quot;00005565&quot;/&gt;&lt;wsp:rsid wsp:val=&quot;0001754A&quot;/&gt;&lt;wsp:rsid wsp:val=&quot;00017719&quot;/&gt;&lt;wsp:rsid wsp:val=&quot;00027F1D&quot;/&gt;&lt;wsp:rsid wsp:val=&quot;0003296C&quot;/&gt;&lt;wsp:rsid wsp:val=&quot;0003351F&quot;/&gt;&lt;wsp:rsid wsp:val=&quot;00044599&quot;/&gt;&lt;wsp:rsid wsp:val=&quot;000540E6&quot;/&gt;&lt;wsp:rsid wsp:val=&quot;00054421&quot;/&gt;&lt;wsp:rsid wsp:val=&quot;00062E46&quot;/&gt;&lt;wsp:rsid wsp:val=&quot;00074AC8&quot;/&gt;&lt;wsp:rsid wsp:val=&quot;00081408&quot;/&gt;&lt;wsp:rsid wsp:val=&quot;00081EBE&quot;/&gt;&lt;wsp:rsid wsp:val=&quot;00086EDC&quot;/&gt;&lt;wsp:rsid wsp:val=&quot;000B1236&quot;/&gt;&lt;wsp:rsid wsp:val=&quot;000B36A3&quot;/&gt;&lt;wsp:rsid wsp:val=&quot;000C013C&quot;/&gt;&lt;wsp:rsid wsp:val=&quot;000D2AFE&quot;/&gt;&lt;wsp:rsid wsp:val=&quot;000E3F84&quot;/&gt;&lt;wsp:rsid wsp:val=&quot;001056DF&quot;/&gt;&lt;wsp:rsid wsp:val=&quot;0010789C&quot;/&gt;&lt;wsp:rsid wsp:val=&quot;00114025&quot;/&gt;&lt;wsp:rsid wsp:val=&quot;001160D2&quot;/&gt;&lt;wsp:rsid wsp:val=&quot;00120636&quot;/&gt;&lt;wsp:rsid wsp:val=&quot;001348A5&quot;/&gt;&lt;wsp:rsid wsp:val=&quot;00151B8E&quot;/&gt;&lt;wsp:rsid wsp:val=&quot;00182170&quot;/&gt;&lt;wsp:rsid wsp:val=&quot;001928FB&quot;/&gt;&lt;wsp:rsid wsp:val=&quot;00192BC7&quot;/&gt;&lt;wsp:rsid wsp:val=&quot;00195BE6&quot;/&gt;&lt;wsp:rsid wsp:val=&quot;001A3C37&quot;/&gt;&lt;wsp:rsid wsp:val=&quot;001A50EA&quot;/&gt;&lt;wsp:rsid wsp:val=&quot;001F16CD&quot;/&gt;&lt;wsp:rsid wsp:val=&quot;001F47D2&quot;/&gt;&lt;wsp:rsid wsp:val=&quot;002029C8&quot;/&gt;&lt;wsp:rsid wsp:val=&quot;0022285A&quot;/&gt;&lt;wsp:rsid wsp:val=&quot;00224C61&quot;/&gt;&lt;wsp:rsid wsp:val=&quot;00256ABC&quot;/&gt;&lt;wsp:rsid wsp:val=&quot;0027227B&quot;/&gt;&lt;wsp:rsid wsp:val=&quot;00273AC7&quot;/&gt;&lt;wsp:rsid wsp:val=&quot;00273D2C&quot;/&gt;&lt;wsp:rsid wsp:val=&quot;00285ECD&quot;/&gt;&lt;wsp:rsid wsp:val=&quot;00290E1B&quot;/&gt;&lt;wsp:rsid wsp:val=&quot;00291B17&quot;/&gt;&lt;wsp:rsid wsp:val=&quot;00291BB3&quot;/&gt;&lt;wsp:rsid wsp:val=&quot;002A6742&quot;/&gt;&lt;wsp:rsid wsp:val=&quot;002C1A7F&quot;/&gt;&lt;wsp:rsid wsp:val=&quot;002C4239&quot;/&gt;&lt;wsp:rsid wsp:val=&quot;002C559D&quot;/&gt;&lt;wsp:rsid wsp:val=&quot;002D16AE&quot;/&gt;&lt;wsp:rsid wsp:val=&quot;002D2D42&quot;/&gt;&lt;wsp:rsid wsp:val=&quot;002F72D0&quot;/&gt;&lt;wsp:rsid wsp:val=&quot;002F7A4F&quot;/&gt;&lt;wsp:rsid wsp:val=&quot;003003AB&quot;/&gt;&lt;wsp:rsid wsp:val=&quot;00302C35&quot;/&gt;&lt;wsp:rsid wsp:val=&quot;00311C49&quot;/&gt;&lt;wsp:rsid wsp:val=&quot;0032119E&quot;/&gt;&lt;wsp:rsid wsp:val=&quot;00321304&quot;/&gt;&lt;wsp:rsid wsp:val=&quot;00324FC2&quot;/&gt;&lt;wsp:rsid wsp:val=&quot;003312CA&quot;/&gt;&lt;wsp:rsid wsp:val=&quot;00331F84&quot;/&gt;&lt;wsp:rsid wsp:val=&quot;003329D6&quot;/&gt;&lt;wsp:rsid wsp:val=&quot;0037721F&quot;/&gt;&lt;wsp:rsid wsp:val=&quot;003950A4&quot;/&gt;&lt;wsp:rsid wsp:val=&quot;003A1E7E&quot;/&gt;&lt;wsp:rsid wsp:val=&quot;003E2FDC&quot;/&gt;&lt;wsp:rsid wsp:val=&quot;003E3577&quot;/&gt;&lt;wsp:rsid wsp:val=&quot;003F3A61&quot;/&gt;&lt;wsp:rsid wsp:val=&quot;00410A5D&quot;/&gt;&lt;wsp:rsid wsp:val=&quot;00414909&quot;/&gt;&lt;wsp:rsid wsp:val=&quot;00416537&quot;/&gt;&lt;wsp:rsid wsp:val=&quot;00425A6A&quot;/&gt;&lt;wsp:rsid wsp:val=&quot;00426FBB&quot;/&gt;&lt;wsp:rsid wsp:val=&quot;00454542&quot;/&gt;&lt;wsp:rsid wsp:val=&quot;0047429A&quot;/&gt;&lt;wsp:rsid wsp:val=&quot;0048374C&quot;/&gt;&lt;wsp:rsid wsp:val=&quot;0048771D&quot;/&gt;&lt;wsp:rsid wsp:val=&quot;004A6605&quot;/&gt;&lt;wsp:rsid wsp:val=&quot;004C45FA&quot;/&gt;&lt;wsp:rsid wsp:val=&quot;004D35A3&quot;/&gt;&lt;wsp:rsid wsp:val=&quot;004E1BD8&quot;/&gt;&lt;wsp:rsid wsp:val=&quot;004E452A&quot;/&gt;&lt;wsp:rsid wsp:val=&quot;004E78E3&quot;/&gt;&lt;wsp:rsid wsp:val=&quot;004F2BFE&quot;/&gt;&lt;wsp:rsid wsp:val=&quot;004F63D3&quot;/&gt;&lt;wsp:rsid wsp:val=&quot;004F7DCF&quot;/&gt;&lt;wsp:rsid wsp:val=&quot;005004BF&quot;/&gt;&lt;wsp:rsid wsp:val=&quot;00502E89&quot;/&gt;&lt;wsp:rsid wsp:val=&quot;00506CFE&quot;/&gt;&lt;wsp:rsid wsp:val=&quot;00510E95&quot;/&gt;&lt;wsp:rsid wsp:val=&quot;005225C3&quot;/&gt;&lt;wsp:rsid wsp:val=&quot;00527D56&quot;/&gt;&lt;wsp:rsid wsp:val=&quot;0053221F&quot;/&gt;&lt;wsp:rsid wsp:val=&quot;00536FAE&quot;/&gt;&lt;wsp:rsid wsp:val=&quot;00542C85&quot;/&gt;&lt;wsp:rsid wsp:val=&quot;00553510&quot;/&gt;&lt;wsp:rsid wsp:val=&quot;00554186&quot;/&gt;&lt;wsp:rsid wsp:val=&quot;00585769&quot;/&gt;&lt;wsp:rsid wsp:val=&quot;00585C61&quot;/&gt;&lt;wsp:rsid wsp:val=&quot;00591130&quot;/&gt;&lt;wsp:rsid wsp:val=&quot;005A3F28&quot;/&gt;&lt;wsp:rsid wsp:val=&quot;005A40BE&quot;/&gt;&lt;wsp:rsid wsp:val=&quot;005B13E2&quot;/&gt;&lt;wsp:rsid wsp:val=&quot;005B47D7&quot;/&gt;&lt;wsp:rsid wsp:val=&quot;005C5526&quot;/&gt;&lt;wsp:rsid wsp:val=&quot;005C62C6&quot;/&gt;&lt;wsp:rsid wsp:val=&quot;005D7B9E&quot;/&gt;&lt;wsp:rsid wsp:val=&quot;005E112E&quot;/&gt;&lt;wsp:rsid wsp:val=&quot;005F0834&quot;/&gt;&lt;wsp:rsid wsp:val=&quot;005F68AB&quot;/&gt;&lt;wsp:rsid wsp:val=&quot;005F6DC3&quot;/&gt;&lt;wsp:rsid wsp:val=&quot;00601A8E&quot;/&gt;&lt;wsp:rsid wsp:val=&quot;0062033E&quot;/&gt;&lt;wsp:rsid wsp:val=&quot;00624482&quot;/&gt;&lt;wsp:rsid wsp:val=&quot;0064799C&quot;/&gt;&lt;wsp:rsid wsp:val=&quot;00654156&quot;/&gt;&lt;wsp:rsid wsp:val=&quot;00656ADC&quot;/&gt;&lt;wsp:rsid wsp:val=&quot;006B47CA&quot;/&gt;&lt;wsp:rsid wsp:val=&quot;006C304C&quot;/&gt;&lt;wsp:rsid wsp:val=&quot;006C4511&quot;/&gt;&lt;wsp:rsid wsp:val=&quot;006C65F5&quot;/&gt;&lt;wsp:rsid wsp:val=&quot;006C7AAA&quot;/&gt;&lt;wsp:rsid wsp:val=&quot;006D1C2A&quot;/&gt;&lt;wsp:rsid wsp:val=&quot;006D264F&quot;/&gt;&lt;wsp:rsid wsp:val=&quot;006D4E89&quot;/&gt;&lt;wsp:rsid wsp:val=&quot;006E2A8D&quot;/&gt;&lt;wsp:rsid wsp:val=&quot;006E7574&quot;/&gt;&lt;wsp:rsid wsp:val=&quot;00703430&quot;/&gt;&lt;wsp:rsid wsp:val=&quot;00703548&quot;/&gt;&lt;wsp:rsid wsp:val=&quot;00704E18&quot;/&gt;&lt;wsp:rsid wsp:val=&quot;007069BE&quot;/&gt;&lt;wsp:rsid wsp:val=&quot;00745C86&quot;/&gt;&lt;wsp:rsid wsp:val=&quot;00764603&quot;/&gt;&lt;wsp:rsid wsp:val=&quot;0076604D&quot;/&gt;&lt;wsp:rsid wsp:val=&quot;00790909&quot;/&gt;&lt;wsp:rsid wsp:val=&quot;007929AF&quot;/&gt;&lt;wsp:rsid wsp:val=&quot;007B1582&quot;/&gt;&lt;wsp:rsid wsp:val=&quot;007B5A07&quot;/&gt;&lt;wsp:rsid wsp:val=&quot;007C065D&quot;/&gt;&lt;wsp:rsid wsp:val=&quot;007D3E71&quot;/&gt;&lt;wsp:rsid wsp:val=&quot;007E5D6A&quot;/&gt;&lt;wsp:rsid wsp:val=&quot;007E645D&quot;/&gt;&lt;wsp:rsid wsp:val=&quot;007F75CA&quot;/&gt;&lt;wsp:rsid wsp:val=&quot;00821E08&quot;/&gt;&lt;wsp:rsid wsp:val=&quot;00834EFD&quot;/&gt;&lt;wsp:rsid wsp:val=&quot;00844B24&quot;/&gt;&lt;wsp:rsid wsp:val=&quot;0084515F&quot;/&gt;&lt;wsp:rsid wsp:val=&quot;0085092D&quot;/&gt;&lt;wsp:rsid wsp:val=&quot;00865414&quot;/&gt;&lt;wsp:rsid wsp:val=&quot;00877D4C&quot;/&gt;&lt;wsp:rsid wsp:val=&quot;008831DC&quot;/&gt;&lt;wsp:rsid wsp:val=&quot;00883903&quot;/&gt;&lt;wsp:rsid wsp:val=&quot;00891C30&quot;/&gt;&lt;wsp:rsid wsp:val=&quot;00897219&quot;/&gt;&lt;wsp:rsid wsp:val=&quot;0089763B&quot;/&gt;&lt;wsp:rsid wsp:val=&quot;008B6AE3&quot;/&gt;&lt;wsp:rsid wsp:val=&quot;008C1332&quot;/&gt;&lt;wsp:rsid wsp:val=&quot;008D1045&quot;/&gt;&lt;wsp:rsid wsp:val=&quot;008E5996&quot;/&gt;&lt;wsp:rsid wsp:val=&quot;00901AE1&quot;/&gt;&lt;wsp:rsid wsp:val=&quot;00912F93&quot;/&gt;&lt;wsp:rsid wsp:val=&quot;009205B4&quot;/&gt;&lt;wsp:rsid wsp:val=&quot;00955B59&quot;/&gt;&lt;wsp:rsid wsp:val=&quot;00992262&quot;/&gt;&lt;wsp:rsid wsp:val=&quot;009926BC&quot;/&gt;&lt;wsp:rsid wsp:val=&quot;009A4319&quot;/&gt;&lt;wsp:rsid wsp:val=&quot;009A6C3F&quot;/&gt;&lt;wsp:rsid wsp:val=&quot;009B73F2&quot;/&gt;&lt;wsp:rsid wsp:val=&quot;009C12BD&quot;/&gt;&lt;wsp:rsid wsp:val=&quot;009C50FE&quot;/&gt;&lt;wsp:rsid wsp:val=&quot;009E49DD&quot;/&gt;&lt;wsp:rsid wsp:val=&quot;00A03E75&quot;/&gt;&lt;wsp:rsid wsp:val=&quot;00A20627&quot;/&gt;&lt;wsp:rsid wsp:val=&quot;00A22FE9&quot;/&gt;&lt;wsp:rsid wsp:val=&quot;00A31A44&quot;/&gt;&lt;wsp:rsid wsp:val=&quot;00A32BFA&quot;/&gt;&lt;wsp:rsid wsp:val=&quot;00A3325E&quot;/&gt;&lt;wsp:rsid wsp:val=&quot;00A45FCE&quot;/&gt;&lt;wsp:rsid wsp:val=&quot;00A75671&quot;/&gt;&lt;wsp:rsid wsp:val=&quot;00A773CC&quot;/&gt;&lt;wsp:rsid wsp:val=&quot;00A924D0&quot;/&gt;&lt;wsp:rsid wsp:val=&quot;00A9318B&quot;/&gt;&lt;wsp:rsid wsp:val=&quot;00A94AC1&quot;/&gt;&lt;wsp:rsid wsp:val=&quot;00AB18B7&quot;/&gt;&lt;wsp:rsid wsp:val=&quot;00AD335D&quot;/&gt;&lt;wsp:rsid wsp:val=&quot;00AF114C&quot;/&gt;&lt;wsp:rsid wsp:val=&quot;00AF792B&quot;/&gt;&lt;wsp:rsid wsp:val=&quot;00B32137&quot;/&gt;&lt;wsp:rsid wsp:val=&quot;00B33D2F&quot;/&gt;&lt;wsp:rsid wsp:val=&quot;00B40A5B&quot;/&gt;&lt;wsp:rsid wsp:val=&quot;00B45C6B&quot;/&gt;&lt;wsp:rsid wsp:val=&quot;00B55D5E&quot;/&gt;&lt;wsp:rsid wsp:val=&quot;00B57A80&quot;/&gt;&lt;wsp:rsid wsp:val=&quot;00B70E9C&quot;/&gt;&lt;wsp:rsid wsp:val=&quot;00B713D8&quot;/&gt;&lt;wsp:rsid wsp:val=&quot;00B72979&quot;/&gt;&lt;wsp:rsid wsp:val=&quot;00B94516&quot;/&gt;&lt;wsp:rsid wsp:val=&quot;00BA25E2&quot;/&gt;&lt;wsp:rsid wsp:val=&quot;00BB2855&quot;/&gt;&lt;wsp:rsid wsp:val=&quot;00BC5343&quot;/&gt;&lt;wsp:rsid wsp:val=&quot;00BD19C1&quot;/&gt;&lt;wsp:rsid wsp:val=&quot;00BD25B8&quot;/&gt;&lt;wsp:rsid wsp:val=&quot;00C012E1&quot;/&gt;&lt;wsp:rsid wsp:val=&quot;00C06BB4&quot;/&gt;&lt;wsp:rsid wsp:val=&quot;00C10D20&quot;/&gt;&lt;wsp:rsid wsp:val=&quot;00C12E0C&quot;/&gt;&lt;wsp:rsid wsp:val=&quot;00C21916&quot;/&gt;&lt;wsp:rsid wsp:val=&quot;00C34915&quot;/&gt;&lt;wsp:rsid wsp:val=&quot;00C457CA&quot;/&gt;&lt;wsp:rsid wsp:val=&quot;00C53FB6&quot;/&gt;&lt;wsp:rsid wsp:val=&quot;00C57FB7&quot;/&gt;&lt;wsp:rsid wsp:val=&quot;00C644D4&quot;/&gt;&lt;wsp:rsid wsp:val=&quot;00C65F3F&quot;/&gt;&lt;wsp:rsid wsp:val=&quot;00C72414&quot;/&gt;&lt;wsp:rsid wsp:val=&quot;00C72B1A&quot;/&gt;&lt;wsp:rsid wsp:val=&quot;00C8667B&quot;/&gt;&lt;wsp:rsid wsp:val=&quot;00C90993&quot;/&gt;&lt;wsp:rsid wsp:val=&quot;00CA4CE3&quot;/&gt;&lt;wsp:rsid wsp:val=&quot;00CC72FD&quot;/&gt;&lt;wsp:rsid wsp:val=&quot;00CD1D23&quot;/&gt;&lt;wsp:rsid wsp:val=&quot;00CD4F3F&quot;/&gt;&lt;wsp:rsid wsp:val=&quot;00D311F8&quot;/&gt;&lt;wsp:rsid wsp:val=&quot;00D31660&quot;/&gt;&lt;wsp:rsid wsp:val=&quot;00D36B52&quot;/&gt;&lt;wsp:rsid wsp:val=&quot;00D377C8&quot;/&gt;&lt;wsp:rsid wsp:val=&quot;00D41274&quot;/&gt;&lt;wsp:rsid wsp:val=&quot;00D4229C&quot;/&gt;&lt;wsp:rsid wsp:val=&quot;00D43BF3&quot;/&gt;&lt;wsp:rsid wsp:val=&quot;00D549FB&quot;/&gt;&lt;wsp:rsid wsp:val=&quot;00D56487&quot;/&gt;&lt;wsp:rsid wsp:val=&quot;00D767BB&quot;/&gt;&lt;wsp:rsid wsp:val=&quot;00D939B0&quot;/&gt;&lt;wsp:rsid wsp:val=&quot;00DA31A2&quot;/&gt;&lt;wsp:rsid wsp:val=&quot;00DB16E0&quot;/&gt;&lt;wsp:rsid wsp:val=&quot;00DB2DF9&quot;/&gt;&lt;wsp:rsid wsp:val=&quot;00DB465D&quot;/&gt;&lt;wsp:rsid wsp:val=&quot;00DB48A2&quot;/&gt;&lt;wsp:rsid wsp:val=&quot;00DB7E63&quot;/&gt;&lt;wsp:rsid wsp:val=&quot;00DC2055&quot;/&gt;&lt;wsp:rsid wsp:val=&quot;00DC3908&quot;/&gt;&lt;wsp:rsid wsp:val=&quot;00DD71E8&quot;/&gt;&lt;wsp:rsid wsp:val=&quot;00DD7F83&quot;/&gt;&lt;wsp:rsid wsp:val=&quot;00DE4EB8&quot;/&gt;&lt;wsp:rsid wsp:val=&quot;00E0641E&quot;/&gt;&lt;wsp:rsid wsp:val=&quot;00E06664&quot;/&gt;&lt;wsp:rsid wsp:val=&quot;00E304BC&quot;/&gt;&lt;wsp:rsid wsp:val=&quot;00E32853&quot;/&gt;&lt;wsp:rsid wsp:val=&quot;00E34EBD&quot;/&gt;&lt;wsp:rsid wsp:val=&quot;00E401F8&quot;/&gt;&lt;wsp:rsid wsp:val=&quot;00E46425&quot;/&gt;&lt;wsp:rsid wsp:val=&quot;00E469FC&quot;/&gt;&lt;wsp:rsid wsp:val=&quot;00E47D0E&quot;/&gt;&lt;wsp:rsid wsp:val=&quot;00E65018&quot;/&gt;&lt;wsp:rsid wsp:val=&quot;00E76CA1&quot;/&gt;&lt;wsp:rsid wsp:val=&quot;00E94339&quot;/&gt;&lt;wsp:rsid wsp:val=&quot;00E97563&quot;/&gt;&lt;wsp:rsid wsp:val=&quot;00EB0B63&quot;/&gt;&lt;wsp:rsid wsp:val=&quot;00EC265C&quot;/&gt;&lt;wsp:rsid wsp:val=&quot;00ED61CB&quot;/&gt;&lt;wsp:rsid wsp:val=&quot;00EE752A&quot;/&gt;&lt;wsp:rsid wsp:val=&quot;00F06A72&quot;/&gt;&lt;wsp:rsid wsp:val=&quot;00F136F0&quot;/&gt;&lt;wsp:rsid wsp:val=&quot;00F20BBB&quot;/&gt;&lt;wsp:rsid wsp:val=&quot;00F36048&quot;/&gt;&lt;wsp:rsid wsp:val=&quot;00F43BD8&quot;/&gt;&lt;wsp:rsid wsp:val=&quot;00F562F3&quot;/&gt;&lt;wsp:rsid wsp:val=&quot;00F74B89&quot;/&gt;&lt;wsp:rsid wsp:val=&quot;00F75133&quot;/&gt;&lt;wsp:rsid wsp:val=&quot;00F83272&quot;/&gt;&lt;wsp:rsid wsp:val=&quot;00F9358D&quot;/&gt;&lt;wsp:rsid wsp:val=&quot;00F9369B&quot;/&gt;&lt;wsp:rsid wsp:val=&quot;00FA3899&quot;/&gt;&lt;wsp:rsid wsp:val=&quot;00FA4909&quot;/&gt;&lt;wsp:rsid wsp:val=&quot;00FA5164&quot;/&gt;&lt;wsp:rsid wsp:val=&quot;00FA6751&quot;/&gt;&lt;wsp:rsid wsp:val=&quot;00FA6BD7&quot;/&gt;&lt;wsp:rsid wsp:val=&quot;00FB1048&quot;/&gt;&lt;wsp:rsid wsp:val=&quot;00FB62C4&quot;/&gt;&lt;wsp:rsid wsp:val=&quot;00FB7701&quot;/&gt;&lt;wsp:rsid wsp:val=&quot;00FD1AC5&quot;/&gt;&lt;wsp:rsid wsp:val=&quot;00FD5CF0&quot;/&gt;&lt;/wsp:rsids&gt;&lt;/w:docPr&gt;&lt;w:body&gt;&lt;wx:sect&gt;&lt;w:p wsp:rsidR=&quot;000D2AFE&quot; wsp:rsidRPr=&quot;000D2AFE&quot; wsp:rsidRDefault=&quot;000D2AFE&quot; wsp:rsidP=&quot;000D2AFE&quot;&gt;&lt;m:oMathPara&gt;&lt;m:oMath&gt;&lt;m:sSub&gt;&lt;m:sSubPr&gt;&lt;m:ctrlPr&gt;&lt;w:rPr&gt;&lt;w:rFonts w:ascii=&quot;Cambria Math&quot; w:h-ansi=&quot;Cambria Math&quot;/&gt;&lt;wx:font wx:val=&quot;Cambria Math&quot;/&gt;&lt;w:i/&gt;&lt;/w:rPr&gt;&lt;/m:ctrlPr&gt;&lt;/m:sSubPr&gt;&lt;m:e&gt;&lt;m:r&gt;&lt;w:rPr&gt;&lt;w:rFonts w:ascii=&quot;Cambria Math&quot; w:h-ansi=&quot;Cambria Math&quot;/&gt;&lt;wx:font wx:val=&quot;Cambria Math&quot;/&gt;&lt;w:i/&gt;&lt;/w:rPr&gt;&lt;m:t&gt;t&lt;/m:t&gt;&lt;/m:r&gt;&lt;/m:e&gt;&lt;m:sub&gt;&lt;m:r&gt;&lt;w:rPr&gt;&lt;w:rFonts w:ascii=&quot;Cambria Math&quot; w:h-ansi=&quot;Cambria Math&quot;/&gt;&lt;wx:font wx:val=&quot;Cambria Math&quot;/&gt;&lt;w:i/&gt;&lt;/w:rPr&gt;&lt;m:t&gt;on&lt;/m:t&gt;&lt;/m:r&gt;&lt;/m:sub&gt;&lt;/m:sSub&gt;&lt;m:r&gt;&lt;w:rPr&gt;&lt;w:rFonts w:ascii=&quot;Cambria Math&quot; w:h-ansi=&quot;Cambria Math&quot;/&gt;&lt;wx:font wx:val=&quot;Cambria Math&quot;/&gt;&lt;w:i/&gt;&lt;/w:rPr&gt;&lt;m:t&gt;=T-&lt;/m:t&gt;&lt;/m:r&gt;&lt;m:sSub&gt;&lt;m:sSubPr&gt;&lt;m:ctrlPr&gt;&lt;w:rPr&gt;&lt;w:rFonts w:ascii=&quot;Cambria Math&quot; w:h-ansi=&quot;Cambria Math&quot;/&gt;&lt;wx:font wx:val=&quot;Cambria Math&quot;/&gt;&lt;w:i/&gt;&lt;/w:rPr&gt;&lt;/m:ctrlPr&gt;&lt;/m:sSubPr&gt;&lt;m:e&gt;&lt;m:r&gt;&lt;w:rPr&gt;&lt;w:rFonts w:ascii=&quot;Cambria Math&quot; w:h-ansi=&quot;Cambria Math&quot;/&gt;&lt;wx:font wx:val=&quot;Cambria Math&quot;/&gt;&lt;w:i/&gt;&lt;/w:rPr&gt;&lt;m:t&gt;t&lt;/m:t&gt;&lt;/m:r&gt;&lt;/m:e&gt;&lt;m:sub&gt;&lt;m:r&gt;&lt;w:rPr&gt;&lt;w:rFonts w:ascii=&quot;Cambria Math&quot; w:h-ansi=&quot;Cambria Math&quot;/&gt;&lt;wx:font wx:val=&quot;Cambria Math&quot;/&gt;&lt;w:i/&gt;&lt;/w:rPr&gt;&lt;m:t&gt;off&lt;/m:t&gt;&lt;/m:r&gt;&lt;/m:sub&gt;&lt;/m:sSub&gt;&lt;/m:oMath&gt;&lt;/m:oMathPara&gt;&lt;/w:p&gt;&lt;w:sectPr wsp:rsidR=&quot;00000000&quot; wsp:rsidRPr=&quot;000D2AFE&quot;&gt;&lt;w:pgSz w:w=&quot;12240&quot; w:h=&quot;15840&quot;/&gt;&lt;w:pgMar w:top=&quot;1440&quot; w:right=&quot;1440&quot; w:bottom=&quot;1440&quot; w:left=&quot;1440&quot; w:header=&quot;720&quot; w:footer=&quot;720&quot; w:gutter=&quot;0&quot;/&gt;&lt;w:cols w:space=&quot;720&quot;/&gt;&lt;/w:sectPr&gt;&lt;/wx:sect&gt;&lt;/w:body&gt;&lt;/w:wordDocument&gt;">
+                <v:shape id="_x0000_i1057" type="#_x0000_t75" style="width:71.3pt;height:15.25pt" equationxml="&lt;?xml version=&quot;1.0&quot; encoding=&quot;UTF-8&quot; standalone=&quot;yes&quot;?&gt;&#10;&lt;?mso-application progid=&quot;Word.Document&quot;?&gt;&#10;&lt;w:wordDocument xmlns:aml=&quot;http://schemas.microsoft.com/aml/2001/core&quot; xmlns:wpc=&quot;http://schemas.microsoft.com/office/word/2010/wordprocessingCanvas&quot; xmlns:cx=&quot;http://schemas.microsoft.com/office/drawing/2014/chartex&quot; xmlns:cx1=&quot;http://schemas.microsoft.com/office/drawing/2015/9/8/chartex&quot; xmlns:cx2=&quot;http://schemas.microsoft.com/office/drawing/2015/10/21/chartex&quot; xmlns:cx3=&quot;http://schemas.microsoft.com/office/drawing/2016/5/9/chartex&quot; xmlns:cx4=&quot;http://schemas.microsoft.com/office/drawing/2016/5/10/chartex&quot; xmlns:cx5=&quot;http://schemas.microsoft.com/office/drawing/2016/5/11/chartex&quot; xmlns:cx6=&quot;http://schemas.microsoft.com/office/drawing/2016/5/12/chartex&quot; xmlns:cx7=&quot;http://schemas.microsoft.com/office/drawing/2016/5/13/chartex&quot; xmlns:cx8=&quot;http://schemas.microsoft.com/office/drawing/2016/5/14/chartex&quot; xmlns:cr=&quot;http://schemas.microsoft.com/office/comments/2020/reactions&quot; xmlns:dt=&quot;uuid:C2F41010-65B3-11d1-A29F-00AA00C14882&quot; xmlns:mc=&quot;http://schemas.openxmlformats.org/markup-compatibility/2006&quot; xmlns:aink=&quot;http://schemas.microsoft.com/office/drawing/2016/ink&quot; xmlns:am3d=&quot;http://schemas.microsoft.com/office/drawing/2017/model3d&quot; xmlns:o=&quot;urn:schemas-microsoft-com:office:office&quot; xmlns:oel=&quot;http://schemas.microsoft.com/office/2019/extlst&quot; xmlns:m=&quot;http://schemas.openxmlformats.org/officeDocument/2006/math&quot; xmlns:v=&quot;urn:schemas-microsoft-com:vml&quot; xmlns:w10=&quot;urn:schemas-microsoft-com:office:word&quot; xmlns:w=&quot;http://schemas.microsoft.com/office/word/2003/wordml&quot; xmlns:wx=&quot;http://schemas.microsoft.com/office/word/2003/auxHint&quot; xmlns:wne=&quot;http://schemas.microsoft.com/office/word/2006/wordml&quot; xmlns:wsp=&quot;http://schemas.microsoft.com/office/word/2003/wordml/sp2&quot; xmlns:sl=&quot;http://schemas.microsoft.com/schemaLibrary/2003/core&quot; w:macrosPresent=&quot;no&quot; w:embeddedObjPresent=&quot;no&quot; w:ocxPresent=&quot;no&quot; xml:space=&quot;preserve&quot;&gt;&lt;w:ignoreSubtree w:val=&quot;http://schemas.microsoft.com/office/word/2003/wordml/sp2&quot;/&gt;&lt;o:DocumentProperties&gt;&lt;o:Version&gt;16&lt;/o:Version&gt;&lt;/o:DocumentProperties&gt;&lt;w:docPr&gt;&lt;w:view w:val=&quot;print&quot;/&gt;&lt;w:zoom w:percent=&quot;100&quot;/&gt;&lt;w:doNotEmbedSystemFonts/&gt;&lt;w:activeWritingStyle w:lang=&quot;EN-AU&quot; w:vendorID=&quot;64&quot; w:dllVersion=&quot;6&quot; w:nlCheck=&quot;on&quot; w:optionSet=&quot;1&quot;/&gt;&lt;w:activeWritingStyle w:lang=&quot;EN-GB&quot; w:vendorID=&quot;64&quot; w:dllVersion=&quot;6&quot; w:nlCheck=&quot;on&quot; w:optionSet=&quot;1&quot;/&gt;&lt;w:activeWritingStyle w:lang=&quot;EN-US&quot; w:vendorID=&quot;64&quot; w:dllVersion=&quot;6&quot; w:nlCheck=&quot;on&quot; w:optionSet=&quot;1&quot;/&gt;&lt;w:activeWritingStyle w:lang=&quot;EN-AU&quot; w:vendorID=&quot;64&quot; w:dllVersion=&quot;0&quot; w:nlCheck=&quot;on&quot; w:optionSet=&quot;0&quot;/&gt;&lt;w:activeWritingStyle w:lang=&quot;EN-GB&quot; w:vendorID=&quot;64&quot; w:dllVersion=&quot;0&quot; w:nlCheck=&quot;on&quot; w:optionSet=&quot;0&quot;/&gt;&lt;w:activeWritingStyle w:lang=&quot;EN-US&quot; w:vendorID=&quot;64&quot; w:dllVersion=&quot;0&quot; w:nlCheck=&quot;on&quot; w:optionSet=&quot;0&quot;/&gt;&lt;w:activeWritingStyle w:lang=&quot;ES-AR&quot; w:vendorID=&quot;64&quot; w:dllVersion=&quot;0&quot; w:nlCheck=&quot;on&quot; w:optionSet=&quot;0&quot;/&gt;&lt;w:activeWritingStyle w:lang=&quot;580A&quot; w:vendorID=&quot;64&quot; w:dllVersion=&quot;0&quot; w:nlCheck=&quot;on&quot; w:optionSet=&quot;0&quot;/&gt;&lt;w:activeWritingStyle w:lang=&quot;PT-BR&quot; w:vendorID=&quot;64&quot; w:dllVersion=&quot;0&quot; w:nlCheck=&quot;on&quot; w:optionSet=&quot;0&quot;/&gt;&lt;w:stylePaneFormatFilter w:val=&quot;3F01&quot;/&gt;&lt;w:defaultTabStop w:val=&quot;720&quot;/&gt;&lt;w:hyphenationZone w:val=&quot;425&quot;/&gt;&lt;w:characterSpacingControl w:val=&quot;DontCompress&quot;/&gt;&lt;w:optimizeForBrowser/&gt;&lt;w:validateAgainstSchema/&gt;&lt;w:saveInvalidXML w:val=&quot;off&quot;/&gt;&lt;w:ignoreMixedContent w:val=&quot;off&quot;/&gt;&lt;w:alwaysShowPlaceholderText w:val=&quot;off&quot;/&gt;&lt;w:compat&gt;&lt;w:breakWrappedTables/&gt;&lt;w:snapToGridInCell/&gt;&lt;w:applyBreakingRules/&gt;&lt;w:wrapTextWithPunct/&gt;&lt;w:useAsianBreakRules/&gt;&lt;w:useWord2002TableStyleRules/&gt;&lt;w:useFELayout/&gt;&lt;/w:compat&gt;&lt;wsp:rsids&gt;&lt;wsp:rsidRoot wsp:val=&quot;00426FBB&quot;/&gt;&lt;wsp:rsid wsp:val=&quot;000002E1&quot;/&gt;&lt;wsp:rsid wsp:val=&quot;00003C97&quot;/&gt;&lt;wsp:rsid wsp:val=&quot;00005565&quot;/&gt;&lt;wsp:rsid wsp:val=&quot;0001754A&quot;/&gt;&lt;wsp:rsid wsp:val=&quot;00017719&quot;/&gt;&lt;wsp:rsid wsp:val=&quot;00027F1D&quot;/&gt;&lt;wsp:rsid wsp:val=&quot;0003296C&quot;/&gt;&lt;wsp:rsid wsp:val=&quot;0003351F&quot;/&gt;&lt;wsp:rsid wsp:val=&quot;00044599&quot;/&gt;&lt;wsp:rsid wsp:val=&quot;000540E6&quot;/&gt;&lt;wsp:rsid wsp:val=&quot;00054421&quot;/&gt;&lt;wsp:rsid wsp:val=&quot;00062E46&quot;/&gt;&lt;wsp:rsid wsp:val=&quot;00074AC8&quot;/&gt;&lt;wsp:rsid wsp:val=&quot;00081408&quot;/&gt;&lt;wsp:rsid wsp:val=&quot;00081EBE&quot;/&gt;&lt;wsp:rsid wsp:val=&quot;00086EDC&quot;/&gt;&lt;wsp:rsid wsp:val=&quot;000B1236&quot;/&gt;&lt;wsp:rsid wsp:val=&quot;000B36A3&quot;/&gt;&lt;wsp:rsid wsp:val=&quot;000C013C&quot;/&gt;&lt;wsp:rsid wsp:val=&quot;000D2AFE&quot;/&gt;&lt;wsp:rsid wsp:val=&quot;000E3F84&quot;/&gt;&lt;wsp:rsid wsp:val=&quot;001056DF&quot;/&gt;&lt;wsp:rsid wsp:val=&quot;0010789C&quot;/&gt;&lt;wsp:rsid wsp:val=&quot;00114025&quot;/&gt;&lt;wsp:rsid wsp:val=&quot;001160D2&quot;/&gt;&lt;wsp:rsid wsp:val=&quot;00120636&quot;/&gt;&lt;wsp:rsid wsp:val=&quot;001348A5&quot;/&gt;&lt;wsp:rsid wsp:val=&quot;00151B8E&quot;/&gt;&lt;wsp:rsid wsp:val=&quot;00182170&quot;/&gt;&lt;wsp:rsid wsp:val=&quot;001928FB&quot;/&gt;&lt;wsp:rsid wsp:val=&quot;00192BC7&quot;/&gt;&lt;wsp:rsid wsp:val=&quot;00195BE6&quot;/&gt;&lt;wsp:rsid wsp:val=&quot;001A3C37&quot;/&gt;&lt;wsp:rsid wsp:val=&quot;001A50EA&quot;/&gt;&lt;wsp:rsid wsp:val=&quot;001F16CD&quot;/&gt;&lt;wsp:rsid wsp:val=&quot;001F47D2&quot;/&gt;&lt;wsp:rsid wsp:val=&quot;002029C8&quot;/&gt;&lt;wsp:rsid wsp:val=&quot;0022285A&quot;/&gt;&lt;wsp:rsid wsp:val=&quot;00224C61&quot;/&gt;&lt;wsp:rsid wsp:val=&quot;00256ABC&quot;/&gt;&lt;wsp:rsid wsp:val=&quot;0027227B&quot;/&gt;&lt;wsp:rsid wsp:val=&quot;00273AC7&quot;/&gt;&lt;wsp:rsid wsp:val=&quot;00273D2C&quot;/&gt;&lt;wsp:rsid wsp:val=&quot;00285ECD&quot;/&gt;&lt;wsp:rsid wsp:val=&quot;00290E1B&quot;/&gt;&lt;wsp:rsid wsp:val=&quot;00291B17&quot;/&gt;&lt;wsp:rsid wsp:val=&quot;00291BB3&quot;/&gt;&lt;wsp:rsid wsp:val=&quot;002A6742&quot;/&gt;&lt;wsp:rsid wsp:val=&quot;002C1A7F&quot;/&gt;&lt;wsp:rsid wsp:val=&quot;002C4239&quot;/&gt;&lt;wsp:rsid wsp:val=&quot;002C559D&quot;/&gt;&lt;wsp:rsid wsp:val=&quot;002D16AE&quot;/&gt;&lt;wsp:rsid wsp:val=&quot;002D2D42&quot;/&gt;&lt;wsp:rsid wsp:val=&quot;002F72D0&quot;/&gt;&lt;wsp:rsid wsp:val=&quot;002F7A4F&quot;/&gt;&lt;wsp:rsid wsp:val=&quot;003003AB&quot;/&gt;&lt;wsp:rsid wsp:val=&quot;00302C35&quot;/&gt;&lt;wsp:rsid wsp:val=&quot;00311C49&quot;/&gt;&lt;wsp:rsid wsp:val=&quot;0032119E&quot;/&gt;&lt;wsp:rsid wsp:val=&quot;00321304&quot;/&gt;&lt;wsp:rsid wsp:val=&quot;00324FC2&quot;/&gt;&lt;wsp:rsid wsp:val=&quot;003312CA&quot;/&gt;&lt;wsp:rsid wsp:val=&quot;00331F84&quot;/&gt;&lt;wsp:rsid wsp:val=&quot;003329D6&quot;/&gt;&lt;wsp:rsid wsp:val=&quot;0037721F&quot;/&gt;&lt;wsp:rsid wsp:val=&quot;003950A4&quot;/&gt;&lt;wsp:rsid wsp:val=&quot;003A1E7E&quot;/&gt;&lt;wsp:rsid wsp:val=&quot;003E2FDC&quot;/&gt;&lt;wsp:rsid wsp:val=&quot;003E3577&quot;/&gt;&lt;wsp:rsid wsp:val=&quot;003F3A61&quot;/&gt;&lt;wsp:rsid wsp:val=&quot;00410A5D&quot;/&gt;&lt;wsp:rsid wsp:val=&quot;00414909&quot;/&gt;&lt;wsp:rsid wsp:val=&quot;00416537&quot;/&gt;&lt;wsp:rsid wsp:val=&quot;00425A6A&quot;/&gt;&lt;wsp:rsid wsp:val=&quot;00426FBB&quot;/&gt;&lt;wsp:rsid wsp:val=&quot;00454542&quot;/&gt;&lt;wsp:rsid wsp:val=&quot;0047429A&quot;/&gt;&lt;wsp:rsid wsp:val=&quot;0048374C&quot;/&gt;&lt;wsp:rsid wsp:val=&quot;0048771D&quot;/&gt;&lt;wsp:rsid wsp:val=&quot;004A6605&quot;/&gt;&lt;wsp:rsid wsp:val=&quot;004C45FA&quot;/&gt;&lt;wsp:rsid wsp:val=&quot;004D35A3&quot;/&gt;&lt;wsp:rsid wsp:val=&quot;004E1BD8&quot;/&gt;&lt;wsp:rsid wsp:val=&quot;004E452A&quot;/&gt;&lt;wsp:rsid wsp:val=&quot;004E78E3&quot;/&gt;&lt;wsp:rsid wsp:val=&quot;004F2BFE&quot;/&gt;&lt;wsp:rsid wsp:val=&quot;004F63D3&quot;/&gt;&lt;wsp:rsid wsp:val=&quot;004F7DCF&quot;/&gt;&lt;wsp:rsid wsp:val=&quot;005004BF&quot;/&gt;&lt;wsp:rsid wsp:val=&quot;00502E89&quot;/&gt;&lt;wsp:rsid wsp:val=&quot;00506CFE&quot;/&gt;&lt;wsp:rsid wsp:val=&quot;00510E95&quot;/&gt;&lt;wsp:rsid wsp:val=&quot;005225C3&quot;/&gt;&lt;wsp:rsid wsp:val=&quot;00527D56&quot;/&gt;&lt;wsp:rsid wsp:val=&quot;0053221F&quot;/&gt;&lt;wsp:rsid wsp:val=&quot;00536FAE&quot;/&gt;&lt;wsp:rsid wsp:val=&quot;00542C85&quot;/&gt;&lt;wsp:rsid wsp:val=&quot;00553510&quot;/&gt;&lt;wsp:rsid wsp:val=&quot;00554186&quot;/&gt;&lt;wsp:rsid wsp:val=&quot;00585769&quot;/&gt;&lt;wsp:rsid wsp:val=&quot;00585C61&quot;/&gt;&lt;wsp:rsid wsp:val=&quot;00591130&quot;/&gt;&lt;wsp:rsid wsp:val=&quot;005A3F28&quot;/&gt;&lt;wsp:rsid wsp:val=&quot;005A40BE&quot;/&gt;&lt;wsp:rsid wsp:val=&quot;005B13E2&quot;/&gt;&lt;wsp:rsid wsp:val=&quot;005B47D7&quot;/&gt;&lt;wsp:rsid wsp:val=&quot;005C5526&quot;/&gt;&lt;wsp:rsid wsp:val=&quot;005C62C6&quot;/&gt;&lt;wsp:rsid wsp:val=&quot;005D7B9E&quot;/&gt;&lt;wsp:rsid wsp:val=&quot;005E112E&quot;/&gt;&lt;wsp:rsid wsp:val=&quot;005F0834&quot;/&gt;&lt;wsp:rsid wsp:val=&quot;005F68AB&quot;/&gt;&lt;wsp:rsid wsp:val=&quot;005F6DC3&quot;/&gt;&lt;wsp:rsid wsp:val=&quot;00601A8E&quot;/&gt;&lt;wsp:rsid wsp:val=&quot;0062033E&quot;/&gt;&lt;wsp:rsid wsp:val=&quot;00624482&quot;/&gt;&lt;wsp:rsid wsp:val=&quot;0064799C&quot;/&gt;&lt;wsp:rsid wsp:val=&quot;00654156&quot;/&gt;&lt;wsp:rsid wsp:val=&quot;00656ADC&quot;/&gt;&lt;wsp:rsid wsp:val=&quot;006B47CA&quot;/&gt;&lt;wsp:rsid wsp:val=&quot;006C304C&quot;/&gt;&lt;wsp:rsid wsp:val=&quot;006C4511&quot;/&gt;&lt;wsp:rsid wsp:val=&quot;006C65F5&quot;/&gt;&lt;wsp:rsid wsp:val=&quot;006C7AAA&quot;/&gt;&lt;wsp:rsid wsp:val=&quot;006D1C2A&quot;/&gt;&lt;wsp:rsid wsp:val=&quot;006D264F&quot;/&gt;&lt;wsp:rsid wsp:val=&quot;006D4E89&quot;/&gt;&lt;wsp:rsid wsp:val=&quot;006E2A8D&quot;/&gt;&lt;wsp:rsid wsp:val=&quot;006E7574&quot;/&gt;&lt;wsp:rsid wsp:val=&quot;00703430&quot;/&gt;&lt;wsp:rsid wsp:val=&quot;00703548&quot;/&gt;&lt;wsp:rsid wsp:val=&quot;00704E18&quot;/&gt;&lt;wsp:rsid wsp:val=&quot;007069BE&quot;/&gt;&lt;wsp:rsid wsp:val=&quot;00745C86&quot;/&gt;&lt;wsp:rsid wsp:val=&quot;00764603&quot;/&gt;&lt;wsp:rsid wsp:val=&quot;0076604D&quot;/&gt;&lt;wsp:rsid wsp:val=&quot;00790909&quot;/&gt;&lt;wsp:rsid wsp:val=&quot;007929AF&quot;/&gt;&lt;wsp:rsid wsp:val=&quot;007B1582&quot;/&gt;&lt;wsp:rsid wsp:val=&quot;007B5A07&quot;/&gt;&lt;wsp:rsid wsp:val=&quot;007C065D&quot;/&gt;&lt;wsp:rsid wsp:val=&quot;007D3E71&quot;/&gt;&lt;wsp:rsid wsp:val=&quot;007E5D6A&quot;/&gt;&lt;wsp:rsid wsp:val=&quot;007E645D&quot;/&gt;&lt;wsp:rsid wsp:val=&quot;007F75CA&quot;/&gt;&lt;wsp:rsid wsp:val=&quot;00821E08&quot;/&gt;&lt;wsp:rsid wsp:val=&quot;00834EFD&quot;/&gt;&lt;wsp:rsid wsp:val=&quot;00844B24&quot;/&gt;&lt;wsp:rsid wsp:val=&quot;0084515F&quot;/&gt;&lt;wsp:rsid wsp:val=&quot;0085092D&quot;/&gt;&lt;wsp:rsid wsp:val=&quot;00865414&quot;/&gt;&lt;wsp:rsid wsp:val=&quot;00877D4C&quot;/&gt;&lt;wsp:rsid wsp:val=&quot;008831DC&quot;/&gt;&lt;wsp:rsid wsp:val=&quot;00883903&quot;/&gt;&lt;wsp:rsid wsp:val=&quot;00891C30&quot;/&gt;&lt;wsp:rsid wsp:val=&quot;00897219&quot;/&gt;&lt;wsp:rsid wsp:val=&quot;0089763B&quot;/&gt;&lt;wsp:rsid wsp:val=&quot;008B6AE3&quot;/&gt;&lt;wsp:rsid wsp:val=&quot;008C1332&quot;/&gt;&lt;wsp:rsid wsp:val=&quot;008D1045&quot;/&gt;&lt;wsp:rsid wsp:val=&quot;008E5996&quot;/&gt;&lt;wsp:rsid wsp:val=&quot;00901AE1&quot;/&gt;&lt;wsp:rsid wsp:val=&quot;00912F93&quot;/&gt;&lt;wsp:rsid wsp:val=&quot;009205B4&quot;/&gt;&lt;wsp:rsid wsp:val=&quot;00955B59&quot;/&gt;&lt;wsp:rsid wsp:val=&quot;00992262&quot;/&gt;&lt;wsp:rsid wsp:val=&quot;009926BC&quot;/&gt;&lt;wsp:rsid wsp:val=&quot;009A4319&quot;/&gt;&lt;wsp:rsid wsp:val=&quot;009A6C3F&quot;/&gt;&lt;wsp:rsid wsp:val=&quot;009B73F2&quot;/&gt;&lt;wsp:rsid wsp:val=&quot;009C12BD&quot;/&gt;&lt;wsp:rsid wsp:val=&quot;009C50FE&quot;/&gt;&lt;wsp:rsid wsp:val=&quot;009E49DD&quot;/&gt;&lt;wsp:rsid wsp:val=&quot;00A03E75&quot;/&gt;&lt;wsp:rsid wsp:val=&quot;00A20627&quot;/&gt;&lt;wsp:rsid wsp:val=&quot;00A22FE9&quot;/&gt;&lt;wsp:rsid wsp:val=&quot;00A31A44&quot;/&gt;&lt;wsp:rsid wsp:val=&quot;00A32BFA&quot;/&gt;&lt;wsp:rsid wsp:val=&quot;00A3325E&quot;/&gt;&lt;wsp:rsid wsp:val=&quot;00A45FCE&quot;/&gt;&lt;wsp:rsid wsp:val=&quot;00A75671&quot;/&gt;&lt;wsp:rsid wsp:val=&quot;00A773CC&quot;/&gt;&lt;wsp:rsid wsp:val=&quot;00A924D0&quot;/&gt;&lt;wsp:rsid wsp:val=&quot;00A9318B&quot;/&gt;&lt;wsp:rsid wsp:val=&quot;00A94AC1&quot;/&gt;&lt;wsp:rsid wsp:val=&quot;00AB18B7&quot;/&gt;&lt;wsp:rsid wsp:val=&quot;00AD335D&quot;/&gt;&lt;wsp:rsid wsp:val=&quot;00AF114C&quot;/&gt;&lt;wsp:rsid wsp:val=&quot;00AF792B&quot;/&gt;&lt;wsp:rsid wsp:val=&quot;00B32137&quot;/&gt;&lt;wsp:rsid wsp:val=&quot;00B33D2F&quot;/&gt;&lt;wsp:rsid wsp:val=&quot;00B40A5B&quot;/&gt;&lt;wsp:rsid wsp:val=&quot;00B45C6B&quot;/&gt;&lt;wsp:rsid wsp:val=&quot;00B55D5E&quot;/&gt;&lt;wsp:rsid wsp:val=&quot;00B57A80&quot;/&gt;&lt;wsp:rsid wsp:val=&quot;00B70E9C&quot;/&gt;&lt;wsp:rsid wsp:val=&quot;00B713D8&quot;/&gt;&lt;wsp:rsid wsp:val=&quot;00B72979&quot;/&gt;&lt;wsp:rsid wsp:val=&quot;00B94516&quot;/&gt;&lt;wsp:rsid wsp:val=&quot;00BA25E2&quot;/&gt;&lt;wsp:rsid wsp:val=&quot;00BB2855&quot;/&gt;&lt;wsp:rsid wsp:val=&quot;00BC5343&quot;/&gt;&lt;wsp:rsid wsp:val=&quot;00BD19C1&quot;/&gt;&lt;wsp:rsid wsp:val=&quot;00BD25B8&quot;/&gt;&lt;wsp:rsid wsp:val=&quot;00C012E1&quot;/&gt;&lt;wsp:rsid wsp:val=&quot;00C06BB4&quot;/&gt;&lt;wsp:rsid wsp:val=&quot;00C10D20&quot;/&gt;&lt;wsp:rsid wsp:val=&quot;00C12E0C&quot;/&gt;&lt;wsp:rsid wsp:val=&quot;00C21916&quot;/&gt;&lt;wsp:rsid wsp:val=&quot;00C34915&quot;/&gt;&lt;wsp:rsid wsp:val=&quot;00C457CA&quot;/&gt;&lt;wsp:rsid wsp:val=&quot;00C53FB6&quot;/&gt;&lt;wsp:rsid wsp:val=&quot;00C57FB7&quot;/&gt;&lt;wsp:rsid wsp:val=&quot;00C644D4&quot;/&gt;&lt;wsp:rsid wsp:val=&quot;00C65F3F&quot;/&gt;&lt;wsp:rsid wsp:val=&quot;00C72414&quot;/&gt;&lt;wsp:rsid wsp:val=&quot;00C72B1A&quot;/&gt;&lt;wsp:rsid wsp:val=&quot;00C8667B&quot;/&gt;&lt;wsp:rsid wsp:val=&quot;00C90993&quot;/&gt;&lt;wsp:rsid wsp:val=&quot;00CA4CE3&quot;/&gt;&lt;wsp:rsid wsp:val=&quot;00CC72FD&quot;/&gt;&lt;wsp:rsid wsp:val=&quot;00CD1D23&quot;/&gt;&lt;wsp:rsid wsp:val=&quot;00CD4F3F&quot;/&gt;&lt;wsp:rsid wsp:val=&quot;00D311F8&quot;/&gt;&lt;wsp:rsid wsp:val=&quot;00D31660&quot;/&gt;&lt;wsp:rsid wsp:val=&quot;00D36B52&quot;/&gt;&lt;wsp:rsid wsp:val=&quot;00D377C8&quot;/&gt;&lt;wsp:rsid wsp:val=&quot;00D41274&quot;/&gt;&lt;wsp:rsid wsp:val=&quot;00D4229C&quot;/&gt;&lt;wsp:rsid wsp:val=&quot;00D43BF3&quot;/&gt;&lt;wsp:rsid wsp:val=&quot;00D549FB&quot;/&gt;&lt;wsp:rsid wsp:val=&quot;00D56487&quot;/&gt;&lt;wsp:rsid wsp:val=&quot;00D767BB&quot;/&gt;&lt;wsp:rsid wsp:val=&quot;00D939B0&quot;/&gt;&lt;wsp:rsid wsp:val=&quot;00DA31A2&quot;/&gt;&lt;wsp:rsid wsp:val=&quot;00DB16E0&quot;/&gt;&lt;wsp:rsid wsp:val=&quot;00DB2DF9&quot;/&gt;&lt;wsp:rsid wsp:val=&quot;00DB465D&quot;/&gt;&lt;wsp:rsid wsp:val=&quot;00DB48A2&quot;/&gt;&lt;wsp:rsid wsp:val=&quot;00DB7E63&quot;/&gt;&lt;wsp:rsid wsp:val=&quot;00DC2055&quot;/&gt;&lt;wsp:rsid wsp:val=&quot;00DC3908&quot;/&gt;&lt;wsp:rsid wsp:val=&quot;00DD71E8&quot;/&gt;&lt;wsp:rsid wsp:val=&quot;00DD7F83&quot;/&gt;&lt;wsp:rsid wsp:val=&quot;00DE4EB8&quot;/&gt;&lt;wsp:rsid wsp:val=&quot;00E0641E&quot;/&gt;&lt;wsp:rsid wsp:val=&quot;00E06664&quot;/&gt;&lt;wsp:rsid wsp:val=&quot;00E304BC&quot;/&gt;&lt;wsp:rsid wsp:val=&quot;00E32853&quot;/&gt;&lt;wsp:rsid wsp:val=&quot;00E34EBD&quot;/&gt;&lt;wsp:rsid wsp:val=&quot;00E401F8&quot;/&gt;&lt;wsp:rsid wsp:val=&quot;00E46425&quot;/&gt;&lt;wsp:rsid wsp:val=&quot;00E469FC&quot;/&gt;&lt;wsp:rsid wsp:val=&quot;00E47D0E&quot;/&gt;&lt;wsp:rsid wsp:val=&quot;00E65018&quot;/&gt;&lt;wsp:rsid wsp:val=&quot;00E76CA1&quot;/&gt;&lt;wsp:rsid wsp:val=&quot;00E94339&quot;/&gt;&lt;wsp:rsid wsp:val=&quot;00E97563&quot;/&gt;&lt;wsp:rsid wsp:val=&quot;00EB0B63&quot;/&gt;&lt;wsp:rsid wsp:val=&quot;00EC265C&quot;/&gt;&lt;wsp:rsid wsp:val=&quot;00ED61CB&quot;/&gt;&lt;wsp:rsid wsp:val=&quot;00EE752A&quot;/&gt;&lt;wsp:rsid wsp:val=&quot;00F06A72&quot;/&gt;&lt;wsp:rsid wsp:val=&quot;00F136F0&quot;/&gt;&lt;wsp:rsid wsp:val=&quot;00F20BBB&quot;/&gt;&lt;wsp:rsid wsp:val=&quot;00F36048&quot;/&gt;&lt;wsp:rsid wsp:val=&quot;00F43BD8&quot;/&gt;&lt;wsp:rsid wsp:val=&quot;00F562F3&quot;/&gt;&lt;wsp:rsid wsp:val=&quot;00F74B89&quot;/&gt;&lt;wsp:rsid wsp:val=&quot;00F75133&quot;/&gt;&lt;wsp:rsid wsp:val=&quot;00F83272&quot;/&gt;&lt;wsp:rsid wsp:val=&quot;00F9358D&quot;/&gt;&lt;wsp:rsid wsp:val=&quot;00F9369B&quot;/&gt;&lt;wsp:rsid wsp:val=&quot;00FA3899&quot;/&gt;&lt;wsp:rsid wsp:val=&quot;00FA4909&quot;/&gt;&lt;wsp:rsid wsp:val=&quot;00FA5164&quot;/&gt;&lt;wsp:rsid wsp:val=&quot;00FA6751&quot;/&gt;&lt;wsp:rsid wsp:val=&quot;00FA6BD7&quot;/&gt;&lt;wsp:rsid wsp:val=&quot;00FB1048&quot;/&gt;&lt;wsp:rsid wsp:val=&quot;00FB62C4&quot;/&gt;&lt;wsp:rsid wsp:val=&quot;00FB7701&quot;/&gt;&lt;wsp:rsid wsp:val=&quot;00FD1AC5&quot;/&gt;&lt;wsp:rsid wsp:val=&quot;00FD5CF0&quot;/&gt;&lt;/wsp:rsids&gt;&lt;/w:docPr&gt;&lt;w:body&gt;&lt;wx:sect&gt;&lt;w:p wsp:rsidR=&quot;000D2AFE&quot; wsp:rsidRPr=&quot;000D2AFE&quot; wsp:rsidRDefault=&quot;000D2AFE&quot; wsp:rsidP=&quot;000D2AFE&quot;&gt;&lt;m:oMathPara&gt;&lt;m:oMath&gt;&lt;m:sSub&gt;&lt;m:sSubPr&gt;&lt;m:ctrlPr&gt;&lt;w:rPr&gt;&lt;w:rFonts w:ascii=&quot;Cambria Math&quot; w:h-ansi=&quot;Cambria Math&quot;/&gt;&lt;wx:font wx:val=&quot;Cambria Math&quot;/&gt;&lt;w:i/&gt;&lt;/w:rPr&gt;&lt;/m:ctrlPr&gt;&lt;/m:sSubPr&gt;&lt;m:e&gt;&lt;m:r&gt;&lt;w:rPr&gt;&lt;w:rFonts w:ascii=&quot;Cambria Math&quot; w:h-ansi=&quot;Cambria Math&quot;/&gt;&lt;wx:font wx:val=&quot;Cambria Math&quot;/&gt;&lt;w:i/&gt;&lt;/w:rPr&gt;&lt;m:t&gt;t&lt;/m:t&gt;&lt;/m:r&gt;&lt;/m:e&gt;&lt;m:sub&gt;&lt;m:r&gt;&lt;w:rPr&gt;&lt;w:rFonts w:ascii=&quot;Cambria Math&quot; w:h-ansi=&quot;Cambria Math&quot;/&gt;&lt;wx:font wx:val=&quot;Cambria Math&quot;/&gt;&lt;w:i/&gt;&lt;/w:rPr&gt;&lt;m:t&gt;on&lt;/m:t&gt;&lt;/m:r&gt;&lt;/m:sub&gt;&lt;/m:sSub&gt;&lt;m:r&gt;&lt;w:rPr&gt;&lt;w:rFonts w:ascii=&quot;Cambria Math&quot; w:h-ansi=&quot;Cambria Math&quot;/&gt;&lt;wx:font wx:val=&quot;Cambria Math&quot;/&gt;&lt;w:i/&gt;&lt;/w:rPr&gt;&lt;m:t&gt;=T-&lt;/m:t&gt;&lt;/m:r&gt;&lt;m:sSub&gt;&lt;m:sSubPr&gt;&lt;m:ctrlPr&gt;&lt;w:rPr&gt;&lt;w:rFonts w:ascii=&quot;Cambria Math&quot; w:h-ansi=&quot;Cambria Math&quot;/&gt;&lt;wx:font wx:val=&quot;Cambria Math&quot;/&gt;&lt;w:i/&gt;&lt;/w:rPr&gt;&lt;/m:ctrlPr&gt;&lt;/m:sSubPr&gt;&lt;m:e&gt;&lt;m:r&gt;&lt;w:rPr&gt;&lt;w:rFonts w:ascii=&quot;Cambria Math&quot; w:h-ansi=&quot;Cambria Math&quot;/&gt;&lt;wx:font wx:val=&quot;Cambria Math&quot;/&gt;&lt;w:i/&gt;&lt;/w:rPr&gt;&lt;m:t&gt;t&lt;/m:t&gt;&lt;/m:r&gt;&lt;/m:e&gt;&lt;m:sub&gt;&lt;m:r&gt;&lt;w:rPr&gt;&lt;w:rFonts w:ascii=&quot;Cambria Math&quot; w:h-ansi=&quot;Cambria Math&quot;/&gt;&lt;wx:font wx:val=&quot;Cambria Math&quot;/&gt;&lt;w:i/&gt;&lt;/w:rPr&gt;&lt;m:t&gt;off&lt;/m:t&gt;&lt;/m:r&gt;&lt;/m:sub&gt;&lt;/m:sSub&gt;&lt;/m:oMath&gt;&lt;/m:oMathPara&gt;&lt;/w:p&gt;&lt;w:sectPr wsp:rsidR=&quot;00000000&quot; wsp:rsidRPr=&quot;000D2AFE&quot;&gt;&lt;w:pgSz w:w=&quot;12240&quot; w:h=&quot;15840&quot;/&gt;&lt;w:pgMar w:top=&quot;1440&quot; w:right=&quot;1440&quot; w:bottom=&quot;1440&quot; w:left=&quot;1440&quot; w:header=&quot;720&quot; w:footer=&quot;720&quot; w:gutter=&quot;0&quot;/&gt;&lt;w:cols w:space=&quot;720&quot;/&gt;&lt;/w:sectPr&gt;&lt;/wx:sect&gt;&lt;/w:body&gt;&lt;/w:wordDocument&gt;">
                   <v:imagedata r:id="rId26" o:title="" chromakey="white"/>
                 </v:shape>
               </w:pict>
@@ -3048,12 +3008,12 @@
       </w:tr>
       <w:tr>
         <w:trPr>
-          <w:trHeight w:val="548"/>
+          <w:trHeight w:val="539"/>
           <w:jc w:val="center"/>
         </w:trPr>
         <w:tc>
           <w:tcPr>
-            <w:tcW w:w="1825" w:type="dxa"/>
+            <w:tcW w:w="1799" w:type="dxa"/>
             <w:shd w:val="clear" w:color="auto" w:fill="auto"/>
             <w:vAlign w:val="center"/>
           </w:tcPr>
@@ -3075,7 +3035,7 @@
         </w:tc>
         <w:tc>
           <w:tcPr>
-            <w:tcW w:w="3184" w:type="dxa"/>
+            <w:tcW w:w="3140" w:type="dxa"/>
             <w:shd w:val="clear" w:color="auto" w:fill="auto"/>
             <w:vAlign w:val="center"/>
           </w:tcPr>
@@ -3093,7 +3053,7 @@
                 <w:szCs w:val="16"/>
               </w:rPr>
               <w:pict w14:anchorId="00A3FA83">
-                <v:shape id="_x0000_i1785" type="#_x0000_t75" style="width:90pt;height:13.1pt" equationxml="&lt;?xml version=&quot;1.0&quot; encoding=&quot;UTF-8&quot; standalone=&quot;yes&quot;?&gt;&#10;&lt;?mso-application progid=&quot;Word.Document&quot;?&gt;&#10;&lt;w:wordDocument xmlns:aml=&quot;http://schemas.microsoft.com/aml/2001/core&quot; xmlns:wpc=&quot;http://schemas.microsoft.com/office/word/2010/wordprocessingCanvas&quot; xmlns:cx=&quot;http://schemas.microsoft.com/office/drawing/2014/chartex&quot; xmlns:cx1=&quot;http://schemas.microsoft.com/office/drawing/2015/9/8/chartex&quot; xmlns:cx2=&quot;http://schemas.microsoft.com/office/drawing/2015/10/21/chartex&quot; xmlns:cx3=&quot;http://schemas.microsoft.com/office/drawing/2016/5/9/chartex&quot; xmlns:cx4=&quot;http://schemas.microsoft.com/office/drawing/2016/5/10/chartex&quot; xmlns:cx5=&quot;http://schemas.microsoft.com/office/drawing/2016/5/11/chartex&quot; xmlns:cx6=&quot;http://schemas.microsoft.com/office/drawing/2016/5/12/chartex&quot; xmlns:cx7=&quot;http://schemas.microsoft.com/office/drawing/2016/5/13/chartex&quot; xmlns:cx8=&quot;http://schemas.microsoft.com/office/drawing/2016/5/14/chartex&quot; xmlns:cr=&quot;http://schemas.microsoft.com/office/comments/2020/reactions&quot; xmlns:dt=&quot;uuid:C2F41010-65B3-11d1-A29F-00AA00C14882&quot; xmlns:mc=&quot;http://schemas.openxmlformats.org/markup-compatibility/2006&quot; xmlns:aink=&quot;http://schemas.microsoft.com/office/drawing/2016/ink&quot; xmlns:am3d=&quot;http://schemas.microsoft.com/office/drawing/2017/model3d&quot; xmlns:o=&quot;urn:schemas-microsoft-com:office:office&quot; xmlns:oel=&quot;http://schemas.microsoft.com/office/2019/extlst&quot; xmlns:m=&quot;http://schemas.openxmlformats.org/officeDocument/2006/math&quot; xmlns:v=&quot;urn:schemas-microsoft-com:vml&quot; xmlns:w10=&quot;urn:schemas-microsoft-com:office:word&quot; xmlns:w=&quot;http://schemas.microsoft.com/office/word/2003/wordml&quot; xmlns:wx=&quot;http://schemas.microsoft.com/office/word/2003/auxHint&quot; xmlns:wne=&quot;http://schemas.microsoft.com/office/word/2006/wordml&quot; xmlns:wsp=&quot;http://schemas.microsoft.com/office/word/2003/wordml/sp2&quot; xmlns:sl=&quot;http://schemas.microsoft.com/schemaLibrary/2003/core&quot; w:macrosPresent=&quot;no&quot; w:embeddedObjPresent=&quot;no&quot; w:ocxPresent=&quot;no&quot; xml:space=&quot;preserve&quot;&gt;&lt;w:ignoreSubtree w:val=&quot;http://schemas.microsoft.com/office/word/2003/wordml/sp2&quot;/&gt;&lt;o:DocumentProperties&gt;&lt;o:Version&gt;16&lt;/o:Version&gt;&lt;/o:DocumentProperties&gt;&lt;w:docPr&gt;&lt;w:view w:val=&quot;print&quot;/&gt;&lt;w:zoom w:percent=&quot;100&quot;/&gt;&lt;w:doNotEmbedSystemFonts/&gt;&lt;w:activeWritingStyle w:lang=&quot;EN-AU&quot; w:vendorID=&quot;64&quot; w:dllVersion=&quot;6&quot; w:nlCheck=&quot;on&quot; w:optionSet=&quot;1&quot;/&gt;&lt;w:activeWritingStyle w:lang=&quot;EN-GB&quot; w:vendorID=&quot;64&quot; w:dllVersion=&quot;6&quot; w:nlCheck=&quot;on&quot; w:optionSet=&quot;1&quot;/&gt;&lt;w:activeWritingStyle w:lang=&quot;EN-US&quot; w:vendorID=&quot;64&quot; w:dllVersion=&quot;6&quot; w:nlCheck=&quot;on&quot; w:optionSet=&quot;1&quot;/&gt;&lt;w:activeWritingStyle w:lang=&quot;EN-AU&quot; w:vendorID=&quot;64&quot; w:dllVersion=&quot;0&quot; w:nlCheck=&quot;on&quot; w:optionSet=&quot;0&quot;/&gt;&lt;w:activeWritingStyle w:lang=&quot;EN-GB&quot; w:vendorID=&quot;64&quot; w:dllVersion=&quot;0&quot; w:nlCheck=&quot;on&quot; w:optionSet=&quot;0&quot;/&gt;&lt;w:activeWritingStyle w:lang=&quot;EN-US&quot; w:vendorID=&quot;64&quot; w:dllVersion=&quot;0&quot; w:nlCheck=&quot;on&quot; w:optionSet=&quot;0&quot;/&gt;&lt;w:activeWritingStyle w:lang=&quot;ES-AR&quot; w:vendorID=&quot;64&quot; w:dllVersion=&quot;0&quot; w:nlCheck=&quot;on&quot; w:optionSet=&quot;0&quot;/&gt;&lt;w:activeWritingStyle w:lang=&quot;580A&quot; w:vendorID=&quot;64&quot; w:dllVersion=&quot;0&quot; w:nlCheck=&quot;on&quot; w:optionSet=&quot;0&quot;/&gt;&lt;w:activeWritingStyle w:lang=&quot;PT-BR&quot; w:vendorID=&quot;64&quot; w:dllVersion=&quot;0&quot; w:nlCheck=&quot;on&quot; w:optionSet=&quot;0&quot;/&gt;&lt;w:stylePaneFormatFilter w:val=&quot;3F01&quot;/&gt;&lt;w:defaultTabStop w:val=&quot;720&quot;/&gt;&lt;w:hyphenationZone w:val=&quot;425&quot;/&gt;&lt;w:characterSpacingControl w:val=&quot;DontCompress&quot;/&gt;&lt;w:optimizeForBrowser/&gt;&lt;w:validateAgainstSchema/&gt;&lt;w:saveInvalidXML w:val=&quot;off&quot;/&gt;&lt;w:ignoreMixedContent w:val=&quot;off&quot;/&gt;&lt;w:alwaysShowPlaceholderText w:val=&quot;off&quot;/&gt;&lt;w:compat&gt;&lt;w:breakWrappedTables/&gt;&lt;w:snapToGridInCell/&gt;&lt;w:applyBreakingRules/&gt;&lt;w:wrapTextWithPunct/&gt;&lt;w:useAsianBreakRules/&gt;&lt;w:useWord2002TableStyleRules/&gt;&lt;w:useFELayout/&gt;&lt;/w:compat&gt;&lt;wsp:rsids&gt;&lt;wsp:rsidRoot wsp:val=&quot;00426FBB&quot;/&gt;&lt;wsp:rsid wsp:val=&quot;000002E1&quot;/&gt;&lt;wsp:rsid wsp:val=&quot;00003C97&quot;/&gt;&lt;wsp:rsid wsp:val=&quot;00005565&quot;/&gt;&lt;wsp:rsid wsp:val=&quot;0001754A&quot;/&gt;&lt;wsp:rsid wsp:val=&quot;00017719&quot;/&gt;&lt;wsp:rsid wsp:val=&quot;00027F1D&quot;/&gt;&lt;wsp:rsid wsp:val=&quot;0003296C&quot;/&gt;&lt;wsp:rsid wsp:val=&quot;0003351F&quot;/&gt;&lt;wsp:rsid wsp:val=&quot;00044599&quot;/&gt;&lt;wsp:rsid wsp:val=&quot;000540E6&quot;/&gt;&lt;wsp:rsid wsp:val=&quot;00054421&quot;/&gt;&lt;wsp:rsid wsp:val=&quot;00062E46&quot;/&gt;&lt;wsp:rsid wsp:val=&quot;00074AC8&quot;/&gt;&lt;wsp:rsid wsp:val=&quot;00081408&quot;/&gt;&lt;wsp:rsid wsp:val=&quot;00081EBE&quot;/&gt;&lt;wsp:rsid wsp:val=&quot;00086EDC&quot;/&gt;&lt;wsp:rsid wsp:val=&quot;000B1236&quot;/&gt;&lt;wsp:rsid wsp:val=&quot;000B36A3&quot;/&gt;&lt;wsp:rsid wsp:val=&quot;000C013C&quot;/&gt;&lt;wsp:rsid wsp:val=&quot;000E3F84&quot;/&gt;&lt;wsp:rsid wsp:val=&quot;001056DF&quot;/&gt;&lt;wsp:rsid wsp:val=&quot;0010789C&quot;/&gt;&lt;wsp:rsid wsp:val=&quot;00114025&quot;/&gt;&lt;wsp:rsid wsp:val=&quot;001160D2&quot;/&gt;&lt;wsp:rsid wsp:val=&quot;00120636&quot;/&gt;&lt;wsp:rsid wsp:val=&quot;001348A5&quot;/&gt;&lt;wsp:rsid wsp:val=&quot;00151B8E&quot;/&gt;&lt;wsp:rsid wsp:val=&quot;00182170&quot;/&gt;&lt;wsp:rsid wsp:val=&quot;001928FB&quot;/&gt;&lt;wsp:rsid wsp:val=&quot;00192BC7&quot;/&gt;&lt;wsp:rsid wsp:val=&quot;00195BE6&quot;/&gt;&lt;wsp:rsid wsp:val=&quot;001A3C37&quot;/&gt;&lt;wsp:rsid wsp:val=&quot;001A50EA&quot;/&gt;&lt;wsp:rsid wsp:val=&quot;001F16CD&quot;/&gt;&lt;wsp:rsid wsp:val=&quot;001F47D2&quot;/&gt;&lt;wsp:rsid wsp:val=&quot;002029C8&quot;/&gt;&lt;wsp:rsid wsp:val=&quot;0022285A&quot;/&gt;&lt;wsp:rsid wsp:val=&quot;00224C61&quot;/&gt;&lt;wsp:rsid wsp:val=&quot;00256ABC&quot;/&gt;&lt;wsp:rsid wsp:val=&quot;0027227B&quot;/&gt;&lt;wsp:rsid wsp:val=&quot;00273AC7&quot;/&gt;&lt;wsp:rsid wsp:val=&quot;00273D2C&quot;/&gt;&lt;wsp:rsid wsp:val=&quot;00285ECD&quot;/&gt;&lt;wsp:rsid wsp:val=&quot;00290E1B&quot;/&gt;&lt;wsp:rsid wsp:val=&quot;00291B17&quot;/&gt;&lt;wsp:rsid wsp:val=&quot;00291BB3&quot;/&gt;&lt;wsp:rsid wsp:val=&quot;002A6742&quot;/&gt;&lt;wsp:rsid wsp:val=&quot;002C1A7F&quot;/&gt;&lt;wsp:rsid wsp:val=&quot;002C4239&quot;/&gt;&lt;wsp:rsid wsp:val=&quot;002C559D&quot;/&gt;&lt;wsp:rsid wsp:val=&quot;002D16AE&quot;/&gt;&lt;wsp:rsid wsp:val=&quot;002D2D42&quot;/&gt;&lt;wsp:rsid wsp:val=&quot;002F72D0&quot;/&gt;&lt;wsp:rsid wsp:val=&quot;002F7A4F&quot;/&gt;&lt;wsp:rsid wsp:val=&quot;003003AB&quot;/&gt;&lt;wsp:rsid wsp:val=&quot;00302C35&quot;/&gt;&lt;wsp:rsid wsp:val=&quot;00311C49&quot;/&gt;&lt;wsp:rsid wsp:val=&quot;0032119E&quot;/&gt;&lt;wsp:rsid wsp:val=&quot;00321304&quot;/&gt;&lt;wsp:rsid wsp:val=&quot;00324FC2&quot;/&gt;&lt;wsp:rsid wsp:val=&quot;003312CA&quot;/&gt;&lt;wsp:rsid wsp:val=&quot;00331F84&quot;/&gt;&lt;wsp:rsid wsp:val=&quot;003329D6&quot;/&gt;&lt;wsp:rsid wsp:val=&quot;0037721F&quot;/&gt;&lt;wsp:rsid wsp:val=&quot;003950A4&quot;/&gt;&lt;wsp:rsid wsp:val=&quot;003A1E7E&quot;/&gt;&lt;wsp:rsid wsp:val=&quot;003E2FDC&quot;/&gt;&lt;wsp:rsid wsp:val=&quot;003E3577&quot;/&gt;&lt;wsp:rsid wsp:val=&quot;003F3A61&quot;/&gt;&lt;wsp:rsid wsp:val=&quot;00410A5D&quot;/&gt;&lt;wsp:rsid wsp:val=&quot;00414909&quot;/&gt;&lt;wsp:rsid wsp:val=&quot;00416537&quot;/&gt;&lt;wsp:rsid wsp:val=&quot;00425A6A&quot;/&gt;&lt;wsp:rsid wsp:val=&quot;00426FBB&quot;/&gt;&lt;wsp:rsid wsp:val=&quot;00454542&quot;/&gt;&lt;wsp:rsid wsp:val=&quot;0047429A&quot;/&gt;&lt;wsp:rsid wsp:val=&quot;0048374C&quot;/&gt;&lt;wsp:rsid wsp:val=&quot;0048771D&quot;/&gt;&lt;wsp:rsid wsp:val=&quot;004A6605&quot;/&gt;&lt;wsp:rsid wsp:val=&quot;004C45FA&quot;/&gt;&lt;wsp:rsid wsp:val=&quot;004D35A3&quot;/&gt;&lt;wsp:rsid wsp:val=&quot;004E1BD8&quot;/&gt;&lt;wsp:rsid wsp:val=&quot;004E452A&quot;/&gt;&lt;wsp:rsid wsp:val=&quot;004E78E3&quot;/&gt;&lt;wsp:rsid wsp:val=&quot;004F2BFE&quot;/&gt;&lt;wsp:rsid wsp:val=&quot;004F63D3&quot;/&gt;&lt;wsp:rsid wsp:val=&quot;004F7DCF&quot;/&gt;&lt;wsp:rsid wsp:val=&quot;005004BF&quot;/&gt;&lt;wsp:rsid wsp:val=&quot;00502E89&quot;/&gt;&lt;wsp:rsid wsp:val=&quot;00506CFE&quot;/&gt;&lt;wsp:rsid wsp:val=&quot;00510E95&quot;/&gt;&lt;wsp:rsid wsp:val=&quot;005225C3&quot;/&gt;&lt;wsp:rsid wsp:val=&quot;00527D56&quot;/&gt;&lt;wsp:rsid wsp:val=&quot;0053221F&quot;/&gt;&lt;wsp:rsid wsp:val=&quot;00536FAE&quot;/&gt;&lt;wsp:rsid wsp:val=&quot;00542C85&quot;/&gt;&lt;wsp:rsid wsp:val=&quot;00553510&quot;/&gt;&lt;wsp:rsid wsp:val=&quot;00554186&quot;/&gt;&lt;wsp:rsid wsp:val=&quot;00585769&quot;/&gt;&lt;wsp:rsid wsp:val=&quot;00585C61&quot;/&gt;&lt;wsp:rsid wsp:val=&quot;00591130&quot;/&gt;&lt;wsp:rsid wsp:val=&quot;005A3F28&quot;/&gt;&lt;wsp:rsid wsp:val=&quot;005A40BE&quot;/&gt;&lt;wsp:rsid wsp:val=&quot;005B13E2&quot;/&gt;&lt;wsp:rsid wsp:val=&quot;005B47D7&quot;/&gt;&lt;wsp:rsid wsp:val=&quot;005C5526&quot;/&gt;&lt;wsp:rsid wsp:val=&quot;005C62C6&quot;/&gt;&lt;wsp:rsid wsp:val=&quot;005D7B9E&quot;/&gt;&lt;wsp:rsid wsp:val=&quot;005E112E&quot;/&gt;&lt;wsp:rsid wsp:val=&quot;005E5515&quot;/&gt;&lt;wsp:rsid wsp:val=&quot;005F0834&quot;/&gt;&lt;wsp:rsid wsp:val=&quot;005F68AB&quot;/&gt;&lt;wsp:rsid wsp:val=&quot;005F6DC3&quot;/&gt;&lt;wsp:rsid wsp:val=&quot;00601A8E&quot;/&gt;&lt;wsp:rsid wsp:val=&quot;0062033E&quot;/&gt;&lt;wsp:rsid wsp:val=&quot;00624482&quot;/&gt;&lt;wsp:rsid wsp:val=&quot;0064799C&quot;/&gt;&lt;wsp:rsid wsp:val=&quot;00654156&quot;/&gt;&lt;wsp:rsid wsp:val=&quot;00656ADC&quot;/&gt;&lt;wsp:rsid wsp:val=&quot;006B47CA&quot;/&gt;&lt;wsp:rsid wsp:val=&quot;006C304C&quot;/&gt;&lt;wsp:rsid wsp:val=&quot;006C4511&quot;/&gt;&lt;wsp:rsid wsp:val=&quot;006C65F5&quot;/&gt;&lt;wsp:rsid wsp:val=&quot;006C7AAA&quot;/&gt;&lt;wsp:rsid wsp:val=&quot;006D1C2A&quot;/&gt;&lt;wsp:rsid wsp:val=&quot;006D264F&quot;/&gt;&lt;wsp:rsid wsp:val=&quot;006D4E89&quot;/&gt;&lt;wsp:rsid wsp:val=&quot;006E2A8D&quot;/&gt;&lt;wsp:rsid wsp:val=&quot;006E7574&quot;/&gt;&lt;wsp:rsid wsp:val=&quot;00703430&quot;/&gt;&lt;wsp:rsid wsp:val=&quot;00703548&quot;/&gt;&lt;wsp:rsid wsp:val=&quot;00704E18&quot;/&gt;&lt;wsp:rsid wsp:val=&quot;007069BE&quot;/&gt;&lt;wsp:rsid wsp:val=&quot;00745C86&quot;/&gt;&lt;wsp:rsid wsp:val=&quot;00764603&quot;/&gt;&lt;wsp:rsid wsp:val=&quot;0076604D&quot;/&gt;&lt;wsp:rsid wsp:val=&quot;00790909&quot;/&gt;&lt;wsp:rsid wsp:val=&quot;007929AF&quot;/&gt;&lt;wsp:rsid wsp:val=&quot;007B1582&quot;/&gt;&lt;wsp:rsid wsp:val=&quot;007B5A07&quot;/&gt;&lt;wsp:rsid wsp:val=&quot;007C065D&quot;/&gt;&lt;wsp:rsid wsp:val=&quot;007D3E71&quot;/&gt;&lt;wsp:rsid wsp:val=&quot;007E5D6A&quot;/&gt;&lt;wsp:rsid wsp:val=&quot;007E645D&quot;/&gt;&lt;wsp:rsid wsp:val=&quot;007F75CA&quot;/&gt;&lt;wsp:rsid wsp:val=&quot;00821E08&quot;/&gt;&lt;wsp:rsid wsp:val=&quot;00834EFD&quot;/&gt;&lt;wsp:rsid wsp:val=&quot;00844B24&quot;/&gt;&lt;wsp:rsid wsp:val=&quot;0084515F&quot;/&gt;&lt;wsp:rsid wsp:val=&quot;0085092D&quot;/&gt;&lt;wsp:rsid wsp:val=&quot;00865414&quot;/&gt;&lt;wsp:rsid wsp:val=&quot;00877D4C&quot;/&gt;&lt;wsp:rsid wsp:val=&quot;008831DC&quot;/&gt;&lt;wsp:rsid wsp:val=&quot;00883903&quot;/&gt;&lt;wsp:rsid wsp:val=&quot;00891C30&quot;/&gt;&lt;wsp:rsid wsp:val=&quot;00897219&quot;/&gt;&lt;wsp:rsid wsp:val=&quot;0089763B&quot;/&gt;&lt;wsp:rsid wsp:val=&quot;008B6AE3&quot;/&gt;&lt;wsp:rsid wsp:val=&quot;008C1332&quot;/&gt;&lt;wsp:rsid wsp:val=&quot;008D1045&quot;/&gt;&lt;wsp:rsid wsp:val=&quot;008E5996&quot;/&gt;&lt;wsp:rsid wsp:val=&quot;00901AE1&quot;/&gt;&lt;wsp:rsid wsp:val=&quot;00912F93&quot;/&gt;&lt;wsp:rsid wsp:val=&quot;009205B4&quot;/&gt;&lt;wsp:rsid wsp:val=&quot;00955B59&quot;/&gt;&lt;wsp:rsid wsp:val=&quot;00992262&quot;/&gt;&lt;wsp:rsid wsp:val=&quot;009926BC&quot;/&gt;&lt;wsp:rsid wsp:val=&quot;009A4319&quot;/&gt;&lt;wsp:rsid wsp:val=&quot;009A6C3F&quot;/&gt;&lt;wsp:rsid wsp:val=&quot;009B73F2&quot;/&gt;&lt;wsp:rsid wsp:val=&quot;009C12BD&quot;/&gt;&lt;wsp:rsid wsp:val=&quot;009C50FE&quot;/&gt;&lt;wsp:rsid wsp:val=&quot;009E49DD&quot;/&gt;&lt;wsp:rsid wsp:val=&quot;00A03E75&quot;/&gt;&lt;wsp:rsid wsp:val=&quot;00A20627&quot;/&gt;&lt;wsp:rsid wsp:val=&quot;00A22FE9&quot;/&gt;&lt;wsp:rsid wsp:val=&quot;00A31A44&quot;/&gt;&lt;wsp:rsid wsp:val=&quot;00A32BFA&quot;/&gt;&lt;wsp:rsid wsp:val=&quot;00A3325E&quot;/&gt;&lt;wsp:rsid wsp:val=&quot;00A45FCE&quot;/&gt;&lt;wsp:rsid wsp:val=&quot;00A75671&quot;/&gt;&lt;wsp:rsid wsp:val=&quot;00A773CC&quot;/&gt;&lt;wsp:rsid wsp:val=&quot;00A924D0&quot;/&gt;&lt;wsp:rsid wsp:val=&quot;00A9318B&quot;/&gt;&lt;wsp:rsid wsp:val=&quot;00A94AC1&quot;/&gt;&lt;wsp:rsid wsp:val=&quot;00AB18B7&quot;/&gt;&lt;wsp:rsid wsp:val=&quot;00AD335D&quot;/&gt;&lt;wsp:rsid wsp:val=&quot;00AF114C&quot;/&gt;&lt;wsp:rsid wsp:val=&quot;00AF792B&quot;/&gt;&lt;wsp:rsid wsp:val=&quot;00B32137&quot;/&gt;&lt;wsp:rsid wsp:val=&quot;00B33D2F&quot;/&gt;&lt;wsp:rsid wsp:val=&quot;00B40A5B&quot;/&gt;&lt;wsp:rsid wsp:val=&quot;00B45C6B&quot;/&gt;&lt;wsp:rsid wsp:val=&quot;00B55D5E&quot;/&gt;&lt;wsp:rsid wsp:val=&quot;00B57A80&quot;/&gt;&lt;wsp:rsid wsp:val=&quot;00B70E9C&quot;/&gt;&lt;wsp:rsid wsp:val=&quot;00B713D8&quot;/&gt;&lt;wsp:rsid wsp:val=&quot;00B72979&quot;/&gt;&lt;wsp:rsid wsp:val=&quot;00B94516&quot;/&gt;&lt;wsp:rsid wsp:val=&quot;00BA25E2&quot;/&gt;&lt;wsp:rsid wsp:val=&quot;00BB2855&quot;/&gt;&lt;wsp:rsid wsp:val=&quot;00BC5343&quot;/&gt;&lt;wsp:rsid wsp:val=&quot;00BD19C1&quot;/&gt;&lt;wsp:rsid wsp:val=&quot;00BD25B8&quot;/&gt;&lt;wsp:rsid wsp:val=&quot;00C012E1&quot;/&gt;&lt;wsp:rsid wsp:val=&quot;00C06BB4&quot;/&gt;&lt;wsp:rsid wsp:val=&quot;00C10D20&quot;/&gt;&lt;wsp:rsid wsp:val=&quot;00C12E0C&quot;/&gt;&lt;wsp:rsid wsp:val=&quot;00C21916&quot;/&gt;&lt;wsp:rsid wsp:val=&quot;00C34915&quot;/&gt;&lt;wsp:rsid wsp:val=&quot;00C457CA&quot;/&gt;&lt;wsp:rsid wsp:val=&quot;00C53FB6&quot;/&gt;&lt;wsp:rsid wsp:val=&quot;00C57FB7&quot;/&gt;&lt;wsp:rsid wsp:val=&quot;00C644D4&quot;/&gt;&lt;wsp:rsid wsp:val=&quot;00C65F3F&quot;/&gt;&lt;wsp:rsid wsp:val=&quot;00C72414&quot;/&gt;&lt;wsp:rsid wsp:val=&quot;00C72B1A&quot;/&gt;&lt;wsp:rsid wsp:val=&quot;00C8667B&quot;/&gt;&lt;wsp:rsid wsp:val=&quot;00C90993&quot;/&gt;&lt;wsp:rsid wsp:val=&quot;00CA4CE3&quot;/&gt;&lt;wsp:rsid wsp:val=&quot;00CC72FD&quot;/&gt;&lt;wsp:rsid wsp:val=&quot;00CD1D23&quot;/&gt;&lt;wsp:rsid wsp:val=&quot;00CD4F3F&quot;/&gt;&lt;wsp:rsid wsp:val=&quot;00D311F8&quot;/&gt;&lt;wsp:rsid wsp:val=&quot;00D31660&quot;/&gt;&lt;wsp:rsid wsp:val=&quot;00D36B52&quot;/&gt;&lt;wsp:rsid wsp:val=&quot;00D377C8&quot;/&gt;&lt;wsp:rsid wsp:val=&quot;00D41274&quot;/&gt;&lt;wsp:rsid wsp:val=&quot;00D4229C&quot;/&gt;&lt;wsp:rsid wsp:val=&quot;00D43BF3&quot;/&gt;&lt;wsp:rsid wsp:val=&quot;00D549FB&quot;/&gt;&lt;wsp:rsid wsp:val=&quot;00D56487&quot;/&gt;&lt;wsp:rsid wsp:val=&quot;00D767BB&quot;/&gt;&lt;wsp:rsid wsp:val=&quot;00D939B0&quot;/&gt;&lt;wsp:rsid wsp:val=&quot;00DA31A2&quot;/&gt;&lt;wsp:rsid wsp:val=&quot;00DB16E0&quot;/&gt;&lt;wsp:rsid wsp:val=&quot;00DB2DF9&quot;/&gt;&lt;wsp:rsid wsp:val=&quot;00DB465D&quot;/&gt;&lt;wsp:rsid wsp:val=&quot;00DB48A2&quot;/&gt;&lt;wsp:rsid wsp:val=&quot;00DB7E63&quot;/&gt;&lt;wsp:rsid wsp:val=&quot;00DC2055&quot;/&gt;&lt;wsp:rsid wsp:val=&quot;00DC3908&quot;/&gt;&lt;wsp:rsid wsp:val=&quot;00DD71E8&quot;/&gt;&lt;wsp:rsid wsp:val=&quot;00DD7F83&quot;/&gt;&lt;wsp:rsid wsp:val=&quot;00DE4EB8&quot;/&gt;&lt;wsp:rsid wsp:val=&quot;00E0641E&quot;/&gt;&lt;wsp:rsid wsp:val=&quot;00E06664&quot;/&gt;&lt;wsp:rsid wsp:val=&quot;00E304BC&quot;/&gt;&lt;wsp:rsid wsp:val=&quot;00E32853&quot;/&gt;&lt;wsp:rsid wsp:val=&quot;00E34EBD&quot;/&gt;&lt;wsp:rsid wsp:val=&quot;00E401F8&quot;/&gt;&lt;wsp:rsid wsp:val=&quot;00E46425&quot;/&gt;&lt;wsp:rsid wsp:val=&quot;00E469FC&quot;/&gt;&lt;wsp:rsid wsp:val=&quot;00E47D0E&quot;/&gt;&lt;wsp:rsid wsp:val=&quot;00E65018&quot;/&gt;&lt;wsp:rsid wsp:val=&quot;00E76CA1&quot;/&gt;&lt;wsp:rsid wsp:val=&quot;00E94339&quot;/&gt;&lt;wsp:rsid wsp:val=&quot;00E97563&quot;/&gt;&lt;wsp:rsid wsp:val=&quot;00EB0B63&quot;/&gt;&lt;wsp:rsid wsp:val=&quot;00EC265C&quot;/&gt;&lt;wsp:rsid wsp:val=&quot;00ED61CB&quot;/&gt;&lt;wsp:rsid wsp:val=&quot;00EE752A&quot;/&gt;&lt;wsp:rsid wsp:val=&quot;00F06A72&quot;/&gt;&lt;wsp:rsid wsp:val=&quot;00F136F0&quot;/&gt;&lt;wsp:rsid wsp:val=&quot;00F20BBB&quot;/&gt;&lt;wsp:rsid wsp:val=&quot;00F36048&quot;/&gt;&lt;wsp:rsid wsp:val=&quot;00F43BD8&quot;/&gt;&lt;wsp:rsid wsp:val=&quot;00F562F3&quot;/&gt;&lt;wsp:rsid wsp:val=&quot;00F74B89&quot;/&gt;&lt;wsp:rsid wsp:val=&quot;00F75133&quot;/&gt;&lt;wsp:rsid wsp:val=&quot;00F83272&quot;/&gt;&lt;wsp:rsid wsp:val=&quot;00F9358D&quot;/&gt;&lt;wsp:rsid wsp:val=&quot;00F9369B&quot;/&gt;&lt;wsp:rsid wsp:val=&quot;00FA3899&quot;/&gt;&lt;wsp:rsid wsp:val=&quot;00FA4909&quot;/&gt;&lt;wsp:rsid wsp:val=&quot;00FA5164&quot;/&gt;&lt;wsp:rsid wsp:val=&quot;00FA6751&quot;/&gt;&lt;wsp:rsid wsp:val=&quot;00FA6BD7&quot;/&gt;&lt;wsp:rsid wsp:val=&quot;00FB1048&quot;/&gt;&lt;wsp:rsid wsp:val=&quot;00FB62C4&quot;/&gt;&lt;wsp:rsid wsp:val=&quot;00FB7701&quot;/&gt;&lt;wsp:rsid wsp:val=&quot;00FD1AC5&quot;/&gt;&lt;wsp:rsid wsp:val=&quot;00FD5CF0&quot;/&gt;&lt;/wsp:rsids&gt;&lt;/w:docPr&gt;&lt;w:body&gt;&lt;wx:sect&gt;&lt;w:p wsp:rsidR=&quot;005E5515&quot; wsp:rsidRPr=&quot;005E5515&quot; wsp:rsidRDefault=&quot;005E5515&quot; wsp:rsidP=&quot;005E5515&quot;&gt;&lt;m:oMathPara&gt;&lt;m:oMath&gt;&lt;m:sSub&gt;&lt;m:sSubPr&gt;&lt;m:ctrlPr&gt;&lt;w:rPr&gt;&lt;w:rFonts w:ascii=&quot;Cambria Math&quot; w:h-ansi=&quot;Cambria Math&quot;/&gt;&lt;wx:font wx:val=&quot;Cambria Math&quot;/&gt;&lt;w:i/&gt;&lt;/w:rPr&gt;&lt;/m:ctrlPr&gt;&lt;/m:sSubPr&gt;&lt;m:e&gt;&lt;m:r&gt;&lt;w:rPr&gt;&lt;w:rFonts w:ascii=&quot;Cambria Math&quot; w:h-ansi=&quot;Cambria Math&quot;/&gt;&lt;wx:font wx:val=&quot;Cambria Math&quot;/&gt;&lt;w:i/&gt;&lt;/w:rPr&gt;&lt;m:t&gt;C&lt;/m:t&gt;&lt;/m:r&gt;&lt;/m:e&gt;&lt;m:sub&gt;&lt;m:r&gt;&lt;w:rPr&gt;&lt;w:rFonts w:ascii=&quot;Cambria Math&quot; w:h-ansi=&quot;Cambria Math&quot;/&gt;&lt;wx:font wx:val=&quot;Cambria Math&quot;/&gt;&lt;w:i/&gt;&lt;/w:rPr&gt;&lt;m:t&gt;T&lt;/m:t&gt;&lt;/m:r&gt;&lt;/m:sub&gt;&lt;/m:sSub&gt;&lt;m:r&gt;&lt;w:rPr&gt;&lt;w:rFonts w:ascii=&quot;Cambria Math&quot; w:h-ansi=&quot;Cambria Math&quot;/&gt;&lt;wx:font wx:val=&quot;Cambria Math&quot;/&gt;&lt;w:i/&gt;&lt;/w:rPr&gt;&lt;m:t&gt;=4Ã—&lt;/m:t&gt;&lt;/m:r&gt;&lt;m:sSup&gt;&lt;m:sSupPr&gt;&lt;m:ctrlPr&gt;&lt;w:rPr&gt;&lt;w:rFonts w:ascii=&quot;Cambria Math&quot; w:h-ansi=&quot;Cambria Math&quot;/&gt;&lt;wx:font wx:val=&quot;Cambria Math&quot;/&gt;&lt;w:i/&gt;&lt;/w:rPr&gt;&lt;/m:ctrlPr&gt;&lt;/m:sSupPr&gt;&lt;m:e&gt;&lt;m:r&gt;&lt;w:rPr&gt;&lt;w:rFonts w:ascii=&quot;Cambria Math&quot; w:h-ansi=&quot;Cambria Math&quot;/&gt;&lt;wx:font wx:val=&quot;Cambria Math&quot;/&gt;&lt;w:i/&gt;&lt;/w:rPr&gt;&lt;m:t&gt;10&lt;/m:t&gt;&lt;/m:r&gt;&lt;/m:e&gt;&lt;m:sup&gt;&lt;m:r&gt;&lt;w:rPr&gt;&lt;w:rFonts w:ascii=&quot;Cambria Math&quot; w:h-ansi=&quot;Cambria Math&quot;/&gt;&lt;wx:font wx:val=&quot;Cambria Math&quot;/&gt;&lt;w:i/&gt;&lt;/w:rPr&gt;&lt;m:t&gt;-5&lt;/m:t&gt;&lt;/m:r&gt;&lt;/m:sup&gt;&lt;/m:sSup&gt;&lt;m:r&gt;&lt;w:rPr&gt;&lt;w:rFonts w:ascii=&quot;Cambria Math&quot; w:h-ansi=&quot;Cambria Math&quot;/&gt;&lt;wx:font wx:val=&quot;Cambria Math&quot;/&gt;&lt;w:i/&gt;&lt;/w:rPr&gt;&lt;m:t&gt;âˆ™&lt;/m:t&gt;&lt;/m:r&gt;&lt;m:sSub&gt;&lt;m:sSubPr&gt;&lt;m:ctrlPr&gt;&lt;w:rPr&gt;&lt;w:rFonts w:ascii=&quot;Cambria Math&quot; w:h-ansi=&quot;Cambria Math&quot;/&gt;&lt;wx:font wx:val=&quot;Cambria Math&quot;/&gt;&lt;w:i/&gt;&lt;/w:rPr&gt;&lt;/m:ctrlPr&gt;&lt;/m:sSubPr&gt;&lt;m:e&gt;&lt;m:r&gt;&lt;w:rPr&gt;&lt;w:rFonts w:ascii=&quot;Cambria Math&quot; w:h-ansi=&quot;Cambria Math&quot;/&gt;&lt;wx:font wx:val=&quot;Cambria Math&quot;/&gt;&lt;w:i/&gt;&lt;/w:rPr&gt;&lt;m:t&gt;t&lt;/m:t&gt;&lt;/m:r&gt;&lt;/m:e&gt;&lt;m:sub&gt;&lt;m:r&gt;&lt;w:rPr&gt;&lt;w:rFonts w:ascii=&quot;Cambria Math&quot; w:h-ansi=&quot;Cambria Math&quot;/&gt;&lt;wx:font wx:val=&quot;Cambria Math&quot;/&gt;&lt;w:i/&gt;&lt;/w:rPr&gt;&lt;m:t&gt;on&lt;/m:t&gt;&lt;/m:r&gt;&lt;/m:sub&gt;&lt;/m:sSub&gt;&lt;/m:oMath&gt;&lt;/m:oMathPara&gt;&lt;/w:p&gt;&lt;w:sectPr wsp:rsidR=&quot;00000000&quot; wsp:rsidRPr=&quot;005E5515&quot;&gt;&lt;w:pgSz w:w=&quot;12240&quot; w:h=&quot;15840&quot;/&gt;&lt;w:pgMar w:top=&quot;1440&quot; w:right=&quot;1440&quot; w:bottom=&quot;1440&quot; w:left=&quot;1440&quot; w:header=&quot;720&quot; w:footer=&quot;720&quot; w:gutter=&quot;0&quot;/&gt;&lt;w:cols w:space=&quot;720&quot;/&gt;&lt;/w:sectPr&gt;&lt;/wx:sect&gt;&lt;/w:body&gt;&lt;/w:wordDocument&gt;">
+                <v:shape id="_x0000_i1058" type="#_x0000_t75" style="width:90pt;height:13.15pt" equationxml="&lt;?xml version=&quot;1.0&quot; encoding=&quot;UTF-8&quot; standalone=&quot;yes&quot;?&gt;&#10;&lt;?mso-application progid=&quot;Word.Document&quot;?&gt;&#10;&lt;w:wordDocument xmlns:aml=&quot;http://schemas.microsoft.com/aml/2001/core&quot; xmlns:wpc=&quot;http://schemas.microsoft.com/office/word/2010/wordprocessingCanvas&quot; xmlns:cx=&quot;http://schemas.microsoft.com/office/drawing/2014/chartex&quot; xmlns:cx1=&quot;http://schemas.microsoft.com/office/drawing/2015/9/8/chartex&quot; xmlns:cx2=&quot;http://schemas.microsoft.com/office/drawing/2015/10/21/chartex&quot; xmlns:cx3=&quot;http://schemas.microsoft.com/office/drawing/2016/5/9/chartex&quot; xmlns:cx4=&quot;http://schemas.microsoft.com/office/drawing/2016/5/10/chartex&quot; xmlns:cx5=&quot;http://schemas.microsoft.com/office/drawing/2016/5/11/chartex&quot; xmlns:cx6=&quot;http://schemas.microsoft.com/office/drawing/2016/5/12/chartex&quot; xmlns:cx7=&quot;http://schemas.microsoft.com/office/drawing/2016/5/13/chartex&quot; xmlns:cx8=&quot;http://schemas.microsoft.com/office/drawing/2016/5/14/chartex&quot; xmlns:cr=&quot;http://schemas.microsoft.com/office/comments/2020/reactions&quot; xmlns:dt=&quot;uuid:C2F41010-65B3-11d1-A29F-00AA00C14882&quot; xmlns:mc=&quot;http://schemas.openxmlformats.org/markup-compatibility/2006&quot; xmlns:aink=&quot;http://schemas.microsoft.com/office/drawing/2016/ink&quot; xmlns:am3d=&quot;http://schemas.microsoft.com/office/drawing/2017/model3d&quot; xmlns:o=&quot;urn:schemas-microsoft-com:office:office&quot; xmlns:oel=&quot;http://schemas.microsoft.com/office/2019/extlst&quot; xmlns:m=&quot;http://schemas.openxmlformats.org/officeDocument/2006/math&quot; xmlns:v=&quot;urn:schemas-microsoft-com:vml&quot; xmlns:w10=&quot;urn:schemas-microsoft-com:office:word&quot; xmlns:w=&quot;http://schemas.microsoft.com/office/word/2003/wordml&quot; xmlns:wx=&quot;http://schemas.microsoft.com/office/word/2003/auxHint&quot; xmlns:wne=&quot;http://schemas.microsoft.com/office/word/2006/wordml&quot; xmlns:wsp=&quot;http://schemas.microsoft.com/office/word/2003/wordml/sp2&quot; xmlns:sl=&quot;http://schemas.microsoft.com/schemaLibrary/2003/core&quot; w:macrosPresent=&quot;no&quot; w:embeddedObjPresent=&quot;no&quot; w:ocxPresent=&quot;no&quot; xml:space=&quot;preserve&quot;&gt;&lt;w:ignoreSubtree w:val=&quot;http://schemas.microsoft.com/office/word/2003/wordml/sp2&quot;/&gt;&lt;o:DocumentProperties&gt;&lt;o:Version&gt;16&lt;/o:Version&gt;&lt;/o:DocumentProperties&gt;&lt;w:docPr&gt;&lt;w:view w:val=&quot;print&quot;/&gt;&lt;w:zoom w:percent=&quot;100&quot;/&gt;&lt;w:doNotEmbedSystemFonts/&gt;&lt;w:activeWritingStyle w:lang=&quot;EN-AU&quot; w:vendorID=&quot;64&quot; w:dllVersion=&quot;6&quot; w:nlCheck=&quot;on&quot; w:optionSet=&quot;1&quot;/&gt;&lt;w:activeWritingStyle w:lang=&quot;EN-GB&quot; w:vendorID=&quot;64&quot; w:dllVersion=&quot;6&quot; w:nlCheck=&quot;on&quot; w:optionSet=&quot;1&quot;/&gt;&lt;w:activeWritingStyle w:lang=&quot;EN-US&quot; w:vendorID=&quot;64&quot; w:dllVersion=&quot;6&quot; w:nlCheck=&quot;on&quot; w:optionSet=&quot;1&quot;/&gt;&lt;w:activeWritingStyle w:lang=&quot;EN-AU&quot; w:vendorID=&quot;64&quot; w:dllVersion=&quot;0&quot; w:nlCheck=&quot;on&quot; w:optionSet=&quot;0&quot;/&gt;&lt;w:activeWritingStyle w:lang=&quot;EN-GB&quot; w:vendorID=&quot;64&quot; w:dllVersion=&quot;0&quot; w:nlCheck=&quot;on&quot; w:optionSet=&quot;0&quot;/&gt;&lt;w:activeWritingStyle w:lang=&quot;EN-US&quot; w:vendorID=&quot;64&quot; w:dllVersion=&quot;0&quot; w:nlCheck=&quot;on&quot; w:optionSet=&quot;0&quot;/&gt;&lt;w:activeWritingStyle w:lang=&quot;ES-AR&quot; w:vendorID=&quot;64&quot; w:dllVersion=&quot;0&quot; w:nlCheck=&quot;on&quot; w:optionSet=&quot;0&quot;/&gt;&lt;w:activeWritingStyle w:lang=&quot;580A&quot; w:vendorID=&quot;64&quot; w:dllVersion=&quot;0&quot; w:nlCheck=&quot;on&quot; w:optionSet=&quot;0&quot;/&gt;&lt;w:activeWritingStyle w:lang=&quot;PT-BR&quot; w:vendorID=&quot;64&quot; w:dllVersion=&quot;0&quot; w:nlCheck=&quot;on&quot; w:optionSet=&quot;0&quot;/&gt;&lt;w:stylePaneFormatFilter w:val=&quot;3F01&quot;/&gt;&lt;w:defaultTabStop w:val=&quot;720&quot;/&gt;&lt;w:hyphenationZone w:val=&quot;425&quot;/&gt;&lt;w:characterSpacingControl w:val=&quot;DontCompress&quot;/&gt;&lt;w:optimizeForBrowser/&gt;&lt;w:validateAgainstSchema/&gt;&lt;w:saveInvalidXML w:val=&quot;off&quot;/&gt;&lt;w:ignoreMixedContent w:val=&quot;off&quot;/&gt;&lt;w:alwaysShowPlaceholderText w:val=&quot;off&quot;/&gt;&lt;w:compat&gt;&lt;w:breakWrappedTables/&gt;&lt;w:snapToGridInCell/&gt;&lt;w:applyBreakingRules/&gt;&lt;w:wrapTextWithPunct/&gt;&lt;w:useAsianBreakRules/&gt;&lt;w:useWord2002TableStyleRules/&gt;&lt;w:useFELayout/&gt;&lt;/w:compat&gt;&lt;wsp:rsids&gt;&lt;wsp:rsidRoot wsp:val=&quot;00426FBB&quot;/&gt;&lt;wsp:rsid wsp:val=&quot;000002E1&quot;/&gt;&lt;wsp:rsid wsp:val=&quot;00003C97&quot;/&gt;&lt;wsp:rsid wsp:val=&quot;00005565&quot;/&gt;&lt;wsp:rsid wsp:val=&quot;0001754A&quot;/&gt;&lt;wsp:rsid wsp:val=&quot;00017719&quot;/&gt;&lt;wsp:rsid wsp:val=&quot;00027F1D&quot;/&gt;&lt;wsp:rsid wsp:val=&quot;0003296C&quot;/&gt;&lt;wsp:rsid wsp:val=&quot;0003351F&quot;/&gt;&lt;wsp:rsid wsp:val=&quot;00044599&quot;/&gt;&lt;wsp:rsid wsp:val=&quot;000540E6&quot;/&gt;&lt;wsp:rsid wsp:val=&quot;00054421&quot;/&gt;&lt;wsp:rsid wsp:val=&quot;00062E46&quot;/&gt;&lt;wsp:rsid wsp:val=&quot;00074AC8&quot;/&gt;&lt;wsp:rsid wsp:val=&quot;00081408&quot;/&gt;&lt;wsp:rsid wsp:val=&quot;00081EBE&quot;/&gt;&lt;wsp:rsid wsp:val=&quot;00086EDC&quot;/&gt;&lt;wsp:rsid wsp:val=&quot;000B1236&quot;/&gt;&lt;wsp:rsid wsp:val=&quot;000B36A3&quot;/&gt;&lt;wsp:rsid wsp:val=&quot;000C013C&quot;/&gt;&lt;wsp:rsid wsp:val=&quot;000E3F84&quot;/&gt;&lt;wsp:rsid wsp:val=&quot;001056DF&quot;/&gt;&lt;wsp:rsid wsp:val=&quot;0010789C&quot;/&gt;&lt;wsp:rsid wsp:val=&quot;00114025&quot;/&gt;&lt;wsp:rsid wsp:val=&quot;001160D2&quot;/&gt;&lt;wsp:rsid wsp:val=&quot;00120636&quot;/&gt;&lt;wsp:rsid wsp:val=&quot;001348A5&quot;/&gt;&lt;wsp:rsid wsp:val=&quot;00151B8E&quot;/&gt;&lt;wsp:rsid wsp:val=&quot;00182170&quot;/&gt;&lt;wsp:rsid wsp:val=&quot;001928FB&quot;/&gt;&lt;wsp:rsid wsp:val=&quot;00192BC7&quot;/&gt;&lt;wsp:rsid wsp:val=&quot;00195BE6&quot;/&gt;&lt;wsp:rsid wsp:val=&quot;001A3C37&quot;/&gt;&lt;wsp:rsid wsp:val=&quot;001A50EA&quot;/&gt;&lt;wsp:rsid wsp:val=&quot;001F16CD&quot;/&gt;&lt;wsp:rsid wsp:val=&quot;001F47D2&quot;/&gt;&lt;wsp:rsid wsp:val=&quot;002029C8&quot;/&gt;&lt;wsp:rsid wsp:val=&quot;0022285A&quot;/&gt;&lt;wsp:rsid wsp:val=&quot;00224C61&quot;/&gt;&lt;wsp:rsid wsp:val=&quot;00256ABC&quot;/&gt;&lt;wsp:rsid wsp:val=&quot;0027227B&quot;/&gt;&lt;wsp:rsid wsp:val=&quot;00273AC7&quot;/&gt;&lt;wsp:rsid wsp:val=&quot;00273D2C&quot;/&gt;&lt;wsp:rsid wsp:val=&quot;00285ECD&quot;/&gt;&lt;wsp:rsid wsp:val=&quot;00290E1B&quot;/&gt;&lt;wsp:rsid wsp:val=&quot;00291B17&quot;/&gt;&lt;wsp:rsid wsp:val=&quot;00291BB3&quot;/&gt;&lt;wsp:rsid wsp:val=&quot;002A6742&quot;/&gt;&lt;wsp:rsid wsp:val=&quot;002C1A7F&quot;/&gt;&lt;wsp:rsid wsp:val=&quot;002C4239&quot;/&gt;&lt;wsp:rsid wsp:val=&quot;002C559D&quot;/&gt;&lt;wsp:rsid wsp:val=&quot;002D16AE&quot;/&gt;&lt;wsp:rsid wsp:val=&quot;002D2D42&quot;/&gt;&lt;wsp:rsid wsp:val=&quot;002F72D0&quot;/&gt;&lt;wsp:rsid wsp:val=&quot;002F7A4F&quot;/&gt;&lt;wsp:rsid wsp:val=&quot;003003AB&quot;/&gt;&lt;wsp:rsid wsp:val=&quot;00302C35&quot;/&gt;&lt;wsp:rsid wsp:val=&quot;00311C49&quot;/&gt;&lt;wsp:rsid wsp:val=&quot;0032119E&quot;/&gt;&lt;wsp:rsid wsp:val=&quot;00321304&quot;/&gt;&lt;wsp:rsid wsp:val=&quot;00324FC2&quot;/&gt;&lt;wsp:rsid wsp:val=&quot;003312CA&quot;/&gt;&lt;wsp:rsid wsp:val=&quot;00331F84&quot;/&gt;&lt;wsp:rsid wsp:val=&quot;003329D6&quot;/&gt;&lt;wsp:rsid wsp:val=&quot;0037721F&quot;/&gt;&lt;wsp:rsid wsp:val=&quot;003950A4&quot;/&gt;&lt;wsp:rsid wsp:val=&quot;003A1E7E&quot;/&gt;&lt;wsp:rsid wsp:val=&quot;003E2FDC&quot;/&gt;&lt;wsp:rsid wsp:val=&quot;003E3577&quot;/&gt;&lt;wsp:rsid wsp:val=&quot;003F3A61&quot;/&gt;&lt;wsp:rsid wsp:val=&quot;00410A5D&quot;/&gt;&lt;wsp:rsid wsp:val=&quot;00414909&quot;/&gt;&lt;wsp:rsid wsp:val=&quot;00416537&quot;/&gt;&lt;wsp:rsid wsp:val=&quot;00425A6A&quot;/&gt;&lt;wsp:rsid wsp:val=&quot;00426FBB&quot;/&gt;&lt;wsp:rsid wsp:val=&quot;00454542&quot;/&gt;&lt;wsp:rsid wsp:val=&quot;0047429A&quot;/&gt;&lt;wsp:rsid wsp:val=&quot;0048374C&quot;/&gt;&lt;wsp:rsid wsp:val=&quot;0048771D&quot;/&gt;&lt;wsp:rsid wsp:val=&quot;004A6605&quot;/&gt;&lt;wsp:rsid wsp:val=&quot;004C45FA&quot;/&gt;&lt;wsp:rsid wsp:val=&quot;004D35A3&quot;/&gt;&lt;wsp:rsid wsp:val=&quot;004E1BD8&quot;/&gt;&lt;wsp:rsid wsp:val=&quot;004E452A&quot;/&gt;&lt;wsp:rsid wsp:val=&quot;004E78E3&quot;/&gt;&lt;wsp:rsid wsp:val=&quot;004F2BFE&quot;/&gt;&lt;wsp:rsid wsp:val=&quot;004F63D3&quot;/&gt;&lt;wsp:rsid wsp:val=&quot;004F7DCF&quot;/&gt;&lt;wsp:rsid wsp:val=&quot;005004BF&quot;/&gt;&lt;wsp:rsid wsp:val=&quot;00502E89&quot;/&gt;&lt;wsp:rsid wsp:val=&quot;00506CFE&quot;/&gt;&lt;wsp:rsid wsp:val=&quot;00510E95&quot;/&gt;&lt;wsp:rsid wsp:val=&quot;005225C3&quot;/&gt;&lt;wsp:rsid wsp:val=&quot;00527D56&quot;/&gt;&lt;wsp:rsid wsp:val=&quot;0053221F&quot;/&gt;&lt;wsp:rsid wsp:val=&quot;00536FAE&quot;/&gt;&lt;wsp:rsid wsp:val=&quot;00542C85&quot;/&gt;&lt;wsp:rsid wsp:val=&quot;00553510&quot;/&gt;&lt;wsp:rsid wsp:val=&quot;00554186&quot;/&gt;&lt;wsp:rsid wsp:val=&quot;00585769&quot;/&gt;&lt;wsp:rsid wsp:val=&quot;00585C61&quot;/&gt;&lt;wsp:rsid wsp:val=&quot;00591130&quot;/&gt;&lt;wsp:rsid wsp:val=&quot;005A3F28&quot;/&gt;&lt;wsp:rsid wsp:val=&quot;005A40BE&quot;/&gt;&lt;wsp:rsid wsp:val=&quot;005B13E2&quot;/&gt;&lt;wsp:rsid wsp:val=&quot;005B47D7&quot;/&gt;&lt;wsp:rsid wsp:val=&quot;005C5526&quot;/&gt;&lt;wsp:rsid wsp:val=&quot;005C62C6&quot;/&gt;&lt;wsp:rsid wsp:val=&quot;005D7B9E&quot;/&gt;&lt;wsp:rsid wsp:val=&quot;005E112E&quot;/&gt;&lt;wsp:rsid wsp:val=&quot;005E5515&quot;/&gt;&lt;wsp:rsid wsp:val=&quot;005F0834&quot;/&gt;&lt;wsp:rsid wsp:val=&quot;005F68AB&quot;/&gt;&lt;wsp:rsid wsp:val=&quot;005F6DC3&quot;/&gt;&lt;wsp:rsid wsp:val=&quot;00601A8E&quot;/&gt;&lt;wsp:rsid wsp:val=&quot;0062033E&quot;/&gt;&lt;wsp:rsid wsp:val=&quot;00624482&quot;/&gt;&lt;wsp:rsid wsp:val=&quot;0064799C&quot;/&gt;&lt;wsp:rsid wsp:val=&quot;00654156&quot;/&gt;&lt;wsp:rsid wsp:val=&quot;00656ADC&quot;/&gt;&lt;wsp:rsid wsp:val=&quot;006B47CA&quot;/&gt;&lt;wsp:rsid wsp:val=&quot;006C304C&quot;/&gt;&lt;wsp:rsid wsp:val=&quot;006C4511&quot;/&gt;&lt;wsp:rsid wsp:val=&quot;006C65F5&quot;/&gt;&lt;wsp:rsid wsp:val=&quot;006C7AAA&quot;/&gt;&lt;wsp:rsid wsp:val=&quot;006D1C2A&quot;/&gt;&lt;wsp:rsid wsp:val=&quot;006D264F&quot;/&gt;&lt;wsp:rsid wsp:val=&quot;006D4E89&quot;/&gt;&lt;wsp:rsid wsp:val=&quot;006E2A8D&quot;/&gt;&lt;wsp:rsid wsp:val=&quot;006E7574&quot;/&gt;&lt;wsp:rsid wsp:val=&quot;00703430&quot;/&gt;&lt;wsp:rsid wsp:val=&quot;00703548&quot;/&gt;&lt;wsp:rsid wsp:val=&quot;00704E18&quot;/&gt;&lt;wsp:rsid wsp:val=&quot;007069BE&quot;/&gt;&lt;wsp:rsid wsp:val=&quot;00745C86&quot;/&gt;&lt;wsp:rsid wsp:val=&quot;00764603&quot;/&gt;&lt;wsp:rsid wsp:val=&quot;0076604D&quot;/&gt;&lt;wsp:rsid wsp:val=&quot;00790909&quot;/&gt;&lt;wsp:rsid wsp:val=&quot;007929AF&quot;/&gt;&lt;wsp:rsid wsp:val=&quot;007B1582&quot;/&gt;&lt;wsp:rsid wsp:val=&quot;007B5A07&quot;/&gt;&lt;wsp:rsid wsp:val=&quot;007C065D&quot;/&gt;&lt;wsp:rsid wsp:val=&quot;007D3E71&quot;/&gt;&lt;wsp:rsid wsp:val=&quot;007E5D6A&quot;/&gt;&lt;wsp:rsid wsp:val=&quot;007E645D&quot;/&gt;&lt;wsp:rsid wsp:val=&quot;007F75CA&quot;/&gt;&lt;wsp:rsid wsp:val=&quot;00821E08&quot;/&gt;&lt;wsp:rsid wsp:val=&quot;00834EFD&quot;/&gt;&lt;wsp:rsid wsp:val=&quot;00844B24&quot;/&gt;&lt;wsp:rsid wsp:val=&quot;0084515F&quot;/&gt;&lt;wsp:rsid wsp:val=&quot;0085092D&quot;/&gt;&lt;wsp:rsid wsp:val=&quot;00865414&quot;/&gt;&lt;wsp:rsid wsp:val=&quot;00877D4C&quot;/&gt;&lt;wsp:rsid wsp:val=&quot;008831DC&quot;/&gt;&lt;wsp:rsid wsp:val=&quot;00883903&quot;/&gt;&lt;wsp:rsid wsp:val=&quot;00891C30&quot;/&gt;&lt;wsp:rsid wsp:val=&quot;00897219&quot;/&gt;&lt;wsp:rsid wsp:val=&quot;0089763B&quot;/&gt;&lt;wsp:rsid wsp:val=&quot;008B6AE3&quot;/&gt;&lt;wsp:rsid wsp:val=&quot;008C1332&quot;/&gt;&lt;wsp:rsid wsp:val=&quot;008D1045&quot;/&gt;&lt;wsp:rsid wsp:val=&quot;008E5996&quot;/&gt;&lt;wsp:rsid wsp:val=&quot;00901AE1&quot;/&gt;&lt;wsp:rsid wsp:val=&quot;00912F93&quot;/&gt;&lt;wsp:rsid wsp:val=&quot;009205B4&quot;/&gt;&lt;wsp:rsid wsp:val=&quot;00955B59&quot;/&gt;&lt;wsp:rsid wsp:val=&quot;00992262&quot;/&gt;&lt;wsp:rsid wsp:val=&quot;009926BC&quot;/&gt;&lt;wsp:rsid wsp:val=&quot;009A4319&quot;/&gt;&lt;wsp:rsid wsp:val=&quot;009A6C3F&quot;/&gt;&lt;wsp:rsid wsp:val=&quot;009B73F2&quot;/&gt;&lt;wsp:rsid wsp:val=&quot;009C12BD&quot;/&gt;&lt;wsp:rsid wsp:val=&quot;009C50FE&quot;/&gt;&lt;wsp:rsid wsp:val=&quot;009E49DD&quot;/&gt;&lt;wsp:rsid wsp:val=&quot;00A03E75&quot;/&gt;&lt;wsp:rsid wsp:val=&quot;00A20627&quot;/&gt;&lt;wsp:rsid wsp:val=&quot;00A22FE9&quot;/&gt;&lt;wsp:rsid wsp:val=&quot;00A31A44&quot;/&gt;&lt;wsp:rsid wsp:val=&quot;00A32BFA&quot;/&gt;&lt;wsp:rsid wsp:val=&quot;00A3325E&quot;/&gt;&lt;wsp:rsid wsp:val=&quot;00A45FCE&quot;/&gt;&lt;wsp:rsid wsp:val=&quot;00A75671&quot;/&gt;&lt;wsp:rsid wsp:val=&quot;00A773CC&quot;/&gt;&lt;wsp:rsid wsp:val=&quot;00A924D0&quot;/&gt;&lt;wsp:rsid wsp:val=&quot;00A9318B&quot;/&gt;&lt;wsp:rsid wsp:val=&quot;00A94AC1&quot;/&gt;&lt;wsp:rsid wsp:val=&quot;00AB18B7&quot;/&gt;&lt;wsp:rsid wsp:val=&quot;00AD335D&quot;/&gt;&lt;wsp:rsid wsp:val=&quot;00AF114C&quot;/&gt;&lt;wsp:rsid wsp:val=&quot;00AF792B&quot;/&gt;&lt;wsp:rsid wsp:val=&quot;00B32137&quot;/&gt;&lt;wsp:rsid wsp:val=&quot;00B33D2F&quot;/&gt;&lt;wsp:rsid wsp:val=&quot;00B40A5B&quot;/&gt;&lt;wsp:rsid wsp:val=&quot;00B45C6B&quot;/&gt;&lt;wsp:rsid wsp:val=&quot;00B55D5E&quot;/&gt;&lt;wsp:rsid wsp:val=&quot;00B57A80&quot;/&gt;&lt;wsp:rsid wsp:val=&quot;00B70E9C&quot;/&gt;&lt;wsp:rsid wsp:val=&quot;00B713D8&quot;/&gt;&lt;wsp:rsid wsp:val=&quot;00B72979&quot;/&gt;&lt;wsp:rsid wsp:val=&quot;00B94516&quot;/&gt;&lt;wsp:rsid wsp:val=&quot;00BA25E2&quot;/&gt;&lt;wsp:rsid wsp:val=&quot;00BB2855&quot;/&gt;&lt;wsp:rsid wsp:val=&quot;00BC5343&quot;/&gt;&lt;wsp:rsid wsp:val=&quot;00BD19C1&quot;/&gt;&lt;wsp:rsid wsp:val=&quot;00BD25B8&quot;/&gt;&lt;wsp:rsid wsp:val=&quot;00C012E1&quot;/&gt;&lt;wsp:rsid wsp:val=&quot;00C06BB4&quot;/&gt;&lt;wsp:rsid wsp:val=&quot;00C10D20&quot;/&gt;&lt;wsp:rsid wsp:val=&quot;00C12E0C&quot;/&gt;&lt;wsp:rsid wsp:val=&quot;00C21916&quot;/&gt;&lt;wsp:rsid wsp:val=&quot;00C34915&quot;/&gt;&lt;wsp:rsid wsp:val=&quot;00C457CA&quot;/&gt;&lt;wsp:rsid wsp:val=&quot;00C53FB6&quot;/&gt;&lt;wsp:rsid wsp:val=&quot;00C57FB7&quot;/&gt;&lt;wsp:rsid wsp:val=&quot;00C644D4&quot;/&gt;&lt;wsp:rsid wsp:val=&quot;00C65F3F&quot;/&gt;&lt;wsp:rsid wsp:val=&quot;00C72414&quot;/&gt;&lt;wsp:rsid wsp:val=&quot;00C72B1A&quot;/&gt;&lt;wsp:rsid wsp:val=&quot;00C8667B&quot;/&gt;&lt;wsp:rsid wsp:val=&quot;00C90993&quot;/&gt;&lt;wsp:rsid wsp:val=&quot;00CA4CE3&quot;/&gt;&lt;wsp:rsid wsp:val=&quot;00CC72FD&quot;/&gt;&lt;wsp:rsid wsp:val=&quot;00CD1D23&quot;/&gt;&lt;wsp:rsid wsp:val=&quot;00CD4F3F&quot;/&gt;&lt;wsp:rsid wsp:val=&quot;00D311F8&quot;/&gt;&lt;wsp:rsid wsp:val=&quot;00D31660&quot;/&gt;&lt;wsp:rsid wsp:val=&quot;00D36B52&quot;/&gt;&lt;wsp:rsid wsp:val=&quot;00D377C8&quot;/&gt;&lt;wsp:rsid wsp:val=&quot;00D41274&quot;/&gt;&lt;wsp:rsid wsp:val=&quot;00D4229C&quot;/&gt;&lt;wsp:rsid wsp:val=&quot;00D43BF3&quot;/&gt;&lt;wsp:rsid wsp:val=&quot;00D549FB&quot;/&gt;&lt;wsp:rsid wsp:val=&quot;00D56487&quot;/&gt;&lt;wsp:rsid wsp:val=&quot;00D767BB&quot;/&gt;&lt;wsp:rsid wsp:val=&quot;00D939B0&quot;/&gt;&lt;wsp:rsid wsp:val=&quot;00DA31A2&quot;/&gt;&lt;wsp:rsid wsp:val=&quot;00DB16E0&quot;/&gt;&lt;wsp:rsid wsp:val=&quot;00DB2DF9&quot;/&gt;&lt;wsp:rsid wsp:val=&quot;00DB465D&quot;/&gt;&lt;wsp:rsid wsp:val=&quot;00DB48A2&quot;/&gt;&lt;wsp:rsid wsp:val=&quot;00DB7E63&quot;/&gt;&lt;wsp:rsid wsp:val=&quot;00DC2055&quot;/&gt;&lt;wsp:rsid wsp:val=&quot;00DC3908&quot;/&gt;&lt;wsp:rsid wsp:val=&quot;00DD71E8&quot;/&gt;&lt;wsp:rsid wsp:val=&quot;00DD7F83&quot;/&gt;&lt;wsp:rsid wsp:val=&quot;00DE4EB8&quot;/&gt;&lt;wsp:rsid wsp:val=&quot;00E0641E&quot;/&gt;&lt;wsp:rsid wsp:val=&quot;00E06664&quot;/&gt;&lt;wsp:rsid wsp:val=&quot;00E304BC&quot;/&gt;&lt;wsp:rsid wsp:val=&quot;00E32853&quot;/&gt;&lt;wsp:rsid wsp:val=&quot;00E34EBD&quot;/&gt;&lt;wsp:rsid wsp:val=&quot;00E401F8&quot;/&gt;&lt;wsp:rsid wsp:val=&quot;00E46425&quot;/&gt;&lt;wsp:rsid wsp:val=&quot;00E469FC&quot;/&gt;&lt;wsp:rsid wsp:val=&quot;00E47D0E&quot;/&gt;&lt;wsp:rsid wsp:val=&quot;00E65018&quot;/&gt;&lt;wsp:rsid wsp:val=&quot;00E76CA1&quot;/&gt;&lt;wsp:rsid wsp:val=&quot;00E94339&quot;/&gt;&lt;wsp:rsid wsp:val=&quot;00E97563&quot;/&gt;&lt;wsp:rsid wsp:val=&quot;00EB0B63&quot;/&gt;&lt;wsp:rsid wsp:val=&quot;00EC265C&quot;/&gt;&lt;wsp:rsid wsp:val=&quot;00ED61CB&quot;/&gt;&lt;wsp:rsid wsp:val=&quot;00EE752A&quot;/&gt;&lt;wsp:rsid wsp:val=&quot;00F06A72&quot;/&gt;&lt;wsp:rsid wsp:val=&quot;00F136F0&quot;/&gt;&lt;wsp:rsid wsp:val=&quot;00F20BBB&quot;/&gt;&lt;wsp:rsid wsp:val=&quot;00F36048&quot;/&gt;&lt;wsp:rsid wsp:val=&quot;00F43BD8&quot;/&gt;&lt;wsp:rsid wsp:val=&quot;00F562F3&quot;/&gt;&lt;wsp:rsid wsp:val=&quot;00F74B89&quot;/&gt;&lt;wsp:rsid wsp:val=&quot;00F75133&quot;/&gt;&lt;wsp:rsid wsp:val=&quot;00F83272&quot;/&gt;&lt;wsp:rsid wsp:val=&quot;00F9358D&quot;/&gt;&lt;wsp:rsid wsp:val=&quot;00F9369B&quot;/&gt;&lt;wsp:rsid wsp:val=&quot;00FA3899&quot;/&gt;&lt;wsp:rsid wsp:val=&quot;00FA4909&quot;/&gt;&lt;wsp:rsid wsp:val=&quot;00FA5164&quot;/&gt;&lt;wsp:rsid wsp:val=&quot;00FA6751&quot;/&gt;&lt;wsp:rsid wsp:val=&quot;00FA6BD7&quot;/&gt;&lt;wsp:rsid wsp:val=&quot;00FB1048&quot;/&gt;&lt;wsp:rsid wsp:val=&quot;00FB62C4&quot;/&gt;&lt;wsp:rsid wsp:val=&quot;00FB7701&quot;/&gt;&lt;wsp:rsid wsp:val=&quot;00FD1AC5&quot;/&gt;&lt;wsp:rsid wsp:val=&quot;00FD5CF0&quot;/&gt;&lt;/wsp:rsids&gt;&lt;/w:docPr&gt;&lt;w:body&gt;&lt;wx:sect&gt;&lt;w:p wsp:rsidR=&quot;005E5515&quot; wsp:rsidRPr=&quot;005E5515&quot; wsp:rsidRDefault=&quot;005E5515&quot; wsp:rsidP=&quot;005E5515&quot;&gt;&lt;m:oMathPara&gt;&lt;m:oMath&gt;&lt;m:sSub&gt;&lt;m:sSubPr&gt;&lt;m:ctrlPr&gt;&lt;w:rPr&gt;&lt;w:rFonts w:ascii=&quot;Cambria Math&quot; w:h-ansi=&quot;Cambria Math&quot;/&gt;&lt;wx:font wx:val=&quot;Cambria Math&quot;/&gt;&lt;w:i/&gt;&lt;/w:rPr&gt;&lt;/m:ctrlPr&gt;&lt;/m:sSubPr&gt;&lt;m:e&gt;&lt;m:r&gt;&lt;w:rPr&gt;&lt;w:rFonts w:ascii=&quot;Cambria Math&quot; w:h-ansi=&quot;Cambria Math&quot;/&gt;&lt;wx:font wx:val=&quot;Cambria Math&quot;/&gt;&lt;w:i/&gt;&lt;/w:rPr&gt;&lt;m:t&gt;C&lt;/m:t&gt;&lt;/m:r&gt;&lt;/m:e&gt;&lt;m:sub&gt;&lt;m:r&gt;&lt;w:rPr&gt;&lt;w:rFonts w:ascii=&quot;Cambria Math&quot; w:h-ansi=&quot;Cambria Math&quot;/&gt;&lt;wx:font wx:val=&quot;Cambria Math&quot;/&gt;&lt;w:i/&gt;&lt;/w:rPr&gt;&lt;m:t&gt;T&lt;/m:t&gt;&lt;/m:r&gt;&lt;/m:sub&gt;&lt;/m:sSub&gt;&lt;m:r&gt;&lt;w:rPr&gt;&lt;w:rFonts w:ascii=&quot;Cambria Math&quot; w:h-ansi=&quot;Cambria Math&quot;/&gt;&lt;wx:font wx:val=&quot;Cambria Math&quot;/&gt;&lt;w:i/&gt;&lt;/w:rPr&gt;&lt;m:t&gt;=4Ã—&lt;/m:t&gt;&lt;/m:r&gt;&lt;m:sSup&gt;&lt;m:sSupPr&gt;&lt;m:ctrlPr&gt;&lt;w:rPr&gt;&lt;w:rFonts w:ascii=&quot;Cambria Math&quot; w:h-ansi=&quot;Cambria Math&quot;/&gt;&lt;wx:font wx:val=&quot;Cambria Math&quot;/&gt;&lt;w:i/&gt;&lt;/w:rPr&gt;&lt;/m:ctrlPr&gt;&lt;/m:sSupPr&gt;&lt;m:e&gt;&lt;m:r&gt;&lt;w:rPr&gt;&lt;w:rFonts w:ascii=&quot;Cambria Math&quot; w:h-ansi=&quot;Cambria Math&quot;/&gt;&lt;wx:font wx:val=&quot;Cambria Math&quot;/&gt;&lt;w:i/&gt;&lt;/w:rPr&gt;&lt;m:t&gt;10&lt;/m:t&gt;&lt;/m:r&gt;&lt;/m:e&gt;&lt;m:sup&gt;&lt;m:r&gt;&lt;w:rPr&gt;&lt;w:rFonts w:ascii=&quot;Cambria Math&quot; w:h-ansi=&quot;Cambria Math&quot;/&gt;&lt;wx:font wx:val=&quot;Cambria Math&quot;/&gt;&lt;w:i/&gt;&lt;/w:rPr&gt;&lt;m:t&gt;-5&lt;/m:t&gt;&lt;/m:r&gt;&lt;/m:sup&gt;&lt;/m:sSup&gt;&lt;m:r&gt;&lt;w:rPr&gt;&lt;w:rFonts w:ascii=&quot;Cambria Math&quot; w:h-ansi=&quot;Cambria Math&quot;/&gt;&lt;wx:font wx:val=&quot;Cambria Math&quot;/&gt;&lt;w:i/&gt;&lt;/w:rPr&gt;&lt;m:t&gt;âˆ™&lt;/m:t&gt;&lt;/m:r&gt;&lt;m:sSub&gt;&lt;m:sSubPr&gt;&lt;m:ctrlPr&gt;&lt;w:rPr&gt;&lt;w:rFonts w:ascii=&quot;Cambria Math&quot; w:h-ansi=&quot;Cambria Math&quot;/&gt;&lt;wx:font wx:val=&quot;Cambria Math&quot;/&gt;&lt;w:i/&gt;&lt;/w:rPr&gt;&lt;/m:ctrlPr&gt;&lt;/m:sSubPr&gt;&lt;m:e&gt;&lt;m:r&gt;&lt;w:rPr&gt;&lt;w:rFonts w:ascii=&quot;Cambria Math&quot; w:h-ansi=&quot;Cambria Math&quot;/&gt;&lt;wx:font wx:val=&quot;Cambria Math&quot;/&gt;&lt;w:i/&gt;&lt;/w:rPr&gt;&lt;m:t&gt;t&lt;/m:t&gt;&lt;/m:r&gt;&lt;/m:e&gt;&lt;m:sub&gt;&lt;m:r&gt;&lt;w:rPr&gt;&lt;w:rFonts w:ascii=&quot;Cambria Math&quot; w:h-ansi=&quot;Cambria Math&quot;/&gt;&lt;wx:font wx:val=&quot;Cambria Math&quot;/&gt;&lt;w:i/&gt;&lt;/w:rPr&gt;&lt;m:t&gt;on&lt;/m:t&gt;&lt;/m:r&gt;&lt;/m:sub&gt;&lt;/m:sSub&gt;&lt;/m:oMath&gt;&lt;/m:oMathPara&gt;&lt;/w:p&gt;&lt;w:sectPr wsp:rsidR=&quot;00000000&quot; wsp:rsidRPr=&quot;005E5515&quot;&gt;&lt;w:pgSz w:w=&quot;12240&quot; w:h=&quot;15840&quot;/&gt;&lt;w:pgMar w:top=&quot;1440&quot; w:right=&quot;1440&quot; w:bottom=&quot;1440&quot; w:left=&quot;1440&quot; w:header=&quot;720&quot; w:footer=&quot;720&quot; w:gutter=&quot;0&quot;/&gt;&lt;w:cols w:space=&quot;720&quot;/&gt;&lt;/w:sectPr&gt;&lt;/wx:sect&gt;&lt;/w:body&gt;&lt;/w:wordDocument&gt;">
                   <v:imagedata r:id="rId27" o:title="" chromakey="white"/>
                 </v:shape>
               </w:pict>
@@ -3103,12 +3063,12 @@
       </w:tr>
       <w:tr>
         <w:trPr>
-          <w:trHeight w:val="538"/>
+          <w:trHeight w:val="529"/>
           <w:jc w:val="center"/>
         </w:trPr>
         <w:tc>
           <w:tcPr>
-            <w:tcW w:w="1825" w:type="dxa"/>
+            <w:tcW w:w="1799" w:type="dxa"/>
             <w:shd w:val="clear" w:color="auto" w:fill="D9D9D9"/>
             <w:vAlign w:val="center"/>
           </w:tcPr>
@@ -3130,7 +3090,7 @@
         </w:tc>
         <w:tc>
           <w:tcPr>
-            <w:tcW w:w="3184" w:type="dxa"/>
+            <w:tcW w:w="3140" w:type="dxa"/>
             <w:shd w:val="clear" w:color="auto" w:fill="D9D9D9"/>
             <w:vAlign w:val="center"/>
           </w:tcPr>
@@ -3149,7 +3109,7 @@
                 <w:szCs w:val="16"/>
               </w:rPr>
               <w:pict w14:anchorId="7E04E81A">
-                <v:shape id="_x0000_i1786" type="#_x0000_t75" style="width:113.45pt;height:14.2pt" equationxml="&lt;?xml version=&quot;1.0&quot; encoding=&quot;UTF-8&quot; standalone=&quot;yes&quot;?&gt;&#10;&lt;?mso-application progid=&quot;Word.Document&quot;?&gt;&#10;&lt;w:wordDocument xmlns:aml=&quot;http://schemas.microsoft.com/aml/2001/core&quot; xmlns:wpc=&quot;http://schemas.microsoft.com/office/word/2010/wordprocessingCanvas&quot; xmlns:cx=&quot;http://schemas.microsoft.com/office/drawing/2014/chartex&quot; xmlns:cx1=&quot;http://schemas.microsoft.com/office/drawing/2015/9/8/chartex&quot; xmlns:cx2=&quot;http://schemas.microsoft.com/office/drawing/2015/10/21/chartex&quot; xmlns:cx3=&quot;http://schemas.microsoft.com/office/drawing/2016/5/9/chartex&quot; xmlns:cx4=&quot;http://schemas.microsoft.com/office/drawing/2016/5/10/chartex&quot; xmlns:cx5=&quot;http://schemas.microsoft.com/office/drawing/2016/5/11/chartex&quot; xmlns:cx6=&quot;http://schemas.microsoft.com/office/drawing/2016/5/12/chartex&quot; xmlns:cx7=&quot;http://schemas.microsoft.com/office/drawing/2016/5/13/chartex&quot; xmlns:cx8=&quot;http://schemas.microsoft.com/office/drawing/2016/5/14/chartex&quot; xmlns:cr=&quot;http://schemas.microsoft.com/office/comments/2020/reactions&quot; xmlns:dt=&quot;uuid:C2F41010-65B3-11d1-A29F-00AA00C14882&quot; xmlns:mc=&quot;http://schemas.openxmlformats.org/markup-compatibility/2006&quot; xmlns:aink=&quot;http://schemas.microsoft.com/office/drawing/2016/ink&quot; xmlns:am3d=&quot;http://schemas.microsoft.com/office/drawing/2017/model3d&quot; xmlns:o=&quot;urn:schemas-microsoft-com:office:office&quot; xmlns:oel=&quot;http://schemas.microsoft.com/office/2019/extlst&quot; xmlns:m=&quot;http://schemas.openxmlformats.org/officeDocument/2006/math&quot; xmlns:v=&quot;urn:schemas-microsoft-com:vml&quot; xmlns:w10=&quot;urn:schemas-microsoft-com:office:word&quot; xmlns:w=&quot;http://schemas.microsoft.com/office/word/2003/wordml&quot; xmlns:wx=&quot;http://schemas.microsoft.com/office/word/2003/auxHint&quot; xmlns:wne=&quot;http://schemas.microsoft.com/office/word/2006/wordml&quot; xmlns:wsp=&quot;http://schemas.microsoft.com/office/word/2003/wordml/sp2&quot; xmlns:sl=&quot;http://schemas.microsoft.com/schemaLibrary/2003/core&quot; w:macrosPresent=&quot;no&quot; w:embeddedObjPresent=&quot;no&quot; w:ocxPresent=&quot;no&quot; xml:space=&quot;preserve&quot;&gt;&lt;w:ignoreSubtree w:val=&quot;http://schemas.microsoft.com/office/word/2003/wordml/sp2&quot;/&gt;&lt;o:DocumentProperties&gt;&lt;o:Version&gt;16&lt;/o:Version&gt;&lt;/o:DocumentProperties&gt;&lt;w:docPr&gt;&lt;w:view w:val=&quot;print&quot;/&gt;&lt;w:zoom w:percent=&quot;100&quot;/&gt;&lt;w:doNotEmbedSystemFonts/&gt;&lt;w:activeWritingStyle w:lang=&quot;EN-AU&quot; w:vendorID=&quot;64&quot; w:dllVersion=&quot;6&quot; w:nlCheck=&quot;on&quot; w:optionSet=&quot;1&quot;/&gt;&lt;w:activeWritingStyle w:lang=&quot;EN-GB&quot; w:vendorID=&quot;64&quot; w:dllVersion=&quot;6&quot; w:nlCheck=&quot;on&quot; w:optionSet=&quot;1&quot;/&gt;&lt;w:activeWritingStyle w:lang=&quot;EN-US&quot; w:vendorID=&quot;64&quot; w:dllVersion=&quot;6&quot; w:nlCheck=&quot;on&quot; w:optionSet=&quot;1&quot;/&gt;&lt;w:activeWritingStyle w:lang=&quot;EN-AU&quot; w:vendorID=&quot;64&quot; w:dllVersion=&quot;0&quot; w:nlCheck=&quot;on&quot; w:optionSet=&quot;0&quot;/&gt;&lt;w:activeWritingStyle w:lang=&quot;EN-GB&quot; w:vendorID=&quot;64&quot; w:dllVersion=&quot;0&quot; w:nlCheck=&quot;on&quot; w:optionSet=&quot;0&quot;/&gt;&lt;w:activeWritingStyle w:lang=&quot;EN-US&quot; w:vendorID=&quot;64&quot; w:dllVersion=&quot;0&quot; w:nlCheck=&quot;on&quot; w:optionSet=&quot;0&quot;/&gt;&lt;w:activeWritingStyle w:lang=&quot;ES-AR&quot; w:vendorID=&quot;64&quot; w:dllVersion=&quot;0&quot; w:nlCheck=&quot;on&quot; w:optionSet=&quot;0&quot;/&gt;&lt;w:activeWritingStyle w:lang=&quot;580A&quot; w:vendorID=&quot;64&quot; w:dllVersion=&quot;0&quot; w:nlCheck=&quot;on&quot; w:optionSet=&quot;0&quot;/&gt;&lt;w:activeWritingStyle w:lang=&quot;PT-BR&quot; w:vendorID=&quot;64&quot; w:dllVersion=&quot;0&quot; w:nlCheck=&quot;on&quot; w:optionSet=&quot;0&quot;/&gt;&lt;w:stylePaneFormatFilter w:val=&quot;3F01&quot;/&gt;&lt;w:defaultTabStop w:val=&quot;720&quot;/&gt;&lt;w:hyphenationZone w:val=&quot;425&quot;/&gt;&lt;w:characterSpacingControl w:val=&quot;DontCompress&quot;/&gt;&lt;w:optimizeForBrowser/&gt;&lt;w:validateAgainstSchema/&gt;&lt;w:saveInvalidXML w:val=&quot;off&quot;/&gt;&lt;w:ignoreMixedContent w:val=&quot;off&quot;/&gt;&lt;w:alwaysShowPlaceholderText w:val=&quot;off&quot;/&gt;&lt;w:compat&gt;&lt;w:breakWrappedTables/&gt;&lt;w:snapToGridInCell/&gt;&lt;w:applyBreakingRules/&gt;&lt;w:wrapTextWithPunct/&gt;&lt;w:useAsianBreakRules/&gt;&lt;w:useWord2002TableStyleRules/&gt;&lt;w:useFELayout/&gt;&lt;/w:compat&gt;&lt;wsp:rsids&gt;&lt;wsp:rsidRoot wsp:val=&quot;00426FBB&quot;/&gt;&lt;wsp:rsid wsp:val=&quot;000002E1&quot;/&gt;&lt;wsp:rsid wsp:val=&quot;00003C97&quot;/&gt;&lt;wsp:rsid wsp:val=&quot;00005565&quot;/&gt;&lt;wsp:rsid wsp:val=&quot;0001754A&quot;/&gt;&lt;wsp:rsid wsp:val=&quot;00017719&quot;/&gt;&lt;wsp:rsid wsp:val=&quot;00027F1D&quot;/&gt;&lt;wsp:rsid wsp:val=&quot;0003296C&quot;/&gt;&lt;wsp:rsid wsp:val=&quot;0003351F&quot;/&gt;&lt;wsp:rsid wsp:val=&quot;00044599&quot;/&gt;&lt;wsp:rsid wsp:val=&quot;000540E6&quot;/&gt;&lt;wsp:rsid wsp:val=&quot;00054421&quot;/&gt;&lt;wsp:rsid wsp:val=&quot;00062E46&quot;/&gt;&lt;wsp:rsid wsp:val=&quot;00074AC8&quot;/&gt;&lt;wsp:rsid wsp:val=&quot;00081408&quot;/&gt;&lt;wsp:rsid wsp:val=&quot;00081EBE&quot;/&gt;&lt;wsp:rsid wsp:val=&quot;00086EDC&quot;/&gt;&lt;wsp:rsid wsp:val=&quot;000B1236&quot;/&gt;&lt;wsp:rsid wsp:val=&quot;000B36A3&quot;/&gt;&lt;wsp:rsid wsp:val=&quot;000C013C&quot;/&gt;&lt;wsp:rsid wsp:val=&quot;000E3F84&quot;/&gt;&lt;wsp:rsid wsp:val=&quot;001056DF&quot;/&gt;&lt;wsp:rsid wsp:val=&quot;0010789C&quot;/&gt;&lt;wsp:rsid wsp:val=&quot;00114025&quot;/&gt;&lt;wsp:rsid wsp:val=&quot;001160D2&quot;/&gt;&lt;wsp:rsid wsp:val=&quot;00120636&quot;/&gt;&lt;wsp:rsid wsp:val=&quot;001348A5&quot;/&gt;&lt;wsp:rsid wsp:val=&quot;00151B8E&quot;/&gt;&lt;wsp:rsid wsp:val=&quot;00182170&quot;/&gt;&lt;wsp:rsid wsp:val=&quot;001928FB&quot;/&gt;&lt;wsp:rsid wsp:val=&quot;00192BC7&quot;/&gt;&lt;wsp:rsid wsp:val=&quot;00195BE6&quot;/&gt;&lt;wsp:rsid wsp:val=&quot;001A3C37&quot;/&gt;&lt;wsp:rsid wsp:val=&quot;001A50EA&quot;/&gt;&lt;wsp:rsid wsp:val=&quot;001F16CD&quot;/&gt;&lt;wsp:rsid wsp:val=&quot;001F47D2&quot;/&gt;&lt;wsp:rsid wsp:val=&quot;002029C8&quot;/&gt;&lt;wsp:rsid wsp:val=&quot;0022285A&quot;/&gt;&lt;wsp:rsid wsp:val=&quot;00224C61&quot;/&gt;&lt;wsp:rsid wsp:val=&quot;00256ABC&quot;/&gt;&lt;wsp:rsid wsp:val=&quot;0027227B&quot;/&gt;&lt;wsp:rsid wsp:val=&quot;00273AC7&quot;/&gt;&lt;wsp:rsid wsp:val=&quot;00273D2C&quot;/&gt;&lt;wsp:rsid wsp:val=&quot;00285ECD&quot;/&gt;&lt;wsp:rsid wsp:val=&quot;00290E1B&quot;/&gt;&lt;wsp:rsid wsp:val=&quot;00291B17&quot;/&gt;&lt;wsp:rsid wsp:val=&quot;00291BB3&quot;/&gt;&lt;wsp:rsid wsp:val=&quot;002A6742&quot;/&gt;&lt;wsp:rsid wsp:val=&quot;002C1A7F&quot;/&gt;&lt;wsp:rsid wsp:val=&quot;002C4239&quot;/&gt;&lt;wsp:rsid wsp:val=&quot;002C559D&quot;/&gt;&lt;wsp:rsid wsp:val=&quot;002D16AE&quot;/&gt;&lt;wsp:rsid wsp:val=&quot;002D2D42&quot;/&gt;&lt;wsp:rsid wsp:val=&quot;002F72D0&quot;/&gt;&lt;wsp:rsid wsp:val=&quot;002F7A4F&quot;/&gt;&lt;wsp:rsid wsp:val=&quot;003003AB&quot;/&gt;&lt;wsp:rsid wsp:val=&quot;00302C35&quot;/&gt;&lt;wsp:rsid wsp:val=&quot;00311C49&quot;/&gt;&lt;wsp:rsid wsp:val=&quot;0032119E&quot;/&gt;&lt;wsp:rsid wsp:val=&quot;00321304&quot;/&gt;&lt;wsp:rsid wsp:val=&quot;00324FC2&quot;/&gt;&lt;wsp:rsid wsp:val=&quot;003312CA&quot;/&gt;&lt;wsp:rsid wsp:val=&quot;00331F84&quot;/&gt;&lt;wsp:rsid wsp:val=&quot;003329D6&quot;/&gt;&lt;wsp:rsid wsp:val=&quot;0037721F&quot;/&gt;&lt;wsp:rsid wsp:val=&quot;003950A4&quot;/&gt;&lt;wsp:rsid wsp:val=&quot;003A1E7E&quot;/&gt;&lt;wsp:rsid wsp:val=&quot;003E2FDC&quot;/&gt;&lt;wsp:rsid wsp:val=&quot;003E3577&quot;/&gt;&lt;wsp:rsid wsp:val=&quot;003F3A61&quot;/&gt;&lt;wsp:rsid wsp:val=&quot;00410A5D&quot;/&gt;&lt;wsp:rsid wsp:val=&quot;00414909&quot;/&gt;&lt;wsp:rsid wsp:val=&quot;00416537&quot;/&gt;&lt;wsp:rsid wsp:val=&quot;00425A6A&quot;/&gt;&lt;wsp:rsid wsp:val=&quot;00426FBB&quot;/&gt;&lt;wsp:rsid wsp:val=&quot;00454542&quot;/&gt;&lt;wsp:rsid wsp:val=&quot;0047429A&quot;/&gt;&lt;wsp:rsid wsp:val=&quot;0048374C&quot;/&gt;&lt;wsp:rsid wsp:val=&quot;0048771D&quot;/&gt;&lt;wsp:rsid wsp:val=&quot;004A6605&quot;/&gt;&lt;wsp:rsid wsp:val=&quot;004C45FA&quot;/&gt;&lt;wsp:rsid wsp:val=&quot;004D35A3&quot;/&gt;&lt;wsp:rsid wsp:val=&quot;004E1BD8&quot;/&gt;&lt;wsp:rsid wsp:val=&quot;004E452A&quot;/&gt;&lt;wsp:rsid wsp:val=&quot;004E78E3&quot;/&gt;&lt;wsp:rsid wsp:val=&quot;004F2BFE&quot;/&gt;&lt;wsp:rsid wsp:val=&quot;004F63D3&quot;/&gt;&lt;wsp:rsid wsp:val=&quot;004F7DCF&quot;/&gt;&lt;wsp:rsid wsp:val=&quot;005004BF&quot;/&gt;&lt;wsp:rsid wsp:val=&quot;00502E89&quot;/&gt;&lt;wsp:rsid wsp:val=&quot;00506CFE&quot;/&gt;&lt;wsp:rsid wsp:val=&quot;00510E95&quot;/&gt;&lt;wsp:rsid wsp:val=&quot;005225C3&quot;/&gt;&lt;wsp:rsid wsp:val=&quot;00527D56&quot;/&gt;&lt;wsp:rsid wsp:val=&quot;0053221F&quot;/&gt;&lt;wsp:rsid wsp:val=&quot;00536FAE&quot;/&gt;&lt;wsp:rsid wsp:val=&quot;00542C85&quot;/&gt;&lt;wsp:rsid wsp:val=&quot;00553510&quot;/&gt;&lt;wsp:rsid wsp:val=&quot;00554186&quot;/&gt;&lt;wsp:rsid wsp:val=&quot;00585769&quot;/&gt;&lt;wsp:rsid wsp:val=&quot;00585C61&quot;/&gt;&lt;wsp:rsid wsp:val=&quot;00591130&quot;/&gt;&lt;wsp:rsid wsp:val=&quot;005A3F28&quot;/&gt;&lt;wsp:rsid wsp:val=&quot;005A40BE&quot;/&gt;&lt;wsp:rsid wsp:val=&quot;005B13E2&quot;/&gt;&lt;wsp:rsid wsp:val=&quot;005B47D7&quot;/&gt;&lt;wsp:rsid wsp:val=&quot;005C5526&quot;/&gt;&lt;wsp:rsid wsp:val=&quot;005C62C6&quot;/&gt;&lt;wsp:rsid wsp:val=&quot;005D7B9E&quot;/&gt;&lt;wsp:rsid wsp:val=&quot;005E112E&quot;/&gt;&lt;wsp:rsid wsp:val=&quot;005F0834&quot;/&gt;&lt;wsp:rsid wsp:val=&quot;005F68AB&quot;/&gt;&lt;wsp:rsid wsp:val=&quot;005F6DC3&quot;/&gt;&lt;wsp:rsid wsp:val=&quot;00601A8E&quot;/&gt;&lt;wsp:rsid wsp:val=&quot;0062033E&quot;/&gt;&lt;wsp:rsid wsp:val=&quot;00624482&quot;/&gt;&lt;wsp:rsid wsp:val=&quot;0064799C&quot;/&gt;&lt;wsp:rsid wsp:val=&quot;00654156&quot;/&gt;&lt;wsp:rsid wsp:val=&quot;00656ADC&quot;/&gt;&lt;wsp:rsid wsp:val=&quot;006B47CA&quot;/&gt;&lt;wsp:rsid wsp:val=&quot;006C304C&quot;/&gt;&lt;wsp:rsid wsp:val=&quot;006C4511&quot;/&gt;&lt;wsp:rsid wsp:val=&quot;006C65F5&quot;/&gt;&lt;wsp:rsid wsp:val=&quot;006C7AAA&quot;/&gt;&lt;wsp:rsid wsp:val=&quot;006D1C2A&quot;/&gt;&lt;wsp:rsid wsp:val=&quot;006D264F&quot;/&gt;&lt;wsp:rsid wsp:val=&quot;006D4E89&quot;/&gt;&lt;wsp:rsid wsp:val=&quot;006E2A8D&quot;/&gt;&lt;wsp:rsid wsp:val=&quot;006E7574&quot;/&gt;&lt;wsp:rsid wsp:val=&quot;00703430&quot;/&gt;&lt;wsp:rsid wsp:val=&quot;00703548&quot;/&gt;&lt;wsp:rsid wsp:val=&quot;00704E18&quot;/&gt;&lt;wsp:rsid wsp:val=&quot;007069BE&quot;/&gt;&lt;wsp:rsid wsp:val=&quot;00745C86&quot;/&gt;&lt;wsp:rsid wsp:val=&quot;00764603&quot;/&gt;&lt;wsp:rsid wsp:val=&quot;0076604D&quot;/&gt;&lt;wsp:rsid wsp:val=&quot;00790909&quot;/&gt;&lt;wsp:rsid wsp:val=&quot;007929AF&quot;/&gt;&lt;wsp:rsid wsp:val=&quot;007B1582&quot;/&gt;&lt;wsp:rsid wsp:val=&quot;007B5A07&quot;/&gt;&lt;wsp:rsid wsp:val=&quot;007C065D&quot;/&gt;&lt;wsp:rsid wsp:val=&quot;007D3E71&quot;/&gt;&lt;wsp:rsid wsp:val=&quot;007E5D6A&quot;/&gt;&lt;wsp:rsid wsp:val=&quot;007E645D&quot;/&gt;&lt;wsp:rsid wsp:val=&quot;007F75CA&quot;/&gt;&lt;wsp:rsid wsp:val=&quot;00806EDD&quot;/&gt;&lt;wsp:rsid wsp:val=&quot;00821E08&quot;/&gt;&lt;wsp:rsid wsp:val=&quot;00834EFD&quot;/&gt;&lt;wsp:rsid wsp:val=&quot;00844B24&quot;/&gt;&lt;wsp:rsid wsp:val=&quot;0084515F&quot;/&gt;&lt;wsp:rsid wsp:val=&quot;0085092D&quot;/&gt;&lt;wsp:rsid wsp:val=&quot;00865414&quot;/&gt;&lt;wsp:rsid wsp:val=&quot;00877D4C&quot;/&gt;&lt;wsp:rsid wsp:val=&quot;008831DC&quot;/&gt;&lt;wsp:rsid wsp:val=&quot;00883903&quot;/&gt;&lt;wsp:rsid wsp:val=&quot;00891C30&quot;/&gt;&lt;wsp:rsid wsp:val=&quot;00897219&quot;/&gt;&lt;wsp:rsid wsp:val=&quot;0089763B&quot;/&gt;&lt;wsp:rsid wsp:val=&quot;008B6AE3&quot;/&gt;&lt;wsp:rsid wsp:val=&quot;008C1332&quot;/&gt;&lt;wsp:rsid wsp:val=&quot;008D1045&quot;/&gt;&lt;wsp:rsid wsp:val=&quot;008E5996&quot;/&gt;&lt;wsp:rsid wsp:val=&quot;00901AE1&quot;/&gt;&lt;wsp:rsid wsp:val=&quot;00912F93&quot;/&gt;&lt;wsp:rsid wsp:val=&quot;009205B4&quot;/&gt;&lt;wsp:rsid wsp:val=&quot;00955B59&quot;/&gt;&lt;wsp:rsid wsp:val=&quot;00992262&quot;/&gt;&lt;wsp:rsid wsp:val=&quot;009926BC&quot;/&gt;&lt;wsp:rsid wsp:val=&quot;009A4319&quot;/&gt;&lt;wsp:rsid wsp:val=&quot;009A6C3F&quot;/&gt;&lt;wsp:rsid wsp:val=&quot;009B73F2&quot;/&gt;&lt;wsp:rsid wsp:val=&quot;009C12BD&quot;/&gt;&lt;wsp:rsid wsp:val=&quot;009C50FE&quot;/&gt;&lt;wsp:rsid wsp:val=&quot;009E49DD&quot;/&gt;&lt;wsp:rsid wsp:val=&quot;00A03E75&quot;/&gt;&lt;wsp:rsid wsp:val=&quot;00A20627&quot;/&gt;&lt;wsp:rsid wsp:val=&quot;00A22FE9&quot;/&gt;&lt;wsp:rsid wsp:val=&quot;00A31A44&quot;/&gt;&lt;wsp:rsid wsp:val=&quot;00A32BFA&quot;/&gt;&lt;wsp:rsid wsp:val=&quot;00A3325E&quot;/&gt;&lt;wsp:rsid wsp:val=&quot;00A45FCE&quot;/&gt;&lt;wsp:rsid wsp:val=&quot;00A75671&quot;/&gt;&lt;wsp:rsid wsp:val=&quot;00A773CC&quot;/&gt;&lt;wsp:rsid wsp:val=&quot;00A924D0&quot;/&gt;&lt;wsp:rsid wsp:val=&quot;00A9318B&quot;/&gt;&lt;wsp:rsid wsp:val=&quot;00A94AC1&quot;/&gt;&lt;wsp:rsid wsp:val=&quot;00AB18B7&quot;/&gt;&lt;wsp:rsid wsp:val=&quot;00AD335D&quot;/&gt;&lt;wsp:rsid wsp:val=&quot;00AF114C&quot;/&gt;&lt;wsp:rsid wsp:val=&quot;00AF792B&quot;/&gt;&lt;wsp:rsid wsp:val=&quot;00B32137&quot;/&gt;&lt;wsp:rsid wsp:val=&quot;00B33D2F&quot;/&gt;&lt;wsp:rsid wsp:val=&quot;00B40A5B&quot;/&gt;&lt;wsp:rsid wsp:val=&quot;00B45C6B&quot;/&gt;&lt;wsp:rsid wsp:val=&quot;00B55D5E&quot;/&gt;&lt;wsp:rsid wsp:val=&quot;00B57A80&quot;/&gt;&lt;wsp:rsid wsp:val=&quot;00B70E9C&quot;/&gt;&lt;wsp:rsid wsp:val=&quot;00B713D8&quot;/&gt;&lt;wsp:rsid wsp:val=&quot;00B72979&quot;/&gt;&lt;wsp:rsid wsp:val=&quot;00B94516&quot;/&gt;&lt;wsp:rsid wsp:val=&quot;00BA25E2&quot;/&gt;&lt;wsp:rsid wsp:val=&quot;00BB2855&quot;/&gt;&lt;wsp:rsid wsp:val=&quot;00BC5343&quot;/&gt;&lt;wsp:rsid wsp:val=&quot;00BD19C1&quot;/&gt;&lt;wsp:rsid wsp:val=&quot;00BD25B8&quot;/&gt;&lt;wsp:rsid wsp:val=&quot;00C012E1&quot;/&gt;&lt;wsp:rsid wsp:val=&quot;00C06BB4&quot;/&gt;&lt;wsp:rsid wsp:val=&quot;00C10D20&quot;/&gt;&lt;wsp:rsid wsp:val=&quot;00C12E0C&quot;/&gt;&lt;wsp:rsid wsp:val=&quot;00C21916&quot;/&gt;&lt;wsp:rsid wsp:val=&quot;00C34915&quot;/&gt;&lt;wsp:rsid wsp:val=&quot;00C457CA&quot;/&gt;&lt;wsp:rsid wsp:val=&quot;00C53FB6&quot;/&gt;&lt;wsp:rsid wsp:val=&quot;00C57FB7&quot;/&gt;&lt;wsp:rsid wsp:val=&quot;00C644D4&quot;/&gt;&lt;wsp:rsid wsp:val=&quot;00C65F3F&quot;/&gt;&lt;wsp:rsid wsp:val=&quot;00C72414&quot;/&gt;&lt;wsp:rsid wsp:val=&quot;00C72B1A&quot;/&gt;&lt;wsp:rsid wsp:val=&quot;00C8667B&quot;/&gt;&lt;wsp:rsid wsp:val=&quot;00C90993&quot;/&gt;&lt;wsp:rsid wsp:val=&quot;00CA4CE3&quot;/&gt;&lt;wsp:rsid wsp:val=&quot;00CC72FD&quot;/&gt;&lt;wsp:rsid wsp:val=&quot;00CD1D23&quot;/&gt;&lt;wsp:rsid wsp:val=&quot;00CD4F3F&quot;/&gt;&lt;wsp:rsid wsp:val=&quot;00D311F8&quot;/&gt;&lt;wsp:rsid wsp:val=&quot;00D31660&quot;/&gt;&lt;wsp:rsid wsp:val=&quot;00D36B52&quot;/&gt;&lt;wsp:rsid wsp:val=&quot;00D377C8&quot;/&gt;&lt;wsp:rsid wsp:val=&quot;00D41274&quot;/&gt;&lt;wsp:rsid wsp:val=&quot;00D4229C&quot;/&gt;&lt;wsp:rsid wsp:val=&quot;00D43BF3&quot;/&gt;&lt;wsp:rsid wsp:val=&quot;00D549FB&quot;/&gt;&lt;wsp:rsid wsp:val=&quot;00D56487&quot;/&gt;&lt;wsp:rsid wsp:val=&quot;00D767BB&quot;/&gt;&lt;wsp:rsid wsp:val=&quot;00D939B0&quot;/&gt;&lt;wsp:rsid wsp:val=&quot;00DA31A2&quot;/&gt;&lt;wsp:rsid wsp:val=&quot;00DB16E0&quot;/&gt;&lt;wsp:rsid wsp:val=&quot;00DB2DF9&quot;/&gt;&lt;wsp:rsid wsp:val=&quot;00DB465D&quot;/&gt;&lt;wsp:rsid wsp:val=&quot;00DB48A2&quot;/&gt;&lt;wsp:rsid wsp:val=&quot;00DB7E63&quot;/&gt;&lt;wsp:rsid wsp:val=&quot;00DC2055&quot;/&gt;&lt;wsp:rsid wsp:val=&quot;00DC3908&quot;/&gt;&lt;wsp:rsid wsp:val=&quot;00DD71E8&quot;/&gt;&lt;wsp:rsid wsp:val=&quot;00DD7F83&quot;/&gt;&lt;wsp:rsid wsp:val=&quot;00DE4EB8&quot;/&gt;&lt;wsp:rsid wsp:val=&quot;00E0641E&quot;/&gt;&lt;wsp:rsid wsp:val=&quot;00E06664&quot;/&gt;&lt;wsp:rsid wsp:val=&quot;00E304BC&quot;/&gt;&lt;wsp:rsid wsp:val=&quot;00E32853&quot;/&gt;&lt;wsp:rsid wsp:val=&quot;00E34EBD&quot;/&gt;&lt;wsp:rsid wsp:val=&quot;00E401F8&quot;/&gt;&lt;wsp:rsid wsp:val=&quot;00E46425&quot;/&gt;&lt;wsp:rsid wsp:val=&quot;00E469FC&quot;/&gt;&lt;wsp:rsid wsp:val=&quot;00E47D0E&quot;/&gt;&lt;wsp:rsid wsp:val=&quot;00E65018&quot;/&gt;&lt;wsp:rsid wsp:val=&quot;00E76CA1&quot;/&gt;&lt;wsp:rsid wsp:val=&quot;00E94339&quot;/&gt;&lt;wsp:rsid wsp:val=&quot;00E97563&quot;/&gt;&lt;wsp:rsid wsp:val=&quot;00EB0B63&quot;/&gt;&lt;wsp:rsid wsp:val=&quot;00EC265C&quot;/&gt;&lt;wsp:rsid wsp:val=&quot;00ED61CB&quot;/&gt;&lt;wsp:rsid wsp:val=&quot;00EE752A&quot;/&gt;&lt;wsp:rsid wsp:val=&quot;00F06A72&quot;/&gt;&lt;wsp:rsid wsp:val=&quot;00F136F0&quot;/&gt;&lt;wsp:rsid wsp:val=&quot;00F20BBB&quot;/&gt;&lt;wsp:rsid wsp:val=&quot;00F36048&quot;/&gt;&lt;wsp:rsid wsp:val=&quot;00F43BD8&quot;/&gt;&lt;wsp:rsid wsp:val=&quot;00F562F3&quot;/&gt;&lt;wsp:rsid wsp:val=&quot;00F74B89&quot;/&gt;&lt;wsp:rsid wsp:val=&quot;00F75133&quot;/&gt;&lt;wsp:rsid wsp:val=&quot;00F83272&quot;/&gt;&lt;wsp:rsid wsp:val=&quot;00F9358D&quot;/&gt;&lt;wsp:rsid wsp:val=&quot;00F9369B&quot;/&gt;&lt;wsp:rsid wsp:val=&quot;00FA3899&quot;/&gt;&lt;wsp:rsid wsp:val=&quot;00FA4909&quot;/&gt;&lt;wsp:rsid wsp:val=&quot;00FA5164&quot;/&gt;&lt;wsp:rsid wsp:val=&quot;00FA6751&quot;/&gt;&lt;wsp:rsid wsp:val=&quot;00FA6BD7&quot;/&gt;&lt;wsp:rsid wsp:val=&quot;00FB1048&quot;/&gt;&lt;wsp:rsid wsp:val=&quot;00FB62C4&quot;/&gt;&lt;wsp:rsid wsp:val=&quot;00FB7701&quot;/&gt;&lt;wsp:rsid wsp:val=&quot;00FD1AC5&quot;/&gt;&lt;wsp:rsid wsp:val=&quot;00FD5CF0&quot;/&gt;&lt;/wsp:rsids&gt;&lt;/w:docPr&gt;&lt;w:body&gt;&lt;wx:sect&gt;&lt;w:p wsp:rsidR=&quot;00806EDD&quot; wsp:rsidRPr=&quot;00806EDD&quot; wsp:rsidRDefault=&quot;00806EDD&quot; wsp:rsidP=&quot;00806EDD&quot;&gt;&lt;m:oMathPara&gt;&lt;m:oMath&gt;&lt;m:sSub&gt;&lt;m:sSubPr&gt;&lt;m:ctrlPr&gt;&lt;w:rPr&gt;&lt;w:rFonts w:ascii=&quot;Cambria Math&quot; w:h-ansi=&quot;Cambria Math&quot;/&gt;&lt;wx:font wx:val=&quot;Cambria Math&quot;/&gt;&lt;w:i/&gt;&lt;/w:rPr&gt;&lt;/m:ctrlPr&gt;&lt;/m:sSubPr&gt;&lt;m:e&gt;&lt;m:r&gt;&lt;w:rPr&gt;&lt;w:rFonts w:ascii=&quot;Cambria Math&quot; w:h-ansi=&quot;Cambria Math&quot;/&gt;&lt;wx:font wx:val=&quot;Cambria Math&quot;/&gt;&lt;w:i/&gt;&lt;/w:rPr&gt;&lt;m:t&gt;I&lt;/m:t&gt;&lt;/m:r&gt;&lt;/m:e&gt;&lt;m:sub&gt;&lt;m:r&gt;&lt;w:rPr&gt;&lt;w:rFonts w:ascii=&quot;Cambria Math&quot; w:h-ansi=&quot;Cambria Math&quot;/&gt;&lt;wx:font wx:val=&quot;Cambria Math&quot;/&gt;&lt;w:i/&gt;&lt;/w:rPr&gt;&lt;m:t&gt;pk&lt;/m:t&gt;&lt;/m:r&gt;&lt;m:d&gt;&lt;m:dPr&gt;&lt;m:ctrlPr&gt;&lt;w:rPr&gt;&lt;w:rFonts w:ascii=&quot;Cambria Math&quot; w:h-ansi=&quot;Cambria Math&quot;/&gt;&lt;wx:font wx:val=&quot;Cambria Math&quot;/&gt;&lt;w:i/&gt;&lt;/w:rPr&gt;&lt;/m:ctrlPr&gt;&lt;/m:dPr&gt;&lt;m:e&gt;&lt;m:r&gt;&lt;w:rPr&gt;&lt;w:rFonts w:ascii=&quot;Cambria Math&quot; w:h-ansi=&quot;Cambria Math&quot;/&gt;&lt;wx:font wx:val=&quot;Cambria Math&quot;/&gt;&lt;w:i/&gt;&lt;/w:rPr&gt;&lt;m:t&gt;switch&lt;/m:t&gt;&lt;/m:r&gt;&lt;/m:e&gt;&lt;/m:d&gt;&lt;/m:sub&gt;&lt;/m:sSub&gt;&lt;m:r&gt;&lt;w:rPr&gt;&lt;w:rFonts w:ascii=&quot;Cambria Math&quot; w:h-ansi=&quot;Cambria Math&quot;/&gt;&lt;wx:font wx:val=&quot;Cambria Math&quot;/&gt;&lt;w:i/&gt;&lt;/w:rPr&gt;&lt;m:t&gt;=2âˆ™&lt;/m:t&gt;&lt;/m:r&gt;&lt;m:sSub&gt;&lt;m:sSubPr&gt;&lt;m:ctrlPr&gt;&lt;w:rPr&gt;&lt;w:rFonts w:ascii=&quot;Cambria Math&quot; w:h-ansi=&quot;Cambria Math&quot;/&gt;&lt;wx:font wx:val=&quot;Cambria Math&quot;/&gt;&lt;w:i/&gt;&lt;/w:rPr&gt;&lt;/m:ctrlPr&gt;&lt;/m:sSubPr&gt;&lt;m:e&gt;&lt;m:r&gt;&lt;w:rPr&gt;&lt;w:rFonts w:ascii=&quot;Cambria Math&quot; w:h-ansi=&quot;Cambria Math&quot;/&gt;&lt;wx:font wx:val=&quot;Cambria Math&quot;/&gt;&lt;w:i/&gt;&lt;/w:rPr&gt;&lt;m:t&gt;I&lt;/m:t&gt;&lt;/m:r&gt;&lt;/m:e&gt;&lt;m:sub&gt;&lt;m:r&gt;&lt;w:rPr&gt;&lt;w:rFonts w:ascii=&quot;Cambria Math&quot; w:h-ansi=&quot;Cambria Math&quot;/&gt;&lt;wx:font wx:val=&quot;Cambria Math&quot;/&gt;&lt;w:i/&gt;&lt;/w:rPr&gt;&lt;m:t&gt;out&lt;/m:t&gt;&lt;/m:r&gt;&lt;m:d&gt;&lt;m:dPr&gt;&lt;m:ctrlPr&gt;&lt;w:rPr&gt;&lt;w:rFonts w:ascii=&quot;Cambria Math&quot; w:h-ansi=&quot;Cambria Math&quot;/&gt;&lt;wx:font wx:val=&quot;Cambria Math&quot;/&gt;&lt;w:i/&gt;&lt;/w:rPr&gt;&lt;/m:ctrlPr&gt;&lt;/m:dPr&gt;&lt;m:e&gt;&lt;m:r&gt;&lt;w:rPr&gt;&lt;w:rFonts w:ascii=&quot;Cambria Math&quot; w:h-ansi=&quot;Cambria Math&quot;/&gt;&lt;wx:font wx:val=&quot;Cambria Math&quot;/&gt;&lt;w:i/&gt;&lt;/w:rPr&gt;&lt;m:t&gt;mÃ¡x&lt;/m:t&gt;&lt;/m:r&gt;&lt;/m:e&gt;&lt;/m:d&gt;&lt;/m:sub&gt;&lt;/m:sSub&gt;&lt;/m:oMath&gt;&lt;/m:oMathPara&gt;&lt;/w:p&gt;&lt;w:sectPr wsp:rsidR=&quot;00000000&quot; wsp:rsidRPr=&quot;00806EDD&quot;&gt;&lt;w:pgSz w:w=&quot;12240&quot; w:h=&quot;15840&quot;/&gt;&lt;w:pgMar w:top=&quot;1440&quot; w:right=&quot;1440&quot; w:bottom=&quot;1440&quot; w:left=&quot;1440&quot; w:header=&quot;720&quot; w:footer=&quot;720&quot; w:gutter=&quot;0&quot;/&gt;&lt;w:cols w:space=&quot;720&quot;/&gt;&lt;/w:sectPr&gt;&lt;/wx:sect&gt;&lt;/w:body&gt;&lt;/w:wordDocument&gt;">
+                <v:shape id="_x0000_i1059" type="#_x0000_t75" style="width:113.55pt;height:14.55pt" equationxml="&lt;?xml version=&quot;1.0&quot; encoding=&quot;UTF-8&quot; standalone=&quot;yes&quot;?&gt;&#10;&lt;?mso-application progid=&quot;Word.Document&quot;?&gt;&#10;&lt;w:wordDocument xmlns:aml=&quot;http://schemas.microsoft.com/aml/2001/core&quot; xmlns:wpc=&quot;http://schemas.microsoft.com/office/word/2010/wordprocessingCanvas&quot; xmlns:cx=&quot;http://schemas.microsoft.com/office/drawing/2014/chartex&quot; xmlns:cx1=&quot;http://schemas.microsoft.com/office/drawing/2015/9/8/chartex&quot; xmlns:cx2=&quot;http://schemas.microsoft.com/office/drawing/2015/10/21/chartex&quot; xmlns:cx3=&quot;http://schemas.microsoft.com/office/drawing/2016/5/9/chartex&quot; xmlns:cx4=&quot;http://schemas.microsoft.com/office/drawing/2016/5/10/chartex&quot; xmlns:cx5=&quot;http://schemas.microsoft.com/office/drawing/2016/5/11/chartex&quot; xmlns:cx6=&quot;http://schemas.microsoft.com/office/drawing/2016/5/12/chartex&quot; xmlns:cx7=&quot;http://schemas.microsoft.com/office/drawing/2016/5/13/chartex&quot; xmlns:cx8=&quot;http://schemas.microsoft.com/office/drawing/2016/5/14/chartex&quot; xmlns:cr=&quot;http://schemas.microsoft.com/office/comments/2020/reactions&quot; xmlns:dt=&quot;uuid:C2F41010-65B3-11d1-A29F-00AA00C14882&quot; xmlns:mc=&quot;http://schemas.openxmlformats.org/markup-compatibility/2006&quot; xmlns:aink=&quot;http://schemas.microsoft.com/office/drawing/2016/ink&quot; xmlns:am3d=&quot;http://schemas.microsoft.com/office/drawing/2017/model3d&quot; xmlns:o=&quot;urn:schemas-microsoft-com:office:office&quot; xmlns:oel=&quot;http://schemas.microsoft.com/office/2019/extlst&quot; xmlns:m=&quot;http://schemas.openxmlformats.org/officeDocument/2006/math&quot; xmlns:v=&quot;urn:schemas-microsoft-com:vml&quot; xmlns:w10=&quot;urn:schemas-microsoft-com:office:word&quot; xmlns:w=&quot;http://schemas.microsoft.com/office/word/2003/wordml&quot; xmlns:wx=&quot;http://schemas.microsoft.com/office/word/2003/auxHint&quot; xmlns:wne=&quot;http://schemas.microsoft.com/office/word/2006/wordml&quot; xmlns:wsp=&quot;http://schemas.microsoft.com/office/word/2003/wordml/sp2&quot; xmlns:sl=&quot;http://schemas.microsoft.com/schemaLibrary/2003/core&quot; w:macrosPresent=&quot;no&quot; w:embeddedObjPresent=&quot;no&quot; w:ocxPresent=&quot;no&quot; xml:space=&quot;preserve&quot;&gt;&lt;w:ignoreSubtree w:val=&quot;http://schemas.microsoft.com/office/word/2003/wordml/sp2&quot;/&gt;&lt;o:DocumentProperties&gt;&lt;o:Version&gt;16&lt;/o:Version&gt;&lt;/o:DocumentProperties&gt;&lt;w:docPr&gt;&lt;w:view w:val=&quot;print&quot;/&gt;&lt;w:zoom w:percent=&quot;100&quot;/&gt;&lt;w:doNotEmbedSystemFonts/&gt;&lt;w:activeWritingStyle w:lang=&quot;EN-AU&quot; w:vendorID=&quot;64&quot; w:dllVersion=&quot;6&quot; w:nlCheck=&quot;on&quot; w:optionSet=&quot;1&quot;/&gt;&lt;w:activeWritingStyle w:lang=&quot;EN-GB&quot; w:vendorID=&quot;64&quot; w:dllVersion=&quot;6&quot; w:nlCheck=&quot;on&quot; w:optionSet=&quot;1&quot;/&gt;&lt;w:activeWritingStyle w:lang=&quot;EN-US&quot; w:vendorID=&quot;64&quot; w:dllVersion=&quot;6&quot; w:nlCheck=&quot;on&quot; w:optionSet=&quot;1&quot;/&gt;&lt;w:activeWritingStyle w:lang=&quot;EN-AU&quot; w:vendorID=&quot;64&quot; w:dllVersion=&quot;0&quot; w:nlCheck=&quot;on&quot; w:optionSet=&quot;0&quot;/&gt;&lt;w:activeWritingStyle w:lang=&quot;EN-GB&quot; w:vendorID=&quot;64&quot; w:dllVersion=&quot;0&quot; w:nlCheck=&quot;on&quot; w:optionSet=&quot;0&quot;/&gt;&lt;w:activeWritingStyle w:lang=&quot;EN-US&quot; w:vendorID=&quot;64&quot; w:dllVersion=&quot;0&quot; w:nlCheck=&quot;on&quot; w:optionSet=&quot;0&quot;/&gt;&lt;w:activeWritingStyle w:lang=&quot;ES-AR&quot; w:vendorID=&quot;64&quot; w:dllVersion=&quot;0&quot; w:nlCheck=&quot;on&quot; w:optionSet=&quot;0&quot;/&gt;&lt;w:activeWritingStyle w:lang=&quot;580A&quot; w:vendorID=&quot;64&quot; w:dllVersion=&quot;0&quot; w:nlCheck=&quot;on&quot; w:optionSet=&quot;0&quot;/&gt;&lt;w:activeWritingStyle w:lang=&quot;PT-BR&quot; w:vendorID=&quot;64&quot; w:dllVersion=&quot;0&quot; w:nlCheck=&quot;on&quot; w:optionSet=&quot;0&quot;/&gt;&lt;w:stylePaneFormatFilter w:val=&quot;3F01&quot;/&gt;&lt;w:defaultTabStop w:val=&quot;720&quot;/&gt;&lt;w:hyphenationZone w:val=&quot;425&quot;/&gt;&lt;w:characterSpacingControl w:val=&quot;DontCompress&quot;/&gt;&lt;w:optimizeForBrowser/&gt;&lt;w:validateAgainstSchema/&gt;&lt;w:saveInvalidXML w:val=&quot;off&quot;/&gt;&lt;w:ignoreMixedContent w:val=&quot;off&quot;/&gt;&lt;w:alwaysShowPlaceholderText w:val=&quot;off&quot;/&gt;&lt;w:compat&gt;&lt;w:breakWrappedTables/&gt;&lt;w:snapToGridInCell/&gt;&lt;w:applyBreakingRules/&gt;&lt;w:wrapTextWithPunct/&gt;&lt;w:useAsianBreakRules/&gt;&lt;w:useWord2002TableStyleRules/&gt;&lt;w:useFELayout/&gt;&lt;/w:compat&gt;&lt;wsp:rsids&gt;&lt;wsp:rsidRoot wsp:val=&quot;00426FBB&quot;/&gt;&lt;wsp:rsid wsp:val=&quot;000002E1&quot;/&gt;&lt;wsp:rsid wsp:val=&quot;00003C97&quot;/&gt;&lt;wsp:rsid wsp:val=&quot;00005565&quot;/&gt;&lt;wsp:rsid wsp:val=&quot;0001754A&quot;/&gt;&lt;wsp:rsid wsp:val=&quot;00017719&quot;/&gt;&lt;wsp:rsid wsp:val=&quot;00027F1D&quot;/&gt;&lt;wsp:rsid wsp:val=&quot;0003296C&quot;/&gt;&lt;wsp:rsid wsp:val=&quot;0003351F&quot;/&gt;&lt;wsp:rsid wsp:val=&quot;00044599&quot;/&gt;&lt;wsp:rsid wsp:val=&quot;000540E6&quot;/&gt;&lt;wsp:rsid wsp:val=&quot;00054421&quot;/&gt;&lt;wsp:rsid wsp:val=&quot;00062E46&quot;/&gt;&lt;wsp:rsid wsp:val=&quot;00074AC8&quot;/&gt;&lt;wsp:rsid wsp:val=&quot;00081408&quot;/&gt;&lt;wsp:rsid wsp:val=&quot;00081EBE&quot;/&gt;&lt;wsp:rsid wsp:val=&quot;00086EDC&quot;/&gt;&lt;wsp:rsid wsp:val=&quot;000B1236&quot;/&gt;&lt;wsp:rsid wsp:val=&quot;000B36A3&quot;/&gt;&lt;wsp:rsid wsp:val=&quot;000C013C&quot;/&gt;&lt;wsp:rsid wsp:val=&quot;000E3F84&quot;/&gt;&lt;wsp:rsid wsp:val=&quot;001056DF&quot;/&gt;&lt;wsp:rsid wsp:val=&quot;0010789C&quot;/&gt;&lt;wsp:rsid wsp:val=&quot;00114025&quot;/&gt;&lt;wsp:rsid wsp:val=&quot;001160D2&quot;/&gt;&lt;wsp:rsid wsp:val=&quot;00120636&quot;/&gt;&lt;wsp:rsid wsp:val=&quot;001348A5&quot;/&gt;&lt;wsp:rsid wsp:val=&quot;00151B8E&quot;/&gt;&lt;wsp:rsid wsp:val=&quot;00182170&quot;/&gt;&lt;wsp:rsid wsp:val=&quot;001928FB&quot;/&gt;&lt;wsp:rsid wsp:val=&quot;00192BC7&quot;/&gt;&lt;wsp:rsid wsp:val=&quot;00195BE6&quot;/&gt;&lt;wsp:rsid wsp:val=&quot;001A3C37&quot;/&gt;&lt;wsp:rsid wsp:val=&quot;001A50EA&quot;/&gt;&lt;wsp:rsid wsp:val=&quot;001F16CD&quot;/&gt;&lt;wsp:rsid wsp:val=&quot;001F47D2&quot;/&gt;&lt;wsp:rsid wsp:val=&quot;002029C8&quot;/&gt;&lt;wsp:rsid wsp:val=&quot;0022285A&quot;/&gt;&lt;wsp:rsid wsp:val=&quot;00224C61&quot;/&gt;&lt;wsp:rsid wsp:val=&quot;00256ABC&quot;/&gt;&lt;wsp:rsid wsp:val=&quot;0027227B&quot;/&gt;&lt;wsp:rsid wsp:val=&quot;00273AC7&quot;/&gt;&lt;wsp:rsid wsp:val=&quot;00273D2C&quot;/&gt;&lt;wsp:rsid wsp:val=&quot;00285ECD&quot;/&gt;&lt;wsp:rsid wsp:val=&quot;00290E1B&quot;/&gt;&lt;wsp:rsid wsp:val=&quot;00291B17&quot;/&gt;&lt;wsp:rsid wsp:val=&quot;00291BB3&quot;/&gt;&lt;wsp:rsid wsp:val=&quot;002A6742&quot;/&gt;&lt;wsp:rsid wsp:val=&quot;002C1A7F&quot;/&gt;&lt;wsp:rsid wsp:val=&quot;002C4239&quot;/&gt;&lt;wsp:rsid wsp:val=&quot;002C559D&quot;/&gt;&lt;wsp:rsid wsp:val=&quot;002D16AE&quot;/&gt;&lt;wsp:rsid wsp:val=&quot;002D2D42&quot;/&gt;&lt;wsp:rsid wsp:val=&quot;002F72D0&quot;/&gt;&lt;wsp:rsid wsp:val=&quot;002F7A4F&quot;/&gt;&lt;wsp:rsid wsp:val=&quot;003003AB&quot;/&gt;&lt;wsp:rsid wsp:val=&quot;00302C35&quot;/&gt;&lt;wsp:rsid wsp:val=&quot;00311C49&quot;/&gt;&lt;wsp:rsid wsp:val=&quot;0032119E&quot;/&gt;&lt;wsp:rsid wsp:val=&quot;00321304&quot;/&gt;&lt;wsp:rsid wsp:val=&quot;00324FC2&quot;/&gt;&lt;wsp:rsid wsp:val=&quot;003312CA&quot;/&gt;&lt;wsp:rsid wsp:val=&quot;00331F84&quot;/&gt;&lt;wsp:rsid wsp:val=&quot;003329D6&quot;/&gt;&lt;wsp:rsid wsp:val=&quot;0037721F&quot;/&gt;&lt;wsp:rsid wsp:val=&quot;003950A4&quot;/&gt;&lt;wsp:rsid wsp:val=&quot;003A1E7E&quot;/&gt;&lt;wsp:rsid wsp:val=&quot;003E2FDC&quot;/&gt;&lt;wsp:rsid wsp:val=&quot;003E3577&quot;/&gt;&lt;wsp:rsid wsp:val=&quot;003F3A61&quot;/&gt;&lt;wsp:rsid wsp:val=&quot;00410A5D&quot;/&gt;&lt;wsp:rsid wsp:val=&quot;00414909&quot;/&gt;&lt;wsp:rsid wsp:val=&quot;00416537&quot;/&gt;&lt;wsp:rsid wsp:val=&quot;00425A6A&quot;/&gt;&lt;wsp:rsid wsp:val=&quot;00426FBB&quot;/&gt;&lt;wsp:rsid wsp:val=&quot;00454542&quot;/&gt;&lt;wsp:rsid wsp:val=&quot;0047429A&quot;/&gt;&lt;wsp:rsid wsp:val=&quot;0048374C&quot;/&gt;&lt;wsp:rsid wsp:val=&quot;0048771D&quot;/&gt;&lt;wsp:rsid wsp:val=&quot;004A6605&quot;/&gt;&lt;wsp:rsid wsp:val=&quot;004C45FA&quot;/&gt;&lt;wsp:rsid wsp:val=&quot;004D35A3&quot;/&gt;&lt;wsp:rsid wsp:val=&quot;004E1BD8&quot;/&gt;&lt;wsp:rsid wsp:val=&quot;004E452A&quot;/&gt;&lt;wsp:rsid wsp:val=&quot;004E78E3&quot;/&gt;&lt;wsp:rsid wsp:val=&quot;004F2BFE&quot;/&gt;&lt;wsp:rsid wsp:val=&quot;004F63D3&quot;/&gt;&lt;wsp:rsid wsp:val=&quot;004F7DCF&quot;/&gt;&lt;wsp:rsid wsp:val=&quot;005004BF&quot;/&gt;&lt;wsp:rsid wsp:val=&quot;00502E89&quot;/&gt;&lt;wsp:rsid wsp:val=&quot;00506CFE&quot;/&gt;&lt;wsp:rsid wsp:val=&quot;00510E95&quot;/&gt;&lt;wsp:rsid wsp:val=&quot;005225C3&quot;/&gt;&lt;wsp:rsid wsp:val=&quot;00527D56&quot;/&gt;&lt;wsp:rsid wsp:val=&quot;0053221F&quot;/&gt;&lt;wsp:rsid wsp:val=&quot;00536FAE&quot;/&gt;&lt;wsp:rsid wsp:val=&quot;00542C85&quot;/&gt;&lt;wsp:rsid wsp:val=&quot;00553510&quot;/&gt;&lt;wsp:rsid wsp:val=&quot;00554186&quot;/&gt;&lt;wsp:rsid wsp:val=&quot;00585769&quot;/&gt;&lt;wsp:rsid wsp:val=&quot;00585C61&quot;/&gt;&lt;wsp:rsid wsp:val=&quot;00591130&quot;/&gt;&lt;wsp:rsid wsp:val=&quot;005A3F28&quot;/&gt;&lt;wsp:rsid wsp:val=&quot;005A40BE&quot;/&gt;&lt;wsp:rsid wsp:val=&quot;005B13E2&quot;/&gt;&lt;wsp:rsid wsp:val=&quot;005B47D7&quot;/&gt;&lt;wsp:rsid wsp:val=&quot;005C5526&quot;/&gt;&lt;wsp:rsid wsp:val=&quot;005C62C6&quot;/&gt;&lt;wsp:rsid wsp:val=&quot;005D7B9E&quot;/&gt;&lt;wsp:rsid wsp:val=&quot;005E112E&quot;/&gt;&lt;wsp:rsid wsp:val=&quot;005F0834&quot;/&gt;&lt;wsp:rsid wsp:val=&quot;005F68AB&quot;/&gt;&lt;wsp:rsid wsp:val=&quot;005F6DC3&quot;/&gt;&lt;wsp:rsid wsp:val=&quot;00601A8E&quot;/&gt;&lt;wsp:rsid wsp:val=&quot;0062033E&quot;/&gt;&lt;wsp:rsid wsp:val=&quot;00624482&quot;/&gt;&lt;wsp:rsid wsp:val=&quot;0064799C&quot;/&gt;&lt;wsp:rsid wsp:val=&quot;00654156&quot;/&gt;&lt;wsp:rsid wsp:val=&quot;00656ADC&quot;/&gt;&lt;wsp:rsid wsp:val=&quot;006B47CA&quot;/&gt;&lt;wsp:rsid wsp:val=&quot;006C304C&quot;/&gt;&lt;wsp:rsid wsp:val=&quot;006C4511&quot;/&gt;&lt;wsp:rsid wsp:val=&quot;006C65F5&quot;/&gt;&lt;wsp:rsid wsp:val=&quot;006C7AAA&quot;/&gt;&lt;wsp:rsid wsp:val=&quot;006D1C2A&quot;/&gt;&lt;wsp:rsid wsp:val=&quot;006D264F&quot;/&gt;&lt;wsp:rsid wsp:val=&quot;006D4E89&quot;/&gt;&lt;wsp:rsid wsp:val=&quot;006E2A8D&quot;/&gt;&lt;wsp:rsid wsp:val=&quot;006E7574&quot;/&gt;&lt;wsp:rsid wsp:val=&quot;00703430&quot;/&gt;&lt;wsp:rsid wsp:val=&quot;00703548&quot;/&gt;&lt;wsp:rsid wsp:val=&quot;00704E18&quot;/&gt;&lt;wsp:rsid wsp:val=&quot;007069BE&quot;/&gt;&lt;wsp:rsid wsp:val=&quot;00745C86&quot;/&gt;&lt;wsp:rsid wsp:val=&quot;00764603&quot;/&gt;&lt;wsp:rsid wsp:val=&quot;0076604D&quot;/&gt;&lt;wsp:rsid wsp:val=&quot;00790909&quot;/&gt;&lt;wsp:rsid wsp:val=&quot;007929AF&quot;/&gt;&lt;wsp:rsid wsp:val=&quot;007B1582&quot;/&gt;&lt;wsp:rsid wsp:val=&quot;007B5A07&quot;/&gt;&lt;wsp:rsid wsp:val=&quot;007C065D&quot;/&gt;&lt;wsp:rsid wsp:val=&quot;007D3E71&quot;/&gt;&lt;wsp:rsid wsp:val=&quot;007E5D6A&quot;/&gt;&lt;wsp:rsid wsp:val=&quot;007E645D&quot;/&gt;&lt;wsp:rsid wsp:val=&quot;007F75CA&quot;/&gt;&lt;wsp:rsid wsp:val=&quot;00806EDD&quot;/&gt;&lt;wsp:rsid wsp:val=&quot;00821E08&quot;/&gt;&lt;wsp:rsid wsp:val=&quot;00834EFD&quot;/&gt;&lt;wsp:rsid wsp:val=&quot;00844B24&quot;/&gt;&lt;wsp:rsid wsp:val=&quot;0084515F&quot;/&gt;&lt;wsp:rsid wsp:val=&quot;0085092D&quot;/&gt;&lt;wsp:rsid wsp:val=&quot;00865414&quot;/&gt;&lt;wsp:rsid wsp:val=&quot;00877D4C&quot;/&gt;&lt;wsp:rsid wsp:val=&quot;008831DC&quot;/&gt;&lt;wsp:rsid wsp:val=&quot;00883903&quot;/&gt;&lt;wsp:rsid wsp:val=&quot;00891C30&quot;/&gt;&lt;wsp:rsid wsp:val=&quot;00897219&quot;/&gt;&lt;wsp:rsid wsp:val=&quot;0089763B&quot;/&gt;&lt;wsp:rsid wsp:val=&quot;008B6AE3&quot;/&gt;&lt;wsp:rsid wsp:val=&quot;008C1332&quot;/&gt;&lt;wsp:rsid wsp:val=&quot;008D1045&quot;/&gt;&lt;wsp:rsid wsp:val=&quot;008E5996&quot;/&gt;&lt;wsp:rsid wsp:val=&quot;00901AE1&quot;/&gt;&lt;wsp:rsid wsp:val=&quot;00912F93&quot;/&gt;&lt;wsp:rsid wsp:val=&quot;009205B4&quot;/&gt;&lt;wsp:rsid wsp:val=&quot;00955B59&quot;/&gt;&lt;wsp:rsid wsp:val=&quot;00992262&quot;/&gt;&lt;wsp:rsid wsp:val=&quot;009926BC&quot;/&gt;&lt;wsp:rsid wsp:val=&quot;009A4319&quot;/&gt;&lt;wsp:rsid wsp:val=&quot;009A6C3F&quot;/&gt;&lt;wsp:rsid wsp:val=&quot;009B73F2&quot;/&gt;&lt;wsp:rsid wsp:val=&quot;009C12BD&quot;/&gt;&lt;wsp:rsid wsp:val=&quot;009C50FE&quot;/&gt;&lt;wsp:rsid wsp:val=&quot;009E49DD&quot;/&gt;&lt;wsp:rsid wsp:val=&quot;00A03E75&quot;/&gt;&lt;wsp:rsid wsp:val=&quot;00A20627&quot;/&gt;&lt;wsp:rsid wsp:val=&quot;00A22FE9&quot;/&gt;&lt;wsp:rsid wsp:val=&quot;00A31A44&quot;/&gt;&lt;wsp:rsid wsp:val=&quot;00A32BFA&quot;/&gt;&lt;wsp:rsid wsp:val=&quot;00A3325E&quot;/&gt;&lt;wsp:rsid wsp:val=&quot;00A45FCE&quot;/&gt;&lt;wsp:rsid wsp:val=&quot;00A75671&quot;/&gt;&lt;wsp:rsid wsp:val=&quot;00A773CC&quot;/&gt;&lt;wsp:rsid wsp:val=&quot;00A924D0&quot;/&gt;&lt;wsp:rsid wsp:val=&quot;00A9318B&quot;/&gt;&lt;wsp:rsid wsp:val=&quot;00A94AC1&quot;/&gt;&lt;wsp:rsid wsp:val=&quot;00AB18B7&quot;/&gt;&lt;wsp:rsid wsp:val=&quot;00AD335D&quot;/&gt;&lt;wsp:rsid wsp:val=&quot;00AF114C&quot;/&gt;&lt;wsp:rsid wsp:val=&quot;00AF792B&quot;/&gt;&lt;wsp:rsid wsp:val=&quot;00B32137&quot;/&gt;&lt;wsp:rsid wsp:val=&quot;00B33D2F&quot;/&gt;&lt;wsp:rsid wsp:val=&quot;00B40A5B&quot;/&gt;&lt;wsp:rsid wsp:val=&quot;00B45C6B&quot;/&gt;&lt;wsp:rsid wsp:val=&quot;00B55D5E&quot;/&gt;&lt;wsp:rsid wsp:val=&quot;00B57A80&quot;/&gt;&lt;wsp:rsid wsp:val=&quot;00B70E9C&quot;/&gt;&lt;wsp:rsid wsp:val=&quot;00B713D8&quot;/&gt;&lt;wsp:rsid wsp:val=&quot;00B72979&quot;/&gt;&lt;wsp:rsid wsp:val=&quot;00B94516&quot;/&gt;&lt;wsp:rsid wsp:val=&quot;00BA25E2&quot;/&gt;&lt;wsp:rsid wsp:val=&quot;00BB2855&quot;/&gt;&lt;wsp:rsid wsp:val=&quot;00BC5343&quot;/&gt;&lt;wsp:rsid wsp:val=&quot;00BD19C1&quot;/&gt;&lt;wsp:rsid wsp:val=&quot;00BD25B8&quot;/&gt;&lt;wsp:rsid wsp:val=&quot;00C012E1&quot;/&gt;&lt;wsp:rsid wsp:val=&quot;00C06BB4&quot;/&gt;&lt;wsp:rsid wsp:val=&quot;00C10D20&quot;/&gt;&lt;wsp:rsid wsp:val=&quot;00C12E0C&quot;/&gt;&lt;wsp:rsid wsp:val=&quot;00C21916&quot;/&gt;&lt;wsp:rsid wsp:val=&quot;00C34915&quot;/&gt;&lt;wsp:rsid wsp:val=&quot;00C457CA&quot;/&gt;&lt;wsp:rsid wsp:val=&quot;00C53FB6&quot;/&gt;&lt;wsp:rsid wsp:val=&quot;00C57FB7&quot;/&gt;&lt;wsp:rsid wsp:val=&quot;00C644D4&quot;/&gt;&lt;wsp:rsid wsp:val=&quot;00C65F3F&quot;/&gt;&lt;wsp:rsid wsp:val=&quot;00C72414&quot;/&gt;&lt;wsp:rsid wsp:val=&quot;00C72B1A&quot;/&gt;&lt;wsp:rsid wsp:val=&quot;00C8667B&quot;/&gt;&lt;wsp:rsid wsp:val=&quot;00C90993&quot;/&gt;&lt;wsp:rsid wsp:val=&quot;00CA4CE3&quot;/&gt;&lt;wsp:rsid wsp:val=&quot;00CC72FD&quot;/&gt;&lt;wsp:rsid wsp:val=&quot;00CD1D23&quot;/&gt;&lt;wsp:rsid wsp:val=&quot;00CD4F3F&quot;/&gt;&lt;wsp:rsid wsp:val=&quot;00D311F8&quot;/&gt;&lt;wsp:rsid wsp:val=&quot;00D31660&quot;/&gt;&lt;wsp:rsid wsp:val=&quot;00D36B52&quot;/&gt;&lt;wsp:rsid wsp:val=&quot;00D377C8&quot;/&gt;&lt;wsp:rsid wsp:val=&quot;00D41274&quot;/&gt;&lt;wsp:rsid wsp:val=&quot;00D4229C&quot;/&gt;&lt;wsp:rsid wsp:val=&quot;00D43BF3&quot;/&gt;&lt;wsp:rsid wsp:val=&quot;00D549FB&quot;/&gt;&lt;wsp:rsid wsp:val=&quot;00D56487&quot;/&gt;&lt;wsp:rsid wsp:val=&quot;00D767BB&quot;/&gt;&lt;wsp:rsid wsp:val=&quot;00D939B0&quot;/&gt;&lt;wsp:rsid wsp:val=&quot;00DA31A2&quot;/&gt;&lt;wsp:rsid wsp:val=&quot;00DB16E0&quot;/&gt;&lt;wsp:rsid wsp:val=&quot;00DB2DF9&quot;/&gt;&lt;wsp:rsid wsp:val=&quot;00DB465D&quot;/&gt;&lt;wsp:rsid wsp:val=&quot;00DB48A2&quot;/&gt;&lt;wsp:rsid wsp:val=&quot;00DB7E63&quot;/&gt;&lt;wsp:rsid wsp:val=&quot;00DC2055&quot;/&gt;&lt;wsp:rsid wsp:val=&quot;00DC3908&quot;/&gt;&lt;wsp:rsid wsp:val=&quot;00DD71E8&quot;/&gt;&lt;wsp:rsid wsp:val=&quot;00DD7F83&quot;/&gt;&lt;wsp:rsid wsp:val=&quot;00DE4EB8&quot;/&gt;&lt;wsp:rsid wsp:val=&quot;00E0641E&quot;/&gt;&lt;wsp:rsid wsp:val=&quot;00E06664&quot;/&gt;&lt;wsp:rsid wsp:val=&quot;00E304BC&quot;/&gt;&lt;wsp:rsid wsp:val=&quot;00E32853&quot;/&gt;&lt;wsp:rsid wsp:val=&quot;00E34EBD&quot;/&gt;&lt;wsp:rsid wsp:val=&quot;00E401F8&quot;/&gt;&lt;wsp:rsid wsp:val=&quot;00E46425&quot;/&gt;&lt;wsp:rsid wsp:val=&quot;00E469FC&quot;/&gt;&lt;wsp:rsid wsp:val=&quot;00E47D0E&quot;/&gt;&lt;wsp:rsid wsp:val=&quot;00E65018&quot;/&gt;&lt;wsp:rsid wsp:val=&quot;00E76CA1&quot;/&gt;&lt;wsp:rsid wsp:val=&quot;00E94339&quot;/&gt;&lt;wsp:rsid wsp:val=&quot;00E97563&quot;/&gt;&lt;wsp:rsid wsp:val=&quot;00EB0B63&quot;/&gt;&lt;wsp:rsid wsp:val=&quot;00EC265C&quot;/&gt;&lt;wsp:rsid wsp:val=&quot;00ED61CB&quot;/&gt;&lt;wsp:rsid wsp:val=&quot;00EE752A&quot;/&gt;&lt;wsp:rsid wsp:val=&quot;00F06A72&quot;/&gt;&lt;wsp:rsid wsp:val=&quot;00F136F0&quot;/&gt;&lt;wsp:rsid wsp:val=&quot;00F20BBB&quot;/&gt;&lt;wsp:rsid wsp:val=&quot;00F36048&quot;/&gt;&lt;wsp:rsid wsp:val=&quot;00F43BD8&quot;/&gt;&lt;wsp:rsid wsp:val=&quot;00F562F3&quot;/&gt;&lt;wsp:rsid wsp:val=&quot;00F74B89&quot;/&gt;&lt;wsp:rsid wsp:val=&quot;00F75133&quot;/&gt;&lt;wsp:rsid wsp:val=&quot;00F83272&quot;/&gt;&lt;wsp:rsid wsp:val=&quot;00F9358D&quot;/&gt;&lt;wsp:rsid wsp:val=&quot;00F9369B&quot;/&gt;&lt;wsp:rsid wsp:val=&quot;00FA3899&quot;/&gt;&lt;wsp:rsid wsp:val=&quot;00FA4909&quot;/&gt;&lt;wsp:rsid wsp:val=&quot;00FA5164&quot;/&gt;&lt;wsp:rsid wsp:val=&quot;00FA6751&quot;/&gt;&lt;wsp:rsid wsp:val=&quot;00FA6BD7&quot;/&gt;&lt;wsp:rsid wsp:val=&quot;00FB1048&quot;/&gt;&lt;wsp:rsid wsp:val=&quot;00FB62C4&quot;/&gt;&lt;wsp:rsid wsp:val=&quot;00FB7701&quot;/&gt;&lt;wsp:rsid wsp:val=&quot;00FD1AC5&quot;/&gt;&lt;wsp:rsid wsp:val=&quot;00FD5CF0&quot;/&gt;&lt;/wsp:rsids&gt;&lt;/w:docPr&gt;&lt;w:body&gt;&lt;wx:sect&gt;&lt;w:p wsp:rsidR=&quot;00806EDD&quot; wsp:rsidRPr=&quot;00806EDD&quot; wsp:rsidRDefault=&quot;00806EDD&quot; wsp:rsidP=&quot;00806EDD&quot;&gt;&lt;m:oMathPara&gt;&lt;m:oMath&gt;&lt;m:sSub&gt;&lt;m:sSubPr&gt;&lt;m:ctrlPr&gt;&lt;w:rPr&gt;&lt;w:rFonts w:ascii=&quot;Cambria Math&quot; w:h-ansi=&quot;Cambria Math&quot;/&gt;&lt;wx:font wx:val=&quot;Cambria Math&quot;/&gt;&lt;w:i/&gt;&lt;/w:rPr&gt;&lt;/m:ctrlPr&gt;&lt;/m:sSubPr&gt;&lt;m:e&gt;&lt;m:r&gt;&lt;w:rPr&gt;&lt;w:rFonts w:ascii=&quot;Cambria Math&quot; w:h-ansi=&quot;Cambria Math&quot;/&gt;&lt;wx:font wx:val=&quot;Cambria Math&quot;/&gt;&lt;w:i/&gt;&lt;/w:rPr&gt;&lt;m:t&gt;I&lt;/m:t&gt;&lt;/m:r&gt;&lt;/m:e&gt;&lt;m:sub&gt;&lt;m:r&gt;&lt;w:rPr&gt;&lt;w:rFonts w:ascii=&quot;Cambria Math&quot; w:h-ansi=&quot;Cambria Math&quot;/&gt;&lt;wx:font wx:val=&quot;Cambria Math&quot;/&gt;&lt;w:i/&gt;&lt;/w:rPr&gt;&lt;m:t&gt;pk&lt;/m:t&gt;&lt;/m:r&gt;&lt;m:d&gt;&lt;m:dPr&gt;&lt;m:ctrlPr&gt;&lt;w:rPr&gt;&lt;w:rFonts w:ascii=&quot;Cambria Math&quot; w:h-ansi=&quot;Cambria Math&quot;/&gt;&lt;wx:font wx:val=&quot;Cambria Math&quot;/&gt;&lt;w:i/&gt;&lt;/w:rPr&gt;&lt;/m:ctrlPr&gt;&lt;/m:dPr&gt;&lt;m:e&gt;&lt;m:r&gt;&lt;w:rPr&gt;&lt;w:rFonts w:ascii=&quot;Cambria Math&quot; w:h-ansi=&quot;Cambria Math&quot;/&gt;&lt;wx:font wx:val=&quot;Cambria Math&quot;/&gt;&lt;w:i/&gt;&lt;/w:rPr&gt;&lt;m:t&gt;switch&lt;/m:t&gt;&lt;/m:r&gt;&lt;/m:e&gt;&lt;/m:d&gt;&lt;/m:sub&gt;&lt;/m:sSub&gt;&lt;m:r&gt;&lt;w:rPr&gt;&lt;w:rFonts w:ascii=&quot;Cambria Math&quot; w:h-ansi=&quot;Cambria Math&quot;/&gt;&lt;wx:font wx:val=&quot;Cambria Math&quot;/&gt;&lt;w:i/&gt;&lt;/w:rPr&gt;&lt;m:t&gt;=2âˆ™&lt;/m:t&gt;&lt;/m:r&gt;&lt;m:sSub&gt;&lt;m:sSubPr&gt;&lt;m:ctrlPr&gt;&lt;w:rPr&gt;&lt;w:rFonts w:ascii=&quot;Cambria Math&quot; w:h-ansi=&quot;Cambria Math&quot;/&gt;&lt;wx:font wx:val=&quot;Cambria Math&quot;/&gt;&lt;w:i/&gt;&lt;/w:rPr&gt;&lt;/m:ctrlPr&gt;&lt;/m:sSubPr&gt;&lt;m:e&gt;&lt;m:r&gt;&lt;w:rPr&gt;&lt;w:rFonts w:ascii=&quot;Cambria Math&quot; w:h-ansi=&quot;Cambria Math&quot;/&gt;&lt;wx:font wx:val=&quot;Cambria Math&quot;/&gt;&lt;w:i/&gt;&lt;/w:rPr&gt;&lt;m:t&gt;I&lt;/m:t&gt;&lt;/m:r&gt;&lt;/m:e&gt;&lt;m:sub&gt;&lt;m:r&gt;&lt;w:rPr&gt;&lt;w:rFonts w:ascii=&quot;Cambria Math&quot; w:h-ansi=&quot;Cambria Math&quot;/&gt;&lt;wx:font wx:val=&quot;Cambria Math&quot;/&gt;&lt;w:i/&gt;&lt;/w:rPr&gt;&lt;m:t&gt;out&lt;/m:t&gt;&lt;/m:r&gt;&lt;m:d&gt;&lt;m:dPr&gt;&lt;m:ctrlPr&gt;&lt;w:rPr&gt;&lt;w:rFonts w:ascii=&quot;Cambria Math&quot; w:h-ansi=&quot;Cambria Math&quot;/&gt;&lt;wx:font wx:val=&quot;Cambria Math&quot;/&gt;&lt;w:i/&gt;&lt;/w:rPr&gt;&lt;/m:ctrlPr&gt;&lt;/m:dPr&gt;&lt;m:e&gt;&lt;m:r&gt;&lt;w:rPr&gt;&lt;w:rFonts w:ascii=&quot;Cambria Math&quot; w:h-ansi=&quot;Cambria Math&quot;/&gt;&lt;wx:font wx:val=&quot;Cambria Math&quot;/&gt;&lt;w:i/&gt;&lt;/w:rPr&gt;&lt;m:t&gt;mÃ¡x&lt;/m:t&gt;&lt;/m:r&gt;&lt;/m:e&gt;&lt;/m:d&gt;&lt;/m:sub&gt;&lt;/m:sSub&gt;&lt;/m:oMath&gt;&lt;/m:oMathPara&gt;&lt;/w:p&gt;&lt;w:sectPr wsp:rsidR=&quot;00000000&quot; wsp:rsidRPr=&quot;00806EDD&quot;&gt;&lt;w:pgSz w:w=&quot;12240&quot; w:h=&quot;15840&quot;/&gt;&lt;w:pgMar w:top=&quot;1440&quot; w:right=&quot;1440&quot; w:bottom=&quot;1440&quot; w:left=&quot;1440&quot; w:header=&quot;720&quot; w:footer=&quot;720&quot; w:gutter=&quot;0&quot;/&gt;&lt;w:cols w:space=&quot;720&quot;/&gt;&lt;/w:sectPr&gt;&lt;/wx:sect&gt;&lt;/w:body&gt;&lt;/w:wordDocument&gt;">
                   <v:imagedata r:id="rId28" o:title="" chromakey="white"/>
                 </v:shape>
               </w:pict>
@@ -3159,12 +3119,12 @@
       </w:tr>
       <w:tr>
         <w:trPr>
-          <w:trHeight w:val="550"/>
+          <w:trHeight w:val="541"/>
           <w:jc w:val="center"/>
         </w:trPr>
         <w:tc>
           <w:tcPr>
-            <w:tcW w:w="1825" w:type="dxa"/>
+            <w:tcW w:w="1799" w:type="dxa"/>
             <w:shd w:val="clear" w:color="auto" w:fill="auto"/>
             <w:vAlign w:val="center"/>
           </w:tcPr>
@@ -3186,7 +3146,7 @@
         </w:tc>
         <w:tc>
           <w:tcPr>
-            <w:tcW w:w="3184" w:type="dxa"/>
+            <w:tcW w:w="3140" w:type="dxa"/>
             <w:shd w:val="clear" w:color="auto" w:fill="auto"/>
             <w:vAlign w:val="center"/>
           </w:tcPr>
@@ -3204,7 +3164,7 @@
                 <w:szCs w:val="16"/>
               </w:rPr>
               <w:pict w14:anchorId="3AED5FD1">
-                <v:shape id="_x0000_i1787" type="#_x0000_t75" style="width:69.8pt;height:25.65pt" equationxml="&lt;?xml version=&quot;1.0&quot; encoding=&quot;UTF-8&quot; standalone=&quot;yes&quot;?&gt;&#10;&lt;?mso-application progid=&quot;Word.Document&quot;?&gt;&#10;&lt;w:wordDocument xmlns:aml=&quot;http://schemas.microsoft.com/aml/2001/core&quot; xmlns:wpc=&quot;http://schemas.microsoft.com/office/word/2010/wordprocessingCanvas&quot; xmlns:cx=&quot;http://schemas.microsoft.com/office/drawing/2014/chartex&quot; xmlns:cx1=&quot;http://schemas.microsoft.com/office/drawing/2015/9/8/chartex&quot; xmlns:cx2=&quot;http://schemas.microsoft.com/office/drawing/2015/10/21/chartex&quot; xmlns:cx3=&quot;http://schemas.microsoft.com/office/drawing/2016/5/9/chartex&quot; xmlns:cx4=&quot;http://schemas.microsoft.com/office/drawing/2016/5/10/chartex&quot; xmlns:cx5=&quot;http://schemas.microsoft.com/office/drawing/2016/5/11/chartex&quot; xmlns:cx6=&quot;http://schemas.microsoft.com/office/drawing/2016/5/12/chartex&quot; xmlns:cx7=&quot;http://schemas.microsoft.com/office/drawing/2016/5/13/chartex&quot; xmlns:cx8=&quot;http://schemas.microsoft.com/office/drawing/2016/5/14/chartex&quot; xmlns:cr=&quot;http://schemas.microsoft.com/office/comments/2020/reactions&quot; xmlns:dt=&quot;uuid:C2F41010-65B3-11d1-A29F-00AA00C14882&quot; xmlns:mc=&quot;http://schemas.openxmlformats.org/markup-compatibility/2006&quot; xmlns:aink=&quot;http://schemas.microsoft.com/office/drawing/2016/ink&quot; xmlns:am3d=&quot;http://schemas.microsoft.com/office/drawing/2017/model3d&quot; xmlns:o=&quot;urn:schemas-microsoft-com:office:office&quot; xmlns:oel=&quot;http://schemas.microsoft.com/office/2019/extlst&quot; xmlns:m=&quot;http://schemas.openxmlformats.org/officeDocument/2006/math&quot; xmlns:v=&quot;urn:schemas-microsoft-com:vml&quot; xmlns:w10=&quot;urn:schemas-microsoft-com:office:word&quot; xmlns:w=&quot;http://schemas.microsoft.com/office/word/2003/wordml&quot; xmlns:wx=&quot;http://schemas.microsoft.com/office/word/2003/auxHint&quot; xmlns:wne=&quot;http://schemas.microsoft.com/office/word/2006/wordml&quot; xmlns:wsp=&quot;http://schemas.microsoft.com/office/word/2003/wordml/sp2&quot; xmlns:sl=&quot;http://schemas.microsoft.com/schemaLibrary/2003/core&quot; w:macrosPresent=&quot;no&quot; w:embeddedObjPresent=&quot;no&quot; w:ocxPresent=&quot;no&quot; xml:space=&quot;preserve&quot;&gt;&lt;w:ignoreSubtree w:val=&quot;http://schemas.microsoft.com/office/word/2003/wordml/sp2&quot;/&gt;&lt;o:DocumentProperties&gt;&lt;o:Version&gt;16&lt;/o:Version&gt;&lt;/o:DocumentProperties&gt;&lt;w:docPr&gt;&lt;w:view w:val=&quot;print&quot;/&gt;&lt;w:zoom w:percent=&quot;100&quot;/&gt;&lt;w:doNotEmbedSystemFonts/&gt;&lt;w:activeWritingStyle w:lang=&quot;EN-AU&quot; w:vendorID=&quot;64&quot; w:dllVersion=&quot;6&quot; w:nlCheck=&quot;on&quot; w:optionSet=&quot;1&quot;/&gt;&lt;w:activeWritingStyle w:lang=&quot;EN-GB&quot; w:vendorID=&quot;64&quot; w:dllVersion=&quot;6&quot; w:nlCheck=&quot;on&quot; w:optionSet=&quot;1&quot;/&gt;&lt;w:activeWritingStyle w:lang=&quot;EN-US&quot; w:vendorID=&quot;64&quot; w:dllVersion=&quot;6&quot; w:nlCheck=&quot;on&quot; w:optionSet=&quot;1&quot;/&gt;&lt;w:activeWritingStyle w:lang=&quot;EN-AU&quot; w:vendorID=&quot;64&quot; w:dllVersion=&quot;0&quot; w:nlCheck=&quot;on&quot; w:optionSet=&quot;0&quot;/&gt;&lt;w:activeWritingStyle w:lang=&quot;EN-GB&quot; w:vendorID=&quot;64&quot; w:dllVersion=&quot;0&quot; w:nlCheck=&quot;on&quot; w:optionSet=&quot;0&quot;/&gt;&lt;w:activeWritingStyle w:lang=&quot;EN-US&quot; w:vendorID=&quot;64&quot; w:dllVersion=&quot;0&quot; w:nlCheck=&quot;on&quot; w:optionSet=&quot;0&quot;/&gt;&lt;w:activeWritingStyle w:lang=&quot;ES-AR&quot; w:vendorID=&quot;64&quot; w:dllVersion=&quot;0&quot; w:nlCheck=&quot;on&quot; w:optionSet=&quot;0&quot;/&gt;&lt;w:activeWritingStyle w:lang=&quot;580A&quot; w:vendorID=&quot;64&quot; w:dllVersion=&quot;0&quot; w:nlCheck=&quot;on&quot; w:optionSet=&quot;0&quot;/&gt;&lt;w:activeWritingStyle w:lang=&quot;PT-BR&quot; w:vendorID=&quot;64&quot; w:dllVersion=&quot;0&quot; w:nlCheck=&quot;on&quot; w:optionSet=&quot;0&quot;/&gt;&lt;w:stylePaneFormatFilter w:val=&quot;3F01&quot;/&gt;&lt;w:defaultTabStop w:val=&quot;720&quot;/&gt;&lt;w:hyphenationZone w:val=&quot;425&quot;/&gt;&lt;w:characterSpacingControl w:val=&quot;DontCompress&quot;/&gt;&lt;w:optimizeForBrowser/&gt;&lt;w:validateAgainstSchema/&gt;&lt;w:saveInvalidXML w:val=&quot;off&quot;/&gt;&lt;w:ignoreMixedContent w:val=&quot;off&quot;/&gt;&lt;w:alwaysShowPlaceholderText w:val=&quot;off&quot;/&gt;&lt;w:compat&gt;&lt;w:breakWrappedTables/&gt;&lt;w:snapToGridInCell/&gt;&lt;w:applyBreakingRules/&gt;&lt;w:wrapTextWithPunct/&gt;&lt;w:useAsianBreakRules/&gt;&lt;w:useWord2002TableStyleRules/&gt;&lt;w:useFELayout/&gt;&lt;/w:compat&gt;&lt;wsp:rsids&gt;&lt;wsp:rsidRoot wsp:val=&quot;00426FBB&quot;/&gt;&lt;wsp:rsid wsp:val=&quot;000002E1&quot;/&gt;&lt;wsp:rsid wsp:val=&quot;00003C97&quot;/&gt;&lt;wsp:rsid wsp:val=&quot;00005565&quot;/&gt;&lt;wsp:rsid wsp:val=&quot;0001754A&quot;/&gt;&lt;wsp:rsid wsp:val=&quot;00017719&quot;/&gt;&lt;wsp:rsid wsp:val=&quot;00027F1D&quot;/&gt;&lt;wsp:rsid wsp:val=&quot;0003296C&quot;/&gt;&lt;wsp:rsid wsp:val=&quot;0003351F&quot;/&gt;&lt;wsp:rsid wsp:val=&quot;00044599&quot;/&gt;&lt;wsp:rsid wsp:val=&quot;000540E6&quot;/&gt;&lt;wsp:rsid wsp:val=&quot;00054421&quot;/&gt;&lt;wsp:rsid wsp:val=&quot;00062E46&quot;/&gt;&lt;wsp:rsid wsp:val=&quot;00074AC8&quot;/&gt;&lt;wsp:rsid wsp:val=&quot;00081408&quot;/&gt;&lt;wsp:rsid wsp:val=&quot;00081EBE&quot;/&gt;&lt;wsp:rsid wsp:val=&quot;00086EDC&quot;/&gt;&lt;wsp:rsid wsp:val=&quot;000B1236&quot;/&gt;&lt;wsp:rsid wsp:val=&quot;000B36A3&quot;/&gt;&lt;wsp:rsid wsp:val=&quot;000C013C&quot;/&gt;&lt;wsp:rsid wsp:val=&quot;000E3F84&quot;/&gt;&lt;wsp:rsid wsp:val=&quot;001056DF&quot;/&gt;&lt;wsp:rsid wsp:val=&quot;0010789C&quot;/&gt;&lt;wsp:rsid wsp:val=&quot;00114025&quot;/&gt;&lt;wsp:rsid wsp:val=&quot;001160D2&quot;/&gt;&lt;wsp:rsid wsp:val=&quot;00120636&quot;/&gt;&lt;wsp:rsid wsp:val=&quot;001348A5&quot;/&gt;&lt;wsp:rsid wsp:val=&quot;00151B8E&quot;/&gt;&lt;wsp:rsid wsp:val=&quot;00182170&quot;/&gt;&lt;wsp:rsid wsp:val=&quot;001928FB&quot;/&gt;&lt;wsp:rsid wsp:val=&quot;00192BC7&quot;/&gt;&lt;wsp:rsid wsp:val=&quot;00195BE6&quot;/&gt;&lt;wsp:rsid wsp:val=&quot;001A3C37&quot;/&gt;&lt;wsp:rsid wsp:val=&quot;001A50EA&quot;/&gt;&lt;wsp:rsid wsp:val=&quot;001F16CD&quot;/&gt;&lt;wsp:rsid wsp:val=&quot;001F47D2&quot;/&gt;&lt;wsp:rsid wsp:val=&quot;002029C8&quot;/&gt;&lt;wsp:rsid wsp:val=&quot;002163A4&quot;/&gt;&lt;wsp:rsid wsp:val=&quot;0022285A&quot;/&gt;&lt;wsp:rsid wsp:val=&quot;00224C61&quot;/&gt;&lt;wsp:rsid wsp:val=&quot;00256ABC&quot;/&gt;&lt;wsp:rsid wsp:val=&quot;0027227B&quot;/&gt;&lt;wsp:rsid wsp:val=&quot;00273AC7&quot;/&gt;&lt;wsp:rsid wsp:val=&quot;00273D2C&quot;/&gt;&lt;wsp:rsid wsp:val=&quot;00285ECD&quot;/&gt;&lt;wsp:rsid wsp:val=&quot;00290E1B&quot;/&gt;&lt;wsp:rsid wsp:val=&quot;00291B17&quot;/&gt;&lt;wsp:rsid wsp:val=&quot;00291BB3&quot;/&gt;&lt;wsp:rsid wsp:val=&quot;002A6742&quot;/&gt;&lt;wsp:rsid wsp:val=&quot;002C1A7F&quot;/&gt;&lt;wsp:rsid wsp:val=&quot;002C4239&quot;/&gt;&lt;wsp:rsid wsp:val=&quot;002C559D&quot;/&gt;&lt;wsp:rsid wsp:val=&quot;002D16AE&quot;/&gt;&lt;wsp:rsid wsp:val=&quot;002D2D42&quot;/&gt;&lt;wsp:rsid wsp:val=&quot;002F72D0&quot;/&gt;&lt;wsp:rsid wsp:val=&quot;002F7A4F&quot;/&gt;&lt;wsp:rsid wsp:val=&quot;003003AB&quot;/&gt;&lt;wsp:rsid wsp:val=&quot;00302C35&quot;/&gt;&lt;wsp:rsid wsp:val=&quot;00311C49&quot;/&gt;&lt;wsp:rsid wsp:val=&quot;0032119E&quot;/&gt;&lt;wsp:rsid wsp:val=&quot;00321304&quot;/&gt;&lt;wsp:rsid wsp:val=&quot;00324FC2&quot;/&gt;&lt;wsp:rsid wsp:val=&quot;003312CA&quot;/&gt;&lt;wsp:rsid wsp:val=&quot;00331F84&quot;/&gt;&lt;wsp:rsid wsp:val=&quot;003329D6&quot;/&gt;&lt;wsp:rsid wsp:val=&quot;0037721F&quot;/&gt;&lt;wsp:rsid wsp:val=&quot;003950A4&quot;/&gt;&lt;wsp:rsid wsp:val=&quot;003A1E7E&quot;/&gt;&lt;wsp:rsid wsp:val=&quot;003E2FDC&quot;/&gt;&lt;wsp:rsid wsp:val=&quot;003E3577&quot;/&gt;&lt;wsp:rsid wsp:val=&quot;003F3A61&quot;/&gt;&lt;wsp:rsid wsp:val=&quot;00410A5D&quot;/&gt;&lt;wsp:rsid wsp:val=&quot;00414909&quot;/&gt;&lt;wsp:rsid wsp:val=&quot;00416537&quot;/&gt;&lt;wsp:rsid wsp:val=&quot;00425A6A&quot;/&gt;&lt;wsp:rsid wsp:val=&quot;00426FBB&quot;/&gt;&lt;wsp:rsid wsp:val=&quot;00454542&quot;/&gt;&lt;wsp:rsid wsp:val=&quot;0047429A&quot;/&gt;&lt;wsp:rsid wsp:val=&quot;0048374C&quot;/&gt;&lt;wsp:rsid wsp:val=&quot;0048771D&quot;/&gt;&lt;wsp:rsid wsp:val=&quot;004A6605&quot;/&gt;&lt;wsp:rsid wsp:val=&quot;004C45FA&quot;/&gt;&lt;wsp:rsid wsp:val=&quot;004D35A3&quot;/&gt;&lt;wsp:rsid wsp:val=&quot;004E1BD8&quot;/&gt;&lt;wsp:rsid wsp:val=&quot;004E452A&quot;/&gt;&lt;wsp:rsid wsp:val=&quot;004E78E3&quot;/&gt;&lt;wsp:rsid wsp:val=&quot;004F2BFE&quot;/&gt;&lt;wsp:rsid wsp:val=&quot;004F63D3&quot;/&gt;&lt;wsp:rsid wsp:val=&quot;004F7DCF&quot;/&gt;&lt;wsp:rsid wsp:val=&quot;005004BF&quot;/&gt;&lt;wsp:rsid wsp:val=&quot;00502E89&quot;/&gt;&lt;wsp:rsid wsp:val=&quot;00506CFE&quot;/&gt;&lt;wsp:rsid wsp:val=&quot;00510E95&quot;/&gt;&lt;wsp:rsid wsp:val=&quot;005225C3&quot;/&gt;&lt;wsp:rsid wsp:val=&quot;00527D56&quot;/&gt;&lt;wsp:rsid wsp:val=&quot;0053221F&quot;/&gt;&lt;wsp:rsid wsp:val=&quot;00536FAE&quot;/&gt;&lt;wsp:rsid wsp:val=&quot;00542C85&quot;/&gt;&lt;wsp:rsid wsp:val=&quot;00553510&quot;/&gt;&lt;wsp:rsid wsp:val=&quot;00554186&quot;/&gt;&lt;wsp:rsid wsp:val=&quot;00585769&quot;/&gt;&lt;wsp:rsid wsp:val=&quot;00585C61&quot;/&gt;&lt;wsp:rsid wsp:val=&quot;00591130&quot;/&gt;&lt;wsp:rsid wsp:val=&quot;005A3F28&quot;/&gt;&lt;wsp:rsid wsp:val=&quot;005A40BE&quot;/&gt;&lt;wsp:rsid wsp:val=&quot;005B13E2&quot;/&gt;&lt;wsp:rsid wsp:val=&quot;005B47D7&quot;/&gt;&lt;wsp:rsid wsp:val=&quot;005C5526&quot;/&gt;&lt;wsp:rsid wsp:val=&quot;005C62C6&quot;/&gt;&lt;wsp:rsid wsp:val=&quot;005D7B9E&quot;/&gt;&lt;wsp:rsid wsp:val=&quot;005E112E&quot;/&gt;&lt;wsp:rsid wsp:val=&quot;005F0834&quot;/&gt;&lt;wsp:rsid wsp:val=&quot;005F68AB&quot;/&gt;&lt;wsp:rsid wsp:val=&quot;005F6DC3&quot;/&gt;&lt;wsp:rsid wsp:val=&quot;00601A8E&quot;/&gt;&lt;wsp:rsid wsp:val=&quot;0062033E&quot;/&gt;&lt;wsp:rsid wsp:val=&quot;00624482&quot;/&gt;&lt;wsp:rsid wsp:val=&quot;0064799C&quot;/&gt;&lt;wsp:rsid wsp:val=&quot;00654156&quot;/&gt;&lt;wsp:rsid wsp:val=&quot;00656ADC&quot;/&gt;&lt;wsp:rsid wsp:val=&quot;006B47CA&quot;/&gt;&lt;wsp:rsid wsp:val=&quot;006C304C&quot;/&gt;&lt;wsp:rsid wsp:val=&quot;006C4511&quot;/&gt;&lt;wsp:rsid wsp:val=&quot;006C65F5&quot;/&gt;&lt;wsp:rsid wsp:val=&quot;006C7AAA&quot;/&gt;&lt;wsp:rsid wsp:val=&quot;006D1C2A&quot;/&gt;&lt;wsp:rsid wsp:val=&quot;006D264F&quot;/&gt;&lt;wsp:rsid wsp:val=&quot;006D4E89&quot;/&gt;&lt;wsp:rsid wsp:val=&quot;006E2A8D&quot;/&gt;&lt;wsp:rsid wsp:val=&quot;006E7574&quot;/&gt;&lt;wsp:rsid wsp:val=&quot;00703430&quot;/&gt;&lt;wsp:rsid wsp:val=&quot;00703548&quot;/&gt;&lt;wsp:rsid wsp:val=&quot;00704E18&quot;/&gt;&lt;wsp:rsid wsp:val=&quot;007069BE&quot;/&gt;&lt;wsp:rsid wsp:val=&quot;00745C86&quot;/&gt;&lt;wsp:rsid wsp:val=&quot;00764603&quot;/&gt;&lt;wsp:rsid wsp:val=&quot;0076604D&quot;/&gt;&lt;wsp:rsid wsp:val=&quot;00790909&quot;/&gt;&lt;wsp:rsid wsp:val=&quot;007929AF&quot;/&gt;&lt;wsp:rsid wsp:val=&quot;007B1582&quot;/&gt;&lt;wsp:rsid wsp:val=&quot;007B5A07&quot;/&gt;&lt;wsp:rsid wsp:val=&quot;007C065D&quot;/&gt;&lt;wsp:rsid wsp:val=&quot;007D3E71&quot;/&gt;&lt;wsp:rsid wsp:val=&quot;007E5D6A&quot;/&gt;&lt;wsp:rsid wsp:val=&quot;007E645D&quot;/&gt;&lt;wsp:rsid wsp:val=&quot;007F75CA&quot;/&gt;&lt;wsp:rsid wsp:val=&quot;00821E08&quot;/&gt;&lt;wsp:rsid wsp:val=&quot;00834EFD&quot;/&gt;&lt;wsp:rsid wsp:val=&quot;00844B24&quot;/&gt;&lt;wsp:rsid wsp:val=&quot;0084515F&quot;/&gt;&lt;wsp:rsid wsp:val=&quot;0085092D&quot;/&gt;&lt;wsp:rsid wsp:val=&quot;00865414&quot;/&gt;&lt;wsp:rsid wsp:val=&quot;00877D4C&quot;/&gt;&lt;wsp:rsid wsp:val=&quot;008831DC&quot;/&gt;&lt;wsp:rsid wsp:val=&quot;00883903&quot;/&gt;&lt;wsp:rsid wsp:val=&quot;00891C30&quot;/&gt;&lt;wsp:rsid wsp:val=&quot;00897219&quot;/&gt;&lt;wsp:rsid wsp:val=&quot;0089763B&quot;/&gt;&lt;wsp:rsid wsp:val=&quot;008B6AE3&quot;/&gt;&lt;wsp:rsid wsp:val=&quot;008C1332&quot;/&gt;&lt;wsp:rsid wsp:val=&quot;008D1045&quot;/&gt;&lt;wsp:rsid wsp:val=&quot;008E5996&quot;/&gt;&lt;wsp:rsid wsp:val=&quot;00901AE1&quot;/&gt;&lt;wsp:rsid wsp:val=&quot;00912F93&quot;/&gt;&lt;wsp:rsid wsp:val=&quot;009205B4&quot;/&gt;&lt;wsp:rsid wsp:val=&quot;00955B59&quot;/&gt;&lt;wsp:rsid wsp:val=&quot;00992262&quot;/&gt;&lt;wsp:rsid wsp:val=&quot;009926BC&quot;/&gt;&lt;wsp:rsid wsp:val=&quot;009A4319&quot;/&gt;&lt;wsp:rsid wsp:val=&quot;009A6C3F&quot;/&gt;&lt;wsp:rsid wsp:val=&quot;009B73F2&quot;/&gt;&lt;wsp:rsid wsp:val=&quot;009C12BD&quot;/&gt;&lt;wsp:rsid wsp:val=&quot;009C50FE&quot;/&gt;&lt;wsp:rsid wsp:val=&quot;009E49DD&quot;/&gt;&lt;wsp:rsid wsp:val=&quot;00A03E75&quot;/&gt;&lt;wsp:rsid wsp:val=&quot;00A20627&quot;/&gt;&lt;wsp:rsid wsp:val=&quot;00A22FE9&quot;/&gt;&lt;wsp:rsid wsp:val=&quot;00A31A44&quot;/&gt;&lt;wsp:rsid wsp:val=&quot;00A32BFA&quot;/&gt;&lt;wsp:rsid wsp:val=&quot;00A3325E&quot;/&gt;&lt;wsp:rsid wsp:val=&quot;00A45FCE&quot;/&gt;&lt;wsp:rsid wsp:val=&quot;00A75671&quot;/&gt;&lt;wsp:rsid wsp:val=&quot;00A773CC&quot;/&gt;&lt;wsp:rsid wsp:val=&quot;00A924D0&quot;/&gt;&lt;wsp:rsid wsp:val=&quot;00A9318B&quot;/&gt;&lt;wsp:rsid wsp:val=&quot;00A94AC1&quot;/&gt;&lt;wsp:rsid wsp:val=&quot;00AB18B7&quot;/&gt;&lt;wsp:rsid wsp:val=&quot;00AD335D&quot;/&gt;&lt;wsp:rsid wsp:val=&quot;00AF114C&quot;/&gt;&lt;wsp:rsid wsp:val=&quot;00AF792B&quot;/&gt;&lt;wsp:rsid wsp:val=&quot;00B32137&quot;/&gt;&lt;wsp:rsid wsp:val=&quot;00B33D2F&quot;/&gt;&lt;wsp:rsid wsp:val=&quot;00B40A5B&quot;/&gt;&lt;wsp:rsid wsp:val=&quot;00B45C6B&quot;/&gt;&lt;wsp:rsid wsp:val=&quot;00B55D5E&quot;/&gt;&lt;wsp:rsid wsp:val=&quot;00B57A80&quot;/&gt;&lt;wsp:rsid wsp:val=&quot;00B70E9C&quot;/&gt;&lt;wsp:rsid wsp:val=&quot;00B713D8&quot;/&gt;&lt;wsp:rsid wsp:val=&quot;00B72979&quot;/&gt;&lt;wsp:rsid wsp:val=&quot;00B94516&quot;/&gt;&lt;wsp:rsid wsp:val=&quot;00BA25E2&quot;/&gt;&lt;wsp:rsid wsp:val=&quot;00BB2855&quot;/&gt;&lt;wsp:rsid wsp:val=&quot;00BC5343&quot;/&gt;&lt;wsp:rsid wsp:val=&quot;00BD19C1&quot;/&gt;&lt;wsp:rsid wsp:val=&quot;00BD25B8&quot;/&gt;&lt;wsp:rsid wsp:val=&quot;00C012E1&quot;/&gt;&lt;wsp:rsid wsp:val=&quot;00C06BB4&quot;/&gt;&lt;wsp:rsid wsp:val=&quot;00C10D20&quot;/&gt;&lt;wsp:rsid wsp:val=&quot;00C12E0C&quot;/&gt;&lt;wsp:rsid wsp:val=&quot;00C21916&quot;/&gt;&lt;wsp:rsid wsp:val=&quot;00C34915&quot;/&gt;&lt;wsp:rsid wsp:val=&quot;00C457CA&quot;/&gt;&lt;wsp:rsid wsp:val=&quot;00C53FB6&quot;/&gt;&lt;wsp:rsid wsp:val=&quot;00C57FB7&quot;/&gt;&lt;wsp:rsid wsp:val=&quot;00C644D4&quot;/&gt;&lt;wsp:rsid wsp:val=&quot;00C65F3F&quot;/&gt;&lt;wsp:rsid wsp:val=&quot;00C72414&quot;/&gt;&lt;wsp:rsid wsp:val=&quot;00C72B1A&quot;/&gt;&lt;wsp:rsid wsp:val=&quot;00C8667B&quot;/&gt;&lt;wsp:rsid wsp:val=&quot;00C90993&quot;/&gt;&lt;wsp:rsid wsp:val=&quot;00CA4CE3&quot;/&gt;&lt;wsp:rsid wsp:val=&quot;00CC72FD&quot;/&gt;&lt;wsp:rsid wsp:val=&quot;00CD1D23&quot;/&gt;&lt;wsp:rsid wsp:val=&quot;00CD4F3F&quot;/&gt;&lt;wsp:rsid wsp:val=&quot;00D311F8&quot;/&gt;&lt;wsp:rsid wsp:val=&quot;00D31660&quot;/&gt;&lt;wsp:rsid wsp:val=&quot;00D36B52&quot;/&gt;&lt;wsp:rsid wsp:val=&quot;00D377C8&quot;/&gt;&lt;wsp:rsid wsp:val=&quot;00D41274&quot;/&gt;&lt;wsp:rsid wsp:val=&quot;00D4229C&quot;/&gt;&lt;wsp:rsid wsp:val=&quot;00D43BF3&quot;/&gt;&lt;wsp:rsid wsp:val=&quot;00D549FB&quot;/&gt;&lt;wsp:rsid wsp:val=&quot;00D56487&quot;/&gt;&lt;wsp:rsid wsp:val=&quot;00D767BB&quot;/&gt;&lt;wsp:rsid wsp:val=&quot;00D939B0&quot;/&gt;&lt;wsp:rsid wsp:val=&quot;00DA31A2&quot;/&gt;&lt;wsp:rsid wsp:val=&quot;00DB16E0&quot;/&gt;&lt;wsp:rsid wsp:val=&quot;00DB2DF9&quot;/&gt;&lt;wsp:rsid wsp:val=&quot;00DB465D&quot;/&gt;&lt;wsp:rsid wsp:val=&quot;00DB48A2&quot;/&gt;&lt;wsp:rsid wsp:val=&quot;00DB7E63&quot;/&gt;&lt;wsp:rsid wsp:val=&quot;00DC2055&quot;/&gt;&lt;wsp:rsid wsp:val=&quot;00DC3908&quot;/&gt;&lt;wsp:rsid wsp:val=&quot;00DD71E8&quot;/&gt;&lt;wsp:rsid wsp:val=&quot;00DD7F83&quot;/&gt;&lt;wsp:rsid wsp:val=&quot;00DE4EB8&quot;/&gt;&lt;wsp:rsid wsp:val=&quot;00E0641E&quot;/&gt;&lt;wsp:rsid wsp:val=&quot;00E06664&quot;/&gt;&lt;wsp:rsid wsp:val=&quot;00E304BC&quot;/&gt;&lt;wsp:rsid wsp:val=&quot;00E32853&quot;/&gt;&lt;wsp:rsid wsp:val=&quot;00E34EBD&quot;/&gt;&lt;wsp:rsid wsp:val=&quot;00E401F8&quot;/&gt;&lt;wsp:rsid wsp:val=&quot;00E46425&quot;/&gt;&lt;wsp:rsid wsp:val=&quot;00E469FC&quot;/&gt;&lt;wsp:rsid wsp:val=&quot;00E47D0E&quot;/&gt;&lt;wsp:rsid wsp:val=&quot;00E65018&quot;/&gt;&lt;wsp:rsid wsp:val=&quot;00E76CA1&quot;/&gt;&lt;wsp:rsid wsp:val=&quot;00E94339&quot;/&gt;&lt;wsp:rsid wsp:val=&quot;00E97563&quot;/&gt;&lt;wsp:rsid wsp:val=&quot;00EB0B63&quot;/&gt;&lt;wsp:rsid wsp:val=&quot;00EC265C&quot;/&gt;&lt;wsp:rsid wsp:val=&quot;00ED61CB&quot;/&gt;&lt;wsp:rsid wsp:val=&quot;00EE752A&quot;/&gt;&lt;wsp:rsid wsp:val=&quot;00F06A72&quot;/&gt;&lt;wsp:rsid wsp:val=&quot;00F136F0&quot;/&gt;&lt;wsp:rsid wsp:val=&quot;00F20BBB&quot;/&gt;&lt;wsp:rsid wsp:val=&quot;00F36048&quot;/&gt;&lt;wsp:rsid wsp:val=&quot;00F43BD8&quot;/&gt;&lt;wsp:rsid wsp:val=&quot;00F562F3&quot;/&gt;&lt;wsp:rsid wsp:val=&quot;00F74B89&quot;/&gt;&lt;wsp:rsid wsp:val=&quot;00F75133&quot;/&gt;&lt;wsp:rsid wsp:val=&quot;00F83272&quot;/&gt;&lt;wsp:rsid wsp:val=&quot;00F9358D&quot;/&gt;&lt;wsp:rsid wsp:val=&quot;00F9369B&quot;/&gt;&lt;wsp:rsid wsp:val=&quot;00FA3899&quot;/&gt;&lt;wsp:rsid wsp:val=&quot;00FA4909&quot;/&gt;&lt;wsp:rsid wsp:val=&quot;00FA5164&quot;/&gt;&lt;wsp:rsid wsp:val=&quot;00FA6751&quot;/&gt;&lt;wsp:rsid wsp:val=&quot;00FA6BD7&quot;/&gt;&lt;wsp:rsid wsp:val=&quot;00FB1048&quot;/&gt;&lt;wsp:rsid wsp:val=&quot;00FB62C4&quot;/&gt;&lt;wsp:rsid wsp:val=&quot;00FB7701&quot;/&gt;&lt;wsp:rsid wsp:val=&quot;00FD1AC5&quot;/&gt;&lt;wsp:rsid wsp:val=&quot;00FD5CF0&quot;/&gt;&lt;/wsp:rsids&gt;&lt;/w:docPr&gt;&lt;w:body&gt;&lt;wx:sect&gt;&lt;w:p wsp:rsidR=&quot;002163A4&quot; wsp:rsidRPr=&quot;002163A4&quot; wsp:rsidRDefault=&quot;002163A4&quot; wsp:rsidP=&quot;002163A4&quot;&gt;&lt;m:oMathPara&gt;&lt;m:oMath&gt;&lt;m:sSub&gt;&lt;m:sSubPr&gt;&lt;m:ctrlPr&gt;&lt;w:rPr&gt;&lt;w:rFonts w:ascii=&quot;Cambria Math&quot; w:h-ansi=&quot;Cambria Math&quot;/&gt;&lt;wx:font wx:val=&quot;Cambria Math&quot;/&gt;&lt;w:i/&gt;&lt;/w:rPr&gt;&lt;/m:ctrlPr&gt;&lt;/m:sSubPr&gt;&lt;m:e&gt;&lt;m:r&gt;&lt;w:rPr&gt;&lt;w:rFonts w:ascii=&quot;Cambria Math&quot; w:h-ansi=&quot;Cambria Math&quot;/&gt;&lt;wx:font wx:val=&quot;Cambria Math&quot;/&gt;&lt;w:i/&gt;&lt;/w:rPr&gt;&lt;m:t&gt;R&lt;/m:t&gt;&lt;/m:r&gt;&lt;/m:e&gt;&lt;m:sub&gt;&lt;m:r&gt;&lt;w:rPr&gt;&lt;w:rFonts w:ascii=&quot;Cambria Math&quot; w:h-ansi=&quot;Cambria Math&quot;/&gt;&lt;wx:font wx:val=&quot;Cambria Math&quot;/&gt;&lt;w:i/&gt;&lt;/w:rPr&gt;&lt;m:t&gt;SC&lt;/m:t&gt;&lt;/m:r&gt;&lt;/m:sub&gt;&lt;/m:sSub&gt;&lt;m:r&gt;&lt;w:rPr&gt;&lt;w:rFonts w:ascii=&quot;Cambria Math&quot; w:h-ansi=&quot;Cambria Math&quot;/&gt;&lt;wx:font wx:val=&quot;Cambria Math&quot;/&gt;&lt;w:i/&gt;&lt;/w:rPr&gt;&lt;m:t&gt;=&lt;/m:t&gt;&lt;/m:r&gt;&lt;m:f&gt;&lt;m:fPr&gt;&lt;m:ctrlPr&gt;&lt;w:rPr&gt;&lt;w:rFonts w:ascii=&quot;Cambria Math&quot; w:h-ansi=&quot;Cambria Math&quot;/&gt;&lt;wx:font wx:val=&quot;Cambria Math&quot;/&gt;&lt;w:i/&gt;&lt;/w:rPr&gt;&lt;/m:ctrlPr&gt;&lt;/m:fPr&gt;&lt;m:num&gt;&lt;m:r&gt;&lt;w:rPr&gt;&lt;w:rFonts w:ascii=&quot;Cambria Math&quot; w:h-ansi=&quot;Cambria Math&quot;/&gt;&lt;wx:font wx:val=&quot;Cambria Math&quot;/&gt;&lt;w:i/&gt;&lt;/w:rPr&gt;&lt;m:t&gt;0.3&lt;/m:t&gt;&lt;/m:r&gt;&lt;/m:num&gt;&lt;m:den&gt;&lt;m:sSub&gt;&lt;m:sSubPr&gt;&lt;m:ctrlPr&gt;&lt;w:rPr&gt;&lt;w:rFonts w:ascii=&quot;Cambria Math&quot; w:h-ansi=&quot;Cambria Math&quot;/&gt;&lt;wx:font wx:val=&quot;Cambria Math&quot;/&gt;&lt;w:i/&gt;&lt;/w:rPr&gt;&lt;/m:ctrlPr&gt;&lt;/m:sSubPr&gt;&lt;m:e&gt;&lt;m:r&gt;&lt;w:rPr&gt;&lt;w:rFonts w:ascii=&quot;Cambria Math&quot; w:h-ansi=&quot;Cambria Math&quot;/&gt;&lt;wx:font wx:val=&quot;Cambria Math&quot;/&gt;&lt;w:i/&gt;&lt;/w:rPr&gt;&lt;m:t&gt;I&lt;/m:t&gt;&lt;/m:r&gt;&lt;/m:e&gt;&lt;m:sub&gt;&lt;m:r&gt;&lt;w:rPr&gt;&lt;w:rFonts w:ascii=&quot;Cambria Math&quot; w:h-ansi=&quot;Cambria Math&quot;/&gt;&lt;wx:font wx:val=&quot;Cambria Math&quot;/&gt;&lt;w:i/&gt;&lt;/w:rPr&gt;&lt;m:t&gt;pk&lt;/m:t&gt;&lt;/m:r&gt;&lt;m:d&gt;&lt;m:dPr&gt;&lt;m:ctrlPr&gt;&lt;w:rPr&gt;&lt;w:rFonts w:ascii=&quot;Cambria Math&quot; w:h-ansi=&quot;Cambria Math&quot;/&gt;&lt;wx:font wx:val=&quot;Cambria Math&quot;/&gt;&lt;w:i/&gt;&lt;/w:rPr&gt;&lt;/m:ctrlPr&gt;&lt;/m:dPr&gt;&lt;m:e&gt;&lt;m:r&gt;&lt;w:rPr&gt;&lt;w:rFonts w:ascii=&quot;Cambria Math&quot; w:h-ansi=&quot;Cambria Math&quot;/&gt;&lt;wx:font wx:val=&quot;Cambria Math&quot;/&gt;&lt;w:i/&gt;&lt;/w:rPr&gt;&lt;m:t&gt;switch&lt;/m:t&gt;&lt;/m:r&gt;&lt;/m:e&gt;&lt;/m:d&gt;&lt;/m:sub&gt;&lt;/m:sSub&gt;&lt;/m:den&gt;&lt;/m:f&gt;&lt;/m:oMath&gt;&lt;/m:oMathPara&gt;&lt;/w:p&gt;&lt;w:sectPr wsp:rsidR=&quot;00000000&quot; wsp:rsidRPr=&quot;002163A4&quot;&gt;&lt;w:pgSz w:w=&quot;12240&quot; w:h=&quot;15840&quot;/&gt;&lt;w:pgMar w:top=&quot;1440&quot; w:right=&quot;1440&quot; w:bottom=&quot;1440&quot; w:left=&quot;1440&quot; w:header=&quot;720&quot; w:footer=&quot;720&quot; w:gutter=&quot;0&quot;/&gt;&lt;w:cols w:space=&quot;720&quot;/&gt;&lt;/w:sectPr&gt;&lt;/wx:sect&gt;&lt;/w:body&gt;&lt;/w:wordDocument&gt;">
+                <v:shape id="_x0000_i1060" type="#_x0000_t75" style="width:69.9pt;height:25.6pt" equationxml="&lt;?xml version=&quot;1.0&quot; encoding=&quot;UTF-8&quot; standalone=&quot;yes&quot;?&gt;&#10;&lt;?mso-application progid=&quot;Word.Document&quot;?&gt;&#10;&lt;w:wordDocument xmlns:aml=&quot;http://schemas.microsoft.com/aml/2001/core&quot; xmlns:wpc=&quot;http://schemas.microsoft.com/office/word/2010/wordprocessingCanvas&quot; xmlns:cx=&quot;http://schemas.microsoft.com/office/drawing/2014/chartex&quot; xmlns:cx1=&quot;http://schemas.microsoft.com/office/drawing/2015/9/8/chartex&quot; xmlns:cx2=&quot;http://schemas.microsoft.com/office/drawing/2015/10/21/chartex&quot; xmlns:cx3=&quot;http://schemas.microsoft.com/office/drawing/2016/5/9/chartex&quot; xmlns:cx4=&quot;http://schemas.microsoft.com/office/drawing/2016/5/10/chartex&quot; xmlns:cx5=&quot;http://schemas.microsoft.com/office/drawing/2016/5/11/chartex&quot; xmlns:cx6=&quot;http://schemas.microsoft.com/office/drawing/2016/5/12/chartex&quot; xmlns:cx7=&quot;http://schemas.microsoft.com/office/drawing/2016/5/13/chartex&quot; xmlns:cx8=&quot;http://schemas.microsoft.com/office/drawing/2016/5/14/chartex&quot; xmlns:cr=&quot;http://schemas.microsoft.com/office/comments/2020/reactions&quot; xmlns:dt=&quot;uuid:C2F41010-65B3-11d1-A29F-00AA00C14882&quot; xmlns:mc=&quot;http://schemas.openxmlformats.org/markup-compatibility/2006&quot; xmlns:aink=&quot;http://schemas.microsoft.com/office/drawing/2016/ink&quot; xmlns:am3d=&quot;http://schemas.microsoft.com/office/drawing/2017/model3d&quot; xmlns:o=&quot;urn:schemas-microsoft-com:office:office&quot; xmlns:oel=&quot;http://schemas.microsoft.com/office/2019/extlst&quot; xmlns:m=&quot;http://schemas.openxmlformats.org/officeDocument/2006/math&quot; xmlns:v=&quot;urn:schemas-microsoft-com:vml&quot; xmlns:w10=&quot;urn:schemas-microsoft-com:office:word&quot; xmlns:w=&quot;http://schemas.microsoft.com/office/word/2003/wordml&quot; xmlns:wx=&quot;http://schemas.microsoft.com/office/word/2003/auxHint&quot; xmlns:wne=&quot;http://schemas.microsoft.com/office/word/2006/wordml&quot; xmlns:wsp=&quot;http://schemas.microsoft.com/office/word/2003/wordml/sp2&quot; xmlns:sl=&quot;http://schemas.microsoft.com/schemaLibrary/2003/core&quot; w:macrosPresent=&quot;no&quot; w:embeddedObjPresent=&quot;no&quot; w:ocxPresent=&quot;no&quot; xml:space=&quot;preserve&quot;&gt;&lt;w:ignoreSubtree w:val=&quot;http://schemas.microsoft.com/office/word/2003/wordml/sp2&quot;/&gt;&lt;o:DocumentProperties&gt;&lt;o:Version&gt;16&lt;/o:Version&gt;&lt;/o:DocumentProperties&gt;&lt;w:docPr&gt;&lt;w:view w:val=&quot;print&quot;/&gt;&lt;w:zoom w:percent=&quot;100&quot;/&gt;&lt;w:doNotEmbedSystemFonts/&gt;&lt;w:activeWritingStyle w:lang=&quot;EN-AU&quot; w:vendorID=&quot;64&quot; w:dllVersion=&quot;6&quot; w:nlCheck=&quot;on&quot; w:optionSet=&quot;1&quot;/&gt;&lt;w:activeWritingStyle w:lang=&quot;EN-GB&quot; w:vendorID=&quot;64&quot; w:dllVersion=&quot;6&quot; w:nlCheck=&quot;on&quot; w:optionSet=&quot;1&quot;/&gt;&lt;w:activeWritingStyle w:lang=&quot;EN-US&quot; w:vendorID=&quot;64&quot; w:dllVersion=&quot;6&quot; w:nlCheck=&quot;on&quot; w:optionSet=&quot;1&quot;/&gt;&lt;w:activeWritingStyle w:lang=&quot;EN-AU&quot; w:vendorID=&quot;64&quot; w:dllVersion=&quot;0&quot; w:nlCheck=&quot;on&quot; w:optionSet=&quot;0&quot;/&gt;&lt;w:activeWritingStyle w:lang=&quot;EN-GB&quot; w:vendorID=&quot;64&quot; w:dllVersion=&quot;0&quot; w:nlCheck=&quot;on&quot; w:optionSet=&quot;0&quot;/&gt;&lt;w:activeWritingStyle w:lang=&quot;EN-US&quot; w:vendorID=&quot;64&quot; w:dllVersion=&quot;0&quot; w:nlCheck=&quot;on&quot; w:optionSet=&quot;0&quot;/&gt;&lt;w:activeWritingStyle w:lang=&quot;ES-AR&quot; w:vendorID=&quot;64&quot; w:dllVersion=&quot;0&quot; w:nlCheck=&quot;on&quot; w:optionSet=&quot;0&quot;/&gt;&lt;w:activeWritingStyle w:lang=&quot;580A&quot; w:vendorID=&quot;64&quot; w:dllVersion=&quot;0&quot; w:nlCheck=&quot;on&quot; w:optionSet=&quot;0&quot;/&gt;&lt;w:activeWritingStyle w:lang=&quot;PT-BR&quot; w:vendorID=&quot;64&quot; w:dllVersion=&quot;0&quot; w:nlCheck=&quot;on&quot; w:optionSet=&quot;0&quot;/&gt;&lt;w:stylePaneFormatFilter w:val=&quot;3F01&quot;/&gt;&lt;w:defaultTabStop w:val=&quot;720&quot;/&gt;&lt;w:hyphenationZone w:val=&quot;425&quot;/&gt;&lt;w:characterSpacingControl w:val=&quot;DontCompress&quot;/&gt;&lt;w:optimizeForBrowser/&gt;&lt;w:validateAgainstSchema/&gt;&lt;w:saveInvalidXML w:val=&quot;off&quot;/&gt;&lt;w:ignoreMixedContent w:val=&quot;off&quot;/&gt;&lt;w:alwaysShowPlaceholderText w:val=&quot;off&quot;/&gt;&lt;w:compat&gt;&lt;w:breakWrappedTables/&gt;&lt;w:snapToGridInCell/&gt;&lt;w:applyBreakingRules/&gt;&lt;w:wrapTextWithPunct/&gt;&lt;w:useAsianBreakRules/&gt;&lt;w:useWord2002TableStyleRules/&gt;&lt;w:useFELayout/&gt;&lt;/w:compat&gt;&lt;wsp:rsids&gt;&lt;wsp:rsidRoot wsp:val=&quot;00426FBB&quot;/&gt;&lt;wsp:rsid wsp:val=&quot;000002E1&quot;/&gt;&lt;wsp:rsid wsp:val=&quot;00003C97&quot;/&gt;&lt;wsp:rsid wsp:val=&quot;00005565&quot;/&gt;&lt;wsp:rsid wsp:val=&quot;0001754A&quot;/&gt;&lt;wsp:rsid wsp:val=&quot;00017719&quot;/&gt;&lt;wsp:rsid wsp:val=&quot;00027F1D&quot;/&gt;&lt;wsp:rsid wsp:val=&quot;0003296C&quot;/&gt;&lt;wsp:rsid wsp:val=&quot;0003351F&quot;/&gt;&lt;wsp:rsid wsp:val=&quot;00044599&quot;/&gt;&lt;wsp:rsid wsp:val=&quot;000540E6&quot;/&gt;&lt;wsp:rsid wsp:val=&quot;00054421&quot;/&gt;&lt;wsp:rsid wsp:val=&quot;00062E46&quot;/&gt;&lt;wsp:rsid wsp:val=&quot;00074AC8&quot;/&gt;&lt;wsp:rsid wsp:val=&quot;00081408&quot;/&gt;&lt;wsp:rsid wsp:val=&quot;00081EBE&quot;/&gt;&lt;wsp:rsid wsp:val=&quot;00086EDC&quot;/&gt;&lt;wsp:rsid wsp:val=&quot;000B1236&quot;/&gt;&lt;wsp:rsid wsp:val=&quot;000B36A3&quot;/&gt;&lt;wsp:rsid wsp:val=&quot;000C013C&quot;/&gt;&lt;wsp:rsid wsp:val=&quot;000E3F84&quot;/&gt;&lt;wsp:rsid wsp:val=&quot;001056DF&quot;/&gt;&lt;wsp:rsid wsp:val=&quot;0010789C&quot;/&gt;&lt;wsp:rsid wsp:val=&quot;00114025&quot;/&gt;&lt;wsp:rsid wsp:val=&quot;001160D2&quot;/&gt;&lt;wsp:rsid wsp:val=&quot;00120636&quot;/&gt;&lt;wsp:rsid wsp:val=&quot;001348A5&quot;/&gt;&lt;wsp:rsid wsp:val=&quot;00151B8E&quot;/&gt;&lt;wsp:rsid wsp:val=&quot;00182170&quot;/&gt;&lt;wsp:rsid wsp:val=&quot;001928FB&quot;/&gt;&lt;wsp:rsid wsp:val=&quot;00192BC7&quot;/&gt;&lt;wsp:rsid wsp:val=&quot;00195BE6&quot;/&gt;&lt;wsp:rsid wsp:val=&quot;001A3C37&quot;/&gt;&lt;wsp:rsid wsp:val=&quot;001A50EA&quot;/&gt;&lt;wsp:rsid wsp:val=&quot;001F16CD&quot;/&gt;&lt;wsp:rsid wsp:val=&quot;001F47D2&quot;/&gt;&lt;wsp:rsid wsp:val=&quot;002029C8&quot;/&gt;&lt;wsp:rsid wsp:val=&quot;002163A4&quot;/&gt;&lt;wsp:rsid wsp:val=&quot;0022285A&quot;/&gt;&lt;wsp:rsid wsp:val=&quot;00224C61&quot;/&gt;&lt;wsp:rsid wsp:val=&quot;00256ABC&quot;/&gt;&lt;wsp:rsid wsp:val=&quot;0027227B&quot;/&gt;&lt;wsp:rsid wsp:val=&quot;00273AC7&quot;/&gt;&lt;wsp:rsid wsp:val=&quot;00273D2C&quot;/&gt;&lt;wsp:rsid wsp:val=&quot;00285ECD&quot;/&gt;&lt;wsp:rsid wsp:val=&quot;00290E1B&quot;/&gt;&lt;wsp:rsid wsp:val=&quot;00291B17&quot;/&gt;&lt;wsp:rsid wsp:val=&quot;00291BB3&quot;/&gt;&lt;wsp:rsid wsp:val=&quot;002A6742&quot;/&gt;&lt;wsp:rsid wsp:val=&quot;002C1A7F&quot;/&gt;&lt;wsp:rsid wsp:val=&quot;002C4239&quot;/&gt;&lt;wsp:rsid wsp:val=&quot;002C559D&quot;/&gt;&lt;wsp:rsid wsp:val=&quot;002D16AE&quot;/&gt;&lt;wsp:rsid wsp:val=&quot;002D2D42&quot;/&gt;&lt;wsp:rsid wsp:val=&quot;002F72D0&quot;/&gt;&lt;wsp:rsid wsp:val=&quot;002F7A4F&quot;/&gt;&lt;wsp:rsid wsp:val=&quot;003003AB&quot;/&gt;&lt;wsp:rsid wsp:val=&quot;00302C35&quot;/&gt;&lt;wsp:rsid wsp:val=&quot;00311C49&quot;/&gt;&lt;wsp:rsid wsp:val=&quot;0032119E&quot;/&gt;&lt;wsp:rsid wsp:val=&quot;00321304&quot;/&gt;&lt;wsp:rsid wsp:val=&quot;00324FC2&quot;/&gt;&lt;wsp:rsid wsp:val=&quot;003312CA&quot;/&gt;&lt;wsp:rsid wsp:val=&quot;00331F84&quot;/&gt;&lt;wsp:rsid wsp:val=&quot;003329D6&quot;/&gt;&lt;wsp:rsid wsp:val=&quot;0037721F&quot;/&gt;&lt;wsp:rsid wsp:val=&quot;003950A4&quot;/&gt;&lt;wsp:rsid wsp:val=&quot;003A1E7E&quot;/&gt;&lt;wsp:rsid wsp:val=&quot;003E2FDC&quot;/&gt;&lt;wsp:rsid wsp:val=&quot;003E3577&quot;/&gt;&lt;wsp:rsid wsp:val=&quot;003F3A61&quot;/&gt;&lt;wsp:rsid wsp:val=&quot;00410A5D&quot;/&gt;&lt;wsp:rsid wsp:val=&quot;00414909&quot;/&gt;&lt;wsp:rsid wsp:val=&quot;00416537&quot;/&gt;&lt;wsp:rsid wsp:val=&quot;00425A6A&quot;/&gt;&lt;wsp:rsid wsp:val=&quot;00426FBB&quot;/&gt;&lt;wsp:rsid wsp:val=&quot;00454542&quot;/&gt;&lt;wsp:rsid wsp:val=&quot;0047429A&quot;/&gt;&lt;wsp:rsid wsp:val=&quot;0048374C&quot;/&gt;&lt;wsp:rsid wsp:val=&quot;0048771D&quot;/&gt;&lt;wsp:rsid wsp:val=&quot;004A6605&quot;/&gt;&lt;wsp:rsid wsp:val=&quot;004C45FA&quot;/&gt;&lt;wsp:rsid wsp:val=&quot;004D35A3&quot;/&gt;&lt;wsp:rsid wsp:val=&quot;004E1BD8&quot;/&gt;&lt;wsp:rsid wsp:val=&quot;004E452A&quot;/&gt;&lt;wsp:rsid wsp:val=&quot;004E78E3&quot;/&gt;&lt;wsp:rsid wsp:val=&quot;004F2BFE&quot;/&gt;&lt;wsp:rsid wsp:val=&quot;004F63D3&quot;/&gt;&lt;wsp:rsid wsp:val=&quot;004F7DCF&quot;/&gt;&lt;wsp:rsid wsp:val=&quot;005004BF&quot;/&gt;&lt;wsp:rsid wsp:val=&quot;00502E89&quot;/&gt;&lt;wsp:rsid wsp:val=&quot;00506CFE&quot;/&gt;&lt;wsp:rsid wsp:val=&quot;00510E95&quot;/&gt;&lt;wsp:rsid wsp:val=&quot;005225C3&quot;/&gt;&lt;wsp:rsid wsp:val=&quot;00527D56&quot;/&gt;&lt;wsp:rsid wsp:val=&quot;0053221F&quot;/&gt;&lt;wsp:rsid wsp:val=&quot;00536FAE&quot;/&gt;&lt;wsp:rsid wsp:val=&quot;00542C85&quot;/&gt;&lt;wsp:rsid wsp:val=&quot;00553510&quot;/&gt;&lt;wsp:rsid wsp:val=&quot;00554186&quot;/&gt;&lt;wsp:rsid wsp:val=&quot;00585769&quot;/&gt;&lt;wsp:rsid wsp:val=&quot;00585C61&quot;/&gt;&lt;wsp:rsid wsp:val=&quot;00591130&quot;/&gt;&lt;wsp:rsid wsp:val=&quot;005A3F28&quot;/&gt;&lt;wsp:rsid wsp:val=&quot;005A40BE&quot;/&gt;&lt;wsp:rsid wsp:val=&quot;005B13E2&quot;/&gt;&lt;wsp:rsid wsp:val=&quot;005B47D7&quot;/&gt;&lt;wsp:rsid wsp:val=&quot;005C5526&quot;/&gt;&lt;wsp:rsid wsp:val=&quot;005C62C6&quot;/&gt;&lt;wsp:rsid wsp:val=&quot;005D7B9E&quot;/&gt;&lt;wsp:rsid wsp:val=&quot;005E112E&quot;/&gt;&lt;wsp:rsid wsp:val=&quot;005F0834&quot;/&gt;&lt;wsp:rsid wsp:val=&quot;005F68AB&quot;/&gt;&lt;wsp:rsid wsp:val=&quot;005F6DC3&quot;/&gt;&lt;wsp:rsid wsp:val=&quot;00601A8E&quot;/&gt;&lt;wsp:rsid wsp:val=&quot;0062033E&quot;/&gt;&lt;wsp:rsid wsp:val=&quot;00624482&quot;/&gt;&lt;wsp:rsid wsp:val=&quot;0064799C&quot;/&gt;&lt;wsp:rsid wsp:val=&quot;00654156&quot;/&gt;&lt;wsp:rsid wsp:val=&quot;00656ADC&quot;/&gt;&lt;wsp:rsid wsp:val=&quot;006B47CA&quot;/&gt;&lt;wsp:rsid wsp:val=&quot;006C304C&quot;/&gt;&lt;wsp:rsid wsp:val=&quot;006C4511&quot;/&gt;&lt;wsp:rsid wsp:val=&quot;006C65F5&quot;/&gt;&lt;wsp:rsid wsp:val=&quot;006C7AAA&quot;/&gt;&lt;wsp:rsid wsp:val=&quot;006D1C2A&quot;/&gt;&lt;wsp:rsid wsp:val=&quot;006D264F&quot;/&gt;&lt;wsp:rsid wsp:val=&quot;006D4E89&quot;/&gt;&lt;wsp:rsid wsp:val=&quot;006E2A8D&quot;/&gt;&lt;wsp:rsid wsp:val=&quot;006E7574&quot;/&gt;&lt;wsp:rsid wsp:val=&quot;00703430&quot;/&gt;&lt;wsp:rsid wsp:val=&quot;00703548&quot;/&gt;&lt;wsp:rsid wsp:val=&quot;00704E18&quot;/&gt;&lt;wsp:rsid wsp:val=&quot;007069BE&quot;/&gt;&lt;wsp:rsid wsp:val=&quot;00745C86&quot;/&gt;&lt;wsp:rsid wsp:val=&quot;00764603&quot;/&gt;&lt;wsp:rsid wsp:val=&quot;0076604D&quot;/&gt;&lt;wsp:rsid wsp:val=&quot;00790909&quot;/&gt;&lt;wsp:rsid wsp:val=&quot;007929AF&quot;/&gt;&lt;wsp:rsid wsp:val=&quot;007B1582&quot;/&gt;&lt;wsp:rsid wsp:val=&quot;007B5A07&quot;/&gt;&lt;wsp:rsid wsp:val=&quot;007C065D&quot;/&gt;&lt;wsp:rsid wsp:val=&quot;007D3E71&quot;/&gt;&lt;wsp:rsid wsp:val=&quot;007E5D6A&quot;/&gt;&lt;wsp:rsid wsp:val=&quot;007E645D&quot;/&gt;&lt;wsp:rsid wsp:val=&quot;007F75CA&quot;/&gt;&lt;wsp:rsid wsp:val=&quot;00821E08&quot;/&gt;&lt;wsp:rsid wsp:val=&quot;00834EFD&quot;/&gt;&lt;wsp:rsid wsp:val=&quot;00844B24&quot;/&gt;&lt;wsp:rsid wsp:val=&quot;0084515F&quot;/&gt;&lt;wsp:rsid wsp:val=&quot;0085092D&quot;/&gt;&lt;wsp:rsid wsp:val=&quot;00865414&quot;/&gt;&lt;wsp:rsid wsp:val=&quot;00877D4C&quot;/&gt;&lt;wsp:rsid wsp:val=&quot;008831DC&quot;/&gt;&lt;wsp:rsid wsp:val=&quot;00883903&quot;/&gt;&lt;wsp:rsid wsp:val=&quot;00891C30&quot;/&gt;&lt;wsp:rsid wsp:val=&quot;00897219&quot;/&gt;&lt;wsp:rsid wsp:val=&quot;0089763B&quot;/&gt;&lt;wsp:rsid wsp:val=&quot;008B6AE3&quot;/&gt;&lt;wsp:rsid wsp:val=&quot;008C1332&quot;/&gt;&lt;wsp:rsid wsp:val=&quot;008D1045&quot;/&gt;&lt;wsp:rsid wsp:val=&quot;008E5996&quot;/&gt;&lt;wsp:rsid wsp:val=&quot;00901AE1&quot;/&gt;&lt;wsp:rsid wsp:val=&quot;00912F93&quot;/&gt;&lt;wsp:rsid wsp:val=&quot;009205B4&quot;/&gt;&lt;wsp:rsid wsp:val=&quot;00955B59&quot;/&gt;&lt;wsp:rsid wsp:val=&quot;00992262&quot;/&gt;&lt;wsp:rsid wsp:val=&quot;009926BC&quot;/&gt;&lt;wsp:rsid wsp:val=&quot;009A4319&quot;/&gt;&lt;wsp:rsid wsp:val=&quot;009A6C3F&quot;/&gt;&lt;wsp:rsid wsp:val=&quot;009B73F2&quot;/&gt;&lt;wsp:rsid wsp:val=&quot;009C12BD&quot;/&gt;&lt;wsp:rsid wsp:val=&quot;009C50FE&quot;/&gt;&lt;wsp:rsid wsp:val=&quot;009E49DD&quot;/&gt;&lt;wsp:rsid wsp:val=&quot;00A03E75&quot;/&gt;&lt;wsp:rsid wsp:val=&quot;00A20627&quot;/&gt;&lt;wsp:rsid wsp:val=&quot;00A22FE9&quot;/&gt;&lt;wsp:rsid wsp:val=&quot;00A31A44&quot;/&gt;&lt;wsp:rsid wsp:val=&quot;00A32BFA&quot;/&gt;&lt;wsp:rsid wsp:val=&quot;00A3325E&quot;/&gt;&lt;wsp:rsid wsp:val=&quot;00A45FCE&quot;/&gt;&lt;wsp:rsid wsp:val=&quot;00A75671&quot;/&gt;&lt;wsp:rsid wsp:val=&quot;00A773CC&quot;/&gt;&lt;wsp:rsid wsp:val=&quot;00A924D0&quot;/&gt;&lt;wsp:rsid wsp:val=&quot;00A9318B&quot;/&gt;&lt;wsp:rsid wsp:val=&quot;00A94AC1&quot;/&gt;&lt;wsp:rsid wsp:val=&quot;00AB18B7&quot;/&gt;&lt;wsp:rsid wsp:val=&quot;00AD335D&quot;/&gt;&lt;wsp:rsid wsp:val=&quot;00AF114C&quot;/&gt;&lt;wsp:rsid wsp:val=&quot;00AF792B&quot;/&gt;&lt;wsp:rsid wsp:val=&quot;00B32137&quot;/&gt;&lt;wsp:rsid wsp:val=&quot;00B33D2F&quot;/&gt;&lt;wsp:rsid wsp:val=&quot;00B40A5B&quot;/&gt;&lt;wsp:rsid wsp:val=&quot;00B45C6B&quot;/&gt;&lt;wsp:rsid wsp:val=&quot;00B55D5E&quot;/&gt;&lt;wsp:rsid wsp:val=&quot;00B57A80&quot;/&gt;&lt;wsp:rsid wsp:val=&quot;00B70E9C&quot;/&gt;&lt;wsp:rsid wsp:val=&quot;00B713D8&quot;/&gt;&lt;wsp:rsid wsp:val=&quot;00B72979&quot;/&gt;&lt;wsp:rsid wsp:val=&quot;00B94516&quot;/&gt;&lt;wsp:rsid wsp:val=&quot;00BA25E2&quot;/&gt;&lt;wsp:rsid wsp:val=&quot;00BB2855&quot;/&gt;&lt;wsp:rsid wsp:val=&quot;00BC5343&quot;/&gt;&lt;wsp:rsid wsp:val=&quot;00BD19C1&quot;/&gt;&lt;wsp:rsid wsp:val=&quot;00BD25B8&quot;/&gt;&lt;wsp:rsid wsp:val=&quot;00C012E1&quot;/&gt;&lt;wsp:rsid wsp:val=&quot;00C06BB4&quot;/&gt;&lt;wsp:rsid wsp:val=&quot;00C10D20&quot;/&gt;&lt;wsp:rsid wsp:val=&quot;00C12E0C&quot;/&gt;&lt;wsp:rsid wsp:val=&quot;00C21916&quot;/&gt;&lt;wsp:rsid wsp:val=&quot;00C34915&quot;/&gt;&lt;wsp:rsid wsp:val=&quot;00C457CA&quot;/&gt;&lt;wsp:rsid wsp:val=&quot;00C53FB6&quot;/&gt;&lt;wsp:rsid wsp:val=&quot;00C57FB7&quot;/&gt;&lt;wsp:rsid wsp:val=&quot;00C644D4&quot;/&gt;&lt;wsp:rsid wsp:val=&quot;00C65F3F&quot;/&gt;&lt;wsp:rsid wsp:val=&quot;00C72414&quot;/&gt;&lt;wsp:rsid wsp:val=&quot;00C72B1A&quot;/&gt;&lt;wsp:rsid wsp:val=&quot;00C8667B&quot;/&gt;&lt;wsp:rsid wsp:val=&quot;00C90993&quot;/&gt;&lt;wsp:rsid wsp:val=&quot;00CA4CE3&quot;/&gt;&lt;wsp:rsid wsp:val=&quot;00CC72FD&quot;/&gt;&lt;wsp:rsid wsp:val=&quot;00CD1D23&quot;/&gt;&lt;wsp:rsid wsp:val=&quot;00CD4F3F&quot;/&gt;&lt;wsp:rsid wsp:val=&quot;00D311F8&quot;/&gt;&lt;wsp:rsid wsp:val=&quot;00D31660&quot;/&gt;&lt;wsp:rsid wsp:val=&quot;00D36B52&quot;/&gt;&lt;wsp:rsid wsp:val=&quot;00D377C8&quot;/&gt;&lt;wsp:rsid wsp:val=&quot;00D41274&quot;/&gt;&lt;wsp:rsid wsp:val=&quot;00D4229C&quot;/&gt;&lt;wsp:rsid wsp:val=&quot;00D43BF3&quot;/&gt;&lt;wsp:rsid wsp:val=&quot;00D549FB&quot;/&gt;&lt;wsp:rsid wsp:val=&quot;00D56487&quot;/&gt;&lt;wsp:rsid wsp:val=&quot;00D767BB&quot;/&gt;&lt;wsp:rsid wsp:val=&quot;00D939B0&quot;/&gt;&lt;wsp:rsid wsp:val=&quot;00DA31A2&quot;/&gt;&lt;wsp:rsid wsp:val=&quot;00DB16E0&quot;/&gt;&lt;wsp:rsid wsp:val=&quot;00DB2DF9&quot;/&gt;&lt;wsp:rsid wsp:val=&quot;00DB465D&quot;/&gt;&lt;wsp:rsid wsp:val=&quot;00DB48A2&quot;/&gt;&lt;wsp:rsid wsp:val=&quot;00DB7E63&quot;/&gt;&lt;wsp:rsid wsp:val=&quot;00DC2055&quot;/&gt;&lt;wsp:rsid wsp:val=&quot;00DC3908&quot;/&gt;&lt;wsp:rsid wsp:val=&quot;00DD71E8&quot;/&gt;&lt;wsp:rsid wsp:val=&quot;00DD7F83&quot;/&gt;&lt;wsp:rsid wsp:val=&quot;00DE4EB8&quot;/&gt;&lt;wsp:rsid wsp:val=&quot;00E0641E&quot;/&gt;&lt;wsp:rsid wsp:val=&quot;00E06664&quot;/&gt;&lt;wsp:rsid wsp:val=&quot;00E304BC&quot;/&gt;&lt;wsp:rsid wsp:val=&quot;00E32853&quot;/&gt;&lt;wsp:rsid wsp:val=&quot;00E34EBD&quot;/&gt;&lt;wsp:rsid wsp:val=&quot;00E401F8&quot;/&gt;&lt;wsp:rsid wsp:val=&quot;00E46425&quot;/&gt;&lt;wsp:rsid wsp:val=&quot;00E469FC&quot;/&gt;&lt;wsp:rsid wsp:val=&quot;00E47D0E&quot;/&gt;&lt;wsp:rsid wsp:val=&quot;00E65018&quot;/&gt;&lt;wsp:rsid wsp:val=&quot;00E76CA1&quot;/&gt;&lt;wsp:rsid wsp:val=&quot;00E94339&quot;/&gt;&lt;wsp:rsid wsp:val=&quot;00E97563&quot;/&gt;&lt;wsp:rsid wsp:val=&quot;00EB0B63&quot;/&gt;&lt;wsp:rsid wsp:val=&quot;00EC265C&quot;/&gt;&lt;wsp:rsid wsp:val=&quot;00ED61CB&quot;/&gt;&lt;wsp:rsid wsp:val=&quot;00EE752A&quot;/&gt;&lt;wsp:rsid wsp:val=&quot;00F06A72&quot;/&gt;&lt;wsp:rsid wsp:val=&quot;00F136F0&quot;/&gt;&lt;wsp:rsid wsp:val=&quot;00F20BBB&quot;/&gt;&lt;wsp:rsid wsp:val=&quot;00F36048&quot;/&gt;&lt;wsp:rsid wsp:val=&quot;00F43BD8&quot;/&gt;&lt;wsp:rsid wsp:val=&quot;00F562F3&quot;/&gt;&lt;wsp:rsid wsp:val=&quot;00F74B89&quot;/&gt;&lt;wsp:rsid wsp:val=&quot;00F75133&quot;/&gt;&lt;wsp:rsid wsp:val=&quot;00F83272&quot;/&gt;&lt;wsp:rsid wsp:val=&quot;00F9358D&quot;/&gt;&lt;wsp:rsid wsp:val=&quot;00F9369B&quot;/&gt;&lt;wsp:rsid wsp:val=&quot;00FA3899&quot;/&gt;&lt;wsp:rsid wsp:val=&quot;00FA4909&quot;/&gt;&lt;wsp:rsid wsp:val=&quot;00FA5164&quot;/&gt;&lt;wsp:rsid wsp:val=&quot;00FA6751&quot;/&gt;&lt;wsp:rsid wsp:val=&quot;00FA6BD7&quot;/&gt;&lt;wsp:rsid wsp:val=&quot;00FB1048&quot;/&gt;&lt;wsp:rsid wsp:val=&quot;00FB62C4&quot;/&gt;&lt;wsp:rsid wsp:val=&quot;00FB7701&quot;/&gt;&lt;wsp:rsid wsp:val=&quot;00FD1AC5&quot;/&gt;&lt;wsp:rsid wsp:val=&quot;00FD5CF0&quot;/&gt;&lt;/wsp:rsids&gt;&lt;/w:docPr&gt;&lt;w:body&gt;&lt;wx:sect&gt;&lt;w:p wsp:rsidR=&quot;002163A4&quot; wsp:rsidRPr=&quot;002163A4&quot; wsp:rsidRDefault=&quot;002163A4&quot; wsp:rsidP=&quot;002163A4&quot;&gt;&lt;m:oMathPara&gt;&lt;m:oMath&gt;&lt;m:sSub&gt;&lt;m:sSubPr&gt;&lt;m:ctrlPr&gt;&lt;w:rPr&gt;&lt;w:rFonts w:ascii=&quot;Cambria Math&quot; w:h-ansi=&quot;Cambria Math&quot;/&gt;&lt;wx:font wx:val=&quot;Cambria Math&quot;/&gt;&lt;w:i/&gt;&lt;/w:rPr&gt;&lt;/m:ctrlPr&gt;&lt;/m:sSubPr&gt;&lt;m:e&gt;&lt;m:r&gt;&lt;w:rPr&gt;&lt;w:rFonts w:ascii=&quot;Cambria Math&quot; w:h-ansi=&quot;Cambria Math&quot;/&gt;&lt;wx:font wx:val=&quot;Cambria Math&quot;/&gt;&lt;w:i/&gt;&lt;/w:rPr&gt;&lt;m:t&gt;R&lt;/m:t&gt;&lt;/m:r&gt;&lt;/m:e&gt;&lt;m:sub&gt;&lt;m:r&gt;&lt;w:rPr&gt;&lt;w:rFonts w:ascii=&quot;Cambria Math&quot; w:h-ansi=&quot;Cambria Math&quot;/&gt;&lt;wx:font wx:val=&quot;Cambria Math&quot;/&gt;&lt;w:i/&gt;&lt;/w:rPr&gt;&lt;m:t&gt;SC&lt;/m:t&gt;&lt;/m:r&gt;&lt;/m:sub&gt;&lt;/m:sSub&gt;&lt;m:r&gt;&lt;w:rPr&gt;&lt;w:rFonts w:ascii=&quot;Cambria Math&quot; w:h-ansi=&quot;Cambria Math&quot;/&gt;&lt;wx:font wx:val=&quot;Cambria Math&quot;/&gt;&lt;w:i/&gt;&lt;/w:rPr&gt;&lt;m:t&gt;=&lt;/m:t&gt;&lt;/m:r&gt;&lt;m:f&gt;&lt;m:fPr&gt;&lt;m:ctrlPr&gt;&lt;w:rPr&gt;&lt;w:rFonts w:ascii=&quot;Cambria Math&quot; w:h-ansi=&quot;Cambria Math&quot;/&gt;&lt;wx:font wx:val=&quot;Cambria Math&quot;/&gt;&lt;w:i/&gt;&lt;/w:rPr&gt;&lt;/m:ctrlPr&gt;&lt;/m:fPr&gt;&lt;m:num&gt;&lt;m:r&gt;&lt;w:rPr&gt;&lt;w:rFonts w:ascii=&quot;Cambria Math&quot; w:h-ansi=&quot;Cambria Math&quot;/&gt;&lt;wx:font wx:val=&quot;Cambria Math&quot;/&gt;&lt;w:i/&gt;&lt;/w:rPr&gt;&lt;m:t&gt;0.3&lt;/m:t&gt;&lt;/m:r&gt;&lt;/m:num&gt;&lt;m:den&gt;&lt;m:sSub&gt;&lt;m:sSubPr&gt;&lt;m:ctrlPr&gt;&lt;w:rPr&gt;&lt;w:rFonts w:ascii=&quot;Cambria Math&quot; w:h-ansi=&quot;Cambria Math&quot;/&gt;&lt;wx:font wx:val=&quot;Cambria Math&quot;/&gt;&lt;w:i/&gt;&lt;/w:rPr&gt;&lt;/m:ctrlPr&gt;&lt;/m:sSubPr&gt;&lt;m:e&gt;&lt;m:r&gt;&lt;w:rPr&gt;&lt;w:rFonts w:ascii=&quot;Cambria Math&quot; w:h-ansi=&quot;Cambria Math&quot;/&gt;&lt;wx:font wx:val=&quot;Cambria Math&quot;/&gt;&lt;w:i/&gt;&lt;/w:rPr&gt;&lt;m:t&gt;I&lt;/m:t&gt;&lt;/m:r&gt;&lt;/m:e&gt;&lt;m:sub&gt;&lt;m:r&gt;&lt;w:rPr&gt;&lt;w:rFonts w:ascii=&quot;Cambria Math&quot; w:h-ansi=&quot;Cambria Math&quot;/&gt;&lt;wx:font wx:val=&quot;Cambria Math&quot;/&gt;&lt;w:i/&gt;&lt;/w:rPr&gt;&lt;m:t&gt;pk&lt;/m:t&gt;&lt;/m:r&gt;&lt;m:d&gt;&lt;m:dPr&gt;&lt;m:ctrlPr&gt;&lt;w:rPr&gt;&lt;w:rFonts w:ascii=&quot;Cambria Math&quot; w:h-ansi=&quot;Cambria Math&quot;/&gt;&lt;wx:font wx:val=&quot;Cambria Math&quot;/&gt;&lt;w:i/&gt;&lt;/w:rPr&gt;&lt;/m:ctrlPr&gt;&lt;/m:dPr&gt;&lt;m:e&gt;&lt;m:r&gt;&lt;w:rPr&gt;&lt;w:rFonts w:ascii=&quot;Cambria Math&quot; w:h-ansi=&quot;Cambria Math&quot;/&gt;&lt;wx:font wx:val=&quot;Cambria Math&quot;/&gt;&lt;w:i/&gt;&lt;/w:rPr&gt;&lt;m:t&gt;switch&lt;/m:t&gt;&lt;/m:r&gt;&lt;/m:e&gt;&lt;/m:d&gt;&lt;/m:sub&gt;&lt;/m:sSub&gt;&lt;/m:den&gt;&lt;/m:f&gt;&lt;/m:oMath&gt;&lt;/m:oMathPara&gt;&lt;/w:p&gt;&lt;w:sectPr wsp:rsidR=&quot;00000000&quot; wsp:rsidRPr=&quot;002163A4&quot;&gt;&lt;w:pgSz w:w=&quot;12240&quot; w:h=&quot;15840&quot;/&gt;&lt;w:pgMar w:top=&quot;1440&quot; w:right=&quot;1440&quot; w:bottom=&quot;1440&quot; w:left=&quot;1440&quot; w:header=&quot;720&quot; w:footer=&quot;720&quot; w:gutter=&quot;0&quot;/&gt;&lt;w:cols w:space=&quot;720&quot;/&gt;&lt;/w:sectPr&gt;&lt;/wx:sect&gt;&lt;/w:body&gt;&lt;/w:wordDocument&gt;">
                   <v:imagedata r:id="rId29" o:title="" chromakey="white"/>
                 </v:shape>
               </w:pict>
@@ -3214,12 +3174,12 @@
       </w:tr>
       <w:tr>
         <w:trPr>
-          <w:trHeight w:val="538"/>
+          <w:trHeight w:val="529"/>
           <w:jc w:val="center"/>
         </w:trPr>
         <w:tc>
           <w:tcPr>
-            <w:tcW w:w="1825" w:type="dxa"/>
+            <w:tcW w:w="1799" w:type="dxa"/>
             <w:shd w:val="clear" w:color="auto" w:fill="D9D9D9"/>
             <w:vAlign w:val="center"/>
           </w:tcPr>
@@ -3241,7 +3201,7 @@
         </w:tc>
         <w:tc>
           <w:tcPr>
-            <w:tcW w:w="3184" w:type="dxa"/>
+            <w:tcW w:w="3140" w:type="dxa"/>
             <w:shd w:val="clear" w:color="auto" w:fill="D9D9D9"/>
             <w:vAlign w:val="center"/>
           </w:tcPr>
@@ -3259,7 +3219,7 @@
                 <w:szCs w:val="16"/>
               </w:rPr>
               <w:pict w14:anchorId="01AE386F">
-                <v:shape id="_x0000_i1788" type="#_x0000_t75" style="width:121.65pt;height:25.1pt" equationxml="&lt;?xml version=&quot;1.0&quot; encoding=&quot;UTF-8&quot; standalone=&quot;yes&quot;?&gt;&#10;&lt;?mso-application progid=&quot;Word.Document&quot;?&gt;&#10;&lt;w:wordDocument xmlns:aml=&quot;http://schemas.microsoft.com/aml/2001/core&quot; xmlns:wpc=&quot;http://schemas.microsoft.com/office/word/2010/wordprocessingCanvas&quot; xmlns:cx=&quot;http://schemas.microsoft.com/office/drawing/2014/chartex&quot; xmlns:cx1=&quot;http://schemas.microsoft.com/office/drawing/2015/9/8/chartex&quot; xmlns:cx2=&quot;http://schemas.microsoft.com/office/drawing/2015/10/21/chartex&quot; xmlns:cx3=&quot;http://schemas.microsoft.com/office/drawing/2016/5/9/chartex&quot; xmlns:cx4=&quot;http://schemas.microsoft.com/office/drawing/2016/5/10/chartex&quot; xmlns:cx5=&quot;http://schemas.microsoft.com/office/drawing/2016/5/11/chartex&quot; xmlns:cx6=&quot;http://schemas.microsoft.com/office/drawing/2016/5/12/chartex&quot; xmlns:cx7=&quot;http://schemas.microsoft.com/office/drawing/2016/5/13/chartex&quot; xmlns:cx8=&quot;http://schemas.microsoft.com/office/drawing/2016/5/14/chartex&quot; xmlns:cr=&quot;http://schemas.microsoft.com/office/comments/2020/reactions&quot; xmlns:dt=&quot;uuid:C2F41010-65B3-11d1-A29F-00AA00C14882&quot; xmlns:mc=&quot;http://schemas.openxmlformats.org/markup-compatibility/2006&quot; xmlns:aink=&quot;http://schemas.microsoft.com/office/drawing/2016/ink&quot; xmlns:am3d=&quot;http://schemas.microsoft.com/office/drawing/2017/model3d&quot; xmlns:o=&quot;urn:schemas-microsoft-com:office:office&quot; xmlns:oel=&quot;http://schemas.microsoft.com/office/2019/extlst&quot; xmlns:m=&quot;http://schemas.openxmlformats.org/officeDocument/2006/math&quot; xmlns:v=&quot;urn:schemas-microsoft-com:vml&quot; xmlns:w10=&quot;urn:schemas-microsoft-com:office:word&quot; xmlns:w=&quot;http://schemas.microsoft.com/office/word/2003/wordml&quot; xmlns:wx=&quot;http://schemas.microsoft.com/office/word/2003/auxHint&quot; xmlns:wne=&quot;http://schemas.microsoft.com/office/word/2006/wordml&quot; xmlns:wsp=&quot;http://schemas.microsoft.com/office/word/2003/wordml/sp2&quot; xmlns:sl=&quot;http://schemas.microsoft.com/schemaLibrary/2003/core&quot; w:macrosPresent=&quot;no&quot; w:embeddedObjPresent=&quot;no&quot; w:ocxPresent=&quot;no&quot; xml:space=&quot;preserve&quot;&gt;&lt;w:ignoreSubtree w:val=&quot;http://schemas.microsoft.com/office/word/2003/wordml/sp2&quot;/&gt;&lt;o:DocumentProperties&gt;&lt;o:Version&gt;16&lt;/o:Version&gt;&lt;/o:DocumentProperties&gt;&lt;w:docPr&gt;&lt;w:view w:val=&quot;print&quot;/&gt;&lt;w:zoom w:percent=&quot;100&quot;/&gt;&lt;w:doNotEmbedSystemFonts/&gt;&lt;w:activeWritingStyle w:lang=&quot;EN-AU&quot; w:vendorID=&quot;64&quot; w:dllVersion=&quot;6&quot; w:nlCheck=&quot;on&quot; w:optionSet=&quot;1&quot;/&gt;&lt;w:activeWritingStyle w:lang=&quot;EN-GB&quot; w:vendorID=&quot;64&quot; w:dllVersion=&quot;6&quot; w:nlCheck=&quot;on&quot; w:optionSet=&quot;1&quot;/&gt;&lt;w:activeWritingStyle w:lang=&quot;EN-US&quot; w:vendorID=&quot;64&quot; w:dllVersion=&quot;6&quot; w:nlCheck=&quot;on&quot; w:optionSet=&quot;1&quot;/&gt;&lt;w:activeWritingStyle w:lang=&quot;EN-AU&quot; w:vendorID=&quot;64&quot; w:dllVersion=&quot;0&quot; w:nlCheck=&quot;on&quot; w:optionSet=&quot;0&quot;/&gt;&lt;w:activeWritingStyle w:lang=&quot;EN-GB&quot; w:vendorID=&quot;64&quot; w:dllVersion=&quot;0&quot; w:nlCheck=&quot;on&quot; w:optionSet=&quot;0&quot;/&gt;&lt;w:activeWritingStyle w:lang=&quot;EN-US&quot; w:vendorID=&quot;64&quot; w:dllVersion=&quot;0&quot; w:nlCheck=&quot;on&quot; w:optionSet=&quot;0&quot;/&gt;&lt;w:activeWritingStyle w:lang=&quot;ES-AR&quot; w:vendorID=&quot;64&quot; w:dllVersion=&quot;0&quot; w:nlCheck=&quot;on&quot; w:optionSet=&quot;0&quot;/&gt;&lt;w:activeWritingStyle w:lang=&quot;580A&quot; w:vendorID=&quot;64&quot; w:dllVersion=&quot;0&quot; w:nlCheck=&quot;on&quot; w:optionSet=&quot;0&quot;/&gt;&lt;w:activeWritingStyle w:lang=&quot;PT-BR&quot; w:vendorID=&quot;64&quot; w:dllVersion=&quot;0&quot; w:nlCheck=&quot;on&quot; w:optionSet=&quot;0&quot;/&gt;&lt;w:stylePaneFormatFilter w:val=&quot;3F01&quot;/&gt;&lt;w:defaultTabStop w:val=&quot;720&quot;/&gt;&lt;w:hyphenationZone w:val=&quot;425&quot;/&gt;&lt;w:characterSpacingControl w:val=&quot;DontCompress&quot;/&gt;&lt;w:optimizeForBrowser/&gt;&lt;w:validateAgainstSchema/&gt;&lt;w:saveInvalidXML w:val=&quot;off&quot;/&gt;&lt;w:ignoreMixedContent w:val=&quot;off&quot;/&gt;&lt;w:alwaysShowPlaceholderText w:val=&quot;off&quot;/&gt;&lt;w:compat&gt;&lt;w:breakWrappedTables/&gt;&lt;w:snapToGridInCell/&gt;&lt;w:applyBreakingRules/&gt;&lt;w:wrapTextWithPunct/&gt;&lt;w:useAsianBreakRules/&gt;&lt;w:useWord2002TableStyleRules/&gt;&lt;w:useFELayout/&gt;&lt;/w:compat&gt;&lt;wsp:rsids&gt;&lt;wsp:rsidRoot wsp:val=&quot;00426FBB&quot;/&gt;&lt;wsp:rsid wsp:val=&quot;000002E1&quot;/&gt;&lt;wsp:rsid wsp:val=&quot;00003C97&quot;/&gt;&lt;wsp:rsid wsp:val=&quot;00005565&quot;/&gt;&lt;wsp:rsid wsp:val=&quot;0001754A&quot;/&gt;&lt;wsp:rsid wsp:val=&quot;00017719&quot;/&gt;&lt;wsp:rsid wsp:val=&quot;00027F1D&quot;/&gt;&lt;wsp:rsid wsp:val=&quot;0003296C&quot;/&gt;&lt;wsp:rsid wsp:val=&quot;0003351F&quot;/&gt;&lt;wsp:rsid wsp:val=&quot;00044599&quot;/&gt;&lt;wsp:rsid wsp:val=&quot;000540E6&quot;/&gt;&lt;wsp:rsid wsp:val=&quot;00054421&quot;/&gt;&lt;wsp:rsid wsp:val=&quot;00062E46&quot;/&gt;&lt;wsp:rsid wsp:val=&quot;00074AC8&quot;/&gt;&lt;wsp:rsid wsp:val=&quot;00081408&quot;/&gt;&lt;wsp:rsid wsp:val=&quot;00081EBE&quot;/&gt;&lt;wsp:rsid wsp:val=&quot;00086EDC&quot;/&gt;&lt;wsp:rsid wsp:val=&quot;000B1236&quot;/&gt;&lt;wsp:rsid wsp:val=&quot;000B36A3&quot;/&gt;&lt;wsp:rsid wsp:val=&quot;000C013C&quot;/&gt;&lt;wsp:rsid wsp:val=&quot;000E3F84&quot;/&gt;&lt;wsp:rsid wsp:val=&quot;001056DF&quot;/&gt;&lt;wsp:rsid wsp:val=&quot;0010789C&quot;/&gt;&lt;wsp:rsid wsp:val=&quot;00114025&quot;/&gt;&lt;wsp:rsid wsp:val=&quot;001160D2&quot;/&gt;&lt;wsp:rsid wsp:val=&quot;00120636&quot;/&gt;&lt;wsp:rsid wsp:val=&quot;001348A5&quot;/&gt;&lt;wsp:rsid wsp:val=&quot;00151B8E&quot;/&gt;&lt;wsp:rsid wsp:val=&quot;00182170&quot;/&gt;&lt;wsp:rsid wsp:val=&quot;001928FB&quot;/&gt;&lt;wsp:rsid wsp:val=&quot;00192BC7&quot;/&gt;&lt;wsp:rsid wsp:val=&quot;00195BE6&quot;/&gt;&lt;wsp:rsid wsp:val=&quot;001A3C37&quot;/&gt;&lt;wsp:rsid wsp:val=&quot;001A50EA&quot;/&gt;&lt;wsp:rsid wsp:val=&quot;001F16CD&quot;/&gt;&lt;wsp:rsid wsp:val=&quot;001F47D2&quot;/&gt;&lt;wsp:rsid wsp:val=&quot;002029C8&quot;/&gt;&lt;wsp:rsid wsp:val=&quot;0022285A&quot;/&gt;&lt;wsp:rsid wsp:val=&quot;00224C61&quot;/&gt;&lt;wsp:rsid wsp:val=&quot;00256ABC&quot;/&gt;&lt;wsp:rsid wsp:val=&quot;0027227B&quot;/&gt;&lt;wsp:rsid wsp:val=&quot;00273AC7&quot;/&gt;&lt;wsp:rsid wsp:val=&quot;00273D2C&quot;/&gt;&lt;wsp:rsid wsp:val=&quot;00285ECD&quot;/&gt;&lt;wsp:rsid wsp:val=&quot;00290E1B&quot;/&gt;&lt;wsp:rsid wsp:val=&quot;00291B17&quot;/&gt;&lt;wsp:rsid wsp:val=&quot;00291BB3&quot;/&gt;&lt;wsp:rsid wsp:val=&quot;002A6742&quot;/&gt;&lt;wsp:rsid wsp:val=&quot;002C1A7F&quot;/&gt;&lt;wsp:rsid wsp:val=&quot;002C4239&quot;/&gt;&lt;wsp:rsid wsp:val=&quot;002C559D&quot;/&gt;&lt;wsp:rsid wsp:val=&quot;002D16AE&quot;/&gt;&lt;wsp:rsid wsp:val=&quot;002D2D42&quot;/&gt;&lt;wsp:rsid wsp:val=&quot;002F72D0&quot;/&gt;&lt;wsp:rsid wsp:val=&quot;002F7A4F&quot;/&gt;&lt;wsp:rsid wsp:val=&quot;003003AB&quot;/&gt;&lt;wsp:rsid wsp:val=&quot;00302C35&quot;/&gt;&lt;wsp:rsid wsp:val=&quot;00311C49&quot;/&gt;&lt;wsp:rsid wsp:val=&quot;0032119E&quot;/&gt;&lt;wsp:rsid wsp:val=&quot;00321304&quot;/&gt;&lt;wsp:rsid wsp:val=&quot;00324FC2&quot;/&gt;&lt;wsp:rsid wsp:val=&quot;003312CA&quot;/&gt;&lt;wsp:rsid wsp:val=&quot;00331F84&quot;/&gt;&lt;wsp:rsid wsp:val=&quot;003329D6&quot;/&gt;&lt;wsp:rsid wsp:val=&quot;0037721F&quot;/&gt;&lt;wsp:rsid wsp:val=&quot;003950A4&quot;/&gt;&lt;wsp:rsid wsp:val=&quot;003A1E7E&quot;/&gt;&lt;wsp:rsid wsp:val=&quot;003E2FDC&quot;/&gt;&lt;wsp:rsid wsp:val=&quot;003E3577&quot;/&gt;&lt;wsp:rsid wsp:val=&quot;003F3A61&quot;/&gt;&lt;wsp:rsid wsp:val=&quot;00410A5D&quot;/&gt;&lt;wsp:rsid wsp:val=&quot;00414909&quot;/&gt;&lt;wsp:rsid wsp:val=&quot;00416537&quot;/&gt;&lt;wsp:rsid wsp:val=&quot;00425A6A&quot;/&gt;&lt;wsp:rsid wsp:val=&quot;00426FBB&quot;/&gt;&lt;wsp:rsid wsp:val=&quot;00454542&quot;/&gt;&lt;wsp:rsid wsp:val=&quot;0047429A&quot;/&gt;&lt;wsp:rsid wsp:val=&quot;0048374C&quot;/&gt;&lt;wsp:rsid wsp:val=&quot;0048771D&quot;/&gt;&lt;wsp:rsid wsp:val=&quot;004A6605&quot;/&gt;&lt;wsp:rsid wsp:val=&quot;004C45FA&quot;/&gt;&lt;wsp:rsid wsp:val=&quot;004D35A3&quot;/&gt;&lt;wsp:rsid wsp:val=&quot;004E1BD8&quot;/&gt;&lt;wsp:rsid wsp:val=&quot;004E452A&quot;/&gt;&lt;wsp:rsid wsp:val=&quot;004E78E3&quot;/&gt;&lt;wsp:rsid wsp:val=&quot;004F2BFE&quot;/&gt;&lt;wsp:rsid wsp:val=&quot;004F63D3&quot;/&gt;&lt;wsp:rsid wsp:val=&quot;004F7DCF&quot;/&gt;&lt;wsp:rsid wsp:val=&quot;005004BF&quot;/&gt;&lt;wsp:rsid wsp:val=&quot;00502E89&quot;/&gt;&lt;wsp:rsid wsp:val=&quot;00506CFE&quot;/&gt;&lt;wsp:rsid wsp:val=&quot;00510E95&quot;/&gt;&lt;wsp:rsid wsp:val=&quot;005225C3&quot;/&gt;&lt;wsp:rsid wsp:val=&quot;00527D56&quot;/&gt;&lt;wsp:rsid wsp:val=&quot;0053221F&quot;/&gt;&lt;wsp:rsid wsp:val=&quot;00536FAE&quot;/&gt;&lt;wsp:rsid wsp:val=&quot;00542C85&quot;/&gt;&lt;wsp:rsid wsp:val=&quot;00553510&quot;/&gt;&lt;wsp:rsid wsp:val=&quot;00554186&quot;/&gt;&lt;wsp:rsid wsp:val=&quot;00585769&quot;/&gt;&lt;wsp:rsid wsp:val=&quot;00585C61&quot;/&gt;&lt;wsp:rsid wsp:val=&quot;00591130&quot;/&gt;&lt;wsp:rsid wsp:val=&quot;005A3F28&quot;/&gt;&lt;wsp:rsid wsp:val=&quot;005A40BE&quot;/&gt;&lt;wsp:rsid wsp:val=&quot;005B13E2&quot;/&gt;&lt;wsp:rsid wsp:val=&quot;005B47D7&quot;/&gt;&lt;wsp:rsid wsp:val=&quot;005C5526&quot;/&gt;&lt;wsp:rsid wsp:val=&quot;005C62C6&quot;/&gt;&lt;wsp:rsid wsp:val=&quot;005D7B9E&quot;/&gt;&lt;wsp:rsid wsp:val=&quot;005E112E&quot;/&gt;&lt;wsp:rsid wsp:val=&quot;005F0834&quot;/&gt;&lt;wsp:rsid wsp:val=&quot;005F68AB&quot;/&gt;&lt;wsp:rsid wsp:val=&quot;005F6DC3&quot;/&gt;&lt;wsp:rsid wsp:val=&quot;00601A8E&quot;/&gt;&lt;wsp:rsid wsp:val=&quot;0062033E&quot;/&gt;&lt;wsp:rsid wsp:val=&quot;00624482&quot;/&gt;&lt;wsp:rsid wsp:val=&quot;0064799C&quot;/&gt;&lt;wsp:rsid wsp:val=&quot;00654156&quot;/&gt;&lt;wsp:rsid wsp:val=&quot;00656ADC&quot;/&gt;&lt;wsp:rsid wsp:val=&quot;006B47CA&quot;/&gt;&lt;wsp:rsid wsp:val=&quot;006C304C&quot;/&gt;&lt;wsp:rsid wsp:val=&quot;006C4511&quot;/&gt;&lt;wsp:rsid wsp:val=&quot;006C65F5&quot;/&gt;&lt;wsp:rsid wsp:val=&quot;006C7AAA&quot;/&gt;&lt;wsp:rsid wsp:val=&quot;006D1C2A&quot;/&gt;&lt;wsp:rsid wsp:val=&quot;006D264F&quot;/&gt;&lt;wsp:rsid wsp:val=&quot;006D4E89&quot;/&gt;&lt;wsp:rsid wsp:val=&quot;006E2A8D&quot;/&gt;&lt;wsp:rsid wsp:val=&quot;006E7574&quot;/&gt;&lt;wsp:rsid wsp:val=&quot;00703430&quot;/&gt;&lt;wsp:rsid wsp:val=&quot;00703548&quot;/&gt;&lt;wsp:rsid wsp:val=&quot;00704E18&quot;/&gt;&lt;wsp:rsid wsp:val=&quot;007069BE&quot;/&gt;&lt;wsp:rsid wsp:val=&quot;00745C86&quot;/&gt;&lt;wsp:rsid wsp:val=&quot;00764603&quot;/&gt;&lt;wsp:rsid wsp:val=&quot;0076604D&quot;/&gt;&lt;wsp:rsid wsp:val=&quot;00790909&quot;/&gt;&lt;wsp:rsid wsp:val=&quot;007929AF&quot;/&gt;&lt;wsp:rsid wsp:val=&quot;007B1582&quot;/&gt;&lt;wsp:rsid wsp:val=&quot;007B5A07&quot;/&gt;&lt;wsp:rsid wsp:val=&quot;007C065D&quot;/&gt;&lt;wsp:rsid wsp:val=&quot;007D3E71&quot;/&gt;&lt;wsp:rsid wsp:val=&quot;007E5D6A&quot;/&gt;&lt;wsp:rsid wsp:val=&quot;007E645D&quot;/&gt;&lt;wsp:rsid wsp:val=&quot;007F75CA&quot;/&gt;&lt;wsp:rsid wsp:val=&quot;00821E08&quot;/&gt;&lt;wsp:rsid wsp:val=&quot;00834EFD&quot;/&gt;&lt;wsp:rsid wsp:val=&quot;00844B24&quot;/&gt;&lt;wsp:rsid wsp:val=&quot;0084515F&quot;/&gt;&lt;wsp:rsid wsp:val=&quot;0085092D&quot;/&gt;&lt;wsp:rsid wsp:val=&quot;00865414&quot;/&gt;&lt;wsp:rsid wsp:val=&quot;00877D4C&quot;/&gt;&lt;wsp:rsid wsp:val=&quot;008831DC&quot;/&gt;&lt;wsp:rsid wsp:val=&quot;00883903&quot;/&gt;&lt;wsp:rsid wsp:val=&quot;00891C30&quot;/&gt;&lt;wsp:rsid wsp:val=&quot;00897219&quot;/&gt;&lt;wsp:rsid wsp:val=&quot;0089763B&quot;/&gt;&lt;wsp:rsid wsp:val=&quot;008B6AE3&quot;/&gt;&lt;wsp:rsid wsp:val=&quot;008C1332&quot;/&gt;&lt;wsp:rsid wsp:val=&quot;008D1045&quot;/&gt;&lt;wsp:rsid wsp:val=&quot;008E5996&quot;/&gt;&lt;wsp:rsid wsp:val=&quot;00901AE1&quot;/&gt;&lt;wsp:rsid wsp:val=&quot;00912F93&quot;/&gt;&lt;wsp:rsid wsp:val=&quot;009205B4&quot;/&gt;&lt;wsp:rsid wsp:val=&quot;00955B59&quot;/&gt;&lt;wsp:rsid wsp:val=&quot;00992262&quot;/&gt;&lt;wsp:rsid wsp:val=&quot;009926BC&quot;/&gt;&lt;wsp:rsid wsp:val=&quot;009A4319&quot;/&gt;&lt;wsp:rsid wsp:val=&quot;009A6C3F&quot;/&gt;&lt;wsp:rsid wsp:val=&quot;009B73F2&quot;/&gt;&lt;wsp:rsid wsp:val=&quot;009C12BD&quot;/&gt;&lt;wsp:rsid wsp:val=&quot;009C50FE&quot;/&gt;&lt;wsp:rsid wsp:val=&quot;009E49DD&quot;/&gt;&lt;wsp:rsid wsp:val=&quot;00A03E75&quot;/&gt;&lt;wsp:rsid wsp:val=&quot;00A20627&quot;/&gt;&lt;wsp:rsid wsp:val=&quot;00A22FE9&quot;/&gt;&lt;wsp:rsid wsp:val=&quot;00A31A44&quot;/&gt;&lt;wsp:rsid wsp:val=&quot;00A32BFA&quot;/&gt;&lt;wsp:rsid wsp:val=&quot;00A3325E&quot;/&gt;&lt;wsp:rsid wsp:val=&quot;00A45FCE&quot;/&gt;&lt;wsp:rsid wsp:val=&quot;00A75671&quot;/&gt;&lt;wsp:rsid wsp:val=&quot;00A773CC&quot;/&gt;&lt;wsp:rsid wsp:val=&quot;00A924D0&quot;/&gt;&lt;wsp:rsid wsp:val=&quot;00A9318B&quot;/&gt;&lt;wsp:rsid wsp:val=&quot;00A94AC1&quot;/&gt;&lt;wsp:rsid wsp:val=&quot;00AB18B7&quot;/&gt;&lt;wsp:rsid wsp:val=&quot;00AD335D&quot;/&gt;&lt;wsp:rsid wsp:val=&quot;00AF114C&quot;/&gt;&lt;wsp:rsid wsp:val=&quot;00AF792B&quot;/&gt;&lt;wsp:rsid wsp:val=&quot;00B32137&quot;/&gt;&lt;wsp:rsid wsp:val=&quot;00B33D2F&quot;/&gt;&lt;wsp:rsid wsp:val=&quot;00B40A5B&quot;/&gt;&lt;wsp:rsid wsp:val=&quot;00B45C6B&quot;/&gt;&lt;wsp:rsid wsp:val=&quot;00B55D5E&quot;/&gt;&lt;wsp:rsid wsp:val=&quot;00B57A80&quot;/&gt;&lt;wsp:rsid wsp:val=&quot;00B70E9C&quot;/&gt;&lt;wsp:rsid wsp:val=&quot;00B713D8&quot;/&gt;&lt;wsp:rsid wsp:val=&quot;00B72979&quot;/&gt;&lt;wsp:rsid wsp:val=&quot;00B90FE3&quot;/&gt;&lt;wsp:rsid wsp:val=&quot;00B94516&quot;/&gt;&lt;wsp:rsid wsp:val=&quot;00BA25E2&quot;/&gt;&lt;wsp:rsid wsp:val=&quot;00BB2855&quot;/&gt;&lt;wsp:rsid wsp:val=&quot;00BC5343&quot;/&gt;&lt;wsp:rsid wsp:val=&quot;00BD19C1&quot;/&gt;&lt;wsp:rsid wsp:val=&quot;00BD25B8&quot;/&gt;&lt;wsp:rsid wsp:val=&quot;00C012E1&quot;/&gt;&lt;wsp:rsid wsp:val=&quot;00C06BB4&quot;/&gt;&lt;wsp:rsid wsp:val=&quot;00C10D20&quot;/&gt;&lt;wsp:rsid wsp:val=&quot;00C12E0C&quot;/&gt;&lt;wsp:rsid wsp:val=&quot;00C21916&quot;/&gt;&lt;wsp:rsid wsp:val=&quot;00C34915&quot;/&gt;&lt;wsp:rsid wsp:val=&quot;00C457CA&quot;/&gt;&lt;wsp:rsid wsp:val=&quot;00C53FB6&quot;/&gt;&lt;wsp:rsid wsp:val=&quot;00C57FB7&quot;/&gt;&lt;wsp:rsid wsp:val=&quot;00C644D4&quot;/&gt;&lt;wsp:rsid wsp:val=&quot;00C65F3F&quot;/&gt;&lt;wsp:rsid wsp:val=&quot;00C72414&quot;/&gt;&lt;wsp:rsid wsp:val=&quot;00C72B1A&quot;/&gt;&lt;wsp:rsid wsp:val=&quot;00C8667B&quot;/&gt;&lt;wsp:rsid wsp:val=&quot;00C90993&quot;/&gt;&lt;wsp:rsid wsp:val=&quot;00CA4CE3&quot;/&gt;&lt;wsp:rsid wsp:val=&quot;00CC72FD&quot;/&gt;&lt;wsp:rsid wsp:val=&quot;00CD1D23&quot;/&gt;&lt;wsp:rsid wsp:val=&quot;00CD4F3F&quot;/&gt;&lt;wsp:rsid wsp:val=&quot;00D311F8&quot;/&gt;&lt;wsp:rsid wsp:val=&quot;00D31660&quot;/&gt;&lt;wsp:rsid wsp:val=&quot;00D36B52&quot;/&gt;&lt;wsp:rsid wsp:val=&quot;00D377C8&quot;/&gt;&lt;wsp:rsid wsp:val=&quot;00D41274&quot;/&gt;&lt;wsp:rsid wsp:val=&quot;00D4229C&quot;/&gt;&lt;wsp:rsid wsp:val=&quot;00D43BF3&quot;/&gt;&lt;wsp:rsid wsp:val=&quot;00D549FB&quot;/&gt;&lt;wsp:rsid wsp:val=&quot;00D56487&quot;/&gt;&lt;wsp:rsid wsp:val=&quot;00D767BB&quot;/&gt;&lt;wsp:rsid wsp:val=&quot;00D939B0&quot;/&gt;&lt;wsp:rsid wsp:val=&quot;00DA31A2&quot;/&gt;&lt;wsp:rsid wsp:val=&quot;00DB16E0&quot;/&gt;&lt;wsp:rsid wsp:val=&quot;00DB2DF9&quot;/&gt;&lt;wsp:rsid wsp:val=&quot;00DB465D&quot;/&gt;&lt;wsp:rsid wsp:val=&quot;00DB48A2&quot;/&gt;&lt;wsp:rsid wsp:val=&quot;00DB7E63&quot;/&gt;&lt;wsp:rsid wsp:val=&quot;00DC2055&quot;/&gt;&lt;wsp:rsid wsp:val=&quot;00DC3908&quot;/&gt;&lt;wsp:rsid wsp:val=&quot;00DD71E8&quot;/&gt;&lt;wsp:rsid wsp:val=&quot;00DD7F83&quot;/&gt;&lt;wsp:rsid wsp:val=&quot;00DE4EB8&quot;/&gt;&lt;wsp:rsid wsp:val=&quot;00E0641E&quot;/&gt;&lt;wsp:rsid wsp:val=&quot;00E06664&quot;/&gt;&lt;wsp:rsid wsp:val=&quot;00E304BC&quot;/&gt;&lt;wsp:rsid wsp:val=&quot;00E32853&quot;/&gt;&lt;wsp:rsid wsp:val=&quot;00E34EBD&quot;/&gt;&lt;wsp:rsid wsp:val=&quot;00E401F8&quot;/&gt;&lt;wsp:rsid wsp:val=&quot;00E46425&quot;/&gt;&lt;wsp:rsid wsp:val=&quot;00E469FC&quot;/&gt;&lt;wsp:rsid wsp:val=&quot;00E47D0E&quot;/&gt;&lt;wsp:rsid wsp:val=&quot;00E65018&quot;/&gt;&lt;wsp:rsid wsp:val=&quot;00E76CA1&quot;/&gt;&lt;wsp:rsid wsp:val=&quot;00E94339&quot;/&gt;&lt;wsp:rsid wsp:val=&quot;00E97563&quot;/&gt;&lt;wsp:rsid wsp:val=&quot;00EB0B63&quot;/&gt;&lt;wsp:rsid wsp:val=&quot;00EC265C&quot;/&gt;&lt;wsp:rsid wsp:val=&quot;00ED61CB&quot;/&gt;&lt;wsp:rsid wsp:val=&quot;00EE752A&quot;/&gt;&lt;wsp:rsid wsp:val=&quot;00F06A72&quot;/&gt;&lt;wsp:rsid wsp:val=&quot;00F136F0&quot;/&gt;&lt;wsp:rsid wsp:val=&quot;00F20BBB&quot;/&gt;&lt;wsp:rsid wsp:val=&quot;00F36048&quot;/&gt;&lt;wsp:rsid wsp:val=&quot;00F43BD8&quot;/&gt;&lt;wsp:rsid wsp:val=&quot;00F562F3&quot;/&gt;&lt;wsp:rsid wsp:val=&quot;00F74B89&quot;/&gt;&lt;wsp:rsid wsp:val=&quot;00F75133&quot;/&gt;&lt;wsp:rsid wsp:val=&quot;00F83272&quot;/&gt;&lt;wsp:rsid wsp:val=&quot;00F9358D&quot;/&gt;&lt;wsp:rsid wsp:val=&quot;00F9369B&quot;/&gt;&lt;wsp:rsid wsp:val=&quot;00FA3899&quot;/&gt;&lt;wsp:rsid wsp:val=&quot;00FA4909&quot;/&gt;&lt;wsp:rsid wsp:val=&quot;00FA5164&quot;/&gt;&lt;wsp:rsid wsp:val=&quot;00FA6751&quot;/&gt;&lt;wsp:rsid wsp:val=&quot;00FA6BD7&quot;/&gt;&lt;wsp:rsid wsp:val=&quot;00FB1048&quot;/&gt;&lt;wsp:rsid wsp:val=&quot;00FB62C4&quot;/&gt;&lt;wsp:rsid wsp:val=&quot;00FB7701&quot;/&gt;&lt;wsp:rsid wsp:val=&quot;00FD1AC5&quot;/&gt;&lt;wsp:rsid wsp:val=&quot;00FD5CF0&quot;/&gt;&lt;/wsp:rsids&gt;&lt;/w:docPr&gt;&lt;w:body&gt;&lt;wx:sect&gt;&lt;w:p wsp:rsidR=&quot;00B90FE3&quot; wsp:rsidRPr=&quot;00B90FE3&quot; wsp:rsidRDefault=&quot;00B90FE3&quot; wsp:rsidP=&quot;00B90FE3&quot;&gt;&lt;m:oMathPara&gt;&lt;m:oMath&gt;&lt;m:sSub&gt;&lt;m:sSubPr&gt;&lt;m:ctrlPr&gt;&lt;w:rPr&gt;&lt;w:rFonts w:ascii=&quot;Cambria Math&quot; w:h-ansi=&quot;Cambria Math&quot;/&gt;&lt;wx:font wx:val=&quot;Cambria Math&quot;/&gt;&lt;w:i/&gt;&lt;/w:rPr&gt;&lt;/m:ctrlPr&gt;&lt;/m:sSubPr&gt;&lt;m:e&gt;&lt;m:r&gt;&lt;w:rPr&gt;&lt;w:rFonts w:ascii=&quot;Cambria Math&quot; w:h-ansi=&quot;Cambria Math&quot;/&gt;&lt;wx:font wx:val=&quot;Cambria Math&quot;/&gt;&lt;w:i/&gt;&lt;/w:rPr&gt;&lt;m:t&gt;L&lt;/m:t&gt;&lt;/m:r&gt;&lt;/m:e&gt;&lt;m:sub&gt;&lt;m:r&gt;&lt;w:rPr&gt;&lt;w:rFonts w:ascii=&quot;Cambria Math&quot; w:h-ansi=&quot;Cambria Math&quot;/&gt;&lt;wx:font wx:val=&quot;Cambria Math&quot;/&gt;&lt;w:i/&gt;&lt;/w:rPr&gt;&lt;m:t&gt;mÃ­n&lt;/m:t&gt;&lt;/m:r&gt;&lt;/m:sub&gt;&lt;/m:sSub&gt;&lt;m:r&gt;&lt;w:rPr&gt;&lt;w:rFonts w:ascii=&quot;Cambria Math&quot; w:h-ansi=&quot;Cambria Math&quot;/&gt;&lt;wx:font wx:val=&quot;Cambria Math&quot;/&gt;&lt;w:i/&gt;&lt;/w:rPr&gt;&lt;m:t&gt;=&lt;/m:t&gt;&lt;/m:r&gt;&lt;m:d&gt;&lt;m:dPr&gt;&lt;m:ctrlPr&gt;&lt;w:rPr&gt;&lt;w:rFonts w:ascii=&quot;Cambria Math&quot; w:h-ansi=&quot;Cambria Math&quot;/&gt;&lt;wx:font wx:val=&quot;Cambria Math&quot;/&gt;&lt;w:i/&gt;&lt;/w:rPr&gt;&lt;/m:ctrlPr&gt;&lt;/m:dPr&gt;&lt;m:e&gt;&lt;m:f&gt;&lt;m:fPr&gt;&lt;m:ctrlPr&gt;&lt;w:rPr&gt;&lt;w:rFonts w:ascii=&quot;Cambria Math&quot; w:h-ansi=&quot;Cambria Math&quot;/&gt;&lt;wx:font wx:val=&quot;Cambria Math&quot;/&gt;&lt;w:i/&gt;&lt;/w:rPr&gt;&lt;/m:ctrlPr&gt;&lt;/m:fPr&gt;&lt;m:num&gt;&lt;m:sSub&gt;&lt;m:sSubPr&gt;&lt;m:ctrlPr&gt;&lt;w:rPr&gt;&lt;w:rFonts w:ascii=&quot;Cambria Math&quot; w:h-ansi=&quot;Cambria Math&quot;/&gt;&lt;wx:font wx:val=&quot;Cambria Math&quot;/&gt;&lt;w:i/&gt;&lt;/w:rPr&gt;&lt;/m:ctrlPr&gt;&lt;/m:sSubPr&gt;&lt;m:e&gt;&lt;m:r&gt;&lt;w:rPr&gt;&lt;w:rFonts w:ascii=&quot;Cambria Math&quot; w:h-ansi=&quot;Cambria Math&quot;/&gt;&lt;wx:font wx:val=&quot;Cambria Math&quot;/&gt;&lt;w:i/&gt;&lt;/w:rPr&gt;&lt;m:t&gt;V&lt;/m:t&gt;&lt;/m:r&gt;&lt;/m:e&gt;&lt;m:sub&gt;&lt;m:r&gt;&lt;w:rPr&gt;&lt;w:rFonts w:ascii=&quot;Cambria Math&quot; w:h-ansi=&quot;Cambria Math&quot;/&gt;&lt;wx:font wx:val=&quot;Cambria Math&quot;/&gt;&lt;w:i/&gt;&lt;/w:rPr&gt;&lt;m:t&gt;in&lt;/m:t&gt;&lt;/m:r&gt;&lt;/m:sub&gt;&lt;/m:sSub&gt;&lt;m:r&gt;&lt;w:rPr&gt;&lt;w:rFonts w:ascii=&quot;Cambria Math&quot; w:h-ansi=&quot;Cambria Math&quot;/&gt;&lt;wx:font wx:val=&quot;Cambria Math&quot;/&gt;&lt;w:i/&gt;&lt;/w:rPr&gt;&lt;m:t&gt;-&lt;/m:t&gt;&lt;/m:r&gt;&lt;m:sSub&gt;&lt;m:sSubPr&gt;&lt;m:ctrlPr&gt;&lt;w:rPr&gt;&lt;w:rFonts w:ascii=&quot;Cambria Math&quot; w:h-ansi=&quot;Cambria Math&quot;/&gt;&lt;wx:font wx:val=&quot;Cambria Math&quot;/&gt;&lt;w:i/&gt;&lt;/w:rPr&gt;&lt;/m:ctrlPr&gt;&lt;/m:sSubPr&gt;&lt;m:e&gt;&lt;m:r&gt;&lt;w:rPr&gt;&lt;w:rFonts w:ascii=&quot;Cambria Math&quot; w:h-ansi=&quot;Cambria Math&quot;/&gt;&lt;wx:font wx:val=&quot;Cambria Math&quot;/&gt;&lt;w:i/&gt;&lt;/w:rPr&gt;&lt;m:t&gt;V&lt;/m:t&gt;&lt;/m:r&gt;&lt;/m:e&gt;&lt;m:sub&gt;&lt;m:r&gt;&lt;w:rPr&gt;&lt;w:rFonts w:ascii=&quot;Cambria Math&quot; w:h-ansi=&quot;Cambria Math&quot;/&gt;&lt;wx:font wx:val=&quot;Cambria Math&quot;/&gt;&lt;w:i/&gt;&lt;/w:rPr&gt;&lt;m:t&gt;sat&lt;/m:t&gt;&lt;/m:r&gt;&lt;/m:sub&gt;&lt;/m:sSub&gt;&lt;m:r&gt;&lt;w:rPr&gt;&lt;w:rFonts w:ascii=&quot;Cambria Math&quot; w:h-ansi=&quot;Cambria Math&quot;/&gt;&lt;wx:font wx:val=&quot;Cambria Math&quot;/&gt;&lt;w:i/&gt;&lt;/w:rPr&gt;&lt;m:t&gt;-&lt;/m:t&gt;&lt;/m:r&gt;&lt;m:sSub&gt;&lt;m:sSubPr&gt;&lt;m:ctrlPr&gt;&lt;w:rPr&gt;&lt;w:rFonts w:ascii=&quot;Cambria Math&quot; w:h-ansi=&quot;Cambria Math&quot;/&gt;&lt;wx:font wx:val=&quot;Cambria Math&quot;/&gt;&lt;w:i/&gt;&lt;/w:rPr&gt;&lt;/m:ctrlPr&gt;&lt;/m:sSubPr&gt;&lt;m:e&gt;&lt;m:r&gt;&lt;w:rPr&gt;&lt;w:rFonts w:ascii=&quot;Cambria Math&quot; w:h-ansi=&quot;Cambria Math&quot;/&gt;&lt;wx:font wx:val=&quot;Cambria Math&quot;/&gt;&lt;w:i/&gt;&lt;/w:rPr&gt;&lt;m:t&gt;V&lt;/m:t&gt;&lt;/m:r&gt;&lt;/m:e&gt;&lt;m:sub&gt;&lt;m:r&gt;&lt;w:rPr&gt;&lt;w:rFonts w:ascii=&quot;Cambria Math&quot; w:h-ansi=&quot;Cambria Math&quot;/&gt;&lt;wx:font wx:val=&quot;Cambria Math&quot;/&gt;&lt;w:i/&gt;&lt;/w:rPr&gt;&lt;m:t&gt;out&lt;/m:t&gt;&lt;/m:r&gt;&lt;/m:sub&gt;&lt;/m:sSub&gt;&lt;/m:num&gt;&lt;m:den&gt;&lt;m:sSub&gt;&lt;m:sSubPr&gt;&lt;m:ctrlPr&gt;&lt;w:rPr&gt;&lt;w:rFonts w:ascii=&quot;Cambria Math&quot; w:h-ansi=&quot;Cambria Math&quot;/&gt;&lt;wx:font wx:val=&quot;Cambria Math&quot;/&gt;&lt;w:i/&gt;&lt;/w:rPr&gt;&lt;/m:ctrlPr&gt;&lt;/m:sSubPr&gt;&lt;m:e&gt;&lt;m:r&gt;&lt;w:rPr&gt;&lt;w:rFonts w:ascii=&quot;Cambria Math&quot; w:h-ansi=&quot;Cambria Math&quot;/&gt;&lt;wx:font wx:val=&quot;Cambria Math&quot;/&gt;&lt;w:i/&gt;&lt;/w:rPr&gt;&lt;m:t&gt;I&lt;/m:t&gt;&lt;/m:r&gt;&lt;/m:e&gt;&lt;m:sub&gt;&lt;m:r&gt;&lt;w:rPr&gt;&lt;w:rFonts w:ascii=&quot;Cambria Math&quot; w:h-ansi=&quot;Cambria Math&quot;/&gt;&lt;wx:font wx:val=&quot;Cambria Math&quot;/&gt;&lt;w:i/&gt;&lt;/w:rPr&gt;&lt;m:t&gt;pk&lt;/m:t&gt;&lt;/m:r&gt;&lt;m:d&gt;&lt;m:dPr&gt;&lt;m:ctrlPr&gt;&lt;w:rPr&gt;&lt;w:rFonts w:ascii=&quot;Cambria Math&quot; w:h-ansi=&quot;Cambria Math&quot;/&gt;&lt;wx:font wx:val=&quot;Cambria Math&quot;/&gt;&lt;w:i/&gt;&lt;/w:rPr&gt;&lt;/m:ctrlPr&gt;&lt;/m:dPr&gt;&lt;m:e&gt;&lt;m:r&gt;&lt;w:rPr&gt;&lt;w:rFonts w:ascii=&quot;Cambria Math&quot; w:h-ansi=&quot;Cambria Math&quot;/&gt;&lt;wx:font wx:val=&quot;Cambria Math&quot;/&gt;&lt;w:i/&gt;&lt;/w:rPr&gt;&lt;m:t&gt;switch&lt;/m:t&gt;&lt;/m:r&gt;&lt;/m:e&gt;&lt;/m:d&gt;&lt;/m:sub&gt;&lt;/m:sSub&gt;&lt;/m:den&gt;&lt;/m:f&gt;&lt;/m:e&gt;&lt;/m:d&gt;&lt;m:r&gt;&lt;w:rPr&gt;&lt;w:rFonts w:ascii=&quot;Cambria Math&quot; w:h-ansi=&quot;Cambria Math&quot;/&gt;&lt;wx:font wx:val=&quot;Cambria Math&quot;/&gt;&lt;w:i/&gt;&lt;/w:rPr&gt;&lt;m:t&gt;âˆ™&lt;/m:t&gt;&lt;/m:r&gt;&lt;m:sSub&gt;&lt;m:sSubPr&gt;&lt;m:ctrlPr&gt;&lt;w:rPr&gt;&lt;w:rFonts w:ascii=&quot;Cambria Math&quot; w:h-ansi=&quot;Cambria Math&quot;/&gt;&lt;wx:font wx:val=&quot;Cambria Math&quot;/&gt;&lt;w:i/&gt;&lt;/w:rPr&gt;&lt;/m:ctrlPr&gt;&lt;/m:sSubPr&gt;&lt;m:e&gt;&lt;m:r&gt;&lt;w:rPr&gt;&lt;w:rFonts w:ascii=&quot;Cambria Math&quot; w:h-ansi=&quot;Cambria Math&quot;/&gt;&lt;wx:font wx:val=&quot;Cambria Math&quot;/&gt;&lt;w:i/&gt;&lt;/w:rPr&gt;&lt;m:t&gt;t&lt;/m:t&gt;&lt;/m:r&gt;&lt;/m:e&gt;&lt;m:sub&gt;&lt;m:r&gt;&lt;w:rPr&gt;&lt;w:rFonts w:ascii=&quot;Cambria Math&quot; w:h-ansi=&quot;Cambria Math&quot;/&gt;&lt;wx:font wx:val=&quot;Cambria Math&quot;/&gt;&lt;w:i/&gt;&lt;/w:rPr&gt;&lt;m:t&gt;on&lt;/m:t&gt;&lt;/m:r&gt;&lt;/m:sub&gt;&lt;/m:sSub&gt;&lt;/m:oMath&gt;&lt;/m:oMathPara&gt;&lt;/w:p&gt;&lt;w:sectPr wsp:rsidR=&quot;00000000&quot; wsp:rsidRPr=&quot;00B90FE3&quot;&gt;&lt;w:pgSz w:w=&quot;12240&quot; w:h=&quot;15840&quot;/&gt;&lt;w:pgMar w:top=&quot;1440&quot; w:right=&quot;1440&quot; w:bottom=&quot;1440&quot; w:left=&quot;1440&quot; w:header=&quot;720&quot; w:footer=&quot;720&quot; w:gutter=&quot;0&quot;/&gt;&lt;w:cols w:space=&quot;720&quot;/&gt;&lt;/w:sectPr&gt;&lt;/wx:sect&gt;&lt;/w:body&gt;&lt;/w:wordDocument&gt;">
+                <v:shape id="_x0000_i1061" type="#_x0000_t75" style="width:121.85pt;height:24.9pt" equationxml="&lt;?xml version=&quot;1.0&quot; encoding=&quot;UTF-8&quot; standalone=&quot;yes&quot;?&gt;&#10;&lt;?mso-application progid=&quot;Word.Document&quot;?&gt;&#10;&lt;w:wordDocument xmlns:aml=&quot;http://schemas.microsoft.com/aml/2001/core&quot; xmlns:wpc=&quot;http://schemas.microsoft.com/office/word/2010/wordprocessingCanvas&quot; xmlns:cx=&quot;http://schemas.microsoft.com/office/drawing/2014/chartex&quot; xmlns:cx1=&quot;http://schemas.microsoft.com/office/drawing/2015/9/8/chartex&quot; xmlns:cx2=&quot;http://schemas.microsoft.com/office/drawing/2015/10/21/chartex&quot; xmlns:cx3=&quot;http://schemas.microsoft.com/office/drawing/2016/5/9/chartex&quot; xmlns:cx4=&quot;http://schemas.microsoft.com/office/drawing/2016/5/10/chartex&quot; xmlns:cx5=&quot;http://schemas.microsoft.com/office/drawing/2016/5/11/chartex&quot; xmlns:cx6=&quot;http://schemas.microsoft.com/office/drawing/2016/5/12/chartex&quot; xmlns:cx7=&quot;http://schemas.microsoft.com/office/drawing/2016/5/13/chartex&quot; xmlns:cx8=&quot;http://schemas.microsoft.com/office/drawing/2016/5/14/chartex&quot; xmlns:cr=&quot;http://schemas.microsoft.com/office/comments/2020/reactions&quot; xmlns:dt=&quot;uuid:C2F41010-65B3-11d1-A29F-00AA00C14882&quot; xmlns:mc=&quot;http://schemas.openxmlformats.org/markup-compatibility/2006&quot; xmlns:aink=&quot;http://schemas.microsoft.com/office/drawing/2016/ink&quot; xmlns:am3d=&quot;http://schemas.microsoft.com/office/drawing/2017/model3d&quot; xmlns:o=&quot;urn:schemas-microsoft-com:office:office&quot; xmlns:oel=&quot;http://schemas.microsoft.com/office/2019/extlst&quot; xmlns:m=&quot;http://schemas.openxmlformats.org/officeDocument/2006/math&quot; xmlns:v=&quot;urn:schemas-microsoft-com:vml&quot; xmlns:w10=&quot;urn:schemas-microsoft-com:office:word&quot; xmlns:w=&quot;http://schemas.microsoft.com/office/word/2003/wordml&quot; xmlns:wx=&quot;http://schemas.microsoft.com/office/word/2003/auxHint&quot; xmlns:wne=&quot;http://schemas.microsoft.com/office/word/2006/wordml&quot; xmlns:wsp=&quot;http://schemas.microsoft.com/office/word/2003/wordml/sp2&quot; xmlns:sl=&quot;http://schemas.microsoft.com/schemaLibrary/2003/core&quot; w:macrosPresent=&quot;no&quot; w:embeddedObjPresent=&quot;no&quot; w:ocxPresent=&quot;no&quot; xml:space=&quot;preserve&quot;&gt;&lt;w:ignoreSubtree w:val=&quot;http://schemas.microsoft.com/office/word/2003/wordml/sp2&quot;/&gt;&lt;o:DocumentProperties&gt;&lt;o:Version&gt;16&lt;/o:Version&gt;&lt;/o:DocumentProperties&gt;&lt;w:docPr&gt;&lt;w:view w:val=&quot;print&quot;/&gt;&lt;w:zoom w:percent=&quot;100&quot;/&gt;&lt;w:doNotEmbedSystemFonts/&gt;&lt;w:activeWritingStyle w:lang=&quot;EN-AU&quot; w:vendorID=&quot;64&quot; w:dllVersion=&quot;6&quot; w:nlCheck=&quot;on&quot; w:optionSet=&quot;1&quot;/&gt;&lt;w:activeWritingStyle w:lang=&quot;EN-GB&quot; w:vendorID=&quot;64&quot; w:dllVersion=&quot;6&quot; w:nlCheck=&quot;on&quot; w:optionSet=&quot;1&quot;/&gt;&lt;w:activeWritingStyle w:lang=&quot;EN-US&quot; w:vendorID=&quot;64&quot; w:dllVersion=&quot;6&quot; w:nlCheck=&quot;on&quot; w:optionSet=&quot;1&quot;/&gt;&lt;w:activeWritingStyle w:lang=&quot;EN-AU&quot; w:vendorID=&quot;64&quot; w:dllVersion=&quot;0&quot; w:nlCheck=&quot;on&quot; w:optionSet=&quot;0&quot;/&gt;&lt;w:activeWritingStyle w:lang=&quot;EN-GB&quot; w:vendorID=&quot;64&quot; w:dllVersion=&quot;0&quot; w:nlCheck=&quot;on&quot; w:optionSet=&quot;0&quot;/&gt;&lt;w:activeWritingStyle w:lang=&quot;EN-US&quot; w:vendorID=&quot;64&quot; w:dllVersion=&quot;0&quot; w:nlCheck=&quot;on&quot; w:optionSet=&quot;0&quot;/&gt;&lt;w:activeWritingStyle w:lang=&quot;ES-AR&quot; w:vendorID=&quot;64&quot; w:dllVersion=&quot;0&quot; w:nlCheck=&quot;on&quot; w:optionSet=&quot;0&quot;/&gt;&lt;w:activeWritingStyle w:lang=&quot;580A&quot; w:vendorID=&quot;64&quot; w:dllVersion=&quot;0&quot; w:nlCheck=&quot;on&quot; w:optionSet=&quot;0&quot;/&gt;&lt;w:activeWritingStyle w:lang=&quot;PT-BR&quot; w:vendorID=&quot;64&quot; w:dllVersion=&quot;0&quot; w:nlCheck=&quot;on&quot; w:optionSet=&quot;0&quot;/&gt;&lt;w:stylePaneFormatFilter w:val=&quot;3F01&quot;/&gt;&lt;w:defaultTabStop w:val=&quot;720&quot;/&gt;&lt;w:hyphenationZone w:val=&quot;425&quot;/&gt;&lt;w:characterSpacingControl w:val=&quot;DontCompress&quot;/&gt;&lt;w:optimizeForBrowser/&gt;&lt;w:validateAgainstSchema/&gt;&lt;w:saveInvalidXML w:val=&quot;off&quot;/&gt;&lt;w:ignoreMixedContent w:val=&quot;off&quot;/&gt;&lt;w:alwaysShowPlaceholderText w:val=&quot;off&quot;/&gt;&lt;w:compat&gt;&lt;w:breakWrappedTables/&gt;&lt;w:snapToGridInCell/&gt;&lt;w:applyBreakingRules/&gt;&lt;w:wrapTextWithPunct/&gt;&lt;w:useAsianBreakRules/&gt;&lt;w:useWord2002TableStyleRules/&gt;&lt;w:useFELayout/&gt;&lt;/w:compat&gt;&lt;wsp:rsids&gt;&lt;wsp:rsidRoot wsp:val=&quot;00426FBB&quot;/&gt;&lt;wsp:rsid wsp:val=&quot;000002E1&quot;/&gt;&lt;wsp:rsid wsp:val=&quot;00003C97&quot;/&gt;&lt;wsp:rsid wsp:val=&quot;00005565&quot;/&gt;&lt;wsp:rsid wsp:val=&quot;0001754A&quot;/&gt;&lt;wsp:rsid wsp:val=&quot;00017719&quot;/&gt;&lt;wsp:rsid wsp:val=&quot;00027F1D&quot;/&gt;&lt;wsp:rsid wsp:val=&quot;0003296C&quot;/&gt;&lt;wsp:rsid wsp:val=&quot;0003351F&quot;/&gt;&lt;wsp:rsid wsp:val=&quot;00044599&quot;/&gt;&lt;wsp:rsid wsp:val=&quot;000540E6&quot;/&gt;&lt;wsp:rsid wsp:val=&quot;00054421&quot;/&gt;&lt;wsp:rsid wsp:val=&quot;00062E46&quot;/&gt;&lt;wsp:rsid wsp:val=&quot;00074AC8&quot;/&gt;&lt;wsp:rsid wsp:val=&quot;00081408&quot;/&gt;&lt;wsp:rsid wsp:val=&quot;00081EBE&quot;/&gt;&lt;wsp:rsid wsp:val=&quot;00086EDC&quot;/&gt;&lt;wsp:rsid wsp:val=&quot;000B1236&quot;/&gt;&lt;wsp:rsid wsp:val=&quot;000B36A3&quot;/&gt;&lt;wsp:rsid wsp:val=&quot;000C013C&quot;/&gt;&lt;wsp:rsid wsp:val=&quot;000E3F84&quot;/&gt;&lt;wsp:rsid wsp:val=&quot;001056DF&quot;/&gt;&lt;wsp:rsid wsp:val=&quot;0010789C&quot;/&gt;&lt;wsp:rsid wsp:val=&quot;00114025&quot;/&gt;&lt;wsp:rsid wsp:val=&quot;001160D2&quot;/&gt;&lt;wsp:rsid wsp:val=&quot;00120636&quot;/&gt;&lt;wsp:rsid wsp:val=&quot;001348A5&quot;/&gt;&lt;wsp:rsid wsp:val=&quot;00151B8E&quot;/&gt;&lt;wsp:rsid wsp:val=&quot;00182170&quot;/&gt;&lt;wsp:rsid wsp:val=&quot;001928FB&quot;/&gt;&lt;wsp:rsid wsp:val=&quot;00192BC7&quot;/&gt;&lt;wsp:rsid wsp:val=&quot;00195BE6&quot;/&gt;&lt;wsp:rsid wsp:val=&quot;001A3C37&quot;/&gt;&lt;wsp:rsid wsp:val=&quot;001A50EA&quot;/&gt;&lt;wsp:rsid wsp:val=&quot;001F16CD&quot;/&gt;&lt;wsp:rsid wsp:val=&quot;001F47D2&quot;/&gt;&lt;wsp:rsid wsp:val=&quot;002029C8&quot;/&gt;&lt;wsp:rsid wsp:val=&quot;0022285A&quot;/&gt;&lt;wsp:rsid wsp:val=&quot;00224C61&quot;/&gt;&lt;wsp:rsid wsp:val=&quot;00256ABC&quot;/&gt;&lt;wsp:rsid wsp:val=&quot;0027227B&quot;/&gt;&lt;wsp:rsid wsp:val=&quot;00273AC7&quot;/&gt;&lt;wsp:rsid wsp:val=&quot;00273D2C&quot;/&gt;&lt;wsp:rsid wsp:val=&quot;00285ECD&quot;/&gt;&lt;wsp:rsid wsp:val=&quot;00290E1B&quot;/&gt;&lt;wsp:rsid wsp:val=&quot;00291B17&quot;/&gt;&lt;wsp:rsid wsp:val=&quot;00291BB3&quot;/&gt;&lt;wsp:rsid wsp:val=&quot;002A6742&quot;/&gt;&lt;wsp:rsid wsp:val=&quot;002C1A7F&quot;/&gt;&lt;wsp:rsid wsp:val=&quot;002C4239&quot;/&gt;&lt;wsp:rsid wsp:val=&quot;002C559D&quot;/&gt;&lt;wsp:rsid wsp:val=&quot;002D16AE&quot;/&gt;&lt;wsp:rsid wsp:val=&quot;002D2D42&quot;/&gt;&lt;wsp:rsid wsp:val=&quot;002F72D0&quot;/&gt;&lt;wsp:rsid wsp:val=&quot;002F7A4F&quot;/&gt;&lt;wsp:rsid wsp:val=&quot;003003AB&quot;/&gt;&lt;wsp:rsid wsp:val=&quot;00302C35&quot;/&gt;&lt;wsp:rsid wsp:val=&quot;00311C49&quot;/&gt;&lt;wsp:rsid wsp:val=&quot;0032119E&quot;/&gt;&lt;wsp:rsid wsp:val=&quot;00321304&quot;/&gt;&lt;wsp:rsid wsp:val=&quot;00324FC2&quot;/&gt;&lt;wsp:rsid wsp:val=&quot;003312CA&quot;/&gt;&lt;wsp:rsid wsp:val=&quot;00331F84&quot;/&gt;&lt;wsp:rsid wsp:val=&quot;003329D6&quot;/&gt;&lt;wsp:rsid wsp:val=&quot;0037721F&quot;/&gt;&lt;wsp:rsid wsp:val=&quot;003950A4&quot;/&gt;&lt;wsp:rsid wsp:val=&quot;003A1E7E&quot;/&gt;&lt;wsp:rsid wsp:val=&quot;003E2FDC&quot;/&gt;&lt;wsp:rsid wsp:val=&quot;003E3577&quot;/&gt;&lt;wsp:rsid wsp:val=&quot;003F3A61&quot;/&gt;&lt;wsp:rsid wsp:val=&quot;00410A5D&quot;/&gt;&lt;wsp:rsid wsp:val=&quot;00414909&quot;/&gt;&lt;wsp:rsid wsp:val=&quot;00416537&quot;/&gt;&lt;wsp:rsid wsp:val=&quot;00425A6A&quot;/&gt;&lt;wsp:rsid wsp:val=&quot;00426FBB&quot;/&gt;&lt;wsp:rsid wsp:val=&quot;00454542&quot;/&gt;&lt;wsp:rsid wsp:val=&quot;0047429A&quot;/&gt;&lt;wsp:rsid wsp:val=&quot;0048374C&quot;/&gt;&lt;wsp:rsid wsp:val=&quot;0048771D&quot;/&gt;&lt;wsp:rsid wsp:val=&quot;004A6605&quot;/&gt;&lt;wsp:rsid wsp:val=&quot;004C45FA&quot;/&gt;&lt;wsp:rsid wsp:val=&quot;004D35A3&quot;/&gt;&lt;wsp:rsid wsp:val=&quot;004E1BD8&quot;/&gt;&lt;wsp:rsid wsp:val=&quot;004E452A&quot;/&gt;&lt;wsp:rsid wsp:val=&quot;004E78E3&quot;/&gt;&lt;wsp:rsid wsp:val=&quot;004F2BFE&quot;/&gt;&lt;wsp:rsid wsp:val=&quot;004F63D3&quot;/&gt;&lt;wsp:rsid wsp:val=&quot;004F7DCF&quot;/&gt;&lt;wsp:rsid wsp:val=&quot;005004BF&quot;/&gt;&lt;wsp:rsid wsp:val=&quot;00502E89&quot;/&gt;&lt;wsp:rsid wsp:val=&quot;00506CFE&quot;/&gt;&lt;wsp:rsid wsp:val=&quot;00510E95&quot;/&gt;&lt;wsp:rsid wsp:val=&quot;005225C3&quot;/&gt;&lt;wsp:rsid wsp:val=&quot;00527D56&quot;/&gt;&lt;wsp:rsid wsp:val=&quot;0053221F&quot;/&gt;&lt;wsp:rsid wsp:val=&quot;00536FAE&quot;/&gt;&lt;wsp:rsid wsp:val=&quot;00542C85&quot;/&gt;&lt;wsp:rsid wsp:val=&quot;00553510&quot;/&gt;&lt;wsp:rsid wsp:val=&quot;00554186&quot;/&gt;&lt;wsp:rsid wsp:val=&quot;00585769&quot;/&gt;&lt;wsp:rsid wsp:val=&quot;00585C61&quot;/&gt;&lt;wsp:rsid wsp:val=&quot;00591130&quot;/&gt;&lt;wsp:rsid wsp:val=&quot;005A3F28&quot;/&gt;&lt;wsp:rsid wsp:val=&quot;005A40BE&quot;/&gt;&lt;wsp:rsid wsp:val=&quot;005B13E2&quot;/&gt;&lt;wsp:rsid wsp:val=&quot;005B47D7&quot;/&gt;&lt;wsp:rsid wsp:val=&quot;005C5526&quot;/&gt;&lt;wsp:rsid wsp:val=&quot;005C62C6&quot;/&gt;&lt;wsp:rsid wsp:val=&quot;005D7B9E&quot;/&gt;&lt;wsp:rsid wsp:val=&quot;005E112E&quot;/&gt;&lt;wsp:rsid wsp:val=&quot;005F0834&quot;/&gt;&lt;wsp:rsid wsp:val=&quot;005F68AB&quot;/&gt;&lt;wsp:rsid wsp:val=&quot;005F6DC3&quot;/&gt;&lt;wsp:rsid wsp:val=&quot;00601A8E&quot;/&gt;&lt;wsp:rsid wsp:val=&quot;0062033E&quot;/&gt;&lt;wsp:rsid wsp:val=&quot;00624482&quot;/&gt;&lt;wsp:rsid wsp:val=&quot;0064799C&quot;/&gt;&lt;wsp:rsid wsp:val=&quot;00654156&quot;/&gt;&lt;wsp:rsid wsp:val=&quot;00656ADC&quot;/&gt;&lt;wsp:rsid wsp:val=&quot;006B47CA&quot;/&gt;&lt;wsp:rsid wsp:val=&quot;006C304C&quot;/&gt;&lt;wsp:rsid wsp:val=&quot;006C4511&quot;/&gt;&lt;wsp:rsid wsp:val=&quot;006C65F5&quot;/&gt;&lt;wsp:rsid wsp:val=&quot;006C7AAA&quot;/&gt;&lt;wsp:rsid wsp:val=&quot;006D1C2A&quot;/&gt;&lt;wsp:rsid wsp:val=&quot;006D264F&quot;/&gt;&lt;wsp:rsid wsp:val=&quot;006D4E89&quot;/&gt;&lt;wsp:rsid wsp:val=&quot;006E2A8D&quot;/&gt;&lt;wsp:rsid wsp:val=&quot;006E7574&quot;/&gt;&lt;wsp:rsid wsp:val=&quot;00703430&quot;/&gt;&lt;wsp:rsid wsp:val=&quot;00703548&quot;/&gt;&lt;wsp:rsid wsp:val=&quot;00704E18&quot;/&gt;&lt;wsp:rsid wsp:val=&quot;007069BE&quot;/&gt;&lt;wsp:rsid wsp:val=&quot;00745C86&quot;/&gt;&lt;wsp:rsid wsp:val=&quot;00764603&quot;/&gt;&lt;wsp:rsid wsp:val=&quot;0076604D&quot;/&gt;&lt;wsp:rsid wsp:val=&quot;00790909&quot;/&gt;&lt;wsp:rsid wsp:val=&quot;007929AF&quot;/&gt;&lt;wsp:rsid wsp:val=&quot;007B1582&quot;/&gt;&lt;wsp:rsid wsp:val=&quot;007B5A07&quot;/&gt;&lt;wsp:rsid wsp:val=&quot;007C065D&quot;/&gt;&lt;wsp:rsid wsp:val=&quot;007D3E71&quot;/&gt;&lt;wsp:rsid wsp:val=&quot;007E5D6A&quot;/&gt;&lt;wsp:rsid wsp:val=&quot;007E645D&quot;/&gt;&lt;wsp:rsid wsp:val=&quot;007F75CA&quot;/&gt;&lt;wsp:rsid wsp:val=&quot;00821E08&quot;/&gt;&lt;wsp:rsid wsp:val=&quot;00834EFD&quot;/&gt;&lt;wsp:rsid wsp:val=&quot;00844B24&quot;/&gt;&lt;wsp:rsid wsp:val=&quot;0084515F&quot;/&gt;&lt;wsp:rsid wsp:val=&quot;0085092D&quot;/&gt;&lt;wsp:rsid wsp:val=&quot;00865414&quot;/&gt;&lt;wsp:rsid wsp:val=&quot;00877D4C&quot;/&gt;&lt;wsp:rsid wsp:val=&quot;008831DC&quot;/&gt;&lt;wsp:rsid wsp:val=&quot;00883903&quot;/&gt;&lt;wsp:rsid wsp:val=&quot;00891C30&quot;/&gt;&lt;wsp:rsid wsp:val=&quot;00897219&quot;/&gt;&lt;wsp:rsid wsp:val=&quot;0089763B&quot;/&gt;&lt;wsp:rsid wsp:val=&quot;008B6AE3&quot;/&gt;&lt;wsp:rsid wsp:val=&quot;008C1332&quot;/&gt;&lt;wsp:rsid wsp:val=&quot;008D1045&quot;/&gt;&lt;wsp:rsid wsp:val=&quot;008E5996&quot;/&gt;&lt;wsp:rsid wsp:val=&quot;00901AE1&quot;/&gt;&lt;wsp:rsid wsp:val=&quot;00912F93&quot;/&gt;&lt;wsp:rsid wsp:val=&quot;009205B4&quot;/&gt;&lt;wsp:rsid wsp:val=&quot;00955B59&quot;/&gt;&lt;wsp:rsid wsp:val=&quot;00992262&quot;/&gt;&lt;wsp:rsid wsp:val=&quot;009926BC&quot;/&gt;&lt;wsp:rsid wsp:val=&quot;009A4319&quot;/&gt;&lt;wsp:rsid wsp:val=&quot;009A6C3F&quot;/&gt;&lt;wsp:rsid wsp:val=&quot;009B73F2&quot;/&gt;&lt;wsp:rsid wsp:val=&quot;009C12BD&quot;/&gt;&lt;wsp:rsid wsp:val=&quot;009C50FE&quot;/&gt;&lt;wsp:rsid wsp:val=&quot;009E49DD&quot;/&gt;&lt;wsp:rsid wsp:val=&quot;00A03E75&quot;/&gt;&lt;wsp:rsid wsp:val=&quot;00A20627&quot;/&gt;&lt;wsp:rsid wsp:val=&quot;00A22FE9&quot;/&gt;&lt;wsp:rsid wsp:val=&quot;00A31A44&quot;/&gt;&lt;wsp:rsid wsp:val=&quot;00A32BFA&quot;/&gt;&lt;wsp:rsid wsp:val=&quot;00A3325E&quot;/&gt;&lt;wsp:rsid wsp:val=&quot;00A45FCE&quot;/&gt;&lt;wsp:rsid wsp:val=&quot;00A75671&quot;/&gt;&lt;wsp:rsid wsp:val=&quot;00A773CC&quot;/&gt;&lt;wsp:rsid wsp:val=&quot;00A924D0&quot;/&gt;&lt;wsp:rsid wsp:val=&quot;00A9318B&quot;/&gt;&lt;wsp:rsid wsp:val=&quot;00A94AC1&quot;/&gt;&lt;wsp:rsid wsp:val=&quot;00AB18B7&quot;/&gt;&lt;wsp:rsid wsp:val=&quot;00AD335D&quot;/&gt;&lt;wsp:rsid wsp:val=&quot;00AF114C&quot;/&gt;&lt;wsp:rsid wsp:val=&quot;00AF792B&quot;/&gt;&lt;wsp:rsid wsp:val=&quot;00B32137&quot;/&gt;&lt;wsp:rsid wsp:val=&quot;00B33D2F&quot;/&gt;&lt;wsp:rsid wsp:val=&quot;00B40A5B&quot;/&gt;&lt;wsp:rsid wsp:val=&quot;00B45C6B&quot;/&gt;&lt;wsp:rsid wsp:val=&quot;00B55D5E&quot;/&gt;&lt;wsp:rsid wsp:val=&quot;00B57A80&quot;/&gt;&lt;wsp:rsid wsp:val=&quot;00B70E9C&quot;/&gt;&lt;wsp:rsid wsp:val=&quot;00B713D8&quot;/&gt;&lt;wsp:rsid wsp:val=&quot;00B72979&quot;/&gt;&lt;wsp:rsid wsp:val=&quot;00B90FE3&quot;/&gt;&lt;wsp:rsid wsp:val=&quot;00B94516&quot;/&gt;&lt;wsp:rsid wsp:val=&quot;00BA25E2&quot;/&gt;&lt;wsp:rsid wsp:val=&quot;00BB2855&quot;/&gt;&lt;wsp:rsid wsp:val=&quot;00BC5343&quot;/&gt;&lt;wsp:rsid wsp:val=&quot;00BD19C1&quot;/&gt;&lt;wsp:rsid wsp:val=&quot;00BD25B8&quot;/&gt;&lt;wsp:rsid wsp:val=&quot;00C012E1&quot;/&gt;&lt;wsp:rsid wsp:val=&quot;00C06BB4&quot;/&gt;&lt;wsp:rsid wsp:val=&quot;00C10D20&quot;/&gt;&lt;wsp:rsid wsp:val=&quot;00C12E0C&quot;/&gt;&lt;wsp:rsid wsp:val=&quot;00C21916&quot;/&gt;&lt;wsp:rsid wsp:val=&quot;00C34915&quot;/&gt;&lt;wsp:rsid wsp:val=&quot;00C457CA&quot;/&gt;&lt;wsp:rsid wsp:val=&quot;00C53FB6&quot;/&gt;&lt;wsp:rsid wsp:val=&quot;00C57FB7&quot;/&gt;&lt;wsp:rsid wsp:val=&quot;00C644D4&quot;/&gt;&lt;wsp:rsid wsp:val=&quot;00C65F3F&quot;/&gt;&lt;wsp:rsid wsp:val=&quot;00C72414&quot;/&gt;&lt;wsp:rsid wsp:val=&quot;00C72B1A&quot;/&gt;&lt;wsp:rsid wsp:val=&quot;00C8667B&quot;/&gt;&lt;wsp:rsid wsp:val=&quot;00C90993&quot;/&gt;&lt;wsp:rsid wsp:val=&quot;00CA4CE3&quot;/&gt;&lt;wsp:rsid wsp:val=&quot;00CC72FD&quot;/&gt;&lt;wsp:rsid wsp:val=&quot;00CD1D23&quot;/&gt;&lt;wsp:rsid wsp:val=&quot;00CD4F3F&quot;/&gt;&lt;wsp:rsid wsp:val=&quot;00D311F8&quot;/&gt;&lt;wsp:rsid wsp:val=&quot;00D31660&quot;/&gt;&lt;wsp:rsid wsp:val=&quot;00D36B52&quot;/&gt;&lt;wsp:rsid wsp:val=&quot;00D377C8&quot;/&gt;&lt;wsp:rsid wsp:val=&quot;00D41274&quot;/&gt;&lt;wsp:rsid wsp:val=&quot;00D4229C&quot;/&gt;&lt;wsp:rsid wsp:val=&quot;00D43BF3&quot;/&gt;&lt;wsp:rsid wsp:val=&quot;00D549FB&quot;/&gt;&lt;wsp:rsid wsp:val=&quot;00D56487&quot;/&gt;&lt;wsp:rsid wsp:val=&quot;00D767BB&quot;/&gt;&lt;wsp:rsid wsp:val=&quot;00D939B0&quot;/&gt;&lt;wsp:rsid wsp:val=&quot;00DA31A2&quot;/&gt;&lt;wsp:rsid wsp:val=&quot;00DB16E0&quot;/&gt;&lt;wsp:rsid wsp:val=&quot;00DB2DF9&quot;/&gt;&lt;wsp:rsid wsp:val=&quot;00DB465D&quot;/&gt;&lt;wsp:rsid wsp:val=&quot;00DB48A2&quot;/&gt;&lt;wsp:rsid wsp:val=&quot;00DB7E63&quot;/&gt;&lt;wsp:rsid wsp:val=&quot;00DC2055&quot;/&gt;&lt;wsp:rsid wsp:val=&quot;00DC3908&quot;/&gt;&lt;wsp:rsid wsp:val=&quot;00DD71E8&quot;/&gt;&lt;wsp:rsid wsp:val=&quot;00DD7F83&quot;/&gt;&lt;wsp:rsid wsp:val=&quot;00DE4EB8&quot;/&gt;&lt;wsp:rsid wsp:val=&quot;00E0641E&quot;/&gt;&lt;wsp:rsid wsp:val=&quot;00E06664&quot;/&gt;&lt;wsp:rsid wsp:val=&quot;00E304BC&quot;/&gt;&lt;wsp:rsid wsp:val=&quot;00E32853&quot;/&gt;&lt;wsp:rsid wsp:val=&quot;00E34EBD&quot;/&gt;&lt;wsp:rsid wsp:val=&quot;00E401F8&quot;/&gt;&lt;wsp:rsid wsp:val=&quot;00E46425&quot;/&gt;&lt;wsp:rsid wsp:val=&quot;00E469FC&quot;/&gt;&lt;wsp:rsid wsp:val=&quot;00E47D0E&quot;/&gt;&lt;wsp:rsid wsp:val=&quot;00E65018&quot;/&gt;&lt;wsp:rsid wsp:val=&quot;00E76CA1&quot;/&gt;&lt;wsp:rsid wsp:val=&quot;00E94339&quot;/&gt;&lt;wsp:rsid wsp:val=&quot;00E97563&quot;/&gt;&lt;wsp:rsid wsp:val=&quot;00EB0B63&quot;/&gt;&lt;wsp:rsid wsp:val=&quot;00EC265C&quot;/&gt;&lt;wsp:rsid wsp:val=&quot;00ED61CB&quot;/&gt;&lt;wsp:rsid wsp:val=&quot;00EE752A&quot;/&gt;&lt;wsp:rsid wsp:val=&quot;00F06A72&quot;/&gt;&lt;wsp:rsid wsp:val=&quot;00F136F0&quot;/&gt;&lt;wsp:rsid wsp:val=&quot;00F20BBB&quot;/&gt;&lt;wsp:rsid wsp:val=&quot;00F36048&quot;/&gt;&lt;wsp:rsid wsp:val=&quot;00F43BD8&quot;/&gt;&lt;wsp:rsid wsp:val=&quot;00F562F3&quot;/&gt;&lt;wsp:rsid wsp:val=&quot;00F74B89&quot;/&gt;&lt;wsp:rsid wsp:val=&quot;00F75133&quot;/&gt;&lt;wsp:rsid wsp:val=&quot;00F83272&quot;/&gt;&lt;wsp:rsid wsp:val=&quot;00F9358D&quot;/&gt;&lt;wsp:rsid wsp:val=&quot;00F9369B&quot;/&gt;&lt;wsp:rsid wsp:val=&quot;00FA3899&quot;/&gt;&lt;wsp:rsid wsp:val=&quot;00FA4909&quot;/&gt;&lt;wsp:rsid wsp:val=&quot;00FA5164&quot;/&gt;&lt;wsp:rsid wsp:val=&quot;00FA6751&quot;/&gt;&lt;wsp:rsid wsp:val=&quot;00FA6BD7&quot;/&gt;&lt;wsp:rsid wsp:val=&quot;00FB1048&quot;/&gt;&lt;wsp:rsid wsp:val=&quot;00FB62C4&quot;/&gt;&lt;wsp:rsid wsp:val=&quot;00FB7701&quot;/&gt;&lt;wsp:rsid wsp:val=&quot;00FD1AC5&quot;/&gt;&lt;wsp:rsid wsp:val=&quot;00FD5CF0&quot;/&gt;&lt;/wsp:rsids&gt;&lt;/w:docPr&gt;&lt;w:body&gt;&lt;wx:sect&gt;&lt;w:p wsp:rsidR=&quot;00B90FE3&quot; wsp:rsidRPr=&quot;00B90FE3&quot; wsp:rsidRDefault=&quot;00B90FE3&quot; wsp:rsidP=&quot;00B90FE3&quot;&gt;&lt;m:oMathPara&gt;&lt;m:oMath&gt;&lt;m:sSub&gt;&lt;m:sSubPr&gt;&lt;m:ctrlPr&gt;&lt;w:rPr&gt;&lt;w:rFonts w:ascii=&quot;Cambria Math&quot; w:h-ansi=&quot;Cambria Math&quot;/&gt;&lt;wx:font wx:val=&quot;Cambria Math&quot;/&gt;&lt;w:i/&gt;&lt;/w:rPr&gt;&lt;/m:ctrlPr&gt;&lt;/m:sSubPr&gt;&lt;m:e&gt;&lt;m:r&gt;&lt;w:rPr&gt;&lt;w:rFonts w:ascii=&quot;Cambria Math&quot; w:h-ansi=&quot;Cambria Math&quot;/&gt;&lt;wx:font wx:val=&quot;Cambria Math&quot;/&gt;&lt;w:i/&gt;&lt;/w:rPr&gt;&lt;m:t&gt;L&lt;/m:t&gt;&lt;/m:r&gt;&lt;/m:e&gt;&lt;m:sub&gt;&lt;m:r&gt;&lt;w:rPr&gt;&lt;w:rFonts w:ascii=&quot;Cambria Math&quot; w:h-ansi=&quot;Cambria Math&quot;/&gt;&lt;wx:font wx:val=&quot;Cambria Math&quot;/&gt;&lt;w:i/&gt;&lt;/w:rPr&gt;&lt;m:t&gt;mÃ­n&lt;/m:t&gt;&lt;/m:r&gt;&lt;/m:sub&gt;&lt;/m:sSub&gt;&lt;m:r&gt;&lt;w:rPr&gt;&lt;w:rFonts w:ascii=&quot;Cambria Math&quot; w:h-ansi=&quot;Cambria Math&quot;/&gt;&lt;wx:font wx:val=&quot;Cambria Math&quot;/&gt;&lt;w:i/&gt;&lt;/w:rPr&gt;&lt;m:t&gt;=&lt;/m:t&gt;&lt;/m:r&gt;&lt;m:d&gt;&lt;m:dPr&gt;&lt;m:ctrlPr&gt;&lt;w:rPr&gt;&lt;w:rFonts w:ascii=&quot;Cambria Math&quot; w:h-ansi=&quot;Cambria Math&quot;/&gt;&lt;wx:font wx:val=&quot;Cambria Math&quot;/&gt;&lt;w:i/&gt;&lt;/w:rPr&gt;&lt;/m:ctrlPr&gt;&lt;/m:dPr&gt;&lt;m:e&gt;&lt;m:f&gt;&lt;m:fPr&gt;&lt;m:ctrlPr&gt;&lt;w:rPr&gt;&lt;w:rFonts w:ascii=&quot;Cambria Math&quot; w:h-ansi=&quot;Cambria Math&quot;/&gt;&lt;wx:font wx:val=&quot;Cambria Math&quot;/&gt;&lt;w:i/&gt;&lt;/w:rPr&gt;&lt;/m:ctrlPr&gt;&lt;/m:fPr&gt;&lt;m:num&gt;&lt;m:sSub&gt;&lt;m:sSubPr&gt;&lt;m:ctrlPr&gt;&lt;w:rPr&gt;&lt;w:rFonts w:ascii=&quot;Cambria Math&quot; w:h-ansi=&quot;Cambria Math&quot;/&gt;&lt;wx:font wx:val=&quot;Cambria Math&quot;/&gt;&lt;w:i/&gt;&lt;/w:rPr&gt;&lt;/m:ctrlPr&gt;&lt;/m:sSubPr&gt;&lt;m:e&gt;&lt;m:r&gt;&lt;w:rPr&gt;&lt;w:rFonts w:ascii=&quot;Cambria Math&quot; w:h-ansi=&quot;Cambria Math&quot;/&gt;&lt;wx:font wx:val=&quot;Cambria Math&quot;/&gt;&lt;w:i/&gt;&lt;/w:rPr&gt;&lt;m:t&gt;V&lt;/m:t&gt;&lt;/m:r&gt;&lt;/m:e&gt;&lt;m:sub&gt;&lt;m:r&gt;&lt;w:rPr&gt;&lt;w:rFonts w:ascii=&quot;Cambria Math&quot; w:h-ansi=&quot;Cambria Math&quot;/&gt;&lt;wx:font wx:val=&quot;Cambria Math&quot;/&gt;&lt;w:i/&gt;&lt;/w:rPr&gt;&lt;m:t&gt;in&lt;/m:t&gt;&lt;/m:r&gt;&lt;/m:sub&gt;&lt;/m:sSub&gt;&lt;m:r&gt;&lt;w:rPr&gt;&lt;w:rFonts w:ascii=&quot;Cambria Math&quot; w:h-ansi=&quot;Cambria Math&quot;/&gt;&lt;wx:font wx:val=&quot;Cambria Math&quot;/&gt;&lt;w:i/&gt;&lt;/w:rPr&gt;&lt;m:t&gt;-&lt;/m:t&gt;&lt;/m:r&gt;&lt;m:sSub&gt;&lt;m:sSubPr&gt;&lt;m:ctrlPr&gt;&lt;w:rPr&gt;&lt;w:rFonts w:ascii=&quot;Cambria Math&quot; w:h-ansi=&quot;Cambria Math&quot;/&gt;&lt;wx:font wx:val=&quot;Cambria Math&quot;/&gt;&lt;w:i/&gt;&lt;/w:rPr&gt;&lt;/m:ctrlPr&gt;&lt;/m:sSubPr&gt;&lt;m:e&gt;&lt;m:r&gt;&lt;w:rPr&gt;&lt;w:rFonts w:ascii=&quot;Cambria Math&quot; w:h-ansi=&quot;Cambria Math&quot;/&gt;&lt;wx:font wx:val=&quot;Cambria Math&quot;/&gt;&lt;w:i/&gt;&lt;/w:rPr&gt;&lt;m:t&gt;V&lt;/m:t&gt;&lt;/m:r&gt;&lt;/m:e&gt;&lt;m:sub&gt;&lt;m:r&gt;&lt;w:rPr&gt;&lt;w:rFonts w:ascii=&quot;Cambria Math&quot; w:h-ansi=&quot;Cambria Math&quot;/&gt;&lt;wx:font wx:val=&quot;Cambria Math&quot;/&gt;&lt;w:i/&gt;&lt;/w:rPr&gt;&lt;m:t&gt;sat&lt;/m:t&gt;&lt;/m:r&gt;&lt;/m:sub&gt;&lt;/m:sSub&gt;&lt;m:r&gt;&lt;w:rPr&gt;&lt;w:rFonts w:ascii=&quot;Cambria Math&quot; w:h-ansi=&quot;Cambria Math&quot;/&gt;&lt;wx:font wx:val=&quot;Cambria Math&quot;/&gt;&lt;w:i/&gt;&lt;/w:rPr&gt;&lt;m:t&gt;-&lt;/m:t&gt;&lt;/m:r&gt;&lt;m:sSub&gt;&lt;m:sSubPr&gt;&lt;m:ctrlPr&gt;&lt;w:rPr&gt;&lt;w:rFonts w:ascii=&quot;Cambria Math&quot; w:h-ansi=&quot;Cambria Math&quot;/&gt;&lt;wx:font wx:val=&quot;Cambria Math&quot;/&gt;&lt;w:i/&gt;&lt;/w:rPr&gt;&lt;/m:ctrlPr&gt;&lt;/m:sSubPr&gt;&lt;m:e&gt;&lt;m:r&gt;&lt;w:rPr&gt;&lt;w:rFonts w:ascii=&quot;Cambria Math&quot; w:h-ansi=&quot;Cambria Math&quot;/&gt;&lt;wx:font wx:val=&quot;Cambria Math&quot;/&gt;&lt;w:i/&gt;&lt;/w:rPr&gt;&lt;m:t&gt;V&lt;/m:t&gt;&lt;/m:r&gt;&lt;/m:e&gt;&lt;m:sub&gt;&lt;m:r&gt;&lt;w:rPr&gt;&lt;w:rFonts w:ascii=&quot;Cambria Math&quot; w:h-ansi=&quot;Cambria Math&quot;/&gt;&lt;wx:font wx:val=&quot;Cambria Math&quot;/&gt;&lt;w:i/&gt;&lt;/w:rPr&gt;&lt;m:t&gt;out&lt;/m:t&gt;&lt;/m:r&gt;&lt;/m:sub&gt;&lt;/m:sSub&gt;&lt;/m:num&gt;&lt;m:den&gt;&lt;m:sSub&gt;&lt;m:sSubPr&gt;&lt;m:ctrlPr&gt;&lt;w:rPr&gt;&lt;w:rFonts w:ascii=&quot;Cambria Math&quot; w:h-ansi=&quot;Cambria Math&quot;/&gt;&lt;wx:font wx:val=&quot;Cambria Math&quot;/&gt;&lt;w:i/&gt;&lt;/w:rPr&gt;&lt;/m:ctrlPr&gt;&lt;/m:sSubPr&gt;&lt;m:e&gt;&lt;m:r&gt;&lt;w:rPr&gt;&lt;w:rFonts w:ascii=&quot;Cambria Math&quot; w:h-ansi=&quot;Cambria Math&quot;/&gt;&lt;wx:font wx:val=&quot;Cambria Math&quot;/&gt;&lt;w:i/&gt;&lt;/w:rPr&gt;&lt;m:t&gt;I&lt;/m:t&gt;&lt;/m:r&gt;&lt;/m:e&gt;&lt;m:sub&gt;&lt;m:r&gt;&lt;w:rPr&gt;&lt;w:rFonts w:ascii=&quot;Cambria Math&quot; w:h-ansi=&quot;Cambria Math&quot;/&gt;&lt;wx:font wx:val=&quot;Cambria Math&quot;/&gt;&lt;w:i/&gt;&lt;/w:rPr&gt;&lt;m:t&gt;pk&lt;/m:t&gt;&lt;/m:r&gt;&lt;m:d&gt;&lt;m:dPr&gt;&lt;m:ctrlPr&gt;&lt;w:rPr&gt;&lt;w:rFonts w:ascii=&quot;Cambria Math&quot; w:h-ansi=&quot;Cambria Math&quot;/&gt;&lt;wx:font wx:val=&quot;Cambria Math&quot;/&gt;&lt;w:i/&gt;&lt;/w:rPr&gt;&lt;/m:ctrlPr&gt;&lt;/m:dPr&gt;&lt;m:e&gt;&lt;m:r&gt;&lt;w:rPr&gt;&lt;w:rFonts w:ascii=&quot;Cambria Math&quot; w:h-ansi=&quot;Cambria Math&quot;/&gt;&lt;wx:font wx:val=&quot;Cambria Math&quot;/&gt;&lt;w:i/&gt;&lt;/w:rPr&gt;&lt;m:t&gt;switch&lt;/m:t&gt;&lt;/m:r&gt;&lt;/m:e&gt;&lt;/m:d&gt;&lt;/m:sub&gt;&lt;/m:sSub&gt;&lt;/m:den&gt;&lt;/m:f&gt;&lt;/m:e&gt;&lt;/m:d&gt;&lt;m:r&gt;&lt;w:rPr&gt;&lt;w:rFonts w:ascii=&quot;Cambria Math&quot; w:h-ansi=&quot;Cambria Math&quot;/&gt;&lt;wx:font wx:val=&quot;Cambria Math&quot;/&gt;&lt;w:i/&gt;&lt;/w:rPr&gt;&lt;m:t&gt;âˆ™&lt;/m:t&gt;&lt;/m:r&gt;&lt;m:sSub&gt;&lt;m:sSubPr&gt;&lt;m:ctrlPr&gt;&lt;w:rPr&gt;&lt;w:rFonts w:ascii=&quot;Cambria Math&quot; w:h-ansi=&quot;Cambria Math&quot;/&gt;&lt;wx:font wx:val=&quot;Cambria Math&quot;/&gt;&lt;w:i/&gt;&lt;/w:rPr&gt;&lt;/m:ctrlPr&gt;&lt;/m:sSubPr&gt;&lt;m:e&gt;&lt;m:r&gt;&lt;w:rPr&gt;&lt;w:rFonts w:ascii=&quot;Cambria Math&quot; w:h-ansi=&quot;Cambria Math&quot;/&gt;&lt;wx:font wx:val=&quot;Cambria Math&quot;/&gt;&lt;w:i/&gt;&lt;/w:rPr&gt;&lt;m:t&gt;t&lt;/m:t&gt;&lt;/m:r&gt;&lt;/m:e&gt;&lt;m:sub&gt;&lt;m:r&gt;&lt;w:rPr&gt;&lt;w:rFonts w:ascii=&quot;Cambria Math&quot; w:h-ansi=&quot;Cambria Math&quot;/&gt;&lt;wx:font wx:val=&quot;Cambria Math&quot;/&gt;&lt;w:i/&gt;&lt;/w:rPr&gt;&lt;m:t&gt;on&lt;/m:t&gt;&lt;/m:r&gt;&lt;/m:sub&gt;&lt;/m:sSub&gt;&lt;/m:oMath&gt;&lt;/m:oMathPara&gt;&lt;/w:p&gt;&lt;w:sectPr wsp:rsidR=&quot;00000000&quot; wsp:rsidRPr=&quot;00B90FE3&quot;&gt;&lt;w:pgSz w:w=&quot;12240&quot; w:h=&quot;15840&quot;/&gt;&lt;w:pgMar w:top=&quot;1440&quot; w:right=&quot;1440&quot; w:bottom=&quot;1440&quot; w:left=&quot;1440&quot; w:header=&quot;720&quot; w:footer=&quot;720&quot; w:gutter=&quot;0&quot;/&gt;&lt;w:cols w:space=&quot;720&quot;/&gt;&lt;/w:sectPr&gt;&lt;/wx:sect&gt;&lt;/w:body&gt;&lt;/w:wordDocument&gt;">
                   <v:imagedata r:id="rId30" o:title="" chromakey="white"/>
                 </v:shape>
               </w:pict>
@@ -3269,12 +3229,12 @@
       </w:tr>
       <w:tr>
         <w:trPr>
-          <w:trHeight w:val="561"/>
+          <w:trHeight w:val="551"/>
           <w:jc w:val="center"/>
         </w:trPr>
         <w:tc>
           <w:tcPr>
-            <w:tcW w:w="1825" w:type="dxa"/>
+            <w:tcW w:w="1799" w:type="dxa"/>
             <w:shd w:val="clear" w:color="auto" w:fill="auto"/>
             <w:vAlign w:val="center"/>
           </w:tcPr>
@@ -3296,7 +3256,7 @@
         </w:tc>
         <w:tc>
           <w:tcPr>
-            <w:tcW w:w="3184" w:type="dxa"/>
+            <w:tcW w:w="3140" w:type="dxa"/>
             <w:shd w:val="clear" w:color="auto" w:fill="auto"/>
             <w:vAlign w:val="center"/>
           </w:tcPr>
@@ -3314,7 +3274,7 @@
                 <w:szCs w:val="16"/>
               </w:rPr>
               <w:pict w14:anchorId="6126416C">
-                <v:shape id="_x0000_i1789" type="#_x0000_t75" style="width:108.55pt;height:25.1pt" equationxml="&lt;?xml version=&quot;1.0&quot; encoding=&quot;UTF-8&quot; standalone=&quot;yes&quot;?&gt;&#10;&lt;?mso-application progid=&quot;Word.Document&quot;?&gt;&#10;&lt;w:wordDocument xmlns:aml=&quot;http://schemas.microsoft.com/aml/2001/core&quot; xmlns:wpc=&quot;http://schemas.microsoft.com/office/word/2010/wordprocessingCanvas&quot; xmlns:cx=&quot;http://schemas.microsoft.com/office/drawing/2014/chartex&quot; xmlns:cx1=&quot;http://schemas.microsoft.com/office/drawing/2015/9/8/chartex&quot; xmlns:cx2=&quot;http://schemas.microsoft.com/office/drawing/2015/10/21/chartex&quot; xmlns:cx3=&quot;http://schemas.microsoft.com/office/drawing/2016/5/9/chartex&quot; xmlns:cx4=&quot;http://schemas.microsoft.com/office/drawing/2016/5/10/chartex&quot; xmlns:cx5=&quot;http://schemas.microsoft.com/office/drawing/2016/5/11/chartex&quot; xmlns:cx6=&quot;http://schemas.microsoft.com/office/drawing/2016/5/12/chartex&quot; xmlns:cx7=&quot;http://schemas.microsoft.com/office/drawing/2016/5/13/chartex&quot; xmlns:cx8=&quot;http://schemas.microsoft.com/office/drawing/2016/5/14/chartex&quot; xmlns:cr=&quot;http://schemas.microsoft.com/office/comments/2020/reactions&quot; xmlns:dt=&quot;uuid:C2F41010-65B3-11d1-A29F-00AA00C14882&quot; xmlns:mc=&quot;http://schemas.openxmlformats.org/markup-compatibility/2006&quot; xmlns:aink=&quot;http://schemas.microsoft.com/office/drawing/2016/ink&quot; xmlns:am3d=&quot;http://schemas.microsoft.com/office/drawing/2017/model3d&quot; xmlns:o=&quot;urn:schemas-microsoft-com:office:office&quot; xmlns:oel=&quot;http://schemas.microsoft.com/office/2019/extlst&quot; xmlns:m=&quot;http://schemas.openxmlformats.org/officeDocument/2006/math&quot; xmlns:v=&quot;urn:schemas-microsoft-com:vml&quot; xmlns:w10=&quot;urn:schemas-microsoft-com:office:word&quot; xmlns:w=&quot;http://schemas.microsoft.com/office/word/2003/wordml&quot; xmlns:wx=&quot;http://schemas.microsoft.com/office/word/2003/auxHint&quot; xmlns:wne=&quot;http://schemas.microsoft.com/office/word/2006/wordml&quot; xmlns:wsp=&quot;http://schemas.microsoft.com/office/word/2003/wordml/sp2&quot; xmlns:sl=&quot;http://schemas.microsoft.com/schemaLibrary/2003/core&quot; w:macrosPresent=&quot;no&quot; w:embeddedObjPresent=&quot;no&quot; w:ocxPresent=&quot;no&quot; xml:space=&quot;preserve&quot;&gt;&lt;w:ignoreSubtree w:val=&quot;http://schemas.microsoft.com/office/word/2003/wordml/sp2&quot;/&gt;&lt;o:DocumentProperties&gt;&lt;o:Version&gt;16&lt;/o:Version&gt;&lt;/o:DocumentProperties&gt;&lt;w:docPr&gt;&lt;w:view w:val=&quot;print&quot;/&gt;&lt;w:zoom w:percent=&quot;100&quot;/&gt;&lt;w:doNotEmbedSystemFonts/&gt;&lt;w:activeWritingStyle w:lang=&quot;EN-AU&quot; w:vendorID=&quot;64&quot; w:dllVersion=&quot;6&quot; w:nlCheck=&quot;on&quot; w:optionSet=&quot;1&quot;/&gt;&lt;w:activeWritingStyle w:lang=&quot;EN-GB&quot; w:vendorID=&quot;64&quot; w:dllVersion=&quot;6&quot; w:nlCheck=&quot;on&quot; w:optionSet=&quot;1&quot;/&gt;&lt;w:activeWritingStyle w:lang=&quot;EN-US&quot; w:vendorID=&quot;64&quot; w:dllVersion=&quot;6&quot; w:nlCheck=&quot;on&quot; w:optionSet=&quot;1&quot;/&gt;&lt;w:activeWritingStyle w:lang=&quot;EN-AU&quot; w:vendorID=&quot;64&quot; w:dllVersion=&quot;0&quot; w:nlCheck=&quot;on&quot; w:optionSet=&quot;0&quot;/&gt;&lt;w:activeWritingStyle w:lang=&quot;EN-GB&quot; w:vendorID=&quot;64&quot; w:dllVersion=&quot;0&quot; w:nlCheck=&quot;on&quot; w:optionSet=&quot;0&quot;/&gt;&lt;w:activeWritingStyle w:lang=&quot;EN-US&quot; w:vendorID=&quot;64&quot; w:dllVersion=&quot;0&quot; w:nlCheck=&quot;on&quot; w:optionSet=&quot;0&quot;/&gt;&lt;w:activeWritingStyle w:lang=&quot;ES-AR&quot; w:vendorID=&quot;64&quot; w:dllVersion=&quot;0&quot; w:nlCheck=&quot;on&quot; w:optionSet=&quot;0&quot;/&gt;&lt;w:activeWritingStyle w:lang=&quot;580A&quot; w:vendorID=&quot;64&quot; w:dllVersion=&quot;0&quot; w:nlCheck=&quot;on&quot; w:optionSet=&quot;0&quot;/&gt;&lt;w:activeWritingStyle w:lang=&quot;PT-BR&quot; w:vendorID=&quot;64&quot; w:dllVersion=&quot;0&quot; w:nlCheck=&quot;on&quot; w:optionSet=&quot;0&quot;/&gt;&lt;w:stylePaneFormatFilter w:val=&quot;3F01&quot;/&gt;&lt;w:defaultTabStop w:val=&quot;720&quot;/&gt;&lt;w:hyphenationZone w:val=&quot;425&quot;/&gt;&lt;w:characterSpacingControl w:val=&quot;DontCompress&quot;/&gt;&lt;w:optimizeForBrowser/&gt;&lt;w:validateAgainstSchema/&gt;&lt;w:saveInvalidXML w:val=&quot;off&quot;/&gt;&lt;w:ignoreMixedContent w:val=&quot;off&quot;/&gt;&lt;w:alwaysShowPlaceholderText w:val=&quot;off&quot;/&gt;&lt;w:compat&gt;&lt;w:breakWrappedTables/&gt;&lt;w:snapToGridInCell/&gt;&lt;w:applyBreakingRules/&gt;&lt;w:wrapTextWithPunct/&gt;&lt;w:useAsianBreakRules/&gt;&lt;w:useWord2002TableStyleRules/&gt;&lt;w:useFELayout/&gt;&lt;/w:compat&gt;&lt;wsp:rsids&gt;&lt;wsp:rsidRoot wsp:val=&quot;00426FBB&quot;/&gt;&lt;wsp:rsid wsp:val=&quot;000002E1&quot;/&gt;&lt;wsp:rsid wsp:val=&quot;00003C97&quot;/&gt;&lt;wsp:rsid wsp:val=&quot;00005565&quot;/&gt;&lt;wsp:rsid wsp:val=&quot;0001754A&quot;/&gt;&lt;wsp:rsid wsp:val=&quot;00017719&quot;/&gt;&lt;wsp:rsid wsp:val=&quot;00027F1D&quot;/&gt;&lt;wsp:rsid wsp:val=&quot;0003296C&quot;/&gt;&lt;wsp:rsid wsp:val=&quot;0003351F&quot;/&gt;&lt;wsp:rsid wsp:val=&quot;00044599&quot;/&gt;&lt;wsp:rsid wsp:val=&quot;000540E6&quot;/&gt;&lt;wsp:rsid wsp:val=&quot;00054421&quot;/&gt;&lt;wsp:rsid wsp:val=&quot;00062E46&quot;/&gt;&lt;wsp:rsid wsp:val=&quot;00074AC8&quot;/&gt;&lt;wsp:rsid wsp:val=&quot;00081408&quot;/&gt;&lt;wsp:rsid wsp:val=&quot;00081EBE&quot;/&gt;&lt;wsp:rsid wsp:val=&quot;00086EDC&quot;/&gt;&lt;wsp:rsid wsp:val=&quot;000B1236&quot;/&gt;&lt;wsp:rsid wsp:val=&quot;000B36A3&quot;/&gt;&lt;wsp:rsid wsp:val=&quot;000C013C&quot;/&gt;&lt;wsp:rsid wsp:val=&quot;000E3F84&quot;/&gt;&lt;wsp:rsid wsp:val=&quot;001056DF&quot;/&gt;&lt;wsp:rsid wsp:val=&quot;0010789C&quot;/&gt;&lt;wsp:rsid wsp:val=&quot;00114025&quot;/&gt;&lt;wsp:rsid wsp:val=&quot;001160D2&quot;/&gt;&lt;wsp:rsid wsp:val=&quot;00120636&quot;/&gt;&lt;wsp:rsid wsp:val=&quot;001348A5&quot;/&gt;&lt;wsp:rsid wsp:val=&quot;00151B8E&quot;/&gt;&lt;wsp:rsid wsp:val=&quot;00182170&quot;/&gt;&lt;wsp:rsid wsp:val=&quot;001928FB&quot;/&gt;&lt;wsp:rsid wsp:val=&quot;00192BC7&quot;/&gt;&lt;wsp:rsid wsp:val=&quot;00195BE6&quot;/&gt;&lt;wsp:rsid wsp:val=&quot;001A3C37&quot;/&gt;&lt;wsp:rsid wsp:val=&quot;001A50EA&quot;/&gt;&lt;wsp:rsid wsp:val=&quot;001C3BEF&quot;/&gt;&lt;wsp:rsid wsp:val=&quot;001F16CD&quot;/&gt;&lt;wsp:rsid wsp:val=&quot;001F47D2&quot;/&gt;&lt;wsp:rsid wsp:val=&quot;002029C8&quot;/&gt;&lt;wsp:rsid wsp:val=&quot;0022285A&quot;/&gt;&lt;wsp:rsid wsp:val=&quot;00224C61&quot;/&gt;&lt;wsp:rsid wsp:val=&quot;00256ABC&quot;/&gt;&lt;wsp:rsid wsp:val=&quot;0027227B&quot;/&gt;&lt;wsp:rsid wsp:val=&quot;00273AC7&quot;/&gt;&lt;wsp:rsid wsp:val=&quot;00273D2C&quot;/&gt;&lt;wsp:rsid wsp:val=&quot;00285ECD&quot;/&gt;&lt;wsp:rsid wsp:val=&quot;00290E1B&quot;/&gt;&lt;wsp:rsid wsp:val=&quot;00291B17&quot;/&gt;&lt;wsp:rsid wsp:val=&quot;00291BB3&quot;/&gt;&lt;wsp:rsid wsp:val=&quot;002A6742&quot;/&gt;&lt;wsp:rsid wsp:val=&quot;002C1A7F&quot;/&gt;&lt;wsp:rsid wsp:val=&quot;002C4239&quot;/&gt;&lt;wsp:rsid wsp:val=&quot;002C559D&quot;/&gt;&lt;wsp:rsid wsp:val=&quot;002D16AE&quot;/&gt;&lt;wsp:rsid wsp:val=&quot;002D2D42&quot;/&gt;&lt;wsp:rsid wsp:val=&quot;002F72D0&quot;/&gt;&lt;wsp:rsid wsp:val=&quot;002F7A4F&quot;/&gt;&lt;wsp:rsid wsp:val=&quot;003003AB&quot;/&gt;&lt;wsp:rsid wsp:val=&quot;00302C35&quot;/&gt;&lt;wsp:rsid wsp:val=&quot;00311C49&quot;/&gt;&lt;wsp:rsid wsp:val=&quot;0032119E&quot;/&gt;&lt;wsp:rsid wsp:val=&quot;00321304&quot;/&gt;&lt;wsp:rsid wsp:val=&quot;00324FC2&quot;/&gt;&lt;wsp:rsid wsp:val=&quot;003312CA&quot;/&gt;&lt;wsp:rsid wsp:val=&quot;00331F84&quot;/&gt;&lt;wsp:rsid wsp:val=&quot;003329D6&quot;/&gt;&lt;wsp:rsid wsp:val=&quot;0037721F&quot;/&gt;&lt;wsp:rsid wsp:val=&quot;003950A4&quot;/&gt;&lt;wsp:rsid wsp:val=&quot;003A1E7E&quot;/&gt;&lt;wsp:rsid wsp:val=&quot;003E2FDC&quot;/&gt;&lt;wsp:rsid wsp:val=&quot;003E3577&quot;/&gt;&lt;wsp:rsid wsp:val=&quot;003F3A61&quot;/&gt;&lt;wsp:rsid wsp:val=&quot;00410A5D&quot;/&gt;&lt;wsp:rsid wsp:val=&quot;00414909&quot;/&gt;&lt;wsp:rsid wsp:val=&quot;00416537&quot;/&gt;&lt;wsp:rsid wsp:val=&quot;00425A6A&quot;/&gt;&lt;wsp:rsid wsp:val=&quot;00426FBB&quot;/&gt;&lt;wsp:rsid wsp:val=&quot;00454542&quot;/&gt;&lt;wsp:rsid wsp:val=&quot;0047429A&quot;/&gt;&lt;wsp:rsid wsp:val=&quot;0048374C&quot;/&gt;&lt;wsp:rsid wsp:val=&quot;0048771D&quot;/&gt;&lt;wsp:rsid wsp:val=&quot;004A6605&quot;/&gt;&lt;wsp:rsid wsp:val=&quot;004C45FA&quot;/&gt;&lt;wsp:rsid wsp:val=&quot;004D35A3&quot;/&gt;&lt;wsp:rsid wsp:val=&quot;004E1BD8&quot;/&gt;&lt;wsp:rsid wsp:val=&quot;004E452A&quot;/&gt;&lt;wsp:rsid wsp:val=&quot;004E78E3&quot;/&gt;&lt;wsp:rsid wsp:val=&quot;004F2BFE&quot;/&gt;&lt;wsp:rsid wsp:val=&quot;004F63D3&quot;/&gt;&lt;wsp:rsid wsp:val=&quot;004F7DCF&quot;/&gt;&lt;wsp:rsid wsp:val=&quot;005004BF&quot;/&gt;&lt;wsp:rsid wsp:val=&quot;00502E89&quot;/&gt;&lt;wsp:rsid wsp:val=&quot;00506CFE&quot;/&gt;&lt;wsp:rsid wsp:val=&quot;00510E95&quot;/&gt;&lt;wsp:rsid wsp:val=&quot;005225C3&quot;/&gt;&lt;wsp:rsid wsp:val=&quot;00527D56&quot;/&gt;&lt;wsp:rsid wsp:val=&quot;0053221F&quot;/&gt;&lt;wsp:rsid wsp:val=&quot;00536FAE&quot;/&gt;&lt;wsp:rsid wsp:val=&quot;00542C85&quot;/&gt;&lt;wsp:rsid wsp:val=&quot;00553510&quot;/&gt;&lt;wsp:rsid wsp:val=&quot;00554186&quot;/&gt;&lt;wsp:rsid wsp:val=&quot;00585769&quot;/&gt;&lt;wsp:rsid wsp:val=&quot;00585C61&quot;/&gt;&lt;wsp:rsid wsp:val=&quot;00591130&quot;/&gt;&lt;wsp:rsid wsp:val=&quot;005A3F28&quot;/&gt;&lt;wsp:rsid wsp:val=&quot;005A40BE&quot;/&gt;&lt;wsp:rsid wsp:val=&quot;005B13E2&quot;/&gt;&lt;wsp:rsid wsp:val=&quot;005B47D7&quot;/&gt;&lt;wsp:rsid wsp:val=&quot;005C5526&quot;/&gt;&lt;wsp:rsid wsp:val=&quot;005C62C6&quot;/&gt;&lt;wsp:rsid wsp:val=&quot;005D7B9E&quot;/&gt;&lt;wsp:rsid wsp:val=&quot;005E112E&quot;/&gt;&lt;wsp:rsid wsp:val=&quot;005F0834&quot;/&gt;&lt;wsp:rsid wsp:val=&quot;005F68AB&quot;/&gt;&lt;wsp:rsid wsp:val=&quot;005F6DC3&quot;/&gt;&lt;wsp:rsid wsp:val=&quot;00601A8E&quot;/&gt;&lt;wsp:rsid wsp:val=&quot;0062033E&quot;/&gt;&lt;wsp:rsid wsp:val=&quot;00624482&quot;/&gt;&lt;wsp:rsid wsp:val=&quot;0064799C&quot;/&gt;&lt;wsp:rsid wsp:val=&quot;00654156&quot;/&gt;&lt;wsp:rsid wsp:val=&quot;00656ADC&quot;/&gt;&lt;wsp:rsid wsp:val=&quot;006B47CA&quot;/&gt;&lt;wsp:rsid wsp:val=&quot;006C304C&quot;/&gt;&lt;wsp:rsid wsp:val=&quot;006C4511&quot;/&gt;&lt;wsp:rsid wsp:val=&quot;006C65F5&quot;/&gt;&lt;wsp:rsid wsp:val=&quot;006C7AAA&quot;/&gt;&lt;wsp:rsid wsp:val=&quot;006D1C2A&quot;/&gt;&lt;wsp:rsid wsp:val=&quot;006D264F&quot;/&gt;&lt;wsp:rsid wsp:val=&quot;006D4E89&quot;/&gt;&lt;wsp:rsid wsp:val=&quot;006E2A8D&quot;/&gt;&lt;wsp:rsid wsp:val=&quot;006E7574&quot;/&gt;&lt;wsp:rsid wsp:val=&quot;00703430&quot;/&gt;&lt;wsp:rsid wsp:val=&quot;00703548&quot;/&gt;&lt;wsp:rsid wsp:val=&quot;00704E18&quot;/&gt;&lt;wsp:rsid wsp:val=&quot;007069BE&quot;/&gt;&lt;wsp:rsid wsp:val=&quot;00745C86&quot;/&gt;&lt;wsp:rsid wsp:val=&quot;00764603&quot;/&gt;&lt;wsp:rsid wsp:val=&quot;0076604D&quot;/&gt;&lt;wsp:rsid wsp:val=&quot;00790909&quot;/&gt;&lt;wsp:rsid wsp:val=&quot;007929AF&quot;/&gt;&lt;wsp:rsid wsp:val=&quot;007B1582&quot;/&gt;&lt;wsp:rsid wsp:val=&quot;007B5A07&quot;/&gt;&lt;wsp:rsid wsp:val=&quot;007C065D&quot;/&gt;&lt;wsp:rsid wsp:val=&quot;007D3E71&quot;/&gt;&lt;wsp:rsid wsp:val=&quot;007E5D6A&quot;/&gt;&lt;wsp:rsid wsp:val=&quot;007E645D&quot;/&gt;&lt;wsp:rsid wsp:val=&quot;007F75CA&quot;/&gt;&lt;wsp:rsid wsp:val=&quot;00821E08&quot;/&gt;&lt;wsp:rsid wsp:val=&quot;00834EFD&quot;/&gt;&lt;wsp:rsid wsp:val=&quot;00844B24&quot;/&gt;&lt;wsp:rsid wsp:val=&quot;0084515F&quot;/&gt;&lt;wsp:rsid wsp:val=&quot;0085092D&quot;/&gt;&lt;wsp:rsid wsp:val=&quot;00865414&quot;/&gt;&lt;wsp:rsid wsp:val=&quot;00877D4C&quot;/&gt;&lt;wsp:rsid wsp:val=&quot;008831DC&quot;/&gt;&lt;wsp:rsid wsp:val=&quot;00883903&quot;/&gt;&lt;wsp:rsid wsp:val=&quot;00891C30&quot;/&gt;&lt;wsp:rsid wsp:val=&quot;00897219&quot;/&gt;&lt;wsp:rsid wsp:val=&quot;0089763B&quot;/&gt;&lt;wsp:rsid wsp:val=&quot;008B6AE3&quot;/&gt;&lt;wsp:rsid wsp:val=&quot;008C1332&quot;/&gt;&lt;wsp:rsid wsp:val=&quot;008D1045&quot;/&gt;&lt;wsp:rsid wsp:val=&quot;008E5996&quot;/&gt;&lt;wsp:rsid wsp:val=&quot;00901AE1&quot;/&gt;&lt;wsp:rsid wsp:val=&quot;00912F93&quot;/&gt;&lt;wsp:rsid wsp:val=&quot;009205B4&quot;/&gt;&lt;wsp:rsid wsp:val=&quot;00955B59&quot;/&gt;&lt;wsp:rsid wsp:val=&quot;00992262&quot;/&gt;&lt;wsp:rsid wsp:val=&quot;009926BC&quot;/&gt;&lt;wsp:rsid wsp:val=&quot;009A4319&quot;/&gt;&lt;wsp:rsid wsp:val=&quot;009A6C3F&quot;/&gt;&lt;wsp:rsid wsp:val=&quot;009B73F2&quot;/&gt;&lt;wsp:rsid wsp:val=&quot;009C12BD&quot;/&gt;&lt;wsp:rsid wsp:val=&quot;009C50FE&quot;/&gt;&lt;wsp:rsid wsp:val=&quot;009E49DD&quot;/&gt;&lt;wsp:rsid wsp:val=&quot;00A03E75&quot;/&gt;&lt;wsp:rsid wsp:val=&quot;00A20627&quot;/&gt;&lt;wsp:rsid wsp:val=&quot;00A22FE9&quot;/&gt;&lt;wsp:rsid wsp:val=&quot;00A31A44&quot;/&gt;&lt;wsp:rsid wsp:val=&quot;00A32BFA&quot;/&gt;&lt;wsp:rsid wsp:val=&quot;00A3325E&quot;/&gt;&lt;wsp:rsid wsp:val=&quot;00A45FCE&quot;/&gt;&lt;wsp:rsid wsp:val=&quot;00A75671&quot;/&gt;&lt;wsp:rsid wsp:val=&quot;00A773CC&quot;/&gt;&lt;wsp:rsid wsp:val=&quot;00A924D0&quot;/&gt;&lt;wsp:rsid wsp:val=&quot;00A9318B&quot;/&gt;&lt;wsp:rsid wsp:val=&quot;00A94AC1&quot;/&gt;&lt;wsp:rsid wsp:val=&quot;00AB18B7&quot;/&gt;&lt;wsp:rsid wsp:val=&quot;00AD335D&quot;/&gt;&lt;wsp:rsid wsp:val=&quot;00AF114C&quot;/&gt;&lt;wsp:rsid wsp:val=&quot;00AF792B&quot;/&gt;&lt;wsp:rsid wsp:val=&quot;00B32137&quot;/&gt;&lt;wsp:rsid wsp:val=&quot;00B33D2F&quot;/&gt;&lt;wsp:rsid wsp:val=&quot;00B40A5B&quot;/&gt;&lt;wsp:rsid wsp:val=&quot;00B45C6B&quot;/&gt;&lt;wsp:rsid wsp:val=&quot;00B55D5E&quot;/&gt;&lt;wsp:rsid wsp:val=&quot;00B57A80&quot;/&gt;&lt;wsp:rsid wsp:val=&quot;00B70E9C&quot;/&gt;&lt;wsp:rsid wsp:val=&quot;00B713D8&quot;/&gt;&lt;wsp:rsid wsp:val=&quot;00B72979&quot;/&gt;&lt;wsp:rsid wsp:val=&quot;00B94516&quot;/&gt;&lt;wsp:rsid wsp:val=&quot;00BA25E2&quot;/&gt;&lt;wsp:rsid wsp:val=&quot;00BB2855&quot;/&gt;&lt;wsp:rsid wsp:val=&quot;00BC5343&quot;/&gt;&lt;wsp:rsid wsp:val=&quot;00BD19C1&quot;/&gt;&lt;wsp:rsid wsp:val=&quot;00BD25B8&quot;/&gt;&lt;wsp:rsid wsp:val=&quot;00C012E1&quot;/&gt;&lt;wsp:rsid wsp:val=&quot;00C06BB4&quot;/&gt;&lt;wsp:rsid wsp:val=&quot;00C10D20&quot;/&gt;&lt;wsp:rsid wsp:val=&quot;00C12E0C&quot;/&gt;&lt;wsp:rsid wsp:val=&quot;00C21916&quot;/&gt;&lt;wsp:rsid wsp:val=&quot;00C34915&quot;/&gt;&lt;wsp:rsid wsp:val=&quot;00C457CA&quot;/&gt;&lt;wsp:rsid wsp:val=&quot;00C53FB6&quot;/&gt;&lt;wsp:rsid wsp:val=&quot;00C57FB7&quot;/&gt;&lt;wsp:rsid wsp:val=&quot;00C644D4&quot;/&gt;&lt;wsp:rsid wsp:val=&quot;00C65F3F&quot;/&gt;&lt;wsp:rsid wsp:val=&quot;00C72414&quot;/&gt;&lt;wsp:rsid wsp:val=&quot;00C72B1A&quot;/&gt;&lt;wsp:rsid wsp:val=&quot;00C8667B&quot;/&gt;&lt;wsp:rsid wsp:val=&quot;00C90993&quot;/&gt;&lt;wsp:rsid wsp:val=&quot;00CA4CE3&quot;/&gt;&lt;wsp:rsid wsp:val=&quot;00CC72FD&quot;/&gt;&lt;wsp:rsid wsp:val=&quot;00CD1D23&quot;/&gt;&lt;wsp:rsid wsp:val=&quot;00CD4F3F&quot;/&gt;&lt;wsp:rsid wsp:val=&quot;00D311F8&quot;/&gt;&lt;wsp:rsid wsp:val=&quot;00D31660&quot;/&gt;&lt;wsp:rsid wsp:val=&quot;00D36B52&quot;/&gt;&lt;wsp:rsid wsp:val=&quot;00D377C8&quot;/&gt;&lt;wsp:rsid wsp:val=&quot;00D41274&quot;/&gt;&lt;wsp:rsid wsp:val=&quot;00D4229C&quot;/&gt;&lt;wsp:rsid wsp:val=&quot;00D43BF3&quot;/&gt;&lt;wsp:rsid wsp:val=&quot;00D549FB&quot;/&gt;&lt;wsp:rsid wsp:val=&quot;00D56487&quot;/&gt;&lt;wsp:rsid wsp:val=&quot;00D767BB&quot;/&gt;&lt;wsp:rsid wsp:val=&quot;00D939B0&quot;/&gt;&lt;wsp:rsid wsp:val=&quot;00DA31A2&quot;/&gt;&lt;wsp:rsid wsp:val=&quot;00DB16E0&quot;/&gt;&lt;wsp:rsid wsp:val=&quot;00DB2DF9&quot;/&gt;&lt;wsp:rsid wsp:val=&quot;00DB465D&quot;/&gt;&lt;wsp:rsid wsp:val=&quot;00DB48A2&quot;/&gt;&lt;wsp:rsid wsp:val=&quot;00DB7E63&quot;/&gt;&lt;wsp:rsid wsp:val=&quot;00DC2055&quot;/&gt;&lt;wsp:rsid wsp:val=&quot;00DC3908&quot;/&gt;&lt;wsp:rsid wsp:val=&quot;00DD71E8&quot;/&gt;&lt;wsp:rsid wsp:val=&quot;00DD7F83&quot;/&gt;&lt;wsp:rsid wsp:val=&quot;00DE4EB8&quot;/&gt;&lt;wsp:rsid wsp:val=&quot;00E0641E&quot;/&gt;&lt;wsp:rsid wsp:val=&quot;00E06664&quot;/&gt;&lt;wsp:rsid wsp:val=&quot;00E304BC&quot;/&gt;&lt;wsp:rsid wsp:val=&quot;00E32853&quot;/&gt;&lt;wsp:rsid wsp:val=&quot;00E34EBD&quot;/&gt;&lt;wsp:rsid wsp:val=&quot;00E401F8&quot;/&gt;&lt;wsp:rsid wsp:val=&quot;00E46425&quot;/&gt;&lt;wsp:rsid wsp:val=&quot;00E469FC&quot;/&gt;&lt;wsp:rsid wsp:val=&quot;00E47D0E&quot;/&gt;&lt;wsp:rsid wsp:val=&quot;00E65018&quot;/&gt;&lt;wsp:rsid wsp:val=&quot;00E76CA1&quot;/&gt;&lt;wsp:rsid wsp:val=&quot;00E94339&quot;/&gt;&lt;wsp:rsid wsp:val=&quot;00E97563&quot;/&gt;&lt;wsp:rsid wsp:val=&quot;00EB0B63&quot;/&gt;&lt;wsp:rsid wsp:val=&quot;00EC265C&quot;/&gt;&lt;wsp:rsid wsp:val=&quot;00ED61CB&quot;/&gt;&lt;wsp:rsid wsp:val=&quot;00EE752A&quot;/&gt;&lt;wsp:rsid wsp:val=&quot;00F06A72&quot;/&gt;&lt;wsp:rsid wsp:val=&quot;00F136F0&quot;/&gt;&lt;wsp:rsid wsp:val=&quot;00F20BBB&quot;/&gt;&lt;wsp:rsid wsp:val=&quot;00F36048&quot;/&gt;&lt;wsp:rsid wsp:val=&quot;00F43BD8&quot;/&gt;&lt;wsp:rsid wsp:val=&quot;00F562F3&quot;/&gt;&lt;wsp:rsid wsp:val=&quot;00F74B89&quot;/&gt;&lt;wsp:rsid wsp:val=&quot;00F75133&quot;/&gt;&lt;wsp:rsid wsp:val=&quot;00F83272&quot;/&gt;&lt;wsp:rsid wsp:val=&quot;00F9358D&quot;/&gt;&lt;wsp:rsid wsp:val=&quot;00F9369B&quot;/&gt;&lt;wsp:rsid wsp:val=&quot;00FA3899&quot;/&gt;&lt;wsp:rsid wsp:val=&quot;00FA4909&quot;/&gt;&lt;wsp:rsid wsp:val=&quot;00FA5164&quot;/&gt;&lt;wsp:rsid wsp:val=&quot;00FA6751&quot;/&gt;&lt;wsp:rsid wsp:val=&quot;00FA6BD7&quot;/&gt;&lt;wsp:rsid wsp:val=&quot;00FB1048&quot;/&gt;&lt;wsp:rsid wsp:val=&quot;00FB62C4&quot;/&gt;&lt;wsp:rsid wsp:val=&quot;00FB7701&quot;/&gt;&lt;wsp:rsid wsp:val=&quot;00FD1AC5&quot;/&gt;&lt;wsp:rsid wsp:val=&quot;00FD5CF0&quot;/&gt;&lt;/wsp:rsids&gt;&lt;/w:docPr&gt;&lt;w:body&gt;&lt;wx:sect&gt;&lt;w:p wsp:rsidR=&quot;001C3BEF&quot; wsp:rsidRPr=&quot;001C3BEF&quot; wsp:rsidRDefault=&quot;001C3BEF&quot; wsp:rsidP=&quot;001C3BEF&quot;&gt;&lt;m:oMathPara&gt;&lt;m:oMath&gt;&lt;m:sSub&gt;&lt;m:sSubPr&gt;&lt;m:ctrlPr&gt;&lt;w:rPr&gt;&lt;w:rFonts w:ascii=&quot;Cambria Math&quot; w:h-ansi=&quot;Cambria Math&quot;/&gt;&lt;wx:font wx:val=&quot;Cambria Math&quot;/&gt;&lt;w:i/&gt;&lt;/w:rPr&gt;&lt;/m:ctrlPr&gt;&lt;/m:sSubPr&gt;&lt;m:e&gt;&lt;m:r&gt;&lt;w:rPr&gt;&lt;w:rFonts w:ascii=&quot;Cambria Math&quot; w:h-ansi=&quot;Cambria Math&quot;/&gt;&lt;wx:font wx:val=&quot;Cambria Math&quot;/&gt;&lt;w:i/&gt;&lt;/w:rPr&gt;&lt;m:t&gt;C&lt;/m:t&gt;&lt;/m:r&gt;&lt;/m:e&gt;&lt;m:sub&gt;&lt;m:r&gt;&lt;w:rPr&gt;&lt;w:rFonts w:ascii=&quot;Cambria Math&quot; w:h-ansi=&quot;Cambria Math&quot;/&gt;&lt;wx:font wx:val=&quot;Cambria Math&quot;/&gt;&lt;w:i/&gt;&lt;/w:rPr&gt;&lt;m:t&gt;o&lt;/m:t&gt;&lt;/m:r&gt;&lt;/m:sub&gt;&lt;/m:sSub&gt;&lt;m:r&gt;&lt;w:rPr&gt;&lt;w:rFonts w:ascii=&quot;Cambria Math&quot; w:h-ansi=&quot;Cambria Math&quot;/&gt;&lt;wx:font wx:val=&quot;Cambria Math&quot;/&gt;&lt;w:i/&gt;&lt;/w:rPr&gt;&lt;m:t&gt;=&lt;/m:t&gt;&lt;/m:r&gt;&lt;m:f&gt;&lt;m:fPr&gt;&lt;m:ctrlPr&gt;&lt;w:rPr&gt;&lt;w:rFonts w:ascii=&quot;Cambria Math&quot; w:h-ansi=&quot;Cambria Math&quot;/&gt;&lt;wx:font wx:val=&quot;Cambria Math&quot;/&gt;&lt;w:i/&gt;&lt;/w:rPr&gt;&lt;/m:ctrlPr&gt;&lt;/m:fPr&gt;&lt;m:num&gt;&lt;m:sSub&gt;&lt;m:sSubPr&gt;&lt;m:ctrlPr&gt;&lt;w:rPr&gt;&lt;w:rFonts w:ascii=&quot;Cambria Math&quot; w:h-ansi=&quot;Cambria Math&quot;/&gt;&lt;wx:font wx:val=&quot;Cambria Math&quot;/&gt;&lt;w:i/&gt;&lt;/w:rPr&gt;&lt;/m:ctrlPr&gt;&lt;/m:sSubPr&gt;&lt;m:e&gt;&lt;m:r&gt;&lt;w:rPr&gt;&lt;w:rFonts w:ascii=&quot;Cambria Math&quot; w:h-ansi=&quot;Cambria Math&quot;/&gt;&lt;wx:font wx:val=&quot;Cambria Math&quot;/&gt;&lt;w:i/&gt;&lt;/w:rPr&gt;&lt;m:t&gt;I&lt;/m:t&gt;&lt;/m:r&gt;&lt;/m:e&gt;&lt;m:sub&gt;&lt;m:r&gt;&lt;w:rPr&gt;&lt;w:rFonts w:ascii=&quot;Cambria Math&quot; w:h-ansi=&quot;Cambria Math&quot;/&gt;&lt;wx:font wx:val=&quot;Cambria Math&quot;/&gt;&lt;w:i/&gt;&lt;/w:rPr&gt;&lt;m:t&gt;pk&lt;/m:t&gt;&lt;/m:r&gt;&lt;m:d&gt;&lt;m:dPr&gt;&lt;m:ctrlPr&gt;&lt;w:rPr&gt;&lt;w:rFonts w:ascii=&quot;Cambria Math&quot; w:h-ansi=&quot;Cambria Math&quot;/&gt;&lt;wx:font wx:val=&quot;Cambria Math&quot;/&gt;&lt;w:i/&gt;&lt;/w:rPr&gt;&lt;/m:ctrlPr&gt;&lt;/m:dPr&gt;&lt;m:e&gt;&lt;m:r&gt;&lt;w:rPr&gt;&lt;w:rFonts w:ascii=&quot;Cambria Math&quot; w:h-ansi=&quot;Cambria Math&quot;/&gt;&lt;wx:font wx:val=&quot;Cambria Math&quot;/&gt;&lt;w:i/&gt;&lt;/w:rPr&gt;&lt;m:t&gt;switch&lt;/m:t&gt;&lt;/m:r&gt;&lt;/m:e&gt;&lt;/m:d&gt;&lt;/m:sub&gt;&lt;/m:sSub&gt;&lt;m:d&gt;&lt;m:dPr&gt;&lt;m:ctrlPr&gt;&lt;w:rPr&gt;&lt;w:rFonts w:ascii=&quot;Cambria Math&quot; w:h-ansi=&quot;Cambria Math&quot;/&gt;&lt;wx:font wx:val=&quot;Cambria Math&quot;/&gt;&lt;w:i/&gt;&lt;/w:rPr&gt;&lt;/m:ctrlPr&gt;&lt;/m:dPr&gt;&lt;m:e&gt;&lt;m:sSub&gt;&lt;m:sSubPr&gt;&lt;m:ctrlPr&gt;&lt;w:rPr&gt;&lt;w:rFonts w:ascii=&quot;Cambria Math&quot; w:h-ansi=&quot;Cambria Math&quot;/&gt;&lt;wx:font wx:val=&quot;Cambria Math&quot;/&gt;&lt;w:i/&gt;&lt;/w:rPr&gt;&lt;/m:ctrlPr&gt;&lt;/m:sSubPr&gt;&lt;m:e&gt;&lt;m:r&gt;&lt;w:rPr&gt;&lt;w:rFonts w:ascii=&quot;Cambria Math&quot; w:h-ansi=&quot;Cambria Math&quot;/&gt;&lt;wx:font wx:val=&quot;Cambria Math&quot;/&gt;&lt;w:i/&gt;&lt;/w:rPr&gt;&lt;m:t&gt;t&lt;/m:t&gt;&lt;/m:r&gt;&lt;/m:e&gt;&lt;m:sub&gt;&lt;m:r&gt;&lt;w:rPr&gt;&lt;w:rFonts w:ascii=&quot;Cambria Math&quot; w:h-ansi=&quot;Cambria Math&quot;/&gt;&lt;wx:font wx:val=&quot;Cambria Math&quot;/&gt;&lt;w:i/&gt;&lt;/w:rPr&gt;&lt;m:t&gt;on&lt;/m:t&gt;&lt;/m:r&gt;&lt;/m:sub&gt;&lt;/m:sSub&gt;&lt;m:r&gt;&lt;w:rPr&gt;&lt;w:rFonts w:ascii=&quot;Cambria Math&quot; w:h-ansi=&quot;Cambria Math&quot;/&gt;&lt;wx:font wx:val=&quot;Cambria Math&quot;/&gt;&lt;w:i/&gt;&lt;/w:rPr&gt;&lt;m:t&gt;+&lt;/m:t&gt;&lt;/m:r&gt;&lt;m:sSub&gt;&lt;m:sSubPr&gt;&lt;m:ctrlPr&gt;&lt;w:rPr&gt;&lt;w:rFonts w:ascii=&quot;Cambria Math&quot; w:h-ansi=&quot;Cambria Math&quot;/&gt;&lt;wx:font wx:val=&quot;Cambria Math&quot;/&gt;&lt;w:i/&gt;&lt;/w:rPr&gt;&lt;/m:ctrlPr&gt;&lt;/m:sSubPr&gt;&lt;m:e&gt;&lt;m:r&gt;&lt;w:rPr&gt;&lt;w:rFonts w:ascii=&quot;Cambria Math&quot; w:h-ansi=&quot;Cambria Math&quot;/&gt;&lt;wx:font wx:val=&quot;Cambria Math&quot;/&gt;&lt;w:i/&gt;&lt;/w:rPr&gt;&lt;m:t&gt;t&lt;/m:t&gt;&lt;/m:r&gt;&lt;/m:e&gt;&lt;m:sub&gt;&lt;m:r&gt;&lt;w:rPr&gt;&lt;w:rFonts w:ascii=&quot;Cambria Math&quot; w:h-ansi=&quot;Cambria Math&quot;/&gt;&lt;wx:font wx:val=&quot;Cambria Math&quot;/&gt;&lt;w:i/&gt;&lt;/w:rPr&gt;&lt;m:t&gt;off&lt;/m:t&gt;&lt;/m:r&gt;&lt;/m:sub&gt;&lt;/m:sSub&gt;&lt;/m:e&gt;&lt;/m:d&gt;&lt;/m:num&gt;&lt;m:den&gt;&lt;m:r&gt;&lt;w:rPr&gt;&lt;w:rFonts w:ascii=&quot;Cambria Math&quot; w:h-ansi=&quot;Cambria Math&quot;/&gt;&lt;wx:font wx:val=&quot;Cambria Math&quot;/&gt;&lt;w:i/&gt;&lt;/w:rPr&gt;&lt;m:t&gt;8âˆ™&lt;/m:t&gt;&lt;/m:r&gt;&lt;m:r&gt;&lt;m:rPr&gt;&lt;m:sty m:val=&quot;p&quot;/&gt;&lt;/m:rPr&gt;&lt;w:rPr&gt;&lt;w:rFonts w:ascii=&quot;Cambria Math&quot; w:h-ansi=&quot;Cambria Math&quot;/&gt;&lt;wx:font wx:val=&quot;Cambria Math&quot;/&gt;&lt;/w:rPr&gt;&lt;m:t&gt;Î”&lt;/m:t&gt;&lt;/m:r&gt;&lt;m:sSub&gt;&lt;m:sSubPr&gt;&lt;m:ctrlPr&gt;&lt;w:rPr&gt;&lt;w:rFonts w:ascii=&quot;Cambria Math&quot; w:h-ansi=&quot;Cambria Math&quot;/&gt;&lt;wx:font wx:val=&quot;Cambria Math&quot;/&gt;&lt;w:i/&gt;&lt;/w:rPr&gt;&lt;/m:ctrlPr&gt;&lt;/m:sSubPr&gt;&lt;m:e&gt;&lt;m:r&gt;&lt;w:rPr&gt;&lt;w:rFonts w:ascii=&quot;Cambria Math&quot; w:h-ansi=&quot;Cambria Math&quot;/&gt;&lt;wx:font wx:val=&quot;Cambria Math&quot;/&gt;&lt;w:i/&gt;&lt;/w:rPr&gt;&lt;m:t&gt;V&lt;/m:t&gt;&lt;/m:r&gt;&lt;/m:e&gt;&lt;m:sub&gt;&lt;m:r&gt;&lt;w:rPr&gt;&lt;w:rFonts w:ascii=&quot;Cambria Math&quot; w:h-ansi=&quot;Cambria Math&quot;/&gt;&lt;wx:font wx:val=&quot;Cambria Math&quot;/&gt;&lt;w:i/&gt;&lt;/w:rPr&gt;&lt;m:t&gt;out&lt;/m:t&gt;&lt;/m:r&gt;&lt;/m:sub&gt;&lt;/m:sSub&gt;&lt;/m:den&gt;&lt;/m:f&gt;&lt;/m:oMath&gt;&lt;/m:oMathPara&gt;&lt;/w:p&gt;&lt;w:sectPr wsp:rsidR=&quot;00000000&quot; wsp:rsidRPr=&quot;001C3BEF&quot;&gt;&lt;w:pgSz w:w=&quot;12240&quot; w:h=&quot;15840&quot;/&gt;&lt;w:pgMar w:top=&quot;1440&quot; w:right=&quot;1440&quot; w:bottom=&quot;1440&quot; w:left=&quot;1440&quot; w:header=&quot;720&quot; w:footer=&quot;720&quot; w:gutter=&quot;0&quot;/&gt;&lt;w:cols w:space=&quot;720&quot;/&gt;&lt;/w:sectPr&gt;&lt;/wx:sect&gt;&lt;/w:body&gt;&lt;/w:wordDocument&gt;">
+                <v:shape id="_x0000_i1062" type="#_x0000_t75" style="width:108.7pt;height:24.9pt" equationxml="&lt;?xml version=&quot;1.0&quot; encoding=&quot;UTF-8&quot; standalone=&quot;yes&quot;?&gt;&#10;&lt;?mso-application progid=&quot;Word.Document&quot;?&gt;&#10;&lt;w:wordDocument xmlns:aml=&quot;http://schemas.microsoft.com/aml/2001/core&quot; xmlns:wpc=&quot;http://schemas.microsoft.com/office/word/2010/wordprocessingCanvas&quot; xmlns:cx=&quot;http://schemas.microsoft.com/office/drawing/2014/chartex&quot; xmlns:cx1=&quot;http://schemas.microsoft.com/office/drawing/2015/9/8/chartex&quot; xmlns:cx2=&quot;http://schemas.microsoft.com/office/drawing/2015/10/21/chartex&quot; xmlns:cx3=&quot;http://schemas.microsoft.com/office/drawing/2016/5/9/chartex&quot; xmlns:cx4=&quot;http://schemas.microsoft.com/office/drawing/2016/5/10/chartex&quot; xmlns:cx5=&quot;http://schemas.microsoft.com/office/drawing/2016/5/11/chartex&quot; xmlns:cx6=&quot;http://schemas.microsoft.com/office/drawing/2016/5/12/chartex&quot; xmlns:cx7=&quot;http://schemas.microsoft.com/office/drawing/2016/5/13/chartex&quot; xmlns:cx8=&quot;http://schemas.microsoft.com/office/drawing/2016/5/14/chartex&quot; xmlns:cr=&quot;http://schemas.microsoft.com/office/comments/2020/reactions&quot; xmlns:dt=&quot;uuid:C2F41010-65B3-11d1-A29F-00AA00C14882&quot; xmlns:mc=&quot;http://schemas.openxmlformats.org/markup-compatibility/2006&quot; xmlns:aink=&quot;http://schemas.microsoft.com/office/drawing/2016/ink&quot; xmlns:am3d=&quot;http://schemas.microsoft.com/office/drawing/2017/model3d&quot; xmlns:o=&quot;urn:schemas-microsoft-com:office:office&quot; xmlns:oel=&quot;http://schemas.microsoft.com/office/2019/extlst&quot; xmlns:m=&quot;http://schemas.openxmlformats.org/officeDocument/2006/math&quot; xmlns:v=&quot;urn:schemas-microsoft-com:vml&quot; xmlns:w10=&quot;urn:schemas-microsoft-com:office:word&quot; xmlns:w=&quot;http://schemas.microsoft.com/office/word/2003/wordml&quot; xmlns:wx=&quot;http://schemas.microsoft.com/office/word/2003/auxHint&quot; xmlns:wne=&quot;http://schemas.microsoft.com/office/word/2006/wordml&quot; xmlns:wsp=&quot;http://schemas.microsoft.com/office/word/2003/wordml/sp2&quot; xmlns:sl=&quot;http://schemas.microsoft.com/schemaLibrary/2003/core&quot; w:macrosPresent=&quot;no&quot; w:embeddedObjPresent=&quot;no&quot; w:ocxPresent=&quot;no&quot; xml:space=&quot;preserve&quot;&gt;&lt;w:ignoreSubtree w:val=&quot;http://schemas.microsoft.com/office/word/2003/wordml/sp2&quot;/&gt;&lt;o:DocumentProperties&gt;&lt;o:Version&gt;16&lt;/o:Version&gt;&lt;/o:DocumentProperties&gt;&lt;w:docPr&gt;&lt;w:view w:val=&quot;print&quot;/&gt;&lt;w:zoom w:percent=&quot;100&quot;/&gt;&lt;w:doNotEmbedSystemFonts/&gt;&lt;w:activeWritingStyle w:lang=&quot;EN-AU&quot; w:vendorID=&quot;64&quot; w:dllVersion=&quot;6&quot; w:nlCheck=&quot;on&quot; w:optionSet=&quot;1&quot;/&gt;&lt;w:activeWritingStyle w:lang=&quot;EN-GB&quot; w:vendorID=&quot;64&quot; w:dllVersion=&quot;6&quot; w:nlCheck=&quot;on&quot; w:optionSet=&quot;1&quot;/&gt;&lt;w:activeWritingStyle w:lang=&quot;EN-US&quot; w:vendorID=&quot;64&quot; w:dllVersion=&quot;6&quot; w:nlCheck=&quot;on&quot; w:optionSet=&quot;1&quot;/&gt;&lt;w:activeWritingStyle w:lang=&quot;EN-AU&quot; w:vendorID=&quot;64&quot; w:dllVersion=&quot;0&quot; w:nlCheck=&quot;on&quot; w:optionSet=&quot;0&quot;/&gt;&lt;w:activeWritingStyle w:lang=&quot;EN-GB&quot; w:vendorID=&quot;64&quot; w:dllVersion=&quot;0&quot; w:nlCheck=&quot;on&quot; w:optionSet=&quot;0&quot;/&gt;&lt;w:activeWritingStyle w:lang=&quot;EN-US&quot; w:vendorID=&quot;64&quot; w:dllVersion=&quot;0&quot; w:nlCheck=&quot;on&quot; w:optionSet=&quot;0&quot;/&gt;&lt;w:activeWritingStyle w:lang=&quot;ES-AR&quot; w:vendorID=&quot;64&quot; w:dllVersion=&quot;0&quot; w:nlCheck=&quot;on&quot; w:optionSet=&quot;0&quot;/&gt;&lt;w:activeWritingStyle w:lang=&quot;580A&quot; w:vendorID=&quot;64&quot; w:dllVersion=&quot;0&quot; w:nlCheck=&quot;on&quot; w:optionSet=&quot;0&quot;/&gt;&lt;w:activeWritingStyle w:lang=&quot;PT-BR&quot; w:vendorID=&quot;64&quot; w:dllVersion=&quot;0&quot; w:nlCheck=&quot;on&quot; w:optionSet=&quot;0&quot;/&gt;&lt;w:stylePaneFormatFilter w:val=&quot;3F01&quot;/&gt;&lt;w:defaultTabStop w:val=&quot;720&quot;/&gt;&lt;w:hyphenationZone w:val=&quot;425&quot;/&gt;&lt;w:characterSpacingControl w:val=&quot;DontCompress&quot;/&gt;&lt;w:optimizeForBrowser/&gt;&lt;w:validateAgainstSchema/&gt;&lt;w:saveInvalidXML w:val=&quot;off&quot;/&gt;&lt;w:ignoreMixedContent w:val=&quot;off&quot;/&gt;&lt;w:alwaysShowPlaceholderText w:val=&quot;off&quot;/&gt;&lt;w:compat&gt;&lt;w:breakWrappedTables/&gt;&lt;w:snapToGridInCell/&gt;&lt;w:applyBreakingRules/&gt;&lt;w:wrapTextWithPunct/&gt;&lt;w:useAsianBreakRules/&gt;&lt;w:useWord2002TableStyleRules/&gt;&lt;w:useFELayout/&gt;&lt;/w:compat&gt;&lt;wsp:rsids&gt;&lt;wsp:rsidRoot wsp:val=&quot;00426FBB&quot;/&gt;&lt;wsp:rsid wsp:val=&quot;000002E1&quot;/&gt;&lt;wsp:rsid wsp:val=&quot;00003C97&quot;/&gt;&lt;wsp:rsid wsp:val=&quot;00005565&quot;/&gt;&lt;wsp:rsid wsp:val=&quot;0001754A&quot;/&gt;&lt;wsp:rsid wsp:val=&quot;00017719&quot;/&gt;&lt;wsp:rsid wsp:val=&quot;00027F1D&quot;/&gt;&lt;wsp:rsid wsp:val=&quot;0003296C&quot;/&gt;&lt;wsp:rsid wsp:val=&quot;0003351F&quot;/&gt;&lt;wsp:rsid wsp:val=&quot;00044599&quot;/&gt;&lt;wsp:rsid wsp:val=&quot;000540E6&quot;/&gt;&lt;wsp:rsid wsp:val=&quot;00054421&quot;/&gt;&lt;wsp:rsid wsp:val=&quot;00062E46&quot;/&gt;&lt;wsp:rsid wsp:val=&quot;00074AC8&quot;/&gt;&lt;wsp:rsid wsp:val=&quot;00081408&quot;/&gt;&lt;wsp:rsid wsp:val=&quot;00081EBE&quot;/&gt;&lt;wsp:rsid wsp:val=&quot;00086EDC&quot;/&gt;&lt;wsp:rsid wsp:val=&quot;000B1236&quot;/&gt;&lt;wsp:rsid wsp:val=&quot;000B36A3&quot;/&gt;&lt;wsp:rsid wsp:val=&quot;000C013C&quot;/&gt;&lt;wsp:rsid wsp:val=&quot;000E3F84&quot;/&gt;&lt;wsp:rsid wsp:val=&quot;001056DF&quot;/&gt;&lt;wsp:rsid wsp:val=&quot;0010789C&quot;/&gt;&lt;wsp:rsid wsp:val=&quot;00114025&quot;/&gt;&lt;wsp:rsid wsp:val=&quot;001160D2&quot;/&gt;&lt;wsp:rsid wsp:val=&quot;00120636&quot;/&gt;&lt;wsp:rsid wsp:val=&quot;001348A5&quot;/&gt;&lt;wsp:rsid wsp:val=&quot;00151B8E&quot;/&gt;&lt;wsp:rsid wsp:val=&quot;00182170&quot;/&gt;&lt;wsp:rsid wsp:val=&quot;001928FB&quot;/&gt;&lt;wsp:rsid wsp:val=&quot;00192BC7&quot;/&gt;&lt;wsp:rsid wsp:val=&quot;00195BE6&quot;/&gt;&lt;wsp:rsid wsp:val=&quot;001A3C37&quot;/&gt;&lt;wsp:rsid wsp:val=&quot;001A50EA&quot;/&gt;&lt;wsp:rsid wsp:val=&quot;001C3BEF&quot;/&gt;&lt;wsp:rsid wsp:val=&quot;001F16CD&quot;/&gt;&lt;wsp:rsid wsp:val=&quot;001F47D2&quot;/&gt;&lt;wsp:rsid wsp:val=&quot;002029C8&quot;/&gt;&lt;wsp:rsid wsp:val=&quot;0022285A&quot;/&gt;&lt;wsp:rsid wsp:val=&quot;00224C61&quot;/&gt;&lt;wsp:rsid wsp:val=&quot;00256ABC&quot;/&gt;&lt;wsp:rsid wsp:val=&quot;0027227B&quot;/&gt;&lt;wsp:rsid wsp:val=&quot;00273AC7&quot;/&gt;&lt;wsp:rsid wsp:val=&quot;00273D2C&quot;/&gt;&lt;wsp:rsid wsp:val=&quot;00285ECD&quot;/&gt;&lt;wsp:rsid wsp:val=&quot;00290E1B&quot;/&gt;&lt;wsp:rsid wsp:val=&quot;00291B17&quot;/&gt;&lt;wsp:rsid wsp:val=&quot;00291BB3&quot;/&gt;&lt;wsp:rsid wsp:val=&quot;002A6742&quot;/&gt;&lt;wsp:rsid wsp:val=&quot;002C1A7F&quot;/&gt;&lt;wsp:rsid wsp:val=&quot;002C4239&quot;/&gt;&lt;wsp:rsid wsp:val=&quot;002C559D&quot;/&gt;&lt;wsp:rsid wsp:val=&quot;002D16AE&quot;/&gt;&lt;wsp:rsid wsp:val=&quot;002D2D42&quot;/&gt;&lt;wsp:rsid wsp:val=&quot;002F72D0&quot;/&gt;&lt;wsp:rsid wsp:val=&quot;002F7A4F&quot;/&gt;&lt;wsp:rsid wsp:val=&quot;003003AB&quot;/&gt;&lt;wsp:rsid wsp:val=&quot;00302C35&quot;/&gt;&lt;wsp:rsid wsp:val=&quot;00311C49&quot;/&gt;&lt;wsp:rsid wsp:val=&quot;0032119E&quot;/&gt;&lt;wsp:rsid wsp:val=&quot;00321304&quot;/&gt;&lt;wsp:rsid wsp:val=&quot;00324FC2&quot;/&gt;&lt;wsp:rsid wsp:val=&quot;003312CA&quot;/&gt;&lt;wsp:rsid wsp:val=&quot;00331F84&quot;/&gt;&lt;wsp:rsid wsp:val=&quot;003329D6&quot;/&gt;&lt;wsp:rsid wsp:val=&quot;0037721F&quot;/&gt;&lt;wsp:rsid wsp:val=&quot;003950A4&quot;/&gt;&lt;wsp:rsid wsp:val=&quot;003A1E7E&quot;/&gt;&lt;wsp:rsid wsp:val=&quot;003E2FDC&quot;/&gt;&lt;wsp:rsid wsp:val=&quot;003E3577&quot;/&gt;&lt;wsp:rsid wsp:val=&quot;003F3A61&quot;/&gt;&lt;wsp:rsid wsp:val=&quot;00410A5D&quot;/&gt;&lt;wsp:rsid wsp:val=&quot;00414909&quot;/&gt;&lt;wsp:rsid wsp:val=&quot;00416537&quot;/&gt;&lt;wsp:rsid wsp:val=&quot;00425A6A&quot;/&gt;&lt;wsp:rsid wsp:val=&quot;00426FBB&quot;/&gt;&lt;wsp:rsid wsp:val=&quot;00454542&quot;/&gt;&lt;wsp:rsid wsp:val=&quot;0047429A&quot;/&gt;&lt;wsp:rsid wsp:val=&quot;0048374C&quot;/&gt;&lt;wsp:rsid wsp:val=&quot;0048771D&quot;/&gt;&lt;wsp:rsid wsp:val=&quot;004A6605&quot;/&gt;&lt;wsp:rsid wsp:val=&quot;004C45FA&quot;/&gt;&lt;wsp:rsid wsp:val=&quot;004D35A3&quot;/&gt;&lt;wsp:rsid wsp:val=&quot;004E1BD8&quot;/&gt;&lt;wsp:rsid wsp:val=&quot;004E452A&quot;/&gt;&lt;wsp:rsid wsp:val=&quot;004E78E3&quot;/&gt;&lt;wsp:rsid wsp:val=&quot;004F2BFE&quot;/&gt;&lt;wsp:rsid wsp:val=&quot;004F63D3&quot;/&gt;&lt;wsp:rsid wsp:val=&quot;004F7DCF&quot;/&gt;&lt;wsp:rsid wsp:val=&quot;005004BF&quot;/&gt;&lt;wsp:rsid wsp:val=&quot;00502E89&quot;/&gt;&lt;wsp:rsid wsp:val=&quot;00506CFE&quot;/&gt;&lt;wsp:rsid wsp:val=&quot;00510E95&quot;/&gt;&lt;wsp:rsid wsp:val=&quot;005225C3&quot;/&gt;&lt;wsp:rsid wsp:val=&quot;00527D56&quot;/&gt;&lt;wsp:rsid wsp:val=&quot;0053221F&quot;/&gt;&lt;wsp:rsid wsp:val=&quot;00536FAE&quot;/&gt;&lt;wsp:rsid wsp:val=&quot;00542C85&quot;/&gt;&lt;wsp:rsid wsp:val=&quot;00553510&quot;/&gt;&lt;wsp:rsid wsp:val=&quot;00554186&quot;/&gt;&lt;wsp:rsid wsp:val=&quot;00585769&quot;/&gt;&lt;wsp:rsid wsp:val=&quot;00585C61&quot;/&gt;&lt;wsp:rsid wsp:val=&quot;00591130&quot;/&gt;&lt;wsp:rsid wsp:val=&quot;005A3F28&quot;/&gt;&lt;wsp:rsid wsp:val=&quot;005A40BE&quot;/&gt;&lt;wsp:rsid wsp:val=&quot;005B13E2&quot;/&gt;&lt;wsp:rsid wsp:val=&quot;005B47D7&quot;/&gt;&lt;wsp:rsid wsp:val=&quot;005C5526&quot;/&gt;&lt;wsp:rsid wsp:val=&quot;005C62C6&quot;/&gt;&lt;wsp:rsid wsp:val=&quot;005D7B9E&quot;/&gt;&lt;wsp:rsid wsp:val=&quot;005E112E&quot;/&gt;&lt;wsp:rsid wsp:val=&quot;005F0834&quot;/&gt;&lt;wsp:rsid wsp:val=&quot;005F68AB&quot;/&gt;&lt;wsp:rsid wsp:val=&quot;005F6DC3&quot;/&gt;&lt;wsp:rsid wsp:val=&quot;00601A8E&quot;/&gt;&lt;wsp:rsid wsp:val=&quot;0062033E&quot;/&gt;&lt;wsp:rsid wsp:val=&quot;00624482&quot;/&gt;&lt;wsp:rsid wsp:val=&quot;0064799C&quot;/&gt;&lt;wsp:rsid wsp:val=&quot;00654156&quot;/&gt;&lt;wsp:rsid wsp:val=&quot;00656ADC&quot;/&gt;&lt;wsp:rsid wsp:val=&quot;006B47CA&quot;/&gt;&lt;wsp:rsid wsp:val=&quot;006C304C&quot;/&gt;&lt;wsp:rsid wsp:val=&quot;006C4511&quot;/&gt;&lt;wsp:rsid wsp:val=&quot;006C65F5&quot;/&gt;&lt;wsp:rsid wsp:val=&quot;006C7AAA&quot;/&gt;&lt;wsp:rsid wsp:val=&quot;006D1C2A&quot;/&gt;&lt;wsp:rsid wsp:val=&quot;006D264F&quot;/&gt;&lt;wsp:rsid wsp:val=&quot;006D4E89&quot;/&gt;&lt;wsp:rsid wsp:val=&quot;006E2A8D&quot;/&gt;&lt;wsp:rsid wsp:val=&quot;006E7574&quot;/&gt;&lt;wsp:rsid wsp:val=&quot;00703430&quot;/&gt;&lt;wsp:rsid wsp:val=&quot;00703548&quot;/&gt;&lt;wsp:rsid wsp:val=&quot;00704E18&quot;/&gt;&lt;wsp:rsid wsp:val=&quot;007069BE&quot;/&gt;&lt;wsp:rsid wsp:val=&quot;00745C86&quot;/&gt;&lt;wsp:rsid wsp:val=&quot;00764603&quot;/&gt;&lt;wsp:rsid wsp:val=&quot;0076604D&quot;/&gt;&lt;wsp:rsid wsp:val=&quot;00790909&quot;/&gt;&lt;wsp:rsid wsp:val=&quot;007929AF&quot;/&gt;&lt;wsp:rsid wsp:val=&quot;007B1582&quot;/&gt;&lt;wsp:rsid wsp:val=&quot;007B5A07&quot;/&gt;&lt;wsp:rsid wsp:val=&quot;007C065D&quot;/&gt;&lt;wsp:rsid wsp:val=&quot;007D3E71&quot;/&gt;&lt;wsp:rsid wsp:val=&quot;007E5D6A&quot;/&gt;&lt;wsp:rsid wsp:val=&quot;007E645D&quot;/&gt;&lt;wsp:rsid wsp:val=&quot;007F75CA&quot;/&gt;&lt;wsp:rsid wsp:val=&quot;00821E08&quot;/&gt;&lt;wsp:rsid wsp:val=&quot;00834EFD&quot;/&gt;&lt;wsp:rsid wsp:val=&quot;00844B24&quot;/&gt;&lt;wsp:rsid wsp:val=&quot;0084515F&quot;/&gt;&lt;wsp:rsid wsp:val=&quot;0085092D&quot;/&gt;&lt;wsp:rsid wsp:val=&quot;00865414&quot;/&gt;&lt;wsp:rsid wsp:val=&quot;00877D4C&quot;/&gt;&lt;wsp:rsid wsp:val=&quot;008831DC&quot;/&gt;&lt;wsp:rsid wsp:val=&quot;00883903&quot;/&gt;&lt;wsp:rsid wsp:val=&quot;00891C30&quot;/&gt;&lt;wsp:rsid wsp:val=&quot;00897219&quot;/&gt;&lt;wsp:rsid wsp:val=&quot;0089763B&quot;/&gt;&lt;wsp:rsid wsp:val=&quot;008B6AE3&quot;/&gt;&lt;wsp:rsid wsp:val=&quot;008C1332&quot;/&gt;&lt;wsp:rsid wsp:val=&quot;008D1045&quot;/&gt;&lt;wsp:rsid wsp:val=&quot;008E5996&quot;/&gt;&lt;wsp:rsid wsp:val=&quot;00901AE1&quot;/&gt;&lt;wsp:rsid wsp:val=&quot;00912F93&quot;/&gt;&lt;wsp:rsid wsp:val=&quot;009205B4&quot;/&gt;&lt;wsp:rsid wsp:val=&quot;00955B59&quot;/&gt;&lt;wsp:rsid wsp:val=&quot;00992262&quot;/&gt;&lt;wsp:rsid wsp:val=&quot;009926BC&quot;/&gt;&lt;wsp:rsid wsp:val=&quot;009A4319&quot;/&gt;&lt;wsp:rsid wsp:val=&quot;009A6C3F&quot;/&gt;&lt;wsp:rsid wsp:val=&quot;009B73F2&quot;/&gt;&lt;wsp:rsid wsp:val=&quot;009C12BD&quot;/&gt;&lt;wsp:rsid wsp:val=&quot;009C50FE&quot;/&gt;&lt;wsp:rsid wsp:val=&quot;009E49DD&quot;/&gt;&lt;wsp:rsid wsp:val=&quot;00A03E75&quot;/&gt;&lt;wsp:rsid wsp:val=&quot;00A20627&quot;/&gt;&lt;wsp:rsid wsp:val=&quot;00A22FE9&quot;/&gt;&lt;wsp:rsid wsp:val=&quot;00A31A44&quot;/&gt;&lt;wsp:rsid wsp:val=&quot;00A32BFA&quot;/&gt;&lt;wsp:rsid wsp:val=&quot;00A3325E&quot;/&gt;&lt;wsp:rsid wsp:val=&quot;00A45FCE&quot;/&gt;&lt;wsp:rsid wsp:val=&quot;00A75671&quot;/&gt;&lt;wsp:rsid wsp:val=&quot;00A773CC&quot;/&gt;&lt;wsp:rsid wsp:val=&quot;00A924D0&quot;/&gt;&lt;wsp:rsid wsp:val=&quot;00A9318B&quot;/&gt;&lt;wsp:rsid wsp:val=&quot;00A94AC1&quot;/&gt;&lt;wsp:rsid wsp:val=&quot;00AB18B7&quot;/&gt;&lt;wsp:rsid wsp:val=&quot;00AD335D&quot;/&gt;&lt;wsp:rsid wsp:val=&quot;00AF114C&quot;/&gt;&lt;wsp:rsid wsp:val=&quot;00AF792B&quot;/&gt;&lt;wsp:rsid wsp:val=&quot;00B32137&quot;/&gt;&lt;wsp:rsid wsp:val=&quot;00B33D2F&quot;/&gt;&lt;wsp:rsid wsp:val=&quot;00B40A5B&quot;/&gt;&lt;wsp:rsid wsp:val=&quot;00B45C6B&quot;/&gt;&lt;wsp:rsid wsp:val=&quot;00B55D5E&quot;/&gt;&lt;wsp:rsid wsp:val=&quot;00B57A80&quot;/&gt;&lt;wsp:rsid wsp:val=&quot;00B70E9C&quot;/&gt;&lt;wsp:rsid wsp:val=&quot;00B713D8&quot;/&gt;&lt;wsp:rsid wsp:val=&quot;00B72979&quot;/&gt;&lt;wsp:rsid wsp:val=&quot;00B94516&quot;/&gt;&lt;wsp:rsid wsp:val=&quot;00BA25E2&quot;/&gt;&lt;wsp:rsid wsp:val=&quot;00BB2855&quot;/&gt;&lt;wsp:rsid wsp:val=&quot;00BC5343&quot;/&gt;&lt;wsp:rsid wsp:val=&quot;00BD19C1&quot;/&gt;&lt;wsp:rsid wsp:val=&quot;00BD25B8&quot;/&gt;&lt;wsp:rsid wsp:val=&quot;00C012E1&quot;/&gt;&lt;wsp:rsid wsp:val=&quot;00C06BB4&quot;/&gt;&lt;wsp:rsid wsp:val=&quot;00C10D20&quot;/&gt;&lt;wsp:rsid wsp:val=&quot;00C12E0C&quot;/&gt;&lt;wsp:rsid wsp:val=&quot;00C21916&quot;/&gt;&lt;wsp:rsid wsp:val=&quot;00C34915&quot;/&gt;&lt;wsp:rsid wsp:val=&quot;00C457CA&quot;/&gt;&lt;wsp:rsid wsp:val=&quot;00C53FB6&quot;/&gt;&lt;wsp:rsid wsp:val=&quot;00C57FB7&quot;/&gt;&lt;wsp:rsid wsp:val=&quot;00C644D4&quot;/&gt;&lt;wsp:rsid wsp:val=&quot;00C65F3F&quot;/&gt;&lt;wsp:rsid wsp:val=&quot;00C72414&quot;/&gt;&lt;wsp:rsid wsp:val=&quot;00C72B1A&quot;/&gt;&lt;wsp:rsid wsp:val=&quot;00C8667B&quot;/&gt;&lt;wsp:rsid wsp:val=&quot;00C90993&quot;/&gt;&lt;wsp:rsid wsp:val=&quot;00CA4CE3&quot;/&gt;&lt;wsp:rsid wsp:val=&quot;00CC72FD&quot;/&gt;&lt;wsp:rsid wsp:val=&quot;00CD1D23&quot;/&gt;&lt;wsp:rsid wsp:val=&quot;00CD4F3F&quot;/&gt;&lt;wsp:rsid wsp:val=&quot;00D311F8&quot;/&gt;&lt;wsp:rsid wsp:val=&quot;00D31660&quot;/&gt;&lt;wsp:rsid wsp:val=&quot;00D36B52&quot;/&gt;&lt;wsp:rsid wsp:val=&quot;00D377C8&quot;/&gt;&lt;wsp:rsid wsp:val=&quot;00D41274&quot;/&gt;&lt;wsp:rsid wsp:val=&quot;00D4229C&quot;/&gt;&lt;wsp:rsid wsp:val=&quot;00D43BF3&quot;/&gt;&lt;wsp:rsid wsp:val=&quot;00D549FB&quot;/&gt;&lt;wsp:rsid wsp:val=&quot;00D56487&quot;/&gt;&lt;wsp:rsid wsp:val=&quot;00D767BB&quot;/&gt;&lt;wsp:rsid wsp:val=&quot;00D939B0&quot;/&gt;&lt;wsp:rsid wsp:val=&quot;00DA31A2&quot;/&gt;&lt;wsp:rsid wsp:val=&quot;00DB16E0&quot;/&gt;&lt;wsp:rsid wsp:val=&quot;00DB2DF9&quot;/&gt;&lt;wsp:rsid wsp:val=&quot;00DB465D&quot;/&gt;&lt;wsp:rsid wsp:val=&quot;00DB48A2&quot;/&gt;&lt;wsp:rsid wsp:val=&quot;00DB7E63&quot;/&gt;&lt;wsp:rsid wsp:val=&quot;00DC2055&quot;/&gt;&lt;wsp:rsid wsp:val=&quot;00DC3908&quot;/&gt;&lt;wsp:rsid wsp:val=&quot;00DD71E8&quot;/&gt;&lt;wsp:rsid wsp:val=&quot;00DD7F83&quot;/&gt;&lt;wsp:rsid wsp:val=&quot;00DE4EB8&quot;/&gt;&lt;wsp:rsid wsp:val=&quot;00E0641E&quot;/&gt;&lt;wsp:rsid wsp:val=&quot;00E06664&quot;/&gt;&lt;wsp:rsid wsp:val=&quot;00E304BC&quot;/&gt;&lt;wsp:rsid wsp:val=&quot;00E32853&quot;/&gt;&lt;wsp:rsid wsp:val=&quot;00E34EBD&quot;/&gt;&lt;wsp:rsid wsp:val=&quot;00E401F8&quot;/&gt;&lt;wsp:rsid wsp:val=&quot;00E46425&quot;/&gt;&lt;wsp:rsid wsp:val=&quot;00E469FC&quot;/&gt;&lt;wsp:rsid wsp:val=&quot;00E47D0E&quot;/&gt;&lt;wsp:rsid wsp:val=&quot;00E65018&quot;/&gt;&lt;wsp:rsid wsp:val=&quot;00E76CA1&quot;/&gt;&lt;wsp:rsid wsp:val=&quot;00E94339&quot;/&gt;&lt;wsp:rsid wsp:val=&quot;00E97563&quot;/&gt;&lt;wsp:rsid wsp:val=&quot;00EB0B63&quot;/&gt;&lt;wsp:rsid wsp:val=&quot;00EC265C&quot;/&gt;&lt;wsp:rsid wsp:val=&quot;00ED61CB&quot;/&gt;&lt;wsp:rsid wsp:val=&quot;00EE752A&quot;/&gt;&lt;wsp:rsid wsp:val=&quot;00F06A72&quot;/&gt;&lt;wsp:rsid wsp:val=&quot;00F136F0&quot;/&gt;&lt;wsp:rsid wsp:val=&quot;00F20BBB&quot;/&gt;&lt;wsp:rsid wsp:val=&quot;00F36048&quot;/&gt;&lt;wsp:rsid wsp:val=&quot;00F43BD8&quot;/&gt;&lt;wsp:rsid wsp:val=&quot;00F562F3&quot;/&gt;&lt;wsp:rsid wsp:val=&quot;00F74B89&quot;/&gt;&lt;wsp:rsid wsp:val=&quot;00F75133&quot;/&gt;&lt;wsp:rsid wsp:val=&quot;00F83272&quot;/&gt;&lt;wsp:rsid wsp:val=&quot;00F9358D&quot;/&gt;&lt;wsp:rsid wsp:val=&quot;00F9369B&quot;/&gt;&lt;wsp:rsid wsp:val=&quot;00FA3899&quot;/&gt;&lt;wsp:rsid wsp:val=&quot;00FA4909&quot;/&gt;&lt;wsp:rsid wsp:val=&quot;00FA5164&quot;/&gt;&lt;wsp:rsid wsp:val=&quot;00FA6751&quot;/&gt;&lt;wsp:rsid wsp:val=&quot;00FA6BD7&quot;/&gt;&lt;wsp:rsid wsp:val=&quot;00FB1048&quot;/&gt;&lt;wsp:rsid wsp:val=&quot;00FB62C4&quot;/&gt;&lt;wsp:rsid wsp:val=&quot;00FB7701&quot;/&gt;&lt;wsp:rsid wsp:val=&quot;00FD1AC5&quot;/&gt;&lt;wsp:rsid wsp:val=&quot;00FD5CF0&quot;/&gt;&lt;/wsp:rsids&gt;&lt;/w:docPr&gt;&lt;w:body&gt;&lt;wx:sect&gt;&lt;w:p wsp:rsidR=&quot;001C3BEF&quot; wsp:rsidRPr=&quot;001C3BEF&quot; wsp:rsidRDefault=&quot;001C3BEF&quot; wsp:rsidP=&quot;001C3BEF&quot;&gt;&lt;m:oMathPara&gt;&lt;m:oMath&gt;&lt;m:sSub&gt;&lt;m:sSubPr&gt;&lt;m:ctrlPr&gt;&lt;w:rPr&gt;&lt;w:rFonts w:ascii=&quot;Cambria Math&quot; w:h-ansi=&quot;Cambria Math&quot;/&gt;&lt;wx:font wx:val=&quot;Cambria Math&quot;/&gt;&lt;w:i/&gt;&lt;/w:rPr&gt;&lt;/m:ctrlPr&gt;&lt;/m:sSubPr&gt;&lt;m:e&gt;&lt;m:r&gt;&lt;w:rPr&gt;&lt;w:rFonts w:ascii=&quot;Cambria Math&quot; w:h-ansi=&quot;Cambria Math&quot;/&gt;&lt;wx:font wx:val=&quot;Cambria Math&quot;/&gt;&lt;w:i/&gt;&lt;/w:rPr&gt;&lt;m:t&gt;C&lt;/m:t&gt;&lt;/m:r&gt;&lt;/m:e&gt;&lt;m:sub&gt;&lt;m:r&gt;&lt;w:rPr&gt;&lt;w:rFonts w:ascii=&quot;Cambria Math&quot; w:h-ansi=&quot;Cambria Math&quot;/&gt;&lt;wx:font wx:val=&quot;Cambria Math&quot;/&gt;&lt;w:i/&gt;&lt;/w:rPr&gt;&lt;m:t&gt;o&lt;/m:t&gt;&lt;/m:r&gt;&lt;/m:sub&gt;&lt;/m:sSub&gt;&lt;m:r&gt;&lt;w:rPr&gt;&lt;w:rFonts w:ascii=&quot;Cambria Math&quot; w:h-ansi=&quot;Cambria Math&quot;/&gt;&lt;wx:font wx:val=&quot;Cambria Math&quot;/&gt;&lt;w:i/&gt;&lt;/w:rPr&gt;&lt;m:t&gt;=&lt;/m:t&gt;&lt;/m:r&gt;&lt;m:f&gt;&lt;m:fPr&gt;&lt;m:ctrlPr&gt;&lt;w:rPr&gt;&lt;w:rFonts w:ascii=&quot;Cambria Math&quot; w:h-ansi=&quot;Cambria Math&quot;/&gt;&lt;wx:font wx:val=&quot;Cambria Math&quot;/&gt;&lt;w:i/&gt;&lt;/w:rPr&gt;&lt;/m:ctrlPr&gt;&lt;/m:fPr&gt;&lt;m:num&gt;&lt;m:sSub&gt;&lt;m:sSubPr&gt;&lt;m:ctrlPr&gt;&lt;w:rPr&gt;&lt;w:rFonts w:ascii=&quot;Cambria Math&quot; w:h-ansi=&quot;Cambria Math&quot;/&gt;&lt;wx:font wx:val=&quot;Cambria Math&quot;/&gt;&lt;w:i/&gt;&lt;/w:rPr&gt;&lt;/m:ctrlPr&gt;&lt;/m:sSubPr&gt;&lt;m:e&gt;&lt;m:r&gt;&lt;w:rPr&gt;&lt;w:rFonts w:ascii=&quot;Cambria Math&quot; w:h-ansi=&quot;Cambria Math&quot;/&gt;&lt;wx:font wx:val=&quot;Cambria Math&quot;/&gt;&lt;w:i/&gt;&lt;/w:rPr&gt;&lt;m:t&gt;I&lt;/m:t&gt;&lt;/m:r&gt;&lt;/m:e&gt;&lt;m:sub&gt;&lt;m:r&gt;&lt;w:rPr&gt;&lt;w:rFonts w:ascii=&quot;Cambria Math&quot; w:h-ansi=&quot;Cambria Math&quot;/&gt;&lt;wx:font wx:val=&quot;Cambria Math&quot;/&gt;&lt;w:i/&gt;&lt;/w:rPr&gt;&lt;m:t&gt;pk&lt;/m:t&gt;&lt;/m:r&gt;&lt;m:d&gt;&lt;m:dPr&gt;&lt;m:ctrlPr&gt;&lt;w:rPr&gt;&lt;w:rFonts w:ascii=&quot;Cambria Math&quot; w:h-ansi=&quot;Cambria Math&quot;/&gt;&lt;wx:font wx:val=&quot;Cambria Math&quot;/&gt;&lt;w:i/&gt;&lt;/w:rPr&gt;&lt;/m:ctrlPr&gt;&lt;/m:dPr&gt;&lt;m:e&gt;&lt;m:r&gt;&lt;w:rPr&gt;&lt;w:rFonts w:ascii=&quot;Cambria Math&quot; w:h-ansi=&quot;Cambria Math&quot;/&gt;&lt;wx:font wx:val=&quot;Cambria Math&quot;/&gt;&lt;w:i/&gt;&lt;/w:rPr&gt;&lt;m:t&gt;switch&lt;/m:t&gt;&lt;/m:r&gt;&lt;/m:e&gt;&lt;/m:d&gt;&lt;/m:sub&gt;&lt;/m:sSub&gt;&lt;m:d&gt;&lt;m:dPr&gt;&lt;m:ctrlPr&gt;&lt;w:rPr&gt;&lt;w:rFonts w:ascii=&quot;Cambria Math&quot; w:h-ansi=&quot;Cambria Math&quot;/&gt;&lt;wx:font wx:val=&quot;Cambria Math&quot;/&gt;&lt;w:i/&gt;&lt;/w:rPr&gt;&lt;/m:ctrlPr&gt;&lt;/m:dPr&gt;&lt;m:e&gt;&lt;m:sSub&gt;&lt;m:sSubPr&gt;&lt;m:ctrlPr&gt;&lt;w:rPr&gt;&lt;w:rFonts w:ascii=&quot;Cambria Math&quot; w:h-ansi=&quot;Cambria Math&quot;/&gt;&lt;wx:font wx:val=&quot;Cambria Math&quot;/&gt;&lt;w:i/&gt;&lt;/w:rPr&gt;&lt;/m:ctrlPr&gt;&lt;/m:sSubPr&gt;&lt;m:e&gt;&lt;m:r&gt;&lt;w:rPr&gt;&lt;w:rFonts w:ascii=&quot;Cambria Math&quot; w:h-ansi=&quot;Cambria Math&quot;/&gt;&lt;wx:font wx:val=&quot;Cambria Math&quot;/&gt;&lt;w:i/&gt;&lt;/w:rPr&gt;&lt;m:t&gt;t&lt;/m:t&gt;&lt;/m:r&gt;&lt;/m:e&gt;&lt;m:sub&gt;&lt;m:r&gt;&lt;w:rPr&gt;&lt;w:rFonts w:ascii=&quot;Cambria Math&quot; w:h-ansi=&quot;Cambria Math&quot;/&gt;&lt;wx:font wx:val=&quot;Cambria Math&quot;/&gt;&lt;w:i/&gt;&lt;/w:rPr&gt;&lt;m:t&gt;on&lt;/m:t&gt;&lt;/m:r&gt;&lt;/m:sub&gt;&lt;/m:sSub&gt;&lt;m:r&gt;&lt;w:rPr&gt;&lt;w:rFonts w:ascii=&quot;Cambria Math&quot; w:h-ansi=&quot;Cambria Math&quot;/&gt;&lt;wx:font wx:val=&quot;Cambria Math&quot;/&gt;&lt;w:i/&gt;&lt;/w:rPr&gt;&lt;m:t&gt;+&lt;/m:t&gt;&lt;/m:r&gt;&lt;m:sSub&gt;&lt;m:sSubPr&gt;&lt;m:ctrlPr&gt;&lt;w:rPr&gt;&lt;w:rFonts w:ascii=&quot;Cambria Math&quot; w:h-ansi=&quot;Cambria Math&quot;/&gt;&lt;wx:font wx:val=&quot;Cambria Math&quot;/&gt;&lt;w:i/&gt;&lt;/w:rPr&gt;&lt;/m:ctrlPr&gt;&lt;/m:sSubPr&gt;&lt;m:e&gt;&lt;m:r&gt;&lt;w:rPr&gt;&lt;w:rFonts w:ascii=&quot;Cambria Math&quot; w:h-ansi=&quot;Cambria Math&quot;/&gt;&lt;wx:font wx:val=&quot;Cambria Math&quot;/&gt;&lt;w:i/&gt;&lt;/w:rPr&gt;&lt;m:t&gt;t&lt;/m:t&gt;&lt;/m:r&gt;&lt;/m:e&gt;&lt;m:sub&gt;&lt;m:r&gt;&lt;w:rPr&gt;&lt;w:rFonts w:ascii=&quot;Cambria Math&quot; w:h-ansi=&quot;Cambria Math&quot;/&gt;&lt;wx:font wx:val=&quot;Cambria Math&quot;/&gt;&lt;w:i/&gt;&lt;/w:rPr&gt;&lt;m:t&gt;off&lt;/m:t&gt;&lt;/m:r&gt;&lt;/m:sub&gt;&lt;/m:sSub&gt;&lt;/m:e&gt;&lt;/m:d&gt;&lt;/m:num&gt;&lt;m:den&gt;&lt;m:r&gt;&lt;w:rPr&gt;&lt;w:rFonts w:ascii=&quot;Cambria Math&quot; w:h-ansi=&quot;Cambria Math&quot;/&gt;&lt;wx:font wx:val=&quot;Cambria Math&quot;/&gt;&lt;w:i/&gt;&lt;/w:rPr&gt;&lt;m:t&gt;8âˆ™&lt;/m:t&gt;&lt;/m:r&gt;&lt;m:r&gt;&lt;m:rPr&gt;&lt;m:sty m:val=&quot;p&quot;/&gt;&lt;/m:rPr&gt;&lt;w:rPr&gt;&lt;w:rFonts w:ascii=&quot;Cambria Math&quot; w:h-ansi=&quot;Cambria Math&quot;/&gt;&lt;wx:font wx:val=&quot;Cambria Math&quot;/&gt;&lt;/w:rPr&gt;&lt;m:t&gt;Î”&lt;/m:t&gt;&lt;/m:r&gt;&lt;m:sSub&gt;&lt;m:sSubPr&gt;&lt;m:ctrlPr&gt;&lt;w:rPr&gt;&lt;w:rFonts w:ascii=&quot;Cambria Math&quot; w:h-ansi=&quot;Cambria Math&quot;/&gt;&lt;wx:font wx:val=&quot;Cambria Math&quot;/&gt;&lt;w:i/&gt;&lt;/w:rPr&gt;&lt;/m:ctrlPr&gt;&lt;/m:sSubPr&gt;&lt;m:e&gt;&lt;m:r&gt;&lt;w:rPr&gt;&lt;w:rFonts w:ascii=&quot;Cambria Math&quot; w:h-ansi=&quot;Cambria Math&quot;/&gt;&lt;wx:font wx:val=&quot;Cambria Math&quot;/&gt;&lt;w:i/&gt;&lt;/w:rPr&gt;&lt;m:t&gt;V&lt;/m:t&gt;&lt;/m:r&gt;&lt;/m:e&gt;&lt;m:sub&gt;&lt;m:r&gt;&lt;w:rPr&gt;&lt;w:rFonts w:ascii=&quot;Cambria Math&quot; w:h-ansi=&quot;Cambria Math&quot;/&gt;&lt;wx:font wx:val=&quot;Cambria Math&quot;/&gt;&lt;w:i/&gt;&lt;/w:rPr&gt;&lt;m:t&gt;out&lt;/m:t&gt;&lt;/m:r&gt;&lt;/m:sub&gt;&lt;/m:sSub&gt;&lt;/m:den&gt;&lt;/m:f&gt;&lt;/m:oMath&gt;&lt;/m:oMathPara&gt;&lt;/w:p&gt;&lt;w:sectPr wsp:rsidR=&quot;00000000&quot; wsp:rsidRPr=&quot;001C3BEF&quot;&gt;&lt;w:pgSz w:w=&quot;12240&quot; w:h=&quot;15840&quot;/&gt;&lt;w:pgMar w:top=&quot;1440&quot; w:right=&quot;1440&quot; w:bottom=&quot;1440&quot; w:left=&quot;1440&quot; w:header=&quot;720&quot; w:footer=&quot;720&quot; w:gutter=&quot;0&quot;/&gt;&lt;w:cols w:space=&quot;720&quot;/&gt;&lt;/w:sectPr&gt;&lt;/wx:sect&gt;&lt;/w:body&gt;&lt;/w:wordDocument&gt;">
                   <v:imagedata r:id="rId31" o:title="" chromakey="white"/>
                 </v:shape>
               </w:pict>
@@ -3324,12 +3284,12 @@
       </w:tr>
       <w:tr>
         <w:trPr>
-          <w:trHeight w:val="538"/>
+          <w:trHeight w:val="529"/>
           <w:jc w:val="center"/>
         </w:trPr>
         <w:tc>
           <w:tcPr>
-            <w:tcW w:w="1825" w:type="dxa"/>
+            <w:tcW w:w="1799" w:type="dxa"/>
             <w:shd w:val="clear" w:color="auto" w:fill="D9D9D9"/>
             <w:vAlign w:val="center"/>
           </w:tcPr>
@@ -3351,7 +3311,7 @@
         </w:tc>
         <w:tc>
           <w:tcPr>
-            <w:tcW w:w="3184" w:type="dxa"/>
+            <w:tcW w:w="3140" w:type="dxa"/>
             <w:shd w:val="clear" w:color="auto" w:fill="D9D9D9"/>
             <w:vAlign w:val="center"/>
           </w:tcPr>
@@ -3370,7 +3330,7 @@
                 <w:szCs w:val="16"/>
               </w:rPr>
               <w:pict w14:anchorId="4EB53FE0">
-                <v:shape id="_x0000_i1790" type="#_x0000_t75" style="width:81.8pt;height:22.35pt" equationxml="&lt;?xml version=&quot;1.0&quot; encoding=&quot;UTF-8&quot; standalone=&quot;yes&quot;?&gt;&#10;&lt;?mso-application progid=&quot;Word.Document&quot;?&gt;&#10;&lt;w:wordDocument xmlns:aml=&quot;http://schemas.microsoft.com/aml/2001/core&quot; xmlns:wpc=&quot;http://schemas.microsoft.com/office/word/2010/wordprocessingCanvas&quot; xmlns:cx=&quot;http://schemas.microsoft.com/office/drawing/2014/chartex&quot; xmlns:cx1=&quot;http://schemas.microsoft.com/office/drawing/2015/9/8/chartex&quot; xmlns:cx2=&quot;http://schemas.microsoft.com/office/drawing/2015/10/21/chartex&quot; xmlns:cx3=&quot;http://schemas.microsoft.com/office/drawing/2016/5/9/chartex&quot; xmlns:cx4=&quot;http://schemas.microsoft.com/office/drawing/2016/5/10/chartex&quot; xmlns:cx5=&quot;http://schemas.microsoft.com/office/drawing/2016/5/11/chartex&quot; xmlns:cx6=&quot;http://schemas.microsoft.com/office/drawing/2016/5/12/chartex&quot; xmlns:cx7=&quot;http://schemas.microsoft.com/office/drawing/2016/5/13/chartex&quot; xmlns:cx8=&quot;http://schemas.microsoft.com/office/drawing/2016/5/14/chartex&quot; xmlns:cr=&quot;http://schemas.microsoft.com/office/comments/2020/reactions&quot; xmlns:dt=&quot;uuid:C2F41010-65B3-11d1-A29F-00AA00C14882&quot; xmlns:mc=&quot;http://schemas.openxmlformats.org/markup-compatibility/2006&quot; xmlns:aink=&quot;http://schemas.microsoft.com/office/drawing/2016/ink&quot; xmlns:am3d=&quot;http://schemas.microsoft.com/office/drawing/2017/model3d&quot; xmlns:o=&quot;urn:schemas-microsoft-com:office:office&quot; xmlns:oel=&quot;http://schemas.microsoft.com/office/2019/extlst&quot; xmlns:m=&quot;http://schemas.openxmlformats.org/officeDocument/2006/math&quot; xmlns:v=&quot;urn:schemas-microsoft-com:vml&quot; xmlns:w10=&quot;urn:schemas-microsoft-com:office:word&quot; xmlns:w=&quot;http://schemas.microsoft.com/office/word/2003/wordml&quot; xmlns:wx=&quot;http://schemas.microsoft.com/office/word/2003/auxHint&quot; xmlns:wne=&quot;http://schemas.microsoft.com/office/word/2006/wordml&quot; xmlns:wsp=&quot;http://schemas.microsoft.com/office/word/2003/wordml/sp2&quot; xmlns:sl=&quot;http://schemas.microsoft.com/schemaLibrary/2003/core&quot; w:macrosPresent=&quot;no&quot; w:embeddedObjPresent=&quot;no&quot; w:ocxPresent=&quot;no&quot; xml:space=&quot;preserve&quot;&gt;&lt;w:ignoreSubtree w:val=&quot;http://schemas.microsoft.com/office/word/2003/wordml/sp2&quot;/&gt;&lt;o:DocumentProperties&gt;&lt;o:Version&gt;16&lt;/o:Version&gt;&lt;/o:DocumentProperties&gt;&lt;w:docPr&gt;&lt;w:view w:val=&quot;print&quot;/&gt;&lt;w:zoom w:percent=&quot;100&quot;/&gt;&lt;w:doNotEmbedSystemFonts/&gt;&lt;w:activeWritingStyle w:lang=&quot;EN-AU&quot; w:vendorID=&quot;64&quot; w:dllVersion=&quot;6&quot; w:nlCheck=&quot;on&quot; w:optionSet=&quot;1&quot;/&gt;&lt;w:activeWritingStyle w:lang=&quot;EN-GB&quot; w:vendorID=&quot;64&quot; w:dllVersion=&quot;6&quot; w:nlCheck=&quot;on&quot; w:optionSet=&quot;1&quot;/&gt;&lt;w:activeWritingStyle w:lang=&quot;EN-US&quot; w:vendorID=&quot;64&quot; w:dllVersion=&quot;6&quot; w:nlCheck=&quot;on&quot; w:optionSet=&quot;1&quot;/&gt;&lt;w:activeWritingStyle w:lang=&quot;EN-AU&quot; w:vendorID=&quot;64&quot; w:dllVersion=&quot;0&quot; w:nlCheck=&quot;on&quot; w:optionSet=&quot;0&quot;/&gt;&lt;w:activeWritingStyle w:lang=&quot;EN-GB&quot; w:vendorID=&quot;64&quot; w:dllVersion=&quot;0&quot; w:nlCheck=&quot;on&quot; w:optionSet=&quot;0&quot;/&gt;&lt;w:activeWritingStyle w:lang=&quot;EN-US&quot; w:vendorID=&quot;64&quot; w:dllVersion=&quot;0&quot; w:nlCheck=&quot;on&quot; w:optionSet=&quot;0&quot;/&gt;&lt;w:activeWritingStyle w:lang=&quot;ES-AR&quot; w:vendorID=&quot;64&quot; w:dllVersion=&quot;0&quot; w:nlCheck=&quot;on&quot; w:optionSet=&quot;0&quot;/&gt;&lt;w:activeWritingStyle w:lang=&quot;580A&quot; w:vendorID=&quot;64&quot; w:dllVersion=&quot;0&quot; w:nlCheck=&quot;on&quot; w:optionSet=&quot;0&quot;/&gt;&lt;w:activeWritingStyle w:lang=&quot;PT-BR&quot; w:vendorID=&quot;64&quot; w:dllVersion=&quot;0&quot; w:nlCheck=&quot;on&quot; w:optionSet=&quot;0&quot;/&gt;&lt;w:stylePaneFormatFilter w:val=&quot;3F01&quot;/&gt;&lt;w:defaultTabStop w:val=&quot;720&quot;/&gt;&lt;w:hyphenationZone w:val=&quot;425&quot;/&gt;&lt;w:characterSpacingControl w:val=&quot;DontCompress&quot;/&gt;&lt;w:optimizeForBrowser/&gt;&lt;w:validateAgainstSchema/&gt;&lt;w:saveInvalidXML w:val=&quot;off&quot;/&gt;&lt;w:ignoreMixedContent w:val=&quot;off&quot;/&gt;&lt;w:alwaysShowPlaceholderText w:val=&quot;off&quot;/&gt;&lt;w:compat&gt;&lt;w:breakWrappedTables/&gt;&lt;w:snapToGridInCell/&gt;&lt;w:applyBreakingRules/&gt;&lt;w:wrapTextWithPunct/&gt;&lt;w:useAsianBreakRules/&gt;&lt;w:useWord2002TableStyleRules/&gt;&lt;w:useFELayout/&gt;&lt;/w:compat&gt;&lt;wsp:rsids&gt;&lt;wsp:rsidRoot wsp:val=&quot;00426FBB&quot;/&gt;&lt;wsp:rsid wsp:val=&quot;000002E1&quot;/&gt;&lt;wsp:rsid wsp:val=&quot;00003C97&quot;/&gt;&lt;wsp:rsid wsp:val=&quot;00005565&quot;/&gt;&lt;wsp:rsid wsp:val=&quot;0001754A&quot;/&gt;&lt;wsp:rsid wsp:val=&quot;00017719&quot;/&gt;&lt;wsp:rsid wsp:val=&quot;00027F1D&quot;/&gt;&lt;wsp:rsid wsp:val=&quot;0003296C&quot;/&gt;&lt;wsp:rsid wsp:val=&quot;0003351F&quot;/&gt;&lt;wsp:rsid wsp:val=&quot;00044599&quot;/&gt;&lt;wsp:rsid wsp:val=&quot;000540E6&quot;/&gt;&lt;wsp:rsid wsp:val=&quot;00054421&quot;/&gt;&lt;wsp:rsid wsp:val=&quot;00062E46&quot;/&gt;&lt;wsp:rsid wsp:val=&quot;00074AC8&quot;/&gt;&lt;wsp:rsid wsp:val=&quot;00081408&quot;/&gt;&lt;wsp:rsid wsp:val=&quot;00081EBE&quot;/&gt;&lt;wsp:rsid wsp:val=&quot;00086EDC&quot;/&gt;&lt;wsp:rsid wsp:val=&quot;000B1236&quot;/&gt;&lt;wsp:rsid wsp:val=&quot;000B36A3&quot;/&gt;&lt;wsp:rsid wsp:val=&quot;000C013C&quot;/&gt;&lt;wsp:rsid wsp:val=&quot;000E3F84&quot;/&gt;&lt;wsp:rsid wsp:val=&quot;001056DF&quot;/&gt;&lt;wsp:rsid wsp:val=&quot;0010789C&quot;/&gt;&lt;wsp:rsid wsp:val=&quot;00114025&quot;/&gt;&lt;wsp:rsid wsp:val=&quot;001160D2&quot;/&gt;&lt;wsp:rsid wsp:val=&quot;00120636&quot;/&gt;&lt;wsp:rsid wsp:val=&quot;001348A5&quot;/&gt;&lt;wsp:rsid wsp:val=&quot;00151B8E&quot;/&gt;&lt;wsp:rsid wsp:val=&quot;00182170&quot;/&gt;&lt;wsp:rsid wsp:val=&quot;001928FB&quot;/&gt;&lt;wsp:rsid wsp:val=&quot;00192BC7&quot;/&gt;&lt;wsp:rsid wsp:val=&quot;00195BE6&quot;/&gt;&lt;wsp:rsid wsp:val=&quot;001A3C37&quot;/&gt;&lt;wsp:rsid wsp:val=&quot;001A50EA&quot;/&gt;&lt;wsp:rsid wsp:val=&quot;001F16CD&quot;/&gt;&lt;wsp:rsid wsp:val=&quot;001F47D2&quot;/&gt;&lt;wsp:rsid wsp:val=&quot;002029C8&quot;/&gt;&lt;wsp:rsid wsp:val=&quot;0022285A&quot;/&gt;&lt;wsp:rsid wsp:val=&quot;00224C61&quot;/&gt;&lt;wsp:rsid wsp:val=&quot;00256ABC&quot;/&gt;&lt;wsp:rsid wsp:val=&quot;0027227B&quot;/&gt;&lt;wsp:rsid wsp:val=&quot;00273AC7&quot;/&gt;&lt;wsp:rsid wsp:val=&quot;00273D2C&quot;/&gt;&lt;wsp:rsid wsp:val=&quot;00285ECD&quot;/&gt;&lt;wsp:rsid wsp:val=&quot;00290E1B&quot;/&gt;&lt;wsp:rsid wsp:val=&quot;00291B17&quot;/&gt;&lt;wsp:rsid wsp:val=&quot;00291BB3&quot;/&gt;&lt;wsp:rsid wsp:val=&quot;002A6742&quot;/&gt;&lt;wsp:rsid wsp:val=&quot;002C1A7F&quot;/&gt;&lt;wsp:rsid wsp:val=&quot;002C4239&quot;/&gt;&lt;wsp:rsid wsp:val=&quot;002C559D&quot;/&gt;&lt;wsp:rsid wsp:val=&quot;002D16AE&quot;/&gt;&lt;wsp:rsid wsp:val=&quot;002D2D42&quot;/&gt;&lt;wsp:rsid wsp:val=&quot;002F72D0&quot;/&gt;&lt;wsp:rsid wsp:val=&quot;002F7A4F&quot;/&gt;&lt;wsp:rsid wsp:val=&quot;003003AB&quot;/&gt;&lt;wsp:rsid wsp:val=&quot;00302C35&quot;/&gt;&lt;wsp:rsid wsp:val=&quot;00311C49&quot;/&gt;&lt;wsp:rsid wsp:val=&quot;0032119E&quot;/&gt;&lt;wsp:rsid wsp:val=&quot;00321304&quot;/&gt;&lt;wsp:rsid wsp:val=&quot;00324FC2&quot;/&gt;&lt;wsp:rsid wsp:val=&quot;003312CA&quot;/&gt;&lt;wsp:rsid wsp:val=&quot;00331F84&quot;/&gt;&lt;wsp:rsid wsp:val=&quot;003329D6&quot;/&gt;&lt;wsp:rsid wsp:val=&quot;0037721F&quot;/&gt;&lt;wsp:rsid wsp:val=&quot;003950A4&quot;/&gt;&lt;wsp:rsid wsp:val=&quot;003A1E7E&quot;/&gt;&lt;wsp:rsid wsp:val=&quot;003E2FDC&quot;/&gt;&lt;wsp:rsid wsp:val=&quot;003E3577&quot;/&gt;&lt;wsp:rsid wsp:val=&quot;003F3A61&quot;/&gt;&lt;wsp:rsid wsp:val=&quot;00410A5D&quot;/&gt;&lt;wsp:rsid wsp:val=&quot;00414909&quot;/&gt;&lt;wsp:rsid wsp:val=&quot;00416537&quot;/&gt;&lt;wsp:rsid wsp:val=&quot;00425A6A&quot;/&gt;&lt;wsp:rsid wsp:val=&quot;00426FBB&quot;/&gt;&lt;wsp:rsid wsp:val=&quot;00454542&quot;/&gt;&lt;wsp:rsid wsp:val=&quot;0047429A&quot;/&gt;&lt;wsp:rsid wsp:val=&quot;0048374C&quot;/&gt;&lt;wsp:rsid wsp:val=&quot;0048771D&quot;/&gt;&lt;wsp:rsid wsp:val=&quot;004A6605&quot;/&gt;&lt;wsp:rsid wsp:val=&quot;004C45FA&quot;/&gt;&lt;wsp:rsid wsp:val=&quot;004D35A3&quot;/&gt;&lt;wsp:rsid wsp:val=&quot;004E1BD8&quot;/&gt;&lt;wsp:rsid wsp:val=&quot;004E452A&quot;/&gt;&lt;wsp:rsid wsp:val=&quot;004E78E3&quot;/&gt;&lt;wsp:rsid wsp:val=&quot;004F2BFE&quot;/&gt;&lt;wsp:rsid wsp:val=&quot;004F63D3&quot;/&gt;&lt;wsp:rsid wsp:val=&quot;004F7DCF&quot;/&gt;&lt;wsp:rsid wsp:val=&quot;005004BF&quot;/&gt;&lt;wsp:rsid wsp:val=&quot;00502E89&quot;/&gt;&lt;wsp:rsid wsp:val=&quot;00506CFE&quot;/&gt;&lt;wsp:rsid wsp:val=&quot;00510E95&quot;/&gt;&lt;wsp:rsid wsp:val=&quot;005225C3&quot;/&gt;&lt;wsp:rsid wsp:val=&quot;00527D56&quot;/&gt;&lt;wsp:rsid wsp:val=&quot;0053221F&quot;/&gt;&lt;wsp:rsid wsp:val=&quot;00536FAE&quot;/&gt;&lt;wsp:rsid wsp:val=&quot;00542C85&quot;/&gt;&lt;wsp:rsid wsp:val=&quot;00553510&quot;/&gt;&lt;wsp:rsid wsp:val=&quot;00554186&quot;/&gt;&lt;wsp:rsid wsp:val=&quot;00585769&quot;/&gt;&lt;wsp:rsid wsp:val=&quot;00585C61&quot;/&gt;&lt;wsp:rsid wsp:val=&quot;00591130&quot;/&gt;&lt;wsp:rsid wsp:val=&quot;005A3F28&quot;/&gt;&lt;wsp:rsid wsp:val=&quot;005A40BE&quot;/&gt;&lt;wsp:rsid wsp:val=&quot;005B13E2&quot;/&gt;&lt;wsp:rsid wsp:val=&quot;005B47D7&quot;/&gt;&lt;wsp:rsid wsp:val=&quot;005C5526&quot;/&gt;&lt;wsp:rsid wsp:val=&quot;005C62C6&quot;/&gt;&lt;wsp:rsid wsp:val=&quot;005D7B9E&quot;/&gt;&lt;wsp:rsid wsp:val=&quot;005E112E&quot;/&gt;&lt;wsp:rsid wsp:val=&quot;005F0834&quot;/&gt;&lt;wsp:rsid wsp:val=&quot;005F68AB&quot;/&gt;&lt;wsp:rsid wsp:val=&quot;005F6DC3&quot;/&gt;&lt;wsp:rsid wsp:val=&quot;00601A8E&quot;/&gt;&lt;wsp:rsid wsp:val=&quot;0062033E&quot;/&gt;&lt;wsp:rsid wsp:val=&quot;00624482&quot;/&gt;&lt;wsp:rsid wsp:val=&quot;0064799C&quot;/&gt;&lt;wsp:rsid wsp:val=&quot;00654156&quot;/&gt;&lt;wsp:rsid wsp:val=&quot;00656ADC&quot;/&gt;&lt;wsp:rsid wsp:val=&quot;006B47CA&quot;/&gt;&lt;wsp:rsid wsp:val=&quot;006C304C&quot;/&gt;&lt;wsp:rsid wsp:val=&quot;006C4511&quot;/&gt;&lt;wsp:rsid wsp:val=&quot;006C65F5&quot;/&gt;&lt;wsp:rsid wsp:val=&quot;006C7AAA&quot;/&gt;&lt;wsp:rsid wsp:val=&quot;006D1C2A&quot;/&gt;&lt;wsp:rsid wsp:val=&quot;006D264F&quot;/&gt;&lt;wsp:rsid wsp:val=&quot;006D4E89&quot;/&gt;&lt;wsp:rsid wsp:val=&quot;006E2A8D&quot;/&gt;&lt;wsp:rsid wsp:val=&quot;006E7574&quot;/&gt;&lt;wsp:rsid wsp:val=&quot;006F379E&quot;/&gt;&lt;wsp:rsid wsp:val=&quot;00703430&quot;/&gt;&lt;wsp:rsid wsp:val=&quot;00703548&quot;/&gt;&lt;wsp:rsid wsp:val=&quot;00704E18&quot;/&gt;&lt;wsp:rsid wsp:val=&quot;007069BE&quot;/&gt;&lt;wsp:rsid wsp:val=&quot;00745C86&quot;/&gt;&lt;wsp:rsid wsp:val=&quot;00764603&quot;/&gt;&lt;wsp:rsid wsp:val=&quot;0076604D&quot;/&gt;&lt;wsp:rsid wsp:val=&quot;00790909&quot;/&gt;&lt;wsp:rsid wsp:val=&quot;007929AF&quot;/&gt;&lt;wsp:rsid wsp:val=&quot;007B1582&quot;/&gt;&lt;wsp:rsid wsp:val=&quot;007B5A07&quot;/&gt;&lt;wsp:rsid wsp:val=&quot;007C065D&quot;/&gt;&lt;wsp:rsid wsp:val=&quot;007D3E71&quot;/&gt;&lt;wsp:rsid wsp:val=&quot;007E5D6A&quot;/&gt;&lt;wsp:rsid wsp:val=&quot;007E645D&quot;/&gt;&lt;wsp:rsid wsp:val=&quot;007F75CA&quot;/&gt;&lt;wsp:rsid wsp:val=&quot;00821E08&quot;/&gt;&lt;wsp:rsid wsp:val=&quot;00834EFD&quot;/&gt;&lt;wsp:rsid wsp:val=&quot;00844B24&quot;/&gt;&lt;wsp:rsid wsp:val=&quot;0084515F&quot;/&gt;&lt;wsp:rsid wsp:val=&quot;0085092D&quot;/&gt;&lt;wsp:rsid wsp:val=&quot;00865414&quot;/&gt;&lt;wsp:rsid wsp:val=&quot;00877D4C&quot;/&gt;&lt;wsp:rsid wsp:val=&quot;008831DC&quot;/&gt;&lt;wsp:rsid wsp:val=&quot;00883903&quot;/&gt;&lt;wsp:rsid wsp:val=&quot;00891C30&quot;/&gt;&lt;wsp:rsid wsp:val=&quot;00897219&quot;/&gt;&lt;wsp:rsid wsp:val=&quot;0089763B&quot;/&gt;&lt;wsp:rsid wsp:val=&quot;008B6AE3&quot;/&gt;&lt;wsp:rsid wsp:val=&quot;008C1332&quot;/&gt;&lt;wsp:rsid wsp:val=&quot;008D1045&quot;/&gt;&lt;wsp:rsid wsp:val=&quot;008E5996&quot;/&gt;&lt;wsp:rsid wsp:val=&quot;00901AE1&quot;/&gt;&lt;wsp:rsid wsp:val=&quot;00912F93&quot;/&gt;&lt;wsp:rsid wsp:val=&quot;009205B4&quot;/&gt;&lt;wsp:rsid wsp:val=&quot;00955B59&quot;/&gt;&lt;wsp:rsid wsp:val=&quot;00992262&quot;/&gt;&lt;wsp:rsid wsp:val=&quot;009926BC&quot;/&gt;&lt;wsp:rsid wsp:val=&quot;009A4319&quot;/&gt;&lt;wsp:rsid wsp:val=&quot;009A6C3F&quot;/&gt;&lt;wsp:rsid wsp:val=&quot;009B73F2&quot;/&gt;&lt;wsp:rsid wsp:val=&quot;009C12BD&quot;/&gt;&lt;wsp:rsid wsp:val=&quot;009C50FE&quot;/&gt;&lt;wsp:rsid wsp:val=&quot;009E49DD&quot;/&gt;&lt;wsp:rsid wsp:val=&quot;00A03E75&quot;/&gt;&lt;wsp:rsid wsp:val=&quot;00A20627&quot;/&gt;&lt;wsp:rsid wsp:val=&quot;00A22FE9&quot;/&gt;&lt;wsp:rsid wsp:val=&quot;00A31A44&quot;/&gt;&lt;wsp:rsid wsp:val=&quot;00A32BFA&quot;/&gt;&lt;wsp:rsid wsp:val=&quot;00A3325E&quot;/&gt;&lt;wsp:rsid wsp:val=&quot;00A45FCE&quot;/&gt;&lt;wsp:rsid wsp:val=&quot;00A75671&quot;/&gt;&lt;wsp:rsid wsp:val=&quot;00A773CC&quot;/&gt;&lt;wsp:rsid wsp:val=&quot;00A924D0&quot;/&gt;&lt;wsp:rsid wsp:val=&quot;00A9318B&quot;/&gt;&lt;wsp:rsid wsp:val=&quot;00A94AC1&quot;/&gt;&lt;wsp:rsid wsp:val=&quot;00AB18B7&quot;/&gt;&lt;wsp:rsid wsp:val=&quot;00AD335D&quot;/&gt;&lt;wsp:rsid wsp:val=&quot;00AF114C&quot;/&gt;&lt;wsp:rsid wsp:val=&quot;00AF792B&quot;/&gt;&lt;wsp:rsid wsp:val=&quot;00B32137&quot;/&gt;&lt;wsp:rsid wsp:val=&quot;00B33D2F&quot;/&gt;&lt;wsp:rsid wsp:val=&quot;00B40A5B&quot;/&gt;&lt;wsp:rsid wsp:val=&quot;00B45C6B&quot;/&gt;&lt;wsp:rsid wsp:val=&quot;00B55D5E&quot;/&gt;&lt;wsp:rsid wsp:val=&quot;00B57A80&quot;/&gt;&lt;wsp:rsid wsp:val=&quot;00B70E9C&quot;/&gt;&lt;wsp:rsid wsp:val=&quot;00B713D8&quot;/&gt;&lt;wsp:rsid wsp:val=&quot;00B72979&quot;/&gt;&lt;wsp:rsid wsp:val=&quot;00B94516&quot;/&gt;&lt;wsp:rsid wsp:val=&quot;00BA25E2&quot;/&gt;&lt;wsp:rsid wsp:val=&quot;00BB2855&quot;/&gt;&lt;wsp:rsid wsp:val=&quot;00BC5343&quot;/&gt;&lt;wsp:rsid wsp:val=&quot;00BD19C1&quot;/&gt;&lt;wsp:rsid wsp:val=&quot;00BD25B8&quot;/&gt;&lt;wsp:rsid wsp:val=&quot;00C012E1&quot;/&gt;&lt;wsp:rsid wsp:val=&quot;00C06BB4&quot;/&gt;&lt;wsp:rsid wsp:val=&quot;00C10D20&quot;/&gt;&lt;wsp:rsid wsp:val=&quot;00C12E0C&quot;/&gt;&lt;wsp:rsid wsp:val=&quot;00C21916&quot;/&gt;&lt;wsp:rsid wsp:val=&quot;00C34915&quot;/&gt;&lt;wsp:rsid wsp:val=&quot;00C457CA&quot;/&gt;&lt;wsp:rsid wsp:val=&quot;00C53FB6&quot;/&gt;&lt;wsp:rsid wsp:val=&quot;00C57FB7&quot;/&gt;&lt;wsp:rsid wsp:val=&quot;00C644D4&quot;/&gt;&lt;wsp:rsid wsp:val=&quot;00C65F3F&quot;/&gt;&lt;wsp:rsid wsp:val=&quot;00C72414&quot;/&gt;&lt;wsp:rsid wsp:val=&quot;00C72B1A&quot;/&gt;&lt;wsp:rsid wsp:val=&quot;00C8667B&quot;/&gt;&lt;wsp:rsid wsp:val=&quot;00C90993&quot;/&gt;&lt;wsp:rsid wsp:val=&quot;00CA4CE3&quot;/&gt;&lt;wsp:rsid wsp:val=&quot;00CC72FD&quot;/&gt;&lt;wsp:rsid wsp:val=&quot;00CD1D23&quot;/&gt;&lt;wsp:rsid wsp:val=&quot;00CD4F3F&quot;/&gt;&lt;wsp:rsid wsp:val=&quot;00D311F8&quot;/&gt;&lt;wsp:rsid wsp:val=&quot;00D31660&quot;/&gt;&lt;wsp:rsid wsp:val=&quot;00D36B52&quot;/&gt;&lt;wsp:rsid wsp:val=&quot;00D377C8&quot;/&gt;&lt;wsp:rsid wsp:val=&quot;00D41274&quot;/&gt;&lt;wsp:rsid wsp:val=&quot;00D4229C&quot;/&gt;&lt;wsp:rsid wsp:val=&quot;00D43BF3&quot;/&gt;&lt;wsp:rsid wsp:val=&quot;00D549FB&quot;/&gt;&lt;wsp:rsid wsp:val=&quot;00D56487&quot;/&gt;&lt;wsp:rsid wsp:val=&quot;00D767BB&quot;/&gt;&lt;wsp:rsid wsp:val=&quot;00D939B0&quot;/&gt;&lt;wsp:rsid wsp:val=&quot;00DA31A2&quot;/&gt;&lt;wsp:rsid wsp:val=&quot;00DB16E0&quot;/&gt;&lt;wsp:rsid wsp:val=&quot;00DB2DF9&quot;/&gt;&lt;wsp:rsid wsp:val=&quot;00DB465D&quot;/&gt;&lt;wsp:rsid wsp:val=&quot;00DB48A2&quot;/&gt;&lt;wsp:rsid wsp:val=&quot;00DB7E63&quot;/&gt;&lt;wsp:rsid wsp:val=&quot;00DC2055&quot;/&gt;&lt;wsp:rsid wsp:val=&quot;00DC3908&quot;/&gt;&lt;wsp:rsid wsp:val=&quot;00DD71E8&quot;/&gt;&lt;wsp:rsid wsp:val=&quot;00DD7F83&quot;/&gt;&lt;wsp:rsid wsp:val=&quot;00DE4EB8&quot;/&gt;&lt;wsp:rsid wsp:val=&quot;00E0641E&quot;/&gt;&lt;wsp:rsid wsp:val=&quot;00E06664&quot;/&gt;&lt;wsp:rsid wsp:val=&quot;00E304BC&quot;/&gt;&lt;wsp:rsid wsp:val=&quot;00E32853&quot;/&gt;&lt;wsp:rsid wsp:val=&quot;00E34EBD&quot;/&gt;&lt;wsp:rsid wsp:val=&quot;00E401F8&quot;/&gt;&lt;wsp:rsid wsp:val=&quot;00E46425&quot;/&gt;&lt;wsp:rsid wsp:val=&quot;00E469FC&quot;/&gt;&lt;wsp:rsid wsp:val=&quot;00E47D0E&quot;/&gt;&lt;wsp:rsid wsp:val=&quot;00E65018&quot;/&gt;&lt;wsp:rsid wsp:val=&quot;00E76CA1&quot;/&gt;&lt;wsp:rsid wsp:val=&quot;00E94339&quot;/&gt;&lt;wsp:rsid wsp:val=&quot;00E97563&quot;/&gt;&lt;wsp:rsid wsp:val=&quot;00EB0B63&quot;/&gt;&lt;wsp:rsid wsp:val=&quot;00EC265C&quot;/&gt;&lt;wsp:rsid wsp:val=&quot;00ED61CB&quot;/&gt;&lt;wsp:rsid wsp:val=&quot;00EE752A&quot;/&gt;&lt;wsp:rsid wsp:val=&quot;00F06A72&quot;/&gt;&lt;wsp:rsid wsp:val=&quot;00F136F0&quot;/&gt;&lt;wsp:rsid wsp:val=&quot;00F20BBB&quot;/&gt;&lt;wsp:rsid wsp:val=&quot;00F36048&quot;/&gt;&lt;wsp:rsid wsp:val=&quot;00F43BD8&quot;/&gt;&lt;wsp:rsid wsp:val=&quot;00F562F3&quot;/&gt;&lt;wsp:rsid wsp:val=&quot;00F74B89&quot;/&gt;&lt;wsp:rsid wsp:val=&quot;00F75133&quot;/&gt;&lt;wsp:rsid wsp:val=&quot;00F83272&quot;/&gt;&lt;wsp:rsid wsp:val=&quot;00F9358D&quot;/&gt;&lt;wsp:rsid wsp:val=&quot;00F9369B&quot;/&gt;&lt;wsp:rsid wsp:val=&quot;00FA3899&quot;/&gt;&lt;wsp:rsid wsp:val=&quot;00FA4909&quot;/&gt;&lt;wsp:rsid wsp:val=&quot;00FA5164&quot;/&gt;&lt;wsp:rsid wsp:val=&quot;00FA6751&quot;/&gt;&lt;wsp:rsid wsp:val=&quot;00FA6BD7&quot;/&gt;&lt;wsp:rsid wsp:val=&quot;00FB1048&quot;/&gt;&lt;wsp:rsid wsp:val=&quot;00FB62C4&quot;/&gt;&lt;wsp:rsid wsp:val=&quot;00FB7701&quot;/&gt;&lt;wsp:rsid wsp:val=&quot;00FD1AC5&quot;/&gt;&lt;wsp:rsid wsp:val=&quot;00FD5CF0&quot;/&gt;&lt;/wsp:rsids&gt;&lt;/w:docPr&gt;&lt;w:body&gt;&lt;wx:sect&gt;&lt;w:p wsp:rsidR=&quot;006F379E&quot; wsp:rsidRPr=&quot;006F379E&quot; wsp:rsidRDefault=&quot;006F379E&quot; wsp:rsidP=&quot;006F379E&quot;&gt;&lt;m:oMathPara&gt;&lt;m:oMath&gt;&lt;m:sSub&gt;&lt;m:sSubPr&gt;&lt;m:ctrlPr&gt;&lt;w:rPr&gt;&lt;w:rFonts w:ascii=&quot;Cambria Math&quot; w:fareast=&quot;Calibri&quot; w:h-ansi=&quot;Cambria Math&quot; w:cs=&quot;Arial&quot;/&gt;&lt;wx:font wx:val=&quot;Cambria Math&quot;/&gt;&lt;w:i/&gt;&lt;/w:rPr&gt;&lt;/m:ctrlPr&gt;&lt;/m:sSubPr&gt;&lt;m:e&gt;&lt;m:r&gt;&lt;w:rPr&gt;&lt;w:rFonts w:ascii=&quot;Cambria Math&quot; w:fareast=&quot;Calibri&quot; w:h-ansi=&quot;Cambria Math&quot; w:cs=&quot;Arial&quot;/&gt;&lt;wx:font wx:val=&quot;Cambria Math&quot;/&gt;&lt;w:i/&gt;&lt;/w:rPr&gt;&lt;m:t&gt;V&lt;/m:t&gt;&lt;/m:r&gt;&lt;/m:e&gt;&lt;m:sub&gt;&lt;m:r&gt;&lt;w:rPr&gt;&lt;w:rFonts w:ascii=&quot;Cambria Math&quot; w:fareast=&quot;Calibri&quot; w:h-ansi=&quot;Cambria Math&quot; w:cs=&quot;Arial&quot;/&gt;&lt;wx:font wx:val=&quot;Cambria Math&quot;/&gt;&lt;w:i/&gt;&lt;/w:rPr&gt;&lt;m:t&gt;out&lt;/m:t&gt;&lt;/m:r&gt;&lt;/m:sub&gt;&lt;/m:sSub&gt;&lt;m:r&gt;&lt;w:rPr&gt;&lt;w:rFonts w:ascii=&quot;Cambria Math&quot; w:fareast=&quot;Calibri&quot; w:h-ansi=&quot;Cambria Math&quot; w:cs=&quot;Arial&quot;/&gt;&lt;wx:font wx:val=&quot;Cambria Math&quot;/&gt;&lt;w:i/&gt;&lt;/w:rPr&gt;&lt;m:t&gt;=&lt;/m:t&gt;&lt;/m:r&gt;&lt;m:sSub&gt;&lt;m:sSubPr&gt;&lt;m:ctrlPr&gt;&lt;w:rPr&gt;&lt;w:rFonts w:ascii=&quot;Cambria Math&quot; w:fareast=&quot;Calibri&quot; w:h-ansi=&quot;Cambria Math&quot; w:cs=&quot;Arial&quot;/&gt;&lt;wx:font wx:val=&quot;Cambria Math&quot;/&gt;&lt;w:i/&gt;&lt;/w:rPr&gt;&lt;/m:ctrlPr&gt;&lt;/m:sSubPr&gt;&lt;m:e&gt;&lt;m:r&gt;&lt;w:rPr&gt;&lt;w:rFonts w:ascii=&quot;Cambria Math&quot; w:fareast=&quot;Calibri&quot; w:h-ansi=&quot;Cambria Math&quot; w:cs=&quot;Arial&quot;/&gt;&lt;wx:font wx:val=&quot;Cambria Math&quot;/&gt;&lt;w:i/&gt;&lt;/w:rPr&gt;&lt;m:t&gt;V&lt;/m:t&gt;&lt;/m:r&gt;&lt;/m:e&gt;&lt;m:sub&gt;&lt;m:r&gt;&lt;w:rPr&gt;&lt;w:rFonts w:ascii=&quot;Cambria Math&quot; w:fareast=&quot;Calibri&quot; w:h-ansi=&quot;Cambria Math&quot; w:cs=&quot;Arial&quot;/&gt;&lt;wx:font wx:val=&quot;Cambria Math&quot;/&gt;&lt;w:i/&gt;&lt;/w:rPr&gt;&lt;m:t&gt;REF&lt;/m:t&gt;&lt;/m:r&gt;&lt;/m:sub&gt;&lt;/m:sSub&gt;&lt;m:d&gt;&lt;m:dPr&gt;&lt;m:ctrlPr&gt;&lt;w:rPr&gt;&lt;w:rFonts w:ascii=&quot;Cambria Math&quot; w:fareast=&quot;Calibri&quot; w:h-ansi=&quot;Cambria Math&quot; w:cs=&quot;Arial&quot;/&gt;&lt;wx:font wx:val=&quot;Cambria Math&quot;/&gt;&lt;w:i/&gt;&lt;/w:rPr&gt;&lt;/m:ctrlPr&gt;&lt;/m:dPr&gt;&lt;m:e&gt;&lt;m:r&gt;&lt;w:rPr&gt;&lt;w:rFonts w:ascii=&quot;Cambria Math&quot; w:fareast=&quot;Calibri&quot; w:h-ansi=&quot;Cambria Math&quot; w:cs=&quot;Arial&quot;/&gt;&lt;wx:font wx:val=&quot;Cambria Math&quot;/&gt;&lt;w:i/&gt;&lt;/w:rPr&gt;&lt;m:t&gt;1+&lt;/m:t&gt;&lt;/m:r&gt;&lt;m:f&gt;&lt;m:fPr&gt;&lt;m:ctrlPr&gt;&lt;w:rPr&gt;&lt;w:rFonts w:ascii=&quot;Cambria Math&quot; w:fareast=&quot;Calibri&quot; w:h-ansi=&quot;Cambria Math&quot; w:cs=&quot;Arial&quot;/&gt;&lt;wx:font wx:val=&quot;Cambria Math&quot;/&gt;&lt;w:i/&gt;&lt;/w:rPr&gt;&lt;/m:ctrlPr&gt;&lt;/m:fPr&gt;&lt;m:num&gt;&lt;m:sSub&gt;&lt;m:sSubPr&gt;&lt;m:ctrlPr&gt;&lt;w:rPr&gt;&lt;w:rFonts w:ascii=&quot;Cambria Math&quot; w:fareast=&quot;Calibri&quot; w:h-ansi=&quot;Cambria Math&quot; w:cs=&quot;Arial&quot;/&gt;&lt;wx:font wx:val=&quot;Cambria Math&quot;/&gt;&lt;w:i/&gt;&lt;/w:rPr&gt;&lt;/m:ctrlPr&gt;&lt;/m:sSubPr&gt;&lt;m:e&gt;&lt;m:r&gt;&lt;w:rPr&gt;&lt;w:rFonts w:ascii=&quot;Cambria Math&quot; w:fareast=&quot;Calibri&quot; w:h-ansi=&quot;Cambria Math&quot; w:cs=&quot;Arial&quot;/&gt;&lt;wx:font wx:val=&quot;Cambria Math&quot;/&gt;&lt;w:i/&gt;&lt;/w:rPr&gt;&lt;m:t&gt;R&lt;/m:t&gt;&lt;/m:r&gt;&lt;/m:e&gt;&lt;m:sub&gt;&lt;m:r&gt;&lt;w:rPr&gt;&lt;w:rFonts w:ascii=&quot;Cambria Math&quot; w:fareast=&quot;Calibri&quot; w:h-ansi=&quot;Cambria Math&quot; w:cs=&quot;Arial&quot;/&gt;&lt;wx:font wx:val=&quot;Cambria Math&quot;/&gt;&lt;w:i/&gt;&lt;/w:rPr&gt;&lt;m:t&gt;2&lt;/m:t&gt;&lt;/m:r&gt;&lt;/m:sub&gt;&lt;/m:sSub&gt;&lt;/m:num&gt;&lt;m:den&gt;&lt;m:sSub&gt;&lt;m:sSubPr&gt;&lt;m:ctrlPr&gt;&lt;w:rPr&gt;&lt;w:rFonts w:ascii=&quot;Cambria Math&quot; w:fareast=&quot;Calibri&quot; w:h-ansi=&quot;Cambria Math&quot; w:cs=&quot;Arial&quot;/&gt;&lt;wx:font wx:val=&quot;Cambria Math&quot;/&gt;&lt;w:i/&gt;&lt;/w:rPr&gt;&lt;/m:ctrlPr&gt;&lt;/m:sSubPr&gt;&lt;m:e&gt;&lt;m:r&gt;&lt;w:rPr&gt;&lt;w:rFonts w:ascii=&quot;Cambria Math&quot; w:fareast=&quot;Calibri&quot; w:h-ansi=&quot;Cambria Math&quot; w:cs=&quot;Arial&quot;/&gt;&lt;wx:font wx:val=&quot;Cambria Math&quot;/&gt;&lt;w:i/&gt;&lt;/w:rPr&gt;&lt;m:t&gt;R&lt;/m:t&gt;&lt;/m:r&gt;&lt;/m:e&gt;&lt;m:sub&gt;&lt;m:r&gt;&lt;w:rPr&gt;&lt;w:rFonts w:ascii=&quot;Cambria Math&quot; w:fareast=&quot;Calibri&quot; w:h-ansi=&quot;Cambria Math&quot; w:cs=&quot;Arial&quot;/&gt;&lt;wx:font wx:val=&quot;Cambria Math&quot;/&gt;&lt;w:i/&gt;&lt;/w:rPr&gt;&lt;m:t&gt;1&lt;/m:t&gt;&lt;/m:r&gt;&lt;/m:sub&gt;&lt;/m:sSub&gt;&lt;/m:den&gt;&lt;/m:f&gt;&lt;/m:e&gt;&lt;/m:d&gt;&lt;/m:oMath&gt;&lt;/m:oMathPara&gt;&lt;/w:p&gt;&lt;w:sectPr wsp:rsidR=&quot;00000000&quot; wsp:rsidRPr=&quot;006F379E&quot;&gt;&lt;w:pgSz w:w=&quot;12240&quot; w:h=&quot;15840&quot;/&gt;&lt;w:pgMar w:top=&quot;1440&quot; w:right=&quot;1440&quot; w:bottom=&quot;1440&quot; w:left=&quot;1440&quot; w:header=&quot;720&quot; w:footer=&quot;720&quot; w:gutter=&quot;0&quot;/&gt;&lt;w:cols w:space=&quot;720&quot;/&gt;&lt;/w:sectPr&gt;&lt;/wx:sect&gt;&lt;/w:body&gt;&lt;/w:wordDocument&gt;">
+                <v:shape id="_x0000_i1063" type="#_x0000_t75" style="width:81.7pt;height:22.15pt" equationxml="&lt;?xml version=&quot;1.0&quot; encoding=&quot;UTF-8&quot; standalone=&quot;yes&quot;?&gt;&#10;&lt;?mso-application progid=&quot;Word.Document&quot;?&gt;&#10;&lt;w:wordDocument xmlns:aml=&quot;http://schemas.microsoft.com/aml/2001/core&quot; xmlns:wpc=&quot;http://schemas.microsoft.com/office/word/2010/wordprocessingCanvas&quot; xmlns:cx=&quot;http://schemas.microsoft.com/office/drawing/2014/chartex&quot; xmlns:cx1=&quot;http://schemas.microsoft.com/office/drawing/2015/9/8/chartex&quot; xmlns:cx2=&quot;http://schemas.microsoft.com/office/drawing/2015/10/21/chartex&quot; xmlns:cx3=&quot;http://schemas.microsoft.com/office/drawing/2016/5/9/chartex&quot; xmlns:cx4=&quot;http://schemas.microsoft.com/office/drawing/2016/5/10/chartex&quot; xmlns:cx5=&quot;http://schemas.microsoft.com/office/drawing/2016/5/11/chartex&quot; xmlns:cx6=&quot;http://schemas.microsoft.com/office/drawing/2016/5/12/chartex&quot; xmlns:cx7=&quot;http://schemas.microsoft.com/office/drawing/2016/5/13/chartex&quot; xmlns:cx8=&quot;http://schemas.microsoft.com/office/drawing/2016/5/14/chartex&quot; xmlns:cr=&quot;http://schemas.microsoft.com/office/comments/2020/reactions&quot; xmlns:dt=&quot;uuid:C2F41010-65B3-11d1-A29F-00AA00C14882&quot; xmlns:mc=&quot;http://schemas.openxmlformats.org/markup-compatibility/2006&quot; xmlns:aink=&quot;http://schemas.microsoft.com/office/drawing/2016/ink&quot; xmlns:am3d=&quot;http://schemas.microsoft.com/office/drawing/2017/model3d&quot; xmlns:o=&quot;urn:schemas-microsoft-com:office:office&quot; xmlns:oel=&quot;http://schemas.microsoft.com/office/2019/extlst&quot; xmlns:m=&quot;http://schemas.openxmlformats.org/officeDocument/2006/math&quot; xmlns:v=&quot;urn:schemas-microsoft-com:vml&quot; xmlns:w10=&quot;urn:schemas-microsoft-com:office:word&quot; xmlns:w=&quot;http://schemas.microsoft.com/office/word/2003/wordml&quot; xmlns:wx=&quot;http://schemas.microsoft.com/office/word/2003/auxHint&quot; xmlns:wne=&quot;http://schemas.microsoft.com/office/word/2006/wordml&quot; xmlns:wsp=&quot;http://schemas.microsoft.com/office/word/2003/wordml/sp2&quot; xmlns:sl=&quot;http://schemas.microsoft.com/schemaLibrary/2003/core&quot; w:macrosPresent=&quot;no&quot; w:embeddedObjPresent=&quot;no&quot; w:ocxPresent=&quot;no&quot; xml:space=&quot;preserve&quot;&gt;&lt;w:ignoreSubtree w:val=&quot;http://schemas.microsoft.com/office/word/2003/wordml/sp2&quot;/&gt;&lt;o:DocumentProperties&gt;&lt;o:Version&gt;16&lt;/o:Version&gt;&lt;/o:DocumentProperties&gt;&lt;w:docPr&gt;&lt;w:view w:val=&quot;print&quot;/&gt;&lt;w:zoom w:percent=&quot;100&quot;/&gt;&lt;w:doNotEmbedSystemFonts/&gt;&lt;w:activeWritingStyle w:lang=&quot;EN-AU&quot; w:vendorID=&quot;64&quot; w:dllVersion=&quot;6&quot; w:nlCheck=&quot;on&quot; w:optionSet=&quot;1&quot;/&gt;&lt;w:activeWritingStyle w:lang=&quot;EN-GB&quot; w:vendorID=&quot;64&quot; w:dllVersion=&quot;6&quot; w:nlCheck=&quot;on&quot; w:optionSet=&quot;1&quot;/&gt;&lt;w:activeWritingStyle w:lang=&quot;EN-US&quot; w:vendorID=&quot;64&quot; w:dllVersion=&quot;6&quot; w:nlCheck=&quot;on&quot; w:optionSet=&quot;1&quot;/&gt;&lt;w:activeWritingStyle w:lang=&quot;EN-AU&quot; w:vendorID=&quot;64&quot; w:dllVersion=&quot;0&quot; w:nlCheck=&quot;on&quot; w:optionSet=&quot;0&quot;/&gt;&lt;w:activeWritingStyle w:lang=&quot;EN-GB&quot; w:vendorID=&quot;64&quot; w:dllVersion=&quot;0&quot; w:nlCheck=&quot;on&quot; w:optionSet=&quot;0&quot;/&gt;&lt;w:activeWritingStyle w:lang=&quot;EN-US&quot; w:vendorID=&quot;64&quot; w:dllVersion=&quot;0&quot; w:nlCheck=&quot;on&quot; w:optionSet=&quot;0&quot;/&gt;&lt;w:activeWritingStyle w:lang=&quot;ES-AR&quot; w:vendorID=&quot;64&quot; w:dllVersion=&quot;0&quot; w:nlCheck=&quot;on&quot; w:optionSet=&quot;0&quot;/&gt;&lt;w:activeWritingStyle w:lang=&quot;580A&quot; w:vendorID=&quot;64&quot; w:dllVersion=&quot;0&quot; w:nlCheck=&quot;on&quot; w:optionSet=&quot;0&quot;/&gt;&lt;w:activeWritingStyle w:lang=&quot;PT-BR&quot; w:vendorID=&quot;64&quot; w:dllVersion=&quot;0&quot; w:nlCheck=&quot;on&quot; w:optionSet=&quot;0&quot;/&gt;&lt;w:stylePaneFormatFilter w:val=&quot;3F01&quot;/&gt;&lt;w:defaultTabStop w:val=&quot;720&quot;/&gt;&lt;w:hyphenationZone w:val=&quot;425&quot;/&gt;&lt;w:characterSpacingControl w:val=&quot;DontCompress&quot;/&gt;&lt;w:optimizeForBrowser/&gt;&lt;w:validateAgainstSchema/&gt;&lt;w:saveInvalidXML w:val=&quot;off&quot;/&gt;&lt;w:ignoreMixedContent w:val=&quot;off&quot;/&gt;&lt;w:alwaysShowPlaceholderText w:val=&quot;off&quot;/&gt;&lt;w:compat&gt;&lt;w:breakWrappedTables/&gt;&lt;w:snapToGridInCell/&gt;&lt;w:applyBreakingRules/&gt;&lt;w:wrapTextWithPunct/&gt;&lt;w:useAsianBreakRules/&gt;&lt;w:useWord2002TableStyleRules/&gt;&lt;w:useFELayout/&gt;&lt;/w:compat&gt;&lt;wsp:rsids&gt;&lt;wsp:rsidRoot wsp:val=&quot;00426FBB&quot;/&gt;&lt;wsp:rsid wsp:val=&quot;000002E1&quot;/&gt;&lt;wsp:rsid wsp:val=&quot;00003C97&quot;/&gt;&lt;wsp:rsid wsp:val=&quot;00005565&quot;/&gt;&lt;wsp:rsid wsp:val=&quot;0001754A&quot;/&gt;&lt;wsp:rsid wsp:val=&quot;00017719&quot;/&gt;&lt;wsp:rsid wsp:val=&quot;00027F1D&quot;/&gt;&lt;wsp:rsid wsp:val=&quot;0003296C&quot;/&gt;&lt;wsp:rsid wsp:val=&quot;0003351F&quot;/&gt;&lt;wsp:rsid wsp:val=&quot;00044599&quot;/&gt;&lt;wsp:rsid wsp:val=&quot;000540E6&quot;/&gt;&lt;wsp:rsid wsp:val=&quot;00054421&quot;/&gt;&lt;wsp:rsid wsp:val=&quot;00062E46&quot;/&gt;&lt;wsp:rsid wsp:val=&quot;00074AC8&quot;/&gt;&lt;wsp:rsid wsp:val=&quot;00081408&quot;/&gt;&lt;wsp:rsid wsp:val=&quot;00081EBE&quot;/&gt;&lt;wsp:rsid wsp:val=&quot;00086EDC&quot;/&gt;&lt;wsp:rsid wsp:val=&quot;000B1236&quot;/&gt;&lt;wsp:rsid wsp:val=&quot;000B36A3&quot;/&gt;&lt;wsp:rsid wsp:val=&quot;000C013C&quot;/&gt;&lt;wsp:rsid wsp:val=&quot;000E3F84&quot;/&gt;&lt;wsp:rsid wsp:val=&quot;001056DF&quot;/&gt;&lt;wsp:rsid wsp:val=&quot;0010789C&quot;/&gt;&lt;wsp:rsid wsp:val=&quot;00114025&quot;/&gt;&lt;wsp:rsid wsp:val=&quot;001160D2&quot;/&gt;&lt;wsp:rsid wsp:val=&quot;00120636&quot;/&gt;&lt;wsp:rsid wsp:val=&quot;001348A5&quot;/&gt;&lt;wsp:rsid wsp:val=&quot;00151B8E&quot;/&gt;&lt;wsp:rsid wsp:val=&quot;00182170&quot;/&gt;&lt;wsp:rsid wsp:val=&quot;001928FB&quot;/&gt;&lt;wsp:rsid wsp:val=&quot;00192BC7&quot;/&gt;&lt;wsp:rsid wsp:val=&quot;00195BE6&quot;/&gt;&lt;wsp:rsid wsp:val=&quot;001A3C37&quot;/&gt;&lt;wsp:rsid wsp:val=&quot;001A50EA&quot;/&gt;&lt;wsp:rsid wsp:val=&quot;001F16CD&quot;/&gt;&lt;wsp:rsid wsp:val=&quot;001F47D2&quot;/&gt;&lt;wsp:rsid wsp:val=&quot;002029C8&quot;/&gt;&lt;wsp:rsid wsp:val=&quot;0022285A&quot;/&gt;&lt;wsp:rsid wsp:val=&quot;00224C61&quot;/&gt;&lt;wsp:rsid wsp:val=&quot;00256ABC&quot;/&gt;&lt;wsp:rsid wsp:val=&quot;0027227B&quot;/&gt;&lt;wsp:rsid wsp:val=&quot;00273AC7&quot;/&gt;&lt;wsp:rsid wsp:val=&quot;00273D2C&quot;/&gt;&lt;wsp:rsid wsp:val=&quot;00285ECD&quot;/&gt;&lt;wsp:rsid wsp:val=&quot;00290E1B&quot;/&gt;&lt;wsp:rsid wsp:val=&quot;00291B17&quot;/&gt;&lt;wsp:rsid wsp:val=&quot;00291BB3&quot;/&gt;&lt;wsp:rsid wsp:val=&quot;002A6742&quot;/&gt;&lt;wsp:rsid wsp:val=&quot;002C1A7F&quot;/&gt;&lt;wsp:rsid wsp:val=&quot;002C4239&quot;/&gt;&lt;wsp:rsid wsp:val=&quot;002C559D&quot;/&gt;&lt;wsp:rsid wsp:val=&quot;002D16AE&quot;/&gt;&lt;wsp:rsid wsp:val=&quot;002D2D42&quot;/&gt;&lt;wsp:rsid wsp:val=&quot;002F72D0&quot;/&gt;&lt;wsp:rsid wsp:val=&quot;002F7A4F&quot;/&gt;&lt;wsp:rsid wsp:val=&quot;003003AB&quot;/&gt;&lt;wsp:rsid wsp:val=&quot;00302C35&quot;/&gt;&lt;wsp:rsid wsp:val=&quot;00311C49&quot;/&gt;&lt;wsp:rsid wsp:val=&quot;0032119E&quot;/&gt;&lt;wsp:rsid wsp:val=&quot;00321304&quot;/&gt;&lt;wsp:rsid wsp:val=&quot;00324FC2&quot;/&gt;&lt;wsp:rsid wsp:val=&quot;003312CA&quot;/&gt;&lt;wsp:rsid wsp:val=&quot;00331F84&quot;/&gt;&lt;wsp:rsid wsp:val=&quot;003329D6&quot;/&gt;&lt;wsp:rsid wsp:val=&quot;0037721F&quot;/&gt;&lt;wsp:rsid wsp:val=&quot;003950A4&quot;/&gt;&lt;wsp:rsid wsp:val=&quot;003A1E7E&quot;/&gt;&lt;wsp:rsid wsp:val=&quot;003E2FDC&quot;/&gt;&lt;wsp:rsid wsp:val=&quot;003E3577&quot;/&gt;&lt;wsp:rsid wsp:val=&quot;003F3A61&quot;/&gt;&lt;wsp:rsid wsp:val=&quot;00410A5D&quot;/&gt;&lt;wsp:rsid wsp:val=&quot;00414909&quot;/&gt;&lt;wsp:rsid wsp:val=&quot;00416537&quot;/&gt;&lt;wsp:rsid wsp:val=&quot;00425A6A&quot;/&gt;&lt;wsp:rsid wsp:val=&quot;00426FBB&quot;/&gt;&lt;wsp:rsid wsp:val=&quot;00454542&quot;/&gt;&lt;wsp:rsid wsp:val=&quot;0047429A&quot;/&gt;&lt;wsp:rsid wsp:val=&quot;0048374C&quot;/&gt;&lt;wsp:rsid wsp:val=&quot;0048771D&quot;/&gt;&lt;wsp:rsid wsp:val=&quot;004A6605&quot;/&gt;&lt;wsp:rsid wsp:val=&quot;004C45FA&quot;/&gt;&lt;wsp:rsid wsp:val=&quot;004D35A3&quot;/&gt;&lt;wsp:rsid wsp:val=&quot;004E1BD8&quot;/&gt;&lt;wsp:rsid wsp:val=&quot;004E452A&quot;/&gt;&lt;wsp:rsid wsp:val=&quot;004E78E3&quot;/&gt;&lt;wsp:rsid wsp:val=&quot;004F2BFE&quot;/&gt;&lt;wsp:rsid wsp:val=&quot;004F63D3&quot;/&gt;&lt;wsp:rsid wsp:val=&quot;004F7DCF&quot;/&gt;&lt;wsp:rsid wsp:val=&quot;005004BF&quot;/&gt;&lt;wsp:rsid wsp:val=&quot;00502E89&quot;/&gt;&lt;wsp:rsid wsp:val=&quot;00506CFE&quot;/&gt;&lt;wsp:rsid wsp:val=&quot;00510E95&quot;/&gt;&lt;wsp:rsid wsp:val=&quot;005225C3&quot;/&gt;&lt;wsp:rsid wsp:val=&quot;00527D56&quot;/&gt;&lt;wsp:rsid wsp:val=&quot;0053221F&quot;/&gt;&lt;wsp:rsid wsp:val=&quot;00536FAE&quot;/&gt;&lt;wsp:rsid wsp:val=&quot;00542C85&quot;/&gt;&lt;wsp:rsid wsp:val=&quot;00553510&quot;/&gt;&lt;wsp:rsid wsp:val=&quot;00554186&quot;/&gt;&lt;wsp:rsid wsp:val=&quot;00585769&quot;/&gt;&lt;wsp:rsid wsp:val=&quot;00585C61&quot;/&gt;&lt;wsp:rsid wsp:val=&quot;00591130&quot;/&gt;&lt;wsp:rsid wsp:val=&quot;005A3F28&quot;/&gt;&lt;wsp:rsid wsp:val=&quot;005A40BE&quot;/&gt;&lt;wsp:rsid wsp:val=&quot;005B13E2&quot;/&gt;&lt;wsp:rsid wsp:val=&quot;005B47D7&quot;/&gt;&lt;wsp:rsid wsp:val=&quot;005C5526&quot;/&gt;&lt;wsp:rsid wsp:val=&quot;005C62C6&quot;/&gt;&lt;wsp:rsid wsp:val=&quot;005D7B9E&quot;/&gt;&lt;wsp:rsid wsp:val=&quot;005E112E&quot;/&gt;&lt;wsp:rsid wsp:val=&quot;005F0834&quot;/&gt;&lt;wsp:rsid wsp:val=&quot;005F68AB&quot;/&gt;&lt;wsp:rsid wsp:val=&quot;005F6DC3&quot;/&gt;&lt;wsp:rsid wsp:val=&quot;00601A8E&quot;/&gt;&lt;wsp:rsid wsp:val=&quot;0062033E&quot;/&gt;&lt;wsp:rsid wsp:val=&quot;00624482&quot;/&gt;&lt;wsp:rsid wsp:val=&quot;0064799C&quot;/&gt;&lt;wsp:rsid wsp:val=&quot;00654156&quot;/&gt;&lt;wsp:rsid wsp:val=&quot;00656ADC&quot;/&gt;&lt;wsp:rsid wsp:val=&quot;006B47CA&quot;/&gt;&lt;wsp:rsid wsp:val=&quot;006C304C&quot;/&gt;&lt;wsp:rsid wsp:val=&quot;006C4511&quot;/&gt;&lt;wsp:rsid wsp:val=&quot;006C65F5&quot;/&gt;&lt;wsp:rsid wsp:val=&quot;006C7AAA&quot;/&gt;&lt;wsp:rsid wsp:val=&quot;006D1C2A&quot;/&gt;&lt;wsp:rsid wsp:val=&quot;006D264F&quot;/&gt;&lt;wsp:rsid wsp:val=&quot;006D4E89&quot;/&gt;&lt;wsp:rsid wsp:val=&quot;006E2A8D&quot;/&gt;&lt;wsp:rsid wsp:val=&quot;006E7574&quot;/&gt;&lt;wsp:rsid wsp:val=&quot;006F379E&quot;/&gt;&lt;wsp:rsid wsp:val=&quot;00703430&quot;/&gt;&lt;wsp:rsid wsp:val=&quot;00703548&quot;/&gt;&lt;wsp:rsid wsp:val=&quot;00704E18&quot;/&gt;&lt;wsp:rsid wsp:val=&quot;007069BE&quot;/&gt;&lt;wsp:rsid wsp:val=&quot;00745C86&quot;/&gt;&lt;wsp:rsid wsp:val=&quot;00764603&quot;/&gt;&lt;wsp:rsid wsp:val=&quot;0076604D&quot;/&gt;&lt;wsp:rsid wsp:val=&quot;00790909&quot;/&gt;&lt;wsp:rsid wsp:val=&quot;007929AF&quot;/&gt;&lt;wsp:rsid wsp:val=&quot;007B1582&quot;/&gt;&lt;wsp:rsid wsp:val=&quot;007B5A07&quot;/&gt;&lt;wsp:rsid wsp:val=&quot;007C065D&quot;/&gt;&lt;wsp:rsid wsp:val=&quot;007D3E71&quot;/&gt;&lt;wsp:rsid wsp:val=&quot;007E5D6A&quot;/&gt;&lt;wsp:rsid wsp:val=&quot;007E645D&quot;/&gt;&lt;wsp:rsid wsp:val=&quot;007F75CA&quot;/&gt;&lt;wsp:rsid wsp:val=&quot;00821E08&quot;/&gt;&lt;wsp:rsid wsp:val=&quot;00834EFD&quot;/&gt;&lt;wsp:rsid wsp:val=&quot;00844B24&quot;/&gt;&lt;wsp:rsid wsp:val=&quot;0084515F&quot;/&gt;&lt;wsp:rsid wsp:val=&quot;0085092D&quot;/&gt;&lt;wsp:rsid wsp:val=&quot;00865414&quot;/&gt;&lt;wsp:rsid wsp:val=&quot;00877D4C&quot;/&gt;&lt;wsp:rsid wsp:val=&quot;008831DC&quot;/&gt;&lt;wsp:rsid wsp:val=&quot;00883903&quot;/&gt;&lt;wsp:rsid wsp:val=&quot;00891C30&quot;/&gt;&lt;wsp:rsid wsp:val=&quot;00897219&quot;/&gt;&lt;wsp:rsid wsp:val=&quot;0089763B&quot;/&gt;&lt;wsp:rsid wsp:val=&quot;008B6AE3&quot;/&gt;&lt;wsp:rsid wsp:val=&quot;008C1332&quot;/&gt;&lt;wsp:rsid wsp:val=&quot;008D1045&quot;/&gt;&lt;wsp:rsid wsp:val=&quot;008E5996&quot;/&gt;&lt;wsp:rsid wsp:val=&quot;00901AE1&quot;/&gt;&lt;wsp:rsid wsp:val=&quot;00912F93&quot;/&gt;&lt;wsp:rsid wsp:val=&quot;009205B4&quot;/&gt;&lt;wsp:rsid wsp:val=&quot;00955B59&quot;/&gt;&lt;wsp:rsid wsp:val=&quot;00992262&quot;/&gt;&lt;wsp:rsid wsp:val=&quot;009926BC&quot;/&gt;&lt;wsp:rsid wsp:val=&quot;009A4319&quot;/&gt;&lt;wsp:rsid wsp:val=&quot;009A6C3F&quot;/&gt;&lt;wsp:rsid wsp:val=&quot;009B73F2&quot;/&gt;&lt;wsp:rsid wsp:val=&quot;009C12BD&quot;/&gt;&lt;wsp:rsid wsp:val=&quot;009C50FE&quot;/&gt;&lt;wsp:rsid wsp:val=&quot;009E49DD&quot;/&gt;&lt;wsp:rsid wsp:val=&quot;00A03E75&quot;/&gt;&lt;wsp:rsid wsp:val=&quot;00A20627&quot;/&gt;&lt;wsp:rsid wsp:val=&quot;00A22FE9&quot;/&gt;&lt;wsp:rsid wsp:val=&quot;00A31A44&quot;/&gt;&lt;wsp:rsid wsp:val=&quot;00A32BFA&quot;/&gt;&lt;wsp:rsid wsp:val=&quot;00A3325E&quot;/&gt;&lt;wsp:rsid wsp:val=&quot;00A45FCE&quot;/&gt;&lt;wsp:rsid wsp:val=&quot;00A75671&quot;/&gt;&lt;wsp:rsid wsp:val=&quot;00A773CC&quot;/&gt;&lt;wsp:rsid wsp:val=&quot;00A924D0&quot;/&gt;&lt;wsp:rsid wsp:val=&quot;00A9318B&quot;/&gt;&lt;wsp:rsid wsp:val=&quot;00A94AC1&quot;/&gt;&lt;wsp:rsid wsp:val=&quot;00AB18B7&quot;/&gt;&lt;wsp:rsid wsp:val=&quot;00AD335D&quot;/&gt;&lt;wsp:rsid wsp:val=&quot;00AF114C&quot;/&gt;&lt;wsp:rsid wsp:val=&quot;00AF792B&quot;/&gt;&lt;wsp:rsid wsp:val=&quot;00B32137&quot;/&gt;&lt;wsp:rsid wsp:val=&quot;00B33D2F&quot;/&gt;&lt;wsp:rsid wsp:val=&quot;00B40A5B&quot;/&gt;&lt;wsp:rsid wsp:val=&quot;00B45C6B&quot;/&gt;&lt;wsp:rsid wsp:val=&quot;00B55D5E&quot;/&gt;&lt;wsp:rsid wsp:val=&quot;00B57A80&quot;/&gt;&lt;wsp:rsid wsp:val=&quot;00B70E9C&quot;/&gt;&lt;wsp:rsid wsp:val=&quot;00B713D8&quot;/&gt;&lt;wsp:rsid wsp:val=&quot;00B72979&quot;/&gt;&lt;wsp:rsid wsp:val=&quot;00B94516&quot;/&gt;&lt;wsp:rsid wsp:val=&quot;00BA25E2&quot;/&gt;&lt;wsp:rsid wsp:val=&quot;00BB2855&quot;/&gt;&lt;wsp:rsid wsp:val=&quot;00BC5343&quot;/&gt;&lt;wsp:rsid wsp:val=&quot;00BD19C1&quot;/&gt;&lt;wsp:rsid wsp:val=&quot;00BD25B8&quot;/&gt;&lt;wsp:rsid wsp:val=&quot;00C012E1&quot;/&gt;&lt;wsp:rsid wsp:val=&quot;00C06BB4&quot;/&gt;&lt;wsp:rsid wsp:val=&quot;00C10D20&quot;/&gt;&lt;wsp:rsid wsp:val=&quot;00C12E0C&quot;/&gt;&lt;wsp:rsid wsp:val=&quot;00C21916&quot;/&gt;&lt;wsp:rsid wsp:val=&quot;00C34915&quot;/&gt;&lt;wsp:rsid wsp:val=&quot;00C457CA&quot;/&gt;&lt;wsp:rsid wsp:val=&quot;00C53FB6&quot;/&gt;&lt;wsp:rsid wsp:val=&quot;00C57FB7&quot;/&gt;&lt;wsp:rsid wsp:val=&quot;00C644D4&quot;/&gt;&lt;wsp:rsid wsp:val=&quot;00C65F3F&quot;/&gt;&lt;wsp:rsid wsp:val=&quot;00C72414&quot;/&gt;&lt;wsp:rsid wsp:val=&quot;00C72B1A&quot;/&gt;&lt;wsp:rsid wsp:val=&quot;00C8667B&quot;/&gt;&lt;wsp:rsid wsp:val=&quot;00C90993&quot;/&gt;&lt;wsp:rsid wsp:val=&quot;00CA4CE3&quot;/&gt;&lt;wsp:rsid wsp:val=&quot;00CC72FD&quot;/&gt;&lt;wsp:rsid wsp:val=&quot;00CD1D23&quot;/&gt;&lt;wsp:rsid wsp:val=&quot;00CD4F3F&quot;/&gt;&lt;wsp:rsid wsp:val=&quot;00D311F8&quot;/&gt;&lt;wsp:rsid wsp:val=&quot;00D31660&quot;/&gt;&lt;wsp:rsid wsp:val=&quot;00D36B52&quot;/&gt;&lt;wsp:rsid wsp:val=&quot;00D377C8&quot;/&gt;&lt;wsp:rsid wsp:val=&quot;00D41274&quot;/&gt;&lt;wsp:rsid wsp:val=&quot;00D4229C&quot;/&gt;&lt;wsp:rsid wsp:val=&quot;00D43BF3&quot;/&gt;&lt;wsp:rsid wsp:val=&quot;00D549FB&quot;/&gt;&lt;wsp:rsid wsp:val=&quot;00D56487&quot;/&gt;&lt;wsp:rsid wsp:val=&quot;00D767BB&quot;/&gt;&lt;wsp:rsid wsp:val=&quot;00D939B0&quot;/&gt;&lt;wsp:rsid wsp:val=&quot;00DA31A2&quot;/&gt;&lt;wsp:rsid wsp:val=&quot;00DB16E0&quot;/&gt;&lt;wsp:rsid wsp:val=&quot;00DB2DF9&quot;/&gt;&lt;wsp:rsid wsp:val=&quot;00DB465D&quot;/&gt;&lt;wsp:rsid wsp:val=&quot;00DB48A2&quot;/&gt;&lt;wsp:rsid wsp:val=&quot;00DB7E63&quot;/&gt;&lt;wsp:rsid wsp:val=&quot;00DC2055&quot;/&gt;&lt;wsp:rsid wsp:val=&quot;00DC3908&quot;/&gt;&lt;wsp:rsid wsp:val=&quot;00DD71E8&quot;/&gt;&lt;wsp:rsid wsp:val=&quot;00DD7F83&quot;/&gt;&lt;wsp:rsid wsp:val=&quot;00DE4EB8&quot;/&gt;&lt;wsp:rsid wsp:val=&quot;00E0641E&quot;/&gt;&lt;wsp:rsid wsp:val=&quot;00E06664&quot;/&gt;&lt;wsp:rsid wsp:val=&quot;00E304BC&quot;/&gt;&lt;wsp:rsid wsp:val=&quot;00E32853&quot;/&gt;&lt;wsp:rsid wsp:val=&quot;00E34EBD&quot;/&gt;&lt;wsp:rsid wsp:val=&quot;00E401F8&quot;/&gt;&lt;wsp:rsid wsp:val=&quot;00E46425&quot;/&gt;&lt;wsp:rsid wsp:val=&quot;00E469FC&quot;/&gt;&lt;wsp:rsid wsp:val=&quot;00E47D0E&quot;/&gt;&lt;wsp:rsid wsp:val=&quot;00E65018&quot;/&gt;&lt;wsp:rsid wsp:val=&quot;00E76CA1&quot;/&gt;&lt;wsp:rsid wsp:val=&quot;00E94339&quot;/&gt;&lt;wsp:rsid wsp:val=&quot;00E97563&quot;/&gt;&lt;wsp:rsid wsp:val=&quot;00EB0B63&quot;/&gt;&lt;wsp:rsid wsp:val=&quot;00EC265C&quot;/&gt;&lt;wsp:rsid wsp:val=&quot;00ED61CB&quot;/&gt;&lt;wsp:rsid wsp:val=&quot;00EE752A&quot;/&gt;&lt;wsp:rsid wsp:val=&quot;00F06A72&quot;/&gt;&lt;wsp:rsid wsp:val=&quot;00F136F0&quot;/&gt;&lt;wsp:rsid wsp:val=&quot;00F20BBB&quot;/&gt;&lt;wsp:rsid wsp:val=&quot;00F36048&quot;/&gt;&lt;wsp:rsid wsp:val=&quot;00F43BD8&quot;/&gt;&lt;wsp:rsid wsp:val=&quot;00F562F3&quot;/&gt;&lt;wsp:rsid wsp:val=&quot;00F74B89&quot;/&gt;&lt;wsp:rsid wsp:val=&quot;00F75133&quot;/&gt;&lt;wsp:rsid wsp:val=&quot;00F83272&quot;/&gt;&lt;wsp:rsid wsp:val=&quot;00F9358D&quot;/&gt;&lt;wsp:rsid wsp:val=&quot;00F9369B&quot;/&gt;&lt;wsp:rsid wsp:val=&quot;00FA3899&quot;/&gt;&lt;wsp:rsid wsp:val=&quot;00FA4909&quot;/&gt;&lt;wsp:rsid wsp:val=&quot;00FA5164&quot;/&gt;&lt;wsp:rsid wsp:val=&quot;00FA6751&quot;/&gt;&lt;wsp:rsid wsp:val=&quot;00FA6BD7&quot;/&gt;&lt;wsp:rsid wsp:val=&quot;00FB1048&quot;/&gt;&lt;wsp:rsid wsp:val=&quot;00FB62C4&quot;/&gt;&lt;wsp:rsid wsp:val=&quot;00FB7701&quot;/&gt;&lt;wsp:rsid wsp:val=&quot;00FD1AC5&quot;/&gt;&lt;wsp:rsid wsp:val=&quot;00FD5CF0&quot;/&gt;&lt;/wsp:rsids&gt;&lt;/w:docPr&gt;&lt;w:body&gt;&lt;wx:sect&gt;&lt;w:p wsp:rsidR=&quot;006F379E&quot; wsp:rsidRPr=&quot;006F379E&quot; wsp:rsidRDefault=&quot;006F379E&quot; wsp:rsidP=&quot;006F379E&quot;&gt;&lt;m:oMathPara&gt;&lt;m:oMath&gt;&lt;m:sSub&gt;&lt;m:sSubPr&gt;&lt;m:ctrlPr&gt;&lt;w:rPr&gt;&lt;w:rFonts w:ascii=&quot;Cambria Math&quot; w:fareast=&quot;Calibri&quot; w:h-ansi=&quot;Cambria Math&quot; w:cs=&quot;Arial&quot;/&gt;&lt;wx:font wx:val=&quot;Cambria Math&quot;/&gt;&lt;w:i/&gt;&lt;/w:rPr&gt;&lt;/m:ctrlPr&gt;&lt;/m:sSubPr&gt;&lt;m:e&gt;&lt;m:r&gt;&lt;w:rPr&gt;&lt;w:rFonts w:ascii=&quot;Cambria Math&quot; w:fareast=&quot;Calibri&quot; w:h-ansi=&quot;Cambria Math&quot; w:cs=&quot;Arial&quot;/&gt;&lt;wx:font wx:val=&quot;Cambria Math&quot;/&gt;&lt;w:i/&gt;&lt;/w:rPr&gt;&lt;m:t&gt;V&lt;/m:t&gt;&lt;/m:r&gt;&lt;/m:e&gt;&lt;m:sub&gt;&lt;m:r&gt;&lt;w:rPr&gt;&lt;w:rFonts w:ascii=&quot;Cambria Math&quot; w:fareast=&quot;Calibri&quot; w:h-ansi=&quot;Cambria Math&quot; w:cs=&quot;Arial&quot;/&gt;&lt;wx:font wx:val=&quot;Cambria Math&quot;/&gt;&lt;w:i/&gt;&lt;/w:rPr&gt;&lt;m:t&gt;out&lt;/m:t&gt;&lt;/m:r&gt;&lt;/m:sub&gt;&lt;/m:sSub&gt;&lt;m:r&gt;&lt;w:rPr&gt;&lt;w:rFonts w:ascii=&quot;Cambria Math&quot; w:fareast=&quot;Calibri&quot; w:h-ansi=&quot;Cambria Math&quot; w:cs=&quot;Arial&quot;/&gt;&lt;wx:font wx:val=&quot;Cambria Math&quot;/&gt;&lt;w:i/&gt;&lt;/w:rPr&gt;&lt;m:t&gt;=&lt;/m:t&gt;&lt;/m:r&gt;&lt;m:sSub&gt;&lt;m:sSubPr&gt;&lt;m:ctrlPr&gt;&lt;w:rPr&gt;&lt;w:rFonts w:ascii=&quot;Cambria Math&quot; w:fareast=&quot;Calibri&quot; w:h-ansi=&quot;Cambria Math&quot; w:cs=&quot;Arial&quot;/&gt;&lt;wx:font wx:val=&quot;Cambria Math&quot;/&gt;&lt;w:i/&gt;&lt;/w:rPr&gt;&lt;/m:ctrlPr&gt;&lt;/m:sSubPr&gt;&lt;m:e&gt;&lt;m:r&gt;&lt;w:rPr&gt;&lt;w:rFonts w:ascii=&quot;Cambria Math&quot; w:fareast=&quot;Calibri&quot; w:h-ansi=&quot;Cambria Math&quot; w:cs=&quot;Arial&quot;/&gt;&lt;wx:font wx:val=&quot;Cambria Math&quot;/&gt;&lt;w:i/&gt;&lt;/w:rPr&gt;&lt;m:t&gt;V&lt;/m:t&gt;&lt;/m:r&gt;&lt;/m:e&gt;&lt;m:sub&gt;&lt;m:r&gt;&lt;w:rPr&gt;&lt;w:rFonts w:ascii=&quot;Cambria Math&quot; w:fareast=&quot;Calibri&quot; w:h-ansi=&quot;Cambria Math&quot; w:cs=&quot;Arial&quot;/&gt;&lt;wx:font wx:val=&quot;Cambria Math&quot;/&gt;&lt;w:i/&gt;&lt;/w:rPr&gt;&lt;m:t&gt;REF&lt;/m:t&gt;&lt;/m:r&gt;&lt;/m:sub&gt;&lt;/m:sSub&gt;&lt;m:d&gt;&lt;m:dPr&gt;&lt;m:ctrlPr&gt;&lt;w:rPr&gt;&lt;w:rFonts w:ascii=&quot;Cambria Math&quot; w:fareast=&quot;Calibri&quot; w:h-ansi=&quot;Cambria Math&quot; w:cs=&quot;Arial&quot;/&gt;&lt;wx:font wx:val=&quot;Cambria Math&quot;/&gt;&lt;w:i/&gt;&lt;/w:rPr&gt;&lt;/m:ctrlPr&gt;&lt;/m:dPr&gt;&lt;m:e&gt;&lt;m:r&gt;&lt;w:rPr&gt;&lt;w:rFonts w:ascii=&quot;Cambria Math&quot; w:fareast=&quot;Calibri&quot; w:h-ansi=&quot;Cambria Math&quot; w:cs=&quot;Arial&quot;/&gt;&lt;wx:font wx:val=&quot;Cambria Math&quot;/&gt;&lt;w:i/&gt;&lt;/w:rPr&gt;&lt;m:t&gt;1+&lt;/m:t&gt;&lt;/m:r&gt;&lt;m:f&gt;&lt;m:fPr&gt;&lt;m:ctrlPr&gt;&lt;w:rPr&gt;&lt;w:rFonts w:ascii=&quot;Cambria Math&quot; w:fareast=&quot;Calibri&quot; w:h-ansi=&quot;Cambria Math&quot; w:cs=&quot;Arial&quot;/&gt;&lt;wx:font wx:val=&quot;Cambria Math&quot;/&gt;&lt;w:i/&gt;&lt;/w:rPr&gt;&lt;/m:ctrlPr&gt;&lt;/m:fPr&gt;&lt;m:num&gt;&lt;m:sSub&gt;&lt;m:sSubPr&gt;&lt;m:ctrlPr&gt;&lt;w:rPr&gt;&lt;w:rFonts w:ascii=&quot;Cambria Math&quot; w:fareast=&quot;Calibri&quot; w:h-ansi=&quot;Cambria Math&quot; w:cs=&quot;Arial&quot;/&gt;&lt;wx:font wx:val=&quot;Cambria Math&quot;/&gt;&lt;w:i/&gt;&lt;/w:rPr&gt;&lt;/m:ctrlPr&gt;&lt;/m:sSubPr&gt;&lt;m:e&gt;&lt;m:r&gt;&lt;w:rPr&gt;&lt;w:rFonts w:ascii=&quot;Cambria Math&quot; w:fareast=&quot;Calibri&quot; w:h-ansi=&quot;Cambria Math&quot; w:cs=&quot;Arial&quot;/&gt;&lt;wx:font wx:val=&quot;Cambria Math&quot;/&gt;&lt;w:i/&gt;&lt;/w:rPr&gt;&lt;m:t&gt;R&lt;/m:t&gt;&lt;/m:r&gt;&lt;/m:e&gt;&lt;m:sub&gt;&lt;m:r&gt;&lt;w:rPr&gt;&lt;w:rFonts w:ascii=&quot;Cambria Math&quot; w:fareast=&quot;Calibri&quot; w:h-ansi=&quot;Cambria Math&quot; w:cs=&quot;Arial&quot;/&gt;&lt;wx:font wx:val=&quot;Cambria Math&quot;/&gt;&lt;w:i/&gt;&lt;/w:rPr&gt;&lt;m:t&gt;2&lt;/m:t&gt;&lt;/m:r&gt;&lt;/m:sub&gt;&lt;/m:sSub&gt;&lt;/m:num&gt;&lt;m:den&gt;&lt;m:sSub&gt;&lt;m:sSubPr&gt;&lt;m:ctrlPr&gt;&lt;w:rPr&gt;&lt;w:rFonts w:ascii=&quot;Cambria Math&quot; w:fareast=&quot;Calibri&quot; w:h-ansi=&quot;Cambria Math&quot; w:cs=&quot;Arial&quot;/&gt;&lt;wx:font wx:val=&quot;Cambria Math&quot;/&gt;&lt;w:i/&gt;&lt;/w:rPr&gt;&lt;/m:ctrlPr&gt;&lt;/m:sSubPr&gt;&lt;m:e&gt;&lt;m:r&gt;&lt;w:rPr&gt;&lt;w:rFonts w:ascii=&quot;Cambria Math&quot; w:fareast=&quot;Calibri&quot; w:h-ansi=&quot;Cambria Math&quot; w:cs=&quot;Arial&quot;/&gt;&lt;wx:font wx:val=&quot;Cambria Math&quot;/&gt;&lt;w:i/&gt;&lt;/w:rPr&gt;&lt;m:t&gt;R&lt;/m:t&gt;&lt;/m:r&gt;&lt;/m:e&gt;&lt;m:sub&gt;&lt;m:r&gt;&lt;w:rPr&gt;&lt;w:rFonts w:ascii=&quot;Cambria Math&quot; w:fareast=&quot;Calibri&quot; w:h-ansi=&quot;Cambria Math&quot; w:cs=&quot;Arial&quot;/&gt;&lt;wx:font wx:val=&quot;Cambria Math&quot;/&gt;&lt;w:i/&gt;&lt;/w:rPr&gt;&lt;m:t&gt;1&lt;/m:t&gt;&lt;/m:r&gt;&lt;/m:sub&gt;&lt;/m:sSub&gt;&lt;/m:den&gt;&lt;/m:f&gt;&lt;/m:e&gt;&lt;/m:d&gt;&lt;/m:oMath&gt;&lt;/m:oMathPara&gt;&lt;/w:p&gt;&lt;w:sectPr wsp:rsidR=&quot;00000000&quot; wsp:rsidRPr=&quot;006F379E&quot;&gt;&lt;w:pgSz w:w=&quot;12240&quot; w:h=&quot;15840&quot;/&gt;&lt;w:pgMar w:top=&quot;1440&quot; w:right=&quot;1440&quot; w:bottom=&quot;1440&quot; w:left=&quot;1440&quot; w:header=&quot;720&quot; w:footer=&quot;720&quot; w:gutter=&quot;0&quot;/&gt;&lt;w:cols w:space=&quot;720&quot;/&gt;&lt;/w:sectPr&gt;&lt;/wx:sect&gt;&lt;/w:body&gt;&lt;/w:wordDocument&gt;">
                   <v:imagedata r:id="rId32" o:title="" chromakey="white"/>
                 </v:shape>
               </w:pict>
@@ -3421,7 +3381,7 @@
           <w:noProof/>
         </w:rPr>
         <w:pict w14:anchorId="01338A00">
-          <v:shape id="_x0000_i1931" type="#_x0000_t75" style="width:266.2pt;height:77.45pt">
+          <v:shape id="_x0000_i1064" type="#_x0000_t75" style="width:261pt;height:76.15pt">
             <v:imagedata r:id="rId33" o:title="Diseño Final" croptop="12541f" cropbottom="7393f" cropleft="1531f" cropright="1774f"/>
           </v:shape>
         </w:pict>
@@ -3429,92 +3389,883 @@
     </w:p>
     <w:p>
       <w:pPr>
+        <w:pStyle w:val="IEEEHeading1"/>
+      </w:pPr>
+      <w:r>
+        <w:t>Simulaciones</w:t>
+      </w:r>
+      <w:r>
+        <w:rPr>
+          <w:noProof/>
+        </w:rPr>
+        <w:pict w14:anchorId="2081DA39">
+          <v:shape id="_x0000_i1065" type="#_x0000_t75" style="width:213.9pt;height:105.25pt;visibility:visible;mso-wrap-style:square">
+            <v:imagedata r:id="rId34" o:title="" cropleft="3108f" cropright="2372f"/>
+          </v:shape>
+        </w:pict>
+      </w:r>
+    </w:p>
+    <w:p>
+      <w:pPr>
         <w:pStyle w:val="IEEEParagraph"/>
+        <w:rPr>
+          <w:noProof/>
+        </w:rPr>
+      </w:pPr>
+      <w:r>
+        <w:rPr>
+          <w:noProof/>
+        </w:rPr>
+        <w:pict w14:anchorId="2AFA3070">
+          <v:shape id="_x0000_i1068" type="#_x0000_t75" style="width:235.4pt;height:105.9pt;visibility:visible;mso-wrap-style:square">
+            <v:imagedata r:id="rId35" o:title=""/>
+          </v:shape>
+        </w:pict>
+      </w:r>
+    </w:p>
+    <w:p>
+      <w:pPr>
+        <w:pStyle w:val="IEEEParagraph"/>
+        <w:rPr>
+          <w:noProof/>
+        </w:rPr>
       </w:pPr>
     </w:p>
     <w:p>
       <w:pPr>
         <w:pStyle w:val="IEEEHeading1"/>
-      </w:pPr>
-      <w:r>
-        <w:t>Calibración</w:t>
-      </w:r>
-    </w:p>
+        <w:numPr>
+          <w:ilvl w:val="0"/>
+          <w:numId w:val="5"/>
+        </w:numPr>
+        <w:rPr>
+          <w:lang w:val="es-AR"/>
+        </w:rPr>
+      </w:pPr>
+      <w:r>
+        <w:rPr>
+          <w:lang w:val="es-AR"/>
+        </w:rPr>
+        <w:t>Mediciones de laboratorio</w:t>
+      </w:r>
+    </w:p>
+    <w:p>
+      <w:pPr>
+        <w:pStyle w:val="IEEEHeading1"/>
+        <w:numPr>
+          <w:ilvl w:val="1"/>
+          <w:numId w:val="5"/>
+        </w:numPr>
+        <w:jc w:val="left"/>
+        <w:rPr>
+          <w:lang w:val="es-AR"/>
+        </w:rPr>
+      </w:pPr>
+      <w:r>
+        <w:rPr>
+          <w:lang w:val="es-AR"/>
+        </w:rPr>
+        <w:t>CONDICIONES DE MEDICIÓN</w:t>
+      </w:r>
+    </w:p>
+    <w:tbl>
+      <w:tblPr>
+        <w:tblStyle w:val="Tablaconcuadrcula"/>
+        <w:tblW w:w="4452" w:type="dxa"/>
+        <w:jc w:val="center"/>
+        <w:tblBorders>
+          <w:top w:val="single" w:sz="4" w:space="0" w:color="000000"/>
+          <w:left w:val="single" w:sz="4" w:space="0" w:color="000000"/>
+          <w:bottom w:val="single" w:sz="4" w:space="0" w:color="000000"/>
+          <w:right w:val="single" w:sz="4" w:space="0" w:color="000000"/>
+          <w:insideH w:val="single" w:sz="4" w:space="0" w:color="FFFFFF"/>
+          <w:insideV w:val="single" w:sz="4" w:space="0" w:color="FFFFFF"/>
+        </w:tblBorders>
+        <w:tblLook w:val="04A0" w:firstRow="1" w:lastRow="0" w:firstColumn="1" w:lastColumn="0" w:noHBand="0" w:noVBand="1"/>
+      </w:tblPr>
+      <w:tblGrid>
+        <w:gridCol w:w="2078"/>
+        <w:gridCol w:w="1160"/>
+        <w:gridCol w:w="1214"/>
+      </w:tblGrid>
+      <w:tr>
+        <w:trPr>
+          <w:trHeight w:val="203"/>
+          <w:jc w:val="center"/>
+        </w:trPr>
+        <w:tc>
+          <w:tcPr>
+            <w:tcW w:w="2078" w:type="dxa"/>
+            <w:shd w:val="clear" w:color="auto" w:fill="404040"/>
+            <w:vAlign w:val="center"/>
+          </w:tcPr>
+          <w:p>
+            <w:pPr>
+              <w:jc w:val="center"/>
+              <w:rPr>
+                <w:b/>
+                <w:bCs/>
+                <w:color w:val="FFFFFF"/>
+                <w:sz w:val="18"/>
+                <w:szCs w:val="18"/>
+              </w:rPr>
+            </w:pPr>
+            <w:r>
+              <w:rPr>
+                <w:b/>
+                <w:bCs/>
+                <w:color w:val="FFFFFF"/>
+                <w:sz w:val="18"/>
+                <w:szCs w:val="18"/>
+              </w:rPr>
+              <w:t>Parámetro</w:t>
+            </w:r>
+          </w:p>
+        </w:tc>
+        <w:tc>
+          <w:tcPr>
+            <w:tcW w:w="1160" w:type="dxa"/>
+            <w:shd w:val="clear" w:color="auto" w:fill="404040"/>
+            <w:vAlign w:val="center"/>
+          </w:tcPr>
+          <w:p>
+            <w:pPr>
+              <w:jc w:val="center"/>
+              <w:rPr>
+                <w:b/>
+                <w:bCs/>
+                <w:color w:val="FFFFFF"/>
+                <w:sz w:val="18"/>
+                <w:szCs w:val="18"/>
+              </w:rPr>
+            </w:pPr>
+            <w:r>
+              <w:rPr>
+                <w:rFonts w:eastAsia="Times New Roman"/>
+                <w:b/>
+                <w:bCs/>
+                <w:color w:val="FFFFFF"/>
+                <w:sz w:val="18"/>
+                <w:szCs w:val="18"/>
+              </w:rPr>
+              <w:t>Símbolo</w:t>
+            </w:r>
+          </w:p>
+        </w:tc>
+        <w:tc>
+          <w:tcPr>
+            <w:tcW w:w="1214" w:type="dxa"/>
+            <w:shd w:val="clear" w:color="auto" w:fill="404040"/>
+            <w:vAlign w:val="center"/>
+          </w:tcPr>
+          <w:p>
+            <w:pPr>
+              <w:jc w:val="center"/>
+              <w:rPr>
+                <w:b/>
+                <w:bCs/>
+                <w:color w:val="FFFFFF"/>
+                <w:sz w:val="18"/>
+                <w:szCs w:val="18"/>
+              </w:rPr>
+            </w:pPr>
+            <w:r>
+              <w:rPr>
+                <w:b/>
+                <w:bCs/>
+                <w:color w:val="FFFFFF"/>
+                <w:sz w:val="18"/>
+                <w:szCs w:val="18"/>
+              </w:rPr>
+              <w:t>Valor</w:t>
+            </w:r>
+          </w:p>
+        </w:tc>
+      </w:tr>
+      <w:tr>
+        <w:trPr>
+          <w:trHeight w:val="221"/>
+          <w:jc w:val="center"/>
+        </w:trPr>
+        <w:tc>
+          <w:tcPr>
+            <w:tcW w:w="2078" w:type="dxa"/>
+            <w:vAlign w:val="center"/>
+          </w:tcPr>
+          <w:p>
+            <w:pPr>
+              <w:rPr>
+                <w:sz w:val="18"/>
+                <w:szCs w:val="18"/>
+              </w:rPr>
+            </w:pPr>
+            <w:r>
+              <w:rPr>
+                <w:sz w:val="18"/>
+                <w:szCs w:val="18"/>
+              </w:rPr>
+              <w:t>Tensión de Alimentación</w:t>
+            </w:r>
+          </w:p>
+        </w:tc>
+        <w:tc>
+          <w:tcPr>
+            <w:tcW w:w="1160" w:type="dxa"/>
+            <w:vAlign w:val="center"/>
+          </w:tcPr>
+          <w:p>
+            <w:pPr>
+              <w:rPr>
+                <w:rFonts w:ascii="Calibri" w:eastAsia="Calibri" w:hAnsi="Calibri" w:cs="Arial"/>
+                <w:sz w:val="18"/>
+                <w:szCs w:val="18"/>
+              </w:rPr>
+            </w:pPr>
+            <w:r>
+              <w:rPr>
+                <w:sz w:val="18"/>
+                <w:szCs w:val="18"/>
+              </w:rPr>
+              <w:pict w14:anchorId="4DE1301D">
+                <v:shape id="_x0000_i1199" type="#_x0000_t75" style="width:15.25pt;height:13.85pt" equationxml="&lt;?xml version=&quot;1.0&quot; encoding=&quot;UTF-8&quot; standalone=&quot;yes&quot;?&gt;&#10;&lt;?mso-application progid=&quot;Word.Document&quot;?&gt;&#10;&lt;w:wordDocument xmlns:aml=&quot;http://schemas.microsoft.com/aml/2001/core&quot; xmlns:wpc=&quot;http://schemas.microsoft.com/office/word/2010/wordprocessingCanvas&quot; xmlns:cx=&quot;http://schemas.microsoft.com/office/drawing/2014/chartex&quot; xmlns:cx1=&quot;http://schemas.microsoft.com/office/drawing/2015/9/8/chartex&quot; xmlns:cx2=&quot;http://schemas.microsoft.com/office/drawing/2015/10/21/chartex&quot; xmlns:cx3=&quot;http://schemas.microsoft.com/office/drawing/2016/5/9/chartex&quot; xmlns:cx4=&quot;http://schemas.microsoft.com/office/drawing/2016/5/10/chartex&quot; xmlns:cx5=&quot;http://schemas.microsoft.com/office/drawing/2016/5/11/chartex&quot; xmlns:cx6=&quot;http://schemas.microsoft.com/office/drawing/2016/5/12/chartex&quot; xmlns:cx7=&quot;http://schemas.microsoft.com/office/drawing/2016/5/13/chartex&quot; xmlns:cx8=&quot;http://schemas.microsoft.com/office/drawing/2016/5/14/chartex&quot; xmlns:cr=&quot;http://schemas.microsoft.com/office/comments/2020/reactions&quot; xmlns:dt=&quot;uuid:C2F41010-65B3-11d1-A29F-00AA00C14882&quot; xmlns:mc=&quot;http://schemas.openxmlformats.org/markup-compatibility/2006&quot; xmlns:aink=&quot;http://schemas.microsoft.com/office/drawing/2016/ink&quot; xmlns:am3d=&quot;http://schemas.microsoft.com/office/drawing/2017/model3d&quot; xmlns:o=&quot;urn:schemas-microsoft-com:office:office&quot; xmlns:oel=&quot;http://schemas.microsoft.com/office/2019/extlst&quot; xmlns:m=&quot;http://schemas.openxmlformats.org/officeDocument/2006/math&quot; xmlns:v=&quot;urn:schemas-microsoft-com:vml&quot; xmlns:w10=&quot;urn:schemas-microsoft-com:office:word&quot; xmlns:w=&quot;http://schemas.microsoft.com/office/word/2003/wordml&quot; xmlns:wx=&quot;http://schemas.microsoft.com/office/word/2003/auxHint&quot; xmlns:wne=&quot;http://schemas.microsoft.com/office/word/2006/wordml&quot; xmlns:wsp=&quot;http://schemas.microsoft.com/office/word/2003/wordml/sp2&quot; xmlns:sl=&quot;http://schemas.microsoft.com/schemaLibrary/2003/core&quot; w:macrosPresent=&quot;no&quot; w:embeddedObjPresent=&quot;no&quot; w:ocxPresent=&quot;no&quot; xml:space=&quot;preserve&quot;&gt;&lt;w:ignoreSubtree w:val=&quot;http://schemas.microsoft.com/office/word/2003/wordml/sp2&quot;/&gt;&lt;o:DocumentProperties&gt;&lt;o:Version&gt;16&lt;/o:Version&gt;&lt;/o:DocumentProperties&gt;&lt;w:docPr&gt;&lt;w:view w:val=&quot;print&quot;/&gt;&lt;w:zoom w:percent=&quot;86&quot;/&gt;&lt;w:doNotEmbedSystemFonts/&gt;&lt;w:activeWritingStyle w:lang=&quot;EN-AU&quot; w:vendorID=&quot;64&quot; w:dllVersion=&quot;6&quot; w:nlCheck=&quot;on&quot; w:optionSet=&quot;1&quot;/&gt;&lt;w:activeWritingStyle w:lang=&quot;EN-GB&quot; w:vendorID=&quot;64&quot; w:dllVersion=&quot;6&quot; w:nlCheck=&quot;on&quot; w:optionSet=&quot;1&quot;/&gt;&lt;w:activeWritingStyle w:lang=&quot;EN-US&quot; w:vendorID=&quot;64&quot; w:dllVersion=&quot;6&quot; w:nlCheck=&quot;on&quot; w:optionSet=&quot;1&quot;/&gt;&lt;w:activeWritingStyle w:lang=&quot;EN-AU&quot; w:vendorID=&quot;64&quot; w:dllVersion=&quot;0&quot; w:nlCheck=&quot;on&quot; w:optionSet=&quot;0&quot;/&gt;&lt;w:activeWritingStyle w:lang=&quot;EN-GB&quot; w:vendorID=&quot;64&quot; w:dllVersion=&quot;0&quot; w:nlCheck=&quot;on&quot; w:optionSet=&quot;0&quot;/&gt;&lt;w:activeWritingStyle w:lang=&quot;EN-US&quot; w:vendorID=&quot;64&quot; w:dllVersion=&quot;0&quot; w:nlCheck=&quot;on&quot; w:optionSet=&quot;0&quot;/&gt;&lt;w:activeWritingStyle w:lang=&quot;ES-AR&quot; w:vendorID=&quot;64&quot; w:dllVersion=&quot;0&quot; w:nlCheck=&quot;on&quot; w:optionSet=&quot;0&quot;/&gt;&lt;w:activeWritingStyle w:lang=&quot;580A&quot; w:vendorID=&quot;64&quot; w:dllVersion=&quot;0&quot; w:nlCheck=&quot;on&quot; w:optionSet=&quot;0&quot;/&gt;&lt;w:activeWritingStyle w:lang=&quot;PT-BR&quot; w:vendorID=&quot;64&quot; w:dllVersion=&quot;0&quot; w:nlCheck=&quot;on&quot; w:optionSet=&quot;0&quot;/&gt;&lt;w:stylePaneFormatFilter w:val=&quot;3F01&quot;/&gt;&lt;w:defaultTabStop w:val=&quot;720&quot;/&gt;&lt;w:hyphenationZone w:val=&quot;425&quot;/&gt;&lt;w:characterSpacingControl w:val=&quot;DontCompress&quot;/&gt;&lt;w:optimizeForBrowser/&gt;&lt;w:validateAgainstSchema/&gt;&lt;w:saveInvalidXML w:val=&quot;off&quot;/&gt;&lt;w:ignoreMixedContent w:val=&quot;off&quot;/&gt;&lt;w:alwaysShowPlaceholderText w:val=&quot;off&quot;/&gt;&lt;w:compat&gt;&lt;w:breakWrappedTables/&gt;&lt;w:snapToGridInCell/&gt;&lt;w:applyBreakingRules/&gt;&lt;w:wrapTextWithPunct/&gt;&lt;w:useAsianBreakRules/&gt;&lt;w:useWord2002TableStyleRules/&gt;&lt;w:useFELayout/&gt;&lt;/w:compat&gt;&lt;wsp:rsids&gt;&lt;wsp:rsidRoot wsp:val=&quot;00426FBB&quot;/&gt;&lt;wsp:rsid wsp:val=&quot;000002E1&quot;/&gt;&lt;wsp:rsid wsp:val=&quot;00003C97&quot;/&gt;&lt;wsp:rsid wsp:val=&quot;00004DA6&quot;/&gt;&lt;wsp:rsid wsp:val=&quot;00005565&quot;/&gt;&lt;wsp:rsid wsp:val=&quot;0001754A&quot;/&gt;&lt;wsp:rsid wsp:val=&quot;00017719&quot;/&gt;&lt;wsp:rsid wsp:val=&quot;00027F1D&quot;/&gt;&lt;wsp:rsid wsp:val=&quot;0003296C&quot;/&gt;&lt;wsp:rsid wsp:val=&quot;0003351F&quot;/&gt;&lt;wsp:rsid wsp:val=&quot;00044599&quot;/&gt;&lt;wsp:rsid wsp:val=&quot;000540E6&quot;/&gt;&lt;wsp:rsid wsp:val=&quot;00054421&quot;/&gt;&lt;wsp:rsid wsp:val=&quot;00062E46&quot;/&gt;&lt;wsp:rsid wsp:val=&quot;00074AC8&quot;/&gt;&lt;wsp:rsid wsp:val=&quot;00081408&quot;/&gt;&lt;wsp:rsid wsp:val=&quot;00081EBE&quot;/&gt;&lt;wsp:rsid wsp:val=&quot;00086EDC&quot;/&gt;&lt;wsp:rsid wsp:val=&quot;000B1236&quot;/&gt;&lt;wsp:rsid wsp:val=&quot;000B36A3&quot;/&gt;&lt;wsp:rsid wsp:val=&quot;000C013C&quot;/&gt;&lt;wsp:rsid wsp:val=&quot;000E3F84&quot;/&gt;&lt;wsp:rsid wsp:val=&quot;001056DF&quot;/&gt;&lt;wsp:rsid wsp:val=&quot;0010789C&quot;/&gt;&lt;wsp:rsid wsp:val=&quot;00110768&quot;/&gt;&lt;wsp:rsid wsp:val=&quot;00114025&quot;/&gt;&lt;wsp:rsid wsp:val=&quot;001160D2&quot;/&gt;&lt;wsp:rsid wsp:val=&quot;00120636&quot;/&gt;&lt;wsp:rsid wsp:val=&quot;001348A5&quot;/&gt;&lt;wsp:rsid wsp:val=&quot;00151B8E&quot;/&gt;&lt;wsp:rsid wsp:val=&quot;00182170&quot;/&gt;&lt;wsp:rsid wsp:val=&quot;0019165C&quot;/&gt;&lt;wsp:rsid wsp:val=&quot;00191C89&quot;/&gt;&lt;wsp:rsid wsp:val=&quot;001928FB&quot;/&gt;&lt;wsp:rsid wsp:val=&quot;00192BC7&quot;/&gt;&lt;wsp:rsid wsp:val=&quot;00195BE6&quot;/&gt;&lt;wsp:rsid wsp:val=&quot;001A3C37&quot;/&gt;&lt;wsp:rsid wsp:val=&quot;001A50EA&quot;/&gt;&lt;wsp:rsid wsp:val=&quot;001D2878&quot;/&gt;&lt;wsp:rsid wsp:val=&quot;001F16CD&quot;/&gt;&lt;wsp:rsid wsp:val=&quot;001F47D2&quot;/&gt;&lt;wsp:rsid wsp:val=&quot;002029C8&quot;/&gt;&lt;wsp:rsid wsp:val=&quot;0022285A&quot;/&gt;&lt;wsp:rsid wsp:val=&quot;00224C61&quot;/&gt;&lt;wsp:rsid wsp:val=&quot;00256ABC&quot;/&gt;&lt;wsp:rsid wsp:val=&quot;00257067&quot;/&gt;&lt;wsp:rsid wsp:val=&quot;0027227B&quot;/&gt;&lt;wsp:rsid wsp:val=&quot;00273AC7&quot;/&gt;&lt;wsp:rsid wsp:val=&quot;00273D2C&quot;/&gt;&lt;wsp:rsid wsp:val=&quot;00285ECD&quot;/&gt;&lt;wsp:rsid wsp:val=&quot;00290E1B&quot;/&gt;&lt;wsp:rsid wsp:val=&quot;00291B17&quot;/&gt;&lt;wsp:rsid wsp:val=&quot;00291BB3&quot;/&gt;&lt;wsp:rsid wsp:val=&quot;002A6742&quot;/&gt;&lt;wsp:rsid wsp:val=&quot;002C1A7F&quot;/&gt;&lt;wsp:rsid wsp:val=&quot;002C4239&quot;/&gt;&lt;wsp:rsid wsp:val=&quot;002C559D&quot;/&gt;&lt;wsp:rsid wsp:val=&quot;002D16AE&quot;/&gt;&lt;wsp:rsid wsp:val=&quot;002D2D42&quot;/&gt;&lt;wsp:rsid wsp:val=&quot;002F72D0&quot;/&gt;&lt;wsp:rsid wsp:val=&quot;002F7A4F&quot;/&gt;&lt;wsp:rsid wsp:val=&quot;003003AB&quot;/&gt;&lt;wsp:rsid wsp:val=&quot;00302C35&quot;/&gt;&lt;wsp:rsid wsp:val=&quot;00311C49&quot;/&gt;&lt;wsp:rsid wsp:val=&quot;0032119E&quot;/&gt;&lt;wsp:rsid wsp:val=&quot;00321304&quot;/&gt;&lt;wsp:rsid wsp:val=&quot;00324FC2&quot;/&gt;&lt;wsp:rsid wsp:val=&quot;003312CA&quot;/&gt;&lt;wsp:rsid wsp:val=&quot;00331F84&quot;/&gt;&lt;wsp:rsid wsp:val=&quot;003329D6&quot;/&gt;&lt;wsp:rsid wsp:val=&quot;003645A1&quot;/&gt;&lt;wsp:rsid wsp:val=&quot;0037721F&quot;/&gt;&lt;wsp:rsid wsp:val=&quot;003950A4&quot;/&gt;&lt;wsp:rsid wsp:val=&quot;003A1E7E&quot;/&gt;&lt;wsp:rsid wsp:val=&quot;003C7045&quot;/&gt;&lt;wsp:rsid wsp:val=&quot;003E2FDC&quot;/&gt;&lt;wsp:rsid wsp:val=&quot;003E3577&quot;/&gt;&lt;wsp:rsid wsp:val=&quot;003F3A61&quot;/&gt;&lt;wsp:rsid wsp:val=&quot;00410A5D&quot;/&gt;&lt;wsp:rsid wsp:val=&quot;00414909&quot;/&gt;&lt;wsp:rsid wsp:val=&quot;00416537&quot;/&gt;&lt;wsp:rsid wsp:val=&quot;00425A6A&quot;/&gt;&lt;wsp:rsid wsp:val=&quot;00426FBB&quot;/&gt;&lt;wsp:rsid wsp:val=&quot;00454542&quot;/&gt;&lt;wsp:rsid wsp:val=&quot;0047429A&quot;/&gt;&lt;wsp:rsid wsp:val=&quot;0048374C&quot;/&gt;&lt;wsp:rsid wsp:val=&quot;0048771D&quot;/&gt;&lt;wsp:rsid wsp:val=&quot;004A3EF0&quot;/&gt;&lt;wsp:rsid wsp:val=&quot;004A6605&quot;/&gt;&lt;wsp:rsid wsp:val=&quot;004B3B15&quot;/&gt;&lt;wsp:rsid wsp:val=&quot;004C45FA&quot;/&gt;&lt;wsp:rsid wsp:val=&quot;004D35A3&quot;/&gt;&lt;wsp:rsid wsp:val=&quot;004E1BD8&quot;/&gt;&lt;wsp:rsid wsp:val=&quot;004E452A&quot;/&gt;&lt;wsp:rsid wsp:val=&quot;004E78E3&quot;/&gt;&lt;wsp:rsid wsp:val=&quot;004F2BFE&quot;/&gt;&lt;wsp:rsid wsp:val=&quot;004F63D3&quot;/&gt;&lt;wsp:rsid wsp:val=&quot;004F7DCF&quot;/&gt;&lt;wsp:rsid wsp:val=&quot;005004BF&quot;/&gt;&lt;wsp:rsid wsp:val=&quot;00502E89&quot;/&gt;&lt;wsp:rsid wsp:val=&quot;00506CFE&quot;/&gt;&lt;wsp:rsid wsp:val=&quot;00510106&quot;/&gt;&lt;wsp:rsid wsp:val=&quot;00510E95&quot;/&gt;&lt;wsp:rsid wsp:val=&quot;005225C3&quot;/&gt;&lt;wsp:rsid wsp:val=&quot;00527D56&quot;/&gt;&lt;wsp:rsid wsp:val=&quot;0053221F&quot;/&gt;&lt;wsp:rsid wsp:val=&quot;00536FAE&quot;/&gt;&lt;wsp:rsid wsp:val=&quot;00542C85&quot;/&gt;&lt;wsp:rsid wsp:val=&quot;00553510&quot;/&gt;&lt;wsp:rsid wsp:val=&quot;00554186&quot;/&gt;&lt;wsp:rsid wsp:val=&quot;00585769&quot;/&gt;&lt;wsp:rsid wsp:val=&quot;00585C61&quot;/&gt;&lt;wsp:rsid wsp:val=&quot;00591130&quot;/&gt;&lt;wsp:rsid wsp:val=&quot;005A3F28&quot;/&gt;&lt;wsp:rsid wsp:val=&quot;005A40BE&quot;/&gt;&lt;wsp:rsid wsp:val=&quot;005B13E2&quot;/&gt;&lt;wsp:rsid wsp:val=&quot;005B47D7&quot;/&gt;&lt;wsp:rsid wsp:val=&quot;005C5526&quot;/&gt;&lt;wsp:rsid wsp:val=&quot;005C62C6&quot;/&gt;&lt;wsp:rsid wsp:val=&quot;005D7B9E&quot;/&gt;&lt;wsp:rsid wsp:val=&quot;005E112E&quot;/&gt;&lt;wsp:rsid wsp:val=&quot;005F0834&quot;/&gt;&lt;wsp:rsid wsp:val=&quot;005F68AB&quot;/&gt;&lt;wsp:rsid wsp:val=&quot;005F6DC3&quot;/&gt;&lt;wsp:rsid wsp:val=&quot;00601A8E&quot;/&gt;&lt;wsp:rsid wsp:val=&quot;0062033E&quot;/&gt;&lt;wsp:rsid wsp:val=&quot;00624482&quot;/&gt;&lt;wsp:rsid wsp:val=&quot;00630477&quot;/&gt;&lt;wsp:rsid wsp:val=&quot;0064799C&quot;/&gt;&lt;wsp:rsid wsp:val=&quot;00654156&quot;/&gt;&lt;wsp:rsid wsp:val=&quot;00656ADC&quot;/&gt;&lt;wsp:rsid wsp:val=&quot;006B47CA&quot;/&gt;&lt;wsp:rsid wsp:val=&quot;006C304C&quot;/&gt;&lt;wsp:rsid wsp:val=&quot;006C4511&quot;/&gt;&lt;wsp:rsid wsp:val=&quot;006C65F5&quot;/&gt;&lt;wsp:rsid wsp:val=&quot;006C7AAA&quot;/&gt;&lt;wsp:rsid wsp:val=&quot;006D1C2A&quot;/&gt;&lt;wsp:rsid wsp:val=&quot;006D264F&quot;/&gt;&lt;wsp:rsid wsp:val=&quot;006D4E89&quot;/&gt;&lt;wsp:rsid wsp:val=&quot;006E2A8D&quot;/&gt;&lt;wsp:rsid wsp:val=&quot;006E7574&quot;/&gt;&lt;wsp:rsid wsp:val=&quot;00703430&quot;/&gt;&lt;wsp:rsid wsp:val=&quot;00703548&quot;/&gt;&lt;wsp:rsid wsp:val=&quot;00704E18&quot;/&gt;&lt;wsp:rsid wsp:val=&quot;007069BE&quot;/&gt;&lt;wsp:rsid wsp:val=&quot;00745C86&quot;/&gt;&lt;wsp:rsid wsp:val=&quot;00764603&quot;/&gt;&lt;wsp:rsid wsp:val=&quot;007653C5&quot;/&gt;&lt;wsp:rsid wsp:val=&quot;0076604D&quot;/&gt;&lt;wsp:rsid wsp:val=&quot;00790909&quot;/&gt;&lt;wsp:rsid wsp:val=&quot;007929AF&quot;/&gt;&lt;wsp:rsid wsp:val=&quot;00792D4A&quot;/&gt;&lt;wsp:rsid wsp:val=&quot;007B1582&quot;/&gt;&lt;wsp:rsid wsp:val=&quot;007B5A07&quot;/&gt;&lt;wsp:rsid wsp:val=&quot;007C065D&quot;/&gt;&lt;wsp:rsid wsp:val=&quot;007D3E71&quot;/&gt;&lt;wsp:rsid wsp:val=&quot;007E5D6A&quot;/&gt;&lt;wsp:rsid wsp:val=&quot;007E645D&quot;/&gt;&lt;wsp:rsid wsp:val=&quot;007F75CA&quot;/&gt;&lt;wsp:rsid wsp:val=&quot;00821E08&quot;/&gt;&lt;wsp:rsid wsp:val=&quot;00834EFD&quot;/&gt;&lt;wsp:rsid wsp:val=&quot;00843007&quot;/&gt;&lt;wsp:rsid wsp:val=&quot;00844B24&quot;/&gt;&lt;wsp:rsid wsp:val=&quot;0084515F&quot;/&gt;&lt;wsp:rsid wsp:val=&quot;0085092D&quot;/&gt;&lt;wsp:rsid wsp:val=&quot;00865414&quot;/&gt;&lt;wsp:rsid wsp:val=&quot;00877D4C&quot;/&gt;&lt;wsp:rsid wsp:val=&quot;008831DC&quot;/&gt;&lt;wsp:rsid wsp:val=&quot;00883903&quot;/&gt;&lt;wsp:rsid wsp:val=&quot;00891C30&quot;/&gt;&lt;wsp:rsid wsp:val=&quot;00897219&quot;/&gt;&lt;wsp:rsid wsp:val=&quot;0089763B&quot;/&gt;&lt;wsp:rsid wsp:val=&quot;008B6AE3&quot;/&gt;&lt;wsp:rsid wsp:val=&quot;008C1332&quot;/&gt;&lt;wsp:rsid wsp:val=&quot;008D1045&quot;/&gt;&lt;wsp:rsid wsp:val=&quot;008E5996&quot;/&gt;&lt;wsp:rsid wsp:val=&quot;00901AE1&quot;/&gt;&lt;wsp:rsid wsp:val=&quot;00912F93&quot;/&gt;&lt;wsp:rsid wsp:val=&quot;009156AA&quot;/&gt;&lt;wsp:rsid wsp:val=&quot;009205B4&quot;/&gt;&lt;wsp:rsid wsp:val=&quot;00955B59&quot;/&gt;&lt;wsp:rsid wsp:val=&quot;00992262&quot;/&gt;&lt;wsp:rsid wsp:val=&quot;009926BC&quot;/&gt;&lt;wsp:rsid wsp:val=&quot;009A4319&quot;/&gt;&lt;wsp:rsid wsp:val=&quot;009A6C3F&quot;/&gt;&lt;wsp:rsid wsp:val=&quot;009B73F2&quot;/&gt;&lt;wsp:rsid wsp:val=&quot;009C12BD&quot;/&gt;&lt;wsp:rsid wsp:val=&quot;009C50FE&quot;/&gt;&lt;wsp:rsid wsp:val=&quot;009E49DD&quot;/&gt;&lt;wsp:rsid wsp:val=&quot;00A03E75&quot;/&gt;&lt;wsp:rsid wsp:val=&quot;00A20627&quot;/&gt;&lt;wsp:rsid wsp:val=&quot;00A22FE9&quot;/&gt;&lt;wsp:rsid wsp:val=&quot;00A31A44&quot;/&gt;&lt;wsp:rsid wsp:val=&quot;00A32BFA&quot;/&gt;&lt;wsp:rsid wsp:val=&quot;00A3325E&quot;/&gt;&lt;wsp:rsid wsp:val=&quot;00A366E2&quot;/&gt;&lt;wsp:rsid wsp:val=&quot;00A45FCE&quot;/&gt;&lt;wsp:rsid wsp:val=&quot;00A75671&quot;/&gt;&lt;wsp:rsid wsp:val=&quot;00A773CC&quot;/&gt;&lt;wsp:rsid wsp:val=&quot;00A924D0&quot;/&gt;&lt;wsp:rsid wsp:val=&quot;00A9318B&quot;/&gt;&lt;wsp:rsid wsp:val=&quot;00A94AC1&quot;/&gt;&lt;wsp:rsid wsp:val=&quot;00AB18B7&quot;/&gt;&lt;wsp:rsid wsp:val=&quot;00AD335D&quot;/&gt;&lt;wsp:rsid wsp:val=&quot;00AF114C&quot;/&gt;&lt;wsp:rsid wsp:val=&quot;00AF792B&quot;/&gt;&lt;wsp:rsid wsp:val=&quot;00B2440C&quot;/&gt;&lt;wsp:rsid wsp:val=&quot;00B32137&quot;/&gt;&lt;wsp:rsid wsp:val=&quot;00B33D2F&quot;/&gt;&lt;wsp:rsid wsp:val=&quot;00B40A5B&quot;/&gt;&lt;wsp:rsid wsp:val=&quot;00B45C6B&quot;/&gt;&lt;wsp:rsid wsp:val=&quot;00B55D5E&quot;/&gt;&lt;wsp:rsid wsp:val=&quot;00B57A80&quot;/&gt;&lt;wsp:rsid wsp:val=&quot;00B70E9C&quot;/&gt;&lt;wsp:rsid wsp:val=&quot;00B713D8&quot;/&gt;&lt;wsp:rsid wsp:val=&quot;00B72979&quot;/&gt;&lt;wsp:rsid wsp:val=&quot;00B94516&quot;/&gt;&lt;wsp:rsid wsp:val=&quot;00BA25E2&quot;/&gt;&lt;wsp:rsid wsp:val=&quot;00BB2855&quot;/&gt;&lt;wsp:rsid wsp:val=&quot;00BC5343&quot;/&gt;&lt;wsp:rsid wsp:val=&quot;00BD19C1&quot;/&gt;&lt;wsp:rsid wsp:val=&quot;00BD25B8&quot;/&gt;&lt;wsp:rsid wsp:val=&quot;00C012E1&quot;/&gt;&lt;wsp:rsid wsp:val=&quot;00C06BB4&quot;/&gt;&lt;wsp:rsid wsp:val=&quot;00C10D20&quot;/&gt;&lt;wsp:rsid wsp:val=&quot;00C12E0C&quot;/&gt;&lt;wsp:rsid wsp:val=&quot;00C21916&quot;/&gt;&lt;wsp:rsid wsp:val=&quot;00C34915&quot;/&gt;&lt;wsp:rsid wsp:val=&quot;00C457CA&quot;/&gt;&lt;wsp:rsid wsp:val=&quot;00C47EAE&quot;/&gt;&lt;wsp:rsid wsp:val=&quot;00C53FB6&quot;/&gt;&lt;wsp:rsid wsp:val=&quot;00C57FB7&quot;/&gt;&lt;wsp:rsid wsp:val=&quot;00C644D4&quot;/&gt;&lt;wsp:rsid wsp:val=&quot;00C65F3F&quot;/&gt;&lt;wsp:rsid wsp:val=&quot;00C72414&quot;/&gt;&lt;wsp:rsid wsp:val=&quot;00C72B1A&quot;/&gt;&lt;wsp:rsid wsp:val=&quot;00C8667B&quot;/&gt;&lt;wsp:rsid wsp:val=&quot;00C90993&quot;/&gt;&lt;wsp:rsid wsp:val=&quot;00CA4CE3&quot;/&gt;&lt;wsp:rsid wsp:val=&quot;00CA5A12&quot;/&gt;&lt;wsp:rsid wsp:val=&quot;00CB4ADD&quot;/&gt;&lt;wsp:rsid wsp:val=&quot;00CC72FD&quot;/&gt;&lt;wsp:rsid wsp:val=&quot;00CD1D23&quot;/&gt;&lt;wsp:rsid wsp:val=&quot;00CD4F3F&quot;/&gt;&lt;wsp:rsid wsp:val=&quot;00D311F8&quot;/&gt;&lt;wsp:rsid wsp:val=&quot;00D31660&quot;/&gt;&lt;wsp:rsid wsp:val=&quot;00D36B52&quot;/&gt;&lt;wsp:rsid wsp:val=&quot;00D377C8&quot;/&gt;&lt;wsp:rsid wsp:val=&quot;00D41274&quot;/&gt;&lt;wsp:rsid wsp:val=&quot;00D4229C&quot;/&gt;&lt;wsp:rsid wsp:val=&quot;00D43BF3&quot;/&gt;&lt;wsp:rsid wsp:val=&quot;00D549FB&quot;/&gt;&lt;wsp:rsid wsp:val=&quot;00D56487&quot;/&gt;&lt;wsp:rsid wsp:val=&quot;00D767BB&quot;/&gt;&lt;wsp:rsid wsp:val=&quot;00D939B0&quot;/&gt;&lt;wsp:rsid wsp:val=&quot;00DA31A2&quot;/&gt;&lt;wsp:rsid wsp:val=&quot;00DB16E0&quot;/&gt;&lt;wsp:rsid wsp:val=&quot;00DB2DF9&quot;/&gt;&lt;wsp:rsid wsp:val=&quot;00DB465D&quot;/&gt;&lt;wsp:rsid wsp:val=&quot;00DB48A2&quot;/&gt;&lt;wsp:rsid wsp:val=&quot;00DB7E63&quot;/&gt;&lt;wsp:rsid wsp:val=&quot;00DC2055&quot;/&gt;&lt;wsp:rsid wsp:val=&quot;00DC3908&quot;/&gt;&lt;wsp:rsid wsp:val=&quot;00DD71E8&quot;/&gt;&lt;wsp:rsid wsp:val=&quot;00DD7F83&quot;/&gt;&lt;wsp:rsid wsp:val=&quot;00DE4EB8&quot;/&gt;&lt;wsp:rsid wsp:val=&quot;00E0641E&quot;/&gt;&lt;wsp:rsid wsp:val=&quot;00E06664&quot;/&gt;&lt;wsp:rsid wsp:val=&quot;00E304BC&quot;/&gt;&lt;wsp:rsid wsp:val=&quot;00E32853&quot;/&gt;&lt;wsp:rsid wsp:val=&quot;00E34EBD&quot;/&gt;&lt;wsp:rsid wsp:val=&quot;00E401F8&quot;/&gt;&lt;wsp:rsid wsp:val=&quot;00E46425&quot;/&gt;&lt;wsp:rsid wsp:val=&quot;00E469FC&quot;/&gt;&lt;wsp:rsid wsp:val=&quot;00E474EB&quot;/&gt;&lt;wsp:rsid wsp:val=&quot;00E47D0E&quot;/&gt;&lt;wsp:rsid wsp:val=&quot;00E65018&quot;/&gt;&lt;wsp:rsid wsp:val=&quot;00E76CA1&quot;/&gt;&lt;wsp:rsid wsp:val=&quot;00E94339&quot;/&gt;&lt;wsp:rsid wsp:val=&quot;00E97563&quot;/&gt;&lt;wsp:rsid wsp:val=&quot;00EB0B63&quot;/&gt;&lt;wsp:rsid wsp:val=&quot;00EC265C&quot;/&gt;&lt;wsp:rsid wsp:val=&quot;00ED61CB&quot;/&gt;&lt;wsp:rsid wsp:val=&quot;00EE752A&quot;/&gt;&lt;wsp:rsid wsp:val=&quot;00F06A72&quot;/&gt;&lt;wsp:rsid wsp:val=&quot;00F12D5B&quot;/&gt;&lt;wsp:rsid wsp:val=&quot;00F136F0&quot;/&gt;&lt;wsp:rsid wsp:val=&quot;00F20BBB&quot;/&gt;&lt;wsp:rsid wsp:val=&quot;00F36048&quot;/&gt;&lt;wsp:rsid wsp:val=&quot;00F43BD8&quot;/&gt;&lt;wsp:rsid wsp:val=&quot;00F562F3&quot;/&gt;&lt;wsp:rsid wsp:val=&quot;00F74B89&quot;/&gt;&lt;wsp:rsid wsp:val=&quot;00F75133&quot;/&gt;&lt;wsp:rsid wsp:val=&quot;00F83272&quot;/&gt;&lt;wsp:rsid wsp:val=&quot;00F9358D&quot;/&gt;&lt;wsp:rsid wsp:val=&quot;00F9369B&quot;/&gt;&lt;wsp:rsid wsp:val=&quot;00FA3899&quot;/&gt;&lt;wsp:rsid wsp:val=&quot;00FA4909&quot;/&gt;&lt;wsp:rsid wsp:val=&quot;00FA5164&quot;/&gt;&lt;wsp:rsid wsp:val=&quot;00FA6751&quot;/&gt;&lt;wsp:rsid wsp:val=&quot;00FA6BD7&quot;/&gt;&lt;wsp:rsid wsp:val=&quot;00FB1048&quot;/&gt;&lt;wsp:rsid wsp:val=&quot;00FB62C4&quot;/&gt;&lt;wsp:rsid wsp:val=&quot;00FB7701&quot;/&gt;&lt;wsp:rsid wsp:val=&quot;00FD1AC5&quot;/&gt;&lt;wsp:rsid wsp:val=&quot;00FD5CF0&quot;/&gt;&lt;/wsp:rsids&gt;&lt;/w:docPr&gt;&lt;w:body&gt;&lt;wx:sect&gt;&lt;w:p wsp:rsidR=&quot;00191C89&quot; wsp:rsidRPr=&quot;00191C89&quot; wsp:rsidRDefault=&quot;00191C89&quot; wsp:rsidP=&quot;00191C89&quot;&gt;&lt;m:oMathPara&gt;&lt;m:oMath&gt;&lt;m:sSub&gt;&lt;m:sSubPr&gt;&lt;m:ctrlPr&gt;&lt;w:rPr&gt;&lt;w:rFonts w:ascii=&quot;Cambria Math&quot; w:fareast=&quot;Calibri&quot; w:h-ansi=&quot;Cambria Math&quot; w:cs=&quot;Arial&quot;/&gt;&lt;wx:font wx:val=&quot;Cambria Math&quot;/&gt;&lt;w:i/&gt;&lt;/w:rPr&gt;&lt;/m:ctrlPr&gt;&lt;/m:sSubPr&gt;&lt;m:e&gt;&lt;m:r&gt;&lt;w:rPr&gt;&lt;w:rFonts w:ascii=&quot;Cambria Math&quot; w:fareast=&quot;Calibri&quot; w:h-ansi=&quot;Cambria Math&quot; w:cs=&quot;Arial&quot;/&gt;&lt;wx:font wx:val=&quot;Cambria Math&quot;/&gt;&lt;w:i/&gt;&lt;/w:rPr&gt;&lt;m:t&gt;V&lt;/m:t&gt;&lt;/m:r&gt;&lt;/m:e&gt;&lt;m:sub&gt;&lt;m:r&gt;&lt;w:rPr&gt;&lt;w:rFonts w:ascii=&quot;Cambria Math&quot; w:fareast=&quot;Calibri&quot; w:h-ansi=&quot;Cambria Math&quot; w:cs=&quot;Arial&quot;/&gt;&lt;wx:font wx:val=&quot;Cambria Math&quot;/&gt;&lt;w:i/&gt;&lt;/w:rPr&gt;&lt;m:t&gt;in&lt;/m:t&gt;&lt;/m:r&gt;&lt;/m:sub&gt;&lt;/m:sSub&gt;&lt;/m:oMath&gt;&lt;/m:oMathPara&gt;&lt;/w:p&gt;&lt;w:sectPr wsp:rsidR=&quot;00000000&quot; wsp:rsidRPr=&quot;00191C89&quot;&gt;&lt;w:pgSz w:w=&quot;12240&quot; w:h=&quot;15840&quot;/&gt;&lt;w:pgMar w:top=&quot;1440&quot; w:right=&quot;1440&quot; w:bottom=&quot;1440&quot; w:left=&quot;1440&quot; w:header=&quot;720&quot; w:footer=&quot;720&quot; w:gutter=&quot;0&quot;/&gt;&lt;w:cols w:space=&quot;720&quot;/&gt;&lt;/w:sectPr&gt;&lt;/wx:sect&gt;&lt;/w:body&gt;&lt;/w:wordDocument&gt;">
+                  <v:imagedata r:id="rId13" o:title="" chromakey="white"/>
+                </v:shape>
+              </w:pict>
+            </w:r>
+          </w:p>
+        </w:tc>
+        <w:tc>
+          <w:tcPr>
+            <w:tcW w:w="1214" w:type="dxa"/>
+            <w:vAlign w:val="center"/>
+          </w:tcPr>
+          <w:p>
+            <w:pPr>
+              <w:rPr>
+                <w:sz w:val="18"/>
+                <w:szCs w:val="18"/>
+              </w:rPr>
+            </w:pPr>
+            <w:r>
+              <w:rPr>
+                <w:sz w:val="18"/>
+                <w:szCs w:val="18"/>
+              </w:rPr>
+              <w:pict w14:anchorId="52FF9D47">
+                <v:shape id="_x0000_i1200" type="#_x0000_t75" style="width:29.75pt;height:13.85pt" equationxml="&lt;?xml version=&quot;1.0&quot; encoding=&quot;UTF-8&quot; standalone=&quot;yes&quot;?&gt;&#10;&lt;?mso-application progid=&quot;Word.Document&quot;?&gt;&#10;&lt;w:wordDocument xmlns:aml=&quot;http://schemas.microsoft.com/aml/2001/core&quot; xmlns:wpc=&quot;http://schemas.microsoft.com/office/word/2010/wordprocessingCanvas&quot; xmlns:cx=&quot;http://schemas.microsoft.com/office/drawing/2014/chartex&quot; xmlns:cx1=&quot;http://schemas.microsoft.com/office/drawing/2015/9/8/chartex&quot; xmlns:cx2=&quot;http://schemas.microsoft.com/office/drawing/2015/10/21/chartex&quot; xmlns:cx3=&quot;http://schemas.microsoft.com/office/drawing/2016/5/9/chartex&quot; xmlns:cx4=&quot;http://schemas.microsoft.com/office/drawing/2016/5/10/chartex&quot; xmlns:cx5=&quot;http://schemas.microsoft.com/office/drawing/2016/5/11/chartex&quot; xmlns:cx6=&quot;http://schemas.microsoft.com/office/drawing/2016/5/12/chartex&quot; xmlns:cx7=&quot;http://schemas.microsoft.com/office/drawing/2016/5/13/chartex&quot; xmlns:cx8=&quot;http://schemas.microsoft.com/office/drawing/2016/5/14/chartex&quot; xmlns:cr=&quot;http://schemas.microsoft.com/office/comments/2020/reactions&quot; xmlns:dt=&quot;uuid:C2F41010-65B3-11d1-A29F-00AA00C14882&quot; xmlns:mc=&quot;http://schemas.openxmlformats.org/markup-compatibility/2006&quot; xmlns:aink=&quot;http://schemas.microsoft.com/office/drawing/2016/ink&quot; xmlns:am3d=&quot;http://schemas.microsoft.com/office/drawing/2017/model3d&quot; xmlns:o=&quot;urn:schemas-microsoft-com:office:office&quot; xmlns:oel=&quot;http://schemas.microsoft.com/office/2019/extlst&quot; xmlns:m=&quot;http://schemas.openxmlformats.org/officeDocument/2006/math&quot; xmlns:v=&quot;urn:schemas-microsoft-com:vml&quot; xmlns:w10=&quot;urn:schemas-microsoft-com:office:word&quot; xmlns:w=&quot;http://schemas.microsoft.com/office/word/2003/wordml&quot; xmlns:wx=&quot;http://schemas.microsoft.com/office/word/2003/auxHint&quot; xmlns:wne=&quot;http://schemas.microsoft.com/office/word/2006/wordml&quot; xmlns:wsp=&quot;http://schemas.microsoft.com/office/word/2003/wordml/sp2&quot; xmlns:sl=&quot;http://schemas.microsoft.com/schemaLibrary/2003/core&quot; w:macrosPresent=&quot;no&quot; w:embeddedObjPresent=&quot;no&quot; w:ocxPresent=&quot;no&quot; xml:space=&quot;preserve&quot;&gt;&lt;w:ignoreSubtree w:val=&quot;http://schemas.microsoft.com/office/word/2003/wordml/sp2&quot;/&gt;&lt;o:DocumentProperties&gt;&lt;o:Version&gt;16&lt;/o:Version&gt;&lt;/o:DocumentProperties&gt;&lt;w:docPr&gt;&lt;w:view w:val=&quot;print&quot;/&gt;&lt;w:zoom w:percent=&quot;86&quot;/&gt;&lt;w:doNotEmbedSystemFonts/&gt;&lt;w:activeWritingStyle w:lang=&quot;EN-AU&quot; w:vendorID=&quot;64&quot; w:dllVersion=&quot;6&quot; w:nlCheck=&quot;on&quot; w:optionSet=&quot;1&quot;/&gt;&lt;w:activeWritingStyle w:lang=&quot;EN-GB&quot; w:vendorID=&quot;64&quot; w:dllVersion=&quot;6&quot; w:nlCheck=&quot;on&quot; w:optionSet=&quot;1&quot;/&gt;&lt;w:activeWritingStyle w:lang=&quot;EN-US&quot; w:vendorID=&quot;64&quot; w:dllVersion=&quot;6&quot; w:nlCheck=&quot;on&quot; w:optionSet=&quot;1&quot;/&gt;&lt;w:activeWritingStyle w:lang=&quot;EN-AU&quot; w:vendorID=&quot;64&quot; w:dllVersion=&quot;0&quot; w:nlCheck=&quot;on&quot; w:optionSet=&quot;0&quot;/&gt;&lt;w:activeWritingStyle w:lang=&quot;EN-GB&quot; w:vendorID=&quot;64&quot; w:dllVersion=&quot;0&quot; w:nlCheck=&quot;on&quot; w:optionSet=&quot;0&quot;/&gt;&lt;w:activeWritingStyle w:lang=&quot;EN-US&quot; w:vendorID=&quot;64&quot; w:dllVersion=&quot;0&quot; w:nlCheck=&quot;on&quot; w:optionSet=&quot;0&quot;/&gt;&lt;w:activeWritingStyle w:lang=&quot;ES-AR&quot; w:vendorID=&quot;64&quot; w:dllVersion=&quot;0&quot; w:nlCheck=&quot;on&quot; w:optionSet=&quot;0&quot;/&gt;&lt;w:activeWritingStyle w:lang=&quot;580A&quot; w:vendorID=&quot;64&quot; w:dllVersion=&quot;0&quot; w:nlCheck=&quot;on&quot; w:optionSet=&quot;0&quot;/&gt;&lt;w:activeWritingStyle w:lang=&quot;PT-BR&quot; w:vendorID=&quot;64&quot; w:dllVersion=&quot;0&quot; w:nlCheck=&quot;on&quot; w:optionSet=&quot;0&quot;/&gt;&lt;w:stylePaneFormatFilter w:val=&quot;3F01&quot;/&gt;&lt;w:defaultTabStop w:val=&quot;720&quot;/&gt;&lt;w:hyphenationZone w:val=&quot;425&quot;/&gt;&lt;w:characterSpacingControl w:val=&quot;DontCompress&quot;/&gt;&lt;w:optimizeForBrowser/&gt;&lt;w:validateAgainstSchema/&gt;&lt;w:saveInvalidXML w:val=&quot;off&quot;/&gt;&lt;w:ignoreMixedContent w:val=&quot;off&quot;/&gt;&lt;w:alwaysShowPlaceholderText w:val=&quot;off&quot;/&gt;&lt;w:compat&gt;&lt;w:breakWrappedTables/&gt;&lt;w:snapToGridInCell/&gt;&lt;w:applyBreakingRules/&gt;&lt;w:wrapTextWithPunct/&gt;&lt;w:useAsianBreakRules/&gt;&lt;w:useWord2002TableStyleRules/&gt;&lt;w:useFELayout/&gt;&lt;/w:compat&gt;&lt;wsp:rsids&gt;&lt;wsp:rsidRoot wsp:val=&quot;00426FBB&quot;/&gt;&lt;wsp:rsid wsp:val=&quot;000002E1&quot;/&gt;&lt;wsp:rsid wsp:val=&quot;00003C97&quot;/&gt;&lt;wsp:rsid wsp:val=&quot;00004DA6&quot;/&gt;&lt;wsp:rsid wsp:val=&quot;00005565&quot;/&gt;&lt;wsp:rsid wsp:val=&quot;0001754A&quot;/&gt;&lt;wsp:rsid wsp:val=&quot;00017719&quot;/&gt;&lt;wsp:rsid wsp:val=&quot;00027F1D&quot;/&gt;&lt;wsp:rsid wsp:val=&quot;0003296C&quot;/&gt;&lt;wsp:rsid wsp:val=&quot;0003351F&quot;/&gt;&lt;wsp:rsid wsp:val=&quot;00044599&quot;/&gt;&lt;wsp:rsid wsp:val=&quot;000540E6&quot;/&gt;&lt;wsp:rsid wsp:val=&quot;00054421&quot;/&gt;&lt;wsp:rsid wsp:val=&quot;00062E46&quot;/&gt;&lt;wsp:rsid wsp:val=&quot;00074AC8&quot;/&gt;&lt;wsp:rsid wsp:val=&quot;00081408&quot;/&gt;&lt;wsp:rsid wsp:val=&quot;00081EBE&quot;/&gt;&lt;wsp:rsid wsp:val=&quot;00086EDC&quot;/&gt;&lt;wsp:rsid wsp:val=&quot;000B1236&quot;/&gt;&lt;wsp:rsid wsp:val=&quot;000B36A3&quot;/&gt;&lt;wsp:rsid wsp:val=&quot;000C013C&quot;/&gt;&lt;wsp:rsid wsp:val=&quot;000E3F84&quot;/&gt;&lt;wsp:rsid wsp:val=&quot;001056DF&quot;/&gt;&lt;wsp:rsid wsp:val=&quot;0010789C&quot;/&gt;&lt;wsp:rsid wsp:val=&quot;00110768&quot;/&gt;&lt;wsp:rsid wsp:val=&quot;00114025&quot;/&gt;&lt;wsp:rsid wsp:val=&quot;001160D2&quot;/&gt;&lt;wsp:rsid wsp:val=&quot;00120636&quot;/&gt;&lt;wsp:rsid wsp:val=&quot;001348A5&quot;/&gt;&lt;wsp:rsid wsp:val=&quot;00151B8E&quot;/&gt;&lt;wsp:rsid wsp:val=&quot;00182170&quot;/&gt;&lt;wsp:rsid wsp:val=&quot;0019165C&quot;/&gt;&lt;wsp:rsid wsp:val=&quot;001928FB&quot;/&gt;&lt;wsp:rsid wsp:val=&quot;00192BC7&quot;/&gt;&lt;wsp:rsid wsp:val=&quot;00195BE6&quot;/&gt;&lt;wsp:rsid wsp:val=&quot;00195E7B&quot;/&gt;&lt;wsp:rsid wsp:val=&quot;001A3C37&quot;/&gt;&lt;wsp:rsid wsp:val=&quot;001A50EA&quot;/&gt;&lt;wsp:rsid wsp:val=&quot;001D2878&quot;/&gt;&lt;wsp:rsid wsp:val=&quot;001F16CD&quot;/&gt;&lt;wsp:rsid wsp:val=&quot;001F47D2&quot;/&gt;&lt;wsp:rsid wsp:val=&quot;002029C8&quot;/&gt;&lt;wsp:rsid wsp:val=&quot;0022285A&quot;/&gt;&lt;wsp:rsid wsp:val=&quot;00224C61&quot;/&gt;&lt;wsp:rsid wsp:val=&quot;00256ABC&quot;/&gt;&lt;wsp:rsid wsp:val=&quot;00257067&quot;/&gt;&lt;wsp:rsid wsp:val=&quot;0027227B&quot;/&gt;&lt;wsp:rsid wsp:val=&quot;00273AC7&quot;/&gt;&lt;wsp:rsid wsp:val=&quot;00273D2C&quot;/&gt;&lt;wsp:rsid wsp:val=&quot;00285ECD&quot;/&gt;&lt;wsp:rsid wsp:val=&quot;00290E1B&quot;/&gt;&lt;wsp:rsid wsp:val=&quot;00291B17&quot;/&gt;&lt;wsp:rsid wsp:val=&quot;00291BB3&quot;/&gt;&lt;wsp:rsid wsp:val=&quot;002A6742&quot;/&gt;&lt;wsp:rsid wsp:val=&quot;002C1A7F&quot;/&gt;&lt;wsp:rsid wsp:val=&quot;002C4239&quot;/&gt;&lt;wsp:rsid wsp:val=&quot;002C559D&quot;/&gt;&lt;wsp:rsid wsp:val=&quot;002D16AE&quot;/&gt;&lt;wsp:rsid wsp:val=&quot;002D2D42&quot;/&gt;&lt;wsp:rsid wsp:val=&quot;002F72D0&quot;/&gt;&lt;wsp:rsid wsp:val=&quot;002F7A4F&quot;/&gt;&lt;wsp:rsid wsp:val=&quot;003003AB&quot;/&gt;&lt;wsp:rsid wsp:val=&quot;00302C35&quot;/&gt;&lt;wsp:rsid wsp:val=&quot;00311C49&quot;/&gt;&lt;wsp:rsid wsp:val=&quot;0032119E&quot;/&gt;&lt;wsp:rsid wsp:val=&quot;00321304&quot;/&gt;&lt;wsp:rsid wsp:val=&quot;00324FC2&quot;/&gt;&lt;wsp:rsid wsp:val=&quot;003312CA&quot;/&gt;&lt;wsp:rsid wsp:val=&quot;00331F84&quot;/&gt;&lt;wsp:rsid wsp:val=&quot;003329D6&quot;/&gt;&lt;wsp:rsid wsp:val=&quot;003645A1&quot;/&gt;&lt;wsp:rsid wsp:val=&quot;0037721F&quot;/&gt;&lt;wsp:rsid wsp:val=&quot;003950A4&quot;/&gt;&lt;wsp:rsid wsp:val=&quot;003A1E7E&quot;/&gt;&lt;wsp:rsid wsp:val=&quot;003C7045&quot;/&gt;&lt;wsp:rsid wsp:val=&quot;003E2FDC&quot;/&gt;&lt;wsp:rsid wsp:val=&quot;003E3577&quot;/&gt;&lt;wsp:rsid wsp:val=&quot;003F3A61&quot;/&gt;&lt;wsp:rsid wsp:val=&quot;00410A5D&quot;/&gt;&lt;wsp:rsid wsp:val=&quot;00414909&quot;/&gt;&lt;wsp:rsid wsp:val=&quot;00416537&quot;/&gt;&lt;wsp:rsid wsp:val=&quot;00425A6A&quot;/&gt;&lt;wsp:rsid wsp:val=&quot;00426FBB&quot;/&gt;&lt;wsp:rsid wsp:val=&quot;00454542&quot;/&gt;&lt;wsp:rsid wsp:val=&quot;0047429A&quot;/&gt;&lt;wsp:rsid wsp:val=&quot;0048374C&quot;/&gt;&lt;wsp:rsid wsp:val=&quot;0048771D&quot;/&gt;&lt;wsp:rsid wsp:val=&quot;004A3EF0&quot;/&gt;&lt;wsp:rsid wsp:val=&quot;004A6605&quot;/&gt;&lt;wsp:rsid wsp:val=&quot;004B3B15&quot;/&gt;&lt;wsp:rsid wsp:val=&quot;004C45FA&quot;/&gt;&lt;wsp:rsid wsp:val=&quot;004D35A3&quot;/&gt;&lt;wsp:rsid wsp:val=&quot;004E1BD8&quot;/&gt;&lt;wsp:rsid wsp:val=&quot;004E452A&quot;/&gt;&lt;wsp:rsid wsp:val=&quot;004E78E3&quot;/&gt;&lt;wsp:rsid wsp:val=&quot;004F2BFE&quot;/&gt;&lt;wsp:rsid wsp:val=&quot;004F63D3&quot;/&gt;&lt;wsp:rsid wsp:val=&quot;004F7DCF&quot;/&gt;&lt;wsp:rsid wsp:val=&quot;005004BF&quot;/&gt;&lt;wsp:rsid wsp:val=&quot;00502E89&quot;/&gt;&lt;wsp:rsid wsp:val=&quot;00506CFE&quot;/&gt;&lt;wsp:rsid wsp:val=&quot;00510106&quot;/&gt;&lt;wsp:rsid wsp:val=&quot;00510E95&quot;/&gt;&lt;wsp:rsid wsp:val=&quot;005225C3&quot;/&gt;&lt;wsp:rsid wsp:val=&quot;00527D56&quot;/&gt;&lt;wsp:rsid wsp:val=&quot;0053221F&quot;/&gt;&lt;wsp:rsid wsp:val=&quot;00536FAE&quot;/&gt;&lt;wsp:rsid wsp:val=&quot;00542C85&quot;/&gt;&lt;wsp:rsid wsp:val=&quot;00553510&quot;/&gt;&lt;wsp:rsid wsp:val=&quot;00554186&quot;/&gt;&lt;wsp:rsid wsp:val=&quot;00585769&quot;/&gt;&lt;wsp:rsid wsp:val=&quot;00585C61&quot;/&gt;&lt;wsp:rsid wsp:val=&quot;00591130&quot;/&gt;&lt;wsp:rsid wsp:val=&quot;005A3F28&quot;/&gt;&lt;wsp:rsid wsp:val=&quot;005A40BE&quot;/&gt;&lt;wsp:rsid wsp:val=&quot;005B13E2&quot;/&gt;&lt;wsp:rsid wsp:val=&quot;005B47D7&quot;/&gt;&lt;wsp:rsid wsp:val=&quot;005C5526&quot;/&gt;&lt;wsp:rsid wsp:val=&quot;005C62C6&quot;/&gt;&lt;wsp:rsid wsp:val=&quot;005D7B9E&quot;/&gt;&lt;wsp:rsid wsp:val=&quot;005E112E&quot;/&gt;&lt;wsp:rsid wsp:val=&quot;005F0834&quot;/&gt;&lt;wsp:rsid wsp:val=&quot;005F68AB&quot;/&gt;&lt;wsp:rsid wsp:val=&quot;005F6DC3&quot;/&gt;&lt;wsp:rsid wsp:val=&quot;00601A8E&quot;/&gt;&lt;wsp:rsid wsp:val=&quot;0062033E&quot;/&gt;&lt;wsp:rsid wsp:val=&quot;00624482&quot;/&gt;&lt;wsp:rsid wsp:val=&quot;00630477&quot;/&gt;&lt;wsp:rsid wsp:val=&quot;0064799C&quot;/&gt;&lt;wsp:rsid wsp:val=&quot;00654156&quot;/&gt;&lt;wsp:rsid wsp:val=&quot;00656ADC&quot;/&gt;&lt;wsp:rsid wsp:val=&quot;006B47CA&quot;/&gt;&lt;wsp:rsid wsp:val=&quot;006C304C&quot;/&gt;&lt;wsp:rsid wsp:val=&quot;006C4511&quot;/&gt;&lt;wsp:rsid wsp:val=&quot;006C65F5&quot;/&gt;&lt;wsp:rsid wsp:val=&quot;006C7AAA&quot;/&gt;&lt;wsp:rsid wsp:val=&quot;006D1C2A&quot;/&gt;&lt;wsp:rsid wsp:val=&quot;006D264F&quot;/&gt;&lt;wsp:rsid wsp:val=&quot;006D4E89&quot;/&gt;&lt;wsp:rsid wsp:val=&quot;006E2A8D&quot;/&gt;&lt;wsp:rsid wsp:val=&quot;006E7574&quot;/&gt;&lt;wsp:rsid wsp:val=&quot;00703430&quot;/&gt;&lt;wsp:rsid wsp:val=&quot;00703548&quot;/&gt;&lt;wsp:rsid wsp:val=&quot;00704E18&quot;/&gt;&lt;wsp:rsid wsp:val=&quot;007069BE&quot;/&gt;&lt;wsp:rsid wsp:val=&quot;00745C86&quot;/&gt;&lt;wsp:rsid wsp:val=&quot;00764603&quot;/&gt;&lt;wsp:rsid wsp:val=&quot;007653C5&quot;/&gt;&lt;wsp:rsid wsp:val=&quot;0076604D&quot;/&gt;&lt;wsp:rsid wsp:val=&quot;00790909&quot;/&gt;&lt;wsp:rsid wsp:val=&quot;007929AF&quot;/&gt;&lt;wsp:rsid wsp:val=&quot;00792D4A&quot;/&gt;&lt;wsp:rsid wsp:val=&quot;007B1582&quot;/&gt;&lt;wsp:rsid wsp:val=&quot;007B5A07&quot;/&gt;&lt;wsp:rsid wsp:val=&quot;007C065D&quot;/&gt;&lt;wsp:rsid wsp:val=&quot;007D3E71&quot;/&gt;&lt;wsp:rsid wsp:val=&quot;007E5D6A&quot;/&gt;&lt;wsp:rsid wsp:val=&quot;007E645D&quot;/&gt;&lt;wsp:rsid wsp:val=&quot;007F75CA&quot;/&gt;&lt;wsp:rsid wsp:val=&quot;00821E08&quot;/&gt;&lt;wsp:rsid wsp:val=&quot;00834EFD&quot;/&gt;&lt;wsp:rsid wsp:val=&quot;00843007&quot;/&gt;&lt;wsp:rsid wsp:val=&quot;00844B24&quot;/&gt;&lt;wsp:rsid wsp:val=&quot;0084515F&quot;/&gt;&lt;wsp:rsid wsp:val=&quot;0085092D&quot;/&gt;&lt;wsp:rsid wsp:val=&quot;00865414&quot;/&gt;&lt;wsp:rsid wsp:val=&quot;00877D4C&quot;/&gt;&lt;wsp:rsid wsp:val=&quot;008831DC&quot;/&gt;&lt;wsp:rsid wsp:val=&quot;00883903&quot;/&gt;&lt;wsp:rsid wsp:val=&quot;00891C30&quot;/&gt;&lt;wsp:rsid wsp:val=&quot;00897219&quot;/&gt;&lt;wsp:rsid wsp:val=&quot;0089763B&quot;/&gt;&lt;wsp:rsid wsp:val=&quot;008B6AE3&quot;/&gt;&lt;wsp:rsid wsp:val=&quot;008C1332&quot;/&gt;&lt;wsp:rsid wsp:val=&quot;008D1045&quot;/&gt;&lt;wsp:rsid wsp:val=&quot;008E5996&quot;/&gt;&lt;wsp:rsid wsp:val=&quot;00901AE1&quot;/&gt;&lt;wsp:rsid wsp:val=&quot;00912F93&quot;/&gt;&lt;wsp:rsid wsp:val=&quot;009156AA&quot;/&gt;&lt;wsp:rsid wsp:val=&quot;009205B4&quot;/&gt;&lt;wsp:rsid wsp:val=&quot;00955B59&quot;/&gt;&lt;wsp:rsid wsp:val=&quot;00992262&quot;/&gt;&lt;wsp:rsid wsp:val=&quot;009926BC&quot;/&gt;&lt;wsp:rsid wsp:val=&quot;009A4319&quot;/&gt;&lt;wsp:rsid wsp:val=&quot;009A6C3F&quot;/&gt;&lt;wsp:rsid wsp:val=&quot;009B73F2&quot;/&gt;&lt;wsp:rsid wsp:val=&quot;009C12BD&quot;/&gt;&lt;wsp:rsid wsp:val=&quot;009C50FE&quot;/&gt;&lt;wsp:rsid wsp:val=&quot;009E49DD&quot;/&gt;&lt;wsp:rsid wsp:val=&quot;00A03E75&quot;/&gt;&lt;wsp:rsid wsp:val=&quot;00A20627&quot;/&gt;&lt;wsp:rsid wsp:val=&quot;00A22FE9&quot;/&gt;&lt;wsp:rsid wsp:val=&quot;00A31A44&quot;/&gt;&lt;wsp:rsid wsp:val=&quot;00A32BFA&quot;/&gt;&lt;wsp:rsid wsp:val=&quot;00A3325E&quot;/&gt;&lt;wsp:rsid wsp:val=&quot;00A366E2&quot;/&gt;&lt;wsp:rsid wsp:val=&quot;00A45FCE&quot;/&gt;&lt;wsp:rsid wsp:val=&quot;00A75671&quot;/&gt;&lt;wsp:rsid wsp:val=&quot;00A773CC&quot;/&gt;&lt;wsp:rsid wsp:val=&quot;00A924D0&quot;/&gt;&lt;wsp:rsid wsp:val=&quot;00A9318B&quot;/&gt;&lt;wsp:rsid wsp:val=&quot;00A94AC1&quot;/&gt;&lt;wsp:rsid wsp:val=&quot;00AB18B7&quot;/&gt;&lt;wsp:rsid wsp:val=&quot;00AD335D&quot;/&gt;&lt;wsp:rsid wsp:val=&quot;00AF114C&quot;/&gt;&lt;wsp:rsid wsp:val=&quot;00AF792B&quot;/&gt;&lt;wsp:rsid wsp:val=&quot;00B2440C&quot;/&gt;&lt;wsp:rsid wsp:val=&quot;00B32137&quot;/&gt;&lt;wsp:rsid wsp:val=&quot;00B33D2F&quot;/&gt;&lt;wsp:rsid wsp:val=&quot;00B40A5B&quot;/&gt;&lt;wsp:rsid wsp:val=&quot;00B45C6B&quot;/&gt;&lt;wsp:rsid wsp:val=&quot;00B55D5E&quot;/&gt;&lt;wsp:rsid wsp:val=&quot;00B57A80&quot;/&gt;&lt;wsp:rsid wsp:val=&quot;00B70E9C&quot;/&gt;&lt;wsp:rsid wsp:val=&quot;00B713D8&quot;/&gt;&lt;wsp:rsid wsp:val=&quot;00B72979&quot;/&gt;&lt;wsp:rsid wsp:val=&quot;00B94516&quot;/&gt;&lt;wsp:rsid wsp:val=&quot;00BA25E2&quot;/&gt;&lt;wsp:rsid wsp:val=&quot;00BB2855&quot;/&gt;&lt;wsp:rsid wsp:val=&quot;00BC5343&quot;/&gt;&lt;wsp:rsid wsp:val=&quot;00BD19C1&quot;/&gt;&lt;wsp:rsid wsp:val=&quot;00BD25B8&quot;/&gt;&lt;wsp:rsid wsp:val=&quot;00C012E1&quot;/&gt;&lt;wsp:rsid wsp:val=&quot;00C06BB4&quot;/&gt;&lt;wsp:rsid wsp:val=&quot;00C10D20&quot;/&gt;&lt;wsp:rsid wsp:val=&quot;00C12E0C&quot;/&gt;&lt;wsp:rsid wsp:val=&quot;00C21916&quot;/&gt;&lt;wsp:rsid wsp:val=&quot;00C34915&quot;/&gt;&lt;wsp:rsid wsp:val=&quot;00C457CA&quot;/&gt;&lt;wsp:rsid wsp:val=&quot;00C47EAE&quot;/&gt;&lt;wsp:rsid wsp:val=&quot;00C53FB6&quot;/&gt;&lt;wsp:rsid wsp:val=&quot;00C57FB7&quot;/&gt;&lt;wsp:rsid wsp:val=&quot;00C644D4&quot;/&gt;&lt;wsp:rsid wsp:val=&quot;00C65F3F&quot;/&gt;&lt;wsp:rsid wsp:val=&quot;00C72414&quot;/&gt;&lt;wsp:rsid wsp:val=&quot;00C72B1A&quot;/&gt;&lt;wsp:rsid wsp:val=&quot;00C8667B&quot;/&gt;&lt;wsp:rsid wsp:val=&quot;00C90993&quot;/&gt;&lt;wsp:rsid wsp:val=&quot;00CA4CE3&quot;/&gt;&lt;wsp:rsid wsp:val=&quot;00CA5A12&quot;/&gt;&lt;wsp:rsid wsp:val=&quot;00CB4ADD&quot;/&gt;&lt;wsp:rsid wsp:val=&quot;00CC72FD&quot;/&gt;&lt;wsp:rsid wsp:val=&quot;00CD1D23&quot;/&gt;&lt;wsp:rsid wsp:val=&quot;00CD4F3F&quot;/&gt;&lt;wsp:rsid wsp:val=&quot;00D311F8&quot;/&gt;&lt;wsp:rsid wsp:val=&quot;00D31660&quot;/&gt;&lt;wsp:rsid wsp:val=&quot;00D36B52&quot;/&gt;&lt;wsp:rsid wsp:val=&quot;00D377C8&quot;/&gt;&lt;wsp:rsid wsp:val=&quot;00D41274&quot;/&gt;&lt;wsp:rsid wsp:val=&quot;00D4229C&quot;/&gt;&lt;wsp:rsid wsp:val=&quot;00D43BF3&quot;/&gt;&lt;wsp:rsid wsp:val=&quot;00D549FB&quot;/&gt;&lt;wsp:rsid wsp:val=&quot;00D56487&quot;/&gt;&lt;wsp:rsid wsp:val=&quot;00D767BB&quot;/&gt;&lt;wsp:rsid wsp:val=&quot;00D939B0&quot;/&gt;&lt;wsp:rsid wsp:val=&quot;00DA31A2&quot;/&gt;&lt;wsp:rsid wsp:val=&quot;00DB16E0&quot;/&gt;&lt;wsp:rsid wsp:val=&quot;00DB2DF9&quot;/&gt;&lt;wsp:rsid wsp:val=&quot;00DB465D&quot;/&gt;&lt;wsp:rsid wsp:val=&quot;00DB48A2&quot;/&gt;&lt;wsp:rsid wsp:val=&quot;00DB7E63&quot;/&gt;&lt;wsp:rsid wsp:val=&quot;00DC2055&quot;/&gt;&lt;wsp:rsid wsp:val=&quot;00DC3908&quot;/&gt;&lt;wsp:rsid wsp:val=&quot;00DD71E8&quot;/&gt;&lt;wsp:rsid wsp:val=&quot;00DD7F83&quot;/&gt;&lt;wsp:rsid wsp:val=&quot;00DE4EB8&quot;/&gt;&lt;wsp:rsid wsp:val=&quot;00E0641E&quot;/&gt;&lt;wsp:rsid wsp:val=&quot;00E06664&quot;/&gt;&lt;wsp:rsid wsp:val=&quot;00E304BC&quot;/&gt;&lt;wsp:rsid wsp:val=&quot;00E32853&quot;/&gt;&lt;wsp:rsid wsp:val=&quot;00E34EBD&quot;/&gt;&lt;wsp:rsid wsp:val=&quot;00E401F8&quot;/&gt;&lt;wsp:rsid wsp:val=&quot;00E46425&quot;/&gt;&lt;wsp:rsid wsp:val=&quot;00E469FC&quot;/&gt;&lt;wsp:rsid wsp:val=&quot;00E474EB&quot;/&gt;&lt;wsp:rsid wsp:val=&quot;00E47D0E&quot;/&gt;&lt;wsp:rsid wsp:val=&quot;00E65018&quot;/&gt;&lt;wsp:rsid wsp:val=&quot;00E76CA1&quot;/&gt;&lt;wsp:rsid wsp:val=&quot;00E94339&quot;/&gt;&lt;wsp:rsid wsp:val=&quot;00E97563&quot;/&gt;&lt;wsp:rsid wsp:val=&quot;00EB0B63&quot;/&gt;&lt;wsp:rsid wsp:val=&quot;00EC265C&quot;/&gt;&lt;wsp:rsid wsp:val=&quot;00ED61CB&quot;/&gt;&lt;wsp:rsid wsp:val=&quot;00EE752A&quot;/&gt;&lt;wsp:rsid wsp:val=&quot;00F06A72&quot;/&gt;&lt;wsp:rsid wsp:val=&quot;00F12D5B&quot;/&gt;&lt;wsp:rsid wsp:val=&quot;00F136F0&quot;/&gt;&lt;wsp:rsid wsp:val=&quot;00F20BBB&quot;/&gt;&lt;wsp:rsid wsp:val=&quot;00F36048&quot;/&gt;&lt;wsp:rsid wsp:val=&quot;00F43BD8&quot;/&gt;&lt;wsp:rsid wsp:val=&quot;00F562F3&quot;/&gt;&lt;wsp:rsid wsp:val=&quot;00F74B89&quot;/&gt;&lt;wsp:rsid wsp:val=&quot;00F75133&quot;/&gt;&lt;wsp:rsid wsp:val=&quot;00F83272&quot;/&gt;&lt;wsp:rsid wsp:val=&quot;00F9358D&quot;/&gt;&lt;wsp:rsid wsp:val=&quot;00F9369B&quot;/&gt;&lt;wsp:rsid wsp:val=&quot;00FA3899&quot;/&gt;&lt;wsp:rsid wsp:val=&quot;00FA4909&quot;/&gt;&lt;wsp:rsid wsp:val=&quot;00FA5164&quot;/&gt;&lt;wsp:rsid wsp:val=&quot;00FA6751&quot;/&gt;&lt;wsp:rsid wsp:val=&quot;00FA6BD7&quot;/&gt;&lt;wsp:rsid wsp:val=&quot;00FB1048&quot;/&gt;&lt;wsp:rsid wsp:val=&quot;00FB62C4&quot;/&gt;&lt;wsp:rsid wsp:val=&quot;00FB7701&quot;/&gt;&lt;wsp:rsid wsp:val=&quot;00FD1AC5&quot;/&gt;&lt;wsp:rsid wsp:val=&quot;00FD5CF0&quot;/&gt;&lt;/wsp:rsids&gt;&lt;/w:docPr&gt;&lt;w:body&gt;&lt;wx:sect&gt;&lt;w:p wsp:rsidR=&quot;00195E7B&quot; wsp:rsidRPr=&quot;00195E7B&quot; wsp:rsidRDefault=&quot;00195E7B&quot; wsp:rsidP=&quot;00195E7B&quot;&gt;&lt;m:oMathPara&gt;&lt;m:oMath&gt;&lt;m:r&gt;&lt;w:rPr&gt;&lt;w:rFonts w:ascii=&quot;Cambria Math&quot; w:h-ansi=&quot;Cambria Math&quot;/&gt;&lt;wx:font wx:val=&quot;Cambria Math&quot;/&gt;&lt;w:i/&gt;&lt;/w:rPr&gt;&lt;m:t&gt;11.9V&lt;/m:t&gt;&lt;/m:r&gt;&lt;/m:oMath&gt;&lt;/m:oMathPara&gt;&lt;/w:p&gt;&lt;w:sectPr wsp:rsidR=&quot;00000000&quot; wsp:rsidRPr=&quot;00195E7B&quot;&gt;&lt;w:pgSz w:w=&quot;12240&quot; w:h=&quot;15840&quot;/&gt;&lt;w:pgMar w:top=&quot;1440&quot; w:right=&quot;1440&quot; w:bottom=&quot;1440&quot; w:left=&quot;1440&quot; w:header=&quot;720&quot; w:footer=&quot;720&quot; w:gutter=&quot;0&quot;/&gt;&lt;w:cols w:space=&quot;720&quot;/&gt;&lt;/w:sectPr&gt;&lt;/wx:sect&gt;&lt;/w:body&gt;&lt;/w:wordDocument&gt;">
+                  <v:imagedata r:id="rId36" o:title="" chromakey="white"/>
+                </v:shape>
+              </w:pict>
+            </w:r>
+          </w:p>
+        </w:tc>
+      </w:tr>
+      <w:tr>
+        <w:trPr>
+          <w:trHeight w:val="230"/>
+          <w:jc w:val="center"/>
+        </w:trPr>
+        <w:tc>
+          <w:tcPr>
+            <w:tcW w:w="2078" w:type="dxa"/>
+            <w:shd w:val="clear" w:color="auto" w:fill="D9D9D9"/>
+            <w:vAlign w:val="center"/>
+          </w:tcPr>
+          <w:p>
+            <w:pPr>
+              <w:rPr>
+                <w:sz w:val="18"/>
+                <w:szCs w:val="18"/>
+              </w:rPr>
+            </w:pPr>
+            <w:r>
+              <w:rPr>
+                <w:sz w:val="18"/>
+                <w:szCs w:val="18"/>
+              </w:rPr>
+              <w:t>Resistencia de Carga</w:t>
+            </w:r>
+          </w:p>
+        </w:tc>
+        <w:tc>
+          <w:tcPr>
+            <w:tcW w:w="1160" w:type="dxa"/>
+            <w:shd w:val="clear" w:color="auto" w:fill="D9D9D9"/>
+            <w:vAlign w:val="center"/>
+          </w:tcPr>
+          <w:p>
+            <w:pPr>
+              <w:rPr>
+                <w:rFonts w:ascii="Calibri" w:eastAsia="Calibri" w:hAnsi="Calibri" w:cs="Arial"/>
+                <w:sz w:val="18"/>
+                <w:szCs w:val="18"/>
+              </w:rPr>
+            </w:pPr>
+            <w:r>
+              <w:rPr>
+                <w:sz w:val="18"/>
+                <w:szCs w:val="18"/>
+              </w:rPr>
+              <w:pict w14:anchorId="33419758">
+                <v:shape id="_x0000_i1201" type="#_x0000_t75" style="width:12.45pt;height:13.85pt" equationxml="&lt;?xml version=&quot;1.0&quot; encoding=&quot;UTF-8&quot; standalone=&quot;yes&quot;?&gt;&#10;&lt;?mso-application progid=&quot;Word.Document&quot;?&gt;&#10;&lt;w:wordDocument xmlns:aml=&quot;http://schemas.microsoft.com/aml/2001/core&quot; xmlns:wpc=&quot;http://schemas.microsoft.com/office/word/2010/wordprocessingCanvas&quot; xmlns:cx=&quot;http://schemas.microsoft.com/office/drawing/2014/chartex&quot; xmlns:cx1=&quot;http://schemas.microsoft.com/office/drawing/2015/9/8/chartex&quot; xmlns:cx2=&quot;http://schemas.microsoft.com/office/drawing/2015/10/21/chartex&quot; xmlns:cx3=&quot;http://schemas.microsoft.com/office/drawing/2016/5/9/chartex&quot; xmlns:cx4=&quot;http://schemas.microsoft.com/office/drawing/2016/5/10/chartex&quot; xmlns:cx5=&quot;http://schemas.microsoft.com/office/drawing/2016/5/11/chartex&quot; xmlns:cx6=&quot;http://schemas.microsoft.com/office/drawing/2016/5/12/chartex&quot; xmlns:cx7=&quot;http://schemas.microsoft.com/office/drawing/2016/5/13/chartex&quot; xmlns:cx8=&quot;http://schemas.microsoft.com/office/drawing/2016/5/14/chartex&quot; xmlns:cr=&quot;http://schemas.microsoft.com/office/comments/2020/reactions&quot; xmlns:dt=&quot;uuid:C2F41010-65B3-11d1-A29F-00AA00C14882&quot; xmlns:mc=&quot;http://schemas.openxmlformats.org/markup-compatibility/2006&quot; xmlns:aink=&quot;http://schemas.microsoft.com/office/drawing/2016/ink&quot; xmlns:am3d=&quot;http://schemas.microsoft.com/office/drawing/2017/model3d&quot; xmlns:o=&quot;urn:schemas-microsoft-com:office:office&quot; xmlns:oel=&quot;http://schemas.microsoft.com/office/2019/extlst&quot; xmlns:m=&quot;http://schemas.openxmlformats.org/officeDocument/2006/math&quot; xmlns:v=&quot;urn:schemas-microsoft-com:vml&quot; xmlns:w10=&quot;urn:schemas-microsoft-com:office:word&quot; xmlns:w=&quot;http://schemas.microsoft.com/office/word/2003/wordml&quot; xmlns:wx=&quot;http://schemas.microsoft.com/office/word/2003/auxHint&quot; xmlns:wne=&quot;http://schemas.microsoft.com/office/word/2006/wordml&quot; xmlns:wsp=&quot;http://schemas.microsoft.com/office/word/2003/wordml/sp2&quot; xmlns:sl=&quot;http://schemas.microsoft.com/schemaLibrary/2003/core&quot; w:macrosPresent=&quot;no&quot; w:embeddedObjPresent=&quot;no&quot; w:ocxPresent=&quot;no&quot; xml:space=&quot;preserve&quot;&gt;&lt;w:ignoreSubtree w:val=&quot;http://schemas.microsoft.com/office/word/2003/wordml/sp2&quot;/&gt;&lt;o:DocumentProperties&gt;&lt;o:Version&gt;16&lt;/o:Version&gt;&lt;/o:DocumentProperties&gt;&lt;w:docPr&gt;&lt;w:view w:val=&quot;print&quot;/&gt;&lt;w:zoom w:percent=&quot;86&quot;/&gt;&lt;w:doNotEmbedSystemFonts/&gt;&lt;w:activeWritingStyle w:lang=&quot;EN-AU&quot; w:vendorID=&quot;64&quot; w:dllVersion=&quot;6&quot; w:nlCheck=&quot;on&quot; w:optionSet=&quot;1&quot;/&gt;&lt;w:activeWritingStyle w:lang=&quot;EN-GB&quot; w:vendorID=&quot;64&quot; w:dllVersion=&quot;6&quot; w:nlCheck=&quot;on&quot; w:optionSet=&quot;1&quot;/&gt;&lt;w:activeWritingStyle w:lang=&quot;EN-US&quot; w:vendorID=&quot;64&quot; w:dllVersion=&quot;6&quot; w:nlCheck=&quot;on&quot; w:optionSet=&quot;1&quot;/&gt;&lt;w:activeWritingStyle w:lang=&quot;EN-AU&quot; w:vendorID=&quot;64&quot; w:dllVersion=&quot;0&quot; w:nlCheck=&quot;on&quot; w:optionSet=&quot;0&quot;/&gt;&lt;w:activeWritingStyle w:lang=&quot;EN-GB&quot; w:vendorID=&quot;64&quot; w:dllVersion=&quot;0&quot; w:nlCheck=&quot;on&quot; w:optionSet=&quot;0&quot;/&gt;&lt;w:activeWritingStyle w:lang=&quot;EN-US&quot; w:vendorID=&quot;64&quot; w:dllVersion=&quot;0&quot; w:nlCheck=&quot;on&quot; w:optionSet=&quot;0&quot;/&gt;&lt;w:activeWritingStyle w:lang=&quot;ES-AR&quot; w:vendorID=&quot;64&quot; w:dllVersion=&quot;0&quot; w:nlCheck=&quot;on&quot; w:optionSet=&quot;0&quot;/&gt;&lt;w:activeWritingStyle w:lang=&quot;580A&quot; w:vendorID=&quot;64&quot; w:dllVersion=&quot;0&quot; w:nlCheck=&quot;on&quot; w:optionSet=&quot;0&quot;/&gt;&lt;w:activeWritingStyle w:lang=&quot;PT-BR&quot; w:vendorID=&quot;64&quot; w:dllVersion=&quot;0&quot; w:nlCheck=&quot;on&quot; w:optionSet=&quot;0&quot;/&gt;&lt;w:stylePaneFormatFilter w:val=&quot;3F01&quot;/&gt;&lt;w:defaultTabStop w:val=&quot;720&quot;/&gt;&lt;w:hyphenationZone w:val=&quot;425&quot;/&gt;&lt;w:characterSpacingControl w:val=&quot;DontCompress&quot;/&gt;&lt;w:optimizeForBrowser/&gt;&lt;w:validateAgainstSchema/&gt;&lt;w:saveInvalidXML w:val=&quot;off&quot;/&gt;&lt;w:ignoreMixedContent w:val=&quot;off&quot;/&gt;&lt;w:alwaysShowPlaceholderText w:val=&quot;off&quot;/&gt;&lt;w:compat&gt;&lt;w:breakWrappedTables/&gt;&lt;w:snapToGridInCell/&gt;&lt;w:applyBreakingRules/&gt;&lt;w:wrapTextWithPunct/&gt;&lt;w:useAsianBreakRules/&gt;&lt;w:useWord2002TableStyleRules/&gt;&lt;w:useFELayout/&gt;&lt;/w:compat&gt;&lt;wsp:rsids&gt;&lt;wsp:rsidRoot wsp:val=&quot;00426FBB&quot;/&gt;&lt;wsp:rsid wsp:val=&quot;000002E1&quot;/&gt;&lt;wsp:rsid wsp:val=&quot;00003C97&quot;/&gt;&lt;wsp:rsid wsp:val=&quot;00004DA6&quot;/&gt;&lt;wsp:rsid wsp:val=&quot;00005565&quot;/&gt;&lt;wsp:rsid wsp:val=&quot;0001754A&quot;/&gt;&lt;wsp:rsid wsp:val=&quot;00017719&quot;/&gt;&lt;wsp:rsid wsp:val=&quot;00027F1D&quot;/&gt;&lt;wsp:rsid wsp:val=&quot;0003296C&quot;/&gt;&lt;wsp:rsid wsp:val=&quot;0003351F&quot;/&gt;&lt;wsp:rsid wsp:val=&quot;00044599&quot;/&gt;&lt;wsp:rsid wsp:val=&quot;000540E6&quot;/&gt;&lt;wsp:rsid wsp:val=&quot;00054421&quot;/&gt;&lt;wsp:rsid wsp:val=&quot;00062E46&quot;/&gt;&lt;wsp:rsid wsp:val=&quot;00074AC8&quot;/&gt;&lt;wsp:rsid wsp:val=&quot;00081408&quot;/&gt;&lt;wsp:rsid wsp:val=&quot;00081EBE&quot;/&gt;&lt;wsp:rsid wsp:val=&quot;00086EDC&quot;/&gt;&lt;wsp:rsid wsp:val=&quot;000B1236&quot;/&gt;&lt;wsp:rsid wsp:val=&quot;000B36A3&quot;/&gt;&lt;wsp:rsid wsp:val=&quot;000C013C&quot;/&gt;&lt;wsp:rsid wsp:val=&quot;000E3F84&quot;/&gt;&lt;wsp:rsid wsp:val=&quot;001056DF&quot;/&gt;&lt;wsp:rsid wsp:val=&quot;0010789C&quot;/&gt;&lt;wsp:rsid wsp:val=&quot;00110768&quot;/&gt;&lt;wsp:rsid wsp:val=&quot;00114025&quot;/&gt;&lt;wsp:rsid wsp:val=&quot;001160D2&quot;/&gt;&lt;wsp:rsid wsp:val=&quot;00120636&quot;/&gt;&lt;wsp:rsid wsp:val=&quot;001348A5&quot;/&gt;&lt;wsp:rsid wsp:val=&quot;00151B8E&quot;/&gt;&lt;wsp:rsid wsp:val=&quot;00182170&quot;/&gt;&lt;wsp:rsid wsp:val=&quot;0019165C&quot;/&gt;&lt;wsp:rsid wsp:val=&quot;001928FB&quot;/&gt;&lt;wsp:rsid wsp:val=&quot;00192BC7&quot;/&gt;&lt;wsp:rsid wsp:val=&quot;00195BE6&quot;/&gt;&lt;wsp:rsid wsp:val=&quot;001A3C37&quot;/&gt;&lt;wsp:rsid wsp:val=&quot;001A50EA&quot;/&gt;&lt;wsp:rsid wsp:val=&quot;001D2878&quot;/&gt;&lt;wsp:rsid wsp:val=&quot;001F16CD&quot;/&gt;&lt;wsp:rsid wsp:val=&quot;001F47D2&quot;/&gt;&lt;wsp:rsid wsp:val=&quot;002029C8&quot;/&gt;&lt;wsp:rsid wsp:val=&quot;0022285A&quot;/&gt;&lt;wsp:rsid wsp:val=&quot;00224C61&quot;/&gt;&lt;wsp:rsid wsp:val=&quot;00256ABC&quot;/&gt;&lt;wsp:rsid wsp:val=&quot;00257067&quot;/&gt;&lt;wsp:rsid wsp:val=&quot;0027227B&quot;/&gt;&lt;wsp:rsid wsp:val=&quot;00273AC7&quot;/&gt;&lt;wsp:rsid wsp:val=&quot;00273D2C&quot;/&gt;&lt;wsp:rsid wsp:val=&quot;00285ECD&quot;/&gt;&lt;wsp:rsid wsp:val=&quot;00290E1B&quot;/&gt;&lt;wsp:rsid wsp:val=&quot;00291B17&quot;/&gt;&lt;wsp:rsid wsp:val=&quot;00291BB3&quot;/&gt;&lt;wsp:rsid wsp:val=&quot;002A6742&quot;/&gt;&lt;wsp:rsid wsp:val=&quot;002C1A7F&quot;/&gt;&lt;wsp:rsid wsp:val=&quot;002C4239&quot;/&gt;&lt;wsp:rsid wsp:val=&quot;002C559D&quot;/&gt;&lt;wsp:rsid wsp:val=&quot;002D16AE&quot;/&gt;&lt;wsp:rsid wsp:val=&quot;002D2D42&quot;/&gt;&lt;wsp:rsid wsp:val=&quot;002F72D0&quot;/&gt;&lt;wsp:rsid wsp:val=&quot;002F7A4F&quot;/&gt;&lt;wsp:rsid wsp:val=&quot;003003AB&quot;/&gt;&lt;wsp:rsid wsp:val=&quot;00302C35&quot;/&gt;&lt;wsp:rsid wsp:val=&quot;00311C49&quot;/&gt;&lt;wsp:rsid wsp:val=&quot;0032119E&quot;/&gt;&lt;wsp:rsid wsp:val=&quot;00321304&quot;/&gt;&lt;wsp:rsid wsp:val=&quot;00324FC2&quot;/&gt;&lt;wsp:rsid wsp:val=&quot;003312CA&quot;/&gt;&lt;wsp:rsid wsp:val=&quot;00331F84&quot;/&gt;&lt;wsp:rsid wsp:val=&quot;003329D6&quot;/&gt;&lt;wsp:rsid wsp:val=&quot;003645A1&quot;/&gt;&lt;wsp:rsid wsp:val=&quot;0037721F&quot;/&gt;&lt;wsp:rsid wsp:val=&quot;003950A4&quot;/&gt;&lt;wsp:rsid wsp:val=&quot;003A1E7E&quot;/&gt;&lt;wsp:rsid wsp:val=&quot;003C7045&quot;/&gt;&lt;wsp:rsid wsp:val=&quot;003E2FDC&quot;/&gt;&lt;wsp:rsid wsp:val=&quot;003E3577&quot;/&gt;&lt;wsp:rsid wsp:val=&quot;003F3A61&quot;/&gt;&lt;wsp:rsid wsp:val=&quot;00410A5D&quot;/&gt;&lt;wsp:rsid wsp:val=&quot;00414909&quot;/&gt;&lt;wsp:rsid wsp:val=&quot;00416537&quot;/&gt;&lt;wsp:rsid wsp:val=&quot;00425A6A&quot;/&gt;&lt;wsp:rsid wsp:val=&quot;00426FBB&quot;/&gt;&lt;wsp:rsid wsp:val=&quot;00454542&quot;/&gt;&lt;wsp:rsid wsp:val=&quot;0047429A&quot;/&gt;&lt;wsp:rsid wsp:val=&quot;0048374C&quot;/&gt;&lt;wsp:rsid wsp:val=&quot;0048771D&quot;/&gt;&lt;wsp:rsid wsp:val=&quot;004A3EF0&quot;/&gt;&lt;wsp:rsid wsp:val=&quot;004A6605&quot;/&gt;&lt;wsp:rsid wsp:val=&quot;004B3B15&quot;/&gt;&lt;wsp:rsid wsp:val=&quot;004C45FA&quot;/&gt;&lt;wsp:rsid wsp:val=&quot;004D35A3&quot;/&gt;&lt;wsp:rsid wsp:val=&quot;004E1BD8&quot;/&gt;&lt;wsp:rsid wsp:val=&quot;004E452A&quot;/&gt;&lt;wsp:rsid wsp:val=&quot;004E78E3&quot;/&gt;&lt;wsp:rsid wsp:val=&quot;004F2BFE&quot;/&gt;&lt;wsp:rsid wsp:val=&quot;004F63D3&quot;/&gt;&lt;wsp:rsid wsp:val=&quot;004F7DCF&quot;/&gt;&lt;wsp:rsid wsp:val=&quot;005004BF&quot;/&gt;&lt;wsp:rsid wsp:val=&quot;00502E89&quot;/&gt;&lt;wsp:rsid wsp:val=&quot;00506CFE&quot;/&gt;&lt;wsp:rsid wsp:val=&quot;00510106&quot;/&gt;&lt;wsp:rsid wsp:val=&quot;00510E95&quot;/&gt;&lt;wsp:rsid wsp:val=&quot;005225C3&quot;/&gt;&lt;wsp:rsid wsp:val=&quot;00527D56&quot;/&gt;&lt;wsp:rsid wsp:val=&quot;0053221F&quot;/&gt;&lt;wsp:rsid wsp:val=&quot;00536FAE&quot;/&gt;&lt;wsp:rsid wsp:val=&quot;00542C85&quot;/&gt;&lt;wsp:rsid wsp:val=&quot;00553510&quot;/&gt;&lt;wsp:rsid wsp:val=&quot;00554186&quot;/&gt;&lt;wsp:rsid wsp:val=&quot;00585769&quot;/&gt;&lt;wsp:rsid wsp:val=&quot;00585C61&quot;/&gt;&lt;wsp:rsid wsp:val=&quot;00591130&quot;/&gt;&lt;wsp:rsid wsp:val=&quot;005A3F28&quot;/&gt;&lt;wsp:rsid wsp:val=&quot;005A40BE&quot;/&gt;&lt;wsp:rsid wsp:val=&quot;005B13E2&quot;/&gt;&lt;wsp:rsid wsp:val=&quot;005B47D7&quot;/&gt;&lt;wsp:rsid wsp:val=&quot;005C5526&quot;/&gt;&lt;wsp:rsid wsp:val=&quot;005C62C6&quot;/&gt;&lt;wsp:rsid wsp:val=&quot;005D7B9E&quot;/&gt;&lt;wsp:rsid wsp:val=&quot;005E112E&quot;/&gt;&lt;wsp:rsid wsp:val=&quot;005F0834&quot;/&gt;&lt;wsp:rsid wsp:val=&quot;005F68AB&quot;/&gt;&lt;wsp:rsid wsp:val=&quot;005F6DC3&quot;/&gt;&lt;wsp:rsid wsp:val=&quot;00601A8E&quot;/&gt;&lt;wsp:rsid wsp:val=&quot;0062033E&quot;/&gt;&lt;wsp:rsid wsp:val=&quot;00624482&quot;/&gt;&lt;wsp:rsid wsp:val=&quot;00630477&quot;/&gt;&lt;wsp:rsid wsp:val=&quot;0064799C&quot;/&gt;&lt;wsp:rsid wsp:val=&quot;00654156&quot;/&gt;&lt;wsp:rsid wsp:val=&quot;00656ADC&quot;/&gt;&lt;wsp:rsid wsp:val=&quot;006B47CA&quot;/&gt;&lt;wsp:rsid wsp:val=&quot;006C304C&quot;/&gt;&lt;wsp:rsid wsp:val=&quot;006C4511&quot;/&gt;&lt;wsp:rsid wsp:val=&quot;006C65F5&quot;/&gt;&lt;wsp:rsid wsp:val=&quot;006C7AAA&quot;/&gt;&lt;wsp:rsid wsp:val=&quot;006D1C2A&quot;/&gt;&lt;wsp:rsid wsp:val=&quot;006D264F&quot;/&gt;&lt;wsp:rsid wsp:val=&quot;006D4E89&quot;/&gt;&lt;wsp:rsid wsp:val=&quot;006E2A8D&quot;/&gt;&lt;wsp:rsid wsp:val=&quot;006E7574&quot;/&gt;&lt;wsp:rsid wsp:val=&quot;00703430&quot;/&gt;&lt;wsp:rsid wsp:val=&quot;00703548&quot;/&gt;&lt;wsp:rsid wsp:val=&quot;00704E18&quot;/&gt;&lt;wsp:rsid wsp:val=&quot;007069BE&quot;/&gt;&lt;wsp:rsid wsp:val=&quot;00745C86&quot;/&gt;&lt;wsp:rsid wsp:val=&quot;00764603&quot;/&gt;&lt;wsp:rsid wsp:val=&quot;007653C5&quot;/&gt;&lt;wsp:rsid wsp:val=&quot;0076604D&quot;/&gt;&lt;wsp:rsid wsp:val=&quot;00790909&quot;/&gt;&lt;wsp:rsid wsp:val=&quot;007929AF&quot;/&gt;&lt;wsp:rsid wsp:val=&quot;00792D4A&quot;/&gt;&lt;wsp:rsid wsp:val=&quot;007B1582&quot;/&gt;&lt;wsp:rsid wsp:val=&quot;007B5A07&quot;/&gt;&lt;wsp:rsid wsp:val=&quot;007C065D&quot;/&gt;&lt;wsp:rsid wsp:val=&quot;007D3E71&quot;/&gt;&lt;wsp:rsid wsp:val=&quot;007E5D6A&quot;/&gt;&lt;wsp:rsid wsp:val=&quot;007E645D&quot;/&gt;&lt;wsp:rsid wsp:val=&quot;007F75CA&quot;/&gt;&lt;wsp:rsid wsp:val=&quot;00821E08&quot;/&gt;&lt;wsp:rsid wsp:val=&quot;00834EFD&quot;/&gt;&lt;wsp:rsid wsp:val=&quot;00843007&quot;/&gt;&lt;wsp:rsid wsp:val=&quot;00844B24&quot;/&gt;&lt;wsp:rsid wsp:val=&quot;0084515F&quot;/&gt;&lt;wsp:rsid wsp:val=&quot;0085092D&quot;/&gt;&lt;wsp:rsid wsp:val=&quot;00865414&quot;/&gt;&lt;wsp:rsid wsp:val=&quot;00877D4C&quot;/&gt;&lt;wsp:rsid wsp:val=&quot;008831DC&quot;/&gt;&lt;wsp:rsid wsp:val=&quot;00883903&quot;/&gt;&lt;wsp:rsid wsp:val=&quot;00891C30&quot;/&gt;&lt;wsp:rsid wsp:val=&quot;00897219&quot;/&gt;&lt;wsp:rsid wsp:val=&quot;0089763B&quot;/&gt;&lt;wsp:rsid wsp:val=&quot;008B6AE3&quot;/&gt;&lt;wsp:rsid wsp:val=&quot;008C1332&quot;/&gt;&lt;wsp:rsid wsp:val=&quot;008D1045&quot;/&gt;&lt;wsp:rsid wsp:val=&quot;008E5996&quot;/&gt;&lt;wsp:rsid wsp:val=&quot;00901AE1&quot;/&gt;&lt;wsp:rsid wsp:val=&quot;00912F93&quot;/&gt;&lt;wsp:rsid wsp:val=&quot;009156AA&quot;/&gt;&lt;wsp:rsid wsp:val=&quot;009205B4&quot;/&gt;&lt;wsp:rsid wsp:val=&quot;00955B59&quot;/&gt;&lt;wsp:rsid wsp:val=&quot;00992262&quot;/&gt;&lt;wsp:rsid wsp:val=&quot;009926BC&quot;/&gt;&lt;wsp:rsid wsp:val=&quot;009A4319&quot;/&gt;&lt;wsp:rsid wsp:val=&quot;009A6C3F&quot;/&gt;&lt;wsp:rsid wsp:val=&quot;009B73F2&quot;/&gt;&lt;wsp:rsid wsp:val=&quot;009C12BD&quot;/&gt;&lt;wsp:rsid wsp:val=&quot;009C50FE&quot;/&gt;&lt;wsp:rsid wsp:val=&quot;009E49DD&quot;/&gt;&lt;wsp:rsid wsp:val=&quot;00A03E75&quot;/&gt;&lt;wsp:rsid wsp:val=&quot;00A20627&quot;/&gt;&lt;wsp:rsid wsp:val=&quot;00A22FE9&quot;/&gt;&lt;wsp:rsid wsp:val=&quot;00A31A44&quot;/&gt;&lt;wsp:rsid wsp:val=&quot;00A32BFA&quot;/&gt;&lt;wsp:rsid wsp:val=&quot;00A3325E&quot;/&gt;&lt;wsp:rsid wsp:val=&quot;00A366E2&quot;/&gt;&lt;wsp:rsid wsp:val=&quot;00A45FCE&quot;/&gt;&lt;wsp:rsid wsp:val=&quot;00A75671&quot;/&gt;&lt;wsp:rsid wsp:val=&quot;00A773CC&quot;/&gt;&lt;wsp:rsid wsp:val=&quot;00A924D0&quot;/&gt;&lt;wsp:rsid wsp:val=&quot;00A9318B&quot;/&gt;&lt;wsp:rsid wsp:val=&quot;00A94AC1&quot;/&gt;&lt;wsp:rsid wsp:val=&quot;00AB18B7&quot;/&gt;&lt;wsp:rsid wsp:val=&quot;00AB5BA9&quot;/&gt;&lt;wsp:rsid wsp:val=&quot;00AD335D&quot;/&gt;&lt;wsp:rsid wsp:val=&quot;00AF114C&quot;/&gt;&lt;wsp:rsid wsp:val=&quot;00AF792B&quot;/&gt;&lt;wsp:rsid wsp:val=&quot;00B2440C&quot;/&gt;&lt;wsp:rsid wsp:val=&quot;00B32137&quot;/&gt;&lt;wsp:rsid wsp:val=&quot;00B33D2F&quot;/&gt;&lt;wsp:rsid wsp:val=&quot;00B40A5B&quot;/&gt;&lt;wsp:rsid wsp:val=&quot;00B45C6B&quot;/&gt;&lt;wsp:rsid wsp:val=&quot;00B55D5E&quot;/&gt;&lt;wsp:rsid wsp:val=&quot;00B57A80&quot;/&gt;&lt;wsp:rsid wsp:val=&quot;00B70E9C&quot;/&gt;&lt;wsp:rsid wsp:val=&quot;00B713D8&quot;/&gt;&lt;wsp:rsid wsp:val=&quot;00B72979&quot;/&gt;&lt;wsp:rsid wsp:val=&quot;00B94516&quot;/&gt;&lt;wsp:rsid wsp:val=&quot;00BA25E2&quot;/&gt;&lt;wsp:rsid wsp:val=&quot;00BB2855&quot;/&gt;&lt;wsp:rsid wsp:val=&quot;00BC5343&quot;/&gt;&lt;wsp:rsid wsp:val=&quot;00BD19C1&quot;/&gt;&lt;wsp:rsid wsp:val=&quot;00BD25B8&quot;/&gt;&lt;wsp:rsid wsp:val=&quot;00C012E1&quot;/&gt;&lt;wsp:rsid wsp:val=&quot;00C06BB4&quot;/&gt;&lt;wsp:rsid wsp:val=&quot;00C10D20&quot;/&gt;&lt;wsp:rsid wsp:val=&quot;00C12E0C&quot;/&gt;&lt;wsp:rsid wsp:val=&quot;00C21916&quot;/&gt;&lt;wsp:rsid wsp:val=&quot;00C34915&quot;/&gt;&lt;wsp:rsid wsp:val=&quot;00C457CA&quot;/&gt;&lt;wsp:rsid wsp:val=&quot;00C47EAE&quot;/&gt;&lt;wsp:rsid wsp:val=&quot;00C53FB6&quot;/&gt;&lt;wsp:rsid wsp:val=&quot;00C57FB7&quot;/&gt;&lt;wsp:rsid wsp:val=&quot;00C644D4&quot;/&gt;&lt;wsp:rsid wsp:val=&quot;00C65F3F&quot;/&gt;&lt;wsp:rsid wsp:val=&quot;00C72414&quot;/&gt;&lt;wsp:rsid wsp:val=&quot;00C72B1A&quot;/&gt;&lt;wsp:rsid wsp:val=&quot;00C8667B&quot;/&gt;&lt;wsp:rsid wsp:val=&quot;00C90993&quot;/&gt;&lt;wsp:rsid wsp:val=&quot;00CA4CE3&quot;/&gt;&lt;wsp:rsid wsp:val=&quot;00CA5A12&quot;/&gt;&lt;wsp:rsid wsp:val=&quot;00CB4ADD&quot;/&gt;&lt;wsp:rsid wsp:val=&quot;00CC72FD&quot;/&gt;&lt;wsp:rsid wsp:val=&quot;00CD1D23&quot;/&gt;&lt;wsp:rsid wsp:val=&quot;00CD4F3F&quot;/&gt;&lt;wsp:rsid wsp:val=&quot;00D311F8&quot;/&gt;&lt;wsp:rsid wsp:val=&quot;00D31660&quot;/&gt;&lt;wsp:rsid wsp:val=&quot;00D36B52&quot;/&gt;&lt;wsp:rsid wsp:val=&quot;00D377C8&quot;/&gt;&lt;wsp:rsid wsp:val=&quot;00D41274&quot;/&gt;&lt;wsp:rsid wsp:val=&quot;00D4229C&quot;/&gt;&lt;wsp:rsid wsp:val=&quot;00D43BF3&quot;/&gt;&lt;wsp:rsid wsp:val=&quot;00D549FB&quot;/&gt;&lt;wsp:rsid wsp:val=&quot;00D56487&quot;/&gt;&lt;wsp:rsid wsp:val=&quot;00D767BB&quot;/&gt;&lt;wsp:rsid wsp:val=&quot;00D939B0&quot;/&gt;&lt;wsp:rsid wsp:val=&quot;00DA31A2&quot;/&gt;&lt;wsp:rsid wsp:val=&quot;00DB16E0&quot;/&gt;&lt;wsp:rsid wsp:val=&quot;00DB2DF9&quot;/&gt;&lt;wsp:rsid wsp:val=&quot;00DB465D&quot;/&gt;&lt;wsp:rsid wsp:val=&quot;00DB48A2&quot;/&gt;&lt;wsp:rsid wsp:val=&quot;00DB7E63&quot;/&gt;&lt;wsp:rsid wsp:val=&quot;00DC2055&quot;/&gt;&lt;wsp:rsid wsp:val=&quot;00DC3908&quot;/&gt;&lt;wsp:rsid wsp:val=&quot;00DD71E8&quot;/&gt;&lt;wsp:rsid wsp:val=&quot;00DD7F83&quot;/&gt;&lt;wsp:rsid wsp:val=&quot;00DE4EB8&quot;/&gt;&lt;wsp:rsid wsp:val=&quot;00E0641E&quot;/&gt;&lt;wsp:rsid wsp:val=&quot;00E06664&quot;/&gt;&lt;wsp:rsid wsp:val=&quot;00E304BC&quot;/&gt;&lt;wsp:rsid wsp:val=&quot;00E32853&quot;/&gt;&lt;wsp:rsid wsp:val=&quot;00E34EBD&quot;/&gt;&lt;wsp:rsid wsp:val=&quot;00E401F8&quot;/&gt;&lt;wsp:rsid wsp:val=&quot;00E46425&quot;/&gt;&lt;wsp:rsid wsp:val=&quot;00E469FC&quot;/&gt;&lt;wsp:rsid wsp:val=&quot;00E474EB&quot;/&gt;&lt;wsp:rsid wsp:val=&quot;00E47D0E&quot;/&gt;&lt;wsp:rsid wsp:val=&quot;00E65018&quot;/&gt;&lt;wsp:rsid wsp:val=&quot;00E76CA1&quot;/&gt;&lt;wsp:rsid wsp:val=&quot;00E94339&quot;/&gt;&lt;wsp:rsid wsp:val=&quot;00E97563&quot;/&gt;&lt;wsp:rsid wsp:val=&quot;00EB0B63&quot;/&gt;&lt;wsp:rsid wsp:val=&quot;00EC265C&quot;/&gt;&lt;wsp:rsid wsp:val=&quot;00ED61CB&quot;/&gt;&lt;wsp:rsid wsp:val=&quot;00EE752A&quot;/&gt;&lt;wsp:rsid wsp:val=&quot;00F06A72&quot;/&gt;&lt;wsp:rsid wsp:val=&quot;00F12D5B&quot;/&gt;&lt;wsp:rsid wsp:val=&quot;00F136F0&quot;/&gt;&lt;wsp:rsid wsp:val=&quot;00F20BBB&quot;/&gt;&lt;wsp:rsid wsp:val=&quot;00F36048&quot;/&gt;&lt;wsp:rsid wsp:val=&quot;00F43BD8&quot;/&gt;&lt;wsp:rsid wsp:val=&quot;00F562F3&quot;/&gt;&lt;wsp:rsid wsp:val=&quot;00F74B89&quot;/&gt;&lt;wsp:rsid wsp:val=&quot;00F75133&quot;/&gt;&lt;wsp:rsid wsp:val=&quot;00F83272&quot;/&gt;&lt;wsp:rsid wsp:val=&quot;00F9358D&quot;/&gt;&lt;wsp:rsid wsp:val=&quot;00F9369B&quot;/&gt;&lt;wsp:rsid wsp:val=&quot;00FA3899&quot;/&gt;&lt;wsp:rsid wsp:val=&quot;00FA4909&quot;/&gt;&lt;wsp:rsid wsp:val=&quot;00FA5164&quot;/&gt;&lt;wsp:rsid wsp:val=&quot;00FA6751&quot;/&gt;&lt;wsp:rsid wsp:val=&quot;00FA6BD7&quot;/&gt;&lt;wsp:rsid wsp:val=&quot;00FB1048&quot;/&gt;&lt;wsp:rsid wsp:val=&quot;00FB62C4&quot;/&gt;&lt;wsp:rsid wsp:val=&quot;00FB7701&quot;/&gt;&lt;wsp:rsid wsp:val=&quot;00FD1AC5&quot;/&gt;&lt;wsp:rsid wsp:val=&quot;00FD5CF0&quot;/&gt;&lt;/wsp:rsids&gt;&lt;/w:docPr&gt;&lt;w:body&gt;&lt;wx:sect&gt;&lt;w:p wsp:rsidR=&quot;00AB5BA9&quot; wsp:rsidRPr=&quot;00AB5BA9&quot; wsp:rsidRDefault=&quot;00AB5BA9&quot; wsp:rsidP=&quot;00AB5BA9&quot;&gt;&lt;m:oMathPara&gt;&lt;m:oMath&gt;&lt;m:sSub&gt;&lt;m:sSubPr&gt;&lt;m:ctrlPr&gt;&lt;w:rPr&gt;&lt;w:rFonts w:ascii=&quot;Cambria Math&quot; w:fareast=&quot;Calibri&quot; w:h-ansi=&quot;Cambria Math&quot; w:cs=&quot;Arial&quot;/&gt;&lt;wx:font wx:val=&quot;Cambria Math&quot;/&gt;&lt;w:i/&gt;&lt;/w:rPr&gt;&lt;/m:ctrlPr&gt;&lt;/m:sSubPr&gt;&lt;m:e&gt;&lt;m:r&gt;&lt;w:rPr&gt;&lt;w:rFonts w:ascii=&quot;Cambria Math&quot; w:fareast=&quot;Calibri&quot; w:h-ansi=&quot;Cambria Math&quot; w:cs=&quot;Arial&quot;/&gt;&lt;wx:font wx:val=&quot;Cambria Math&quot;/&gt;&lt;w:i/&gt;&lt;/w:rPr&gt;&lt;m:t&gt;R&lt;/m:t&gt;&lt;/m:r&gt;&lt;/m:e&gt;&lt;m:sub&gt;&lt;m:r&gt;&lt;w:rPr&gt;&lt;w:rFonts w:ascii=&quot;Cambria Math&quot; w:fareast=&quot;Calibri&quot; w:h-ansi=&quot;Cambria Math&quot; w:cs=&quot;Arial&quot;/&gt;&lt;wx:font wx:val=&quot;Cambria Math&quot;/&gt;&lt;w:i/&gt;&lt;/w:rPr&gt;&lt;m:t&gt;L&lt;/m:t&gt;&lt;/m:r&gt;&lt;/m:sub&gt;&lt;/m:sSub&gt;&lt;/m:oMath&gt;&lt;/m:oMathPara&gt;&lt;/w:p&gt;&lt;w:sectPr wsp:rsidR=&quot;00000000&quot; wsp:rsidRPr=&quot;00AB5BA9&quot;&gt;&lt;w:pgSz w:w=&quot;12240&quot; w:h=&quot;15840&quot;/&gt;&lt;w:pgMar w:top=&quot;1440&quot; w:right=&quot;1440&quot; w:bottom=&quot;1440&quot; w:left=&quot;1440&quot; w:header=&quot;720&quot; w:footer=&quot;720&quot; w:gutter=&quot;0&quot;/&gt;&lt;w:cols w:space=&quot;720&quot;/&gt;&lt;/w:sectPr&gt;&lt;/wx:sect&gt;&lt;/w:body&gt;&lt;/w:wordDocument&gt;">
+                  <v:imagedata r:id="rId37" o:title="" chromakey="white"/>
+                </v:shape>
+              </w:pict>
+            </w:r>
+          </w:p>
+        </w:tc>
+        <w:tc>
+          <w:tcPr>
+            <w:tcW w:w="1214" w:type="dxa"/>
+            <w:shd w:val="clear" w:color="auto" w:fill="D9D9D9"/>
+            <w:vAlign w:val="center"/>
+          </w:tcPr>
+          <w:p>
+            <w:pPr>
+              <w:rPr>
+                <w:sz w:val="18"/>
+                <w:szCs w:val="18"/>
+              </w:rPr>
+            </w:pPr>
+            <w:r>
+              <w:rPr>
+                <w:sz w:val="18"/>
+                <w:szCs w:val="18"/>
+              </w:rPr>
+              <w:pict w14:anchorId="7657C9AE">
+                <v:shape id="_x0000_i1202" type="#_x0000_t75" style="width:24.25pt;height:13.85pt" equationxml="&lt;?xml version=&quot;1.0&quot; encoding=&quot;UTF-8&quot; standalone=&quot;yes&quot;?&gt;&#10;&lt;?mso-application progid=&quot;Word.Document&quot;?&gt;&#10;&lt;w:wordDocument xmlns:aml=&quot;http://schemas.microsoft.com/aml/2001/core&quot; xmlns:wpc=&quot;http://schemas.microsoft.com/office/word/2010/wordprocessingCanvas&quot; xmlns:cx=&quot;http://schemas.microsoft.com/office/drawing/2014/chartex&quot; xmlns:cx1=&quot;http://schemas.microsoft.com/office/drawing/2015/9/8/chartex&quot; xmlns:cx2=&quot;http://schemas.microsoft.com/office/drawing/2015/10/21/chartex&quot; xmlns:cx3=&quot;http://schemas.microsoft.com/office/drawing/2016/5/9/chartex&quot; xmlns:cx4=&quot;http://schemas.microsoft.com/office/drawing/2016/5/10/chartex&quot; xmlns:cx5=&quot;http://schemas.microsoft.com/office/drawing/2016/5/11/chartex&quot; xmlns:cx6=&quot;http://schemas.microsoft.com/office/drawing/2016/5/12/chartex&quot; xmlns:cx7=&quot;http://schemas.microsoft.com/office/drawing/2016/5/13/chartex&quot; xmlns:cx8=&quot;http://schemas.microsoft.com/office/drawing/2016/5/14/chartex&quot; xmlns:cr=&quot;http://schemas.microsoft.com/office/comments/2020/reactions&quot; xmlns:dt=&quot;uuid:C2F41010-65B3-11d1-A29F-00AA00C14882&quot; xmlns:mc=&quot;http://schemas.openxmlformats.org/markup-compatibility/2006&quot; xmlns:aink=&quot;http://schemas.microsoft.com/office/drawing/2016/ink&quot; xmlns:am3d=&quot;http://schemas.microsoft.com/office/drawing/2017/model3d&quot; xmlns:o=&quot;urn:schemas-microsoft-com:office:office&quot; xmlns:oel=&quot;http://schemas.microsoft.com/office/2019/extlst&quot; xmlns:m=&quot;http://schemas.openxmlformats.org/officeDocument/2006/math&quot; xmlns:v=&quot;urn:schemas-microsoft-com:vml&quot; xmlns:w10=&quot;urn:schemas-microsoft-com:office:word&quot; xmlns:w=&quot;http://schemas.microsoft.com/office/word/2003/wordml&quot; xmlns:wx=&quot;http://schemas.microsoft.com/office/word/2003/auxHint&quot; xmlns:wne=&quot;http://schemas.microsoft.com/office/word/2006/wordml&quot; xmlns:wsp=&quot;http://schemas.microsoft.com/office/word/2003/wordml/sp2&quot; xmlns:sl=&quot;http://schemas.microsoft.com/schemaLibrary/2003/core&quot; w:macrosPresent=&quot;no&quot; w:embeddedObjPresent=&quot;no&quot; w:ocxPresent=&quot;no&quot; xml:space=&quot;preserve&quot;&gt;&lt;w:ignoreSubtree w:val=&quot;http://schemas.microsoft.com/office/word/2003/wordml/sp2&quot;/&gt;&lt;o:DocumentProperties&gt;&lt;o:Version&gt;16&lt;/o:Version&gt;&lt;/o:DocumentProperties&gt;&lt;w:docPr&gt;&lt;w:view w:val=&quot;print&quot;/&gt;&lt;w:zoom w:percent=&quot;86&quot;/&gt;&lt;w:doNotEmbedSystemFonts/&gt;&lt;w:activeWritingStyle w:lang=&quot;EN-AU&quot; w:vendorID=&quot;64&quot; w:dllVersion=&quot;6&quot; w:nlCheck=&quot;on&quot; w:optionSet=&quot;1&quot;/&gt;&lt;w:activeWritingStyle w:lang=&quot;EN-GB&quot; w:vendorID=&quot;64&quot; w:dllVersion=&quot;6&quot; w:nlCheck=&quot;on&quot; w:optionSet=&quot;1&quot;/&gt;&lt;w:activeWritingStyle w:lang=&quot;EN-US&quot; w:vendorID=&quot;64&quot; w:dllVersion=&quot;6&quot; w:nlCheck=&quot;on&quot; w:optionSet=&quot;1&quot;/&gt;&lt;w:activeWritingStyle w:lang=&quot;EN-AU&quot; w:vendorID=&quot;64&quot; w:dllVersion=&quot;0&quot; w:nlCheck=&quot;on&quot; w:optionSet=&quot;0&quot;/&gt;&lt;w:activeWritingStyle w:lang=&quot;EN-GB&quot; w:vendorID=&quot;64&quot; w:dllVersion=&quot;0&quot; w:nlCheck=&quot;on&quot; w:optionSet=&quot;0&quot;/&gt;&lt;w:activeWritingStyle w:lang=&quot;EN-US&quot; w:vendorID=&quot;64&quot; w:dllVersion=&quot;0&quot; w:nlCheck=&quot;on&quot; w:optionSet=&quot;0&quot;/&gt;&lt;w:activeWritingStyle w:lang=&quot;ES-AR&quot; w:vendorID=&quot;64&quot; w:dllVersion=&quot;0&quot; w:nlCheck=&quot;on&quot; w:optionSet=&quot;0&quot;/&gt;&lt;w:activeWritingStyle w:lang=&quot;580A&quot; w:vendorID=&quot;64&quot; w:dllVersion=&quot;0&quot; w:nlCheck=&quot;on&quot; w:optionSet=&quot;0&quot;/&gt;&lt;w:activeWritingStyle w:lang=&quot;PT-BR&quot; w:vendorID=&quot;64&quot; w:dllVersion=&quot;0&quot; w:nlCheck=&quot;on&quot; w:optionSet=&quot;0&quot;/&gt;&lt;w:stylePaneFormatFilter w:val=&quot;3F01&quot;/&gt;&lt;w:defaultTabStop w:val=&quot;720&quot;/&gt;&lt;w:hyphenationZone w:val=&quot;425&quot;/&gt;&lt;w:characterSpacingControl w:val=&quot;DontCompress&quot;/&gt;&lt;w:optimizeForBrowser/&gt;&lt;w:validateAgainstSchema/&gt;&lt;w:saveInvalidXML w:val=&quot;off&quot;/&gt;&lt;w:ignoreMixedContent w:val=&quot;off&quot;/&gt;&lt;w:alwaysShowPlaceholderText w:val=&quot;off&quot;/&gt;&lt;w:compat&gt;&lt;w:breakWrappedTables/&gt;&lt;w:snapToGridInCell/&gt;&lt;w:applyBreakingRules/&gt;&lt;w:wrapTextWithPunct/&gt;&lt;w:useAsianBreakRules/&gt;&lt;w:useWord2002TableStyleRules/&gt;&lt;w:useFELayout/&gt;&lt;/w:compat&gt;&lt;wsp:rsids&gt;&lt;wsp:rsidRoot wsp:val=&quot;00426FBB&quot;/&gt;&lt;wsp:rsid wsp:val=&quot;000002E1&quot;/&gt;&lt;wsp:rsid wsp:val=&quot;00003C97&quot;/&gt;&lt;wsp:rsid wsp:val=&quot;00004DA6&quot;/&gt;&lt;wsp:rsid wsp:val=&quot;00005565&quot;/&gt;&lt;wsp:rsid wsp:val=&quot;0001754A&quot;/&gt;&lt;wsp:rsid wsp:val=&quot;00017719&quot;/&gt;&lt;wsp:rsid wsp:val=&quot;00027F1D&quot;/&gt;&lt;wsp:rsid wsp:val=&quot;0003296C&quot;/&gt;&lt;wsp:rsid wsp:val=&quot;0003351F&quot;/&gt;&lt;wsp:rsid wsp:val=&quot;00044599&quot;/&gt;&lt;wsp:rsid wsp:val=&quot;000540E6&quot;/&gt;&lt;wsp:rsid wsp:val=&quot;00054421&quot;/&gt;&lt;wsp:rsid wsp:val=&quot;00062E46&quot;/&gt;&lt;wsp:rsid wsp:val=&quot;00074AC8&quot;/&gt;&lt;wsp:rsid wsp:val=&quot;00081408&quot;/&gt;&lt;wsp:rsid wsp:val=&quot;00081EBE&quot;/&gt;&lt;wsp:rsid wsp:val=&quot;00086EDC&quot;/&gt;&lt;wsp:rsid wsp:val=&quot;000B1236&quot;/&gt;&lt;wsp:rsid wsp:val=&quot;000B36A3&quot;/&gt;&lt;wsp:rsid wsp:val=&quot;000C013C&quot;/&gt;&lt;wsp:rsid wsp:val=&quot;000E3F84&quot;/&gt;&lt;wsp:rsid wsp:val=&quot;001056DF&quot;/&gt;&lt;wsp:rsid wsp:val=&quot;0010789C&quot;/&gt;&lt;wsp:rsid wsp:val=&quot;00110768&quot;/&gt;&lt;wsp:rsid wsp:val=&quot;00114025&quot;/&gt;&lt;wsp:rsid wsp:val=&quot;001160D2&quot;/&gt;&lt;wsp:rsid wsp:val=&quot;00120636&quot;/&gt;&lt;wsp:rsid wsp:val=&quot;001348A5&quot;/&gt;&lt;wsp:rsid wsp:val=&quot;00151B8E&quot;/&gt;&lt;wsp:rsid wsp:val=&quot;00182170&quot;/&gt;&lt;wsp:rsid wsp:val=&quot;0019165C&quot;/&gt;&lt;wsp:rsid wsp:val=&quot;001928FB&quot;/&gt;&lt;wsp:rsid wsp:val=&quot;00192BC7&quot;/&gt;&lt;wsp:rsid wsp:val=&quot;00195BE6&quot;/&gt;&lt;wsp:rsid wsp:val=&quot;001A3C37&quot;/&gt;&lt;wsp:rsid wsp:val=&quot;001A50EA&quot;/&gt;&lt;wsp:rsid wsp:val=&quot;001D2878&quot;/&gt;&lt;wsp:rsid wsp:val=&quot;001F16CD&quot;/&gt;&lt;wsp:rsid wsp:val=&quot;001F47D2&quot;/&gt;&lt;wsp:rsid wsp:val=&quot;002029C8&quot;/&gt;&lt;wsp:rsid wsp:val=&quot;0022285A&quot;/&gt;&lt;wsp:rsid wsp:val=&quot;00224C61&quot;/&gt;&lt;wsp:rsid wsp:val=&quot;00256ABC&quot;/&gt;&lt;wsp:rsid wsp:val=&quot;00257067&quot;/&gt;&lt;wsp:rsid wsp:val=&quot;0027227B&quot;/&gt;&lt;wsp:rsid wsp:val=&quot;00273AC7&quot;/&gt;&lt;wsp:rsid wsp:val=&quot;00273D2C&quot;/&gt;&lt;wsp:rsid wsp:val=&quot;00285ECD&quot;/&gt;&lt;wsp:rsid wsp:val=&quot;00290E1B&quot;/&gt;&lt;wsp:rsid wsp:val=&quot;00291B17&quot;/&gt;&lt;wsp:rsid wsp:val=&quot;00291BB3&quot;/&gt;&lt;wsp:rsid wsp:val=&quot;002A6742&quot;/&gt;&lt;wsp:rsid wsp:val=&quot;002C1A7F&quot;/&gt;&lt;wsp:rsid wsp:val=&quot;002C4239&quot;/&gt;&lt;wsp:rsid wsp:val=&quot;002C559D&quot;/&gt;&lt;wsp:rsid wsp:val=&quot;002D16AE&quot;/&gt;&lt;wsp:rsid wsp:val=&quot;002D2D42&quot;/&gt;&lt;wsp:rsid wsp:val=&quot;002F72D0&quot;/&gt;&lt;wsp:rsid wsp:val=&quot;002F7A4F&quot;/&gt;&lt;wsp:rsid wsp:val=&quot;003003AB&quot;/&gt;&lt;wsp:rsid wsp:val=&quot;00302C35&quot;/&gt;&lt;wsp:rsid wsp:val=&quot;00311C49&quot;/&gt;&lt;wsp:rsid wsp:val=&quot;0032119E&quot;/&gt;&lt;wsp:rsid wsp:val=&quot;00321304&quot;/&gt;&lt;wsp:rsid wsp:val=&quot;00324FC2&quot;/&gt;&lt;wsp:rsid wsp:val=&quot;003312CA&quot;/&gt;&lt;wsp:rsid wsp:val=&quot;00331F84&quot;/&gt;&lt;wsp:rsid wsp:val=&quot;003329D6&quot;/&gt;&lt;wsp:rsid wsp:val=&quot;003645A1&quot;/&gt;&lt;wsp:rsid wsp:val=&quot;0037721F&quot;/&gt;&lt;wsp:rsid wsp:val=&quot;003950A4&quot;/&gt;&lt;wsp:rsid wsp:val=&quot;003A1E7E&quot;/&gt;&lt;wsp:rsid wsp:val=&quot;003C7045&quot;/&gt;&lt;wsp:rsid wsp:val=&quot;003E2FDC&quot;/&gt;&lt;wsp:rsid wsp:val=&quot;003E3577&quot;/&gt;&lt;wsp:rsid wsp:val=&quot;003F3A61&quot;/&gt;&lt;wsp:rsid wsp:val=&quot;00410A5D&quot;/&gt;&lt;wsp:rsid wsp:val=&quot;00414909&quot;/&gt;&lt;wsp:rsid wsp:val=&quot;00416537&quot;/&gt;&lt;wsp:rsid wsp:val=&quot;00425A6A&quot;/&gt;&lt;wsp:rsid wsp:val=&quot;00426FBB&quot;/&gt;&lt;wsp:rsid wsp:val=&quot;00454542&quot;/&gt;&lt;wsp:rsid wsp:val=&quot;0047429A&quot;/&gt;&lt;wsp:rsid wsp:val=&quot;0048374C&quot;/&gt;&lt;wsp:rsid wsp:val=&quot;0048771D&quot;/&gt;&lt;wsp:rsid wsp:val=&quot;004A3EF0&quot;/&gt;&lt;wsp:rsid wsp:val=&quot;004A6605&quot;/&gt;&lt;wsp:rsid wsp:val=&quot;004B3B15&quot;/&gt;&lt;wsp:rsid wsp:val=&quot;004C45FA&quot;/&gt;&lt;wsp:rsid wsp:val=&quot;004D35A3&quot;/&gt;&lt;wsp:rsid wsp:val=&quot;004E1BD8&quot;/&gt;&lt;wsp:rsid wsp:val=&quot;004E452A&quot;/&gt;&lt;wsp:rsid wsp:val=&quot;004E78E3&quot;/&gt;&lt;wsp:rsid wsp:val=&quot;004F2BFE&quot;/&gt;&lt;wsp:rsid wsp:val=&quot;004F63D3&quot;/&gt;&lt;wsp:rsid wsp:val=&quot;004F7DCF&quot;/&gt;&lt;wsp:rsid wsp:val=&quot;005004BF&quot;/&gt;&lt;wsp:rsid wsp:val=&quot;00502E89&quot;/&gt;&lt;wsp:rsid wsp:val=&quot;00506CFE&quot;/&gt;&lt;wsp:rsid wsp:val=&quot;00510106&quot;/&gt;&lt;wsp:rsid wsp:val=&quot;00510E95&quot;/&gt;&lt;wsp:rsid wsp:val=&quot;005225C3&quot;/&gt;&lt;wsp:rsid wsp:val=&quot;00527D56&quot;/&gt;&lt;wsp:rsid wsp:val=&quot;0053221F&quot;/&gt;&lt;wsp:rsid wsp:val=&quot;00536FAE&quot;/&gt;&lt;wsp:rsid wsp:val=&quot;00542C85&quot;/&gt;&lt;wsp:rsid wsp:val=&quot;00553510&quot;/&gt;&lt;wsp:rsid wsp:val=&quot;00554186&quot;/&gt;&lt;wsp:rsid wsp:val=&quot;00585769&quot;/&gt;&lt;wsp:rsid wsp:val=&quot;00585C61&quot;/&gt;&lt;wsp:rsid wsp:val=&quot;00591130&quot;/&gt;&lt;wsp:rsid wsp:val=&quot;005A3F28&quot;/&gt;&lt;wsp:rsid wsp:val=&quot;005A40BE&quot;/&gt;&lt;wsp:rsid wsp:val=&quot;005B13E2&quot;/&gt;&lt;wsp:rsid wsp:val=&quot;005B47D7&quot;/&gt;&lt;wsp:rsid wsp:val=&quot;005C5526&quot;/&gt;&lt;wsp:rsid wsp:val=&quot;005C62C6&quot;/&gt;&lt;wsp:rsid wsp:val=&quot;005D7B9E&quot;/&gt;&lt;wsp:rsid wsp:val=&quot;005E112E&quot;/&gt;&lt;wsp:rsid wsp:val=&quot;005F0834&quot;/&gt;&lt;wsp:rsid wsp:val=&quot;005F68AB&quot;/&gt;&lt;wsp:rsid wsp:val=&quot;005F6DC3&quot;/&gt;&lt;wsp:rsid wsp:val=&quot;00601A8E&quot;/&gt;&lt;wsp:rsid wsp:val=&quot;0062033E&quot;/&gt;&lt;wsp:rsid wsp:val=&quot;00624482&quot;/&gt;&lt;wsp:rsid wsp:val=&quot;00630477&quot;/&gt;&lt;wsp:rsid wsp:val=&quot;0064799C&quot;/&gt;&lt;wsp:rsid wsp:val=&quot;00654156&quot;/&gt;&lt;wsp:rsid wsp:val=&quot;00656ADC&quot;/&gt;&lt;wsp:rsid wsp:val=&quot;006B47CA&quot;/&gt;&lt;wsp:rsid wsp:val=&quot;006C304C&quot;/&gt;&lt;wsp:rsid wsp:val=&quot;006C4511&quot;/&gt;&lt;wsp:rsid wsp:val=&quot;006C65F5&quot;/&gt;&lt;wsp:rsid wsp:val=&quot;006C7AAA&quot;/&gt;&lt;wsp:rsid wsp:val=&quot;006D1C2A&quot;/&gt;&lt;wsp:rsid wsp:val=&quot;006D264F&quot;/&gt;&lt;wsp:rsid wsp:val=&quot;006D4E89&quot;/&gt;&lt;wsp:rsid wsp:val=&quot;006E2A8D&quot;/&gt;&lt;wsp:rsid wsp:val=&quot;006E7574&quot;/&gt;&lt;wsp:rsid wsp:val=&quot;00703430&quot;/&gt;&lt;wsp:rsid wsp:val=&quot;00703548&quot;/&gt;&lt;wsp:rsid wsp:val=&quot;00704E18&quot;/&gt;&lt;wsp:rsid wsp:val=&quot;007069BE&quot;/&gt;&lt;wsp:rsid wsp:val=&quot;00745C86&quot;/&gt;&lt;wsp:rsid wsp:val=&quot;00764603&quot;/&gt;&lt;wsp:rsid wsp:val=&quot;007653C5&quot;/&gt;&lt;wsp:rsid wsp:val=&quot;0076604D&quot;/&gt;&lt;wsp:rsid wsp:val=&quot;00790909&quot;/&gt;&lt;wsp:rsid wsp:val=&quot;007929AF&quot;/&gt;&lt;wsp:rsid wsp:val=&quot;00792D4A&quot;/&gt;&lt;wsp:rsid wsp:val=&quot;007A2E5D&quot;/&gt;&lt;wsp:rsid wsp:val=&quot;007B1582&quot;/&gt;&lt;wsp:rsid wsp:val=&quot;007B5A07&quot;/&gt;&lt;wsp:rsid wsp:val=&quot;007C065D&quot;/&gt;&lt;wsp:rsid wsp:val=&quot;007D3E71&quot;/&gt;&lt;wsp:rsid wsp:val=&quot;007E5D6A&quot;/&gt;&lt;wsp:rsid wsp:val=&quot;007E645D&quot;/&gt;&lt;wsp:rsid wsp:val=&quot;007F75CA&quot;/&gt;&lt;wsp:rsid wsp:val=&quot;00821E08&quot;/&gt;&lt;wsp:rsid wsp:val=&quot;00834EFD&quot;/&gt;&lt;wsp:rsid wsp:val=&quot;00843007&quot;/&gt;&lt;wsp:rsid wsp:val=&quot;00844B24&quot;/&gt;&lt;wsp:rsid wsp:val=&quot;0084515F&quot;/&gt;&lt;wsp:rsid wsp:val=&quot;0085092D&quot;/&gt;&lt;wsp:rsid wsp:val=&quot;00865414&quot;/&gt;&lt;wsp:rsid wsp:val=&quot;00877D4C&quot;/&gt;&lt;wsp:rsid wsp:val=&quot;008831DC&quot;/&gt;&lt;wsp:rsid wsp:val=&quot;00883903&quot;/&gt;&lt;wsp:rsid wsp:val=&quot;00891C30&quot;/&gt;&lt;wsp:rsid wsp:val=&quot;00897219&quot;/&gt;&lt;wsp:rsid wsp:val=&quot;0089763B&quot;/&gt;&lt;wsp:rsid wsp:val=&quot;008B6AE3&quot;/&gt;&lt;wsp:rsid wsp:val=&quot;008C1332&quot;/&gt;&lt;wsp:rsid wsp:val=&quot;008D1045&quot;/&gt;&lt;wsp:rsid wsp:val=&quot;008E5996&quot;/&gt;&lt;wsp:rsid wsp:val=&quot;00901AE1&quot;/&gt;&lt;wsp:rsid wsp:val=&quot;00912F93&quot;/&gt;&lt;wsp:rsid wsp:val=&quot;009156AA&quot;/&gt;&lt;wsp:rsid wsp:val=&quot;009205B4&quot;/&gt;&lt;wsp:rsid wsp:val=&quot;00955B59&quot;/&gt;&lt;wsp:rsid wsp:val=&quot;00992262&quot;/&gt;&lt;wsp:rsid wsp:val=&quot;009926BC&quot;/&gt;&lt;wsp:rsid wsp:val=&quot;009A4319&quot;/&gt;&lt;wsp:rsid wsp:val=&quot;009A6C3F&quot;/&gt;&lt;wsp:rsid wsp:val=&quot;009B73F2&quot;/&gt;&lt;wsp:rsid wsp:val=&quot;009C12BD&quot;/&gt;&lt;wsp:rsid wsp:val=&quot;009C50FE&quot;/&gt;&lt;wsp:rsid wsp:val=&quot;009E49DD&quot;/&gt;&lt;wsp:rsid wsp:val=&quot;00A03E75&quot;/&gt;&lt;wsp:rsid wsp:val=&quot;00A20627&quot;/&gt;&lt;wsp:rsid wsp:val=&quot;00A22FE9&quot;/&gt;&lt;wsp:rsid wsp:val=&quot;00A31A44&quot;/&gt;&lt;wsp:rsid wsp:val=&quot;00A32BFA&quot;/&gt;&lt;wsp:rsid wsp:val=&quot;00A3325E&quot;/&gt;&lt;wsp:rsid wsp:val=&quot;00A366E2&quot;/&gt;&lt;wsp:rsid wsp:val=&quot;00A45FCE&quot;/&gt;&lt;wsp:rsid wsp:val=&quot;00A75671&quot;/&gt;&lt;wsp:rsid wsp:val=&quot;00A773CC&quot;/&gt;&lt;wsp:rsid wsp:val=&quot;00A924D0&quot;/&gt;&lt;wsp:rsid wsp:val=&quot;00A9318B&quot;/&gt;&lt;wsp:rsid wsp:val=&quot;00A94AC1&quot;/&gt;&lt;wsp:rsid wsp:val=&quot;00AB18B7&quot;/&gt;&lt;wsp:rsid wsp:val=&quot;00AD335D&quot;/&gt;&lt;wsp:rsid wsp:val=&quot;00AF114C&quot;/&gt;&lt;wsp:rsid wsp:val=&quot;00AF792B&quot;/&gt;&lt;wsp:rsid wsp:val=&quot;00B2440C&quot;/&gt;&lt;wsp:rsid wsp:val=&quot;00B32137&quot;/&gt;&lt;wsp:rsid wsp:val=&quot;00B33D2F&quot;/&gt;&lt;wsp:rsid wsp:val=&quot;00B40A5B&quot;/&gt;&lt;wsp:rsid wsp:val=&quot;00B45C6B&quot;/&gt;&lt;wsp:rsid wsp:val=&quot;00B55D5E&quot;/&gt;&lt;wsp:rsid wsp:val=&quot;00B57A80&quot;/&gt;&lt;wsp:rsid wsp:val=&quot;00B70E9C&quot;/&gt;&lt;wsp:rsid wsp:val=&quot;00B713D8&quot;/&gt;&lt;wsp:rsid wsp:val=&quot;00B72979&quot;/&gt;&lt;wsp:rsid wsp:val=&quot;00B94516&quot;/&gt;&lt;wsp:rsid wsp:val=&quot;00BA25E2&quot;/&gt;&lt;wsp:rsid wsp:val=&quot;00BB2855&quot;/&gt;&lt;wsp:rsid wsp:val=&quot;00BC5343&quot;/&gt;&lt;wsp:rsid wsp:val=&quot;00BD19C1&quot;/&gt;&lt;wsp:rsid wsp:val=&quot;00BD25B8&quot;/&gt;&lt;wsp:rsid wsp:val=&quot;00C012E1&quot;/&gt;&lt;wsp:rsid wsp:val=&quot;00C06BB4&quot;/&gt;&lt;wsp:rsid wsp:val=&quot;00C10D20&quot;/&gt;&lt;wsp:rsid wsp:val=&quot;00C12E0C&quot;/&gt;&lt;wsp:rsid wsp:val=&quot;00C21916&quot;/&gt;&lt;wsp:rsid wsp:val=&quot;00C34915&quot;/&gt;&lt;wsp:rsid wsp:val=&quot;00C457CA&quot;/&gt;&lt;wsp:rsid wsp:val=&quot;00C47EAE&quot;/&gt;&lt;wsp:rsid wsp:val=&quot;00C53FB6&quot;/&gt;&lt;wsp:rsid wsp:val=&quot;00C57FB7&quot;/&gt;&lt;wsp:rsid wsp:val=&quot;00C644D4&quot;/&gt;&lt;wsp:rsid wsp:val=&quot;00C65F3F&quot;/&gt;&lt;wsp:rsid wsp:val=&quot;00C72414&quot;/&gt;&lt;wsp:rsid wsp:val=&quot;00C72B1A&quot;/&gt;&lt;wsp:rsid wsp:val=&quot;00C8667B&quot;/&gt;&lt;wsp:rsid wsp:val=&quot;00C90993&quot;/&gt;&lt;wsp:rsid wsp:val=&quot;00CA4CE3&quot;/&gt;&lt;wsp:rsid wsp:val=&quot;00CA5A12&quot;/&gt;&lt;wsp:rsid wsp:val=&quot;00CB4ADD&quot;/&gt;&lt;wsp:rsid wsp:val=&quot;00CC72FD&quot;/&gt;&lt;wsp:rsid wsp:val=&quot;00CD1D23&quot;/&gt;&lt;wsp:rsid wsp:val=&quot;00CD4F3F&quot;/&gt;&lt;wsp:rsid wsp:val=&quot;00D311F8&quot;/&gt;&lt;wsp:rsid wsp:val=&quot;00D31660&quot;/&gt;&lt;wsp:rsid wsp:val=&quot;00D36B52&quot;/&gt;&lt;wsp:rsid wsp:val=&quot;00D377C8&quot;/&gt;&lt;wsp:rsid wsp:val=&quot;00D41274&quot;/&gt;&lt;wsp:rsid wsp:val=&quot;00D4229C&quot;/&gt;&lt;wsp:rsid wsp:val=&quot;00D43BF3&quot;/&gt;&lt;wsp:rsid wsp:val=&quot;00D549FB&quot;/&gt;&lt;wsp:rsid wsp:val=&quot;00D56487&quot;/&gt;&lt;wsp:rsid wsp:val=&quot;00D767BB&quot;/&gt;&lt;wsp:rsid wsp:val=&quot;00D939B0&quot;/&gt;&lt;wsp:rsid wsp:val=&quot;00DA31A2&quot;/&gt;&lt;wsp:rsid wsp:val=&quot;00DB16E0&quot;/&gt;&lt;wsp:rsid wsp:val=&quot;00DB2DF9&quot;/&gt;&lt;wsp:rsid wsp:val=&quot;00DB465D&quot;/&gt;&lt;wsp:rsid wsp:val=&quot;00DB48A2&quot;/&gt;&lt;wsp:rsid wsp:val=&quot;00DB7E63&quot;/&gt;&lt;wsp:rsid wsp:val=&quot;00DC2055&quot;/&gt;&lt;wsp:rsid wsp:val=&quot;00DC3908&quot;/&gt;&lt;wsp:rsid wsp:val=&quot;00DD71E8&quot;/&gt;&lt;wsp:rsid wsp:val=&quot;00DD7F83&quot;/&gt;&lt;wsp:rsid wsp:val=&quot;00DE4EB8&quot;/&gt;&lt;wsp:rsid wsp:val=&quot;00E0641E&quot;/&gt;&lt;wsp:rsid wsp:val=&quot;00E06664&quot;/&gt;&lt;wsp:rsid wsp:val=&quot;00E304BC&quot;/&gt;&lt;wsp:rsid wsp:val=&quot;00E32853&quot;/&gt;&lt;wsp:rsid wsp:val=&quot;00E34EBD&quot;/&gt;&lt;wsp:rsid wsp:val=&quot;00E401F8&quot;/&gt;&lt;wsp:rsid wsp:val=&quot;00E46425&quot;/&gt;&lt;wsp:rsid wsp:val=&quot;00E469FC&quot;/&gt;&lt;wsp:rsid wsp:val=&quot;00E474EB&quot;/&gt;&lt;wsp:rsid wsp:val=&quot;00E47D0E&quot;/&gt;&lt;wsp:rsid wsp:val=&quot;00E65018&quot;/&gt;&lt;wsp:rsid wsp:val=&quot;00E76CA1&quot;/&gt;&lt;wsp:rsid wsp:val=&quot;00E94339&quot;/&gt;&lt;wsp:rsid wsp:val=&quot;00E97563&quot;/&gt;&lt;wsp:rsid wsp:val=&quot;00EB0B63&quot;/&gt;&lt;wsp:rsid wsp:val=&quot;00EC265C&quot;/&gt;&lt;wsp:rsid wsp:val=&quot;00ED61CB&quot;/&gt;&lt;wsp:rsid wsp:val=&quot;00EE752A&quot;/&gt;&lt;wsp:rsid wsp:val=&quot;00F06A72&quot;/&gt;&lt;wsp:rsid wsp:val=&quot;00F12D5B&quot;/&gt;&lt;wsp:rsid wsp:val=&quot;00F136F0&quot;/&gt;&lt;wsp:rsid wsp:val=&quot;00F20BBB&quot;/&gt;&lt;wsp:rsid wsp:val=&quot;00F36048&quot;/&gt;&lt;wsp:rsid wsp:val=&quot;00F43BD8&quot;/&gt;&lt;wsp:rsid wsp:val=&quot;00F562F3&quot;/&gt;&lt;wsp:rsid wsp:val=&quot;00F74B89&quot;/&gt;&lt;wsp:rsid wsp:val=&quot;00F75133&quot;/&gt;&lt;wsp:rsid wsp:val=&quot;00F83272&quot;/&gt;&lt;wsp:rsid wsp:val=&quot;00F9358D&quot;/&gt;&lt;wsp:rsid wsp:val=&quot;00F9369B&quot;/&gt;&lt;wsp:rsid wsp:val=&quot;00FA3899&quot;/&gt;&lt;wsp:rsid wsp:val=&quot;00FA4909&quot;/&gt;&lt;wsp:rsid wsp:val=&quot;00FA5164&quot;/&gt;&lt;wsp:rsid wsp:val=&quot;00FA6751&quot;/&gt;&lt;wsp:rsid wsp:val=&quot;00FA6BD7&quot;/&gt;&lt;wsp:rsid wsp:val=&quot;00FB1048&quot;/&gt;&lt;wsp:rsid wsp:val=&quot;00FB62C4&quot;/&gt;&lt;wsp:rsid wsp:val=&quot;00FB7701&quot;/&gt;&lt;wsp:rsid wsp:val=&quot;00FD1AC5&quot;/&gt;&lt;wsp:rsid wsp:val=&quot;00FD5CF0&quot;/&gt;&lt;/wsp:rsids&gt;&lt;/w:docPr&gt;&lt;w:body&gt;&lt;wx:sect&gt;&lt;w:p wsp:rsidR=&quot;007A2E5D&quot; wsp:rsidRPr=&quot;007A2E5D&quot; wsp:rsidRDefault=&quot;007A2E5D&quot; wsp:rsidP=&quot;007A2E5D&quot;&gt;&lt;m:oMathPara&gt;&lt;m:oMath&gt;&lt;m:r&gt;&lt;w:rPr&gt;&lt;w:rFonts w:ascii=&quot;Cambria Math&quot; w:fareast=&quot;Calibri&quot; w:h-ansi=&quot;Cambria Math&quot; w:cs=&quot;Arial&quot;/&gt;&lt;wx:font wx:val=&quot;Cambria Math&quot;/&gt;&lt;w:i/&gt;&lt;/w:rPr&gt;&lt;m:t&gt;4.7&lt;/m:t&gt;&lt;/m:r&gt;&lt;m:r&gt;&lt;m:rPr&gt;&lt;m:sty m:val=&quot;p&quot;/&gt;&lt;/m:rPr&gt;&lt;w:rPr&gt;&lt;w:rFonts w:ascii=&quot;Cambria Math&quot; w:fareast=&quot;Calibri&quot; w:h-ansi=&quot;Cambria Math&quot; w:cs=&quot;Arial&quot;/&gt;&lt;wx:font wx:val=&quot;Cambria Math&quot;/&gt;&lt;/w:rPr&gt;&lt;m:t&gt;Î©&lt;/m:t&gt;&lt;/m:r&gt;&lt;/m:oMath&gt;&lt;/m:oMathPara&gt;&lt;/w:p&gt;&lt;w:sectPr wsp:rsidR=&quot;00000000&quot; wsp:rsidRPr=&quot;007A2E5D&quot;&gt;&lt;w:pgSz w:w=&quot;12240&quot; w:h=&quot;15840&quot;/&gt;&lt;w:pgMar w:top=&quot;1440&quot; w:right=&quot;1440&quot; w:bottom=&quot;1440&quot; w:left=&quot;1440&quot; w:header=&quot;720&quot; w:footer=&quot;720&quot; w:gutter=&quot;0&quot;/&gt;&lt;w:cols w:space=&quot;720&quot;/&gt;&lt;/w:sectPr&gt;&lt;/wx:sect&gt;&lt;/w:body&gt;&lt;/w:wordDocument&gt;">
+                  <v:imagedata r:id="rId38" o:title="" chromakey="white"/>
+                </v:shape>
+              </w:pict>
+            </w:r>
+          </w:p>
+        </w:tc>
+      </w:tr>
+    </w:tbl>
     <w:p>
       <w:pPr>
         <w:pStyle w:val="IEEEParagraph"/>
-        <w:rPr>
-          <w:lang w:val="es-AR"/>
-        </w:rPr>
-      </w:pPr>
-      <w:r>
-        <w:rPr>
-          <w:lang w:val="es-AR"/>
-        </w:rPr>
-        <w:lastRenderedPageBreak/>
-        <w:t xml:space="preserve">Para el proceso de calibración, se utilizaron: un generador de señales, un multímetro patrón y el equipo a calibrar. Las condiciones de calibración se establecieron para una señal senoidal con una frecuencia de 1 kHz. Las mediciones se realizaron de manera simultánea con ambos instrumentos, asegurando que la influencia de las incertidumbres del generador de señales estuviera presente en ambos dispositivos. Se varió la amplitud desde 10 mV hasta 100 mV en pasos de 5 mV para la primera escala, y luego desde 100 mV hasta 1000 mV en pasos de 50 mV para la segunda escala. Los resultados se presentan en las siguientes tablas, donde </w:t>
-      </w:r>
-      <w:proofErr w:type="spellStart"/>
-      <w:r>
-        <w:rPr>
-          <w:lang w:val="es-AR"/>
-        </w:rPr>
-        <w:t>Vv</w:t>
-      </w:r>
-      <w:proofErr w:type="spellEnd"/>
-      <w:r>
-        <w:rPr>
-          <w:lang w:val="es-AR"/>
-        </w:rPr>
-        <w:t xml:space="preserve"> representa la tensión medida por el multímetro patrón y Vi la tensión medida por el voltímetro a calibrar:</w:t>
-      </w:r>
+        <w:ind w:firstLine="0"/>
+        <w:rPr>
+          <w:lang w:val="es-AR"/>
+        </w:rPr>
+      </w:pPr>
     </w:p>
     <w:p>
       <w:pPr>
         <w:pStyle w:val="IEEEParagraph"/>
-        <w:rPr>
-          <w:lang w:val="es-AR"/>
-        </w:rPr>
-      </w:pPr>
+        <w:ind w:left="360" w:firstLine="0"/>
+        <w:jc w:val="left"/>
+        <w:rPr>
+          <w:lang w:val="es-AR"/>
+        </w:rPr>
+      </w:pPr>
+    </w:p>
+    <w:p>
+      <w:pPr>
+        <w:pStyle w:val="IEEEParagraph"/>
+        <w:numPr>
+          <w:ilvl w:val="1"/>
+          <w:numId w:val="16"/>
+        </w:numPr>
+        <w:jc w:val="left"/>
+        <w:rPr>
+          <w:lang w:val="es-AR"/>
+        </w:rPr>
+      </w:pPr>
+      <w:r>
+        <w:rPr>
+          <w:lang w:val="es-AR"/>
+        </w:rPr>
+        <w:t>INSTRUMENTTOS UTILIZADOS</w:t>
+      </w:r>
+    </w:p>
+    <w:p>
+      <w:pPr>
+        <w:pStyle w:val="IEEEParagraph"/>
+        <w:numPr>
+          <w:ilvl w:val="0"/>
+          <w:numId w:val="17"/>
+        </w:numPr>
+        <w:jc w:val="left"/>
+        <w:rPr>
+          <w:lang w:val="es-AR"/>
+        </w:rPr>
+      </w:pPr>
+      <w:r>
+        <w:rPr>
+          <w:lang w:val="es-AR"/>
+        </w:rPr>
+        <w:t>Fuente DC</w:t>
+      </w:r>
+    </w:p>
+    <w:p>
+      <w:pPr>
+        <w:pStyle w:val="IEEEParagraph"/>
+        <w:numPr>
+          <w:ilvl w:val="0"/>
+          <w:numId w:val="17"/>
+        </w:numPr>
+        <w:jc w:val="left"/>
+        <w:rPr>
+          <w:lang w:val="es-AR"/>
+        </w:rPr>
+      </w:pPr>
+      <w:r>
+        <w:rPr>
+          <w:lang w:val="es-AR"/>
+        </w:rPr>
+        <w:t>Osciloscopio</w:t>
+      </w:r>
+    </w:p>
+    <w:p>
+      <w:pPr>
+        <w:pStyle w:val="IEEEParagraph"/>
+        <w:numPr>
+          <w:ilvl w:val="0"/>
+          <w:numId w:val="17"/>
+        </w:numPr>
+        <w:jc w:val="left"/>
+        <w:rPr>
+          <w:lang w:val="es-AR"/>
+        </w:rPr>
+      </w:pPr>
+      <w:r>
+        <w:rPr>
+          <w:lang w:val="es-AR"/>
+        </w:rPr>
+        <w:t>M</w:t>
+      </w:r>
+      <w:r>
+        <w:rPr>
+          <w:lang w:val="es-AR"/>
+        </w:rPr>
+        <w:t>ultímetro</w:t>
+      </w:r>
     </w:p>
     <w:p>
       <w:pPr>
         <w:pStyle w:val="IEEEParagraph"/>
         <w:jc w:val="left"/>
+        <w:rPr>
+          <w:lang w:val="es-AR"/>
+        </w:rPr>
       </w:pPr>
     </w:p>
     <w:p>
       <w:pPr>
         <w:pStyle w:val="IEEEParagraph"/>
-        <w:jc w:val="left"/>
-      </w:pPr>
+        <w:numPr>
+          <w:ilvl w:val="1"/>
+          <w:numId w:val="16"/>
+        </w:numPr>
+        <w:rPr>
+          <w:lang w:val="es-AR"/>
+        </w:rPr>
+      </w:pPr>
+      <w:r>
+        <w:rPr>
+          <w:lang w:val="es-AR"/>
+        </w:rPr>
+        <w:t>RESULTADOS DE LA MEDICIÓN</w:t>
+      </w:r>
+    </w:p>
+    <w:tbl>
+      <w:tblPr>
+        <w:tblStyle w:val="Tablaconcuadrcula"/>
+        <w:tblW w:w="4708" w:type="dxa"/>
+        <w:jc w:val="center"/>
+        <w:tblBorders>
+          <w:top w:val="single" w:sz="4" w:space="0" w:color="000000"/>
+          <w:left w:val="single" w:sz="4" w:space="0" w:color="000000"/>
+          <w:bottom w:val="single" w:sz="4" w:space="0" w:color="000000"/>
+          <w:right w:val="single" w:sz="4" w:space="0" w:color="000000"/>
+          <w:insideH w:val="single" w:sz="4" w:space="0" w:color="FFFFFF"/>
+          <w:insideV w:val="single" w:sz="4" w:space="0" w:color="FFFFFF"/>
+        </w:tblBorders>
+        <w:tblLook w:val="04A0" w:firstRow="1" w:lastRow="0" w:firstColumn="1" w:lastColumn="0" w:noHBand="0" w:noVBand="1"/>
+      </w:tblPr>
+      <w:tblGrid>
+        <w:gridCol w:w="2368"/>
+        <w:gridCol w:w="962"/>
+        <w:gridCol w:w="1378"/>
+      </w:tblGrid>
+      <w:tr>
+        <w:trPr>
+          <w:jc w:val="center"/>
+        </w:trPr>
+        <w:tc>
+          <w:tcPr>
+            <w:tcW w:w="2368" w:type="dxa"/>
+            <w:shd w:val="clear" w:color="auto" w:fill="404040"/>
+            <w:vAlign w:val="center"/>
+          </w:tcPr>
+          <w:p>
+            <w:pPr>
+              <w:jc w:val="center"/>
+              <w:rPr>
+                <w:b/>
+                <w:bCs/>
+                <w:color w:val="FFFFFF"/>
+                <w:sz w:val="18"/>
+                <w:szCs w:val="18"/>
+              </w:rPr>
+            </w:pPr>
+            <w:r>
+              <w:rPr>
+                <w:b/>
+                <w:bCs/>
+                <w:color w:val="FFFFFF"/>
+                <w:sz w:val="18"/>
+                <w:szCs w:val="18"/>
+              </w:rPr>
+              <w:t>Parámetro</w:t>
+            </w:r>
+          </w:p>
+        </w:tc>
+        <w:tc>
+          <w:tcPr>
+            <w:tcW w:w="962" w:type="dxa"/>
+            <w:shd w:val="clear" w:color="auto" w:fill="404040"/>
+            <w:vAlign w:val="center"/>
+          </w:tcPr>
+          <w:p>
+            <w:pPr>
+              <w:jc w:val="center"/>
+              <w:rPr>
+                <w:b/>
+                <w:bCs/>
+                <w:color w:val="FFFFFF"/>
+                <w:sz w:val="18"/>
+                <w:szCs w:val="18"/>
+              </w:rPr>
+            </w:pPr>
+            <w:r>
+              <w:rPr>
+                <w:rFonts w:eastAsia="Times New Roman"/>
+                <w:b/>
+                <w:bCs/>
+                <w:color w:val="FFFFFF"/>
+                <w:sz w:val="18"/>
+                <w:szCs w:val="18"/>
+              </w:rPr>
+              <w:t>Símbolo</w:t>
+            </w:r>
+          </w:p>
+        </w:tc>
+        <w:tc>
+          <w:tcPr>
+            <w:tcW w:w="1378" w:type="dxa"/>
+            <w:shd w:val="clear" w:color="auto" w:fill="404040"/>
+            <w:vAlign w:val="center"/>
+          </w:tcPr>
+          <w:p>
+            <w:pPr>
+              <w:jc w:val="center"/>
+              <w:rPr>
+                <w:b/>
+                <w:bCs/>
+                <w:color w:val="FFFFFF"/>
+                <w:sz w:val="18"/>
+                <w:szCs w:val="18"/>
+              </w:rPr>
+            </w:pPr>
+            <w:r>
+              <w:rPr>
+                <w:b/>
+                <w:bCs/>
+                <w:color w:val="FFFFFF"/>
+                <w:sz w:val="18"/>
+                <w:szCs w:val="18"/>
+              </w:rPr>
+              <w:t>Valor</w:t>
+            </w:r>
+          </w:p>
+        </w:tc>
+      </w:tr>
+      <w:tr>
+        <w:trPr>
+          <w:trHeight w:val="1"/>
+          <w:jc w:val="center"/>
+        </w:trPr>
+        <w:tc>
+          <w:tcPr>
+            <w:tcW w:w="2368" w:type="dxa"/>
+            <w:vAlign w:val="center"/>
+          </w:tcPr>
+          <w:p>
+            <w:pPr>
+              <w:rPr>
+                <w:sz w:val="18"/>
+                <w:szCs w:val="18"/>
+              </w:rPr>
+            </w:pPr>
+            <w:r>
+              <w:rPr>
+                <w:sz w:val="18"/>
+                <w:szCs w:val="18"/>
+              </w:rPr>
+              <w:t>Tensión de Salida</w:t>
+            </w:r>
+          </w:p>
+        </w:tc>
+        <w:tc>
+          <w:tcPr>
+            <w:tcW w:w="962" w:type="dxa"/>
+            <w:vAlign w:val="center"/>
+          </w:tcPr>
+          <w:p>
+            <w:pPr>
+              <w:rPr>
+                <w:rFonts w:ascii="Calibri" w:eastAsia="Calibri" w:hAnsi="Calibri" w:cs="Arial"/>
+                <w:sz w:val="18"/>
+                <w:szCs w:val="18"/>
+              </w:rPr>
+            </w:pPr>
+            <w:r>
+              <w:rPr>
+                <w:sz w:val="18"/>
+                <w:szCs w:val="18"/>
+              </w:rPr>
+              <w:pict w14:anchorId="5BF04783">
+                <v:shape id="_x0000_i1295" type="#_x0000_t75" style="width:20.75pt;height:13.85pt" equationxml="&lt;?xml version=&quot;1.0&quot; encoding=&quot;UTF-8&quot; standalone=&quot;yes&quot;?&gt;&#10;&lt;?mso-application progid=&quot;Word.Document&quot;?&gt;&#10;&lt;w:wordDocument xmlns:aml=&quot;http://schemas.microsoft.com/aml/2001/core&quot; xmlns:wpc=&quot;http://schemas.microsoft.com/office/word/2010/wordprocessingCanvas&quot; xmlns:cx=&quot;http://schemas.microsoft.com/office/drawing/2014/chartex&quot; xmlns:cx1=&quot;http://schemas.microsoft.com/office/drawing/2015/9/8/chartex&quot; xmlns:cx2=&quot;http://schemas.microsoft.com/office/drawing/2015/10/21/chartex&quot; xmlns:cx3=&quot;http://schemas.microsoft.com/office/drawing/2016/5/9/chartex&quot; xmlns:cx4=&quot;http://schemas.microsoft.com/office/drawing/2016/5/10/chartex&quot; xmlns:cx5=&quot;http://schemas.microsoft.com/office/drawing/2016/5/11/chartex&quot; xmlns:cx6=&quot;http://schemas.microsoft.com/office/drawing/2016/5/12/chartex&quot; xmlns:cx7=&quot;http://schemas.microsoft.com/office/drawing/2016/5/13/chartex&quot; xmlns:cx8=&quot;http://schemas.microsoft.com/office/drawing/2016/5/14/chartex&quot; xmlns:cr=&quot;http://schemas.microsoft.com/office/comments/2020/reactions&quot; xmlns:dt=&quot;uuid:C2F41010-65B3-11d1-A29F-00AA00C14882&quot; xmlns:mc=&quot;http://schemas.openxmlformats.org/markup-compatibility/2006&quot; xmlns:aink=&quot;http://schemas.microsoft.com/office/drawing/2016/ink&quot; xmlns:am3d=&quot;http://schemas.microsoft.com/office/drawing/2017/model3d&quot; xmlns:o=&quot;urn:schemas-microsoft-com:office:office&quot; xmlns:oel=&quot;http://schemas.microsoft.com/office/2019/extlst&quot; xmlns:m=&quot;http://schemas.openxmlformats.org/officeDocument/2006/math&quot; xmlns:v=&quot;urn:schemas-microsoft-com:vml&quot; xmlns:w10=&quot;urn:schemas-microsoft-com:office:word&quot; xmlns:w=&quot;http://schemas.microsoft.com/office/word/2003/wordml&quot; xmlns:wx=&quot;http://schemas.microsoft.com/office/word/2003/auxHint&quot; xmlns:wne=&quot;http://schemas.microsoft.com/office/word/2006/wordml&quot; xmlns:wsp=&quot;http://schemas.microsoft.com/office/word/2003/wordml/sp2&quot; xmlns:sl=&quot;http://schemas.microsoft.com/schemaLibrary/2003/core&quot; w:macrosPresent=&quot;no&quot; w:embeddedObjPresent=&quot;no&quot; w:ocxPresent=&quot;no&quot; xml:space=&quot;preserve&quot;&gt;&lt;w:ignoreSubtree w:val=&quot;http://schemas.microsoft.com/office/word/2003/wordml/sp2&quot;/&gt;&lt;o:DocumentProperties&gt;&lt;o:Version&gt;16&lt;/o:Version&gt;&lt;/o:DocumentProperties&gt;&lt;w:docPr&gt;&lt;w:view w:val=&quot;print&quot;/&gt;&lt;w:zoom w:percent=&quot;86&quot;/&gt;&lt;w:doNotEmbedSystemFonts/&gt;&lt;w:activeWritingStyle w:lang=&quot;EN-AU&quot; w:vendorID=&quot;64&quot; w:dllVersion=&quot;6&quot; w:nlCheck=&quot;on&quot; w:optionSet=&quot;1&quot;/&gt;&lt;w:activeWritingStyle w:lang=&quot;EN-GB&quot; w:vendorID=&quot;64&quot; w:dllVersion=&quot;6&quot; w:nlCheck=&quot;on&quot; w:optionSet=&quot;1&quot;/&gt;&lt;w:activeWritingStyle w:lang=&quot;EN-US&quot; w:vendorID=&quot;64&quot; w:dllVersion=&quot;6&quot; w:nlCheck=&quot;on&quot; w:optionSet=&quot;1&quot;/&gt;&lt;w:activeWritingStyle w:lang=&quot;EN-AU&quot; w:vendorID=&quot;64&quot; w:dllVersion=&quot;0&quot; w:nlCheck=&quot;on&quot; w:optionSet=&quot;0&quot;/&gt;&lt;w:activeWritingStyle w:lang=&quot;EN-GB&quot; w:vendorID=&quot;64&quot; w:dllVersion=&quot;0&quot; w:nlCheck=&quot;on&quot; w:optionSet=&quot;0&quot;/&gt;&lt;w:activeWritingStyle w:lang=&quot;EN-US&quot; w:vendorID=&quot;64&quot; w:dllVersion=&quot;0&quot; w:nlCheck=&quot;on&quot; w:optionSet=&quot;0&quot;/&gt;&lt;w:activeWritingStyle w:lang=&quot;ES-AR&quot; w:vendorID=&quot;64&quot; w:dllVersion=&quot;0&quot; w:nlCheck=&quot;on&quot; w:optionSet=&quot;0&quot;/&gt;&lt;w:activeWritingStyle w:lang=&quot;580A&quot; w:vendorID=&quot;64&quot; w:dllVersion=&quot;0&quot; w:nlCheck=&quot;on&quot; w:optionSet=&quot;0&quot;/&gt;&lt;w:activeWritingStyle w:lang=&quot;PT-BR&quot; w:vendorID=&quot;64&quot; w:dllVersion=&quot;0&quot; w:nlCheck=&quot;on&quot; w:optionSet=&quot;0&quot;/&gt;&lt;w:stylePaneFormatFilter w:val=&quot;3F01&quot;/&gt;&lt;w:defaultTabStop w:val=&quot;720&quot;/&gt;&lt;w:hyphenationZone w:val=&quot;425&quot;/&gt;&lt;w:characterSpacingControl w:val=&quot;DontCompress&quot;/&gt;&lt;w:optimizeForBrowser/&gt;&lt;w:validateAgainstSchema/&gt;&lt;w:saveInvalidXML w:val=&quot;off&quot;/&gt;&lt;w:ignoreMixedContent w:val=&quot;off&quot;/&gt;&lt;w:alwaysShowPlaceholderText w:val=&quot;off&quot;/&gt;&lt;w:compat&gt;&lt;w:breakWrappedTables/&gt;&lt;w:snapToGridInCell/&gt;&lt;w:applyBreakingRules/&gt;&lt;w:wrapTextWithPunct/&gt;&lt;w:useAsianBreakRules/&gt;&lt;w:useWord2002TableStyleRules/&gt;&lt;w:useFELayout/&gt;&lt;/w:compat&gt;&lt;wsp:rsids&gt;&lt;wsp:rsidRoot wsp:val=&quot;00426FBB&quot;/&gt;&lt;wsp:rsid wsp:val=&quot;000002E1&quot;/&gt;&lt;wsp:rsid wsp:val=&quot;00003C97&quot;/&gt;&lt;wsp:rsid wsp:val=&quot;00004DA6&quot;/&gt;&lt;wsp:rsid wsp:val=&quot;00005565&quot;/&gt;&lt;wsp:rsid wsp:val=&quot;0001754A&quot;/&gt;&lt;wsp:rsid wsp:val=&quot;00017719&quot;/&gt;&lt;wsp:rsid wsp:val=&quot;00027F1D&quot;/&gt;&lt;wsp:rsid wsp:val=&quot;0003296C&quot;/&gt;&lt;wsp:rsid wsp:val=&quot;0003351F&quot;/&gt;&lt;wsp:rsid wsp:val=&quot;00044599&quot;/&gt;&lt;wsp:rsid wsp:val=&quot;000540E6&quot;/&gt;&lt;wsp:rsid wsp:val=&quot;00054421&quot;/&gt;&lt;wsp:rsid wsp:val=&quot;00062E46&quot;/&gt;&lt;wsp:rsid wsp:val=&quot;00074AC8&quot;/&gt;&lt;wsp:rsid wsp:val=&quot;00081408&quot;/&gt;&lt;wsp:rsid wsp:val=&quot;00081EBE&quot;/&gt;&lt;wsp:rsid wsp:val=&quot;00086EDC&quot;/&gt;&lt;wsp:rsid wsp:val=&quot;000B1236&quot;/&gt;&lt;wsp:rsid wsp:val=&quot;000B36A3&quot;/&gt;&lt;wsp:rsid wsp:val=&quot;000C013C&quot;/&gt;&lt;wsp:rsid wsp:val=&quot;000E3F84&quot;/&gt;&lt;wsp:rsid wsp:val=&quot;001056DF&quot;/&gt;&lt;wsp:rsid wsp:val=&quot;00106456&quot;/&gt;&lt;wsp:rsid wsp:val=&quot;0010789C&quot;/&gt;&lt;wsp:rsid wsp:val=&quot;00110768&quot;/&gt;&lt;wsp:rsid wsp:val=&quot;00114025&quot;/&gt;&lt;wsp:rsid wsp:val=&quot;001160D2&quot;/&gt;&lt;wsp:rsid wsp:val=&quot;00120636&quot;/&gt;&lt;wsp:rsid wsp:val=&quot;001348A5&quot;/&gt;&lt;wsp:rsid wsp:val=&quot;00151B8E&quot;/&gt;&lt;wsp:rsid wsp:val=&quot;00182170&quot;/&gt;&lt;wsp:rsid wsp:val=&quot;0019165C&quot;/&gt;&lt;wsp:rsid wsp:val=&quot;001928FB&quot;/&gt;&lt;wsp:rsid wsp:val=&quot;00192BC7&quot;/&gt;&lt;wsp:rsid wsp:val=&quot;00195BE6&quot;/&gt;&lt;wsp:rsid wsp:val=&quot;001A3C37&quot;/&gt;&lt;wsp:rsid wsp:val=&quot;001A50EA&quot;/&gt;&lt;wsp:rsid wsp:val=&quot;001D2878&quot;/&gt;&lt;wsp:rsid wsp:val=&quot;001F16CD&quot;/&gt;&lt;wsp:rsid wsp:val=&quot;001F47D2&quot;/&gt;&lt;wsp:rsid wsp:val=&quot;002029C8&quot;/&gt;&lt;wsp:rsid wsp:val=&quot;0022285A&quot;/&gt;&lt;wsp:rsid wsp:val=&quot;00224C61&quot;/&gt;&lt;wsp:rsid wsp:val=&quot;00256ABC&quot;/&gt;&lt;wsp:rsid wsp:val=&quot;00257067&quot;/&gt;&lt;wsp:rsid wsp:val=&quot;0027227B&quot;/&gt;&lt;wsp:rsid wsp:val=&quot;00273AC7&quot;/&gt;&lt;wsp:rsid wsp:val=&quot;00273D2C&quot;/&gt;&lt;wsp:rsid wsp:val=&quot;00285ECD&quot;/&gt;&lt;wsp:rsid wsp:val=&quot;00290E1B&quot;/&gt;&lt;wsp:rsid wsp:val=&quot;00291B17&quot;/&gt;&lt;wsp:rsid wsp:val=&quot;00291BB3&quot;/&gt;&lt;wsp:rsid wsp:val=&quot;002A6742&quot;/&gt;&lt;wsp:rsid wsp:val=&quot;002C1A7F&quot;/&gt;&lt;wsp:rsid wsp:val=&quot;002C4239&quot;/&gt;&lt;wsp:rsid wsp:val=&quot;002C559D&quot;/&gt;&lt;wsp:rsid wsp:val=&quot;002D16AE&quot;/&gt;&lt;wsp:rsid wsp:val=&quot;002D2D42&quot;/&gt;&lt;wsp:rsid wsp:val=&quot;002F72D0&quot;/&gt;&lt;wsp:rsid wsp:val=&quot;002F7A4F&quot;/&gt;&lt;wsp:rsid wsp:val=&quot;003003AB&quot;/&gt;&lt;wsp:rsid wsp:val=&quot;00302C35&quot;/&gt;&lt;wsp:rsid wsp:val=&quot;00311C49&quot;/&gt;&lt;wsp:rsid wsp:val=&quot;0032119E&quot;/&gt;&lt;wsp:rsid wsp:val=&quot;00321304&quot;/&gt;&lt;wsp:rsid wsp:val=&quot;00324FC2&quot;/&gt;&lt;wsp:rsid wsp:val=&quot;003312CA&quot;/&gt;&lt;wsp:rsid wsp:val=&quot;00331F84&quot;/&gt;&lt;wsp:rsid wsp:val=&quot;003329D6&quot;/&gt;&lt;wsp:rsid wsp:val=&quot;003645A1&quot;/&gt;&lt;wsp:rsid wsp:val=&quot;0037721F&quot;/&gt;&lt;wsp:rsid wsp:val=&quot;003950A4&quot;/&gt;&lt;wsp:rsid wsp:val=&quot;003A1E7E&quot;/&gt;&lt;wsp:rsid wsp:val=&quot;003C7045&quot;/&gt;&lt;wsp:rsid wsp:val=&quot;003E2FDC&quot;/&gt;&lt;wsp:rsid wsp:val=&quot;003E3577&quot;/&gt;&lt;wsp:rsid wsp:val=&quot;003F3A61&quot;/&gt;&lt;wsp:rsid wsp:val=&quot;00404014&quot;/&gt;&lt;wsp:rsid wsp:val=&quot;00410A5D&quot;/&gt;&lt;wsp:rsid wsp:val=&quot;00414909&quot;/&gt;&lt;wsp:rsid wsp:val=&quot;00416537&quot;/&gt;&lt;wsp:rsid wsp:val=&quot;00425A6A&quot;/&gt;&lt;wsp:rsid wsp:val=&quot;00426FBB&quot;/&gt;&lt;wsp:rsid wsp:val=&quot;00454542&quot;/&gt;&lt;wsp:rsid wsp:val=&quot;0047429A&quot;/&gt;&lt;wsp:rsid wsp:val=&quot;00477AA8&quot;/&gt;&lt;wsp:rsid wsp:val=&quot;0048374C&quot;/&gt;&lt;wsp:rsid wsp:val=&quot;0048771D&quot;/&gt;&lt;wsp:rsid wsp:val=&quot;004A3EF0&quot;/&gt;&lt;wsp:rsid wsp:val=&quot;004A6605&quot;/&gt;&lt;wsp:rsid wsp:val=&quot;004B3B15&quot;/&gt;&lt;wsp:rsid wsp:val=&quot;004C45FA&quot;/&gt;&lt;wsp:rsid wsp:val=&quot;004D347F&quot;/&gt;&lt;wsp:rsid wsp:val=&quot;004D35A3&quot;/&gt;&lt;wsp:rsid wsp:val=&quot;004E1BD8&quot;/&gt;&lt;wsp:rsid wsp:val=&quot;004E452A&quot;/&gt;&lt;wsp:rsid wsp:val=&quot;004E78E3&quot;/&gt;&lt;wsp:rsid wsp:val=&quot;004F2BFE&quot;/&gt;&lt;wsp:rsid wsp:val=&quot;004F63D3&quot;/&gt;&lt;wsp:rsid wsp:val=&quot;004F7DCF&quot;/&gt;&lt;wsp:rsid wsp:val=&quot;005004BF&quot;/&gt;&lt;wsp:rsid wsp:val=&quot;00502E89&quot;/&gt;&lt;wsp:rsid wsp:val=&quot;00506CFE&quot;/&gt;&lt;wsp:rsid wsp:val=&quot;00510106&quot;/&gt;&lt;wsp:rsid wsp:val=&quot;00510E95&quot;/&gt;&lt;wsp:rsid wsp:val=&quot;005225C3&quot;/&gt;&lt;wsp:rsid wsp:val=&quot;00527D56&quot;/&gt;&lt;wsp:rsid wsp:val=&quot;0053221F&quot;/&gt;&lt;wsp:rsid wsp:val=&quot;00536FAE&quot;/&gt;&lt;wsp:rsid wsp:val=&quot;00542C85&quot;/&gt;&lt;wsp:rsid wsp:val=&quot;00553510&quot;/&gt;&lt;wsp:rsid wsp:val=&quot;00554186&quot;/&gt;&lt;wsp:rsid wsp:val=&quot;00585769&quot;/&gt;&lt;wsp:rsid wsp:val=&quot;00585C61&quot;/&gt;&lt;wsp:rsid wsp:val=&quot;00591130&quot;/&gt;&lt;wsp:rsid wsp:val=&quot;005A3F28&quot;/&gt;&lt;wsp:rsid wsp:val=&quot;005A40BE&quot;/&gt;&lt;wsp:rsid wsp:val=&quot;005B13E2&quot;/&gt;&lt;wsp:rsid wsp:val=&quot;005B47D7&quot;/&gt;&lt;wsp:rsid wsp:val=&quot;005C5526&quot;/&gt;&lt;wsp:rsid wsp:val=&quot;005C62C6&quot;/&gt;&lt;wsp:rsid wsp:val=&quot;005D7B9E&quot;/&gt;&lt;wsp:rsid wsp:val=&quot;005E112E&quot;/&gt;&lt;wsp:rsid wsp:val=&quot;005F0834&quot;/&gt;&lt;wsp:rsid wsp:val=&quot;005F68AB&quot;/&gt;&lt;wsp:rsid wsp:val=&quot;005F6DC3&quot;/&gt;&lt;wsp:rsid wsp:val=&quot;00601A8E&quot;/&gt;&lt;wsp:rsid wsp:val=&quot;0062033E&quot;/&gt;&lt;wsp:rsid wsp:val=&quot;00624482&quot;/&gt;&lt;wsp:rsid wsp:val=&quot;00630477&quot;/&gt;&lt;wsp:rsid wsp:val=&quot;0064799C&quot;/&gt;&lt;wsp:rsid wsp:val=&quot;00654156&quot;/&gt;&lt;wsp:rsid wsp:val=&quot;00656ADC&quot;/&gt;&lt;wsp:rsid wsp:val=&quot;006B47CA&quot;/&gt;&lt;wsp:rsid wsp:val=&quot;006C304C&quot;/&gt;&lt;wsp:rsid wsp:val=&quot;006C4511&quot;/&gt;&lt;wsp:rsid wsp:val=&quot;006C65F5&quot;/&gt;&lt;wsp:rsid wsp:val=&quot;006C7AAA&quot;/&gt;&lt;wsp:rsid wsp:val=&quot;006D1C2A&quot;/&gt;&lt;wsp:rsid wsp:val=&quot;006D264F&quot;/&gt;&lt;wsp:rsid wsp:val=&quot;006D4E89&quot;/&gt;&lt;wsp:rsid wsp:val=&quot;006E2A8D&quot;/&gt;&lt;wsp:rsid wsp:val=&quot;006E7574&quot;/&gt;&lt;wsp:rsid wsp:val=&quot;00703430&quot;/&gt;&lt;wsp:rsid wsp:val=&quot;00703548&quot;/&gt;&lt;wsp:rsid wsp:val=&quot;00704E18&quot;/&gt;&lt;wsp:rsid wsp:val=&quot;007069BE&quot;/&gt;&lt;wsp:rsid wsp:val=&quot;00745C86&quot;/&gt;&lt;wsp:rsid wsp:val=&quot;00764603&quot;/&gt;&lt;wsp:rsid wsp:val=&quot;007653C5&quot;/&gt;&lt;wsp:rsid wsp:val=&quot;0076604D&quot;/&gt;&lt;wsp:rsid wsp:val=&quot;00790909&quot;/&gt;&lt;wsp:rsid wsp:val=&quot;007929AF&quot;/&gt;&lt;wsp:rsid wsp:val=&quot;00792D4A&quot;/&gt;&lt;wsp:rsid wsp:val=&quot;007B1582&quot;/&gt;&lt;wsp:rsid wsp:val=&quot;007B5A07&quot;/&gt;&lt;wsp:rsid wsp:val=&quot;007C065D&quot;/&gt;&lt;wsp:rsid wsp:val=&quot;007D3E71&quot;/&gt;&lt;wsp:rsid wsp:val=&quot;007E5D6A&quot;/&gt;&lt;wsp:rsid wsp:val=&quot;007E645D&quot;/&gt;&lt;wsp:rsid wsp:val=&quot;007F75CA&quot;/&gt;&lt;wsp:rsid wsp:val=&quot;00821E08&quot;/&gt;&lt;wsp:rsid wsp:val=&quot;00834EFD&quot;/&gt;&lt;wsp:rsid wsp:val=&quot;00843007&quot;/&gt;&lt;wsp:rsid wsp:val=&quot;00844B24&quot;/&gt;&lt;wsp:rsid wsp:val=&quot;0084515F&quot;/&gt;&lt;wsp:rsid wsp:val=&quot;0085092D&quot;/&gt;&lt;wsp:rsid wsp:val=&quot;00865414&quot;/&gt;&lt;wsp:rsid wsp:val=&quot;00877D4C&quot;/&gt;&lt;wsp:rsid wsp:val=&quot;008831DC&quot;/&gt;&lt;wsp:rsid wsp:val=&quot;00883903&quot;/&gt;&lt;wsp:rsid wsp:val=&quot;00891C30&quot;/&gt;&lt;wsp:rsid wsp:val=&quot;00897219&quot;/&gt;&lt;wsp:rsid wsp:val=&quot;0089763B&quot;/&gt;&lt;wsp:rsid wsp:val=&quot;008B6AE3&quot;/&gt;&lt;wsp:rsid wsp:val=&quot;008C1332&quot;/&gt;&lt;wsp:rsid wsp:val=&quot;008D1045&quot;/&gt;&lt;wsp:rsid wsp:val=&quot;008E5996&quot;/&gt;&lt;wsp:rsid wsp:val=&quot;00901AE1&quot;/&gt;&lt;wsp:rsid wsp:val=&quot;00912F93&quot;/&gt;&lt;wsp:rsid wsp:val=&quot;009156AA&quot;/&gt;&lt;wsp:rsid wsp:val=&quot;009205B4&quot;/&gt;&lt;wsp:rsid wsp:val=&quot;00955B59&quot;/&gt;&lt;wsp:rsid wsp:val=&quot;00992262&quot;/&gt;&lt;wsp:rsid wsp:val=&quot;009926BC&quot;/&gt;&lt;wsp:rsid wsp:val=&quot;009A4319&quot;/&gt;&lt;wsp:rsid wsp:val=&quot;009A6C3F&quot;/&gt;&lt;wsp:rsid wsp:val=&quot;009B73F2&quot;/&gt;&lt;wsp:rsid wsp:val=&quot;009C12BD&quot;/&gt;&lt;wsp:rsid wsp:val=&quot;009C50FE&quot;/&gt;&lt;wsp:rsid wsp:val=&quot;009E49DD&quot;/&gt;&lt;wsp:rsid wsp:val=&quot;00A03E75&quot;/&gt;&lt;wsp:rsid wsp:val=&quot;00A20627&quot;/&gt;&lt;wsp:rsid wsp:val=&quot;00A22FE9&quot;/&gt;&lt;wsp:rsid wsp:val=&quot;00A31A44&quot;/&gt;&lt;wsp:rsid wsp:val=&quot;00A32BFA&quot;/&gt;&lt;wsp:rsid wsp:val=&quot;00A3325E&quot;/&gt;&lt;wsp:rsid wsp:val=&quot;00A366E2&quot;/&gt;&lt;wsp:rsid wsp:val=&quot;00A45FCE&quot;/&gt;&lt;wsp:rsid wsp:val=&quot;00A55CFF&quot;/&gt;&lt;wsp:rsid wsp:val=&quot;00A75671&quot;/&gt;&lt;wsp:rsid wsp:val=&quot;00A773CC&quot;/&gt;&lt;wsp:rsid wsp:val=&quot;00A924D0&quot;/&gt;&lt;wsp:rsid wsp:val=&quot;00A9318B&quot;/&gt;&lt;wsp:rsid wsp:val=&quot;00A94AC1&quot;/&gt;&lt;wsp:rsid wsp:val=&quot;00AB18B7&quot;/&gt;&lt;wsp:rsid wsp:val=&quot;00AD335D&quot;/&gt;&lt;wsp:rsid wsp:val=&quot;00AF114C&quot;/&gt;&lt;wsp:rsid wsp:val=&quot;00AF792B&quot;/&gt;&lt;wsp:rsid wsp:val=&quot;00B2440C&quot;/&gt;&lt;wsp:rsid wsp:val=&quot;00B32137&quot;/&gt;&lt;wsp:rsid wsp:val=&quot;00B33D2F&quot;/&gt;&lt;wsp:rsid wsp:val=&quot;00B40A5B&quot;/&gt;&lt;wsp:rsid wsp:val=&quot;00B45C6B&quot;/&gt;&lt;wsp:rsid wsp:val=&quot;00B55D5E&quot;/&gt;&lt;wsp:rsid wsp:val=&quot;00B57A80&quot;/&gt;&lt;wsp:rsid wsp:val=&quot;00B70E9C&quot;/&gt;&lt;wsp:rsid wsp:val=&quot;00B713D8&quot;/&gt;&lt;wsp:rsid wsp:val=&quot;00B72979&quot;/&gt;&lt;wsp:rsid wsp:val=&quot;00B94516&quot;/&gt;&lt;wsp:rsid wsp:val=&quot;00BA25E2&quot;/&gt;&lt;wsp:rsid wsp:val=&quot;00BB2855&quot;/&gt;&lt;wsp:rsid wsp:val=&quot;00BC5343&quot;/&gt;&lt;wsp:rsid wsp:val=&quot;00BD19C1&quot;/&gt;&lt;wsp:rsid wsp:val=&quot;00BD25B8&quot;/&gt;&lt;wsp:rsid wsp:val=&quot;00C012E1&quot;/&gt;&lt;wsp:rsid wsp:val=&quot;00C06BB4&quot;/&gt;&lt;wsp:rsid wsp:val=&quot;00C10D20&quot;/&gt;&lt;wsp:rsid wsp:val=&quot;00C12E0C&quot;/&gt;&lt;wsp:rsid wsp:val=&quot;00C21916&quot;/&gt;&lt;wsp:rsid wsp:val=&quot;00C34915&quot;/&gt;&lt;wsp:rsid wsp:val=&quot;00C457CA&quot;/&gt;&lt;wsp:rsid wsp:val=&quot;00C47EAE&quot;/&gt;&lt;wsp:rsid wsp:val=&quot;00C53FB6&quot;/&gt;&lt;wsp:rsid wsp:val=&quot;00C57FB7&quot;/&gt;&lt;wsp:rsid wsp:val=&quot;00C644D4&quot;/&gt;&lt;wsp:rsid wsp:val=&quot;00C65F3F&quot;/&gt;&lt;wsp:rsid wsp:val=&quot;00C72414&quot;/&gt;&lt;wsp:rsid wsp:val=&quot;00C72B1A&quot;/&gt;&lt;wsp:rsid wsp:val=&quot;00C8667B&quot;/&gt;&lt;wsp:rsid wsp:val=&quot;00C90993&quot;/&gt;&lt;wsp:rsid wsp:val=&quot;00CA4CE3&quot;/&gt;&lt;wsp:rsid wsp:val=&quot;00CA5A12&quot;/&gt;&lt;wsp:rsid wsp:val=&quot;00CB4ADD&quot;/&gt;&lt;wsp:rsid wsp:val=&quot;00CC72FD&quot;/&gt;&lt;wsp:rsid wsp:val=&quot;00CD1D23&quot;/&gt;&lt;wsp:rsid wsp:val=&quot;00CD4F3F&quot;/&gt;&lt;wsp:rsid wsp:val=&quot;00D311F8&quot;/&gt;&lt;wsp:rsid wsp:val=&quot;00D31660&quot;/&gt;&lt;wsp:rsid wsp:val=&quot;00D36B52&quot;/&gt;&lt;wsp:rsid wsp:val=&quot;00D377C8&quot;/&gt;&lt;wsp:rsid wsp:val=&quot;00D41274&quot;/&gt;&lt;wsp:rsid wsp:val=&quot;00D4229C&quot;/&gt;&lt;wsp:rsid wsp:val=&quot;00D43BF3&quot;/&gt;&lt;wsp:rsid wsp:val=&quot;00D549FB&quot;/&gt;&lt;wsp:rsid wsp:val=&quot;00D56487&quot;/&gt;&lt;wsp:rsid wsp:val=&quot;00D767BB&quot;/&gt;&lt;wsp:rsid wsp:val=&quot;00D939B0&quot;/&gt;&lt;wsp:rsid wsp:val=&quot;00DA31A2&quot;/&gt;&lt;wsp:rsid wsp:val=&quot;00DB16E0&quot;/&gt;&lt;wsp:rsid wsp:val=&quot;00DB2DF9&quot;/&gt;&lt;wsp:rsid wsp:val=&quot;00DB465D&quot;/&gt;&lt;wsp:rsid wsp:val=&quot;00DB48A2&quot;/&gt;&lt;wsp:rsid wsp:val=&quot;00DB7E63&quot;/&gt;&lt;wsp:rsid wsp:val=&quot;00DC2055&quot;/&gt;&lt;wsp:rsid wsp:val=&quot;00DC3908&quot;/&gt;&lt;wsp:rsid wsp:val=&quot;00DD71E8&quot;/&gt;&lt;wsp:rsid wsp:val=&quot;00DD7F83&quot;/&gt;&lt;wsp:rsid wsp:val=&quot;00DE4EB8&quot;/&gt;&lt;wsp:rsid wsp:val=&quot;00E0641E&quot;/&gt;&lt;wsp:rsid wsp:val=&quot;00E06664&quot;/&gt;&lt;wsp:rsid wsp:val=&quot;00E169D1&quot;/&gt;&lt;wsp:rsid wsp:val=&quot;00E304BC&quot;/&gt;&lt;wsp:rsid wsp:val=&quot;00E32853&quot;/&gt;&lt;wsp:rsid wsp:val=&quot;00E34EBD&quot;/&gt;&lt;wsp:rsid wsp:val=&quot;00E401F8&quot;/&gt;&lt;wsp:rsid wsp:val=&quot;00E46425&quot;/&gt;&lt;wsp:rsid wsp:val=&quot;00E469FC&quot;/&gt;&lt;wsp:rsid wsp:val=&quot;00E474EB&quot;/&gt;&lt;wsp:rsid wsp:val=&quot;00E47D0E&quot;/&gt;&lt;wsp:rsid wsp:val=&quot;00E65018&quot;/&gt;&lt;wsp:rsid wsp:val=&quot;00E76CA1&quot;/&gt;&lt;wsp:rsid wsp:val=&quot;00E94339&quot;/&gt;&lt;wsp:rsid wsp:val=&quot;00E97563&quot;/&gt;&lt;wsp:rsid wsp:val=&quot;00EB0B63&quot;/&gt;&lt;wsp:rsid wsp:val=&quot;00EC265C&quot;/&gt;&lt;wsp:rsid wsp:val=&quot;00ED61CB&quot;/&gt;&lt;wsp:rsid wsp:val=&quot;00EE752A&quot;/&gt;&lt;wsp:rsid wsp:val=&quot;00F06A72&quot;/&gt;&lt;wsp:rsid wsp:val=&quot;00F12D5B&quot;/&gt;&lt;wsp:rsid wsp:val=&quot;00F136F0&quot;/&gt;&lt;wsp:rsid wsp:val=&quot;00F20BBB&quot;/&gt;&lt;wsp:rsid wsp:val=&quot;00F36048&quot;/&gt;&lt;wsp:rsid wsp:val=&quot;00F43BD8&quot;/&gt;&lt;wsp:rsid wsp:val=&quot;00F562F3&quot;/&gt;&lt;wsp:rsid wsp:val=&quot;00F74B89&quot;/&gt;&lt;wsp:rsid wsp:val=&quot;00F75133&quot;/&gt;&lt;wsp:rsid wsp:val=&quot;00F83272&quot;/&gt;&lt;wsp:rsid wsp:val=&quot;00F9358D&quot;/&gt;&lt;wsp:rsid wsp:val=&quot;00F9369B&quot;/&gt;&lt;wsp:rsid wsp:val=&quot;00FA3899&quot;/&gt;&lt;wsp:rsid wsp:val=&quot;00FA4909&quot;/&gt;&lt;wsp:rsid wsp:val=&quot;00FA5164&quot;/&gt;&lt;wsp:rsid wsp:val=&quot;00FA6751&quot;/&gt;&lt;wsp:rsid wsp:val=&quot;00FA6BD7&quot;/&gt;&lt;wsp:rsid wsp:val=&quot;00FB1048&quot;/&gt;&lt;wsp:rsid wsp:val=&quot;00FB62C4&quot;/&gt;&lt;wsp:rsid wsp:val=&quot;00FB7701&quot;/&gt;&lt;wsp:rsid wsp:val=&quot;00FD1AC5&quot;/&gt;&lt;wsp:rsid wsp:val=&quot;00FD5CF0&quot;/&gt;&lt;/wsp:rsids&gt;&lt;/w:docPr&gt;&lt;w:body&gt;&lt;wx:sect&gt;&lt;w:p wsp:rsidR=&quot;00106456&quot; wsp:rsidRPr=&quot;00106456&quot; wsp:rsidRDefault=&quot;00106456&quot; wsp:rsidP=&quot;00106456&quot;&gt;&lt;m:oMathPara&gt;&lt;m:oMath&gt;&lt;m:sSub&gt;&lt;m:sSubPr&gt;&lt;m:ctrlPr&gt;&lt;w:rPr&gt;&lt;w:rFonts w:ascii=&quot;Cambria Math&quot; w:fareast=&quot;Calibri&quot; w:h-ansi=&quot;Cambria Math&quot; w:cs=&quot;Arial&quot;/&gt;&lt;wx:font wx:val=&quot;Cambria Math&quot;/&gt;&lt;w:i/&gt;&lt;/w:rPr&gt;&lt;/m:ctrlPr&gt;&lt;/m:sSubPr&gt;&lt;m:e&gt;&lt;m:r&gt;&lt;w:rPr&gt;&lt;w:rFonts w:ascii=&quot;Cambria Math&quot; w:fareast=&quot;Calibri&quot; w:h-ansi=&quot;Cambria Math&quot; w:cs=&quot;Arial&quot;/&gt;&lt;wx:font wx:val=&quot;Cambria Math&quot;/&gt;&lt;w:i/&gt;&lt;/w:rPr&gt;&lt;m:t&gt;V&lt;/m:t&gt;&lt;/m:r&gt;&lt;/m:e&gt;&lt;m:sub&gt;&lt;m:r&gt;&lt;w:rPr&gt;&lt;w:rFonts w:ascii=&quot;Cambria Math&quot; w:fareast=&quot;Calibri&quot; w:h-ansi=&quot;Cambria Math&quot; w:cs=&quot;Arial&quot;/&gt;&lt;wx:font wx:val=&quot;Cambria Math&quot;/&gt;&lt;w:i/&gt;&lt;/w:rPr&gt;&lt;m:t&gt;out&lt;/m:t&gt;&lt;/m:r&gt;&lt;/m:sub&gt;&lt;/m:sSub&gt;&lt;/m:oMath&gt;&lt;/m:oMathPara&gt;&lt;/w:p&gt;&lt;w:sectPr wsp:rsidR=&quot;00000000&quot; wsp:rsidRPr=&quot;00106456&quot;&gt;&lt;w:pgSz w:w=&quot;12240&quot; w:h=&quot;15840&quot;/&gt;&lt;w:pgMar w:top=&quot;1440&quot; w:right=&quot;1440&quot; w:bottom=&quot;1440&quot; w:left=&quot;1440&quot; w:header=&quot;720&quot; w:footer=&quot;720&quot; w:gutter=&quot;0&quot;/&gt;&lt;w:cols w:space=&quot;720&quot;/&gt;&lt;/w:sectPr&gt;&lt;/wx:sect&gt;&lt;/w:body&gt;&lt;/w:wordDocument&gt;">
+                  <v:imagedata r:id="rId14" o:title="" chromakey="white"/>
+                </v:shape>
+              </w:pict>
+            </w:r>
+          </w:p>
+        </w:tc>
+        <w:tc>
+          <w:tcPr>
+            <w:tcW w:w="1378" w:type="dxa"/>
+            <w:vAlign w:val="center"/>
+          </w:tcPr>
+          <w:p>
+            <w:pPr>
+              <w:rPr>
+                <w:sz w:val="18"/>
+                <w:szCs w:val="18"/>
+              </w:rPr>
+            </w:pPr>
+            <w:r>
+              <w:rPr>
+                <w:sz w:val="18"/>
+                <w:szCs w:val="18"/>
+              </w:rPr>
+              <w:pict w14:anchorId="6D9BFCDD">
+                <v:shape id="_x0000_i1296" type="#_x0000_t75" style="width:29.75pt;height:13.85pt" equationxml="&lt;?xml version=&quot;1.0&quot; encoding=&quot;UTF-8&quot; standalone=&quot;yes&quot;?&gt;&#10;&lt;?mso-application progid=&quot;Word.Document&quot;?&gt;&#10;&lt;w:wordDocument xmlns:aml=&quot;http://schemas.microsoft.com/aml/2001/core&quot; xmlns:wpc=&quot;http://schemas.microsoft.com/office/word/2010/wordprocessingCanvas&quot; xmlns:cx=&quot;http://schemas.microsoft.com/office/drawing/2014/chartex&quot; xmlns:cx1=&quot;http://schemas.microsoft.com/office/drawing/2015/9/8/chartex&quot; xmlns:cx2=&quot;http://schemas.microsoft.com/office/drawing/2015/10/21/chartex&quot; xmlns:cx3=&quot;http://schemas.microsoft.com/office/drawing/2016/5/9/chartex&quot; xmlns:cx4=&quot;http://schemas.microsoft.com/office/drawing/2016/5/10/chartex&quot; xmlns:cx5=&quot;http://schemas.microsoft.com/office/drawing/2016/5/11/chartex&quot; xmlns:cx6=&quot;http://schemas.microsoft.com/office/drawing/2016/5/12/chartex&quot; xmlns:cx7=&quot;http://schemas.microsoft.com/office/drawing/2016/5/13/chartex&quot; xmlns:cx8=&quot;http://schemas.microsoft.com/office/drawing/2016/5/14/chartex&quot; xmlns:cr=&quot;http://schemas.microsoft.com/office/comments/2020/reactions&quot; xmlns:dt=&quot;uuid:C2F41010-65B3-11d1-A29F-00AA00C14882&quot; xmlns:mc=&quot;http://schemas.openxmlformats.org/markup-compatibility/2006&quot; xmlns:aink=&quot;http://schemas.microsoft.com/office/drawing/2016/ink&quot; xmlns:am3d=&quot;http://schemas.microsoft.com/office/drawing/2017/model3d&quot; xmlns:o=&quot;urn:schemas-microsoft-com:office:office&quot; xmlns:oel=&quot;http://schemas.microsoft.com/office/2019/extlst&quot; xmlns:m=&quot;http://schemas.openxmlformats.org/officeDocument/2006/math&quot; xmlns:v=&quot;urn:schemas-microsoft-com:vml&quot; xmlns:w10=&quot;urn:schemas-microsoft-com:office:word&quot; xmlns:w=&quot;http://schemas.microsoft.com/office/word/2003/wordml&quot; xmlns:wx=&quot;http://schemas.microsoft.com/office/word/2003/auxHint&quot; xmlns:wne=&quot;http://schemas.microsoft.com/office/word/2006/wordml&quot; xmlns:wsp=&quot;http://schemas.microsoft.com/office/word/2003/wordml/sp2&quot; xmlns:sl=&quot;http://schemas.microsoft.com/schemaLibrary/2003/core&quot; w:macrosPresent=&quot;no&quot; w:embeddedObjPresent=&quot;no&quot; w:ocxPresent=&quot;no&quot; xml:space=&quot;preserve&quot;&gt;&lt;w:ignoreSubtree w:val=&quot;http://schemas.microsoft.com/office/word/2003/wordml/sp2&quot;/&gt;&lt;o:DocumentProperties&gt;&lt;o:Version&gt;16&lt;/o:Version&gt;&lt;/o:DocumentProperties&gt;&lt;w:docPr&gt;&lt;w:view w:val=&quot;print&quot;/&gt;&lt;w:zoom w:percent=&quot;86&quot;/&gt;&lt;w:doNotEmbedSystemFonts/&gt;&lt;w:activeWritingStyle w:lang=&quot;EN-AU&quot; w:vendorID=&quot;64&quot; w:dllVersion=&quot;6&quot; w:nlCheck=&quot;on&quot; w:optionSet=&quot;1&quot;/&gt;&lt;w:activeWritingStyle w:lang=&quot;EN-GB&quot; w:vendorID=&quot;64&quot; w:dllVersion=&quot;6&quot; w:nlCheck=&quot;on&quot; w:optionSet=&quot;1&quot;/&gt;&lt;w:activeWritingStyle w:lang=&quot;EN-US&quot; w:vendorID=&quot;64&quot; w:dllVersion=&quot;6&quot; w:nlCheck=&quot;on&quot; w:optionSet=&quot;1&quot;/&gt;&lt;w:activeWritingStyle w:lang=&quot;EN-AU&quot; w:vendorID=&quot;64&quot; w:dllVersion=&quot;0&quot; w:nlCheck=&quot;on&quot; w:optionSet=&quot;0&quot;/&gt;&lt;w:activeWritingStyle w:lang=&quot;EN-GB&quot; w:vendorID=&quot;64&quot; w:dllVersion=&quot;0&quot; w:nlCheck=&quot;on&quot; w:optionSet=&quot;0&quot;/&gt;&lt;w:activeWritingStyle w:lang=&quot;EN-US&quot; w:vendorID=&quot;64&quot; w:dllVersion=&quot;0&quot; w:nlCheck=&quot;on&quot; w:optionSet=&quot;0&quot;/&gt;&lt;w:activeWritingStyle w:lang=&quot;ES-AR&quot; w:vendorID=&quot;64&quot; w:dllVersion=&quot;0&quot; w:nlCheck=&quot;on&quot; w:optionSet=&quot;0&quot;/&gt;&lt;w:activeWritingStyle w:lang=&quot;580A&quot; w:vendorID=&quot;64&quot; w:dllVersion=&quot;0&quot; w:nlCheck=&quot;on&quot; w:optionSet=&quot;0&quot;/&gt;&lt;w:activeWritingStyle w:lang=&quot;PT-BR&quot; w:vendorID=&quot;64&quot; w:dllVersion=&quot;0&quot; w:nlCheck=&quot;on&quot; w:optionSet=&quot;0&quot;/&gt;&lt;w:stylePaneFormatFilter w:val=&quot;3F01&quot;/&gt;&lt;w:defaultTabStop w:val=&quot;720&quot;/&gt;&lt;w:hyphenationZone w:val=&quot;425&quot;/&gt;&lt;w:characterSpacingControl w:val=&quot;DontCompress&quot;/&gt;&lt;w:optimizeForBrowser/&gt;&lt;w:validateAgainstSchema/&gt;&lt;w:saveInvalidXML w:val=&quot;off&quot;/&gt;&lt;w:ignoreMixedContent w:val=&quot;off&quot;/&gt;&lt;w:alwaysShowPlaceholderText w:val=&quot;off&quot;/&gt;&lt;w:compat&gt;&lt;w:breakWrappedTables/&gt;&lt;w:snapToGridInCell/&gt;&lt;w:applyBreakingRules/&gt;&lt;w:wrapTextWithPunct/&gt;&lt;w:useAsianBreakRules/&gt;&lt;w:useWord2002TableStyleRules/&gt;&lt;w:useFELayout/&gt;&lt;/w:compat&gt;&lt;wsp:rsids&gt;&lt;wsp:rsidRoot wsp:val=&quot;00426FBB&quot;/&gt;&lt;wsp:rsid wsp:val=&quot;000002E1&quot;/&gt;&lt;wsp:rsid wsp:val=&quot;00003C97&quot;/&gt;&lt;wsp:rsid wsp:val=&quot;00004DA6&quot;/&gt;&lt;wsp:rsid wsp:val=&quot;00005565&quot;/&gt;&lt;wsp:rsid wsp:val=&quot;0001754A&quot;/&gt;&lt;wsp:rsid wsp:val=&quot;00017719&quot;/&gt;&lt;wsp:rsid wsp:val=&quot;00027F1D&quot;/&gt;&lt;wsp:rsid wsp:val=&quot;0003296C&quot;/&gt;&lt;wsp:rsid wsp:val=&quot;0003351F&quot;/&gt;&lt;wsp:rsid wsp:val=&quot;00044599&quot;/&gt;&lt;wsp:rsid wsp:val=&quot;000540E6&quot;/&gt;&lt;wsp:rsid wsp:val=&quot;00054421&quot;/&gt;&lt;wsp:rsid wsp:val=&quot;00062E46&quot;/&gt;&lt;wsp:rsid wsp:val=&quot;00074AC8&quot;/&gt;&lt;wsp:rsid wsp:val=&quot;00081408&quot;/&gt;&lt;wsp:rsid wsp:val=&quot;00081EBE&quot;/&gt;&lt;wsp:rsid wsp:val=&quot;00086EDC&quot;/&gt;&lt;wsp:rsid wsp:val=&quot;000B1236&quot;/&gt;&lt;wsp:rsid wsp:val=&quot;000B36A3&quot;/&gt;&lt;wsp:rsid wsp:val=&quot;000C013C&quot;/&gt;&lt;wsp:rsid wsp:val=&quot;000E3F84&quot;/&gt;&lt;wsp:rsid wsp:val=&quot;001056DF&quot;/&gt;&lt;wsp:rsid wsp:val=&quot;0010789C&quot;/&gt;&lt;wsp:rsid wsp:val=&quot;00110768&quot;/&gt;&lt;wsp:rsid wsp:val=&quot;00114025&quot;/&gt;&lt;wsp:rsid wsp:val=&quot;001160D2&quot;/&gt;&lt;wsp:rsid wsp:val=&quot;00120636&quot;/&gt;&lt;wsp:rsid wsp:val=&quot;001348A5&quot;/&gt;&lt;wsp:rsid wsp:val=&quot;00151B8E&quot;/&gt;&lt;wsp:rsid wsp:val=&quot;00182170&quot;/&gt;&lt;wsp:rsid wsp:val=&quot;0019165C&quot;/&gt;&lt;wsp:rsid wsp:val=&quot;001928FB&quot;/&gt;&lt;wsp:rsid wsp:val=&quot;00192BC7&quot;/&gt;&lt;wsp:rsid wsp:val=&quot;00195BE6&quot;/&gt;&lt;wsp:rsid wsp:val=&quot;001A3C37&quot;/&gt;&lt;wsp:rsid wsp:val=&quot;001A50EA&quot;/&gt;&lt;wsp:rsid wsp:val=&quot;001D2878&quot;/&gt;&lt;wsp:rsid wsp:val=&quot;001F16CD&quot;/&gt;&lt;wsp:rsid wsp:val=&quot;001F47D2&quot;/&gt;&lt;wsp:rsid wsp:val=&quot;002029C8&quot;/&gt;&lt;wsp:rsid wsp:val=&quot;0022285A&quot;/&gt;&lt;wsp:rsid wsp:val=&quot;00224C61&quot;/&gt;&lt;wsp:rsid wsp:val=&quot;00256ABC&quot;/&gt;&lt;wsp:rsid wsp:val=&quot;00257067&quot;/&gt;&lt;wsp:rsid wsp:val=&quot;0027227B&quot;/&gt;&lt;wsp:rsid wsp:val=&quot;00273AC7&quot;/&gt;&lt;wsp:rsid wsp:val=&quot;00273D2C&quot;/&gt;&lt;wsp:rsid wsp:val=&quot;00275202&quot;/&gt;&lt;wsp:rsid wsp:val=&quot;00285ECD&quot;/&gt;&lt;wsp:rsid wsp:val=&quot;00290E1B&quot;/&gt;&lt;wsp:rsid wsp:val=&quot;00291B17&quot;/&gt;&lt;wsp:rsid wsp:val=&quot;00291BB3&quot;/&gt;&lt;wsp:rsid wsp:val=&quot;002A6742&quot;/&gt;&lt;wsp:rsid wsp:val=&quot;002C1A7F&quot;/&gt;&lt;wsp:rsid wsp:val=&quot;002C4239&quot;/&gt;&lt;wsp:rsid wsp:val=&quot;002C559D&quot;/&gt;&lt;wsp:rsid wsp:val=&quot;002D16AE&quot;/&gt;&lt;wsp:rsid wsp:val=&quot;002D2D42&quot;/&gt;&lt;wsp:rsid wsp:val=&quot;002F72D0&quot;/&gt;&lt;wsp:rsid wsp:val=&quot;002F7A4F&quot;/&gt;&lt;wsp:rsid wsp:val=&quot;003003AB&quot;/&gt;&lt;wsp:rsid wsp:val=&quot;00302C35&quot;/&gt;&lt;wsp:rsid wsp:val=&quot;00311C49&quot;/&gt;&lt;wsp:rsid wsp:val=&quot;0032119E&quot;/&gt;&lt;wsp:rsid wsp:val=&quot;00321304&quot;/&gt;&lt;wsp:rsid wsp:val=&quot;00324FC2&quot;/&gt;&lt;wsp:rsid wsp:val=&quot;003312CA&quot;/&gt;&lt;wsp:rsid wsp:val=&quot;00331F84&quot;/&gt;&lt;wsp:rsid wsp:val=&quot;003329D6&quot;/&gt;&lt;wsp:rsid wsp:val=&quot;003645A1&quot;/&gt;&lt;wsp:rsid wsp:val=&quot;0037721F&quot;/&gt;&lt;wsp:rsid wsp:val=&quot;003950A4&quot;/&gt;&lt;wsp:rsid wsp:val=&quot;003A1E7E&quot;/&gt;&lt;wsp:rsid wsp:val=&quot;003C7045&quot;/&gt;&lt;wsp:rsid wsp:val=&quot;003E2FDC&quot;/&gt;&lt;wsp:rsid wsp:val=&quot;003E3577&quot;/&gt;&lt;wsp:rsid wsp:val=&quot;003F3A61&quot;/&gt;&lt;wsp:rsid wsp:val=&quot;00404014&quot;/&gt;&lt;wsp:rsid wsp:val=&quot;00410A5D&quot;/&gt;&lt;wsp:rsid wsp:val=&quot;00414909&quot;/&gt;&lt;wsp:rsid wsp:val=&quot;00416537&quot;/&gt;&lt;wsp:rsid wsp:val=&quot;00425A6A&quot;/&gt;&lt;wsp:rsid wsp:val=&quot;00426FBB&quot;/&gt;&lt;wsp:rsid wsp:val=&quot;00454542&quot;/&gt;&lt;wsp:rsid wsp:val=&quot;0047429A&quot;/&gt;&lt;wsp:rsid wsp:val=&quot;00477AA8&quot;/&gt;&lt;wsp:rsid wsp:val=&quot;0048374C&quot;/&gt;&lt;wsp:rsid wsp:val=&quot;0048771D&quot;/&gt;&lt;wsp:rsid wsp:val=&quot;004A3EF0&quot;/&gt;&lt;wsp:rsid wsp:val=&quot;004A6605&quot;/&gt;&lt;wsp:rsid wsp:val=&quot;004B3B15&quot;/&gt;&lt;wsp:rsid wsp:val=&quot;004C45FA&quot;/&gt;&lt;wsp:rsid wsp:val=&quot;004D347F&quot;/&gt;&lt;wsp:rsid wsp:val=&quot;004D35A3&quot;/&gt;&lt;wsp:rsid wsp:val=&quot;004E1BD8&quot;/&gt;&lt;wsp:rsid wsp:val=&quot;004E452A&quot;/&gt;&lt;wsp:rsid wsp:val=&quot;004E78E3&quot;/&gt;&lt;wsp:rsid wsp:val=&quot;004F2BFE&quot;/&gt;&lt;wsp:rsid wsp:val=&quot;004F63D3&quot;/&gt;&lt;wsp:rsid wsp:val=&quot;004F7DCF&quot;/&gt;&lt;wsp:rsid wsp:val=&quot;005004BF&quot;/&gt;&lt;wsp:rsid wsp:val=&quot;00502E89&quot;/&gt;&lt;wsp:rsid wsp:val=&quot;00506CFE&quot;/&gt;&lt;wsp:rsid wsp:val=&quot;00510106&quot;/&gt;&lt;wsp:rsid wsp:val=&quot;00510E95&quot;/&gt;&lt;wsp:rsid wsp:val=&quot;005225C3&quot;/&gt;&lt;wsp:rsid wsp:val=&quot;00527D56&quot;/&gt;&lt;wsp:rsid wsp:val=&quot;0053221F&quot;/&gt;&lt;wsp:rsid wsp:val=&quot;00536FAE&quot;/&gt;&lt;wsp:rsid wsp:val=&quot;00542C85&quot;/&gt;&lt;wsp:rsid wsp:val=&quot;00553510&quot;/&gt;&lt;wsp:rsid wsp:val=&quot;00554186&quot;/&gt;&lt;wsp:rsid wsp:val=&quot;00585769&quot;/&gt;&lt;wsp:rsid wsp:val=&quot;00585C61&quot;/&gt;&lt;wsp:rsid wsp:val=&quot;00591130&quot;/&gt;&lt;wsp:rsid wsp:val=&quot;005A3F28&quot;/&gt;&lt;wsp:rsid wsp:val=&quot;005A40BE&quot;/&gt;&lt;wsp:rsid wsp:val=&quot;005B13E2&quot;/&gt;&lt;wsp:rsid wsp:val=&quot;005B47D7&quot;/&gt;&lt;wsp:rsid wsp:val=&quot;005C5526&quot;/&gt;&lt;wsp:rsid wsp:val=&quot;005C62C6&quot;/&gt;&lt;wsp:rsid wsp:val=&quot;005D7B9E&quot;/&gt;&lt;wsp:rsid wsp:val=&quot;005E112E&quot;/&gt;&lt;wsp:rsid wsp:val=&quot;005F0834&quot;/&gt;&lt;wsp:rsid wsp:val=&quot;005F68AB&quot;/&gt;&lt;wsp:rsid wsp:val=&quot;005F6DC3&quot;/&gt;&lt;wsp:rsid wsp:val=&quot;00601A8E&quot;/&gt;&lt;wsp:rsid wsp:val=&quot;0062033E&quot;/&gt;&lt;wsp:rsid wsp:val=&quot;00624482&quot;/&gt;&lt;wsp:rsid wsp:val=&quot;00630477&quot;/&gt;&lt;wsp:rsid wsp:val=&quot;0064799C&quot;/&gt;&lt;wsp:rsid wsp:val=&quot;00654156&quot;/&gt;&lt;wsp:rsid wsp:val=&quot;00656ADC&quot;/&gt;&lt;wsp:rsid wsp:val=&quot;006B47CA&quot;/&gt;&lt;wsp:rsid wsp:val=&quot;006C304C&quot;/&gt;&lt;wsp:rsid wsp:val=&quot;006C4511&quot;/&gt;&lt;wsp:rsid wsp:val=&quot;006C65F5&quot;/&gt;&lt;wsp:rsid wsp:val=&quot;006C7AAA&quot;/&gt;&lt;wsp:rsid wsp:val=&quot;006D1C2A&quot;/&gt;&lt;wsp:rsid wsp:val=&quot;006D264F&quot;/&gt;&lt;wsp:rsid wsp:val=&quot;006D4E89&quot;/&gt;&lt;wsp:rsid wsp:val=&quot;006E2A8D&quot;/&gt;&lt;wsp:rsid wsp:val=&quot;006E7574&quot;/&gt;&lt;wsp:rsid wsp:val=&quot;00703430&quot;/&gt;&lt;wsp:rsid wsp:val=&quot;00703548&quot;/&gt;&lt;wsp:rsid wsp:val=&quot;00704E18&quot;/&gt;&lt;wsp:rsid wsp:val=&quot;007069BE&quot;/&gt;&lt;wsp:rsid wsp:val=&quot;00745C86&quot;/&gt;&lt;wsp:rsid wsp:val=&quot;00764603&quot;/&gt;&lt;wsp:rsid wsp:val=&quot;007653C5&quot;/&gt;&lt;wsp:rsid wsp:val=&quot;0076604D&quot;/&gt;&lt;wsp:rsid wsp:val=&quot;00790909&quot;/&gt;&lt;wsp:rsid wsp:val=&quot;007929AF&quot;/&gt;&lt;wsp:rsid wsp:val=&quot;00792D4A&quot;/&gt;&lt;wsp:rsid wsp:val=&quot;007B1582&quot;/&gt;&lt;wsp:rsid wsp:val=&quot;007B5A07&quot;/&gt;&lt;wsp:rsid wsp:val=&quot;007C065D&quot;/&gt;&lt;wsp:rsid wsp:val=&quot;007D3E71&quot;/&gt;&lt;wsp:rsid wsp:val=&quot;007E5D6A&quot;/&gt;&lt;wsp:rsid wsp:val=&quot;007E645D&quot;/&gt;&lt;wsp:rsid wsp:val=&quot;007F75CA&quot;/&gt;&lt;wsp:rsid wsp:val=&quot;00821E08&quot;/&gt;&lt;wsp:rsid wsp:val=&quot;00834EFD&quot;/&gt;&lt;wsp:rsid wsp:val=&quot;00843007&quot;/&gt;&lt;wsp:rsid wsp:val=&quot;00844B24&quot;/&gt;&lt;wsp:rsid wsp:val=&quot;0084515F&quot;/&gt;&lt;wsp:rsid wsp:val=&quot;0085092D&quot;/&gt;&lt;wsp:rsid wsp:val=&quot;00865414&quot;/&gt;&lt;wsp:rsid wsp:val=&quot;00877D4C&quot;/&gt;&lt;wsp:rsid wsp:val=&quot;008831DC&quot;/&gt;&lt;wsp:rsid wsp:val=&quot;00883903&quot;/&gt;&lt;wsp:rsid wsp:val=&quot;00891C30&quot;/&gt;&lt;wsp:rsid wsp:val=&quot;00897219&quot;/&gt;&lt;wsp:rsid wsp:val=&quot;0089763B&quot;/&gt;&lt;wsp:rsid wsp:val=&quot;008B6AE3&quot;/&gt;&lt;wsp:rsid wsp:val=&quot;008C1332&quot;/&gt;&lt;wsp:rsid wsp:val=&quot;008D1045&quot;/&gt;&lt;wsp:rsid wsp:val=&quot;008E5996&quot;/&gt;&lt;wsp:rsid wsp:val=&quot;00901AE1&quot;/&gt;&lt;wsp:rsid wsp:val=&quot;00912F93&quot;/&gt;&lt;wsp:rsid wsp:val=&quot;009156AA&quot;/&gt;&lt;wsp:rsid wsp:val=&quot;009205B4&quot;/&gt;&lt;wsp:rsid wsp:val=&quot;00955B59&quot;/&gt;&lt;wsp:rsid wsp:val=&quot;00992262&quot;/&gt;&lt;wsp:rsid wsp:val=&quot;009926BC&quot;/&gt;&lt;wsp:rsid wsp:val=&quot;009A4319&quot;/&gt;&lt;wsp:rsid wsp:val=&quot;009A6C3F&quot;/&gt;&lt;wsp:rsid wsp:val=&quot;009B73F2&quot;/&gt;&lt;wsp:rsid wsp:val=&quot;009C12BD&quot;/&gt;&lt;wsp:rsid wsp:val=&quot;009C50FE&quot;/&gt;&lt;wsp:rsid wsp:val=&quot;009E49DD&quot;/&gt;&lt;wsp:rsid wsp:val=&quot;00A03E75&quot;/&gt;&lt;wsp:rsid wsp:val=&quot;00A20627&quot;/&gt;&lt;wsp:rsid wsp:val=&quot;00A22FE9&quot;/&gt;&lt;wsp:rsid wsp:val=&quot;00A31A44&quot;/&gt;&lt;wsp:rsid wsp:val=&quot;00A32BFA&quot;/&gt;&lt;wsp:rsid wsp:val=&quot;00A3325E&quot;/&gt;&lt;wsp:rsid wsp:val=&quot;00A366E2&quot;/&gt;&lt;wsp:rsid wsp:val=&quot;00A45FCE&quot;/&gt;&lt;wsp:rsid wsp:val=&quot;00A55CFF&quot;/&gt;&lt;wsp:rsid wsp:val=&quot;00A75671&quot;/&gt;&lt;wsp:rsid wsp:val=&quot;00A773CC&quot;/&gt;&lt;wsp:rsid wsp:val=&quot;00A924D0&quot;/&gt;&lt;wsp:rsid wsp:val=&quot;00A9318B&quot;/&gt;&lt;wsp:rsid wsp:val=&quot;00A94AC1&quot;/&gt;&lt;wsp:rsid wsp:val=&quot;00AB18B7&quot;/&gt;&lt;wsp:rsid wsp:val=&quot;00AD335D&quot;/&gt;&lt;wsp:rsid wsp:val=&quot;00AF114C&quot;/&gt;&lt;wsp:rsid wsp:val=&quot;00AF792B&quot;/&gt;&lt;wsp:rsid wsp:val=&quot;00B2440C&quot;/&gt;&lt;wsp:rsid wsp:val=&quot;00B32137&quot;/&gt;&lt;wsp:rsid wsp:val=&quot;00B33D2F&quot;/&gt;&lt;wsp:rsid wsp:val=&quot;00B40A5B&quot;/&gt;&lt;wsp:rsid wsp:val=&quot;00B45C6B&quot;/&gt;&lt;wsp:rsid wsp:val=&quot;00B55D5E&quot;/&gt;&lt;wsp:rsid wsp:val=&quot;00B57A80&quot;/&gt;&lt;wsp:rsid wsp:val=&quot;00B70E9C&quot;/&gt;&lt;wsp:rsid wsp:val=&quot;00B713D8&quot;/&gt;&lt;wsp:rsid wsp:val=&quot;00B72979&quot;/&gt;&lt;wsp:rsid wsp:val=&quot;00B94516&quot;/&gt;&lt;wsp:rsid wsp:val=&quot;00BA25E2&quot;/&gt;&lt;wsp:rsid wsp:val=&quot;00BB2855&quot;/&gt;&lt;wsp:rsid wsp:val=&quot;00BC5343&quot;/&gt;&lt;wsp:rsid wsp:val=&quot;00BD19C1&quot;/&gt;&lt;wsp:rsid wsp:val=&quot;00BD25B8&quot;/&gt;&lt;wsp:rsid wsp:val=&quot;00C012E1&quot;/&gt;&lt;wsp:rsid wsp:val=&quot;00C06BB4&quot;/&gt;&lt;wsp:rsid wsp:val=&quot;00C10D20&quot;/&gt;&lt;wsp:rsid wsp:val=&quot;00C12E0C&quot;/&gt;&lt;wsp:rsid wsp:val=&quot;00C21916&quot;/&gt;&lt;wsp:rsid wsp:val=&quot;00C34915&quot;/&gt;&lt;wsp:rsid wsp:val=&quot;00C457CA&quot;/&gt;&lt;wsp:rsid wsp:val=&quot;00C47EAE&quot;/&gt;&lt;wsp:rsid wsp:val=&quot;00C53FB6&quot;/&gt;&lt;wsp:rsid wsp:val=&quot;00C57FB7&quot;/&gt;&lt;wsp:rsid wsp:val=&quot;00C644D4&quot;/&gt;&lt;wsp:rsid wsp:val=&quot;00C65F3F&quot;/&gt;&lt;wsp:rsid wsp:val=&quot;00C72414&quot;/&gt;&lt;wsp:rsid wsp:val=&quot;00C72B1A&quot;/&gt;&lt;wsp:rsid wsp:val=&quot;00C8667B&quot;/&gt;&lt;wsp:rsid wsp:val=&quot;00C90993&quot;/&gt;&lt;wsp:rsid wsp:val=&quot;00CA4CE3&quot;/&gt;&lt;wsp:rsid wsp:val=&quot;00CA5A12&quot;/&gt;&lt;wsp:rsid wsp:val=&quot;00CB4ADD&quot;/&gt;&lt;wsp:rsid wsp:val=&quot;00CC72FD&quot;/&gt;&lt;wsp:rsid wsp:val=&quot;00CD1D23&quot;/&gt;&lt;wsp:rsid wsp:val=&quot;00CD4F3F&quot;/&gt;&lt;wsp:rsid wsp:val=&quot;00D311F8&quot;/&gt;&lt;wsp:rsid wsp:val=&quot;00D31660&quot;/&gt;&lt;wsp:rsid wsp:val=&quot;00D36B52&quot;/&gt;&lt;wsp:rsid wsp:val=&quot;00D377C8&quot;/&gt;&lt;wsp:rsid wsp:val=&quot;00D41274&quot;/&gt;&lt;wsp:rsid wsp:val=&quot;00D4229C&quot;/&gt;&lt;wsp:rsid wsp:val=&quot;00D43BF3&quot;/&gt;&lt;wsp:rsid wsp:val=&quot;00D549FB&quot;/&gt;&lt;wsp:rsid wsp:val=&quot;00D56487&quot;/&gt;&lt;wsp:rsid wsp:val=&quot;00D767BB&quot;/&gt;&lt;wsp:rsid wsp:val=&quot;00D939B0&quot;/&gt;&lt;wsp:rsid wsp:val=&quot;00DA31A2&quot;/&gt;&lt;wsp:rsid wsp:val=&quot;00DB16E0&quot;/&gt;&lt;wsp:rsid wsp:val=&quot;00DB2DF9&quot;/&gt;&lt;wsp:rsid wsp:val=&quot;00DB465D&quot;/&gt;&lt;wsp:rsid wsp:val=&quot;00DB48A2&quot;/&gt;&lt;wsp:rsid wsp:val=&quot;00DB7E63&quot;/&gt;&lt;wsp:rsid wsp:val=&quot;00DC2055&quot;/&gt;&lt;wsp:rsid wsp:val=&quot;00DC3908&quot;/&gt;&lt;wsp:rsid wsp:val=&quot;00DD71E8&quot;/&gt;&lt;wsp:rsid wsp:val=&quot;00DD7F83&quot;/&gt;&lt;wsp:rsid wsp:val=&quot;00DE4EB8&quot;/&gt;&lt;wsp:rsid wsp:val=&quot;00E0641E&quot;/&gt;&lt;wsp:rsid wsp:val=&quot;00E06664&quot;/&gt;&lt;wsp:rsid wsp:val=&quot;00E169D1&quot;/&gt;&lt;wsp:rsid wsp:val=&quot;00E304BC&quot;/&gt;&lt;wsp:rsid wsp:val=&quot;00E32853&quot;/&gt;&lt;wsp:rsid wsp:val=&quot;00E34EBD&quot;/&gt;&lt;wsp:rsid wsp:val=&quot;00E401F8&quot;/&gt;&lt;wsp:rsid wsp:val=&quot;00E46425&quot;/&gt;&lt;wsp:rsid wsp:val=&quot;00E469FC&quot;/&gt;&lt;wsp:rsid wsp:val=&quot;00E474EB&quot;/&gt;&lt;wsp:rsid wsp:val=&quot;00E47D0E&quot;/&gt;&lt;wsp:rsid wsp:val=&quot;00E65018&quot;/&gt;&lt;wsp:rsid wsp:val=&quot;00E76CA1&quot;/&gt;&lt;wsp:rsid wsp:val=&quot;00E94339&quot;/&gt;&lt;wsp:rsid wsp:val=&quot;00E97563&quot;/&gt;&lt;wsp:rsid wsp:val=&quot;00EB0B63&quot;/&gt;&lt;wsp:rsid wsp:val=&quot;00EC265C&quot;/&gt;&lt;wsp:rsid wsp:val=&quot;00ED61CB&quot;/&gt;&lt;wsp:rsid wsp:val=&quot;00EE752A&quot;/&gt;&lt;wsp:rsid wsp:val=&quot;00F06A72&quot;/&gt;&lt;wsp:rsid wsp:val=&quot;00F12D5B&quot;/&gt;&lt;wsp:rsid wsp:val=&quot;00F136F0&quot;/&gt;&lt;wsp:rsid wsp:val=&quot;00F20BBB&quot;/&gt;&lt;wsp:rsid wsp:val=&quot;00F36048&quot;/&gt;&lt;wsp:rsid wsp:val=&quot;00F43BD8&quot;/&gt;&lt;wsp:rsid wsp:val=&quot;00F562F3&quot;/&gt;&lt;wsp:rsid wsp:val=&quot;00F74B89&quot;/&gt;&lt;wsp:rsid wsp:val=&quot;00F75133&quot;/&gt;&lt;wsp:rsid wsp:val=&quot;00F83272&quot;/&gt;&lt;wsp:rsid wsp:val=&quot;00F9358D&quot;/&gt;&lt;wsp:rsid wsp:val=&quot;00F9369B&quot;/&gt;&lt;wsp:rsid wsp:val=&quot;00FA3899&quot;/&gt;&lt;wsp:rsid wsp:val=&quot;00FA4909&quot;/&gt;&lt;wsp:rsid wsp:val=&quot;00FA5164&quot;/&gt;&lt;wsp:rsid wsp:val=&quot;00FA6751&quot;/&gt;&lt;wsp:rsid wsp:val=&quot;00FA6BD7&quot;/&gt;&lt;wsp:rsid wsp:val=&quot;00FB1048&quot;/&gt;&lt;wsp:rsid wsp:val=&quot;00FB62C4&quot;/&gt;&lt;wsp:rsid wsp:val=&quot;00FB7701&quot;/&gt;&lt;wsp:rsid wsp:val=&quot;00FD1AC5&quot;/&gt;&lt;wsp:rsid wsp:val=&quot;00FD5CF0&quot;/&gt;&lt;/wsp:rsids&gt;&lt;/w:docPr&gt;&lt;w:body&gt;&lt;wx:sect&gt;&lt;w:p wsp:rsidR=&quot;00275202&quot; wsp:rsidRPr=&quot;00275202&quot; wsp:rsidRDefault=&quot;00275202&quot; wsp:rsidP=&quot;00275202&quot;&gt;&lt;m:oMathPara&gt;&lt;m:oMath&gt;&lt;m:r&gt;&lt;w:rPr&gt;&lt;w:rFonts w:ascii=&quot;Cambria Math&quot; w:h-ansi=&quot;Cambria Math&quot;/&gt;&lt;wx:font wx:val=&quot;Cambria Math&quot;/&gt;&lt;w:i/&gt;&lt;/w:rPr&gt;&lt;m:t&gt;4.99V&lt;/m:t&gt;&lt;/m:r&gt;&lt;/m:oMath&gt;&lt;/m:oMathPara&gt;&lt;/w:p&gt;&lt;w:sectPr wsp:rsidR=&quot;00000000&quot; wsp:rsidRPr=&quot;00275202&quot;&gt;&lt;w:pgSz w:w=&quot;12240&quot; w:h=&quot;15840&quot;/&gt;&lt;w:pgMar w:top=&quot;1440&quot; w:right=&quot;1440&quot; w:bottom=&quot;1440&quot; w:left=&quot;1440&quot; w:header=&quot;720&quot; w:footer=&quot;720&quot; w:gutter=&quot;0&quot;/&gt;&lt;w:cols w:space=&quot;720&quot;/&gt;&lt;/w:sectPr&gt;&lt;/wx:sect&gt;&lt;/w:body&gt;&lt;/w:wordDocument&gt;">
+                  <v:imagedata r:id="rId39" o:title="" chromakey="white"/>
+                </v:shape>
+              </w:pict>
+            </w:r>
+          </w:p>
+        </w:tc>
+      </w:tr>
+      <w:tr>
+        <w:trPr>
+          <w:trHeight w:val="1"/>
+          <w:jc w:val="center"/>
+        </w:trPr>
+        <w:tc>
+          <w:tcPr>
+            <w:tcW w:w="2368" w:type="dxa"/>
+            <w:shd w:val="clear" w:color="auto" w:fill="D9D9D9"/>
+            <w:vAlign w:val="center"/>
+          </w:tcPr>
+          <w:p>
+            <w:pPr>
+              <w:rPr>
+                <w:sz w:val="18"/>
+                <w:szCs w:val="18"/>
+              </w:rPr>
+            </w:pPr>
+            <w:r>
+              <w:rPr>
+                <w:sz w:val="18"/>
+                <w:szCs w:val="18"/>
+              </w:rPr>
+              <w:t>Corriente de Salida</w:t>
+            </w:r>
+          </w:p>
+        </w:tc>
+        <w:tc>
+          <w:tcPr>
+            <w:tcW w:w="962" w:type="dxa"/>
+            <w:shd w:val="clear" w:color="auto" w:fill="D9D9D9"/>
+            <w:vAlign w:val="center"/>
+          </w:tcPr>
+          <w:p>
+            <w:pPr>
+              <w:rPr>
+                <w:rFonts w:ascii="Calibri" w:eastAsia="Calibri" w:hAnsi="Calibri" w:cs="Arial"/>
+                <w:sz w:val="18"/>
+                <w:szCs w:val="18"/>
+              </w:rPr>
+            </w:pPr>
+            <w:r>
+              <w:rPr>
+                <w:sz w:val="18"/>
+                <w:szCs w:val="18"/>
+              </w:rPr>
+              <w:pict w14:anchorId="7248AB64">
+                <v:shape id="_x0000_i1297" type="#_x0000_t75" style="width:18.7pt;height:13.85pt" equationxml="&lt;?xml version=&quot;1.0&quot; encoding=&quot;UTF-8&quot; standalone=&quot;yes&quot;?&gt;&#10;&lt;?mso-application progid=&quot;Word.Document&quot;?&gt;&#10;&lt;w:wordDocument xmlns:aml=&quot;http://schemas.microsoft.com/aml/2001/core&quot; xmlns:wpc=&quot;http://schemas.microsoft.com/office/word/2010/wordprocessingCanvas&quot; xmlns:cx=&quot;http://schemas.microsoft.com/office/drawing/2014/chartex&quot; xmlns:cx1=&quot;http://schemas.microsoft.com/office/drawing/2015/9/8/chartex&quot; xmlns:cx2=&quot;http://schemas.microsoft.com/office/drawing/2015/10/21/chartex&quot; xmlns:cx3=&quot;http://schemas.microsoft.com/office/drawing/2016/5/9/chartex&quot; xmlns:cx4=&quot;http://schemas.microsoft.com/office/drawing/2016/5/10/chartex&quot; xmlns:cx5=&quot;http://schemas.microsoft.com/office/drawing/2016/5/11/chartex&quot; xmlns:cx6=&quot;http://schemas.microsoft.com/office/drawing/2016/5/12/chartex&quot; xmlns:cx7=&quot;http://schemas.microsoft.com/office/drawing/2016/5/13/chartex&quot; xmlns:cx8=&quot;http://schemas.microsoft.com/office/drawing/2016/5/14/chartex&quot; xmlns:cr=&quot;http://schemas.microsoft.com/office/comments/2020/reactions&quot; xmlns:dt=&quot;uuid:C2F41010-65B3-11d1-A29F-00AA00C14882&quot; xmlns:mc=&quot;http://schemas.openxmlformats.org/markup-compatibility/2006&quot; xmlns:aink=&quot;http://schemas.microsoft.com/office/drawing/2016/ink&quot; xmlns:am3d=&quot;http://schemas.microsoft.com/office/drawing/2017/model3d&quot; xmlns:o=&quot;urn:schemas-microsoft-com:office:office&quot; xmlns:oel=&quot;http://schemas.microsoft.com/office/2019/extlst&quot; xmlns:m=&quot;http://schemas.openxmlformats.org/officeDocument/2006/math&quot; xmlns:v=&quot;urn:schemas-microsoft-com:vml&quot; xmlns:w10=&quot;urn:schemas-microsoft-com:office:word&quot; xmlns:w=&quot;http://schemas.microsoft.com/office/word/2003/wordml&quot; xmlns:wx=&quot;http://schemas.microsoft.com/office/word/2003/auxHint&quot; xmlns:wne=&quot;http://schemas.microsoft.com/office/word/2006/wordml&quot; xmlns:wsp=&quot;http://schemas.microsoft.com/office/word/2003/wordml/sp2&quot; xmlns:sl=&quot;http://schemas.microsoft.com/schemaLibrary/2003/core&quot; w:macrosPresent=&quot;no&quot; w:embeddedObjPresent=&quot;no&quot; w:ocxPresent=&quot;no&quot; xml:space=&quot;preserve&quot;&gt;&lt;w:ignoreSubtree w:val=&quot;http://schemas.microsoft.com/office/word/2003/wordml/sp2&quot;/&gt;&lt;o:DocumentProperties&gt;&lt;o:Version&gt;16&lt;/o:Version&gt;&lt;/o:DocumentProperties&gt;&lt;w:docPr&gt;&lt;w:view w:val=&quot;print&quot;/&gt;&lt;w:zoom w:percent=&quot;86&quot;/&gt;&lt;w:doNotEmbedSystemFonts/&gt;&lt;w:activeWritingStyle w:lang=&quot;EN-AU&quot; w:vendorID=&quot;64&quot; w:dllVersion=&quot;6&quot; w:nlCheck=&quot;on&quot; w:optionSet=&quot;1&quot;/&gt;&lt;w:activeWritingStyle w:lang=&quot;EN-GB&quot; w:vendorID=&quot;64&quot; w:dllVersion=&quot;6&quot; w:nlCheck=&quot;on&quot; w:optionSet=&quot;1&quot;/&gt;&lt;w:activeWritingStyle w:lang=&quot;EN-US&quot; w:vendorID=&quot;64&quot; w:dllVersion=&quot;6&quot; w:nlCheck=&quot;on&quot; w:optionSet=&quot;1&quot;/&gt;&lt;w:activeWritingStyle w:lang=&quot;EN-AU&quot; w:vendorID=&quot;64&quot; w:dllVersion=&quot;0&quot; w:nlCheck=&quot;on&quot; w:optionSet=&quot;0&quot;/&gt;&lt;w:activeWritingStyle w:lang=&quot;EN-GB&quot; w:vendorID=&quot;64&quot; w:dllVersion=&quot;0&quot; w:nlCheck=&quot;on&quot; w:optionSet=&quot;0&quot;/&gt;&lt;w:activeWritingStyle w:lang=&quot;EN-US&quot; w:vendorID=&quot;64&quot; w:dllVersion=&quot;0&quot; w:nlCheck=&quot;on&quot; w:optionSet=&quot;0&quot;/&gt;&lt;w:activeWritingStyle w:lang=&quot;ES-AR&quot; w:vendorID=&quot;64&quot; w:dllVersion=&quot;0&quot; w:nlCheck=&quot;on&quot; w:optionSet=&quot;0&quot;/&gt;&lt;w:activeWritingStyle w:lang=&quot;580A&quot; w:vendorID=&quot;64&quot; w:dllVersion=&quot;0&quot; w:nlCheck=&quot;on&quot; w:optionSet=&quot;0&quot;/&gt;&lt;w:activeWritingStyle w:lang=&quot;PT-BR&quot; w:vendorID=&quot;64&quot; w:dllVersion=&quot;0&quot; w:nlCheck=&quot;on&quot; w:optionSet=&quot;0&quot;/&gt;&lt;w:stylePaneFormatFilter w:val=&quot;3F01&quot;/&gt;&lt;w:defaultTabStop w:val=&quot;720&quot;/&gt;&lt;w:hyphenationZone w:val=&quot;425&quot;/&gt;&lt;w:characterSpacingControl w:val=&quot;DontCompress&quot;/&gt;&lt;w:optimizeForBrowser/&gt;&lt;w:validateAgainstSchema/&gt;&lt;w:saveInvalidXML w:val=&quot;off&quot;/&gt;&lt;w:ignoreMixedContent w:val=&quot;off&quot;/&gt;&lt;w:alwaysShowPlaceholderText w:val=&quot;off&quot;/&gt;&lt;w:compat&gt;&lt;w:breakWrappedTables/&gt;&lt;w:snapToGridInCell/&gt;&lt;w:applyBreakingRules/&gt;&lt;w:wrapTextWithPunct/&gt;&lt;w:useAsianBreakRules/&gt;&lt;w:useWord2002TableStyleRules/&gt;&lt;w:useFELayout/&gt;&lt;/w:compat&gt;&lt;wsp:rsids&gt;&lt;wsp:rsidRoot wsp:val=&quot;00426FBB&quot;/&gt;&lt;wsp:rsid wsp:val=&quot;000002E1&quot;/&gt;&lt;wsp:rsid wsp:val=&quot;00003C97&quot;/&gt;&lt;wsp:rsid wsp:val=&quot;00004DA6&quot;/&gt;&lt;wsp:rsid wsp:val=&quot;00005565&quot;/&gt;&lt;wsp:rsid wsp:val=&quot;0001754A&quot;/&gt;&lt;wsp:rsid wsp:val=&quot;00017719&quot;/&gt;&lt;wsp:rsid wsp:val=&quot;00027F1D&quot;/&gt;&lt;wsp:rsid wsp:val=&quot;0003296C&quot;/&gt;&lt;wsp:rsid wsp:val=&quot;0003351F&quot;/&gt;&lt;wsp:rsid wsp:val=&quot;00044599&quot;/&gt;&lt;wsp:rsid wsp:val=&quot;000540E6&quot;/&gt;&lt;wsp:rsid wsp:val=&quot;00054421&quot;/&gt;&lt;wsp:rsid wsp:val=&quot;00062E46&quot;/&gt;&lt;wsp:rsid wsp:val=&quot;00074AC8&quot;/&gt;&lt;wsp:rsid wsp:val=&quot;00081408&quot;/&gt;&lt;wsp:rsid wsp:val=&quot;00081EBE&quot;/&gt;&lt;wsp:rsid wsp:val=&quot;00086EDC&quot;/&gt;&lt;wsp:rsid wsp:val=&quot;000B1236&quot;/&gt;&lt;wsp:rsid wsp:val=&quot;000B36A3&quot;/&gt;&lt;wsp:rsid wsp:val=&quot;000C013C&quot;/&gt;&lt;wsp:rsid wsp:val=&quot;000E3F84&quot;/&gt;&lt;wsp:rsid wsp:val=&quot;001056DF&quot;/&gt;&lt;wsp:rsid wsp:val=&quot;0010789C&quot;/&gt;&lt;wsp:rsid wsp:val=&quot;00110768&quot;/&gt;&lt;wsp:rsid wsp:val=&quot;00114025&quot;/&gt;&lt;wsp:rsid wsp:val=&quot;001160D2&quot;/&gt;&lt;wsp:rsid wsp:val=&quot;00120636&quot;/&gt;&lt;wsp:rsid wsp:val=&quot;001348A5&quot;/&gt;&lt;wsp:rsid wsp:val=&quot;00151B8E&quot;/&gt;&lt;wsp:rsid wsp:val=&quot;00182170&quot;/&gt;&lt;wsp:rsid wsp:val=&quot;0019165C&quot;/&gt;&lt;wsp:rsid wsp:val=&quot;001928FB&quot;/&gt;&lt;wsp:rsid wsp:val=&quot;00192BC7&quot;/&gt;&lt;wsp:rsid wsp:val=&quot;00195BE6&quot;/&gt;&lt;wsp:rsid wsp:val=&quot;001A3C37&quot;/&gt;&lt;wsp:rsid wsp:val=&quot;001A50EA&quot;/&gt;&lt;wsp:rsid wsp:val=&quot;001D2878&quot;/&gt;&lt;wsp:rsid wsp:val=&quot;001F16CD&quot;/&gt;&lt;wsp:rsid wsp:val=&quot;001F47D2&quot;/&gt;&lt;wsp:rsid wsp:val=&quot;002029C8&quot;/&gt;&lt;wsp:rsid wsp:val=&quot;0022285A&quot;/&gt;&lt;wsp:rsid wsp:val=&quot;00224C61&quot;/&gt;&lt;wsp:rsid wsp:val=&quot;00256ABC&quot;/&gt;&lt;wsp:rsid wsp:val=&quot;00257067&quot;/&gt;&lt;wsp:rsid wsp:val=&quot;0027227B&quot;/&gt;&lt;wsp:rsid wsp:val=&quot;00273AC7&quot;/&gt;&lt;wsp:rsid wsp:val=&quot;00273D2C&quot;/&gt;&lt;wsp:rsid wsp:val=&quot;00285ECD&quot;/&gt;&lt;wsp:rsid wsp:val=&quot;00290E1B&quot;/&gt;&lt;wsp:rsid wsp:val=&quot;00291B17&quot;/&gt;&lt;wsp:rsid wsp:val=&quot;00291BB3&quot;/&gt;&lt;wsp:rsid wsp:val=&quot;002A6742&quot;/&gt;&lt;wsp:rsid wsp:val=&quot;002C1A7F&quot;/&gt;&lt;wsp:rsid wsp:val=&quot;002C4239&quot;/&gt;&lt;wsp:rsid wsp:val=&quot;002C559D&quot;/&gt;&lt;wsp:rsid wsp:val=&quot;002D16AE&quot;/&gt;&lt;wsp:rsid wsp:val=&quot;002D2D42&quot;/&gt;&lt;wsp:rsid wsp:val=&quot;002F72D0&quot;/&gt;&lt;wsp:rsid wsp:val=&quot;002F7A4F&quot;/&gt;&lt;wsp:rsid wsp:val=&quot;003003AB&quot;/&gt;&lt;wsp:rsid wsp:val=&quot;00302C35&quot;/&gt;&lt;wsp:rsid wsp:val=&quot;00311C49&quot;/&gt;&lt;wsp:rsid wsp:val=&quot;0032119E&quot;/&gt;&lt;wsp:rsid wsp:val=&quot;00321304&quot;/&gt;&lt;wsp:rsid wsp:val=&quot;00324FC2&quot;/&gt;&lt;wsp:rsid wsp:val=&quot;003312CA&quot;/&gt;&lt;wsp:rsid wsp:val=&quot;00331F84&quot;/&gt;&lt;wsp:rsid wsp:val=&quot;003329D6&quot;/&gt;&lt;wsp:rsid wsp:val=&quot;003645A1&quot;/&gt;&lt;wsp:rsid wsp:val=&quot;0037721F&quot;/&gt;&lt;wsp:rsid wsp:val=&quot;003950A4&quot;/&gt;&lt;wsp:rsid wsp:val=&quot;003A1E7E&quot;/&gt;&lt;wsp:rsid wsp:val=&quot;003C7045&quot;/&gt;&lt;wsp:rsid wsp:val=&quot;003E2FDC&quot;/&gt;&lt;wsp:rsid wsp:val=&quot;003E3577&quot;/&gt;&lt;wsp:rsid wsp:val=&quot;003F3A61&quot;/&gt;&lt;wsp:rsid wsp:val=&quot;00404014&quot;/&gt;&lt;wsp:rsid wsp:val=&quot;00410A5D&quot;/&gt;&lt;wsp:rsid wsp:val=&quot;00414909&quot;/&gt;&lt;wsp:rsid wsp:val=&quot;00416537&quot;/&gt;&lt;wsp:rsid wsp:val=&quot;00425A6A&quot;/&gt;&lt;wsp:rsid wsp:val=&quot;00426FBB&quot;/&gt;&lt;wsp:rsid wsp:val=&quot;00454542&quot;/&gt;&lt;wsp:rsid wsp:val=&quot;0047429A&quot;/&gt;&lt;wsp:rsid wsp:val=&quot;00477AA8&quot;/&gt;&lt;wsp:rsid wsp:val=&quot;0048374C&quot;/&gt;&lt;wsp:rsid wsp:val=&quot;0048771D&quot;/&gt;&lt;wsp:rsid wsp:val=&quot;004A3EF0&quot;/&gt;&lt;wsp:rsid wsp:val=&quot;004A6605&quot;/&gt;&lt;wsp:rsid wsp:val=&quot;004B3B15&quot;/&gt;&lt;wsp:rsid wsp:val=&quot;004C45FA&quot;/&gt;&lt;wsp:rsid wsp:val=&quot;004D347F&quot;/&gt;&lt;wsp:rsid wsp:val=&quot;004D35A3&quot;/&gt;&lt;wsp:rsid wsp:val=&quot;004E1BD8&quot;/&gt;&lt;wsp:rsid wsp:val=&quot;004E452A&quot;/&gt;&lt;wsp:rsid wsp:val=&quot;004E78E3&quot;/&gt;&lt;wsp:rsid wsp:val=&quot;004F2BFE&quot;/&gt;&lt;wsp:rsid wsp:val=&quot;004F63D3&quot;/&gt;&lt;wsp:rsid wsp:val=&quot;004F7DCF&quot;/&gt;&lt;wsp:rsid wsp:val=&quot;005004BF&quot;/&gt;&lt;wsp:rsid wsp:val=&quot;00502E89&quot;/&gt;&lt;wsp:rsid wsp:val=&quot;00506CFE&quot;/&gt;&lt;wsp:rsid wsp:val=&quot;00510106&quot;/&gt;&lt;wsp:rsid wsp:val=&quot;00510E95&quot;/&gt;&lt;wsp:rsid wsp:val=&quot;005225C3&quot;/&gt;&lt;wsp:rsid wsp:val=&quot;00527D56&quot;/&gt;&lt;wsp:rsid wsp:val=&quot;0053221F&quot;/&gt;&lt;wsp:rsid wsp:val=&quot;00536FAE&quot;/&gt;&lt;wsp:rsid wsp:val=&quot;00542C85&quot;/&gt;&lt;wsp:rsid wsp:val=&quot;00553510&quot;/&gt;&lt;wsp:rsid wsp:val=&quot;00554186&quot;/&gt;&lt;wsp:rsid wsp:val=&quot;00585769&quot;/&gt;&lt;wsp:rsid wsp:val=&quot;00585C61&quot;/&gt;&lt;wsp:rsid wsp:val=&quot;00591130&quot;/&gt;&lt;wsp:rsid wsp:val=&quot;005A3F28&quot;/&gt;&lt;wsp:rsid wsp:val=&quot;005A40BE&quot;/&gt;&lt;wsp:rsid wsp:val=&quot;005B13E2&quot;/&gt;&lt;wsp:rsid wsp:val=&quot;005B47D7&quot;/&gt;&lt;wsp:rsid wsp:val=&quot;005C5526&quot;/&gt;&lt;wsp:rsid wsp:val=&quot;005C62C6&quot;/&gt;&lt;wsp:rsid wsp:val=&quot;005D7B9E&quot;/&gt;&lt;wsp:rsid wsp:val=&quot;005E112E&quot;/&gt;&lt;wsp:rsid wsp:val=&quot;005F0834&quot;/&gt;&lt;wsp:rsid wsp:val=&quot;005F68AB&quot;/&gt;&lt;wsp:rsid wsp:val=&quot;005F6DC3&quot;/&gt;&lt;wsp:rsid wsp:val=&quot;00601A8E&quot;/&gt;&lt;wsp:rsid wsp:val=&quot;0062033E&quot;/&gt;&lt;wsp:rsid wsp:val=&quot;00624482&quot;/&gt;&lt;wsp:rsid wsp:val=&quot;00630477&quot;/&gt;&lt;wsp:rsid wsp:val=&quot;0064799C&quot;/&gt;&lt;wsp:rsid wsp:val=&quot;00654156&quot;/&gt;&lt;wsp:rsid wsp:val=&quot;00656ADC&quot;/&gt;&lt;wsp:rsid wsp:val=&quot;006B47CA&quot;/&gt;&lt;wsp:rsid wsp:val=&quot;006C304C&quot;/&gt;&lt;wsp:rsid wsp:val=&quot;006C4511&quot;/&gt;&lt;wsp:rsid wsp:val=&quot;006C65F5&quot;/&gt;&lt;wsp:rsid wsp:val=&quot;006C7AAA&quot;/&gt;&lt;wsp:rsid wsp:val=&quot;006D1C2A&quot;/&gt;&lt;wsp:rsid wsp:val=&quot;006D264F&quot;/&gt;&lt;wsp:rsid wsp:val=&quot;006D4E89&quot;/&gt;&lt;wsp:rsid wsp:val=&quot;006E2A8D&quot;/&gt;&lt;wsp:rsid wsp:val=&quot;006E7574&quot;/&gt;&lt;wsp:rsid wsp:val=&quot;00703430&quot;/&gt;&lt;wsp:rsid wsp:val=&quot;00703548&quot;/&gt;&lt;wsp:rsid wsp:val=&quot;00704E18&quot;/&gt;&lt;wsp:rsid wsp:val=&quot;007069BE&quot;/&gt;&lt;wsp:rsid wsp:val=&quot;00745C86&quot;/&gt;&lt;wsp:rsid wsp:val=&quot;00764603&quot;/&gt;&lt;wsp:rsid wsp:val=&quot;007653C5&quot;/&gt;&lt;wsp:rsid wsp:val=&quot;0076604D&quot;/&gt;&lt;wsp:rsid wsp:val=&quot;00790909&quot;/&gt;&lt;wsp:rsid wsp:val=&quot;007929AF&quot;/&gt;&lt;wsp:rsid wsp:val=&quot;00792D4A&quot;/&gt;&lt;wsp:rsid wsp:val=&quot;007B1582&quot;/&gt;&lt;wsp:rsid wsp:val=&quot;007B5A07&quot;/&gt;&lt;wsp:rsid wsp:val=&quot;007C065D&quot;/&gt;&lt;wsp:rsid wsp:val=&quot;007D3E71&quot;/&gt;&lt;wsp:rsid wsp:val=&quot;007E5D6A&quot;/&gt;&lt;wsp:rsid wsp:val=&quot;007E645D&quot;/&gt;&lt;wsp:rsid wsp:val=&quot;007F75CA&quot;/&gt;&lt;wsp:rsid wsp:val=&quot;00821E08&quot;/&gt;&lt;wsp:rsid wsp:val=&quot;00834EFD&quot;/&gt;&lt;wsp:rsid wsp:val=&quot;00843007&quot;/&gt;&lt;wsp:rsid wsp:val=&quot;00844B24&quot;/&gt;&lt;wsp:rsid wsp:val=&quot;0084515F&quot;/&gt;&lt;wsp:rsid wsp:val=&quot;0085092D&quot;/&gt;&lt;wsp:rsid wsp:val=&quot;00865414&quot;/&gt;&lt;wsp:rsid wsp:val=&quot;00877D4C&quot;/&gt;&lt;wsp:rsid wsp:val=&quot;008831DC&quot;/&gt;&lt;wsp:rsid wsp:val=&quot;00883903&quot;/&gt;&lt;wsp:rsid wsp:val=&quot;00891C30&quot;/&gt;&lt;wsp:rsid wsp:val=&quot;00897219&quot;/&gt;&lt;wsp:rsid wsp:val=&quot;0089763B&quot;/&gt;&lt;wsp:rsid wsp:val=&quot;008B6AE3&quot;/&gt;&lt;wsp:rsid wsp:val=&quot;008C1332&quot;/&gt;&lt;wsp:rsid wsp:val=&quot;008D1045&quot;/&gt;&lt;wsp:rsid wsp:val=&quot;008E5996&quot;/&gt;&lt;wsp:rsid wsp:val=&quot;00901AE1&quot;/&gt;&lt;wsp:rsid wsp:val=&quot;00912F93&quot;/&gt;&lt;wsp:rsid wsp:val=&quot;009156AA&quot;/&gt;&lt;wsp:rsid wsp:val=&quot;009205B4&quot;/&gt;&lt;wsp:rsid wsp:val=&quot;00955B59&quot;/&gt;&lt;wsp:rsid wsp:val=&quot;00992262&quot;/&gt;&lt;wsp:rsid wsp:val=&quot;009926BC&quot;/&gt;&lt;wsp:rsid wsp:val=&quot;009A4319&quot;/&gt;&lt;wsp:rsid wsp:val=&quot;009A6C3F&quot;/&gt;&lt;wsp:rsid wsp:val=&quot;009B73F2&quot;/&gt;&lt;wsp:rsid wsp:val=&quot;009C12BD&quot;/&gt;&lt;wsp:rsid wsp:val=&quot;009C50FE&quot;/&gt;&lt;wsp:rsid wsp:val=&quot;009E49DD&quot;/&gt;&lt;wsp:rsid wsp:val=&quot;00A03E75&quot;/&gt;&lt;wsp:rsid wsp:val=&quot;00A20627&quot;/&gt;&lt;wsp:rsid wsp:val=&quot;00A22FE9&quot;/&gt;&lt;wsp:rsid wsp:val=&quot;00A31A44&quot;/&gt;&lt;wsp:rsid wsp:val=&quot;00A32BFA&quot;/&gt;&lt;wsp:rsid wsp:val=&quot;00A3325E&quot;/&gt;&lt;wsp:rsid wsp:val=&quot;00A366E2&quot;/&gt;&lt;wsp:rsid wsp:val=&quot;00A45FCE&quot;/&gt;&lt;wsp:rsid wsp:val=&quot;00A55CFF&quot;/&gt;&lt;wsp:rsid wsp:val=&quot;00A75671&quot;/&gt;&lt;wsp:rsid wsp:val=&quot;00A773CC&quot;/&gt;&lt;wsp:rsid wsp:val=&quot;00A924D0&quot;/&gt;&lt;wsp:rsid wsp:val=&quot;00A9318B&quot;/&gt;&lt;wsp:rsid wsp:val=&quot;00A94AC1&quot;/&gt;&lt;wsp:rsid wsp:val=&quot;00AB18B7&quot;/&gt;&lt;wsp:rsid wsp:val=&quot;00AD335D&quot;/&gt;&lt;wsp:rsid wsp:val=&quot;00AF114C&quot;/&gt;&lt;wsp:rsid wsp:val=&quot;00AF792B&quot;/&gt;&lt;wsp:rsid wsp:val=&quot;00B2440C&quot;/&gt;&lt;wsp:rsid wsp:val=&quot;00B32137&quot;/&gt;&lt;wsp:rsid wsp:val=&quot;00B33D2F&quot;/&gt;&lt;wsp:rsid wsp:val=&quot;00B40A5B&quot;/&gt;&lt;wsp:rsid wsp:val=&quot;00B45C6B&quot;/&gt;&lt;wsp:rsid wsp:val=&quot;00B55D5E&quot;/&gt;&lt;wsp:rsid wsp:val=&quot;00B57A80&quot;/&gt;&lt;wsp:rsid wsp:val=&quot;00B70E9C&quot;/&gt;&lt;wsp:rsid wsp:val=&quot;00B713D8&quot;/&gt;&lt;wsp:rsid wsp:val=&quot;00B72979&quot;/&gt;&lt;wsp:rsid wsp:val=&quot;00B94516&quot;/&gt;&lt;wsp:rsid wsp:val=&quot;00BA25E2&quot;/&gt;&lt;wsp:rsid wsp:val=&quot;00BB2855&quot;/&gt;&lt;wsp:rsid wsp:val=&quot;00BC5343&quot;/&gt;&lt;wsp:rsid wsp:val=&quot;00BD19C1&quot;/&gt;&lt;wsp:rsid wsp:val=&quot;00BD25B8&quot;/&gt;&lt;wsp:rsid wsp:val=&quot;00C012E1&quot;/&gt;&lt;wsp:rsid wsp:val=&quot;00C06BB4&quot;/&gt;&lt;wsp:rsid wsp:val=&quot;00C10D20&quot;/&gt;&lt;wsp:rsid wsp:val=&quot;00C12E0C&quot;/&gt;&lt;wsp:rsid wsp:val=&quot;00C21916&quot;/&gt;&lt;wsp:rsid wsp:val=&quot;00C34915&quot;/&gt;&lt;wsp:rsid wsp:val=&quot;00C457CA&quot;/&gt;&lt;wsp:rsid wsp:val=&quot;00C47EAE&quot;/&gt;&lt;wsp:rsid wsp:val=&quot;00C53FB6&quot;/&gt;&lt;wsp:rsid wsp:val=&quot;00C57FB7&quot;/&gt;&lt;wsp:rsid wsp:val=&quot;00C644D4&quot;/&gt;&lt;wsp:rsid wsp:val=&quot;00C65F3F&quot;/&gt;&lt;wsp:rsid wsp:val=&quot;00C72414&quot;/&gt;&lt;wsp:rsid wsp:val=&quot;00C72B1A&quot;/&gt;&lt;wsp:rsid wsp:val=&quot;00C8667B&quot;/&gt;&lt;wsp:rsid wsp:val=&quot;00C90993&quot;/&gt;&lt;wsp:rsid wsp:val=&quot;00CA4CE3&quot;/&gt;&lt;wsp:rsid wsp:val=&quot;00CA5A12&quot;/&gt;&lt;wsp:rsid wsp:val=&quot;00CB4ADD&quot;/&gt;&lt;wsp:rsid wsp:val=&quot;00CC72FD&quot;/&gt;&lt;wsp:rsid wsp:val=&quot;00CD1D23&quot;/&gt;&lt;wsp:rsid wsp:val=&quot;00CD4F3F&quot;/&gt;&lt;wsp:rsid wsp:val=&quot;00D311F8&quot;/&gt;&lt;wsp:rsid wsp:val=&quot;00D31660&quot;/&gt;&lt;wsp:rsid wsp:val=&quot;00D36B52&quot;/&gt;&lt;wsp:rsid wsp:val=&quot;00D377C8&quot;/&gt;&lt;wsp:rsid wsp:val=&quot;00D41274&quot;/&gt;&lt;wsp:rsid wsp:val=&quot;00D4229C&quot;/&gt;&lt;wsp:rsid wsp:val=&quot;00D43BF3&quot;/&gt;&lt;wsp:rsid wsp:val=&quot;00D549FB&quot;/&gt;&lt;wsp:rsid wsp:val=&quot;00D56487&quot;/&gt;&lt;wsp:rsid wsp:val=&quot;00D767BB&quot;/&gt;&lt;wsp:rsid wsp:val=&quot;00D939B0&quot;/&gt;&lt;wsp:rsid wsp:val=&quot;00DA31A2&quot;/&gt;&lt;wsp:rsid wsp:val=&quot;00DB16E0&quot;/&gt;&lt;wsp:rsid wsp:val=&quot;00DB2DF9&quot;/&gt;&lt;wsp:rsid wsp:val=&quot;00DB465D&quot;/&gt;&lt;wsp:rsid wsp:val=&quot;00DB48A2&quot;/&gt;&lt;wsp:rsid wsp:val=&quot;00DB7E63&quot;/&gt;&lt;wsp:rsid wsp:val=&quot;00DC2055&quot;/&gt;&lt;wsp:rsid wsp:val=&quot;00DC3908&quot;/&gt;&lt;wsp:rsid wsp:val=&quot;00DD71E8&quot;/&gt;&lt;wsp:rsid wsp:val=&quot;00DD7F83&quot;/&gt;&lt;wsp:rsid wsp:val=&quot;00DE4EB8&quot;/&gt;&lt;wsp:rsid wsp:val=&quot;00E0641E&quot;/&gt;&lt;wsp:rsid wsp:val=&quot;00E06664&quot;/&gt;&lt;wsp:rsid wsp:val=&quot;00E169D1&quot;/&gt;&lt;wsp:rsid wsp:val=&quot;00E304BC&quot;/&gt;&lt;wsp:rsid wsp:val=&quot;00E32853&quot;/&gt;&lt;wsp:rsid wsp:val=&quot;00E34EBD&quot;/&gt;&lt;wsp:rsid wsp:val=&quot;00E401F8&quot;/&gt;&lt;wsp:rsid wsp:val=&quot;00E46425&quot;/&gt;&lt;wsp:rsid wsp:val=&quot;00E469FC&quot;/&gt;&lt;wsp:rsid wsp:val=&quot;00E474EB&quot;/&gt;&lt;wsp:rsid wsp:val=&quot;00E47D0E&quot;/&gt;&lt;wsp:rsid wsp:val=&quot;00E65018&quot;/&gt;&lt;wsp:rsid wsp:val=&quot;00E76CA1&quot;/&gt;&lt;wsp:rsid wsp:val=&quot;00E94339&quot;/&gt;&lt;wsp:rsid wsp:val=&quot;00E97563&quot;/&gt;&lt;wsp:rsid wsp:val=&quot;00EB0B63&quot;/&gt;&lt;wsp:rsid wsp:val=&quot;00EC265C&quot;/&gt;&lt;wsp:rsid wsp:val=&quot;00ED61CB&quot;/&gt;&lt;wsp:rsid wsp:val=&quot;00EE752A&quot;/&gt;&lt;wsp:rsid wsp:val=&quot;00F06A72&quot;/&gt;&lt;wsp:rsid wsp:val=&quot;00F12D5B&quot;/&gt;&lt;wsp:rsid wsp:val=&quot;00F136F0&quot;/&gt;&lt;wsp:rsid wsp:val=&quot;00F20BBB&quot;/&gt;&lt;wsp:rsid wsp:val=&quot;00F36048&quot;/&gt;&lt;wsp:rsid wsp:val=&quot;00F43BD8&quot;/&gt;&lt;wsp:rsid wsp:val=&quot;00F562F3&quot;/&gt;&lt;wsp:rsid wsp:val=&quot;00F74B89&quot;/&gt;&lt;wsp:rsid wsp:val=&quot;00F75133&quot;/&gt;&lt;wsp:rsid wsp:val=&quot;00F83272&quot;/&gt;&lt;wsp:rsid wsp:val=&quot;00F9358D&quot;/&gt;&lt;wsp:rsid wsp:val=&quot;00F9369B&quot;/&gt;&lt;wsp:rsid wsp:val=&quot;00FA3899&quot;/&gt;&lt;wsp:rsid wsp:val=&quot;00FA4909&quot;/&gt;&lt;wsp:rsid wsp:val=&quot;00FA5164&quot;/&gt;&lt;wsp:rsid wsp:val=&quot;00FA6751&quot;/&gt;&lt;wsp:rsid wsp:val=&quot;00FA6BD7&quot;/&gt;&lt;wsp:rsid wsp:val=&quot;00FB1048&quot;/&gt;&lt;wsp:rsid wsp:val=&quot;00FB62C4&quot;/&gt;&lt;wsp:rsid wsp:val=&quot;00FB7701&quot;/&gt;&lt;wsp:rsid wsp:val=&quot;00FD1AC5&quot;/&gt;&lt;wsp:rsid wsp:val=&quot;00FD5CF0&quot;/&gt;&lt;wsp:rsid wsp:val=&quot;00FF65C6&quot;/&gt;&lt;/wsp:rsids&gt;&lt;/w:docPr&gt;&lt;w:body&gt;&lt;wx:sect&gt;&lt;w:p wsp:rsidR=&quot;00FF65C6&quot; wsp:rsidRPr=&quot;00FF65C6&quot; wsp:rsidRDefault=&quot;00FF65C6&quot; wsp:rsidP=&quot;00FF65C6&quot;&gt;&lt;m:oMathPara&gt;&lt;m:oMath&gt;&lt;m:sSub&gt;&lt;m:sSubPr&gt;&lt;m:ctrlPr&gt;&lt;w:rPr&gt;&lt;w:rFonts w:ascii=&quot;Cambria Math&quot; w:fareast=&quot;Calibri&quot; w:h-ansi=&quot;Cambria Math&quot; w:cs=&quot;Arial&quot;/&gt;&lt;wx:font wx:val=&quot;Cambria Math&quot;/&gt;&lt;w:i/&gt;&lt;/w:rPr&gt;&lt;/m:ctrlPr&gt;&lt;/m:sSubPr&gt;&lt;m:e&gt;&lt;m:r&gt;&lt;w:rPr&gt;&lt;w:rFonts w:ascii=&quot;Cambria Math&quot; w:fareast=&quot;Calibri&quot; w:h-ansi=&quot;Cambria Math&quot; w:cs=&quot;Arial&quot;/&gt;&lt;wx:font wx:val=&quot;Cambria Math&quot;/&gt;&lt;w:i/&gt;&lt;/w:rPr&gt;&lt;m:t&gt;I&lt;/m:t&gt;&lt;/m:r&gt;&lt;/m:e&gt;&lt;m:sub&gt;&lt;m:r&gt;&lt;w:rPr&gt;&lt;w:rFonts w:ascii=&quot;Cambria Math&quot; w:fareast=&quot;Calibri&quot; w:h-ansi=&quot;Cambria Math&quot; w:cs=&quot;Arial&quot;/&gt;&lt;wx:font wx:val=&quot;Cambria Math&quot;/&gt;&lt;w:i/&gt;&lt;/w:rPr&gt;&lt;m:t&gt;out&lt;/m:t&gt;&lt;/m:r&gt;&lt;/m:sub&gt;&lt;/m:sSub&gt;&lt;/m:oMath&gt;&lt;/m:oMathPara&gt;&lt;/w:p&gt;&lt;w:sectPr wsp:rsidR=&quot;00000000&quot; wsp:rsidRPr=&quot;00FF65C6&quot;&gt;&lt;w:pgSz w:w=&quot;12240&quot; w:h=&quot;15840&quot;/&gt;&lt;w:pgMar w:top=&quot;1440&quot; w:right=&quot;1440&quot; w:bottom=&quot;1440&quot; w:left=&quot;1440&quot; w:header=&quot;720&quot; w:footer=&quot;720&quot; w:gutter=&quot;0&quot;/&gt;&lt;w:cols w:space=&quot;720&quot;/&gt;&lt;/w:sectPr&gt;&lt;/wx:sect&gt;&lt;/w:body&gt;&lt;/w:wordDocument&gt;">
+                  <v:imagedata r:id="rId19" o:title="" chromakey="white"/>
+                </v:shape>
+              </w:pict>
+            </w:r>
+          </w:p>
+        </w:tc>
+        <w:tc>
+          <w:tcPr>
+            <w:tcW w:w="1378" w:type="dxa"/>
+            <w:shd w:val="clear" w:color="auto" w:fill="D9D9D9"/>
+            <w:vAlign w:val="center"/>
+          </w:tcPr>
+          <w:p>
+            <w:pPr>
+              <w:rPr>
+                <w:sz w:val="18"/>
+                <w:szCs w:val="18"/>
+              </w:rPr>
+            </w:pPr>
+            <w:r>
+              <w:rPr>
+                <w:sz w:val="18"/>
+                <w:szCs w:val="18"/>
+              </w:rPr>
+              <w:pict w14:anchorId="634A4D28">
+                <v:shape id="_x0000_i1298" type="#_x0000_t75" style="width:39.45pt;height:13.85pt" equationxml="&lt;?xml version=&quot;1.0&quot; encoding=&quot;UTF-8&quot; standalone=&quot;yes&quot;?&gt;&#10;&lt;?mso-application progid=&quot;Word.Document&quot;?&gt;&#10;&lt;w:wordDocument xmlns:aml=&quot;http://schemas.microsoft.com/aml/2001/core&quot; xmlns:wpc=&quot;http://schemas.microsoft.com/office/word/2010/wordprocessingCanvas&quot; xmlns:cx=&quot;http://schemas.microsoft.com/office/drawing/2014/chartex&quot; xmlns:cx1=&quot;http://schemas.microsoft.com/office/drawing/2015/9/8/chartex&quot; xmlns:cx2=&quot;http://schemas.microsoft.com/office/drawing/2015/10/21/chartex&quot; xmlns:cx3=&quot;http://schemas.microsoft.com/office/drawing/2016/5/9/chartex&quot; xmlns:cx4=&quot;http://schemas.microsoft.com/office/drawing/2016/5/10/chartex&quot; xmlns:cx5=&quot;http://schemas.microsoft.com/office/drawing/2016/5/11/chartex&quot; xmlns:cx6=&quot;http://schemas.microsoft.com/office/drawing/2016/5/12/chartex&quot; xmlns:cx7=&quot;http://schemas.microsoft.com/office/drawing/2016/5/13/chartex&quot; xmlns:cx8=&quot;http://schemas.microsoft.com/office/drawing/2016/5/14/chartex&quot; xmlns:cr=&quot;http://schemas.microsoft.com/office/comments/2020/reactions&quot; xmlns:dt=&quot;uuid:C2F41010-65B3-11d1-A29F-00AA00C14882&quot; xmlns:mc=&quot;http://schemas.openxmlformats.org/markup-compatibility/2006&quot; xmlns:aink=&quot;http://schemas.microsoft.com/office/drawing/2016/ink&quot; xmlns:am3d=&quot;http://schemas.microsoft.com/office/drawing/2017/model3d&quot; xmlns:o=&quot;urn:schemas-microsoft-com:office:office&quot; xmlns:oel=&quot;http://schemas.microsoft.com/office/2019/extlst&quot; xmlns:m=&quot;http://schemas.openxmlformats.org/officeDocument/2006/math&quot; xmlns:v=&quot;urn:schemas-microsoft-com:vml&quot; xmlns:w10=&quot;urn:schemas-microsoft-com:office:word&quot; xmlns:w=&quot;http://schemas.microsoft.com/office/word/2003/wordml&quot; xmlns:wx=&quot;http://schemas.microsoft.com/office/word/2003/auxHint&quot; xmlns:wne=&quot;http://schemas.microsoft.com/office/word/2006/wordml&quot; xmlns:wsp=&quot;http://schemas.microsoft.com/office/word/2003/wordml/sp2&quot; xmlns:sl=&quot;http://schemas.microsoft.com/schemaLibrary/2003/core&quot; w:macrosPresent=&quot;no&quot; w:embeddedObjPresent=&quot;no&quot; w:ocxPresent=&quot;no&quot; xml:space=&quot;preserve&quot;&gt;&lt;w:ignoreSubtree w:val=&quot;http://schemas.microsoft.com/office/word/2003/wordml/sp2&quot;/&gt;&lt;o:DocumentProperties&gt;&lt;o:Version&gt;16&lt;/o:Version&gt;&lt;/o:DocumentProperties&gt;&lt;w:docPr&gt;&lt;w:view w:val=&quot;print&quot;/&gt;&lt;w:zoom w:percent=&quot;86&quot;/&gt;&lt;w:doNotEmbedSystemFonts/&gt;&lt;w:activeWritingStyle w:lang=&quot;EN-AU&quot; w:vendorID=&quot;64&quot; w:dllVersion=&quot;6&quot; w:nlCheck=&quot;on&quot; w:optionSet=&quot;1&quot;/&gt;&lt;w:activeWritingStyle w:lang=&quot;EN-GB&quot; w:vendorID=&quot;64&quot; w:dllVersion=&quot;6&quot; w:nlCheck=&quot;on&quot; w:optionSet=&quot;1&quot;/&gt;&lt;w:activeWritingStyle w:lang=&quot;EN-US&quot; w:vendorID=&quot;64&quot; w:dllVersion=&quot;6&quot; w:nlCheck=&quot;on&quot; w:optionSet=&quot;1&quot;/&gt;&lt;w:activeWritingStyle w:lang=&quot;EN-AU&quot; w:vendorID=&quot;64&quot; w:dllVersion=&quot;0&quot; w:nlCheck=&quot;on&quot; w:optionSet=&quot;0&quot;/&gt;&lt;w:activeWritingStyle w:lang=&quot;EN-GB&quot; w:vendorID=&quot;64&quot; w:dllVersion=&quot;0&quot; w:nlCheck=&quot;on&quot; w:optionSet=&quot;0&quot;/&gt;&lt;w:activeWritingStyle w:lang=&quot;EN-US&quot; w:vendorID=&quot;64&quot; w:dllVersion=&quot;0&quot; w:nlCheck=&quot;on&quot; w:optionSet=&quot;0&quot;/&gt;&lt;w:activeWritingStyle w:lang=&quot;ES-AR&quot; w:vendorID=&quot;64&quot; w:dllVersion=&quot;0&quot; w:nlCheck=&quot;on&quot; w:optionSet=&quot;0&quot;/&gt;&lt;w:activeWritingStyle w:lang=&quot;580A&quot; w:vendorID=&quot;64&quot; w:dllVersion=&quot;0&quot; w:nlCheck=&quot;on&quot; w:optionSet=&quot;0&quot;/&gt;&lt;w:activeWritingStyle w:lang=&quot;PT-BR&quot; w:vendorID=&quot;64&quot; w:dllVersion=&quot;0&quot; w:nlCheck=&quot;on&quot; w:optionSet=&quot;0&quot;/&gt;&lt;w:stylePaneFormatFilter w:val=&quot;3F01&quot;/&gt;&lt;w:defaultTabStop w:val=&quot;720&quot;/&gt;&lt;w:hyphenationZone w:val=&quot;425&quot;/&gt;&lt;w:characterSpacingControl w:val=&quot;DontCompress&quot;/&gt;&lt;w:optimizeForBrowser/&gt;&lt;w:validateAgainstSchema/&gt;&lt;w:saveInvalidXML w:val=&quot;off&quot;/&gt;&lt;w:ignoreMixedContent w:val=&quot;off&quot;/&gt;&lt;w:alwaysShowPlaceholderText w:val=&quot;off&quot;/&gt;&lt;w:compat&gt;&lt;w:breakWrappedTables/&gt;&lt;w:snapToGridInCell/&gt;&lt;w:applyBreakingRules/&gt;&lt;w:wrapTextWithPunct/&gt;&lt;w:useAsianBreakRules/&gt;&lt;w:useWord2002TableStyleRules/&gt;&lt;w:useFELayout/&gt;&lt;/w:compat&gt;&lt;wsp:rsids&gt;&lt;wsp:rsidRoot wsp:val=&quot;00426FBB&quot;/&gt;&lt;wsp:rsid wsp:val=&quot;000002E1&quot;/&gt;&lt;wsp:rsid wsp:val=&quot;00003C97&quot;/&gt;&lt;wsp:rsid wsp:val=&quot;00004DA6&quot;/&gt;&lt;wsp:rsid wsp:val=&quot;00005565&quot;/&gt;&lt;wsp:rsid wsp:val=&quot;0001754A&quot;/&gt;&lt;wsp:rsid wsp:val=&quot;00017719&quot;/&gt;&lt;wsp:rsid wsp:val=&quot;00027F1D&quot;/&gt;&lt;wsp:rsid wsp:val=&quot;0003296C&quot;/&gt;&lt;wsp:rsid wsp:val=&quot;0003351F&quot;/&gt;&lt;wsp:rsid wsp:val=&quot;00044599&quot;/&gt;&lt;wsp:rsid wsp:val=&quot;000540E6&quot;/&gt;&lt;wsp:rsid wsp:val=&quot;00054421&quot;/&gt;&lt;wsp:rsid wsp:val=&quot;00062E46&quot;/&gt;&lt;wsp:rsid wsp:val=&quot;00074AC8&quot;/&gt;&lt;wsp:rsid wsp:val=&quot;00081408&quot;/&gt;&lt;wsp:rsid wsp:val=&quot;00081EBE&quot;/&gt;&lt;wsp:rsid wsp:val=&quot;00086EDC&quot;/&gt;&lt;wsp:rsid wsp:val=&quot;000B1236&quot;/&gt;&lt;wsp:rsid wsp:val=&quot;000B36A3&quot;/&gt;&lt;wsp:rsid wsp:val=&quot;000C013C&quot;/&gt;&lt;wsp:rsid wsp:val=&quot;000E3F84&quot;/&gt;&lt;wsp:rsid wsp:val=&quot;001056DF&quot;/&gt;&lt;wsp:rsid wsp:val=&quot;0010789C&quot;/&gt;&lt;wsp:rsid wsp:val=&quot;00110768&quot;/&gt;&lt;wsp:rsid wsp:val=&quot;00114025&quot;/&gt;&lt;wsp:rsid wsp:val=&quot;001160D2&quot;/&gt;&lt;wsp:rsid wsp:val=&quot;00120636&quot;/&gt;&lt;wsp:rsid wsp:val=&quot;001348A5&quot;/&gt;&lt;wsp:rsid wsp:val=&quot;00151B8E&quot;/&gt;&lt;wsp:rsid wsp:val=&quot;00182170&quot;/&gt;&lt;wsp:rsid wsp:val=&quot;0019165C&quot;/&gt;&lt;wsp:rsid wsp:val=&quot;001928FB&quot;/&gt;&lt;wsp:rsid wsp:val=&quot;00192BC7&quot;/&gt;&lt;wsp:rsid wsp:val=&quot;00195BE6&quot;/&gt;&lt;wsp:rsid wsp:val=&quot;001A3C37&quot;/&gt;&lt;wsp:rsid wsp:val=&quot;001A50EA&quot;/&gt;&lt;wsp:rsid wsp:val=&quot;001D2878&quot;/&gt;&lt;wsp:rsid wsp:val=&quot;001F16CD&quot;/&gt;&lt;wsp:rsid wsp:val=&quot;001F47D2&quot;/&gt;&lt;wsp:rsid wsp:val=&quot;002029C8&quot;/&gt;&lt;wsp:rsid wsp:val=&quot;00207E6E&quot;/&gt;&lt;wsp:rsid wsp:val=&quot;0022285A&quot;/&gt;&lt;wsp:rsid wsp:val=&quot;00224C61&quot;/&gt;&lt;wsp:rsid wsp:val=&quot;00256ABC&quot;/&gt;&lt;wsp:rsid wsp:val=&quot;00257067&quot;/&gt;&lt;wsp:rsid wsp:val=&quot;0027227B&quot;/&gt;&lt;wsp:rsid wsp:val=&quot;00273AC7&quot;/&gt;&lt;wsp:rsid wsp:val=&quot;00273D2C&quot;/&gt;&lt;wsp:rsid wsp:val=&quot;00285ECD&quot;/&gt;&lt;wsp:rsid wsp:val=&quot;00290E1B&quot;/&gt;&lt;wsp:rsid wsp:val=&quot;00291B17&quot;/&gt;&lt;wsp:rsid wsp:val=&quot;00291BB3&quot;/&gt;&lt;wsp:rsid wsp:val=&quot;002A6742&quot;/&gt;&lt;wsp:rsid wsp:val=&quot;002C1A7F&quot;/&gt;&lt;wsp:rsid wsp:val=&quot;002C4239&quot;/&gt;&lt;wsp:rsid wsp:val=&quot;002C559D&quot;/&gt;&lt;wsp:rsid wsp:val=&quot;002D16AE&quot;/&gt;&lt;wsp:rsid wsp:val=&quot;002D2D42&quot;/&gt;&lt;wsp:rsid wsp:val=&quot;002F72D0&quot;/&gt;&lt;wsp:rsid wsp:val=&quot;002F7A4F&quot;/&gt;&lt;wsp:rsid wsp:val=&quot;003003AB&quot;/&gt;&lt;wsp:rsid wsp:val=&quot;00302C35&quot;/&gt;&lt;wsp:rsid wsp:val=&quot;00311C49&quot;/&gt;&lt;wsp:rsid wsp:val=&quot;0032119E&quot;/&gt;&lt;wsp:rsid wsp:val=&quot;00321304&quot;/&gt;&lt;wsp:rsid wsp:val=&quot;00324FC2&quot;/&gt;&lt;wsp:rsid wsp:val=&quot;003312CA&quot;/&gt;&lt;wsp:rsid wsp:val=&quot;00331F84&quot;/&gt;&lt;wsp:rsid wsp:val=&quot;003329D6&quot;/&gt;&lt;wsp:rsid wsp:val=&quot;003645A1&quot;/&gt;&lt;wsp:rsid wsp:val=&quot;0037721F&quot;/&gt;&lt;wsp:rsid wsp:val=&quot;003950A4&quot;/&gt;&lt;wsp:rsid wsp:val=&quot;003A1E7E&quot;/&gt;&lt;wsp:rsid wsp:val=&quot;003C7045&quot;/&gt;&lt;wsp:rsid wsp:val=&quot;003E2FDC&quot;/&gt;&lt;wsp:rsid wsp:val=&quot;003E3577&quot;/&gt;&lt;wsp:rsid wsp:val=&quot;003F3A61&quot;/&gt;&lt;wsp:rsid wsp:val=&quot;00404014&quot;/&gt;&lt;wsp:rsid wsp:val=&quot;00410A5D&quot;/&gt;&lt;wsp:rsid wsp:val=&quot;00414909&quot;/&gt;&lt;wsp:rsid wsp:val=&quot;00416537&quot;/&gt;&lt;wsp:rsid wsp:val=&quot;00425A6A&quot;/&gt;&lt;wsp:rsid wsp:val=&quot;00426FBB&quot;/&gt;&lt;wsp:rsid wsp:val=&quot;00454542&quot;/&gt;&lt;wsp:rsid wsp:val=&quot;0047429A&quot;/&gt;&lt;wsp:rsid wsp:val=&quot;00477AA8&quot;/&gt;&lt;wsp:rsid wsp:val=&quot;0048374C&quot;/&gt;&lt;wsp:rsid wsp:val=&quot;0048771D&quot;/&gt;&lt;wsp:rsid wsp:val=&quot;004A3EF0&quot;/&gt;&lt;wsp:rsid wsp:val=&quot;004A6605&quot;/&gt;&lt;wsp:rsid wsp:val=&quot;004B3B15&quot;/&gt;&lt;wsp:rsid wsp:val=&quot;004C45FA&quot;/&gt;&lt;wsp:rsid wsp:val=&quot;004D347F&quot;/&gt;&lt;wsp:rsid wsp:val=&quot;004D35A3&quot;/&gt;&lt;wsp:rsid wsp:val=&quot;004E1BD8&quot;/&gt;&lt;wsp:rsid wsp:val=&quot;004E452A&quot;/&gt;&lt;wsp:rsid wsp:val=&quot;004E78E3&quot;/&gt;&lt;wsp:rsid wsp:val=&quot;004F2BFE&quot;/&gt;&lt;wsp:rsid wsp:val=&quot;004F63D3&quot;/&gt;&lt;wsp:rsid wsp:val=&quot;004F7DCF&quot;/&gt;&lt;wsp:rsid wsp:val=&quot;005004BF&quot;/&gt;&lt;wsp:rsid wsp:val=&quot;00502E89&quot;/&gt;&lt;wsp:rsid wsp:val=&quot;00506CFE&quot;/&gt;&lt;wsp:rsid wsp:val=&quot;00510106&quot;/&gt;&lt;wsp:rsid wsp:val=&quot;00510E95&quot;/&gt;&lt;wsp:rsid wsp:val=&quot;005225C3&quot;/&gt;&lt;wsp:rsid wsp:val=&quot;00527D56&quot;/&gt;&lt;wsp:rsid wsp:val=&quot;0053221F&quot;/&gt;&lt;wsp:rsid wsp:val=&quot;00536FAE&quot;/&gt;&lt;wsp:rsid wsp:val=&quot;00542C85&quot;/&gt;&lt;wsp:rsid wsp:val=&quot;00553510&quot;/&gt;&lt;wsp:rsid wsp:val=&quot;00554186&quot;/&gt;&lt;wsp:rsid wsp:val=&quot;00585769&quot;/&gt;&lt;wsp:rsid wsp:val=&quot;00585C61&quot;/&gt;&lt;wsp:rsid wsp:val=&quot;00591130&quot;/&gt;&lt;wsp:rsid wsp:val=&quot;005A3F28&quot;/&gt;&lt;wsp:rsid wsp:val=&quot;005A40BE&quot;/&gt;&lt;wsp:rsid wsp:val=&quot;005B13E2&quot;/&gt;&lt;wsp:rsid wsp:val=&quot;005B47D7&quot;/&gt;&lt;wsp:rsid wsp:val=&quot;005C5526&quot;/&gt;&lt;wsp:rsid wsp:val=&quot;005C62C6&quot;/&gt;&lt;wsp:rsid wsp:val=&quot;005D7B9E&quot;/&gt;&lt;wsp:rsid wsp:val=&quot;005E112E&quot;/&gt;&lt;wsp:rsid wsp:val=&quot;005F0834&quot;/&gt;&lt;wsp:rsid wsp:val=&quot;005F68AB&quot;/&gt;&lt;wsp:rsid wsp:val=&quot;005F6DC3&quot;/&gt;&lt;wsp:rsid wsp:val=&quot;00601A8E&quot;/&gt;&lt;wsp:rsid wsp:val=&quot;0062033E&quot;/&gt;&lt;wsp:rsid wsp:val=&quot;00624482&quot;/&gt;&lt;wsp:rsid wsp:val=&quot;00630477&quot;/&gt;&lt;wsp:rsid wsp:val=&quot;0064799C&quot;/&gt;&lt;wsp:rsid wsp:val=&quot;00654156&quot;/&gt;&lt;wsp:rsid wsp:val=&quot;00656ADC&quot;/&gt;&lt;wsp:rsid wsp:val=&quot;006B47CA&quot;/&gt;&lt;wsp:rsid wsp:val=&quot;006C304C&quot;/&gt;&lt;wsp:rsid wsp:val=&quot;006C4511&quot;/&gt;&lt;wsp:rsid wsp:val=&quot;006C65F5&quot;/&gt;&lt;wsp:rsid wsp:val=&quot;006C7AAA&quot;/&gt;&lt;wsp:rsid wsp:val=&quot;006D1C2A&quot;/&gt;&lt;wsp:rsid wsp:val=&quot;006D264F&quot;/&gt;&lt;wsp:rsid wsp:val=&quot;006D4E89&quot;/&gt;&lt;wsp:rsid wsp:val=&quot;006E2A8D&quot;/&gt;&lt;wsp:rsid wsp:val=&quot;006E7574&quot;/&gt;&lt;wsp:rsid wsp:val=&quot;00703430&quot;/&gt;&lt;wsp:rsid wsp:val=&quot;00703548&quot;/&gt;&lt;wsp:rsid wsp:val=&quot;00704E18&quot;/&gt;&lt;wsp:rsid wsp:val=&quot;007069BE&quot;/&gt;&lt;wsp:rsid wsp:val=&quot;00745C86&quot;/&gt;&lt;wsp:rsid wsp:val=&quot;00764603&quot;/&gt;&lt;wsp:rsid wsp:val=&quot;007653C5&quot;/&gt;&lt;wsp:rsid wsp:val=&quot;0076604D&quot;/&gt;&lt;wsp:rsid wsp:val=&quot;00790909&quot;/&gt;&lt;wsp:rsid wsp:val=&quot;007929AF&quot;/&gt;&lt;wsp:rsid wsp:val=&quot;00792D4A&quot;/&gt;&lt;wsp:rsid wsp:val=&quot;007B1582&quot;/&gt;&lt;wsp:rsid wsp:val=&quot;007B5A07&quot;/&gt;&lt;wsp:rsid wsp:val=&quot;007C065D&quot;/&gt;&lt;wsp:rsid wsp:val=&quot;007D3E71&quot;/&gt;&lt;wsp:rsid wsp:val=&quot;007E5D6A&quot;/&gt;&lt;wsp:rsid wsp:val=&quot;007E645D&quot;/&gt;&lt;wsp:rsid wsp:val=&quot;007F75CA&quot;/&gt;&lt;wsp:rsid wsp:val=&quot;00821E08&quot;/&gt;&lt;wsp:rsid wsp:val=&quot;00834EFD&quot;/&gt;&lt;wsp:rsid wsp:val=&quot;00843007&quot;/&gt;&lt;wsp:rsid wsp:val=&quot;00844B24&quot;/&gt;&lt;wsp:rsid wsp:val=&quot;0084515F&quot;/&gt;&lt;wsp:rsid wsp:val=&quot;0085092D&quot;/&gt;&lt;wsp:rsid wsp:val=&quot;00865414&quot;/&gt;&lt;wsp:rsid wsp:val=&quot;00877D4C&quot;/&gt;&lt;wsp:rsid wsp:val=&quot;008831DC&quot;/&gt;&lt;wsp:rsid wsp:val=&quot;00883903&quot;/&gt;&lt;wsp:rsid wsp:val=&quot;00891C30&quot;/&gt;&lt;wsp:rsid wsp:val=&quot;00897219&quot;/&gt;&lt;wsp:rsid wsp:val=&quot;0089763B&quot;/&gt;&lt;wsp:rsid wsp:val=&quot;008B6AE3&quot;/&gt;&lt;wsp:rsid wsp:val=&quot;008C1332&quot;/&gt;&lt;wsp:rsid wsp:val=&quot;008D1045&quot;/&gt;&lt;wsp:rsid wsp:val=&quot;008E5996&quot;/&gt;&lt;wsp:rsid wsp:val=&quot;00901AE1&quot;/&gt;&lt;wsp:rsid wsp:val=&quot;00912F93&quot;/&gt;&lt;wsp:rsid wsp:val=&quot;009156AA&quot;/&gt;&lt;wsp:rsid wsp:val=&quot;009205B4&quot;/&gt;&lt;wsp:rsid wsp:val=&quot;00955B59&quot;/&gt;&lt;wsp:rsid wsp:val=&quot;00992262&quot;/&gt;&lt;wsp:rsid wsp:val=&quot;009926BC&quot;/&gt;&lt;wsp:rsid wsp:val=&quot;009A4319&quot;/&gt;&lt;wsp:rsid wsp:val=&quot;009A6C3F&quot;/&gt;&lt;wsp:rsid wsp:val=&quot;009B73F2&quot;/&gt;&lt;wsp:rsid wsp:val=&quot;009C12BD&quot;/&gt;&lt;wsp:rsid wsp:val=&quot;009C50FE&quot;/&gt;&lt;wsp:rsid wsp:val=&quot;009E49DD&quot;/&gt;&lt;wsp:rsid wsp:val=&quot;00A03E75&quot;/&gt;&lt;wsp:rsid wsp:val=&quot;00A20627&quot;/&gt;&lt;wsp:rsid wsp:val=&quot;00A22FE9&quot;/&gt;&lt;wsp:rsid wsp:val=&quot;00A31A44&quot;/&gt;&lt;wsp:rsid wsp:val=&quot;00A32BFA&quot;/&gt;&lt;wsp:rsid wsp:val=&quot;00A3325E&quot;/&gt;&lt;wsp:rsid wsp:val=&quot;00A366E2&quot;/&gt;&lt;wsp:rsid wsp:val=&quot;00A45FCE&quot;/&gt;&lt;wsp:rsid wsp:val=&quot;00A55CFF&quot;/&gt;&lt;wsp:rsid wsp:val=&quot;00A75671&quot;/&gt;&lt;wsp:rsid wsp:val=&quot;00A773CC&quot;/&gt;&lt;wsp:rsid wsp:val=&quot;00A924D0&quot;/&gt;&lt;wsp:rsid wsp:val=&quot;00A9318B&quot;/&gt;&lt;wsp:rsid wsp:val=&quot;00A94AC1&quot;/&gt;&lt;wsp:rsid wsp:val=&quot;00AB18B7&quot;/&gt;&lt;wsp:rsid wsp:val=&quot;00AD335D&quot;/&gt;&lt;wsp:rsid wsp:val=&quot;00AF114C&quot;/&gt;&lt;wsp:rsid wsp:val=&quot;00AF792B&quot;/&gt;&lt;wsp:rsid wsp:val=&quot;00B2440C&quot;/&gt;&lt;wsp:rsid wsp:val=&quot;00B32137&quot;/&gt;&lt;wsp:rsid wsp:val=&quot;00B33D2F&quot;/&gt;&lt;wsp:rsid wsp:val=&quot;00B40A5B&quot;/&gt;&lt;wsp:rsid wsp:val=&quot;00B45C6B&quot;/&gt;&lt;wsp:rsid wsp:val=&quot;00B55D5E&quot;/&gt;&lt;wsp:rsid wsp:val=&quot;00B57A80&quot;/&gt;&lt;wsp:rsid wsp:val=&quot;00B70E9C&quot;/&gt;&lt;wsp:rsid wsp:val=&quot;00B713D8&quot;/&gt;&lt;wsp:rsid wsp:val=&quot;00B72979&quot;/&gt;&lt;wsp:rsid wsp:val=&quot;00B94516&quot;/&gt;&lt;wsp:rsid wsp:val=&quot;00BA25E2&quot;/&gt;&lt;wsp:rsid wsp:val=&quot;00BB2855&quot;/&gt;&lt;wsp:rsid wsp:val=&quot;00BC5343&quot;/&gt;&lt;wsp:rsid wsp:val=&quot;00BD19C1&quot;/&gt;&lt;wsp:rsid wsp:val=&quot;00BD25B8&quot;/&gt;&lt;wsp:rsid wsp:val=&quot;00C012E1&quot;/&gt;&lt;wsp:rsid wsp:val=&quot;00C06BB4&quot;/&gt;&lt;wsp:rsid wsp:val=&quot;00C10D20&quot;/&gt;&lt;wsp:rsid wsp:val=&quot;00C12E0C&quot;/&gt;&lt;wsp:rsid wsp:val=&quot;00C21916&quot;/&gt;&lt;wsp:rsid wsp:val=&quot;00C34915&quot;/&gt;&lt;wsp:rsid wsp:val=&quot;00C457CA&quot;/&gt;&lt;wsp:rsid wsp:val=&quot;00C47EAE&quot;/&gt;&lt;wsp:rsid wsp:val=&quot;00C53FB6&quot;/&gt;&lt;wsp:rsid wsp:val=&quot;00C57FB7&quot;/&gt;&lt;wsp:rsid wsp:val=&quot;00C644D4&quot;/&gt;&lt;wsp:rsid wsp:val=&quot;00C65F3F&quot;/&gt;&lt;wsp:rsid wsp:val=&quot;00C72414&quot;/&gt;&lt;wsp:rsid wsp:val=&quot;00C72B1A&quot;/&gt;&lt;wsp:rsid wsp:val=&quot;00C8667B&quot;/&gt;&lt;wsp:rsid wsp:val=&quot;00C90993&quot;/&gt;&lt;wsp:rsid wsp:val=&quot;00CA4CE3&quot;/&gt;&lt;wsp:rsid wsp:val=&quot;00CA5A12&quot;/&gt;&lt;wsp:rsid wsp:val=&quot;00CB4ADD&quot;/&gt;&lt;wsp:rsid wsp:val=&quot;00CC72FD&quot;/&gt;&lt;wsp:rsid wsp:val=&quot;00CD1D23&quot;/&gt;&lt;wsp:rsid wsp:val=&quot;00CD4F3F&quot;/&gt;&lt;wsp:rsid wsp:val=&quot;00D311F8&quot;/&gt;&lt;wsp:rsid wsp:val=&quot;00D31660&quot;/&gt;&lt;wsp:rsid wsp:val=&quot;00D36B52&quot;/&gt;&lt;wsp:rsid wsp:val=&quot;00D377C8&quot;/&gt;&lt;wsp:rsid wsp:val=&quot;00D41274&quot;/&gt;&lt;wsp:rsid wsp:val=&quot;00D4229C&quot;/&gt;&lt;wsp:rsid wsp:val=&quot;00D43BF3&quot;/&gt;&lt;wsp:rsid wsp:val=&quot;00D549FB&quot;/&gt;&lt;wsp:rsid wsp:val=&quot;00D56487&quot;/&gt;&lt;wsp:rsid wsp:val=&quot;00D767BB&quot;/&gt;&lt;wsp:rsid wsp:val=&quot;00D939B0&quot;/&gt;&lt;wsp:rsid wsp:val=&quot;00DA31A2&quot;/&gt;&lt;wsp:rsid wsp:val=&quot;00DB16E0&quot;/&gt;&lt;wsp:rsid wsp:val=&quot;00DB2DF9&quot;/&gt;&lt;wsp:rsid wsp:val=&quot;00DB465D&quot;/&gt;&lt;wsp:rsid wsp:val=&quot;00DB48A2&quot;/&gt;&lt;wsp:rsid wsp:val=&quot;00DB7E63&quot;/&gt;&lt;wsp:rsid wsp:val=&quot;00DC2055&quot;/&gt;&lt;wsp:rsid wsp:val=&quot;00DC3908&quot;/&gt;&lt;wsp:rsid wsp:val=&quot;00DD71E8&quot;/&gt;&lt;wsp:rsid wsp:val=&quot;00DD7F83&quot;/&gt;&lt;wsp:rsid wsp:val=&quot;00DE4EB8&quot;/&gt;&lt;wsp:rsid wsp:val=&quot;00E0641E&quot;/&gt;&lt;wsp:rsid wsp:val=&quot;00E06664&quot;/&gt;&lt;wsp:rsid wsp:val=&quot;00E169D1&quot;/&gt;&lt;wsp:rsid wsp:val=&quot;00E304BC&quot;/&gt;&lt;wsp:rsid wsp:val=&quot;00E32853&quot;/&gt;&lt;wsp:rsid wsp:val=&quot;00E34EBD&quot;/&gt;&lt;wsp:rsid wsp:val=&quot;00E401F8&quot;/&gt;&lt;wsp:rsid wsp:val=&quot;00E46425&quot;/&gt;&lt;wsp:rsid wsp:val=&quot;00E469FC&quot;/&gt;&lt;wsp:rsid wsp:val=&quot;00E474EB&quot;/&gt;&lt;wsp:rsid wsp:val=&quot;00E47D0E&quot;/&gt;&lt;wsp:rsid wsp:val=&quot;00E65018&quot;/&gt;&lt;wsp:rsid wsp:val=&quot;00E76CA1&quot;/&gt;&lt;wsp:rsid wsp:val=&quot;00E94339&quot;/&gt;&lt;wsp:rsid wsp:val=&quot;00E97563&quot;/&gt;&lt;wsp:rsid wsp:val=&quot;00EB0B63&quot;/&gt;&lt;wsp:rsid wsp:val=&quot;00EC265C&quot;/&gt;&lt;wsp:rsid wsp:val=&quot;00ED61CB&quot;/&gt;&lt;wsp:rsid wsp:val=&quot;00EE752A&quot;/&gt;&lt;wsp:rsid wsp:val=&quot;00F06A72&quot;/&gt;&lt;wsp:rsid wsp:val=&quot;00F12D5B&quot;/&gt;&lt;wsp:rsid wsp:val=&quot;00F136F0&quot;/&gt;&lt;wsp:rsid wsp:val=&quot;00F20BBB&quot;/&gt;&lt;wsp:rsid wsp:val=&quot;00F36048&quot;/&gt;&lt;wsp:rsid wsp:val=&quot;00F43BD8&quot;/&gt;&lt;wsp:rsid wsp:val=&quot;00F562F3&quot;/&gt;&lt;wsp:rsid wsp:val=&quot;00F74B89&quot;/&gt;&lt;wsp:rsid wsp:val=&quot;00F75133&quot;/&gt;&lt;wsp:rsid wsp:val=&quot;00F83272&quot;/&gt;&lt;wsp:rsid wsp:val=&quot;00F9358D&quot;/&gt;&lt;wsp:rsid wsp:val=&quot;00F9369B&quot;/&gt;&lt;wsp:rsid wsp:val=&quot;00FA3899&quot;/&gt;&lt;wsp:rsid wsp:val=&quot;00FA4909&quot;/&gt;&lt;wsp:rsid wsp:val=&quot;00FA5164&quot;/&gt;&lt;wsp:rsid wsp:val=&quot;00FA6751&quot;/&gt;&lt;wsp:rsid wsp:val=&quot;00FA6BD7&quot;/&gt;&lt;wsp:rsid wsp:val=&quot;00FB1048&quot;/&gt;&lt;wsp:rsid wsp:val=&quot;00FB62C4&quot;/&gt;&lt;wsp:rsid wsp:val=&quot;00FB7701&quot;/&gt;&lt;wsp:rsid wsp:val=&quot;00FD1AC5&quot;/&gt;&lt;wsp:rsid wsp:val=&quot;00FD5CF0&quot;/&gt;&lt;/wsp:rsids&gt;&lt;/w:docPr&gt;&lt;w:body&gt;&lt;wx:sect&gt;&lt;w:p wsp:rsidR=&quot;00207E6E&quot; wsp:rsidRPr=&quot;00207E6E&quot; wsp:rsidRDefault=&quot;00207E6E&quot; wsp:rsidP=&quot;00207E6E&quot;&gt;&lt;m:oMathPara&gt;&lt;m:oMath&gt;&lt;m:r&gt;&lt;w:rPr&gt;&lt;w:rFonts w:ascii=&quot;Cambria Math&quot; w:fareast=&quot;Calibri&quot; w:h-ansi=&quot;Cambria Math&quot; w:cs=&quot;Arial&quot;/&gt;&lt;wx:font wx:val=&quot;Cambria Math&quot;/&gt;&lt;w:i/&gt;&lt;/w:rPr&gt;&lt;m:t&gt;1.062 A&lt;/m:t&gt;&lt;/m:r&gt;&lt;/m:oMath&gt;&lt;/m:oMathPara&gt;&lt;/w:p&gt;&lt;w:sectPr wsp:rsidR=&quot;00000000&quot; wsp:rsidRPr=&quot;00207E6E&quot;&gt;&lt;w:pgSz w:w=&quot;12240&quot; w:h=&quot;15840&quot;/&gt;&lt;w:pgMar w:top=&quot;1440&quot; w:right=&quot;1440&quot; w:bottom=&quot;1440&quot; w:left=&quot;1440&quot; w:header=&quot;720&quot; w:footer=&quot;720&quot; w:gutter=&quot;0&quot;/&gt;&lt;w:cols w:space=&quot;720&quot;/&gt;&lt;/w:sectPr&gt;&lt;/wx:sect&gt;&lt;/w:body&gt;&lt;/w:wordDocument&gt;">
+                  <v:imagedata r:id="rId40" o:title="" chromakey="white"/>
+                </v:shape>
+              </w:pict>
+            </w:r>
+          </w:p>
+        </w:tc>
+      </w:tr>
+      <w:tr>
+        <w:trPr>
+          <w:trHeight w:val="1"/>
+          <w:jc w:val="center"/>
+        </w:trPr>
+        <w:tc>
+          <w:tcPr>
+            <w:tcW w:w="2368" w:type="dxa"/>
+            <w:vAlign w:val="center"/>
+          </w:tcPr>
+          <w:p>
+            <w:pPr>
+              <w:rPr>
+                <w:sz w:val="18"/>
+                <w:szCs w:val="18"/>
+              </w:rPr>
+            </w:pPr>
+            <w:r>
+              <w:rPr>
+                <w:sz w:val="18"/>
+                <w:szCs w:val="18"/>
+              </w:rPr>
+              <w:t>Ripple de Salida</w:t>
+            </w:r>
+          </w:p>
+        </w:tc>
+        <w:tc>
+          <w:tcPr>
+            <w:tcW w:w="962" w:type="dxa"/>
+            <w:vAlign w:val="center"/>
+          </w:tcPr>
+          <w:p>
+            <w:pPr>
+              <w:rPr>
+                <w:rFonts w:ascii="Calibri" w:eastAsia="Calibri" w:hAnsi="Calibri" w:cs="Arial"/>
+                <w:sz w:val="18"/>
+                <w:szCs w:val="18"/>
+              </w:rPr>
+            </w:pPr>
+            <w:r>
+              <w:rPr>
+                <w:sz w:val="18"/>
+                <w:szCs w:val="18"/>
+              </w:rPr>
+              <w:pict w14:anchorId="7D36BC38">
+                <v:shape id="_x0000_i1299" type="#_x0000_t75" style="width:28.4pt;height:13.85pt" equationxml="&lt;?xml version=&quot;1.0&quot; encoding=&quot;UTF-8&quot; standalone=&quot;yes&quot;?&gt;&#10;&lt;?mso-application progid=&quot;Word.Document&quot;?&gt;&#10;&lt;w:wordDocument xmlns:aml=&quot;http://schemas.microsoft.com/aml/2001/core&quot; xmlns:wpc=&quot;http://schemas.microsoft.com/office/word/2010/wordprocessingCanvas&quot; xmlns:cx=&quot;http://schemas.microsoft.com/office/drawing/2014/chartex&quot; xmlns:cx1=&quot;http://schemas.microsoft.com/office/drawing/2015/9/8/chartex&quot; xmlns:cx2=&quot;http://schemas.microsoft.com/office/drawing/2015/10/21/chartex&quot; xmlns:cx3=&quot;http://schemas.microsoft.com/office/drawing/2016/5/9/chartex&quot; xmlns:cx4=&quot;http://schemas.microsoft.com/office/drawing/2016/5/10/chartex&quot; xmlns:cx5=&quot;http://schemas.microsoft.com/office/drawing/2016/5/11/chartex&quot; xmlns:cx6=&quot;http://schemas.microsoft.com/office/drawing/2016/5/12/chartex&quot; xmlns:cx7=&quot;http://schemas.microsoft.com/office/drawing/2016/5/13/chartex&quot; xmlns:cx8=&quot;http://schemas.microsoft.com/office/drawing/2016/5/14/chartex&quot; xmlns:cr=&quot;http://schemas.microsoft.com/office/comments/2020/reactions&quot; xmlns:dt=&quot;uuid:C2F41010-65B3-11d1-A29F-00AA00C14882&quot; xmlns:mc=&quot;http://schemas.openxmlformats.org/markup-compatibility/2006&quot; xmlns:aink=&quot;http://schemas.microsoft.com/office/drawing/2016/ink&quot; xmlns:am3d=&quot;http://schemas.microsoft.com/office/drawing/2017/model3d&quot; xmlns:o=&quot;urn:schemas-microsoft-com:office:office&quot; xmlns:oel=&quot;http://schemas.microsoft.com/office/2019/extlst&quot; xmlns:m=&quot;http://schemas.openxmlformats.org/officeDocument/2006/math&quot; xmlns:v=&quot;urn:schemas-microsoft-com:vml&quot; xmlns:w10=&quot;urn:schemas-microsoft-com:office:word&quot; xmlns:w=&quot;http://schemas.microsoft.com/office/word/2003/wordml&quot; xmlns:wx=&quot;http://schemas.microsoft.com/office/word/2003/auxHint&quot; xmlns:wne=&quot;http://schemas.microsoft.com/office/word/2006/wordml&quot; xmlns:wsp=&quot;http://schemas.microsoft.com/office/word/2003/wordml/sp2&quot; xmlns:sl=&quot;http://schemas.microsoft.com/schemaLibrary/2003/core&quot; w:macrosPresent=&quot;no&quot; w:embeddedObjPresent=&quot;no&quot; w:ocxPresent=&quot;no&quot; xml:space=&quot;preserve&quot;&gt;&lt;w:ignoreSubtree w:val=&quot;http://schemas.microsoft.com/office/word/2003/wordml/sp2&quot;/&gt;&lt;o:DocumentProperties&gt;&lt;o:Version&gt;16&lt;/o:Version&gt;&lt;/o:DocumentProperties&gt;&lt;w:docPr&gt;&lt;w:view w:val=&quot;print&quot;/&gt;&lt;w:zoom w:percent=&quot;86&quot;/&gt;&lt;w:doNotEmbedSystemFonts/&gt;&lt;w:activeWritingStyle w:lang=&quot;EN-AU&quot; w:vendorID=&quot;64&quot; w:dllVersion=&quot;6&quot; w:nlCheck=&quot;on&quot; w:optionSet=&quot;1&quot;/&gt;&lt;w:activeWritingStyle w:lang=&quot;EN-GB&quot; w:vendorID=&quot;64&quot; w:dllVersion=&quot;6&quot; w:nlCheck=&quot;on&quot; w:optionSet=&quot;1&quot;/&gt;&lt;w:activeWritingStyle w:lang=&quot;EN-US&quot; w:vendorID=&quot;64&quot; w:dllVersion=&quot;6&quot; w:nlCheck=&quot;on&quot; w:optionSet=&quot;1&quot;/&gt;&lt;w:activeWritingStyle w:lang=&quot;EN-AU&quot; w:vendorID=&quot;64&quot; w:dllVersion=&quot;0&quot; w:nlCheck=&quot;on&quot; w:optionSet=&quot;0&quot;/&gt;&lt;w:activeWritingStyle w:lang=&quot;EN-GB&quot; w:vendorID=&quot;64&quot; w:dllVersion=&quot;0&quot; w:nlCheck=&quot;on&quot; w:optionSet=&quot;0&quot;/&gt;&lt;w:activeWritingStyle w:lang=&quot;EN-US&quot; w:vendorID=&quot;64&quot; w:dllVersion=&quot;0&quot; w:nlCheck=&quot;on&quot; w:optionSet=&quot;0&quot;/&gt;&lt;w:activeWritingStyle w:lang=&quot;ES-AR&quot; w:vendorID=&quot;64&quot; w:dllVersion=&quot;0&quot; w:nlCheck=&quot;on&quot; w:optionSet=&quot;0&quot;/&gt;&lt;w:activeWritingStyle w:lang=&quot;580A&quot; w:vendorID=&quot;64&quot; w:dllVersion=&quot;0&quot; w:nlCheck=&quot;on&quot; w:optionSet=&quot;0&quot;/&gt;&lt;w:activeWritingStyle w:lang=&quot;PT-BR&quot; w:vendorID=&quot;64&quot; w:dllVersion=&quot;0&quot; w:nlCheck=&quot;on&quot; w:optionSet=&quot;0&quot;/&gt;&lt;w:stylePaneFormatFilter w:val=&quot;3F01&quot;/&gt;&lt;w:defaultTabStop w:val=&quot;720&quot;/&gt;&lt;w:hyphenationZone w:val=&quot;425&quot;/&gt;&lt;w:characterSpacingControl w:val=&quot;DontCompress&quot;/&gt;&lt;w:optimizeForBrowser/&gt;&lt;w:validateAgainstSchema/&gt;&lt;w:saveInvalidXML w:val=&quot;off&quot;/&gt;&lt;w:ignoreMixedContent w:val=&quot;off&quot;/&gt;&lt;w:alwaysShowPlaceholderText w:val=&quot;off&quot;/&gt;&lt;w:compat&gt;&lt;w:breakWrappedTables/&gt;&lt;w:snapToGridInCell/&gt;&lt;w:applyBreakingRules/&gt;&lt;w:wrapTextWithPunct/&gt;&lt;w:useAsianBreakRules/&gt;&lt;w:useWord2002TableStyleRules/&gt;&lt;w:useFELayout/&gt;&lt;/w:compat&gt;&lt;wsp:rsids&gt;&lt;wsp:rsidRoot wsp:val=&quot;00426FBB&quot;/&gt;&lt;wsp:rsid wsp:val=&quot;000002E1&quot;/&gt;&lt;wsp:rsid wsp:val=&quot;00003C97&quot;/&gt;&lt;wsp:rsid wsp:val=&quot;00004DA6&quot;/&gt;&lt;wsp:rsid wsp:val=&quot;00005565&quot;/&gt;&lt;wsp:rsid wsp:val=&quot;0001754A&quot;/&gt;&lt;wsp:rsid wsp:val=&quot;00017719&quot;/&gt;&lt;wsp:rsid wsp:val=&quot;00027F1D&quot;/&gt;&lt;wsp:rsid wsp:val=&quot;0003296C&quot;/&gt;&lt;wsp:rsid wsp:val=&quot;0003351F&quot;/&gt;&lt;wsp:rsid wsp:val=&quot;00044599&quot;/&gt;&lt;wsp:rsid wsp:val=&quot;000540E6&quot;/&gt;&lt;wsp:rsid wsp:val=&quot;00054421&quot;/&gt;&lt;wsp:rsid wsp:val=&quot;00062E46&quot;/&gt;&lt;wsp:rsid wsp:val=&quot;00074AC8&quot;/&gt;&lt;wsp:rsid wsp:val=&quot;00081408&quot;/&gt;&lt;wsp:rsid wsp:val=&quot;00081EBE&quot;/&gt;&lt;wsp:rsid wsp:val=&quot;00086EDC&quot;/&gt;&lt;wsp:rsid wsp:val=&quot;000B1236&quot;/&gt;&lt;wsp:rsid wsp:val=&quot;000B36A3&quot;/&gt;&lt;wsp:rsid wsp:val=&quot;000C013C&quot;/&gt;&lt;wsp:rsid wsp:val=&quot;000E3F84&quot;/&gt;&lt;wsp:rsid wsp:val=&quot;001056DF&quot;/&gt;&lt;wsp:rsid wsp:val=&quot;0010789C&quot;/&gt;&lt;wsp:rsid wsp:val=&quot;00110768&quot;/&gt;&lt;wsp:rsid wsp:val=&quot;00114025&quot;/&gt;&lt;wsp:rsid wsp:val=&quot;001160D2&quot;/&gt;&lt;wsp:rsid wsp:val=&quot;00120636&quot;/&gt;&lt;wsp:rsid wsp:val=&quot;001348A5&quot;/&gt;&lt;wsp:rsid wsp:val=&quot;00151B8E&quot;/&gt;&lt;wsp:rsid wsp:val=&quot;00182170&quot;/&gt;&lt;wsp:rsid wsp:val=&quot;0019165C&quot;/&gt;&lt;wsp:rsid wsp:val=&quot;001928FB&quot;/&gt;&lt;wsp:rsid wsp:val=&quot;00192BC7&quot;/&gt;&lt;wsp:rsid wsp:val=&quot;00195BE6&quot;/&gt;&lt;wsp:rsid wsp:val=&quot;001A3C37&quot;/&gt;&lt;wsp:rsid wsp:val=&quot;001A50EA&quot;/&gt;&lt;wsp:rsid wsp:val=&quot;001B122F&quot;/&gt;&lt;wsp:rsid wsp:val=&quot;001D2878&quot;/&gt;&lt;wsp:rsid wsp:val=&quot;001F16CD&quot;/&gt;&lt;wsp:rsid wsp:val=&quot;001F47D2&quot;/&gt;&lt;wsp:rsid wsp:val=&quot;002029C8&quot;/&gt;&lt;wsp:rsid wsp:val=&quot;0022285A&quot;/&gt;&lt;wsp:rsid wsp:val=&quot;00224C61&quot;/&gt;&lt;wsp:rsid wsp:val=&quot;00256ABC&quot;/&gt;&lt;wsp:rsid wsp:val=&quot;00257067&quot;/&gt;&lt;wsp:rsid wsp:val=&quot;0027227B&quot;/&gt;&lt;wsp:rsid wsp:val=&quot;00273AC7&quot;/&gt;&lt;wsp:rsid wsp:val=&quot;00273D2C&quot;/&gt;&lt;wsp:rsid wsp:val=&quot;00285ECD&quot;/&gt;&lt;wsp:rsid wsp:val=&quot;00290E1B&quot;/&gt;&lt;wsp:rsid wsp:val=&quot;00291B17&quot;/&gt;&lt;wsp:rsid wsp:val=&quot;00291BB3&quot;/&gt;&lt;wsp:rsid wsp:val=&quot;002A6742&quot;/&gt;&lt;wsp:rsid wsp:val=&quot;002C1A7F&quot;/&gt;&lt;wsp:rsid wsp:val=&quot;002C4239&quot;/&gt;&lt;wsp:rsid wsp:val=&quot;002C559D&quot;/&gt;&lt;wsp:rsid wsp:val=&quot;002D16AE&quot;/&gt;&lt;wsp:rsid wsp:val=&quot;002D2D42&quot;/&gt;&lt;wsp:rsid wsp:val=&quot;002F72D0&quot;/&gt;&lt;wsp:rsid wsp:val=&quot;002F7A4F&quot;/&gt;&lt;wsp:rsid wsp:val=&quot;003003AB&quot;/&gt;&lt;wsp:rsid wsp:val=&quot;00302C35&quot;/&gt;&lt;wsp:rsid wsp:val=&quot;00311C49&quot;/&gt;&lt;wsp:rsid wsp:val=&quot;0032119E&quot;/&gt;&lt;wsp:rsid wsp:val=&quot;00321304&quot;/&gt;&lt;wsp:rsid wsp:val=&quot;00324FC2&quot;/&gt;&lt;wsp:rsid wsp:val=&quot;003312CA&quot;/&gt;&lt;wsp:rsid wsp:val=&quot;00331F84&quot;/&gt;&lt;wsp:rsid wsp:val=&quot;003329D6&quot;/&gt;&lt;wsp:rsid wsp:val=&quot;003645A1&quot;/&gt;&lt;wsp:rsid wsp:val=&quot;0037721F&quot;/&gt;&lt;wsp:rsid wsp:val=&quot;003950A4&quot;/&gt;&lt;wsp:rsid wsp:val=&quot;003A1E7E&quot;/&gt;&lt;wsp:rsid wsp:val=&quot;003C7045&quot;/&gt;&lt;wsp:rsid wsp:val=&quot;003E2FDC&quot;/&gt;&lt;wsp:rsid wsp:val=&quot;003E3577&quot;/&gt;&lt;wsp:rsid wsp:val=&quot;003F3A61&quot;/&gt;&lt;wsp:rsid wsp:val=&quot;00404014&quot;/&gt;&lt;wsp:rsid wsp:val=&quot;00410A5D&quot;/&gt;&lt;wsp:rsid wsp:val=&quot;00414909&quot;/&gt;&lt;wsp:rsid wsp:val=&quot;00416537&quot;/&gt;&lt;wsp:rsid wsp:val=&quot;00425A6A&quot;/&gt;&lt;wsp:rsid wsp:val=&quot;00426FBB&quot;/&gt;&lt;wsp:rsid wsp:val=&quot;00454542&quot;/&gt;&lt;wsp:rsid wsp:val=&quot;0047429A&quot;/&gt;&lt;wsp:rsid wsp:val=&quot;00477AA8&quot;/&gt;&lt;wsp:rsid wsp:val=&quot;0048374C&quot;/&gt;&lt;wsp:rsid wsp:val=&quot;0048771D&quot;/&gt;&lt;wsp:rsid wsp:val=&quot;004A3EF0&quot;/&gt;&lt;wsp:rsid wsp:val=&quot;004A6605&quot;/&gt;&lt;wsp:rsid wsp:val=&quot;004B3B15&quot;/&gt;&lt;wsp:rsid wsp:val=&quot;004C45FA&quot;/&gt;&lt;wsp:rsid wsp:val=&quot;004D347F&quot;/&gt;&lt;wsp:rsid wsp:val=&quot;004D35A3&quot;/&gt;&lt;wsp:rsid wsp:val=&quot;004E1BD8&quot;/&gt;&lt;wsp:rsid wsp:val=&quot;004E452A&quot;/&gt;&lt;wsp:rsid wsp:val=&quot;004E78E3&quot;/&gt;&lt;wsp:rsid wsp:val=&quot;004F2BFE&quot;/&gt;&lt;wsp:rsid wsp:val=&quot;004F63D3&quot;/&gt;&lt;wsp:rsid wsp:val=&quot;004F7DCF&quot;/&gt;&lt;wsp:rsid wsp:val=&quot;005004BF&quot;/&gt;&lt;wsp:rsid wsp:val=&quot;00502E89&quot;/&gt;&lt;wsp:rsid wsp:val=&quot;00506CFE&quot;/&gt;&lt;wsp:rsid wsp:val=&quot;00510106&quot;/&gt;&lt;wsp:rsid wsp:val=&quot;00510E95&quot;/&gt;&lt;wsp:rsid wsp:val=&quot;005225C3&quot;/&gt;&lt;wsp:rsid wsp:val=&quot;00527D56&quot;/&gt;&lt;wsp:rsid wsp:val=&quot;0053221F&quot;/&gt;&lt;wsp:rsid wsp:val=&quot;00536FAE&quot;/&gt;&lt;wsp:rsid wsp:val=&quot;00542C85&quot;/&gt;&lt;wsp:rsid wsp:val=&quot;00553510&quot;/&gt;&lt;wsp:rsid wsp:val=&quot;00554186&quot;/&gt;&lt;wsp:rsid wsp:val=&quot;00585769&quot;/&gt;&lt;wsp:rsid wsp:val=&quot;00585C61&quot;/&gt;&lt;wsp:rsid wsp:val=&quot;00591130&quot;/&gt;&lt;wsp:rsid wsp:val=&quot;005A3F28&quot;/&gt;&lt;wsp:rsid wsp:val=&quot;005A40BE&quot;/&gt;&lt;wsp:rsid wsp:val=&quot;005B13E2&quot;/&gt;&lt;wsp:rsid wsp:val=&quot;005B47D7&quot;/&gt;&lt;wsp:rsid wsp:val=&quot;005C5526&quot;/&gt;&lt;wsp:rsid wsp:val=&quot;005C62C6&quot;/&gt;&lt;wsp:rsid wsp:val=&quot;005D7B9E&quot;/&gt;&lt;wsp:rsid wsp:val=&quot;005E112E&quot;/&gt;&lt;wsp:rsid wsp:val=&quot;005F0834&quot;/&gt;&lt;wsp:rsid wsp:val=&quot;005F68AB&quot;/&gt;&lt;wsp:rsid wsp:val=&quot;005F6DC3&quot;/&gt;&lt;wsp:rsid wsp:val=&quot;00601A8E&quot;/&gt;&lt;wsp:rsid wsp:val=&quot;0062033E&quot;/&gt;&lt;wsp:rsid wsp:val=&quot;00624482&quot;/&gt;&lt;wsp:rsid wsp:val=&quot;00630477&quot;/&gt;&lt;wsp:rsid wsp:val=&quot;0064799C&quot;/&gt;&lt;wsp:rsid wsp:val=&quot;00654156&quot;/&gt;&lt;wsp:rsid wsp:val=&quot;00656ADC&quot;/&gt;&lt;wsp:rsid wsp:val=&quot;006B47CA&quot;/&gt;&lt;wsp:rsid wsp:val=&quot;006C304C&quot;/&gt;&lt;wsp:rsid wsp:val=&quot;006C4511&quot;/&gt;&lt;wsp:rsid wsp:val=&quot;006C65F5&quot;/&gt;&lt;wsp:rsid wsp:val=&quot;006C7AAA&quot;/&gt;&lt;wsp:rsid wsp:val=&quot;006D1C2A&quot;/&gt;&lt;wsp:rsid wsp:val=&quot;006D264F&quot;/&gt;&lt;wsp:rsid wsp:val=&quot;006D4E89&quot;/&gt;&lt;wsp:rsid wsp:val=&quot;006E2A8D&quot;/&gt;&lt;wsp:rsid wsp:val=&quot;006E7574&quot;/&gt;&lt;wsp:rsid wsp:val=&quot;00703430&quot;/&gt;&lt;wsp:rsid wsp:val=&quot;00703548&quot;/&gt;&lt;wsp:rsid wsp:val=&quot;00704E18&quot;/&gt;&lt;wsp:rsid wsp:val=&quot;007069BE&quot;/&gt;&lt;wsp:rsid wsp:val=&quot;00745C86&quot;/&gt;&lt;wsp:rsid wsp:val=&quot;00764603&quot;/&gt;&lt;wsp:rsid wsp:val=&quot;007653C5&quot;/&gt;&lt;wsp:rsid wsp:val=&quot;0076604D&quot;/&gt;&lt;wsp:rsid wsp:val=&quot;00790909&quot;/&gt;&lt;wsp:rsid wsp:val=&quot;007929AF&quot;/&gt;&lt;wsp:rsid wsp:val=&quot;00792D4A&quot;/&gt;&lt;wsp:rsid wsp:val=&quot;007B1582&quot;/&gt;&lt;wsp:rsid wsp:val=&quot;007B5A07&quot;/&gt;&lt;wsp:rsid wsp:val=&quot;007C065D&quot;/&gt;&lt;wsp:rsid wsp:val=&quot;007D3E71&quot;/&gt;&lt;wsp:rsid wsp:val=&quot;007E5D6A&quot;/&gt;&lt;wsp:rsid wsp:val=&quot;007E645D&quot;/&gt;&lt;wsp:rsid wsp:val=&quot;007F75CA&quot;/&gt;&lt;wsp:rsid wsp:val=&quot;00821E08&quot;/&gt;&lt;wsp:rsid wsp:val=&quot;00834EFD&quot;/&gt;&lt;wsp:rsid wsp:val=&quot;00843007&quot;/&gt;&lt;wsp:rsid wsp:val=&quot;00844B24&quot;/&gt;&lt;wsp:rsid wsp:val=&quot;0084515F&quot;/&gt;&lt;wsp:rsid wsp:val=&quot;0085092D&quot;/&gt;&lt;wsp:rsid wsp:val=&quot;00865414&quot;/&gt;&lt;wsp:rsid wsp:val=&quot;00877D4C&quot;/&gt;&lt;wsp:rsid wsp:val=&quot;008831DC&quot;/&gt;&lt;wsp:rsid wsp:val=&quot;00883903&quot;/&gt;&lt;wsp:rsid wsp:val=&quot;00891C30&quot;/&gt;&lt;wsp:rsid wsp:val=&quot;00897219&quot;/&gt;&lt;wsp:rsid wsp:val=&quot;0089763B&quot;/&gt;&lt;wsp:rsid wsp:val=&quot;008B6AE3&quot;/&gt;&lt;wsp:rsid wsp:val=&quot;008C1332&quot;/&gt;&lt;wsp:rsid wsp:val=&quot;008D1045&quot;/&gt;&lt;wsp:rsid wsp:val=&quot;008E5996&quot;/&gt;&lt;wsp:rsid wsp:val=&quot;00901AE1&quot;/&gt;&lt;wsp:rsid wsp:val=&quot;00912F93&quot;/&gt;&lt;wsp:rsid wsp:val=&quot;009156AA&quot;/&gt;&lt;wsp:rsid wsp:val=&quot;009205B4&quot;/&gt;&lt;wsp:rsid wsp:val=&quot;00955B59&quot;/&gt;&lt;wsp:rsid wsp:val=&quot;00992262&quot;/&gt;&lt;wsp:rsid wsp:val=&quot;009926BC&quot;/&gt;&lt;wsp:rsid wsp:val=&quot;009A4319&quot;/&gt;&lt;wsp:rsid wsp:val=&quot;009A6C3F&quot;/&gt;&lt;wsp:rsid wsp:val=&quot;009B73F2&quot;/&gt;&lt;wsp:rsid wsp:val=&quot;009C12BD&quot;/&gt;&lt;wsp:rsid wsp:val=&quot;009C50FE&quot;/&gt;&lt;wsp:rsid wsp:val=&quot;009E49DD&quot;/&gt;&lt;wsp:rsid wsp:val=&quot;00A03E75&quot;/&gt;&lt;wsp:rsid wsp:val=&quot;00A20627&quot;/&gt;&lt;wsp:rsid wsp:val=&quot;00A22FE9&quot;/&gt;&lt;wsp:rsid wsp:val=&quot;00A31A44&quot;/&gt;&lt;wsp:rsid wsp:val=&quot;00A32BFA&quot;/&gt;&lt;wsp:rsid wsp:val=&quot;00A3325E&quot;/&gt;&lt;wsp:rsid wsp:val=&quot;00A366E2&quot;/&gt;&lt;wsp:rsid wsp:val=&quot;00A45FCE&quot;/&gt;&lt;wsp:rsid wsp:val=&quot;00A55CFF&quot;/&gt;&lt;wsp:rsid wsp:val=&quot;00A75671&quot;/&gt;&lt;wsp:rsid wsp:val=&quot;00A773CC&quot;/&gt;&lt;wsp:rsid wsp:val=&quot;00A924D0&quot;/&gt;&lt;wsp:rsid wsp:val=&quot;00A9318B&quot;/&gt;&lt;wsp:rsid wsp:val=&quot;00A94AC1&quot;/&gt;&lt;wsp:rsid wsp:val=&quot;00AB18B7&quot;/&gt;&lt;wsp:rsid wsp:val=&quot;00AD335D&quot;/&gt;&lt;wsp:rsid wsp:val=&quot;00AF114C&quot;/&gt;&lt;wsp:rsid wsp:val=&quot;00AF792B&quot;/&gt;&lt;wsp:rsid wsp:val=&quot;00B2440C&quot;/&gt;&lt;wsp:rsid wsp:val=&quot;00B32137&quot;/&gt;&lt;wsp:rsid wsp:val=&quot;00B33D2F&quot;/&gt;&lt;wsp:rsid wsp:val=&quot;00B40A5B&quot;/&gt;&lt;wsp:rsid wsp:val=&quot;00B45C6B&quot;/&gt;&lt;wsp:rsid wsp:val=&quot;00B55D5E&quot;/&gt;&lt;wsp:rsid wsp:val=&quot;00B57A80&quot;/&gt;&lt;wsp:rsid wsp:val=&quot;00B70E9C&quot;/&gt;&lt;wsp:rsid wsp:val=&quot;00B713D8&quot;/&gt;&lt;wsp:rsid wsp:val=&quot;00B72979&quot;/&gt;&lt;wsp:rsid wsp:val=&quot;00B94516&quot;/&gt;&lt;wsp:rsid wsp:val=&quot;00BA25E2&quot;/&gt;&lt;wsp:rsid wsp:val=&quot;00BB2855&quot;/&gt;&lt;wsp:rsid wsp:val=&quot;00BC5343&quot;/&gt;&lt;wsp:rsid wsp:val=&quot;00BD19C1&quot;/&gt;&lt;wsp:rsid wsp:val=&quot;00BD25B8&quot;/&gt;&lt;wsp:rsid wsp:val=&quot;00C012E1&quot;/&gt;&lt;wsp:rsid wsp:val=&quot;00C06BB4&quot;/&gt;&lt;wsp:rsid wsp:val=&quot;00C10D20&quot;/&gt;&lt;wsp:rsid wsp:val=&quot;00C12E0C&quot;/&gt;&lt;wsp:rsid wsp:val=&quot;00C21916&quot;/&gt;&lt;wsp:rsid wsp:val=&quot;00C34915&quot;/&gt;&lt;wsp:rsid wsp:val=&quot;00C457CA&quot;/&gt;&lt;wsp:rsid wsp:val=&quot;00C47EAE&quot;/&gt;&lt;wsp:rsid wsp:val=&quot;00C53FB6&quot;/&gt;&lt;wsp:rsid wsp:val=&quot;00C57FB7&quot;/&gt;&lt;wsp:rsid wsp:val=&quot;00C644D4&quot;/&gt;&lt;wsp:rsid wsp:val=&quot;00C65F3F&quot;/&gt;&lt;wsp:rsid wsp:val=&quot;00C72414&quot;/&gt;&lt;wsp:rsid wsp:val=&quot;00C72B1A&quot;/&gt;&lt;wsp:rsid wsp:val=&quot;00C8667B&quot;/&gt;&lt;wsp:rsid wsp:val=&quot;00C90993&quot;/&gt;&lt;wsp:rsid wsp:val=&quot;00CA4CE3&quot;/&gt;&lt;wsp:rsid wsp:val=&quot;00CA5A12&quot;/&gt;&lt;wsp:rsid wsp:val=&quot;00CB4ADD&quot;/&gt;&lt;wsp:rsid wsp:val=&quot;00CC72FD&quot;/&gt;&lt;wsp:rsid wsp:val=&quot;00CD1D23&quot;/&gt;&lt;wsp:rsid wsp:val=&quot;00CD4F3F&quot;/&gt;&lt;wsp:rsid wsp:val=&quot;00D311F8&quot;/&gt;&lt;wsp:rsid wsp:val=&quot;00D31660&quot;/&gt;&lt;wsp:rsid wsp:val=&quot;00D36B52&quot;/&gt;&lt;wsp:rsid wsp:val=&quot;00D377C8&quot;/&gt;&lt;wsp:rsid wsp:val=&quot;00D41274&quot;/&gt;&lt;wsp:rsid wsp:val=&quot;00D4229C&quot;/&gt;&lt;wsp:rsid wsp:val=&quot;00D43BF3&quot;/&gt;&lt;wsp:rsid wsp:val=&quot;00D549FB&quot;/&gt;&lt;wsp:rsid wsp:val=&quot;00D56487&quot;/&gt;&lt;wsp:rsid wsp:val=&quot;00D767BB&quot;/&gt;&lt;wsp:rsid wsp:val=&quot;00D939B0&quot;/&gt;&lt;wsp:rsid wsp:val=&quot;00DA31A2&quot;/&gt;&lt;wsp:rsid wsp:val=&quot;00DB16E0&quot;/&gt;&lt;wsp:rsid wsp:val=&quot;00DB2DF9&quot;/&gt;&lt;wsp:rsid wsp:val=&quot;00DB465D&quot;/&gt;&lt;wsp:rsid wsp:val=&quot;00DB48A2&quot;/&gt;&lt;wsp:rsid wsp:val=&quot;00DB7E63&quot;/&gt;&lt;wsp:rsid wsp:val=&quot;00DC2055&quot;/&gt;&lt;wsp:rsid wsp:val=&quot;00DC3908&quot;/&gt;&lt;wsp:rsid wsp:val=&quot;00DD71E8&quot;/&gt;&lt;wsp:rsid wsp:val=&quot;00DD7F83&quot;/&gt;&lt;wsp:rsid wsp:val=&quot;00DE4EB8&quot;/&gt;&lt;wsp:rsid wsp:val=&quot;00E0641E&quot;/&gt;&lt;wsp:rsid wsp:val=&quot;00E06664&quot;/&gt;&lt;wsp:rsid wsp:val=&quot;00E169D1&quot;/&gt;&lt;wsp:rsid wsp:val=&quot;00E304BC&quot;/&gt;&lt;wsp:rsid wsp:val=&quot;00E32853&quot;/&gt;&lt;wsp:rsid wsp:val=&quot;00E34EBD&quot;/&gt;&lt;wsp:rsid wsp:val=&quot;00E401F8&quot;/&gt;&lt;wsp:rsid wsp:val=&quot;00E46425&quot;/&gt;&lt;wsp:rsid wsp:val=&quot;00E469FC&quot;/&gt;&lt;wsp:rsid wsp:val=&quot;00E474EB&quot;/&gt;&lt;wsp:rsid wsp:val=&quot;00E47D0E&quot;/&gt;&lt;wsp:rsid wsp:val=&quot;00E65018&quot;/&gt;&lt;wsp:rsid wsp:val=&quot;00E76CA1&quot;/&gt;&lt;wsp:rsid wsp:val=&quot;00E94339&quot;/&gt;&lt;wsp:rsid wsp:val=&quot;00E97563&quot;/&gt;&lt;wsp:rsid wsp:val=&quot;00EB0B63&quot;/&gt;&lt;wsp:rsid wsp:val=&quot;00EC265C&quot;/&gt;&lt;wsp:rsid wsp:val=&quot;00ED61CB&quot;/&gt;&lt;wsp:rsid wsp:val=&quot;00EE752A&quot;/&gt;&lt;wsp:rsid wsp:val=&quot;00F06A72&quot;/&gt;&lt;wsp:rsid wsp:val=&quot;00F12D5B&quot;/&gt;&lt;wsp:rsid wsp:val=&quot;00F136F0&quot;/&gt;&lt;wsp:rsid wsp:val=&quot;00F20BBB&quot;/&gt;&lt;wsp:rsid wsp:val=&quot;00F36048&quot;/&gt;&lt;wsp:rsid wsp:val=&quot;00F43BD8&quot;/&gt;&lt;wsp:rsid wsp:val=&quot;00F562F3&quot;/&gt;&lt;wsp:rsid wsp:val=&quot;00F74B89&quot;/&gt;&lt;wsp:rsid wsp:val=&quot;00F75133&quot;/&gt;&lt;wsp:rsid wsp:val=&quot;00F83272&quot;/&gt;&lt;wsp:rsid wsp:val=&quot;00F9358D&quot;/&gt;&lt;wsp:rsid wsp:val=&quot;00F9369B&quot;/&gt;&lt;wsp:rsid wsp:val=&quot;00FA3899&quot;/&gt;&lt;wsp:rsid wsp:val=&quot;00FA4909&quot;/&gt;&lt;wsp:rsid wsp:val=&quot;00FA5164&quot;/&gt;&lt;wsp:rsid wsp:val=&quot;00FA6751&quot;/&gt;&lt;wsp:rsid wsp:val=&quot;00FA6BD7&quot;/&gt;&lt;wsp:rsid wsp:val=&quot;00FB1048&quot;/&gt;&lt;wsp:rsid wsp:val=&quot;00FB62C4&quot;/&gt;&lt;wsp:rsid wsp:val=&quot;00FB7701&quot;/&gt;&lt;wsp:rsid wsp:val=&quot;00FD1AC5&quot;/&gt;&lt;wsp:rsid wsp:val=&quot;00FD5CF0&quot;/&gt;&lt;/wsp:rsids&gt;&lt;/w:docPr&gt;&lt;w:body&gt;&lt;wx:sect&gt;&lt;w:p wsp:rsidR=&quot;001B122F&quot; wsp:rsidRPr=&quot;001B122F&quot; wsp:rsidRDefault=&quot;001B122F&quot; wsp:rsidP=&quot;001B122F&quot;&gt;&lt;m:oMathPara&gt;&lt;m:oMath&gt;&lt;m:r&gt;&lt;m:rPr&gt;&lt;m:sty m:val=&quot;p&quot;/&gt;&lt;/m:rPr&gt;&lt;w:rPr&gt;&lt;w:rFonts w:ascii=&quot;Cambria Math&quot; w:fareast=&quot;Calibri&quot; w:h-ansi=&quot;Cambria Math&quot; w:cs=&quot;Arial&quot;/&gt;&lt;wx:font wx:val=&quot;Cambria Math&quot;/&gt;&lt;/w:rPr&gt;&lt;m:t&gt;Î”&lt;/m:t&gt;&lt;/m:r&gt;&lt;m:sSub&gt;&lt;m:sSubPr&gt;&lt;m:ctrlPr&gt;&lt;w:rPr&gt;&lt;w:rFonts w:ascii=&quot;Cambria Math&quot; w:fareast=&quot;Calibri&quot; w:h-ansi=&quot;Cambria Math&quot; w:cs=&quot;Arial&quot;/&gt;&lt;wx:font wx:val=&quot;Cambria Math&quot;/&gt;&lt;w:i/&gt;&lt;/w:rPr&gt;&lt;/m:ctrlPr&gt;&lt;/m:sSubPr&gt;&lt;m:e&gt;&lt;m:r&gt;&lt;w:rPr&gt;&lt;w:rFonts w:ascii=&quot;Cambria Math&quot; w:fareast=&quot;Calibri&quot; w:h-ansi=&quot;Cambria Math&quot; w:cs=&quot;Arial&quot;/&gt;&lt;wx:font wx:val=&quot;Cambria Math&quot;/&gt;&lt;w:i/&gt;&lt;/w:rPr&gt;&lt;m:t&gt;V&lt;/m:t&gt;&lt;/m:r&gt;&lt;/m:e&gt;&lt;m:sub&gt;&lt;m:r&gt;&lt;w:rPr&gt;&lt;w:rFonts w:ascii=&quot;Cambria Math&quot; w:fareast=&quot;Calibri&quot; w:h-ansi=&quot;Cambria Math&quot; w:cs=&quot;Arial&quot;/&gt;&lt;wx:font wx:val=&quot;Cambria Math&quot;/&gt;&lt;w:i/&gt;&lt;/w:rPr&gt;&lt;m:t&gt;out&lt;/m:t&gt;&lt;/m:r&gt;&lt;/m:sub&gt;&lt;/m:sSub&gt;&lt;/m:oMath&gt;&lt;/m:oMathPara&gt;&lt;/w:p&gt;&lt;w:sectPr wsp:rsidR=&quot;00000000&quot; wsp:rsidRPr=&quot;001B122F&quot;&gt;&lt;w:pgSz w:w=&quot;12240&quot; w:h=&quot;15840&quot;/&gt;&lt;w:pgMar w:top=&quot;1440&quot; w:right=&quot;1440&quot; w:bottom=&quot;1440&quot; w:left=&quot;1440&quot; w:header=&quot;720&quot; w:footer=&quot;720&quot; w:gutter=&quot;0&quot;/&gt;&lt;w:cols w:space=&quot;720&quot;/&gt;&lt;/w:sectPr&gt;&lt;/wx:sect&gt;&lt;/w:body&gt;&lt;/w:wordDocument&gt;">
+                  <v:imagedata r:id="rId21" o:title="" chromakey="white"/>
+                </v:shape>
+              </w:pict>
+            </w:r>
+          </w:p>
+        </w:tc>
+        <w:tc>
+          <w:tcPr>
+            <w:tcW w:w="1378" w:type="dxa"/>
+            <w:vAlign w:val="center"/>
+          </w:tcPr>
+          <w:p>
+            <w:pPr>
+              <w:rPr>
+                <w:rFonts w:ascii="Calibri" w:eastAsia="Calibri" w:hAnsi="Calibri" w:cs="Arial"/>
+                <w:sz w:val="18"/>
+                <w:szCs w:val="18"/>
+              </w:rPr>
+            </w:pPr>
+            <w:r>
+              <w:rPr>
+                <w:sz w:val="18"/>
+                <w:szCs w:val="18"/>
+              </w:rPr>
+              <w:pict w14:anchorId="1FF858AF">
+                <v:shape id="_x0000_i1300" type="#_x0000_t75" style="width:31.15pt;height:13.85pt" equationxml="&lt;?xml version=&quot;1.0&quot; encoding=&quot;UTF-8&quot; standalone=&quot;yes&quot;?&gt;&#10;&lt;?mso-application progid=&quot;Word.Document&quot;?&gt;&#10;&lt;w:wordDocument xmlns:aml=&quot;http://schemas.microsoft.com/aml/2001/core&quot; xmlns:wpc=&quot;http://schemas.microsoft.com/office/word/2010/wordprocessingCanvas&quot; xmlns:cx=&quot;http://schemas.microsoft.com/office/drawing/2014/chartex&quot; xmlns:cx1=&quot;http://schemas.microsoft.com/office/drawing/2015/9/8/chartex&quot; xmlns:cx2=&quot;http://schemas.microsoft.com/office/drawing/2015/10/21/chartex&quot; xmlns:cx3=&quot;http://schemas.microsoft.com/office/drawing/2016/5/9/chartex&quot; xmlns:cx4=&quot;http://schemas.microsoft.com/office/drawing/2016/5/10/chartex&quot; xmlns:cx5=&quot;http://schemas.microsoft.com/office/drawing/2016/5/11/chartex&quot; xmlns:cx6=&quot;http://schemas.microsoft.com/office/drawing/2016/5/12/chartex&quot; xmlns:cx7=&quot;http://schemas.microsoft.com/office/drawing/2016/5/13/chartex&quot; xmlns:cx8=&quot;http://schemas.microsoft.com/office/drawing/2016/5/14/chartex&quot; xmlns:cr=&quot;http://schemas.microsoft.com/office/comments/2020/reactions&quot; xmlns:dt=&quot;uuid:C2F41010-65B3-11d1-A29F-00AA00C14882&quot; xmlns:mc=&quot;http://schemas.openxmlformats.org/markup-compatibility/2006&quot; xmlns:aink=&quot;http://schemas.microsoft.com/office/drawing/2016/ink&quot; xmlns:am3d=&quot;http://schemas.microsoft.com/office/drawing/2017/model3d&quot; xmlns:o=&quot;urn:schemas-microsoft-com:office:office&quot; xmlns:oel=&quot;http://schemas.microsoft.com/office/2019/extlst&quot; xmlns:m=&quot;http://schemas.openxmlformats.org/officeDocument/2006/math&quot; xmlns:v=&quot;urn:schemas-microsoft-com:vml&quot; xmlns:w10=&quot;urn:schemas-microsoft-com:office:word&quot; xmlns:w=&quot;http://schemas.microsoft.com/office/word/2003/wordml&quot; xmlns:wx=&quot;http://schemas.microsoft.com/office/word/2003/auxHint&quot; xmlns:wne=&quot;http://schemas.microsoft.com/office/word/2006/wordml&quot; xmlns:wsp=&quot;http://schemas.microsoft.com/office/word/2003/wordml/sp2&quot; xmlns:sl=&quot;http://schemas.microsoft.com/schemaLibrary/2003/core&quot; w:macrosPresent=&quot;no&quot; w:embeddedObjPresent=&quot;no&quot; w:ocxPresent=&quot;no&quot; xml:space=&quot;preserve&quot;&gt;&lt;w:ignoreSubtree w:val=&quot;http://schemas.microsoft.com/office/word/2003/wordml/sp2&quot;/&gt;&lt;o:DocumentProperties&gt;&lt;o:Version&gt;16&lt;/o:Version&gt;&lt;/o:DocumentProperties&gt;&lt;w:docPr&gt;&lt;w:view w:val=&quot;print&quot;/&gt;&lt;w:zoom w:percent=&quot;86&quot;/&gt;&lt;w:doNotEmbedSystemFonts/&gt;&lt;w:activeWritingStyle w:lang=&quot;EN-AU&quot; w:vendorID=&quot;64&quot; w:dllVersion=&quot;6&quot; w:nlCheck=&quot;on&quot; w:optionSet=&quot;1&quot;/&gt;&lt;w:activeWritingStyle w:lang=&quot;EN-GB&quot; w:vendorID=&quot;64&quot; w:dllVersion=&quot;6&quot; w:nlCheck=&quot;on&quot; w:optionSet=&quot;1&quot;/&gt;&lt;w:activeWritingStyle w:lang=&quot;EN-US&quot; w:vendorID=&quot;64&quot; w:dllVersion=&quot;6&quot; w:nlCheck=&quot;on&quot; w:optionSet=&quot;1&quot;/&gt;&lt;w:activeWritingStyle w:lang=&quot;EN-AU&quot; w:vendorID=&quot;64&quot; w:dllVersion=&quot;0&quot; w:nlCheck=&quot;on&quot; w:optionSet=&quot;0&quot;/&gt;&lt;w:activeWritingStyle w:lang=&quot;EN-GB&quot; w:vendorID=&quot;64&quot; w:dllVersion=&quot;0&quot; w:nlCheck=&quot;on&quot; w:optionSet=&quot;0&quot;/&gt;&lt;w:activeWritingStyle w:lang=&quot;EN-US&quot; w:vendorID=&quot;64&quot; w:dllVersion=&quot;0&quot; w:nlCheck=&quot;on&quot; w:optionSet=&quot;0&quot;/&gt;&lt;w:activeWritingStyle w:lang=&quot;ES-AR&quot; w:vendorID=&quot;64&quot; w:dllVersion=&quot;0&quot; w:nlCheck=&quot;on&quot; w:optionSet=&quot;0&quot;/&gt;&lt;w:activeWritingStyle w:lang=&quot;580A&quot; w:vendorID=&quot;64&quot; w:dllVersion=&quot;0&quot; w:nlCheck=&quot;on&quot; w:optionSet=&quot;0&quot;/&gt;&lt;w:activeWritingStyle w:lang=&quot;PT-BR&quot; w:vendorID=&quot;64&quot; w:dllVersion=&quot;0&quot; w:nlCheck=&quot;on&quot; w:optionSet=&quot;0&quot;/&gt;&lt;w:stylePaneFormatFilter w:val=&quot;3F01&quot;/&gt;&lt;w:defaultTabStop w:val=&quot;720&quot;/&gt;&lt;w:hyphenationZone w:val=&quot;425&quot;/&gt;&lt;w:characterSpacingControl w:val=&quot;DontCompress&quot;/&gt;&lt;w:optimizeForBrowser/&gt;&lt;w:validateAgainstSchema/&gt;&lt;w:saveInvalidXML w:val=&quot;off&quot;/&gt;&lt;w:ignoreMixedContent w:val=&quot;off&quot;/&gt;&lt;w:alwaysShowPlaceholderText w:val=&quot;off&quot;/&gt;&lt;w:compat&gt;&lt;w:breakWrappedTables/&gt;&lt;w:snapToGridInCell/&gt;&lt;w:applyBreakingRules/&gt;&lt;w:wrapTextWithPunct/&gt;&lt;w:useAsianBreakRules/&gt;&lt;w:useWord2002TableStyleRules/&gt;&lt;w:useFELayout/&gt;&lt;/w:compat&gt;&lt;wsp:rsids&gt;&lt;wsp:rsidRoot wsp:val=&quot;00426FBB&quot;/&gt;&lt;wsp:rsid wsp:val=&quot;000002E1&quot;/&gt;&lt;wsp:rsid wsp:val=&quot;00003C97&quot;/&gt;&lt;wsp:rsid wsp:val=&quot;00004DA6&quot;/&gt;&lt;wsp:rsid wsp:val=&quot;00005565&quot;/&gt;&lt;wsp:rsid wsp:val=&quot;0001754A&quot;/&gt;&lt;wsp:rsid wsp:val=&quot;00017719&quot;/&gt;&lt;wsp:rsid wsp:val=&quot;00027F1D&quot;/&gt;&lt;wsp:rsid wsp:val=&quot;0003296C&quot;/&gt;&lt;wsp:rsid wsp:val=&quot;0003351F&quot;/&gt;&lt;wsp:rsid wsp:val=&quot;00044599&quot;/&gt;&lt;wsp:rsid wsp:val=&quot;000540E6&quot;/&gt;&lt;wsp:rsid wsp:val=&quot;00054421&quot;/&gt;&lt;wsp:rsid wsp:val=&quot;00062E46&quot;/&gt;&lt;wsp:rsid wsp:val=&quot;00074AC8&quot;/&gt;&lt;wsp:rsid wsp:val=&quot;00081408&quot;/&gt;&lt;wsp:rsid wsp:val=&quot;00081EBE&quot;/&gt;&lt;wsp:rsid wsp:val=&quot;00086EDC&quot;/&gt;&lt;wsp:rsid wsp:val=&quot;000B1236&quot;/&gt;&lt;wsp:rsid wsp:val=&quot;000B36A3&quot;/&gt;&lt;wsp:rsid wsp:val=&quot;000C013C&quot;/&gt;&lt;wsp:rsid wsp:val=&quot;000E3F84&quot;/&gt;&lt;wsp:rsid wsp:val=&quot;001056DF&quot;/&gt;&lt;wsp:rsid wsp:val=&quot;0010789C&quot;/&gt;&lt;wsp:rsid wsp:val=&quot;00110768&quot;/&gt;&lt;wsp:rsid wsp:val=&quot;00114025&quot;/&gt;&lt;wsp:rsid wsp:val=&quot;001160D2&quot;/&gt;&lt;wsp:rsid wsp:val=&quot;00120636&quot;/&gt;&lt;wsp:rsid wsp:val=&quot;001348A5&quot;/&gt;&lt;wsp:rsid wsp:val=&quot;00151B8E&quot;/&gt;&lt;wsp:rsid wsp:val=&quot;00182170&quot;/&gt;&lt;wsp:rsid wsp:val=&quot;0019165C&quot;/&gt;&lt;wsp:rsid wsp:val=&quot;001928FB&quot;/&gt;&lt;wsp:rsid wsp:val=&quot;00192BC7&quot;/&gt;&lt;wsp:rsid wsp:val=&quot;00195BE6&quot;/&gt;&lt;wsp:rsid wsp:val=&quot;001A3C37&quot;/&gt;&lt;wsp:rsid wsp:val=&quot;001A50EA&quot;/&gt;&lt;wsp:rsid wsp:val=&quot;001D2878&quot;/&gt;&lt;wsp:rsid wsp:val=&quot;001F16CD&quot;/&gt;&lt;wsp:rsid wsp:val=&quot;001F47D2&quot;/&gt;&lt;wsp:rsid wsp:val=&quot;002029C8&quot;/&gt;&lt;wsp:rsid wsp:val=&quot;0022285A&quot;/&gt;&lt;wsp:rsid wsp:val=&quot;00224C61&quot;/&gt;&lt;wsp:rsid wsp:val=&quot;00256ABC&quot;/&gt;&lt;wsp:rsid wsp:val=&quot;00257067&quot;/&gt;&lt;wsp:rsid wsp:val=&quot;0027227B&quot;/&gt;&lt;wsp:rsid wsp:val=&quot;00273AC7&quot;/&gt;&lt;wsp:rsid wsp:val=&quot;00273D2C&quot;/&gt;&lt;wsp:rsid wsp:val=&quot;00285ECD&quot;/&gt;&lt;wsp:rsid wsp:val=&quot;00290E1B&quot;/&gt;&lt;wsp:rsid wsp:val=&quot;00291B17&quot;/&gt;&lt;wsp:rsid wsp:val=&quot;00291BB3&quot;/&gt;&lt;wsp:rsid wsp:val=&quot;002A6742&quot;/&gt;&lt;wsp:rsid wsp:val=&quot;002C1A7F&quot;/&gt;&lt;wsp:rsid wsp:val=&quot;002C4239&quot;/&gt;&lt;wsp:rsid wsp:val=&quot;002C559D&quot;/&gt;&lt;wsp:rsid wsp:val=&quot;002D16AE&quot;/&gt;&lt;wsp:rsid wsp:val=&quot;002D2D42&quot;/&gt;&lt;wsp:rsid wsp:val=&quot;002F72D0&quot;/&gt;&lt;wsp:rsid wsp:val=&quot;002F7A4F&quot;/&gt;&lt;wsp:rsid wsp:val=&quot;003003AB&quot;/&gt;&lt;wsp:rsid wsp:val=&quot;00302C35&quot;/&gt;&lt;wsp:rsid wsp:val=&quot;00311C49&quot;/&gt;&lt;wsp:rsid wsp:val=&quot;0032119E&quot;/&gt;&lt;wsp:rsid wsp:val=&quot;00321304&quot;/&gt;&lt;wsp:rsid wsp:val=&quot;00324FC2&quot;/&gt;&lt;wsp:rsid wsp:val=&quot;003312CA&quot;/&gt;&lt;wsp:rsid wsp:val=&quot;00331F84&quot;/&gt;&lt;wsp:rsid wsp:val=&quot;003329D6&quot;/&gt;&lt;wsp:rsid wsp:val=&quot;003645A1&quot;/&gt;&lt;wsp:rsid wsp:val=&quot;0037721F&quot;/&gt;&lt;wsp:rsid wsp:val=&quot;003950A4&quot;/&gt;&lt;wsp:rsid wsp:val=&quot;003A1E7E&quot;/&gt;&lt;wsp:rsid wsp:val=&quot;003C7045&quot;/&gt;&lt;wsp:rsid wsp:val=&quot;003E2FDC&quot;/&gt;&lt;wsp:rsid wsp:val=&quot;003E3577&quot;/&gt;&lt;wsp:rsid wsp:val=&quot;003F3A61&quot;/&gt;&lt;wsp:rsid wsp:val=&quot;00404014&quot;/&gt;&lt;wsp:rsid wsp:val=&quot;00410A5D&quot;/&gt;&lt;wsp:rsid wsp:val=&quot;00414909&quot;/&gt;&lt;wsp:rsid wsp:val=&quot;00416537&quot;/&gt;&lt;wsp:rsid wsp:val=&quot;00425A6A&quot;/&gt;&lt;wsp:rsid wsp:val=&quot;00426FBB&quot;/&gt;&lt;wsp:rsid wsp:val=&quot;00454542&quot;/&gt;&lt;wsp:rsid wsp:val=&quot;0047429A&quot;/&gt;&lt;wsp:rsid wsp:val=&quot;00477AA8&quot;/&gt;&lt;wsp:rsid wsp:val=&quot;0048374C&quot;/&gt;&lt;wsp:rsid wsp:val=&quot;0048771D&quot;/&gt;&lt;wsp:rsid wsp:val=&quot;004A3EF0&quot;/&gt;&lt;wsp:rsid wsp:val=&quot;004A6605&quot;/&gt;&lt;wsp:rsid wsp:val=&quot;004B3B15&quot;/&gt;&lt;wsp:rsid wsp:val=&quot;004C45FA&quot;/&gt;&lt;wsp:rsid wsp:val=&quot;004D347F&quot;/&gt;&lt;wsp:rsid wsp:val=&quot;004D35A3&quot;/&gt;&lt;wsp:rsid wsp:val=&quot;004E1BD8&quot;/&gt;&lt;wsp:rsid wsp:val=&quot;004E452A&quot;/&gt;&lt;wsp:rsid wsp:val=&quot;004E78E3&quot;/&gt;&lt;wsp:rsid wsp:val=&quot;004F2BFE&quot;/&gt;&lt;wsp:rsid wsp:val=&quot;004F63D3&quot;/&gt;&lt;wsp:rsid wsp:val=&quot;004F7DCF&quot;/&gt;&lt;wsp:rsid wsp:val=&quot;005004BF&quot;/&gt;&lt;wsp:rsid wsp:val=&quot;00502E89&quot;/&gt;&lt;wsp:rsid wsp:val=&quot;00506CFE&quot;/&gt;&lt;wsp:rsid wsp:val=&quot;00510106&quot;/&gt;&lt;wsp:rsid wsp:val=&quot;00510E95&quot;/&gt;&lt;wsp:rsid wsp:val=&quot;005225C3&quot;/&gt;&lt;wsp:rsid wsp:val=&quot;00527D56&quot;/&gt;&lt;wsp:rsid wsp:val=&quot;0053221F&quot;/&gt;&lt;wsp:rsid wsp:val=&quot;00536FAE&quot;/&gt;&lt;wsp:rsid wsp:val=&quot;00542C85&quot;/&gt;&lt;wsp:rsid wsp:val=&quot;00553510&quot;/&gt;&lt;wsp:rsid wsp:val=&quot;00554186&quot;/&gt;&lt;wsp:rsid wsp:val=&quot;00585769&quot;/&gt;&lt;wsp:rsid wsp:val=&quot;00585C61&quot;/&gt;&lt;wsp:rsid wsp:val=&quot;00591130&quot;/&gt;&lt;wsp:rsid wsp:val=&quot;005A3F28&quot;/&gt;&lt;wsp:rsid wsp:val=&quot;005A40BE&quot;/&gt;&lt;wsp:rsid wsp:val=&quot;005B13E2&quot;/&gt;&lt;wsp:rsid wsp:val=&quot;005B47D7&quot;/&gt;&lt;wsp:rsid wsp:val=&quot;005C5526&quot;/&gt;&lt;wsp:rsid wsp:val=&quot;005C62C6&quot;/&gt;&lt;wsp:rsid wsp:val=&quot;005D7B9E&quot;/&gt;&lt;wsp:rsid wsp:val=&quot;005E112E&quot;/&gt;&lt;wsp:rsid wsp:val=&quot;005F0834&quot;/&gt;&lt;wsp:rsid wsp:val=&quot;005F68AB&quot;/&gt;&lt;wsp:rsid wsp:val=&quot;005F6DC3&quot;/&gt;&lt;wsp:rsid wsp:val=&quot;00601A8E&quot;/&gt;&lt;wsp:rsid wsp:val=&quot;0062033E&quot;/&gt;&lt;wsp:rsid wsp:val=&quot;00624482&quot;/&gt;&lt;wsp:rsid wsp:val=&quot;00630477&quot;/&gt;&lt;wsp:rsid wsp:val=&quot;0064799C&quot;/&gt;&lt;wsp:rsid wsp:val=&quot;00654156&quot;/&gt;&lt;wsp:rsid wsp:val=&quot;00656ADC&quot;/&gt;&lt;wsp:rsid wsp:val=&quot;006B47CA&quot;/&gt;&lt;wsp:rsid wsp:val=&quot;006C304C&quot;/&gt;&lt;wsp:rsid wsp:val=&quot;006C4511&quot;/&gt;&lt;wsp:rsid wsp:val=&quot;006C65F5&quot;/&gt;&lt;wsp:rsid wsp:val=&quot;006C7AAA&quot;/&gt;&lt;wsp:rsid wsp:val=&quot;006D1C2A&quot;/&gt;&lt;wsp:rsid wsp:val=&quot;006D264F&quot;/&gt;&lt;wsp:rsid wsp:val=&quot;006D4E89&quot;/&gt;&lt;wsp:rsid wsp:val=&quot;006E2A8D&quot;/&gt;&lt;wsp:rsid wsp:val=&quot;006E7574&quot;/&gt;&lt;wsp:rsid wsp:val=&quot;00703430&quot;/&gt;&lt;wsp:rsid wsp:val=&quot;00703548&quot;/&gt;&lt;wsp:rsid wsp:val=&quot;00704E18&quot;/&gt;&lt;wsp:rsid wsp:val=&quot;007069BE&quot;/&gt;&lt;wsp:rsid wsp:val=&quot;00745C86&quot;/&gt;&lt;wsp:rsid wsp:val=&quot;00764603&quot;/&gt;&lt;wsp:rsid wsp:val=&quot;007653C5&quot;/&gt;&lt;wsp:rsid wsp:val=&quot;0076604D&quot;/&gt;&lt;wsp:rsid wsp:val=&quot;00790909&quot;/&gt;&lt;wsp:rsid wsp:val=&quot;007929AF&quot;/&gt;&lt;wsp:rsid wsp:val=&quot;00792D4A&quot;/&gt;&lt;wsp:rsid wsp:val=&quot;007B1582&quot;/&gt;&lt;wsp:rsid wsp:val=&quot;007B5A07&quot;/&gt;&lt;wsp:rsid wsp:val=&quot;007C065D&quot;/&gt;&lt;wsp:rsid wsp:val=&quot;007D3E71&quot;/&gt;&lt;wsp:rsid wsp:val=&quot;007E5D6A&quot;/&gt;&lt;wsp:rsid wsp:val=&quot;007E645D&quot;/&gt;&lt;wsp:rsid wsp:val=&quot;007F75CA&quot;/&gt;&lt;wsp:rsid wsp:val=&quot;00821E08&quot;/&gt;&lt;wsp:rsid wsp:val=&quot;00821FE1&quot;/&gt;&lt;wsp:rsid wsp:val=&quot;00834EFD&quot;/&gt;&lt;wsp:rsid wsp:val=&quot;00843007&quot;/&gt;&lt;wsp:rsid wsp:val=&quot;00844B24&quot;/&gt;&lt;wsp:rsid wsp:val=&quot;0084515F&quot;/&gt;&lt;wsp:rsid wsp:val=&quot;0085092D&quot;/&gt;&lt;wsp:rsid wsp:val=&quot;00865414&quot;/&gt;&lt;wsp:rsid wsp:val=&quot;00877D4C&quot;/&gt;&lt;wsp:rsid wsp:val=&quot;008831DC&quot;/&gt;&lt;wsp:rsid wsp:val=&quot;00883903&quot;/&gt;&lt;wsp:rsid wsp:val=&quot;00891C30&quot;/&gt;&lt;wsp:rsid wsp:val=&quot;00897219&quot;/&gt;&lt;wsp:rsid wsp:val=&quot;0089763B&quot;/&gt;&lt;wsp:rsid wsp:val=&quot;008B6AE3&quot;/&gt;&lt;wsp:rsid wsp:val=&quot;008C1332&quot;/&gt;&lt;wsp:rsid wsp:val=&quot;008D1045&quot;/&gt;&lt;wsp:rsid wsp:val=&quot;008E5996&quot;/&gt;&lt;wsp:rsid wsp:val=&quot;00901AE1&quot;/&gt;&lt;wsp:rsid wsp:val=&quot;00912F93&quot;/&gt;&lt;wsp:rsid wsp:val=&quot;009156AA&quot;/&gt;&lt;wsp:rsid wsp:val=&quot;009205B4&quot;/&gt;&lt;wsp:rsid wsp:val=&quot;00955B59&quot;/&gt;&lt;wsp:rsid wsp:val=&quot;00992262&quot;/&gt;&lt;wsp:rsid wsp:val=&quot;009926BC&quot;/&gt;&lt;wsp:rsid wsp:val=&quot;009A4319&quot;/&gt;&lt;wsp:rsid wsp:val=&quot;009A6C3F&quot;/&gt;&lt;wsp:rsid wsp:val=&quot;009B73F2&quot;/&gt;&lt;wsp:rsid wsp:val=&quot;009C12BD&quot;/&gt;&lt;wsp:rsid wsp:val=&quot;009C50FE&quot;/&gt;&lt;wsp:rsid wsp:val=&quot;009E49DD&quot;/&gt;&lt;wsp:rsid wsp:val=&quot;00A03E75&quot;/&gt;&lt;wsp:rsid wsp:val=&quot;00A20627&quot;/&gt;&lt;wsp:rsid wsp:val=&quot;00A22FE9&quot;/&gt;&lt;wsp:rsid wsp:val=&quot;00A31A44&quot;/&gt;&lt;wsp:rsid wsp:val=&quot;00A32BFA&quot;/&gt;&lt;wsp:rsid wsp:val=&quot;00A3325E&quot;/&gt;&lt;wsp:rsid wsp:val=&quot;00A366E2&quot;/&gt;&lt;wsp:rsid wsp:val=&quot;00A45FCE&quot;/&gt;&lt;wsp:rsid wsp:val=&quot;00A55CFF&quot;/&gt;&lt;wsp:rsid wsp:val=&quot;00A75671&quot;/&gt;&lt;wsp:rsid wsp:val=&quot;00A773CC&quot;/&gt;&lt;wsp:rsid wsp:val=&quot;00A924D0&quot;/&gt;&lt;wsp:rsid wsp:val=&quot;00A9318B&quot;/&gt;&lt;wsp:rsid wsp:val=&quot;00A94AC1&quot;/&gt;&lt;wsp:rsid wsp:val=&quot;00AB18B7&quot;/&gt;&lt;wsp:rsid wsp:val=&quot;00AD335D&quot;/&gt;&lt;wsp:rsid wsp:val=&quot;00AF114C&quot;/&gt;&lt;wsp:rsid wsp:val=&quot;00AF792B&quot;/&gt;&lt;wsp:rsid wsp:val=&quot;00B2440C&quot;/&gt;&lt;wsp:rsid wsp:val=&quot;00B32137&quot;/&gt;&lt;wsp:rsid wsp:val=&quot;00B33D2F&quot;/&gt;&lt;wsp:rsid wsp:val=&quot;00B40A5B&quot;/&gt;&lt;wsp:rsid wsp:val=&quot;00B45C6B&quot;/&gt;&lt;wsp:rsid wsp:val=&quot;00B55D5E&quot;/&gt;&lt;wsp:rsid wsp:val=&quot;00B57A80&quot;/&gt;&lt;wsp:rsid wsp:val=&quot;00B70E9C&quot;/&gt;&lt;wsp:rsid wsp:val=&quot;00B713D8&quot;/&gt;&lt;wsp:rsid wsp:val=&quot;00B72979&quot;/&gt;&lt;wsp:rsid wsp:val=&quot;00B94516&quot;/&gt;&lt;wsp:rsid wsp:val=&quot;00BA25E2&quot;/&gt;&lt;wsp:rsid wsp:val=&quot;00BB2855&quot;/&gt;&lt;wsp:rsid wsp:val=&quot;00BC5343&quot;/&gt;&lt;wsp:rsid wsp:val=&quot;00BD19C1&quot;/&gt;&lt;wsp:rsid wsp:val=&quot;00BD25B8&quot;/&gt;&lt;wsp:rsid wsp:val=&quot;00C012E1&quot;/&gt;&lt;wsp:rsid wsp:val=&quot;00C06BB4&quot;/&gt;&lt;wsp:rsid wsp:val=&quot;00C10D20&quot;/&gt;&lt;wsp:rsid wsp:val=&quot;00C12E0C&quot;/&gt;&lt;wsp:rsid wsp:val=&quot;00C21916&quot;/&gt;&lt;wsp:rsid wsp:val=&quot;00C34915&quot;/&gt;&lt;wsp:rsid wsp:val=&quot;00C457CA&quot;/&gt;&lt;wsp:rsid wsp:val=&quot;00C47EAE&quot;/&gt;&lt;wsp:rsid wsp:val=&quot;00C53FB6&quot;/&gt;&lt;wsp:rsid wsp:val=&quot;00C57FB7&quot;/&gt;&lt;wsp:rsid wsp:val=&quot;00C644D4&quot;/&gt;&lt;wsp:rsid wsp:val=&quot;00C65F3F&quot;/&gt;&lt;wsp:rsid wsp:val=&quot;00C72414&quot;/&gt;&lt;wsp:rsid wsp:val=&quot;00C72B1A&quot;/&gt;&lt;wsp:rsid wsp:val=&quot;00C8667B&quot;/&gt;&lt;wsp:rsid wsp:val=&quot;00C90993&quot;/&gt;&lt;wsp:rsid wsp:val=&quot;00CA4CE3&quot;/&gt;&lt;wsp:rsid wsp:val=&quot;00CA5A12&quot;/&gt;&lt;wsp:rsid wsp:val=&quot;00CB4ADD&quot;/&gt;&lt;wsp:rsid wsp:val=&quot;00CC72FD&quot;/&gt;&lt;wsp:rsid wsp:val=&quot;00CD1D23&quot;/&gt;&lt;wsp:rsid wsp:val=&quot;00CD4F3F&quot;/&gt;&lt;wsp:rsid wsp:val=&quot;00D311F8&quot;/&gt;&lt;wsp:rsid wsp:val=&quot;00D31660&quot;/&gt;&lt;wsp:rsid wsp:val=&quot;00D36B52&quot;/&gt;&lt;wsp:rsid wsp:val=&quot;00D377C8&quot;/&gt;&lt;wsp:rsid wsp:val=&quot;00D41274&quot;/&gt;&lt;wsp:rsid wsp:val=&quot;00D4229C&quot;/&gt;&lt;wsp:rsid wsp:val=&quot;00D43BF3&quot;/&gt;&lt;wsp:rsid wsp:val=&quot;00D549FB&quot;/&gt;&lt;wsp:rsid wsp:val=&quot;00D56487&quot;/&gt;&lt;wsp:rsid wsp:val=&quot;00D767BB&quot;/&gt;&lt;wsp:rsid wsp:val=&quot;00D939B0&quot;/&gt;&lt;wsp:rsid wsp:val=&quot;00DA31A2&quot;/&gt;&lt;wsp:rsid wsp:val=&quot;00DB16E0&quot;/&gt;&lt;wsp:rsid wsp:val=&quot;00DB2DF9&quot;/&gt;&lt;wsp:rsid wsp:val=&quot;00DB465D&quot;/&gt;&lt;wsp:rsid wsp:val=&quot;00DB48A2&quot;/&gt;&lt;wsp:rsid wsp:val=&quot;00DB7E63&quot;/&gt;&lt;wsp:rsid wsp:val=&quot;00DC2055&quot;/&gt;&lt;wsp:rsid wsp:val=&quot;00DC3908&quot;/&gt;&lt;wsp:rsid wsp:val=&quot;00DD71E8&quot;/&gt;&lt;wsp:rsid wsp:val=&quot;00DD7F83&quot;/&gt;&lt;wsp:rsid wsp:val=&quot;00DE4EB8&quot;/&gt;&lt;wsp:rsid wsp:val=&quot;00E0641E&quot;/&gt;&lt;wsp:rsid wsp:val=&quot;00E06664&quot;/&gt;&lt;wsp:rsid wsp:val=&quot;00E169D1&quot;/&gt;&lt;wsp:rsid wsp:val=&quot;00E304BC&quot;/&gt;&lt;wsp:rsid wsp:val=&quot;00E32853&quot;/&gt;&lt;wsp:rsid wsp:val=&quot;00E34EBD&quot;/&gt;&lt;wsp:rsid wsp:val=&quot;00E401F8&quot;/&gt;&lt;wsp:rsid wsp:val=&quot;00E46425&quot;/&gt;&lt;wsp:rsid wsp:val=&quot;00E469FC&quot;/&gt;&lt;wsp:rsid wsp:val=&quot;00E474EB&quot;/&gt;&lt;wsp:rsid wsp:val=&quot;00E47D0E&quot;/&gt;&lt;wsp:rsid wsp:val=&quot;00E65018&quot;/&gt;&lt;wsp:rsid wsp:val=&quot;00E76CA1&quot;/&gt;&lt;wsp:rsid wsp:val=&quot;00E94339&quot;/&gt;&lt;wsp:rsid wsp:val=&quot;00E97563&quot;/&gt;&lt;wsp:rsid wsp:val=&quot;00EB0B63&quot;/&gt;&lt;wsp:rsid wsp:val=&quot;00EC265C&quot;/&gt;&lt;wsp:rsid wsp:val=&quot;00ED61CB&quot;/&gt;&lt;wsp:rsid wsp:val=&quot;00EE752A&quot;/&gt;&lt;wsp:rsid wsp:val=&quot;00F06A72&quot;/&gt;&lt;wsp:rsid wsp:val=&quot;00F12D5B&quot;/&gt;&lt;wsp:rsid wsp:val=&quot;00F136F0&quot;/&gt;&lt;wsp:rsid wsp:val=&quot;00F20BBB&quot;/&gt;&lt;wsp:rsid wsp:val=&quot;00F36048&quot;/&gt;&lt;wsp:rsid wsp:val=&quot;00F43BD8&quot;/&gt;&lt;wsp:rsid wsp:val=&quot;00F562F3&quot;/&gt;&lt;wsp:rsid wsp:val=&quot;00F74B89&quot;/&gt;&lt;wsp:rsid wsp:val=&quot;00F75133&quot;/&gt;&lt;wsp:rsid wsp:val=&quot;00F83272&quot;/&gt;&lt;wsp:rsid wsp:val=&quot;00F9358D&quot;/&gt;&lt;wsp:rsid wsp:val=&quot;00F9369B&quot;/&gt;&lt;wsp:rsid wsp:val=&quot;00FA3899&quot;/&gt;&lt;wsp:rsid wsp:val=&quot;00FA4909&quot;/&gt;&lt;wsp:rsid wsp:val=&quot;00FA5164&quot;/&gt;&lt;wsp:rsid wsp:val=&quot;00FA6751&quot;/&gt;&lt;wsp:rsid wsp:val=&quot;00FA6BD7&quot;/&gt;&lt;wsp:rsid wsp:val=&quot;00FB1048&quot;/&gt;&lt;wsp:rsid wsp:val=&quot;00FB62C4&quot;/&gt;&lt;wsp:rsid wsp:val=&quot;00FB7701&quot;/&gt;&lt;wsp:rsid wsp:val=&quot;00FD1AC5&quot;/&gt;&lt;wsp:rsid wsp:val=&quot;00FD5CF0&quot;/&gt;&lt;/wsp:rsids&gt;&lt;/w:docPr&gt;&lt;w:body&gt;&lt;wx:sect&gt;&lt;w:p wsp:rsidR=&quot;00821FE1&quot; wsp:rsidRPr=&quot;00821FE1&quot; wsp:rsidRDefault=&quot;00821FE1&quot; wsp:rsidP=&quot;00821FE1&quot;&gt;&lt;m:oMathPara&gt;&lt;m:oMath&gt;&lt;m:r&gt;&lt;w:rPr&gt;&lt;w:rFonts w:ascii=&quot;Cambria Math&quot; w:fareast=&quot;Calibri&quot; w:h-ansi=&quot;Cambria Math&quot; w:cs=&quot;Arial&quot;/&gt;&lt;wx:font wx:val=&quot;Cambria Math&quot;/&gt;&lt;w:i/&gt;&lt;/w:rPr&gt;&lt;m:t&gt;60mV&lt;/m:t&gt;&lt;/m:r&gt;&lt;/m:oMath&gt;&lt;/m:oMathPara&gt;&lt;/w:p&gt;&lt;w:sectPr wsp:rsidR=&quot;00000000&quot; wsp:rsidRPr=&quot;00821FE1&quot;&gt;&lt;w:pgSz w:w=&quot;12240&quot; w:h=&quot;15840&quot;/&gt;&lt;w:pgMar w:top=&quot;1440&quot; w:right=&quot;1440&quot; w:bottom=&quot;1440&quot; w:left=&quot;1440&quot; w:header=&quot;720&quot; w:footer=&quot;720&quot; w:gutter=&quot;0&quot;/&gt;&lt;w:cols w:space=&quot;720&quot;/&gt;&lt;/w:sectPr&gt;&lt;/wx:sect&gt;&lt;/w:body&gt;&lt;/w:wordDocument&gt;">
+                  <v:imagedata r:id="rId41" o:title="" chromakey="white"/>
+                </v:shape>
+              </w:pict>
+            </w:r>
+          </w:p>
+        </w:tc>
+      </w:tr>
+    </w:tbl>
+    <w:p>
+      <w:pPr>
+        <w:pStyle w:val="IEEEHeading1"/>
+        <w:numPr>
+          <w:ilvl w:val="0"/>
+          <w:numId w:val="5"/>
+        </w:numPr>
+      </w:pPr>
+      <w:r>
+        <w:t>Conclusión</w:t>
+      </w:r>
     </w:p>
     <w:p>
       <w:pPr>
         <w:pStyle w:val="IEEEParagraph"/>
-        <w:rPr>
-          <w:lang w:val="es-AR"/>
-        </w:rPr>
-      </w:pPr>
-      <w:r>
-        <w:rPr>
-          <w:lang w:val="es-AR"/>
-        </w:rPr>
-        <w:t>Con los valores de la tabla anterior procedemos a aplicar una regresión lineal, de tal forma que, nos genere una ecuación lineal que permita corregir los valores obtenidos, y de esta manera lograr una mayor exactitud en la medición.</w:t>
-      </w:r>
+      </w:pPr>
     </w:p>
     <w:p>
       <w:pPr>
         <w:pStyle w:val="IEEEParagraph"/>
-        <w:ind w:firstLine="0"/>
-        <w:jc w:val="left"/>
-      </w:pPr>
+        <w:rPr>
+          <w:lang w:val="es-AR"/>
+        </w:rPr>
+      </w:pPr>
+      <w:r>
+        <w:rPr>
+          <w:lang w:val="es-AR"/>
+        </w:rPr>
+        <w:t xml:space="preserve">La realización de este proyecto resulto altamente didáctica, ya que permitió integrar y aplicar de manera efectiva los conocimientos teóricos y prácticos abordados en la cursada. Esto se vio reflejado especialmente en las pruebas experimentales, donde los resultados obtenidos fueron incluso mejores de lo esperado. </w:t>
+      </w:r>
     </w:p>
     <w:p>
       <w:pPr>
         <w:pStyle w:val="IEEEParagraph"/>
-        <w:jc w:val="left"/>
-      </w:pPr>
+        <w:rPr>
+          <w:lang w:val="es-AR"/>
+        </w:rPr>
+      </w:pPr>
+      <w:r>
+        <w:rPr>
+          <w:lang w:val="es-AR"/>
+        </w:rPr>
+        <w:t>Durante el desarrollo se identificó la posibilidad de incorporar elementos de protección (como un poliswith y/o un diodo TVS), los cuales no se implementaron por cuestiones de tiempo. Siendo estas, mejoras para tener en cuenta en futuras versiones del proyecto.</w:t>
+      </w:r>
     </w:p>
     <w:p>
       <w:pPr>
@@ -3527,440 +4278,22 @@
         <w:rPr>
           <w:lang w:val="es-AR"/>
         </w:rPr>
-        <w:t xml:space="preserve">Aplicando la corrección mencionada en el punto anterior, pasamos ahora a realizar el </w:t>
-      </w:r>
-      <w:proofErr w:type="spellStart"/>
-      <w:r>
-        <w:rPr>
-          <w:lang w:val="es-AR"/>
-        </w:rPr>
-        <w:t>c</w:t>
-      </w:r>
-      <w:r>
-        <w:rPr>
-          <w:lang w:val="es-AR"/>
-        </w:rPr>
-        <w:t>alcul</w:t>
-      </w:r>
-      <w:r>
-        <w:rPr>
-          <w:lang w:val="es-AR"/>
-        </w:rPr>
-        <w:t>o</w:t>
-      </w:r>
-      <w:proofErr w:type="spellEnd"/>
-      <w:r>
-        <w:rPr>
-          <w:lang w:val="es-AR"/>
-        </w:rPr>
-        <w:t xml:space="preserve"> de</w:t>
-      </w:r>
-      <w:r>
-        <w:rPr>
-          <w:lang w:val="es-AR"/>
-        </w:rPr>
-        <w:t xml:space="preserve"> ince</w:t>
-      </w:r>
-      <w:r>
-        <w:rPr>
-          <w:lang w:val="es-AR"/>
-        </w:rPr>
-        <w:t>r</w:t>
-      </w:r>
-      <w:r>
-        <w:rPr>
-          <w:lang w:val="es-AR"/>
-        </w:rPr>
-        <w:t xml:space="preserve">tidumbre, realizando varias mediciones a fondo de escala del instrumento. En nuestro caso </w:t>
-      </w:r>
-      <w:proofErr w:type="spellStart"/>
-      <w:r>
-        <w:rPr>
-          <w:lang w:val="es-AR"/>
-        </w:rPr>
-        <w:t>temenos</w:t>
-      </w:r>
-      <w:proofErr w:type="spellEnd"/>
-      <w:r>
-        <w:rPr>
-          <w:lang w:val="es-AR"/>
-        </w:rPr>
-        <w:t xml:space="preserve"> una escala de 100mV y otra de 1000 mV. A </w:t>
-      </w:r>
-      <w:proofErr w:type="gramStart"/>
-      <w:r>
-        <w:rPr>
-          <w:lang w:val="es-AR"/>
-        </w:rPr>
-        <w:t>continuación</w:t>
-      </w:r>
-      <w:proofErr w:type="gramEnd"/>
-      <w:r>
-        <w:rPr>
-          <w:lang w:val="es-AR"/>
-        </w:rPr>
-        <w:t xml:space="preserve"> se presentamos las mediciones obtenidas y el c</w:t>
-      </w:r>
-      <w:r>
-        <w:rPr>
-          <w:lang w:val="es-AR"/>
-        </w:rPr>
-        <w:t>ál</w:t>
-      </w:r>
-      <w:r>
-        <w:rPr>
-          <w:lang w:val="es-AR"/>
-        </w:rPr>
-        <w:t xml:space="preserve">culo de sus </w:t>
-      </w:r>
-      <w:proofErr w:type="spellStart"/>
-      <w:r>
-        <w:rPr>
-          <w:lang w:val="es-AR"/>
-        </w:rPr>
-        <w:t>insertidumbres</w:t>
-      </w:r>
-      <w:proofErr w:type="spellEnd"/>
-      <w:r>
-        <w:rPr>
-          <w:lang w:val="es-AR"/>
-        </w:rPr>
-        <w:t>:</w:t>
+        <w:t>Asimismo, el trabajo en equipo fue clave para alcanzar los objetivos, con una correcta división de tareas y colaboración constante entre los integrantes.</w:t>
       </w:r>
     </w:p>
     <w:p>
       <w:pPr>
         <w:pStyle w:val="IEEEParagraph"/>
-        <w:jc w:val="left"/>
-        <w:rPr>
-          <w:lang w:val="es-AR"/>
-        </w:rPr>
-      </w:pPr>
-    </w:p>
-    <w:p>
-      <w:pPr>
-        <w:pStyle w:val="IEEEParagraph"/>
-        <w:jc w:val="center"/>
-      </w:pPr>
-    </w:p>
-    <w:p>
-      <w:pPr>
-        <w:pStyle w:val="IEEEParagraph"/>
-        <w:jc w:val="center"/>
-      </w:pPr>
-    </w:p>
-    <w:p>
-      <w:pPr>
-        <w:pStyle w:val="IEEEParagraph"/>
-        <w:jc w:val="center"/>
-      </w:pPr>
-    </w:p>
-    <w:p>
-      <w:pPr>
-        <w:pStyle w:val="IEEEParagraph"/>
-      </w:pPr>
-    </w:p>
-    <w:p>
-      <w:pPr>
-        <w:pStyle w:val="IEEEParagraph"/>
-        <w:rPr>
-          <w:lang w:val="es-AR"/>
-        </w:rPr>
-      </w:pPr>
-      <w:r>
-        <w:rPr>
-          <w:lang w:val="es-AR"/>
-        </w:rPr>
-        <w:t>Ahora pasamos realizar un an</w:t>
-      </w:r>
-      <w:r>
-        <w:rPr>
-          <w:lang w:val="es-AR"/>
-        </w:rPr>
-        <w:t>á</w:t>
-      </w:r>
-      <w:r>
-        <w:rPr>
-          <w:lang w:val="es-AR"/>
-        </w:rPr>
-        <w:t xml:space="preserve">lisis </w:t>
-      </w:r>
-      <w:proofErr w:type="spellStart"/>
-      <w:r>
-        <w:rPr>
-          <w:lang w:val="es-AR"/>
-        </w:rPr>
-        <w:t>spectral</w:t>
-      </w:r>
-      <w:proofErr w:type="spellEnd"/>
-      <w:r>
-        <w:rPr>
-          <w:lang w:val="es-AR"/>
-        </w:rPr>
-        <w:t xml:space="preserve">, teniendo en cuenta que el dispositivo está diseñado para la medición de señales, tanto periódicas como aperiódicas. Se llevaron a cabo pruebas utilizando señales de formas conocidas (senoidal, cuadrada y triangular) con el propósito de caracterizar la respuesta en frecuencia. Este análisis permite comprender el comportamiento y la variación de la tensión en función de la frecuencia. Con estos resultados, podemos determinar el ancho de banda efectivo en el cual las mediciones de tensión </w:t>
-      </w:r>
-      <w:r>
-        <w:rPr>
-          <w:lang w:val="es-AR"/>
-        </w:rPr>
-        <w:t>son consistentes. Las mediciones se realizaron utilizando una tensión de entrada de 100 mV para cada una de las señales mencionadas y abarcando un rango de frecuencias desde 1 Hz hasta 100 kHz.</w:t>
-      </w:r>
-    </w:p>
-    <w:p>
-      <w:pPr>
-        <w:pStyle w:val="IEEEParagraph"/>
-        <w:rPr>
-          <w:lang w:val="es-AR"/>
-        </w:rPr>
-      </w:pPr>
-    </w:p>
-    <w:p>
-      <w:pPr>
-        <w:pStyle w:val="IEEEParagraph"/>
-        <w:ind w:firstLine="0"/>
-        <w:jc w:val="center"/>
-      </w:pPr>
-    </w:p>
-    <w:p>
-      <w:pPr>
-        <w:pStyle w:val="IEEEParagraph"/>
-        <w:ind w:firstLine="0"/>
-        <w:rPr>
-          <w:lang w:val="es-AR"/>
-        </w:rPr>
-      </w:pPr>
-      <w:r>
-        <w:rPr>
-          <w:lang w:val="es-AR"/>
-        </w:rPr>
-        <w:t xml:space="preserve">De la table anterior, obtenemos su correspondiente gráfico de la </w:t>
-      </w:r>
-      <w:proofErr w:type="spellStart"/>
-      <w:r>
-        <w:rPr>
-          <w:lang w:val="es-AR"/>
-        </w:rPr>
-        <w:t>tesión</w:t>
-      </w:r>
-      <w:proofErr w:type="spellEnd"/>
-      <w:r>
-        <w:rPr>
-          <w:lang w:val="es-AR"/>
-        </w:rPr>
-        <w:t xml:space="preserve"> en función de la frecu</w:t>
-      </w:r>
-      <w:r>
-        <w:rPr>
-          <w:lang w:val="es-AR"/>
-        </w:rPr>
-        <w:t>e</w:t>
-      </w:r>
-      <w:r>
-        <w:rPr>
-          <w:lang w:val="es-AR"/>
-        </w:rPr>
-        <w:t>ncia:</w:t>
-      </w:r>
-    </w:p>
-    <w:p>
-      <w:pPr>
-        <w:pStyle w:val="IEEEParagraph"/>
-        <w:ind w:firstLine="0"/>
-        <w:jc w:val="center"/>
-      </w:pPr>
-    </w:p>
-    <w:p>
-      <w:pPr>
-        <w:pStyle w:val="IEEEParagraph"/>
-        <w:ind w:firstLine="0"/>
-        <w:jc w:val="center"/>
-        <w:rPr>
-          <w:lang w:val="es-AR"/>
-        </w:rPr>
-      </w:pPr>
-      <w:r>
-        <w:rPr>
-          <w:b/>
-          <w:bCs/>
-          <w:lang w:val="es-AR"/>
-        </w:rPr>
-        <w:t>Rango de Frecuencia</w:t>
-      </w:r>
-      <w:r>
-        <w:rPr>
-          <w:lang w:val="es-AR"/>
-        </w:rPr>
-        <w:t>: 100 Hz a 5 kHz</w:t>
-      </w:r>
-    </w:p>
-    <w:p>
-      <w:pPr>
-        <w:pStyle w:val="IEEEParagraph"/>
-        <w:ind w:firstLine="0"/>
-        <w:jc w:val="center"/>
-        <w:rPr>
-          <w:lang w:val="es-AR"/>
-        </w:rPr>
-      </w:pPr>
-    </w:p>
-    <w:p>
-      <w:pPr>
-        <w:pStyle w:val="IEEEParagraph"/>
-        <w:ind w:firstLine="0"/>
-        <w:rPr>
-          <w:lang w:val="es-AR"/>
-        </w:rPr>
-      </w:pPr>
-      <w:r>
-        <w:rPr>
-          <w:lang w:val="es-AR"/>
-        </w:rPr>
-        <w:t xml:space="preserve">Una vez de haber corregido, </w:t>
-      </w:r>
-      <w:proofErr w:type="spellStart"/>
-      <w:r>
-        <w:rPr>
-          <w:lang w:val="es-AR"/>
-        </w:rPr>
-        <w:t>cálculado</w:t>
-      </w:r>
-      <w:proofErr w:type="spellEnd"/>
-      <w:r>
-        <w:rPr>
-          <w:lang w:val="es-AR"/>
-        </w:rPr>
-        <w:t xml:space="preserve"> la incertidumbre de cada escala y determinado el </w:t>
-      </w:r>
-      <w:proofErr w:type="spellStart"/>
-      <w:r>
-        <w:rPr>
-          <w:lang w:val="es-AR"/>
-        </w:rPr>
-        <w:t>rago</w:t>
-      </w:r>
-      <w:proofErr w:type="spellEnd"/>
-      <w:r>
-        <w:rPr>
-          <w:lang w:val="es-AR"/>
-        </w:rPr>
-        <w:t xml:space="preserve"> de frecuencia, pasamos a verificar mediciones en los extremos de frecuencia para valores intermedios de </w:t>
-      </w:r>
-      <w:proofErr w:type="spellStart"/>
-      <w:r>
-        <w:rPr>
-          <w:lang w:val="es-AR"/>
-        </w:rPr>
-        <w:t>tension</w:t>
-      </w:r>
-      <w:proofErr w:type="spellEnd"/>
-      <w:r>
-        <w:rPr>
-          <w:lang w:val="es-AR"/>
-        </w:rPr>
-        <w:t xml:space="preserve"> y para las tres señ</w:t>
-      </w:r>
-      <w:r>
-        <w:rPr>
-          <w:lang w:val="es-AR"/>
-        </w:rPr>
-        <w:t>a</w:t>
-      </w:r>
-      <w:r>
-        <w:rPr>
-          <w:lang w:val="es-AR"/>
-        </w:rPr>
-        <w:t>les periódicas:</w:t>
-      </w:r>
-    </w:p>
-    <w:p>
-      <w:pPr>
-        <w:pStyle w:val="IEEEParagraph"/>
-        <w:ind w:firstLine="0"/>
-        <w:rPr>
-          <w:lang w:val="es-AR"/>
-        </w:rPr>
-      </w:pPr>
-    </w:p>
-    <w:p>
-      <w:pPr>
-        <w:pStyle w:val="IEEEParagraph"/>
-        <w:ind w:firstLine="0"/>
-        <w:jc w:val="center"/>
-      </w:pPr>
-    </w:p>
-    <w:p>
-      <w:pPr>
-        <w:pStyle w:val="IEEEParagraph"/>
-        <w:ind w:firstLine="0"/>
-        <w:jc w:val="center"/>
-      </w:pPr>
-    </w:p>
-    <w:p>
-      <w:pPr>
-        <w:pStyle w:val="IEEEParagraph"/>
-        <w:ind w:firstLine="0"/>
-        <w:jc w:val="left"/>
-      </w:pPr>
-    </w:p>
-    <w:p>
-      <w:pPr>
-        <w:pStyle w:val="IEEEParagraph"/>
-        <w:ind w:firstLine="0"/>
-        <w:jc w:val="left"/>
-      </w:pPr>
-    </w:p>
-    <w:p>
-      <w:pPr>
-        <w:pStyle w:val="IEEEParagraph"/>
-        <w:ind w:firstLine="0"/>
-        <w:rPr>
-          <w:lang w:val="es-AR"/>
-        </w:rPr>
-      </w:pPr>
-      <w:r>
-        <w:rPr>
-          <w:lang w:val="es-AR"/>
-        </w:rPr>
-        <w:t>La tabla anterior se puede verificar los errores</w:t>
-      </w:r>
-      <w:r>
-        <w:rPr>
-          <w:lang w:val="es-AR"/>
-        </w:rPr>
-        <w:t xml:space="preserve"> relativos de la medición están dentro de las especificaciones obtenidas en la calibración.</w:t>
-      </w:r>
-    </w:p>
-    <w:p>
-      <w:pPr>
-        <w:pStyle w:val="IEEEHeading1"/>
-      </w:pPr>
-      <w:proofErr w:type="spellStart"/>
-      <w:r>
-        <w:t>Conclusión</w:t>
-      </w:r>
-      <w:proofErr w:type="spellEnd"/>
-    </w:p>
-    <w:p>
-      <w:pPr>
-        <w:pStyle w:val="IEEEParagraph"/>
-        <w:rPr>
-          <w:lang w:val="es-AR"/>
-        </w:rPr>
-      </w:pPr>
-      <w:r>
-        <w:rPr>
-          <w:lang w:val="es-AR"/>
-        </w:rPr>
-        <w:t>Tras completar las pruebas exhaustivas y calibraciones necesarias para verificar la eficacia del instrumento desarrollado, se confirma que se lograron los objetivos establecidos inicialmente. El equipo demostró ser altamente confiable y preciso en la medición del RMS de cualquier señal, cumpliendo con los estándares requeridos para su aplicación en como voltímetro digital.</w:t>
-      </w:r>
-    </w:p>
-    <w:p>
-      <w:pPr>
-        <w:pStyle w:val="IEEEParagraph"/>
-        <w:rPr>
-          <w:lang w:val="es-AR"/>
-        </w:rPr>
-      </w:pPr>
+        <w:rPr>
+          <w:lang w:val="es-AR"/>
+        </w:rPr>
+      </w:pPr>
+      <w:r>
+        <w:rPr>
+          <w:lang w:val="es-AR"/>
+        </w:rPr>
+        <w:t>En definitiva, el proyecto no solo permitió cumplir con los objetivos académicos propuestos, sino que también despertó interés por seguir diseñando otras topologías de fuentes conmutadas, aplicando el mismo enfoque sistemático de análisis, diseño, simulación e implementación.</w:t>
+      </w:r>
     </w:p>
     <w:p>
       <w:pPr>
@@ -3970,62 +4303,63 @@
           <w:numId w:val="0"/>
         </w:numPr>
       </w:pPr>
-      <w:proofErr w:type="spellStart"/>
-      <w:r>
-        <w:t>Ref</w:t>
-      </w:r>
-      <w:r>
-        <w:t>erencias</w:t>
-      </w:r>
-      <w:proofErr w:type="spellEnd"/>
+      <w:r>
+        <w:t>Referencias</w:t>
+      </w:r>
     </w:p>
     <w:p>
       <w:pPr>
         <w:pStyle w:val="IEEEReferenceItem"/>
       </w:pPr>
       <w:r>
-        <w:t>AN-268 Application Note—RMS-to-DC Converters Ease Measurement Tasks</w:t>
-      </w:r>
-    </w:p>
-    <w:p>
-      <w:pPr>
-        <w:pStyle w:val="IEEEReferenceItem"/>
-      </w:pPr>
-      <w:r>
-        <w:t>Appendix D October 2002 New Products Appendix to the RMS to DC Conversion Application Guide</w:t>
-      </w:r>
-      <w:r>
-        <w:t>.</w:t>
-      </w:r>
-    </w:p>
-    <w:p>
-      <w:pPr>
-        <w:pStyle w:val="IEEEReferenceItem"/>
-        <w:jc w:val="left"/>
-      </w:pPr>
-      <w:r>
-        <w:rPr>
-          <w:lang w:val="en-AU"/>
-        </w:rPr>
-        <w:t>Datasheet del AD736 de Analog Devices [</w:t>
-      </w:r>
-      <w:hyperlink r:id="rId34" w:history="1">
+        <w:t xml:space="preserve">Hoja de datos del integrado: </w:t>
+      </w:r>
+      <w:hyperlink r:id="rId42" w:history="1">
         <w:r>
           <w:rPr>
             <w:rStyle w:val="Hipervnculo"/>
           </w:rPr>
-          <w:t>AD736.pdf (analog.com)</w:t>
+          <w:t>MC34063A - Inverting Regulator - Buck, Boost, Switching 1.5 A</w:t>
         </w:r>
       </w:hyperlink>
-      <w:r>
-        <w:rPr>
-          <w:lang w:val="en-AU"/>
-        </w:rPr>
-        <w:t>]</w:t>
-      </w:r>
-      <w:r>
-        <w:t>.</w:t>
-      </w:r>
+    </w:p>
+    <w:p>
+      <w:pPr>
+        <w:pStyle w:val="IEEEReferenceItem"/>
+      </w:pPr>
+      <w:r>
+        <w:t xml:space="preserve">Repositorio GitHub: </w:t>
+      </w:r>
+      <w:hyperlink r:id="rId43" w:history="1">
+        <w:r>
+          <w:rPr>
+            <w:rStyle w:val="Hipervnculo"/>
+          </w:rPr>
+          <w:t>Proyecto-G2-EDP-R5053-2025</w:t>
+        </w:r>
+      </w:hyperlink>
+    </w:p>
+    <w:p>
+      <w:pPr>
+        <w:pStyle w:val="IEEEReferenceItem"/>
+      </w:pPr>
+      <w:r>
+        <w:t>Informe</w:t>
+      </w:r>
+      <w:r>
+        <w:t xml:space="preserve"> en formato cuaderno</w:t>
+      </w:r>
+      <w:r>
+        <w:t xml:space="preserve">: </w:t>
+      </w:r>
+      <w:hyperlink r:id="rId44" w:history="1">
+        <w:r>
+          <w:rPr>
+            <w:rStyle w:val="Hipervnculo"/>
+          </w:rPr>
+          <w:t>Jupyter Notebook Viewer</w:t>
+        </w:r>
+      </w:hyperlink>
     </w:p>
     <w:p>
       <w:pPr>
@@ -4035,41 +4369,9 @@
           <w:numId w:val="0"/>
         </w:numPr>
         <w:ind w:left="432" w:hanging="432"/>
-      </w:pPr>
-      <w:r>
-        <w:t>[4]</w:t>
-      </w:r>
-      <w:r>
-        <w:tab/>
-      </w:r>
-      <w:r>
-        <w:t xml:space="preserve">Arduino </w:t>
-      </w:r>
-      <w:r>
-        <w:t>documentation</w:t>
-      </w:r>
-      <w:r>
-        <w:t xml:space="preserve">: </w:t>
-      </w:r>
-      <w:hyperlink r:id="rId35" w:history="1">
-        <w:r>
-          <w:rPr>
-            <w:rStyle w:val="Hipervnculo"/>
-          </w:rPr>
-          <w:t>A000066-datasheet.pdf (arduino.cc)</w:t>
-        </w:r>
-      </w:hyperlink>
-      <w:r>
-        <w:t>.</w:t>
-      </w:r>
-    </w:p>
-    <w:p>
-      <w:pPr>
-        <w:pStyle w:val="IEEEReferenceItem"/>
-        <w:numPr>
-          <w:ilvl w:val="0"/>
-          <w:numId w:val="0"/>
-        </w:numPr>
+        <w:rPr>
+          <w:lang w:val="es-AR"/>
+        </w:rPr>
         <w:sectPr>
           <w:type w:val="continuous"/>
           <w:pgSz w:w="11906" w:h="16838"/>
@@ -4079,35 +4381,45 @@
         </w:sectPr>
       </w:pPr>
       <w:r>
-        <w:t xml:space="preserve">[5]   6½-Digit USB Digital Multimeter  </w:t>
-      </w:r>
-      <w:hyperlink r:id="rId36" w:history="1">
+        <w:rPr>
+          <w:lang w:val="es-AR"/>
+        </w:rPr>
+        <w:t>[4]</w:t>
+      </w:r>
+      <w:r>
+        <w:rPr>
+          <w:lang w:val="es-AR"/>
+        </w:rPr>
+        <w:tab/>
+        <w:t xml:space="preserve">Video demostrativo: </w:t>
+      </w:r>
+      <w:hyperlink r:id="rId45" w:history="1">
         <w:r>
           <w:rPr>
             <w:rStyle w:val="Hipervnculo"/>
+            <w:lang w:val="es-AR"/>
           </w:rPr>
-          <w:t>KEITHEL-2100</w:t>
+          <w:t>https://www.youtube.com/embed/OiL7ilHiBNU</w:t>
         </w:r>
       </w:hyperlink>
       <w:r>
-        <w:t xml:space="preserve"> &amp; </w:t>
-      </w:r>
-      <w:hyperlink r:id="rId37" w:history="1">
-        <w:r>
-          <w:rPr>
-            <w:rStyle w:val="Hipervnculo"/>
-          </w:rPr>
-          <w:t>MANUAL</w:t>
-        </w:r>
-      </w:hyperlink>
-    </w:p>
-    <w:p>
-      <w:pPr>
-        <w:pStyle w:val="IEEEReferenceItem"/>
+        <w:rPr>
+          <w:lang w:val="es-AR"/>
+        </w:rPr>
+        <w:t xml:space="preserve"> </w:t>
+      </w:r>
+    </w:p>
+    <w:p>
+      <w:pPr>
+        <w:pStyle w:val="IEEEHeading1"/>
         <w:numPr>
           <w:ilvl w:val="0"/>
           <w:numId w:val="0"/>
         </w:numPr>
+        <w:jc w:val="left"/>
+        <w:rPr>
+          <w:lang w:val="es-AR"/>
+        </w:rPr>
       </w:pPr>
     </w:p>
     <w:sectPr>
@@ -4188,7 +4500,7 @@
           <v:path o:extrusionok="f" gradientshapeok="t" o:connecttype="rect"/>
           <o:lock v:ext="edit" aspectratio="t"/>
         </v:shapetype>
-        <v:shape id="_x0000_i1025" type="#_x0000_t75" style="width:97.1pt;height:42pt">
+        <v:shape id="_x0000_i1025" type="#_x0000_t75" style="width:96.9pt;height:41.55pt">
           <v:imagedata r:id="rId1" o:title="LogoElectronicaSinFondo-transformed"/>
         </v:shape>
       </w:pict>
@@ -4209,7 +4521,7 @@
   <w:abstractNum w:abstractNumId="0" w15:restartNumberingAfterBreak="0">
     <w:nsid w:val="023E2E4D"/>
     <w:multiLevelType w:val="multilevel"/>
-    <w:tmpl w:val="129C5206"/>
+    <w:tmpl w:val="2AB863F8"/>
     <w:lvl w:ilvl="0">
       <w:start w:val="1"/>
       <w:numFmt w:val="upperRoman"/>
@@ -4253,17 +4565,8 @@
       <w:lvlText w:val="%2."/>
       <w:lvlJc w:val="left"/>
       <w:pPr>
-        <w:tabs>
-          <w:tab w:val="num" w:pos="288"/>
-        </w:tabs>
-        <w:ind w:left="288" w:hanging="288"/>
-      </w:pPr>
-      <w:rPr>
-        <w:rFonts w:ascii="Times New Roman" w:hAnsi="Times New Roman" w:hint="default"/>
-        <w:b w:val="0"/>
-        <w:i w:val="0"/>
-        <w:sz w:val="20"/>
-      </w:rPr>
+        <w:ind w:left="360" w:hanging="360"/>
+      </w:pPr>
     </w:lvl>
     <w:lvl w:ilvl="2">
       <w:start w:val="1"/>
@@ -4372,6 +4675,92 @@
     </w:lvl>
   </w:abstractNum>
   <w:abstractNum w:abstractNumId="1" w15:restartNumberingAfterBreak="0">
+    <w:nsid w:val="1F373918"/>
+    <w:multiLevelType w:val="hybridMultilevel"/>
+    <w:tmpl w:val="3E5CD2FA"/>
+    <w:lvl w:ilvl="0" w:tplc="2C0A0015">
+      <w:start w:val="1"/>
+      <w:numFmt w:val="upperLetter"/>
+      <w:lvlText w:val="%1."/>
+      <w:lvlJc w:val="left"/>
+      <w:pPr>
+        <w:ind w:left="720" w:hanging="360"/>
+      </w:pPr>
+    </w:lvl>
+    <w:lvl w:ilvl="1" w:tplc="2C0A0019" w:tentative="1">
+      <w:start w:val="1"/>
+      <w:numFmt w:val="lowerLetter"/>
+      <w:lvlText w:val="%2."/>
+      <w:lvlJc w:val="left"/>
+      <w:pPr>
+        <w:ind w:left="1440" w:hanging="360"/>
+      </w:pPr>
+    </w:lvl>
+    <w:lvl w:ilvl="2" w:tplc="2C0A001B" w:tentative="1">
+      <w:start w:val="1"/>
+      <w:numFmt w:val="lowerRoman"/>
+      <w:lvlText w:val="%3."/>
+      <w:lvlJc w:val="right"/>
+      <w:pPr>
+        <w:ind w:left="2160" w:hanging="180"/>
+      </w:pPr>
+    </w:lvl>
+    <w:lvl w:ilvl="3" w:tplc="2C0A000F" w:tentative="1">
+      <w:start w:val="1"/>
+      <w:numFmt w:val="decimal"/>
+      <w:lvlText w:val="%4."/>
+      <w:lvlJc w:val="left"/>
+      <w:pPr>
+        <w:ind w:left="2880" w:hanging="360"/>
+      </w:pPr>
+    </w:lvl>
+    <w:lvl w:ilvl="4" w:tplc="2C0A0019" w:tentative="1">
+      <w:start w:val="1"/>
+      <w:numFmt w:val="lowerLetter"/>
+      <w:lvlText w:val="%5."/>
+      <w:lvlJc w:val="left"/>
+      <w:pPr>
+        <w:ind w:left="3600" w:hanging="360"/>
+      </w:pPr>
+    </w:lvl>
+    <w:lvl w:ilvl="5" w:tplc="2C0A001B" w:tentative="1">
+      <w:start w:val="1"/>
+      <w:numFmt w:val="lowerRoman"/>
+      <w:lvlText w:val="%6."/>
+      <w:lvlJc w:val="right"/>
+      <w:pPr>
+        <w:ind w:left="4320" w:hanging="180"/>
+      </w:pPr>
+    </w:lvl>
+    <w:lvl w:ilvl="6" w:tplc="2C0A000F" w:tentative="1">
+      <w:start w:val="1"/>
+      <w:numFmt w:val="decimal"/>
+      <w:lvlText w:val="%7."/>
+      <w:lvlJc w:val="left"/>
+      <w:pPr>
+        <w:ind w:left="5040" w:hanging="360"/>
+      </w:pPr>
+    </w:lvl>
+    <w:lvl w:ilvl="7" w:tplc="2C0A0019" w:tentative="1">
+      <w:start w:val="1"/>
+      <w:numFmt w:val="lowerLetter"/>
+      <w:lvlText w:val="%8."/>
+      <w:lvlJc w:val="left"/>
+      <w:pPr>
+        <w:ind w:left="5760" w:hanging="360"/>
+      </w:pPr>
+    </w:lvl>
+    <w:lvl w:ilvl="8" w:tplc="2C0A001B" w:tentative="1">
+      <w:start w:val="1"/>
+      <w:numFmt w:val="lowerRoman"/>
+      <w:lvlText w:val="%9."/>
+      <w:lvlJc w:val="right"/>
+      <w:pPr>
+        <w:ind w:left="6480" w:hanging="180"/>
+      </w:pPr>
+    </w:lvl>
+  </w:abstractNum>
+  <w:abstractNum w:abstractNumId="2" w15:restartNumberingAfterBreak="0">
     <w:nsid w:val="2B855861"/>
     <w:multiLevelType w:val="multilevel"/>
     <w:tmpl w:val="6380B6B8"/>
@@ -4513,7 +4902,7 @@
       </w:rPr>
     </w:lvl>
   </w:abstractNum>
-  <w:abstractNum w:abstractNumId="2" w15:restartNumberingAfterBreak="0">
+  <w:abstractNum w:abstractNumId="3" w15:restartNumberingAfterBreak="0">
     <w:nsid w:val="4A6A0670"/>
     <w:multiLevelType w:val="multilevel"/>
     <w:tmpl w:val="9C8E938C"/>
@@ -4658,7 +5047,120 @@
       </w:rPr>
     </w:lvl>
   </w:abstractNum>
-  <w:abstractNum w:abstractNumId="3" w15:restartNumberingAfterBreak="0">
+  <w:abstractNum w:abstractNumId="4" w15:restartNumberingAfterBreak="0">
+    <w:nsid w:val="4E915244"/>
+    <w:multiLevelType w:val="hybridMultilevel"/>
+    <w:tmpl w:val="7C567BA0"/>
+    <w:lvl w:ilvl="0" w:tplc="2C0A0001">
+      <w:start w:val="1"/>
+      <w:numFmt w:val="bullet"/>
+      <w:lvlText w:val=""/>
+      <w:lvlJc w:val="left"/>
+      <w:pPr>
+        <w:ind w:left="720" w:hanging="360"/>
+      </w:pPr>
+      <w:rPr>
+        <w:rFonts w:ascii="Symbol" w:hAnsi="Symbol" w:hint="default"/>
+      </w:rPr>
+    </w:lvl>
+    <w:lvl w:ilvl="1" w:tplc="2C0A0003" w:tentative="1">
+      <w:start w:val="1"/>
+      <w:numFmt w:val="bullet"/>
+      <w:lvlText w:val="o"/>
+      <w:lvlJc w:val="left"/>
+      <w:pPr>
+        <w:ind w:left="1440" w:hanging="360"/>
+      </w:pPr>
+      <w:rPr>
+        <w:rFonts w:ascii="Courier New" w:hAnsi="Courier New" w:cs="Courier New" w:hint="default"/>
+      </w:rPr>
+    </w:lvl>
+    <w:lvl w:ilvl="2" w:tplc="2C0A0005" w:tentative="1">
+      <w:start w:val="1"/>
+      <w:numFmt w:val="bullet"/>
+      <w:lvlText w:val=""/>
+      <w:lvlJc w:val="left"/>
+      <w:pPr>
+        <w:ind w:left="2160" w:hanging="360"/>
+      </w:pPr>
+      <w:rPr>
+        <w:rFonts w:ascii="Wingdings" w:hAnsi="Wingdings" w:hint="default"/>
+      </w:rPr>
+    </w:lvl>
+    <w:lvl w:ilvl="3" w:tplc="2C0A0001" w:tentative="1">
+      <w:start w:val="1"/>
+      <w:numFmt w:val="bullet"/>
+      <w:lvlText w:val=""/>
+      <w:lvlJc w:val="left"/>
+      <w:pPr>
+        <w:ind w:left="2880" w:hanging="360"/>
+      </w:pPr>
+      <w:rPr>
+        <w:rFonts w:ascii="Symbol" w:hAnsi="Symbol" w:hint="default"/>
+      </w:rPr>
+    </w:lvl>
+    <w:lvl w:ilvl="4" w:tplc="2C0A0003" w:tentative="1">
+      <w:start w:val="1"/>
+      <w:numFmt w:val="bullet"/>
+      <w:lvlText w:val="o"/>
+      <w:lvlJc w:val="left"/>
+      <w:pPr>
+        <w:ind w:left="3600" w:hanging="360"/>
+      </w:pPr>
+      <w:rPr>
+        <w:rFonts w:ascii="Courier New" w:hAnsi="Courier New" w:cs="Courier New" w:hint="default"/>
+      </w:rPr>
+    </w:lvl>
+    <w:lvl w:ilvl="5" w:tplc="2C0A0005" w:tentative="1">
+      <w:start w:val="1"/>
+      <w:numFmt w:val="bullet"/>
+      <w:lvlText w:val=""/>
+      <w:lvlJc w:val="left"/>
+      <w:pPr>
+        <w:ind w:left="4320" w:hanging="360"/>
+      </w:pPr>
+      <w:rPr>
+        <w:rFonts w:ascii="Wingdings" w:hAnsi="Wingdings" w:hint="default"/>
+      </w:rPr>
+    </w:lvl>
+    <w:lvl w:ilvl="6" w:tplc="2C0A0001" w:tentative="1">
+      <w:start w:val="1"/>
+      <w:numFmt w:val="bullet"/>
+      <w:lvlText w:val=""/>
+      <w:lvlJc w:val="left"/>
+      <w:pPr>
+        <w:ind w:left="5040" w:hanging="360"/>
+      </w:pPr>
+      <w:rPr>
+        <w:rFonts w:ascii="Symbol" w:hAnsi="Symbol" w:hint="default"/>
+      </w:rPr>
+    </w:lvl>
+    <w:lvl w:ilvl="7" w:tplc="2C0A0003" w:tentative="1">
+      <w:start w:val="1"/>
+      <w:numFmt w:val="bullet"/>
+      <w:lvlText w:val="o"/>
+      <w:lvlJc w:val="left"/>
+      <w:pPr>
+        <w:ind w:left="5760" w:hanging="360"/>
+      </w:pPr>
+      <w:rPr>
+        <w:rFonts w:ascii="Courier New" w:hAnsi="Courier New" w:cs="Courier New" w:hint="default"/>
+      </w:rPr>
+    </w:lvl>
+    <w:lvl w:ilvl="8" w:tplc="2C0A0005" w:tentative="1">
+      <w:start w:val="1"/>
+      <w:numFmt w:val="bullet"/>
+      <w:lvlText w:val=""/>
+      <w:lvlJc w:val="left"/>
+      <w:pPr>
+        <w:ind w:left="6480" w:hanging="360"/>
+      </w:pPr>
+      <w:rPr>
+        <w:rFonts w:ascii="Wingdings" w:hAnsi="Wingdings" w:hint="default"/>
+      </w:rPr>
+    </w:lvl>
+  </w:abstractNum>
+  <w:abstractNum w:abstractNumId="5" w15:restartNumberingAfterBreak="0">
     <w:nsid w:val="50232215"/>
     <w:multiLevelType w:val="multilevel"/>
     <w:tmpl w:val="3D5EA5BC"/>
@@ -4823,7 +5325,7 @@
       </w:rPr>
     </w:lvl>
   </w:abstractNum>
-  <w:abstractNum w:abstractNumId="4" w15:restartNumberingAfterBreak="0">
+  <w:abstractNum w:abstractNumId="6" w15:restartNumberingAfterBreak="0">
     <w:nsid w:val="59205E17"/>
     <w:multiLevelType w:val="hybridMultilevel"/>
     <w:tmpl w:val="EAB4AE50"/>
@@ -4936,7 +5438,7 @@
       </w:rPr>
     </w:lvl>
   </w:abstractNum>
-  <w:abstractNum w:abstractNumId="5" w15:restartNumberingAfterBreak="0">
+  <w:abstractNum w:abstractNumId="7" w15:restartNumberingAfterBreak="0">
     <w:nsid w:val="5B2E3DEE"/>
     <w:multiLevelType w:val="hybridMultilevel"/>
     <w:tmpl w:val="2238274A"/>
@@ -5049,7 +5551,7 @@
       </w:rPr>
     </w:lvl>
   </w:abstractNum>
-  <w:abstractNum w:abstractNumId="6" w15:restartNumberingAfterBreak="0">
+  <w:abstractNum w:abstractNumId="8" w15:restartNumberingAfterBreak="0">
     <w:nsid w:val="5B8A0388"/>
     <w:multiLevelType w:val="hybridMultilevel"/>
     <w:tmpl w:val="501CA722"/>
@@ -5162,7 +5664,7 @@
       </w:rPr>
     </w:lvl>
   </w:abstractNum>
-  <w:abstractNum w:abstractNumId="7" w15:restartNumberingAfterBreak="0">
+  <w:abstractNum w:abstractNumId="9" w15:restartNumberingAfterBreak="0">
     <w:nsid w:val="6A7F4B21"/>
     <w:multiLevelType w:val="multilevel"/>
     <w:tmpl w:val="9C62DC70"/>
@@ -5301,14 +5803,213 @@
       </w:rPr>
     </w:lvl>
   </w:abstractNum>
+  <w:abstractNum w:abstractNumId="10" w15:restartNumberingAfterBreak="0">
+    <w:nsid w:val="72014E08"/>
+    <w:multiLevelType w:val="hybridMultilevel"/>
+    <w:tmpl w:val="A7A61302"/>
+    <w:lvl w:ilvl="0" w:tplc="2C0A0015">
+      <w:start w:val="1"/>
+      <w:numFmt w:val="upperLetter"/>
+      <w:lvlText w:val="%1."/>
+      <w:lvlJc w:val="left"/>
+      <w:pPr>
+        <w:ind w:left="720" w:hanging="360"/>
+      </w:pPr>
+    </w:lvl>
+    <w:lvl w:ilvl="1" w:tplc="2C0A0019" w:tentative="1">
+      <w:start w:val="1"/>
+      <w:numFmt w:val="lowerLetter"/>
+      <w:lvlText w:val="%2."/>
+      <w:lvlJc w:val="left"/>
+      <w:pPr>
+        <w:ind w:left="1440" w:hanging="360"/>
+      </w:pPr>
+    </w:lvl>
+    <w:lvl w:ilvl="2" w:tplc="2C0A001B" w:tentative="1">
+      <w:start w:val="1"/>
+      <w:numFmt w:val="lowerRoman"/>
+      <w:lvlText w:val="%3."/>
+      <w:lvlJc w:val="right"/>
+      <w:pPr>
+        <w:ind w:left="2160" w:hanging="180"/>
+      </w:pPr>
+    </w:lvl>
+    <w:lvl w:ilvl="3" w:tplc="2C0A000F" w:tentative="1">
+      <w:start w:val="1"/>
+      <w:numFmt w:val="decimal"/>
+      <w:lvlText w:val="%4."/>
+      <w:lvlJc w:val="left"/>
+      <w:pPr>
+        <w:ind w:left="2880" w:hanging="360"/>
+      </w:pPr>
+    </w:lvl>
+    <w:lvl w:ilvl="4" w:tplc="2C0A0019" w:tentative="1">
+      <w:start w:val="1"/>
+      <w:numFmt w:val="lowerLetter"/>
+      <w:lvlText w:val="%5."/>
+      <w:lvlJc w:val="left"/>
+      <w:pPr>
+        <w:ind w:left="3600" w:hanging="360"/>
+      </w:pPr>
+    </w:lvl>
+    <w:lvl w:ilvl="5" w:tplc="2C0A001B" w:tentative="1">
+      <w:start w:val="1"/>
+      <w:numFmt w:val="lowerRoman"/>
+      <w:lvlText w:val="%6."/>
+      <w:lvlJc w:val="right"/>
+      <w:pPr>
+        <w:ind w:left="4320" w:hanging="180"/>
+      </w:pPr>
+    </w:lvl>
+    <w:lvl w:ilvl="6" w:tplc="2C0A000F" w:tentative="1">
+      <w:start w:val="1"/>
+      <w:numFmt w:val="decimal"/>
+      <w:lvlText w:val="%7."/>
+      <w:lvlJc w:val="left"/>
+      <w:pPr>
+        <w:ind w:left="5040" w:hanging="360"/>
+      </w:pPr>
+    </w:lvl>
+    <w:lvl w:ilvl="7" w:tplc="2C0A0019" w:tentative="1">
+      <w:start w:val="1"/>
+      <w:numFmt w:val="lowerLetter"/>
+      <w:lvlText w:val="%8."/>
+      <w:lvlJc w:val="left"/>
+      <w:pPr>
+        <w:ind w:left="5760" w:hanging="360"/>
+      </w:pPr>
+    </w:lvl>
+    <w:lvl w:ilvl="8" w:tplc="2C0A001B" w:tentative="1">
+      <w:start w:val="1"/>
+      <w:numFmt w:val="lowerRoman"/>
+      <w:lvlText w:val="%9."/>
+      <w:lvlJc w:val="right"/>
+      <w:pPr>
+        <w:ind w:left="6480" w:hanging="180"/>
+      </w:pPr>
+    </w:lvl>
+  </w:abstractNum>
+  <w:abstractNum w:abstractNumId="11" w15:restartNumberingAfterBreak="0">
+    <w:nsid w:val="7B1E0218"/>
+    <w:multiLevelType w:val="hybridMultilevel"/>
+    <w:tmpl w:val="F670B6BC"/>
+    <w:lvl w:ilvl="0" w:tplc="2C0A0001">
+      <w:start w:val="1"/>
+      <w:numFmt w:val="bullet"/>
+      <w:lvlText w:val=""/>
+      <w:lvlJc w:val="left"/>
+      <w:pPr>
+        <w:ind w:left="1008" w:hanging="360"/>
+      </w:pPr>
+      <w:rPr>
+        <w:rFonts w:ascii="Symbol" w:hAnsi="Symbol" w:hint="default"/>
+      </w:rPr>
+    </w:lvl>
+    <w:lvl w:ilvl="1" w:tplc="2C0A0003" w:tentative="1">
+      <w:start w:val="1"/>
+      <w:numFmt w:val="bullet"/>
+      <w:lvlText w:val="o"/>
+      <w:lvlJc w:val="left"/>
+      <w:pPr>
+        <w:ind w:left="1728" w:hanging="360"/>
+      </w:pPr>
+      <w:rPr>
+        <w:rFonts w:ascii="Courier New" w:hAnsi="Courier New" w:cs="Courier New" w:hint="default"/>
+      </w:rPr>
+    </w:lvl>
+    <w:lvl w:ilvl="2" w:tplc="2C0A0005" w:tentative="1">
+      <w:start w:val="1"/>
+      <w:numFmt w:val="bullet"/>
+      <w:lvlText w:val=""/>
+      <w:lvlJc w:val="left"/>
+      <w:pPr>
+        <w:ind w:left="2448" w:hanging="360"/>
+      </w:pPr>
+      <w:rPr>
+        <w:rFonts w:ascii="Wingdings" w:hAnsi="Wingdings" w:hint="default"/>
+      </w:rPr>
+    </w:lvl>
+    <w:lvl w:ilvl="3" w:tplc="2C0A0001" w:tentative="1">
+      <w:start w:val="1"/>
+      <w:numFmt w:val="bullet"/>
+      <w:lvlText w:val=""/>
+      <w:lvlJc w:val="left"/>
+      <w:pPr>
+        <w:ind w:left="3168" w:hanging="360"/>
+      </w:pPr>
+      <w:rPr>
+        <w:rFonts w:ascii="Symbol" w:hAnsi="Symbol" w:hint="default"/>
+      </w:rPr>
+    </w:lvl>
+    <w:lvl w:ilvl="4" w:tplc="2C0A0003" w:tentative="1">
+      <w:start w:val="1"/>
+      <w:numFmt w:val="bullet"/>
+      <w:lvlText w:val="o"/>
+      <w:lvlJc w:val="left"/>
+      <w:pPr>
+        <w:ind w:left="3888" w:hanging="360"/>
+      </w:pPr>
+      <w:rPr>
+        <w:rFonts w:ascii="Courier New" w:hAnsi="Courier New" w:cs="Courier New" w:hint="default"/>
+      </w:rPr>
+    </w:lvl>
+    <w:lvl w:ilvl="5" w:tplc="2C0A0005" w:tentative="1">
+      <w:start w:val="1"/>
+      <w:numFmt w:val="bullet"/>
+      <w:lvlText w:val=""/>
+      <w:lvlJc w:val="left"/>
+      <w:pPr>
+        <w:ind w:left="4608" w:hanging="360"/>
+      </w:pPr>
+      <w:rPr>
+        <w:rFonts w:ascii="Wingdings" w:hAnsi="Wingdings" w:hint="default"/>
+      </w:rPr>
+    </w:lvl>
+    <w:lvl w:ilvl="6" w:tplc="2C0A0001" w:tentative="1">
+      <w:start w:val="1"/>
+      <w:numFmt w:val="bullet"/>
+      <w:lvlText w:val=""/>
+      <w:lvlJc w:val="left"/>
+      <w:pPr>
+        <w:ind w:left="5328" w:hanging="360"/>
+      </w:pPr>
+      <w:rPr>
+        <w:rFonts w:ascii="Symbol" w:hAnsi="Symbol" w:hint="default"/>
+      </w:rPr>
+    </w:lvl>
+    <w:lvl w:ilvl="7" w:tplc="2C0A0003" w:tentative="1">
+      <w:start w:val="1"/>
+      <w:numFmt w:val="bullet"/>
+      <w:lvlText w:val="o"/>
+      <w:lvlJc w:val="left"/>
+      <w:pPr>
+        <w:ind w:left="6048" w:hanging="360"/>
+      </w:pPr>
+      <w:rPr>
+        <w:rFonts w:ascii="Courier New" w:hAnsi="Courier New" w:cs="Courier New" w:hint="default"/>
+      </w:rPr>
+    </w:lvl>
+    <w:lvl w:ilvl="8" w:tplc="2C0A0005" w:tentative="1">
+      <w:start w:val="1"/>
+      <w:numFmt w:val="bullet"/>
+      <w:lvlText w:val=""/>
+      <w:lvlJc w:val="left"/>
+      <w:pPr>
+        <w:ind w:left="6768" w:hanging="360"/>
+      </w:pPr>
+      <w:rPr>
+        <w:rFonts w:ascii="Wingdings" w:hAnsi="Wingdings" w:hint="default"/>
+      </w:rPr>
+    </w:lvl>
+  </w:abstractNum>
   <w:num w:numId="1" w16cid:durableId="1733890635">
-    <w:abstractNumId w:val="7"/>
+    <w:abstractNumId w:val="9"/>
   </w:num>
   <w:num w:numId="2" w16cid:durableId="133301745">
-    <w:abstractNumId w:val="3"/>
+    <w:abstractNumId w:val="5"/>
   </w:num>
   <w:num w:numId="3" w16cid:durableId="1307973455">
-    <w:abstractNumId w:val="3"/>
+    <w:abstractNumId w:val="5"/>
     <w:lvlOverride w:ilvl="0">
       <w:startOverride w:val="1"/>
     </w:lvlOverride>
@@ -5338,22 +6039,22 @@
     </w:lvlOverride>
   </w:num>
   <w:num w:numId="4" w16cid:durableId="1591620713">
-    <w:abstractNumId w:val="2"/>
+    <w:abstractNumId w:val="3"/>
   </w:num>
   <w:num w:numId="5" w16cid:durableId="854196457">
     <w:abstractNumId w:val="0"/>
   </w:num>
   <w:num w:numId="6" w16cid:durableId="369065873">
-    <w:abstractNumId w:val="1"/>
+    <w:abstractNumId w:val="2"/>
   </w:num>
   <w:num w:numId="7" w16cid:durableId="1642077043">
-    <w:abstractNumId w:val="4"/>
+    <w:abstractNumId w:val="6"/>
   </w:num>
   <w:num w:numId="8" w16cid:durableId="1101954348">
-    <w:abstractNumId w:val="5"/>
+    <w:abstractNumId w:val="7"/>
   </w:num>
   <w:num w:numId="9" w16cid:durableId="1221984577">
-    <w:abstractNumId w:val="6"/>
+    <w:abstractNumId w:val="8"/>
   </w:num>
   <w:num w:numId="10" w16cid:durableId="703944940">
     <w:abstractNumId w:val="0"/>
@@ -5413,6 +6114,36 @@
     </w:lvlOverride>
     <w:lvlOverride w:ilvl="8">
       <w:startOverride w:val="1"/>
+    </w:lvlOverride>
+  </w:num>
+  <w:num w:numId="12" w16cid:durableId="1554851968">
+    <w:abstractNumId w:val="11"/>
+  </w:num>
+  <w:num w:numId="13" w16cid:durableId="1122652644">
+    <w:abstractNumId w:val="0"/>
+    <w:lvlOverride w:ilvl="0">
+      <w:startOverride w:val="1"/>
+    </w:lvlOverride>
+    <w:lvlOverride w:ilvl="1">
+      <w:startOverride w:val="2"/>
+    </w:lvlOverride>
+  </w:num>
+  <w:num w:numId="14" w16cid:durableId="1478374530">
+    <w:abstractNumId w:val="1"/>
+  </w:num>
+  <w:num w:numId="15" w16cid:durableId="1359621278">
+    <w:abstractNumId w:val="10"/>
+  </w:num>
+  <w:num w:numId="16" w16cid:durableId="85852541">
+    <w:abstractNumId w:val="0"/>
+  </w:num>
+  <w:num w:numId="17" w16cid:durableId="1473213496">
+    <w:abstractNumId w:val="4"/>
+  </w:num>
+  <w:num w:numId="18" w16cid:durableId="1359575550">
+    <w:abstractNumId w:val="0"/>
+    <w:lvlOverride w:ilvl="0">
+      <w:startOverride w:val="5"/>
     </w:lvlOverride>
   </w:num>
   <w:numIdMacAtCleanup w:val="7"/>
@@ -5953,7 +6684,7 @@
     <w:rsid w:val="00273D2C"/>
     <w:pPr>
       <w:numPr>
-        <w:numId w:val="5"/>
+        <w:numId w:val="16"/>
       </w:numPr>
       <w:adjustRightInd w:val="0"/>
       <w:snapToGrid w:val="0"/>

</xml_diff>